<commit_message>
docs(tesis): nota de la Tabla 7 y coma suelta; verificar_coherencia lee los rotulos con campo SEQ simple; PDF de 165 paginas (pasada 179)
Co-Authored-By: Claude Sonnet 5.5 <noreply@anthropic.com>
</commit_message>
<xml_diff>
--- a/avance/Tesis Postly Bontorno Hassan-1 v2.docx
+++ b/avance/Tesis Postly Bontorno Hassan-1 v2.docx
@@ -316,7 +316,7 @@
       <w:r>
         <w:fldChar w:fldCharType="separate"/>
       </w:r>
-      <w:hyperlink w:anchor="_Toc241538441" w:history="1">
+      <w:hyperlink w:anchor="_Toc241538608" w:history="1">
         <w:r>
           <w:rPr>
             <w:rStyle w:val="Hyperlink"/>
@@ -339,7 +339,7 @@
           <w:rPr>
             <w:webHidden/>
           </w:rPr>
-          <w:instrText xml:space="preserve"> PAGEREF _Toc241538441 \h </w:instrText>
+          <w:instrText xml:space="preserve"> PAGEREF _Toc241538608 \h </w:instrText>
         </w:r>
         <w:r>
           <w:rPr>
@@ -378,7 +378,7 @@
           <w14:ligatures w14:val="standardContextual"/>
         </w:rPr>
       </w:pPr>
-      <w:hyperlink w:anchor="_Toc241538442" w:history="1">
+      <w:hyperlink w:anchor="_Toc241538609" w:history="1">
         <w:r>
           <w:rPr>
             <w:rStyle w:val="Hyperlink"/>
@@ -401,7 +401,7 @@
           <w:rPr>
             <w:webHidden/>
           </w:rPr>
-          <w:instrText xml:space="preserve"> PAGEREF _Toc241538442 \h </w:instrText>
+          <w:instrText xml:space="preserve"> PAGEREF _Toc241538609 \h </w:instrText>
         </w:r>
         <w:r>
           <w:rPr>
@@ -442,7 +442,7 @@
           <w14:ligatures w14:val="standardContextual"/>
         </w:rPr>
       </w:pPr>
-      <w:hyperlink w:anchor="_Toc241538443" w:history="1">
+      <w:hyperlink w:anchor="_Toc241538610" w:history="1">
         <w:r>
           <w:rPr>
             <w:rStyle w:val="Hyperlink"/>
@@ -469,7 +469,7 @@
             <w:noProof/>
             <w:webHidden/>
           </w:rPr>
-          <w:instrText xml:space="preserve"> PAGEREF _Toc241538443 \h </w:instrText>
+          <w:instrText xml:space="preserve"> PAGEREF _Toc241538610 \h </w:instrText>
         </w:r>
         <w:r>
           <w:rPr>
@@ -514,7 +514,7 @@
           <w14:ligatures w14:val="standardContextual"/>
         </w:rPr>
       </w:pPr>
-      <w:hyperlink w:anchor="_Toc241538444" w:history="1">
+      <w:hyperlink w:anchor="_Toc241538611" w:history="1">
         <w:r>
           <w:rPr>
             <w:rStyle w:val="Hyperlink"/>
@@ -541,7 +541,7 @@
             <w:noProof/>
             <w:webHidden/>
           </w:rPr>
-          <w:instrText xml:space="preserve"> PAGEREF _Toc241538444 \h </w:instrText>
+          <w:instrText xml:space="preserve"> PAGEREF _Toc241538611 \h </w:instrText>
         </w:r>
         <w:r>
           <w:rPr>
@@ -586,7 +586,7 @@
           <w14:ligatures w14:val="standardContextual"/>
         </w:rPr>
       </w:pPr>
-      <w:hyperlink w:anchor="_Toc241538445" w:history="1">
+      <w:hyperlink w:anchor="_Toc241538612" w:history="1">
         <w:r>
           <w:rPr>
             <w:rStyle w:val="Hyperlink"/>
@@ -613,7 +613,7 @@
             <w:noProof/>
             <w:webHidden/>
           </w:rPr>
-          <w:instrText xml:space="preserve"> PAGEREF _Toc241538445 \h </w:instrText>
+          <w:instrText xml:space="preserve"> PAGEREF _Toc241538612 \h </w:instrText>
         </w:r>
         <w:r>
           <w:rPr>
@@ -658,7 +658,7 @@
           <w14:ligatures w14:val="standardContextual"/>
         </w:rPr>
       </w:pPr>
-      <w:hyperlink w:anchor="_Toc241538446" w:history="1">
+      <w:hyperlink w:anchor="_Toc241538613" w:history="1">
         <w:r>
           <w:rPr>
             <w:rStyle w:val="Hyperlink"/>
@@ -685,7 +685,7 @@
             <w:noProof/>
             <w:webHidden/>
           </w:rPr>
-          <w:instrText xml:space="preserve"> PAGEREF _Toc241538446 \h </w:instrText>
+          <w:instrText xml:space="preserve"> PAGEREF _Toc241538613 \h </w:instrText>
         </w:r>
         <w:r>
           <w:rPr>
@@ -730,7 +730,7 @@
           <w14:ligatures w14:val="standardContextual"/>
         </w:rPr>
       </w:pPr>
-      <w:hyperlink w:anchor="_Toc241538447" w:history="1">
+      <w:hyperlink w:anchor="_Toc241538614" w:history="1">
         <w:r>
           <w:rPr>
             <w:rStyle w:val="Hyperlink"/>
@@ -757,7 +757,7 @@
             <w:noProof/>
             <w:webHidden/>
           </w:rPr>
-          <w:instrText xml:space="preserve"> PAGEREF _Toc241538447 \h </w:instrText>
+          <w:instrText xml:space="preserve"> PAGEREF _Toc241538614 \h </w:instrText>
         </w:r>
         <w:r>
           <w:rPr>
@@ -802,7 +802,7 @@
           <w14:ligatures w14:val="standardContextual"/>
         </w:rPr>
       </w:pPr>
-      <w:hyperlink w:anchor="_Toc241538448" w:history="1">
+      <w:hyperlink w:anchor="_Toc241538615" w:history="1">
         <w:r>
           <w:rPr>
             <w:rStyle w:val="Hyperlink"/>
@@ -829,7 +829,7 @@
             <w:noProof/>
             <w:webHidden/>
           </w:rPr>
-          <w:instrText xml:space="preserve"> PAGEREF _Toc241538448 \h </w:instrText>
+          <w:instrText xml:space="preserve"> PAGEREF _Toc241538615 \h </w:instrText>
         </w:r>
         <w:r>
           <w:rPr>
@@ -874,7 +874,7 @@
           <w14:ligatures w14:val="standardContextual"/>
         </w:rPr>
       </w:pPr>
-      <w:hyperlink w:anchor="_Toc241538449" w:history="1">
+      <w:hyperlink w:anchor="_Toc241538616" w:history="1">
         <w:r>
           <w:rPr>
             <w:rStyle w:val="Hyperlink"/>
@@ -901,7 +901,7 @@
             <w:noProof/>
             <w:webHidden/>
           </w:rPr>
-          <w:instrText xml:space="preserve"> PAGEREF _Toc241538449 \h </w:instrText>
+          <w:instrText xml:space="preserve"> PAGEREF _Toc241538616 \h </w:instrText>
         </w:r>
         <w:r>
           <w:rPr>
@@ -946,7 +946,7 @@
           <w14:ligatures w14:val="standardContextual"/>
         </w:rPr>
       </w:pPr>
-      <w:hyperlink w:anchor="_Toc241538450" w:history="1">
+      <w:hyperlink w:anchor="_Toc241538617" w:history="1">
         <w:r>
           <w:rPr>
             <w:rStyle w:val="Hyperlink"/>
@@ -973,7 +973,7 @@
             <w:noProof/>
             <w:webHidden/>
           </w:rPr>
-          <w:instrText xml:space="preserve"> PAGEREF _Toc241538450 \h </w:instrText>
+          <w:instrText xml:space="preserve"> PAGEREF _Toc241538617 \h </w:instrText>
         </w:r>
         <w:r>
           <w:rPr>
@@ -1018,7 +1018,7 @@
           <w14:ligatures w14:val="standardContextual"/>
         </w:rPr>
       </w:pPr>
-      <w:hyperlink w:anchor="_Toc241538451" w:history="1">
+      <w:hyperlink w:anchor="_Toc241538618" w:history="1">
         <w:r>
           <w:rPr>
             <w:rStyle w:val="Hyperlink"/>
@@ -1045,7 +1045,7 @@
             <w:noProof/>
             <w:webHidden/>
           </w:rPr>
-          <w:instrText xml:space="preserve"> PAGEREF _Toc241538451 \h </w:instrText>
+          <w:instrText xml:space="preserve"> PAGEREF _Toc241538618 \h </w:instrText>
         </w:r>
         <w:r>
           <w:rPr>
@@ -1090,7 +1090,7 @@
           <w14:ligatures w14:val="standardContextual"/>
         </w:rPr>
       </w:pPr>
-      <w:hyperlink w:anchor="_Toc241538452" w:history="1">
+      <w:hyperlink w:anchor="_Toc241538619" w:history="1">
         <w:r>
           <w:rPr>
             <w:rStyle w:val="Hyperlink"/>
@@ -1117,7 +1117,7 @@
             <w:noProof/>
             <w:webHidden/>
           </w:rPr>
-          <w:instrText xml:space="preserve"> PAGEREF _Toc241538452 \h </w:instrText>
+          <w:instrText xml:space="preserve"> PAGEREF _Toc241538619 \h </w:instrText>
         </w:r>
         <w:r>
           <w:rPr>
@@ -1162,7 +1162,7 @@
           <w14:ligatures w14:val="standardContextual"/>
         </w:rPr>
       </w:pPr>
-      <w:hyperlink w:anchor="_Toc241538453" w:history="1">
+      <w:hyperlink w:anchor="_Toc241538620" w:history="1">
         <w:r>
           <w:rPr>
             <w:rStyle w:val="Hyperlink"/>
@@ -1189,7 +1189,7 @@
             <w:noProof/>
             <w:webHidden/>
           </w:rPr>
-          <w:instrText xml:space="preserve"> PAGEREF _Toc241538453 \h </w:instrText>
+          <w:instrText xml:space="preserve"> PAGEREF _Toc241538620 \h </w:instrText>
         </w:r>
         <w:r>
           <w:rPr>
@@ -1234,7 +1234,7 @@
           <w14:ligatures w14:val="standardContextual"/>
         </w:rPr>
       </w:pPr>
-      <w:hyperlink w:anchor="_Toc241538454" w:history="1">
+      <w:hyperlink w:anchor="_Toc241538621" w:history="1">
         <w:r>
           <w:rPr>
             <w:rStyle w:val="Hyperlink"/>
@@ -1261,7 +1261,7 @@
             <w:noProof/>
             <w:webHidden/>
           </w:rPr>
-          <w:instrText xml:space="preserve"> PAGEREF _Toc241538454 \h </w:instrText>
+          <w:instrText xml:space="preserve"> PAGEREF _Toc241538621 \h </w:instrText>
         </w:r>
         <w:r>
           <w:rPr>
@@ -1306,7 +1306,7 @@
           <w14:ligatures w14:val="standardContextual"/>
         </w:rPr>
       </w:pPr>
-      <w:hyperlink w:anchor="_Toc241538455" w:history="1">
+      <w:hyperlink w:anchor="_Toc241538622" w:history="1">
         <w:r>
           <w:rPr>
             <w:rStyle w:val="Hyperlink"/>
@@ -1333,7 +1333,7 @@
             <w:noProof/>
             <w:webHidden/>
           </w:rPr>
-          <w:instrText xml:space="preserve"> PAGEREF _Toc241538455 \h </w:instrText>
+          <w:instrText xml:space="preserve"> PAGEREF _Toc241538622 \h </w:instrText>
         </w:r>
         <w:r>
           <w:rPr>
@@ -1378,7 +1378,7 @@
           <w14:ligatures w14:val="standardContextual"/>
         </w:rPr>
       </w:pPr>
-      <w:hyperlink w:anchor="_Toc241538456" w:history="1">
+      <w:hyperlink w:anchor="_Toc241538623" w:history="1">
         <w:r>
           <w:rPr>
             <w:rStyle w:val="Hyperlink"/>
@@ -1405,7 +1405,7 @@
             <w:noProof/>
             <w:webHidden/>
           </w:rPr>
-          <w:instrText xml:space="preserve"> PAGEREF _Toc241538456 \h </w:instrText>
+          <w:instrText xml:space="preserve"> PAGEREF _Toc241538623 \h </w:instrText>
         </w:r>
         <w:r>
           <w:rPr>
@@ -1448,7 +1448,7 @@
           <w14:ligatures w14:val="standardContextual"/>
         </w:rPr>
       </w:pPr>
-      <w:hyperlink w:anchor="_Toc241538457" w:history="1">
+      <w:hyperlink w:anchor="_Toc241538624" w:history="1">
         <w:r>
           <w:rPr>
             <w:rStyle w:val="Hyperlink"/>
@@ -1471,7 +1471,7 @@
           <w:rPr>
             <w:webHidden/>
           </w:rPr>
-          <w:instrText xml:space="preserve"> PAGEREF _Toc241538457 \h </w:instrText>
+          <w:instrText xml:space="preserve"> PAGEREF _Toc241538624 \h </w:instrText>
         </w:r>
         <w:r>
           <w:rPr>
@@ -1512,7 +1512,7 @@
           <w14:ligatures w14:val="standardContextual"/>
         </w:rPr>
       </w:pPr>
-      <w:hyperlink w:anchor="_Toc241538458" w:history="1">
+      <w:hyperlink w:anchor="_Toc241538625" w:history="1">
         <w:r>
           <w:rPr>
             <w:rStyle w:val="Hyperlink"/>
@@ -1539,7 +1539,7 @@
             <w:noProof/>
             <w:webHidden/>
           </w:rPr>
-          <w:instrText xml:space="preserve"> PAGEREF _Toc241538458 \h </w:instrText>
+          <w:instrText xml:space="preserve"> PAGEREF _Toc241538625 \h </w:instrText>
         </w:r>
         <w:r>
           <w:rPr>
@@ -1584,7 +1584,7 @@
           <w14:ligatures w14:val="standardContextual"/>
         </w:rPr>
       </w:pPr>
-      <w:hyperlink w:anchor="_Toc241538459" w:history="1">
+      <w:hyperlink w:anchor="_Toc241538626" w:history="1">
         <w:r>
           <w:rPr>
             <w:rStyle w:val="Hyperlink"/>
@@ -1611,7 +1611,7 @@
             <w:noProof/>
             <w:webHidden/>
           </w:rPr>
-          <w:instrText xml:space="preserve"> PAGEREF _Toc241538459 \h </w:instrText>
+          <w:instrText xml:space="preserve"> PAGEREF _Toc241538626 \h </w:instrText>
         </w:r>
         <w:r>
           <w:rPr>
@@ -1656,7 +1656,7 @@
           <w14:ligatures w14:val="standardContextual"/>
         </w:rPr>
       </w:pPr>
-      <w:hyperlink w:anchor="_Toc241538460" w:history="1">
+      <w:hyperlink w:anchor="_Toc241538627" w:history="1">
         <w:r>
           <w:rPr>
             <w:rStyle w:val="Hyperlink"/>
@@ -1683,7 +1683,7 @@
             <w:noProof/>
             <w:webHidden/>
           </w:rPr>
-          <w:instrText xml:space="preserve"> PAGEREF _Toc241538460 \h </w:instrText>
+          <w:instrText xml:space="preserve"> PAGEREF _Toc241538627 \h </w:instrText>
         </w:r>
         <w:r>
           <w:rPr>
@@ -1728,7 +1728,7 @@
           <w14:ligatures w14:val="standardContextual"/>
         </w:rPr>
       </w:pPr>
-      <w:hyperlink w:anchor="_Toc241538461" w:history="1">
+      <w:hyperlink w:anchor="_Toc241538628" w:history="1">
         <w:r>
           <w:rPr>
             <w:rStyle w:val="Hyperlink"/>
@@ -1755,7 +1755,7 @@
             <w:noProof/>
             <w:webHidden/>
           </w:rPr>
-          <w:instrText xml:space="preserve"> PAGEREF _Toc241538461 \h </w:instrText>
+          <w:instrText xml:space="preserve"> PAGEREF _Toc241538628 \h </w:instrText>
         </w:r>
         <w:r>
           <w:rPr>
@@ -1798,7 +1798,7 @@
           <w14:ligatures w14:val="standardContextual"/>
         </w:rPr>
       </w:pPr>
-      <w:hyperlink w:anchor="_Toc241538462" w:history="1">
+      <w:hyperlink w:anchor="_Toc241538629" w:history="1">
         <w:r>
           <w:rPr>
             <w:rStyle w:val="Hyperlink"/>
@@ -1821,7 +1821,7 @@
           <w:rPr>
             <w:webHidden/>
           </w:rPr>
-          <w:instrText xml:space="preserve"> PAGEREF _Toc241538462 \h </w:instrText>
+          <w:instrText xml:space="preserve"> PAGEREF _Toc241538629 \h </w:instrText>
         </w:r>
         <w:r>
           <w:rPr>
@@ -1862,7 +1862,7 @@
           <w14:ligatures w14:val="standardContextual"/>
         </w:rPr>
       </w:pPr>
-      <w:hyperlink w:anchor="_Toc241538463" w:history="1">
+      <w:hyperlink w:anchor="_Toc241538630" w:history="1">
         <w:r>
           <w:rPr>
             <w:rStyle w:val="Hyperlink"/>
@@ -1889,7 +1889,7 @@
             <w:noProof/>
             <w:webHidden/>
           </w:rPr>
-          <w:instrText xml:space="preserve"> PAGEREF _Toc241538463 \h </w:instrText>
+          <w:instrText xml:space="preserve"> PAGEREF _Toc241538630 \h </w:instrText>
         </w:r>
         <w:r>
           <w:rPr>
@@ -1934,7 +1934,7 @@
           <w14:ligatures w14:val="standardContextual"/>
         </w:rPr>
       </w:pPr>
-      <w:hyperlink w:anchor="_Toc241538464" w:history="1">
+      <w:hyperlink w:anchor="_Toc241538631" w:history="1">
         <w:r>
           <w:rPr>
             <w:rStyle w:val="Hyperlink"/>
@@ -1961,7 +1961,7 @@
             <w:noProof/>
             <w:webHidden/>
           </w:rPr>
-          <w:instrText xml:space="preserve"> PAGEREF _Toc241538464 \h </w:instrText>
+          <w:instrText xml:space="preserve"> PAGEREF _Toc241538631 \h </w:instrText>
         </w:r>
         <w:r>
           <w:rPr>
@@ -2006,7 +2006,7 @@
           <w14:ligatures w14:val="standardContextual"/>
         </w:rPr>
       </w:pPr>
-      <w:hyperlink w:anchor="_Toc241538465" w:history="1">
+      <w:hyperlink w:anchor="_Toc241538632" w:history="1">
         <w:r>
           <w:rPr>
             <w:rStyle w:val="Hyperlink"/>
@@ -2033,7 +2033,7 @@
             <w:noProof/>
             <w:webHidden/>
           </w:rPr>
-          <w:instrText xml:space="preserve"> PAGEREF _Toc241538465 \h </w:instrText>
+          <w:instrText xml:space="preserve"> PAGEREF _Toc241538632 \h </w:instrText>
         </w:r>
         <w:r>
           <w:rPr>
@@ -2078,7 +2078,7 @@
           <w14:ligatures w14:val="standardContextual"/>
         </w:rPr>
       </w:pPr>
-      <w:hyperlink w:anchor="_Toc241538466" w:history="1">
+      <w:hyperlink w:anchor="_Toc241538633" w:history="1">
         <w:r>
           <w:rPr>
             <w:rStyle w:val="Hyperlink"/>
@@ -2105,7 +2105,7 @@
             <w:noProof/>
             <w:webHidden/>
           </w:rPr>
-          <w:instrText xml:space="preserve"> PAGEREF _Toc241538466 \h </w:instrText>
+          <w:instrText xml:space="preserve"> PAGEREF _Toc241538633 \h </w:instrText>
         </w:r>
         <w:r>
           <w:rPr>
@@ -2150,7 +2150,7 @@
           <w14:ligatures w14:val="standardContextual"/>
         </w:rPr>
       </w:pPr>
-      <w:hyperlink w:anchor="_Toc241538467" w:history="1">
+      <w:hyperlink w:anchor="_Toc241538634" w:history="1">
         <w:r>
           <w:rPr>
             <w:rStyle w:val="Hyperlink"/>
@@ -2177,7 +2177,7 @@
             <w:noProof/>
             <w:webHidden/>
           </w:rPr>
-          <w:instrText xml:space="preserve"> PAGEREF _Toc241538467 \h </w:instrText>
+          <w:instrText xml:space="preserve"> PAGEREF _Toc241538634 \h </w:instrText>
         </w:r>
         <w:r>
           <w:rPr>
@@ -2222,7 +2222,7 @@
           <w14:ligatures w14:val="standardContextual"/>
         </w:rPr>
       </w:pPr>
-      <w:hyperlink w:anchor="_Toc241538468" w:history="1">
+      <w:hyperlink w:anchor="_Toc241538635" w:history="1">
         <w:r>
           <w:rPr>
             <w:rStyle w:val="Hyperlink"/>
@@ -2249,7 +2249,7 @@
             <w:noProof/>
             <w:webHidden/>
           </w:rPr>
-          <w:instrText xml:space="preserve"> PAGEREF _Toc241538468 \h </w:instrText>
+          <w:instrText xml:space="preserve"> PAGEREF _Toc241538635 \h </w:instrText>
         </w:r>
         <w:r>
           <w:rPr>
@@ -2294,7 +2294,7 @@
           <w14:ligatures w14:val="standardContextual"/>
         </w:rPr>
       </w:pPr>
-      <w:hyperlink w:anchor="_Toc241538469" w:history="1">
+      <w:hyperlink w:anchor="_Toc241538636" w:history="1">
         <w:r>
           <w:rPr>
             <w:rStyle w:val="Hyperlink"/>
@@ -2321,7 +2321,7 @@
             <w:noProof/>
             <w:webHidden/>
           </w:rPr>
-          <w:instrText xml:space="preserve"> PAGEREF _Toc241538469 \h </w:instrText>
+          <w:instrText xml:space="preserve"> PAGEREF _Toc241538636 \h </w:instrText>
         </w:r>
         <w:r>
           <w:rPr>
@@ -2366,7 +2366,7 @@
           <w14:ligatures w14:val="standardContextual"/>
         </w:rPr>
       </w:pPr>
-      <w:hyperlink w:anchor="_Toc241538470" w:history="1">
+      <w:hyperlink w:anchor="_Toc241538637" w:history="1">
         <w:r>
           <w:rPr>
             <w:rStyle w:val="Hyperlink"/>
@@ -2393,7 +2393,7 @@
             <w:noProof/>
             <w:webHidden/>
           </w:rPr>
-          <w:instrText xml:space="preserve"> PAGEREF _Toc241538470 \h </w:instrText>
+          <w:instrText xml:space="preserve"> PAGEREF _Toc241538637 \h </w:instrText>
         </w:r>
         <w:r>
           <w:rPr>
@@ -2438,7 +2438,7 @@
           <w14:ligatures w14:val="standardContextual"/>
         </w:rPr>
       </w:pPr>
-      <w:hyperlink w:anchor="_Toc241538471" w:history="1">
+      <w:hyperlink w:anchor="_Toc241538638" w:history="1">
         <w:r>
           <w:rPr>
             <w:rStyle w:val="Hyperlink"/>
@@ -2465,7 +2465,7 @@
             <w:noProof/>
             <w:webHidden/>
           </w:rPr>
-          <w:instrText xml:space="preserve"> PAGEREF _Toc241538471 \h </w:instrText>
+          <w:instrText xml:space="preserve"> PAGEREF _Toc241538638 \h </w:instrText>
         </w:r>
         <w:r>
           <w:rPr>
@@ -2510,7 +2510,7 @@
           <w14:ligatures w14:val="standardContextual"/>
         </w:rPr>
       </w:pPr>
-      <w:hyperlink w:anchor="_Toc241538472" w:history="1">
+      <w:hyperlink w:anchor="_Toc241538639" w:history="1">
         <w:r>
           <w:rPr>
             <w:rStyle w:val="Hyperlink"/>
@@ -2537,7 +2537,7 @@
             <w:noProof/>
             <w:webHidden/>
           </w:rPr>
-          <w:instrText xml:space="preserve"> PAGEREF _Toc241538472 \h </w:instrText>
+          <w:instrText xml:space="preserve"> PAGEREF _Toc241538639 \h </w:instrText>
         </w:r>
         <w:r>
           <w:rPr>
@@ -2582,7 +2582,7 @@
           <w14:ligatures w14:val="standardContextual"/>
         </w:rPr>
       </w:pPr>
-      <w:hyperlink w:anchor="_Toc241538473" w:history="1">
+      <w:hyperlink w:anchor="_Toc241538640" w:history="1">
         <w:r>
           <w:rPr>
             <w:rStyle w:val="Hyperlink"/>
@@ -2609,7 +2609,7 @@
             <w:noProof/>
             <w:webHidden/>
           </w:rPr>
-          <w:instrText xml:space="preserve"> PAGEREF _Toc241538473 \h </w:instrText>
+          <w:instrText xml:space="preserve"> PAGEREF _Toc241538640 \h </w:instrText>
         </w:r>
         <w:r>
           <w:rPr>
@@ -2654,7 +2654,7 @@
           <w14:ligatures w14:val="standardContextual"/>
         </w:rPr>
       </w:pPr>
-      <w:hyperlink w:anchor="_Toc241538474" w:history="1">
+      <w:hyperlink w:anchor="_Toc241538641" w:history="1">
         <w:r>
           <w:rPr>
             <w:rStyle w:val="Hyperlink"/>
@@ -2681,7 +2681,7 @@
             <w:noProof/>
             <w:webHidden/>
           </w:rPr>
-          <w:instrText xml:space="preserve"> PAGEREF _Toc241538474 \h </w:instrText>
+          <w:instrText xml:space="preserve"> PAGEREF _Toc241538641 \h </w:instrText>
         </w:r>
         <w:r>
           <w:rPr>
@@ -2726,7 +2726,7 @@
           <w14:ligatures w14:val="standardContextual"/>
         </w:rPr>
       </w:pPr>
-      <w:hyperlink w:anchor="_Toc241538475" w:history="1">
+      <w:hyperlink w:anchor="_Toc241538642" w:history="1">
         <w:r>
           <w:rPr>
             <w:rStyle w:val="Hyperlink"/>
@@ -2753,7 +2753,7 @@
             <w:noProof/>
             <w:webHidden/>
           </w:rPr>
-          <w:instrText xml:space="preserve"> PAGEREF _Toc241538475 \h </w:instrText>
+          <w:instrText xml:space="preserve"> PAGEREF _Toc241538642 \h </w:instrText>
         </w:r>
         <w:r>
           <w:rPr>
@@ -2798,7 +2798,7 @@
           <w14:ligatures w14:val="standardContextual"/>
         </w:rPr>
       </w:pPr>
-      <w:hyperlink w:anchor="_Toc241538476" w:history="1">
+      <w:hyperlink w:anchor="_Toc241538643" w:history="1">
         <w:r>
           <w:rPr>
             <w:rStyle w:val="Hyperlink"/>
@@ -2825,7 +2825,7 @@
             <w:noProof/>
             <w:webHidden/>
           </w:rPr>
-          <w:instrText xml:space="preserve"> PAGEREF _Toc241538476 \h </w:instrText>
+          <w:instrText xml:space="preserve"> PAGEREF _Toc241538643 \h </w:instrText>
         </w:r>
         <w:r>
           <w:rPr>
@@ -2870,7 +2870,7 @@
           <w14:ligatures w14:val="standardContextual"/>
         </w:rPr>
       </w:pPr>
-      <w:hyperlink w:anchor="_Toc241538477" w:history="1">
+      <w:hyperlink w:anchor="_Toc241538644" w:history="1">
         <w:r>
           <w:rPr>
             <w:rStyle w:val="Hyperlink"/>
@@ -2897,7 +2897,7 @@
             <w:noProof/>
             <w:webHidden/>
           </w:rPr>
-          <w:instrText xml:space="preserve"> PAGEREF _Toc241538477 \h </w:instrText>
+          <w:instrText xml:space="preserve"> PAGEREF _Toc241538644 \h </w:instrText>
         </w:r>
         <w:r>
           <w:rPr>
@@ -2942,7 +2942,7 @@
           <w14:ligatures w14:val="standardContextual"/>
         </w:rPr>
       </w:pPr>
-      <w:hyperlink w:anchor="_Toc241538478" w:history="1">
+      <w:hyperlink w:anchor="_Toc241538645" w:history="1">
         <w:r>
           <w:rPr>
             <w:rStyle w:val="Hyperlink"/>
@@ -2969,7 +2969,7 @@
             <w:noProof/>
             <w:webHidden/>
           </w:rPr>
-          <w:instrText xml:space="preserve"> PAGEREF _Toc241538478 \h </w:instrText>
+          <w:instrText xml:space="preserve"> PAGEREF _Toc241538645 \h </w:instrText>
         </w:r>
         <w:r>
           <w:rPr>
@@ -3014,7 +3014,7 @@
           <w14:ligatures w14:val="standardContextual"/>
         </w:rPr>
       </w:pPr>
-      <w:hyperlink w:anchor="_Toc241538479" w:history="1">
+      <w:hyperlink w:anchor="_Toc241538646" w:history="1">
         <w:r>
           <w:rPr>
             <w:rStyle w:val="Hyperlink"/>
@@ -3041,7 +3041,7 @@
             <w:noProof/>
             <w:webHidden/>
           </w:rPr>
-          <w:instrText xml:space="preserve"> PAGEREF _Toc241538479 \h </w:instrText>
+          <w:instrText xml:space="preserve"> PAGEREF _Toc241538646 \h </w:instrText>
         </w:r>
         <w:r>
           <w:rPr>
@@ -3086,7 +3086,7 @@
           <w14:ligatures w14:val="standardContextual"/>
         </w:rPr>
       </w:pPr>
-      <w:hyperlink w:anchor="_Toc241538480" w:history="1">
+      <w:hyperlink w:anchor="_Toc241538647" w:history="1">
         <w:r>
           <w:rPr>
             <w:rStyle w:val="Hyperlink"/>
@@ -3113,7 +3113,7 @@
             <w:noProof/>
             <w:webHidden/>
           </w:rPr>
-          <w:instrText xml:space="preserve"> PAGEREF _Toc241538480 \h </w:instrText>
+          <w:instrText xml:space="preserve"> PAGEREF _Toc241538647 \h </w:instrText>
         </w:r>
         <w:r>
           <w:rPr>
@@ -3158,7 +3158,7 @@
           <w14:ligatures w14:val="standardContextual"/>
         </w:rPr>
       </w:pPr>
-      <w:hyperlink w:anchor="_Toc241538481" w:history="1">
+      <w:hyperlink w:anchor="_Toc241538648" w:history="1">
         <w:r>
           <w:rPr>
             <w:rStyle w:val="Hyperlink"/>
@@ -3185,7 +3185,7 @@
             <w:noProof/>
             <w:webHidden/>
           </w:rPr>
-          <w:instrText xml:space="preserve"> PAGEREF _Toc241538481 \h </w:instrText>
+          <w:instrText xml:space="preserve"> PAGEREF _Toc241538648 \h </w:instrText>
         </w:r>
         <w:r>
           <w:rPr>
@@ -3230,7 +3230,7 @@
           <w14:ligatures w14:val="standardContextual"/>
         </w:rPr>
       </w:pPr>
-      <w:hyperlink w:anchor="_Toc241538482" w:history="1">
+      <w:hyperlink w:anchor="_Toc241538649" w:history="1">
         <w:r>
           <w:rPr>
             <w:rStyle w:val="Hyperlink"/>
@@ -3257,7 +3257,7 @@
             <w:noProof/>
             <w:webHidden/>
           </w:rPr>
-          <w:instrText xml:space="preserve"> PAGEREF _Toc241538482 \h </w:instrText>
+          <w:instrText xml:space="preserve"> PAGEREF _Toc241538649 \h </w:instrText>
         </w:r>
         <w:r>
           <w:rPr>
@@ -3302,7 +3302,7 @@
           <w14:ligatures w14:val="standardContextual"/>
         </w:rPr>
       </w:pPr>
-      <w:hyperlink w:anchor="_Toc241538483" w:history="1">
+      <w:hyperlink w:anchor="_Toc241538650" w:history="1">
         <w:r>
           <w:rPr>
             <w:rStyle w:val="Hyperlink"/>
@@ -3329,7 +3329,7 @@
             <w:noProof/>
             <w:webHidden/>
           </w:rPr>
-          <w:instrText xml:space="preserve"> PAGEREF _Toc241538483 \h </w:instrText>
+          <w:instrText xml:space="preserve"> PAGEREF _Toc241538650 \h </w:instrText>
         </w:r>
         <w:r>
           <w:rPr>
@@ -3374,7 +3374,7 @@
           <w14:ligatures w14:val="standardContextual"/>
         </w:rPr>
       </w:pPr>
-      <w:hyperlink w:anchor="_Toc241538484" w:history="1">
+      <w:hyperlink w:anchor="_Toc241538651" w:history="1">
         <w:r>
           <w:rPr>
             <w:rStyle w:val="Hyperlink"/>
@@ -3401,7 +3401,7 @@
             <w:noProof/>
             <w:webHidden/>
           </w:rPr>
-          <w:instrText xml:space="preserve"> PAGEREF _Toc241538484 \h </w:instrText>
+          <w:instrText xml:space="preserve"> PAGEREF _Toc241538651 \h </w:instrText>
         </w:r>
         <w:r>
           <w:rPr>
@@ -3446,7 +3446,7 @@
           <w14:ligatures w14:val="standardContextual"/>
         </w:rPr>
       </w:pPr>
-      <w:hyperlink w:anchor="_Toc241538485" w:history="1">
+      <w:hyperlink w:anchor="_Toc241538652" w:history="1">
         <w:r>
           <w:rPr>
             <w:rStyle w:val="Hyperlink"/>
@@ -3489,7 +3489,7 @@
             <w:noProof/>
             <w:webHidden/>
           </w:rPr>
-          <w:instrText xml:space="preserve"> PAGEREF _Toc241538485 \h </w:instrText>
+          <w:instrText xml:space="preserve"> PAGEREF _Toc241538652 \h </w:instrText>
         </w:r>
         <w:r>
           <w:rPr>
@@ -3534,7 +3534,7 @@
           <w14:ligatures w14:val="standardContextual"/>
         </w:rPr>
       </w:pPr>
-      <w:hyperlink w:anchor="_Toc241538486" w:history="1">
+      <w:hyperlink w:anchor="_Toc241538653" w:history="1">
         <w:r>
           <w:rPr>
             <w:rStyle w:val="Hyperlink"/>
@@ -3561,7 +3561,7 @@
             <w:noProof/>
             <w:webHidden/>
           </w:rPr>
-          <w:instrText xml:space="preserve"> PAGEREF _Toc241538486 \h </w:instrText>
+          <w:instrText xml:space="preserve"> PAGEREF _Toc241538653 \h </w:instrText>
         </w:r>
         <w:r>
           <w:rPr>
@@ -3606,7 +3606,7 @@
           <w14:ligatures w14:val="standardContextual"/>
         </w:rPr>
       </w:pPr>
-      <w:hyperlink w:anchor="_Toc241538487" w:history="1">
+      <w:hyperlink w:anchor="_Toc241538654" w:history="1">
         <w:r>
           <w:rPr>
             <w:rStyle w:val="Hyperlink"/>
@@ -3633,7 +3633,7 @@
             <w:noProof/>
             <w:webHidden/>
           </w:rPr>
-          <w:instrText xml:space="preserve"> PAGEREF _Toc241538487 \h </w:instrText>
+          <w:instrText xml:space="preserve"> PAGEREF _Toc241538654 \h </w:instrText>
         </w:r>
         <w:r>
           <w:rPr>
@@ -3678,7 +3678,7 @@
           <w14:ligatures w14:val="standardContextual"/>
         </w:rPr>
       </w:pPr>
-      <w:hyperlink w:anchor="_Toc241538488" w:history="1">
+      <w:hyperlink w:anchor="_Toc241538655" w:history="1">
         <w:r>
           <w:rPr>
             <w:rStyle w:val="Hyperlink"/>
@@ -3705,7 +3705,7 @@
             <w:noProof/>
             <w:webHidden/>
           </w:rPr>
-          <w:instrText xml:space="preserve"> PAGEREF _Toc241538488 \h </w:instrText>
+          <w:instrText xml:space="preserve"> PAGEREF _Toc241538655 \h </w:instrText>
         </w:r>
         <w:r>
           <w:rPr>
@@ -3748,7 +3748,7 @@
           <w14:ligatures w14:val="standardContextual"/>
         </w:rPr>
       </w:pPr>
-      <w:hyperlink w:anchor="_Toc241538489" w:history="1">
+      <w:hyperlink w:anchor="_Toc241538656" w:history="1">
         <w:r>
           <w:rPr>
             <w:rStyle w:val="Hyperlink"/>
@@ -3771,7 +3771,7 @@
           <w:rPr>
             <w:webHidden/>
           </w:rPr>
-          <w:instrText xml:space="preserve"> PAGEREF _Toc241538489 \h </w:instrText>
+          <w:instrText xml:space="preserve"> PAGEREF _Toc241538656 \h </w:instrText>
         </w:r>
         <w:r>
           <w:rPr>
@@ -3812,7 +3812,7 @@
           <w14:ligatures w14:val="standardContextual"/>
         </w:rPr>
       </w:pPr>
-      <w:hyperlink w:anchor="_Toc241538490" w:history="1">
+      <w:hyperlink w:anchor="_Toc241538657" w:history="1">
         <w:r>
           <w:rPr>
             <w:rStyle w:val="Hyperlink"/>
@@ -3839,7 +3839,7 @@
             <w:noProof/>
             <w:webHidden/>
           </w:rPr>
-          <w:instrText xml:space="preserve"> PAGEREF _Toc241538490 \h </w:instrText>
+          <w:instrText xml:space="preserve"> PAGEREF _Toc241538657 \h </w:instrText>
         </w:r>
         <w:r>
           <w:rPr>
@@ -3884,7 +3884,7 @@
           <w14:ligatures w14:val="standardContextual"/>
         </w:rPr>
       </w:pPr>
-      <w:hyperlink w:anchor="_Toc241538491" w:history="1">
+      <w:hyperlink w:anchor="_Toc241538658" w:history="1">
         <w:r>
           <w:rPr>
             <w:rStyle w:val="Hyperlink"/>
@@ -3911,7 +3911,7 @@
             <w:noProof/>
             <w:webHidden/>
           </w:rPr>
-          <w:instrText xml:space="preserve"> PAGEREF _Toc241538491 \h </w:instrText>
+          <w:instrText xml:space="preserve"> PAGEREF _Toc241538658 \h </w:instrText>
         </w:r>
         <w:r>
           <w:rPr>
@@ -3956,7 +3956,7 @@
           <w14:ligatures w14:val="standardContextual"/>
         </w:rPr>
       </w:pPr>
-      <w:hyperlink w:anchor="_Toc241538492" w:history="1">
+      <w:hyperlink w:anchor="_Toc241538659" w:history="1">
         <w:r>
           <w:rPr>
             <w:rStyle w:val="Hyperlink"/>
@@ -3983,7 +3983,7 @@
             <w:noProof/>
             <w:webHidden/>
           </w:rPr>
-          <w:instrText xml:space="preserve"> PAGEREF _Toc241538492 \h </w:instrText>
+          <w:instrText xml:space="preserve"> PAGEREF _Toc241538659 \h </w:instrText>
         </w:r>
         <w:r>
           <w:rPr>
@@ -4028,7 +4028,7 @@
           <w14:ligatures w14:val="standardContextual"/>
         </w:rPr>
       </w:pPr>
-      <w:hyperlink w:anchor="_Toc241538493" w:history="1">
+      <w:hyperlink w:anchor="_Toc241538660" w:history="1">
         <w:r>
           <w:rPr>
             <w:rStyle w:val="Hyperlink"/>
@@ -4055,7 +4055,7 @@
             <w:noProof/>
             <w:webHidden/>
           </w:rPr>
-          <w:instrText xml:space="preserve"> PAGEREF _Toc241538493 \h </w:instrText>
+          <w:instrText xml:space="preserve"> PAGEREF _Toc241538660 \h </w:instrText>
         </w:r>
         <w:r>
           <w:rPr>
@@ -4100,7 +4100,7 @@
           <w14:ligatures w14:val="standardContextual"/>
         </w:rPr>
       </w:pPr>
-      <w:hyperlink w:anchor="_Toc241538494" w:history="1">
+      <w:hyperlink w:anchor="_Toc241538661" w:history="1">
         <w:r>
           <w:rPr>
             <w:rStyle w:val="Hyperlink"/>
@@ -4127,7 +4127,7 @@
             <w:noProof/>
             <w:webHidden/>
           </w:rPr>
-          <w:instrText xml:space="preserve"> PAGEREF _Toc241538494 \h </w:instrText>
+          <w:instrText xml:space="preserve"> PAGEREF _Toc241538661 \h </w:instrText>
         </w:r>
         <w:r>
           <w:rPr>
@@ -4172,7 +4172,7 @@
           <w14:ligatures w14:val="standardContextual"/>
         </w:rPr>
       </w:pPr>
-      <w:hyperlink w:anchor="_Toc241538495" w:history="1">
+      <w:hyperlink w:anchor="_Toc241538662" w:history="1">
         <w:r>
           <w:rPr>
             <w:rStyle w:val="Hyperlink"/>
@@ -4199,7 +4199,7 @@
             <w:noProof/>
             <w:webHidden/>
           </w:rPr>
-          <w:instrText xml:space="preserve"> PAGEREF _Toc241538495 \h </w:instrText>
+          <w:instrText xml:space="preserve"> PAGEREF _Toc241538662 \h </w:instrText>
         </w:r>
         <w:r>
           <w:rPr>
@@ -4244,7 +4244,7 @@
           <w14:ligatures w14:val="standardContextual"/>
         </w:rPr>
       </w:pPr>
-      <w:hyperlink w:anchor="_Toc241538496" w:history="1">
+      <w:hyperlink w:anchor="_Toc241538663" w:history="1">
         <w:r>
           <w:rPr>
             <w:rStyle w:val="Hyperlink"/>
@@ -4271,7 +4271,7 @@
             <w:noProof/>
             <w:webHidden/>
           </w:rPr>
-          <w:instrText xml:space="preserve"> PAGEREF _Toc241538496 \h </w:instrText>
+          <w:instrText xml:space="preserve"> PAGEREF _Toc241538663 \h </w:instrText>
         </w:r>
         <w:r>
           <w:rPr>
@@ -4316,7 +4316,7 @@
           <w14:ligatures w14:val="standardContextual"/>
         </w:rPr>
       </w:pPr>
-      <w:hyperlink w:anchor="_Toc241538497" w:history="1">
+      <w:hyperlink w:anchor="_Toc241538664" w:history="1">
         <w:r>
           <w:rPr>
             <w:rStyle w:val="Hyperlink"/>
@@ -4343,7 +4343,7 @@
             <w:noProof/>
             <w:webHidden/>
           </w:rPr>
-          <w:instrText xml:space="preserve"> PAGEREF _Toc241538497 \h </w:instrText>
+          <w:instrText xml:space="preserve"> PAGEREF _Toc241538664 \h </w:instrText>
         </w:r>
         <w:r>
           <w:rPr>
@@ -4388,7 +4388,7 @@
           <w14:ligatures w14:val="standardContextual"/>
         </w:rPr>
       </w:pPr>
-      <w:hyperlink w:anchor="_Toc241538498" w:history="1">
+      <w:hyperlink w:anchor="_Toc241538665" w:history="1">
         <w:r>
           <w:rPr>
             <w:rStyle w:val="Hyperlink"/>
@@ -4415,7 +4415,7 @@
             <w:noProof/>
             <w:webHidden/>
           </w:rPr>
-          <w:instrText xml:space="preserve"> PAGEREF _Toc241538498 \h </w:instrText>
+          <w:instrText xml:space="preserve"> PAGEREF _Toc241538665 \h </w:instrText>
         </w:r>
         <w:r>
           <w:rPr>
@@ -4460,7 +4460,7 @@
           <w14:ligatures w14:val="standardContextual"/>
         </w:rPr>
       </w:pPr>
-      <w:hyperlink w:anchor="_Toc241538499" w:history="1">
+      <w:hyperlink w:anchor="_Toc241538666" w:history="1">
         <w:r>
           <w:rPr>
             <w:rStyle w:val="Hyperlink"/>
@@ -4487,7 +4487,7 @@
             <w:noProof/>
             <w:webHidden/>
           </w:rPr>
-          <w:instrText xml:space="preserve"> PAGEREF _Toc241538499 \h </w:instrText>
+          <w:instrText xml:space="preserve"> PAGEREF _Toc241538666 \h </w:instrText>
         </w:r>
         <w:r>
           <w:rPr>
@@ -4532,7 +4532,7 @@
           <w14:ligatures w14:val="standardContextual"/>
         </w:rPr>
       </w:pPr>
-      <w:hyperlink w:anchor="_Toc241538500" w:history="1">
+      <w:hyperlink w:anchor="_Toc241538667" w:history="1">
         <w:r>
           <w:rPr>
             <w:rStyle w:val="Hyperlink"/>
@@ -4559,7 +4559,7 @@
             <w:noProof/>
             <w:webHidden/>
           </w:rPr>
-          <w:instrText xml:space="preserve"> PAGEREF _Toc241538500 \h </w:instrText>
+          <w:instrText xml:space="preserve"> PAGEREF _Toc241538667 \h </w:instrText>
         </w:r>
         <w:r>
           <w:rPr>
@@ -4604,7 +4604,7 @@
           <w14:ligatures w14:val="standardContextual"/>
         </w:rPr>
       </w:pPr>
-      <w:hyperlink w:anchor="_Toc241538501" w:history="1">
+      <w:hyperlink w:anchor="_Toc241538668" w:history="1">
         <w:r>
           <w:rPr>
             <w:rStyle w:val="Hyperlink"/>
@@ -4631,7 +4631,7 @@
             <w:noProof/>
             <w:webHidden/>
           </w:rPr>
-          <w:instrText xml:space="preserve"> PAGEREF _Toc241538501 \h </w:instrText>
+          <w:instrText xml:space="preserve"> PAGEREF _Toc241538668 \h </w:instrText>
         </w:r>
         <w:r>
           <w:rPr>
@@ -4676,7 +4676,7 @@
           <w14:ligatures w14:val="standardContextual"/>
         </w:rPr>
       </w:pPr>
-      <w:hyperlink w:anchor="_Toc241538502" w:history="1">
+      <w:hyperlink w:anchor="_Toc241538669" w:history="1">
         <w:r>
           <w:rPr>
             <w:rStyle w:val="Hyperlink"/>
@@ -4703,7 +4703,7 @@
             <w:noProof/>
             <w:webHidden/>
           </w:rPr>
-          <w:instrText xml:space="preserve"> PAGEREF _Toc241538502 \h </w:instrText>
+          <w:instrText xml:space="preserve"> PAGEREF _Toc241538669 \h </w:instrText>
         </w:r>
         <w:r>
           <w:rPr>
@@ -4748,7 +4748,7 @@
           <w14:ligatures w14:val="standardContextual"/>
         </w:rPr>
       </w:pPr>
-      <w:hyperlink w:anchor="_Toc241538503" w:history="1">
+      <w:hyperlink w:anchor="_Toc241538670" w:history="1">
         <w:r>
           <w:rPr>
             <w:rStyle w:val="Hyperlink"/>
@@ -4775,7 +4775,7 @@
             <w:noProof/>
             <w:webHidden/>
           </w:rPr>
-          <w:instrText xml:space="preserve"> PAGEREF _Toc241538503 \h </w:instrText>
+          <w:instrText xml:space="preserve"> PAGEREF _Toc241538670 \h </w:instrText>
         </w:r>
         <w:r>
           <w:rPr>
@@ -4818,7 +4818,7 @@
           <w14:ligatures w14:val="standardContextual"/>
         </w:rPr>
       </w:pPr>
-      <w:hyperlink w:anchor="_Toc241538504" w:history="1">
+      <w:hyperlink w:anchor="_Toc241538671" w:history="1">
         <w:r>
           <w:rPr>
             <w:rStyle w:val="Hyperlink"/>
@@ -4841,7 +4841,7 @@
           <w:rPr>
             <w:webHidden/>
           </w:rPr>
-          <w:instrText xml:space="preserve"> PAGEREF _Toc241538504 \h </w:instrText>
+          <w:instrText xml:space="preserve"> PAGEREF _Toc241538671 \h </w:instrText>
         </w:r>
         <w:r>
           <w:rPr>
@@ -4882,7 +4882,7 @@
           <w14:ligatures w14:val="standardContextual"/>
         </w:rPr>
       </w:pPr>
-      <w:hyperlink w:anchor="_Toc241538505" w:history="1">
+      <w:hyperlink w:anchor="_Toc241538672" w:history="1">
         <w:r>
           <w:rPr>
             <w:rStyle w:val="Hyperlink"/>
@@ -4909,7 +4909,7 @@
             <w:noProof/>
             <w:webHidden/>
           </w:rPr>
-          <w:instrText xml:space="preserve"> PAGEREF _Toc241538505 \h </w:instrText>
+          <w:instrText xml:space="preserve"> PAGEREF _Toc241538672 \h </w:instrText>
         </w:r>
         <w:r>
           <w:rPr>
@@ -4954,7 +4954,7 @@
           <w14:ligatures w14:val="standardContextual"/>
         </w:rPr>
       </w:pPr>
-      <w:hyperlink w:anchor="_Toc241538506" w:history="1">
+      <w:hyperlink w:anchor="_Toc241538673" w:history="1">
         <w:r>
           <w:rPr>
             <w:rStyle w:val="Hyperlink"/>
@@ -4981,7 +4981,7 @@
             <w:noProof/>
             <w:webHidden/>
           </w:rPr>
-          <w:instrText xml:space="preserve"> PAGEREF _Toc241538506 \h </w:instrText>
+          <w:instrText xml:space="preserve"> PAGEREF _Toc241538673 \h </w:instrText>
         </w:r>
         <w:r>
           <w:rPr>
@@ -5026,7 +5026,7 @@
           <w14:ligatures w14:val="standardContextual"/>
         </w:rPr>
       </w:pPr>
-      <w:hyperlink w:anchor="_Toc241538507" w:history="1">
+      <w:hyperlink w:anchor="_Toc241538674" w:history="1">
         <w:r>
           <w:rPr>
             <w:rStyle w:val="Hyperlink"/>
@@ -5053,7 +5053,7 @@
             <w:noProof/>
             <w:webHidden/>
           </w:rPr>
-          <w:instrText xml:space="preserve"> PAGEREF _Toc241538507 \h </w:instrText>
+          <w:instrText xml:space="preserve"> PAGEREF _Toc241538674 \h </w:instrText>
         </w:r>
         <w:r>
           <w:rPr>
@@ -5098,7 +5098,7 @@
           <w14:ligatures w14:val="standardContextual"/>
         </w:rPr>
       </w:pPr>
-      <w:hyperlink w:anchor="_Toc241538508" w:history="1">
+      <w:hyperlink w:anchor="_Toc241538675" w:history="1">
         <w:r>
           <w:rPr>
             <w:rStyle w:val="Hyperlink"/>
@@ -5125,7 +5125,7 @@
             <w:noProof/>
             <w:webHidden/>
           </w:rPr>
-          <w:instrText xml:space="preserve"> PAGEREF _Toc241538508 \h </w:instrText>
+          <w:instrText xml:space="preserve"> PAGEREF _Toc241538675 \h </w:instrText>
         </w:r>
         <w:r>
           <w:rPr>
@@ -5170,7 +5170,7 @@
           <w14:ligatures w14:val="standardContextual"/>
         </w:rPr>
       </w:pPr>
-      <w:hyperlink w:anchor="_Toc241538509" w:history="1">
+      <w:hyperlink w:anchor="_Toc241538676" w:history="1">
         <w:r>
           <w:rPr>
             <w:rStyle w:val="Hyperlink"/>
@@ -5197,7 +5197,7 @@
             <w:noProof/>
             <w:webHidden/>
           </w:rPr>
-          <w:instrText xml:space="preserve"> PAGEREF _Toc241538509 \h </w:instrText>
+          <w:instrText xml:space="preserve"> PAGEREF _Toc241538676 \h </w:instrText>
         </w:r>
         <w:r>
           <w:rPr>
@@ -5242,7 +5242,7 @@
           <w14:ligatures w14:val="standardContextual"/>
         </w:rPr>
       </w:pPr>
-      <w:hyperlink w:anchor="_Toc241538510" w:history="1">
+      <w:hyperlink w:anchor="_Toc241538677" w:history="1">
         <w:r>
           <w:rPr>
             <w:rStyle w:val="Hyperlink"/>
@@ -5269,7 +5269,7 @@
             <w:noProof/>
             <w:webHidden/>
           </w:rPr>
-          <w:instrText xml:space="preserve"> PAGEREF _Toc241538510 \h </w:instrText>
+          <w:instrText xml:space="preserve"> PAGEREF _Toc241538677 \h </w:instrText>
         </w:r>
         <w:r>
           <w:rPr>
@@ -5314,7 +5314,7 @@
           <w14:ligatures w14:val="standardContextual"/>
         </w:rPr>
       </w:pPr>
-      <w:hyperlink w:anchor="_Toc241538511" w:history="1">
+      <w:hyperlink w:anchor="_Toc241538678" w:history="1">
         <w:r>
           <w:rPr>
             <w:rStyle w:val="Hyperlink"/>
@@ -5341,7 +5341,7 @@
             <w:noProof/>
             <w:webHidden/>
           </w:rPr>
-          <w:instrText xml:space="preserve"> PAGEREF _Toc241538511 \h </w:instrText>
+          <w:instrText xml:space="preserve"> PAGEREF _Toc241538678 \h </w:instrText>
         </w:r>
         <w:r>
           <w:rPr>
@@ -5386,7 +5386,7 @@
           <w14:ligatures w14:val="standardContextual"/>
         </w:rPr>
       </w:pPr>
-      <w:hyperlink w:anchor="_Toc241538512" w:history="1">
+      <w:hyperlink w:anchor="_Toc241538679" w:history="1">
         <w:r>
           <w:rPr>
             <w:rStyle w:val="Hyperlink"/>
@@ -5413,7 +5413,7 @@
             <w:noProof/>
             <w:webHidden/>
           </w:rPr>
-          <w:instrText xml:space="preserve"> PAGEREF _Toc241538512 \h </w:instrText>
+          <w:instrText xml:space="preserve"> PAGEREF _Toc241538679 \h </w:instrText>
         </w:r>
         <w:r>
           <w:rPr>
@@ -5458,7 +5458,7 @@
           <w14:ligatures w14:val="standardContextual"/>
         </w:rPr>
       </w:pPr>
-      <w:hyperlink w:anchor="_Toc241538513" w:history="1">
+      <w:hyperlink w:anchor="_Toc241538680" w:history="1">
         <w:r>
           <w:rPr>
             <w:rStyle w:val="Hyperlink"/>
@@ -5485,7 +5485,7 @@
             <w:noProof/>
             <w:webHidden/>
           </w:rPr>
-          <w:instrText xml:space="preserve"> PAGEREF _Toc241538513 \h </w:instrText>
+          <w:instrText xml:space="preserve"> PAGEREF _Toc241538680 \h </w:instrText>
         </w:r>
         <w:r>
           <w:rPr>
@@ -5530,7 +5530,7 @@
           <w14:ligatures w14:val="standardContextual"/>
         </w:rPr>
       </w:pPr>
-      <w:hyperlink w:anchor="_Toc241538514" w:history="1">
+      <w:hyperlink w:anchor="_Toc241538681" w:history="1">
         <w:r>
           <w:rPr>
             <w:rStyle w:val="Hyperlink"/>
@@ -5557,7 +5557,7 @@
             <w:noProof/>
             <w:webHidden/>
           </w:rPr>
-          <w:instrText xml:space="preserve"> PAGEREF _Toc241538514 \h </w:instrText>
+          <w:instrText xml:space="preserve"> PAGEREF _Toc241538681 \h </w:instrText>
         </w:r>
         <w:r>
           <w:rPr>
@@ -5600,7 +5600,7 @@
           <w14:ligatures w14:val="standardContextual"/>
         </w:rPr>
       </w:pPr>
-      <w:hyperlink w:anchor="_Toc241538515" w:history="1">
+      <w:hyperlink w:anchor="_Toc241538682" w:history="1">
         <w:r>
           <w:rPr>
             <w:rStyle w:val="Hyperlink"/>
@@ -5623,7 +5623,7 @@
           <w:rPr>
             <w:webHidden/>
           </w:rPr>
-          <w:instrText xml:space="preserve"> PAGEREF _Toc241538515 \h </w:instrText>
+          <w:instrText xml:space="preserve"> PAGEREF _Toc241538682 \h </w:instrText>
         </w:r>
         <w:r>
           <w:rPr>
@@ -5664,7 +5664,7 @@
           <w14:ligatures w14:val="standardContextual"/>
         </w:rPr>
       </w:pPr>
-      <w:hyperlink w:anchor="_Toc241538516" w:history="1">
+      <w:hyperlink w:anchor="_Toc241538683" w:history="1">
         <w:r>
           <w:rPr>
             <w:rStyle w:val="Hyperlink"/>
@@ -5691,7 +5691,7 @@
             <w:noProof/>
             <w:webHidden/>
           </w:rPr>
-          <w:instrText xml:space="preserve"> PAGEREF _Toc241538516 \h </w:instrText>
+          <w:instrText xml:space="preserve"> PAGEREF _Toc241538683 \h </w:instrText>
         </w:r>
         <w:r>
           <w:rPr>
@@ -5736,7 +5736,7 @@
           <w14:ligatures w14:val="standardContextual"/>
         </w:rPr>
       </w:pPr>
-      <w:hyperlink w:anchor="_Toc241538517" w:history="1">
+      <w:hyperlink w:anchor="_Toc241538684" w:history="1">
         <w:r>
           <w:rPr>
             <w:rStyle w:val="Hyperlink"/>
@@ -5763,7 +5763,7 @@
             <w:noProof/>
             <w:webHidden/>
           </w:rPr>
-          <w:instrText xml:space="preserve"> PAGEREF _Toc241538517 \h </w:instrText>
+          <w:instrText xml:space="preserve"> PAGEREF _Toc241538684 \h </w:instrText>
         </w:r>
         <w:r>
           <w:rPr>
@@ -5808,7 +5808,7 @@
           <w14:ligatures w14:val="standardContextual"/>
         </w:rPr>
       </w:pPr>
-      <w:hyperlink w:anchor="_Toc241538518" w:history="1">
+      <w:hyperlink w:anchor="_Toc241538685" w:history="1">
         <w:r>
           <w:rPr>
             <w:rStyle w:val="Hyperlink"/>
@@ -5835,7 +5835,7 @@
             <w:noProof/>
             <w:webHidden/>
           </w:rPr>
-          <w:instrText xml:space="preserve"> PAGEREF _Toc241538518 \h </w:instrText>
+          <w:instrText xml:space="preserve"> PAGEREF _Toc241538685 \h </w:instrText>
         </w:r>
         <w:r>
           <w:rPr>
@@ -5880,7 +5880,7 @@
           <w14:ligatures w14:val="standardContextual"/>
         </w:rPr>
       </w:pPr>
-      <w:hyperlink w:anchor="_Toc241538519" w:history="1">
+      <w:hyperlink w:anchor="_Toc241538686" w:history="1">
         <w:r>
           <w:rPr>
             <w:rStyle w:val="Hyperlink"/>
@@ -5907,7 +5907,7 @@
             <w:noProof/>
             <w:webHidden/>
           </w:rPr>
-          <w:instrText xml:space="preserve"> PAGEREF _Toc241538519 \h </w:instrText>
+          <w:instrText xml:space="preserve"> PAGEREF _Toc241538686 \h </w:instrText>
         </w:r>
         <w:r>
           <w:rPr>
@@ -5952,7 +5952,7 @@
           <w14:ligatures w14:val="standardContextual"/>
         </w:rPr>
       </w:pPr>
-      <w:hyperlink w:anchor="_Toc241538520" w:history="1">
+      <w:hyperlink w:anchor="_Toc241538687" w:history="1">
         <w:r>
           <w:rPr>
             <w:rStyle w:val="Hyperlink"/>
@@ -5979,7 +5979,7 @@
             <w:noProof/>
             <w:webHidden/>
           </w:rPr>
-          <w:instrText xml:space="preserve"> PAGEREF _Toc241538520 \h </w:instrText>
+          <w:instrText xml:space="preserve"> PAGEREF _Toc241538687 \h </w:instrText>
         </w:r>
         <w:r>
           <w:rPr>
@@ -6024,7 +6024,7 @@
           <w14:ligatures w14:val="standardContextual"/>
         </w:rPr>
       </w:pPr>
-      <w:hyperlink w:anchor="_Toc241538521" w:history="1">
+      <w:hyperlink w:anchor="_Toc241538688" w:history="1">
         <w:r>
           <w:rPr>
             <w:rStyle w:val="Hyperlink"/>
@@ -6051,7 +6051,7 @@
             <w:noProof/>
             <w:webHidden/>
           </w:rPr>
-          <w:instrText xml:space="preserve"> PAGEREF _Toc241538521 \h </w:instrText>
+          <w:instrText xml:space="preserve"> PAGEREF _Toc241538688 \h </w:instrText>
         </w:r>
         <w:r>
           <w:rPr>
@@ -6096,7 +6096,7 @@
           <w14:ligatures w14:val="standardContextual"/>
         </w:rPr>
       </w:pPr>
-      <w:hyperlink w:anchor="_Toc241538522" w:history="1">
+      <w:hyperlink w:anchor="_Toc241538689" w:history="1">
         <w:r>
           <w:rPr>
             <w:rStyle w:val="Hyperlink"/>
@@ -6123,7 +6123,7 @@
             <w:noProof/>
             <w:webHidden/>
           </w:rPr>
-          <w:instrText xml:space="preserve"> PAGEREF _Toc241538522 \h </w:instrText>
+          <w:instrText xml:space="preserve"> PAGEREF _Toc241538689 \h </w:instrText>
         </w:r>
         <w:r>
           <w:rPr>
@@ -6168,7 +6168,7 @@
           <w14:ligatures w14:val="standardContextual"/>
         </w:rPr>
       </w:pPr>
-      <w:hyperlink w:anchor="_Toc241538523" w:history="1">
+      <w:hyperlink w:anchor="_Toc241538690" w:history="1">
         <w:r>
           <w:rPr>
             <w:rStyle w:val="Hyperlink"/>
@@ -6195,7 +6195,7 @@
             <w:noProof/>
             <w:webHidden/>
           </w:rPr>
-          <w:instrText xml:space="preserve"> PAGEREF _Toc241538523 \h </w:instrText>
+          <w:instrText xml:space="preserve"> PAGEREF _Toc241538690 \h </w:instrText>
         </w:r>
         <w:r>
           <w:rPr>
@@ -6240,7 +6240,7 @@
           <w14:ligatures w14:val="standardContextual"/>
         </w:rPr>
       </w:pPr>
-      <w:hyperlink w:anchor="_Toc241538524" w:history="1">
+      <w:hyperlink w:anchor="_Toc241538691" w:history="1">
         <w:r>
           <w:rPr>
             <w:rStyle w:val="Hyperlink"/>
@@ -6267,7 +6267,7 @@
             <w:noProof/>
             <w:webHidden/>
           </w:rPr>
-          <w:instrText xml:space="preserve"> PAGEREF _Toc241538524 \h </w:instrText>
+          <w:instrText xml:space="preserve"> PAGEREF _Toc241538691 \h </w:instrText>
         </w:r>
         <w:r>
           <w:rPr>
@@ -6312,7 +6312,7 @@
           <w14:ligatures w14:val="standardContextual"/>
         </w:rPr>
       </w:pPr>
-      <w:hyperlink w:anchor="_Toc241538525" w:history="1">
+      <w:hyperlink w:anchor="_Toc241538692" w:history="1">
         <w:r>
           <w:rPr>
             <w:rStyle w:val="Hyperlink"/>
@@ -6339,7 +6339,7 @@
             <w:noProof/>
             <w:webHidden/>
           </w:rPr>
-          <w:instrText xml:space="preserve"> PAGEREF _Toc241538525 \h </w:instrText>
+          <w:instrText xml:space="preserve"> PAGEREF _Toc241538692 \h </w:instrText>
         </w:r>
         <w:r>
           <w:rPr>
@@ -6382,7 +6382,7 @@
           <w14:ligatures w14:val="standardContextual"/>
         </w:rPr>
       </w:pPr>
-      <w:hyperlink w:anchor="_Toc241538526" w:history="1">
+      <w:hyperlink w:anchor="_Toc241538693" w:history="1">
         <w:r>
           <w:rPr>
             <w:rStyle w:val="Hyperlink"/>
@@ -6405,7 +6405,7 @@
           <w:rPr>
             <w:webHidden/>
           </w:rPr>
-          <w:instrText xml:space="preserve"> PAGEREF _Toc241538526 \h </w:instrText>
+          <w:instrText xml:space="preserve"> PAGEREF _Toc241538693 \h </w:instrText>
         </w:r>
         <w:r>
           <w:rPr>
@@ -6446,7 +6446,7 @@
           <w14:ligatures w14:val="standardContextual"/>
         </w:rPr>
       </w:pPr>
-      <w:hyperlink w:anchor="_Toc241538527" w:history="1">
+      <w:hyperlink w:anchor="_Toc241538694" w:history="1">
         <w:r>
           <w:rPr>
             <w:rStyle w:val="Hyperlink"/>
@@ -6473,7 +6473,7 @@
             <w:noProof/>
             <w:webHidden/>
           </w:rPr>
-          <w:instrText xml:space="preserve"> PAGEREF _Toc241538527 \h </w:instrText>
+          <w:instrText xml:space="preserve"> PAGEREF _Toc241538694 \h </w:instrText>
         </w:r>
         <w:r>
           <w:rPr>
@@ -6518,7 +6518,7 @@
           <w14:ligatures w14:val="standardContextual"/>
         </w:rPr>
       </w:pPr>
-      <w:hyperlink w:anchor="_Toc241538528" w:history="1">
+      <w:hyperlink w:anchor="_Toc241538695" w:history="1">
         <w:r>
           <w:rPr>
             <w:rStyle w:val="Hyperlink"/>
@@ -6545,7 +6545,7 @@
             <w:noProof/>
             <w:webHidden/>
           </w:rPr>
-          <w:instrText xml:space="preserve"> PAGEREF _Toc241538528 \h </w:instrText>
+          <w:instrText xml:space="preserve"> PAGEREF _Toc241538695 \h </w:instrText>
         </w:r>
         <w:r>
           <w:rPr>
@@ -6590,7 +6590,7 @@
           <w14:ligatures w14:val="standardContextual"/>
         </w:rPr>
       </w:pPr>
-      <w:hyperlink w:anchor="_Toc241538529" w:history="1">
+      <w:hyperlink w:anchor="_Toc241538696" w:history="1">
         <w:r>
           <w:rPr>
             <w:rStyle w:val="Hyperlink"/>
@@ -6617,7 +6617,7 @@
             <w:noProof/>
             <w:webHidden/>
           </w:rPr>
-          <w:instrText xml:space="preserve"> PAGEREF _Toc241538529 \h </w:instrText>
+          <w:instrText xml:space="preserve"> PAGEREF _Toc241538696 \h </w:instrText>
         </w:r>
         <w:r>
           <w:rPr>
@@ -6662,7 +6662,7 @@
           <w14:ligatures w14:val="standardContextual"/>
         </w:rPr>
       </w:pPr>
-      <w:hyperlink w:anchor="_Toc241538530" w:history="1">
+      <w:hyperlink w:anchor="_Toc241538697" w:history="1">
         <w:r>
           <w:rPr>
             <w:rStyle w:val="Hyperlink"/>
@@ -6689,7 +6689,7 @@
             <w:noProof/>
             <w:webHidden/>
           </w:rPr>
-          <w:instrText xml:space="preserve"> PAGEREF _Toc241538530 \h </w:instrText>
+          <w:instrText xml:space="preserve"> PAGEREF _Toc241538697 \h </w:instrText>
         </w:r>
         <w:r>
           <w:rPr>
@@ -6734,7 +6734,7 @@
           <w14:ligatures w14:val="standardContextual"/>
         </w:rPr>
       </w:pPr>
-      <w:hyperlink w:anchor="_Toc241538531" w:history="1">
+      <w:hyperlink w:anchor="_Toc241538698" w:history="1">
         <w:r>
           <w:rPr>
             <w:rStyle w:val="Hyperlink"/>
@@ -6761,7 +6761,7 @@
             <w:noProof/>
             <w:webHidden/>
           </w:rPr>
-          <w:instrText xml:space="preserve"> PAGEREF _Toc241538531 \h </w:instrText>
+          <w:instrText xml:space="preserve"> PAGEREF _Toc241538698 \h </w:instrText>
         </w:r>
         <w:r>
           <w:rPr>
@@ -6806,7 +6806,7 @@
           <w14:ligatures w14:val="standardContextual"/>
         </w:rPr>
       </w:pPr>
-      <w:hyperlink w:anchor="_Toc241538532" w:history="1">
+      <w:hyperlink w:anchor="_Toc241538699" w:history="1">
         <w:r>
           <w:rPr>
             <w:rStyle w:val="Hyperlink"/>
@@ -6833,7 +6833,7 @@
             <w:noProof/>
             <w:webHidden/>
           </w:rPr>
-          <w:instrText xml:space="preserve"> PAGEREF _Toc241538532 \h </w:instrText>
+          <w:instrText xml:space="preserve"> PAGEREF _Toc241538699 \h </w:instrText>
         </w:r>
         <w:r>
           <w:rPr>
@@ -6878,7 +6878,7 @@
           <w14:ligatures w14:val="standardContextual"/>
         </w:rPr>
       </w:pPr>
-      <w:hyperlink w:anchor="_Toc241538533" w:history="1">
+      <w:hyperlink w:anchor="_Toc241538700" w:history="1">
         <w:r>
           <w:rPr>
             <w:rStyle w:val="Hyperlink"/>
@@ -6905,7 +6905,7 @@
             <w:noProof/>
             <w:webHidden/>
           </w:rPr>
-          <w:instrText xml:space="preserve"> PAGEREF _Toc241538533 \h </w:instrText>
+          <w:instrText xml:space="preserve"> PAGEREF _Toc241538700 \h </w:instrText>
         </w:r>
         <w:r>
           <w:rPr>
@@ -6950,7 +6950,7 @@
           <w14:ligatures w14:val="standardContextual"/>
         </w:rPr>
       </w:pPr>
-      <w:hyperlink w:anchor="_Toc241538534" w:history="1">
+      <w:hyperlink w:anchor="_Toc241538701" w:history="1">
         <w:r>
           <w:rPr>
             <w:rStyle w:val="Hyperlink"/>
@@ -6977,7 +6977,7 @@
             <w:noProof/>
             <w:webHidden/>
           </w:rPr>
-          <w:instrText xml:space="preserve"> PAGEREF _Toc241538534 \h </w:instrText>
+          <w:instrText xml:space="preserve"> PAGEREF _Toc241538701 \h </w:instrText>
         </w:r>
         <w:r>
           <w:rPr>
@@ -7020,7 +7020,7 @@
           <w14:ligatures w14:val="standardContextual"/>
         </w:rPr>
       </w:pPr>
-      <w:hyperlink w:anchor="_Toc241538535" w:history="1">
+      <w:hyperlink w:anchor="_Toc241538702" w:history="1">
         <w:r>
           <w:rPr>
             <w:rStyle w:val="Hyperlink"/>
@@ -7043,7 +7043,7 @@
           <w:rPr>
             <w:webHidden/>
           </w:rPr>
-          <w:instrText xml:space="preserve"> PAGEREF _Toc241538535 \h </w:instrText>
+          <w:instrText xml:space="preserve"> PAGEREF _Toc241538702 \h </w:instrText>
         </w:r>
         <w:r>
           <w:rPr>
@@ -7084,7 +7084,7 @@
           <w14:ligatures w14:val="standardContextual"/>
         </w:rPr>
       </w:pPr>
-      <w:hyperlink w:anchor="_Toc241538536" w:history="1">
+      <w:hyperlink w:anchor="_Toc241538703" w:history="1">
         <w:r>
           <w:rPr>
             <w:rStyle w:val="Hyperlink"/>
@@ -7111,7 +7111,7 @@
             <w:noProof/>
             <w:webHidden/>
           </w:rPr>
-          <w:instrText xml:space="preserve"> PAGEREF _Toc241538536 \h </w:instrText>
+          <w:instrText xml:space="preserve"> PAGEREF _Toc241538703 \h </w:instrText>
         </w:r>
         <w:r>
           <w:rPr>
@@ -7156,7 +7156,7 @@
           <w14:ligatures w14:val="standardContextual"/>
         </w:rPr>
       </w:pPr>
-      <w:hyperlink w:anchor="_Toc241538537" w:history="1">
+      <w:hyperlink w:anchor="_Toc241538704" w:history="1">
         <w:r>
           <w:rPr>
             <w:rStyle w:val="Hyperlink"/>
@@ -7183,7 +7183,7 @@
             <w:noProof/>
             <w:webHidden/>
           </w:rPr>
-          <w:instrText xml:space="preserve"> PAGEREF _Toc241538537 \h </w:instrText>
+          <w:instrText xml:space="preserve"> PAGEREF _Toc241538704 \h </w:instrText>
         </w:r>
         <w:r>
           <w:rPr>
@@ -7226,7 +7226,7 @@
           <w14:ligatures w14:val="standardContextual"/>
         </w:rPr>
       </w:pPr>
-      <w:hyperlink w:anchor="_Toc241538538" w:history="1">
+      <w:hyperlink w:anchor="_Toc241538705" w:history="1">
         <w:r>
           <w:rPr>
             <w:rStyle w:val="Hyperlink"/>
@@ -7249,7 +7249,7 @@
           <w:rPr>
             <w:webHidden/>
           </w:rPr>
-          <w:instrText xml:space="preserve"> PAGEREF _Toc241538538 \h </w:instrText>
+          <w:instrText xml:space="preserve"> PAGEREF _Toc241538705 \h </w:instrText>
         </w:r>
         <w:r>
           <w:rPr>
@@ -7288,7 +7288,7 @@
           <w14:ligatures w14:val="standardContextual"/>
         </w:rPr>
       </w:pPr>
-      <w:hyperlink w:anchor="_Toc241538539" w:history="1">
+      <w:hyperlink w:anchor="_Toc241538706" w:history="1">
         <w:r>
           <w:rPr>
             <w:rStyle w:val="Hyperlink"/>
@@ -7311,7 +7311,7 @@
           <w:rPr>
             <w:webHidden/>
           </w:rPr>
-          <w:instrText xml:space="preserve"> PAGEREF _Toc241538539 \h </w:instrText>
+          <w:instrText xml:space="preserve"> PAGEREF _Toc241538706 \h </w:instrText>
         </w:r>
         <w:r>
           <w:rPr>
@@ -7352,7 +7352,7 @@
           <w14:ligatures w14:val="standardContextual"/>
         </w:rPr>
       </w:pPr>
-      <w:hyperlink w:anchor="_Toc241538540" w:history="1">
+      <w:hyperlink w:anchor="_Toc241538707" w:history="1">
         <w:r>
           <w:rPr>
             <w:rStyle w:val="Hyperlink"/>
@@ -7379,7 +7379,7 @@
             <w:noProof/>
             <w:webHidden/>
           </w:rPr>
-          <w:instrText xml:space="preserve"> PAGEREF _Toc241538540 \h </w:instrText>
+          <w:instrText xml:space="preserve"> PAGEREF _Toc241538707 \h </w:instrText>
         </w:r>
         <w:r>
           <w:rPr>
@@ -7424,7 +7424,7 @@
           <w14:ligatures w14:val="standardContextual"/>
         </w:rPr>
       </w:pPr>
-      <w:hyperlink w:anchor="_Toc241538541" w:history="1">
+      <w:hyperlink w:anchor="_Toc241538708" w:history="1">
         <w:r>
           <w:rPr>
             <w:rStyle w:val="Hyperlink"/>
@@ -7451,7 +7451,7 @@
             <w:noProof/>
             <w:webHidden/>
           </w:rPr>
-          <w:instrText xml:space="preserve"> PAGEREF _Toc241538541 \h </w:instrText>
+          <w:instrText xml:space="preserve"> PAGEREF _Toc241538708 \h </w:instrText>
         </w:r>
         <w:r>
           <w:rPr>
@@ -7496,7 +7496,7 @@
           <w14:ligatures w14:val="standardContextual"/>
         </w:rPr>
       </w:pPr>
-      <w:hyperlink w:anchor="_Toc241538542" w:history="1">
+      <w:hyperlink w:anchor="_Toc241538709" w:history="1">
         <w:r>
           <w:rPr>
             <w:rStyle w:val="Hyperlink"/>
@@ -7523,7 +7523,7 @@
             <w:noProof/>
             <w:webHidden/>
           </w:rPr>
-          <w:instrText xml:space="preserve"> PAGEREF _Toc241538542 \h </w:instrText>
+          <w:instrText xml:space="preserve"> PAGEREF _Toc241538709 \h </w:instrText>
         </w:r>
         <w:r>
           <w:rPr>
@@ -7568,7 +7568,7 @@
           <w14:ligatures w14:val="standardContextual"/>
         </w:rPr>
       </w:pPr>
-      <w:hyperlink w:anchor="_Toc241538543" w:history="1">
+      <w:hyperlink w:anchor="_Toc241538710" w:history="1">
         <w:r>
           <w:rPr>
             <w:rStyle w:val="Hyperlink"/>
@@ -7595,7 +7595,7 @@
             <w:noProof/>
             <w:webHidden/>
           </w:rPr>
-          <w:instrText xml:space="preserve"> PAGEREF _Toc241538543 \h </w:instrText>
+          <w:instrText xml:space="preserve"> PAGEREF _Toc241538710 \h </w:instrText>
         </w:r>
         <w:r>
           <w:rPr>
@@ -7640,7 +7640,7 @@
           <w14:ligatures w14:val="standardContextual"/>
         </w:rPr>
       </w:pPr>
-      <w:hyperlink w:anchor="_Toc241538544" w:history="1">
+      <w:hyperlink w:anchor="_Toc241538711" w:history="1">
         <w:r>
           <w:rPr>
             <w:rStyle w:val="Hyperlink"/>
@@ -7667,7 +7667,7 @@
             <w:noProof/>
             <w:webHidden/>
           </w:rPr>
-          <w:instrText xml:space="preserve"> PAGEREF _Toc241538544 \h </w:instrText>
+          <w:instrText xml:space="preserve"> PAGEREF _Toc241538711 \h </w:instrText>
         </w:r>
         <w:r>
           <w:rPr>
@@ -7712,7 +7712,7 @@
           <w14:ligatures w14:val="standardContextual"/>
         </w:rPr>
       </w:pPr>
-      <w:hyperlink w:anchor="_Toc241538545" w:history="1">
+      <w:hyperlink w:anchor="_Toc241538712" w:history="1">
         <w:r>
           <w:rPr>
             <w:rStyle w:val="Hyperlink"/>
@@ -7739,7 +7739,7 @@
             <w:noProof/>
             <w:webHidden/>
           </w:rPr>
-          <w:instrText xml:space="preserve"> PAGEREF _Toc241538545 \h </w:instrText>
+          <w:instrText xml:space="preserve"> PAGEREF _Toc241538712 \h </w:instrText>
         </w:r>
         <w:r>
           <w:rPr>
@@ -7784,7 +7784,7 @@
           <w14:ligatures w14:val="standardContextual"/>
         </w:rPr>
       </w:pPr>
-      <w:hyperlink w:anchor="_Toc241538546" w:history="1">
+      <w:hyperlink w:anchor="_Toc241538713" w:history="1">
         <w:r>
           <w:rPr>
             <w:rStyle w:val="Hyperlink"/>
@@ -7811,7 +7811,7 @@
             <w:noProof/>
             <w:webHidden/>
           </w:rPr>
-          <w:instrText xml:space="preserve"> PAGEREF _Toc241538546 \h </w:instrText>
+          <w:instrText xml:space="preserve"> PAGEREF _Toc241538713 \h </w:instrText>
         </w:r>
         <w:r>
           <w:rPr>
@@ -7856,7 +7856,7 @@
           <w14:ligatures w14:val="standardContextual"/>
         </w:rPr>
       </w:pPr>
-      <w:hyperlink w:anchor="_Toc241538547" w:history="1">
+      <w:hyperlink w:anchor="_Toc241538714" w:history="1">
         <w:r>
           <w:rPr>
             <w:rStyle w:val="Hyperlink"/>
@@ -7883,7 +7883,7 @@
             <w:noProof/>
             <w:webHidden/>
           </w:rPr>
-          <w:instrText xml:space="preserve"> PAGEREF _Toc241538547 \h </w:instrText>
+          <w:instrText xml:space="preserve"> PAGEREF _Toc241538714 \h </w:instrText>
         </w:r>
         <w:r>
           <w:rPr>
@@ -7928,7 +7928,7 @@
           <w14:ligatures w14:val="standardContextual"/>
         </w:rPr>
       </w:pPr>
-      <w:hyperlink w:anchor="_Toc241538548" w:history="1">
+      <w:hyperlink w:anchor="_Toc241538715" w:history="1">
         <w:r>
           <w:rPr>
             <w:rStyle w:val="Hyperlink"/>
@@ -7955,7 +7955,7 @@
             <w:noProof/>
             <w:webHidden/>
           </w:rPr>
-          <w:instrText xml:space="preserve"> PAGEREF _Toc241538548 \h </w:instrText>
+          <w:instrText xml:space="preserve"> PAGEREF _Toc241538715 \h </w:instrText>
         </w:r>
         <w:r>
           <w:rPr>
@@ -8000,7 +8000,7 @@
           <w14:ligatures w14:val="standardContextual"/>
         </w:rPr>
       </w:pPr>
-      <w:hyperlink w:anchor="_Toc241538549" w:history="1">
+      <w:hyperlink w:anchor="_Toc241538716" w:history="1">
         <w:r>
           <w:rPr>
             <w:rStyle w:val="Hyperlink"/>
@@ -8027,7 +8027,7 @@
             <w:noProof/>
             <w:webHidden/>
           </w:rPr>
-          <w:instrText xml:space="preserve"> PAGEREF _Toc241538549 \h </w:instrText>
+          <w:instrText xml:space="preserve"> PAGEREF _Toc241538716 \h </w:instrText>
         </w:r>
         <w:r>
           <w:rPr>
@@ -8072,7 +8072,7 @@
           <w14:ligatures w14:val="standardContextual"/>
         </w:rPr>
       </w:pPr>
-      <w:hyperlink w:anchor="_Toc241538550" w:history="1">
+      <w:hyperlink w:anchor="_Toc241538717" w:history="1">
         <w:r>
           <w:rPr>
             <w:rStyle w:val="Hyperlink"/>
@@ -8099,7 +8099,7 @@
             <w:noProof/>
             <w:webHidden/>
           </w:rPr>
-          <w:instrText xml:space="preserve"> PAGEREF _Toc241538550 \h </w:instrText>
+          <w:instrText xml:space="preserve"> PAGEREF _Toc241538717 \h </w:instrText>
         </w:r>
         <w:r>
           <w:rPr>
@@ -8144,7 +8144,7 @@
           <w14:ligatures w14:val="standardContextual"/>
         </w:rPr>
       </w:pPr>
-      <w:hyperlink w:anchor="_Toc241538551" w:history="1">
+      <w:hyperlink w:anchor="_Toc241538718" w:history="1">
         <w:r>
           <w:rPr>
             <w:rStyle w:val="Hyperlink"/>
@@ -8171,7 +8171,7 @@
             <w:noProof/>
             <w:webHidden/>
           </w:rPr>
-          <w:instrText xml:space="preserve"> PAGEREF _Toc241538551 \h </w:instrText>
+          <w:instrText xml:space="preserve"> PAGEREF _Toc241538718 \h </w:instrText>
         </w:r>
         <w:r>
           <w:rPr>
@@ -8216,7 +8216,7 @@
           <w14:ligatures w14:val="standardContextual"/>
         </w:rPr>
       </w:pPr>
-      <w:hyperlink w:anchor="_Toc241538552" w:history="1">
+      <w:hyperlink w:anchor="_Toc241538719" w:history="1">
         <w:r>
           <w:rPr>
             <w:rStyle w:val="Hyperlink"/>
@@ -8243,7 +8243,7 @@
             <w:noProof/>
             <w:webHidden/>
           </w:rPr>
-          <w:instrText xml:space="preserve"> PAGEREF _Toc241538552 \h </w:instrText>
+          <w:instrText xml:space="preserve"> PAGEREF _Toc241538719 \h </w:instrText>
         </w:r>
         <w:r>
           <w:rPr>
@@ -8288,7 +8288,7 @@
           <w14:ligatures w14:val="standardContextual"/>
         </w:rPr>
       </w:pPr>
-      <w:hyperlink w:anchor="_Toc241538553" w:history="1">
+      <w:hyperlink w:anchor="_Toc241538720" w:history="1">
         <w:r>
           <w:rPr>
             <w:rStyle w:val="Hyperlink"/>
@@ -8315,7 +8315,7 @@
             <w:noProof/>
             <w:webHidden/>
           </w:rPr>
-          <w:instrText xml:space="preserve"> PAGEREF _Toc241538553 \h </w:instrText>
+          <w:instrText xml:space="preserve"> PAGEREF _Toc241538720 \h </w:instrText>
         </w:r>
         <w:r>
           <w:rPr>
@@ -8360,7 +8360,7 @@
           <w14:ligatures w14:val="standardContextual"/>
         </w:rPr>
       </w:pPr>
-      <w:hyperlink w:anchor="_Toc241538554" w:history="1">
+      <w:hyperlink w:anchor="_Toc241538721" w:history="1">
         <w:r>
           <w:rPr>
             <w:rStyle w:val="Hyperlink"/>
@@ -8387,7 +8387,7 @@
             <w:noProof/>
             <w:webHidden/>
           </w:rPr>
-          <w:instrText xml:space="preserve"> PAGEREF _Toc241538554 \h </w:instrText>
+          <w:instrText xml:space="preserve"> PAGEREF _Toc241538721 \h </w:instrText>
         </w:r>
         <w:r>
           <w:rPr>
@@ -8432,7 +8432,7 @@
           <w14:ligatures w14:val="standardContextual"/>
         </w:rPr>
       </w:pPr>
-      <w:hyperlink w:anchor="_Toc241538555" w:history="1">
+      <w:hyperlink w:anchor="_Toc241538722" w:history="1">
         <w:r>
           <w:rPr>
             <w:rStyle w:val="Hyperlink"/>
@@ -8459,7 +8459,7 @@
             <w:noProof/>
             <w:webHidden/>
           </w:rPr>
-          <w:instrText xml:space="preserve"> PAGEREF _Toc241538555 \h </w:instrText>
+          <w:instrText xml:space="preserve"> PAGEREF _Toc241538722 \h </w:instrText>
         </w:r>
         <w:r>
           <w:rPr>
@@ -8504,7 +8504,7 @@
           <w14:ligatures w14:val="standardContextual"/>
         </w:rPr>
       </w:pPr>
-      <w:hyperlink w:anchor="_Toc241538556" w:history="1">
+      <w:hyperlink w:anchor="_Toc241538723" w:history="1">
         <w:r>
           <w:rPr>
             <w:rStyle w:val="Hyperlink"/>
@@ -8531,7 +8531,7 @@
             <w:noProof/>
             <w:webHidden/>
           </w:rPr>
-          <w:instrText xml:space="preserve"> PAGEREF _Toc241538556 \h </w:instrText>
+          <w:instrText xml:space="preserve"> PAGEREF _Toc241538723 \h </w:instrText>
         </w:r>
         <w:r>
           <w:rPr>
@@ -8576,7 +8576,7 @@
           <w14:ligatures w14:val="standardContextual"/>
         </w:rPr>
       </w:pPr>
-      <w:hyperlink w:anchor="_Toc241538557" w:history="1">
+      <w:hyperlink w:anchor="_Toc241538724" w:history="1">
         <w:r>
           <w:rPr>
             <w:rStyle w:val="Hyperlink"/>
@@ -8603,7 +8603,7 @@
             <w:noProof/>
             <w:webHidden/>
           </w:rPr>
-          <w:instrText xml:space="preserve"> PAGEREF _Toc241538557 \h </w:instrText>
+          <w:instrText xml:space="preserve"> PAGEREF _Toc241538724 \h </w:instrText>
         </w:r>
         <w:r>
           <w:rPr>
@@ -8648,7 +8648,7 @@
           <w14:ligatures w14:val="standardContextual"/>
         </w:rPr>
       </w:pPr>
-      <w:hyperlink w:anchor="_Toc241538558" w:history="1">
+      <w:hyperlink w:anchor="_Toc241538725" w:history="1">
         <w:r>
           <w:rPr>
             <w:rStyle w:val="Hyperlink"/>
@@ -8675,7 +8675,7 @@
             <w:noProof/>
             <w:webHidden/>
           </w:rPr>
-          <w:instrText xml:space="preserve"> PAGEREF _Toc241538558 \h </w:instrText>
+          <w:instrText xml:space="preserve"> PAGEREF _Toc241538725 \h </w:instrText>
         </w:r>
         <w:r>
           <w:rPr>
@@ -8720,7 +8720,7 @@
           <w14:ligatures w14:val="standardContextual"/>
         </w:rPr>
       </w:pPr>
-      <w:hyperlink w:anchor="_Toc241538559" w:history="1">
+      <w:hyperlink w:anchor="_Toc241538726" w:history="1">
         <w:r>
           <w:rPr>
             <w:rStyle w:val="Hyperlink"/>
@@ -8747,7 +8747,7 @@
             <w:noProof/>
             <w:webHidden/>
           </w:rPr>
-          <w:instrText xml:space="preserve"> PAGEREF _Toc241538559 \h </w:instrText>
+          <w:instrText xml:space="preserve"> PAGEREF _Toc241538726 \h </w:instrText>
         </w:r>
         <w:r>
           <w:rPr>
@@ -8792,7 +8792,7 @@
           <w14:ligatures w14:val="standardContextual"/>
         </w:rPr>
       </w:pPr>
-      <w:hyperlink w:anchor="_Toc241538560" w:history="1">
+      <w:hyperlink w:anchor="_Toc241538727" w:history="1">
         <w:r>
           <w:rPr>
             <w:rStyle w:val="Hyperlink"/>
@@ -8819,7 +8819,7 @@
             <w:noProof/>
             <w:webHidden/>
           </w:rPr>
-          <w:instrText xml:space="preserve"> PAGEREF _Toc241538560 \h </w:instrText>
+          <w:instrText xml:space="preserve"> PAGEREF _Toc241538727 \h </w:instrText>
         </w:r>
         <w:r>
           <w:rPr>
@@ -8864,7 +8864,7 @@
           <w14:ligatures w14:val="standardContextual"/>
         </w:rPr>
       </w:pPr>
-      <w:hyperlink w:anchor="_Toc241538561" w:history="1">
+      <w:hyperlink w:anchor="_Toc241538728" w:history="1">
         <w:r>
           <w:rPr>
             <w:rStyle w:val="Hyperlink"/>
@@ -8891,7 +8891,7 @@
             <w:noProof/>
             <w:webHidden/>
           </w:rPr>
-          <w:instrText xml:space="preserve"> PAGEREF _Toc241538561 \h </w:instrText>
+          <w:instrText xml:space="preserve"> PAGEREF _Toc241538728 \h </w:instrText>
         </w:r>
         <w:r>
           <w:rPr>
@@ -8936,7 +8936,7 @@
           <w14:ligatures w14:val="standardContextual"/>
         </w:rPr>
       </w:pPr>
-      <w:hyperlink w:anchor="_Toc241538562" w:history="1">
+      <w:hyperlink w:anchor="_Toc241538729" w:history="1">
         <w:r>
           <w:rPr>
             <w:rStyle w:val="Hyperlink"/>
@@ -8963,7 +8963,7 @@
             <w:noProof/>
             <w:webHidden/>
           </w:rPr>
-          <w:instrText xml:space="preserve"> PAGEREF _Toc241538562 \h </w:instrText>
+          <w:instrText xml:space="preserve"> PAGEREF _Toc241538729 \h </w:instrText>
         </w:r>
         <w:r>
           <w:rPr>
@@ -9008,7 +9008,7 @@
           <w14:ligatures w14:val="standardContextual"/>
         </w:rPr>
       </w:pPr>
-      <w:hyperlink w:anchor="_Toc241538563" w:history="1">
+      <w:hyperlink w:anchor="_Toc241538730" w:history="1">
         <w:r>
           <w:rPr>
             <w:rStyle w:val="Hyperlink"/>
@@ -9035,7 +9035,7 @@
             <w:noProof/>
             <w:webHidden/>
           </w:rPr>
-          <w:instrText xml:space="preserve"> PAGEREF _Toc241538563 \h </w:instrText>
+          <w:instrText xml:space="preserve"> PAGEREF _Toc241538730 \h </w:instrText>
         </w:r>
         <w:r>
           <w:rPr>
@@ -9080,7 +9080,7 @@
           <w14:ligatures w14:val="standardContextual"/>
         </w:rPr>
       </w:pPr>
-      <w:hyperlink w:anchor="_Toc241538564" w:history="1">
+      <w:hyperlink w:anchor="_Toc241538731" w:history="1">
         <w:r>
           <w:rPr>
             <w:rStyle w:val="Hyperlink"/>
@@ -9107,7 +9107,7 @@
             <w:noProof/>
             <w:webHidden/>
           </w:rPr>
-          <w:instrText xml:space="preserve"> PAGEREF _Toc241538564 \h </w:instrText>
+          <w:instrText xml:space="preserve"> PAGEREF _Toc241538731 \h </w:instrText>
         </w:r>
         <w:r>
           <w:rPr>
@@ -9152,7 +9152,7 @@
           <w14:ligatures w14:val="standardContextual"/>
         </w:rPr>
       </w:pPr>
-      <w:hyperlink w:anchor="_Toc241538565" w:history="1">
+      <w:hyperlink w:anchor="_Toc241538732" w:history="1">
         <w:r>
           <w:rPr>
             <w:rStyle w:val="Hyperlink"/>
@@ -9179,7 +9179,7 @@
             <w:noProof/>
             <w:webHidden/>
           </w:rPr>
-          <w:instrText xml:space="preserve"> PAGEREF _Toc241538565 \h </w:instrText>
+          <w:instrText xml:space="preserve"> PAGEREF _Toc241538732 \h </w:instrText>
         </w:r>
         <w:r>
           <w:rPr>
@@ -9224,7 +9224,7 @@
           <w14:ligatures w14:val="standardContextual"/>
         </w:rPr>
       </w:pPr>
-      <w:hyperlink w:anchor="_Toc241538566" w:history="1">
+      <w:hyperlink w:anchor="_Toc241538733" w:history="1">
         <w:r>
           <w:rPr>
             <w:rStyle w:val="Hyperlink"/>
@@ -9251,7 +9251,7 @@
             <w:noProof/>
             <w:webHidden/>
           </w:rPr>
-          <w:instrText xml:space="preserve"> PAGEREF _Toc241538566 \h </w:instrText>
+          <w:instrText xml:space="preserve"> PAGEREF _Toc241538733 \h </w:instrText>
         </w:r>
         <w:r>
           <w:rPr>
@@ -9296,7 +9296,7 @@
           <w14:ligatures w14:val="standardContextual"/>
         </w:rPr>
       </w:pPr>
-      <w:hyperlink w:anchor="_Toc241538567" w:history="1">
+      <w:hyperlink w:anchor="_Toc241538734" w:history="1">
         <w:r>
           <w:rPr>
             <w:rStyle w:val="Hyperlink"/>
@@ -9323,7 +9323,7 @@
             <w:noProof/>
             <w:webHidden/>
           </w:rPr>
-          <w:instrText xml:space="preserve"> PAGEREF _Toc241538567 \h </w:instrText>
+          <w:instrText xml:space="preserve"> PAGEREF _Toc241538734 \h </w:instrText>
         </w:r>
         <w:r>
           <w:rPr>
@@ -9368,7 +9368,7 @@
           <w14:ligatures w14:val="standardContextual"/>
         </w:rPr>
       </w:pPr>
-      <w:hyperlink w:anchor="_Toc241538568" w:history="1">
+      <w:hyperlink w:anchor="_Toc241538735" w:history="1">
         <w:r>
           <w:rPr>
             <w:rStyle w:val="Hyperlink"/>
@@ -9395,7 +9395,7 @@
             <w:noProof/>
             <w:webHidden/>
           </w:rPr>
-          <w:instrText xml:space="preserve"> PAGEREF _Toc241538568 \h </w:instrText>
+          <w:instrText xml:space="preserve"> PAGEREF _Toc241538735 \h </w:instrText>
         </w:r>
         <w:r>
           <w:rPr>
@@ -9440,7 +9440,7 @@
           <w14:ligatures w14:val="standardContextual"/>
         </w:rPr>
       </w:pPr>
-      <w:hyperlink w:anchor="_Toc241538569" w:history="1">
+      <w:hyperlink w:anchor="_Toc241538736" w:history="1">
         <w:r>
           <w:rPr>
             <w:rStyle w:val="Hyperlink"/>
@@ -9467,7 +9467,7 @@
             <w:noProof/>
             <w:webHidden/>
           </w:rPr>
-          <w:instrText xml:space="preserve"> PAGEREF _Toc241538569 \h </w:instrText>
+          <w:instrText xml:space="preserve"> PAGEREF _Toc241538736 \h </w:instrText>
         </w:r>
         <w:r>
           <w:rPr>
@@ -9512,7 +9512,7 @@
           <w14:ligatures w14:val="standardContextual"/>
         </w:rPr>
       </w:pPr>
-      <w:hyperlink w:anchor="_Toc241538570" w:history="1">
+      <w:hyperlink w:anchor="_Toc241538737" w:history="1">
         <w:r>
           <w:rPr>
             <w:rStyle w:val="Hyperlink"/>
@@ -9539,7 +9539,7 @@
             <w:noProof/>
             <w:webHidden/>
           </w:rPr>
-          <w:instrText xml:space="preserve"> PAGEREF _Toc241538570 \h </w:instrText>
+          <w:instrText xml:space="preserve"> PAGEREF _Toc241538737 \h </w:instrText>
         </w:r>
         <w:r>
           <w:rPr>
@@ -9584,7 +9584,7 @@
           <w14:ligatures w14:val="standardContextual"/>
         </w:rPr>
       </w:pPr>
-      <w:hyperlink w:anchor="_Toc241538571" w:history="1">
+      <w:hyperlink w:anchor="_Toc241538738" w:history="1">
         <w:r>
           <w:rPr>
             <w:rStyle w:val="Hyperlink"/>
@@ -9611,7 +9611,7 @@
             <w:noProof/>
             <w:webHidden/>
           </w:rPr>
-          <w:instrText xml:space="preserve"> PAGEREF _Toc241538571 \h </w:instrText>
+          <w:instrText xml:space="preserve"> PAGEREF _Toc241538738 \h </w:instrText>
         </w:r>
         <w:r>
           <w:rPr>
@@ -9656,7 +9656,7 @@
           <w14:ligatures w14:val="standardContextual"/>
         </w:rPr>
       </w:pPr>
-      <w:hyperlink w:anchor="_Toc241538572" w:history="1">
+      <w:hyperlink w:anchor="_Toc241538739" w:history="1">
         <w:r>
           <w:rPr>
             <w:rStyle w:val="Hyperlink"/>
@@ -9683,7 +9683,7 @@
             <w:noProof/>
             <w:webHidden/>
           </w:rPr>
-          <w:instrText xml:space="preserve"> PAGEREF _Toc241538572 \h </w:instrText>
+          <w:instrText xml:space="preserve"> PAGEREF _Toc241538739 \h </w:instrText>
         </w:r>
         <w:r>
           <w:rPr>
@@ -9728,7 +9728,7 @@
           <w14:ligatures w14:val="standardContextual"/>
         </w:rPr>
       </w:pPr>
-      <w:hyperlink w:anchor="_Toc241538573" w:history="1">
+      <w:hyperlink w:anchor="_Toc241538740" w:history="1">
         <w:r>
           <w:rPr>
             <w:rStyle w:val="Hyperlink"/>
@@ -9755,7 +9755,7 @@
             <w:noProof/>
             <w:webHidden/>
           </w:rPr>
-          <w:instrText xml:space="preserve"> PAGEREF _Toc241538573 \h </w:instrText>
+          <w:instrText xml:space="preserve"> PAGEREF _Toc241538740 \h </w:instrText>
         </w:r>
         <w:r>
           <w:rPr>
@@ -9800,7 +9800,7 @@
           <w14:ligatures w14:val="standardContextual"/>
         </w:rPr>
       </w:pPr>
-      <w:hyperlink w:anchor="_Toc241538574" w:history="1">
+      <w:hyperlink w:anchor="_Toc241538741" w:history="1">
         <w:r>
           <w:rPr>
             <w:rStyle w:val="Hyperlink"/>
@@ -9827,7 +9827,7 @@
             <w:noProof/>
             <w:webHidden/>
           </w:rPr>
-          <w:instrText xml:space="preserve"> PAGEREF _Toc241538574 \h </w:instrText>
+          <w:instrText xml:space="preserve"> PAGEREF _Toc241538741 \h </w:instrText>
         </w:r>
         <w:r>
           <w:rPr>
@@ -9872,7 +9872,7 @@
           <w14:ligatures w14:val="standardContextual"/>
         </w:rPr>
       </w:pPr>
-      <w:hyperlink w:anchor="_Toc241538575" w:history="1">
+      <w:hyperlink w:anchor="_Toc241538742" w:history="1">
         <w:r>
           <w:rPr>
             <w:rStyle w:val="Hyperlink"/>
@@ -9899,7 +9899,7 @@
             <w:noProof/>
             <w:webHidden/>
           </w:rPr>
-          <w:instrText xml:space="preserve"> PAGEREF _Toc241538575 \h </w:instrText>
+          <w:instrText xml:space="preserve"> PAGEREF _Toc241538742 \h </w:instrText>
         </w:r>
         <w:r>
           <w:rPr>
@@ -9944,7 +9944,7 @@
           <w14:ligatures w14:val="standardContextual"/>
         </w:rPr>
       </w:pPr>
-      <w:hyperlink w:anchor="_Toc241538576" w:history="1">
+      <w:hyperlink w:anchor="_Toc241538743" w:history="1">
         <w:r>
           <w:rPr>
             <w:rStyle w:val="Hyperlink"/>
@@ -9971,7 +9971,7 @@
             <w:noProof/>
             <w:webHidden/>
           </w:rPr>
-          <w:instrText xml:space="preserve"> PAGEREF _Toc241538576 \h </w:instrText>
+          <w:instrText xml:space="preserve"> PAGEREF _Toc241538743 \h </w:instrText>
         </w:r>
         <w:r>
           <w:rPr>
@@ -10016,7 +10016,7 @@
           <w14:ligatures w14:val="standardContextual"/>
         </w:rPr>
       </w:pPr>
-      <w:hyperlink w:anchor="_Toc241538577" w:history="1">
+      <w:hyperlink w:anchor="_Toc241538744" w:history="1">
         <w:r>
           <w:rPr>
             <w:rStyle w:val="Hyperlink"/>
@@ -10043,7 +10043,7 @@
             <w:noProof/>
             <w:webHidden/>
           </w:rPr>
-          <w:instrText xml:space="preserve"> PAGEREF _Toc241538577 \h </w:instrText>
+          <w:instrText xml:space="preserve"> PAGEREF _Toc241538744 \h </w:instrText>
         </w:r>
         <w:r>
           <w:rPr>
@@ -10117,7 +10117,7 @@
       <w:r>
         <w:fldChar w:fldCharType="separate"/>
       </w:r>
-      <w:hyperlink w:anchor="_Toc241538578" w:history="1">
+      <w:hyperlink w:anchor="_Toc241538745" w:history="1">
         <w:r>
           <w:rPr>
             <w:rStyle w:val="Hyperlink"/>
@@ -10141,7 +10141,7 @@
           <w:rPr>
             <w:webHidden/>
           </w:rPr>
-          <w:instrText xml:space="preserve"> PAGEREF _Toc241538578 \h </w:instrText>
+          <w:instrText xml:space="preserve"> PAGEREF _Toc241538745 \h </w:instrText>
         </w:r>
         <w:r>
           <w:rPr>
@@ -10179,7 +10179,7 @@
           <w14:ligatures w14:val="standardContextual"/>
         </w:rPr>
       </w:pPr>
-      <w:hyperlink w:anchor="_Toc241538579" w:history="1">
+      <w:hyperlink w:anchor="_Toc241538746" w:history="1">
         <w:r>
           <w:rPr>
             <w:rStyle w:val="Hyperlink"/>
@@ -10203,7 +10203,7 @@
           <w:rPr>
             <w:webHidden/>
           </w:rPr>
-          <w:instrText xml:space="preserve"> PAGEREF _Toc241538579 \h </w:instrText>
+          <w:instrText xml:space="preserve"> PAGEREF _Toc241538746 \h </w:instrText>
         </w:r>
         <w:r>
           <w:rPr>
@@ -10241,7 +10241,7 @@
           <w14:ligatures w14:val="standardContextual"/>
         </w:rPr>
       </w:pPr>
-      <w:hyperlink w:anchor="_Toc241538580" w:history="1">
+      <w:hyperlink w:anchor="_Toc241538747" w:history="1">
         <w:r>
           <w:rPr>
             <w:rStyle w:val="Hyperlink"/>
@@ -10265,7 +10265,7 @@
           <w:rPr>
             <w:webHidden/>
           </w:rPr>
-          <w:instrText xml:space="preserve"> PAGEREF _Toc241538580 \h </w:instrText>
+          <w:instrText xml:space="preserve"> PAGEREF _Toc241538747 \h </w:instrText>
         </w:r>
         <w:r>
           <w:rPr>
@@ -10303,7 +10303,7 @@
           <w14:ligatures w14:val="standardContextual"/>
         </w:rPr>
       </w:pPr>
-      <w:hyperlink w:anchor="_Toc241538581" w:history="1">
+      <w:hyperlink w:anchor="_Toc241538748" w:history="1">
         <w:r>
           <w:rPr>
             <w:rStyle w:val="Hyperlink"/>
@@ -10327,7 +10327,7 @@
           <w:rPr>
             <w:webHidden/>
           </w:rPr>
-          <w:instrText xml:space="preserve"> PAGEREF _Toc241538581 \h </w:instrText>
+          <w:instrText xml:space="preserve"> PAGEREF _Toc241538748 \h </w:instrText>
         </w:r>
         <w:r>
           <w:rPr>
@@ -10365,7 +10365,7 @@
           <w14:ligatures w14:val="standardContextual"/>
         </w:rPr>
       </w:pPr>
-      <w:hyperlink w:anchor="_Toc241538582" w:history="1">
+      <w:hyperlink w:anchor="_Toc241538749" w:history="1">
         <w:r>
           <w:rPr>
             <w:rStyle w:val="Hyperlink"/>
@@ -10389,7 +10389,7 @@
           <w:rPr>
             <w:webHidden/>
           </w:rPr>
-          <w:instrText xml:space="preserve"> PAGEREF _Toc241538582 \h </w:instrText>
+          <w:instrText xml:space="preserve"> PAGEREF _Toc241538749 \h </w:instrText>
         </w:r>
         <w:r>
           <w:rPr>
@@ -10427,7 +10427,7 @@
           <w14:ligatures w14:val="standardContextual"/>
         </w:rPr>
       </w:pPr>
-      <w:hyperlink w:anchor="_Toc241538583" w:history="1">
+      <w:hyperlink w:anchor="_Toc241538750" w:history="1">
         <w:r>
           <w:rPr>
             <w:rStyle w:val="Hyperlink"/>
@@ -10451,7 +10451,7 @@
           <w:rPr>
             <w:webHidden/>
           </w:rPr>
-          <w:instrText xml:space="preserve"> PAGEREF _Toc241538583 \h </w:instrText>
+          <w:instrText xml:space="preserve"> PAGEREF _Toc241538750 \h </w:instrText>
         </w:r>
         <w:r>
           <w:rPr>
@@ -10489,7 +10489,7 @@
           <w14:ligatures w14:val="standardContextual"/>
         </w:rPr>
       </w:pPr>
-      <w:hyperlink w:anchor="_Toc241538584" w:history="1">
+      <w:hyperlink w:anchor="_Toc241538751" w:history="1">
         <w:r>
           <w:rPr>
             <w:rStyle w:val="Hyperlink"/>
@@ -10513,7 +10513,7 @@
           <w:rPr>
             <w:webHidden/>
           </w:rPr>
-          <w:instrText xml:space="preserve"> PAGEREF _Toc241538584 \h </w:instrText>
+          <w:instrText xml:space="preserve"> PAGEREF _Toc241538751 \h </w:instrText>
         </w:r>
         <w:r>
           <w:rPr>
@@ -10551,7 +10551,7 @@
           <w14:ligatures w14:val="standardContextual"/>
         </w:rPr>
       </w:pPr>
-      <w:hyperlink w:anchor="_Toc241538585" w:history="1">
+      <w:hyperlink w:anchor="_Toc241538752" w:history="1">
         <w:r>
           <w:rPr>
             <w:rStyle w:val="Hyperlink"/>
@@ -10575,7 +10575,7 @@
           <w:rPr>
             <w:webHidden/>
           </w:rPr>
-          <w:instrText xml:space="preserve"> PAGEREF _Toc241538585 \h </w:instrText>
+          <w:instrText xml:space="preserve"> PAGEREF _Toc241538752 \h </w:instrText>
         </w:r>
         <w:r>
           <w:rPr>
@@ -10613,7 +10613,7 @@
           <w14:ligatures w14:val="standardContextual"/>
         </w:rPr>
       </w:pPr>
-      <w:hyperlink w:anchor="_Toc241538586" w:history="1">
+      <w:hyperlink w:anchor="_Toc241538753" w:history="1">
         <w:r>
           <w:rPr>
             <w:rStyle w:val="Hyperlink"/>
@@ -10637,7 +10637,7 @@
           <w:rPr>
             <w:webHidden/>
           </w:rPr>
-          <w:instrText xml:space="preserve"> PAGEREF _Toc241538586 \h </w:instrText>
+          <w:instrText xml:space="preserve"> PAGEREF _Toc241538753 \h </w:instrText>
         </w:r>
         <w:r>
           <w:rPr>
@@ -10675,7 +10675,7 @@
           <w14:ligatures w14:val="standardContextual"/>
         </w:rPr>
       </w:pPr>
-      <w:hyperlink w:anchor="_Toc241538587" w:history="1">
+      <w:hyperlink w:anchor="_Toc241538754" w:history="1">
         <w:r>
           <w:rPr>
             <w:rStyle w:val="Hyperlink"/>
@@ -10699,7 +10699,7 @@
           <w:rPr>
             <w:webHidden/>
           </w:rPr>
-          <w:instrText xml:space="preserve"> PAGEREF _Toc241538587 \h </w:instrText>
+          <w:instrText xml:space="preserve"> PAGEREF _Toc241538754 \h </w:instrText>
         </w:r>
         <w:r>
           <w:rPr>
@@ -10737,7 +10737,7 @@
           <w14:ligatures w14:val="standardContextual"/>
         </w:rPr>
       </w:pPr>
-      <w:hyperlink w:anchor="_Toc241538588" w:history="1">
+      <w:hyperlink w:anchor="_Toc241538755" w:history="1">
         <w:r>
           <w:rPr>
             <w:rStyle w:val="Hyperlink"/>
@@ -10760,7 +10760,7 @@
           <w:rPr>
             <w:webHidden/>
           </w:rPr>
-          <w:instrText xml:space="preserve"> PAGEREF _Toc241538588 \h </w:instrText>
+          <w:instrText xml:space="preserve"> PAGEREF _Toc241538755 \h </w:instrText>
         </w:r>
         <w:r>
           <w:rPr>
@@ -10798,7 +10798,7 @@
           <w14:ligatures w14:val="standardContextual"/>
         </w:rPr>
       </w:pPr>
-      <w:hyperlink w:anchor="_Toc241538589" w:history="1">
+      <w:hyperlink w:anchor="_Toc241538756" w:history="1">
         <w:r>
           <w:rPr>
             <w:rStyle w:val="Hyperlink"/>
@@ -10821,7 +10821,7 @@
           <w:rPr>
             <w:webHidden/>
           </w:rPr>
-          <w:instrText xml:space="preserve"> PAGEREF _Toc241538589 \h </w:instrText>
+          <w:instrText xml:space="preserve"> PAGEREF _Toc241538756 \h </w:instrText>
         </w:r>
         <w:r>
           <w:rPr>
@@ -10859,7 +10859,7 @@
           <w14:ligatures w14:val="standardContextual"/>
         </w:rPr>
       </w:pPr>
-      <w:hyperlink w:anchor="_Toc241538590" w:history="1">
+      <w:hyperlink w:anchor="_Toc241538757" w:history="1">
         <w:r>
           <w:rPr>
             <w:rStyle w:val="Hyperlink"/>
@@ -10882,7 +10882,7 @@
           <w:rPr>
             <w:webHidden/>
           </w:rPr>
-          <w:instrText xml:space="preserve"> PAGEREF _Toc241538590 \h </w:instrText>
+          <w:instrText xml:space="preserve"> PAGEREF _Toc241538757 \h </w:instrText>
         </w:r>
         <w:r>
           <w:rPr>
@@ -10920,7 +10920,7 @@
           <w14:ligatures w14:val="standardContextual"/>
         </w:rPr>
       </w:pPr>
-      <w:hyperlink w:anchor="_Toc241538591" w:history="1">
+      <w:hyperlink w:anchor="_Toc241538758" w:history="1">
         <w:r>
           <w:rPr>
             <w:rStyle w:val="Hyperlink"/>
@@ -10943,7 +10943,7 @@
           <w:rPr>
             <w:webHidden/>
           </w:rPr>
-          <w:instrText xml:space="preserve"> PAGEREF _Toc241538591 \h </w:instrText>
+          <w:instrText xml:space="preserve"> PAGEREF _Toc241538758 \h </w:instrText>
         </w:r>
         <w:r>
           <w:rPr>
@@ -10981,7 +10981,7 @@
           <w14:ligatures w14:val="standardContextual"/>
         </w:rPr>
       </w:pPr>
-      <w:hyperlink w:anchor="_Toc241538592" w:history="1">
+      <w:hyperlink w:anchor="_Toc241538759" w:history="1">
         <w:r>
           <w:rPr>
             <w:rStyle w:val="Hyperlink"/>
@@ -11004,7 +11004,7 @@
           <w:rPr>
             <w:webHidden/>
           </w:rPr>
-          <w:instrText xml:space="preserve"> PAGEREF _Toc241538592 \h </w:instrText>
+          <w:instrText xml:space="preserve"> PAGEREF _Toc241538759 \h </w:instrText>
         </w:r>
         <w:r>
           <w:rPr>
@@ -11068,7 +11068,7 @@
       <w:r>
         <w:fldChar w:fldCharType="separate"/>
       </w:r>
-      <w:hyperlink w:anchor="_Toc241538593" w:history="1">
+      <w:hyperlink w:anchor="_Toc241538760" w:history="1">
         <w:r>
           <w:rPr>
             <w:rStyle w:val="Hyperlink"/>
@@ -11092,7 +11092,7 @@
           <w:rPr>
             <w:webHidden/>
           </w:rPr>
-          <w:instrText xml:space="preserve"> PAGEREF _Toc241538593 \h </w:instrText>
+          <w:instrText xml:space="preserve"> PAGEREF _Toc241538760 \h </w:instrText>
         </w:r>
         <w:r>
           <w:rPr>
@@ -11130,7 +11130,7 @@
           <w14:ligatures w14:val="standardContextual"/>
         </w:rPr>
       </w:pPr>
-      <w:hyperlink w:anchor="_Toc241538594" w:history="1">
+      <w:hyperlink w:anchor="_Toc241538761" w:history="1">
         <w:r>
           <w:rPr>
             <w:rStyle w:val="Hyperlink"/>
@@ -11154,7 +11154,7 @@
           <w:rPr>
             <w:webHidden/>
           </w:rPr>
-          <w:instrText xml:space="preserve"> PAGEREF _Toc241538594 \h </w:instrText>
+          <w:instrText xml:space="preserve"> PAGEREF _Toc241538761 \h </w:instrText>
         </w:r>
         <w:r>
           <w:rPr>
@@ -11192,7 +11192,7 @@
           <w14:ligatures w14:val="standardContextual"/>
         </w:rPr>
       </w:pPr>
-      <w:hyperlink w:anchor="_Toc241538595" w:history="1">
+      <w:hyperlink w:anchor="_Toc241538762" w:history="1">
         <w:r>
           <w:rPr>
             <w:rStyle w:val="Hyperlink"/>
@@ -11217,7 +11217,7 @@
           <w:rPr>
             <w:webHidden/>
           </w:rPr>
-          <w:instrText xml:space="preserve"> PAGEREF _Toc241538595 \h </w:instrText>
+          <w:instrText xml:space="preserve"> PAGEREF _Toc241538762 \h </w:instrText>
         </w:r>
         <w:r>
           <w:rPr>
@@ -11255,7 +11255,7 @@
           <w14:ligatures w14:val="standardContextual"/>
         </w:rPr>
       </w:pPr>
-      <w:hyperlink w:anchor="_Toc241538596" w:history="1">
+      <w:hyperlink w:anchor="_Toc241538763" w:history="1">
         <w:r>
           <w:rPr>
             <w:rStyle w:val="Hyperlink"/>
@@ -11279,7 +11279,7 @@
           <w:rPr>
             <w:webHidden/>
           </w:rPr>
-          <w:instrText xml:space="preserve"> PAGEREF _Toc241538596 \h </w:instrText>
+          <w:instrText xml:space="preserve"> PAGEREF _Toc241538763 \h </w:instrText>
         </w:r>
         <w:r>
           <w:rPr>
@@ -11317,7 +11317,7 @@
           <w14:ligatures w14:val="standardContextual"/>
         </w:rPr>
       </w:pPr>
-      <w:hyperlink w:anchor="_Toc241538597" w:history="1">
+      <w:hyperlink w:anchor="_Toc241538764" w:history="1">
         <w:r>
           <w:rPr>
             <w:rStyle w:val="Hyperlink"/>
@@ -11341,7 +11341,7 @@
           <w:rPr>
             <w:webHidden/>
           </w:rPr>
-          <w:instrText xml:space="preserve"> PAGEREF _Toc241538597 \h </w:instrText>
+          <w:instrText xml:space="preserve"> PAGEREF _Toc241538764 \h </w:instrText>
         </w:r>
         <w:r>
           <w:rPr>
@@ -11379,7 +11379,7 @@
           <w14:ligatures w14:val="standardContextual"/>
         </w:rPr>
       </w:pPr>
-      <w:hyperlink w:anchor="_Toc241538598" w:history="1">
+      <w:hyperlink w:anchor="_Toc241538765" w:history="1">
         <w:r>
           <w:rPr>
             <w:rStyle w:val="Hyperlink"/>
@@ -11403,7 +11403,7 @@
           <w:rPr>
             <w:webHidden/>
           </w:rPr>
-          <w:instrText xml:space="preserve"> PAGEREF _Toc241538598 \h </w:instrText>
+          <w:instrText xml:space="preserve"> PAGEREF _Toc241538765 \h </w:instrText>
         </w:r>
         <w:r>
           <w:rPr>
@@ -11441,7 +11441,7 @@
           <w14:ligatures w14:val="standardContextual"/>
         </w:rPr>
       </w:pPr>
-      <w:hyperlink w:anchor="_Toc241538599" w:history="1">
+      <w:hyperlink w:anchor="_Toc241538766" w:history="1">
         <w:r>
           <w:rPr>
             <w:rStyle w:val="Hyperlink"/>
@@ -11465,7 +11465,7 @@
           <w:rPr>
             <w:webHidden/>
           </w:rPr>
-          <w:instrText xml:space="preserve"> PAGEREF _Toc241538599 \h </w:instrText>
+          <w:instrText xml:space="preserve"> PAGEREF _Toc241538766 \h </w:instrText>
         </w:r>
         <w:r>
           <w:rPr>
@@ -11503,7 +11503,7 @@
           <w14:ligatures w14:val="standardContextual"/>
         </w:rPr>
       </w:pPr>
-      <w:hyperlink w:anchor="_Toc241538600" w:history="1">
+      <w:hyperlink w:anchor="_Toc241538767" w:history="1">
         <w:r>
           <w:rPr>
             <w:rStyle w:val="Hyperlink"/>
@@ -11527,7 +11527,7 @@
           <w:rPr>
             <w:webHidden/>
           </w:rPr>
-          <w:instrText xml:space="preserve"> PAGEREF _Toc241538600 \h </w:instrText>
+          <w:instrText xml:space="preserve"> PAGEREF _Toc241538767 \h </w:instrText>
         </w:r>
         <w:r>
           <w:rPr>
@@ -11565,7 +11565,7 @@
           <w14:ligatures w14:val="standardContextual"/>
         </w:rPr>
       </w:pPr>
-      <w:hyperlink w:anchor="_Toc241538601" w:history="1">
+      <w:hyperlink w:anchor="_Toc241538768" w:history="1">
         <w:r>
           <w:rPr>
             <w:rStyle w:val="Hyperlink"/>
@@ -11589,7 +11589,7 @@
           <w:rPr>
             <w:webHidden/>
           </w:rPr>
-          <w:instrText xml:space="preserve"> PAGEREF _Toc241538601 \h </w:instrText>
+          <w:instrText xml:space="preserve"> PAGEREF _Toc241538768 \h </w:instrText>
         </w:r>
         <w:r>
           <w:rPr>
@@ -11627,7 +11627,7 @@
           <w14:ligatures w14:val="standardContextual"/>
         </w:rPr>
       </w:pPr>
-      <w:hyperlink w:anchor="_Toc241538602" w:history="1">
+      <w:hyperlink w:anchor="_Toc241538769" w:history="1">
         <w:r>
           <w:rPr>
             <w:rStyle w:val="Hyperlink"/>
@@ -11651,7 +11651,7 @@
           <w:rPr>
             <w:webHidden/>
           </w:rPr>
-          <w:instrText xml:space="preserve"> PAGEREF _Toc241538602 \h </w:instrText>
+          <w:instrText xml:space="preserve"> PAGEREF _Toc241538769 \h </w:instrText>
         </w:r>
         <w:r>
           <w:rPr>
@@ -11689,7 +11689,7 @@
           <w14:ligatures w14:val="standardContextual"/>
         </w:rPr>
       </w:pPr>
-      <w:hyperlink w:anchor="_Toc241538603" w:history="1">
+      <w:hyperlink w:anchor="_Toc241538770" w:history="1">
         <w:r>
           <w:rPr>
             <w:rStyle w:val="Hyperlink"/>
@@ -11713,7 +11713,7 @@
           <w:rPr>
             <w:webHidden/>
           </w:rPr>
-          <w:instrText xml:space="preserve"> PAGEREF _Toc241538603 \h </w:instrText>
+          <w:instrText xml:space="preserve"> PAGEREF _Toc241538770 \h </w:instrText>
         </w:r>
         <w:r>
           <w:rPr>
@@ -11751,7 +11751,7 @@
           <w14:ligatures w14:val="standardContextual"/>
         </w:rPr>
       </w:pPr>
-      <w:hyperlink w:anchor="_Toc241538604" w:history="1">
+      <w:hyperlink w:anchor="_Toc241538771" w:history="1">
         <w:r>
           <w:rPr>
             <w:rStyle w:val="Hyperlink"/>
@@ -11775,7 +11775,7 @@
           <w:rPr>
             <w:webHidden/>
           </w:rPr>
-          <w:instrText xml:space="preserve"> PAGEREF _Toc241538604 \h </w:instrText>
+          <w:instrText xml:space="preserve"> PAGEREF _Toc241538771 \h </w:instrText>
         </w:r>
         <w:r>
           <w:rPr>
@@ -11813,7 +11813,7 @@
           <w14:ligatures w14:val="standardContextual"/>
         </w:rPr>
       </w:pPr>
-      <w:hyperlink w:anchor="_Toc241538605" w:history="1">
+      <w:hyperlink w:anchor="_Toc241538772" w:history="1">
         <w:r>
           <w:rPr>
             <w:rStyle w:val="Hyperlink"/>
@@ -11837,7 +11837,7 @@
           <w:rPr>
             <w:webHidden/>
           </w:rPr>
-          <w:instrText xml:space="preserve"> PAGEREF _Toc241538605 \h </w:instrText>
+          <w:instrText xml:space="preserve"> PAGEREF _Toc241538772 \h </w:instrText>
         </w:r>
         <w:r>
           <w:rPr>
@@ -11875,7 +11875,7 @@
           <w14:ligatures w14:val="standardContextual"/>
         </w:rPr>
       </w:pPr>
-      <w:hyperlink w:anchor="_Toc241538606" w:history="1">
+      <w:hyperlink w:anchor="_Toc241538773" w:history="1">
         <w:r>
           <w:rPr>
             <w:rStyle w:val="Hyperlink"/>
@@ -11899,7 +11899,7 @@
           <w:rPr>
             <w:webHidden/>
           </w:rPr>
-          <w:instrText xml:space="preserve"> PAGEREF _Toc241538606 \h </w:instrText>
+          <w:instrText xml:space="preserve"> PAGEREF _Toc241538773 \h </w:instrText>
         </w:r>
         <w:r>
           <w:rPr>
@@ -11937,7 +11937,7 @@
           <w14:ligatures w14:val="standardContextual"/>
         </w:rPr>
       </w:pPr>
-      <w:hyperlink w:anchor="_Toc241538607" w:history="1">
+      <w:hyperlink w:anchor="_Toc241538774" w:history="1">
         <w:r>
           <w:rPr>
             <w:rStyle w:val="Hyperlink"/>
@@ -11961,7 +11961,7 @@
           <w:rPr>
             <w:webHidden/>
           </w:rPr>
-          <w:instrText xml:space="preserve"> PAGEREF _Toc241538607 \h </w:instrText>
+          <w:instrText xml:space="preserve"> PAGEREF _Toc241538774 \h </w:instrText>
         </w:r>
         <w:r>
           <w:rPr>
@@ -12079,7 +12079,7 @@
         <w:pStyle w:val="Heading1"/>
       </w:pPr>
       <w:bookmarkStart w:id="1" w:name="_Toc241062250"/>
-      <w:bookmarkStart w:id="2" w:name="_Toc241538441"/>
+      <w:bookmarkStart w:id="2" w:name="_Toc241538608"/>
       <w:r>
         <w:t>RESUMEN</w:t>
       </w:r>
@@ -12168,7 +12168,7 @@
         <w:pStyle w:val="Heading1"/>
       </w:pPr>
       <w:bookmarkStart w:id="3" w:name="_Toc241062251"/>
-      <w:bookmarkStart w:id="4" w:name="_Toc241538442"/>
+      <w:bookmarkStart w:id="4" w:name="_Toc241538609"/>
       <w:r>
         <w:t>CAPÍTULO 1: Introducción</w:t>
       </w:r>
@@ -12201,7 +12201,7 @@
         <w:pStyle w:val="Heading2"/>
       </w:pPr>
       <w:bookmarkStart w:id="6" w:name="_Toc241062252"/>
-      <w:bookmarkStart w:id="7" w:name="_Toc241538443"/>
+      <w:bookmarkStart w:id="7" w:name="_Toc241538610"/>
       <w:r>
         <w:t>1.1 Contexto del problema</w:t>
       </w:r>
@@ -12262,7 +12262,7 @@
         <w:pStyle w:val="Heading2"/>
       </w:pPr>
       <w:bookmarkStart w:id="8" w:name="_Toc241062253"/>
-      <w:bookmarkStart w:id="9" w:name="_Toc241538444"/>
+      <w:bookmarkStart w:id="9" w:name="_Toc241538611"/>
       <w:r>
         <w:t>1.2 Planteamiento del problema</w:t>
       </w:r>
@@ -12357,7 +12357,7 @@
         <w:pStyle w:val="Heading2"/>
       </w:pPr>
       <w:bookmarkStart w:id="10" w:name="_Toc241062254"/>
-      <w:bookmarkStart w:id="11" w:name="_Toc241538445"/>
+      <w:bookmarkStart w:id="11" w:name="_Toc241538612"/>
       <w:r>
         <w:lastRenderedPageBreak/>
         <w:t>1.3 Justificación</w:t>
@@ -12436,7 +12436,7 @@
         <w:pStyle w:val="Heading2"/>
       </w:pPr>
       <w:bookmarkStart w:id="12" w:name="_Toc241062255"/>
-      <w:bookmarkStart w:id="13" w:name="_Toc241538446"/>
+      <w:bookmarkStart w:id="13" w:name="_Toc241538613"/>
       <w:r>
         <w:lastRenderedPageBreak/>
         <w:t>1.4 Objetivos</w:t>
@@ -12457,7 +12457,7 @@
         <w:pStyle w:val="Heading3"/>
       </w:pPr>
       <w:bookmarkStart w:id="14" w:name="_Toc241062256"/>
-      <w:bookmarkStart w:id="15" w:name="_Toc241538447"/>
+      <w:bookmarkStart w:id="15" w:name="_Toc241538614"/>
       <w:r>
         <w:t>1.4.1 Objetivo General</w:t>
       </w:r>
@@ -12477,7 +12477,7 @@
         <w:pStyle w:val="Heading3"/>
       </w:pPr>
       <w:bookmarkStart w:id="16" w:name="_Toc241062257"/>
-      <w:bookmarkStart w:id="17" w:name="_Toc241538448"/>
+      <w:bookmarkStart w:id="17" w:name="_Toc241538615"/>
       <w:r>
         <w:t>1.4.2 Objetivos Específicos</w:t>
       </w:r>
@@ -12611,7 +12611,7 @@
         <w:pStyle w:val="Heading2"/>
       </w:pPr>
       <w:bookmarkStart w:id="18" w:name="_Toc241062258"/>
-      <w:bookmarkStart w:id="19" w:name="_Toc241538449"/>
+      <w:bookmarkStart w:id="19" w:name="_Toc241538616"/>
       <w:r>
         <w:t>1.5 Alcance y Limitaciones</w:t>
       </w:r>
@@ -12631,7 +12631,7 @@
         <w:pStyle w:val="Heading3"/>
       </w:pPr>
       <w:bookmarkStart w:id="20" w:name="_Toc241062259"/>
-      <w:bookmarkStart w:id="21" w:name="_Toc241538450"/>
+      <w:bookmarkStart w:id="21" w:name="_Toc241538617"/>
       <w:r>
         <w:t>1.5.1 Alcance del Proyecto</w:t>
       </w:r>
@@ -12798,7 +12798,7 @@
         </w:rPr>
       </w:pPr>
       <w:bookmarkStart w:id="22" w:name="_Toc241062260"/>
-      <w:bookmarkStart w:id="23" w:name="_Toc241538451"/>
+      <w:bookmarkStart w:id="23" w:name="_Toc241538618"/>
       <w:r>
         <w:lastRenderedPageBreak/>
         <w:t>1.5.2 Limitaciones del Proyecto</w:t>
@@ -12941,7 +12941,7 @@
         <w:pStyle w:val="Heading2"/>
       </w:pPr>
       <w:bookmarkStart w:id="24" w:name="_Toc241062261"/>
-      <w:bookmarkStart w:id="25" w:name="_Toc241538452"/>
+      <w:bookmarkStart w:id="25" w:name="_Toc241538619"/>
       <w:r>
         <w:t>1.6 Estado del Arte: Análisis de Soluciones y Vacío Tecnológico</w:t>
       </w:r>
@@ -12966,7 +12966,7 @@
         <w:pStyle w:val="Heading3"/>
       </w:pPr>
       <w:bookmarkStart w:id="26" w:name="_Toc241062262"/>
-      <w:bookmarkStart w:id="27" w:name="_Toc241538453"/>
+      <w:bookmarkStart w:id="27" w:name="_Toc241538620"/>
       <w:r>
         <w:t>1.6.0 Antecedentes académicos</w:t>
       </w:r>
@@ -13019,7 +13019,7 @@
         <w:spacing w:before="0" w:line="276" w:lineRule="auto"/>
       </w:pPr>
       <w:bookmarkStart w:id="28" w:name="_Toc241062263"/>
-      <w:bookmarkStart w:id="29" w:name="_Toc241538454"/>
+      <w:bookmarkStart w:id="29" w:name="_Toc241538621"/>
       <w:r>
         <w:t>1.6.1 Sistemas Tradicionales de Gestión de Redes Sociales (SMMS)</w:t>
       </w:r>
@@ -13063,7 +13063,7 @@
         <w:spacing w:before="0" w:line="276" w:lineRule="auto"/>
       </w:pPr>
       <w:bookmarkStart w:id="30" w:name="_Toc241062264"/>
-      <w:bookmarkStart w:id="31" w:name="_Toc241538455"/>
+      <w:bookmarkStart w:id="31" w:name="_Toc241538622"/>
       <w:r>
         <w:t>1.6.2 Plataformas Genéricas de Automatización (iPaaS)</w:t>
       </w:r>
@@ -13103,7 +13103,7 @@
         <w:spacing w:before="0" w:line="276" w:lineRule="auto"/>
       </w:pPr>
       <w:bookmarkStart w:id="32" w:name="_Toc241062265"/>
-      <w:bookmarkStart w:id="33" w:name="_Toc241538456"/>
+      <w:bookmarkStart w:id="33" w:name="_Toc241538623"/>
       <w:r>
         <w:t>1.6.3 El Vacío Tecnológico y la Propuesta de Valor de Postly</w:t>
       </w:r>
@@ -13122,7 +13122,7 @@
       <w:pPr>
         <w:keepNext/>
       </w:pPr>
-      <w:bookmarkStart w:id="34" w:name="_Toc241538578"/>
+      <w:bookmarkStart w:id="34" w:name="_Toc241538745"/>
       <w:r>
         <w:rPr>
           <w:b/>
@@ -14233,7 +14233,7 @@
         <w:pStyle w:val="Heading1"/>
       </w:pPr>
       <w:bookmarkStart w:id="35" w:name="_Toc241062266"/>
-      <w:bookmarkStart w:id="36" w:name="_Toc241538457"/>
+      <w:bookmarkStart w:id="36" w:name="_Toc241538624"/>
       <w:r>
         <w:t>CAPÍTULO 2: MARCO TEÓRICO</w:t>
       </w:r>
@@ -14263,7 +14263,7 @@
         <w:pStyle w:val="Heading2"/>
       </w:pPr>
       <w:bookmarkStart w:id="37" w:name="_Toc241062267"/>
-      <w:bookmarkStart w:id="38" w:name="_Toc241538458"/>
+      <w:bookmarkStart w:id="38" w:name="_Toc241538625"/>
       <w:r>
         <w:t>2.1 Automatización de Procesos de Negocio (BPA) y n8n</w:t>
       </w:r>
@@ -14368,7 +14368,7 @@
         <w:pStyle w:val="Heading2"/>
       </w:pPr>
       <w:bookmarkStart w:id="39" w:name="_Toc241062268"/>
-      <w:bookmarkStart w:id="40" w:name="_Toc241538459"/>
+      <w:bookmarkStart w:id="40" w:name="_Toc241538626"/>
       <w:r>
         <w:t>2.2 Modelos de Lenguaje de Gran Escala (LLM) y Multimodalidad</w:t>
       </w:r>
@@ -14462,7 +14462,7 @@
         <w:pStyle w:val="Heading2"/>
       </w:pPr>
       <w:bookmarkStart w:id="41" w:name="_Toc241062269"/>
-      <w:bookmarkStart w:id="42" w:name="_Toc241538460"/>
+      <w:bookmarkStart w:id="42" w:name="_Toc241538627"/>
       <w:r>
         <w:t>2.3 Arquitectura de Integración mediante APIs y Webhooks</w:t>
       </w:r>
@@ -14722,7 +14722,7 @@
         <w:keepNext/>
         <w:jc w:val="center"/>
       </w:pPr>
-      <w:bookmarkStart w:id="46" w:name="_Toc241538593"/>
+      <w:bookmarkStart w:id="46" w:name="_Toc241538760"/>
       <w:r>
         <w:rPr>
           <w:i/>
@@ -14970,7 +14970,7 @@
         <w:pStyle w:val="Heading2"/>
       </w:pPr>
       <w:bookmarkStart w:id="47" w:name="_Toc241062270"/>
-      <w:bookmarkStart w:id="48" w:name="_Toc241538461"/>
+      <w:bookmarkStart w:id="48" w:name="_Toc241538628"/>
       <w:r>
         <w:t>2.4 Normativas de Marketing y Cumplimiento Corporativo en Venta Directa</w:t>
       </w:r>
@@ -15269,7 +15269,7 @@
         <w:pStyle w:val="Heading1"/>
       </w:pPr>
       <w:bookmarkStart w:id="52" w:name="_Toc241062271"/>
-      <w:bookmarkStart w:id="53" w:name="_Toc241538462"/>
+      <w:bookmarkStart w:id="53" w:name="_Toc241538629"/>
       <w:r>
         <w:t>CAPÍTULO 3: MARCO METODOLÓGICO</w:t>
       </w:r>
@@ -15281,7 +15281,7 @@
         <w:pStyle w:val="Heading2"/>
       </w:pPr>
       <w:bookmarkStart w:id="54" w:name="_Toc241062272"/>
-      <w:bookmarkStart w:id="55" w:name="_Toc241538463"/>
+      <w:bookmarkStart w:id="55" w:name="_Toc241538630"/>
       <w:r>
         <w:t>3.1 Tipo de investigación</w:t>
       </w:r>
@@ -15319,7 +15319,7 @@
         <w:pStyle w:val="Heading2"/>
       </w:pPr>
       <w:bookmarkStart w:id="56" w:name="_Toc241062273"/>
-      <w:bookmarkStart w:id="57" w:name="_Toc241538464"/>
+      <w:bookmarkStart w:id="57" w:name="_Toc241538631"/>
       <w:r>
         <w:t>3.2 Enfoque y Diseño de investigación</w:t>
       </w:r>
@@ -15497,7 +15497,7 @@
         <w:pStyle w:val="Heading2"/>
       </w:pPr>
       <w:bookmarkStart w:id="59" w:name="_Toc241062274"/>
-      <w:bookmarkStart w:id="60" w:name="_Toc241538465"/>
+      <w:bookmarkStart w:id="60" w:name="_Toc241538632"/>
       <w:r>
         <w:t>3.3 Metodología de Desarrollo (Agile/Scrum)</w:t>
       </w:r>
@@ -15517,7 +15517,7 @@
         <w:spacing w:before="240" w:after="240" w:line="240" w:lineRule="auto"/>
       </w:pPr>
       <w:bookmarkStart w:id="62" w:name="_Toc241062275"/>
-      <w:bookmarkStart w:id="63" w:name="_Toc241538466"/>
+      <w:bookmarkStart w:id="63" w:name="_Toc241538633"/>
       <w:r>
         <w:t>3.3.1 Marco metodológico de desarrollo</w:t>
       </w:r>
@@ -15565,7 +15565,7 @@
         <w:spacing w:before="240" w:after="240" w:line="240" w:lineRule="auto"/>
       </w:pPr>
       <w:bookmarkStart w:id="64" w:name="_Toc241062276"/>
-      <w:bookmarkStart w:id="65" w:name="_Toc241538467"/>
+      <w:bookmarkStart w:id="65" w:name="_Toc241538634"/>
       <w:r>
         <w:t>3.3.2 Implementación de la metodología: Sprints de desarrollo</w:t>
       </w:r>
@@ -15593,7 +15593,7 @@
         <w:pStyle w:val="Heading3"/>
         <w:spacing w:before="240" w:after="240" w:line="240" w:lineRule="auto"/>
       </w:pPr>
-      <w:bookmarkStart w:id="66" w:name="_Toc241538468"/>
+      <w:bookmarkStart w:id="66" w:name="_Toc241538635"/>
       <w:r>
         <w:t>3.3.3 Riesgos del proyecto y decisiones de diseño derivadas</w:t>
       </w:r>
@@ -15628,7 +15628,7 @@
       <w:pPr>
         <w:keepNext/>
       </w:pPr>
-      <w:bookmarkStart w:id="67" w:name="_Toc241538579"/>
+      <w:bookmarkStart w:id="67" w:name="_Toc241538746"/>
       <w:r>
         <w:rPr>
           <w:b/>
@@ -16165,7 +16165,7 @@
         <w:pStyle w:val="Heading2"/>
       </w:pPr>
       <w:bookmarkStart w:id="68" w:name="_Toc241062277"/>
-      <w:bookmarkStart w:id="69" w:name="_Toc241538469"/>
+      <w:bookmarkStart w:id="69" w:name="_Toc241538636"/>
       <w:r>
         <w:t>3.4 Técnicas de recolección de datos e instrumentos</w:t>
       </w:r>
@@ -16190,7 +16190,7 @@
         <w:pStyle w:val="Heading3"/>
       </w:pPr>
       <w:bookmarkStart w:id="70" w:name="_Toc241062278"/>
-      <w:bookmarkStart w:id="71" w:name="_Toc241538470"/>
+      <w:bookmarkStart w:id="71" w:name="_Toc241538637"/>
       <w:r>
         <w:t>3.4.1 Recolección de información para el análisis del problema</w:t>
       </w:r>
@@ -16294,7 +16294,7 @@
         <w:pStyle w:val="Heading3"/>
       </w:pPr>
       <w:bookmarkStart w:id="72" w:name="_Toc241062279"/>
-      <w:bookmarkStart w:id="73" w:name="_Toc241538471"/>
+      <w:bookmarkStart w:id="73" w:name="_Toc241538638"/>
       <w:r>
         <w:t>3.4.2 Técnicas de validación técnica del sistema</w:t>
       </w:r>
@@ -16580,7 +16580,7 @@
         <w:pStyle w:val="Heading3"/>
       </w:pPr>
       <w:bookmarkStart w:id="74" w:name="_Toc241062280"/>
-      <w:bookmarkStart w:id="75" w:name="_Toc241538472"/>
+      <w:bookmarkStart w:id="75" w:name="_Toc241538639"/>
       <w:r>
         <w:t>3.4.3 Limitaciones y alcance de la recolección de datos</w:t>
       </w:r>
@@ -16671,7 +16671,7 @@
         <w:pStyle w:val="Heading2"/>
       </w:pPr>
       <w:bookmarkStart w:id="76" w:name="_Toc241062281"/>
-      <w:bookmarkStart w:id="77" w:name="_Toc241538473"/>
+      <w:bookmarkStart w:id="77" w:name="_Toc241538640"/>
       <w:r>
         <w:t>3.5 Población, Muestra y Diseño de la Evaluación</w:t>
       </w:r>
@@ -16696,7 +16696,7 @@
         <w:pStyle w:val="Heading3"/>
       </w:pPr>
       <w:bookmarkStart w:id="78" w:name="_Toc241062282"/>
-      <w:bookmarkStart w:id="79" w:name="_Toc241538474"/>
+      <w:bookmarkStart w:id="79" w:name="_Toc241538641"/>
       <w:r>
         <w:t>3.5.1 Población objetivo</w:t>
       </w:r>
@@ -16729,7 +16729,7 @@
         <w:pStyle w:val="Heading3"/>
       </w:pPr>
       <w:bookmarkStart w:id="80" w:name="_Toc241062283"/>
-      <w:bookmarkStart w:id="81" w:name="_Toc241538475"/>
+      <w:bookmarkStart w:id="81" w:name="_Toc241538642"/>
       <w:r>
         <w:t>3.5.2 Definición de la muestra</w:t>
       </w:r>
@@ -16774,7 +16774,7 @@
         <w:pStyle w:val="Heading3"/>
       </w:pPr>
       <w:bookmarkStart w:id="82" w:name="_Toc241062284"/>
-      <w:bookmarkStart w:id="83" w:name="_Toc241538476"/>
+      <w:bookmarkStart w:id="83" w:name="_Toc241538643"/>
       <w:r>
         <w:t>3.5.3 Consideraciones sobre el tamaño muestral</w:t>
       </w:r>
@@ -16809,7 +16809,7 @@
         <w:pStyle w:val="Heading3"/>
       </w:pPr>
       <w:bookmarkStart w:id="84" w:name="_Toc241062285"/>
-      <w:bookmarkStart w:id="85" w:name="_Toc241538477"/>
+      <w:bookmarkStart w:id="85" w:name="_Toc241538644"/>
       <w:r>
         <w:lastRenderedPageBreak/>
         <w:t>3.5.4 Variables e instrumentos de medición</w:t>
@@ -16852,7 +16852,7 @@
         <w:pStyle w:val="Heading3"/>
       </w:pPr>
       <w:bookmarkStart w:id="86" w:name="_Toc241062286"/>
-      <w:bookmarkStart w:id="87" w:name="_Toc241538478"/>
+      <w:bookmarkStart w:id="87" w:name="_Toc241538645"/>
       <w:r>
         <w:lastRenderedPageBreak/>
         <w:t>3.5.5 Amenazas a la validez</w:t>
@@ -16928,7 +16928,7 @@
         <w:pStyle w:val="Heading2"/>
       </w:pPr>
       <w:bookmarkStart w:id="88" w:name="_Toc241062287"/>
-      <w:bookmarkStart w:id="89" w:name="_Toc241538479"/>
+      <w:bookmarkStart w:id="89" w:name="_Toc241538646"/>
       <w:r>
         <w:t>3.6 Herramientas y Tecnologías Seleccionadas</w:t>
       </w:r>
@@ -16962,7 +16962,7 @@
         <w:pStyle w:val="Heading3"/>
       </w:pPr>
       <w:bookmarkStart w:id="90" w:name="_Toc241062288"/>
-      <w:bookmarkStart w:id="91" w:name="_Toc241538480"/>
+      <w:bookmarkStart w:id="91" w:name="_Toc241538647"/>
       <w:r>
         <w:t>3.6.1 Motor de automatización: n8n</w:t>
       </w:r>
@@ -16995,7 +16995,7 @@
         <w:pStyle w:val="Heading3"/>
       </w:pPr>
       <w:bookmarkStart w:id="92" w:name="_Toc241062289"/>
-      <w:bookmarkStart w:id="93" w:name="_Toc241538481"/>
+      <w:bookmarkStart w:id="93" w:name="_Toc241538648"/>
       <w:r>
         <w:t>3.6.2 Modelo multimodal, integraciones y arquitectura</w:t>
       </w:r>
@@ -17044,7 +17044,7 @@
         <w:spacing w:before="280"/>
       </w:pPr>
       <w:bookmarkStart w:id="94" w:name="_Toc241062290"/>
-      <w:bookmarkStart w:id="95" w:name="_Toc241538482"/>
+      <w:bookmarkStart w:id="95" w:name="_Toc241538649"/>
       <w:r>
         <w:t>3.7 Consideraciones éticas y legales</w:t>
       </w:r>
@@ -17079,7 +17079,7 @@
         <w:pStyle w:val="Heading3"/>
       </w:pPr>
       <w:bookmarkStart w:id="96" w:name="_Toc241062291"/>
-      <w:bookmarkStart w:id="97" w:name="_Toc241538483"/>
+      <w:bookmarkStart w:id="97" w:name="_Toc241538650"/>
       <w:r>
         <w:t>3.7.1 Protección de datos personales y Privacidad desde el Diseño</w:t>
       </w:r>
@@ -17129,7 +17129,7 @@
         <w:pStyle w:val="Heading3"/>
       </w:pPr>
       <w:bookmarkStart w:id="98" w:name="_Toc241062292"/>
-      <w:bookmarkStart w:id="99" w:name="_Toc241538484"/>
+      <w:bookmarkStart w:id="99" w:name="_Toc241538651"/>
       <w:r>
         <w:lastRenderedPageBreak/>
         <w:t>3.7.2 Seguridad en la autenticación, acceso y soberanía</w:t>
@@ -17168,7 +17168,7 @@
         <w:pStyle w:val="Heading3"/>
       </w:pPr>
       <w:bookmarkStart w:id="100" w:name="_Toc241062293"/>
-      <w:bookmarkStart w:id="101" w:name="_Toc241538485"/>
+      <w:bookmarkStart w:id="101" w:name="_Toc241538652"/>
       <w:r>
         <w:t>3.7.3 Ética en la Inteligencia Artificial (</w:t>
       </w:r>
@@ -17216,7 +17216,7 @@
         <w:pStyle w:val="Heading3"/>
       </w:pPr>
       <w:bookmarkStart w:id="102" w:name="_Toc241062294"/>
-      <w:bookmarkStart w:id="103" w:name="_Toc241538486"/>
+      <w:bookmarkStart w:id="103" w:name="_Toc241538653"/>
       <w:r>
         <w:t>3.7.4 Auditoría de compliance y exposición de la consultora ante la normativa de la marca</w:t>
       </w:r>
@@ -17261,7 +17261,7 @@
         <w:pStyle w:val="Heading3"/>
       </w:pPr>
       <w:bookmarkStart w:id="104" w:name="_Toc241062295"/>
-      <w:bookmarkStart w:id="105" w:name="_Toc241538487"/>
+      <w:bookmarkStart w:id="105" w:name="_Toc241538654"/>
       <w:r>
         <w:lastRenderedPageBreak/>
         <w:t>3.7.5 Responsabilidad en la automatización y uso indebido</w:t>
@@ -17282,7 +17282,7 @@
         <w:pStyle w:val="Heading3"/>
       </w:pPr>
       <w:bookmarkStart w:id="106" w:name="_Toc241062296"/>
-      <w:bookmarkStart w:id="107" w:name="_Toc241538488"/>
+      <w:bookmarkStart w:id="107" w:name="_Toc241538655"/>
       <w:r>
         <w:t>3.7.6 Ética de la investigación</w:t>
       </w:r>
@@ -17406,7 +17406,7 @@
         <w:pStyle w:val="Heading1"/>
       </w:pPr>
       <w:bookmarkStart w:id="108" w:name="_Toc241062297"/>
-      <w:bookmarkStart w:id="109" w:name="_Toc241538489"/>
+      <w:bookmarkStart w:id="109" w:name="_Toc241538656"/>
       <w:r>
         <w:t>CAPÍTULO 4: DESARROLLO DEL ESTUDIO</w:t>
       </w:r>
@@ -17425,7 +17425,7 @@
         <w:pStyle w:val="Heading2"/>
       </w:pPr>
       <w:bookmarkStart w:id="110" w:name="_Toc241062298"/>
-      <w:bookmarkStart w:id="111" w:name="_Toc241538490"/>
+      <w:bookmarkStart w:id="111" w:name="_Toc241538657"/>
       <w:r>
         <w:t>4.1 Historias de Usuario y Criterios de Aceptación</w:t>
       </w:r>
@@ -17473,7 +17473,7 @@
         <w:spacing w:before="360" w:line="240" w:lineRule="auto"/>
       </w:pPr>
       <w:bookmarkStart w:id="112" w:name="_Toc241062299"/>
-      <w:bookmarkStart w:id="113" w:name="_Toc241538491"/>
+      <w:bookmarkStart w:id="113" w:name="_Toc241538658"/>
       <w:r>
         <w:t>4.1.1 Módulo A: Seguridad, Onboarding y Autenticación</w:t>
       </w:r>
@@ -17890,7 +17890,7 @@
         <w:spacing w:before="0" w:line="276" w:lineRule="auto"/>
       </w:pPr>
       <w:bookmarkStart w:id="114" w:name="_Toc241062300"/>
-      <w:bookmarkStart w:id="115" w:name="_Toc241538492"/>
+      <w:bookmarkStart w:id="115" w:name="_Toc241538659"/>
       <w:r>
         <w:t>4.1.2 Módulo B: Creación de Contenido Asistida por IA</w:t>
       </w:r>
@@ -18305,7 +18305,7 @@
         <w:spacing w:before="0" w:line="276" w:lineRule="auto"/>
       </w:pPr>
       <w:bookmarkStart w:id="116" w:name="_Toc241062301"/>
-      <w:bookmarkStart w:id="117" w:name="_Toc241538493"/>
+      <w:bookmarkStart w:id="117" w:name="_Toc241538660"/>
       <w:r>
         <w:lastRenderedPageBreak/>
         <w:t>4.1.3 Módulo C: Auditoría de Compliance (Módulo Centinela)</w:t>
@@ -18685,7 +18685,7 @@
         <w:spacing w:before="0" w:line="276" w:lineRule="auto"/>
       </w:pPr>
       <w:bookmarkStart w:id="118" w:name="_Toc241062302"/>
-      <w:bookmarkStart w:id="119" w:name="_Toc241538494"/>
+      <w:bookmarkStart w:id="119" w:name="_Toc241538661"/>
       <w:r>
         <w:t>4.1.4 Módulo D: Gestión de Publicación y Agenda</w:t>
       </w:r>
@@ -18845,7 +18845,7 @@
         <w:keepNext/>
         <w:jc w:val="center"/>
       </w:pPr>
-      <w:bookmarkStart w:id="120" w:name="_Toc241538594"/>
+      <w:bookmarkStart w:id="120" w:name="_Toc241538761"/>
       <w:r>
         <w:rPr>
           <w:i/>
@@ -19200,7 +19200,7 @@
         <w:spacing w:before="0" w:line="276" w:lineRule="auto"/>
       </w:pPr>
       <w:bookmarkStart w:id="121" w:name="_Toc241062303"/>
-      <w:bookmarkStart w:id="122" w:name="_Toc241538495"/>
+      <w:bookmarkStart w:id="122" w:name="_Toc241538662"/>
       <w:r>
         <w:t>4.1.5 Módulo E: Procesamiento Multimedia y Analítica de Datos</w:t>
       </w:r>
@@ -19466,7 +19466,7 @@
         <w:pStyle w:val="Heading2"/>
       </w:pPr>
       <w:bookmarkStart w:id="123" w:name="_Toc241062304"/>
-      <w:bookmarkStart w:id="124" w:name="_Toc241538496"/>
+      <w:bookmarkStart w:id="124" w:name="_Toc241538663"/>
       <w:r>
         <w:t>4.2 Definición del Producto Mínimo Viable (MVP)</w:t>
       </w:r>
@@ -19482,7 +19482,7 @@
           <w:lang w:val="en-US"/>
         </w:rPr>
       </w:pPr>
-      <w:bookmarkStart w:id="125" w:name="_Toc241538595"/>
+      <w:bookmarkStart w:id="125" w:name="_Toc241538762"/>
       <w:r>
         <w:rPr>
           <w:i/>
@@ -19780,7 +19780,7 @@
         <w:pStyle w:val="Heading2"/>
       </w:pPr>
       <w:bookmarkStart w:id="126" w:name="_Toc241062305"/>
-      <w:bookmarkStart w:id="127" w:name="_Toc241538497"/>
+      <w:bookmarkStart w:id="127" w:name="_Toc241538664"/>
       <w:r>
         <w:t>4.3 Implementación de Lógica de Auditoría y Compliance</w:t>
       </w:r>
@@ -19822,7 +19822,7 @@
         <w:spacing w:before="0" w:line="276" w:lineRule="auto"/>
       </w:pPr>
       <w:bookmarkStart w:id="128" w:name="_Toc241062306"/>
-      <w:bookmarkStart w:id="129" w:name="_Toc241538498"/>
+      <w:bookmarkStart w:id="129" w:name="_Toc241538665"/>
       <w:r>
         <w:t>4.3.1 Detección Multimodal de Precios y Restricciones Comerciales</w:t>
       </w:r>
@@ -19947,7 +19947,7 @@
         <w:spacing w:before="0" w:line="276" w:lineRule="auto"/>
       </w:pPr>
       <w:bookmarkStart w:id="130" w:name="_Toc241062307"/>
-      <w:bookmarkStart w:id="131" w:name="_Toc241538499"/>
+      <w:bookmarkStart w:id="131" w:name="_Toc241538666"/>
       <w:r>
         <w:t>4.3.2 Automatización de Identidad y Transparencia Corporativa</w:t>
       </w:r>
@@ -19971,10 +19971,7 @@
       </w:r>
       <w:r>
         <w:lastRenderedPageBreak/>
-        <w:t>puedes conseguirlo!» (p. 3), una invitación a contactar. Una línea de datos no es ese acto, pero cumple su función, que es ofrecer el canal para que quien lee escriba, y la fuente no dice si un dato de contacto al pie de un mensaje informativo lo vuelve comercial. Este trabajo no puede resolverlo con la letra, y lo declara como una pregunta abierta. Tiene tres consecuencias. Las mediciones del Anexo E.12 (0/15 y 0/32) se tomaron sobre el copy que genera el modelo, antes de que el nodo concatene la firma y e</w:t>
-      </w:r>
-      <w:r>
-        <w:t>l contacto, de modo que no alcanzan a esa línea. La línea es idéntica en cada publicación y no depende del modelo, así que ninguna corrección del prompt la modifica. Y su contenido lo fija la consultora en la hoja: Postly no la obliga a poner un contacto, pero tampoco la avisa de que podría ser comercial. Queda como riesgo residual, con la recomendación de hacerla opcional y de consultarla con la Compañía (§8.2).</w:t>
+        <w:t>puedes conseguirlo!» (p. 3), una invitación a contactar. Una línea de datos no es ese acto, pero cumple su función, que es ofrecer el canal para que quien lee escriba, y la fuente no dice si un dato de contacto al pie de un mensaje informativo lo vuelve comercial. Este trabajo no puede resolverlo con la letra, y lo declara como una pregunta abierta. Tiene tres consecuencias. Las mediciones del Anexo E.12 (0/15 y 0/32) se tomaron sobre el copy que genera el modelo, antes de que el nodo concatene la firma y el contacto, de modo que no alcanzan a esa línea. La línea es idéntica en cada publicación y no depende del modelo, así que ninguna corrección del prompt la modifica. Y su contenido lo fija la consultora en la hoja: Postly no la obliga a poner un contacto, pero tampoco la avisa de que podría ser comercial. Queda como riesgo residual, con la recomendación de hacerla opcional y de consultarla con la Compañía (§8.2).</w:t>
       </w:r>
     </w:p>
     <w:p>
@@ -20018,7 +20015,7 @@
         <w:spacing w:before="0" w:line="276" w:lineRule="auto"/>
       </w:pPr>
       <w:bookmarkStart w:id="132" w:name="_Toc241062308"/>
-      <w:bookmarkStart w:id="133" w:name="_Toc241538500"/>
+      <w:bookmarkStart w:id="133" w:name="_Toc241538667"/>
       <w:r>
         <w:t>4.4 Procesamiento Multimedia y Optimización de Archivos</w:t>
       </w:r>
@@ -20048,7 +20045,7 @@
         <w:spacing w:before="0" w:line="276" w:lineRule="auto"/>
       </w:pPr>
       <w:bookmarkStart w:id="135" w:name="_Toc241062309"/>
-      <w:bookmarkStart w:id="136" w:name="_Toc241538501"/>
+      <w:bookmarkStart w:id="136" w:name="_Toc241538668"/>
       <w:r>
         <w:t>4.4.1 Integración de FFmpeg y Normalización de Formatos</w:t>
       </w:r>
@@ -20078,7 +20075,7 @@
         <w:spacing w:before="0" w:line="276" w:lineRule="auto"/>
       </w:pPr>
       <w:bookmarkStart w:id="138" w:name="_Toc241062310"/>
-      <w:bookmarkStart w:id="139" w:name="_Toc241538502"/>
+      <w:bookmarkStart w:id="139" w:name="_Toc241538669"/>
       <w:r>
         <w:t>4.4.2 Tratamiento de Imágenes para Carruseles y Feeds</w:t>
       </w:r>
@@ -20162,7 +20159,7 @@
         <w:spacing w:before="0" w:line="276" w:lineRule="auto"/>
       </w:pPr>
       <w:bookmarkStart w:id="141" w:name="_Toc241062311"/>
-      <w:bookmarkStart w:id="142" w:name="_Toc241538503"/>
+      <w:bookmarkStart w:id="142" w:name="_Toc241538670"/>
       <w:r>
         <w:t>4.4.3 Validación y Tratamiento de Video (Reels)</w:t>
       </w:r>
@@ -20330,7 +20327,7 @@
         <w:spacing w:before="0" w:line="276" w:lineRule="auto"/>
       </w:pPr>
       <w:bookmarkStart w:id="143" w:name="_Toc241062312"/>
-      <w:bookmarkStart w:id="144" w:name="_Toc241538504"/>
+      <w:bookmarkStart w:id="144" w:name="_Toc241538671"/>
       <w:r>
         <w:t>CAPÍTULO 5: ARQUITECTURA E INTERFAZ DE VISUALIZACIÓN</w:t>
       </w:r>
@@ -20350,7 +20347,7 @@
         <w:pStyle w:val="Heading2"/>
       </w:pPr>
       <w:bookmarkStart w:id="145" w:name="_Toc241062313"/>
-      <w:bookmarkStart w:id="146" w:name="_Toc241538505"/>
+      <w:bookmarkStart w:id="146" w:name="_Toc241538672"/>
       <w:r>
         <w:t>5.1 Arquitectura del Sistema Postly</w:t>
       </w:r>
@@ -20362,7 +20359,7 @@
         <w:keepNext/>
         <w:jc w:val="center"/>
       </w:pPr>
-      <w:bookmarkStart w:id="147" w:name="_Toc241538596"/>
+      <w:bookmarkStart w:id="147" w:name="_Toc241538763"/>
       <w:r>
         <w:rPr>
           <w:i/>
@@ -20525,7 +20522,7 @@
         <w:pStyle w:val="Heading3"/>
       </w:pPr>
       <w:bookmarkStart w:id="148" w:name="_Toc241062314"/>
-      <w:bookmarkStart w:id="149" w:name="_Toc241538506"/>
+      <w:bookmarkStart w:id="149" w:name="_Toc241538673"/>
       <w:r>
         <w:t>5.1.1 Capas de la arquitectura</w:t>
       </w:r>
@@ -20724,7 +20721,7 @@
         <w:keepNext/>
         <w:jc w:val="center"/>
       </w:pPr>
-      <w:bookmarkStart w:id="150" w:name="_Toc241538597"/>
+      <w:bookmarkStart w:id="150" w:name="_Toc241538764"/>
       <w:r>
         <w:rPr>
           <w:i/>
@@ -20903,7 +20900,7 @@
         <w:pStyle w:val="Heading3"/>
       </w:pPr>
       <w:bookmarkStart w:id="151" w:name="_Toc241062315"/>
-      <w:bookmarkStart w:id="152" w:name="_Toc241538507"/>
+      <w:bookmarkStart w:id="152" w:name="_Toc241538674"/>
       <w:r>
         <w:t>5.1.2 Flujo de datos entre componentes</w:t>
       </w:r>
@@ -21149,7 +21146,7 @@
         <w:pStyle w:val="Heading3"/>
       </w:pPr>
       <w:bookmarkStart w:id="153" w:name="_Toc241062316"/>
-      <w:bookmarkStart w:id="154" w:name="_Toc241538508"/>
+      <w:bookmarkStart w:id="154" w:name="_Toc241538675"/>
       <w:r>
         <w:t>5.1.3 Principios de diseño adoptados</w:t>
       </w:r>
@@ -21302,7 +21299,7 @@
         <w:pStyle w:val="Heading3"/>
       </w:pPr>
       <w:bookmarkStart w:id="155" w:name="_Toc241062317"/>
-      <w:bookmarkStart w:id="156" w:name="_Toc241538509"/>
+      <w:bookmarkStart w:id="156" w:name="_Toc241538676"/>
       <w:r>
         <w:t>5.1.4 Consideraciones sobre la evolución arquitectónica</w:t>
       </w:r>
@@ -21333,7 +21330,7 @@
         <w:pStyle w:val="Heading2"/>
       </w:pPr>
       <w:bookmarkStart w:id="157" w:name="_Toc241062318"/>
-      <w:bookmarkStart w:id="158" w:name="_Toc241538510"/>
+      <w:bookmarkStart w:id="158" w:name="_Toc241538677"/>
       <w:r>
         <w:t>5.2 Diseño de Flujos de Trabajo en n8n</w:t>
       </w:r>
@@ -21358,7 +21355,7 @@
         <w:pStyle w:val="Heading3"/>
       </w:pPr>
       <w:bookmarkStart w:id="159" w:name="_Toc241062319"/>
-      <w:bookmarkStart w:id="160" w:name="_Toc241538511"/>
+      <w:bookmarkStart w:id="160" w:name="_Toc241538678"/>
       <w:r>
         <w:lastRenderedPageBreak/>
         <w:t>5.2.1 Workflow de Creación y Publicación Inteligente</w:t>
@@ -21371,7 +21368,7 @@
         <w:keepNext/>
         <w:jc w:val="center"/>
       </w:pPr>
-      <w:bookmarkStart w:id="161" w:name="_Toc241538598"/>
+      <w:bookmarkStart w:id="161" w:name="_Toc241538765"/>
       <w:r>
         <w:rPr>
           <w:i/>
@@ -21602,7 +21599,7 @@
         <w:keepNext/>
         <w:jc w:val="center"/>
       </w:pPr>
-      <w:bookmarkStart w:id="162" w:name="_Toc241538599"/>
+      <w:bookmarkStart w:id="162" w:name="_Toc241538766"/>
       <w:r>
         <w:rPr>
           <w:i/>
@@ -21772,7 +21769,7 @@
         <w:keepNext/>
         <w:jc w:val="center"/>
       </w:pPr>
-      <w:bookmarkStart w:id="163" w:name="_Toc241538600"/>
+      <w:bookmarkStart w:id="163" w:name="_Toc241538767"/>
       <w:r>
         <w:rPr>
           <w:i/>
@@ -22004,7 +22001,7 @@
         <w:keepNext/>
         <w:jc w:val="center"/>
       </w:pPr>
-      <w:bookmarkStart w:id="164" w:name="_Toc241538601"/>
+      <w:bookmarkStart w:id="164" w:name="_Toc241538768"/>
       <w:r>
         <w:rPr>
           <w:i/>
@@ -22120,7 +22117,7 @@
         <w:keepNext/>
         <w:jc w:val="center"/>
       </w:pPr>
-      <w:bookmarkStart w:id="165" w:name="_Toc241538602"/>
+      <w:bookmarkStart w:id="165" w:name="_Toc241538769"/>
       <w:r>
         <w:rPr>
           <w:i/>
@@ -22239,7 +22236,7 @@
         <w:jc w:val="center"/>
       </w:pPr>
     </w:p>
-    <w:bookmarkStart w:id="166" w:name="_Toc241538603"/>
+    <w:bookmarkStart w:id="166" w:name="_Toc241538770"/>
     <w:p>
       <w:pPr>
         <w:keepNext/>
@@ -22704,7 +22701,7 @@
       <w:pPr>
         <w:pStyle w:val="Heading3"/>
       </w:pPr>
-      <w:bookmarkStart w:id="168" w:name="_Toc241538512"/>
+      <w:bookmarkStart w:id="168" w:name="_Toc241538679"/>
       <w:r>
         <w:t>5.2.2 Workflow de Gestión de Agenda y Estados</w:t>
       </w:r>
@@ -22817,7 +22814,7 @@
         <w:pStyle w:val="Heading3"/>
       </w:pPr>
       <w:bookmarkStart w:id="169" w:name="_Toc241062321"/>
-      <w:bookmarkStart w:id="170" w:name="_Toc241538513"/>
+      <w:bookmarkStart w:id="170" w:name="_Toc241538680"/>
       <w:r>
         <w:t>5.2.3 Workflow de Configuración y Tutorial de Vinculación</w:t>
       </w:r>
@@ -22935,7 +22932,7 @@
         <w:pStyle w:val="Heading2"/>
       </w:pPr>
       <w:bookmarkStart w:id="171" w:name="_Toc241062322"/>
-      <w:bookmarkStart w:id="172" w:name="_Toc241538514"/>
+      <w:bookmarkStart w:id="172" w:name="_Toc241538681"/>
       <w:r>
         <w:t>5.3 Diseño de la Experiencia de Usuario (User Journey)</w:t>
       </w:r>
@@ -23068,7 +23065,7 @@
         <w:spacing w:before="0" w:line="276" w:lineRule="auto"/>
       </w:pPr>
       <w:bookmarkStart w:id="173" w:name="_Toc241062323"/>
-      <w:bookmarkStart w:id="174" w:name="_Toc241538515"/>
+      <w:bookmarkStart w:id="174" w:name="_Toc241538682"/>
       <w:r>
         <w:t>CAPÍTULO 6: RESULTADOS</w:t>
       </w:r>
@@ -23115,7 +23112,7 @@
         <w:spacing w:before="0" w:line="276" w:lineRule="auto"/>
       </w:pPr>
       <w:bookmarkStart w:id="175" w:name="_Toc241062324"/>
-      <w:bookmarkStart w:id="176" w:name="_Toc241538516"/>
+      <w:bookmarkStart w:id="176" w:name="_Toc241538683"/>
       <w:r>
         <w:t>6.1 Validación empírica del artefacto</w:t>
       </w:r>
@@ -23190,7 +23187,7 @@
         <w:spacing w:before="360" w:line="240" w:lineRule="auto"/>
       </w:pPr>
       <w:bookmarkStart w:id="177" w:name="_Toc241062325"/>
-      <w:bookmarkStart w:id="178" w:name="_Toc241538517"/>
+      <w:bookmarkStart w:id="178" w:name="_Toc241538684"/>
       <w:r>
         <w:t>6.1.1 Validación empírica del Módulo Centinela</w:t>
       </w:r>
@@ -23272,7 +23269,7 @@
           <w:i/>
         </w:rPr>
       </w:pPr>
-      <w:bookmarkStart w:id="179" w:name="_Toc241538580"/>
+      <w:bookmarkStart w:id="179" w:name="_Toc241538747"/>
       <w:r>
         <w:rPr>
           <w:b/>
@@ -23507,7 +23504,7 @@
       <w:pPr>
         <w:keepNext/>
       </w:pPr>
-      <w:bookmarkStart w:id="180" w:name="_Toc241538581"/>
+      <w:bookmarkStart w:id="180" w:name="_Toc241538748"/>
       <w:r>
         <w:rPr>
           <w:b/>
@@ -23853,7 +23850,7 @@
         <w:keepNext/>
         <w:jc w:val="center"/>
       </w:pPr>
-      <w:bookmarkStart w:id="181" w:name="_Toc241538604"/>
+      <w:bookmarkStart w:id="181" w:name="_Toc241538771"/>
       <w:r>
         <w:rPr>
           <w:i/>
@@ -24006,7 +24003,7 @@
         <w:keepNext/>
         <w:jc w:val="center"/>
       </w:pPr>
-      <w:bookmarkStart w:id="182" w:name="_Toc241538605"/>
+      <w:bookmarkStart w:id="182" w:name="_Toc241538772"/>
       <w:r>
         <w:rPr>
           <w:i/>
@@ -24162,7 +24159,7 @@
         <w:keepNext/>
         <w:jc w:val="center"/>
       </w:pPr>
-      <w:bookmarkStart w:id="183" w:name="_Toc241538606"/>
+      <w:bookmarkStart w:id="183" w:name="_Toc241538773"/>
       <w:r>
         <w:rPr>
           <w:i/>
@@ -24318,7 +24315,7 @@
           <w:sz w:val="20"/>
         </w:rPr>
       </w:pPr>
-      <w:bookmarkStart w:id="184" w:name="_Toc241538607"/>
+      <w:bookmarkStart w:id="184" w:name="_Toc241538774"/>
       <w:r>
         <w:rPr>
           <w:i/>
@@ -24482,7 +24479,7 @@
         <w:spacing w:before="360" w:line="240" w:lineRule="auto"/>
       </w:pPr>
       <w:bookmarkStart w:id="185" w:name="_Toc241062326"/>
-      <w:bookmarkStart w:id="186" w:name="_Toc241538518"/>
+      <w:bookmarkStart w:id="186" w:name="_Toc241538685"/>
       <w:r>
         <w:t>6.1.2 Conjunto ampliado del canal de imagen (HU8)</w:t>
       </w:r>
@@ -24553,7 +24550,7 @@
         <w:spacing w:before="360" w:line="240" w:lineRule="auto"/>
       </w:pPr>
       <w:bookmarkStart w:id="187" w:name="_Toc241062327"/>
-      <w:bookmarkStart w:id="188" w:name="_Toc241538519"/>
+      <w:bookmarkStart w:id="188" w:name="_Toc241538686"/>
       <w:r>
         <w:t>6.1.3 Validación con contenido real y evaluación externa</w:t>
       </w:r>
@@ -24580,7 +24577,7 @@
       <w:pPr>
         <w:keepNext/>
       </w:pPr>
-      <w:bookmarkStart w:id="189" w:name="_Toc241538582"/>
+      <w:bookmarkStart w:id="189" w:name="_Toc241538749"/>
       <w:r>
         <w:rPr>
           <w:b/>
@@ -25074,7 +25071,7 @@
         <w:spacing w:before="360" w:line="240" w:lineRule="auto"/>
       </w:pPr>
       <w:bookmarkStart w:id="190" w:name="_Toc241062328"/>
-      <w:bookmarkStart w:id="191" w:name="_Toc241538520"/>
+      <w:bookmarkStart w:id="191" w:name="_Toc241538687"/>
       <w:r>
         <w:t>6.1.4 Análisis de valores límite y refinamiento del detector</w:t>
       </w:r>
@@ -25141,7 +25138,7 @@
       <w:pPr>
         <w:keepNext/>
       </w:pPr>
-      <w:bookmarkStart w:id="192" w:name="_Toc241538583"/>
+      <w:bookmarkStart w:id="192" w:name="_Toc241538750"/>
       <w:r>
         <w:rPr>
           <w:b/>
@@ -25957,7 +25954,7 @@
         <w:spacing w:before="360" w:line="240" w:lineRule="auto"/>
       </w:pPr>
       <w:bookmarkStart w:id="193" w:name="_Toc241062329"/>
-      <w:bookmarkStart w:id="194" w:name="_Toc241538521"/>
+      <w:bookmarkStart w:id="194" w:name="_Toc241538688"/>
       <w:r>
         <w:t>6.1.5 Baterías de validación técnica del sistema</w:t>
       </w:r>
@@ -26000,7 +25997,7 @@
         <w:spacing w:before="360" w:line="240" w:lineRule="auto"/>
       </w:pPr>
       <w:bookmarkStart w:id="195" w:name="_Toc241062330"/>
-      <w:bookmarkStart w:id="196" w:name="_Toc241538522"/>
+      <w:bookmarkStart w:id="196" w:name="_Toc241538689"/>
       <w:r>
         <w:t>6.1.6 Reducción del tiempo operativo y contraste de la hipótesis</w:t>
       </w:r>
@@ -26034,7 +26031,7 @@
           <w:i/>
         </w:rPr>
       </w:pPr>
-      <w:bookmarkStart w:id="197" w:name="_Toc241538584"/>
+      <w:bookmarkStart w:id="197" w:name="_Toc241538751"/>
       <w:r>
         <w:rPr>
           <w:b/>
@@ -26668,7 +26665,7 @@
         <w:rPr>
           <w:i/>
         </w:rPr>
-        <w:t>Nota. Elaboración propia a partir de Cronometraje_datos_v2.csv (Anexo E.2). «Manual» es el tramo comparable —producción y publicación, descontada la adaptación— y «Postly», el tiempo total corregido con el historial de ejecuciones (§6.1.6), que es una cota inferior del tiempo real, porque esa subtarea no le corresponde a la usuaria: la imagen única la adapta el sistema, dentro de ese tiempo (§4.4.2). La «Reducción» es la media de las ocho reducciones individuales, no la reducción entre las medias globales de esta tabla. El detalle de la adaptación por participante y la reducción sobre el tiempo total están en el §6.1.6 y el Anexo E.2. La codificación cambió entre el piloto y la ampliación: la C1 del piloto es la C6 de la ampliación, y C2 y C3 conservan su código. Con la codificación de la ampliación, los estratos de relación son «Conocida», C2 y C3; «Familiar», C6; y «Ninguna», C1, C4, C5, C7 y C8.</w:t>
+        <w:t>Nota. Elaboración propia a partir de Cronometraje_datos_v2.csv (Anexo E.2). «Manual» es el tramo comparable —producción y publicación, descontada la adaptación— y «Postly», el tiempo total corregido con el historial de ejecuciones (§6.1.6), porque esa subtarea no le corresponde a la usuaria: la imagen única la adapta el sistema, dentro de ese tiempo (§4.4.2). Ese tiempo es una cota inferior del real (§6.1.6). La «Reducción» es la media de las ocho reducciones individuales, no la reducción entre las medias globales de esta tabla. El detalle de la adaptación por participante y la reducción sobre el tiempo total están en el §6.1.6 y el Anexo E.2. La codificación cambió entre el piloto y la ampliación: la C1 del piloto es la C6 de la ampliación, y C2 y C3 conservan su código. Con la codificación de la ampliación, los estratos de relación son «Conocida», C2 y C3; «Familiar», C6; y «Ninguna», C1, C4, C5, C7 y C8.</w:t>
       </w:r>
     </w:p>
     <w:p>
@@ -26687,16 +26684,7 @@
     </w:p>
     <w:p>
       <w:r>
-        <w:t>Falta estimar cuánto tiempo no se registró. En los 9 pares —de cinco participantes— en que el cronómetro superó al intervalo del motor, la diferencia entre ambos fue de 6 a 68 s, con una mediana de 17 s y una media de 28 s. Es lo que la usuaria tardó antes de que el motor viera la foto. Se aplica la regla del tiempo corregido con el intervalo del motor incrementado en esa cantidad. La reducción media es del 74,9 % con 10 s (t(7) = 3,31; p = 0,006). Es del 73,6 % con 17 s, la mediana (t(7) = 2,29; p = 0,028)</w:t>
-      </w:r>
-      <w:r>
-        <w:t>, y del 73,0 % con 20 s (p = 0,052). Con 28 s, la media, es del 71,4 % (t(7) = 0,80; p = 0,224). El contraste deja de ser significativo con unos 20 s, y la estimación puntual deja de superar el 70 % con unos 35 s. Los datos sostienen, entonces, una conclusión más acotada que el contraste sobre el tiempo registrado: con el tiempo omitido en su mediana observada la reducción supera el 70 % de forma significativa, y con su media no se distingue del umbral. La hipótesis es compatible con los datos, pero no qued</w:t>
-      </w:r>
-      <w:r>
-        <w:t>a confirmada de forma concluyente. Con las medidas no paramétricas que recomiendan Kitchenham y Madeyski (2024), Postly fue más rápido en los 32 pares (probabilidad de superioridad pareada = 1,00). La prueba de rangos con signo de Wilcoxon, exacta y unilateral, sobre las ocho reducciones frente al 70 % da p = 0,004 con el tiempo registrado, p = 0,027 con 17 s y p = 0,191 con 28 s. Los nueve pares en que el cronómetro cubrió todo el tramo dan una reducción media del 77,7 % (mínimo 63,1 %), aunque son un subc</w:t>
-      </w:r>
-      <w:r>
-        <w:t>onjunto que el propio cronómetro seleccionó y no un contraste. El script sensibilidad_tiempo_omitido.mjs, que está en el repositorio del proyecto (avance/instrumentos/), reproduce estas cifras desde la planilla del Anexo E.2, y run_cronometraje_v2.mjs reporta los contrastes anteriores y la cuenta con el cronómetro sin corregir.</w:t>
+        <w:t>Falta estimar cuánto tiempo no se registró. En los 9 pares —de cinco participantes— en que el cronómetro superó al intervalo del motor, la diferencia entre ambos fue de 6 a 68 s, con una mediana de 17 s y una media de 28 s. Es lo que la usuaria tardó antes de que el motor viera la foto. Se aplica la regla del tiempo corregido con el intervalo del motor incrementado en esa cantidad. La reducción media es del 74,9 % con 10 s (t(7) = 3,31; p = 0,006). Es del 73,6 % con 17 s, la mediana (t(7) = 2,29; p = 0,028), y del 73,0 % con 20 s (p = 0,052). Con 28 s, la media, es del 71,4 % (t(7) = 0,80; p = 0,224). El contraste deja de ser significativo con unos 20 s, y la estimación puntual deja de superar el 70 % con unos 35 s. Los datos sostienen, entonces, una conclusión más acotada que el contraste sobre el tiempo registrado: con el tiempo omitido en su mediana observada la reducción supera el 70 % de forma significativa, y con su media no se distingue del umbral. La hipótesis es compatible con los datos, pero no queda confirmada de forma concluyente. Con las medidas no paramétricas que recomiendan Kitchenham y Madeyski (2024), Postly fue más rápido en los 32 pares (probabilidad de superioridad pareada = 1,00). La prueba de rangos con signo de Wilcoxon, exacta y unilateral, sobre las ocho reducciones frente al 70 % da p = 0,004 con el tiempo registrado, p = 0,027 con 17 s y p = 0,191 con 28 s. Los nueve pares en que el cronómetro cubrió todo el tramo dan una reducción media del 77,7 % (mínimo 63,1 %), aunque son un subconjunto que el propio cronómetro seleccionó y no un contraste. El script sensibilidad_tiempo_omitido.mjs, que está en el repositorio del proyecto (avance/instrumentos/), reproduce estas cifras desde la planilla del Anexo E.2, y run_cronometraje_v2.mjs reporta los contrastes anteriores y la cuenta con el cronómetro sin corregir.</w:t>
       </w:r>
     </w:p>
     <w:p>
@@ -26726,7 +26714,7 @@
         <w:spacing w:before="360" w:line="240" w:lineRule="auto"/>
       </w:pPr>
       <w:bookmarkStart w:id="198" w:name="_Toc241062331"/>
-      <w:bookmarkStart w:id="199" w:name="_Toc241538523"/>
+      <w:bookmarkStart w:id="199" w:name="_Toc241538690"/>
       <w:r>
         <w:t>6.1.7 Aceptación de las usuarias (Modelo TAM)</w:t>
       </w:r>
@@ -26745,7 +26733,7 @@
       <w:pPr>
         <w:keepNext/>
       </w:pPr>
-      <w:bookmarkStart w:id="200" w:name="_Toc241538585"/>
+      <w:bookmarkStart w:id="200" w:name="_Toc241538752"/>
       <w:r>
         <w:rPr>
           <w:b/>
@@ -27009,7 +26997,7 @@
         <w:pStyle w:val="Heading3"/>
         <w:spacing w:before="360" w:line="240" w:lineRule="auto"/>
       </w:pPr>
-      <w:bookmarkStart w:id="201" w:name="_Toc241538524"/>
+      <w:bookmarkStart w:id="201" w:name="_Toc241538691"/>
       <w:r>
         <w:t>6.1.8 Evaluación externa de la calidad del copy y del orden de carrusel (OE2)</w:t>
       </w:r>
@@ -27031,7 +27019,7 @@
         <w:spacing w:before="0" w:line="276" w:lineRule="auto"/>
       </w:pPr>
       <w:bookmarkStart w:id="202" w:name="_Toc241062332"/>
-      <w:bookmarkStart w:id="203" w:name="_Toc241538525"/>
+      <w:bookmarkStart w:id="203" w:name="_Toc241538692"/>
       <w:r>
         <w:t>6.2 Desafíos de Integración y Lecciones Aprendidas</w:t>
       </w:r>
@@ -27152,7 +27140,7 @@
         <w:pStyle w:val="Heading1"/>
       </w:pPr>
       <w:bookmarkStart w:id="204" w:name="_Toc241062334"/>
-      <w:bookmarkStart w:id="205" w:name="_Toc241538526"/>
+      <w:bookmarkStart w:id="205" w:name="_Toc241538693"/>
       <w:r>
         <w:t>CAPÍTULO 7: DISCUSIÓN</w:t>
       </w:r>
@@ -27170,7 +27158,7 @@
         <w:spacing w:after="240" w:line="276" w:lineRule="auto"/>
       </w:pPr>
       <w:bookmarkStart w:id="206" w:name="_Toc241062335"/>
-      <w:bookmarkStart w:id="207" w:name="_Toc241538527"/>
+      <w:bookmarkStart w:id="207" w:name="_Toc241538694"/>
       <w:r>
         <w:t>7.1 Contraste con la literatura sobre interfaces conversacionales</w:t>
       </w:r>
@@ -27192,7 +27180,7 @@
         <w:spacing w:after="240" w:line="276" w:lineRule="auto"/>
       </w:pPr>
       <w:bookmarkStart w:id="208" w:name="_Toc241062336"/>
-      <w:bookmarkStart w:id="209" w:name="_Toc241538528"/>
+      <w:bookmarkStart w:id="209" w:name="_Toc241538695"/>
       <w:r>
         <w:t>7.2 Grounding visual y mitigación de alucinaciones</w:t>
       </w:r>
@@ -27210,7 +27198,7 @@
         <w:spacing w:after="240" w:line="276" w:lineRule="auto"/>
       </w:pPr>
       <w:bookmarkStart w:id="210" w:name="_Toc241062337"/>
-      <w:bookmarkStart w:id="211" w:name="_Toc241538529"/>
+      <w:bookmarkStart w:id="211" w:name="_Toc241538696"/>
       <w:r>
         <w:t>7.3 Compliance automatizado y RegTech</w:t>
       </w:r>
@@ -27247,7 +27235,7 @@
         <w:spacing w:after="240" w:line="276" w:lineRule="auto"/>
       </w:pPr>
       <w:bookmarkStart w:id="212" w:name="_Toc241062338"/>
-      <w:bookmarkStart w:id="213" w:name="_Toc241538530"/>
+      <w:bookmarkStart w:id="213" w:name="_Toc241538697"/>
       <w:r>
         <w:t>7.4 Visibilidad algorítmica y consistencia estética</w:t>
       </w:r>
@@ -27265,7 +27253,7 @@
         <w:spacing w:after="240" w:line="276" w:lineRule="auto"/>
       </w:pPr>
       <w:bookmarkStart w:id="214" w:name="_Toc241062339"/>
-      <w:bookmarkStart w:id="215" w:name="_Toc241538531"/>
+      <w:bookmarkStart w:id="215" w:name="_Toc241538698"/>
       <w:r>
         <w:t>7.5 Frente al vacío tecnológico del Estado del Arte</w:t>
       </w:r>
@@ -27287,7 +27275,7 @@
         <w:spacing w:after="240" w:line="276" w:lineRule="auto"/>
       </w:pPr>
       <w:bookmarkStart w:id="216" w:name="_Toc241062340"/>
-      <w:bookmarkStart w:id="217" w:name="_Toc241538532"/>
+      <w:bookmarkStart w:id="217" w:name="_Toc241538699"/>
       <w:r>
         <w:t>7.6 Aporte original frente a integración de tecnologías existentes</w:t>
       </w:r>
@@ -27305,7 +27293,7 @@
         <w:spacing w:after="240" w:line="276" w:lineRule="auto"/>
       </w:pPr>
       <w:bookmarkStart w:id="218" w:name="_Toc241062341"/>
-      <w:bookmarkStart w:id="219" w:name="_Toc241538533"/>
+      <w:bookmarkStart w:id="219" w:name="_Toc241538700"/>
       <w:r>
         <w:t>7.7 Limitaciones de la evidencia</w:t>
       </w:r>
@@ -27347,7 +27335,7 @@
         <w:spacing w:after="240" w:line="276" w:lineRule="auto"/>
       </w:pPr>
       <w:bookmarkStart w:id="220" w:name="_Toc241062342"/>
-      <w:bookmarkStart w:id="221" w:name="_Toc241538534"/>
+      <w:bookmarkStart w:id="221" w:name="_Toc241538701"/>
       <w:r>
         <w:t>7.8 Transferibilidad</w:t>
       </w:r>
@@ -27377,7 +27365,7 @@
         <w:pStyle w:val="Heading1"/>
       </w:pPr>
       <w:bookmarkStart w:id="222" w:name="_Toc241062343"/>
-      <w:bookmarkStart w:id="223" w:name="_Toc241538535"/>
+      <w:bookmarkStart w:id="223" w:name="_Toc241538702"/>
       <w:r>
         <w:t>CAPÍTULO 8. CONCLUSIONES Y RECOMENDACIONES</w:t>
       </w:r>
@@ -27413,7 +27401,7 @@
         <w:spacing w:after="240" w:line="276" w:lineRule="auto"/>
       </w:pPr>
       <w:bookmarkStart w:id="224" w:name="_Toc241062344"/>
-      <w:bookmarkStart w:id="225" w:name="_Toc241538536"/>
+      <w:bookmarkStart w:id="225" w:name="_Toc241538703"/>
       <w:r>
         <w:t>8.1 Conclusiones Generales y Cumplimiento de Objetivos</w:t>
       </w:r>
@@ -27586,7 +27574,7 @@
         <w:t>Sobre la hipótesis central del proyecto:</w:t>
       </w:r>
       <w:r>
-        <w:t xml:space="preserve"> el §3.5.4 planteó que el sistema reduce el tiempo operativo de publicación en más de un 70 % respecto del proceso manual. El diseño no aísla la interfaz conversacional: la reducción es la del sistema completo. En la ampliación de ocho consultoras, el cronometraje intra-sujeto de 32 pares arrojó una reducción media del 76,7 % sobre el tramo comparable, (IC 95 % [73,5 %; 79,9 %]; t(7) = 4,90 frente al 70 %). Es una cota </w:t>
+        <w:t xml:space="preserve"> el §3.5.4 planteó que el sistema reduce el tiempo operativo de publicación en más de un 70 % respecto del proceso manual. El diseño no aísla la interfaz conversacional: la reducción es la del sistema completo. En la ampliación de ocho consultoras, el cronometraje intra-sujeto de 32 pares arrojó una reducción media del 76,7 % sobre el tramo comparable (IC 95 % [73,5 %; 79,9 %]; t(7) = 4,90 frente al 70 %). Es una cota </w:t>
       </w:r>
       <w:r>
         <w:lastRenderedPageBreak/>
@@ -27612,7 +27600,7 @@
         <w:spacing w:after="240" w:line="276" w:lineRule="auto"/>
       </w:pPr>
       <w:bookmarkStart w:id="226" w:name="_Toc241062345"/>
-      <w:bookmarkStart w:id="227" w:name="_Toc241538537"/>
+      <w:bookmarkStart w:id="227" w:name="_Toc241538704"/>
       <w:r>
         <w:t>8.2 Recomendaciones Priorizadas</w:t>
       </w:r>
@@ -27865,7 +27853,7 @@
         <w:pStyle w:val="Heading1"/>
       </w:pPr>
       <w:bookmarkStart w:id="228" w:name="_Toc241062346"/>
-      <w:bookmarkStart w:id="229" w:name="_Toc241538538"/>
+      <w:bookmarkStart w:id="229" w:name="_Toc241538705"/>
       <w:r>
         <w:t>CAPÍTULO 9. REFERENCIAS BIBLIOGRÁFICAS</w:t>
       </w:r>
@@ -31200,7 +31188,7 @@
         <w:pStyle w:val="Heading1"/>
       </w:pPr>
       <w:bookmarkStart w:id="231" w:name="_Toc241062347"/>
-      <w:bookmarkStart w:id="232" w:name="_Toc241538539"/>
+      <w:bookmarkStart w:id="232" w:name="_Toc241538706"/>
       <w:r>
         <w:t>CAPÍTULO 10. ANEXOS</w:t>
       </w:r>
@@ -31223,7 +31211,7 @@
         <w:pStyle w:val="Heading2"/>
       </w:pPr>
       <w:bookmarkStart w:id="233" w:name="_Toc241062348"/>
-      <w:bookmarkStart w:id="234" w:name="_Toc241538540"/>
+      <w:bookmarkStart w:id="234" w:name="_Toc241538707"/>
       <w:r>
         <w:t>Anexo A — Tabla de cumplimiento de Historias de Usuario</w:t>
       </w:r>
@@ -31235,7 +31223,7 @@
         <w:pStyle w:val="Heading3"/>
       </w:pPr>
       <w:bookmarkStart w:id="235" w:name="_Toc241062349"/>
-      <w:bookmarkStart w:id="236" w:name="_Toc241538541"/>
+      <w:bookmarkStart w:id="236" w:name="_Toc241538708"/>
       <w:r>
         <w:t>A.1 Cumplimiento de las Historias de Usuario</w:t>
       </w:r>
@@ -31252,7 +31240,7 @@
       <w:pPr>
         <w:keepNext/>
       </w:pPr>
-      <w:bookmarkStart w:id="237" w:name="_Toc241538586"/>
+      <w:bookmarkStart w:id="237" w:name="_Toc241538753"/>
       <w:r>
         <w:rPr>
           <w:b/>
@@ -32977,7 +32965,7 @@
         <w:pStyle w:val="Heading3"/>
       </w:pPr>
       <w:bookmarkStart w:id="238" w:name="_Toc241062350"/>
-      <w:bookmarkStart w:id="239" w:name="_Toc241538542"/>
+      <w:bookmarkStart w:id="239" w:name="_Toc241538709"/>
       <w:r>
         <w:t>A.2 Cronología del desarrollo reconstruida del repositorio</w:t>
       </w:r>
@@ -33059,7 +33047,7 @@
         <w:pStyle w:val="Heading2"/>
       </w:pPr>
       <w:bookmarkStart w:id="240" w:name="_Toc241062351"/>
-      <w:bookmarkStart w:id="241" w:name="_Toc241538543"/>
+      <w:bookmarkStart w:id="241" w:name="_Toc241538710"/>
       <w:r>
         <w:t>Anexo B — Arquitectura técnica y decisiones de diseño</w:t>
       </w:r>
@@ -33078,7 +33066,7 @@
         <w:pStyle w:val="Heading3"/>
       </w:pPr>
       <w:bookmarkStart w:id="242" w:name="_Toc241062352"/>
-      <w:bookmarkStart w:id="243" w:name="_Toc241538544"/>
+      <w:bookmarkStart w:id="243" w:name="_Toc241538711"/>
       <w:r>
         <w:t>B.1 Infraestructura de despliegue</w:t>
       </w:r>
@@ -33104,7 +33092,7 @@
         <w:pStyle w:val="Heading3"/>
       </w:pPr>
       <w:bookmarkStart w:id="244" w:name="_Toc241062353"/>
-      <w:bookmarkStart w:id="245" w:name="_Toc241538545"/>
+      <w:bookmarkStart w:id="245" w:name="_Toc241538712"/>
       <w:r>
         <w:t>B.2 Inventario de workflows y su función</w:t>
       </w:r>
@@ -33274,7 +33262,7 @@
         <w:pStyle w:val="Heading3"/>
       </w:pPr>
       <w:bookmarkStart w:id="246" w:name="_Toc241062354"/>
-      <w:bookmarkStart w:id="247" w:name="_Toc241538546"/>
+      <w:bookmarkStart w:id="247" w:name="_Toc241538713"/>
       <w:r>
         <w:t>B.3 Seguridad de credenciales</w:t>
       </w:r>
@@ -33291,7 +33279,7 @@
         <w:pStyle w:val="Heading3"/>
       </w:pPr>
       <w:bookmarkStart w:id="248" w:name="_Toc241062355"/>
-      <w:bookmarkStart w:id="249" w:name="_Toc241538547"/>
+      <w:bookmarkStart w:id="249" w:name="_Toc241538714"/>
       <w:r>
         <w:t>B.4 Módulo Centinela de Compliance: implementación</w:t>
       </w:r>
@@ -33354,7 +33342,7 @@
         <w:pStyle w:val="Heading3"/>
       </w:pPr>
       <w:bookmarkStart w:id="250" w:name="_Toc241062356"/>
-      <w:bookmarkStart w:id="251" w:name="_Toc241538548"/>
+      <w:bookmarkStart w:id="251" w:name="_Toc241538715"/>
       <w:r>
         <w:t>B.5 Concurrencia en la ingesta de carruseles</w:t>
       </w:r>
@@ -33375,7 +33363,7 @@
         <w:pStyle w:val="Heading3"/>
       </w:pPr>
       <w:bookmarkStart w:id="252" w:name="_Toc241062357"/>
-      <w:bookmarkStart w:id="253" w:name="_Toc241538549"/>
+      <w:bookmarkStart w:id="253" w:name="_Toc241538716"/>
       <w:r>
         <w:t>B.6 Prevención de publicaciones duplicadas</w:t>
       </w:r>
@@ -33401,7 +33389,7 @@
         <w:pStyle w:val="Heading3"/>
       </w:pPr>
       <w:bookmarkStart w:id="254" w:name="_Toc241062358"/>
-      <w:bookmarkStart w:id="255" w:name="_Toc241538550"/>
+      <w:bookmarkStart w:id="255" w:name="_Toc241538717"/>
       <w:r>
         <w:t>B.7 Publicación multiplataforma: extensión a Facebook</w:t>
       </w:r>
@@ -33418,7 +33406,7 @@
         <w:pStyle w:val="Heading3"/>
       </w:pPr>
       <w:bookmarkStart w:id="256" w:name="_Toc241062359"/>
-      <w:bookmarkStart w:id="257" w:name="_Toc241538551"/>
+      <w:bookmarkStart w:id="257" w:name="_Toc241538718"/>
       <w:r>
         <w:t>B.8 Sincronización de estado con Instagram</w:t>
       </w:r>
@@ -33435,7 +33423,7 @@
         <w:pStyle w:val="Heading3"/>
       </w:pPr>
       <w:bookmarkStart w:id="258" w:name="_Toc241062360"/>
-      <w:bookmarkStart w:id="259" w:name="_Toc241538552"/>
+      <w:bookmarkStart w:id="259" w:name="_Toc241538719"/>
       <w:r>
         <w:t>B.9 Procesamiento de video (HU13): detalle de implementación</w:t>
       </w:r>
@@ -33457,7 +33445,7 @@
         <w:pStyle w:val="Heading2"/>
       </w:pPr>
       <w:bookmarkStart w:id="260" w:name="_Toc241062361"/>
-      <w:bookmarkStart w:id="261" w:name="_Toc241538553"/>
+      <w:bookmarkStart w:id="261" w:name="_Toc241538720"/>
       <w:r>
         <w:t>Anexo C — Lecciones aprendidas y desafíos técnicos</w:t>
       </w:r>
@@ -33476,7 +33464,7 @@
         <w:pStyle w:val="Heading3"/>
       </w:pPr>
       <w:bookmarkStart w:id="262" w:name="_Toc241062362"/>
-      <w:bookmarkStart w:id="263" w:name="_Toc241538554"/>
+      <w:bookmarkStart w:id="263" w:name="_Toc241538721"/>
       <w:r>
         <w:t>C.1 Restricciones de infraestructura: el problema de las tarjetas virtuales</w:t>
       </w:r>
@@ -33497,7 +33485,7 @@
         <w:pStyle w:val="Heading3"/>
       </w:pPr>
       <w:bookmarkStart w:id="264" w:name="_Toc241062363"/>
-      <w:bookmarkStart w:id="265" w:name="_Toc241538555"/>
+      <w:bookmarkStart w:id="265" w:name="_Toc241538722"/>
       <w:r>
         <w:t>C.2 Concurrencia en flujos disparados por eventos externos</w:t>
       </w:r>
@@ -33514,7 +33502,7 @@
         <w:pStyle w:val="Heading3"/>
       </w:pPr>
       <w:bookmarkStart w:id="266" w:name="_Toc241062364"/>
-      <w:bookmarkStart w:id="267" w:name="_Toc241538556"/>
+      <w:bookmarkStart w:id="267" w:name="_Toc241538723"/>
       <w:r>
         <w:t>C.3 Integridad de datos al editar el sistema por su propia API</w:t>
       </w:r>
@@ -33531,7 +33519,7 @@
         <w:pStyle w:val="Heading3"/>
       </w:pPr>
       <w:bookmarkStart w:id="268" w:name="_Toc241062365"/>
-      <w:bookmarkStart w:id="269" w:name="_Toc241538557"/>
+      <w:bookmarkStart w:id="269" w:name="_Toc241538724"/>
       <w:r>
         <w:t>C.4 Regresiones de plataforma en la migración al servidor propio</w:t>
       </w:r>
@@ -33552,7 +33540,7 @@
         <w:pStyle w:val="Heading3"/>
       </w:pPr>
       <w:bookmarkStart w:id="270" w:name="_Toc241062366"/>
-      <w:bookmarkStart w:id="271" w:name="_Toc241538558"/>
+      <w:bookmarkStart w:id="271" w:name="_Toc241538725"/>
       <w:r>
         <w:t>C.5 Restricciones del entorno de ejecución para el procesamiento de video</w:t>
       </w:r>
@@ -33569,7 +33557,7 @@
         <w:pStyle w:val="Heading3"/>
       </w:pPr>
       <w:bookmarkStart w:id="272" w:name="_Toc241062367"/>
-      <w:bookmarkStart w:id="273" w:name="_Toc241538559"/>
+      <w:bookmarkStart w:id="273" w:name="_Toc241538726"/>
       <w:r>
         <w:t>C.6 Integración con servicios externos: formatos de envío no documentados con claridad</w:t>
       </w:r>
@@ -33586,7 +33574,7 @@
         <w:pStyle w:val="Heading3"/>
       </w:pPr>
       <w:bookmarkStart w:id="274" w:name="_Toc241062368"/>
-      <w:bookmarkStart w:id="275" w:name="_Toc241538560"/>
+      <w:bookmarkStart w:id="275" w:name="_Toc241538727"/>
       <w:r>
         <w:t>C.7 Errores intermitentes en APIs de terceros</w:t>
       </w:r>
@@ -33603,7 +33591,7 @@
         <w:pStyle w:val="Heading3"/>
       </w:pPr>
       <w:bookmarkStart w:id="276" w:name="_Toc241062369"/>
-      <w:bookmarkStart w:id="277" w:name="_Toc241538561"/>
+      <w:bookmarkStart w:id="277" w:name="_Toc241538728"/>
       <w:r>
         <w:lastRenderedPageBreak/>
         <w:t>C.8 Límites de cuota en servicios de IA gratuitos</w:t>
@@ -33622,7 +33610,7 @@
         <w:pStyle w:val="Heading2"/>
       </w:pPr>
       <w:bookmarkStart w:id="278" w:name="_Toc241062370"/>
-      <w:bookmarkStart w:id="279" w:name="_Toc241538562"/>
+      <w:bookmarkStart w:id="279" w:name="_Toc241538729"/>
       <w:r>
         <w:t>Anexo D — Pautas Mary Kay para el uso en los medios sociales</w:t>
       </w:r>
@@ -33720,7 +33708,7 @@
         <w:pStyle w:val="Heading2"/>
       </w:pPr>
       <w:bookmarkStart w:id="280" w:name="_Toc241062371"/>
-      <w:bookmarkStart w:id="281" w:name="_Toc241538563"/>
+      <w:bookmarkStart w:id="281" w:name="_Toc241538730"/>
       <w:r>
         <w:t>Anexo E — Protocolo de validación empírica y conjuntos de datos</w:t>
       </w:r>
@@ -33740,7 +33728,7 @@
         <w:pStyle w:val="Heading3"/>
       </w:pPr>
       <w:bookmarkStart w:id="282" w:name="_Toc241062372"/>
-      <w:bookmarkStart w:id="283" w:name="_Toc241538564"/>
+      <w:bookmarkStart w:id="283" w:name="_Toc241538731"/>
       <w:r>
         <w:t>E.1 Validación del Módulo Centinela de Compliance</w:t>
       </w:r>
@@ -33831,7 +33819,7 @@
       <w:pPr>
         <w:keepNext/>
       </w:pPr>
-      <w:bookmarkStart w:id="284" w:name="_Toc241538587"/>
+      <w:bookmarkStart w:id="284" w:name="_Toc241538754"/>
       <w:r>
         <w:rPr>
           <w:b/>
@@ -36341,7 +36329,7 @@
         <w:pStyle w:val="Heading3"/>
       </w:pPr>
       <w:bookmarkStart w:id="285" w:name="_Toc241062373"/>
-      <w:bookmarkStart w:id="286" w:name="_Toc241538565"/>
+      <w:bookmarkStart w:id="286" w:name="_Toc241538732"/>
       <w:r>
         <w:t>E.2 Protocolo de cronometraje del tiempo operativo</w:t>
       </w:r>
@@ -36405,7 +36393,7 @@
         <w:pStyle w:val="Heading3"/>
       </w:pPr>
       <w:bookmarkStart w:id="287" w:name="_Toc241062374"/>
-      <w:bookmarkStart w:id="288" w:name="_Toc241538566"/>
+      <w:bookmarkStart w:id="288" w:name="_Toc241538733"/>
       <w:r>
         <w:t>E.3 Cuestionario de aceptación tecnológica (TAM)</w:t>
       </w:r>
@@ -36437,7 +36425,7 @@
         <w:pStyle w:val="Heading3"/>
       </w:pPr>
       <w:bookmarkStart w:id="289" w:name="_Toc241062375"/>
-      <w:bookmarkStart w:id="290" w:name="_Toc241538567"/>
+      <w:bookmarkStart w:id="290" w:name="_Toc241538734"/>
       <w:r>
         <w:t>E.4 Reproducibilidad de los análisis</w:t>
       </w:r>
@@ -36525,7 +36513,7 @@
         <w:pStyle w:val="Heading3"/>
       </w:pPr>
       <w:bookmarkStart w:id="291" w:name="_Toc241062376"/>
-      <w:bookmarkStart w:id="292" w:name="_Toc241538568"/>
+      <w:bookmarkStart w:id="292" w:name="_Toc241538735"/>
       <w:r>
         <w:t>E.5 Baterías de validación técnica</w:t>
       </w:r>
@@ -36556,7 +36544,7 @@
       <w:pPr>
         <w:keepNext/>
       </w:pPr>
-      <w:bookmarkStart w:id="293" w:name="_Toc241538588"/>
+      <w:bookmarkStart w:id="293" w:name="_Toc241538755"/>
       <w:r>
         <w:t xml:space="preserve">Tabla </w:t>
       </w:r>
@@ -37427,7 +37415,7 @@
         <w:pStyle w:val="Heading3"/>
       </w:pPr>
       <w:bookmarkStart w:id="294" w:name="_Toc241062377"/>
-      <w:bookmarkStart w:id="295" w:name="_Toc241538569"/>
+      <w:bookmarkStart w:id="295" w:name="_Toc241538736"/>
       <w:r>
         <w:t>E.6 Conjunto ampliado del canal de imagen (HU8)</w:t>
       </w:r>
@@ -37510,7 +37498,7 @@
       <w:pPr>
         <w:keepNext/>
       </w:pPr>
-      <w:bookmarkStart w:id="296" w:name="_Toc241538589"/>
+      <w:bookmarkStart w:id="296" w:name="_Toc241538756"/>
       <w:r>
         <w:t xml:space="preserve">Tabla </w:t>
       </w:r>
@@ -37725,7 +37713,7 @@
         <w:pStyle w:val="Heading3"/>
       </w:pPr>
       <w:bookmarkStart w:id="297" w:name="_Toc241062378"/>
-      <w:bookmarkStart w:id="298" w:name="_Toc241538570"/>
+      <w:bookmarkStart w:id="298" w:name="_Toc241538737"/>
       <w:r>
         <w:t>E.7 Verificación de los umbrales de las Historias de Usuario</w:t>
       </w:r>
@@ -37760,7 +37748,7 @@
       <w:pPr>
         <w:keepNext/>
       </w:pPr>
-      <w:bookmarkStart w:id="299" w:name="_Toc241538590"/>
+      <w:bookmarkStart w:id="299" w:name="_Toc241538757"/>
       <w:r>
         <w:lastRenderedPageBreak/>
         <w:t xml:space="preserve">Tabla </w:t>
@@ -38948,7 +38936,7 @@
         <w:pStyle w:val="Heading3"/>
       </w:pPr>
       <w:bookmarkStart w:id="300" w:name="_Toc241062379"/>
-      <w:bookmarkStart w:id="301" w:name="_Toc241538571"/>
+      <w:bookmarkStart w:id="301" w:name="_Toc241538738"/>
       <w:r>
         <w:t>E.8 Casos difíciles del canal de imagen y variabilidad entre corridas</w:t>
       </w:r>
@@ -39005,7 +38993,7 @@
       <w:pPr>
         <w:keepNext/>
       </w:pPr>
-      <w:bookmarkStart w:id="302" w:name="_Toc241538591"/>
+      <w:bookmarkStart w:id="302" w:name="_Toc241538758"/>
       <w:r>
         <w:t xml:space="preserve">Tabla </w:t>
       </w:r>
@@ -39213,7 +39201,7 @@
         <w:pStyle w:val="Heading3"/>
       </w:pPr>
       <w:bookmarkStart w:id="303" w:name="_Toc241062380"/>
-      <w:bookmarkStart w:id="304" w:name="_Toc241538572"/>
+      <w:bookmarkStart w:id="304" w:name="_Toc241538739"/>
       <w:r>
         <w:t>E.9 Casos de video del canal visual (HU13)</w:t>
       </w:r>
@@ -39264,7 +39252,7 @@
         <w:pStyle w:val="Heading3"/>
       </w:pPr>
       <w:bookmarkStart w:id="305" w:name="_Toc241062381"/>
-      <w:bookmarkStart w:id="306" w:name="_Toc241538573"/>
+      <w:bookmarkStart w:id="306" w:name="_Toc241538740"/>
       <w:r>
         <w:t>E.10 Caso de carrusel del canal visual (HU5)</w:t>
       </w:r>
@@ -39315,7 +39303,7 @@
         <w:pStyle w:val="Heading3"/>
       </w:pPr>
       <w:bookmarkStart w:id="307" w:name="_Toc241062382"/>
-      <w:bookmarkStart w:id="308" w:name="_Toc241538574"/>
+      <w:bookmarkStart w:id="308" w:name="_Toc241538741"/>
       <w:r>
         <w:t>E.11 Caso de re-publicación del canal visual (HU12)</w:t>
       </w:r>
@@ -39358,7 +39346,7 @@
         <w:pStyle w:val="Heading3"/>
       </w:pPr>
       <w:bookmarkStart w:id="309" w:name="_Toc241062383"/>
-      <w:bookmarkStart w:id="310" w:name="_Toc241538575"/>
+      <w:bookmarkStart w:id="310" w:name="_Toc241538742"/>
       <w:r>
         <w:t>E.12 Gobierno del llamado a la acción generado</w:t>
       </w:r>
@@ -39409,7 +39397,7 @@
         <w:pStyle w:val="Heading3"/>
       </w:pPr>
       <w:bookmarkStart w:id="311" w:name="_Toc241062384"/>
-      <w:bookmarkStart w:id="312" w:name="_Toc241538576"/>
+      <w:bookmarkStart w:id="312" w:name="_Toc241538743"/>
       <w:r>
         <w:t>E.13 Trazabilidad de los Objetivos Específicos</w:t>
       </w:r>
@@ -39428,7 +39416,7 @@
       <w:pPr>
         <w:keepNext/>
       </w:pPr>
-      <w:bookmarkStart w:id="313" w:name="_Toc241538592"/>
+      <w:bookmarkStart w:id="313" w:name="_Toc241538759"/>
       <w:r>
         <w:t xml:space="preserve">Tabla </w:t>
       </w:r>
@@ -39990,7 +39978,7 @@
       <w:pPr>
         <w:pStyle w:val="Heading3"/>
       </w:pPr>
-      <w:bookmarkStart w:id="314" w:name="_Toc241538577"/>
+      <w:bookmarkStart w:id="314" w:name="_Toc241538744"/>
       <w:r>
         <w:lastRenderedPageBreak/>
         <w:t>E.14 Objetivo Específico 2 — calidad del copy y comparación con el trabajo manual</w:t>

</xml_diff>

<commit_message>
docs(tesis): devolucion del profesor, 2.a instancia: N-01, N-02, N-07, N-08, N-09 y N-12 en el texto (pasadas 180-182)
- N-01: tres entornos (E1 dado de baja, E2 local, E3 vigente desde el 01-10)
  en B.1, 3.5.5, 5.1.1, 8.1, 8.2 y el Resumen; el OE-1 aclara que la
  autorizacion en Meta solo la ejecutaron los autores.
- N-02: Anexo E.15 con la Tabla 16, version del workflow (commit, fecha, nodos,
  SHA-256) x resultados. Al final del Anexo E, sin renumerar. Verificado que el
  prompt de HU8 es identico desde el 02-07 y los 8 prompts de IA desde el 19-09.
- N-07: OE3 "se cumplio con alcance acotado".
- N-08/N-09: Config por consultora, retencion de 14 dias, borrado en Cloudinary
  (3.7.1, 7.7, 8.2, notas de las Figs. 5 y 6); Figura 5 redibujada.
- N-12: binomiales exactas bilaterales; carruseles de dos imagenes en el cuerpo.
- B.9 y nota de la Fig. 6: el video se sube ANTES de la deteccion, no despues.

Co-Authored-By: Claude Opus 5.5 <noreply@anthropic.com>
</commit_message>
<xml_diff>
--- a/avance/Tesis Postly Bontorno Hassan-1 v2.docx
+++ b/avance/Tesis Postly Bontorno Hassan-1 v2.docx
@@ -12099,12 +12099,9 @@
         <w:spacing w:before="240" w:after="240" w:line="240" w:lineRule="auto"/>
       </w:pPr>
       <w:r>
-        <w:t xml:space="preserve">Construido bajo Design Science Research hasta un Producto Mínimo Viable, orquesta en n8n un bot de Telegram, el modelo multimodal Gemini 2.5 Flash y la API Graph de Meta, con persistencia en Google Sheets. Su componente diferencial es un Módulo Centinela que audita cada publicación antes de emitirla, con un canal textual determinista y uno visual delegado al modelo. Se </w:t>
-      </w:r>
-      <w:r>
-        <w:lastRenderedPageBreak/>
-        <w:t>validó de extremo a extremo sobre un servidor hoy dado de baja, y las mediciones corrieron sobre una instancia local.</w:t>
-      </w:r>
+        <w:t>Construido bajo Design Science Research hasta un Producto Mínimo Viable, orquesta en n8n un bot de Telegram, el modelo multimodal Gemini 2.5 Flash y la API Graph de Meta, con persistencia en Google Sheets. Su componente diferencial es un Módulo Centinela que audita cada publicación antes de emitirla, con un canal textual determinista y uno visual delegado al modelo. Se validó de extremo a extremo sobre un primer servidor propio, las mediciones corrieron sobre una instancia local y el sistema corre hoy sobre un segundo servidor.</w:t>
+      </w:r>
+      <w:r/>
     </w:p>
     <w:p>
       <w:pPr>
@@ -16915,7 +16912,7 @@
     </w:p>
     <w:p>
       <w:r>
-        <w:t>Entorno de medición: las mediciones del Capítulo 6 corrieron sobre E2, una instancia local de n8n sobre Windows expuesta por un túnel, y no sobre E1, el servidor Linux en el que se validaron las catorce Historias de Usuario. E1 se dio de baja el 14 de septiembre de 2026 (Anexo B.1). Los dos entornos no se comportan igual en todo: el Anexo C.4 documenta diferencias de sistema operativo —las rutas temporales— y de validación en algunos nodos, que pueden deberse a la versión del motor instalada en cada uno. Las latencias del Anexo E.5 incluyen además el túnel y la máquina local, de modo que caracterizan E2 y no un despliegue. Lo que no depende del entorno sí se transfiere: las reglas del detector, idénticas carácter por carácter a las del workflow (Anexo E.4), y las respuestas del modelo, que es un servicio externo. Al cierre de este trabajo el sistema no tiene un despliegue permanente.</w:t>
+        <w:t>Entorno de medición: las mediciones del Capítulo 6 corrieron sobre E2, una instancia local de n8n sobre Windows expuesta por un túnel, y no sobre E1, el servidor Linux en el que se validaron las catorce Historias de Usuario. E1 se dio de baja el 14 de septiembre de 2026, y el sistema corre desde el 1 de octubre sobre E3, donde las mediciones no se repitieron (Anexo B.1). Los dos entornos no se comportan igual en todo: el Anexo C.4 documenta diferencias de sistema operativo —las rutas temporales— y de validación en algunos nodos, que pueden deberse a la versión del motor instalada en cada uno. Las latencias del Anexo E.5 incluyen además el túnel y la máquina local, de modo que caracterizan E2 y no un despliegue. Lo que no depende del entorno sí se transfiere: las reglas del detector, idénticas carácter por carácter a las del workflow (Anexo E.4), y las respuestas del modelo, que es un servicio externo. La versión del workflow que produjo cada medición, y en qué difiere de la vigente, se detalla en el Anexo E.15.</w:t>
       </w:r>
     </w:p>
     <w:p>
@@ -17106,7 +17103,7 @@
         <w:spacing w:before="240" w:after="240"/>
       </w:pPr>
       <w:r>
-        <w:t>Fuera de esas dos hojas, el despliegue almacena cinco cosas más, y declararlas es parte del principio. La hoja Config guarda la firma y el contacto de la consultora. El historial de ejecuciones del motor n8n, en su base SQLite, conserva los updates completos de Telegram, que incluyen el nombre, el apellido y el identificador de quien escribe; no tiene configurada ninguna política de retención, de modo que se conserva hasta que se lo borre a mano. El armado de un carrusel usa un archivo del servidor como buffer (Anexo B.5), y la deduplicación de pulsaciones guarda identificadores de callback. Y los activos multimedia de las usuarias —las imágenes y los videos— se alojan en Cloudinary, que es infraestructura de un tercero. La imagen única se sube antes de la auditoría visual, de modo que una imagen que el módulo bloquea por traer un precio queda igualmente alojada allí: el sistema no la borra. El principio que el sistema aplica no es, por lo tanto, que no haya ningún otro dato personal, sino que no se recolecta ninguno ajeno a la ejecución del flujo de publicación. El historial de ejecuciones es donde ese principio queda más expuesto, porque guarda el update entero y no el subconjunto que el flujo necesita. Es, con precisión, una debilidad de privacidad declarada y no corregida. Cerrarla no exige rediseñar nada, sino fijar en el motor una política de retención y depurar el historial ya acumulado, y queda entre las recomendaciones del §8.2.</w:t>
+        <w:t>Fuera de esas dos hojas, el despliegue almacena cinco cosas más, y declararlas es parte del principio. La hoja Config guarda la firma y el contacto de cada consultora, en una fila con su TelegramUserID, y una fila general para la que no tiene una propia. El historial de ejecuciones del motor n8n, en su base SQLite, conserva los updates completos de Telegram, que incluyen el nombre, el apellido y el identificador de quien escribe; en E3 el motor lo purga a los catorce días. El de E2, del que salen la Tabla 13 y la conciliación de tiempos del Anexo E.2, se conserva en la máquina de los autores, sin exposición pública. El armado de un carrusel usa un archivo del servidor como buffer (Anexo B.5), y la deduplicación de pulsaciones guarda identificadores de callback. Y los activos multimedia de las usuarias —las imágenes y los videos— se alojan en Cloudinary, que es infraestructura de un tercero. Las imágenes y los videos se suben antes de la auditoría visual, porque el modelo los lee por URL. Cuando el módulo bloquea una pieza por traer un precio, un nodo la borra de Cloudinary en paralelo al aviso, con el video y sus fotogramas; un bloqueo por el texto no borra nada, porque la usuaria corrige el copy y reintenta con las mismas imágenes. Lo subido antes del 1 de octubre de 2026 no se depuró. El principio que el sistema aplica no es, por lo tanto, que no haya ningún otro dato personal, sino que no se recolecta ninguno ajeno a la ejecución del flujo de publicación. El historial de ejecuciones es donde ese principio queda más expuesto, porque guarda el update entero y no el subconjunto que el flujo necesita. La purga de catorce días acota esa exposición sin eliminarla: durante ese plazo el historial guarda más de lo que el flujo necesita (§8.2).</w:t>
       </w:r>
     </w:p>
     <w:p>
@@ -20474,7 +20471,7 @@
         <w:spacing w:after="240" w:line="276" w:lineRule="auto"/>
       </w:pPr>
       <w:r>
-        <w:t xml:space="preserve">La macro-arquitectura de Postly es un orquestador centralizado dirigido por eventos, con bajo acoplamiento y alta cohesión (Erl, 2005; Newman, 2015). Es un workflow principal de ~207 nodos ejecutado en un único proceso n8n, que guarda su propio historial de ejecuciones en SQLite (Anexo B.1, B.2); la persistencia del sistema es la de Google Sheets (§5.1.1). Sus componentes no se despliegan, versionan ni escalan por separado, y Dragoni et al. (2017) separan el monolito del microservicio justamente por la ejecución y el </w:t>
+        <w:t xml:space="preserve">La macro-arquitectura de Postly es un orquestador centralizado dirigido por eventos, con bajo acoplamiento y alta cohesión (Erl, 2005; Newman, 2015). Es un workflow principal de 213 nodos ejecutado en un único proceso n8n, que guarda su propio historial de ejecuciones en SQLite (Anexo B.1, B.2); la persistencia del sistema es la de Google Sheets (§5.1.1). Sus componentes no se despliegan, versionan ni escalan por separado, y Dragoni et al. (2017) separan el monolito del microservicio justamente por la ejecución y el </w:t>
       </w:r>
       <w:r>
         <w:lastRenderedPageBreak/>
@@ -20614,7 +20611,7 @@
         <w:t xml:space="preserve"> / n8n):</w:t>
       </w:r>
       <w:r>
-        <w:t xml:space="preserve"> Implementada con el motor low-code n8n —en E1, el servidor dado de baja; hoy, en la instancia local E2 (Anexo B.1)—, es el núcleo operativo del sistema. Su función es instanciar </w:t>
+        <w:t xml:space="preserve"> Implementada con el motor low-code n8n —sobre un servidor propio: E1 hasta septiembre de 2026 y E3 desde octubre (Anexo B.1)—, es el núcleo operativo del sistema. Su función es instanciar </w:t>
       </w:r>
       <w:r>
         <w:rPr>
@@ -20785,7 +20782,7 @@
         </w:rPr>
         <w:drawing>
           <wp:inline distT="0" distB="0" distL="0" distR="0" wp14:anchorId="254DBC8D" wp14:editId="32472D4A">
-            <wp:extent cx="5400000" cy="1932065"/>
+            <wp:extent cx="5400000" cy="2103261"/>
             <wp:effectExtent l="0" t="0" r="0" b="0"/>
             <wp:docPr id="4" name="Picture 4"/>
             <wp:cNvGraphicFramePr>
@@ -20807,7 +20804,7 @@
                   <pic:spPr>
                     <a:xfrm>
                       <a:off x="0" y="0"/>
-                      <a:ext cx="5400000" cy="1932065"/>
+                      <a:ext cx="5400000" cy="2103261"/>
                     </a:xfrm>
                     <a:prstGeom prst="rect">
                       <a:avLst/>
@@ -20829,7 +20826,7 @@
           <w:i/>
           <w:sz w:val="20"/>
         </w:rPr>
-        <w:t>Nota. Fuente: elaboración propia. Los nombres son los de las columnas de la hoja, leídos del workflow desplegado (Anexo B.2). TelegramUserID es el identificador que Telegram asigna a la conversación, y es a la vez la clave por la que se filtra la multitenencia: no hay un identificador interno distinto de él (§5.2.2). «Reach» es una columna de la hoja de publicaciones que ningún nodo puebla: las métricas que el sistema recoge son likes y comentarios. «ExpiresAt» guarda la vigencia del token de usuaria que obtiene el callback —60 días desde el canje— y no la del token de página que se cifra en «AccessToken», que la Graph API devuelve sin campo de expiración (Anexo B.3). No es un modelo relacional con integridad referencial declarada ni transacciones ACID: la relación UserID → TelegramUserID se resuelve por lookup en tiempo de ejecución y no por una restricción de clave foránea del motor (§2.3, Anexo B.5). AccessToken se cifra con AES-256-GCM antes de escribirse en la hoja (Anexo B.3). Config tiene una sola fila de datos y alimenta la firma y el contacto que el sistema concatena a cada publicación (Anexo B.4). El campo Status alimenta el diagrama de estados de la Figura 2.</w:t>
+        <w:t>Nota. Fuente: elaboración propia. Los nombres son los de las columnas de la hoja, leídos del workflow desplegado (Anexo B.2). TelegramUserID es el identificador que Telegram asigna a la conversación, y es a la vez la clave por la que se filtra la multitenencia: no hay un identificador interno distinto de él (§5.2.2). «Reach» es una columna de la hoja de publicaciones que ningún nodo puebla: las métricas que el sistema recoge son likes y comentarios. «ExpiresAt» guarda la vigencia del token de usuaria que obtiene el callback —60 días desde el canje— y no la del token de página que se cifra en «AccessToken», que la Graph API devuelve sin campo de expiración (Anexo B.3). No es un modelo relacional con integridad referencial declarada ni transacciones ACID: la relación UserID → TelegramUserID se resuelve por lookup en tiempo de ejecución y no por una restricción de clave foránea del motor (§2.3, Anexo B.5). AccessToken se cifra con AES-256-GCM antes de escribirse en la hoja (Anexo B.3). Config tiene una fila por consultora, identificada por su TelegramUserID, y una fila general sin dueña; alimenta la firma y el contacto que el sistema concatena a cada publicación (Anexo B.4). El campo Status alimenta el diagrama de estados de la Figura 2.</w:t>
       </w:r>
     </w:p>
     <w:p>
@@ -21475,7 +21472,7 @@
           <w:i/>
           <w:sz w:val="20"/>
         </w:rPr>
-        <w:t>Nota. Fuente: elaboración propia. Recorrido de la imagen única. El orden es el del sistema: la imagen se sube a Cloudinary al recibirla (pasos 2 y 3), porque la auditoría visual y la Graph API la leen por su URL pública. La auditoría visual corre antes de generar los copys, de modo que una imagen con precio incrustado interrumpe el flujo sin gastar una inferencia de redacción (Anexo B.4; Anexo A, HU8), pero corre después de la subida: la imagen bloqueada queda alojada en Cloudinary. Si cualquiera de las dos auditorías detecta un precio se le avisa a la usuaria. El flujo de video agrega una tercera respuesta, avisar sin bloquear, cuando el recorte a 9:16 elimina el precio (§4.3.1), y sube el video después de la detección (Anexo B.9). La firma se concatena por código antes de publicar (Anexo B.4). El canal visual del Módulo Centinela es una llamada al mismo Gemini (pasos 5 y 6) y el textual, un nodo de código determinista (paso 12): el recorrido consume dos inferencias (Anexo E.5).</w:t>
+        <w:t>Nota. Fuente: elaboración propia. Recorrido de la imagen única. El orden es el del sistema: la imagen se sube a Cloudinary al recibirla (pasos 2 y 3), porque la auditoría visual y la Graph API la leen por su URL pública. La auditoría visual corre antes de generar los copys, de modo que una imagen con precio incrustado interrumpe el flujo sin gastar una inferencia de redacción (Anexo B.4; Anexo A, HU8), pero corre después de la subida, de modo que la imagen bloqueada se borra de Cloudinary en paralelo al aviso (§3.7.1). Si cualquiera de las dos auditorías detecta un precio se le avisa a la usuaria. El flujo de video agrega una tercera respuesta, avisar sin bloquear, cuando el recorte a 9:16 elimina el precio (§4.3.1). El video y sus fotogramas también se suben antes de la detección (Anexo B.9). La firma se concatena por código antes de publicar (Anexo B.4). El canal visual del Módulo Centinela es una llamada al mismo Gemini (pasos 5 y 6) y el textual, un nodo de código determinista (paso 12): el recorrido consume dos inferencias (Anexo E.5).</w:t>
       </w:r>
     </w:p>
     <w:p>
@@ -22688,7 +22685,7 @@
           <w:i/>
           <w:sz w:val="20"/>
         </w:rPr>
-        <w:t>Nota. Fuente: capturas de pantalla del editor de n8n sobre el entorno E2 (Anexo B.1). El canvas se presenta en dos partes y muestra la forma del workflow, no sus ~207 nodos, cuyos nombres no son legibles a esta escala; el workflow completo está en el repositorio del proyecto (workflows/Postly - Entrega Final Sprint 1 v2.json).</w:t>
+        <w:t>Nota. Fuente: capturas de pantalla del editor de n8n sobre el entorno E2 (Anexo B.1). El canvas se presenta en dos partes y muestra la forma del workflow, no sus más de 200 nodos, cuyos nombres no son legibles a esta escala; el workflow completo está en el repositorio del proyecto (workflows/Postly - Entrega Final Sprint 1 v2.json).</w:t>
       </w:r>
     </w:p>
     <w:p>
@@ -27008,7 +27005,7 @@
         <w:jc w:val="both"/>
       </w:pPr>
       <w:r>
-        <w:t>Las tres capacidades del Objetivo Específico 2 que la integración no mide por sí sola —la calidad del copywriting de HU4, el tono de HU6 y el ordenamiento de carrusel de HU5— tienen una primera evaluación con dos evaluadores externos, a ciegas, detallada en el Anexo E.14. El Estudio 1 comparó, sobre 8 productos, el copy de Postly contra un generador genérico de referencia: el evaluador prefirió a Postly en los 8, sin que ningún copy incluyera una afirmación no verificable contra la foto (Anexo E.14.1). En la dimensión de cumplimiento esa comparación favorece a Postly por diseño, porque el generador de referencia es un prompt de una línea que no conoce las reglas de la marca. El Estudio 2 midió si el tono elegido —Informativo, Vendedor, Divertido— se reconoce en el texto: un segundo evaluador acertó 22 de 24 asignaciones forzadas (91,7 %), por encima del umbral del 60 % fijado de antemano (Anexo E.14.3). El Estudio 3 comparó el orden de carrusel que propone el sistema contra el orden de envío original, sobre 8 conjuntos reales: fue preferido en 6 de 8, sin significancia estadística (n = 8; Anexo E.14.4). El Estudio 4 repitió la comparación de copy y de orden, ahora contra el trabajo manual real de las 8 participantes de la ampliación. El copy de Postly fue preferido en 26 de 32 pares (81,3 %), y su orden de carrusel, en 6 de los 7 conjuntos no triviales (85,7 %; p = 0,125; Anexo E.14.2). Los cuatro estudios comparten la misma limitación: un único evaluador por estudio, sin acuerdo inter-evaluador que calcular.</w:t>
+        <w:t>Las tres capacidades del Objetivo Específico 2 que la integración no mide por sí sola —la calidad del copywriting de HU4, el tono de HU6 y el ordenamiento de carrusel de HU5— tienen una primera evaluación con dos evaluadores externos, a ciegas, detallada en el Anexo E.14. El Estudio 1 comparó, sobre 8 productos, el copy de Postly contra un generador genérico de referencia: el evaluador prefirió a Postly en los 8, sin que ningún copy incluyera una afirmación no verificable contra la foto (Anexo E.14.1). En la dimensión de cumplimiento esa comparación favorece a Postly por diseño, porque el generador de referencia es un prompt de una línea que no conoce las reglas de la marca. El Estudio 2 midió si el tono elegido —Informativo, Vendedor, Divertido— se reconoce en el texto: un segundo evaluador acertó 22 de 24 asignaciones forzadas (91,7 %), por encima del umbral del 60 % fijado de antemano (Anexo E.14.3). El Estudio 3 comparó el orden de carrusel que propone el sistema contra el orden de envío original, sobre 8 conjuntos reales: fue preferido en 6 de 8, sin significancia estadística (n = 8; Anexo E.14.4). El Estudio 4 repitió la comparación de copy y de orden, ahora contra el trabajo manual real de las 8 participantes de la ampliación. El copy de Postly fue preferido en 26 de 32 pares (81,3 %), y su orden de carrusel, en 6 de los 7 conjuntos no triviales (85,7 %; binomial exacta bilateral, p = 0,125; Anexo E.14.2). Esos carruseles son de dos imágenes, de modo que cada uno admite sólo dos órdenes. Los cuatro estudios comparten la misma limitación: un único evaluador por estudio, sin acuerdo inter-evaluador que calcular.</w:t>
       </w:r>
     </w:p>
     <w:p>
@@ -27326,7 +27323,7 @@
     </w:p>
     <w:p>
       <w:r>
-        <w:t>Hay además una limitación del diseño de datos. La hoja Config guarda una sola firma y un solo contacto, sin clave de usuaria (§3.7.1): con más de una consultora vinculada, todas publicarían la misma línea. La multitenencia del sistema alcanza a las credenciales y a las publicaciones, y no a esa configuración.</w:t>
+        <w:t>La multitenencia alcanza a las credenciales, a las publicaciones y a la configuración: cada consultora publica con la firma y el contacto de su fila de la hoja Config, y la que no tiene fila propia, con la fila general, nunca con la de otra (§3.7.1). La separación se comprobó alternando la fila de una misma usuaria entre propia y general, y no con dos consultoras vinculadas a la vez.</w:t>
       </w:r>
     </w:p>
     <w:p>
@@ -27441,7 +27438,7 @@
         <w:t>Sobre el Objetivo Específico 1 (Interfaz Conversacional orientada a la accesibilidad):</w:t>
       </w:r>
       <w:r>
-        <w:t xml:space="preserve"> el objetivo se cumplió con el bot de Telegram. Los webhooks y los teclados dinámicos abstrajeron la complejidad de n8n: las ocho consultoras publicaron sin instrucción ni demostración previa del bot y sin conocer la orquestación subyacente (Anexo E.2). Tres lo habían usado en el piloto, y todas publicaron en la cuenta de prueba del equipo, de modo que no recorrieron la vinculación por OAuth. La reducción de la carga cognitiva orientó el diseño, pero no se midió con un instrumento dedicado (Capítulo 7).</w:t>
+        <w:t xml:space="preserve"> el objetivo se cumplió con el bot de Telegram. Los webhooks y los teclados dinámicos abstrajeron la complejidad de n8n: las ocho consultoras publicaron sin instrucción ni demostración previa del bot y sin conocer la orquestación subyacente (Anexo E.2). Tres lo habían usado en el piloto, y todas publicaron en la cuenta de prueba del equipo, de modo que no recorrieron la vinculación por OAuth. La autorización en Meta, que es el tramo más exigente del recorrido para una usuaria sin perfil técnico, quedó por eso ejecutada sólo por los autores, en E1 y en E3 (Anexo B.1), y no evaluada con usuarias. La reducción de la carga cognitiva orientó el diseño, pero no se midió con un instrumento dedicado (Capítulo 7).</w:t>
       </w:r>
     </w:p>
     <w:p>
@@ -27469,7 +27466,7 @@
         <w:rPr>
           <w:bCs/>
         </w:rPr>
-        <w:t xml:space="preserve"> el objetivo se cumplió en la integración, y sus otras tres capacidades tienen una primera evaluación. Gemini 2.5 Flash está integrado y operativo, el §6.1 mide la auditoría visual de precios y el Anexo E.14 mide lo demás, con dos evaluadores externos al proyecto. En calidad del copy, Postly fue preferido frente a un generador genérico en los 8 productos del Estudio 1, y frente al trabajo manual real de las ocho participantes en 26 de los 32 pares del Estudio 4. Ninguno de sus 8 copys del Estudio 1 llevó una afirmación no verificable contra la foto. En correspondencia con el tono pedido, el Estudio 2 acertó 22 de 24 asignaciones (91,7 %), por encima del umbral del 60 % declarado de antemano. En el orden del carrusel, fue preferido frente al orden manual en 6 de 7 pares del Estudio 4 (p = 0,125) y frente al orden de envío original en 6 de 8 conjuntos del Estudio 3 (p = 0,289), sin significancia estadística. Con un único evaluador por estudio, los intervalos de Wilson que el Anexo E.14 reporta describen la variación entre los ítems juzgados, no entre evaluadores. La «fatiga de decisión» es motivación de diseño y no un efecto medido (§2.2).</w:t>
+        <w:t xml:space="preserve"> el objetivo se cumplió en la integración, y sus otras tres capacidades tienen una primera evaluación. Gemini 2.5 Flash está integrado y operativo, el §6.1 mide la auditoría visual de precios y el Anexo E.14 mide lo demás, con dos evaluadores externos al proyecto. En calidad del copy, Postly fue preferido frente a un generador genérico en los 8 productos del Estudio 1, y frente al trabajo manual real de las ocho participantes en 26 de los 32 pares del Estudio 4. Ninguno de sus 8 copys del Estudio 1 llevó una afirmación no verificable contra la foto. En correspondencia con el tono pedido, el Estudio 2 acertó 22 de 24 asignaciones (91,7 %), por encima del umbral del 60 % declarado de antemano. En el orden del carrusel, fue preferido frente al orden manual en 6 de 7 carruseles de dos imágenes del Estudio 4 y frente al orden de envío original en 6 de 8 conjuntos del Estudio 3, sin significancia estadística (binomial exacta bilateral: p = 0,125 y p = 0,289). Con un único evaluador por estudio, los intervalos de Wilson que el Anexo E.14 reporta describen la variación entre los ítems juzgados, no entre evaluadores. La «fatiga de decisión» es motivación de diseño y no un efecto medido (§2.2).</w:t>
       </w:r>
     </w:p>
     <w:p>
@@ -27499,7 +27496,7 @@
           <w:i/>
           <w:iCs/>
         </w:rPr>
-        <w:t xml:space="preserve"> el objetivo, diferencial del sistema, se cumplió. La cascada de expresiones regulares y la lectura de la imagen por el modelo multimodal bloquean la referencia monetaria, y el sistema fuerza la firma de identidad corporativa. Postly es así una herramienta RegTech que reduce la exposición de la consultora a incumplir la regla de mensaje comercial de la marca. No es una exposición contractual: las Pautas son instrumentales al Acuerdo (Mary Kay Inc., s.f., p. 1), pero para el mensaje comercial en canal público no fijan ninguna consecuencia </w:t>
+        <w:t xml:space="preserve"> el objetivo, diferencial del sistema, se cumplió con alcance acotado. La cascada de expresiones regulares y la lectura de la imagen por el modelo multimodal bloquean la referencia monetaria, y el sistema fuerza la firma de identidad corporativa. Postly es así una herramienta RegTech que reduce la exposición de la consultora a incumplir la regla de mensaje comercial de la marca. No es una exposición contractual: las Pautas son instrumentales al Acuerdo (Mary Kay Inc., s.f., p. 1), pero para el mensaje comercial en canal público no fijan ninguna consecuencia </w:t>
       </w:r>
       <w:r>
         <w:rPr>
@@ -27507,8 +27504,7 @@
           <w:i/>
           <w:iCs/>
         </w:rPr>
-        <w:lastRenderedPageBreak/>
-        <w:t>(§3.7.4, Anexo D). Contra la regla completa el módulo no es efectivo: ésta alcanza también a la solicitud de compra sin cifra, que no detecta y que el generador produjo en cada copy hasta la corrección del 19 de septiembre de 2026 (§6.1.3; Anexo E.12). El OE3 se cumple, entonces, sobre el objeto que el módulo declara auditar, y no sobre la regla completa. El análisis de valores límite del §6.1 delimitó el alcance de la cascada léxica, motivó sus correcciones y fundamenta la recomendación del §8.2.</w:t>
+        <w:t>(§3.7.4, Anexo D). Contra la regla completa el módulo no es efectivo: ésta alcanza también a la solicitud de compra sin cifra, que no detecta y que el generador produjo en cada copy hasta la corrección del 19 de septiembre de 2026 (§6.1.3; Anexo E.12). El OE3 se cumple, entonces, sobre el objeto que el módulo declara auditar, y no sobre la regla completa. Tampoco calza exactamente con la fuente en las dos redes: en Facebook bloquea lo que la página de negocios admite, y en Instagram opera sobre una cuenta que las Pautas no contemplan como página de negocios (Anexo D). El análisis de valores límite del §6.1 delimitó el alcance de la cascada léxica, motivó sus correcciones y fundamenta la recomendación del §8.2.</w:t>
       </w:r>
     </w:p>
     <w:p>
@@ -27762,7 +27758,7 @@
         <w:rPr>
           <w:bCs/>
         </w:rPr>
-        <w:t xml:space="preserve"> si la validación empírica confirma una adopción multi-usuaria significativa, se recomienda evaluar el modo "queue" de n8n —colas con Redis y workers separados— y balanceadores de carga. Ese escalamiento requiere retomar un despliegue permanente: el que corrió durante el desarrollo se dio de baja el 14-09-2026 (Anexo B.1).</w:t>
+        <w:t xml:space="preserve"> si la validación empírica confirma una adopción multi-usuaria significativa, se recomienda evaluar el modo "queue" de n8n —colas con Redis y workers separados— y balanceadores de carga. El despliegue permanente que ese escalamiento necesita existe desde el 1 de octubre de 2026 (E3, Anexo B.1) y corre en modo regular.</w:t>
       </w:r>
     </w:p>
     <w:p>
@@ -27782,15 +27778,12 @@
         <w:rPr>
           <w:b/>
         </w:rPr>
-        <w:t>Política de retención del historial de ejecuciones (Prioridad Media):</w:t>
-      </w:r>
-      <w:r>
-        <w:t xml:space="preserve"> el historial que el motor n8n conserva guarda los updates completos de Telegram, con el nombre, el apellido y el identificador de quien escribe, y el despliegue no le fijó ninguna política de retención (§3.7.1). Se recomienda configurar el borrado automático por antigüedad que el propio motor ofrece y depurar lo ya acumulado. Es la brecha entre el </w:t>
-      </w:r>
-      <w:r>
-        <w:lastRenderedPageBreak/>
-        <w:t>principio de minimización que el sistema declara y lo que el despliegue efectivamente almacena, y se cierra con configuración y no con desarrollo.</w:t>
-      </w:r>
+        <w:t>Política de retención del historial de ejecuciones (Prioridad Media, aplicada):</w:t>
+      </w:r>
+      <w:r>
+        <w:t xml:space="preserve"> el historial que el motor n8n conserva guarda los updates completos de Telegram, con el nombre, el apellido y el identificador de quien escribe, (§3.7.1). E3 lo purga a los catorce días con el borrado por antigüedad que el propio motor ofrece. Queda reducir lo que guarda durante ese plazo al subconjunto que el flujo necesita, que es la distancia que sigue habiendo entre el principio de minimización y lo que el despliegue almacena.</w:t>
+      </w:r>
+      <w:r/>
     </w:p>
     <w:p>
       <w:pPr>
@@ -33075,16 +33068,15 @@
     </w:p>
     <w:p>
       <w:r>
-        <w:t xml:space="preserve">Este trabajo se ejecutó sobre dos entornos, y se los nombra porque sus cifras no provienen todas del mismo. El entorno E1 es el servidor propio: un Servidor Privado Virtual (VPS) contratado a un proveedor de hosting argentino (DonWeb), con plan de 2 vCPU / 2 GB RAM / 20 GB SSD, sobre Ubuntu 24.04 LTS. El entorno E2 es una instancia local del mismo motor y con el mismo </w:t>
-      </w:r>
-      <w:r>
-        <w:lastRenderedPageBreak/>
-        <w:t>workflow, sobre Windows y expuesta por un túnel para recibir los webhooks. La elección de un proveedor local respondió a una restricción práctica. Los principales proveedores cloud internacionales —Oracle Cloud, Microsoft Azure for Students, DigitalOcean— rechazaron sistemáticamente las tarjetas virtuales prepagas disponibles para el equipo de desarrollo; el Anexo C.1 documenta ese patrón en detalle.</w:t>
-      </w:r>
-    </w:p>
-    <w:p>
-      <w:r>
-        <w:t>El stack de software se organiza en dos contenedores Docker orquestados con Docker Compose. Un proxy inverso (Caddy) expone los puertos 80/443 y gestiona la emisión y renovación de certificados SSL/TLS (Let's Encrypt). El propio motor n8n no expone puertos públicos y sólo es alcanzable a través del proxy. La persistencia de n8n usa SQLite y el motor corre en el modo de ejecución «regular» que su documentación distingue del modo de cola (§5.1), adecuado para el volumen transaccional de un bot con una base de usuarias acotada. E1 se dio de baja el 14 de septiembre de 2026, y desde esa fecha el sistema no tiene un despliegue permanente. El reparto entre los dos entornos es el que sigue, y el documento lo indica donde reporta cada cifra. Sobre E1 corrió, en junio y julio de 2026, la validación funcional de las catorce Historias de Usuario que reporta la Tabla 9, y de él provienen las trazas que esa validación no preservó. Sobre E2 corrieron, en septiembre de 2026, las mediciones del Capítulo 6: las matrices de compliance, las baterías de la Tabla 11, los umbrales de la Tabla 13 y los casos de extremo a extremo de los Anexos E.9 a E.11. E2 tiene una salvedad propia: la dirección de retorno del flujo OAuth registrada en la aplicación de Meta, y con ella los botones de vinculación y de reconexión del bot (HU1 a HU3), siguen apuntando al dominio de E1. En E2 no se puede vincular ni reconectar una cuenta nueva: las mediciones usaron la cuenta del equipo, vinculada antes, y la validación del token de HU3 consulta a la Graph API igual que en E1.</w:t>
+        <w:t xml:space="preserve">Este trabajo se ejecutó sobre tres entornos, y se los nombra porque sus cifras no provienen todas del mismo. El entorno E1 fue el primer servidor propio: un Servidor Privado Virtual (VPS) contratado a un proveedor de hosting argentino (DonWeb), con plan de 2 vCPU / 2 GB RAM / 20 GB SSD, sobre Ubuntu 24.04 LTS. El entorno E2 es una instancia local del mismo motor y con el mismo </w:t>
+      </w:r>
+      <w:r>
+        <w:t>workflow, sobre Windows y expuesta por un túnel para recibir los webhooks. El entorno E3 es el despliegue vigente: un VPS nuevo del mismo proveedor, con 2 GB de RAM y 14 GB de disco sobre Ubuntu 24.04 LTS, en servicio desde el 1 de octubre de 2026. La elección de un proveedor local respondió a una restricción práctica. Los principales proveedores cloud internacionales —Oracle Cloud, Microsoft Azure for Students, DigitalOcean— rechazaron sistemáticamente las tarjetas virtuales prepagas disponibles para el equipo de desarrollo; el Anexo C.1 documenta ese patrón en detalle.</w:t>
+      </w:r>
+    </w:p>
+    <w:p>
+      <w:r>
+        <w:t>El stack de software se organiza en dos contenedores Docker orquestados con Docker Compose. Un proxy inverso (Caddy) expone los puertos 80/443 y gestiona la emisión y renovación de certificados SSL/TLS (Let's Encrypt). El propio motor n8n no expone puertos públicos y sólo es alcanzable a través del proxy. La persistencia de n8n usa SQLite y el motor corre en el modo de ejecución «regular» que su documentación distingue del modo de cola (§5.1), adecuado para el volumen transaccional de un bot con una base de usuarias acotada. E1 se dio de baja el 14 de septiembre de 2026. E3 repite su stack desde el 1 de octubre, con el binario de FFmpeg montado en el contenedor del motor y el historial de ejecuciones purgado a los catorce días (§3.7.1). El reparto entre los dos entornos es el que sigue, y el documento lo indica donde reporta cada cifra. Sobre E1 corrió, en junio y julio de 2026, la validación funcional de las catorce Historias de Usuario que reporta la Tabla 9, y de él provienen las trazas que esa validación no preservó. Sobre E2 corrieron, en septiembre de 2026, las mediciones del Capítulo 6: las matrices de compliance, las baterías de la Tabla 11, los umbrales de la Tabla 13 y los casos de extremo a extremo de los Anexos E.9 a E.11. E2 tiene una salvedad propia: la dirección de retorno del flujo OAuth registrada en la aplicación de Meta apuntaba al dominio de E1, de modo que en E2 no se podía vincular ni reconectar una cuenta, y las mediciones usaron la cuenta del equipo, vinculada antes. En E3 la dirección de retorno está registrada en Meta y en Google. El 1 de octubre de 2026 se ejecutó sobre él, con la cuenta del equipo, el recorrido completo de la vinculación: autorización en Meta, canje de los tres tokens, cifrado y guardado de la fila de la usuaria y aviso por el bot. Sobre E3 no se repitió ninguna medición del Capítulo 6: la versión del workflow que produjo cada una se detalla en el Anexo E.15.</w:t>
       </w:r>
     </w:p>
     <w:p>
@@ -33122,7 +33114,7 @@
           <w:b/>
           <w:lang w:val="es-ES"/>
         </w:rPr>
-        <w:t>"Postly – Entrega Final": workflow principal (~207 nodos)</w:t>
+        <w:t>"Postly – Entrega Final": workflow principal (213 nodos)</w:t>
       </w:r>
       <w:r>
         <w:rPr>
@@ -33435,8 +33427,7 @@
         <w:t xml:space="preserve">La normalización de video se ejecuta con el binario de FFmpeg instalado en el propio servidor, invocado programáticamente desde un nodo de código de n8n (mediante la capacidad de ejecutar subprocesos del runtime de Node.js). El </w:t>
       </w:r>
       <w:r>
-        <w:lastRenderedPageBreak/>
-        <w:t>proceso completo, ante la recepción de un video, tiene siete pasos. (1) Se descarga el archivo desde los servidores de Telegram al almacenamiento temporal del servidor. (2) Se determina su duración real invocando FFmpeg en modo de solo lectura de metadatos; el servidor no cuenta con la utilidad ffprobe instalada de forma independiente, por lo que la duración se extrae parseando la salida estándar de FFmpeg. (3) Si la duración es aceptable, se normaliza el video forzando una resolución de 1080×1920 píxeles (relación de aspecto 9:16), codificación de video H.264 y codificación de audio AAC. (4) Se extraen cuatro imágenes del video: tres instantes del ya normalizado, al 10 %, 50 % y 90 % de su duración, más el encuadre original sin recortar. Las cuatro se envían al modelo en una sola petición, para la detección visual de precios y con el mismo criterio que el flujo de imagen única. Si el precio sobrevive al recorte, el módulo bloquea; si el recorte lo elimina, avisa. Superado ese control, el primero de esos fotogramas se envía al modelo para generar los tres copys, replicando el mismo flujo cognitivo que para una imagen única. (5) El video normalizado y el fotograma se suben a un servicio de almacenamiento en la nube (Cloudinary), que expone las URLs desde las que la Graph API de Meta puede descargarlos. (6) Se crea el contenedor de publicación en Instagram indicando que se trata de un Reel y se consulta periódicamente (polling) su estado de procesamiento, hasta que Meta confirma que el video terminó de procesarse del lado de la plataforma; recién entonces se publica. (7) En paralelo se publica el mismo video normalizado en la página de Facebook vinculada.</w:t>
+        <w:t>proceso completo, ante la recepción de un video, tiene siete pasos. (1) Se descarga el archivo desde los servidores de Telegram al almacenamiento temporal del servidor. (2) Se determina su duración real invocando FFmpeg en modo de solo lectura de metadatos; el servidor no cuenta con la utilidad ffprobe instalada de forma independiente, por lo que la duración se extrae parseando la salida estándar de FFmpeg. (3) Si la duración es aceptable, se normaliza el video forzando una resolución de 1080×1920 píxeles (relación de aspecto 9:16), codificación de video H.264 y codificación de audio AAC. (4) Se extraen cuatro imágenes del video: tres instantes del ya normalizado, al 10 %, 50 % y 90 % de su duración, más el encuadre original sin recortar. Las cuatro se envían al modelo en una sola petición, para la detección visual de precios y con el mismo criterio que el flujo de imagen única. Si el precio sobrevive al recorte, el módulo bloquea; si el recorte lo elimina, avisa. Superado ese control, el primero de esos fotogramas se envía al modelo para generar los tres copys, replicando el mismo flujo cognitivo que para una imagen única. (5) El video normalizado y los fotogramas se suben a un servicio de almacenamiento en la nube (Cloudinary), que expone las URLs desde las que el modelo y la Graph API de Meta los leen. La subida ocurre junto con la normalización, antes de la detección del paso 4, que necesita esas URLs; si la detección bloquea, el sistema borra de Cloudinary el video y los fotogramas. (6) Se crea el contenedor de publicación en Instagram indicando que se trata de un Reel y se consulta periódicamente (polling) su estado de procesamiento, hasta que Meta confirma que el video terminó de procesarse del lado de la plataforma; recién entonces se publica. (7) En paralelo se publica el mismo video normalizado en la página de Facebook vinculada.</w:t>
       </w:r>
     </w:p>
     <w:p/>
@@ -39689,8 +39680,7 @@
                 <w:sz w:val="18"/>
                 <w:lang w:val="es-ES"/>
               </w:rPr>
-              <w:lastRenderedPageBreak/>
-              <w:t>dos evaluadores externos (Anexo E.14): favorable en los tres, sin significancia estadística en el orden, ni frente al manual (p = 0,125) ni frente al envío original (p = 0,289)</w:t>
+              <w:t>dos evaluadores externos (Anexo E.14): favorable en los tres, sin significancia estadística en el orden, ni frente al manual (p = 0,125) ni frente al envío original (p = 0,289; binomiales exactas bilaterales)</w:t>
             </w:r>
           </w:p>
         </w:tc>
@@ -40058,7 +40048,7 @@
     </w:p>
     <w:p>
       <w:r>
-        <w:t>Contra la hipótesis de que no hay preferencia, la prueba binomial exacta da p = 0,125. Con n = 7 el resultado no alcanza significancia, y así se informa.</w:t>
+        <w:t>Contra la hipótesis de que no hay preferencia, la prueba binomial exacta bilateral da p = 0,125. Con n = 7 el resultado no alcanza significancia, y así se informa.</w:t>
       </w:r>
     </w:p>
     <w:p>
@@ -40118,7 +40108,7 @@
     </w:p>
     <w:p>
       <w:r>
-        <w:t>Prefirió la secuencia de la IA en 6 de los 8 conjuntos (75,0 %; Wilson [40,9 %; 92,9 %]). Contra la hipótesis de que no hay preferencia, la prueba binomial exacta da p = 0,289: con n = 8 el resultado no alcanza significancia, y así se informa. Es la misma dirección que el orden de carrusel del Estudio 4 —Postly preferido en 6 de 7 pares frente al manual, p = 0,125—, ahora frente al orden de envío.</w:t>
+        <w:t>Prefirió la secuencia de la IA en 6 de los 8 conjuntos (75,0 %; Wilson [40,9 %; 92,9 %]). Contra la hipótesis de que no hay preferencia, la prueba binomial exacta bilateral da p = 0,289: con n = 8 el resultado no alcanza significancia, y así se informa. Es la misma dirección que el orden de carrusel del Estudio 4 —Postly preferido en 6 de 7 pares frente al manual, p = 0,125—, ahora frente al orden de envío.</w:t>
       </w:r>
     </w:p>
     <w:p>
@@ -40129,6 +40119,504 @@
     <w:p>
       <w:r>
         <w:t>Con esto, los cuatro estudios de PROTOCOLO-OE2.md tienen una primera medición. Los cuatro comparten la misma limitación: un único evaluador por estudio, sin acuerdo inter-evaluador que calcular. El §8.1 se actualiza con los cuatro resultados.</w:t>
+      </w:r>
+    </w:p>
+    <w:p>
+      <w:pPr>
+        <w:pStyle w:val="Heading3"/>
+      </w:pPr>
+      <w:r>
+        <w:rPr>
+          <w:b w:val="0"/>
+        </w:rPr>
+        <w:t>E.15 Trazabilidad entre versiones del sistema y mediciones</w:t>
+      </w:r>
+    </w:p>
+    <w:p>
+      <w:pPr/>
+      <w:r>
+        <w:rPr>
+          <w:b w:val="0"/>
+        </w:rPr>
+        <w:t>El sistema cambió durante su evaluación: varias de las correcciones que este trabajo reporta las expuso la propia evaluación, y se aplicaron después de parte de las mediciones. La Tabla 16 fija qué versión del workflow principal produjo cada resultado. Cada versión se identifica por el commit del repositorio del proyecto que la contiene, su fecha, su número de nodos y el SHA-256 del archivo del workflow, del que se dan los doce primeros caracteres.</w:t>
+      </w:r>
+    </w:p>
+    <w:p>
+      <w:pPr>
+        <w:keepNext/>
+      </w:pPr>
+      <w:bookmarkStart w:id="313" w:name="_Toc241538759"/>
+      <w:r>
+        <w:t xml:space="preserve">Tabla </w:t>
+      </w:r>
+      <w:fldSimple w:instr=" SEQ Tabla \* ARABIC ">
+        <w:r>
+          <w:rPr>
+            <w:noProof/>
+          </w:rPr>
+          <w:t>16</w:t>
+        </w:r>
+      </w:fldSimple>
+      <w:r>
+        <w:t>. Trazabilidad entre las versiones del workflow principal y los resultados del trabajo</w:t>
+      </w:r>
+      <w:bookmarkEnd w:id="313"/>
+    </w:p>
+    <w:tbl>
+      <w:tblPr>
+        <w:tblStyle w:val="TableGrid"/>
+        <w:tblW w:w="0" w:type="auto"/>
+        <w:tblLook w:val="04A0" w:firstRow="1" w:lastRow="0" w:firstColumn="1" w:lastColumn="0" w:noHBand="0" w:noVBand="1"/>
+      </w:tblPr>
+      <w:tblGrid>
+        <w:gridCol w:w="2124"/>
+        <w:gridCol w:w="2124"/>
+        <w:gridCol w:w="2123"/>
+        <w:gridCol w:w="2123"/>
+      </w:tblGrid>
+      <w:tr>
+        <w:trPr>
+          <w:tblHeader/>
+        </w:trPr>
+        <w:tc>
+          <w:tcPr>
+            <w:tcW w:w="2126" w:type="dxa"/>
+          </w:tcPr>
+          <w:p>
+            <w:pPr>
+              <w:keepNext/>
+            </w:pPr>
+            <w:r>
+              <w:rPr>
+                <w:rFonts w:ascii="Arial" w:hAnsi="Arial" w:cs="Arial"/>
+                <w:b/>
+                <w:sz w:val="18"/>
+              </w:rPr>
+              <w:t xml:space="preserve">Versión (commit · SHA-256)</w:t>
+            </w:r>
+          </w:p>
+        </w:tc>
+        <w:tc>
+          <w:tcPr>
+            <w:tcW w:w="2126" w:type="dxa"/>
+          </w:tcPr>
+          <w:p>
+            <w:pPr>
+              <w:keepNext/>
+            </w:pPr>
+            <w:r>
+              <w:rPr>
+                <w:rFonts w:ascii="Arial" w:hAnsi="Arial" w:cs="Arial"/>
+                <w:b/>
+                <w:sz w:val="18"/>
+              </w:rPr>
+              <w:t xml:space="preserve">Fecha · nodos</w:t>
+            </w:r>
+          </w:p>
+        </w:tc>
+        <w:tc>
+          <w:tcPr>
+            <w:tcW w:w="2126" w:type="dxa"/>
+          </w:tcPr>
+          <w:p>
+            <w:pPr>
+              <w:keepNext/>
+            </w:pPr>
+            <w:r>
+              <w:rPr>
+                <w:rFonts w:ascii="Arial" w:hAnsi="Arial" w:cs="Arial"/>
+                <w:b/>
+                <w:sz w:val="18"/>
+              </w:rPr>
+              <w:t xml:space="preserve">Cambio respecto de la anterior</w:t>
+            </w:r>
+          </w:p>
+        </w:tc>
+        <w:tc>
+          <w:tcPr>
+            <w:tcW w:w="2126" w:type="dxa"/>
+          </w:tcPr>
+          <w:p>
+            <w:pPr>
+              <w:keepNext/>
+            </w:pPr>
+            <w:r>
+              <w:rPr>
+                <w:rFonts w:ascii="Arial" w:hAnsi="Arial" w:cs="Arial"/>
+                <w:b/>
+                <w:sz w:val="18"/>
+              </w:rPr>
+              <w:t xml:space="preserve">Resultados producidos sobre esta versión</w:t>
+            </w:r>
+          </w:p>
+        </w:tc>
+      </w:tr>
+      <w:tr>
+        <w:tc>
+          <w:tcPr>
+            <w:tcW w:w="2126" w:type="dxa"/>
+          </w:tcPr>
+          <w:p>
+            <w:r>
+              <w:rPr>
+                <w:rFonts w:ascii="Arial" w:hAnsi="Arial" w:cs="Arial"/>
+                <w:sz w:val="18"/>
+              </w:rPr>
+              <w:t xml:space="preserve">327a5d4 · 1cfe1dfac472</w:t>
+            </w:r>
+          </w:p>
+        </w:tc>
+        <w:tc>
+          <w:tcPr>
+            <w:tcW w:w="2126" w:type="dxa"/>
+          </w:tcPr>
+          <w:p>
+            <w:r>
+              <w:rPr>
+                <w:rFonts w:ascii="Arial" w:hAnsi="Arial" w:cs="Arial"/>
+                <w:sz w:val="18"/>
+              </w:rPr>
+              <w:t xml:space="preserve">2 jul. 2026 · 185</w:t>
+            </w:r>
+          </w:p>
+        </w:tc>
+        <w:tc>
+          <w:tcPr>
+            <w:tcW w:w="2126" w:type="dxa"/>
+          </w:tcPr>
+          <w:p>
+            <w:r>
+              <w:rPr>
+                <w:rFonts w:ascii="Arial" w:hAnsi="Arial" w:cs="Arial"/>
+                <w:sz w:val="18"/>
+              </w:rPr>
+              <w:t xml:space="preserve">Catorce Historias completas. Detector textual previo al análisis de valores límite, con un conjunto propio y más débil en HU10.</w:t>
+            </w:r>
+          </w:p>
+        </w:tc>
+        <w:tc>
+          <w:tcPr>
+            <w:tcW w:w="2126" w:type="dxa"/>
+          </w:tcPr>
+          <w:p>
+            <w:r>
+              <w:rPr>
+                <w:rFonts w:ascii="Arial" w:hAnsi="Arial" w:cs="Arial"/>
+                <w:sz w:val="18"/>
+              </w:rPr>
+              <w:t xml:space="preserve">Tabla 9 (E1, junio y julio). Tablas 3, 4 y 5, con el detector de esta versión. Divergencia de HU10 (E.1.4).</w:t>
+            </w:r>
+          </w:p>
+        </w:tc>
+      </w:tr>
+      <w:tr>
+        <w:tc>
+          <w:tcPr>
+            <w:tcW w:w="2126" w:type="dxa"/>
+          </w:tcPr>
+          <w:p>
+            <w:r>
+              <w:rPr>
+                <w:rFonts w:ascii="Arial" w:hAnsi="Arial" w:cs="Arial"/>
+                <w:sz w:val="18"/>
+              </w:rPr>
+              <w:t xml:space="preserve">dc8fd6f · 129cdfb42e75</w:t>
+            </w:r>
+          </w:p>
+        </w:tc>
+        <w:tc>
+          <w:tcPr>
+            <w:tcW w:w="2126" w:type="dxa"/>
+          </w:tcPr>
+          <w:p>
+            <w:r>
+              <w:rPr>
+                <w:rFonts w:ascii="Arial" w:hAnsi="Arial" w:cs="Arial"/>
+                <w:sz w:val="18"/>
+              </w:rPr>
+              <w:t xml:space="preserve">14 sept. · 185</w:t>
+            </w:r>
+          </w:p>
+        </w:tc>
+        <w:tc>
+          <w:tcPr>
+            <w:tcW w:w="2126" w:type="dxa"/>
+          </w:tcPr>
+          <w:p>
+            <w:r>
+              <w:rPr>
+                <w:rFonts w:ascii="Arial" w:hAnsi="Arial" w:cs="Arial"/>
+                <w:sz w:val="18"/>
+              </w:rPr>
+              <w:t xml:space="preserve">Seis patrones corregidos y unificados en los cuatro nodos que publican.</w:t>
+            </w:r>
+          </w:p>
+        </w:tc>
+        <w:tc>
+          <w:tcPr>
+            <w:tcW w:w="2126" w:type="dxa"/>
+          </w:tcPr>
+          <w:p>
+            <w:r>
+              <w:rPr>
+                <w:rFonts w:ascii="Arial" w:hAnsi="Arial" w:cs="Arial"/>
+                <w:sz w:val="18"/>
+              </w:rPr>
+              <w:t xml:space="preserve">Tablas 6 y 10. Tabla 11 (baterías, 16 sept.). Tabla 13 (historial de E2 al 17 sept.).</w:t>
+            </w:r>
+          </w:p>
+        </w:tc>
+      </w:tr>
+      <w:tr>
+        <w:tc>
+          <w:tcPr>
+            <w:tcW w:w="2126" w:type="dxa"/>
+          </w:tcPr>
+          <w:p>
+            <w:r>
+              <w:rPr>
+                <w:rFonts w:ascii="Arial" w:hAnsi="Arial" w:cs="Arial"/>
+                <w:sz w:val="18"/>
+              </w:rPr>
+              <w:t xml:space="preserve">a62bb01 · c69a685b2d8e</w:t>
+            </w:r>
+          </w:p>
+        </w:tc>
+        <w:tc>
+          <w:tcPr>
+            <w:tcW w:w="2126" w:type="dxa"/>
+          </w:tcPr>
+          <w:p>
+            <w:r>
+              <w:rPr>
+                <w:rFonts w:ascii="Arial" w:hAnsi="Arial" w:cs="Arial"/>
+                <w:sz w:val="18"/>
+              </w:rPr>
+              <w:t xml:space="preserve">18 y 19 sept. · 193 a 195</w:t>
+            </w:r>
+          </w:p>
+        </w:tc>
+        <w:tc>
+          <w:tcPr>
+            <w:tcW w:w="2126" w:type="dxa"/>
+          </w:tcPr>
+          <w:p>
+            <w:r>
+              <w:rPr>
+                <w:rFonts w:ascii="Arial" w:hAnsi="Arial" w:cs="Arial"/>
+                <w:sz w:val="18"/>
+              </w:rPr>
+              <w:t xml:space="preserve">Criterio visual único en los cuatro flujos; video con varios fotogramas y la regla de bloquear o avisar; guarda de duración sin paso por defecto; inversión del llamado a la acción en los cuatro prompts.</w:t>
+            </w:r>
+          </w:p>
+        </w:tc>
+        <w:tc>
+          <w:tcPr>
+            <w:tcW w:w="2126" w:type="dxa"/>
+          </w:tcPr>
+          <w:p>
+            <w:r>
+              <w:rPr>
+                <w:rFonts w:ascii="Arial" w:hAnsi="Arial" w:cs="Arial"/>
+                <w:sz w:val="18"/>
+              </w:rPr>
+              <w:t xml:space="preserve">Casos de extremo a extremo de los Anexos E.9 a E.11. Medición del llamado a la acción (E.12).</w:t>
+            </w:r>
+          </w:p>
+        </w:tc>
+      </w:tr>
+      <w:tr>
+        <w:tc>
+          <w:tcPr>
+            <w:tcW w:w="2126" w:type="dxa"/>
+          </w:tcPr>
+          <w:p>
+            <w:r>
+              <w:rPr>
+                <w:rFonts w:ascii="Arial" w:hAnsi="Arial" w:cs="Arial"/>
+                <w:sz w:val="18"/>
+              </w:rPr>
+              <w:t xml:space="preserve">ae50585 · b8893c10b76b</w:t>
+            </w:r>
+          </w:p>
+        </w:tc>
+        <w:tc>
+          <w:tcPr>
+            <w:tcW w:w="2126" w:type="dxa"/>
+          </w:tcPr>
+          <w:p>
+            <w:r>
+              <w:rPr>
+                <w:rFonts w:ascii="Arial" w:hAnsi="Arial" w:cs="Arial"/>
+                <w:sz w:val="18"/>
+              </w:rPr>
+              <w:t xml:space="preserve">24 sept. · 195</w:t>
+            </w:r>
+          </w:p>
+        </w:tc>
+        <w:tc>
+          <w:tcPr>
+            <w:tcW w:w="2126" w:type="dxa"/>
+          </w:tcPr>
+          <w:p>
+            <w:r>
+              <w:rPr>
+                <w:rFonts w:ascii="Arial" w:hAnsi="Arial" w:cs="Arial"/>
+                <w:sz w:val="18"/>
+              </w:rPr>
+              <w:t xml:space="preserve">Esquema de Google Sheets sincronizado en siete nodos; sin cambio en patrones ni prompts.</w:t>
+            </w:r>
+          </w:p>
+        </w:tc>
+        <w:tc>
+          <w:tcPr>
+            <w:tcW w:w="2126" w:type="dxa"/>
+          </w:tcPr>
+          <w:p>
+            <w:r>
+              <w:rPr>
+                <w:rFonts w:ascii="Arial" w:hAnsi="Arial" w:cs="Arial"/>
+                <w:sz w:val="18"/>
+              </w:rPr>
+              <w:t xml:space="preserve">Sesiones del 26 y 27 de septiembre: Tablas 7 y 8. Material de los cuatro estudios del Anexo E.14.</w:t>
+            </w:r>
+          </w:p>
+        </w:tc>
+      </w:tr>
+      <w:tr>
+        <w:tc>
+          <w:tcPr>
+            <w:tcW w:w="2126" w:type="dxa"/>
+          </w:tcPr>
+          <w:p>
+            <w:r>
+              <w:rPr>
+                <w:rFonts w:ascii="Arial" w:hAnsi="Arial" w:cs="Arial"/>
+                <w:sz w:val="18"/>
+              </w:rPr>
+              <w:t xml:space="preserve">8db511e · dc4a45d86a80</w:t>
+            </w:r>
+          </w:p>
+        </w:tc>
+        <w:tc>
+          <w:tcPr>
+            <w:tcW w:w="2126" w:type="dxa"/>
+          </w:tcPr>
+          <w:p>
+            <w:r>
+              <w:rPr>
+                <w:rFonts w:ascii="Arial" w:hAnsi="Arial" w:cs="Arial"/>
+                <w:sz w:val="18"/>
+              </w:rPr>
+              <w:t xml:space="preserve">28 sept. · 207</w:t>
+            </w:r>
+          </w:p>
+        </w:tc>
+        <w:tc>
+          <w:tcPr>
+            <w:tcW w:w="2126" w:type="dxa"/>
+          </w:tcPr>
+          <w:p>
+            <w:r>
+              <w:rPr>
+                <w:rFonts w:ascii="Arial" w:hAnsi="Arial" w:cs="Arial"/>
+                <w:sz w:val="18"/>
+              </w:rPr>
+              <w:t xml:space="preserve">Candado de grupo contra la publicación de dos opciones de una misma pieza (B.6).</w:t>
+            </w:r>
+          </w:p>
+        </w:tc>
+        <w:tc>
+          <w:tcPr>
+            <w:tcW w:w="2126" w:type="dxa"/>
+          </w:tcPr>
+          <w:p>
+            <w:r>
+              <w:rPr>
+                <w:rFonts w:ascii="Arial" w:hAnsi="Arial" w:cs="Arial"/>
+                <w:sz w:val="18"/>
+              </w:rPr>
+              <w:t xml:space="preserve">Pruebas del candado en E2. Ninguna tabla del Capítulo 6.</w:t>
+            </w:r>
+          </w:p>
+        </w:tc>
+      </w:tr>
+      <w:tr>
+        <w:tc>
+          <w:tcPr>
+            <w:tcW w:w="2126" w:type="dxa"/>
+          </w:tcPr>
+          <w:p>
+            <w:r>
+              <w:rPr>
+                <w:rFonts w:ascii="Arial" w:hAnsi="Arial" w:cs="Arial"/>
+                <w:sz w:val="18"/>
+              </w:rPr>
+              <w:t xml:space="preserve">c740bad · 24075a38fa52</w:t>
+            </w:r>
+          </w:p>
+        </w:tc>
+        <w:tc>
+          <w:tcPr>
+            <w:tcW w:w="2126" w:type="dxa"/>
+          </w:tcPr>
+          <w:p>
+            <w:r>
+              <w:rPr>
+                <w:rFonts w:ascii="Arial" w:hAnsi="Arial" w:cs="Arial"/>
+                <w:sz w:val="18"/>
+              </w:rPr>
+              <w:t xml:space="preserve">1 oct. · 210 a 213</w:t>
+            </w:r>
+          </w:p>
+        </w:tc>
+        <w:tc>
+          <w:tcPr>
+            <w:tcW w:w="2126" w:type="dxa"/>
+          </w:tcPr>
+          <w:p>
+            <w:r>
+              <w:rPr>
+                <w:rFonts w:ascii="Arial" w:hAnsi="Arial" w:cs="Arial"/>
+                <w:sz w:val="18"/>
+              </w:rPr>
+              <w:t xml:space="preserve">Despliegue en E3. Un texto enviado sin tocar «Editar» ya no reemplaza el copy de la última publicación; firma y contacto por consultora (HU9); lectura única de la hoja Config, que con muchas publicaciones agotaba la cuota de Google Sheets al programar; borrado en Cloudinary de lo que el canal visual bloquea.</w:t>
+            </w:r>
+          </w:p>
+        </w:tc>
+        <w:tc>
+          <w:tcPr>
+            <w:tcW w:w="2126" w:type="dxa"/>
+          </w:tcPr>
+          <w:p>
+            <w:r>
+              <w:rPr>
+                <w:rFonts w:ascii="Arial" w:hAnsi="Arial" w:cs="Arial"/>
+                <w:sz w:val="18"/>
+              </w:rPr>
+              <w:t xml:space="preserve">Validación funcional en E3, vinculación OAuth incluida. Ninguna medición del Capítulo 6.</w:t>
+            </w:r>
+          </w:p>
+        </w:tc>
+      </w:tr>
+    </w:tbl>
+    <w:p>
+      <w:pPr/>
+      <w:r>
+        <w:rPr>
+          <w:b w:val="0"/>
+          <w:i/>
+        </w:rPr>
+        <w:t>Nota. Elaboración propia a partir del historial del repositorio del proyecto. La última fila es la versión vigente y la que se presenta en la defensa. Las Tablas 12 y 14 no figuran en una fila porque valen para todas: el prompt del nodo «HU8: Detección visual» tiene el mismo SHA-256 (0cfb82b494b9) en las seis versiones. Los SHA-256 se calculan sobre el archivo tal como lo guarda el repositorio, sin la conversión de fin de línea que aplica una copia de trabajo en Windows.</w:t>
+      </w:r>
+    </w:p>
+    <w:p>
+      <w:pPr/>
+      <w:r>
+        <w:rPr>
+          <w:b w:val="0"/>
+        </w:rPr>
+        <w:t>La tabla admite tres lecturas. El detector textual que produjo las Tablas 3, 4 y 5 no es el vigente: la Tabla 6 resume qué cambió y la Tabla 10 mide el conjunto corregido. El canal visual de la imagen única, en cambio, no cambió en ninguna versión; lo que cambió el 19 de septiembre es que los otros tres flujos adoptaron su criterio. Y entre la última medición, del 27 de septiembre, y la versión vigente, los cambios agregan nodos sin tocar los seis patrones del canal textual, el prompt visual ni los ocho prompts que llaman al modelo, que conservan el mismo SHA-256 desde el 19 de septiembre. La verificación del Anexo E.4, corrida sobre el workflow vigente, lo comprueba para los patrones y el prompt visual.</w:t>
       </w:r>
     </w:p>
     <w:sectPr>

</xml_diff>

<commit_message>
docs(tesis): N-06, la tesis deja de narrar su propia revision (pasadas 183-184)
- Fuera los rastros que cita la devolucion: "version del 1 de agosto",
  Lectura_A26.md con el relato de las citas corregidas, "el 8.1 se actualiza",
  "a diferencia del piloto" y la autonarracion del E.4.
- Los 96 nombres de archivo (26 en el cuerpo, 70 en los anexos) pasan a una
  tabla unica: Anexo E.16, Tabla 17, resultado x scripts x datos x registro
  (Zenodo abierto / restringido / repositorio, segun deposito/v2.0.0 y git).
- Venable et al. (2016) citado donde se usa la distincion formativa/sumativa;
  8.2 ya no pide guardar el contacto por usuaria (hecho, N-08);
  Imagenes_manifiesto.csv no estaba publicado: se retira la cita.

Co-Authored-By: Claude Opus 5.5 <noreply@anthropic.com>
</commit_message>
<xml_diff>
--- a/avance/Tesis Postly Bontorno Hassan-1 v2.docx
+++ b/avance/Tesis Postly Bontorno Hassan-1 v2.docx
@@ -12991,7 +12991,7 @@
     </w:p>
     <w:p>
       <w:r>
-        <w:t>La lectura completa se extendió a la bibliografía reciente: de las 29 obras de 2024 a 2026 que este trabajo cita, veintiséis la tienen registrada (Lectura_A26.md y Lectura_obras_recientes.md, en el repositorio). Contrastada con lo que la tesis atribuía a cada una, corrigió cuatro citas. La distinción formativa/sumativa no es de Baskerville et al., que la citan de Venable et al. (2016). Yao et al. no presentan como tensión de diseño el patrón que describen. Kitchenham y Madeyski recomiendan una medida no paramétrica, que el §6.1.6 ahora informa. Y Yılmaz et al. no formulan la ventaja de los modelos de visión y lenguaje que se les atribuía. Las tres restantes —Liu et al. (2024), Larsen et al. (2025) y Storey et al. (2025)— están detrás de un muro de pago y no se consiguieron: de Liu y de Storey se conoce el resumen, y de Larsen, el título, y este trabajo no les apoya nada más que eso.</w:t>
+        <w:t>La lectura completa se extendió a la bibliografía reciente: de las 29 obras de 2024 a 2026 que este trabajo cita, se leyeron completas veintiséis, con un registro de lectura por obra (Anexo E.4). Las tres restantes —Liu et al. (2024), Larsen et al. (2025) y Storey et al. (2025)— están detrás de un muro de pago y no se consiguieron: de Liu y de Storey se conoce el resumen, y de Larsen, el título, y este trabajo no les apoya nada más que eso.</w:t>
       </w:r>
     </w:p>
     <w:p>
@@ -15336,8 +15336,7 @@
         <w:spacing w:before="240" w:after="240" w:line="240" w:lineRule="auto"/>
       </w:pPr>
       <w:r>
-        <w:lastRenderedPageBreak/>
-        <w:t>El proceso sigue el ciclo de la DSRM (Peffers et al., 2007). Cómo se evalúa un artefacto —y no sólo cuándo— es un problema propio de este marco. La literatura del área distingue la evaluación formativa, que informa el diseño mientras se construye, de la sumativa, que juzga el artefacto terminado; Baskerville et al. (2026) retienen esa distinción y proponen sobre ella MEDS, un método de cuatro pasos para que la evaluación en DSR sea eficiente sin perder rigor. La fase 5 de este trabajo combina las dos. Las fases son:</w:t>
+        <w:t>El proceso sigue el ciclo de la DSRM (Peffers et al., 2007). Cómo se evalúa un artefacto —y no sólo cuándo— es un problema propio de este marco. La literatura del área distingue la evaluación formativa, que informa el diseño mientras se construye, de la sumativa, que juzga el artefacto terminado (Venable et al., 2016); Baskerville et al. (2026) retienen esa distinción y proponen sobre ella MEDS, un método de cuatro pasos para que la evaluación en DSR sea eficiente sin perder rigor. La fase 5 de este trabajo combina las dos. Las fases son:</w:t>
       </w:r>
     </w:p>
     <w:p>
@@ -16821,7 +16820,7 @@
     </w:p>
     <w:p>
       <w:r>
-        <w:t>a) Reducción del tiempo operativo de posteo. Variable cuantitativa continua. Indicador: minutos requeridos para completar una publicación, medidos por cronometraje directo y conciliados con el historial de ejecuciones del sistema (§6.1.6). Unidad: minutos. Instrumento: planilla de cronometraje (Anexo E.2, Cronometraje_datos_v2.csv), aplicada a 8 consultoras × 4 publicaciones, comparando el proceso manual (sin Postly) contra el proceso con Postly para la misma publicación.</w:t>
+        <w:t>a) Reducción del tiempo operativo de posteo. Variable cuantitativa continua. Indicador: minutos requeridos para completar una publicación, medidos por cronometraje directo y conciliados con el historial de ejecuciones del sistema (§6.1.6). Unidad: minutos. Instrumento: planilla de cronometraje (Anexo E.2), aplicada a 8 consultoras × 4 publicaciones, comparando el proceso manual (sin Postly) contra el proceso con Postly para la misma publicación.</w:t>
       </w:r>
     </w:p>
     <w:p>
@@ -16831,7 +16830,7 @@
     </w:p>
     <w:p>
       <w:r>
-        <w:t>b) Tasa de acierto del Módulo Centinela de Compliance. Variable cuantitativa. Indicadores: Recall = VP/(VP+FN), Precisión = VP/(VP+FP), F1. Unidad: proporción [0,1]. Instrumento: dos conjuntos de 40 casos de prueba, representativo y de estrés (Anexo E.1, Casos_Compliance_Representativo.csv y Casos_Compliance.csv), cada uno con 20 con precio (texto o imagen) y 20 sin él, incluyendo los casos límite descritos en el Anexo B.4.</w:t>
+        <w:t>b) Tasa de acierto del Módulo Centinela de Compliance. Variable cuantitativa. Indicadores: Recall = VP/(VP+FN), Precisión = VP/(VP+FP), F1. Unidad: proporción [0,1]. Instrumento: dos conjuntos de 40 casos de prueba, representativo y de estrés (Anexo E.1), cada uno con 20 con precio (texto o imagen) y 20 sin él, incluyendo los casos límite descritos en el Anexo B.4.</w:t>
       </w:r>
     </w:p>
     <w:p>
@@ -16901,8 +16900,7 @@
         <w:t xml:space="preserve">Asimetría de cuentas de publicación: en la ampliación, la condición manual publicó en la cuenta real de cada participante y la condición Postly, en la cuenta de prueba del equipo. La razón es que el sistema aún no tenía </w:t>
       </w:r>
       <w:r>
-        <w:lastRenderedPageBreak/>
-        <w:t>vinculada por OAuth (HU2) la cuenta de cada una de las 8 (PROTOCOLO-ampliacion.md, §10). El cronometraje no se ve afectado: los pasos que se miden van del material en mano a la confirmación del sistema, sin importar el destino. El cuestionario TAM sí puede verse afectado, en particular los ítems de intención de uso y de cumplimiento de marca, porque la participante evalúa un resultado que no llega a su propia audiencia; el puntaje se informa sin ajustar, con esta salvedad al lado. La comparación a ciegas del Estudio 4 tampoco se ve afectada, porque el evaluador juzga el texto del copy o el orden de las imágenes, y nunca una captura de la cuenta de destino.</w:t>
+        <w:t>vinculada por OAuth (HU2) la cuenta de cada una de las 8 (protocolo de la ampliación, §10; Anexo E.4). El cronometraje no se ve afectado: los pasos que se miden van del material en mano a la confirmación del sistema, sin importar el destino. El cuestionario TAM sí puede verse afectado, en particular los ítems de intención de uso y de cumplimiento de marca, porque la participante evalúa un resultado que no llega a su propia audiencia; el puntaje se informa sin ajustar, con esta salvedad al lado. La comparación a ciegas del Estudio 4 tampoco se ve afectada, porque el evaluador juzga el texto del copy o el orden de las imágenes, y nunca una captura de la cuenta de destino.</w:t>
       </w:r>
     </w:p>
     <w:p>
@@ -17299,7 +17297,7 @@
         <w:spacing w:before="240" w:after="240"/>
       </w:pPr>
       <w:r>
-        <w:t>El piloto obtuvo consentimiento verbal de sus tres consultoras. Se les explicó el objetivo académico de la medición, que los tiempos y las respuestas se publicarían de forma agregada y que su identidad no aparecería: la planilla sólo registra C1, C2 y C3 en esa ronda (Anexo E.2). No se recogió un consentimiento escrito, y esa es una carencia del procedimiento y no una decisión justificable por la escala del estudio. La ampliación la corrigió: las ocho participantes firmaron un consentimiento informado por escrito antes de la sesión, incluidas las tres del piloto, cuyo consentimiento verbal original no cubría la sesión nueva (PROTOCOLO-ampliacion.md, §7). El evaluador externo del corpus de campo, ajeno al cronometraje, no firmó un consentimiento escrito: participó bajo el acuerdo verbal del piloto.</w:t>
+        <w:t>El piloto obtuvo consentimiento verbal de sus tres consultoras. Se les explicó el objetivo académico de la medición, que los tiempos y las respuestas se publicarían de forma agregada y que su identidad no aparecería: la planilla sólo registra C1, C2 y C3 en esa ronda (Anexo E.2). No se recogió un consentimiento escrito, y esa es una carencia del procedimiento y no una decisión justificable por la escala del estudio. En la ampliación, las ocho participantes firmaron un consentimiento informado por escrito antes de la sesión, incluidas las tres del piloto, cuyo consentimiento verbal original no cubría la sesión nueva (protocolo de la ampliación, §7). El evaluador externo del corpus de campo, ajeno al cronometraje, no firmó un consentimiento escrito: participó bajo el acuerdo verbal del piloto.</w:t>
       </w:r>
     </w:p>
     <w:p>
@@ -17445,8 +17443,7 @@
         <w:t xml:space="preserve">Para que cada historia sea comprobable —el atributo «Testable» del modelo INVEST (Wake, 2003)— se la acompaña de criterios de aceptación: las </w:t>
       </w:r>
       <w:r>
-        <w:lastRenderedPageBreak/>
-        <w:t>condiciones que el sistema debe cumplir para darla por terminada. Donde un criterio fija un umbral, el umbral se conserva como se redactó antes de medir, y el Anexo E.7 registra si se verificó. Los umbrales numéricos se incorporaron al documento después de su versión del 1 de agosto de 2026, que varios los expresaba sin cifra («latencia mínima»), y antes de las mediciones de septiembre que los contrastan. Reescribirlo a la medida de lo observado le quitaría su función, que es comprometer un valor antes de conocerlo.</w:t>
+        <w:t>condiciones que el sistema debe cumplir para darla por terminada. Donde un criterio fija un umbral, el umbral se conserva como se redactó antes de medir, y el Anexo E.7 registra si se verificó. Los umbrales numéricos se fijaron antes de las mediciones de septiembre de 2026 que los contrastan; hasta entonces, varios criterios los expresaban sin cifra («latencia mínima»). Reescribirlo a la medida de lo observado le quitaría su función, que es comprometer un valor antes de conocerlo.</w:t>
       </w:r>
     </w:p>
     <w:p>
@@ -22685,7 +22682,7 @@
           <w:i/>
           <w:sz w:val="20"/>
         </w:rPr>
-        <w:t>Nota. Fuente: capturas de pantalla del editor de n8n sobre el entorno E2 (Anexo B.1). El canvas se presenta en dos partes y muestra la forma del workflow, no sus más de 200 nodos, cuyos nombres no son legibles a esta escala; el workflow completo está en el repositorio del proyecto (workflows/Postly - Entrega Final Sprint 1 v2.json).</w:t>
+        <w:t>Nota. Fuente: capturas de pantalla del editor de n8n sobre el entorno E2 (Anexo B.1). El canvas se presenta en dos partes y muestra la forma del workflow, no sus más de 200 nodos, cuyos nombres no son legibles a esta escala; el workflow completo está en el repositorio del proyecto (Anexo E.4).</w:t>
       </w:r>
     </w:p>
     <w:p>
@@ -23231,18 +23228,17 @@
         <w:t xml:space="preserve">Se construyó un conjunto de 40 casos: 20 infractores —con precio, oferta o promoción, que el sistema debe bloquear— y 20 limpios, que debe publicar. La clase real se etiquetó a mano con el criterio que el módulo audita: una referencia monetaria —precio, descuento, oferta o promoción— en contenido destinado al canal público, aun sin cifra: «¿Precios? Te los paso por privado» es infractor, y una invitación a escribir que no menciona precios no lo es (§3.5.5). Ese criterio es más estrecho que la definición de mensaje comercial </w:t>
       </w:r>
       <w:r>
-        <w:lastRenderedPageBreak/>
-        <w:t>de las Pautas, que alcanza también a la solicitud de compra sin cifra (Capítulo 7). Los casos de texto los ejecutó el script run_compliance_text.mjs, que transcribe verbatim las seis expresiones del nodo desplegado y registra el veredicto y la expresión que disparó cada bloqueo. Los de imagen se enviaron al bot sobre el entorno E2, por la ruta completa de HU8, y su veredicto se registró a mano.</w:t>
-      </w:r>
-    </w:p>
-    <w:p>
-      <w:r>
-        <w:t>Cada resultado se clasificó como verdadero positivo (VP: infractor bloqueado), falso negativo (FN: infractor publicado), verdadero negativo (VN: limpio publicado) o falso positivo (FP: limpio bloqueado). Con esas frecuencias se calcularon Recall = VP/(VP+FN), Precisión = VP/(VP+FP) y F1 = 2·(Precisión·Recall)/(Precisión+Recall). Se aplicaron dos configuraciones. La representativa refleja la forma habitual en que las consultoras redactan —mayoría de casos directos y una minoría de casos límite— y es la medida principal; esa intención es anterior a toda observación de redacción real, y el párrafo siguiente la contrasta con el corpus de campo. La de estrés está cargada de casos límite para exponer las fronteras de decisión del detector. El detalle caso por caso está en Casos_Compliance_Representativo_resultados.csv y Casos_Compliance_resultados.csv.</w:t>
-      </w:r>
-    </w:p>
-    <w:p>
-      <w:r>
-        <w:t>El contraste es posible porque los 29 textos verbatim del estudio de campo llegaron después de diseñados los conjuntos. El script run_representatividad.mjs clasifica cada caso infractor de texto según la forma en que expresa el precio o la promoción, con una taxonomía léxica propia. Las formas son seis: símbolo de moneda con cifra, cifra con palabra de moneda, palabra de precio con cifra, descuento porcentual, vocabulario comercial y forma indirecta. A la quinta la define que el vocabulario, y no la cifra, sea lo que dispara la regla: dos de los tres casos de campo que caen en ella ofrecen un «2x1», que sí lleva cifra, y el tercero un «envío GRATIS». No son mutuamente excluyentes —cinco de los doce casos reales satisfacen más de una—, de modo que a cada caso se le asigna la primera que coincide, en ese orden. La distribución por forma depende por lo tanto del orden elegido; lo que no depende de él es la categoría residual, que es la que sostiene el contraste. Los 12 casos infractores de texto del corpus real se reparten en tres formas: 5 con símbolo de moneda, 4 con descuento porcentual y 3 con vocabulario comercial. Ninguno adopta una forma indirecta, mientras que el conjunto representativo lleva 1 de 18, y 4 de sus casos usan la palabra de moneda o la de precio, que en el corpus real no aparecen.</w:t>
+        <w:t>de las Pautas, que alcanza también a la solicitud de compra sin cifra (Capítulo 7). Los casos de texto los ejecutó un script que transcribe verbatim las seis expresiones del nodo desplegado y registra el veredicto y la expresión que disparó cada bloqueo (Anexo E.4). Los de imagen se enviaron al bot sobre el entorno E2, por la ruta completa de HU8, y su veredicto se registró a mano.</w:t>
+      </w:r>
+    </w:p>
+    <w:p>
+      <w:r>
+        <w:t>Cada resultado se clasificó como verdadero positivo (VP: infractor bloqueado), falso negativo (FN: infractor publicado), verdadero negativo (VN: limpio publicado) o falso positivo (FP: limpio bloqueado). Con esas frecuencias se calcularon Recall = VP/(VP+FN), Precisión = VP/(VP+FP) y F1 = 2·(Precisión·Recall)/(Precisión+Recall). Se aplicaron dos configuraciones. La representativa refleja la forma habitual en que las consultoras redactan —mayoría de casos directos y una minoría de casos límite— y es la medida principal; esa intención es anterior a toda observación de redacción real, y el párrafo siguiente la contrasta con el corpus de campo. La de estrés está cargada de casos límite para exponer las fronteras de decisión del detector. El detalle caso por caso está en el material complementario (Anexo E.4).</w:t>
+      </w:r>
+    </w:p>
+    <w:p>
+      <w:r>
+        <w:t>El contraste es posible porque los 29 textos verbatim del estudio de campo llegaron después de diseñados los conjuntos. Un script clasifica cada caso infractor de texto según la forma en que expresa el precio o la promoción, con una taxonomía léxica propia. Las formas son seis: símbolo de moneda con cifra, cifra con palabra de moneda, palabra de precio con cifra, descuento porcentual, vocabulario comercial y forma indirecta. A la quinta la define que el vocabulario, y no la cifra, sea lo que dispara la regla: dos de los tres casos de campo que caen en ella ofrecen un «2x1», que sí lleva cifra, y el tercero un «envío GRATIS». No son mutuamente excluyentes —cinco de los doce casos reales satisfacen más de una—, de modo que a cada caso se le asigna la primera que coincide, en ese orden. La distribución por forma depende por lo tanto del orden elegido; lo que no depende de él es la categoría residual, que es la que sostiene el contraste. Los 12 casos infractores de texto del corpus real se reparten en tres formas: 5 con símbolo de moneda, 4 con descuento porcentual y 3 con vocabulario comercial. Ninguno adopta una forma indirecta, mientras que el conjunto representativo lleva 1 de 18, y 4 de sus casos usan la palabra de moneda o la de precio, que en el corpus real no aparecen.</w:t>
       </w:r>
     </w:p>
     <w:p>
@@ -23256,7 +23252,7 @@
     </w:p>
     <w:p>
       <w:r>
-        <w:t>El conjunto diseñado incluye, entonces, una forma indirecta que el corpus real no exhibe: un caso sobre dieciocho frente a cero sobre doce, una diferencia que la prueba exacta de Fisher no distingue del azar (p = 1,0 bilateral). No autoriza a tratar las métricas del conjunto como cota de las reales, ni explica la brecha de F1 con el campo, que sale sobre todo de los falsos positivos —tres contra cero— y que la taxonomía no clasifica, porque sólo ordena los positivos. Los doce textos reales son, además, mensajes de canal privado, donde el precio se enuncia con menos rodeos que en una publicación de feed. Archivo de resultados: Representatividad_resultados.csv (Anexo E.1).</w:t>
+        <w:t>El conjunto diseñado incluye, entonces, una forma indirecta que el corpus real no exhibe: un caso sobre dieciocho frente a cero sobre doce, una diferencia que la prueba exacta de Fisher no distingue del azar (p = 1,0 bilateral). No autoriza a tratar las métricas del conjunto como cota de las reales, ni explica la brecha de F1 con el campo, que sale sobre todo de los falsos positivos —tres contra cero— y que la taxonomía no clasifica, porque sólo ordena los positivos. Los doce textos reales son, además, mensajes de canal privado, donde el precio se enuncia con menos rodeos que en una publicación de feed. El resultado por caso está en el material complementario (Anexo E.4).</w:t>
       </w:r>
     </w:p>
     <w:p>
@@ -23488,7 +23484,7 @@
         <w:jc w:val="both"/>
       </w:pPr>
       <w:r>
-        <w:t>Nota. Elaboración propia. VP: verdadero positivo; FN: falso negativo; FP: falso positivo; VN: verdadero negativo. El conjunto agrega los dos canales del módulo: 36 casos de texto y 4 de imagen. El conjunto de estrés reutiliza esos mismos cuatro escenarios de imagen, de modo que el canal visual aporta cuatro observaciones y no ocho. El veredicto caso por caso, con la expresión regular que produjo cada bloqueo, está en Casos_Compliance_Representativo_resultados_v1.csv (Anexo E.1).</w:t>
+        <w:t>Nota. Elaboración propia. VP: verdadero positivo; FN: falso negativo; FP: falso positivo; VN: verdadero negativo. El conjunto agrega los dos canales del módulo: 36 casos de texto y 4 de imagen. El conjunto de estrés reutiliza esos mismos cuatro escenarios de imagen, de modo que el canal visual aporta cuatro observaciones y no ocho. El veredicto caso por caso, con la expresión regular que produjo cada bloqueo, está en el material complementario (Anexo E.4).</w:t>
       </w:r>
     </w:p>
     <w:p/>
@@ -23719,8 +23715,7 @@
     </w:tbl>
     <w:p>
       <w:r>
-        <w:lastRenderedPageBreak/>
-        <w:t>Nota. Elaboración propia. VP: verdadero positivo; FN: falso negativo; FP: falso positivo; VN: verdadero negativo. El conjunto concentra construcciones adversariales —precio en palabras, términos polisémicos, separadores de miles— y no representa la distribución esperada del uso corriente: sus cifras no describen el desempeño típico. Tampoco son el peor caso: el análisis de valores límite del §6.1.4 lo supera. Detalle en Casos_Compliance_resultados_v1.csv (Anexo E.1).</w:t>
+        <w:t>Nota. Elaboración propia. VP: verdadero positivo; FN: falso negativo; FP: falso positivo; VN: verdadero negativo. El conjunto concentra construcciones adversariales —precio en palabras, términos polisémicos, separadores de miles— y no representa la distribución esperada del uso corriente: sus cifras no describen el desempeño típico. Tampoco son el peor caso: el análisis de valores límite del §6.1.4 lo supera. Detalle caso por caso en el material complementario (Anexo E.4).</w:t>
       </w:r>
     </w:p>
     <w:p/>
@@ -25108,7 +25103,7 @@
         <w:jc w:val="both"/>
       </w:pPr>
       <w:r>
-        <w:t>La revisión del canal visual, hecha después de la del textual, encontró una divergencia de la misma clase y de mayor alcance. El grafo de conexiones mostró que la detección de precios incrustados corría sólo en el flujo de imagen única. El carrusel usaba un criterio propio, sin una de las formas que el de imagen única enumera, y el video y la re-publicación no ejecutaban ninguna detección visual. Una foto con el precio impreso quedaba bloqueada si se enviaba sola y se publicaba como video o reciclada desde Mi Agenda. La corrección unificó la regla: los cuatro flujos con imagen llevan hoy el mismo criterio, idéntico carácter por carácter. El carrusel lo lleva dentro del prompt que le pide el orden narrativo, porque separarlo multiplicaría por el número de imágenes el consumo de una cuota diaria acotada. El script verificar_patrones_desplegados.mjs comprueba esa identidad flujo por flujo, y los Anexos E.9 a E.11 miden que el comportamiento acompañe a la regla.</w:t>
+        <w:t>La revisión del canal visual, hecha después de la del textual, encontró una divergencia de la misma clase y de mayor alcance. El grafo de conexiones mostró que la detección de precios incrustados corría sólo en el flujo de imagen única. El carrusel usaba un criterio propio, sin una de las formas que el de imagen única enumera, y el video y la re-publicación no ejecutaban ninguna detección visual. Una foto con el precio impreso quedaba bloqueada si se enviaba sola y se publicaba como video o reciclada desde Mi Agenda. La corrección unificó la regla: los cuatro flujos con imagen llevan hoy el mismo criterio, idéntico carácter por carácter. El carrusel lo lleva dentro del prompt que le pide el orden narrativo, porque separarlo multiplicaría por el número de imágenes el consumo de una cuota diaria acotada. La verificación del Anexo E.4 comprueba esa identidad flujo por flujo, y los Anexos E.9 a E.11 miden que el comportamiento acompañe a la regla.</w:t>
       </w:r>
     </w:p>
     <w:p>
@@ -25960,7 +25955,7 @@
     </w:p>
     <w:p>
       <w:r>
-        <w:t xml:space="preserve">Las cuatro baterías del §3.4.2 —integración multimodal, interfaz conversacional, procesamiento multimedia y transacciones OAuth 2.0— se ejecutaron sobre el entorno E2 (Anexo E.5), cada una contra el umbral de su Historia de Usuario cuando fija uno. Las Historias fijan once umbrales numéricos, y el inventario del Anexo E.7 tiene una fila por cada uno. Dos —la firma de HU9 y el corte de 60 s de HU13— se comprueban leyendo del código desplegado el parámetro que impone el límite. Los otros nueve los contrasta el script run_umbrales.mjs contra E2 y su historial de ejecuciones, salvo el intercambio de token de HU2 y la regeneración de copys de HU12, que salen </w:t>
+        <w:t xml:space="preserve">Las cuatro baterías del §3.4.2 —integración multimodal, interfaz conversacional, procesamiento multimedia y transacciones OAuth 2.0— se ejecutaron sobre el entorno E2 (Anexo E.5), cada una contra el umbral de su Historia de Usuario cuando fija uno. Las Historias fijan once umbrales numéricos, y el inventario del Anexo E.7 tiene una fila por cada uno. Dos —la firma de HU9 y el corte de 60 s de HU13— se comprueban leyendo del código desplegado el parámetro que impone el límite. Los otros nueve se contrastan contra E2 y su historial de ejecuciones, salvo el intercambio de token de HU2 y la regeneración de copys de HU12, que salen </w:t>
       </w:r>
       <w:r>
         <w:lastRenderedPageBreak/>
@@ -26003,7 +25998,7 @@
     </w:p>
     <w:p>
       <w:r>
-        <w:t>Se cronometró el tramo operativo —del material en mano a la publicación confirmada— de una publicación de feed en Instagram y Facebook, comparando el flujo manual (As-Is) con el asistido por Postly (To-Be). La medición operacionaliza la variable (a) del §3.5.4 y contrasta la hipótesis del §3.5.4. Participaron ocho Consultoras de Belleza Independientes reales —las tres del piloto más cinco nuevas—, con el orden de las condiciones contrabalanceado entre participantes (PROTOCOLO-ampliacion.md). Cada una ejecutó la tarea en ambas condiciones para cuatro publicaciones, bajo un diseño intra-sujeto que evita confundir el efecto de la persona con el de la herramienta (n = 32 pares).</w:t>
+        <w:t>Se cronometró el tramo operativo —del material en mano a la publicación confirmada— de una publicación de feed en Instagram y Facebook, comparando el flujo manual (As-Is) con el asistido por Postly (To-Be). La medición operacionaliza la variable (a) del §3.5.4 y contrasta la hipótesis del §3.5.4. Participaron ocho Consultoras de Belleza Independientes reales —las tres del piloto más cinco nuevas—, con el orden de las condiciones contrabalanceado entre participantes (protocolo de la ampliación, Anexo E.2). Cada una ejecutó la tarea en ambas condiciones para cuatro publicaciones, bajo un diseño intra-sujeto que evita confundir el efecto de la persona con el de la herramienta (n = 32 pares).</w:t>
       </w:r>
     </w:p>
     <w:p>
@@ -26662,7 +26657,7 @@
         <w:rPr>
           <w:i/>
         </w:rPr>
-        <w:t>Nota. Elaboración propia a partir de Cronometraje_datos_v2.csv (Anexo E.2). «Manual» es el tramo comparable —producción y publicación, descontada la adaptación— y «Postly», el tiempo total corregido con el historial de ejecuciones (§6.1.6), porque esa subtarea no le corresponde a la usuaria: la imagen única la adapta el sistema, dentro de ese tiempo (§4.4.2). Ese tiempo es una cota inferior del real (§6.1.6). La «Reducción» es la media de las ocho reducciones individuales, no la reducción entre las medias globales de esta tabla. El detalle de la adaptación por participante y la reducción sobre el tiempo total están en el §6.1.6 y el Anexo E.2. La codificación cambió entre el piloto y la ampliación: la C1 del piloto es la C6 de la ampliación, y C2 y C3 conservan su código. Con la codificación de la ampliación, los estratos de relación son «Conocida», C2 y C3; «Familiar», C6; y «Ninguna», C1, C4, C5, C7 y C8.</w:t>
+        <w:t>Nota. Elaboración propia a partir de la planilla de cronometraje (Anexo E.2). «Manual» es el tramo comparable —producción y publicación, descontada la adaptación— y «Postly», el tiempo total corregido con el historial de ejecuciones (§6.1.6), porque esa subtarea no le corresponde a la usuaria: la imagen única la adapta el sistema, dentro de ese tiempo (§4.4.2). Ese tiempo es una cota inferior del real (§6.1.6). La «Reducción» es la media de las ocho reducciones individuales, no la reducción entre las medias globales de esta tabla. El detalle de la adaptación por participante y la reducción sobre el tiempo total están en el §6.1.6 y el Anexo E.2. La codificación cambió entre el piloto y la ampliación: la C1 del piloto es la C6 de la ampliación, y C2 y C3 conservan su código. Con la codificación de la ampliación, los estratos de relación son «Conocida», C2 y C3; «Familiar», C6; y «Ninguna», C1, C4, C5, C7 y C8.</w:t>
       </w:r>
     </w:p>
     <w:p>
@@ -26681,12 +26676,12 @@
     </w:p>
     <w:p>
       <w:r>
-        <w:t>Falta estimar cuánto tiempo no se registró. En los 9 pares —de cinco participantes— en que el cronómetro superó al intervalo del motor, la diferencia entre ambos fue de 6 a 68 s, con una mediana de 17 s y una media de 28 s. Es lo que la usuaria tardó antes de que el motor viera la foto. Se aplica la regla del tiempo corregido con el intervalo del motor incrementado en esa cantidad. La reducción media es del 74,9 % con 10 s (t(7) = 3,31; p = 0,006). Es del 73,6 % con 17 s, la mediana (t(7) = 2,29; p = 0,028), y del 73,0 % con 20 s (p = 0,052). Con 28 s, la media, es del 71,4 % (t(7) = 0,80; p = 0,224). El contraste deja de ser significativo con unos 20 s, y la estimación puntual deja de superar el 70 % con unos 35 s. Los datos sostienen, entonces, una conclusión más acotada que el contraste sobre el tiempo registrado: con el tiempo omitido en su mediana observada la reducción supera el 70 % de forma significativa, y con su media no se distingue del umbral. La hipótesis es compatible con los datos, pero no queda confirmada de forma concluyente. Con las medidas no paramétricas que recomiendan Kitchenham y Madeyski (2024), Postly fue más rápido en los 32 pares (probabilidad de superioridad pareada = 1,00). La prueba de rangos con signo de Wilcoxon, exacta y unilateral, sobre las ocho reducciones frente al 70 % da p = 0,004 con el tiempo registrado, p = 0,027 con 17 s y p = 0,191 con 28 s. Los nueve pares en que el cronómetro cubrió todo el tramo dan una reducción media del 77,7 % (mínimo 63,1 %), aunque son un subconjunto que el propio cronómetro seleccionó y no un contraste. El script sensibilidad_tiempo_omitido.mjs, que está en el repositorio del proyecto (avance/instrumentos/), reproduce estas cifras desde la planilla del Anexo E.2, y run_cronometraje_v2.mjs reporta los contrastes anteriores y la cuenta con el cronómetro sin corregir.</w:t>
-      </w:r>
-    </w:p>
-    <w:p>
-      <w:r>
-        <w:t>La diferencia entre las dos reducciones —76,7 % sobre el tramo comparable y 81,2 % sobre el tiempo total— es la propia subtarea de adaptación, de 1,8 minutos de media. La ampliación la midió como un tramo separado del mismo cronómetro (§5, PROTOCOLO-ampliacion.md). Sobre el tiempo total la reducción también es significativa contra el umbral del 70 % (t(7) = 9,27; p &lt; 0,001). El registro del tramo de adaptación y los datos completos están en el Anexo E.2.</w:t>
+        <w:t>Falta estimar cuánto tiempo no se registró. En los 9 pares —de cinco participantes— en que el cronómetro superó al intervalo del motor, la diferencia entre ambos fue de 6 a 68 s, con una mediana de 17 s y una media de 28 s. Es lo que la usuaria tardó antes de que el motor viera la foto. Se aplica la regla del tiempo corregido con el intervalo del motor incrementado en esa cantidad. La reducción media es del 74,9 % con 10 s (t(7) = 3,31; p = 0,006). Es del 73,6 % con 17 s, la mediana (t(7) = 2,29; p = 0,028), y del 73,0 % con 20 s (p = 0,052). Con 28 s, la media, es del 71,4 % (t(7) = 0,80; p = 0,224). El contraste deja de ser significativo con unos 20 s, y la estimación puntual deja de superar el 70 % con unos 35 s. Los datos sostienen, entonces, una conclusión más acotada que el contraste sobre el tiempo registrado: con el tiempo omitido en su mediana observada la reducción supera el 70 % de forma significativa, y con su media no se distingue del umbral. La hipótesis es compatible con los datos, pero no queda confirmada de forma concluyente. Con las medidas no paramétricas que recomiendan Kitchenham y Madeyski (2024), Postly fue más rápido en los 32 pares (probabilidad de superioridad pareada = 1,00). La prueba de rangos con signo de Wilcoxon, exacta y unilateral, sobre las ocho reducciones frente al 70 % da p = 0,004 con el tiempo registrado, p = 0,027 con 17 s y p = 0,191 con 28 s. Los nueve pares en que el cronómetro cubrió todo el tramo dan una reducción media del 77,7 % (mínimo 63,1 %), aunque son un subconjunto que el propio cronómetro seleccionó y no un contraste. Estas cifras, los contrastes anteriores y la cuenta con el cronómetro sin corregir se reproducen desde la planilla del Anexo E.2 con los scripts que lista el Anexo E.4.</w:t>
+      </w:r>
+    </w:p>
+    <w:p>
+      <w:r>
+        <w:t>La diferencia entre las dos reducciones —76,7 % sobre el tramo comparable y 81,2 % sobre el tiempo total— es la propia subtarea de adaptación, de 1,8 minutos de media. La ampliación la midió como un tramo separado del mismo cronómetro (protocolo de la ampliación, §5). Sobre el tiempo total la reducción también es significativa contra el umbral del 70 % (t(7) = 9,27; p &lt; 0,001). El registro del tramo de adaptación y los datos completos están en el Anexo E.2.</w:t>
       </w:r>
     </w:p>
     <w:p>
@@ -26723,7 +26718,7 @@
         <w:jc w:val="both"/>
       </w:pPr>
       <w:r>
-        <w:t>Las ocho consultoras completaron, tras usar el sistema, un cuestionario de Aceptación Tecnológica (Davis, 1989) ampliado a doce ítems en escala Likert de 1 a 5, con tres ítems invertidos y un ítem de control de atención. El instrumento del piloto tenía diez ítems y ninguno invertido; la ampliación lo corrigió para medir la aquiescencia, la tendencia a acordar con una afirmación y también con su contraria (§3.5.5; PROTOCOLO-ampliacion.md). Los ítems se agrupan en Utilidad Percibida, Facilidad de Uso Percibida e Intención de Uso, y operacionalizan la variable (c) del §3.5.4. La Tabla 8 resume los resultados.</w:t>
+        <w:t>Las ocho consultoras completaron, tras usar el sistema, un cuestionario de Aceptación Tecnológica (Davis, 1989) ampliado a doce ítems en escala Likert de 1 a 5, con tres ítems invertidos y un ítem de control de atención. El instrumento del piloto tenía diez ítems y ninguno invertido; el de la ampliación invierte ítems para medir la aquiescencia, la tendencia a acordar con una afirmación y también con su contraria (§3.5.5). Los ítems se agrupan en Utilidad Percibida, Facilidad de Uso Percibida e Intención de Uso, y operacionalizan la variable (c) del §3.5.4. La Tabla 8 resume los resultados.</w:t>
       </w:r>
     </w:p>
     <w:p>
@@ -26974,7 +26969,7 @@
         <w:rPr>
           <w:i/>
         </w:rPr>
-        <w:t>Nota. Elaboración propia a partir de TAM_respuestas_v2.csv (Anexo E.3). PU: Utilidad Percibida; PEOU: Facilidad de Uso Percibida; BI: Intención de Uso. Escala de Likert de 1 a 5, doce ítems adaptados de Davis (1989), con los tres invertidos ya recodificados. Las ocho participantes pasaron el ítem de control de atención (8/8).</w:t>
+        <w:t>Nota. Elaboración propia a partir de las respuestas del cuestionario (Anexo E.3). PU: Utilidad Percibida; PEOU: Facilidad de Uso Percibida; BI: Intención de Uso. Escala de Likert de 1 a 5, doce ítems adaptados de Davis (1989), con los tres invertidos ya recodificados. Las ocho participantes pasaron el ítem de control de atención (8/8).</w:t>
       </w:r>
     </w:p>
     <w:p>
@@ -27318,7 +27313,7 @@
     </w:p>
     <w:p>
       <w:r>
-        <w:t>El tercero de esos casos es de carrusel (HU5) y lo documenta el Anexo E.10. Demuestra que la detección corre en ese flujo, no que aplique el mismo criterio que el de imagen única. Su imagen con precio es la misma pieza auténtica que el caso R01 (Anexo E.8), pero R01 no recorrió el bot sino el script run_compliance_vision.mjs, que llama a la API directamente (Anexos E.6 y E.8). Un solo acuerdo entre un script y un flujo con prompts distintos, sobre un positivo de alto contraste, no establece identidad de criterio. El cuarto caso es el de la re-publicación (HU12) y lo documenta el Anexo E.11.</w:t>
+        <w:t>El tercero de esos casos es de carrusel (HU5) y lo documenta el Anexo E.10. Demuestra que la detección corre en ese flujo, no que aplique el mismo criterio que el de imagen única. Su imagen con precio es la misma pieza auténtica que el caso R01 (Anexo E.8), pero R01 no recorrió el bot sino un script que llama a la API directamente (Anexos E.6 y E.8). Un solo acuerdo entre un script y un flujo con prompts distintos, sobre un positivo de alto contraste, no establece identidad de criterio. El cuarto caso es el de la re-publicación (HU12) y lo documenta el Anexo E.11.</w:t>
       </w:r>
     </w:p>
     <w:p>
@@ -27627,7 +27622,7 @@
         <w:t>Consolidación de la Validación Empírica (Alta Prioridad, parcialmente aplicada):</w:t>
       </w:r>
       <w:r>
-        <w:t xml:space="preserve"> con las catorce Historias de Usuario recorridas de extremo a extremo (Tabla 9), la validación de campo pasó de un piloto de tres consultoras a una ampliación de ocho, con el orden de las condiciones contrabalanceado (§6.1; PROTOCOLO-ampliacion.md). Con ocho participantes, el intervalo de confianza de la reducción es de ± 3,2 puntos porcentuales. El acceso del equipo a consultoras fuera de su círculo se agotó en esas ocho. Queda como línea siguiente una muestra probabilística que permita generalizar a la población objetivo.</w:t>
+        <w:t xml:space="preserve"> con las catorce Historias de Usuario recorridas de extremo a extremo (Tabla 9), la validación de campo pasó de un piloto de tres consultoras a una ampliación de ocho, con el orden de las condiciones contrabalanceado (§6.1; Anexo E.2). Con ocho participantes, el intervalo de confianza de la reducción es de ± 3,2 puntos porcentuales. El acceso del equipo a consultoras fuera de su círculo se agotó en esas ocho. Queda como línea siguiente una muestra probabilística que permita generalizar a la población objetivo.</w:t>
       </w:r>
     </w:p>
     <w:p>
@@ -27690,8 +27685,7 @@
         <w:t xml:space="preserve"> hasta el 19 de septiembre de 2026 los cuatro prompts </w:t>
       </w:r>
       <w:r>
-        <w:lastRenderedPageBreak/>
-        <w:t>de generación exigían cerrar los tres copys con una invitación a contactar a la consultora. Según la letra de la fuente, esa invitación convierte un mensaje informativo en comercial (§6.1.3; Anexo D). Se aplicó la salida estricta: la regla se invirtió en los cuatro prompts y ahora prohíbe la invitación en los tres tonos (Anexo E.12). La otra queda como trabajo futuro: conservar el llamado a la acción en la ruta de Facebook, que la fuente autoriza en la página de negocios (Anexo D, p. 1), y retirarlo de la de Instagram. Exige generar dos textos por publicación y medir cada ruta por separado, porque el sistema publica hoy el mismo copy en las dos redes. Queda pendiente, además, que el módulo detecte la solicitud de compra sin cifra cuando la escribe la usuaria al editar el copy. Y queda la línea de contacto que el sistema agrega a cada publicación (§4.3.2). Conviene hacerla opcional por publicación, guardarla por usuaria y no en la hoja de una sola fila (§7.7), y preguntar a la Compañía si un dato de contacto al pie de un mensaje informativo lo vuelve comercial.</w:t>
+        <w:t>de generación exigían cerrar los tres copys con una invitación a contactar a la consultora. Según la letra de la fuente, esa invitación convierte un mensaje informativo en comercial (§6.1.3; Anexo D). Se aplicó la salida estricta: la regla se invirtió en los cuatro prompts y ahora prohíbe la invitación en los tres tonos (Anexo E.12). La otra queda como trabajo futuro: conservar el llamado a la acción en la ruta de Facebook, que la fuente autoriza en la página de negocios (Anexo D, p. 1), y retirarlo de la de Instagram. Exige generar dos textos por publicación y medir cada ruta por separado, porque el sistema publica hoy el mismo copy en las dos redes. Queda pendiente, además, que el módulo detecte la solicitud de compra sin cifra cuando la escribe la usuaria al editar el copy. Y queda la línea de contacto que el sistema agrega a cada publicación (§4.3.2). Conviene hacerla opcional por publicación —ya se guarda por usuaria (§7.7)— y preguntar a la Compañía si un dato de contacto al pie de un mensaje informativo lo vuelve comercial.</w:t>
       </w:r>
     </w:p>
     <w:p>
@@ -33016,7 +33010,7 @@
     </w:p>
     <w:p>
       <w:r>
-        <w:t>24 de septiembre. Diseño de la evaluación ampliada y de los cuatro estudios del Objetivo Específico 2 (PROTOCOLO-ampliacion.md y PROTOCOLO-OE2.md), generación del material del Estudio 1.</w:t>
+        <w:t>24 de septiembre. Diseño de la evaluación ampliada y de los cuatro estudios del Objetivo Específico 2 (protocolos de la ampliación y del Objetivo Específico 2), generación del material del Estudio 1.</w:t>
       </w:r>
     </w:p>
     <w:p>
@@ -33742,8 +33736,7 @@
         <w:t xml:space="preserve">Se construyeron dos conjuntos de 40 casos, cada uno balanceado en 20 casos infractores y 20 limpios, con idéntica composición por canal: 36 casos de texto (HU7) y 4 de imagen (HU8). El conjunto representativo se construyó para reproducir la redacción habitual de una publicación comercial, en la forma en que una consultora escribiría el precio o la promoción. El §6.1 contrasta esa intención contra los textos reales y concluye que la comparación no autoriza a tratar las métricas del conjunto como cota inferior de las reales, y que tampoco indica una </w:t>
       </w:r>
       <w:r>
-        <w:lastRenderedPageBreak/>
-        <w:t>dirección: la prueba exacta de Fisher sobre esa tabla da p = 1,0 bilateral. El conjunto de estrés incorpora deliberadamente formulaciones adversas: precio expresado en palabras, jerga monetaria, descuentos sin palabra gatillo y números que no son precios. La clase real de cada caso se etiquetó con el criterio del §6.1.1: una referencia monetaria —precio, descuento, oferta o promoción— en canal público, aun sin cifra. Los casos de texto se ejecutaron con un script que transcribe las reglas del detector desplegado (Anexo E.4) y los de imagen sobre el bot completo, en el entorno E2 (Anexo B.1). Archivos de casos: Casos_Compliance_Representativo.csv y Casos_Compliance.csv. Archivos de resultados, con el veredicto de cada caso y la expresión regular que lo produjo: Casos_Compliance_Representativo_resultados_v1.csv y Casos_Compliance_resultados_v1.csv para el detector original (el de las Tablas 3 y 4), y los homónimos sin sufijo para el detector corregido.</w:t>
+        <w:t>dirección: la prueba exacta de Fisher sobre esa tabla da p = 1,0 bilateral. El conjunto de estrés incorpora deliberadamente formulaciones adversas: precio expresado en palabras, jerga monetaria, descuentos sin palabra gatillo y números que no son precios. La clase real de cada caso se etiquetó con el criterio del §6.1.1: una referencia monetaria —precio, descuento, oferta o promoción— en canal público, aun sin cifra. Los casos de texto se ejecutaron con un script que transcribe las reglas del detector desplegado (Anexo E.4) y los de imagen sobre el bot completo, en el entorno E2 (Anexo B.1). Los archivos de resultados guardan, para cada caso, el veredicto y la expresión regular que lo produjo, por separado para el detector original (el de las Tablas 3 y 4) y el corregido (Tabla 17).</w:t>
       </w:r>
     </w:p>
     <w:p>
@@ -33787,7 +33780,7 @@
         <w:jc w:val="both"/>
       </w:pPr>
       <w:r>
-        <w:t>Dos de los casos señalados como infractores correspondían a defectos del producto fotografiado —tinta corrida y tapa dañada— y no a precios ni promociones. Se conservaron en el conjunto y la Tabla 5 los cuenta como falsos negativos en el panel B, con la etiqueta de los etiquetadores, y como verdaderos negativos en el panel A, que sólo audita la referencia monetaria; el §6.1 los analiza como límite de alcance del módulo. El origen del material es el siguiente. Lo redactaron las consultoras sobre sus propios productos y se reunió para esta evaluación, de modo que no son publicaciones en línea de sus cuentas. La planilla registra el pie de foto verbatim de cada uno de los 29 casos y no una descripción, de modo que un tercero puede ejecutar el detector sobre el mismo texto que recibió el bot y reproducir la Tabla 5. Lo único que se normaliza es el espacio en blanco, porque la planilla tiene una fila por caso. Archivo: Compliance_Campo.csv.</w:t>
+        <w:t>Dos de los casos señalados como infractores correspondían a defectos del producto fotografiado —tinta corrida y tapa dañada— y no a precios ni promociones. Se conservaron en el conjunto y la Tabla 5 los cuenta como falsos negativos en el panel B, con la etiqueta de los etiquetadores, y como verdaderos negativos en el panel A, que sólo audita la referencia monetaria; el §6.1 los analiza como límite de alcance del módulo. El origen del material es el siguiente. Lo redactaron las consultoras sobre sus propios productos y se reunió para esta evaluación, de modo que no son publicaciones en línea de sus cuentas. La planilla registra el pie de foto verbatim de cada uno de los 29 casos y no una descripción, de modo que un tercero puede ejecutar el detector sobre el mismo texto que recibió el bot y reproducir la Tabla 5. Lo único que se normaliza es el espacio en blanco, porque la planilla tiene una fila por caso.</w:t>
       </w:r>
     </w:p>
     <w:p>
@@ -33803,7 +33796,7 @@
         <w:jc w:val="both"/>
       </w:pPr>
       <w:r>
-        <w:t>El canal textual del Centinela evalúa seis expresiones regulares en cascada sobre el pie de foto final (Anexo B.4) y detiene el flujo con la primera que coincide. Por tratarse de un componente determinista, su comportamiento es derivable por inspección del código y la técnica de prueba apropiada es el análisis de valores límite con partición en clases de equivalencia (Myers, 2004). Se diseñó un caso por cada regla dentro de su límite de decisión, un caso inmediatamente fuera de él y los casos limpios que la propia regla puede bloquear por error, hasta cubrir las seis reglas: 25 casos, 17 infractores y 8 limpios. Antes de ejecutarlos se registró la predicción de comportamiento derivada de la lectura estática de las reglas, y esa predicción se cumplió en los 25 casos. La Tabla 10 detalla el conjunto y el veredicto antes y después de la corrección descrita en el §6.1. Archivo: Casos_Compliance_Limite.csv.</w:t>
+        <w:t>El canal textual del Centinela evalúa seis expresiones regulares en cascada sobre el pie de foto final (Anexo B.4) y detiene el flujo con la primera que coincide. Por tratarse de un componente determinista, su comportamiento es derivable por inspección del código y la técnica de prueba apropiada es el análisis de valores límite con partición en clases de equivalencia (Myers, 2004). Se diseñó un caso por cada regla dentro de su límite de decisión, un caso inmediatamente fuera de él y los casos limpios que la propia regla puede bloquear por error, hasta cubrir las seis reglas: 25 casos, 17 infractores y 8 limpios. Antes de ejecutarlos se registró la predicción de comportamiento derivada de la lectura estática de las reglas, y esa predicción se cumplió en los 25 casos. La Tabla 10 detalla el conjunto y el veredicto antes y después de la corrección descrita en el §6.1.</w:t>
       </w:r>
     </w:p>
     <w:p>
@@ -36312,7 +36305,7 @@
         <w:jc w:val="both"/>
       </w:pPr>
       <w:r>
-        <w:t>El conjunto de cuatro patrones que el nodo de programación a futuro («Sched: Procesar», HU10) mantenía por su cuenta antes de la unificación se recuperó del workflow versionado, del commit inmediatamente anterior a la corrección. Se lo ejecutó sobre los cuatro conjuntos de casos, de modo que la divergencia reportada en el §6.1 sea reproducible. Sobre el canal de texto del conjunto representativo, el flujo programado bloqueaba 9 de los 18 casos infractores (Recall 0,500) frente a los 15 del flujo inmediato (Recall 0,833). Sobre el conjunto de estrés bloqueaba 8 de 18 frente a 12; sobre el de valores límite, 4 de 17 frente a 7; y sobre el contenido real de campo, 12 de 12 en ambos flujos. En este último conjunto la divergencia no llegó a materializarse: los dos casos que ofrecen un «2x1» (c1inf2 y c3inf2) contienen también la palabra «promo», presente en el vocabulario comercial del conjunto reducido, de modo que el flujo programado los bloqueó por una regla distinta de la que les correspondía. El resultado depende del texto concreto y no del conjunto de patrones: los tres conjuntos controlados sí exhiben la divergencia. Script: run_compliance_hu10.mjs. Archivo de resultados, con el veredicto de ambos flujos para cada caso: Divergencia_HU10_resultados.csv.</w:t>
+        <w:t>El conjunto de cuatro patrones que el nodo de programación a futuro («Sched: Procesar», HU10) mantenía por su cuenta antes de la unificación se recuperó del workflow versionado, del commit inmediatamente anterior a la corrección. Se lo ejecutó sobre los cuatro conjuntos de casos, de modo que la divergencia reportada en el §6.1 sea reproducible. Sobre el canal de texto del conjunto representativo, el flujo programado bloqueaba 9 de los 18 casos infractores (Recall 0,500) frente a los 15 del flujo inmediato (Recall 0,833). Sobre el conjunto de estrés bloqueaba 8 de 18 frente a 12; sobre el de valores límite, 4 de 17 frente a 7; y sobre el contenido real de campo, 12 de 12 en ambos flujos. En este último conjunto la divergencia no llegó a materializarse: los dos casos que ofrecen un «2x1» (c1inf2 y c3inf2) contienen también la palabra «promo», presente en el vocabulario comercial del conjunto reducido, de modo que el flujo programado los bloqueó por una regla distinta de la que les correspondía. El resultado depende del texto concreto y no del conjunto de patrones: los tres conjuntos controlados sí exhiben la divergencia. El archivo de resultados guarda el veredicto de ambos flujos para cada caso (Tabla 17).</w:t>
       </w:r>
     </w:p>
     <w:p>
@@ -36332,11 +36325,10 @@
         <w:jc w:val="both"/>
       </w:pPr>
       <w:r>
-        <w:t xml:space="preserve">El diseño es intra-sujeto: cada participante ejecutó la misma tarea en las dos condiciones —manual y con Postly—, de modo que actúa como su propio control y se neutraliza la variabilidad de destreza entre participantes (PROTOCOLO-ampliacion.md). El tramo medido es «material en mano hasta publicación confirmada en Instagram y Facebook»: la búsqueda o creación del contenido no computa en ninguna de las dos condiciones. Participaron ocho consultoras —las tres del piloto más cinco nuevas—. La codificación cambió entre el piloto y la ampliación: la C1 del piloto es la C6 de la ampliación, y C2 y C3 conservan su código. Con la codificación de la ampliación, los estratos de relación son «Conocida», C2 y C3; «Familiar», C6; y «Ninguna», C1, C4, C5, C7 y C8. Cada una hizo cuatro publicaciones (dos de imagen única y dos de carrusel de dos imágenes), para un total de 32 pares. Las sesiones se hicieron el 26 y el 27 de septiembre de 2026, con el prompt ya corregido el 19 (Anexo E.12): el ítem PU3 </w:t>
-      </w:r>
-      <w:r>
-        <w:lastRenderedPageBreak/>
-        <w:t>del TAM, sobre el cumplimiento de las normas de la marca, se respondió sobre un sistema que ya no generaba la invitación a contactar. Las sesiones pidieron al modelo más que el cupo diario de una clave del nivel gratuito, que es de veinte peticiones (Anexo E.5): cada publicación de imagen única consume dos y cada carrusel, al menos una, más los reintentos. Se usaron por eso tres claves de API distintas —de los dos autores y de un colaborador ajeno al estudio—, cada una con su propio cupo y todas sobre el mismo modelo, gemini-2.5-flash, que el de los Anexos E.5 y E.6. La clave no cambia el comportamiento del sistema: sólo decide contra qué cupo se cuenta cada petición. El orden de las condiciones se contrabalanceó por bloques: cuatro participantes hicieron primero la condición manual (secuencia MP) y cuatro, primero Postly (secuencia PM). A diferencia del piloto, el tiempo manual se registró en dos tramos separados sobre el mismo cronómetro: Adaptación —desde que recibe la imagen hasta tenerla en el formato de feed— y Producción y publicación —redacción del copy, verificación de cumplimiento y publicación en cada red—. Con Postly la adaptación no es una tarea de la usuaria —la imagen única la rellena el sistema dentro de su tiempo (§4.4.2)—, de modo que la reducción principal se calcula sobre el segundo tramo, el que las dos condiciones comparten. El cronómetro lo llevó quien observaba la sesión, no la participante. Cada consultora firmó un consentimiento informado por escrito antes de la sesión —a diferencia del piloto, que usó consentimiento verbal—. Se registraron además seis criterios de inclusión declarados de antemano: actividad comercial vigente, publicaciones en los últimos 30 días, cuenta profesional de Instagram, página de Facebook vinculada, uso previo de herramientas de programación de contenido y relación previa con el equipo. La planilla tiene una fila por publicación, con las columnas Participante, Secuencia, Publicacion, Tipo, Producto, Orden_en_sesion, Adaptacion_mmss, Manual_mmss, Postly_mmss y Observaciones. Manual_mmss es el tiempo manual total, adaptación incluida; el tramo comparable de la Tabla 7 es Manual_mmss menos Adaptacion_mmss. Archivo: Cronometraje_datos_v2.csv.</w:t>
+        <w:t xml:space="preserve">El diseño es intra-sujeto: cada participante ejecutó la misma tarea en las dos condiciones —manual y con Postly—, de modo que actúa como su propio control y se neutraliza la variabilidad de destreza entre participantes (protocolo de la ampliación). El tramo medido es «material en mano hasta publicación confirmada en Instagram y Facebook»: la búsqueda o creación del contenido no computa en ninguna de las dos condiciones. Participaron ocho consultoras —las tres del piloto más cinco nuevas—. La codificación cambió entre el piloto y la ampliación: la C1 del piloto es la C6 de la ampliación, y C2 y C3 conservan su código. Con la codificación de la ampliación, los estratos de relación son «Conocida», C2 y C3; «Familiar», C6; y «Ninguna», C1, C4, C5, C7 y C8. Cada una hizo cuatro publicaciones (dos de imagen única y dos de carrusel de dos imágenes), para un total de 32 pares. Las sesiones se hicieron el 26 y el 27 de septiembre de 2026, con el prompt ya corregido el 19 (Anexo E.12): el ítem PU3 </w:t>
+      </w:r>
+      <w:r>
+        <w:t>del TAM, sobre el cumplimiento de las normas de la marca, se respondió sobre un sistema que ya no generaba la invitación a contactar. Las sesiones pidieron al modelo más que el cupo diario de una clave del nivel gratuito, que es de veinte peticiones (Anexo E.5): cada publicación de imagen única consume dos y cada carrusel, al menos una, más los reintentos. Se usaron por eso tres claves de API distintas —de los dos autores y de un colaborador ajeno al estudio—, cada una con su propio cupo y todas sobre el mismo modelo, gemini-2.5-flash, que el de los Anexos E.5 y E.6. La clave no cambia el comportamiento del sistema: sólo decide contra qué cupo se cuenta cada petición. El orden de las condiciones se contrabalanceó por bloques: cuatro participantes hicieron primero la condición manual (secuencia MP) y cuatro, primero Postly (secuencia PM). El tiempo manual se registró en dos tramos separados sobre el mismo cronómetro: Adaptación —desde que recibe la imagen hasta tenerla en el formato de feed— y Producción y publicación —redacción del copy, verificación de cumplimiento y publicación en cada red—. Con Postly la adaptación no es una tarea de la usuaria —la imagen única la rellena el sistema dentro de su tiempo (§4.4.2)—, de modo que la reducción principal se calcula sobre el segundo tramo, el que las dos condiciones comparten. El cronómetro lo llevó quien observaba la sesión, no la participante. Cada consultora firmó un consentimiento informado por escrito antes de la sesión. Se registraron además seis criterios de inclusión declarados de antemano: actividad comercial vigente, publicaciones en los últimos 30 días, cuenta profesional de Instagram, página de Facebook vinculada, uso previo de herramientas de programación de contenido y relación previa con el equipo. La planilla tiene una fila por publicación, con las columnas Participante, Secuencia, Publicacion, Tipo, Producto, Orden_en_sesion, Adaptacion_mmss, Manual_mmss, Postly_mmss y Observaciones. Manual_mmss es el tiempo manual total, adaptación incluida; el tramo comparable de la Tabla 7 es Manual_mmss menos Adaptacion_mmss.</w:t>
       </w:r>
     </w:p>
     <w:p>
@@ -36356,7 +36348,7 @@
         <w:jc w:val="both"/>
       </w:pPr>
       <w:r>
-        <w:t>Dos condiciones del procedimiento gobiernan la validez interna de la medición, y las dos son iguales que en el piloto. La primera es que no hubo instrucción ni demostración previa del bot: cada participante recorrió el flujo por su cuenta en su primera ejecución. La segunda es que el cronómetro lo llevaron los autores y no las participantes: ninguna medición fue autorregistrada, lo que acota sin eliminar la amenaza que el §3.5.5 declara sobre el ritmo de la condición manual. Con Postly, en cambio, el cronómetro no incluyó de forma uniforme la espera por el modelo, y el §6.1.6 corrige esa condición con el historial de ejecuciones. A diferencia del piloto, la planilla no tiene columnas sin poblar: Tipo, Producto y Orden_en_sesion se completaron en las 32 filas, y la adaptación se registró en vez de estimarse. La asimetría de los carruseles —donde la condición manual incluye además decidir el orden de las imágenes— sigue declarada y no ponderada, igual que en el piloto: no puede establecerse cuánto de la reducción en esos 16 pares proviene de esa funcionalidad y no del resto del flujo.</w:t>
+        <w:t>Dos condiciones del procedimiento gobiernan la validez interna de la medición, y las dos son iguales que en el piloto. La primera es que no hubo instrucción ni demostración previa del bot: cada participante recorrió el flujo por su cuenta en su primera ejecución. La segunda es que el cronómetro lo llevaron los autores y no las participantes: ninguna medición fue autorregistrada, lo que acota sin eliminar la amenaza que el §3.5.5 declara sobre el ritmo de la condición manual. Con Postly, en cambio, el cronómetro no incluyó de forma uniforme la espera por el modelo, y el §6.1.6 corrige esa condición con el historial de ejecuciones. La planilla no tiene columnas sin poblar: Tipo, Producto y Orden_en_sesion se completaron en las 32 filas, y la adaptación se registró en vez de estimarse. La asimetría de los carruseles —donde la condición manual incluye además decidir el orden de las imágenes— sigue declarada y no ponderada, igual que en el piloto: no puede establecerse cuánto de la reducción en esos 16 pares proviene de esa funcionalidad y no del resto del flujo.</w:t>
       </w:r>
     </w:p>
     <w:p>
@@ -36364,7 +36356,7 @@
         <w:jc w:val="both"/>
       </w:pPr>
       <w:r>
-        <w:t>La reducción sobre el tiempo total —adaptación incluida— es del 81,2 %, también significativa contra el umbral del 70 % (t(7) = 9,27; p &lt; 0,001), con la misma salvedad de cota superior que la del tramo comparable (§6.1.6). La diferencia con el 76,7 % del tramo comparable es la propia adaptación, de 1,8 minutos de media. A diferencia del piloto, que la estimó por sensibilidad (run_sensibilidad_cronometraje.mjs, conservado como antecedente) porque no la había registrado, esta ampliación la mide directamente en la misma planilla. El script run_cronometraje_v2.mjs recalcula los dos tramos, el efecto de orden y el de aprendizaje desde el dato crudo, con el tiempo corregido y con el cronómetro.</w:t>
+        <w:t>La reducción sobre el tiempo total —adaptación incluida— es del 81,2 %, también significativa contra el umbral del 70 % (t(7) = 9,27; p &lt; 0,001), con la misma salvedad de cota superior que la del tramo comparable (§6.1.6). La diferencia con el 76,7 % del tramo comparable es la propia adaptación, de 1,8 minutos de media. La ampliación la mide directamente en la misma planilla; el piloto no la había registrado. Un script recalcula los dos tramos, el efecto de orden y el de aprendizaje desde el dato crudo, con el tiempo corregido y con el cronómetro.</w:t>
       </w:r>
     </w:p>
     <w:p>
@@ -36396,7 +36388,7 @@
         <w:jc w:val="both"/>
       </w:pPr>
       <w:r>
-        <w:t>El instrumento consta de doce ítems en escala Likert de cinco puntos, derivados del Modelo de Aceptación Tecnológica (Davis, 1989) y organizados en tres constructos: Utilidad Percibida (cinco ítems), Facilidad de Uso Percibida (cuatro ítems) e Intención de Uso (dos ítems), más un ítem de control de atención. El instrumento del piloto tenía diez ítems, los mismos tres constructos y ninguno invertido. Esta versión agrega un quinto ítem de Utilidad Percibida, invierte uno de cada constructo —PU4, PEOU2 y BI2— para medir la aquiescencia, y agrega el control de atención (§3.5.5; PROTOCOLO-ampliacion.md). Se administró a las ocho consultoras inmediatamente después de la sesión de cronometraje, con el sistema recién utilizado, condición necesaria para que el cuestionario mida aceptación y no expectativa. Los doce ítems se administraron con el siguiente enunciado: «Indicá tu grado de acuerdo con cada afirmación, del 1 al 5, donde 1 es "muy en desacuerdo" y 5 es "muy de acuerdo". Algunas afirmaciones están escritas al revés a propósito: leelas con atención». Utilidad percibida. PU1: «Usar Postly me permite crear y publicar contenido más rápido». PU2: «Usar Postly reduce el esfuerzo que dedico a gestionar mis redes». PU3: «Postly me ayuda a cumplir las normas de la marca sin revisar todo a mano». PU4 (invertido): «Termino haciendo por mi cuenta buena parte del trabajo que esperaba que Postly resolviera». PU5: «En general, Postly es útil para mi actividad como consultora». Facilidad de uso percibida: PEOU1, «Aprender a usar Postly me resultó fácil»; PEOU2 (invertido), «Tuve que pensar demasiado para entender qué me estaba pidiendo el bot»; PEOU3, «No necesito conocimientos técnicos para usar Postly»; PEOU4, «En general, Postly es fácil de usar». Intención de uso: BI1, «Tengo intención de seguir usando Postly para gestionar mis publicaciones»; BI2 (invertido), «Si tuviera que elegir hoy, volvería a publicar como lo hacía antes». Control de atención: AT1, «Para verificar que estás leyendo, marcá el número 2 en esta afirmación». El cuestionario incluyó un campo de comentario libre; cuatro participantes lo completaron, con observaciones de uso que no señalan alucinaciones ni errores de compliance. Tratan de rehacer toda la descripción para cambiar un punto, la vinculación con Facebook, el formato de los hashtags en imagen única, y una publicación duplicada que el Anexo E.2 documenta. Archivo de respuestas: TAM_respuestas_v2.csv, una fila por participante y una columna por ítem, con el código del ítem como encabezado.</w:t>
+        <w:t>El instrumento consta de doce ítems en escala Likert de cinco puntos, derivados del Modelo de Aceptación Tecnológica (Davis, 1989) y organizados en tres constructos: Utilidad Percibida (cinco ítems), Facilidad de Uso Percibida (cuatro ítems) e Intención de Uso (dos ítems), más un ítem de control de atención. El instrumento del piloto tenía diez ítems, los mismos tres constructos y ninguno invertido. Esta versión agrega un quinto ítem de Utilidad Percibida, invierte uno de cada constructo —PU4, PEOU2 y BI2— para medir la aquiescencia, y agrega el control de atención (§3.5.5; protocolo de la ampliación). Se administró a las ocho consultoras inmediatamente después de la sesión de cronometraje, con el sistema recién utilizado, condición necesaria para que el cuestionario mida aceptación y no expectativa. Los doce ítems se administraron con el siguiente enunciado: «Indicá tu grado de acuerdo con cada afirmación, del 1 al 5, donde 1 es "muy en desacuerdo" y 5 es "muy de acuerdo". Algunas afirmaciones están escritas al revés a propósito: leelas con atención». Utilidad percibida. PU1: «Usar Postly me permite crear y publicar contenido más rápido». PU2: «Usar Postly reduce el esfuerzo que dedico a gestionar mis redes». PU3: «Postly me ayuda a cumplir las normas de la marca sin revisar todo a mano». PU4 (invertido): «Termino haciendo por mi cuenta buena parte del trabajo que esperaba que Postly resolviera». PU5: «En general, Postly es útil para mi actividad como consultora». Facilidad de uso percibida: PEOU1, «Aprender a usar Postly me resultó fácil»; PEOU2 (invertido), «Tuve que pensar demasiado para entender qué me estaba pidiendo el bot»; PEOU3, «No necesito conocimientos técnicos para usar Postly»; PEOU4, «En general, Postly es fácil de usar». Intención de uso: BI1, «Tengo intención de seguir usando Postly para gestionar mis publicaciones»; BI2 (invertido), «Si tuviera que elegir hoy, volvería a publicar como lo hacía antes». Control de atención: AT1, «Para verificar que estás leyendo, marcá el número 2 en esta afirmación». El cuestionario incluyó un campo de comentario libre; cuatro participantes lo completaron, con observaciones de uso que no señalan alucinaciones ni errores de compliance. Tratan de rehacer toda la descripción para cambiar un punto, la vinculación con Facebook, el formato de los hashtags en imagen única, y una publicación duplicada que el Anexo E.2 documenta. El archivo de respuestas tiene una fila por participante y una columna por ítem, con el código del ítem como encabezado.</w:t>
       </w:r>
     </w:p>
     <w:p>
@@ -36407,8 +36399,7 @@
         <w:t xml:space="preserve">Las ocho respuestas se transcriben aquí, por la misma razón, en el orden PU1 a PU5, PEOU1 a PEOU4, BI1, BI2 y AT1, tal como se recolectaron y sin recodificar los invertidos. C1, 5, 4, 5, 2, 5, 5, 4, 4, 4, 4, 3 y 2. C2, 5, 4, 5, 1, 4, 5, 3, 5, 4, 2, 4 y 2. C3, 5, 5, 5, 1, 5, 5, 2, 5, 5, 5, 1 y 2. C4, 5, 3, 5, 2, 4, 3, 4, 3, 4, 4, 3 y 2. C5, 5, 5, 4, 1, 5, 5, 1, 5, 5, 5, 1 y 2. C6, 5, 4, 5, 2, 5, 5, 1, 5, 5, 5, 2 y 2. C7, 5, 3, 5, 1, </w:t>
       </w:r>
       <w:r>
-        <w:lastRenderedPageBreak/>
-        <w:t>5, 5, 1, 2, 5, 3, 3 y 2. C8, 5, 5, 5, 1, 5, 5, 1, 5, 5, 5, 1 y 2. run_tam_v2.mjs recodifica PU4, PEOU2 y BI2 antes de calcular las medias de la Tabla 8.</w:t>
+        <w:t>5, 5, 1, 2, 5, 3, 3 y 2. C8, 5, 5, 5, 1, 5, 5, 1, 5, 5, 5, 1 y 2. El script del cuestionario recodifica PU4, PEOU2 y BI2 antes de calcular las medias de la Tabla 8.</w:t>
       </w:r>
     </w:p>
     <w:p>
@@ -36428,7 +36419,7 @@
         <w:jc w:val="both"/>
       </w:pPr>
       <w:r>
-        <w:t>Los análisis se ejecutan con un conjunto de scripts que replican la lógica desplegada, sin reimplementarla. Este apartado describe los que producen las matrices del §6.1; el E.5, el E.6 y el E.7 documentan los suyos. El inventario completo, con el comando exacto que reproduce cada tabla, está en el archivo LEEME del material complementario, que es donde se mantiene. A todos ellos se suma verificar_csv.py, que no produce ninguna tabla: carga cada archivo de resultados con un lector de CSV estándar, exige que toda fila tenga los campos de su cabecera y recomputa contra su valor publicado cada cifra que el Capítulo 6 reporta. Detecta además un archivo mal formado —por ejemplo, una coma sin comillar dentro de un campo—, que haría que la matriz que un tercero obtiene de él no fuera la publicada sin que nada lo advirtiera. El script run_compliance_text.mjs reproduce las seis expresiones regulares del detector y admite el conmutador --v1 para regenerar las matrices previas a la corrección. El script run_compliance_field.mjs calcula la matriz de campo y el κ de Cohen. El script run_cronometraje.mjs calcula medias, reducción porcentual y la prueba t pareada. Y run_tam.mjs calcula las medias por constructo y el α de Cronbach. A ellos se suma run_compliance_hu10.mjs, que contrasta el conjunto de reglas del flujo inmediato contra el del flujo programado sobre los cuatro conjuntos de casos (E.1.4). Y dos más: run_compliance_vision.mjs, que ejecuta el canal visual sobre los conjuntos de imagen (E.6 y E.8), y run_representatividad.mjs, que clasifica los positivos de cada corpus en la taxonomía del §6.1.</w:t>
+        <w:t>Los análisis se ejecutan con un conjunto de scripts que replican la lógica desplegada, sin reimplementarla. La Tabla 17 (Anexo E.16) reúne todos los archivos que este trabajo cita: qué resultado produce cada script, de qué datos parte y en qué registro está. El comando exacto que reproduce cada tabla está en el archivo LEEME del material complementario. Uno de los scripts no produce ninguna tabla: carga cada archivo de resultados con un lector de CSV estándar, exige que toda fila tenga los campos de su cabecera y recomputa contra su valor publicado cada cifra que el Capítulo 6 reporta. Detecta además un archivo mal formado —por ejemplo, una coma sin comillar dentro de un campo—, que haría que la matriz que un tercero obtiene de él no fuera la publicada sin que nada lo advirtiera. El script del canal textual reproduce las seis expresiones regulares del detector y regenera también las matrices del detector anterior a la corrección.</w:t>
       </w:r>
     </w:p>
     <w:p>
@@ -36448,7 +36439,7 @@
         <w:jc w:val="both"/>
       </w:pPr>
       <w:r>
-        <w:t>Tres documentos que este anexo cita como declaración previa al dato —PROTOCOLO-ampliacion.md, PROTOCOLO-OE2.md y Protocolo_TrackA2_Muestras.md— son públicos en el repositorio del proyecto (https://github.com/NicolasHassanP/Postly), los dos primeros en avance/instrumentos/ y el tercero en avance/. Desde la versión 2.0.1 del registro abierto de Zenodo forman parte también de ese depósito, tal como estaban en los commits que se citan a continuación. Su anterioridad frente al dato no descansa en la fecha que escriben los autores, sino en la hora a la que GitHub recibió cada commit, que registra su propio servidor. Los dos protocolos de la ampliación entraron en el commit 927ef0d, recibido el 24 de septiembre de 2026 a las 18:58 UTC, dos días antes de la primera sesión; el de Track A2, en el commit 1ba76eb, recibido el 14 de septiembre a las 14:38 UTC. Ese registro de eventos GitHub lo conserva noventa días; el hash del commit, en cambio, es permanente y fija el contenido exacto de cada protocolo, y el depósito de Zenodo lo conserva sin fecha de vencimiento. Lo que este trabajo toma de ellos como declarado de antemano está transcrito además en el propio documento: el umbral, el contraste, la unidad de análisis y el tramo comparable en el §3.5.4, y la partición del cronómetro en el §6.1.6 y el Anexo E.2.</w:t>
+        <w:t>Tres documentos que este anexo cita como declaración previa al dato —los protocolos de la ampliación, del Objetivo Específico 2 y de la muestra de campo (Tabla 17)— son públicos en el repositorio del proyecto (https://github.com/NicolasHassanP/Postly). Desde la versión 2.0.1 del registro abierto de Zenodo forman parte también de ese depósito, tal como estaban en los commits que se citan a continuación. Su anterioridad frente al dato no descansa en la fecha que escriben los autores, sino en la hora a la que GitHub recibió cada commit, que registra su propio servidor. Los dos protocolos de la ampliación entraron en el commit 927ef0d, recibido el 24 de septiembre de 2026 a las 18:58 UTC, dos días antes de la primera sesión; el de Track A2, en el commit 1ba76eb, recibido el 14 de septiembre a las 14:38 UTC. Ese registro de eventos GitHub lo conserva noventa días; el hash del commit, en cambio, es permanente y fija el contenido exacto de cada protocolo, y el depósito de Zenodo lo conserva sin fecha de vencimiento. Lo que este trabajo toma de ellos como declarado de antemano está transcrito además en el propio documento: el umbral, el contraste, la unidad de análisis y el tramo comparable en el §3.5.4, y la partición del cronómetro en el §6.1.6 y el Anexo E.2.</w:t>
       </w:r>
     </w:p>
     <w:p>
@@ -36456,7 +36447,7 @@
         <w:jc w:val="both"/>
       </w:pPr>
       <w:r>
-        <w:t>Ese segundo registro no es abierto, y las razones y el costo son los que siguen. El material gráfico de base es arte comercial oficial de la marca, y las placas de precio de los casos infractores las compusieron los autores sobre él: las Pautas prohíben modificar ese material «en modo alguno» (Anexo D, p. 8), de modo que los autores no están en condiciones de otorgar una licencia de redistribución. Los veintinueve textos del corpus los redactaron participantes identificables, con un consentimiento verbal circunscripto a esta evaluación (Anexo E.2). El costo no es el mismo para todas las tablas. Con el registro abierto solo, un lector recomputa desde el dato crudo todas las matrices del Capítulo 6 salvo la Tabla 5, cuyo dato es el corpus de campo. Los conjuntos de imagen de los Anexos E.6 y E.8 sí los recomputa, porque sus archivos de resultados viajan al registro abierto con el veredicto y la justificación de cada caso. Lo que ese nivel no permite es volver a ejecutar el canal visual, que exige las imágenes. El script verificar_csv.py recorre esa frontera sin ambigüedad: corrido sobre el registro abierto declara omitida la Tabla 5 y recomputa el resto. La fuente normativa no se deposita en ninguno de los dos registros, por tratarse de material corporativo de un tercero; el Anexo D transcribe con su página las dos reglas sobre las que se construye el módulo.</w:t>
+        <w:t>Ese segundo registro no es abierto, y las razones y el costo son los que siguen. El material gráfico de base es arte comercial oficial de la marca, y las placas de precio de los casos infractores las compusieron los autores sobre él: las Pautas prohíben modificar ese material «en modo alguno» (Anexo D, p. 8), de modo que los autores no están en condiciones de otorgar una licencia de redistribución. Los veintinueve textos del corpus los redactaron participantes identificables, con un consentimiento verbal circunscripto a esta evaluación (Anexo E.2). El costo no es el mismo para todas las tablas. Con el registro abierto solo, un lector recomputa desde el dato crudo todas las matrices del Capítulo 6 salvo la Tabla 5, cuyo dato es el corpus de campo. Los conjuntos de imagen de los Anexos E.6 y E.8 sí los recomputa, porque sus archivos de resultados viajan al registro abierto con el veredicto y la justificación de cada caso. Lo que ese nivel no permite es volver a ejecutar el canal visual, que exige las imágenes. La verificación de los CSV recorre esa frontera sin ambigüedad: corrido sobre el registro abierto declara omitida la Tabla 5 y recomputa el resto. La fuente normativa no se deposita en ninguno de los dos registros, por tratarse de material corporativo de un tercero; el Anexo D transcribe con su página las dos reglas sobre las que se construye el módulo.</w:t>
       </w:r>
     </w:p>
     <w:p>
@@ -36464,11 +36455,10 @@
         <w:jc w:val="both"/>
       </w:pPr>
       <w:r>
-        <w:t xml:space="preserve">La corrección del detector descrita en el §6.1 se aplica con el script fix-compliance-patterns.mjs, que unifica el conjunto de reglas en los cuatro nodos que ejecutan compliance de precios y deja registro de la versión anterior. Cada ejecución de run_compliance_text.mjs escribe un archivo de resultados con el </w:t>
-      </w:r>
-      <w:r>
-        <w:lastRenderedPageBreak/>
-        <w:t>sufijo _resultados —o _resultados_v1 con el conmutador --v1—. Ese archivo contiene, para cada caso, la clase real, el veredicto del detector y la expresión regular que produjo el bloqueo, de modo que todas las matrices de confusión del §6.1 son reconstruibles sin volver a ejecutar nada. Los scripts y los conjuntos de datos se depositan con identificador persistente, en los dos registros que este mismo apartado describe.</w:t>
+        <w:t>La corrección del detector descrita en el §6.1 se aplica con un script que unifica el conjunto de reglas en los cuatro nodos que ejecutan compliance de precios y deja registro de la versión anterior. Cada ejecución del script del canal textual escribe un archivo de resultados, uno por detector.</w:t>
+      </w:r>
+      <w:r>
+        <w:t xml:space="preserve"> Ese archivo contiene, para cada caso, la clase real, el veredicto del detector y la expresión regular que produjo el bloqueo, de modo que todas las matrices de confusión del §6.1 son reconstruibles sin volver a ejecutar nada. Los scripts y los conjuntos de datos se depositan con identificador persistente, en los dos registros que este mismo apartado describe.</w:t>
       </w:r>
     </w:p>
     <w:p>
@@ -36476,7 +36466,7 @@
         <w:jc w:val="both"/>
       </w:pPr>
       <w:r>
-        <w:t>Esos scripts declaran replicar la lógica desplegada, y esa declaración es a su vez comprobable. El script verificar_patrones_desplegados.mjs lee el workflow exportado y extrae de él, sin intervención manual, las expresiones regulares de los cuatro nodos que ejecutan compliance de precios y el prompt del nodo de detección visual. Escribe ese extracto en Nodos_compliance_desplegados.json y compara su contenido, carácter por carácter, contra lo que declaran los dos scripts de evidencia. El extracto incluye el código completo de cada uno de esos nodos junto a su SHA-256, de modo que el hash es comprobable contra el texto que el propio extracto publica. Incluye también el prompt entero de los cuatro nodos de detección visual. La corrida deja constancia de cuatro cosas. Que los cuatro nodos llevan el mismo conjunto de seis expresiones tras la corrección de la divergencia de HU10 (E.1.4). Que las seis del script de texto son exactamente las del nodo desplegado. Que el prompt de visión coincide en sus 967 caracteres. Y que los prompts de los cuatro flujos visuales contienen, carácter por carácter, el mismo criterio de 569 caracteres. El extracto no contiene identificadores de la instancia —ni webhook, ni credenciales, ni URL—, de modo que acompaña al material complementario sin exponer el despliegue.</w:t>
+        <w:t>Esos scripts declaran replicar la lógica desplegada, y esa declaración es a su vez comprobable. Un script de verificación lee el workflow exportado y extrae de él, sin intervención manual, las expresiones regulares de los cuatro nodos que ejecutan compliance de precios y el prompt del nodo de detección visual. Escribe ese extracto y compara su contenido, carácter por carácter, contra lo que declaran los dos scripts de evidencia. El extracto incluye el código completo de cada uno de esos nodos junto a su SHA-256, de modo que el hash es comprobable contra el texto que el propio extracto publica. Incluye también el prompt entero de los cuatro nodos de detección visual. La corrida deja constancia de cuatro cosas. Que los cuatro nodos llevan el mismo conjunto de seis expresiones tras la corrección de la divergencia de HU10 (E.1.4). Que las seis del script de texto son exactamente las del nodo desplegado. Que el prompt de visión coincide en sus 967 caracteres. Y que los prompts de los cuatro flujos visuales contienen, carácter por carácter, el mismo criterio de 569 caracteres. El extracto no contiene identificadores de la instancia —ni webhook, ni credenciales, ni URL—, de modo que acompaña al material complementario sin exponer el despliegue.</w:t>
       </w:r>
     </w:p>
     <w:p>
@@ -36484,7 +36474,7 @@
         <w:jc w:val="both"/>
       </w:pPr>
       <w:r>
-        <w:t>Esa comprobación no cierra la cadena entera. Lo que el script establece es la identidad literal entre los detectores de estos scripts y los del extracto, y que los cuatro nodos llevan el mismo conjunto. La comprobación alcanza también al detector anterior a la corrección, que es el que produjo las Tablas 3, 4 y 5, y al conjunto divergente del flujo programado. El workflow previo está versionado —es el del commit inmediatamente anterior a la unificación—, de modo que el conmutador --extraer-v1 produce de él un segundo extracto, Nodos_compliance_desplegados_v1.json, contra el que se verifican carácter por carácter los dos conjuntos. La verificación de ese estado anterior expuso una diferencia literal en el conjunto de HU10, inerte en su comportamiento pero real en su escritura, que se corrigió para que la transcripción sea exacta. Comprueba además, sobre el mismo extracto, que los cuatro flujos que reciben una imagen llevan el mismo criterio de detección visual, lo que sostiene la corrección descrita en el §6.1. Y comprueba los dos umbrales de configuración con el alcance que el §6.1 declara para cada uno: el de la firma de HU9 y el del corte de HU13. Esas dos comprobaciones son las que sostienen las dos filas de «Configuración» que la Tabla 13 agrega para las reglas del módulo.</w:t>
+        <w:t>Esa comprobación no cierra la cadena entera. Lo que el script establece es la identidad literal entre los detectores de estos scripts y los del extracto, y que los cuatro nodos llevan el mismo conjunto. La comprobación alcanza también al detector anterior a la corrección, que es el que produjo las Tablas 3, 4 y 5, y al conjunto divergente del flujo programado. El workflow previo está versionado —es el del commit inmediatamente anterior a la unificación—, de modo que el mismo script produce de él un segundo extracto, contra el que se verifican carácter por carácter los dos conjuntos. El conjunto de HU10 de ese estado coincide también, carácter por carácter, con su transcripción. Comprueba además, sobre el mismo extracto, que los cuatro flujos que reciben una imagen llevan el mismo criterio de detección visual, lo que sostiene la corrección descrita en el §6.1. Y comprueba los dos umbrales de configuración con el alcance que el §6.1 declara para cada uno: el de la firma de HU9 y el del corte de HU13. Esas dos comprobaciones son las que sostienen las dos filas de «Configuración» que la Tabla 13 agrega para las reglas del módulo.</w:t>
       </w:r>
     </w:p>
     <w:p>
@@ -36492,11 +36482,10 @@
         <w:jc w:val="both"/>
       </w:pPr>
       <w:r>
-        <w:t xml:space="preserve">Lo que no establece es que el extracto provenga del workflow en marcha: se genera con el conmutador --extraer desde un workflow exportado. Ese workflow </w:t>
-      </w:r>
-      <w:r>
-        <w:lastRenderedPageBreak/>
-        <w:t>no acompaña al material complementario, pero sí está en el repositorio público del proyecto (workflows/Postly - Entrega Final Sprint 1 v2.json), de modo que un lector puede reproducir la comparación y regenerar el extracto desde allí. La cadena se acorta sin cerrarse: falta la prueba de que el archivo exportado es el que corría. Lo que antes era una afirmación sobre seis expresiones regulares y un prompt transcritos a mano es ahora una afirmación sobre un archivo extraído sin intervención manual, contrastable contra los scripts que produjeron cada cifra de este capítulo. Cerrarla del todo exigiría acceso a una instancia en marcha, que es la misma condición que limita a las baterías de la Tabla 11 y a los umbrales de la Tabla 13.</w:t>
+        <w:t xml:space="preserve">Lo que no establece es que el extracto provenga del workflow en marcha: se genera desde un workflow exportado. Ese workflow </w:t>
+      </w:r>
+      <w:r>
+        <w:t>no acompaña al material complementario, pero sí está en el repositorio público del proyecto (Tabla 17), de modo que un lector puede reproducir la comparación y regenerar el extracto desde allí. La cadena se acorta sin cerrarse: falta la prueba de que el archivo exportado es el que corría. La afirmación no descansa en una transcripción manual, sino en un archivo extraído sin intervención, contrastable contra los scripts que produjeron cada cifra de este capítulo. Cerrarla del todo exigiría acceso a una instancia en marcha, que es la misma condición que limita a las baterías de la Tabla 11 y a los umbrales de la Tabla 13.</w:t>
       </w:r>
     </w:p>
     <w:p>
@@ -36516,7 +36505,7 @@
         <w:jc w:val="both"/>
       </w:pPr>
       <w:r>
-        <w:t>Las cuatro baterías se ejecutan con run_baterias.mjs, sobre la instancia de n8n en marcha. La de integración multimodal es la que el §3.4.2 declara. Reproduce contra el webhook del entorno E2 un update de Telegram con foto, tomado de una ejecución real, de modo que cada repetición baja la misma imagen de 1280 × 1280 píxeles y la diferencia medida sea la del sistema. Mide la duración completa de la ejecución en la API del motor: desde que entra la foto hasta que salen los tres copys. Cuenta además cuántas ejecuciones devolvieron los tres copys, que es la consistencia de la extracción de JSON que el §3.4.2 promete. El recorrido pasa por Cloudinary y por dos llamadas a Gemini 2.5 Flash, la detección visual del Centinela y la generación de copys, y termina mostrando las tres opciones sin publicar nada. Sobre 9 repeticiones la latencia media fue de 59,7 segundos (DE 40,6; mínimo 30,4; máximo 143,1) y las 9 ejecuciones devolvieron los tres copys. La décima repetición no llegó a completarse: se agotó el cupo diario del nivel gratuito del modelo, que admite veinte peticiones (la cifra la informa el propio mensaje de error de la API, con la cuota GenerateRequestsPerDayPerProjectPerModel-FreeTier). Cada repetición consume dos, de modo que estas nueve gastaron dieciocho; el cupo es de la jornada entera y lo comparten el desarrollo y los reintentos del día, que es lo que lo llevó al tope antes de la décima. El desglose por nodo de cada repetición queda en B1b_desglose.csv, que lo extrae del historial de ejecuciones sin disparar ninguna nueva.</w:t>
+        <w:t>Las cuatro baterías las ejecuta un mismo script sobre la instancia de n8n en marcha. La de integración multimodal es la que el §3.4.2 declara. Reproduce contra el webhook del entorno E2 un update de Telegram con foto, tomado de una ejecución real, de modo que cada repetición baja la misma imagen de 1280 × 1280 píxeles y la diferencia medida sea la del sistema. Mide la duración completa de la ejecución en la API del motor: desde que entra la foto hasta que salen los tres copys. Cuenta además cuántas ejecuciones devolvieron los tres copys, que es la consistencia de la extracción de JSON que el §3.4.2 promete. El recorrido pasa por Cloudinary y por dos llamadas a Gemini 2.5 Flash, la detección visual del Centinela y la generación de copys, y termina mostrando las tres opciones sin publicar nada. Sobre 9 repeticiones la latencia media fue de 59,7 segundos (DE 40,6; mínimo 30,4; máximo 143,1) y las 9 ejecuciones devolvieron los tres copys. La décima repetición no llegó a completarse: se agotó el cupo diario del nivel gratuito del modelo, que admite veinte peticiones (la cifra la informa el propio mensaje de error de la API, con la cuota GenerateRequestsPerDayPerProjectPerModel-FreeTier). Cada repetición consume dos, de modo que estas nueve gastaron dieciocho; el cupo es de la jornada entera y lo comparten el desarrollo y los reintentos del día, que es lo que lo llevó al tope antes de la décima. El desglose por nodo de cada repetición queda en un archivo propio, que lo extrae del historial de ejecuciones sin disparar ninguna nueva.</w:t>
       </w:r>
     </w:p>
     <w:p>
@@ -36527,8 +36516,7 @@
         <w:t xml:space="preserve">La batería de interfaz envía diez veces el comando de inicio al webhook del disparador de Telegram del entorno E2 y toma dos tiempos. Uno es el acuse de recepción, medido en el cliente. El otro, la duración completa de la ejecución, leída de la API de ejecuciones del propio motor: el tiempo que transcurre hasta que el bot responde. La batería multimedia genera un clip de prueba de 1920×1080 píxeles y 45 segundos, le aplica el mismo comando de FFmpeg que ejecuta el nodo «Video: procesar» y muestrea la memoria residente del proceso cada 30 milisegundos hasta que termina. La batería de OAuth repite diez veces la misma consulta de validación que ejecuta el nodo «HU3: Validar token» y, una vez, el intercambio por un token de larga duración del nodo «Token largo»; no </w:t>
       </w:r>
       <w:r>
-        <w:lastRenderedPageBreak/>
-        <w:t>persiste el token obtenido. Archivo de resultados: Baterias_resultados.csv. Los umbrales de las Historias de Usuario que estas baterías no cubren se verifican por separado en el Anexo E.7.</w:t>
+        <w:t>persiste el token obtenido. Los umbrales de las Historias de Usuario que estas baterías no cubren se verifican por separado en el Anexo E.7.</w:t>
       </w:r>
     </w:p>
     <w:p>
@@ -37391,7 +37379,7 @@
         <w:rPr>
           <w:i/>
         </w:rPr>
-        <w:t xml:space="preserve">Nota. Elaboración propia. Mediciones tomadas sobre el entorno E2 (Anexo B.1) con el script run_baterias.mjs (Anexo E.5), sin carga concurrente. Las latencias incluyen el túnel y la máquina local de E2, y no caracterizan un despliegue (§3.5.5). DE: desvío estándar. La de interfaz conversacional se incorporó </w:t>
+        <w:t xml:space="preserve">Nota. Elaboración propia. Mediciones tomadas sobre el entorno E2 (Anexo B.1) con el script de las baterías, sin carga concurrente. Las latencias incluyen el túnel y la máquina local de E2, y no caracterizan un despliegue (§3.5.5). DE: desvío estándar. La de interfaz conversacional se incorporó </w:t>
       </w:r>
       <w:r>
         <w:rPr>
@@ -37418,7 +37406,7 @@
         <w:jc w:val="both"/>
       </w:pPr>
       <w:r>
-        <w:t>El canal de imagen del Centinela delega la detección en el modelo multimodal. El nodo «HU8: Detección visual» le envía la imagen con un prompt que enumera lo que debe considerar infractor y le exige una respuesta en JSON de dos campos. Los conjuntos controlados del E.1.1 incluyen sólo cuatro casos de imagen, reutilizados en las dos configuraciones, de modo que se construyó para este canal un conjunto propio de 20, balanceado en 10 infractores y 10 limpios. Cada infractor prueba una forma distinta de incrustar un precio en los píxeles y cada caso limpio, una cifra que puede confundirse con uno. El manifiesto Casos_Compliance_Imagen.csv registra, para cada caso, la clase real y la forma que prueba.</w:t>
+        <w:t>El canal de imagen del Centinela delega la detección en el modelo multimodal. El nodo «HU8: Detección visual» le envía la imagen con un prompt que enumera lo que debe considerar infractor y le exige una respuesta en JSON de dos campos. Los conjuntos controlados del E.1.1 incluyen sólo cuatro casos de imagen, reutilizados en las dos configuraciones, de modo que se construyó para este canal un conjunto propio de 20, balanceado en 10 infractores y 10 limpios. Cada infractor prueba una forma distinta de incrustar un precio en los píxeles y cada caso limpio, una cifra que puede confundirse con uno. El manifiesto del conjunto registra, para cada caso, la clase real y la forma que prueba.</w:t>
       </w:r>
     </w:p>
     <w:p>
@@ -37426,7 +37414,7 @@
         <w:jc w:val="both"/>
       </w:pPr>
       <w:r>
-        <w:t>Las imágenes se obtuvieron así. El material de base lo aportaron las tres consultoras para el estudio de campo, y es esto. En su mayoría no son fotografías tomadas por ellas, sino material gráfico oficial de la marca —arte de catálogo, bodegones de producto y placas de campaña— que la consultora recibe por el canal interno y reenvía. Ninguna de las piezas de esa primera recolección traía un precio incrustado, porque la normativa que el módulo audita lo prohíbe justamente en el canal público: las infracciones que ellas aportaron estaban todas en el texto. Las placas, etiquetas, marcas de agua y textos promocionales de los diez casos infractores los compusieron los autores sobre ese material, con el script armar_casos_imagen.py. El conjunto mide, por lo tanto, la capacidad del modelo de leer un precio incrustado sobre arte comercial de marca. No mide la frecuencia con que ese precio aparece en la actividad real de una consultora, ni su desempeño sobre fotografía casera, que es un régimen visual distinto y queda fuera de esta medición.</w:t>
+        <w:t>Las imágenes se obtuvieron así. El material de base lo aportaron las tres consultoras para el estudio de campo, y es esto. En su mayoría no son fotografías tomadas por ellas, sino material gráfico oficial de la marca —arte de catálogo, bodegones de producto y placas de campaña— que la consultora recibe por el canal interno y reenvía. Ninguna de las piezas de esa primera recolección traía un precio incrustado, porque la normativa que el módulo audita lo prohíbe justamente en el canal público: las infracciones que ellas aportaron estaban todas en el texto. Las placas, etiquetas, marcas de agua y textos promocionales de los diez casos infractores los compusieron los autores sobre ese material, con un script. El conjunto mide, por lo tanto, la capacidad del modelo de leer un precio incrustado sobre arte comercial de marca. No mide la frecuencia con que ese precio aparece en la actividad real de una consultora, ni su desempeño sobre fotografía casera, que es un régimen visual distinto y queda fuera de esta medición.</w:t>
       </w:r>
     </w:p>
     <w:p>
@@ -37470,11 +37458,10 @@
         <w:jc w:val="both"/>
       </w:pPr>
       <w:r>
-        <w:t xml:space="preserve">El script run_compliance_vision.mjs ejecuta el conjunto. Transcribe verbatim el prompt del nodo desplegado, llama al mismo modelo —gemini-2.5-flash— y aplica el mismo parseo tolerante del nodo «HU8: Parsear detección», que no bloquea si la respuesta no es un JSON válido. La única diferencia con el flujo desplegado es el transporte de la imagen: el nodo la pasa por URL de Cloudinary y el script la envía en base64. El nivel gratuito de la API admite veinte peticiones </w:t>
-      </w:r>
-      <w:r>
-        <w:lastRenderedPageBreak/>
-        <w:t>por día, y los reintentos cuentan contra ese tope, de modo que el script guarda cada caso apenas lo resuelve y reanuda desde ahí. Que el prompt y el modelo sean efectivamente los del nodo lo comprueba verificar_patrones_desplegados.mjs (E.4). Archivo de resultados, con el veredicto del modelo y la justificación que devolvió para cada caso: Casos_Compliance_Imagen_resultados.csv.</w:t>
+        <w:t xml:space="preserve">Un script ejecuta el conjunto. Transcribe verbatim el prompt del nodo desplegado, llama al mismo modelo —gemini-2.5-flash— y aplica el mismo parseo tolerante del nodo «HU8: Parsear detección», que no bloquea si la respuesta no es un JSON válido. La única diferencia con el flujo desplegado es el transporte de la imagen: el nodo la pasa por URL de Cloudinary y el script la envía en base64. El nivel gratuito de la API admite veinte peticiones </w:t>
+      </w:r>
+      <w:r>
+        <w:t>por día, y los reintentos cuentan contra ese tope, de modo que el script guarda cada caso apenas lo resuelve y reanuda desde ahí. Que el prompt y el modelo sean efectivamente los del nodo lo comprueba la verificación del E.4. El archivo de resultados guarda el veredicto del modelo y la justificación que devolvió para cada caso.</w:t>
       </w:r>
     </w:p>
     <w:p>
@@ -37716,7 +37703,7 @@
         <w:rPr>
           <w:i/>
         </w:rPr>
-        <w:t>Las Historias de Usuario fijan once umbrales numéricos, y la Tabla 13 tiene una fila por cada uno. Nueve los recorre el script run_umbrales.mjs. Para dos de ellos el valor no sale del historial de ejecuciones sino de las baterías del E.5: el intercambio de token de HU2, que mide la batería de OAuth, y el de HU12, que es indirecto y sale del desglose de la batería de integración multimodal. Los otros dos —la firma de HU9, que fija el 100 % de las ejecuciones, y el corte de 60 s de HU13 (§4.1.5)— se verifican de otro modo: leyendo del workflow el parámetro que impone el límite en lugar de medir una serie de ejecuciones. El script no dispara ejecuciones nuevas: lee la configuración del workflow desplegado y el historial de ejecuciones que el propio motor conserva. Salvo las filas de HU2 y HU12, que salen de las baterías del Anexo E.5, las cifras provienen del historial del sistema y no de un banco de pruebas armado para la ocasión.</w:t>
+        <w:t>Las Historias de Usuario fijan once umbrales numéricos, y la Tabla 13 tiene una fila por cada uno. Nueve los recorre un script. Para dos de ellos el valor no sale del historial de ejecuciones sino de las baterías del E.5: el intercambio de token de HU2, que mide la batería de OAuth, y el de HU12, que es indirecto y sale del desglose de la batería de integración multimodal. Los otros dos —la firma de HU9, que fija el 100 % de las ejecuciones, y el corte de 60 s de HU13 (§4.1.5)— se verifican de otro modo: leyendo del workflow el parámetro que impone el límite en lugar de medir una serie de ejecuciones. El script no dispara ejecuciones nuevas: lee la configuración del workflow desplegado y el historial de ejecuciones que el propio motor conserva. Salvo las filas de HU2 y HU12, que salen de las baterías del Anexo E.5, las cifras provienen del historial del sistema y no de un banco de pruebas armado para la ocasión.</w:t>
       </w:r>
     </w:p>
     <w:p>
@@ -37732,7 +37719,7 @@
         <w:rPr>
           <w:i/>
         </w:rPr>
-        <w:t>El script distingue tres grados de verificación y no los confunde. «Medición» significa que hay una serie de tiempos tomada sobre la instancia en marcha, con su n. «Configuración» significa que el umbral es estructural y está escrito en el workflow: un corte en el código de un nodo, la regla de un disparador programado. En ese caso se lo lee de ahí y se cita el nodo, de modo que es una comprobación del parámetro y no una medición de latencia. «Medición indirecta» significa que la serie no se tomó sobre el recorrido de esa Historia sino sobre otro que ejecuta la misma llamada, y la tabla dice cuál. «No verificado» se declara como tal, sin reformular el umbral para que encaje con lo que sí se midió. Archivo de resultados: Umbrales_HU_resultados.csv.</w:t>
+        <w:t>El script distingue tres grados de verificación y no los confunde. «Medición» significa que hay una serie de tiempos tomada sobre la instancia en marcha, con su n. «Configuración» significa que el umbral es estructural y está escrito en el workflow: un corte en el código de un nodo, la regla de un disparador programado. En ese caso se lo lee de ahí y se cita el nodo, de modo que es una comprobación del parámetro y no una medición de latencia. «Medición indirecta» significa que la serie no se tomó sobre el recorrido de esa Historia sino sobre otro que ejecuta la misma llamada, y la tabla dice cuál. «No verificado» se declara como tal, sin reformular el umbral para que encaje con lo que sí se midió.</w:t>
       </w:r>
     </w:p>
     <w:p>
@@ -38911,7 +38898,7 @@
         <w:rPr>
           <w:i/>
         </w:rPr>
-        <w:t>Nota. Elaboración propia. Verificación producida por el script run_umbrales.mjs sobre el entorno E2 (Anexo B.1), sin disparar ejecuciones nuevas. «Medición» = serie de tiempos del historial de ejecuciones; «Configuración» = parámetro leído del workflow; «No verificado» = sin evidencia, con el umbral declarado tal cual.</w:t>
+        <w:t>Nota. Elaboración propia. Verificación producida por el script de los umbrales sobre el entorno E2 (Anexo B.1), sin disparar ejecuciones nuevas. «Medición» = serie de tiempos del historial de ejecuciones; «Configuración» = parámetro leído del workflow; «No verificado» = sin evidencia, con el umbral declarado tal cual.</w:t>
       </w:r>
     </w:p>
     <w:p>
@@ -39176,7 +39163,7 @@
         <w:jc w:val="both"/>
       </w:pPr>
       <w:r>
-        <w:t>Nota. Elaboración propia. VP: verdadero positivo; FN: falso negativo; FP: falso positivo; VN: verdadero negativo. Recall = 0,83; precisión = 0,83; especificidad = 0,67; F1 = 0,83. Ocho de los nueve casos son composiciones de los autores sobre material gráfico oficial de la marca; R01 es una pieza auténtica no compuesta, incorporada por su autenticidad y no por su dificultad de lectura. Resultados de run_compliance_vision.mjs sobre casos_imagen/ y casos_imagen_corrida2/. El archivo de resultados no conserva la respuesta cruda del modelo, de modo que un negativo no es distinguible de una respuesta que el parseo fail-open no pudo leer (Anexo E.6).</w:t>
+        <w:t>Nota. Elaboración propia. VP: verdadero positivo; FN: falso negativo; FP: falso positivo; VN: verdadero negativo. Recall = 0,83; precisión = 0,83; especificidad = 0,67; F1 = 0,83. Ocho de los nueve casos son composiciones de los autores sobre material gráfico oficial de la marca; R01 es una pieza auténtica no compuesta, incorporada por su autenticidad y no por su dificultad de lectura. Resultados de las dos corridas del script del canal visual (Tabla 17). El archivo de resultados no conserva la respuesta cruda del modelo, de modo que un negativo no es distinguible de una respuesta que el parseo fail-open no pudo leer (Anexo E.6).</w:t>
       </w:r>
     </w:p>
     <w:p>
@@ -39278,7 +39265,7 @@
         <w:rPr>
           <w:i/>
         </w:rPr>
-        <w:t>La imagen con precio no se compuso para esta prueba: es la misma pieza que el caso R01 del Anexo E.8, arte oficial de la marca con el precio ya impreso. A R01 lo evaluó el script run_compliance_vision.mjs contra la API, y no el flujo de imagen única del bot, de modo que el par no compara dos flujos entre sí. Lo que el caso establece es que la detección visual corre en el flujo de carrusel y bloquea la publicación entera. Es un solo caso y no habilita ninguna métrica.</w:t>
+        <w:t>La imagen con precio no se compuso para esta prueba: es la misma pieza que el caso R01 del Anexo E.8, arte oficial de la marca con el precio ya impreso. A R01 lo evaluó el script del canal visual contra la API, y no el flujo de imagen única del bot, de modo que el par no compara dos flujos entre sí. Lo que el caso establece es que la detección visual corre en el flujo de carrusel y bloquea la publicación entera. Es un solo caso y no habilita ninguna métrica.</w:t>
       </w:r>
     </w:p>
     <w:p>
@@ -39380,7 +39367,7 @@
         <w:rPr>
           <w:i/>
         </w:rPr>
-        <w:t>Esta medición tiene dos límites. Cubre el flujo de imagen única y no los otros tres, si bien los cuatro prompts llevan la misma regla, idéntica carácter por carácter, y el archivo Prompts_generacion.json lo comprueba con el SHA-256 de cada uno en sus dos estados. El Estudio 4 extiende el resultado al carrusel y al sistema en uso. Ninguno de los 32 copys de Postly de las sesiones del 26 y 27 de septiembre lleva una solicitud de contacto o de compra (0/32; Wilson [0,000; 0,107]), frente a 12 de los 32 copys manuales (run_cta_estudios_oe2.mjs; CTA_estudios_OE2_resultados.csv). Ninguna de las dos cifras alcanza la línea de contacto que el nodo de firma concatena después del copy (§4.3.2). Y no evalúa la calidad del copy: retirar el cierre de contacto puede empeorarlo como pieza de marketing, y esta medición en particular no lo contrasta. El Anexo E.14 sí mide calidad de copy, pero sobre el prompt vigente en su conjunto, no sobre el efecto de este cambio puntual. Script: run_cta_generacion.mjs. Archivo de resultados, con el texto completo de cada opción y los patrones que dispararon en cada una: CTA_generacion_resultados.csv.</w:t>
+        <w:t>Esta medición tiene dos límites. Cubre el flujo de imagen única y no los otros tres, si bien los cuatro prompts llevan la misma regla, idéntica carácter por carácter, y el archivo de prompts del material complementario lo comprueba con el SHA-256 de cada uno en sus dos estados. El Estudio 4 extiende el resultado al carrusel y al sistema en uso. Ninguno de los 32 copys de Postly de las sesiones del 26 y 27 de septiembre lleva una solicitud de contacto o de compra (0/32; Wilson [0,000; 0,107]), frente a 12 de los 32 copys manuales (Tabla 17). Ninguna de las dos cifras alcanza la línea de contacto que el nodo de firma concatena después del copy (§4.3.2). Y no evalúa la calidad del copy: retirar el cierre de contacto puede empeorarlo como pieza de marketing, y esta medición en particular no lo contrasta. El Anexo E.14 sí mide calidad de copy, pero sobre el prompt vigente en su conjunto, no sobre el efecto de este cambio puntual. El archivo de resultados guarda el texto completo de cada opción y los patrones que dispararon en cada una.</w:t>
       </w:r>
     </w:p>
     <w:p>
@@ -39977,7 +39964,7 @@
     </w:p>
     <w:p>
       <w:r>
-        <w:t>El Objetivo Específico 2 se cumple en la integración (§8.1), pero la calidad de lo que el sistema genera requiere una evaluación propia, y sobre las alucinaciones no había evidencia previa. Este apartado corre los cuatro estudios que PROTOCOLO-OE2.md define para esa evaluación. Miden calidad del copy frente a un generador genérico (HU4, Estudio 1), correspondencia con el tono pedido (HU6, Estudio 2), ordenamiento del carrusel frente al envío original (HU5, Estudio 3) y comparación a ciegas contra el trabajo manual real de las ocho participantes de la ampliación (Estudio 4). Los Estudios 1 y 4 los juzgó el evaluador externo del corpus de campo; los Estudios 2 y 3, un segundo evaluador, también externo al equipo y a las participantes: un compañero de carrera de los autores que cursa su propio trabajo final de manera independiente de este.</w:t>
+        <w:t>El Objetivo Específico 2 se cumple en la integración (§8.1), pero la calidad de lo que el sistema genera requiere una evaluación propia, y sobre las alucinaciones no había evidencia previa. Este apartado corre los cuatro estudios que el protocolo del Objetivo Específico 2 define para esa evaluación. Miden calidad del copy frente a un generador genérico (HU4, Estudio 1), correspondencia con el tono pedido (HU6, Estudio 2), ordenamiento del carrusel frente al envío original (HU5, Estudio 3) y comparación a ciegas contra el trabajo manual real de las ocho participantes de la ampliación (Estudio 4). Los Estudios 1 y 4 los juzgó el evaluador externo del corpus de campo; los Estudios 2 y 3, un segundo evaluador, también externo al equipo y a las participantes: un compañero de carrera de los autores que cursa su propio trabajo final de manera independiente de este.</w:t>
       </w:r>
     </w:p>
     <w:p>
@@ -39990,17 +39977,17 @@
     </w:p>
     <w:p>
       <w:r>
-        <w:t>El material son ocho productos del catálogo oficial de la marca, cuatro de imagen única y cuatro de carrusel de dos imágenes (Imagenes_manifiesto.csv). Para cada uno se generó, con el mismo modelo y la misma temperatura, un copy con el prompt desplegado de Postly y otro con un prompt genérico: «Escribí un pie de foto para esta imagen/este carrusel de producto para Instagram». El pareo, la rotación de tono y la letra A/B de cada producto se fijaron de antemano, antes de generar ningún resultado (run_copy_pareado.mjs; OE2_copys_material.csv).</w:t>
-      </w:r>
-    </w:p>
-    <w:p>
-      <w:r>
-        <w:t>Un evaluador externo a las participantes y al equipo juzgó los dos copys de cada producto a ciegas. Es el mismo que etiquetó INFRACTOR/LIMPIO en el corpus de campo (Protocolo_TrackA2_Muestras.md). Puntuó cuatro dimensiones de 1 a 5 —fidelidad a la foto, utilidad comercial, voz de marca y cumplimiento normativo— y eligió cuál copy preferiría publicar, sin empate. Los copys de Postly se tomaron sin la firma que el sistema agrega al publicar; dos de los ocho del generador genérico, en cambio, la incluyeron por su cuenta, lo que en todo caso juega en contra de Postly.</w:t>
-      </w:r>
-    </w:p>
-    <w:p>
-      <w:r>
-        <w:t>Con un único evaluador en este estudio no hay acuerdo inter-evaluador que calcular, y el intervalo de Wilson describe la variación entre productos y no entre evaluadores. La decisión se tomó el 24-09-2026, cuando no se tenía acceso a un segundo; el evaluador de los Estudios 2 y 3 se sumó después y no repitió los Estudios 1 y 4. El resultado es un juicio experto descriptivo, y así se informa (run_oe2.mjs).</w:t>
+        <w:t>El material son ocho productos del catálogo oficial de la marca, cuatro de imagen única y cuatro de carrusel de dos imágenes. Para cada uno se generó, con el mismo modelo y la misma temperatura, un copy con el prompt desplegado de Postly y otro con un prompt genérico: «Escribí un pie de foto para esta imagen/este carrusel de producto para Instagram». El pareo, la rotación de tono y la letra A/B de cada producto se fijaron de antemano, antes de generar ningún resultado (Tabla 17).</w:t>
+      </w:r>
+    </w:p>
+    <w:p>
+      <w:r>
+        <w:t>Un evaluador externo a las participantes y al equipo juzgó los dos copys de cada producto a ciegas. Es el mismo que etiquetó INFRACTOR/LIMPIO en el corpus de campo (protocolo de la muestra de campo). Puntuó cuatro dimensiones de 1 a 5 —fidelidad a la foto, utilidad comercial, voz de marca y cumplimiento normativo— y eligió cuál copy preferiría publicar, sin empate. Los copys de Postly se tomaron sin la firma que el sistema agrega al publicar; dos de los ocho del generador genérico, en cambio, la incluyeron por su cuenta, lo que en todo caso juega en contra de Postly.</w:t>
+      </w:r>
+    </w:p>
+    <w:p>
+      <w:r>
+        <w:t>Con un único evaluador en este estudio no hay acuerdo inter-evaluador que calcular, y el intervalo de Wilson describe la variación entre productos y no entre evaluadores. La decisión se tomó el 24-09-2026, cuando no se tenía acceso a un segundo; el evaluador de los Estudios 2 y 3 se sumó después y no repitió los Estudios 1 y 4. El resultado es un juicio experto descriptivo, y así se informa.</w:t>
       </w:r>
     </w:p>
     <w:p>
@@ -40027,17 +40014,17 @@
     </w:p>
     <w:p>
       <w:r>
-        <w:t>El material sale de la evaluación ampliada del cronometraje (Anexo E.2; PROTOCOLO-ampliacion.md, §4): cuatro publicaciones por cada una de las 8 participantes, dos de imagen única y dos de carrusel, hechas dos veces, una a mano y otra con Postly. El mismo evaluador comparó a ciegas el copy manual contra el de Postly en las 32 publicaciones. El copy de Postly se tomó antes de que el sistema le concatene la firma (HU9), de modo que ninguno de los 32 la lleva y la firma no delata su origen. El llamado a la acción sí puede delatarlo, como declara el §3.5.5. Otro arrastre es propio del diseño cruzado: en las cuatro participantes con secuencia Postly primero, el copy manual de cada publicación se redactó después de ver los tres de Postly para el mismo producto. También comparó, en los 16 carruseles, el orden que armó cada participante contra el que propuso el sistema.</w:t>
-      </w:r>
-    </w:p>
-    <w:p>
-      <w:r>
-        <w:t>armar_material_estudio4.mjs asigna la letra A/B por paridad de índice, antes de mostrarle nada al evaluador. Separa la identidad de la participante, que queda en OE2_estudio4_material.csv y no se versiona, del material que el evaluador ve, en OE2_estudio4_ciego.csv.</w:t>
-      </w:r>
-    </w:p>
-    <w:p>
-      <w:r>
-        <w:t>En los 32 pares de copy, el evaluador prefirió el de Postly en 26 (81,3 %). La ventaja media fue de 0,84 puntos en voz de marca, 0,53 en utilidad comercial, 0,34 en cumplimiento y 0,28 en fidelidad. Es la misma dirección que el Estudio 1 frente al genérico, ahora frente al trabajo real de las ocho participantes. Por secuencia, el evaluador prefirió el copy de Postly en 12 de los 16 pares de las participantes con manual primero (75,0 %) y en 14 de los 16 de las que empezaron con Postly (87,5 %); la diferencia no es significativa (Fisher, p = 0,65). Si el arrastre hubiera acercado el copy manual al de Postly, la preferencia habría bajado en esas segundas, y subió. Con cuatro participantes por secuencia el análisis no descarta un arrastre pequeño (estudio4_por_secuencia.mjs, en el repositorio del proyecto).</w:t>
+        <w:t>El material sale de la evaluación ampliada del cronometraje (Anexo E.2; protocolo de la ampliación, §4): cuatro publicaciones por cada una de las 8 participantes, dos de imagen única y dos de carrusel, hechas dos veces, una a mano y otra con Postly. El mismo evaluador comparó a ciegas el copy manual contra el de Postly en las 32 publicaciones. El copy de Postly se tomó antes de que el sistema le concatene la firma (HU9), de modo que ninguno de los 32 la lleva y la firma no delata su origen. El llamado a la acción sí puede delatarlo, como declara el §3.5.5. Otro arrastre es propio del diseño cruzado: en las cuatro participantes con secuencia Postly primero, el copy manual de cada publicación se redactó después de ver los tres de Postly para el mismo producto. También comparó, en los 16 carruseles, el orden que armó cada participante contra el que propuso el sistema.</w:t>
+      </w:r>
+    </w:p>
+    <w:p>
+      <w:r>
+        <w:t>Un script asigna la letra A/B por paridad de índice, antes de mostrarle nada al evaluador. Separa la identidad de la participante, que queda en el registro restringido, del material que el evaluador ve.</w:t>
+      </w:r>
+    </w:p>
+    <w:p>
+      <w:r>
+        <w:t>En los 32 pares de copy, el evaluador prefirió el de Postly en 26 (81,3 %). La ventaja media fue de 0,84 puntos en voz de marca, 0,53 en utilidad comercial, 0,34 en cumplimiento y 0,28 en fidelidad. Es la misma dirección que el Estudio 1 frente al genérico, ahora frente al trabajo real de las ocho participantes. Por secuencia, el evaluador prefirió el copy de Postly en 12 de los 16 pares de las participantes con manual primero (75,0 %) y en 14 de los 16 de las que empezaron con Postly (87,5 %); la diferencia no es significativa (Fisher, p = 0,65). Si el arrastre hubiera acercado el copy manual al de Postly, la preferencia habría bajado en esas segundas, y subió. Con cuatro participantes por secuencia el análisis no descarta un arrastre pequeño (Tabla 17).</w:t>
       </w:r>
     </w:p>
     <w:p>
@@ -40053,7 +40040,7 @@
     </w:p>
     <w:p>
       <w:r>
-        <w:t>El material manual se publicó en la cuenta real de cada participante y el de Postly en la cuenta de prueba del equipo, por la limitación que PROTOCOLO-ampliacion.md declara en su §10. No afecta esta comparación, porque lo que el evaluador juzga es el texto o el orden, nunca la cuenta de destino. Y como en el Estudio 1, un único evaluador da un juicio experto descriptivo: el intervalo describe la variación entre pares y no hay acuerdo inter-evaluador.</w:t>
+        <w:t>El material manual se publicó en la cuenta real de cada participante y el de Postly en la cuenta de prueba del equipo, por la limitación que el protocolo de la ampliación declara en su §10. No afecta esta comparación, porque lo que el evaluador juzga es el texto o el orden, nunca la cuenta de destino. Y como en el Estudio 1, un único evaluador da un juicio experto descriptivo: el intervalo describe la variación entre pares y no hay acuerdo inter-evaluador.</w:t>
       </w:r>
     </w:p>
     <w:p>
@@ -40066,7 +40053,7 @@
     </w:p>
     <w:p>
       <w:r>
-        <w:t>El material son los mismos 8 conjuntos de tres copys —Informativo, Vendedor, Divertido— que genera run_copy_pareado.mjs para el Estudio 1, con la etiqueta de tono quitada y el orden de exhibición mezclado dentro de cada conjunto por una rotación fija (OE2_copys_material.csv).</w:t>
+        <w:t>El material son los mismos 8 conjuntos de tres copys —Informativo, Vendedor, Divertido— que se generaron para el Estudio 1, con la etiqueta de tono quitada y el orden de exhibición mezclado dentro de cada conjunto por una rotación fija.</w:t>
       </w:r>
     </w:p>
     <w:p>
@@ -40113,12 +40100,12 @@
     </w:p>
     <w:p>
       <w:r>
-        <w:t>El alcance de esta medición es la preferencia declarada de un evaluador, no el rendimiento de la publicación en la plataforma: la misma salvedad que el Estudio 3 de PROTOCOLO-OE2.md declara de antemano.</w:t>
-      </w:r>
-    </w:p>
-    <w:p>
-      <w:r>
-        <w:t>Con esto, los cuatro estudios de PROTOCOLO-OE2.md tienen una primera medición. Los cuatro comparten la misma limitación: un único evaluador por estudio, sin acuerdo inter-evaluador que calcular. El §8.1 se actualiza con los cuatro resultados.</w:t>
+        <w:t>El alcance de esta medición es la preferencia declarada de un evaluador, no el rendimiento de la publicación en la plataforma: la misma salvedad que el protocolo del Objetivo Específico 2 declara de antemano para el Estudio 3.</w:t>
+      </w:r>
+    </w:p>
+    <w:p>
+      <w:r>
+        <w:t>Con esto, los cuatro estudios del protocolo tienen una primera medición. Los cuatro comparten la misma limitación: un único evaluador por estudio, sin acuerdo inter-evaluador que calcular.</w:t>
       </w:r>
     </w:p>
     <w:p>
@@ -40617,6 +40604,1307 @@
           <w:b w:val="0"/>
         </w:rPr>
         <w:t>La tabla admite tres lecturas. El detector textual que produjo las Tablas 3, 4 y 5 no es el vigente: la Tabla 6 resume qué cambió y la Tabla 10 mide el conjunto corregido. El canal visual de la imagen única, en cambio, no cambió en ninguna versión; lo que cambió el 19 de septiembre es que los otros tres flujos adoptaron su criterio. Y entre la última medición, del 27 de septiembre, y la versión vigente, los cambios agregan nodos sin tocar los seis patrones del canal textual, el prompt visual ni los ocho prompts que llaman al modelo, que conservan el mismo SHA-256 desde el 19 de septiembre. La verificación del Anexo E.4, corrida sobre el workflow vigente, lo comprueba para los patrones y el prompt visual.</w:t>
+      </w:r>
+    </w:p>
+    <w:p>
+      <w:pPr>
+        <w:pStyle w:val="Heading3"/>
+      </w:pPr>
+      <w:r>
+        <w:rPr>
+          <w:b w:val="0"/>
+        </w:rPr>
+        <w:t>E.16 Inventario del material complementario</w:t>
+      </w:r>
+    </w:p>
+    <w:p>
+      <w:pPr/>
+      <w:r>
+        <w:rPr>
+          <w:b w:val="0"/>
+        </w:rPr>
+        <w:t>La Tabla 17 reúne, en un solo lugar, los archivos que este trabajo cita: para cada resultado, los scripts que lo producen, los datos de los que parte y el registro en el que está. Los dos registros de Zenodo son los que describe el Anexo E.4; el repositorio es el del proyecto en GitHub.</w:t>
+      </w:r>
+    </w:p>
+    <w:p>
+      <w:pPr>
+        <w:keepNext/>
+      </w:pPr>
+      <w:bookmarkStart w:id="313" w:name="_Toc241538759"/>
+      <w:r>
+        <w:t xml:space="preserve">Tabla </w:t>
+      </w:r>
+      <w:fldSimple w:instr=" SEQ Tabla \* ARABIC ">
+        <w:r>
+          <w:rPr>
+            <w:noProof/>
+          </w:rPr>
+          <w:t>17</w:t>
+        </w:r>
+      </w:fldSimple>
+      <w:r>
+        <w:t>. Inventario del material complementario por resultado</w:t>
+      </w:r>
+      <w:bookmarkEnd w:id="313"/>
+    </w:p>
+    <w:tbl>
+      <w:tblPr>
+        <w:tblStyle w:val="TableGrid"/>
+        <w:tblW w:w="0" w:type="auto"/>
+        <w:tblLook w:val="04A0" w:firstRow="1" w:lastRow="0" w:firstColumn="1" w:lastColumn="0" w:noHBand="0" w:noVBand="1"/>
+      </w:tblPr>
+      <w:tblGrid>
+        <w:gridCol w:w="2124"/>
+        <w:gridCol w:w="2124"/>
+        <w:gridCol w:w="2123"/>
+        <w:gridCol w:w="2123"/>
+      </w:tblGrid>
+      <w:tr>
+        <w:trPr>
+          <w:tblHeader/>
+        </w:trPr>
+        <w:tc>
+          <w:tcPr>
+            <w:tcW w:w="2126" w:type="dxa"/>
+          </w:tcPr>
+          <w:p>
+            <w:pPr>
+              <w:keepNext/>
+            </w:pPr>
+            <w:r>
+              <w:rPr>
+                <w:rFonts w:ascii="Arial" w:hAnsi="Arial" w:cs="Arial"/>
+                <w:b/>
+                <w:sz w:val="18"/>
+              </w:rPr>
+              <w:t xml:space="preserve">Resultado</w:t>
+            </w:r>
+          </w:p>
+        </w:tc>
+        <w:tc>
+          <w:tcPr>
+            <w:tcW w:w="2126" w:type="dxa"/>
+          </w:tcPr>
+          <w:p>
+            <w:pPr>
+              <w:keepNext/>
+            </w:pPr>
+            <w:r>
+              <w:rPr>
+                <w:rFonts w:ascii="Arial" w:hAnsi="Arial" w:cs="Arial"/>
+                <w:b/>
+                <w:sz w:val="18"/>
+              </w:rPr>
+              <w:t xml:space="preserve">Scripts</w:t>
+            </w:r>
+          </w:p>
+        </w:tc>
+        <w:tc>
+          <w:tcPr>
+            <w:tcW w:w="2126" w:type="dxa"/>
+          </w:tcPr>
+          <w:p>
+            <w:pPr>
+              <w:keepNext/>
+            </w:pPr>
+            <w:r>
+              <w:rPr>
+                <w:rFonts w:ascii="Arial" w:hAnsi="Arial" w:cs="Arial"/>
+                <w:b/>
+                <w:sz w:val="18"/>
+              </w:rPr>
+              <w:t xml:space="preserve">Datos y resultados</w:t>
+            </w:r>
+          </w:p>
+        </w:tc>
+        <w:tc>
+          <w:tcPr>
+            <w:tcW w:w="2126" w:type="dxa"/>
+          </w:tcPr>
+          <w:p>
+            <w:pPr>
+              <w:keepNext/>
+            </w:pPr>
+            <w:r>
+              <w:rPr>
+                <w:rFonts w:ascii="Arial" w:hAnsi="Arial" w:cs="Arial"/>
+                <w:b/>
+                <w:sz w:val="18"/>
+              </w:rPr>
+              <w:t xml:space="preserve">Registro</w:t>
+            </w:r>
+          </w:p>
+        </w:tc>
+      </w:tr>
+      <w:tr>
+        <w:tc>
+          <w:tcPr>
+            <w:tcW w:w="2126" w:type="dxa"/>
+          </w:tcPr>
+          <w:p>
+            <w:r>
+              <w:rPr>
+                <w:rFonts w:ascii="Arial" w:hAnsi="Arial" w:cs="Arial"/>
+                <w:sz w:val="18"/>
+              </w:rPr>
+              <w:t xml:space="preserve">Tablas 3, 4, 6 y 10 (E.1.1, E.1.3)</w:t>
+            </w:r>
+          </w:p>
+        </w:tc>
+        <w:tc>
+          <w:tcPr>
+            <w:tcW w:w="2126" w:type="dxa"/>
+          </w:tcPr>
+          <w:p>
+            <w:r>
+              <w:rPr>
+                <w:rFonts w:ascii="Arial" w:hAnsi="Arial" w:cs="Arial"/>
+                <w:sz w:val="18"/>
+              </w:rPr>
+              <w:t xml:space="preserve">run_compliance_text.mjs</w:t>
+            </w:r>
+          </w:p>
+        </w:tc>
+        <w:tc>
+          <w:tcPr>
+            <w:tcW w:w="2126" w:type="dxa"/>
+          </w:tcPr>
+          <w:p>
+            <w:r>
+              <w:rPr>
+                <w:rFonts w:ascii="Arial" w:hAnsi="Arial" w:cs="Arial"/>
+                <w:sz w:val="18"/>
+              </w:rPr>
+              <w:t xml:space="preserve">Casos_Compliance_Representativo.csv, Casos_Compliance.csv, Casos_Compliance_Limite.csv y sus archivos _resultados (detector corregido) y _resultados_v1 (detector anterior)</w:t>
+            </w:r>
+          </w:p>
+        </w:tc>
+        <w:tc>
+          <w:tcPr>
+            <w:tcW w:w="2126" w:type="dxa"/>
+          </w:tcPr>
+          <w:p>
+            <w:r>
+              <w:rPr>
+                <w:rFonts w:ascii="Arial" w:hAnsi="Arial" w:cs="Arial"/>
+                <w:sz w:val="18"/>
+              </w:rPr>
+              <w:t xml:space="preserve">Abierto</w:t>
+            </w:r>
+          </w:p>
+        </w:tc>
+      </w:tr>
+      <w:tr>
+        <w:tc>
+          <w:tcPr>
+            <w:tcW w:w="2126" w:type="dxa"/>
+          </w:tcPr>
+          <w:p>
+            <w:r>
+              <w:rPr>
+                <w:rFonts w:ascii="Arial" w:hAnsi="Arial" w:cs="Arial"/>
+                <w:sz w:val="18"/>
+              </w:rPr>
+              <w:t xml:space="preserve">Tabla 5 (E.1.2)</w:t>
+            </w:r>
+          </w:p>
+        </w:tc>
+        <w:tc>
+          <w:tcPr>
+            <w:tcW w:w="2126" w:type="dxa"/>
+          </w:tcPr>
+          <w:p>
+            <w:r>
+              <w:rPr>
+                <w:rFonts w:ascii="Arial" w:hAnsi="Arial" w:cs="Arial"/>
+                <w:sz w:val="18"/>
+              </w:rPr>
+              <w:t xml:space="preserve">run_compliance_field.mjs</w:t>
+            </w:r>
+          </w:p>
+        </w:tc>
+        <w:tc>
+          <w:tcPr>
+            <w:tcW w:w="2126" w:type="dxa"/>
+          </w:tcPr>
+          <w:p>
+            <w:r>
+              <w:rPr>
+                <w:rFonts w:ascii="Arial" w:hAnsi="Arial" w:cs="Arial"/>
+                <w:sz w:val="18"/>
+              </w:rPr>
+              <w:t xml:space="preserve">Compliance_Campo.csv</w:t>
+            </w:r>
+          </w:p>
+        </w:tc>
+        <w:tc>
+          <w:tcPr>
+            <w:tcW w:w="2126" w:type="dxa"/>
+          </w:tcPr>
+          <w:p>
+            <w:r>
+              <w:rPr>
+                <w:rFonts w:ascii="Arial" w:hAnsi="Arial" w:cs="Arial"/>
+                <w:sz w:val="18"/>
+              </w:rPr>
+              <w:t xml:space="preserve">Script: abierto; datos: restringido</w:t>
+            </w:r>
+          </w:p>
+        </w:tc>
+      </w:tr>
+      <w:tr>
+        <w:tc>
+          <w:tcPr>
+            <w:tcW w:w="2126" w:type="dxa"/>
+          </w:tcPr>
+          <w:p>
+            <w:r>
+              <w:rPr>
+                <w:rFonts w:ascii="Arial" w:hAnsi="Arial" w:cs="Arial"/>
+                <w:sz w:val="18"/>
+              </w:rPr>
+              <w:t xml:space="preserve">Representatividad (§6.1)</w:t>
+            </w:r>
+          </w:p>
+        </w:tc>
+        <w:tc>
+          <w:tcPr>
+            <w:tcW w:w="2126" w:type="dxa"/>
+          </w:tcPr>
+          <w:p>
+            <w:r>
+              <w:rPr>
+                <w:rFonts w:ascii="Arial" w:hAnsi="Arial" w:cs="Arial"/>
+                <w:sz w:val="18"/>
+              </w:rPr>
+              <w:t xml:space="preserve">run_representatividad.mjs</w:t>
+            </w:r>
+          </w:p>
+        </w:tc>
+        <w:tc>
+          <w:tcPr>
+            <w:tcW w:w="2126" w:type="dxa"/>
+          </w:tcPr>
+          <w:p>
+            <w:r>
+              <w:rPr>
+                <w:rFonts w:ascii="Arial" w:hAnsi="Arial" w:cs="Arial"/>
+                <w:sz w:val="18"/>
+              </w:rPr>
+              <w:t xml:space="preserve">Representatividad_resultados.csv</w:t>
+            </w:r>
+          </w:p>
+        </w:tc>
+        <w:tc>
+          <w:tcPr>
+            <w:tcW w:w="2126" w:type="dxa"/>
+          </w:tcPr>
+          <w:p>
+            <w:r>
+              <w:rPr>
+                <w:rFonts w:ascii="Arial" w:hAnsi="Arial" w:cs="Arial"/>
+                <w:sz w:val="18"/>
+              </w:rPr>
+              <w:t xml:space="preserve">Abierto</w:t>
+            </w:r>
+          </w:p>
+        </w:tc>
+      </w:tr>
+      <w:tr>
+        <w:tc>
+          <w:tcPr>
+            <w:tcW w:w="2126" w:type="dxa"/>
+          </w:tcPr>
+          <w:p>
+            <w:r>
+              <w:rPr>
+                <w:rFonts w:ascii="Arial" w:hAnsi="Arial" w:cs="Arial"/>
+                <w:sz w:val="18"/>
+              </w:rPr>
+              <w:t xml:space="preserve">Divergencia de HU10 (E.1.4)</w:t>
+            </w:r>
+          </w:p>
+        </w:tc>
+        <w:tc>
+          <w:tcPr>
+            <w:tcW w:w="2126" w:type="dxa"/>
+          </w:tcPr>
+          <w:p>
+            <w:r>
+              <w:rPr>
+                <w:rFonts w:ascii="Arial" w:hAnsi="Arial" w:cs="Arial"/>
+                <w:sz w:val="18"/>
+              </w:rPr>
+              <w:t xml:space="preserve">run_compliance_hu10.mjs</w:t>
+            </w:r>
+          </w:p>
+        </w:tc>
+        <w:tc>
+          <w:tcPr>
+            <w:tcW w:w="2126" w:type="dxa"/>
+          </w:tcPr>
+          <w:p>
+            <w:r>
+              <w:rPr>
+                <w:rFonts w:ascii="Arial" w:hAnsi="Arial" w:cs="Arial"/>
+                <w:sz w:val="18"/>
+              </w:rPr>
+              <w:t xml:space="preserve">Divergencia_HU10_resultados.csv</w:t>
+            </w:r>
+          </w:p>
+        </w:tc>
+        <w:tc>
+          <w:tcPr>
+            <w:tcW w:w="2126" w:type="dxa"/>
+          </w:tcPr>
+          <w:p>
+            <w:r>
+              <w:rPr>
+                <w:rFonts w:ascii="Arial" w:hAnsi="Arial" w:cs="Arial"/>
+                <w:sz w:val="18"/>
+              </w:rPr>
+              <w:t xml:space="preserve">Abierto</w:t>
+            </w:r>
+          </w:p>
+        </w:tc>
+      </w:tr>
+      <w:tr>
+        <w:tc>
+          <w:tcPr>
+            <w:tcW w:w="2126" w:type="dxa"/>
+          </w:tcPr>
+          <w:p>
+            <w:r>
+              <w:rPr>
+                <w:rFonts w:ascii="Arial" w:hAnsi="Arial" w:cs="Arial"/>
+                <w:sz w:val="18"/>
+              </w:rPr>
+              <w:t xml:space="preserve">Tabla 7 (E.2)</w:t>
+            </w:r>
+          </w:p>
+        </w:tc>
+        <w:tc>
+          <w:tcPr>
+            <w:tcW w:w="2126" w:type="dxa"/>
+          </w:tcPr>
+          <w:p>
+            <w:r>
+              <w:rPr>
+                <w:rFonts w:ascii="Arial" w:hAnsi="Arial" w:cs="Arial"/>
+                <w:sz w:val="18"/>
+              </w:rPr>
+              <w:t xml:space="preserve">run_cronometraje_v2.mjs, tiempos_motor_v2.mjs, sensibilidad_tiempo_omitido.mjs</w:t>
+            </w:r>
+          </w:p>
+        </w:tc>
+        <w:tc>
+          <w:tcPr>
+            <w:tcW w:w="2126" w:type="dxa"/>
+          </w:tcPr>
+          <w:p>
+            <w:r>
+              <w:rPr>
+                <w:rFonts w:ascii="Arial" w:hAnsi="Arial" w:cs="Arial"/>
+                <w:sz w:val="18"/>
+              </w:rPr>
+              <w:t xml:space="preserve">Cronometraje_datos_v2.csv, Reclutamiento_v2.csv</w:t>
+            </w:r>
+          </w:p>
+        </w:tc>
+        <w:tc>
+          <w:tcPr>
+            <w:tcW w:w="2126" w:type="dxa"/>
+          </w:tcPr>
+          <w:p>
+            <w:r>
+              <w:rPr>
+                <w:rFonts w:ascii="Arial" w:hAnsi="Arial" w:cs="Arial"/>
+                <w:sz w:val="18"/>
+              </w:rPr>
+              <w:t xml:space="preserve">Scripts: abierto, salvo sensibilidad_tiempo_omitido.mjs (repositorio); datos: restringido</w:t>
+            </w:r>
+          </w:p>
+        </w:tc>
+      </w:tr>
+      <w:tr>
+        <w:tc>
+          <w:tcPr>
+            <w:tcW w:w="2126" w:type="dxa"/>
+          </w:tcPr>
+          <w:p>
+            <w:r>
+              <w:rPr>
+                <w:rFonts w:ascii="Arial" w:hAnsi="Arial" w:cs="Arial"/>
+                <w:sz w:val="18"/>
+              </w:rPr>
+              <w:t xml:space="preserve">Tabla 8 (E.3)</w:t>
+            </w:r>
+          </w:p>
+        </w:tc>
+        <w:tc>
+          <w:tcPr>
+            <w:tcW w:w="2126" w:type="dxa"/>
+          </w:tcPr>
+          <w:p>
+            <w:r>
+              <w:rPr>
+                <w:rFonts w:ascii="Arial" w:hAnsi="Arial" w:cs="Arial"/>
+                <w:sz w:val="18"/>
+              </w:rPr>
+              <w:t xml:space="preserve">run_tam_v2.mjs</w:t>
+            </w:r>
+          </w:p>
+        </w:tc>
+        <w:tc>
+          <w:tcPr>
+            <w:tcW w:w="2126" w:type="dxa"/>
+          </w:tcPr>
+          <w:p>
+            <w:r>
+              <w:rPr>
+                <w:rFonts w:ascii="Arial" w:hAnsi="Arial" w:cs="Arial"/>
+                <w:sz w:val="18"/>
+              </w:rPr>
+              <w:t xml:space="preserve">TAM_v2_cuestionario.md, TAM_respuestas_v2.csv</w:t>
+            </w:r>
+          </w:p>
+        </w:tc>
+        <w:tc>
+          <w:tcPr>
+            <w:tcW w:w="2126" w:type="dxa"/>
+          </w:tcPr>
+          <w:p>
+            <w:r>
+              <w:rPr>
+                <w:rFonts w:ascii="Arial" w:hAnsi="Arial" w:cs="Arial"/>
+                <w:sz w:val="18"/>
+              </w:rPr>
+              <w:t xml:space="preserve">Script y cuestionario: abierto; respuestas: restringido</w:t>
+            </w:r>
+          </w:p>
+        </w:tc>
+      </w:tr>
+      <w:tr>
+        <w:tc>
+          <w:tcPr>
+            <w:tcW w:w="2126" w:type="dxa"/>
+          </w:tcPr>
+          <w:p>
+            <w:r>
+              <w:rPr>
+                <w:rFonts w:ascii="Arial" w:hAnsi="Arial" w:cs="Arial"/>
+                <w:sz w:val="18"/>
+              </w:rPr>
+              <w:t xml:space="preserve">Piloto: cronometraje y cuestionario</w:t>
+            </w:r>
+          </w:p>
+        </w:tc>
+        <w:tc>
+          <w:tcPr>
+            <w:tcW w:w="2126" w:type="dxa"/>
+          </w:tcPr>
+          <w:p>
+            <w:r>
+              <w:rPr>
+                <w:rFonts w:ascii="Arial" w:hAnsi="Arial" w:cs="Arial"/>
+                <w:sz w:val="18"/>
+              </w:rPr>
+              <w:t xml:space="preserve">run_cronometraje.mjs, run_sensibilidad_cronometraje.mjs, run_tam.mjs</w:t>
+            </w:r>
+          </w:p>
+        </w:tc>
+        <w:tc>
+          <w:tcPr>
+            <w:tcW w:w="2126" w:type="dxa"/>
+          </w:tcPr>
+          <w:p>
+            <w:r>
+              <w:rPr>
+                <w:rFonts w:ascii="Arial" w:hAnsi="Arial" w:cs="Arial"/>
+                <w:sz w:val="18"/>
+              </w:rPr>
+              <w:t xml:space="preserve">Cronometraje_datos.csv, TAM_respuestas.csv, Sensibilidad_cronometraje_resultados.csv</w:t>
+            </w:r>
+          </w:p>
+        </w:tc>
+        <w:tc>
+          <w:tcPr>
+            <w:tcW w:w="2126" w:type="dxa"/>
+          </w:tcPr>
+          <w:p>
+            <w:r>
+              <w:rPr>
+                <w:rFonts w:ascii="Arial" w:hAnsi="Arial" w:cs="Arial"/>
+                <w:sz w:val="18"/>
+              </w:rPr>
+              <w:t xml:space="preserve">Abierto</w:t>
+            </w:r>
+          </w:p>
+        </w:tc>
+      </w:tr>
+      <w:tr>
+        <w:tc>
+          <w:tcPr>
+            <w:tcW w:w="2126" w:type="dxa"/>
+          </w:tcPr>
+          <w:p>
+            <w:r>
+              <w:rPr>
+                <w:rFonts w:ascii="Arial" w:hAnsi="Arial" w:cs="Arial"/>
+                <w:sz w:val="18"/>
+              </w:rPr>
+              <w:t xml:space="preserve">Tabla 11 (E.5)</w:t>
+            </w:r>
+          </w:p>
+        </w:tc>
+        <w:tc>
+          <w:tcPr>
+            <w:tcW w:w="2126" w:type="dxa"/>
+          </w:tcPr>
+          <w:p>
+            <w:r>
+              <w:rPr>
+                <w:rFonts w:ascii="Arial" w:hAnsi="Arial" w:cs="Arial"/>
+                <w:sz w:val="18"/>
+              </w:rPr>
+              <w:t xml:space="preserve">run_baterias.mjs</w:t>
+            </w:r>
+          </w:p>
+        </w:tc>
+        <w:tc>
+          <w:tcPr>
+            <w:tcW w:w="2126" w:type="dxa"/>
+          </w:tcPr>
+          <w:p>
+            <w:r>
+              <w:rPr>
+                <w:rFonts w:ascii="Arial" w:hAnsi="Arial" w:cs="Arial"/>
+                <w:sz w:val="18"/>
+              </w:rPr>
+              <w:t xml:space="preserve">Baterias_resultados.csv, B1b_desglose.csv</w:t>
+            </w:r>
+          </w:p>
+        </w:tc>
+        <w:tc>
+          <w:tcPr>
+            <w:tcW w:w="2126" w:type="dxa"/>
+          </w:tcPr>
+          <w:p>
+            <w:r>
+              <w:rPr>
+                <w:rFonts w:ascii="Arial" w:hAnsi="Arial" w:cs="Arial"/>
+                <w:sz w:val="18"/>
+              </w:rPr>
+              <w:t xml:space="preserve">Abierto</w:t>
+            </w:r>
+          </w:p>
+        </w:tc>
+      </w:tr>
+      <w:tr>
+        <w:tc>
+          <w:tcPr>
+            <w:tcW w:w="2126" w:type="dxa"/>
+          </w:tcPr>
+          <w:p>
+            <w:r>
+              <w:rPr>
+                <w:rFonts w:ascii="Arial" w:hAnsi="Arial" w:cs="Arial"/>
+                <w:sz w:val="18"/>
+              </w:rPr>
+              <w:t xml:space="preserve">Tablas 12 y 14 (E.6, E.8)</w:t>
+            </w:r>
+          </w:p>
+        </w:tc>
+        <w:tc>
+          <w:tcPr>
+            <w:tcW w:w="2126" w:type="dxa"/>
+          </w:tcPr>
+          <w:p>
+            <w:r>
+              <w:rPr>
+                <w:rFonts w:ascii="Arial" w:hAnsi="Arial" w:cs="Arial"/>
+                <w:sz w:val="18"/>
+              </w:rPr>
+              <w:t xml:space="preserve">run_compliance_vision.mjs, armar_casos_imagen.py, armar_casos_imagen_dificiles.py</w:t>
+            </w:r>
+          </w:p>
+        </w:tc>
+        <w:tc>
+          <w:tcPr>
+            <w:tcW w:w="2126" w:type="dxa"/>
+          </w:tcPr>
+          <w:p>
+            <w:r>
+              <w:rPr>
+                <w:rFonts w:ascii="Arial" w:hAnsi="Arial" w:cs="Arial"/>
+                <w:sz w:val="18"/>
+              </w:rPr>
+              <w:t xml:space="preserve">Casos_Compliance_Imagen.csv y su archivo _resultados, de cada corrida (casos_imagen/ y casos_imagen_corrida2/)</w:t>
+            </w:r>
+          </w:p>
+        </w:tc>
+        <w:tc>
+          <w:tcPr>
+            <w:tcW w:w="2126" w:type="dxa"/>
+          </w:tcPr>
+          <w:p>
+            <w:r>
+              <w:rPr>
+                <w:rFonts w:ascii="Arial" w:hAnsi="Arial" w:cs="Arial"/>
+                <w:sz w:val="18"/>
+              </w:rPr>
+              <w:t xml:space="preserve">Manifiestos y resultados: abierto; imágenes: restringido</w:t>
+            </w:r>
+          </w:p>
+        </w:tc>
+      </w:tr>
+      <w:tr>
+        <w:tc>
+          <w:tcPr>
+            <w:tcW w:w="2126" w:type="dxa"/>
+          </w:tcPr>
+          <w:p>
+            <w:r>
+              <w:rPr>
+                <w:rFonts w:ascii="Arial" w:hAnsi="Arial" w:cs="Arial"/>
+                <w:sz w:val="18"/>
+              </w:rPr>
+              <w:t xml:space="preserve">Casos de extremo a extremo (E.9 a E.11)</w:t>
+            </w:r>
+          </w:p>
+        </w:tc>
+        <w:tc>
+          <w:tcPr>
+            <w:tcW w:w="2126" w:type="dxa"/>
+          </w:tcPr>
+          <w:p>
+            <w:r>
+              <w:rPr>
+                <w:rFonts w:ascii="Arial" w:hAnsi="Arial" w:cs="Arial"/>
+                <w:sz w:val="18"/>
+              </w:rPr>
+              <w:t xml:space="preserve">—</w:t>
+            </w:r>
+          </w:p>
+        </w:tc>
+        <w:tc>
+          <w:tcPr>
+            <w:tcW w:w="2126" w:type="dxa"/>
+          </w:tcPr>
+          <w:p>
+            <w:r>
+              <w:rPr>
+                <w:rFonts w:ascii="Arial" w:hAnsi="Arial" w:cs="Arial"/>
+                <w:sz w:val="18"/>
+              </w:rPr>
+              <w:t xml:space="preserve">Casos_Compliance_Video_resultados.csv, Casos_Compliance_Carrusel_resultados.csv, Casos_Compliance_Repost_resultados.csv</w:t>
+            </w:r>
+          </w:p>
+        </w:tc>
+        <w:tc>
+          <w:tcPr>
+            <w:tcW w:w="2126" w:type="dxa"/>
+          </w:tcPr>
+          <w:p>
+            <w:r>
+              <w:rPr>
+                <w:rFonts w:ascii="Arial" w:hAnsi="Arial" w:cs="Arial"/>
+                <w:sz w:val="18"/>
+              </w:rPr>
+              <w:t xml:space="preserve">Resultados: abierto; imágenes y fotogramas: restringido</w:t>
+            </w:r>
+          </w:p>
+        </w:tc>
+      </w:tr>
+      <w:tr>
+        <w:tc>
+          <w:tcPr>
+            <w:tcW w:w="2126" w:type="dxa"/>
+          </w:tcPr>
+          <w:p>
+            <w:r>
+              <w:rPr>
+                <w:rFonts w:ascii="Arial" w:hAnsi="Arial" w:cs="Arial"/>
+                <w:sz w:val="18"/>
+              </w:rPr>
+              <w:t xml:space="preserve">Tabla 13 (E.7)</w:t>
+            </w:r>
+          </w:p>
+        </w:tc>
+        <w:tc>
+          <w:tcPr>
+            <w:tcW w:w="2126" w:type="dxa"/>
+          </w:tcPr>
+          <w:p>
+            <w:r>
+              <w:rPr>
+                <w:rFonts w:ascii="Arial" w:hAnsi="Arial" w:cs="Arial"/>
+                <w:sz w:val="18"/>
+              </w:rPr>
+              <w:t xml:space="preserve">run_umbrales.mjs</w:t>
+            </w:r>
+          </w:p>
+        </w:tc>
+        <w:tc>
+          <w:tcPr>
+            <w:tcW w:w="2126" w:type="dxa"/>
+          </w:tcPr>
+          <w:p>
+            <w:r>
+              <w:rPr>
+                <w:rFonts w:ascii="Arial" w:hAnsi="Arial" w:cs="Arial"/>
+                <w:sz w:val="18"/>
+              </w:rPr>
+              <w:t xml:space="preserve">Umbrales_HU_resultados.csv</w:t>
+            </w:r>
+          </w:p>
+        </w:tc>
+        <w:tc>
+          <w:tcPr>
+            <w:tcW w:w="2126" w:type="dxa"/>
+          </w:tcPr>
+          <w:p>
+            <w:r>
+              <w:rPr>
+                <w:rFonts w:ascii="Arial" w:hAnsi="Arial" w:cs="Arial"/>
+                <w:sz w:val="18"/>
+              </w:rPr>
+              <w:t xml:space="preserve">Abierto</w:t>
+            </w:r>
+          </w:p>
+        </w:tc>
+      </w:tr>
+      <w:tr>
+        <w:tc>
+          <w:tcPr>
+            <w:tcW w:w="2126" w:type="dxa"/>
+          </w:tcPr>
+          <w:p>
+            <w:r>
+              <w:rPr>
+                <w:rFonts w:ascii="Arial" w:hAnsi="Arial" w:cs="Arial"/>
+                <w:sz w:val="18"/>
+              </w:rPr>
+              <w:t xml:space="preserve">Llamado a la acción (E.12)</w:t>
+            </w:r>
+          </w:p>
+        </w:tc>
+        <w:tc>
+          <w:tcPr>
+            <w:tcW w:w="2126" w:type="dxa"/>
+          </w:tcPr>
+          <w:p>
+            <w:r>
+              <w:rPr>
+                <w:rFonts w:ascii="Arial" w:hAnsi="Arial" w:cs="Arial"/>
+                <w:sz w:val="18"/>
+              </w:rPr>
+              <w:t xml:space="preserve">run_cta_generacion.mjs, run_cta_estudios_oe2.mjs</w:t>
+            </w:r>
+          </w:p>
+        </w:tc>
+        <w:tc>
+          <w:tcPr>
+            <w:tcW w:w="2126" w:type="dxa"/>
+          </w:tcPr>
+          <w:p>
+            <w:r>
+              <w:rPr>
+                <w:rFonts w:ascii="Arial" w:hAnsi="Arial" w:cs="Arial"/>
+                <w:sz w:val="18"/>
+              </w:rPr>
+              <w:t xml:space="preserve">Prompts_generacion.json, CTA_generacion_resultados.csv, CTA_estudios_OE2_resultados.csv</w:t>
+            </w:r>
+          </w:p>
+        </w:tc>
+        <w:tc>
+          <w:tcPr>
+            <w:tcW w:w="2126" w:type="dxa"/>
+          </w:tcPr>
+          <w:p>
+            <w:r>
+              <w:rPr>
+                <w:rFonts w:ascii="Arial" w:hAnsi="Arial" w:cs="Arial"/>
+                <w:sz w:val="18"/>
+              </w:rPr>
+              <w:t xml:space="preserve">Abierto</w:t>
+            </w:r>
+          </w:p>
+        </w:tc>
+      </w:tr>
+      <w:tr>
+        <w:tc>
+          <w:tcPr>
+            <w:tcW w:w="2126" w:type="dxa"/>
+          </w:tcPr>
+          <w:p>
+            <w:r>
+              <w:rPr>
+                <w:rFonts w:ascii="Arial" w:hAnsi="Arial" w:cs="Arial"/>
+                <w:sz w:val="18"/>
+              </w:rPr>
+              <w:t xml:space="preserve">Estudios 1 a 3 (E.14.1, E.14.3, E.14.4)</w:t>
+            </w:r>
+          </w:p>
+        </w:tc>
+        <w:tc>
+          <w:tcPr>
+            <w:tcW w:w="2126" w:type="dxa"/>
+          </w:tcPr>
+          <w:p>
+            <w:r>
+              <w:rPr>
+                <w:rFonts w:ascii="Arial" w:hAnsi="Arial" w:cs="Arial"/>
+                <w:sz w:val="18"/>
+              </w:rPr>
+              <w:t xml:space="preserve">run_copy_pareado.mjs, run_oe2.mjs</w:t>
+            </w:r>
+          </w:p>
+        </w:tc>
+        <w:tc>
+          <w:tcPr>
+            <w:tcW w:w="2126" w:type="dxa"/>
+          </w:tcPr>
+          <w:p>
+            <w:r>
+              <w:rPr>
+                <w:rFonts w:ascii="Arial" w:hAnsi="Arial" w:cs="Arial"/>
+                <w:sz w:val="18"/>
+              </w:rPr>
+              <w:t xml:space="preserve">OE2_copys_material.csv; respuestas y claves de los evaluadores (OE2_estudio1 a OE2_estudio3)</w:t>
+            </w:r>
+          </w:p>
+        </w:tc>
+        <w:tc>
+          <w:tcPr>
+            <w:tcW w:w="2126" w:type="dxa"/>
+          </w:tcPr>
+          <w:p>
+            <w:r>
+              <w:rPr>
+                <w:rFonts w:ascii="Arial" w:hAnsi="Arial" w:cs="Arial"/>
+                <w:sz w:val="18"/>
+              </w:rPr>
+              <w:t xml:space="preserve">Abierto; imágenes: restringido</w:t>
+            </w:r>
+          </w:p>
+        </w:tc>
+      </w:tr>
+      <w:tr>
+        <w:tc>
+          <w:tcPr>
+            <w:tcW w:w="2126" w:type="dxa"/>
+          </w:tcPr>
+          <w:p>
+            <w:r>
+              <w:rPr>
+                <w:rFonts w:ascii="Arial" w:hAnsi="Arial" w:cs="Arial"/>
+                <w:sz w:val="18"/>
+              </w:rPr>
+              <w:t xml:space="preserve">Estudio 4 (E.14.2)</w:t>
+            </w:r>
+          </w:p>
+        </w:tc>
+        <w:tc>
+          <w:tcPr>
+            <w:tcW w:w="2126" w:type="dxa"/>
+          </w:tcPr>
+          <w:p>
+            <w:r>
+              <w:rPr>
+                <w:rFonts w:ascii="Arial" w:hAnsi="Arial" w:cs="Arial"/>
+                <w:sz w:val="18"/>
+              </w:rPr>
+              <w:t xml:space="preserve">armar_material_estudio4.mjs, estudio4_por_secuencia.mjs</w:t>
+            </w:r>
+          </w:p>
+        </w:tc>
+        <w:tc>
+          <w:tcPr>
+            <w:tcW w:w="2126" w:type="dxa"/>
+          </w:tcPr>
+          <w:p>
+            <w:r>
+              <w:rPr>
+                <w:rFonts w:ascii="Arial" w:hAnsi="Arial" w:cs="Arial"/>
+                <w:sz w:val="18"/>
+              </w:rPr>
+              <w:t xml:space="preserve">OE2_estudio4_material.csv, OE2_estudio4_ciego.csv, OE2_estudio4_clave.csv, OE2_estudio4_respuestas.csv</w:t>
+            </w:r>
+          </w:p>
+        </w:tc>
+        <w:tc>
+          <w:tcPr>
+            <w:tcW w:w="2126" w:type="dxa"/>
+          </w:tcPr>
+          <w:p>
+            <w:r>
+              <w:rPr>
+                <w:rFonts w:ascii="Arial" w:hAnsi="Arial" w:cs="Arial"/>
+                <w:sz w:val="18"/>
+              </w:rPr>
+              <w:t xml:space="preserve">Material y copys manuales: restringido; clave y respuestas: abierto; estudio4_por_secuencia.mjs: repositorio</w:t>
+            </w:r>
+          </w:p>
+        </w:tc>
+      </w:tr>
+      <w:tr>
+        <w:tc>
+          <w:tcPr>
+            <w:tcW w:w="2126" w:type="dxa"/>
+          </w:tcPr>
+          <w:p>
+            <w:r>
+              <w:rPr>
+                <w:rFonts w:ascii="Arial" w:hAnsi="Arial" w:cs="Arial"/>
+                <w:sz w:val="18"/>
+              </w:rPr>
+              <w:t xml:space="preserve">Identidad entre los scripts y el detector desplegado (E.4)</w:t>
+            </w:r>
+          </w:p>
+        </w:tc>
+        <w:tc>
+          <w:tcPr>
+            <w:tcW w:w="2126" w:type="dxa"/>
+          </w:tcPr>
+          <w:p>
+            <w:r>
+              <w:rPr>
+                <w:rFonts w:ascii="Arial" w:hAnsi="Arial" w:cs="Arial"/>
+                <w:sz w:val="18"/>
+              </w:rPr>
+              <w:t xml:space="preserve">verificar_patrones_desplegados.mjs</w:t>
+            </w:r>
+          </w:p>
+        </w:tc>
+        <w:tc>
+          <w:tcPr>
+            <w:tcW w:w="2126" w:type="dxa"/>
+          </w:tcPr>
+          <w:p>
+            <w:r>
+              <w:rPr>
+                <w:rFonts w:ascii="Arial" w:hAnsi="Arial" w:cs="Arial"/>
+                <w:sz w:val="18"/>
+              </w:rPr>
+              <w:t xml:space="preserve">Nodos_compliance_desplegados.json, Nodos_compliance_desplegados_v1.json</w:t>
+            </w:r>
+          </w:p>
+        </w:tc>
+        <w:tc>
+          <w:tcPr>
+            <w:tcW w:w="2126" w:type="dxa"/>
+          </w:tcPr>
+          <w:p>
+            <w:r>
+              <w:rPr>
+                <w:rFonts w:ascii="Arial" w:hAnsi="Arial" w:cs="Arial"/>
+                <w:sz w:val="18"/>
+              </w:rPr>
+              <w:t xml:space="preserve">Abierto</w:t>
+            </w:r>
+          </w:p>
+        </w:tc>
+      </w:tr>
+      <w:tr>
+        <w:tc>
+          <w:tcPr>
+            <w:tcW w:w="2126" w:type="dxa"/>
+          </w:tcPr>
+          <w:p>
+            <w:r>
+              <w:rPr>
+                <w:rFonts w:ascii="Arial" w:hAnsi="Arial" w:cs="Arial"/>
+                <w:sz w:val="18"/>
+              </w:rPr>
+              <w:t xml:space="preserve">Recomputo de las cifras del Capítulo 6 (E.4)</w:t>
+            </w:r>
+          </w:p>
+        </w:tc>
+        <w:tc>
+          <w:tcPr>
+            <w:tcW w:w="2126" w:type="dxa"/>
+          </w:tcPr>
+          <w:p>
+            <w:r>
+              <w:rPr>
+                <w:rFonts w:ascii="Arial" w:hAnsi="Arial" w:cs="Arial"/>
+                <w:sz w:val="18"/>
+              </w:rPr>
+              <w:t xml:space="preserve">verificar_csv.py</w:t>
+            </w:r>
+          </w:p>
+        </w:tc>
+        <w:tc>
+          <w:tcPr>
+            <w:tcW w:w="2126" w:type="dxa"/>
+          </w:tcPr>
+          <w:p>
+            <w:r>
+              <w:rPr>
+                <w:rFonts w:ascii="Arial" w:hAnsi="Arial" w:cs="Arial"/>
+                <w:sz w:val="18"/>
+              </w:rPr>
+              <w:t xml:space="preserve">Todos los archivos _resultados</w:t>
+            </w:r>
+          </w:p>
+        </w:tc>
+        <w:tc>
+          <w:tcPr>
+            <w:tcW w:w="2126" w:type="dxa"/>
+          </w:tcPr>
+          <w:p>
+            <w:r>
+              <w:rPr>
+                <w:rFonts w:ascii="Arial" w:hAnsi="Arial" w:cs="Arial"/>
+                <w:sz w:val="18"/>
+              </w:rPr>
+              <w:t xml:space="preserve">Abierto</w:t>
+            </w:r>
+          </w:p>
+        </w:tc>
+      </w:tr>
+      <w:tr>
+        <w:tc>
+          <w:tcPr>
+            <w:tcW w:w="2126" w:type="dxa"/>
+          </w:tcPr>
+          <w:p>
+            <w:r>
+              <w:rPr>
+                <w:rFonts w:ascii="Arial" w:hAnsi="Arial" w:cs="Arial"/>
+                <w:sz w:val="18"/>
+              </w:rPr>
+              <w:t xml:space="preserve">Corrección del detector (§6.1)</w:t>
+            </w:r>
+          </w:p>
+        </w:tc>
+        <w:tc>
+          <w:tcPr>
+            <w:tcW w:w="2126" w:type="dxa"/>
+          </w:tcPr>
+          <w:p>
+            <w:r>
+              <w:rPr>
+                <w:rFonts w:ascii="Arial" w:hAnsi="Arial" w:cs="Arial"/>
+                <w:sz w:val="18"/>
+              </w:rPr>
+              <w:t xml:space="preserve">fix-compliance-patterns.mjs</w:t>
+            </w:r>
+          </w:p>
+        </w:tc>
+        <w:tc>
+          <w:tcPr>
+            <w:tcW w:w="2126" w:type="dxa"/>
+          </w:tcPr>
+          <w:p>
+            <w:r>
+              <w:rPr>
+                <w:rFonts w:ascii="Arial" w:hAnsi="Arial" w:cs="Arial"/>
+                <w:sz w:val="18"/>
+              </w:rPr>
+              <w:t xml:space="preserve">—</w:t>
+            </w:r>
+          </w:p>
+        </w:tc>
+        <w:tc>
+          <w:tcPr>
+            <w:tcW w:w="2126" w:type="dxa"/>
+          </w:tcPr>
+          <w:p>
+            <w:r>
+              <w:rPr>
+                <w:rFonts w:ascii="Arial" w:hAnsi="Arial" w:cs="Arial"/>
+                <w:sz w:val="18"/>
+              </w:rPr>
+              <w:t xml:space="preserve">Abierto</w:t>
+            </w:r>
+          </w:p>
+        </w:tc>
+      </w:tr>
+      <w:tr>
+        <w:tc>
+          <w:tcPr>
+            <w:tcW w:w="2126" w:type="dxa"/>
+          </w:tcPr>
+          <w:p>
+            <w:r>
+              <w:rPr>
+                <w:rFonts w:ascii="Arial" w:hAnsi="Arial" w:cs="Arial"/>
+                <w:sz w:val="18"/>
+              </w:rPr>
+              <w:t xml:space="preserve">Workflows del sistema (Tabla 16)</w:t>
+            </w:r>
+          </w:p>
+        </w:tc>
+        <w:tc>
+          <w:tcPr>
+            <w:tcW w:w="2126" w:type="dxa"/>
+          </w:tcPr>
+          <w:p>
+            <w:r>
+              <w:rPr>
+                <w:rFonts w:ascii="Arial" w:hAnsi="Arial" w:cs="Arial"/>
+                <w:sz w:val="18"/>
+              </w:rPr>
+              <w:t xml:space="preserve">—</w:t>
+            </w:r>
+          </w:p>
+        </w:tc>
+        <w:tc>
+          <w:tcPr>
+            <w:tcW w:w="2126" w:type="dxa"/>
+          </w:tcPr>
+          <w:p>
+            <w:r>
+              <w:rPr>
+                <w:rFonts w:ascii="Arial" w:hAnsi="Arial" w:cs="Arial"/>
+                <w:sz w:val="18"/>
+              </w:rPr>
+              <w:t xml:space="preserve">workflows/, seis archivos JSON</w:t>
+            </w:r>
+          </w:p>
+        </w:tc>
+        <w:tc>
+          <w:tcPr>
+            <w:tcW w:w="2126" w:type="dxa"/>
+          </w:tcPr>
+          <w:p>
+            <w:r>
+              <w:rPr>
+                <w:rFonts w:ascii="Arial" w:hAnsi="Arial" w:cs="Arial"/>
+                <w:sz w:val="18"/>
+              </w:rPr>
+              <w:t xml:space="preserve">Repositorio</w:t>
+            </w:r>
+          </w:p>
+        </w:tc>
+      </w:tr>
+      <w:tr>
+        <w:tc>
+          <w:tcPr>
+            <w:tcW w:w="2126" w:type="dxa"/>
+          </w:tcPr>
+          <w:p>
+            <w:r>
+              <w:rPr>
+                <w:rFonts w:ascii="Arial" w:hAnsi="Arial" w:cs="Arial"/>
+                <w:sz w:val="18"/>
+              </w:rPr>
+              <w:t xml:space="preserve">Protocolos previos al dato (§3.5)</w:t>
+            </w:r>
+          </w:p>
+        </w:tc>
+        <w:tc>
+          <w:tcPr>
+            <w:tcW w:w="2126" w:type="dxa"/>
+          </w:tcPr>
+          <w:p>
+            <w:r>
+              <w:rPr>
+                <w:rFonts w:ascii="Arial" w:hAnsi="Arial" w:cs="Arial"/>
+                <w:sz w:val="18"/>
+              </w:rPr>
+              <w:t xml:space="preserve">—</w:t>
+            </w:r>
+          </w:p>
+        </w:tc>
+        <w:tc>
+          <w:tcPr>
+            <w:tcW w:w="2126" w:type="dxa"/>
+          </w:tcPr>
+          <w:p>
+            <w:r>
+              <w:rPr>
+                <w:rFonts w:ascii="Arial" w:hAnsi="Arial" w:cs="Arial"/>
+                <w:sz w:val="18"/>
+              </w:rPr>
+              <w:t xml:space="preserve">PROTOCOLO-ampliacion.md, PROTOCOLO-OE2.md, Protocolo_TrackA2_Muestras.md, CONSENTIMIENTO.md</w:t>
+            </w:r>
+          </w:p>
+        </w:tc>
+        <w:tc>
+          <w:tcPr>
+            <w:tcW w:w="2126" w:type="dxa"/>
+          </w:tcPr>
+          <w:p>
+            <w:r>
+              <w:rPr>
+                <w:rFonts w:ascii="Arial" w:hAnsi="Arial" w:cs="Arial"/>
+                <w:sz w:val="18"/>
+              </w:rPr>
+              <w:t xml:space="preserve">Repositorio y abierto</w:t>
+            </w:r>
+          </w:p>
+        </w:tc>
+      </w:tr>
+      <w:tr>
+        <w:tc>
+          <w:tcPr>
+            <w:tcW w:w="2126" w:type="dxa"/>
+          </w:tcPr>
+          <w:p>
+            <w:r>
+              <w:rPr>
+                <w:rFonts w:ascii="Arial" w:hAnsi="Arial" w:cs="Arial"/>
+                <w:sz w:val="18"/>
+              </w:rPr>
+              <w:t xml:space="preserve">Lectura de las obras de 2024 a 2026 (§1.6.0)</w:t>
+            </w:r>
+          </w:p>
+        </w:tc>
+        <w:tc>
+          <w:tcPr>
+            <w:tcW w:w="2126" w:type="dxa"/>
+          </w:tcPr>
+          <w:p>
+            <w:r>
+              <w:rPr>
+                <w:rFonts w:ascii="Arial" w:hAnsi="Arial" w:cs="Arial"/>
+                <w:sz w:val="18"/>
+              </w:rPr>
+              <w:t xml:space="preserve">—</w:t>
+            </w:r>
+          </w:p>
+        </w:tc>
+        <w:tc>
+          <w:tcPr>
+            <w:tcW w:w="2126" w:type="dxa"/>
+          </w:tcPr>
+          <w:p>
+            <w:r>
+              <w:rPr>
+                <w:rFonts w:ascii="Arial" w:hAnsi="Arial" w:cs="Arial"/>
+                <w:sz w:val="18"/>
+              </w:rPr>
+              <w:t xml:space="preserve">Registros de lectura, uno por obra</w:t>
+            </w:r>
+          </w:p>
+        </w:tc>
+        <w:tc>
+          <w:tcPr>
+            <w:tcW w:w="2126" w:type="dxa"/>
+          </w:tcPr>
+          <w:p>
+            <w:r>
+              <w:rPr>
+                <w:rFonts w:ascii="Arial" w:hAnsi="Arial" w:cs="Arial"/>
+                <w:sz w:val="18"/>
+              </w:rPr>
+              <w:t xml:space="preserve">Repositorio</w:t>
+            </w:r>
+          </w:p>
+        </w:tc>
+      </w:tr>
+    </w:tbl>
+    <w:p>
+      <w:pPr/>
+      <w:r>
+        <w:rPr>
+          <w:b w:val="0"/>
+          <w:i/>
+        </w:rPr>
+        <w:t>Nota. Elaboración propia. Abierto y restringido son los dos registros de Zenodo del Anexo E.4, en su versión 2.0.1 y 2.0.0; repositorio, el del proyecto en GitHub. Un archivo de resultados lleva el sufijo _resultados, o _resultados_v1 cuando lo produjo el detector anterior a la corrección (Tabla 16).</w:t>
       </w:r>
     </w:p>
     <w:sectPr>

</xml_diff>

<commit_message>
docs(tesis): N-05, Capitulo 1 condensado de 4.485 a 3.345 palabras (pasada 185)
Sin tocar la pregunta rectora, el objetivo general, las cifras ni las 40 citas;
salen redundancias y salvedades de segundo orden que el documento ya trae en el
Anexo D, 2.4, 5.1.3, 6.1 y 8.1. Verificadores en verde.

Co-Authored-By: Claude Opus 5.5 <noreply@anthropic.com>
</commit_message>
<xml_diff>
--- a/avance/Tesis Postly Bontorno Hassan-1 v2.docx
+++ b/avance/Tesis Postly Bontorno Hassan-1 v2.docx
@@ -12210,7 +12210,7 @@
         <w:spacing w:after="240" w:line="276" w:lineRule="auto"/>
       </w:pPr>
       <w:r>
-        <w:t>La venta directa se transformó durante la última década con la digitalización del consumo y el comercio social. El modelo de las Consultoras de Belleza Independientes (CBI) operaba casi exclusivamente por contacto interpersonal, catálogo físico y demostración presencial. Hoy exige presencia digital, y las redes sociales —en particular Instagram y Facebook, de Meta— pasaron a ser el principal escaparate de venta, prospección y fidelización (Kaplan y Haenlein, 2010; Hajli, 2014).</w:t>
+        <w:t>La digitalización del consumo transformó la venta directa. El modelo de las Consultoras de Belleza Independientes (CBI), que operaba por contacto interpersonal, catálogo físico y demostración presencial, exige hoy presencia digital: Instagram y Facebook, de Meta, son su principal escaparate de venta, prospección y fidelización (Kaplan y Haenlein, 2010; Hajli, 2014).</w:t>
       </w:r>
     </w:p>
     <w:p>
@@ -12218,19 +12218,16 @@
         <w:spacing w:after="240" w:line="276" w:lineRule="auto"/>
       </w:pPr>
       <w:r>
-        <w:t xml:space="preserve">Esa transición dejó a muchas microemprendedoras en una posición paradójica: la herramienta que promete aliviar la carga operativa exige, para adoptarse, una competencia técnica que el sector no tiene. El mercado de Software como Servicio (SaaS) ofrece numerosas herramientas de gestión y programación de contenidos, pero con barreras de adopción. Las suscripciones erosionan el </w:t>
-      </w:r>
-      <w:r>
-        <w:lastRenderedPageBreak/>
-        <w:t>margen, las interfaces están diseñadas para agencias de marketing y la curva de aprendizaje excede lo que la usuaria promedio del sector puede asumir.</w:t>
-      </w:r>
+        <w:t>Esa transición dejó a muchas microemprendedoras en una posición paradójica. Las herramientas de Software como Servicio (SaaS) que prometen aliviar la carga operativa exigen una competencia técnica que el sector no tiene: sus suscripciones erosionan el margen, sus interfaces están pensadas para agencias de marketing y su curva de aprendizaje excede lo que la usuaria promedio puede asumir.</w:t>
+      </w:r>
+      <w:r/>
     </w:p>
     <w:p>
       <w:pPr>
         <w:spacing w:after="240" w:line="276" w:lineRule="auto"/>
       </w:pPr>
       <w:r>
-        <w:t>La consultora termina ejecutando un proceso artesanal y fragmentado. El diseño partió de reconocer que asume a la vez cuatro roles (§3.4.1): curadora de contenidos, que navega catálogos de activos oficiales; editora multimedia, que adapta resoluciones a los estándares de cada plataforma; redactora publicitaria; y responsable de cumplimiento normativo (compliance officer).</w:t>
+        <w:t>La consultora termina ejecutando un proceso artesanal y fragmentado en el que asume cuatro roles (§3.4.1): curadora de contenidos, editora multimedia, redactora publicitaria y responsable de cumplimiento normativo.</w:t>
       </w:r>
     </w:p>
     <w:p>
@@ -12238,7 +12235,7 @@
         <w:spacing w:after="240" w:line="276" w:lineRule="auto"/>
       </w:pPr>
       <w:r>
-        <w:t>Este último rol es el más sensible. Las normativas de marcas como Mary Kay restringen los mensajes comerciales: los que dan información suficiente para decidir una compra, como un precio, un descuento o una oferta, y los que invitan a comprar o a contactar. Los prohíben en publicaciones dirigidas al público general y los reservan a canales privados con clientas y clientas potenciales. La fuente lo funda en dos razones: los términos de uso de varias plataformas limitan el mensaje comercial en las páginas personales, y el consumidor responde mejor cuando el producto se comparte sin una solicitud comercial directa (Mary Kay Inc., s.f.; véase Anexo D). Cumplir esas reglas depende hoy sólo de la revisión visual, la memoria y el cuidado de la emprendedora. Y el trabajo manual consume tiempo que no vuelve al núcleo del negocio, el cierre de ventas y el liderazgo de equipos: cuánto es lo que mide el §6.1. En adelante, «mensaje comercial» es lo que la norma regula y «referencia monetaria», lo que el Módulo Centinela audita: un precio, un descuento o una oferta expresados, que es una parte de aquél (§2.4; §6.1.3).</w:t>
+        <w:t>Este último rol es el más sensible. Las pautas de Mary Kay reservan los mensajes comerciales a canales privados con clientas y clientas potenciales, y los prohíben en publicaciones dirigidas al público general (Mary Kay Inc., s.f.; Anexo D). Son comerciales los que dan información suficiente para decidir una compra, como un precio, un descuento o una oferta, y los que invitan a comprar o a contactar. Cumplirlas depende hoy sólo de la revisión, la memoria y el cuidado de la emprendedora, y el trabajo manual consume tiempo que no vuelve al cierre de ventas ni al liderazgo de equipos. En adelante, «mensaje comercial» es lo que la norma regula y «referencia monetaria» —un precio, un descuento o una oferta expresados—, la parte de aquél que audita el Módulo Centinela (§2.4).</w:t>
       </w:r>
     </w:p>
     <w:p>
@@ -12271,7 +12268,7 @@
         <w:spacing w:after="240" w:line="276" w:lineRule="auto"/>
       </w:pPr>
       <w:r>
-        <w:t>El problema es una ineficiencia operativa y un riesgo de incumplimiento normativo en la gestión de contenidos de la consultora. Desde la Gestión de Procesos de Negocio (BPM), las tareas manuales, fragmentadas y sin valor agregado cognitivo son una falla en el diseño del trabajo (Dumas et al., 2018). El análisis del flujo actual identificó tres deficiencias:</w:t>
+        <w:t>El problema es una ineficiencia operativa y un riesgo de incumplimiento normativo en la gestión de contenidos de la consultora. Desde la Gestión de Procesos de Negocio (BPM), las tareas manuales, fragmentadas y sin valor cognitivo son una falla de diseño del trabajo (Dumas et al., 2018). El análisis del flujo actual identificó tres deficiencias:</w:t>
       </w:r>
     </w:p>
     <w:p>
@@ -12285,7 +12282,7 @@
         <w:t>a) Elevado costo de oportunidad estratégico:</w:t>
       </w:r>
       <w:r>
-        <w:t xml:space="preserve"> el proceso manual involucra seleccionar imágenes, editarlas y redactar el pie de foto. Su tramo operativo —con el material ya disponible, hasta la publicación en ambas redes— se cronometró con ocho consultoras y arrojó un promedio de 9,3 minutos por publicación (§6.1): a razón de una publicación diaria, unas 4,7 horas mensuales. La curación y creación previa del contenido se suma a ese tiempo, pero este trabajo no la midió. Es tiempo que se resta del asesoramiento personalizado, el cierre de ventas y la expansión de la red de contactos para destinarlo a tareas mecánicas automatizables.</w:t>
+        <w:t xml:space="preserve"> el tramo operativo de una publicación —con el material ya disponible, hasta publicarla en ambas redes— se cronometró con ocho consultoras en 9,3 minutos de media (§6.1). Con una publicación diaria son unas 4,7 horas al mes, sin contar la curación previa, que no se midió. Es tiempo que se resta al asesoramiento, al cierre de ventas y a la expansión de la red.</w:t>
       </w:r>
     </w:p>
     <w:p>
@@ -12301,7 +12298,7 @@
         <w:t>b) Fricción tecnológica y disparidad estética:</w:t>
       </w:r>
       <w:r>
-        <w:t xml:space="preserve"> el capital de marca en plataformas visuales requiere homogeneidad estética y una narrativa coherente (Aaker, 1991), y la consultora promedio no tiene formación en diseño gráfico ni en comunicación publicitaria. Adaptar formatos —una imagen horizontal de catálogo a un posteo cuadrado o a una historia vertical— es técnicamente difícil, y a eso se suma el bloqueo al redactar textos a la vez informativos y vendedores. El resultado es una comunicación errática, que a juicio de los autores degrada la percepción de productos que la marca posiciona en la gama alta. Sobre el alcance no cabe afirmar nada: la literatura de visibilidad algorítmica documenta que las plataformas jerarquizan el contenido con criterios opacos (Bucher, 2012; Cotter, 2019), no que la estandarización estética sea uno de ellos.</w:t>
+        <w:t xml:space="preserve"> el capital de marca en plataformas visuales requiere homogeneidad estética y una narrativa coherente (Aaker, 1991), y la consultora promedio no tiene formación en diseño ni en redacción publicitaria. Adaptar una imagen de catálogo a cada formato es técnicamente difícil, y redactar textos a la vez informativos y vendedores la bloquea. El resultado es una comunicación errática, que a juicio de los autores degrada la percepción de la marca. Que además reduzca el alcance no puede afirmarse: las plataformas jerarquizan el contenido con criterios opacos (Bucher, 2012; Cotter, 2019).</w:t>
       </w:r>
     </w:p>
     <w:p>
@@ -12315,7 +12312,7 @@
         <w:t>c) Vulnerabilidad estructural ante normativas de cumplimiento (Compliance):</w:t>
       </w:r>
       <w:r>
-        <w:t xml:space="preserve"> es el punto que motiva el componente diferencial del sistema. Las políticas de compañías de venta directa como Mary Kay restringen la comunicación comercial, y este trabajo toma dos de sus reglas. Provienen de las Pautas, que son instrumentales al Acuerdo de Consultora y no el Acuerdo mismo (§2.4; Anexo D). La primera prohíbe comunicar mensajes comerciales fuera de un canal privado con clientas; el módulo audita de ellos la referencia monetaria —precio, descuento u oferta—, que es una parte de la regla (§6.1.3). La segunda obliga a usar la nomenclatura autorizada ("Consultora de Belleza Independiente Mary Kay") en el nombre de la página de negocio y al identificarse en sitios patrocinados por la Compañía (Mary Kay Inc., s.f.). La norma no exige, en cambio, firmar cada publicación del feed propio. Hoy el cumplimiento recae en la supervisión humana, falible bajo fatiga o estrés (Reason, 1990): omitir borrar un precio visible en una placa promocional deja a la consultora en incumplimiento. El §2.4 acota el alcance de esa exposición: la fuente no fija sanción para el mensaje comercial en canal público, de modo que lo comprometido es el cumplimiento y no una consecuencia tipificada. Lo que falta es un filtro de auditoría previo a que el contenido llegue a la audiencia.</w:t>
+        <w:t xml:space="preserve"> es el punto que motiva el componente diferencial del sistema. Este trabajo toma dos reglas de las Pautas de Mary Kay, que son instrumentales al Acuerdo de Consultora (§2.4; Anexo D). La primera prohíbe los mensajes comerciales fuera de un canal privado con clientas; el módulo audita de ellos la referencia monetaria, que es una parte de la regla (§6.1.3). La segunda obliga a usar la nomenclatura autorizada («Consultora de Belleza Independiente Mary Kay») en el nombre de la página de negocio (Mary Kay Inc., s.f.); la norma no exige firmar cada publicación del feed. El cumplimiento recae hoy en una supervisión humana falible bajo fatiga (Reason, 1990): basta no borrar el precio de una placa promocional. El §2.4 acota el alcance de esa exposición: la fuente no fija sanción para el mensaje comercial en canal público, de modo que lo comprometido es el cumplimiento y no una consecuencia tipificada. Lo que falta es un filtro de auditoría previo a la publicación.</w:t>
       </w:r>
     </w:p>
     <w:p>
@@ -12367,7 +12364,7 @@
         <w:spacing w:after="240" w:line="276" w:lineRule="auto"/>
       </w:pPr>
       <w:r>
-        <w:t>La literatura sobre el valor de negocio de las tecnologías de la información sostiene que una solución genera ventaja cuando está alineada con los procesos de la organización (Melville et al., 2004). La pertinencia de Postly se funda en tres dimensiones:</w:t>
+        <w:t>Una solución de tecnologías de la información genera ventaja cuando está alineada con los procesos de la organización (Melville et al., 2004). La pertinencia de Postly se funda en tres dimensiones:</w:t>
       </w:r>
     </w:p>
     <w:p>
@@ -12382,7 +12379,7 @@
         <w:t>a) Dimensión Operativa y de Productividad:</w:t>
       </w:r>
       <w:r>
-        <w:t xml:space="preserve"> el sistema ataca el costo de oportunidad de la consultora, que invierte un tiempo desproporcionado en tareas repetitivas como adaptar formatos y redactar textos desde cero. Automatizarlas libera capacidad para actividades de mayor valor, como el cierre de ventas y el seguimiento de clientes (Davenport y Kirby, 2016). Reducir la fricción abarata además sostener una cadencia de publicación. Que esa cadencia se traduzca en mayor alcance es una creencia extendida y no algo que este trabajo mida: Bucher (2012) documenta la presión que la opacidad algorítmica ejerce sobre las prácticas de publicación, no una relación entre frecuencia y visibilidad.</w:t>
+        <w:t xml:space="preserve"> el sistema ataca el tiempo que la consultora invierte en tareas repetitivas, como adaptar formatos y redactar desde cero, y lo libera para el cierre de ventas y el seguimiento de clientes (Davenport y Kirby, 2016). Abarata además sostener una cadencia de publicación. Que esa cadencia aumente el alcance es una creencia extendida que este trabajo no mide: lo documentado es la presión que la opacidad algorítmica ejerce sobre las prácticas de publicación (Bucher, 2012).</w:t>
       </w:r>
     </w:p>
     <w:p>
@@ -12396,7 +12393,7 @@
         <w:t>b) Dimensión Técnica y de Innovación:</w:t>
       </w:r>
       <w:r>
-        <w:t xml:space="preserve"> el proyecto es un desafío de integración. Orquesta servicios asincrónicos de terceros (Newman, 2015): una interfaz conversacional en Telegram, un motor de flujos (n8n), procesamiento multimedia de bajo nivel (FFmpeg) y un modelo multimodal (Gemini 2.5 Flash). Eso describe su integración hacia afuera y no su despliegue: puertas adentro es un monolito modular y no una arquitectura de microservicios (§5.1.3). Incorpora además un bucle de retroalimentación que recolecta métricas de desempeño desde las APIs y las muestra en la agenda de la usuaria. Es la base de una capa de recomendación que adapte el comportamiento futuro al desempeño histórico, y que queda como trabajo futuro (§8.1).</w:t>
+        <w:t xml:space="preserve"> el proyecto es un desafío de integración. Orquesta servicios asincrónicos de terceros (Newman, 2015) —Telegram, el motor de flujos n8n, FFmpeg y el modelo multimodal Gemini 2.5 Flash— dentro de un monolito modular, no de una arquitectura de microservicios (§5.1.3). Incorpora además un bucle de retroalimentación que recoge las métricas de cada publicación y las muestra en la agenda; la capa de recomendación que se apoyaría en él queda como trabajo futuro (§8.1).</w:t>
       </w:r>
     </w:p>
     <w:p>
@@ -12410,7 +12407,7 @@
         <w:t>c) Dimensión de Cumplimiento (Compliance) e Identidad de Marca:</w:t>
       </w:r>
       <w:r>
-        <w:t xml:space="preserve"> en la venta directa, la imagen de marca es un activo que la compañía regula mediante sus pautas. Postly actúa como un filtro de auditoría previo a la publicación y reduce la exposición al incumplimiento vinculada al error humano (Tarantino, 2008): detecta y bloquea precios en publicaciones públicas y agrega la nomenclatura de identidad corporativa en cada publicación que genera. El alcance de esa salvaguarda es acotado: cubre la referencia monetaria y no la regla de mensaje comercial en toda su extensión (§6.1.3; Capítulo 7).</w:t>
+        <w:t xml:space="preserve"> en la venta directa, la imagen de marca es un activo que la compañía regula con sus pautas. Postly es un filtro de auditoría previo a la publicación que reduce la exposición al incumplimiento por error humano (Tarantino, 2008): bloquea los precios en publicaciones públicas y agrega la nomenclatura corporativa. Cubre la referencia monetaria y no la regla de mensaje comercial completa (§6.1.3).</w:t>
       </w:r>
     </w:p>
     <w:p>
@@ -12446,7 +12443,7 @@
         <w:spacing w:before="280" w:after="280" w:line="240" w:lineRule="auto"/>
       </w:pPr>
       <w:r>
-        <w:t>Los objetivos responden a la pregunta de investigación y son la base de la especificación de requerimientos (Sommerville, 2015). Se organizan en un objetivo general y cinco específicos, que delimitan los módulos del sistema.</w:t>
+        <w:t>Los objetivos responden a la pregunta de investigación y son la base de la especificación de requerimientos (Sommerville, 2015): un objetivo general y cinco específicos, que delimitan los módulos del sistema.</w:t>
       </w:r>
     </w:p>
     <w:p>
@@ -12505,7 +12502,7 @@
         <w:t>1. Desarrollar e implementar una Interfaz de Usuario Conversacional (CUI) orientada a la accesibilidad:</w:t>
       </w:r>
       <w:r>
-        <w:t xml:space="preserve"> un bot de Telegram que acerque la automatización a una usuaria sin perfil técnico y la abstraiga de la complejidad de la Graph API de Meta. Las interfaces conversacionales se proponen como una vía para reducir la carga cognitiva de los usuarios no técnicos (McTear et al., 2016). El bot lo persigue con teclados dinámicos (Inline Keyboards), menús contextuales y diálogos guiados paso a paso.</w:t>
+        <w:t xml:space="preserve"> un bot de Telegram que acerque la automatización a una usuaria sin perfil técnico, con teclados dinámicos, menús contextuales y diálogos guiados, y la abstraiga de la Graph API de Meta. Las interfaces conversacionales se proponen como una vía para reducir la carga cognitiva de los usuarios no técnicos (McTear et al., 2016).</w:t>
       </w:r>
     </w:p>
     <w:p>
@@ -12524,7 +12521,7 @@
         <w:t>2. Integrar y configurar modelos de Inteligencia Artificial Multimodal para la curaduría y generación de contenido:</w:t>
       </w:r>
       <w:r>
-        <w:t xml:space="preserve"> integrar por API el modelo Google Gemini 2.5 Flash para razonar sobre las fotografías de los productos, con instrucciones de sistema diseñadas para cada tarea. El sistema debe analizar visualmente los productos, ordenar carruseles de varias imágenes con un criterio narrativo y proponer copys en tres tonos predefinidos (Informativo, Vendedor y Divertido), para que la usuaria elija uno y lo publique, editándolo si hace falta.</w:t>
+        <w:t xml:space="preserve"> integrar por API el modelo Gemini 2.5 Flash, con instrucciones de sistema por tarea. El sistema analiza las fotografías de los productos, ordena carruseles con un criterio narrativo y propone copys en tres tonos (Informativo, Vendedor y Divertido) entre los que la usuaria elige, edita si hace falta y publica.</w:t>
       </w:r>
     </w:p>
     <w:p>
@@ -12542,12 +12539,9 @@
         <w:t>3. Construir y desplegar un Módulo de Auditoría y Cumplimiento Normativo (Compliance) proactivo:</w:t>
       </w:r>
       <w:r>
-        <w:t xml:space="preserve"> una capa que examine el texto y las imágenes antes de enviarlos a las APIs de publicación de Meta. Combina expresiones regulares deterministas con visión artificial, dentro de lo que Arner et al. (2017) llaman RegTech, para detectar precios, descuentos o referencias monetarias en publicaciones públicas e interrumpir la publicación que los contenga (Anexo D). Concatena además por código la firma ("Consultora de Belleza Independiente Mary </w:t>
-      </w:r>
-      <w:r>
-        <w:lastRenderedPageBreak/>
-        <w:t>Kay") en cada publicación que genera, que es una política del sistema y no una exigencia de la norma para el feed propio.</w:t>
-      </w:r>
+        <w:t xml:space="preserve"> una capa que examine el texto y las imágenes antes de enviarlos a Meta y combine expresiones regulares deterministas con visión artificial —lo que Arner et al. (2017) llaman RegTech— para detectar precios, descuentos o referencias monetarias e interrumpir la publicación que los contenga (Anexo D). Concatena además la firma («Consultora de Belleza Independiente Mary Kay») en cada publicación, como política del sistema y no como exigencia de la norma.</w:t>
+      </w:r>
+      <w:r/>
     </w:p>
     <w:p>
       <w:pPr>
@@ -12564,7 +12558,7 @@
         <w:t>4. Diseñar una arquitectura de persistencia de datos y establecer un Bucle de Retroalimentación (Feedback Loop) analítico:</w:t>
       </w:r>
       <w:r>
-        <w:t xml:space="preserve"> persistir los datos en Google Sheets, que la usuaria puede revisar sin saber SQL, y extraer periódicamente por cron las métricas de interacción (likes y comentarios) desde las redes. Ese repositorio es la base de una futura capa predictiva que sugiera encuadres y franjas horarias, en línea con la toma de decisiones basada en datos (Provost y Fawcett, 2013).</w:t>
+        <w:t xml:space="preserve"> persistir los datos en Google Sheets, que la usuaria puede revisar sin saber SQL. Las métricas de interacción (likes y comentarios) se extraen periódicamente, como base de una futura capa predictiva de encuadres y franjas horarias (Provost y Fawcett, 2013).</w:t>
       </w:r>
     </w:p>
     <w:p>
@@ -12582,7 +12576,7 @@
         <w:t>5. Establecer un flujo de autenticación, autorización y enrutamiento seguro basado en OAuth 2.0:</w:t>
       </w:r>
       <w:r>
-        <w:t xml:space="preserve"> implementar la delegación de acceso OAuth 2.0 (Hardt, 2012) para toda comunicación con la Graph API de Meta. El sistema obtiene tokens de larga duración por canal cifrado (TLS) y los guarda cifrados en reposo (AES-256-GCM), sin que la usuaria exponga nunca su contraseña. El principio de menor privilegio contribuye a la protección de datos personales y reduce la exposición a la sustracción o la fuerza bruta de credenciales.</w:t>
+        <w:t xml:space="preserve"> delegar por OAuth 2.0 (Hardt, 2012) el acceso a la Graph API de Meta. Los tokens de larga duración se obtienen por TLS y se guardan cifrados con AES-256-GCM, sin que la usuaria exponga nunca su contraseña y bajo el principio de menor privilegio.</w:t>
       </w:r>
     </w:p>
     <w:p>
@@ -12620,7 +12614,7 @@
         <w:spacing w:before="280" w:after="280" w:line="240" w:lineRule="auto"/>
       </w:pPr>
       <w:r>
-        <w:t>Delimitar las fronteras del sistema previene el desbordamiento de requerimientos (Scope Creep) y protege los plazos (Project Management Institute, 2021). Esta sección fija qué capacidades contiene el MVP y qué restricciones actúan como salvaguardas del diseño (Bass et al., 2012).</w:t>
+        <w:t>Delimitar las fronteras del sistema previene el desbordamiento de requerimientos (Project Management Institute, 2021). Esta sección fija qué contiene el MVP y qué restricciones actúan como salvaguardas del diseño (Bass et al., 2012).</w:t>
       </w:r>
     </w:p>
     <w:p>
@@ -12640,7 +12634,7 @@
         <w:spacing w:after="240" w:line="276" w:lineRule="auto"/>
       </w:pPr>
       <w:r>
-        <w:t>El alcance comprende el diseño, la programación, el despliegue y la validación funcional de extremo a extremo de una solución que cubre el ciclo de vida de una publicación: desde que la usuaria la concibe hasta su distribución y el seguimiento de sus métricas. Se estructura en los siguientes módulos:</w:t>
+        <w:t>El alcance comprende el diseño, la programación, el despliegue y la validación de extremo a extremo de una solución que cubre el ciclo de vida de una publicación, desde que la usuaria la envía hasta el seguimiento de sus métricas, en los siguientes módulos:</w:t>
       </w:r>
     </w:p>
     <w:p>
@@ -12659,7 +12653,7 @@
         <w:t>Desarrollo de Interfaz Conversacional (Capa Frontend):</w:t>
       </w:r>
       <w:r>
-        <w:t xml:space="preserve"> un bot de Telegram con teclados dinámicos (Inline Keyboards), menús anidados y confirmaciones ante acciones irreversibles, capaz de recibir y validar comandos de texto, imágenes y videos enviados desde el teléfono de la usuaria.</w:t>
+        <w:t xml:space="preserve"> un bot de Telegram con teclados dinámicos, menús anidados y confirmaciones ante acciones irreversibles, que recibe texto, imágenes y videos desde el teléfono de la usuaria.</w:t>
       </w:r>
     </w:p>
     <w:p>
@@ -12678,12 +12672,9 @@
         <w:t>Orquestación de Lógica de Negocio (Capa Backend):</w:t>
       </w:r>
       <w:r>
-        <w:t xml:space="preserve"> flujos de trabajo sobre el motor low-code n8n, con webhooks que procesan de forma asincrónica las peticiones de Telegram, lógica condicional, manejo </w:t>
-      </w:r>
-      <w:r>
-        <w:lastRenderedPageBreak/>
-        <w:t>de excepciones —como la caída de una API— y coordinación entre los servicios externos.</w:t>
-      </w:r>
+        <w:t xml:space="preserve"> flujos de trabajo en el motor low-code n8n, con webhooks asincrónicos, lógica condicional y manejo de excepciones ante la caída de un servicio externo.</w:t>
+      </w:r>
+      <w:r/>
     </w:p>
     <w:p>
       <w:pPr>
@@ -12700,7 +12691,7 @@
         <w:t>Integración de Inteligencia Artificial Multimodal:</w:t>
       </w:r>
       <w:r>
-        <w:t xml:space="preserve"> conexión autenticada con Google Gemini 2.5 Flash (Google AI for Developers, s.f.), limitada a tres funciones. La primera es el análisis visual y el ordenamiento de conjuntos de hasta 10 imágenes para carruseles. La segunda, la generación de copys en tres tonos predefinidos (Informativo, Vendedor y Divertido). La tercera, la detección de precios y promociones incrustados en los píxeles, que es la capa visual del Módulo Centinela (HU8) y el componente que el Capítulo 6 más mide.</w:t>
+        <w:t xml:space="preserve"> conexión con Google Gemini 2.5 Flash (Google AI for Developers, s.f.) para tres funciones: ordenar carruseles de hasta 10 imágenes, generar copys en tres tonos y detectar precios incrustados en los píxeles, que es la capa visual del Módulo Centinela (HU8).</w:t>
       </w:r>
     </w:p>
     <w:p>
@@ -12724,7 +12715,7 @@
           <w:i/>
           <w:iCs/>
         </w:rPr>
-        <w:t xml:space="preserve"> un subsistema de filtrado que se interpone, sin excepción condicional, en el 100% de las transacciones de contenido. Interponerse en todas no es detectar en todas: el acierto de cada canal lo mide el §6.1. Cumple dos funciones. Una es detectar referencias a precios: el canal de texto lo hace con seis expresiones regulares deterministas, sin análisis semántico, y el de imagen lo delega en el modelo multimodal, con el modo de falla que declara el §4.3.1. La otra es insertar la nomenclatura de identidad corporativa ("Consultora de Belleza Independiente Mary Kay") al pie de cada publicación.</w:t>
+        <w:t xml:space="preserve"> un filtro que se interpone en todas las publicaciones, sin excepción condicional; interponerse en todas no es detectar en todas, y el acierto lo mide el §6.1. Detecta referencias a precios con seis expresiones regulares en el texto y con el modelo multimodal en la imagen (§4.3.1), e inserta la nomenclatura corporativa al pie.</w:t>
       </w:r>
     </w:p>
     <w:p>
@@ -12742,7 +12733,7 @@
         <w:t>Persistencia de Datos y Analítica Básica (capa de persistencia):</w:t>
       </w:r>
       <w:r>
-        <w:t xml:space="preserve"> almacenamiento tabular en Google Sheets para el historial de publicaciones, el estado de cada una en la agenda —Pendiente, Programado, Publicado o Fallido— y las métricas públicas de interacción (likes y comentarios), que se muestran en Mi Agenda. No alimentan ningún motor de sugerencias: esa capa no se implementó, y el §8.1 y el §8.2 la declaran como trabajo futuro.</w:t>
+        <w:t xml:space="preserve"> almacenamiento tabular en Google Sheets del historial de publicaciones, su estado en la agenda —Pendiente, Programado, Publicado o Fallido— y sus likes y comentarios, que se muestran en Mi Agenda. La capa de sugerencias que se apoyaría en ellos no se implementó (§8.1).</w:t>
       </w:r>
     </w:p>
     <w:p>
@@ -12780,7 +12771,7 @@
     </w:p>
     <w:p>
       <w:r>
-        <w:t>Durante la validación, el alcance se amplió con cuatro capacidades no planificadas (Anexos A y B). Son la publicación también en la página de Facebook vinculada, para imagen, carrusel y video; la sincronización de publicaciones existentes desde Instagram al abrir la agenda; las métricas de ambas redes en una misma tarjeta; y un mecanismo que evita publicaciones duplicadas. El ecosistema de destino (Meta Platforms, Inc.) no cambió, de modo que la ampliación no contradice la restricción del §1.5.2.</w:t>
+        <w:t>Durante la validación se agregaron cuatro capacidades no planificadas (Anexos A y B): la publicación también en Facebook, la sincronización de publicaciones desde Instagram, las métricas de ambas redes en una misma tarjeta y la prevención de publicaciones duplicadas. Ninguna sale del ecosistema de Meta (§1.5.2).</w:t>
       </w:r>
     </w:p>
     <w:p>
@@ -12827,7 +12818,7 @@
         <w:t>Restricción de Ecosistema de Redes Sociales:</w:t>
       </w:r>
       <w:r>
-        <w:t xml:space="preserve"> Postly publica sólo en el ecosistema de Meta: perfiles comerciales de Instagram y páginas de Facebook. Quedan fuera TikTok, LinkedIn o X. La decisión estabiliza la autenticación en un único protocolo (Graph API) y evita fragmentar la arquitectura de datos en la fase inicial.</w:t>
+        <w:t xml:space="preserve"> Postly publica sólo en perfiles comerciales de Instagram y páginas de Facebook; quedan fuera TikTok, LinkedIn o X. Así la autenticación usa un único protocolo (Graph API).</w:t>
       </w:r>
     </w:p>
     <w:p>
@@ -12845,7 +12836,7 @@
         <w:t>Complejidad y Tratamiento Multimedia:</w:t>
       </w:r>
       <w:r>
-        <w:t xml:space="preserve"> Postly no es un editor de video. No hace posproducción —corrección de color, audio generado por IA, edición o corte de clips— más allá del recorte asistido de HU13. Para preservar la CPU del servidor y evitar timeouts en los webhooks, normaliza todo video a la relación vertical 9:16, y cuando dura más de 60 segundos pide confirmación para recortarlo a ese límite (véase HU13, §4.1.5, y Anexo B.9). La edición creativa queda a cargo de la usuaria, antes de usar el bot.</w:t>
+        <w:t xml:space="preserve"> Postly no es un editor de video: no hace posproducción más allá del recorte asistido de HU13. Normaliza todo video a 9:16 y, si dura más de 60 segundos, pide confirmación para recortarlo (Anexo B.9). La edición creativa queda a cargo de la usuaria.</w:t>
       </w:r>
     </w:p>
     <w:p>
@@ -12893,7 +12884,7 @@
           <w:i/>
           <w:iCs/>
         </w:rPr>
-        <w:t xml:space="preserve"> el sistema es de salida (Outbound): no procesa, responde, modera ni notifica comentarios, menciones ni mensajes directos de clientes. Ese rol, propio de un CRM, requeriría una IA conversacional y un manejo de sesiones muy distintos de los de esta arquitectura de publicación.</w:t>
+        <w:t xml:space="preserve"> el sistema es de salida (Outbound): no procesa ni responde comentarios, menciones o mensajes directos, que exigirían un CRM con una IA conversacional y un manejo de sesiones distintos.</w:t>
       </w:r>
     </w:p>
     <w:p>
@@ -12911,7 +12902,7 @@
         <w:t>Dependencia de Infraestructura de Terceros:</w:t>
       </w:r>
       <w:r>
-        <w:t xml:space="preserve"> la disponibilidad de Postly depende de Telegram, del servidor que aloja n8n, de Google Cloud (Gemini y Sheets) y de Meta. Un cambio no anunciado en sus políticas, una versión obsoleta o una caída global afecta directamente al sistema, y es un riesgo externo fuera del control del equipo.</w:t>
+        <w:t xml:space="preserve"> la disponibilidad de Postly depende de Telegram, del servidor que aloja n8n, de Google (Gemini y Sheets) y de Meta: un cambio de política o una caída de cualquiera de ellos lo afecta, fuera del control del equipo.</w:t>
       </w:r>
     </w:p>
     <w:p/>
@@ -12950,7 +12941,7 @@
         <w:spacing w:after="240" w:line="276" w:lineRule="auto"/>
       </w:pPr>
       <w:r>
-        <w:t>Postly se inscribe en un mercado saturado de soluciones de gestión digital, y delimitar su originalidad exige revisar críticamente las herramientas existentes (Hevner et al., 2004). Se dividen en dos categorías: los Sistemas de Gestión de Redes Sociales (SMMS) y las Plataformas de Integración como Servicio (iPaaS). Las dos son potentes en su dominio y presentan deficiencias de fondo para consultoras reguladas por normas corporativas.</w:t>
+        <w:t>Postly se inscribe en un mercado saturado de soluciones de gestión digital, y delimitar su originalidad exige revisar las existentes (Hevner et al., 2004). Son de dos categorías, los Sistemas de Gestión de Redes Sociales (SMMS) y las Plataformas de Integración como Servicio (iPaaS), potentes en su dominio y con deficiencias de fondo para consultoras reguladas por normas corporativas.</w:t>
       </w:r>
     </w:p>
     <w:p>
@@ -12972,41 +12963,35 @@
     </w:p>
     <w:p>
       <w:r>
-        <w:t>Cómo se seleccionó esta literatura determina qué puede concluirse de ella. La búsqueda se hizo en Google Scholar y en las bibliotecas digitales de ACM y arXiv, con fecha de corte en septiembre de 2026, sobre las expresiones «LLM agent orchestration», «multi-agent LLM framework», «algorithmic content moderation» y «compliance automation». Se incluyeron obras de 2024 y 2025 con revisión por pares, más un preprint que se declara como tal en el listado, y se las retuvo por pertinencia temática juzgada por los autores sobre el título y el resumen. No hubo protocolo de tamizado en dos fases, ni registro de los descartes, ni un segundo revisor. No es, por lo tanto, una revisión sistemática: es un relevamiento acotado, y las comparaciones que este apartado hace deben leerse con ese alcance.</w:t>
-      </w:r>
-    </w:p>
-    <w:p>
-      <w:r>
-        <w:t>Aparte de ese relevamiento acotado, entre el 23 y el 25 de septiembre de 2026 se hizo una revisión más amplia, sin su restricción a 2024 y 2025. Consultó Crossref en veinte revistas arbitradas sobre ocho ejes del vacío que este trabajo declara y reunió 596 candidatos. El tamizado por título y resumen descartó 462 y dejó 85 para incluir. Ese tamizado no exigió lectura completa, y los editores bloquean la descarga automatizada de las obras de acceso abierto, de modo que la lectura completa se hizo a mano y sólo sobre las más cercanas al vacío. Los 34 candidatos sin acceso abierto no se intentaron, porque exigirían un acceso institucional que este trabajo no tiene.</w:t>
-      </w:r>
-    </w:p>
-    <w:p>
-      <w:r>
-        <w:t xml:space="preserve">Se priorizaron once de esos candidatos por su cercanía al vacío que el trabajo declara —verificar, antes de publicar, que un contenido cumpla una norma— y se los leyó a texto completo, descargados a mano. Nueve estaban efectivamente accesibles; los otros dos, pese a figurar como de acceso abierto, sólo se ofrecían con suscripción. Ninguno de los nueve es un antecedente directo de lo que Postly hace, y los más próximos quedan cada uno a un paso. TORA (Wang et al., 2026) incorpora reglas explícitas de una comunidad a la </w:t>
-      </w:r>
-      <w:r>
-        <w:lastRenderedPageBreak/>
-        <w:t>moderación automática con modelos de lenguaje, pero la ejerce la plataforma y se evaluó fuera de línea, sobre publicaciones ya moderadas. Warner et al. (2025) estudian la moderación proactiva en el momento de redactar, del lado de quien publica, como el Módulo Centinela, pero sobre toxicidad y no sobre las normas comerciales de una marca. Das et al. (2026) y Barrientos et al. (2026) verifican cumplimiento normativo con modelos de lenguaje —el segundo, combinados con reglas deterministas—, pero sobre requisitos de software y procesos de negocio, en la etapa de diseño. El vacío que declara el §1.6.3 queda así respaldado por lectura, y no sólo por la ausencia de resultados de la búsqueda.</w:t>
-      </w:r>
-    </w:p>
-    <w:p>
-      <w:r>
-        <w:t>La lectura completa se extendió a la bibliografía reciente: de las 29 obras de 2024 a 2026 que este trabajo cita, se leyeron completas veintiséis, con un registro de lectura por obra (Anexo E.4). Las tres restantes —Liu et al. (2024), Larsen et al. (2025) y Storey et al. (2025)— están detrás de un muro de pago y no se consiguieron: de Liu y de Storey se conoce el resumen, y de Larsen, el título, y este trabajo no les apoya nada más que eso.</w:t>
-      </w:r>
-    </w:p>
-    <w:p>
-      <w:r>
-        <w:t>Frameworks como MetaGPT (Hong et al., 2024), que codifica procedimientos operativos estandarizados para coordinar agentes especializados, o AutoAgents (Chen et al., 2024), que los genera y coordina según la tarea, representan el estado del arte en sistemas multiagente basados en modelos de lenguaje. Postly no es un sistema multiagente: es orquestación de bajo código con un solo punto de inferencia (Gemini 2.5 Flash), invocado en puntos discretos de un workflow determinista de n8n (§5.1). Eso simplifica su depuración y su costo, a cambio de la flexibilidad adaptativa de los sistemas multiagente. Yao et al. (2025), en su survey de MLLM agénticos, formalizan un patrón cercano al de Postly: un modelo único invocado en varias etapas con roles distintos, encadenadas por un orquestador externo (AgentMLLM = f_T ∘ … ∘ f_1). No lo presentan, sin embargo, como una tensión de diseño frente a los sistemas multiagente; ese punto lo agrega este trabajo. El survey de Wang et al. (2024) organiza el campo en torno a la construcción de los agentes, sus aplicaciones y su evaluación; en la construcción, Postly adopta la variante más simple y auditable. En marketing, Grewal et al. (2025) sistematizan cómo la IA generativa redefine la creación de contenido y la relación con el cliente, el movimiento en el que se inscribe este trabajo.</w:t>
-      </w:r>
-    </w:p>
-    <w:p>
-      <w:r>
-        <w:t xml:space="preserve">En el plano del Módulo Centinela, la literatura sobre moderación algorítmica es más antigua y aporta un hallazgo pertinente. Gómez et al. (2024) muestran que </w:t>
-      </w:r>
-      <w:r>
-        <w:lastRenderedPageBreak/>
-        <w:t>hay decisiones de entrenamiento que no afectan la exactitud promedio de un clasificador de contenido pero sí determinan qué casos concretos clasifica mal. En un sentido acotado vale para este trabajo: el desempeño agregado de un detector no dice qué casos deja pasar, que es lo que el análisis de valores límite del §6.1 expone caso por caso. La analogía no va más lejos, porque esa arbitrariedad se da entre modelos entrenados y el canal textual de Postly es un conjunto de reglas léxicas. Sobre los modelos de lenguaje como clasificadores —lo que el §8.2 recomienda para reemplazar esa cascada—, Kumar et al. (2024) los evalúan contra reglas de moderación reales de comunidades de Reddit, con un desempeño útil pero dispar entre comunidades. Franco et al. (2025) describen cómo integrarlos a un sistema de moderación existente sin sustituirlo. Las dos obras son pertinentes a una decisión que este trabajo deja planteada y no tomada.</w:t>
-      </w:r>
+        <w:t>La búsqueda se hizo en Google Scholar, ACM y arXiv, con corte en septiembre de 2026, sobre «LLM agent orchestration», «multi-agent LLM framework», «algorithmic content moderation» y «compliance automation». Se incluyeron obras de 2024 y 2025 con revisión por pares, más un preprint declarado como tal, retenidas por pertinencia temática sobre título y resumen, sin tamizado en dos fases, registro de descartes ni segundo revisor. Es un relevamiento acotado, no una revisión sistemática.</w:t>
+      </w:r>
+    </w:p>
+    <w:p>
+      <w:r>
+        <w:t>Entre el 23 y el 25 de septiembre de 2026 se hizo además una revisión más amplia. Crossref, en veinte revistas arbitradas y sobre ocho ejes del vacío declarado, reunió 596 candidatos, y el tamizado por título y resumen descartó 462 y dejó 85 para incluir. Los editores bloquean la descarga automatizada, de modo que la lectura completa se hizo a mano y sólo sobre los más cercanos al vacío; los 34 sin acceso abierto no se intentaron.</w:t>
+      </w:r>
+    </w:p>
+    <w:p>
+      <w:r>
+        <w:t>Once de esos candidatos, los más cercanos al vacío —verificar, antes de publicar, que un contenido cumpla una norma—, se leyeron completos; nueve estaban accesibles. Ninguno es un antecedente directo de Postly. TORA (Wang et al., 2026) incorpora reglas de una comunidad a la moderación con modelos de lenguaje, pero la ejerce la plataforma y fuera de línea. Warner et al. (2025) estudian la moderación proactiva del lado de quien publica, como el Módulo Centinela, pero sobre toxicidad. Das et al. (2026) y Barrientos et al. (2026) verifican cumplimiento normativo con modelos de lenguaje —el segundo, combinados con reglas deterministas—, pero sobre requisitos de software y procesos de negocio. El vacío del §1.6.3 queda así respaldado por lectura y no sólo por la ausencia de resultados.</w:t>
+      </w:r>
+      <w:r/>
+    </w:p>
+    <w:p>
+      <w:r>
+        <w:t>De las 29 obras de 2024 a 2026 que este trabajo cita, se leyeron completas veintiséis (Tabla 17). Liu et al. (2024), Larsen et al. (2025) y Storey et al. (2025) están detrás de un muro de pago: se conoce su resumen o su título, y este trabajo no les apoya más que eso.</w:t>
+      </w:r>
+    </w:p>
+    <w:p>
+      <w:r>
+        <w:t>MetaGPT (Hong et al., 2024), que codifica procedimientos estandarizados para coordinar agentes especializados, y AutoAgents (Chen et al., 2024), que los genera según la tarea, representan el estado del arte en sistemas multiagente. Postly no lo es: invoca un único modelo (Gemini 2.5 Flash) en puntos discretos de un workflow determinista (§5.1), lo que simplifica su depuración y su costo a cambio de flexibilidad. Yao et al. (2025) formalizan ese patrón —un modelo invocado en varias etapas encadenadas por un orquestador externo—, aunque no lo presentan como alternativa a los sistemas multiagente, y Wang et al. (2024) organizan el campo en torno a la construcción, las aplicaciones y la evaluación de los agentes. En marketing, Grewal et al. (2025) sistematizan cómo la IA generativa redefine la creación de contenido, el movimiento en el que se inscribe este trabajo.</w:t>
+      </w:r>
+    </w:p>
+    <w:p>
+      <w:r>
+        <w:t>En el plano del Módulo Centinela, Gómez et al. (2024) muestran que decisiones de entrenamiento que no afectan la exactitud promedio de un clasificador sí determinan qué casos clasifica mal. El desempeño agregado no dice qué casos deja pasar un detector, que es lo que expone el análisis de valores límite del §6.1, aunque el canal textual de Postly sea un conjunto de reglas y no un modelo entrenado. Sobre los modelos de lenguaje como clasificadores, que el §8.2 recomienda en reemplazo de esas reglas, Kumar et al. (2024) los evalúan contra reglas de moderación de comunidades de Reddit, con un desempeño útil pero dispar, y Franco et al. (2025) describen cómo integrarlos a un sistema existente.</w:t>
+      </w:r>
+      <w:r/>
     </w:p>
     <w:p>
       <w:pPr>
@@ -13028,7 +13013,7 @@
         <w:spacing w:after="240" w:line="276" w:lineRule="auto"/>
       </w:pPr>
       <w:r>
-        <w:t>La primera categoría abarca plataformas comerciales consolidadas como Hootsuite, Buffer, Later y Metricool. Estas herramientas han democratizado la programación diferida de publicaciones y la centralización de métricas analíticas. Sin embargo, desde la perspectiva del microemprendimiento de venta directa, presentan tres limitaciones.</w:t>
+        <w:t>La primera categoría abarca plataformas como Hootsuite, Buffer, Later y Metricool, que democratizaron la programación diferida y la centralización de métricas. Para el microemprendimiento de venta directa presentan tres limitaciones.</w:t>
       </w:r>
     </w:p>
     <w:p>
@@ -13036,7 +13021,7 @@
         <w:spacing w:after="240" w:line="276" w:lineRule="auto"/>
       </w:pPr>
       <w:r>
-        <w:t>Su interfaz está orientada a agencias, community managers o PyMEs con equipos dedicados, lo que supone una curva de aprendizaje para una operadora individual sin formación técnica. Sus asistentes de IA redactan a partir de un texto que escribe la usuaria —el de Later, por ejemplo, pide describir la publicación en 3 a 80 caracteres—: no ven la fotografía del producto ni ordenan un carrusel.</w:t>
+        <w:t>Su interfaz está pensada para agencias y equipos dedicados, con una curva de aprendizaje alta para una operadora individual. Sus asistentes de IA redactan a partir de un texto de la usuaria —el de Later pide describir la publicación en 3 a 80 caracteres—: no ven la fotografía ni ordenan un carrusel.</w:t>
       </w:r>
     </w:p>
     <w:p>
@@ -13044,7 +13029,7 @@
         <w:spacing w:after="240" w:line="276" w:lineRule="auto"/>
       </w:pPr>
       <w:r>
-        <w:t>La limitación de mayor peso es que ninguna ofrece, en los planes al alcance de una usuaria individual, compliance programable. Las suites empresariales, como Hootsuite Enterprise, ofrecen gobernanza de marca a costo elevado y sin detección de precios en la imagen, y por eso la Tabla 1 marca a Hootsuite «Parcial». Buffer permite programar un post, pero no bloquea un precio ni agrega la firma corporativa ("Consultora de Belleza Independiente Mary Kay") antes de enviarlo a Meta.</w:t>
+        <w:t>Y ninguna ofrece, en los planes al alcance de una usuaria individual, compliance programable. Las suites empresariales, como Hootsuite Enterprise, ofrecen gobernanza de marca a costo elevado y sin detectar precios en la imagen —de ahí el «Parcial» de la Tabla 1—; Buffer programa una publicación, pero no bloquea un precio ni agrega la firma corporativa.</w:t>
       </w:r>
     </w:p>
     <w:p>
@@ -13072,19 +13057,16 @@
         <w:spacing w:after="240" w:line="276" w:lineRule="auto"/>
       </w:pPr>
       <w:r>
-        <w:t xml:space="preserve">La segunda categoría corresponde a las plataformas genéricas de automatización de flujos de trabajo en la nube, siendo Zapier y Make (anteriormente Integromat) los dos productos de mayor difusión. Estas herramientas comparten el modelo de programación visual basada en nodos </w:t>
-      </w:r>
-      <w:r>
-        <w:lastRenderedPageBreak/>
-        <w:t>que Postly utiliza en su backend (n8n). Su principal ventaja es la amplia flexibilidad para conectar miles de aplicaciones mediante APIs, bajo el modelo de conectividad dirigida por APIs (API-led connectivity) (MuleSoft, s.f.).</w:t>
-      </w:r>
+        <w:t>La segunda categoría son las plataformas genéricas de automatización, como Zapier y Make, que comparten con n8n la programación visual por nodos y conectan miles de aplicaciones por API (MuleSoft, s.f.).</w:t>
+      </w:r>
+      <w:r/>
     </w:p>
     <w:p>
       <w:pPr>
         <w:spacing w:after="240" w:line="276" w:lineRule="auto"/>
       </w:pPr>
       <w:r>
-        <w:t>El problema de las iPaaS es que trasladan la arquitectura a la usuaria. Replicar Postly en Zapier o Make exigiría configurar webhooks, mapear objetos JSON, gestionar tokens OAuth 2.0 y programar expresiones regulares, algo inviable para el perfil objetivo. Cimino et al. (2026) constatan lo mismo para las plataformas trigger-action: la ejecución condicional y la transformación de datos exigen saber programar. Sus precios por volumen de tareas encarecen además el procesamiento multimedia, y no permiten auto-hospedar el motor, que Postly resuelve con un n8n propio; esa soberanía alcanza a la lógica y no a todo el dato (§2.1.a). Abendroth (2026) sitúa esa tensión entre accesibilidad declarada y competencia técnica exigida en el centro del debate sobre la democratización del desarrollo: el bajo código amplía quién puede construir, sin suprimir el trabajo de arquitectura.</w:t>
+        <w:t>Su problema es que trasladan la arquitectura a la usuaria: replicar Postly en ellas exigiría configurar webhooks, mapear JSON, gestionar tokens OAuth 2.0 y escribir expresiones regulares. Cimino et al. (2026) constatan que, en las plataformas trigger-action, la ejecución condicional y la transformación de datos exigen saber programar, y Abendroth (2026) sitúa esa tensión entre accesibilidad declarada y competencia exigida en el centro del debate sobre el bajo código. Sus precios por tarea encarecen además el procesamiento multimedia, y no permiten auto-hospedar el motor, que Postly resuelve con un n8n propio (§2.1.a).</w:t>
       </w:r>
     </w:p>
     <w:p>

</xml_diff>

<commit_message>
docs(tesis): N-05, Capitulo 2 condensado de 3.239 a 2.514 palabras (pasadas 186 y 186b)
Tres parrafos redundantes fuera (atributos de calidad, contrasena dicha dos
veces, ubicacion de los controles); la prosa de la Figura 1 en una oracion.
2.4 ya no remite al 1.1 por las dos razones de la regla; la firma sale de la
fila de cada consultora (N-08). Citas, cifras y frases exigidas intactas.

Co-Authored-By: Claude Opus 5.5 <noreply@anthropic.com>
</commit_message>
<xml_diff>
--- a/avance/Tesis Postly Bontorno Hassan-1 v2.docx
+++ b/avance/Tesis Postly Bontorno Hassan-1 v2.docx
@@ -14222,8 +14222,7 @@
     <w:p/>
     <w:p>
       <w:r>
-        <w:lastRenderedPageBreak/>
-        <w:t>Este capítulo reúne los fundamentos sobre los que se apoya Postly, en cuatro ejes: la automatización de procesos de negocio, los modelos de lenguaje multimodales, la integración mediante APIs y el marco normativo que rige la actividad comercial de las consultoras.</w:t>
+        <w:t>Este capítulo reúne los fundamentos de Postly en cuatro ejes: la automatización de procesos de negocio, los modelos de lenguaje multimodales, la integración mediante APIs y el marco normativo de la actividad comercial de las consultoras.</w:t>
       </w:r>
     </w:p>
     <w:p/>
@@ -14254,7 +14253,7 @@
         <w:spacing w:after="240" w:line="276" w:lineRule="auto"/>
       </w:pPr>
       <w:r>
-        <w:t>La Automatización de Procesos de Negocio (BPA) es el uso de tecnologías de la información para modelar, ejecutar, orquestar y monitorear flujos de trabajo recurrentes que de otro modo requerirían intervención humana constante (Weske, 2012; Dumas et al., 2018). Su valor depende de que se subordine al propósito del negocio y no a la tecnología disponible (vom Brocke et al., 2014): en este trabajo, cada flujo automatizado responde a una restricción normativa o a un cuello de botella del §1.2. Para un microemprendimiento, la BPA permite integrar en un solo flujo tareas que hoy están fragmentadas: curaduría, edición, verificación normativa y publicación.</w:t>
+        <w:t>La Automatización de Procesos de Negocio (BPA) usa tecnologías de la información para ejecutar flujos de trabajo recurrentes que de otro modo requerirían intervención humana (Weske, 2012; Dumas et al., 2018), y su valor depende de que se subordine al propósito del negocio (vom Brocke et al., 2014). En este trabajo, cada flujo responde a una restricción normativa o a un cuello de botella del §1.2.</w:t>
       </w:r>
     </w:p>
     <w:p>
@@ -14262,7 +14261,7 @@
         <w:spacing w:after="240" w:line="276" w:lineRule="auto"/>
       </w:pPr>
       <w:r>
-        <w:t>El motor de orquestación elegido es n8n, una plataforma de desarrollo de bajo código (LCDP) que modela los flujos como grafos de nodos que interconectan APIs de forma declarativa (Richardson y Rymer, 2014). La elección se hizo con lo que la literatura empírica reporta del paradigma y no sólo con sus ventajas declaradas: Liu et al. (2024) caracterizan, según su resumen, los defectos de cuatro plataformas de bajo código (no de n8n) a partir de 974 defectos confirmados, y Kedziora y Wnuk (2026) muestran que la elicitación de requerimientos cambia cuando se desarrolla sobre una de ellas. Tres propiedades la justifican frente a las iPaaS comerciales:</w:t>
+        <w:t>El motor elegido es n8n, una plataforma de desarrollo de bajo código (LCDP) que modela los flujos como grafos de nodos (Richardson y Rymer, 2014). La elección consideró también la evidencia empírica del paradigma: los defectos que Liu et al. (2024) caracterizan en cuatro plataformas de bajo código y el cambio en la elicitación de requerimientos que documentan Kedziora y Wnuk (2026). Tres propiedades justifican a n8n frente a las iPaaS comerciales:</w:t>
       </w:r>
     </w:p>
     <w:p>
@@ -14277,7 +14276,7 @@
         <w:t>a) Auto-hospedaje:</w:t>
       </w:r>
       <w:r>
-        <w:t xml:space="preserve"> las plataformas de automatización SaaS multi-inquilino —en la terminología de Mell y Grance (2011)— dejan la lógica y las credenciales en servidores de terceros. El motor n8n, bajo un modelo fair-code, puede ejecutarse en un servidor propio, de modo que quien administra el sistema conserva el control del motor y de los tokens OAuth.</w:t>
+        <w:t xml:space="preserve"> las plataformas SaaS multi-inquilino (Mell y Grance, 2011) dejan la lógica y las credenciales en servidores de terceros; n8n, bajo un modelo fair-code, corre en un servidor propio, y quien lo administra conserva el control del motor y de los tokens OAuth.</w:t>
       </w:r>
     </w:p>
     <w:p>
@@ -14288,7 +14287,7 @@
         <w:rPr>
           <w:bCs/>
         </w:rPr>
-        <w:t>Esa soberanía no cubre la totalidad del dato. La persistencia está en Google Sheets, la inferencia en la API de Gemini y los activos multimedia pasan por Cloudinary (§5.1.1, §4.4.2). Lo que el auto-hospedaje preserva es el control de la lógica de negocio, del motor que la ejecuta y de las credenciales, que se almacenan cifradas con AES-256-GCM (Anexo B.3); no la localización del almacenamiento.</w:t>
+        <w:t>Esa soberanía no cubre todo el dato: la persistencia está en Google Sheets, la inferencia en Gemini y los activos multimedia en Cloudinary (§5.1.1). El auto-hospedaje preserva la lógica de negocio, el motor y las credenciales, cifradas con AES-256-GCM (Anexo B.3), y no la localización del almacenamiento.</w:t>
       </w:r>
     </w:p>
     <w:p>
@@ -14303,12 +14302,9 @@
         <w:t>b) Programación visual modular:</w:t>
       </w:r>
       <w:r>
-        <w:t xml:space="preserve"> cada nodo cumple una función acotada —un disparador, un filtro condicional, una petición HTTP—, lo que favorece el mantenimiento (Pressman, 2010). Agregar una red o una regla de compliance </w:t>
-      </w:r>
-      <w:r>
-        <w:lastRenderedPageBreak/>
-        <w:t>se concentra en los nodos de la rama afectada, aunque exige editar el workflow único que los contiene (§5.1.3).</w:t>
-      </w:r>
+        <w:t xml:space="preserve"> cada nodo cumple una función acotada —un disparador, un filtro, una petición HTTP—, lo que favorece el mantenimiento (Pressman, 2010); agregar una red o una regla afecta sólo a su rama, aunque dentro del workflow único que la contiene (§5.1.3).</w:t>
+      </w:r>
+      <w:r/>
     </w:p>
     <w:p>
       <w:pPr>
@@ -14321,7 +14317,7 @@
         <w:t>c) Extensibilidad:</w:t>
       </w:r>
       <w:r>
-        <w:t xml:space="preserve"> además de las integraciones predefinidas, n8n admite código JavaScript propio (Code Nodes) y peticiones HTTP en crudo. Es lo que permite en Postly manejar archivos multimedia pesados, parsear las respuestas JSON del modelo y codificar las reglas de compliance, que una herramienta de consumo masivo no permitiría expresar.</w:t>
+        <w:t xml:space="preserve"> n8n admite código JavaScript propio (Code Nodes) y peticiones HTTP en crudo, que Postly usa para manejar archivos multimedia, parsear las respuestas del modelo y codificar las reglas de compliance.</w:t>
       </w:r>
     </w:p>
     <w:p>
@@ -14359,7 +14355,7 @@
         <w:spacing w:after="240" w:line="276" w:lineRule="auto"/>
       </w:pPr>
       <w:r>
-        <w:t>Un Modelo de Lenguaje de Gran Escala (LLM) es una red neuronal profunda, por lo general basada en la arquitectura Transformer y su mecanismo de auto-atención (Vaswani et al., 2017), entrenada con volúmenes masivos de texto. Esa escala le da la capacidad de comprender y generar lenguaje con alta coherencia (Brown et al., 2020; Zhao et al., 2023).</w:t>
+        <w:t>Un Modelo de Lenguaje de Gran Escala (LLM) es una red neuronal profunda, por lo general basada en la arquitectura Transformer y su mecanismo de auto-atención (Vaswani et al., 2017), entrenada con volúmenes masivos de texto para comprender y generar lenguaje (Brown et al., 2020; Zhao et al., 2023).</w:t>
       </w:r>
     </w:p>
     <w:p>
@@ -14367,7 +14363,7 @@
         <w:spacing w:after="240" w:line="276" w:lineRule="auto"/>
       </w:pPr>
       <w:r>
-        <w:t>Para el caso de Postly el texto no alcanza: el material de partida es una fotografía. Por eso se integra Gemini 2.5 Flash, un modelo multimodal nativo. La multimodalidad es la capacidad de una misma arquitectura para procesar y alinear distintas modalidades —texto, imagen, audio, video— (Baltrušaitis et al., 2019). Las revisiones recientes describen el modelo multimodal típico como un modelo de lenguaje al que un codificador de modalidad y un módulo de conexión le permiten recibir imágenes (Yin et al., 2024). Postly la usa en tres tareas:</w:t>
+        <w:t>En Postly el material de partida es una fotografía, y por eso se integra Gemini 2.5 Flash, un modelo multimodal nativo. Una misma arquitectura procesa y alinea texto e imagen (Baltrušaitis et al., 2019): un modelo de lenguaje al que un codificador de modalidad le permite recibir imágenes (Yin et al., 2024). Postly la usa en tres tareas:</w:t>
       </w:r>
     </w:p>
     <w:p>
@@ -14382,7 +14378,7 @@
         <w:t>a) Interpretación visual:</w:t>
       </w:r>
       <w:r>
-        <w:t xml:space="preserve"> las redes convolucionales ya detectaban y etiquetaban objetos, y combinadas con redes recurrentes generaban descripciones de una imagen (LeCun et al., 2015). Un modelo multimodal integra esa lectura en la misma inferencia que redacta, y puede además inferir qué tipo de plano es una foto —un detalle que muestra la textura, una escena de estilo de vida— y usar esa lectura. Postly la aprovecha para proponer el orden de un carrusel (HU5); elegir qué imágenes rinden mejor es otra tarea, la de la capa predictiva del Objetivo Específico 4, que el §8.1 declara no implementada.</w:t>
+        <w:t xml:space="preserve"> un modelo multimodal integra en la misma inferencia que redacta la lectura de la imagen que antes hacían las redes convolucionales y recurrentes (LeCun et al., 2015), e infiere qué tipo de plano es una foto, lo que Postly usa para ordenar un carrusel (HU5). Elegir qué imágenes rinden mejor corresponde a la capa predictiva, no implementada (§8.1).</w:t>
       </w:r>
     </w:p>
     <w:p>
@@ -14396,12 +14392,9 @@
         <w:t>b) Orden narrativo del carrusel:</w:t>
       </w:r>
       <w:r>
-        <w:t xml:space="preserve"> el modelo recibe hasta 10 imágenes y propone una secuencia —portada, imágenes de soporte, cierre—, una decisión que a una emprendedora sin formación en diseño le cuesta. El propósito es reducir su carga de decisión (Baumeister et al., 1998); como el constructo de </w:t>
-      </w:r>
-      <w:r>
-        <w:lastRenderedPageBreak/>
-        <w:t>fatiga de decisión tiene fallos de replicación relevantes, se lo invoca como motivación de diseño y no como un efecto medido.</w:t>
-      </w:r>
+        <w:t xml:space="preserve"> el modelo recibe hasta 10 imágenes y propone una secuencia —portada, soporte, cierre—, una decisión que a una emprendedora sin formación en diseño le cuesta. Reducir su carga de decisión (Baumeister et al., 1998) es una motivación de diseño y no un efecto medido, porque el constructo de fatiga de decisión tiene fallos de replicación.</w:t>
+      </w:r>
+      <w:r/>
     </w:p>
     <w:p>
       <w:pPr>
@@ -14415,7 +14408,7 @@
         <w:t>c) Copy anclado a la imagen:</w:t>
       </w:r>
       <w:r>
-        <w:t xml:space="preserve"> los LLM pueden producir texto gramaticalmente correcto pero falso, lo que se conoce como alucinación (Ji et al., 2023). Anclar la redacción en lo que el modelo ve en la foto —el color, el envase, la textura— reduce ese riesgo sin eliminarlo (Capítulo 7). El mismo prompt pide tres tonos —informativo, vendedor y divertido— entre los que elige la usuaria; el copy elegido se publica igual en las dos redes (§8.2).</w:t>
+        <w:t xml:space="preserve"> los LLM pueden producir texto correcto pero falso, la llamada alucinación (Ji et al., 2023); anclar la redacción en lo que el modelo ve en la foto reduce ese riesgo sin eliminarlo (Capítulo 7). El mismo prompt pide tres tonos —informativo, vendedor y divertido—, y el copy elegido se publica igual en las dos redes (§8.2).</w:t>
       </w:r>
     </w:p>
     <w:p>
@@ -14453,7 +14446,7 @@
         <w:spacing w:after="240" w:line="276" w:lineRule="auto"/>
       </w:pPr>
       <w:r>
-        <w:t>La integración de servicios distribuidos depende más de la arquitectura de comunicación que de la potencia de cada componente (Tanenbaum y Van Steen, 2007). La tendencia de las últimas décadas fue pasar de sistemas monolíticos acoplados a servicios desacoplados y microservicios (Erl, 2005; Newman, 2015). Postly consume APIs de terceros de forma desacoplada, pero no se inscribe en esa tendencia: es un monolito modular de un solo proceso (§5.1). Lo que lo hace funcionar es la interoperabilidad entre plataformas heterogéneas —Telegram, Google, Meta y el propio n8n— mediante patrones de integración estándar (Hohpe y Woolf, 2003).</w:t>
+        <w:t>La integración de servicios distribuidos depende más de la arquitectura de comunicación que de la potencia de cada componente (Tanenbaum y Van Steen, 2007). Postly consume APIs de terceros de forma desacoplada, pero no sigue la tendencia hacia los microservicios (Erl, 2005; Newman, 2015): es un monolito modular de un solo proceso (§5.1) que hace interoperar Telegram, Google, Meta y n8n con patrones de integración estándar (Hohpe y Woolf, 2003).</w:t>
       </w:r>
     </w:p>
     <w:p>
@@ -14461,15 +14454,7 @@
         <w:spacing w:after="240" w:line="276" w:lineRule="auto"/>
       </w:pPr>
       <w:r>
-        <w:t>Una estrategia de integración se juzga por atributos de calidad (Bass et al., 2012). Para Postly pesan dos: la escalabilidad, para sumar módulos o redes, y la disponibilidad, para que la caída de un servicio externo no arrastre al resto.</w:t>
-      </w:r>
-    </w:p>
-    <w:p>
-      <w:pPr>
-        <w:spacing w:after="240" w:line="276" w:lineRule="auto"/>
-      </w:pPr>
-      <w:r>
-        <w:t>Postly adopta una arquitectura dirigida por eventos, en la que la información se empuja (push) o se solicita (pull) mediante protocolos web estándar (Michelson, 2006). Los apartados siguientes describen sus tres piezas: las interfaces REST, los webhooks y la autorización delegada.</w:t>
+        <w:t>Postly adopta una arquitectura dirigida por eventos, en la que la información se empuja o se solicita mediante protocolos web estándar (Michelson, 2006). Sus tres piezas son las interfaces REST, los webhooks y la autorización delegada.</w:t>
       </w:r>
     </w:p>
     <w:p>
@@ -14508,7 +14493,7 @@
         <w:spacing w:after="240" w:line="276" w:lineRule="auto"/>
       </w:pPr>
       <w:r>
-        <w:t>Una API es un contrato técnico: un conjunto de protocolos y definiciones que permite a dos aplicaciones intercambiar datos con independencia de su lenguaje (Reddy, 2011). Postly consume APIs de tipo REST, el estilo que Fielding (2000) definió sobre HTTP y que se volvió el estándar de los servicios web por su simplicidad. Tres de sus restricciones importan acá:</w:t>
+        <w:t>Una API es un contrato técnico que permite a dos aplicaciones intercambiar datos con independencia de su lenguaje (Reddy, 2011). Postly consume APIs REST, el estilo que Fielding (2000) definió sobre HTTP, y tres de sus restricciones importan acá:</w:t>
       </w:r>
     </w:p>
     <w:p>
@@ -14579,7 +14564,7 @@
         <w:spacing w:after="240" w:line="276" w:lineRule="auto"/>
       </w:pPr>
       <w:r>
-        <w:t>En Postly, las APIs son el único mecanismo de conexión entre el orquestador, el modelo y las redes de destino. La Telegram Bot API (Telegram Messenger Inc., s.f.) recibe los mensajes y archivos de la usuaria. La Meta Graph API (Meta for Developers, s.f.) publica en Instagram y Facebook y devuelve las métricas. La Google Sheets API trata una hoja de cálculo como almacenamiento tabular, sin esquema declarado, integridad referencial ni transacciones ACID (Anexo B.5). Todo el intercambio usa JSON (Crockford, 2006).</w:t>
+        <w:t>Las APIs son el único mecanismo de conexión entre el orquestador, el modelo y las redes. La Telegram Bot API (Telegram Messenger Inc., s.f.) recibe los mensajes de la usuaria, y la Meta Graph API (Meta for Developers, s.f.) publica en Instagram y Facebook y devuelve las métricas. La Google Sheets API trata una hoja de cálculo como almacenamiento tabular, sin esquema, integridad referencial ni transacciones ACID (Anexo B.5). Todo el intercambio usa JSON (Crockford, 2006).</w:t>
       </w:r>
     </w:p>
     <w:p>
@@ -14626,7 +14611,7 @@
         <w:spacing w:after="240" w:line="276" w:lineRule="auto"/>
       </w:pPr>
       <w:r>
-        <w:t>El modo tradicional de integrar es el sondeo (polling): el cliente consulta periódicamente al servidor si hay novedades. Consume recursos, agota las cuotas de peticiones (rate limits) y agrega la latencia del intervalo. La alternativa es la que Michelson (2006) describe para una arquitectura dirigida por eventos: el evento dispara la acción, y eso elimina el tiempo muerto del flujo.</w:t>
+        <w:t>El modo tradicional de integrar es el sondeo (polling): consultar periódicamente si hay novedades, lo que consume recursos, agota las cuotas de peticiones y agrega la latencia del intervalo. En una arquitectura dirigida por eventos, en cambio, el evento dispara la acción (Michelson, 2006).</w:t>
       </w:r>
     </w:p>
     <w:p>
@@ -14634,7 +14619,7 @@
         <w:spacing w:after="240" w:line="276" w:lineRule="auto"/>
       </w:pPr>
       <w:r>
-        <w:t>Postly recibe los eventos por webhooks. La consulta activa queda reservada a los cuatro tramos en los que no existe webhook que notifique. Dos corren por intervalo: el disparo de las publicaciones programadas y el Feedback Loop diario de métricas (Anexo B.2). Los otros dos, a demanda: el estado del contenedor de Instagram mientras se procesa un Reel (Anexo B.9) y la sincronización con Instagram al abrir Mi Agenda.</w:t>
+        <w:t>Postly recibe los eventos por webhooks y sondea sólo donde no hay webhook que notifique: por intervalo, el disparo de las publicaciones programadas y las métricas diarias (Anexo B.2); a demanda, el estado de un Reel en procesamiento (Anexo B.9) y la sincronización con Instagram al abrir Mi Agenda.</w:t>
       </w:r>
     </w:p>
     <w:p>
@@ -14642,7 +14627,7 @@
         <w:spacing w:after="240" w:line="276" w:lineRule="auto"/>
       </w:pPr>
       <w:r>
-        <w:t>Un webhook es una URL pública, cifrada con TLS, en la que n8n espera los eventos: es la plataforma de origen la que avisa, en el momento en que ocurre la novedad.</w:t>
+        <w:t>Un webhook es una URL pública, cifrada con TLS, en la que n8n espera que la plataforma de origen le avise de una novedad.</w:t>
       </w:r>
     </w:p>
     <w:p>
@@ -14650,7 +14635,7 @@
         <w:spacing w:after="240" w:line="276" w:lineRule="auto"/>
       </w:pPr>
       <w:r>
-        <w:t>Cuando la consultora envía una foto por Telegram, los servidores de Telegram hacen una petición POST a esa URL con un JSON que lleva el identificador del chat, la referencia al archivo y la marca de tiempo.</w:t>
+        <w:t>Cuando la consultora envía una foto, Telegram hace una petición POST a esa URL con el identificador del chat y la referencia al archivo, y esa petición inicia el workflow.</w:t>
       </w:r>
     </w:p>
     <w:p>
@@ -14658,12 +14643,9 @@
         <w:spacing w:after="240" w:line="276" w:lineRule="auto"/>
       </w:pPr>
       <w:r>
-        <w:t xml:space="preserve">Esa petición es el disparador que inicia la ejecución del workflow. Lo que el webhook aporta es que el bot reaccione en cuanto llega el mensaje. La espera </w:t>
-      </w:r>
-      <w:r>
-        <w:lastRenderedPageBreak/>
-        <w:t>que queda es la del modelo: el Anexo E.5 la mide en 59,7 segundos de media y 143,1 de máximo entre la foto y los tres copys. HU12 fija 15 s para otra operación, la regeneración de copys, que tarda 31,2 s (Anexo E.7).</w:t>
-      </w:r>
+        <w:t>El bot reacciona en cuanto llega el mensaje; la espera que queda es la del modelo, que el Anexo E.5 mide en 59,7 s de media y 143,1 s de máximo entre la foto y los tres copys. La regeneración de copys, para la que HU12 fija 15 s, tarda 31,2 s (Anexo E.7).</w:t>
+      </w:r>
+      <w:r/>
     </w:p>
     <w:p>
       <w:pPr>
@@ -14808,7 +14790,7 @@
           <w:i/>
           <w:sz w:val="20"/>
         </w:rPr>
-        <w:t>Nota. Fuente: elaboración propia. Los tres canjes son peticiones distintas del workflow de callback: código → token de usuaria, token de usuaria → versión larga, y de ahí al token de página. El token que el sistema usa al publicar es el de página, y es el único cuya vigencia mide el §6.1.5: la Graph API lo devuelve sin campo de expiración (Anexo E.7, HU2). El token nunca es visible ni ingresado manualmente por la usuaria (Anexo B.3). OAuth 2.0 delega autorización; no provee no repudio ni autenticación del bot ante ella (§2.3).</w:t>
+        <w:t>Nota. Fuente: elaboración propia. Los tres canjes son peticiones distintas del workflow de callback: código → token de usuaria → versión larga → token de página. El sistema publica con el de página, que la Graph API devuelve sin campo de expiración y es el único cuya vigencia mide el §6.1.5 (Anexo E.7, HU2). La usuaria nunca ve ni ingresa el token (Anexo B.3). OAuth 2.0 delega autorización; no provee no repudio ni autenticación del bot ante ella.</w:t>
       </w:r>
     </w:p>
     <w:p>
@@ -14816,7 +14798,7 @@
         <w:spacing w:after="240" w:line="276" w:lineRule="auto"/>
       </w:pPr>
       <w:r>
-        <w:t>Postly actúa en nombre de la consultora ante la infraestructura de Meta, y eso hace de la seguridad un eje del diseño y no un agregado posterior (Stallings, 2017). La delegación se resuelve con OAuth 2.0, el marco estándar para autorizar a un tercero sobre HTTP (Hardt, 2012). OAuth es un marco de autorización, no de autenticación ni de no repudio: un token portador es transferible por diseño, de modo que lo que aporta es alcance acotado y revocabilidad, no una firma del emisor.</w:t>
+        <w:t>Postly actúa en nombre de la consultora ante Meta, y eso hace de la seguridad un eje del diseño (Stallings, 2017). La delegación se resuelve con OAuth 2.0, el marco estándar para autorizar a un tercero sobre HTTP (Hardt, 2012). Es un marco de autorización y no de autenticación ni de no repudio: un token portador es transferible, de modo que aporta alcance acotado y revocabilidad, no una firma del emisor.</w:t>
       </w:r>
     </w:p>
     <w:p>
@@ -14824,15 +14806,7 @@
         <w:spacing w:after="240" w:line="276" w:lineRule="auto"/>
       </w:pPr>
       <w:r>
-        <w:t>La Figura 1 representa ese intercambio como un diagrama de secuencia. Fija el orden de los mensajes entre la consultora, el bot junto con el orquestador n8n —una sola línea de vida—, el servidor de autorización de Meta y la Graph API, desde el enlace inicial de vinculación hasta el canje del código por un token de larga duración.</w:t>
-      </w:r>
-    </w:p>
-    <w:p>
-      <w:pPr>
-        <w:spacing w:after="240" w:line="276" w:lineRule="auto"/>
-      </w:pPr>
-      <w:r>
-        <w:t>La consultora nunca le entrega su contraseña a Postly: autoriza el acceso en la página de Meta, y Postly recibe un token con permisos limitados. Eso no la protege de una página falsa de inicio de sesión (phishing), que puede capturar sus credenciales igual.</w:t>
+        <w:t>La Figura 1 lo representa como diagrama de secuencia.</w:t>
       </w:r>
     </w:p>
     <w:p>
@@ -14849,7 +14823,7 @@
         <w:spacing w:after="240" w:line="276" w:lineRule="auto"/>
       </w:pPr>
       <w:r>
-        <w:t>En el flujo de código de autorización, Postly redirige a la consultora a Meta, que le muestra los permisos solicitados (scopes). Postly pide sólo los necesarios para publicar y leer métricas básicas, según el principio de menor privilegio (Saltzer y Schroeder, 1975), y nunca el acceso a mensajes privados ni a la administración financiera. Aprobada la solicitud, Meta devuelve un código que Postly canjea en el servidor por un token de acceso.</w:t>
+        <w:t>Postly redirige a la consultora a Meta, que le muestra los permisos solicitados. Pide sólo los necesarios para publicar y leer métricas básicas, por el principio de menor privilegio (Saltzer y Schroeder, 1975), y nunca el acceso a mensajes privados ni a la administración financiera. Meta devuelve un código que Postly canjea en el servidor por un token de acceso.</w:t>
       </w:r>
     </w:p>
     <w:p>
@@ -14877,7 +14851,7 @@
         <w:spacing w:after="0" w:line="276" w:lineRule="auto"/>
       </w:pPr>
       <w:r>
-        <w:t>Menor impacto de una filtración: una brecha expone sólo tokens de permisos limitados y revocables, nunca la contraseña de la usuaria, que no pasa por el sistema (Stallings, 2017).</w:t>
+        <w:t>Menor impacto de una filtración: una brecha expone sólo tokens limitados y revocables, nunca la contraseña, que no pasa por el sistema (Stallings, 2017); eso no protege, en cambio, de una página falsa de inicio de sesión.</w:t>
       </w:r>
     </w:p>
     <w:p>
@@ -14896,7 +14870,7 @@
         <w:t>Revocación:</w:t>
       </w:r>
       <w:r>
-        <w:t xml:space="preserve"> la consultora puede revocar el acceso de Postly desde la configuración de su cuenta, sin intervención del desarrollador.</w:t>
+        <w:t xml:space="preserve"> la consultora puede revocar el acceso desde su cuenta, sin intervención del desarrollador.</w:t>
       </w:r>
     </w:p>
     <w:p>
@@ -14915,7 +14889,7 @@
         <w:t>Trazabilidad:</w:t>
       </w:r>
       <w:r>
-        <w:t xml:space="preserve"> cada acción de la Graph API queda asociada al token emitido para Postly, lo que permite saber qué aplicación publicó qué y cuándo.</w:t>
+        <w:t xml:space="preserve"> cada acción de la Graph API queda asociada al token de Postly.</w:t>
       </w:r>
     </w:p>
     <w:p>
@@ -14923,7 +14897,7 @@
         <w:spacing w:after="240" w:line="276" w:lineRule="auto"/>
       </w:pPr>
       <w:r>
-        <w:t>Es una aplicación del principio de defensa en profundidad (Cole et al., 2005): permisos delegados, acotados y revocables, además del cifrado de los tokens en reposo.</w:t>
+        <w:t>Es defensa en profundidad (Cole et al., 2005): permisos delegados, acotados y revocables, más el cifrado de los tokens en reposo.</w:t>
       </w:r>
     </w:p>
     <w:p>
@@ -14961,7 +14935,7 @@
         <w:spacing w:after="240" w:line="276" w:lineRule="auto"/>
       </w:pPr>
       <w:r>
-        <w:t>Un sistema de información tiene que alinearse con el marco regulatorio del sector en el que opera (Hashmi et al., 2018; para el estado más reciente de esa línea, Colombo Tosatto et al., 2026). En la venta directa, la actividad digital de las consultoras está regida por políticas de marketing de la compañía —que la propia normativa declara instrumentales al Acuerdo de Consultora (Mary Kay Inc., s.f., p. 1)— destinadas a proteger el capital de marca (Peterson y Wotruba, 1996).</w:t>
+        <w:t>Un sistema de información tiene que alinearse con el marco regulatorio de su sector (Hashmi et al., 2018; Colombo Tosatto et al., 2026). En la venta directa, la actividad digital de las consultoras la rigen políticas de marketing de la compañía, instrumentales al Acuerdo de Consultora (Mary Kay Inc., s.f., p. 1) y destinadas a proteger el capital de marca (Peterson y Wotruba, 1996).</w:t>
       </w:r>
     </w:p>
     <w:p>
@@ -14969,16 +14943,7 @@
         <w:spacing w:after="240" w:line="276" w:lineRule="auto"/>
       </w:pPr>
       <w:r>
-        <w:lastRenderedPageBreak/>
-        <w:t>Postly traduce dos de esas reglas a controles en código, en la línea del enfoque que suele llamarse Compliance by Design, en el que las restricciones se codifican en la arquitectura del sistema. La literatura reciente sobre tecnologías regulatorias muestra que es viable usar modelos de lenguaje para verificar el cumplimiento de forma continua (Li y Maiti, 2025), el mismo camino que sigue el canal visual del Módulo Centinela.</w:t>
-      </w:r>
-    </w:p>
-    <w:p>
-      <w:pPr>
-        <w:spacing w:after="240" w:line="276" w:lineRule="auto"/>
-      </w:pPr>
-      <w:r>
-        <w:t>Los controles se ubican antes de cualquier llamada de publicación a Meta y verifican cada activo y cada texto contra las directrices de la compañía (Mary Kay Inc., s.f.; Anexo D).</w:t>
+        <w:t>Postly traduce dos de esas reglas a controles en código, en la línea del Compliance by Design, que codifica las restricciones en la arquitectura del sistema, y los ubica antes de cualquier llamada de publicación a Meta (Mary Kay Inc., s.f.; Anexo D). La literatura reciente muestra que es viable verificar el cumplimiento de forma continua con modelos de lenguaje (Li y Maiti, 2025), el camino del canal visual del Módulo Centinela.</w:t>
       </w:r>
     </w:p>
     <w:p>
@@ -15017,7 +14982,7 @@
         <w:spacing w:after="240" w:line="276" w:lineRule="auto"/>
       </w:pPr>
       <w:r>
-        <w:t>La primera regla prohíbe compartir el mensaje comercial con el público en general: sólo puede ir por un mecanismo privado a clientas y clientas potenciales (Mary Kay Inc., s.f., pp. 3 y 4; Anexo D). La fuente lo define por lo que el mensaje hace —da información suficiente para decidir una compra, con el precio, el descuento y la oferta como ejemplos, o invita a comprar— y no por una cifra. Por eso este trabajo usa dos términos: «mensaje comercial» es lo que la norma regula, y «referencia monetaria», lo que el módulo audita, que es una parte de aquél. La fuente la funda en dos razones, que el §1.1 cita: los términos de uso de varias plataformas limitan el mensaje comercial en páginas personales, y el consumidor responde mejor sin una solicitud comercial directa. Leerla como protección de la venta consultiva frente a la guerra de precios es una interpretación de los autores, apoyada en Kotler y Keller (2012), y no un fundamento de la fuente.</w:t>
+        <w:t>La primera regla prohíbe compartir el mensaje comercial con el público en general: sólo puede ir por un mecanismo privado a clientas y clientas potenciales (Mary Kay Inc., s.f., pp. 3 y 4; Anexo D). La fuente lo define por lo que el mensaje hace —da información suficiente para decidir una compra, con el precio, el descuento y la oferta como ejemplos, o invita a comprar— y no por una cifra. De ahí los dos términos de este trabajo: «mensaje comercial» es lo que la norma regula, y «referencia monetaria», la parte de aquél que el módulo audita. La fuente funda la regla en dos razones: los términos de uso de varias plataformas limitan el mensaje comercial en las páginas personales, y el consumidor responde mejor sin una solicitud comercial directa. Leerla como protección de la venta consultiva frente a la guerra de precios es una interpretación de los autores (Kotler y Keller, 2012), no un fundamento de la fuente.</w:t>
       </w:r>
     </w:p>
     <w:p>
@@ -15025,7 +14990,7 @@
         <w:spacing w:after="240" w:line="276" w:lineRule="auto"/>
       </w:pPr>
       <w:r>
-        <w:t>Su aplicación a los dos destinos de Postly no es simétrica. Para el feed de Instagram, que la fuente no nombra, este trabajo infiere que es público en general, y la inferencia es directa. Para la página de negocios de Facebook la fuente dice lo contrario: «Facebook … fomenta que los mensajes comerciales se publiquen en la página de negocios en Facebook» (p. 1), y la nombra otras dos veces entre los mecanismos autorizados (pp. 3 y 6). El módulo audita igual ese canal, por decisión de los autores y contra la letra de la fuente, con el fundamento que el Anexo D detalla.</w:t>
+        <w:t>Su aplicación a los dos destinos no es simétrica. El feed de Instagram, que la fuente no nombra, se infiere público en general. De la página de negocios de Facebook la fuente dice lo contrario: «Facebook … fomenta que los mensajes comerciales se publiquen en la página de negocios en Facebook» (p. 1), y la nombra otras dos veces entre los mecanismos autorizados (pp. 3 y 6). El módulo audita igual ese canal, por decisión de los autores y contra la letra de la fuente (Anexo D).</w:t>
       </w:r>
     </w:p>
     <w:p>
@@ -15033,7 +14998,7 @@
         <w:spacing w:after="240" w:line="276" w:lineRule="auto"/>
       </w:pPr>
       <w:r>
-        <w:t>La fuente no fija sanción para el mensaje comercial en canal público. Se presenta como un medio para «ayudarte a cumplir con los términos de tu Acuerdo de Consultora de Belleza Independiente» (p. 1), pero separa las Pautas de los Acuerdos (p. 4) y reserva las calificaciones de «violación grave» y «violación seria» —y la posible terminación del Acuerdo— para las afirmaciones de ingresos y la venta en grupos de intercambio. Lo más cercano que tipifica es el «anuncio no autorizado», para la oferta que llega al público por un hashtag de marca (p. 6). Dentro de ese alcance, Postly reduce el riesgo de que una cifra monetaria llegue al dominio público.</w:t>
+        <w:t>La fuente no fija sanción para el mensaje comercial en canal público. Se presenta como un medio para «ayudarte a cumplir con los términos de tu Acuerdo de Consultora de Belleza Independiente» (p. 1), pero separa las Pautas de los Acuerdos (p. 4) y reserva la «violación grave» o «seria» —y la posible terminación del Acuerdo— para las afirmaciones de ingresos y la venta en grupos de intercambio. Lo más cercano que tipifica es el «anuncio no autorizado» de una oferta por un hashtag de marca (p. 6). Dentro de ese alcance, Postly reduce el riesgo de que una cifra monetaria llegue al dominio público.</w:t>
       </w:r>
     </w:p>
     <w:p>
@@ -15061,7 +15026,7 @@
         <w:t>Canal textual:</w:t>
       </w:r>
       <w:r>
-        <w:t xml:space="preserve"> un nodo de código evalúa sobre el texto final —generado o editado por la usuaria— seis expresiones regulares en cascada (Friedl, 2006). Son las de símbolo de divisa con cifra, cifra seguida de moneda escrita, separador de miles, porcentaje de descuento, vocabulario comercial («oferta», «promo», «2x1») y palabra de precio con cifra. Dos de ellas asocian cifra y palabra por adyacencia —la cifra seguida de la moneda escrita y la palabra de precio seguida de la cifra—, y ninguna las relaciona a mayor distancia; la moneda que precede a la cifra («ARS 4500») no se detecta (§6.1). El conjunto completo está en el Anexo B.4. Una coincidencia interrumpe la publicación y le pide a la usuaria que corrija el texto.</w:t>
+        <w:t xml:space="preserve"> un nodo de código evalúa sobre el texto final seis expresiones regulares en cascada (Friedl, 2006): símbolo de divisa con cifra, moneda escrita, separador de miles, porcentaje de descuento, vocabulario comercial («oferta», «2x1») y palabra de precio con cifra. Dos asocian cifra y palabra sólo por adyacencia, y la moneda que precede a la cifra («ARS 4500») no se detecta (§6.1; Anexo B.4). Una coincidencia interrumpe la publicación y pide corregir el texto.</w:t>
       </w:r>
     </w:p>
     <w:p>
@@ -15080,7 +15045,7 @@
         <w:t>Canal visual:</w:t>
       </w:r>
       <w:r>
-        <w:t xml:space="preserve"> los precios suelen estar incrustados en las piezas gráficas, no en el pie de foto. Gemini 2.5 Flash recibe la imagen y reconoce en ella cualquier cifra que, por su contexto, pueda ser un precio. Si la detecta, el flujo se detiene y avisa a la usuaria.</w:t>
+        <w:t xml:space="preserve"> los precios suelen estar incrustados en las piezas gráficas y no en el pie de foto. Gemini 2.5 Flash reconoce en la imagen cualquier cifra que, por su contexto, pueda ser un precio, y si la detecta el flujo se detiene y avisa a la usuaria.</w:t>
       </w:r>
     </w:p>
     <w:p>
@@ -15119,7 +15084,7 @@
         <w:spacing w:after="240" w:line="276" w:lineRule="auto"/>
       </w:pPr>
       <w:r>
-        <w:t>La segunda regla es de identidad. La regulación de la información al consumidor busca corregir las asimetrías que impiden una decisión de compra informada (Beales et al., 1981); en la venta directa, esa asimetría es sobre quién vende: la marca o una emprendedora independiente. La distinción la exige la propia fuente en sus Pautas, no una norma estatal que este trabajo haya relevado.</w:t>
+        <w:t>La segunda regla es de identidad. La regulación de la información al consumidor busca corregir asimetrías que impiden una decisión de compra informada (Beales et al., 1981); en la venta directa, la asimetría es sobre quién vende, la marca o una emprendedora independiente. La distinción la exigen las Pautas, no una norma estatal que este trabajo haya relevado.</w:t>
       </w:r>
     </w:p>
     <w:p>
@@ -15127,7 +15092,7 @@
         <w:spacing w:after="240" w:line="276" w:lineRule="auto"/>
       </w:pPr>
       <w:r>
-        <w:t>La fuente exige la nomenclatura «Consultora de Belleza Independiente Mary Kay» en el nombre de la página de negocio y al comentar en sitios patrocinados por la Compañía, pero no al pie de cada publicación del feed propio (Anexo D). Postly la agrega igual a los tres copys, como lectura conservadora del deber de transparencia: una publicación sin la leyenda puede hacer pasar el perfil de una consultora por un canal oficial de la marca. En el proceso manual, esa firma depende de la memoria de la consultora.</w:t>
+        <w:t>La fuente exige la nomenclatura «Consultora de Belleza Independiente Mary Kay» en el nombre de la página de negocio y al comentar en sitios de la Compañía, pero no al pie de cada publicación (Anexo D). Postly la agrega igual a los tres copys, como lectura conservadora del deber de transparencia: sin la leyenda, el perfil de una consultora puede pasar por un canal oficial de la marca.</w:t>
       </w:r>
     </w:p>
     <w:p>
@@ -15135,7 +15100,7 @@
         <w:spacing w:after="240" w:line="276" w:lineRule="auto"/>
       </w:pPr>
       <w:r>
-        <w:t>Postly la agrega en código: después de la elección de la usuaria, un nodo concatena de forma incondicional la firma y el dato de contacto al final del texto, y la misma firma, guardada en la hoja de configuración, se aplica en las dos redes. La línea de contacto, que se concatena igual, plantea una pregunta que el §4.3.2 declara abierta.</w:t>
+        <w:t>Un nodo la concatena en código, de forma incondicional y después de la elección de la usuaria, junto con el dato de contacto, desde la fila de configuración de cada consultora y en las dos redes. La línea de contacto plantea una pregunta que el §4.3.2 declara abierta.</w:t>
       </w:r>
     </w:p>
     <w:p>
@@ -15172,12 +15137,9 @@
         <w:spacing w:after="240" w:line="276" w:lineRule="auto"/>
       </w:pPr>
       <w:r>
-        <w:t xml:space="preserve">La tercera restricción es de propiedad intelectual. Las Pautas no fijan un estándar estético: piden que las imágenes con copyright de la Compañía se </w:t>
-      </w:r>
-      <w:r>
-        <w:lastRenderedPageBreak/>
-        <w:t>tomen de la función «COMPARTIR» o de la biblioteca del editor de medios sociales y que no se modifiquen de ningún modo; copiarlas por otra vía «no está autorizado». La decisión de diseño que se deriva —no extraer imágenes del sitio de la marca por scraping— se trata en el §3.3.3.</w:t>
-      </w:r>
+        <w:t>La tercera restricción es de propiedad intelectual: las Pautas piden tomar las imágenes de la Compañía de la función «COMPARTIR» o de la biblioteca del editor de medios sociales y no modificarlas de ningún modo. La decisión que se deriva —no extraer imágenes del sitio de la marca por scraping— se trata en el §3.3.3.</w:t>
+      </w:r>
+      <w:r/>
     </w:p>
     <w:p>
       <w:pPr>

</xml_diff>

<commit_message>
docs(tesis): N-05, Capitulo 3 condensado de 6.590 a 4.609 palabras (pasadas 187 y 187b)
3.7.1 dejaba de contradecirse: Config ya no es 'de una sola fila' (arrastre de
N-08). N-04: el kappa = 1,00 del campo deja de presentarse como validacion
independiente. El vinculo con los autores se contaba tres veces; queda en 3.5.2
y en la validez interna. Citas, cifras y frases exigidas intactas.

Co-Authored-By: Claude Opus 5.5 <noreply@anthropic.com>
</commit_message>
<xml_diff>
--- a/avance/Tesis Postly Bontorno Hassan-1 v2.docx
+++ b/avance/Tesis Postly Bontorno Hassan-1 v2.docx
@@ -15234,7 +15234,7 @@
         <w:spacing w:after="240" w:line="276" w:lineRule="auto"/>
       </w:pPr>
       <w:r>
-        <w:t>Este Trabajo Integrador es una investigación aplicada de desarrollo tecnológico. Busca resolver un problema documentado en un contexto productivo —la carga operativa y el riesgo normativo de publicar contenido en un microemprendimiento de venta directa— (Hernández Sampieri et al., 2014) mediante el diseño, la implementación y la validación de un artefacto (Pressman, 2010). Combina pruebas técnicas controladas con una evaluación de campo que es un experimento intra-sujeto cruzado, con el orden de las condiciones contrabalanceado (Wohlin et al., 2012), sobre una muestra intencional y no probabilística. El §6.1 reporta esa evaluación sobre tres variables: la reducción del tiempo operativo, la exactitud de la detección de incumplimientos y la aceptación tecnológica.</w:t>
+        <w:t>Este Trabajo Integrador es una investigación aplicada de desarrollo tecnológico. Busca resolver un problema documentado en un contexto productivo —la carga operativa y el riesgo normativo de publicar en un microemprendimiento de venta directa— (Hernández Sampieri et al., 2014) mediante el diseño, la implementación y la validación de un artefacto (Pressman, 2010). Combina pruebas técnicas controladas con un experimento de campo intra-sujeto cruzado y contrabalanceado (Wohlin et al., 2012), sobre una muestra intencional, que mide tres variables: el tiempo operativo, la exactitud del detector de incumplimientos y la aceptación tecnológica (§6.1).</w:t>
       </w:r>
     </w:p>
     <w:p>
@@ -15272,7 +15272,7 @@
         <w:spacing w:before="240" w:after="240" w:line="240" w:lineRule="auto"/>
       </w:pPr>
       <w:r>
-        <w:t>El diseño sigue la Design Science Research (Hevner et al., 2004). A diferencia de los paradigmas que describen o explican fenómenos existentes, se orienta a crear y evaluar artefactos que resuelven problemas reales (Simon, 1996; Peffers et al., 2007), y Postly es por eso el eje de la investigación y no un subproducto de ella.</w:t>
+        <w:t>El diseño sigue la Design Science Research (Hevner et al., 2004), orientada a crear y evaluar artefactos que resuelven problemas reales y no a describir fenómenos existentes (Simon, 1996; Peffers et al., 2007): Postly es el eje de la investigación y no un subproducto de ella.</w:t>
       </w:r>
     </w:p>
     <w:p>
@@ -15280,7 +15280,7 @@
         <w:spacing w:before="240" w:after="240" w:line="240" w:lineRule="auto"/>
       </w:pPr>
       <w:r>
-        <w:t>El proceso sigue el ciclo de la DSRM (Peffers et al., 2007). Cómo se evalúa un artefacto —y no sólo cuándo— es un problema propio de este marco. La literatura del área distingue la evaluación formativa, que informa el diseño mientras se construye, de la sumativa, que juzga el artefacto terminado (Venable et al., 2016); Baskerville et al. (2026) retienen esa distinción y proponen sobre ella MEDS, un método de cuatro pasos para que la evaluación en DSR sea eficiente sin perder rigor. La fase 5 de este trabajo combina las dos. Las fases son:</w:t>
+        <w:t>El proceso sigue el ciclo de la DSRM (Peffers et al., 2007). La literatura distingue la evaluación formativa, que informa el diseño mientras se construye, de la sumativa, que juzga el artefacto terminado (Venable et al., 2016), y Baskerville et al. (2026) proponen sobre esa distinción MEDS, un método para evaluar con eficiencia sin perder rigor. La fase 5 de este trabajo combina las dos. Las fases son:</w:t>
       </w:r>
     </w:p>
     <w:p>
@@ -15398,7 +15398,7 @@
         <w:rPr>
           <w:bCs/>
         </w:rPr>
-        <w:t xml:space="preserve"> la fase combina dos instrumentos. El primero verifica el comportamiento determinista del sistema mediante pruebas funcionales de software (testing de caja negra y validación de APIs), orientadas a auditar su capacidad de detectar precios y de forzar las identidades visuales que los requerimientos fijan. El segundo es la evaluación con usuarias que el §3.4.3 y el §3.5 describen y el Capítulo 6 reporta: el cronometraje comparativo del tiempo operativo, el cuestionario de aceptación tecnológica y la validación del Módulo Centinela sobre contenido redactado por las consultoras. Ese segundo instrumento se incorporó después de definida la fase, y es el que sostiene las conclusiones sobre el uso del artefacto.</w:t>
+        <w:t xml:space="preserve"> combina dos instrumentos. Uno verifica el comportamiento determinista del sistema con pruebas funcionales de caja negra y de las APIs, en particular la detección de precios y la inserción de la firma. El otro es la evaluación con usuarias del §3.5 —cronometraje, cuestionario de aceptación y validación del Módulo Centinela sobre contenido de las consultoras—, que se incorporó después de definida la fase y sostiene las conclusiones sobre el uso.</w:t>
       </w:r>
     </w:p>
     <w:p>
@@ -15469,7 +15469,7 @@
         <w:spacing w:after="240" w:line="276" w:lineRule="auto"/>
       </w:pPr>
       <w:r>
-        <w:t>El desarrollo se organizó con Scrum (Schwaber y Sutherland, 2020), un marco iterativo apto para la incertidumbre técnica de integrar servicios de terceros y modelos de IA cambiantes (Beck et al., 2001). A diferencia del modelo en cascada, que exige fijar los requerimientos al comienzo (Sommerville, 2015), permitió ajustar la arquitectura en ciclos cortos a lo que revelaba cada integración, como el manejo de tokens o el peso del video.</w:t>
+        <w:t>El desarrollo se organizó con Scrum (Schwaber y Sutherland, 2020), un marco iterativo apto para la incertidumbre de integrar servicios de terceros y modelos de IA cambiantes (Beck et al., 2001). A diferencia del modelo en cascada (Sommerville, 2015), permitió ajustar la arquitectura en ciclos cortos a lo que revelaba cada integración.</w:t>
       </w:r>
     </w:p>
     <w:p>
@@ -15486,7 +15486,7 @@
         <w:spacing w:after="240" w:line="276" w:lineRule="auto"/>
       </w:pPr>
       <w:r>
-        <w:t>El trabajo se organizó sobre un backlog de historias priorizadas por su impacto en el MVP, en ciclos con planificación, desarrollo, pruebas, revisión y retrospectiva (Schwaber y Sutherland, 2020). Ese backlog no se conservó como artefacto (§3.3.2); lo que documenta su resultado es el Anexo A.</w:t>
+        <w:t>Se trabajó sobre un backlog de historias priorizadas por su impacto en el MVP, en ciclos con planificación, desarrollo, pruebas, revisión y retrospectiva (Schwaber y Sutherland, 2020).</w:t>
       </w:r>
     </w:p>
     <w:p>
@@ -15517,7 +15517,7 @@
         <w:spacing w:before="240" w:after="240" w:line="276" w:lineRule="auto"/>
       </w:pPr>
       <w:r>
-        <w:t>El trabajo se ordena en cuatro bloques por objetivo. El primero es la infraestructura y la autorización: servidor, bot de Telegram y OAuth 2.0. El segundo, la capa cognitiva: la integración con Gemini, los prompts de tres tonos y la salida JSON. El tercero, la lógica de negocio: el Módulo Centinela, la firma, la persistencia en Google Sheets y el manejo de errores. El cuarto, los datos y el multimedia: las métricas por Cron, la normalización de video con FFmpeg y la re-publicación.</w:t>
+        <w:t>El trabajo se ordena en cuatro bloques por objetivo: infraestructura y autorización (servidor, bot y OAuth 2.0); capa cognitiva (Gemini, prompts de tres tonos y salida JSON); lógica de negocio (Módulo Centinela, firma, persistencia y manejo de errores); y datos y multimedia (métricas, video con FFmpeg y re-publicación).</w:t>
       </w:r>
     </w:p>
     <w:p>
@@ -15525,7 +15525,7 @@
         <w:spacing w:after="240" w:line="276" w:lineRule="auto"/>
       </w:pPr>
       <w:r>
-        <w:t>Esa ordenación es por objetivo y no un registro llevado durante el trabajo: del marco no se conserva ninguno de sus artefactos —ni el Product Backlog, ni las fechas de cada Sprint, ni las salidas de las retrospectivas—. Lo que sí quedó es el repositorio versionado, del que el Anexo A.2 reconstruye la cronología efectiva con sus fechas y su alcance. El Anexo A documenta, Historia por Historia, lo entregado y su validación; el alcance comprometido está en los criterios de aceptación (§4.1). El Anexo C recoge en sustancia lo que habrían recogido las retrospectivas: los problemas técnicos encontrados y cómo se resolvieron.</w:t>
+        <w:t>Esa ordenación es por objetivo y no un registro llevado durante el trabajo: del marco no se conserva ninguno de sus artefactos —ni el Product Backlog, ni las fechas de cada Sprint, ni las retrospectivas—. Lo que quedó es el repositorio versionado, del que el Anexo A.2 reconstruye la cronología efectiva; el Anexo A documenta lo entregado Historia por Historia, y el Anexo C, los problemas técnicos y su solución.</w:t>
       </w:r>
     </w:p>
     <w:p>
@@ -15544,7 +15544,7 @@
         <w:spacing w:after="240" w:line="276" w:lineRule="auto"/>
       </w:pPr>
       <w:r>
-        <w:t>Durante la fase inicial de conceptualización y diseño de Postly, el equipo evaluó la factibilidad técnica de implementar un módulo de extracción automatizada de datos (Web Scraping o Data Crawling). La hipótesis inicial contemplaba que la usuaria ingresara el nombre de un producto y el motor n8n hiciera peticiones HTTP en segundo plano hacia el sitio web de la compañía madre. Descargaría así las imágenes en alta resolución y las serviría directamente en el chat para su publicación. El análisis de riesgos que los autores hicieron sobre esa alternativa —resumido en la Tabla 2, junto con los demás riesgos del proyecto— la descartó por operativamente inestable y hostil para la integridad de la cuenta del microemprendimiento. Es un juicio de los autores sobre su propio diseño, y la Tabla 2 declara conjeturados sus dos escenarios.</w:t>
+        <w:t>En la fase inicial el equipo evaluó un módulo de extracción automatizada (scraping): la usuaria ingresaría el nombre de un producto y n8n descargaría del sitio de la compañía las imágenes en alta resolución. El análisis de riesgos de los autores lo descartó (Tabla 2), con dos escenarios que la propia tabla declara conjeturados.</w:t>
       </w:r>
     </w:p>
     <w:p>
@@ -15552,8 +15552,7 @@
         <w:spacing w:after="240" w:line="276" w:lineRule="auto"/>
       </w:pPr>
       <w:r>
-        <w:lastRenderedPageBreak/>
-        <w:t>Los sitios corporativos se defienden del tráfico automatizado con cortafuegos de aplicación (WAF) y soluciones anti-bot, y la extracción masiva de contenido figura como amenaza en el catálogo de OWASP: «recolectar contenido de la aplicación para usarlo en otro lado» (OWASP Foundation, s.f.). Peticiones automatizadas repetidas contra el catálogo oficial serían probablemente rechazadas, por ejemplo con un Error 403 Forbidden; tampoco eso se probó. El equipo conjeturó además un escenario peor, el bloqueo de la cuenta de la consultora, que no se evaluó: no se ejecutó ninguna prueba contra la infraestructura de la compañía ni se localizó una política suya que lo establezca. La decisión de no implementar scraping no depende de ese escenario. Se sostiene en la propiedad intelectual del material, en los términos de servicio del sitio y en el tráfico que impondría sobre un servidor ajeno.</w:t>
+        <w:t>Los sitios corporativos se defienden del tráfico automatizado con cortafuegos de aplicación y soluciones anti-bot, y la extracción masiva de contenido figura como amenaza en el catálogo de OWASP (OWASP Foundation, s.f.). Que el sitio rechazara las peticiones o bloqueara la cuenta de la consultora no se probó. La decisión no depende de esos escenarios: se sostiene en la propiedad intelectual del material, en los términos de servicio del sitio y en el tráfico que impondría sobre un servidor ajeno.</w:t>
       </w:r>
     </w:p>
     <w:p>
@@ -15561,7 +15560,7 @@
         <w:spacing w:after="240" w:line="276" w:lineRule="auto"/>
       </w:pPr>
       <w:r>
-        <w:t>El diseño previó reemplazar la extracción por una redirección: un botón con un enlace profundo que abriera, en el navegador del teléfono de la usuaria, el repositorio oficial de la compañía, para que ella misma descargara la imagen autorizada. Esa redirección no se implementó. El sistema desplegado sólo recibe las imágenes que la usuaria envía por Telegram, y la elección de la fuente queda a su cargo (§4.4.2). La decisión de no extraer imágenes se sostiene igual, porque no depende de que exista esa alternativa.</w:t>
+        <w:t>El diseño previó reemplazar la extracción por un botón que abriera el repositorio oficial de la compañía, para que la usuaria descargara ella misma la imagen. No se implementó: el sistema sólo recibe lo que la usuaria envía por Telegram (§4.4.2), y la decisión de no extraer imágenes no depende de esa alternativa.</w:t>
       </w:r>
     </w:p>
     <w:p>
@@ -16142,7 +16141,7 @@
         <w:spacing w:after="240" w:line="276" w:lineRule="auto"/>
       </w:pPr>
       <w:r>
-        <w:t>La técnica de análisis aplicada al relevamiento del proceso manual fue modesta. No hubo sistema de categorías ni codificación: lo que se hizo fue una síntesis temática de enunciaciones concordantes. Su único registro conservado es la elicitación del Anexo D, donde a cada consultora se le pidió por separado que enunciara las restricciones que la marca le impone, y la síntesis se les devolvió para confirmación. Las observaciones de flujo de trabajo y la identificación de cuellos de botella que siguen no dejaron registro instrumental, de modo que lo que sostienen es el diseño del sistema y no ninguna afirmación empírica de este trabajo.</w:t>
+        <w:t>El relevamiento del proceso manual fue una síntesis temática de enunciaciones concordantes, sin sistema de categorías ni codificación. Su único registro conservado es la elicitación del Anexo D, en la que cada consultora enunció por separado las restricciones de la marca y confirmó después la síntesis. Las observaciones que siguen no dejaron registro instrumental: sostienen el diseño del sistema y no una afirmación empírica.</w:t>
       </w:r>
     </w:p>
     <w:p>
@@ -16169,7 +16168,7 @@
         <w:t>Observación no participante del flujo de trabajo real:</w:t>
       </w:r>
       <w:r>
-        <w:t xml:space="preserve"> Inspirada en técnicas etnográficas adaptadas a entornos digitales, se recorrió la secuencia de tareas procedimentales (selección, descarga, edición, redacción y posteo) involucradas en la generación de una sola publicación comercial. Esto permitió mapear la complejidad del flujo operativo manual (Dumas et al., 2018).</w:t>
+        <w:t xml:space="preserve"> se recorrió la secuencia de tareas de una publicación —selección, descarga, edición, redacción y posteo— para mapear la complejidad del flujo manual (Dumas et al., 2018).</w:t>
       </w:r>
     </w:p>
     <w:p>
@@ -16191,7 +16190,7 @@
         <w:rPr>
           <w:bCs/>
         </w:rPr>
-        <w:t xml:space="preserve"> el recorrido del proceso señaló tres puntos de fricción. Son el costo de oportunidad (tiempo invertido frente a retorno comercial), la carga cognitiva de redactar textos persuasivos y el riesgo de incumplir las normas de compliance de la matriz. La identificación fue cualitativa; la única medición del tiempo es el cronometraje del §6.1, posterior al diseño.</w:t>
+        <w:t xml:space="preserve"> el recorrido señaló tres puntos de fricción: el tiempo invertido frente al retorno comercial, la carga de redactar textos persuasivos y el riesgo de incumplir las normas de la marca. La identificación fue cualitativa; la única medición del tiempo es el cronometraje del §6.1, posterior al diseño.</w:t>
       </w:r>
     </w:p>
     <w:p>
@@ -16209,20 +16208,9 @@
         <w:t>Análisis contextual y documental del entorno de despliegue:</w:t>
       </w:r>
       <w:r>
-        <w:t xml:space="preserve"> Se realizó un estudio documentado de las arquitecturas, las restricciones técnicas (Rate Limits, formatos admitidos) y los términos de servicio (ToS) de las plataformas de destino, la API Graph de Instagram y </w:t>
-      </w:r>
-      <w:r>
-        <w:lastRenderedPageBreak/>
-        <w:t>Facebook. El estudio abarcó también las Pautas Mary Kay para el uso en los medios sociales (Mary Kay Inc., s.f.; véase Anexo D). Ese documento confirmó las fronteras y restricciones (NFR) del sistema: la elicitación con las consultoras las había enunciado antes, y el acceso a la fuente fue posterior, como el Anexo D declara.</w:t>
-      </w:r>
-    </w:p>
-    <w:p>
-      <w:pPr>
-        <w:spacing w:after="240" w:line="276" w:lineRule="auto"/>
-      </w:pPr>
-      <w:r>
-        <w:t>Este conjunto de técnicas orientó la definición de los requerimientos funcionales de Postly hacia necesidades de negocio reales. Su alcance es el que declara el primer párrafo de este apartado: sostiene el diseño del sistema, no una afirmación empírica.</w:t>
-      </w:r>
+        <w:t xml:space="preserve"> se estudiaron las restricciones técnicas y los términos de servicio de la Graph API de Instagram y Facebook, y las Pautas de la marca (Mary Kay Inc., s.f.; Anexo D). Las Pautas confirmaron las restricciones que las consultoras habían enunciado antes de que se accediera a la fuente.</w:t>
+      </w:r>
+      <w:r/>
     </w:p>
     <w:p>
       <w:pPr>
@@ -16246,15 +16234,7 @@
         <w:spacing w:after="240" w:line="276" w:lineRule="auto"/>
       </w:pPr>
       <w:r>
-        <w:t>La validación técnica no provino de encuestas sino de pruebas de software controladas, de caja negra y de caja blanca (Myers, 2004). El cuestionario de aceptación del §3.4.3 pertenece al otro instrumento de la fase de evaluación, el de campo, que se incorporó después.</w:t>
-      </w:r>
-    </w:p>
-    <w:p>
-      <w:pPr>
-        <w:spacing w:after="240" w:line="276" w:lineRule="auto"/>
-      </w:pPr>
-      <w:r>
-        <w:t>Las pruebas se organizaron en cuatro baterías técnicas, cuyos resultados reúne el Anexo E.5. La auditoría del módulo de compliance corre aparte, con su propio harness, y se reporta en el §6.1 (Anexo E.4). Las cinco se describen a continuación:</w:t>
+        <w:t>La validación técnica se hizo con pruebas de software controladas, de caja negra y de caja blanca (Myers, 2004), en cuatro baterías que reúne el Anexo E.5; la auditoría del módulo de compliance corre aparte y se reporta en el §6.1. Las cinco se describen a continuación:</w:t>
       </w:r>
     </w:p>
     <w:p>
@@ -16273,24 +16253,17 @@
         <w:t>Flujos de integración multimodal:</w:t>
       </w:r>
       <w:r>
-        <w:t xml:space="preserve"> Verificación de latencia y consistencia en la comunicación bidireccional entre la interfaz conversacional de Telegram y la API de </w:t>
-      </w:r>
-      <w:r>
-        <w:t>Gemini 2.5 Flash</w:t>
-      </w:r>
-      <w:r>
-        <w:t xml:space="preserve">, asegurando la correcta extracción de formato JSON para la generación de </w:t>
-      </w:r>
+        <w:t xml:space="preserve"> latencia y consistencia de la comunicación entre Telegram y Gemini 2.5 Flash, y extracción correcta del JSON de los copys.</w:t>
+      </w:r>
+      <w:r/>
+      <w:r/>
       <w:r>
         <w:rPr>
           <w:i/>
           <w:iCs/>
         </w:rPr>
-        <w:t>copywriting</w:t>
-      </w:r>
-      <w:r>
-        <w:t>.</w:t>
-      </w:r>
+      </w:r>
+      <w:r/>
     </w:p>
     <w:p>
       <w:pPr>
@@ -16311,7 +16284,7 @@
         <w:rPr>
           <w:bCs/>
         </w:rPr>
-        <w:t xml:space="preserve"> tiempo de acuse y de respuesta del bot sobre diez envíos del comando de inicio al disparador de Telegram. Se incorporó después del diseño original de las baterías, porque mide el umbral de respuesta de HU1.</w:t>
+        <w:t xml:space="preserve"> tiempo de acuse y de respuesta del bot sobre diez envíos del comando de inicio, que mide el umbral de HU1; se agregó después del diseño original.</w:t>
       </w:r>
     </w:p>
     <w:p>
@@ -16333,11 +16306,9 @@
         <w:rPr>
           <w:bCs/>
         </w:rPr>
-        <w:t xml:space="preserve"> normalización de un clip de video con los filtros de FFmpeg del backend, midiendo la memoria residente (RAM) del proceso. Es una sola normalización, sin concurrencia (Anexo E.5, n = 1): caracteriza el consumo de ese proceso, no el comportamiento del sistema bajo carga.</w:t>
-      </w:r>
-      <w:r>
-        <w:t xml:space="preserve"> La imagen no atraviesa FFmpeg (§4.4.2), de modo que no entra en esta batería.</w:t>
-      </w:r>
+        <w:t xml:space="preserve"> memoria residente de FFmpeg al normalizar un clip de video, una sola vez y sin concurrencia (n = 1): caracteriza ese proceso y no el sistema bajo carga. La imagen no atraviesa FFmpeg (§4.4.2).</w:t>
+      </w:r>
+      <w:r/>
     </w:p>
     <w:p>
       <w:pPr>
@@ -16361,18 +16332,15 @@
           <w:i/>
           <w:iCs/>
         </w:rPr>
-        <w:t>compliance</w:t>
+        <w:t>casos infractores inyectados a propósito para medir la tasa de captura (Recall) de las expresiones regulares; la inserción de la firma se verificó leyendo el código (§6.1.5).</w:t>
       </w:r>
       <w:r>
         <w:rPr>
           <w:b/>
           <w:bCs/>
         </w:rPr>
-        <w:t>:</w:t>
-      </w:r>
-      <w:r>
-        <w:t xml:space="preserve"> Inyección deliberada de casos de prueba infractores (textos engañosos con símbolos monetarios ocultos) para comprobar empíricamente la tasa de captura (Recall) de las expresiones regulares (RegEx). La inserción de la firma se verificó leyendo el código (§6.1.5).</w:t>
-      </w:r>
+      </w:r>
+      <w:r/>
     </w:p>
     <w:p>
       <w:pPr>
@@ -16393,14 +16361,12 @@
         <w:rPr>
           <w:bCs/>
         </w:rPr>
-        <w:t xml:space="preserve"> comprobación del canje del código de autorización por un token de larga duración y de su </w:t>
+        <w:t xml:space="preserve"> canje del código de autorización por un token de larga duración y su persistencia cifrada. El refresco automático de tokens no se implementó, y esa parte del instrumento no se ejecutó (§6.2, §8.1).</w:t>
       </w:r>
       <w:r>
         <w:rPr>
           <w:bCs/>
         </w:rPr>
-        <w:lastRenderedPageBreak/>
-        <w:t>persistencia cifrada. El diseño preveía testear además algoritmos de refresco automático; no se implementaron, de modo que esa parte del instrumento no se ejecutó (§6.2, §8.1).</w:t>
       </w:r>
     </w:p>
     <w:p>
@@ -16408,18 +16374,15 @@
         <w:spacing w:after="240" w:line="276" w:lineRule="auto"/>
       </w:pPr>
       <w:r>
-        <w:t xml:space="preserve">Los instrumentos técnicos y de </w:t>
+        <w:t>Se usaron además tres instrumentos de depuración:</w:t>
       </w:r>
       <w:r>
         <w:rPr>
           <w:i/>
           <w:iCs/>
         </w:rPr>
-        <w:t>debugging</w:t>
-      </w:r>
-      <w:r>
-        <w:t xml:space="preserve"> utilizados para materializar esta validación incluyeron:</w:t>
-      </w:r>
+      </w:r>
+      <w:r/>
     </w:p>
     <w:p>
       <w:pPr>
@@ -16443,28 +16406,22 @@
           <w:i/>
           <w:iCs/>
         </w:rPr>
-        <w:t>System Logs</w:t>
+        <w:t xml:space="preserve"> las trazas de ejecución de n8n, para auditar nodo por nodo, medir tiempos y detectar excepciones no controladas.</w:t>
       </w:r>
       <w:r>
         <w:rPr>
           <w:b/>
           <w:bCs/>
         </w:rPr>
-        <w:t>):</w:t>
-      </w:r>
-      <w:r>
-        <w:t xml:space="preserve"> Extracción y análisis de las trazas de ejecución en la consola de n8n para auditar el comportamiento paso a paso de los nodos lógicos, medir tiempos de respuesta y detectar excepciones no controladas (</w:t>
-      </w:r>
+      </w:r>
+      <w:r/>
       <w:r>
         <w:rPr>
           <w:i/>
           <w:iCs/>
         </w:rPr>
-        <w:t>Unhandled Exceptions</w:t>
-      </w:r>
-      <w:r>
-        <w:t>).</w:t>
-      </w:r>
+      </w:r>
+      <w:r/>
     </w:p>
     <w:p>
       <w:pPr>
@@ -16485,7 +16442,7 @@
         <w:rPr>
           <w:bCs/>
         </w:rPr>
-        <w:t xml:space="preserve"> simulación procedimental de escenarios reales de interacción transaccional, forzando los límites del sistema mediante entradas inesperadas (Edge Cases) para evaluar la tolerancia a fallos. Este instrumento se planificó y no se ejecutó como tal: lo que ocupó su lugar es el análisis de valores límite del §6.1, que se aplica al Módulo Centinela y no al conjunto de las transacciones. Ningún anexo reporta una matriz de casos de uso, y no cabe darla por ejecutada.</w:t>
+        <w:t xml:space="preserve"> simular escenarios de interacción con entradas inesperadas para evaluar la tolerancia a fallos. Se planificó y no se ejecutó: ocupó su lugar el análisis de valores límite del §6.1, que se aplica al Módulo Centinela y no al conjunto de las transacciones.</w:t>
       </w:r>
     </w:p>
     <w:p>
@@ -16507,7 +16464,7 @@
         <w:rPr>
           <w:bCs/>
         </w:rPr>
-        <w:t xml:space="preserve"> el diseño previó utilizar «Usuarios de Prueba» (Test Users) del panel de desarrolladores de Meta para validar los endpoints sin impacto visible. No se usaron. La validación se hizo contra la cuenta real de Instagram y la página real de Facebook del proyecto, que es lo que los Anexos A y E documentan, y las publicaciones de prueba se retiraron de las cuentas.</w:t>
+        <w:t xml:space="preserve"> el diseño previó los usuarios de prueba de Meta y no se usaron: la validación corrió contra la cuenta real de Instagram y la página real de Facebook del proyecto, y las publicaciones de prueba se retiraron (Anexos A y E).</w:t>
       </w:r>
     </w:p>
     <w:p>
@@ -16532,7 +16489,7 @@
         <w:spacing w:after="240" w:line="276" w:lineRule="auto"/>
       </w:pPr>
       <w:r>
-        <w:t>La evaluación es de escala piloto: no hay datos de uso masivo en producción ni una serie de ventas que permita medir el impacto comercial del sistema (protocolo en el Anexo E, resultados en el §6.1).</w:t>
+        <w:t>La evaluación es de escala piloto: no hay datos de uso masivo ni una serie de ventas que permita medir el impacto comercial (Anexo E; §6.1).</w:t>
       </w:r>
     </w:p>
     <w:p>
@@ -16559,7 +16516,7 @@
         <w:t>Cronometraje:</w:t>
       </w:r>
       <w:r>
-        <w:t xml:space="preserve"> el tiempo de una misma publicación hecha a mano y con Postly. El diseño preveía además cuantificar, mediante registros, la reducción de errores de cumplimiento en el uso corriente; esa cifra no se computó. El Capítulo 6 mide, en cambio, la exactitud del detector sobre conjuntos de casos.</w:t>
+        <w:t xml:space="preserve"> el tiempo de una misma publicación hecha a mano y con Postly. La reducción de errores de cumplimiento en el uso corriente, que el diseño preveía, no se computó: el Capítulo 6 mide la exactitud del detector sobre conjuntos de casos.</w:t>
       </w:r>
     </w:p>
     <w:p>
@@ -16586,8 +16543,7 @@
         <w:spacing w:after="240" w:line="276" w:lineRule="auto"/>
       </w:pPr>
       <w:r>
-        <w:lastRenderedPageBreak/>
-        <w:t>Con ellos, las tres variables del §3.5.4 cuentan con medición. Lo que resta es ampliar la muestra más allá de la escala piloto (§8.2).</w:t>
+        <w:t>Con ellos, las tres variables del §3.5.4 cuentan con medición.</w:t>
       </w:r>
     </w:p>
     <w:p>
@@ -16648,7 +16604,7 @@
         <w:spacing w:after="240" w:line="276" w:lineRule="auto"/>
       </w:pPr>
       <w:r>
-        <w:t>La población objetivo son las Consultoras de Belleza Independientes que usan las redes de Meta como canal principal de promoción y venta. Comparten cuatro rasgos que motivan el diseño. Operan por cuenta propia y gestionan su comunicación a la par de la venta. En su mayoría no tienen formación técnica en marketing digital ni en automatización. Y están sujetas a las normas comerciales de la compañía, que la propia fuente presenta como el medio para cumplir con los términos del Acuerdo de Consultora (Anexo D).</w:t>
+        <w:t>La población objetivo son las Consultoras de Belleza Independientes que usan las redes de Meta como canal principal de promoción y venta. Operan por cuenta propia y gestionan su comunicación a la par de la venta; en su mayoría no tienen formación técnica en marketing digital, y están sujetas a las normas comerciales de la compañía (Anexo D).</w:t>
       </w:r>
     </w:p>
     <w:p>
@@ -16697,12 +16653,9 @@
         <w:spacing w:after="240" w:line="276" w:lineRule="auto"/>
       </w:pPr>
       <w:r>
-        <w:t xml:space="preserve">La ampliación los reemplazó por seis criterios operativos declarados de antemano y registrados para cada una de las ocho participantes. Pesa más la composición de la muestra que su tamaño. Las tres participantes del piloto tienen relación previa con los autores: dos son conocidas y una tiene un vínculo </w:t>
-      </w:r>
-      <w:r>
-        <w:lastRenderedPageBreak/>
-        <w:t>familiar directo con uno de ellos. Sobre ellas recaen cuatro papeles: enunciaron las dos reglas que el Módulo Centinela codifica (Anexo D), aportaron las veintinueve piezas de contenido real con que se lo evaluó y etiquetaron esas piezas. Fueron además cronometradas y encuestadas junto con las cinco que sumó la ampliación, que no tenían relación previa con el equipo. Su única intervención en el diseño fue enunciar y confirmar esas dos reglas: no escribieron código ni etiquetaron los conjuntos controlados. El §3.5.5 trata esa acumulación como una amenaza única, porque la regla, el material que la pone a prueba y el juicio sobre ese material provienen de la misma fuente. Una cuarta consultora, ajena a la muestra de campo y madre de uno de los autores, aportó una segunda recolección de material gráfico, de la que sale el caso real R01. El objetivo no es la generalización estadística, sino evaluar el comportamiento del sistema y la fricción de uso en contextos reales (Hernández Sampieri et al., 2014).</w:t>
-      </w:r>
+        <w:t>La ampliación los reemplazó por seis criterios operativos declarados de antemano y registrados para cada una de las ocho participantes. Pesa más la composición de la muestra que su tamaño. Las tres participantes del piloto tienen relación previa con los autores —dos son conocidas y una tiene un vínculo familiar directo con uno de ellos—; las cinco que sumó la ampliación, no. Sobre esas tres recaen cuatro papeles: enunciaron las dos reglas que el Módulo Centinela codifica (Anexo D), aportaron las veintinueve piezas de contenido real con que se lo evaluó, las etiquetaron y fueron cronometradas y encuestadas. El §3.5.5 trata esa acumulación como una amenaza única. Una cuarta consultora, madre de uno de los autores y ajena a la muestra, aportó el material gráfico del caso real R01. El objetivo no es la generalización estadística, sino evaluar el comportamiento del sistema en contextos reales (Hernández Sampieri et al., 2014).</w:t>
+      </w:r>
+      <w:r/>
     </w:p>
     <w:p>
       <w:pPr>
@@ -16726,7 +16679,7 @@
         <w:spacing w:before="240" w:after="240" w:line="240" w:lineRule="auto"/>
       </w:pPr>
       <w:r>
-        <w:t>El tamaño muestral no lo fijó el mismo criterio para las tres variables. No se invoca el principio de «Saturación Teórica» (Glaser y Strauss, 1967), que es una lógica propia de la Teoría Fundamentada y exige material narrativo. No lo hay: la variable (c) se midió con doce ítems en escala Likert, un instrumento cuantitativo actitudinal, y el campo de comentario libre lo completaron cuatro de las ocho participantes, con una observación de uso cada una (Anexo E.3). Tampoco aplicaría a las variables (a) y (b), que son una proporción y un tiempo: la saturación gobierna el muestreo de material narrativo y no el de una medida numérica. El de la variable (a) lo fijó el criterio pragmático de disponibilidad declarado en el Anexo E: un mínimo de 3 consultoras y 3 publicaciones cada una, que cumplió el piloto (3 consultoras, 12 pares) y que la ampliación escaló a 8 consultoras y 32 pares. El §6.1 reporta sólo la ampliación. El de la (b) lo fijan los conjuntos de casos (40, 40, 25, 20 y 9) y el corpus de campo (29), y el de la (c), las ocho participantes de la ampliación. Un n de ese orden es frecuente en la experimentación en ingeniería de software. Kitchenham y Madeyski (2024) muestran que, para muestras pequeñas y no normales como ésta, una medida de tamaño del efecto no paramétrica —la probabilidad de superioridad— sesga menos que la diferencia media estandarizada, la familia a la que pertenece la d de Cohen. El §6.1 informa la d de Cohen junto a cada prueba, por ser la convención más extendida en el área, y el §6.1.6 agrega la medida que ellos recomiendan, la probabilidad de superioridad pareada, junto con una prueba de rangos con signo.</w:t>
+        <w:t>El tamaño muestral no lo fijó el mismo criterio para las tres variables. Ninguno es la saturación teórica (Glaser y Strauss, 1967), que gobierna el muestreo de material narrativo: aquí las variables son un tiempo, una proporción y una escala Likert, cuyo campo libre completaron cuatro de las ocho participantes (Anexo E.3). El de la variable (a) es un criterio pragmático de disponibilidad declarado en el Anexo E —un mínimo de 3 consultoras con 3 publicaciones—, que el piloto cumplió (12 pares) y la ampliación escaló a 8 consultoras y 32 pares; el §6.1 reporta sólo la ampliación. El de la (b) lo fijan los conjuntos de casos (40, 40, 25, 20 y 9) y el corpus de campo (29), y el de la (c), las ocho participantes. Para muestras pequeñas y no normales como ésta, Kitchenham y Madeyski (2024) muestran que la probabilidad de superioridad sesga menos que la d de Cohen: el §6.1 informa la d por convención, y el §6.1.6 agrega la probabilidad de superioridad pareada y una prueba de rangos con signo.</w:t>
       </w:r>
     </w:p>
     <w:p>
@@ -16759,7 +16712,7 @@
     </w:p>
     <w:p>
       <w:r>
-        <w:t>Para dar cumplimiento a la fase de Evaluación del marco DSRM (Peffers et al., 2007) declarada en el §3.2, se operacionalizan a continuación las variables mencionadas en el §3.5.3:</w:t>
+        <w:t>Las variables de la fase de evaluación (§3.2) se operacionalizan así:</w:t>
       </w:r>
     </w:p>
     <w:p>
@@ -16769,7 +16722,7 @@
     </w:p>
     <w:p>
       <w:r>
-        <w:t>La variable (a) sostiene la hipótesis del trabajo: que el sistema reduce el tiempo operativo de publicación en más de un 70 % respecto del proceso manual. Lo que se mide es el sistema entero —la conversación, la redacción por IA, la auditoría y la publicación en las dos redes—, y el diseño no aísla la interfaz conversacional de los demás componentes. Se contrasta con una prueba t unilateral contra el 70 % (H₀: reducción = 70 %), con la participante como unidad de análisis y sobre el tramo comparable, que descuenta del lado manual la adaptación de la imagen. Umbral, contraste y tramo se fijaron en el protocolo de la ampliación antes de la primera sesión (Anexo E.4). La regla que define el tiempo de Postly, el mayor entre el cronómetro y el intervalo del motor, no estaba en el protocolo: se adoptó al ver los datos, cuando el cronómetro resultó subregistrar la espera por el modelo. Esa regla produce por construcción una cota, y por eso el §6.1.6 acompaña el contraste con un análisis de sensibilidad.</w:t>
+        <w:t>La variable (a) sostiene la hipótesis del trabajo: que el sistema reduce el tiempo operativo de publicación en más de un 70 % respecto del proceso manual. Se mide el sistema entero, sin aislar la interfaz conversacional, con una prueba t unilateral contra el 70 % (H₀: reducción = 70 %), la participante como unidad de análisis y el tramo comparable, que descuenta del lado manual la adaptación de la imagen. Umbral, contraste y tramo se fijaron en el protocolo antes de la primera sesión (Anexo E.4). La regla que toma como tiempo de Postly el mayor entre el cronómetro y el intervalo del motor se adoptó al ver los datos, cuando el cronómetro resultó subregistrar la espera por el modelo; produce por construcción una cota, y el §6.1.6 la acompaña con un análisis de sensibilidad.</w:t>
       </w:r>
     </w:p>
     <w:p>
@@ -16802,27 +16755,24 @@
     </w:p>
     <w:p>
       <w:r>
-        <w:t>En línea con las buenas prácticas de investigación empírica en ingeniería de software (Wohlin et al., 2012), se declaran explícitamente las amenazas a la validez del diseño de evaluación propuesto en el §3.5.4; las cuestiones de ética de la investigación que ese diseño plantea se tratan aparte, en el §3.7.6. Storey et al. (2025) proponen, según su resumen, un marco de fiabilidad para la Design Science Research que distingue qué se evalúa —el artefacto, los métodos, las medidas y el conocimiento de diseño— y cuándo; las amenazas que siguen se declaran para el artefacto y para las mediciones:</w:t>
-      </w:r>
-    </w:p>
-    <w:p>
-      <w:r>
-        <w:t>Validez de constructo: las métricas de Recall/Precisión del Módulo Centinela dependen de la definición operacional de "caso positivo"; una definición demasiado laxa o estricta de qué cuenta como "precio detectable" puede sesgar el resultado. La amenaza se materializó y se corrigió durante el análisis: dos casos equivalentes —el ofrecimiento público de pasar los precios por canal privado, sin cifra alguna— habían recibido etiquetas opuestas en dos conjuntos distintos. El criterio adoptado para resolverlo es el del constructo que el módulo declara auditar: la referencia monetaria —precio, descuento u oferta— en canal público, aun sin cifra. Es una parte de la regla de mensaje comercial del Anexo D, y con él ambos casos quedan etiquetados como infractores. La corrección empeora las métricas reportadas en el §6.1 y se aplica igualmente.</w:t>
-      </w:r>
-    </w:p>
-    <w:p>
-      <w:r>
-        <w:t>Validez interna: la ampliación contrabalanceó el orden de las dos condiciones entre participantes y no detectó efecto de orden ni de aprendizaje entre la primera y la última publicación con Postly, aunque ninguno de los dos contrastes tiene potencia para ser concluyente con n = 8. Las observaciones de tiempo tampoco son independientes entre sí, por estar anidadas en un número reducido de participantes, lo que obliga a calcular el contraste estadístico sobre las medias por sujeto y no sobre el total de pares. A esas amenazas se suma la de características de demanda: de las ocho participantes, tres tienen relación previa con los autores desde el piloto —dos conocidas y una familiar— (§3.5.2) y cinco no tenían relación previa. La condición manual es autoadministrada —su duración depende del ritmo que la participante le imprima—, mientras la condición con Postly no lo es. La relación previa puede por lo tanto afectar a la magnitud medida, aunque el estrato «Ninguna» no mostró una reducción distinta de los otros dos. Y se suma una última, sobre el constructo de la comparación: la condición manual incluye adaptar la imagen al formato de feed y con Postly esa tarea no le corresponde a la usuaria. La ampliación registró esa duración como un tramo separado, de modo que la amenaza queda medida y no sólo declarada.</w:t>
-      </w:r>
-    </w:p>
-    <w:p>
-      <w:r>
-        <w:t xml:space="preserve">Arrastre en el Estudio 4: en las cuatro participantes con secuencia Postly primero, el copy manual de cada publicación se redactó después de ver los tres copys del sistema para el mismo producto, y el Estudio 4 compara justamente esos textos. El diseño contrabalanceado reparte el orden entre participantes, </w:t>
-      </w:r>
-      <w:r>
-        <w:lastRenderedPageBreak/>
-        <w:t>pero cada participante tiene un solo orden, de modo que el arrastre no queda neutralizado dentro de ella. El Anexo E.14.2 lo mide por secuencia y no encuentra que acerque el copy manual al de Postly, con la salvedad de que son cuatro participantes por secuencia.</w:t>
-      </w:r>
+        <w:t>Siguiendo a Wohlin et al. (2012), se declaran las amenazas a la validez de la evaluación del §3.5.4, para el artefacto y para las mediciones, en la línea del marco de fiabilidad que Storey et al. (2025) proponen, según su resumen, para la Design Science Research. La ética de la investigación se trata aparte, en el §3.7.6:</w:t>
+      </w:r>
+    </w:p>
+    <w:p>
+      <w:r>
+        <w:t>Validez de constructo: las métricas del Módulo Centinela dependen de qué se define como caso positivo. La amenaza se materializó y se corrigió durante el análisis: dos casos equivalentes —ofrecer en público pasar los precios por privado, sin cifra— tenían etiquetas opuestas en dos conjuntos. Se resolvió con el constructo que el módulo declara auditar, la referencia monetaria —precio, descuento u oferta— publicada aun sin cifra, y los dos quedaron como infractores, aunque eso empeora las métricas del §6.1.</w:t>
+      </w:r>
+    </w:p>
+    <w:p>
+      <w:r>
+        <w:t>Validez interna: la ampliación contrabalanceó el orden de las condiciones y no detectó efecto de orden ni de aprendizaje, aunque con n = 8 ninguno de los dos contrastes tiene potencia para ser concluyente. Las observaciones están anidadas en ocho participantes, de modo que el contraste se calcula sobre las medias por sujeto. Se suman las características de demanda: la condición manual es autoadministrada, y tres participantes tienen relación previa con los autores. El registro de reclutamiento las estratifica en «Ninguna» (n = 5), «Conocida» (n = 2) y «Familiar» (n = 1), y la reducción no difiere entre estratos (§6.1.6). Y la condición manual incluye adaptar la imagen al formato de feed, que con Postly no le corresponde a la usuaria: la ampliación registró ese tramo por separado, de modo que la amenaza queda medida.</w:t>
+      </w:r>
+    </w:p>
+    <w:p>
+      <w:r>
+        <w:t>Arrastre en el Estudio 4: las cuatro participantes con secuencia Postly primero redactaron su copy manual después de ver los tres del sistema para el mismo producto, y el contrabalanceo no neutraliza ese arrastre dentro de cada participante. El Anexo E.14.2 lo mide por secuencia y no encuentra que acerque el copy manual al de Postly, con cuatro participantes por secuencia.</w:t>
+      </w:r>
+      <w:r/>
     </w:p>
     <w:p>
       <w:r>
@@ -16831,35 +16781,28 @@
     </w:p>
     <w:p>
       <w:r>
-        <w:t>Validez de constructo, expectativas de los experimentadores: el etiquetado de los 130 casos controlados lo realizaron los propios desarrolladores del sistema, lo que introduce un sesgo de confirmación sobre esa porción de la evidencia. Esos 130 son los 97 casos de texto de las tres configuraciones, los cuatro escenarios de imagen que ellas describen y los 29 casos del canal visual (Anexos E.6 y E.8), que no son las 29 piezas del corpus de campo. De esos 29 el equipo compuso 27: quedan fuera la foto de producto sin sobreimpresión y el caso real R01. A ellos se suman los cuatro casos de los flujos de video, de carrusel y de re-publicación (Anexos E.9 a E.11), que el equipo también etiquetó y que no entran en ninguna matriz de confusión. La amenaza se mitigó en el estudio de campo, donde un evaluador externo al equipo, caracterizado en el Anexo E.1.2, etiquetó los 29 casos de forma independiente (κ = 1,00 respecto de la consultora autora del material, §6.1). Ocho consultoras ajenas al desarrollo ejecutaron además el cronometraje y el cuestionario TAM, cinco de ellas sin relación previa con el equipo. Subsiste, en cambio, para los conjuntos controlados, cuyo etiquetado no fue replicado por un tercero. Tres de esas ocho consultoras tienen a la vez relación previa con los autores, de modo que la mitigación que aportan tiene, para ese subconjunto, el límite que este mismo apartado declara.</w:t>
-      </w:r>
-    </w:p>
-    <w:p>
-      <w:r>
-        <w:t>Validez del instrumento de aceptación: la ampliación invirtió un ítem de cada constructo del cuestionario TAM y le agregó un control de atención (Anexo E.3), para controlar la aquiescencia, que el instrumento del piloto no podía detectar. Las ocho participantes pasaron el control de atención, y la correlación entre los ítems directos e invertidos de cada constructo fue negativa en los tres (§6.1.7), la dirección esperable si el instrumento mide aceptación y no aquiescencia. La amenaza de diseño del instrumento queda así mitigada, pero no descartada: con ocho participantes, esa correlación es compatible con la ausencia de aquiescencia sin probarla. Persiste, como en el piloto, que se administra inmediatamente después de la sesión de uso, y que tres de las participantes tienen relación previa con los autores.</w:t>
-      </w:r>
-    </w:p>
-    <w:p>
-      <w:r>
-        <w:t xml:space="preserve">Asimetría de cuentas de publicación: en la ampliación, la condición manual publicó en la cuenta real de cada participante y la condición Postly, en la cuenta de prueba del equipo. La razón es que el sistema aún no tenía </w:t>
-      </w:r>
-      <w:r>
-        <w:t>vinculada por OAuth (HU2) la cuenta de cada una de las 8 (protocolo de la ampliación, §10; Anexo E.4). El cronometraje no se ve afectado: los pasos que se miden van del material en mano a la confirmación del sistema, sin importar el destino. El cuestionario TAM sí puede verse afectado, en particular los ítems de intención de uso y de cumplimiento de marca, porque la participante evalúa un resultado que no llega a su propia audiencia; el puntaje se informa sin ajustar, con esta salvedad al lado. La comparación a ciegas del Estudio 4 tampoco se ve afectada, porque el evaluador juzga el texto del copy o el orden de las imágenes, y nunca una captura de la cuenta de destino.</w:t>
-      </w:r>
-    </w:p>
-    <w:p>
-      <w:r>
-        <w:t>Vínculo con el equipo: el registro de reclutamiento de la ampliación estratifica la relación de cada participante en «Ninguna» (n = 5), «Conocida» (n = 2) y «Familiar» (n = 1) —esta última, un vínculo familiar directo con uno de los autores—. Esa relación no se asocia con una reducción de tiempo mayor o menor entre estratos (§6.1.6). El Anexo E.6 recurre además a una cuarta consultora, ajena a la muestra de campo y madre de uno de los autores, para una segunda recolección de material gráfico, de la que sale el caso real R01.</w:t>
-      </w:r>
-    </w:p>
-    <w:p>
-      <w:r>
-        <w:t>Entorno de medición: las mediciones del Capítulo 6 corrieron sobre E2, una instancia local de n8n sobre Windows expuesta por un túnel, y no sobre E1, el servidor Linux en el que se validaron las catorce Historias de Usuario. E1 se dio de baja el 14 de septiembre de 2026, y el sistema corre desde el 1 de octubre sobre E3, donde las mediciones no se repitieron (Anexo B.1). Los dos entornos no se comportan igual en todo: el Anexo C.4 documenta diferencias de sistema operativo —las rutas temporales— y de validación en algunos nodos, que pueden deberse a la versión del motor instalada en cada uno. Las latencias del Anexo E.5 incluyen además el túnel y la máquina local, de modo que caracterizan E2 y no un despliegue. Lo que no depende del entorno sí se transfiere: las reglas del detector, idénticas carácter por carácter a las del workflow (Anexo E.4), y las respuestas del modelo, que es un servicio externo. La versión del workflow que produjo cada medición, y en qué difiere de la vigente, se detalla en el Anexo E.15.</w:t>
-      </w:r>
-    </w:p>
-    <w:p>
-      <w:r>
-        <w:t>Cegamiento del Estudio 4: el evaluador no veía de qué sistema venía cada copy, pero la regla de la marca deja una marca. Doce de los 32 copys manuales cierran con una invitación a contactar y ninguno de los de Postly (Anexo E.12), y el evaluador, que conoce las reglas, podía reconocer por eso el origen de parte de los pares. La preferencia de 26 sobre 32 debe leerse con esa reserva.</w:t>
+        <w:t>Validez de constructo, expectativas de los experimentadores: los 130 casos controlados —los 97 de texto, los cuatro escenarios de imagen de esos conjuntos y los 29 del canal visual (Anexos E.6 y E.8)— los etiquetaron los propios desarrolladores, y 27 de esos 29 los compuso el equipo. También etiquetó los cuatro casos de extremo a extremo de los Anexos E.9 a E.11, que no entran en ninguna matriz. En el estudio de campo, un evaluador externo al equipo etiquetó las 29 piezas por su cuenta (κ = 1,00 respecto de la consultora autora, §6.1); con un solo evaluador y 29 piezas, ese acuerdo atenúa la amenaza pero no equivale a una validación independiente. El cronometraje y el cuestionario los ejecutaron ocho consultoras, cinco sin relación previa con el equipo. La amenaza subsiste para los conjuntos controlados, cuyo etiquetado no replicó un tercero.</w:t>
+      </w:r>
+    </w:p>
+    <w:p>
+      <w:r>
+        <w:t>Validez del instrumento de aceptación: la ampliación invirtió un ítem por constructo y agregó un control de atención (Anexo E.3). Las ocho participantes lo pasaron, y la correlación entre ítems directos e invertidos fue negativa en los tres constructos (§6.1.7), lo esperable si el instrumento mide aceptación y no aquiescencia; con ocho participantes, eso es compatible con la ausencia de aquiescencia sin probarla. Persiste que se administra inmediatamente después de la sesión y que tres participantes tienen relación previa con los autores.</w:t>
+      </w:r>
+    </w:p>
+    <w:p>
+      <w:r>
+        <w:t>Asimetría de cuentas de publicación: en la ampliación, la condición manual publicó en la cuenta real de cada participante y la condición Postly en la cuenta de prueba del equipo, porque el sistema no tenía vinculadas por OAuth las cuentas de las ocho (protocolo de la ampliación, §10). El cronometraje no se ve afectado, porque mide del material en mano a la confirmación; tampoco el Estudio 4, cuyo evaluador juzga textos y órdenes y no capturas. Sí puede afectar al cuestionario, en particular a la intención de uso, porque la participante evalúa un resultado que no llega a su audiencia; el puntaje se informa sin ajustar.</w:t>
+      </w:r>
+      <w:r/>
+    </w:p>
+    <w:p>
+      <w:r>
+        <w:t>Entorno de medición: las mediciones del Capítulo 6 corrieron sobre E2, una instancia local sobre Windows expuesta por un túnel, y no sobre E1, el servidor en el que se validaron las catorce Historias. E1 se dio de baja el 14 de septiembre de 2026, y el sistema corre desde el 1 de octubre sobre E3, donde las mediciones no se repitieron (Anexo B.1). Los entornos difieren en las rutas temporales y en la validación de algunos nodos (Anexo C.4), y las latencias del Anexo E.5 incluyen el túnel. Se transfieren, en cambio, las reglas del detector, idénticas carácter por carácter a las del workflow (Anexo E.4), y las respuestas del modelo, que es un servicio externo. La versión del workflow que produjo cada medición se detalla en el Anexo E.15.</w:t>
+      </w:r>
+    </w:p>
+    <w:p>
+      <w:r>
+        <w:t>Cegamiento del Estudio 4: el evaluador no veía el origen de cada copy, pero doce de los 32 copys manuales cierran con una invitación a contactar y ninguno de los de Postly (Anexo E.12), de modo que podía reconocer el origen de parte de los pares. La preferencia de 26 sobre 32 se lee con esa reserva.</w:t>
       </w:r>
     </w:p>
     <w:p>
@@ -16879,7 +16822,7 @@
         <w:spacing w:before="240" w:after="240" w:line="240" w:lineRule="auto"/>
       </w:pPr>
       <w:r>
-        <w:t>La selección de las herramientas y tecnologías utilizadas en Postly responde a criterios de viabilidad técnica, capacidad de integración y alineación con los requerimientos funcionales y no funcionales del sistema (Bass et al., 2012). Los fundamentos conceptuales de cada tecnología están en el Marco Teórico (§2.1-§2.3); esta sección se limita a justificar por qué cada una se eligió frente a sus alternativas.</w:t>
+        <w:t>Las herramientas se eligieron por viabilidad técnica, capacidad de integración y alineación con los requerimientos (Bass et al., 2012). Sus fundamentos están en el §2.1 a §2.3; este apartado justifica la elección frente a las alternativas.</w:t>
       </w:r>
     </w:p>
     <w:p>
@@ -16913,7 +16856,7 @@
         <w:spacing w:before="240" w:after="240" w:line="240" w:lineRule="auto"/>
       </w:pPr>
       <w:r>
-        <w:t>Para la orquestación de los flujos de trabajo se seleccionó n8n. El §2.1 caracteriza la plataforma y sus tres pilares arquitectónicos; lo que toca a este apartado es por qué se la eligió frente a sus alternativas. La razón determinante fue el auto-hospedaje: ninguna de las iPaaS comerciales evaluadas en el §1.6.2 lo permite, y sin él la lógica de negocio y las credenciales de la consultora quedarían en infraestructura de un tercero, con el alcance que el §2.1.a precisa. A eso se suma la ausencia de costo de licenciamiento por ejecución, que para un proyecto sin financiamiento institucional no es un detalle de precio sino una condición de viabilidad.</w:t>
+        <w:t>La razón determinante para elegir n8n fue el auto-hospedaje: ninguna de las iPaaS comerciales del §1.6.2 lo permite, y sin él la lógica de negocio y las credenciales de la consultora quedarían en infraestructura de un tercero (§2.1.a). Se suma la ausencia de costo de licenciamiento por ejecución, que para un proyecto sin financiamiento es una condición de viabilidad.</w:t>
       </w:r>
     </w:p>
     <w:p>
@@ -16950,7 +16893,7 @@
         <w:spacing w:after="0" w:line="276" w:lineRule="auto"/>
       </w:pPr>
       <w:r>
-        <w:t>Inteligencia Artificial Multimodal (Gemini 2.5 Flash): entre los modelos fundacionales multimodales disponibles al momento del desarrollo se eligió Gemini 2.5 Flash por dos razones. Una es que su nivel gratuito no cobra por token, algo relevante para un MVP sin presupuesto de inferencia. La otra, una ventana de contexto suficiente para procesar hasta 10 imágenes simultáneas (§2.2).</w:t>
+        <w:t>Inteligencia Artificial Multimodal (Gemini 2.5 Flash): se eligió entre los modelos multimodales disponibles por dos razones. Su nivel gratuito no cobra por token, algo relevante para un MVP sin presupuesto de inferencia, y su ventana de contexto admite hasta 10 imágenes simultáneas (§2.2).</w:t>
       </w:r>
     </w:p>
     <w:p>
@@ -17033,19 +16976,16 @@
         <w:spacing w:before="240" w:after="240"/>
       </w:pPr>
       <w:r>
-        <w:t xml:space="preserve">Adhiriendo al paradigma de Privacy by Design o Privacidad desde el Diseño (Cavoukian, 2009), el sistema mitiga activamente el almacenamiento de Información Personal Identificable (PII) que no sea estrictamente necesaria para la ejecución del flujo de publicación. El modelo de datos del §5.1.1 muestra lo que el sistema persiste en su base de datos, que no es todo lo que </w:t>
-      </w:r>
-      <w:r>
-        <w:lastRenderedPageBreak/>
-        <w:t>el despliegue almacena: el inventario completo está en el párrafo siguiente. La hoja Usuarios guarda el identificador que Telegram asigna a la conversación —que hace de clave primaria y de filtro de multitenencia, sin un identificador interno distinto de él—, el identificador y el nombre de la página de Facebook vinculada, y el identificador de la cuenta de Instagram Business asociada. Guarda también la fecha de expiración del token y el token de acceso, cifrado con AES-256-GCM antes de persistirse (Anexo B.3). La firma corporativa y el dato de contacto que el sistema agrega a cada publicación no viven en Usuarios sino en la hoja Config, de una sola fila (Anexo B.4). Esa hoja no tiene clave de usuaria: con más de una consultora vinculada, todas publicarían el mismo contacto. La multitenencia que HU11 y el §5.2.2 describen alcanza a las credenciales y a las publicaciones, no a esa configuración, que hoy es de una sola consultora. La hoja de publicaciones —«Hoja 1» en la planilla— guarda el copy publicado, el estado, la fecha programada, las URIs de los activos multimedia y los identificadores de cada publicación en ambas redes. El identificador de la conversación es dato personal en cualquier marco de protección de datos, y se almacena porque es la dirección a la que el bot responde: sin él no hay flujo.</w:t>
-      </w:r>
+        <w:t>Adhiriendo a la Privacidad desde el Diseño (Cavoukian, 2009), el sistema evita almacenar Información Personal Identificable (PII) que no sea necesaria para el flujo de publicación. La hoja Usuarios guarda el identificador que Telegram asigna a la conversación —clave primaria y filtro de multitenencia—, el identificador y el nombre de la página de Facebook, el de la cuenta de Instagram Business, la vigencia del token y el token, cifrado con AES-256-GCM (Anexo B.3). La hoja Config guarda la firma y el contacto de cada consultora, en una fila con su identificador, y una fila general para quien no tiene una propia (Anexo B.4). La de publicaciones guarda el copy, el estado, la fecha programada, las URIs de los activos y los identificadores de cada publicación en ambas redes. El identificador de la conversación es dato personal en cualquier marco de protección de datos, y se almacena porque es la dirección a la que responde el bot.</w:t>
+      </w:r>
+      <w:r/>
     </w:p>
     <w:p>
       <w:pPr>
         <w:spacing w:before="240" w:after="240"/>
       </w:pPr>
       <w:r>
-        <w:t>Fuera de esas dos hojas, el despliegue almacena cinco cosas más, y declararlas es parte del principio. La hoja Config guarda la firma y el contacto de cada consultora, en una fila con su TelegramUserID, y una fila general para la que no tiene una propia. El historial de ejecuciones del motor n8n, en su base SQLite, conserva los updates completos de Telegram, que incluyen el nombre, el apellido y el identificador de quien escribe; en E3 el motor lo purga a los catorce días. El de E2, del que salen la Tabla 13 y la conciliación de tiempos del Anexo E.2, se conserva en la máquina de los autores, sin exposición pública. El armado de un carrusel usa un archivo del servidor como buffer (Anexo B.5), y la deduplicación de pulsaciones guarda identificadores de callback. Y los activos multimedia de las usuarias —las imágenes y los videos— se alojan en Cloudinary, que es infraestructura de un tercero. Las imágenes y los videos se suben antes de la auditoría visual, porque el modelo los lee por URL. Cuando el módulo bloquea una pieza por traer un precio, un nodo la borra de Cloudinary en paralelo al aviso, con el video y sus fotogramas; un bloqueo por el texto no borra nada, porque la usuaria corrige el copy y reintenta con las mismas imágenes. Lo subido antes del 1 de octubre de 2026 no se depuró. El principio que el sistema aplica no es, por lo tanto, que no haya ningún otro dato personal, sino que no se recolecta ninguno ajeno a la ejecución del flujo de publicación. El historial de ejecuciones es donde ese principio queda más expuesto, porque guarda el update entero y no el subconjunto que el flujo necesita. La purga de catorce días acota esa exposición sin eliminarla: durante ese plazo el historial guarda más de lo que el flujo necesita (§8.2).</w:t>
+        <w:t>Fuera de esas hojas, el despliegue almacena cuatro cosas más. El historial de ejecuciones de n8n conserva los updates completos de Telegram, con el nombre, el apellido y el identificador de quien escribe. En E3 se purga a los catorce días; el de E2, del que salen la Tabla 13 y la conciliación de tiempos del Anexo E.2, se conserva en la máquina de los autores. El armado de un carrusel usa un archivo del servidor como buffer (Anexo B.5), y la deduplicación guarda identificadores de callback. Las imágenes y los videos se alojan en Cloudinary, un tercero, y se suben antes de la auditoría visual porque el modelo los lee por URL. Cuando el módulo bloquea una pieza por un precio, la borra en paralelo al aviso; un bloqueo por el texto no borra nada, porque la usuaria reintenta con las mismas imágenes. Lo subido antes del 1 de octubre de 2026 no se depuró. El principio, por lo tanto, no es que no haya otro dato personal, sino que no se recolecta ninguno ajeno al flujo; el historial, que durante su plazo guarda el update entero, es donde queda más expuesto (§8.2).</w:t>
       </w:r>
     </w:p>
     <w:p>
@@ -17132,7 +17072,7 @@
         <w:spacing w:before="240" w:after="240"/>
       </w:pPr>
       <w:r>
-        <w:t>Usar modelos de lenguaje para redactar publicidad plantea problemas de veracidad, sesgo y alucinación (Jobin et al., 2019). Postly responde con un diseño Human-in-the-Loop: las salidas de Gemini son propuestas, y nada se publica sin la revisión, la edición y la confirmación explícita de la usuaria. La práctica lo respalda fuera de este trabajo: en las startups que producen contenido promocional con IA generativa, la edición manual sigue siendo necesaria para asegurar calidad y exactitud (Rezazadeh et al., 2025).</w:t>
+        <w:t>Usar modelos de lenguaje para redactar publicidad plantea problemas de veracidad, sesgo y alucinación (Jobin et al., 2019). Postly responde con un diseño Human-in-the-Loop: las salidas de Gemini son propuestas, y nada se publica sin la revisión y la confirmación explícita de la usuaria, una edición manual que la práctica en startups de contenido promocional con IA también encuentra necesaria (Rezazadeh et al., 2025).</w:t>
       </w:r>
     </w:p>
     <w:p>
@@ -17167,18 +17107,15 @@
         <w:spacing w:before="240" w:after="240"/>
       </w:pPr>
       <w:r>
-        <w:t xml:space="preserve">La génesis del sistema incorpora, por diseño, un módulo centinela de </w:t>
+        <w:t>Al detectar precios y forzar la nomenclatura autorizada, el módulo centinela reduce la exposición de la consultora al incumplimiento de la normativa de la compañía. No cabe atribuirle más que eso: un detector léxico y un concatenador de cadenas no previenen la competencia desleal, la publicidad engañosa ni el fraude marcario, y este trabajo no midió ningún efecto de ese orden. Lo que audita son las dos reglas de las Pautas que el Anexo D transcribe, que la propia fuente distingue de los Acuerdos de Consultora.</w:t>
       </w:r>
       <w:r>
         <w:rPr>
           <w:i/>
           <w:iCs/>
         </w:rPr>
-        <w:t>compliance de la marca</w:t>
-      </w:r>
-      <w:r>
-        <w:t>. Al detectar de forma automática la presencia de precios y forzar la nomenclatura autorizada ("Consultora de Belleza Independiente Mary Kay"), el sistema eleva la calidad técnica del posteo y reduce la exposición de la consultora al incumplimiento de la normativa de la compañía. No cabe atribuirle más que eso. Un detector léxico de precios y un concatenador de cadenas no previenen la competencia desleal, la publicidad engañosa ni el fraude marcario, y este trabajo no midió ningún efecto de ese orden. Lo que el módulo audita, en el alcance que el Capítulo 6 mide, son las dos reglas de las Pautas para el uso de los medios sociales que el Anexo D transcribe. Las Pautas no son el contrato: la propia fuente las distingue de los Acuerdos de Consultora, a los que remite por separado.</w:t>
-      </w:r>
+      </w:r>
+      <w:r/>
     </w:p>
     <w:p>
       <w:pPr>

</xml_diff>

<commit_message>
docs(tesis): N-05, Capitulo 4 condensado de 5.408 a 4.691 palabras (pasada 188)
Los criterios de aceptacion de las 14 Historias quedan como se redactaron antes
de medir; se acortan sus notas, la prosa de Diseno y los parrafos analiticos
(modo de falla, linea de contacto, relacion de aspecto, video, Figs. 2 y 3).
2.3: 'La Figura 1 representa ese flujo' (antecedente ambiguo).

Co-Authored-By: Claude Opus 5.5 <noreply@anthropic.com>
</commit_message>
<xml_diff>
--- a/avance/Tesis Postly Bontorno Hassan-1 v2.docx
+++ b/avance/Tesis Postly Bontorno Hassan-1 v2.docx
@@ -14806,7 +14806,7 @@
         <w:spacing w:after="240" w:line="276" w:lineRule="auto"/>
       </w:pPr>
       <w:r>
-        <w:t>La Figura 1 lo representa como diagrama de secuencia.</w:t>
+        <w:t>La Figura 1 representa ese flujo como diagrama de secuencia.</w:t>
       </w:r>
     </w:p>
     <w:p>
@@ -17292,7 +17292,7 @@
     <w:p/>
     <w:p>
       <w:r>
-        <w:t>Este capítulo describe cómo se implementó Postly: las catorce Historias de Usuario con sus criterios de aceptación (§4.1), el alcance del MVP (§4.2) y las dos piezas con más lógica propia, el Módulo Centinela y el procesamiento multimedia. Como propone la práctica ágil, los requerimientos se expresan por el valor que aportan a la usuaria (Beck et al., 2001).</w:t>
+        <w:t>Este capítulo describe la implementación de Postly: las catorce Historias de Usuario con sus criterios de aceptación (§4.1), el alcance del MVP (§4.2) y las dos piezas con más lógica propia, el Módulo Centinela (§4.3) y el procesamiento multimedia (§4.4).</w:t>
       </w:r>
     </w:p>
     <w:p/>
@@ -17321,18 +17321,16 @@
         <w:spacing w:after="240" w:line="276" w:lineRule="auto"/>
       </w:pPr>
       <w:r>
-        <w:t xml:space="preserve">Para que cada historia sea comprobable —el atributo «Testable» del modelo INVEST (Wake, 2003)— se la acompaña de criterios de aceptación: las </w:t>
-      </w:r>
-      <w:r>
-        <w:t>condiciones que el sistema debe cumplir para darla por terminada. Donde un criterio fija un umbral, el umbral se conserva como se redactó antes de medir, y el Anexo E.7 registra si se verificó. Los umbrales numéricos se fijaron antes de las mediciones de septiembre de 2026 que los contrastan; hasta entonces, varios criterios los expresaban sin cifra («latencia mínima»). Reescribirlo a la medida de lo observado le quitaría su función, que es comprometer un valor antes de conocerlo.</w:t>
-      </w:r>
+        <w:t>Para que cada historia sea comprobable —el atributo «Testable» del modelo INVEST (Wake, 2003)— se la acompaña de criterios de aceptación. Los umbrales numéricos se fijaron antes de las mediciones de septiembre de 2026 que los contrastan y se conservan como se redactaron; el Anexo E.7 registra si se verificó cada uno. Reescribirlos a la medida de lo observado les quitaría su función, que es comprometer un valor antes de conocerlo.</w:t>
+      </w:r>
+      <w:r/>
     </w:p>
     <w:p>
       <w:pPr>
         <w:spacing w:after="240" w:line="276" w:lineRule="auto"/>
       </w:pPr>
       <w:r>
-        <w:t>Las catorce historias se agrupan en cinco módulos. Su estado de cumplimiento se consolida en el Anexo A, y su trazabilidad hasta los Objetivos Específicos, en el Anexo E.13. Los resultados de cada una están en el Capítulo 6; acá se describe el diseño.</w:t>
+        <w:t>Las catorce historias se agrupan en cinco módulos. El Anexo A consolida su cumplimiento, el E.13 su trazabilidad hasta los objetivos y el Capítulo 6 sus resultados.</w:t>
       </w:r>
     </w:p>
     <w:p>
@@ -17411,7 +17409,7 @@
         <w:t>Diseño:</w:t>
       </w:r>
       <w:r>
-        <w:t xml:space="preserve"> el flujo extrae el identificador que Telegram asigna a la conversación y lo busca en la hoja Usuarios (columna TelegramUserID). Ese identificador es la única clave de usuaria del sistema y la que aísla la multitenencia (§5.2.2; modelo de datos del §5.1.1); según exista o no, la usuaria sigue a su sesión o al registro inicial.</w:t>
+        <w:t xml:space="preserve"> el flujo busca el identificador que Telegram asigna a la conversación en la hoja Usuarios. Es la única clave de usuaria del sistema y aísla la multitenencia (§5.2.2): si existe, la usuaria sigue a su sesión; si no, al registro inicial.</w:t>
       </w:r>
     </w:p>
     <w:p>
@@ -17605,7 +17603,7 @@
         <w:spacing w:after="0" w:line="276" w:lineRule="auto"/>
       </w:pPr>
       <w:r>
-        <w:t>El sistema debe poseer un endpoint de retorno (Callback URL) que reciba el código temporal y lo canjee por un token de larga duración, con una vigencia de hasta 60 días, tomada de la documentación del token de usuaria. El Anexo E.7 lo registra sin verificar: la Graph API devolvió el token de página sin campo de expiración, que es una propiedad de la respuesta y no la longevidad del token.</w:t>
+        <w:t>El sistema debe poseer un endpoint de retorno (Callback URL) que reciba el código temporal y lo canjee por un token de larga duración, con una vigencia de hasta 60 días, tomada de la documentación del token de usuaria. El Anexo E.7 lo registra sin verificar, porque la Graph API devuelve el token de página sin campo de expiración.</w:t>
       </w:r>
     </w:p>
     <w:p>
@@ -17831,7 +17829,7 @@
         <w:rPr>
           <w:bCs/>
         </w:rPr>
-        <w:t xml:space="preserve"> el servidor recibe la imagen por Telegram y la envía a la API de Gemini, que extrae los atributos del producto —tipo, color, textura, uso— y redacta un copy anclado a lo que ve (Visual Grounding). El efecto sobre el tiempo de publicación lo mide el §6.1.6, y la calidad del copy, el §6.1.8 y el Anexo E.14.</w:t>
+        <w:t xml:space="preserve"> el servidor envía la imagen a Gemini, que extrae los atributos del producto —tipo, color, textura, uso— y redacta un copy anclado a lo que ve (Visual Grounding). El efecto sobre el tiempo lo mide el §6.1.6, y la calidad del copy, el §6.1.8.</w:t>
       </w:r>
     </w:p>
     <w:p>
@@ -17859,7 +17857,7 @@
         <w:spacing w:after="0" w:line="276" w:lineRule="auto"/>
       </w:pPr>
       <w:r>
-        <w:t>El motor n8n debe ser capaz de recibir y procesar temporalmente imágenes de alta resolución (hasta 20 MB por archivo, el límite de la Telegram Bot API) sin recomprimirlas antes de enviarlas al LLM. Por la vía de ingesta que el §4.4.2 declara, ese tope no es alcanzable: Telegram entrega la foto ya transcodificada a JPEG, y Meta no publica imágenes de más de 8 MB (Meta for Developers, s.f.). El criterio se conserva como se fijó, y el Anexo E.7 lo registra sin verificar.</w:t>
+        <w:t>El motor n8n debe ser capaz de recibir y procesar temporalmente imágenes de alta resolución (hasta 20 MB por archivo, el límite de la Telegram Bot API) sin recomprimirlas antes de enviarlas al LLM. El Anexo E.7 lo registra sin verificar: Telegram entrega la foto ya transcodificada a JPEG, y Meta no publica imágenes de más de 8 MB (Meta for Developers, s.f.).</w:t>
       </w:r>
     </w:p>
     <w:p>
@@ -17871,7 +17869,7 @@
         <w:spacing w:after="0" w:line="276" w:lineRule="auto"/>
       </w:pPr>
       <w:r>
-        <w:t>El modelo debe restringirse mediante instrucciones de sistema a describir lo que ve en la imagen (Visual Grounding), para reducir el riesgo de alucinación. La alucinación no se midió como tasa; la evidencia disponible, acotada, está en el §7.2 y el Anexo E.14.</w:t>
+        <w:t>El modelo debe restringirse mediante instrucciones de sistema a describir lo que ve en la imagen (Visual Grounding), para reducir el riesgo de alucinación. La alucinación no se midió como tasa (§7.2; Anexo E.14).</w:t>
       </w:r>
     </w:p>
     <w:p>
@@ -17948,7 +17946,7 @@
         <w:rPr>
           <w:bCs/>
         </w:rPr>
-        <w:t xml:space="preserve"> la IA propone el orden del carrusel: una portada de mayor impacto visual y el resto en secuencia narrativa. La comparación de ese orden con el que arma la consultora y con el de envío la reportan el §6.1.8 y el Anexo E.14.</w:t>
+        <w:t xml:space="preserve"> la IA propone una portada de mayor impacto visual y el resto en secuencia narrativa; su comparación con el orden de la consultora y con el de envío está en el §6.1.8.</w:t>
       </w:r>
     </w:p>
     <w:p>
@@ -18193,7 +18191,7 @@
         <w:spacing w:after="240" w:line="276" w:lineRule="auto"/>
       </w:pPr>
       <w:r>
-        <w:t>Este módulo es el Módulo Centinela (§2.4): una capa que verifica cada texto y cada imagen antes de la llamada de publicación, para reducir el riesgo de incumplir las directrices de la compañía (Tarantino, 2008). El canal textual es determinista; el visual depende de que un modelo externo devuelva un veredicto legible (§4.3.1).</w:t>
+        <w:t>Este módulo es el Módulo Centinela (§2.4): verifica cada texto y cada imagen antes de publicar, para reducir el riesgo de incumplir las directrices de la compañía (Tarantino, 2008). El canal textual es determinista; el visual depende de que un modelo externo devuelva un veredicto legible (§4.3.1).</w:t>
       </w:r>
     </w:p>
     <w:p>
@@ -18481,7 +18479,7 @@
         <w:t>Diseño:</w:t>
       </w:r>
       <w:r>
-        <w:t xml:space="preserve"> el sistema inserta la firma «Consultora de Belleza Independiente Mary Kay» en cada copy, para diferenciar la cuenta de la consultora de una cuenta oficial de la marca. Es más estricto que la norma, que la exige en el nombre de la página de negocio y no al pie de cada publicación (Anexo D): lo que la literatura de cumplimiento de procesos llama sobrecumplimiento (Barrientos et al., 2026). Una concatenación de cadenas no previene la publicidad engañosa, y el §3.7.4 lo declara.</w:t>
+        <w:t xml:space="preserve"> el sistema inserta la firma «Consultora de Belleza Independiente Mary Kay» en cada copy, para diferenciar la cuenta de la consultora de una oficial de la marca. Es más estricto que la norma, que la exige en el nombre de la página y no al pie de cada publicación (Anexo D): un sobrecumplimiento, en los términos de Barrientos et al. (2026), que no previene la publicidad engañosa (§3.7.4).</w:t>
       </w:r>
     </w:p>
     <w:p>
@@ -18712,7 +18710,7 @@
         <w:spacing w:after="240" w:line="276" w:lineRule="auto"/>
       </w:pPr>
       <w:r>
-        <w:t>Al alcanzarse la marca de tiempo programada, el flujo debe ejecutarse de forma autónoma en el servidor, actualizando el estado y notificando el éxito de la transacción (o el volcado de cualquier excepción capturada) a través de un mensaje Push en Telegram. La Figura 2 modela el ciclo de vida completo de una publicación: los cuatro estados que puede adoptar —Pendiente, Programado, Publicado y Fallido— y las transiciones que los conectan, incluidas las de error.</w:t>
+        <w:t>Al alcanzarse la marca de tiempo programada, el flujo debe ejecutarse de forma autónoma en el servidor, actualizando el estado y notificando el éxito de la transacción (o el volcado de cualquier excepción capturada) a través de un mensaje Push en Telegram. La Figura 2 modela los cuatro estados de una publicación y sus transiciones, incluidas las de error.</w:t>
       </w:r>
     </w:p>
     <w:p>
@@ -19005,7 +19003,7 @@
         <w:t>Diseño:</w:t>
       </w:r>
       <w:r>
-        <w:t xml:space="preserve"> reutiliza la imagen de una publicación anterior y genera copys nuevos para ella. El propósito es editorial —reciclar un activo sin repetir el texto—, no eludir el filtro de contenido duplicado de Meta, que sería incompatible con los términos de la plataforma, que este trabajo no relevó.</w:t>
+        <w:t xml:space="preserve"> reutiliza la imagen de una publicación anterior con copys nuevos. El propósito es editorial, no eludir el filtro de contenido duplicado de Meta.</w:t>
       </w:r>
     </w:p>
     <w:p>
@@ -19087,7 +19085,7 @@
         <w:spacing w:after="240" w:line="276" w:lineRule="auto"/>
       </w:pPr>
       <w:r>
-        <w:t>Este módulo normaliza el video al formato que publica el sistema y recoge las métricas de interacción para mostrarlas en Mi Agenda. Sobre la imagen sólo aplica el relleno a 1:1 de la imagen única (§4.4.2). Convertir las métricas en recomendaciones era el propósito de diseño, y es la capa que el §8.1 declara no implementada.</w:t>
+        <w:t>Este módulo normaliza el video y recoge las métricas de interacción para Mi Agenda; sobre la imagen sólo aplica el relleno a 1:1 de la imagen única (§4.4.2). La capa que convertiría las métricas en recomendaciones no se implementó (§8.1).</w:t>
       </w:r>
     </w:p>
     <w:p>
@@ -19170,7 +19168,7 @@
         <w:t xml:space="preserve"> </w:t>
       </w:r>
       <w:r>
-        <w:t>El sistema interroga la duración real del archivo de video ejecutando FFmpeg sobre el binario recibido. Si la duración es igual o inferior a 60 segundos, el flujo de normalización continúa automáticamente. Si la supera, el sistema no descarta el archivo: informa a la usuaria la duración detectada y solicita una confirmación explícita para recortar el video a los primeros 60 segundos mediante un teclado interactivo (Inline Keyboard) con las opciones "Recortar" o "Cancelar". Este diseño prioriza la experiencia de usuario sobre el rechazo automático, evitando que una usuaria no técnica pierda un contenido válido por exceder el límite en pocos segundos.</w:t>
+        <w:t>El sistema interroga la duración real del archivo de video ejecutando FFmpeg sobre el binario recibido. Si la duración es igual o inferior a 60 segundos, el flujo de normalización continúa automáticamente. Si la supera, el sistema no descarta el archivo: informa a la usuaria la duración detectada y solicita una confirmación explícita para recortar el video a los primeros 60 segundos mediante un teclado interactivo (Inline Keyboard) con las opciones "Recortar" o "Cancelar". Así una usuaria no técnica no pierde un contenido válido por exceder el límite en pocos segundos.</w:t>
       </w:r>
     </w:p>
     <w:p>
@@ -19481,7 +19479,7 @@
           <w:sz w:val="20"/>
           <w:lang w:val="es-ES"/>
         </w:rPr>
-        <w:t>Nota. Fuente: elaboración propia. El flujo As-Is tiene cinco pasos y se reconstruye a partir del §1.2.a y del §3.4.1; su tramo operativo se cronometró (Anexo E.2). El flujo To-Be es el del sistema, recorrido de extremo a extremo sobre el entorno E1 (Anexo A, Anexo B.1), con las dos auditorías en el orden que describen el §5.2.1 y el Anexo B.4. La reducción del 76,7 % (n = 8; cota superior, §6.1.6) se midió sobre el tramo «material en mano hasta publicación confirmada». La selección y descarga de la imagen no computa en ninguna condición; la adaptación de la imagen la hace la usuaria en la manual y el sistema en Postly, que rellena la imagen única a 1:1 (§4.4.2).</w:t>
+        <w:t>Nota. Fuente: elaboración propia. El flujo As-Is se reconstruye a partir del §1.2.a y del §3.4.1, y su tramo operativo se cronometró (Anexo E.2). El To-Be es el del sistema, recorrido de extremo a extremo (Anexo A), con las dos auditorías en el orden del §5.2.1. La reducción del 76,7 % (n = 8; cota superior, §6.1.6) se midió sobre el tramo «material en mano hasta publicación confirmada», que excluye en las dos condiciones la selección y descarga de la imagen. La adaptación de la imagen la hace la usuaria en la condición manual y el sistema en Postly (§4.4.2).</w:t>
       </w:r>
     </w:p>
     <w:p>
@@ -19489,7 +19487,7 @@
         <w:spacing w:after="240" w:line="276" w:lineRule="auto"/>
       </w:pPr>
       <w:r>
-        <w:t>El MVP se definió con el criterio de Lean Startup (Ries, 2011): automatizar el ciclo básico de publicación y postergar lo periférico. La Figura 3 contrasta el proceso manual (As-Is), con sus cinco etapas a cargo de la consultora, con el flujo de Postly (To-Be), en el que la usuaria envía la foto, elige uno de los tres copys y confirma la publicación.</w:t>
+        <w:t>El MVP se definió con el criterio de Lean Startup (Ries, 2011): automatizar el ciclo básico de publicación y postergar lo periférico. La Figura 3 contrasta las cinco etapas manuales (As-Is) con el flujo de Postly (To-Be), en el que la usuaria envía la foto, elige un copy y confirma.</w:t>
       </w:r>
     </w:p>
     <w:p>
@@ -19674,7 +19672,7 @@
         <w:spacing w:line="240" w:lineRule="auto"/>
       </w:pPr>
       <w:r>
-        <w:t>El Módulo Centinela es una capa obligatoria del flujo, en la línea de la RegTech (Arner et al., 2017): toda publicación pasa por él. El canal textual es determinista; el visual delega el veredicto en un modelo externo y no hereda esa propiedad, con el alcance que declara el §4.3.1.</w:t>
+        <w:t>El Módulo Centinela es una capa obligatoria del flujo, en la línea de la RegTech (Arner et al., 2017): toda publicación pasa por él.</w:t>
       </w:r>
     </w:p>
     <w:p>
@@ -19789,7 +19787,7 @@
         <w:rPr>
           <w:bCs/>
         </w:rPr>
-        <w:t xml:space="preserve"> si cualquiera de los dos canales detecta una cifra monetaria, la publicación se detiene y el bot le pide a la usuaria que corrija el material. En el video hay un segundo caso: la normalización recorta el clip al encuadre vertical, y una placa de precio pegada a un borde puede quedar fuera. Ahí el módulo no bloquea, porque no habría infracción, pero avisa, porque el sistema estaría modificando el contenido en silencio. La regla es bloquear si el precio sobrevive al recorte y avisar si el recorte lo elimina (§6.1; Capítulo 7).</w:t>
+        <w:t xml:space="preserve"> si cualquiera de los dos canales detecta una cifra monetaria, la publicación se detiene y el bot pide corregir el material. En el video, la normalización recorta al encuadre vertical, y una placa de precio pegada a un borde puede quedar fuera. Ahí el módulo no bloquea, porque no habría infracción, pero avisa, porque el sistema modificaría el contenido en silencio (§6.1).</w:t>
       </w:r>
     </w:p>
     <w:p>
@@ -19811,7 +19809,7 @@
         <w:spacing w:after="240" w:line="276" w:lineRule="auto"/>
       </w:pPr>
       <w:r>
-        <w:t>Modo de falla de la detección visual. El protocolo anterior gobierna la rama positiva: detectada la cifra, el flujo se detiene. El comportamiento ante el fallo del propio detector no es simétrico, y de él depende el alcance real de la cobertura. La capa textual es determinista y evalúa siempre, de modo que no tiene un modo de falla propio. La visual depende de que un modelo externo devuelva un veredicto legible. Si la petición a la API falla o agota su cuota, el nodo de detección reintenta y, agotados los reintentos, la ejecución se interrumpe sin publicar. Pero si la API responde y el texto devuelto no es un JSON válido —porque el modelo antepuso prosa al objeto o lo truncó—, el nodo de parseo resuelve el veredicto como negativo y el contenido sigue hacia la publicación: ese tramo es fail-open. Es una decisión deliberada, porque fallar en el sentido contrario dejaría a la consultora sin publicar cada vez que el modelo se desvía del formato pedido. Implica, no obstante, que el bloqueo del canal visual depende además de la forma de la respuesta. El del canal textual es determinista, aunque tampoco detecta todas las formas del precio (§6.1.1). El Anexo E.6 documenta que el script con que se validó este canal replica el mismo parseo tolerante, de modo que la medición del §6.1 se hizo sobre el comportamiento real del nodo y no sobre uno idealizado.</w:t>
+        <w:t>Modo de falla de la detección visual. La capa textual evalúa siempre y no tiene un modo de falla propio; la visual depende de que un modelo externo devuelva un veredicto legible. Si la petición a la API falla o agota su cuota, el nodo reintenta y, agotados los reintentos, la ejecución se interrumpe sin publicar. Pero si la API responde con un texto que no es un JSON válido —porque el modelo antepuso prosa o lo truncó—, el veredicto se resuelve como negativo y el contenido sigue hacia la publicación: ese tramo es fail-open. Es deliberado, porque fallar en el sentido contrario dejaría a la consultora sin publicar cada vez que el modelo se desvía del formato, y significa que el bloqueo visual depende también de la forma de la respuesta. El script con que se validó el canal replica ese parseo tolerante (Anexo E.6), de modo que la medición del §6.1 corresponde al comportamiento real del nodo.</w:t>
       </w:r>
     </w:p>
     <w:p>
@@ -19834,7 +19832,7 @@
         <w:spacing w:after="240" w:line="276" w:lineRule="auto"/>
       </w:pPr>
       <w:r>
-        <w:t>La norma exige la nomenclatura en el nombre de la página de negocio y al identificarse en sitios patrocinados, no al pie de cada publicación (§2.4, Anexo D): la inserción incondicional es una política que el sistema se impone. Después de la confirmación de la usuaria, un nodo de código concatena la leyenda «Consultora de Belleza Independiente Mary Kay» al final del texto, sin condición, y la misma leyenda se aplica en las dos redes.</w:t>
+        <w:t>La norma exige la nomenclatura en el nombre de la página de negocio y al identificarse en sitios patrocinados, no al pie de cada publicación (§2.4; Anexo D): la inserción incondicional es una política que el sistema se impone. Tras la confirmación de la usuaria, un nodo de código concatena la leyenda al final del texto, igual en las dos redes.</w:t>
       </w:r>
     </w:p>
     <w:p>
@@ -19842,12 +19840,9 @@
         <w:spacing w:after="240" w:line="276" w:lineRule="auto"/>
       </w:pPr>
       <w:r>
-        <w:t xml:space="preserve">El nodo agrega, además de la firma, la línea de contacto que la hoja Config guarda para la consultora. En las 41 ejecuciones del historial de E2 que van de las sesiones del 26 y 27 de septiembre a las pruebas del 28, esa línea es la misma: un identificador de Instagram y un número de WhatsApp, sin verbo ni invitación. Se concatena a cada publicación sin condición. Las Pautas definen el mensaje comercial por el acto y lo ejemplifican con «¡Pregúntame cómo </w:t>
-      </w:r>
-      <w:r>
-        <w:lastRenderedPageBreak/>
-        <w:t>puedes conseguirlo!» (p. 3), una invitación a contactar. Una línea de datos no es ese acto, pero cumple su función, que es ofrecer el canal para que quien lee escriba, y la fuente no dice si un dato de contacto al pie de un mensaje informativo lo vuelve comercial. Este trabajo no puede resolverlo con la letra, y lo declara como una pregunta abierta. Tiene tres consecuencias. Las mediciones del Anexo E.12 (0/15 y 0/32) se tomaron sobre el copy que genera el modelo, antes de que el nodo concatene la firma y el contacto, de modo que no alcanzan a esa línea. La línea es idéntica en cada publicación y no depende del modelo, así que ninguna corrección del prompt la modifica. Y su contenido lo fija la consultora en la hoja: Postly no la obliga a poner un contacto, pero tampoco la avisa de que podría ser comercial. Queda como riesgo residual, con la recomendación de hacerla opcional y de consultarla con la Compañía (§8.2).</w:t>
-      </w:r>
+        <w:t>El nodo agrega, además de la firma, la línea de contacto que la hoja Config guarda para la consultora. En las 41 ejecuciones de E2 que van de las sesiones del 26 y 27 de septiembre a las pruebas del 28, esa línea es un identificador de Instagram y un número de WhatsApp, sin verbo ni invitación. Las Pautas ejemplifican el mensaje comercial con una invitación a contactar —«¡Pregúntame cómo puedes conseguirlo!» (p. 3)—. Una línea de datos no es ese acto, pero cumple su función, y la fuente no dice si un contacto al pie de un mensaje informativo lo vuelve comercial. Este trabajo lo declara como pregunta abierta, con tres consecuencias. Las mediciones del Anexo E.12 (0/15 y 0/32) se tomaron sobre el copy del modelo, antes de la concatenación, y no alcanzan a esa línea; ninguna corrección del prompt la modifica; y su contenido lo fija la consultora, a quien Postly no avisa de que podría ser comercial. Queda como riesgo residual, con la recomendación de hacerla opcional y de consultarla con la Compañía (§8.2).</w:t>
+      </w:r>
+      <w:r/>
     </w:p>
     <w:p>
       <w:pPr>
@@ -19984,14 +19979,12 @@
         <w:rPr>
           <w:bCs/>
         </w:rPr>
-        <w:t xml:space="preserve"> la ingesta acepta únicamente mensajes de tipo fotografía de Telegram, que la plataforma entrega ya transcodificados a JPEG cualquiera sea el formato que haya generado el teléfono. Eso evita los errores de renderizado (Error 400 Bad Request) que provocarían en las plataformas de destino los formatos modernos de </w:t>
+        <w:t xml:space="preserve"> la ingesta acepta sólo mensajes de tipo fotografía, que Telegram entrega ya transcodificados a JPEG; eso evita los errores que formatos como HEIC o WebP provocarían en las plataformas de destino. Una imagen enviada como archivo adjunto, la vía por la que esos formatos llegarían sin transcodificar, no entra en el flujo. La estandarización es una propiedad del canal de ingesta y no una subrutina del sistema, y no se midió.</w:t>
       </w:r>
       <w:r>
         <w:rPr>
           <w:bCs/>
         </w:rPr>
-        <w:lastRenderedPageBreak/>
-        <w:t>Apple o Android, como HEIC o WebP. La contrapartida está en el otro extremo: una imagen enviada como archivo adjunto, que es la vía por la que esos formatos llegarían sin transcodificar, no entra en el flujo porque el enrutador sólo reconoce fotografías. La estandarización es entonces una propiedad del canal de ingesta y no una subrutina propia del sistema, y no se la sometió a medición.</w:t>
       </w:r>
     </w:p>
     <w:p>
@@ -20016,7 +20009,7 @@
         <w:t>Relación de aspecto:</w:t>
       </w:r>
       <w:r>
-        <w:t xml:space="preserve"> el diseño contemplaba aplicar un redimensionamiento escalar para forzar una relación de aspecto uniforme —1:1 o 4:5— entre las imágenes que componen un carrusel, y evitar así que Instagram fragmente la publicación o le aplique bordes negros (letterboxing). Esa subrutina no llegó a implementarse para el carrusel. La imagen única, en cambio, sí se normaliza: antes de publicar en las dos redes, el flujo inmediato la rellena a 1:1 con fondo blanco (transformación c_pad de Cloudinary, nodo «Resolucion - IG»), lo mismo que la reanudación desde la agenda. Así queda dentro del rango que admite la Graph API, de 4:5 a 1,91:1 (Meta for Developers, s.f.): una foto vertical de 3:4 y otra de 4:5 se publicaron en Instagram sin rechazo en pruebas del 28 de septiembre de 2026 (ejecuciones 813 y 819). El carrusel, la publicación programada y la re-publicación suben cada imagen sin transformación y con su proporción original, y el sistema no verifica ese rango antes de publicar. Un carrusel con una imagen de 3:4 —fuera del rango documentado— y otra de 4:5 se publicó sin rechazo el mismo día (ejecución 825): la plataforma admitió en la práctica algo más que lo que documenta. Una proporción más extrema no se probó, y la normalización del carrusel se traslada a las recomendaciones del §8.2.</w:t>
+        <w:t xml:space="preserve"> el diseño preveía forzar una relación de aspecto uniforme —1:1 o 4:5— entre las imágenes de un carrusel, para que Instagram no lo fragmente ni le agregue bordes negros, y esa subrutina no se implementó. La imagen única, en cambio, se rellena a 1:1 con fondo blanco antes de publicar en las dos redes, lo mismo que la reanudación desde la agenda. Queda así dentro del rango de 4:5 a 1,91:1 que admite la Graph API (Meta for Developers, s.f.): una foto de 3:4 y otra de 4:5 se publicaron sin rechazo el 28 de septiembre de 2026 (ejecuciones 813 y 819). El carrusel, la publicación programada y la re-publicación suben cada imagen con su proporción original y sin verificar ese rango. Un carrusel con una imagen de 3:4 y otra de 4:5 se publicó sin rechazo el mismo día (ejecución 825), pero una proporción más extrema no se probó, y la normalización del carrusel queda entre las recomendaciones del §8.2.</w:t>
       </w:r>
     </w:p>
     <w:p>
@@ -20064,12 +20057,9 @@
         <w:t>Control Determinista de Duración:</w:t>
       </w:r>
       <w:r>
-        <w:t xml:space="preserve"> El sistema determina la duración real del archivo invocando FFmpeg en modo de solo lectura de metadatos. El servidor no cuenta con la utilidad ffprobe instalada de forma independiente, por lo que la duración se extrae parseando la salida estándar de FFmpeg (Anexo B.9). Cuando la duración supera los 60 segundos, o cuando no se la puede leer, el sistema solicita a la usuaria una confirmación explícita para recortar el video a ese límite, en lugar de rechazar la transacción, alineándose con los límites recomendados para los Reels de Instagram. Que el caso de la duración ilegible tome esa misma rama es una corrección posterior a la </w:t>
-      </w:r>
-      <w:r>
-        <w:lastRenderedPageBreak/>
-        <w:t>evaluación del Capítulo 6: antes la guarda no se disparaba y el video seguía sin control de duración (§6.1, Anexo E.4).</w:t>
-      </w:r>
+        <w:t xml:space="preserve"> el sistema lee la duración del video invocando FFmpeg en modo de metadatos, porque el servidor no tiene ffprobe (Anexo B.9). Si supera los 60 segundos, o si no se la puede leer, pide a la usuaria confirmación para recortarlo a ese límite en lugar de rechazarlo. Que la duración ilegible tome esa rama es una corrección posterior a la evaluación del Capítulo 6: antes, ese video seguía sin control de duración (§6.1; Tabla 16).</w:t>
+      </w:r>
+      <w:r/>
     </w:p>
     <w:p>
       <w:pPr>
@@ -20086,7 +20076,7 @@
         <w:spacing w:before="240" w:after="240" w:line="276" w:lineRule="auto"/>
       </w:pPr>
       <w:r>
-        <w:t>Relación de Aspecto Nativa: El sistema normaliza de forma forzada la relación de aspecto de todo video recibido a 1080×1920 píxeles (formato vertical 9:16), en lugar de validar y rechazar los archivos que no cumplen ese formato de origen. Es el formato que Meta recomienda para contenido inmersivo, aunque la API admite un rango más amplio (§7.4). Esa decisión no es neutral sobre el contenido. La normalización escala para cubrir y recorta al centro, de modo que sobre un video horizontal de 16:9 sólo sobrevive el tercio central del ancho. Todo lo que la usuaria haya puesto contra un borde —una placa, una marca de agua, un texto— desaparece del material publicado sin que ella lo pida. El §6.1 reporta el caso en que eso se cruza con el compliance.</w:t>
+        <w:t>Relación de Aspecto Nativa: todo video se normaliza a 1080×1920 (9:16), el formato que Meta recomienda para contenido inmersivo, aunque la API admite un rango más amplio (§7.4). La decisión no es neutral: la normalización escala para cubrir y recorta al centro, de modo que de un video de 16:9 sólo sobrevive el tercio central, y lo que la usuaria haya puesto contra un borde desaparece sin que lo pida. El §6.1 reporta el caso en que eso se cruza con el compliance.</w:t>
       </w:r>
     </w:p>
     <w:p>
@@ -20104,7 +20094,7 @@
         <w:spacing w:before="240" w:after="240" w:line="276" w:lineRule="auto"/>
       </w:pPr>
       <w:r>
-        <w:t>Gestión de errores: si FFmpeg no puede procesar el archivo, el bot interrumpe el flujo y se lo informa a la usuaria con un mensaje claro, para que lo corrija en su editor. El exceso de duración no es uno de esos casos: ante un video de más de 60 segundos, o uno cuya duración no se puede leer, el bot pregunta si recortar.</w:t>
+        <w:t>Gestión de errores: si FFmpeg no puede procesar el archivo, el bot interrumpe el flujo y se lo informa a la usuaria para que lo corrija; el exceso de duración, en cambio, lleva a la pregunta de recorte.</w:t>
       </w:r>
     </w:p>
     <w:p>

</xml_diff>

<commit_message>
docs(tesis): N-05, Capitulo 5 condensado de 3.539 a 2.365 palabras (pasadas 189 y 189b)
5.2.2 ya no dice que Config no tiene clave de usuaria (arrastre de N-08). El
orden de las dos auditorias se contaba cuatro veces; quedan la nota de la
Figura 6 y una frase. Notas de las Figuras 4, 5 y 6 mas cortas, sin perder
ninguna aclaracion tecnica.

Co-Authored-By: Claude Opus 5.5 <noreply@anthropic.com>
</commit_message>
<xml_diff>
--- a/avance/Tesis Postly Bontorno Hassan-1 v2.docx
+++ b/avance/Tesis Postly Bontorno Hassan-1 v2.docx
@@ -20204,7 +20204,7 @@
         <w:spacing w:after="240" w:line="276" w:lineRule="auto"/>
       </w:pPr>
       <w:r>
-        <w:t>Este capítulo reúne la arquitectura del sistema y la interfaz por la que la usuaria lo opera, que los capítulos anteriores describían por separado. El §5.1 presenta la macro-arquitectura en notación C4 y el modelo de datos de la capa de persistencia. El §5.2 desciende a los flujos de trabajo que la ejecutan y documenta la interfaz conversacional real con capturas del sistema. El §5.3 recorre la experiencia de la usuaria de extremo a extremo, desde el enrolamiento hasta la consulta de métricas.</w:t>
+        <w:t>Este capítulo reúne la arquitectura del sistema y la interfaz por la que la usuaria lo opera: la macro-arquitectura en notación C4 y el modelo de datos (§5.1), los flujos de trabajo con capturas de la interfaz real (§5.2) y el recorrido de la usuaria (§5.3).</w:t>
       </w:r>
     </w:p>
     <w:p>
@@ -20331,7 +20331,7 @@
           <w:i/>
           <w:sz w:val="20"/>
         </w:rPr>
-        <w:t>Nota. Fuente: elaboración propia. Nivel de contexto y de componentes: los recuadros dentro de la frontera son componentes de un único proceso n8n, no contenedores C4. El callback OAuth y los sub-workflows de publicación son workflows independientes de la misma instancia (Anexo B.2). El Módulo Centinela son nodos de función del mismo proceso; su canal visual es una llamada a Gemini, fuera de la frontera. El bot de Telegram y la persistencia corren en infraestructura de terceros y quedan fuera de la frontera del sistema. La publicación la emite el orquestador, que cumple el papel de capa de integración (§5.1.1); el Centinela audita y no publica. Cloudinary es un paso intermedio obligatorio en todos los flujos que publican: cada imagen y cada video se suben allí para que la Graph API pueda descargarlos (§4.4.2; Anexos B.9, C.6 y E.5). La persistencia es un almacenamiento tabular, sin modelo relacional (Anexo B.5).</w:t>
+        <w:t>Nota. Fuente: elaboración propia. Niveles de contexto y de componentes: los recuadros dentro de la frontera son componentes de un único proceso n8n, no contenedores C4; el callback OAuth y los sub-workflows de publicación son workflows independientes de la misma instancia (Anexo B.2). El Centinela son nodos de función del mismo proceso, cuyo canal visual llama a Gemini, fuera de la frontera; audita y no publica. Telegram, la persistencia y Cloudinary —por donde pasa todo activo publicado, para que la Graph API lo descargue (§4.4.2)— corren en infraestructura de terceros. La persistencia es un almacenamiento tabular, sin modelo relacional (Anexo B.5).</w:t>
       </w:r>
     </w:p>
     <w:p>
@@ -20339,30 +20339,24 @@
         <w:spacing w:after="240" w:line="276" w:lineRule="auto"/>
       </w:pPr>
       <w:r>
-        <w:t xml:space="preserve">La macro-arquitectura de Postly es un orquestador centralizado dirigido por eventos, con bajo acoplamiento y alta cohesión (Erl, 2005; Newman, 2015). Es un workflow principal de 213 nodos ejecutado en un único proceso n8n, que guarda su propio historial de ejecuciones en SQLite (Anexo B.1, B.2); la persistencia del sistema es la de Google Sheets (§5.1.1). Sus componentes no se despliegan, versionan ni escalan por separado, y Dragoni et al. (2017) separan el monolito del microservicio justamente por la ejecución y el </w:t>
-      </w:r>
-      <w:r>
-        <w:lastRenderedPageBreak/>
-        <w:t>despliegue independientes: los módulos de un monolito no pueden ejecutarse por separado, y un microservicio es un proceso independiente, desplegado en aislamiento. Postly queda del lado del primero, aunque consuma APIs de terceros de forma desacoplada. La modularidad facilita el mantenimiento y el aislamiento de fallos sin perder la simplicidad operativa de una sola instancia autoalojada (Bass et al., 2012), que corre en el modo de ejecución «regular» del motor y no en el modo de cola con procesos trabajadores separados (n8n GmbH, s.f.). La Figura 4 presenta esa arquitectura en notación C4, en sus niveles de contexto y de componentes. Dentro de la frontera auto-hospedada corren, en un mismo proceso, el orquestador, el Módulo Centinela y los dos disparadores programados. El bot de Telegram y la persistencia quedan fuera, en infraestructura de terceros, igual que la inferencia, la publicación y el almacenamiento de activos.</w:t>
-      </w:r>
+        <w:t>La macro-arquitectura de Postly es un orquestador centralizado dirigido por eventos (Erl, 2005; Newman, 2015). Es un workflow principal de 213 nodos que corre en un único proceso n8n, con su propio historial de ejecuciones en SQLite (Anexos B.1 y B.2), y que persiste los datos del sistema en Google Sheets (§5.1.1). Sus componentes no se despliegan, versionan ni escalan por separado, que es lo que separa el monolito del microservicio (Dragoni et al., 2017): Postly es un monolito modular, aunque consuma APIs de terceros de forma desacoplada. La modularidad facilita el mantenimiento y el aislamiento de fallos sin perder la simplicidad de una sola instancia autoalojada (Bass et al., 2012), que corre en el modo «regular» del motor y no en el de cola (n8n GmbH, s.f.). La Figura 4 la presenta en notación C4.</w:t>
+      </w:r>
+      <w:r/>
     </w:p>
     <w:p>
       <w:pPr>
         <w:spacing w:after="240" w:line="276" w:lineRule="auto"/>
       </w:pPr>
       <w:r>
-        <w:t xml:space="preserve">A nivel conceptual y de diseño de </w:t>
+        <w:t>Conceptualmente, la estructura se describe en capas lógicas (Fowler, 2002; Richards, 2015), que no son estrictas: la de orquestación invoca a todas las demás —cognitiva, de validación, de integración y de persistencia—, y la de validación consulta además al modelo en su canal visual. La topología es la de un orquestador central, la que dibuja la Figura 4.</w:t>
       </w:r>
       <w:r>
         <w:rPr>
           <w:i/>
           <w:iCs/>
         </w:rPr>
-        <w:t>software</w:t>
-      </w:r>
-      <w:r>
-        <w:t>, la estructura general de Postly se describe en capas lógicas (Layered Architecture) (Fowler, 2002; Richards, 2015), cada una con una función específica dentro del procesamiento. Las capas no son estrictas: no se comunican sólo con sus vecinas. La de orquestación es el centro que invoca a todas las demás —la cognitiva, la de validación, la de integración y la de persistencia—, y la de validación consulta además al modelo en su canal visual. La topología es, por lo tanto, la de un orquestador central, que es la que dibuja la Figura 4.</w:t>
-      </w:r>
+      </w:r>
+      <w:r/>
     </w:p>
     <w:p>
       <w:pPr>
@@ -20429,18 +20423,15 @@
           <w:i/>
           <w:iCs/>
         </w:rPr>
-        <w:t>Frontend</w:t>
+        <w:t xml:space="preserve"> el único punto de entrada al sistema. Alojada en Telegram, abstrae la complejidad de red y deja que la usuaria opere con botones y lenguaje natural en una interfaz que ya conoce.</w:t>
       </w:r>
       <w:r>
         <w:rPr>
           <w:b/>
           <w:bCs/>
         </w:rPr>
-        <w:t xml:space="preserve"> / CUI):</w:t>
-      </w:r>
-      <w:r>
-        <w:t xml:space="preserve"> Constituye el único punto de entrada físico y transaccional al sistema. Alojada en el ecosistema de Telegram, esta capa abstrae la complejidad de red subyacente, permitiendo que la usuaria final defina sus requerimientos de negocio mediante comandos táctiles y lenguaje natural en una interfaz conversacional familiar.</w:t>
-      </w:r>
+      </w:r>
+      <w:r/>
     </w:p>
     <w:p>
       <w:pPr>
@@ -20469,32 +20460,23 @@
           <w:i/>
           <w:iCs/>
         </w:rPr>
-        <w:t>Middleware</w:t>
+        <w:t xml:space="preserve"> implementada con n8n sobre un servidor propio —E1 hasta septiembre de 2026 y E3 desde octubre (Anexo B.1)—, es el núcleo operativo: instancia los webhooks, gestiona el flujo de datos entre módulos, resuelve la lógica condicional y coordina el manejo de excepciones.</w:t>
       </w:r>
       <w:r>
         <w:rPr>
           <w:b/>
           <w:bCs/>
         </w:rPr>
-        <w:t xml:space="preserve"> / n8n):</w:t>
-      </w:r>
-      <w:r>
-        <w:t xml:space="preserve"> Implementada con el motor low-code n8n —sobre un servidor propio: E1 hasta septiembre de 2026 y E3 desde octubre (Anexo B.1)—, es el núcleo operativo del sistema. Su función es instanciar </w:t>
-      </w:r>
+      </w:r>
+      <w:r/>
       <w:r>
         <w:rPr>
           <w:i/>
           <w:iCs/>
         </w:rPr>
-        <w:t>webhooks</w:t>
-      </w:r>
-      <w:r>
-        <w:t xml:space="preserve">, gestionar el flujo </w:t>
-      </w:r>
-      <w:r>
-        <w:lastRenderedPageBreak/>
-        <w:t>asincrónico de datos entre los distintos módulos, resolver la lógica condicional y coordinar el manejo de excepciones de red.</w:t>
-      </w:r>
+      </w:r>
+      <w:r/>
+      <w:r/>
     </w:p>
     <w:p>
       <w:pPr>
@@ -20518,14 +20500,10 @@
         <w:t>Capa de Procesamiento Cognitivo e Inteligente:</w:t>
       </w:r>
       <w:r>
-        <w:t xml:space="preserve"> En este nivel se encapsulan e integran mediante API las inferencias de los modelos fundacionales (</w:t>
-      </w:r>
-      <w:r>
-        <w:t>Gemini 2.5 Flash</w:t>
-      </w:r>
-      <w:r>
-        <w:t>). Es responsable de generar contenido generativo textual, interpretar la semántica oculta en las entradas multimedia y estructurar lógicamente narrativas visuales. Introduce en el flujo una inferencia no determinista, invocada en puntos discretos de un workflow determinista (§5.1).</w:t>
-      </w:r>
+        <w:t xml:space="preserve"> encapsula las inferencias de Gemini 2.5 Flash: genera los copys, interpreta las imágenes y ordena los carruseles. Introduce una inferencia no determinista en puntos discretos de un workflow determinista.</w:t>
+      </w:r>
+      <w:r/>
+      <w:r/>
     </w:p>
     <w:p>
       <w:pPr>
@@ -20548,7 +20526,7 @@
         <w:t>Capa de Validación y Regulación (Módulo Centinela):</w:t>
       </w:r>
       <w:r>
-        <w:t xml:space="preserve"> Actúa como un Proxy interno o filtro de seguridad de negocio antes de permitir la salida de red. Se encarga de auditar el contenido contra las normas de compliance vigentes: de forma determinista en el texto (RegEx) y mediante un modelo probabilístico en la imagen (visión multimodal), reduciendo el riesgo de incumplir la normativa de la marca antes de cualquier intento de publicación.</w:t>
+        <w:t xml:space="preserve"> filtra el contenido antes de cualquier intento de publicación, de forma determinista en el texto y con un modelo probabilístico en la imagen, para reducir el riesgo de incumplir la normativa de la marca.</w:t>
       </w:r>
     </w:p>
     <w:p>
@@ -20572,7 +20550,7 @@
         <w:t>Capa de Integración y Distribución:</w:t>
       </w:r>
       <w:r>
-        <w:t xml:space="preserve"> Gestiona la comunicación saliente autenticada (OAuth 2.0) con los servicios externos, principalmente la API Graph de Meta. Esta capa incluye además un paso intermedio obligatorio a través de Cloudinary, un servicio de almacenamiento en la nube de terceros que expone las URLs públicas que la Graph API de Meta requiere para descargar el activo. No es exclusivo del flujo de video: cada imagen se sube igualmente, y el flujo de carrusel lo hace sin declarar transformación alguna (§4.4.2; Anexos B.9, E.5 y E.6). Esta capa concentra en sus propios nodos el conocimiento de cada proveedor, de modo que un cambio en sus endpoints o políticas se resuelve tocando esos nodos. No desacopla el núcleo de los proveedores, porque el workflow es único (§5.1.3).</w:t>
+        <w:t xml:space="preserve"> gestiona la comunicación saliente autenticada con OAuth 2.0, principalmente con la Graph API de Meta, e incluye el paso obligatorio por Cloudinary, que expone las URLs públicas desde las que Meta descarga cada imagen y cada video (§4.4.2). Concentra en sus nodos el conocimiento de cada proveedor, de modo que un cambio en sus endpoints se resuelve tocándolos, aunque no desacopla el núcleo de los proveedores, porque el workflow es único (§5.1.3).</w:t>
       </w:r>
     </w:p>
     <w:p>
@@ -20694,7 +20672,7 @@
           <w:i/>
           <w:sz w:val="20"/>
         </w:rPr>
-        <w:t>Nota. Fuente: elaboración propia. Los nombres son los de las columnas de la hoja, leídos del workflow desplegado (Anexo B.2). TelegramUserID es el identificador que Telegram asigna a la conversación, y es a la vez la clave por la que se filtra la multitenencia: no hay un identificador interno distinto de él (§5.2.2). «Reach» es una columna de la hoja de publicaciones que ningún nodo puebla: las métricas que el sistema recoge son likes y comentarios. «ExpiresAt» guarda la vigencia del token de usuaria que obtiene el callback —60 días desde el canje— y no la del token de página que se cifra en «AccessToken», que la Graph API devuelve sin campo de expiración (Anexo B.3). No es un modelo relacional con integridad referencial declarada ni transacciones ACID: la relación UserID → TelegramUserID se resuelve por lookup en tiempo de ejecución y no por una restricción de clave foránea del motor (§2.3, Anexo B.5). AccessToken se cifra con AES-256-GCM antes de escribirse en la hoja (Anexo B.3). Config tiene una fila por consultora, identificada por su TelegramUserID, y una fila general sin dueña; alimenta la firma y el contacto que el sistema concatena a cada publicación (Anexo B.4). El campo Status alimenta el diagrama de estados de la Figura 2.</w:t>
+        <w:t>Nota. Fuente: elaboración propia. Los nombres son los de las columnas de la hoja, leídos del workflow desplegado (Anexo B.2). TelegramUserID, el identificador que Telegram asigna a la conversación, es la clave por la que se filtra la multitenencia (§5.2.2). «Reach» es una columna que ningún nodo puebla: el sistema recoge likes y comentarios. «ExpiresAt» guarda la vigencia del token de usuaria —60 días desde el canje— y no la del token de página, que se cifra con AES-256-GCM en «AccessToken» y que la Graph API devuelve sin expiración (Anexo B.3). La relación UserID → TelegramUserID se resuelve por lookup en tiempo de ejecución, sin integridad referencial ni transacciones ACID (§2.3; Anexo B.5). Config tiene una fila por consultora y una general sin dueña, de la que salen la firma y el contacto (Anexo B.4). Status alimenta el diagrama de estados de la Figura 2.</w:t>
       </w:r>
     </w:p>
     <w:p>
@@ -20716,31 +20694,23 @@
         <w:rPr>
           <w:bCs/>
         </w:rPr>
-        <w:t xml:space="preserve"> Responsable de la ejecución de operaciones CRUD</w:t>
-      </w:r>
-      <w:r>
-        <w:t xml:space="preserve"> para el almacenamiento seguro de los estados del sistema, historiales de interacciones, métricas de </w:t>
-      </w:r>
+        <w:t xml:space="preserve"> ejecuta las operaciones de lectura y escritura sobre los estados, el historial, las métricas y los tokens cifrados, en Google Sheets, para que la usuaria pueda auditarlos. La Figura 5 detalla sus tres hojas, sus campos y la relación de uno a muchos entre cada usuaria y sus publicaciones.</w:t>
+      </w:r>
+      <w:r/>
       <w:r>
         <w:rPr>
           <w:i/>
           <w:iCs/>
         </w:rPr>
-        <w:t>engagement</w:t>
-      </w:r>
-      <w:r>
-        <w:t xml:space="preserve"> y </w:t>
-      </w:r>
+      </w:r>
+      <w:r/>
       <w:r>
         <w:rPr>
           <w:i/>
           <w:iCs/>
         </w:rPr>
-        <w:t>tokens</w:t>
-      </w:r>
-      <w:r>
-        <w:t xml:space="preserve"> cifrados. Actualmente implementada sobre la API de Google Sheets para maximizar la accesibilidad de auditoría de la usuaria. La Figura 5 detalla el modelo de datos de esta capa: las tres hojas de persistencia, sus campos y la relación de uno a muchos que vincula a cada usuaria con sus publicaciones.</w:t>
-      </w:r>
+      </w:r>
+      <w:r/>
     </w:p>
     <w:p>
       <w:pPr>
@@ -20777,18 +20747,15 @@
         <w:spacing w:before="240" w:after="240" w:line="276" w:lineRule="auto"/>
       </w:pPr>
       <w:r>
-        <w:t>El tránsito de la información dentro del ecosistema (</w:t>
+        <w:t>Cada ejecución encadena sus pasos como una tubería de filtros (Hohpe y Woolf, 2003), aunque el encadenamiento lo decide el orquestador central y no los filtros entre sí:</w:t>
       </w:r>
       <w:r>
         <w:rPr>
           <w:i/>
           <w:iCs/>
         </w:rPr>
-        <w:t>Data Pipeline</w:t>
-      </w:r>
-      <w:r>
-        <w:t>) sigue una secuencia lógica de eventos. Cada ejecución encadena sus pasos como una tubería de filtros (Pipes and Filters) (Hohpe y Woolf, 2003), aunque el encadenamiento lo decide el orquestador central y no los filtros entre sí:</w:t>
-      </w:r>
+      </w:r>
+      <w:r/>
     </w:p>
     <w:p>
       <w:pPr>
@@ -20884,7 +20851,7 @@
         <w:rPr>
           <w:bCs/>
         </w:rPr>
-        <w:t xml:space="preserve"> antes de redactar nada, el canal visual del Módulo Centinela analiza el activo recibido —y lo hace con una llamada al mismo modelo—. Si detecta una referencia monetaria incrustada, el flujo se interrumpe ahí y se notifica a la usuaria (§4.3.1).</w:t>
+        <w:t xml:space="preserve"> antes de redactar, el canal visual del Módulo Centinela analiza el activo con una llamada al mismo modelo; si detecta una referencia monetaria incrustada, el flujo se interrumpe y avisa (§4.3.1).</w:t>
       </w:r>
     </w:p>
     <w:p>
@@ -20975,18 +20942,15 @@
           <w:i/>
           <w:iCs/>
         </w:rPr>
-        <w:t>Logging</w:t>
+        <w:t xml:space="preserve"> los metadatos de éxito o fracaso y los identificadores de plataforma se escriben en la persistencia, no de manera transaccional (§2.3). La secuencia unidireccional sí aporta que ningún componente mute estados ajenos, y la trazabilidad de las operaciones.</w:t>
       </w:r>
       <w:r>
         <w:rPr>
           <w:b/>
           <w:bCs/>
         </w:rPr>
-        <w:t>):</w:t>
-      </w:r>
-      <w:r>
-        <w:t xml:space="preserve"> Los metadatos de éxito, fracaso e identificadores de plataforma se escriben en la capa de persistencia para futuras consultas. No lo hacen de manera transaccional: la persistencia es una hoja de cálculo, que el §2.3 describe sin esquema declarado, sin integridad referencial y sin transacciones ACID. Lo que la secuenciación unidireccional sí aporta es que cada componente ejecute su responsabilidad sin mutar estados ajenos, y la trazabilidad (Audit Trail) de las operaciones.</w:t>
-      </w:r>
+      </w:r>
+      <w:r/>
     </w:p>
     <w:p>
       <w:pPr>
@@ -21023,18 +20987,15 @@
         <w:spacing w:before="240" w:after="240" w:line="276" w:lineRule="auto"/>
       </w:pPr>
       <w:r>
-        <w:t xml:space="preserve">Para asegurar la calidad del </w:t>
+        <w:t>La arquitectura adopta cuatro principios de diseño, adaptados a la integración de APIs (Martin, 2003):</w:t>
       </w:r>
       <w:r>
         <w:rPr>
           <w:i/>
           <w:iCs/>
         </w:rPr>
-        <w:t>software</w:t>
-      </w:r>
-      <w:r>
-        <w:t>, la arquitectura del sistema Postly se adhiere a principios fundamentales de diseño de sistemas distribuidos y orientados a objetos (adaptados a integración de APIs) (Martin, 2003):</w:t>
-      </w:r>
+      </w:r>
+      <w:r/>
     </w:p>
     <w:p>
       <w:pPr>
@@ -21058,18 +21019,15 @@
           <w:i/>
           <w:iCs/>
         </w:rPr>
-        <w:t>Loose Coupling</w:t>
+        <w:t xml:space="preserve"> cada servicio de terceros queda detrás de sus propios nodos y puede reemplazarse tocándolos, sin fallas en cascada. El desacoplamiento es entre servicios y no entre capas: el workflow es único, y extender una capa exige editarlo (§8.2).</w:t>
       </w:r>
       <w:r>
         <w:rPr>
           <w:b/>
           <w:bCs/>
         </w:rPr>
-        <w:t>):</w:t>
-      </w:r>
-      <w:r>
-        <w:t xml:space="preserve"> Cada servicio de terceros queda detrás de sus propios nodos del workflow, de modo que puede actualizarse o reemplazarse tocando esos nodos, sin provocar fallas en cascada en el resto. El desacoplamiento es entre servicios y no entre capas: la arquitectura es un workflow único, y extender una capa exige editarlo (§8.2).</w:t>
-      </w:r>
+      </w:r>
+      <w:r/>
     </w:p>
     <w:p>
       <w:pPr>
@@ -21090,14 +21048,12 @@
         <w:rPr>
           <w:bCs/>
         </w:rPr>
-        <w:t xml:space="preserve"> la lógica está organizada en nodos de función con responsabilidades singulares y bien definidas. Se trata de una modularidad lógica y no de despliegue: todos esos nodos se </w:t>
+        <w:t xml:space="preserve"> la lógica se organiza en nodos de función con responsabilidades acotadas; es una modularidad lógica y no de despliegue, porque todos corren en el mismo proceso (§5.1).</w:t>
       </w:r>
       <w:r>
         <w:rPr>
           <w:bCs/>
         </w:rPr>
-        <w:lastRenderedPageBreak/>
-        <w:t>ejecutan dentro de un mismo proceso n8n y no se versionan ni escalan de forma independiente (§5.1).</w:t>
       </w:r>
     </w:p>
     <w:p>
@@ -21119,7 +21075,7 @@
         <w:rPr>
           <w:bCs/>
         </w:rPr>
-        <w:t xml:space="preserve"> el diseño asincrónico basado en webhooks evita que una transacción larga —la normalización de un video, por ejemplo— bloquee el hilo de ejecución de la sesión en curso. La excepción deliberada es la escritura sincrónica del buffer de carrusel (Anexo B.5): bloquea el hilo sólo lo que tarda en anexar una línea a un archivo, y esa breve serialización es la que ordena las ejecuciones concurrentes. Esto es una propiedad del modelo de ejecución, no una capacidad de escalado: el sistema corre en el modo de ejecución «regular» de n8n, sin cola de tareas separada, y su comportamiento ante varias usuarias concurrentes no fue validado empíricamente (§6.1). La escalabilidad horizontal se traslada a las recomendaciones de trabajo futuro.</w:t>
+        <w:t xml:space="preserve"> el diseño asincrónico evita que una transacción larga, como normalizar un video, bloquee la sesión en curso. La excepción deliberada es la escritura sincrónica del buffer de carrusel (Anexo B.5), cuya breve serialización ordena las ejecuciones concurrentes. Es una propiedad del modelo de ejecución y no una capacidad de escalado: el comportamiento con varias usuarias concurrentes no se validó (§6.1), y la escalabilidad horizontal queda como trabajo futuro.</w:t>
       </w:r>
     </w:p>
     <w:p>
@@ -21176,7 +21132,7 @@
         <w:spacing w:after="240" w:line="276" w:lineRule="auto"/>
       </w:pPr>
       <w:r>
-        <w:t>El sistema no está petrificado: el diseño deja puntos de extensión explícitos, en la línea de lo que Ford et al. (2017) llaman arquitectura evolutiva. Los tres que se identificaron son sustituir o sumar otro modelo fundacional junto a Gemini, extender la publicación a otras plataformas —que el §8.2 acota, porque no se reduce a agregar nodos— y endurecer con el tiempo las reglas heurísticas de compliance. Ninguno se implementó todavía.</w:t>
+        <w:t>El diseño deja tres puntos de extensión, en la línea de la arquitectura evolutiva (Ford et al., 2017): sumar o sustituir el modelo fundacional, extender la publicación a otras plataformas —que no se reduce a agregar nodos (§8.2)— y endurecer las reglas de compliance. Ninguno se implementó.</w:t>
       </w:r>
     </w:p>
     <w:p/>
@@ -21207,7 +21163,7 @@
         <w:spacing w:before="280" w:after="280" w:line="240" w:lineRule="auto"/>
       </w:pPr>
       <w:r>
-        <w:t>El núcleo de Postly son flujos de trabajo interconectados dentro de n8n. En la Gestión de Procesos de Negocio, modelar un flujo es representar la secuencia de tareas, eventos y compuertas lógicas que alcanza un objetivo de negocio (Dumas et al., 2018). Los de Postly responden a eventos que la usuaria dispara desde Telegram, como un sistema reactivo (Chandy y Schulte, 2010), salvo los dos disparadores programados del Anexo B.2 —el de publicación diferida y el de métricas—, que corren sin que nadie los active. Se desglosan a continuación los tres bloques principales:</w:t>
+        <w:t>El núcleo de Postly son flujos de trabajo interconectados en n8n. Modelar un flujo es representar la secuencia de tareas, eventos y compuertas que alcanza un objetivo de negocio (Dumas et al., 2018). Los de Postly responden, como un sistema reactivo (Chandy y Schulte, 2010), a eventos que la usuaria dispara desde Telegram, salvo los dos disparadores programados del Anexo B.2. Se desglosan sus tres bloques principales:</w:t>
       </w:r>
     </w:p>
     <w:p>
@@ -21340,7 +21296,7 @@
           <w:i/>
           <w:sz w:val="20"/>
         </w:rPr>
-        <w:t>Nota. Fuente: elaboración propia. Recorrido de la imagen única. El orden es el del sistema: la imagen se sube a Cloudinary al recibirla (pasos 2 y 3), porque la auditoría visual y la Graph API la leen por su URL pública. La auditoría visual corre antes de generar los copys, de modo que una imagen con precio incrustado interrumpe el flujo sin gastar una inferencia de redacción (Anexo B.4; Anexo A, HU8), pero corre después de la subida, de modo que la imagen bloqueada se borra de Cloudinary en paralelo al aviso (§3.7.1). Si cualquiera de las dos auditorías detecta un precio se le avisa a la usuaria. El flujo de video agrega una tercera respuesta, avisar sin bloquear, cuando el recorte a 9:16 elimina el precio (§4.3.1). El video y sus fotogramas también se suben antes de la detección (Anexo B.9). La firma se concatena por código antes de publicar (Anexo B.4). El canal visual del Módulo Centinela es una llamada al mismo Gemini (pasos 5 y 6) y el textual, un nodo de código determinista (paso 12): el recorrido consume dos inferencias (Anexo E.5).</w:t>
+        <w:t>Nota. Fuente: elaboración propia. Recorrido de la imagen única, en el orden del sistema. La imagen se sube a Cloudinary al recibirla (pasos 2 y 3), porque la auditoría visual y la Graph API la leen por URL. La auditoría visual corre antes de generar los copys, de modo que una imagen con precio interrumpe el flujo sin gastar una inferencia de redacción; si la bloquea, se la borra de Cloudinary en paralelo al aviso (§3.7.1). En el video, que también se sube antes de la detección (Anexo B.9), hay una tercera respuesta: avisar sin bloquear cuando el recorte a 9:16 elimina el precio (§4.3.1). La firma se concatena por código antes de publicar (Anexo B.4). El canal visual es una llamada a Gemini (pasos 5 y 6) y el textual un nodo determinista (paso 12): el recorrido consume dos inferencias (Anexo E.5).</w:t>
       </w:r>
     </w:p>
     <w:p>
@@ -21348,7 +21304,7 @@
         <w:spacing w:after="240" w:line="276" w:lineRule="auto"/>
       </w:pPr>
       <w:r>
-        <w:t>Este es el flujo de mayor complejidad técnica y peso computacional de la plataforma, ya que asume la responsabilidad de coordinar en tiempo real la lógica no determinista de la inteligencia artificial con el procesamiento de archivos multimedia y la interacción humana. La Figura 6 descompone el flujo de la imagen única en un diagrama de secuencia, desde la recepción del activo hasta la confirmación de publicación. La imagen se sube a Cloudinary al recibirla, antes de la auditoría visual, que la lee por su URL pública. El punto de control humano (HITL) y las dos intervenciones del Módulo Centinela aparecen en el orden en que el sistema las ejecuta: la auditoría visual antes de generar los copys y la textual sobre el texto final, antes de publicar. Las dos no son del mismo tipo. La visual es una llamada al modelo y la textual, un nodo de código determinista, de modo que el recorrido consume dos inferencias y no una (Anexo E.5).</w:t>
+        <w:t>Es el flujo de mayor complejidad de la plataforma: coordina la inferencia no determinista del modelo con el procesamiento de archivos y la interacción humana. La Figura 6 lo descompone para la imagen única, desde la recepción del activo hasta la confirmación. Muestra el punto de control humano (HITL) y las dos intervenciones del Módulo Centinela en el orden en que se ejecutan: la visual antes de generar los copys y la textual sobre el texto final, antes de publicar.</w:t>
       </w:r>
     </w:p>
     <w:p>
@@ -21369,8 +21325,7 @@
           <w:b/>
           <w:bCs/>
         </w:rPr>
-        <w:lastRenderedPageBreak/>
-        <w:t>El flujo se dispara con un nodo Telegram Trigger en escucha permanente por webhook, y un nodo Switch lo enruta según lo que llegó —imagen única, video o grupo de imágenes—. Superada la auditoría visual, una llamada a Gemini analiza el activo y propone tres copys; el bot los presenta en un Inline Keyboard y un nodo Wait espera la elección de la usuaria. Confirmado el texto y pasada la auditoría textual, un nodo HTTP Request publica en la Graph API; con la respuesta 200 guarda el identificador y confirma el éxito. Si la API devuelve un error 4xx o 5xx —un token expirado, por ejemplo—, un nodo Error Trigger lo captura y se lo comunica a la usuaria.</w:t>
+        <w:t>Un nodo Telegram Trigger escucha por webhook y un Switch enruta según lo recibido —imagen única, video o grupo de imágenes—. Superada la auditoría visual, Gemini propone tres copys, que el bot presenta en un Inline Keyboard mientras un nodo Wait espera la elección. Confirmado el texto y pasada la auditoría textual, un HTTP Request publica en la Graph API y, con la respuesta 200, guarda el identificador y confirma el éxito; un error 4xx o 5xx lo captura un Error Trigger, que se lo comunica a la usuaria.</w:t>
       </w:r>
     </w:p>
     <w:p>
@@ -21387,28 +21342,6 @@
     </w:p>
     <w:p>
       <w:pPr>
-        <w:numPr>
-          <w:ilvl w:val="0"/>
-          <w:numId w:val="29"/>
-        </w:numPr>
-        <w:spacing w:after="240" w:line="276" w:lineRule="auto"/>
-      </w:pPr>
-      <w:r>
-        <w:rPr>
-          <w:b/>
-          <w:bCs/>
-        </w:rPr>
-        <w:t>Auditoría visual del Módulo Centinela:</w:t>
-      </w:r>
-      <w:r>
-        <w:rPr>
-          <w:bCs/>
-        </w:rPr>
-        <w:t xml:space="preserve"> antes de generar los copys, una llamada al modelo examina la imagen en busca de un precio incrustado. Si lo detecta, el flujo se detiene y avisa a la usuaria; si el modelo no devuelve un veredicto, el flujo sigue, en el modo que el §4.3.1 declara.</w:t>
-      </w:r>
-    </w:p>
-    <w:p>
-      <w:pPr>
         <w:spacing w:after="240" w:line="276" w:lineRule="auto"/>
         <w:ind w:left="720"/>
       </w:pPr>
@@ -21427,28 +21360,6 @@
     </w:p>
     <w:p>
       <w:pPr>
-        <w:numPr>
-          <w:ilvl w:val="0"/>
-          <w:numId w:val="29"/>
-        </w:numPr>
-        <w:spacing w:after="240" w:line="276" w:lineRule="auto"/>
-      </w:pPr>
-      <w:r>
-        <w:rPr>
-          <w:b/>
-          <w:bCs/>
-        </w:rPr>
-        <w:t>Auditoría textual del Módulo Centinela:</w:t>
-      </w:r>
-      <w:r>
-        <w:rPr>
-          <w:bCs/>
-        </w:rPr>
-        <w:t xml:space="preserve"> sobre el texto final, ya elegido y eventualmente editado por la usuaria, un nodo de código evalúa las seis expresiones regulares y agrega la firma (HU9). Una coincidencia interrumpe la publicación.</w:t>
-      </w:r>
-    </w:p>
-    <w:p>
-      <w:pPr>
         <w:spacing w:after="240" w:line="276" w:lineRule="auto"/>
         <w:ind w:left="720"/>
       </w:pPr>
@@ -21456,7 +21367,7 @@
     <w:p/>
     <w:p>
       <w:r>
-        <w:t>Las Figuras 7 a 10 documentan la interfaz conversacional real en los cuatro flujos principales validados sobre el entorno E1 (Anexo B.1). La Figura 7 muestra la vinculación de cuenta y la publicación de imagen única, y la Figura 8, el armado de un carrusel de múltiples imágenes. La Figura 9 muestra la normalización y publicación de un video como Reel, y la Figura 10, la tarjeta dinámica de estado de Mi Agenda. La Figura 11 muestra, por último, el canvas del workflow principal en n8n, donde se aprecia la escala del grafo de nodos que sostiene esos cuatro flujos.</w:t>
+        <w:t>Las Figuras 7 a 10 documentan la interfaz conversacional real sobre el entorno E1 (Anexo B.1): la vinculación de cuenta y la publicación de imagen única, un carrusel, la normalización y publicación de un video como Reel y la tarjeta de estado de Mi Agenda. La Figura 11 muestra el canvas del workflow principal en n8n.</w:t>
       </w:r>
     </w:p>
     <w:p>
@@ -22553,7 +22464,7 @@
           <w:i/>
           <w:sz w:val="20"/>
         </w:rPr>
-        <w:t>Nota. Fuente: capturas de pantalla del editor de n8n sobre el entorno E2 (Anexo B.1). El canvas se presenta en dos partes y muestra la forma del workflow, no sus más de 200 nodos, cuyos nombres no son legibles a esta escala; el workflow completo está en el repositorio del proyecto (Anexo E.4).</w:t>
+        <w:t>Nota. Fuente: capturas de pantalla del editor de n8n sobre el entorno E2 (Anexo B.1). El canvas se presenta en dos partes y muestra la forma del workflow, no sus más de 200 nodos, cuyos nombres no son legibles a esta escala; el workflow completo está en el repositorio del proyecto (Tabla 17).</w:t>
       </w:r>
     </w:p>
     <w:p>
@@ -22608,18 +22519,15 @@
           <w:i/>
           <w:iCs/>
         </w:rPr>
-        <w:t>Data Fetching</w:t>
+        <w:t xml:space="preserve"> al recibir «Mi Agenda», n8n lee las filas de la hoja de publicaciones filtradas por el identificador de Telegram de la usuaria, lo que aísla los datos entre consultoras. El aislamiento descansa en el filtrado de la consulta y no en un control de acceso del almacenamiento, que Google Sheets no ofrece por fila.</w:t>
       </w:r>
       <w:r>
         <w:rPr>
           <w:b/>
           <w:bCs/>
         </w:rPr>
-        <w:t>):</w:t>
-      </w:r>
-      <w:r>
-        <w:t xml:space="preserve"> Al interceptar el comando específico de "Mi Agenda", n8n lee las filas de la hoja de publicaciones en Google Sheets. Esta consulta se filtra cruzando la tabla de registros con el identificador único (ID) del usuario de Telegram, lo que provee el aislamiento de datos entre consultoras (Multitenencia). Ese aislamiento descansa en el filtrado de la consulta y no en un control de acceso del almacenamiento, que Google Sheets no ofrece a nivel de fila, y no alcanza a la firma y el contacto, que la hoja Config guarda sin clave de usuaria (§3.7.1).</w:t>
-      </w:r>
+      </w:r>
+      <w:r/>
     </w:p>
     <w:p>
       <w:pPr>
@@ -22642,7 +22550,7 @@
         <w:t>Generación de Tarjetas Dinámicas (Dynamic UI Rendering):</w:t>
       </w:r>
       <w:r>
-        <w:t xml:space="preserve"> El flujo implementa un nodo de iteración (Loop) sobre los registros obtenidos y genera un mensaje de Telegram por publicación. Estas "tarjetas" UI incluyen una renderización de la miniatura del activo visual, la marca de tiempo (timestamp) de posteo programada y un indicador visual del estado transaccional: [Pendiente], [Programado], [Publicado] o [Fallido]. El estado «Fallido» sólo lo escribe el Programador, cuando una publicación agendada no se concreta; la publicación inmediata no lo usa. Las tarjetas muestran además las métricas de interacción cuando existen, ya persistidas por una rutina programada aparte (Anexo B.2): este flujo sólo las lee, no llama a la API de métricas.</w:t>
+        <w:t xml:space="preserve"> un bucle genera un mensaje de Telegram por publicación, con la miniatura, la fecha y el estado: [Pendiente], [Programado], [Publicado] o [Fallido], este último escrito sólo por el Programador cuando una publicación agendada no se concreta. Las tarjetas muestran además las métricas ya persistidas por la rutina programada (Anexo B.2); este flujo sólo las lee.</w:t>
       </w:r>
     </w:p>
     <w:p>
@@ -22666,7 +22574,7 @@
         <w:t>Lógica de Re-publicación Inteligente y Reciclaje:</w:t>
       </w:r>
       <w:r>
-        <w:t xml:space="preserve"> Ante la activación asincrónica del botón "Volver a publicar" (Callback Query), el flujo recupera los archivos binarios originales, que no están en la hoja: la hoja guarda su URI y el contenido vive en Cloudinary (§4.4.2, Figura 5). A partir de ellos reinicia el ciclo de publicación, que genera copys nuevos para la misma pieza. El propósito es editorial y no la elusión del filtro de contenido duplicado de Meta, como HU12 declara. La publicación anterior no se borra. Ningún criterio de aceptación de HU12 lo contempla, el alcance del §1.5.1 no lo incluye y hacerlo borraría las métricas pasadas que esa misma Historia exige preservar.</w:t>
+        <w:t xml:space="preserve"> el botón «Volver a publicar» recupera la imagen original, cuya URI guarda la hoja y cuyo contenido vive en Cloudinary (Figura 5), y reinicia el ciclo de publicación con copys nuevos. La publicación anterior no se borra: ningún criterio de HU12 lo pide, y hacerlo borraría las métricas que esa Historia exige preservar.</w:t>
       </w:r>
     </w:p>
     <w:p>
@@ -22718,7 +22626,7 @@
         <w:rPr>
           <w:bCs/>
         </w:rPr>
-        <w:t xml:space="preserve"> Ante cualquier intento de interacción inicial, el primer componente del flujo es un nodo condicional If. Ese nodo consulta la base de datos de persistencia (Google Sheets) para auditar si existe un Access Token de Meta válido, descifrado y activo para esa sesión.</w:t>
+        <w:t xml:space="preserve"> ante cualquier interacción inicial, un nodo condicional comprueba en la hoja de usuarias que exista un token de Meta válido para esa sesión.</w:t>
       </w:r>
     </w:p>
     <w:p>
@@ -22743,7 +22651,7 @@
         <w:t>Protocolo de Enrolamiento Automatizado:</w:t>
       </w:r>
       <w:r>
-        <w:t xml:space="preserve"> Si el sistema detecta la ausencia o caducidad de las credenciales necesarias, n8n interrumpe el flujo normal y dispara automáticamente una secuencia enrutada de mensajes educativos estructurados. Este tutorial conversacional guía a la usuaria paso a paso para sortear la complejidad de obtener los permisos necesarios de Facebook e Instagram.</w:t>
+        <w:t xml:space="preserve"> si el token falta o caducó, n8n interrumpe el flujo y guía a la usuaria paso a paso para conceder los permisos de Facebook e Instagram.</w:t>
       </w:r>
     </w:p>
     <w:p>
@@ -22771,7 +22679,7 @@
         <w:rPr>
           <w:bCs/>
         </w:rPr>
-        <w:t xml:space="preserve"> El flujo expone un endpoint seguro que intercambia códigos de autorización temporales por tokens de larga duración, según la especificación del protocolo OAuth 2.0 (Hardt, 2012). Los tokens se almacenan de inmediato y de forma segura en la capa de persistencia, para habilitar sesiones asincrónicas futuras desatendidas.</w:t>
+        <w:t xml:space="preserve"> un endpoint canjea el código de autorización por un token de larga duración (Hardt, 2012), que se guarda cifrado para habilitar las publicaciones desatendidas.</w:t>
       </w:r>
     </w:p>
     <w:p>
@@ -22809,7 +22717,7 @@
         <w:spacing w:after="240" w:line="276" w:lineRule="auto"/>
       </w:pPr>
       <w:r>
-        <w:t>Para usuarias no técnicas, el diseño de la experiencia de usuario es la arquitectura misma de la interacción (Norman, 2013). Postly sigue un recorrido basado en la simplicidad, la conversación guiada y la confirmación activa, que busca eliminar la incertidumbre técnica y los callejones sin salida. La reducción de la carga cognitiva es una propiedad de diseño buscada y no un resultado medido con usuarias (Capítulo 7).</w:t>
+        <w:t>Para usuarias no técnicas, la experiencia de usuario es la arquitectura misma de la interacción (Norman, 2013). Postly sigue un recorrido de conversación guiada y confirmación activa, sin callejones sin salida; la reducción de la carga cognitiva es una propiedad de diseño buscada y no un resultado medido (Capítulo 7).</w:t>
       </w:r>
     </w:p>
     <w:p>

</xml_diff>

<commit_message>
docs(tesis): N-05, Capitulo 6 condensado de 8.355 a ~4.740 palabras (pasadas 190 a 190d)
El detalle que solo vivia en el cuerpo se traslada tal cual a su anexo (10
parrafos: taxonomia de representatividad a E.1.1; casos limpios y Yilmaz a E.6;
aviso que no llegaba a E.11; baterias a E.5; tiempo corregido, sensibilidad
completa, orden y aprendizaje a E.2). El cuerpo conserva cada resultado con su
remision. Se quita 'E2, hoy el unico activo' (E3 desde el 01-10).

Co-Authored-By: Claude Opus 5.5 <noreply@anthropic.com>
</commit_message>
<xml_diff>
--- a/avance/Tesis Postly Bontorno Hassan-1 v2.docx
+++ b/avance/Tesis Postly Bontorno Hassan-1 v2.docx
@@ -22851,7 +22851,7 @@
         <w:spacing w:after="240" w:line="276" w:lineRule="auto"/>
       </w:pPr>
       <w:r>
-        <w:t>En la Design Science Research lo que se evalúa es un artefacto construido, y no una hipótesis sobre un fenómeno preexistente (Hevner et al., 2004). Eso no excluye el contraste estadístico donde hay una medida repetida y un umbral declarado de antemano, como el del tiempo operativo; excluye tomar ese contraste por el criterio de éxito del artefacto. La evaluación contrasta el problema detectado («As-Is») con la capacidad demostrable del artefacto para resolverlo («To-Be») (Sommerville, 2015). Postly alcanzó el estado de MVP: se validó de extremo a extremo sobre el entorno E1 y se midió sobre el entorno E2, hoy el único activo (Anexo B.1).</w:t>
+        <w:t>En la Design Science Research se evalúa un artefacto construido y no una hipótesis sobre un fenómeno preexistente (Hevner et al., 2004). El contraste estadístico cabe donde hay una medida repetida y un umbral declarado de antemano, como el del tiempo operativo, pero no es el criterio de éxito del artefacto. La evaluación contrasta el problema detectado («As-Is») con la capacidad del artefacto para resolverlo («To-Be») (Sommerville, 2015). Postly se validó de extremo a extremo sobre el entorno E1 y se midió sobre E2 (Anexo B.1).</w:t>
       </w:r>
     </w:p>
     <w:p>
@@ -22897,12 +22897,9 @@
         <w:spacing w:after="240" w:line="276" w:lineRule="auto"/>
       </w:pPr>
       <w:r>
-        <w:t xml:space="preserve">La topología en estrella, orquestada de forma centralizada por n8n, resolvió la integración de servicios heterogéneos planteada al inicio. Es una validación funcional del diseño y no una evaluación de alcance poblacional: confirma que el sistema hace lo que fue diseñado para hacer, sobre el entorno E1, para las </w:t>
-      </w:r>
-      <w:r>
-        <w:lastRenderedPageBreak/>
-        <w:t>14 Historias de Usuario (Anexo A). La medición con usuarias, de escala piloto, se reporta más adelante en esta sección (§3.4.3, §3.5.2).</w:t>
-      </w:r>
+        <w:t>La topología en estrella orquestada por n8n resolvió la integración de servicios heterogéneos: el sistema hace lo que fue diseñado para hacer en las 14 Historias de Usuario, sobre el entorno E1 (Anexo A). Es una validación funcional y no poblacional; la medición con usuarias, de escala piloto, sigue en esta sección.</w:t>
+      </w:r>
+      <w:r/>
     </w:p>
     <w:p>
       <w:pPr>
@@ -22919,7 +22916,7 @@
         <w:t>Viabilidad de la Interfaz Conversacional (CUI):</w:t>
       </w:r>
       <w:r>
-        <w:t xml:space="preserve"> la Telegram Bot API soportó la captura de imágenes y videos de forma estable en el escenario validado, una usuaria por sesión, y los webhooks evitan bloquear el procesamiento durante una transacción. El sistema corre, sin embargo, en el modo «regular» de n8n, sin cola de tareas separada (Anexo B.1): su escalabilidad ante usuarias concurrentes no se validó y queda como trabajo futuro (§8.2).</w:t>
+        <w:t xml:space="preserve"> la Telegram Bot API soportó la captura de imágenes y videos de forma estable con una usuaria por sesión. La escalabilidad ante usuarias concurrentes no se validó, porque el sistema corre en el modo «regular» de n8n (Anexo B.1; §8.2).</w:t>
       </w:r>
     </w:p>
     <w:p>
@@ -22943,7 +22940,7 @@
         <w:t>Integración Cognitiva Multimodal:</w:t>
       </w:r>
       <w:r>
-        <w:t xml:space="preserve"> las pruebas de caja negra con Gemini 2.5 Flash confirman la capacidad de razonamiento visual que sostiene la auditoría de precios en imagen y la generación de copy contextual. La precisión de esa auditoría se cuantifica en los §6.1.1 y 6.1.2. La calidad del copy se midió aparte, con evaluadores externos a ciegas (§6.1.8; Anexo E.14): fue preferido frente a un generador genérico y frente al trabajo manual real de las ocho participantes de la ampliación.</w:t>
+        <w:t xml:space="preserve"> las pruebas con Gemini 2.5 Flash confirman el razonamiento visual que sostiene la auditoría de precios en imagen (§6.1.1 y §6.1.2) y la generación de copy, cuya calidad midieron evaluadores externos a ciegas (§6.1.8).</w:t>
       </w:r>
     </w:p>
     <w:p>
@@ -22976,7 +22973,7 @@
         <w:spacing w:after="240" w:line="276" w:lineRule="auto"/>
       </w:pPr>
       <w:r>
-        <w:t>Se ejecutó el protocolo del Anexo E sobre el detector desplegado, en el entorno E2 (Anexo B.1), para operacionalizar la variable «tasa de acierto del Módulo Centinela» (§3.5.4) con una matriz de confusión y las métricas de Recall, Precisión y F1. El módulo opera sobre dos canales. Uno es la auditoría de precios en texto (HU7), con seis expresiones regulares evaluadas en cascada sobre el pie de foto final. El otro es la detección de precios incrustados en imagen (HU8), delegada a la visión del modelo multimodal. La validación cubrió ambos.</w:t>
+        <w:t>Sobre el detector desplegado en E2 se ejecutó el protocolo del Anexo E para medir la tasa de acierto del Módulo Centinela (§3.5.4) con matrices de confusión, Recall, Precisión y F1. Se midieron sus dos canales: el textual, de seis expresiones regulares sobre el pie de foto final (HU7), y el visual, delegado al modelo multimodal (HU8).</w:t>
       </w:r>
     </w:p>
     <w:p>
@@ -23004,34 +23001,18 @@
     </w:p>
     <w:p>
       <w:r>
-        <w:t xml:space="preserve">Se construyó un conjunto de 40 casos: 20 infractores —con precio, oferta o promoción, que el sistema debe bloquear— y 20 limpios, que debe publicar. La clase real se etiquetó a mano con el criterio que el módulo audita: una referencia monetaria —precio, descuento, oferta o promoción— en contenido destinado al canal público, aun sin cifra: «¿Precios? Te los paso por privado» es infractor, y una invitación a escribir que no menciona precios no lo es (§3.5.5). Ese criterio es más estrecho que la definición de mensaje comercial </w:t>
-      </w:r>
-      <w:r>
-        <w:t>de las Pautas, que alcanza también a la solicitud de compra sin cifra (Capítulo 7). Los casos de texto los ejecutó un script que transcribe verbatim las seis expresiones del nodo desplegado y registra el veredicto y la expresión que disparó cada bloqueo (Anexo E.4). Los de imagen se enviaron al bot sobre el entorno E2, por la ruta completa de HU8, y su veredicto se registró a mano.</w:t>
-      </w:r>
-    </w:p>
-    <w:p>
-      <w:r>
-        <w:t>Cada resultado se clasificó como verdadero positivo (VP: infractor bloqueado), falso negativo (FN: infractor publicado), verdadero negativo (VN: limpio publicado) o falso positivo (FP: limpio bloqueado). Con esas frecuencias se calcularon Recall = VP/(VP+FN), Precisión = VP/(VP+FP) y F1 = 2·(Precisión·Recall)/(Precisión+Recall). Se aplicaron dos configuraciones. La representativa refleja la forma habitual en que las consultoras redactan —mayoría de casos directos y una minoría de casos límite— y es la medida principal; esa intención es anterior a toda observación de redacción real, y el párrafo siguiente la contrasta con el corpus de campo. La de estrés está cargada de casos límite para exponer las fronteras de decisión del detector. El detalle caso por caso está en el material complementario (Anexo E.4).</w:t>
-      </w:r>
-    </w:p>
-    <w:p>
-      <w:r>
-        <w:t>El contraste es posible porque los 29 textos verbatim del estudio de campo llegaron después de diseñados los conjuntos. Un script clasifica cada caso infractor de texto según la forma en que expresa el precio o la promoción, con una taxonomía léxica propia. Las formas son seis: símbolo de moneda con cifra, cifra con palabra de moneda, palabra de precio con cifra, descuento porcentual, vocabulario comercial y forma indirecta. A la quinta la define que el vocabulario, y no la cifra, sea lo que dispara la regla: dos de los tres casos de campo que caen en ella ofrecen un «2x1», que sí lleva cifra, y el tercero un «envío GRATIS». No son mutuamente excluyentes —cinco de los doce casos reales satisfacen más de una—, de modo que a cada caso se le asigna la primera que coincide, en ese orden. La distribución por forma depende por lo tanto del orden elegido; lo que no depende de él es la categoría residual, que es la que sostiene el contraste. Los 12 casos infractores de texto del corpus real se reparten en tres formas: 5 con símbolo de moneda, 4 con descuento porcentual y 3 con vocabulario comercial. Ninguno adopta una forma indirecta, mientras que el conjunto representativo lleva 1 de 18, y 4 de sus casos usan la palabra de moneda o la de precio, que en el corpus real no aparecen.</w:t>
-      </w:r>
-    </w:p>
-    <w:p>
-      <w:r>
-        <w:t xml:space="preserve">Esa taxonomía no es del todo independiente de lo que mide: su primera categoría reproduce el patrón 1 del detector carácter por carácter, y la quinta repite buena parte del vocabulario del patrón 5. El contraste establece entonces qué formas trae cada corpus, y no si el detector las reconocería con independencia de cómo está escrito. Leído así sigue siendo útil para lo único </w:t>
-      </w:r>
-      <w:r>
-        <w:lastRenderedPageBreak/>
-        <w:t>que el §6.1 le pide —saber si el conjunto diseñado es más adverso que la redacción observada—, y no para más que eso.</w:t>
-      </w:r>
-    </w:p>
-    <w:p>
-      <w:r>
-        <w:t>El conjunto diseñado incluye, entonces, una forma indirecta que el corpus real no exhibe: un caso sobre dieciocho frente a cero sobre doce, una diferencia que la prueba exacta de Fisher no distingue del azar (p = 1,0 bilateral). No autoriza a tratar las métricas del conjunto como cota de las reales, ni explica la brecha de F1 con el campo, que sale sobre todo de los falsos positivos —tres contra cero— y que la taxonomía no clasifica, porque sólo ordena los positivos. Los doce textos reales son, además, mensajes de canal privado, donde el precio se enuncia con menos rodeos que en una publicación de feed. El resultado por caso está en el material complementario (Anexo E.4).</w:t>
+        <w:t>Se construyó un conjunto de 40 casos, 20 infractores y 20 limpios, etiquetados a mano con el criterio que el módulo audita: una referencia monetaria —precio, descuento, oferta o promoción— en contenido destinado al canal público, aun sin cifra. «¿Precios? Te los paso por privado» es infractor; una invitación a escribir que no menciona precios no lo es (§3.5.5). Ese criterio es más estrecho que el mensaje comercial de las Pautas, que alcanza también a la solicitud de compra sin cifra (Capítulo 7). Los casos de texto los ejecutó un script que transcribe verbatim las expresiones del nodo, y los de imagen se enviaron al bot por la ruta completa de HU8 (Anexo E.4).</w:t>
+      </w:r>
+      <w:r/>
+    </w:p>
+    <w:p>
+      <w:r>
+        <w:t>Recall, Precisión y F1 se calcularon sobre las frecuencias de verdaderos y falsos positivos y negativos, en dos configuraciones. La representativa refleja la forma habitual en que redactan las consultoras, con mayoría de casos directos, y es la medida principal; la de estrés concentra casos límite para exponer las fronteras del detector (Anexo E.1.1).</w:t>
+      </w:r>
+    </w:p>
+    <w:p>
+      <w:r>
+        <w:t>El corpus de campo, que llegó después de diseñados los conjuntos, permite contrastar esa intención. Sus 12 textos infractores se reparten entre símbolo de moneda (5), descuento porcentual (4) y vocabulario comercial (3), sin ninguna forma indirecta, frente a 1 de 18 en el conjunto representativo, una diferencia que la prueba exacta de Fisher no distingue del azar (p = 1,0). El contraste dice qué formas trae cada corpus, no que las métricas del conjunto acoten las reales (Anexo E.1.1).</w:t>
       </w:r>
     </w:p>
     <w:p>
@@ -23263,13 +23244,13 @@
         <w:jc w:val="both"/>
       </w:pPr>
       <w:r>
-        <w:t>Nota. Elaboración propia. VP: verdadero positivo; FN: falso negativo; FP: falso positivo; VN: verdadero negativo. El conjunto agrega los dos canales del módulo: 36 casos de texto y 4 de imagen. El conjunto de estrés reutiliza esos mismos cuatro escenarios de imagen, de modo que el canal visual aporta cuatro observaciones y no ocho. El veredicto caso por caso, con la expresión regular que produjo cada bloqueo, está en el material complementario (Anexo E.4).</w:t>
+        <w:t>Nota. Elaboración propia. VP: verdadero positivo; FN: falso negativo; FP: falso positivo; VN: verdadero negativo. El conjunto agrega 36 casos de texto y 4 de imagen; el de estrés reutiliza esos cuatro escenarios de imagen. Detalle caso por caso en el material complementario (Anexo E.4).</w:t>
       </w:r>
     </w:p>
     <w:p/>
     <w:p>
       <w:r>
-        <w:t>En la configuración representativa (Tabla 3) el módulo alcanzó un Recall de 0,85, una Precisión de 0,85, una especificidad de 0,85 y un F1 de 0,85, con una exactitud global del 85 %. Detectó y bloqueó 17 de los 20 intentos de publicar contenido comercial y permitió correctamente 17 de las 20 publicaciones informativas. Bajo la configuración de estrés (Tabla 4) el desempeño desciende de forma esperable: Recall 0,70; Precisión 0,64; F1 0,67. Alrededor de un tercio de los casos fue diseñado para tensionar el detector, así que el descenso no debe leerse como el rendimiento operativo del sistema, sino como una caracterización de sus condiciones de falla.</w:t>
+        <w:t>En la configuración representativa (Tabla 3) el módulo alcanzó un Recall, una Precisión, una especificidad y un F1 de 0,85: bloqueó 17 de los 20 intentos de publicar contenido comercial y publicó 17 de las 20 piezas informativas. En la de estrés (Tabla 4) el F1 baja a 0,67 (Recall 0,70; Precisión 0,64), una caracterización de las condiciones de falla y no del rendimiento operativo.</w:t>
       </w:r>
     </w:p>
     <w:p>
@@ -23494,13 +23475,13 @@
     </w:tbl>
     <w:p>
       <w:r>
-        <w:t>Nota. Elaboración propia. VP: verdadero positivo; FN: falso negativo; FP: falso positivo; VN: verdadero negativo. El conjunto concentra construcciones adversariales —precio en palabras, términos polisémicos, separadores de miles— y no representa la distribución esperada del uso corriente: sus cifras no describen el desempeño típico. Tampoco son el peor caso: el análisis de valores límite del §6.1.4 lo supera. Detalle caso por caso en el material complementario (Anexo E.4).</w:t>
+        <w:t>Nota. Elaboración propia. El conjunto concentra construcciones adversariales —precio en palabras, términos polisémicos, separadores de miles— y no representa el uso corriente; el análisis de valores límite del §6.1.4 es más exigente todavía. Detalle caso por caso en el material complementario (Anexo E.4).</w:t>
       </w:r>
     </w:p>
     <w:p/>
     <w:p>
       <w:r>
-        <w:t>Los errores siguen un patrón léxico común a ambas configuraciones. Los falsos negativos se concentran en tres formas: precios en palabras sin dígitos («tres mil quinientos»), referencias comerciales sin cifra («a mitad de precio», «te paso la lista de precios») y descuentos sin el token esperado («30 % menos»). El precio existe, pero no adopta ninguna forma que las expresiones reconozcan: salvo dos, asocian un dígito a un símbolo o a una palabra monetaria. Los falsos positivos surgen de números no monetarios con formato de miles («más de 20.000 clientas», «el año 2.025») y de términos comerciales en acepción no comercial («este sérum rebaja las líneas de expresión»): el detector no analiza el contexto. En el canal de imagen (HU8) los cuatro casos se resolvieron bien (dos VP y dos VN), incluido un envase con «SPF 50» y «50 ml» que la visión no confundió con un precio. Es una base estrecha: sólo dos son positivos y son los mismos en las dos configuraciones, de modo que el canal se midió además sobre un conjunto propio (§6.1.2).</w:t>
+        <w:t>Los errores siguen un patrón léxico. Los falsos negativos son precios en palabras («tres mil quinientos»), referencias comerciales sin cifra («a mitad de precio») y descuentos sin el token esperado («30 % menos»). Los falsos positivos son números no monetarios con formato de miles («más de 20.000 clientas») y términos comerciales en otra acepción («este sérum rebaja las líneas de expresión»): el detector no analiza el contexto. En imagen, los cuatro casos se resolvieron bien —incluido un envase con «SPF 50» y «50 ml»—, pero sólo dos son positivos, y el canal se midió por eso sobre un conjunto propio (§6.1.2).</w:t>
       </w:r>
     </w:p>
     <w:p>
@@ -24262,7 +24243,7 @@
         <w:jc w:val="both"/>
       </w:pPr>
       <w:r>
-        <w:t>Esos cuatro casos no alcanzan para caracterizar el canal de imagen, y el §8.2 apoya en él una recomendación de arquitectura. Se construyó por eso un conjunto propio de 20 casos, 10 infractores y 10 limpios, ejecutado contra el mismo modelo y el mismo prompt del nodo desplegado (Anexo E.6). Los infractores cubren diez formas de incrustar en una imagen una referencia comercial prohibida, sea precio o promoción. Cinco son la placa promocional superior, la etiqueta adhesiva con el monto, la marca de agua diagonal, el precio pequeño en una esquina y el texto rotado sobre el borde. Las otras cinco, la cinta inferior de descuento, la lista de tarifas, el precio en tipografía de estilo caligráfico, el monto sin símbolo de moneda y el envío gratis junto al precio.</w:t>
+        <w:t>Para caracterizar el canal de imagen se construyó un conjunto de 20 casos, 10 infractores y 10 limpios, ejecutado contra el mismo modelo y el mismo prompt del nodo desplegado (Anexo E.6). Los infractores cubren diez formas de incrustar un precio o una promoción —placas, etiquetas, marcas de agua, cintas de descuento, listas de tarifas, montos sin símbolo, envío gratis junto al precio—. Los limpios llevan cifras que pueden confundirse con un precio, como el factor de protección, los mililitros o un separador de miles.</w:t>
       </w:r>
     </w:p>
     <w:p>
@@ -24270,11 +24251,7 @@
         <w:jc w:val="both"/>
       </w:pPr>
       <w:r>
-        <w:t xml:space="preserve">Los diez casos limpios llevan, en cambio, cifras que pueden confundirse con un precio: el factor de protección solar, el volumen en mililitros, la duración en horas, la concentración porcentual de un activo y el año de un tono. Las otras cinco son la numeración de pasos de una rutina, un separador de miles, un porcentaje que no es un descuento, un nombre de línea de producto sobreimpreso y una foto de producto sin ninguna sobreimpresión. Dos de los diez infractores (V03 y V06) prueban la promoción sin monto —una marca de agua «PROMO 2x1» y una </w:t>
-      </w:r>
-      <w:r>
-        <w:lastRenderedPageBreak/>
-        <w:t xml:space="preserve">cinta de «30% OFF»—, que el Módulo Centinela debe bloquear con el mismo criterio que el precio. Un tercero, V10, combina el envío gratis con la cifra («ENVÍO GRATIS · $1.890») y pertenece por lo tanto a la clase del precio incrustado. </w:t>
+        <w:t>Los casos extremos de legibilidad se midieron aparte, en una extensión de nueve casos con la inferencia repetida (Anexo E.8).</w:t>
       </w:r>
     </w:p>
     <w:p>
@@ -24282,7 +24259,7 @@
         <w:jc w:val="both"/>
       </w:pPr>
       <w:r>
-        <w:t>Los casos extremos de legibilidad —la cifra parcialmente ocluida, la tipografía de bajo contraste sobre fondo texturado, el número aislado sin contexto y el código de moneda en lugar del símbolo— se midieron aparte, en una extensión de nueve casos (Anexo E.8). La inferencia se repitió en ocho de ellos, porque el cupo diario del modelo se agotó antes del noveno. Eso establece que el veredicto no fue un accidente de una llamada aislada, y no una distribución.</w:t>
+        <w:t>El modelo resolvió los 20 casos: Recall, Precisión, especificidad y F1 valen 1,00 (Tabla 12). Con diez casos por clase, el intervalo de Wilson del 95 % del Recall va de 0,72 a 1,00: la ausencia de errores acota la tasa, no la fija. Es coherente con Yılmaz et al. (2026), que encuentran que los modelos de visión y lenguaje superan a los motores de OCR y que la baja resolución es lo que más los dificulta, sobre otro idioma y texto sintético (Anexo E.6). La visión resolvió sobre el significado —reconoció un monto en tipografía caligráfica y otro sin símbolo, y no tomó por precio «+10.000 consultoras»—, aunque tres casos limpios usan los mismos tokens que el prompt enumera como ejemplos de lo que no debe bloquear.</w:t>
       </w:r>
     </w:p>
     <w:p>
@@ -24290,7 +24267,7 @@
         <w:jc w:val="both"/>
       </w:pPr>
       <w:r>
-        <w:t>El modelo resolvió correctamente los 20 casos: bloqueó los 10 infractores y publicó los 10 limpios. Recall, Precisión, especificidad y F1 valen 1,00. Con diez casos por clase, el intervalo de Wilson del 95 % para el Recall de 10/10 va de 0,72 a 1,00, y el de la especificidad, otro tanto: la ausencia de errores no fija la tasa, la acota por abajo en 0,72. La visión resolvió sobre el significado y no sobre la forma de la cadena: reconoció como precio un monto en tipografía caligráfica y otro sin símbolo de moneda, y no tomó por precio «+10.000 consultoras». Parte de esos aciertos vale menos. El prompt del nodo enumera «SPF 30», «24h» y «50 ml» como ejemplos de lo que no debe bloquear, y tres casos limpios (V12 a V14) usan justamente esos tokens: sobre ellos, la matriz mide en parte si el modelo sigue sus instrucciones. Fuera de este trabajo, Yılmaz et al. (2026) comparan diez modelos, entre motores de OCR y modelos de visión y lenguaje, sobre 6.600 imágenes sintéticas de texto en turco. Los modelos de visión y lenguaje superan a los motores de OCR, y la baja resolución es lo que más dificulta el reconocimiento a todos, incluido el mejor. Es un antecedente sobre otro idioma y sobre texto sintético, y extenderlo a precios sobre arte comercial en español es una lectura de los autores. La dificultad de la baja resolución es, sin embargo, la que el corte difícil de este trabajo pone a prueba con un precio en cuerpo diminuto.</w:t>
+        <w:t>El archivo de resultados no conservó la respuesta cruda del modelo, y el parseo replica el modo fail-open del nodo: los diez verdaderos negativos no se distinguen de diez fallos de formato, y sólo los positivos guardan la justificación del modelo (§4.3.1; Anexo E.6).</w:t>
       </w:r>
     </w:p>
     <w:p>
@@ -24298,20 +24275,9 @@
         <w:jc w:val="both"/>
       </w:pPr>
       <w:r>
-        <w:t>El archivo de resultados de esta corrida no conservó la respuesta cruda del modelo, y el parseo replica el modo fail-open del nodo desplegado: un negativo genuino y una respuesta que el parseo no pudo leer quedan registrados igual (§4.3.1; Anexo E.6). Los diez verdaderos negativos de este conjunto no son, por lo tanto, distinguibles de diez fallos de formato. Los diez positivos sí lo son, porque cada uno guarda la justificación que el modelo devolvió.</w:t>
-      </w:r>
-    </w:p>
-    <w:p>
-      <w:pPr>
-        <w:jc w:val="both"/>
-      </w:pPr>
-      <w:r>
-        <w:t xml:space="preserve">El resultado tiene dos límites más. Las diez placas promocionales las compusieron los autores, y las fotografías de base son en su mayoría material gráfico oficial de la marca —arte de catálogo, bodegones y placas de campaña— que las consultoras reciben por el canal interno y reenviaron para este estudio. El conjunto mide, por lo tanto, el detector sobre arte comercial de marca, que según la única informante que lo describe es lo que más circula por estas cuentas </w:t>
-      </w:r>
-      <w:r>
-        <w:lastRenderedPageBreak/>
-        <w:t>(un testimonio que no se contrastó con las otras tres; Anexo E.6), y no sobre fotografía casera. Y el modelo es probabilístico: veinte aciertos no garantizan el de una imagen futura. La extensión del Anexo E.8 pone ambos límites a prueba. Sobre nueve casos de legibilidad extrema —ocho compuestos y uno real, con el precio ya impreso en los píxeles— el F1 cae a 0,83, con un falso negativo y un falso positivo que retoma el §8.2. Con seis infractores, el intervalo de Wilson del Recall de 5/6 va de 0,44 a 0,97: indica la dirección del deterioro y no su magnitud.</w:t>
-      </w:r>
+        <w:t>Hay dos límites más. Las placas las compusieron los autores sobre material gráfico oficial de la marca, de modo que el conjunto mide el detector sobre arte comercial y no sobre fotografía casera; y el modelo es probabilístico, de modo que veinte aciertos no garantizan el de una imagen futura. Sobre los nueve casos de legibilidad extrema del Anexo E.8, ocho compuestos y uno real, el F1 cae a 0,83 (Tabla 14), y el intervalo de Wilson del Recall de 5/6 va de 0,44 a 0,97: indica la dirección del deterioro y no su magnitud.</w:t>
+      </w:r>
+      <w:r/>
     </w:p>
     <w:p>
       <w:pPr>
@@ -24333,7 +24299,7 @@
         <w:jc w:val="both"/>
       </w:pPr>
       <w:r>
-        <w:t>Como los casos anteriores los diseñaron los autores, el módulo se validó además sobre contenido real. Tres consultoras aportaron 29 casos redactados por ellas sobre sus productos: 14 mensajes de venta de canal privado, que son conversaciones reales, y 15 pies de foto del tipo que publican en su feed, recolectados con el procedimiento del Anexo E.1.2. Once de esos quince cierran con una invitación a escribir por mensaje directo, que según la letra de las Pautas basta para volver comercial un mensaje. No son por eso «piezas informativas» en el sentido de la norma, sino piezas sin referencia monetaria: la clase que el módulo distingue. El material es real en su autoría y su redacción, pero no llegó a publicarse. La clase real de cada caso la etiquetaron por separado la consultora y un evaluador externo al equipo (Anexo E.1.2), con acuerdo perfecto (κ de Cohen = 1,00). Cada caso se ejecutó de extremo a extremo en el bot sobre el entorno E2.</w:t>
+        <w:t>Como esos casos los diseñaron los autores, el módulo se validó además sobre 29 casos redactados por tres consultoras sobre sus productos: 14 mensajes de venta de canal privado y 15 pies de foto del tipo que publican en su feed (Anexo E.1.2), que no llegaron a publicarse. Once de esos quince cierran con una invitación a escribir, que según las Pautas basta para volver comercial un mensaje: son piezas sin referencia monetaria, la clase que el módulo distingue, y no «informativas» en el sentido de la norma. La clase real la etiquetaron por separado la consultora y un evaluador externo al equipo (κ de Cohen = 1,00), y cada caso se ejecutó de extremo a extremo en el bot sobre E2.</w:t>
       </w:r>
     </w:p>
     <w:p>
@@ -24341,7 +24307,7 @@
         <w:jc w:val="both"/>
       </w:pPr>
       <w:r>
-        <w:t>La clase positiva no es homogénea. Doce de los 14 mensajes llevan precio, oferta o descuento. Los otros dos no llevan cifra alguna: las dos etiquetas los marcaron no publicables por un defecto del producto visible en la foto, y son los dos únicos falsos negativos del estudio. Los mensajes con referencia monetaria son, por lo tanto, 12. Y los doce son piezas de canal privado —donde la norma los permite— trasladadas hipotéticamente al feed para poder someterlas al módulo: la clase positiva no es contenido que las consultoras hubieran publicado. La Tabla 5 reporta por eso los dos constructos en paneles separados: el que el módulo declara auditar y el que aplicaron los etiquetadores.</w:t>
+        <w:t>La clase positiva no es homogénea. Doce de los 14 mensajes llevan precio, oferta o descuento; los otros dos no llevan cifra, y los etiquetadores los descartaron por un defecto del producto visible en la foto. Los doce son además piezas de canal privado trasladadas hipotéticamente al feed, no contenido que las consultoras hubieran publicado. La Tabla 5 reporta por eso dos paneles: el constructo que el módulo audita y el que aplicaron los etiquetadores.</w:t>
       </w:r>
     </w:p>
     <w:p>
@@ -24786,7 +24752,7 @@
         <w:rPr>
           <w:i/>
         </w:rPr>
-        <w:t>Nota. Elaboración propia. VP: verdadero positivo; FN: falso negativo; FP: falso positivo; VN: verdadero negativo. Los dos paneles corren sobre las mismas 29 piezas y difieren sólo en la etiqueta. El panel A mide el constructo que el módulo declara auditar: la referencia monetaria —precio, descuento, oferta o promoción—. El panel B mide la noción más amplia de «publicable» de los etiquetadores, que suma el defecto del producto. Esa noción mueve a la clase infractora dos casos sin cifra, que son los dos únicos falsos negativos y que bajo el panel A son verdaderos negativos. Ninguno de los dos paneles mide la regla de mensaje comercial en toda su extensión (Capítulo 7). La Precisión de 1,00 dice que ninguna pieza sin referencia monetaria fue bloqueada, no que no haya sobre-bloqueo: el corpus no tiene casos en los que sobre-bloquear. Las piezas no llegaron a publicarse (Anexo E.1.2). El acuerdo entre la consultora autora y el evaluador externo (κ de Cohen = 1,00) se mide sobre la etiqueta del panel B. La del panel A es una re-etiquetación de los autores, posterior al resultado, que aplica el constructo declarado antes de la medición y que no validó un tercero.</w:t>
+        <w:t>Nota. Elaboración propia. Los dos paneles corren sobre las mismas 29 piezas y difieren sólo en la etiqueta. El panel A mide la referencia monetaria que el módulo declara auditar; el panel B, la noción más amplia de «publicable» de los etiquetadores, que suma el defecto del producto y mueve a la clase infractora dos casos sin cifra. Ninguno mide la regla de mensaje comercial completa (Capítulo 7). La Precisión de 1,00 dice que ninguna pieza sin referencia monetaria fue bloqueada, no que no haya sobre-bloqueo: el corpus no tiene casos en los que sobre-bloquear. El κ de Cohen = 1,00 entre la consultora y el evaluador se mide sobre la etiqueta del panel B; la del panel A es una re-etiquetación de los autores, posterior al resultado, que aplica el constructo declarado antes de la medición y que no validó un tercero.</w:t>
       </w:r>
     </w:p>
     <w:p>
@@ -24794,7 +24760,7 @@
         <w:jc w:val="both"/>
       </w:pPr>
       <w:r>
-        <w:t>Los dos paneles de la Tabla 5 dan dos cifras y las dos hacen falta. Sobre el constructo que el módulo audita —la referencia monetaria— el Recall, la Precisión, la especificidad y el F1 valen 1,00: bloqueó los 12 mensajes con precio o promoción y publicó las 17 piezas sin cifra. Entre esas 17 están las dos que los etiquetadores descartaron por un defecto del producto: bajo este constructo son verdaderos negativos. Sobre la noción de «publicable» de los etiquetadores, que suma los dos casos de defecto del producto, el Recall baja a 0,857 y el F1 queda en 0,923 (exactitud 93,1 %), con la Precisión en 1,00. El 1,00 del panel A no es un desempeño mejor: es el mismo comportamiento leído contra el objeto que el módulo declara auditar. El 0,923 del panel B incorpora una exigencia que el módulo nunca se propuso satisfacer. Los denominadores son pequeños y cada proporción va con su intervalo del 95 % por el método de Wilson, que no colapsa cuando la proporción vale 1. En el panel A: Recall de 12/12 en [0,758; 1,000], especificidad de 17/17 en [0,816; 1,000] y exactitud de 29/29 en [0,883; 1,000]. En el panel B: Recall en [0,601; 0,960] y Precisión en [0,758; 1,000]. El F1 no es una proporción sobre un denominador único y no admite ese intervalo.</w:t>
+        <w:t>Sobre el constructo que el módulo audita (panel A), el Recall, la Precisión, la especificidad y el F1 valen 1,00: bloqueó los 12 mensajes con precio o promoción y publicó las 17 piezas sin cifra, entre ellas las dos con defecto. Sobre la noción de «publicable» (panel B), el Recall baja a 0,857 y el F1 queda en 0,923 (exactitud 93,1 %), con la Precisión en 1,00. Es el mismo comportamiento leído contra dos objetos: el 0,923 incorpora una exigencia que el módulo nunca se propuso satisfacer. Con denominadores pequeños, cada proporción lleva su intervalo de Wilson del 95 %. En el panel A, Recall de 12/12 en [0,758; 1,000], especificidad de 17/17 en [0,816; 1,000] y exactitud de 29/29 en [0,883; 1,000]; en el panel B, Recall en [0,601; 0,960] y Precisión en [0,758; 1,000].</w:t>
       </w:r>
     </w:p>
     <w:p>
@@ -24802,19 +24768,16 @@
         <w:jc w:val="both"/>
       </w:pPr>
       <w:r>
-        <w:t xml:space="preserve">Los dos falsos negativos no son fallas de compliance. Eran mensajes de venta sin precio ni texto promocional, acompañados de una foto del producto con un defecto visible —en un caso la tinta del envase corrida, en el otro la tapa rota—, y el módulo los publicó según su alcance declarado (Anexo D). El evaluador externo los consideró no publicables por ese defecto. La discrepancia es de validez de constructo: para una usuaria, «publicable» es más amplio que </w:t>
-      </w:r>
-      <w:r>
-        <w:lastRenderedPageBreak/>
-        <w:t>«conforme a compliance» e incluye la calidad del producto. Delimita el alcance del sistema y abre una línea de trabajo directa: extender la capa multimodal a un control de calidad estética del producto, tarea para la que el mismo modelo de visión (Gemini) es apto (§8.2).</w:t>
-      </w:r>
+        <w:t>Los dos falsos negativos del panel B no son fallas de compliance: eran mensajes sin precio con una foto del producto defectuoso —tinta corrida, tapa rota—, que el módulo publicó según su alcance. Para una usuaria, «publicable» es más amplio que «conforme» e incluye la calidad del producto, una tarea para la que el mismo modelo de visión es apto (§8.2).</w:t>
+      </w:r>
+      <w:r/>
     </w:p>
     <w:p>
       <w:pPr>
         <w:jc w:val="both"/>
       </w:pPr>
       <w:r>
-        <w:t>El corpus permite medir, además, la distancia entre el constructo que el módulo audita y la regla completa de la marca. Las Pautas definen el mensaje comercial por el acto y no por la cifra, y once de los quince pies de foto sin cifra cierran con una invitación a contactar. Los mensajes comerciales según la letra de la fuente son entonces 25 de los 29: doce por la cifra, once pies de foto por la invitación y los dos mensajes de venta sin precio, que también solicitan la compra. El módulo detiene doce. Contra el objeto que declara auditar no comete errores; contra la regla completa, su cobertura es de doce sobre veinticinco. Las cuatro piezas sin solicitud son todas de la misma consultora: la forma es frecuente en la práctica real y no universal.</w:t>
+        <w:t>El corpus mide también la distancia con la regla completa. Las Pautas definen el mensaje comercial por el acto y no por la cifra. Según la letra de la fuente, los comerciales son 25 de los 29: doce por la cifra, once pies de foto por la invitación a contactar y los dos mensajes de venta sin precio, que también solicitan la compra. El módulo detiene doce: contra el objeto que declara auditar no comete errores, y contra la regla completa su cobertura es de doce sobre veinticinco. Las cuatro piezas sin solicitud son de la misma consultora.</w:t>
       </w:r>
     </w:p>
     <w:p>
@@ -24822,17 +24785,14 @@
         <w:jc w:val="both"/>
       </w:pPr>
       <w:r>
-        <w:t>Hasta el 19 de septiembre de 2026, los cuatro prompts de generación ordenaban que «cada una de las tres opciones DEBE terminar SIEMPRE con un llamado a la acción que invite a contactar a la consultora», también en la opción rotulada «Informativa». Postly producía así, en cada publicación, el acto que la fuente pone como ejemplo de mensaje comercial —«¡Pregúntame cómo puedes conseguirlo!» (p. 3)—, y el detector lo dejaba pasar porque audita la cifra. Sobre la regla completa, el sistema no reducía la exposición de la consultora: la introducía. La corrección invierte esa regla en los cuatro prompts y prohíbe la invitación en los tres tonos. El Anexo E.12 mide la conducta del modelo en los dos estados: antes de la corrección, quince de quince opciones cerraron con una solicitud de contacto o de compra (IC de Wilson del 95 % [0,796; 1,000]); después, ninguna de quince ([0,000; 0,204]). Las matrices y el corpus de campo no dependen de lo que el generador agregue, y la corrección no las altera. Un prompt fija la instrucción y no garantiza la conducta: la Figura 14 muestra una ejecución anterior a la corrección en la que la opción «Informativa» cierra sin ninguna invitación, y el intervalo medido no excluye ese incumplimiento ocasional.</w:t>
-      </w:r>
-    </w:p>
-    <w:p>
-      <w:r>
-        <w:t xml:space="preserve">En síntesis, la evidencia controlada y de campo muestra un módulo funcional. Su F1 es de 0,85 en el conjunto representativo y de 0,923 sobre contenido real, contra la etiqueta de «publicable» de la consultora y del evaluador externo (panel B de la Tabla 5). Contra el constructo que audita, con la etiqueta de los autores (panel A), es de 1,00. Su debilidad está en el canal de texto: las expresiones regulares, deterministas y baratas, no capturan la semántica del precio, y omiten precios en lenguaje natural y sobre-bloquean números y términos ambiguos. Esa distinción entre la forma de una cadena y su significado es la que separa el reconocimiento por patrones de la clasificación semántica de textos (Jurafsky y Martin, 2023). El canal de imagen opera sobre el significado, y el contraste sugiere complementar el textual con un clasificador </w:t>
-      </w:r>
-      <w:r>
-        <w:lastRenderedPageBreak/>
-        <w:t>de PLN o un modelo de lenguaje, como HU8 ya hace con las imágenes. Queda una reserva de canal. En Facebook, parte de los verdaderos positivos es contenido que la fuente admite bajo condición, porque nombra a la página de negocios entre los mecanismos autorizados: ahí el módulo es más estricto que la norma. El Capítulo 7 y el §8.2 retoman esa línea.</w:t>
-      </w:r>
+        <w:t>Hasta el 19 de septiembre de 2026, los cuatro prompts de generación ordenaban cerrar las tres opciones con «un llamado a la acción que invite a contactar a la consultora», también la «Informativa». Postly producía así en cada publicación el acto que la fuente pone como ejemplo de mensaje comercial, y el detector lo dejaba pasar porque audita la cifra: sobre la regla completa, el sistema introducía la exposición en lugar de reducirla. La corrección prohíbe la invitación en los tres tonos, y el Anexo E.12 mide el cambio: quince de quince opciones con solicitud de contacto antes, ninguna de quince después ([0,000; 0,204]). Las matrices no dependen de lo que el generador agregue y no se alteran. Un prompt fija la instrucción y no garantiza la conducta, como muestra la Figura 14.</w:t>
+      </w:r>
+    </w:p>
+    <w:p>
+      <w:r>
+        <w:t>En síntesis, el módulo es funcional. Su F1 es de 0,85 en el conjunto representativo y de 0,923 sobre contenido real contra la etiqueta de «publicable» de la consultora y del evaluador (panel B), y de 1,00 contra el constructo que audita, con la etiqueta de los autores (panel A). Su debilidad está en el canal de texto: las expresiones regulares no capturan la semántica del precio, que es lo que separa el reconocimiento de patrones de la clasificación semántica (Jurafsky y Martin, 2023), y el contraste con el canal de imagen sugiere complementarlo con un clasificador de lenguaje (§8.2). En Facebook, además, parte de los verdaderos positivos es contenido que la fuente admite en la página de negocios: ahí el módulo es más estricto que la norma (Capítulo 7).</w:t>
+      </w:r>
+      <w:r/>
     </w:p>
     <w:p>
       <w:pPr>
@@ -24854,7 +24814,7 @@
         <w:jc w:val="both"/>
       </w:pPr>
       <w:r>
-        <w:t>Las tres matrices estiman el desempeño sobre distribuciones de casos, pero no dicen dónde decide cada regla. El canal textual es determinista —seis expresiones regulares en cascada (Anexo B.4)— y su comportamiento es derivable del código. La técnica apropiada no es por eso ampliar el muestreo sino el análisis de valores límite con partición en clases de equivalencia (Myers, 2004). Las dos técnicas se complementan: el análisis de valores límite establece dónde decide cada regla, y el muestreo, cuán frecuentes son esas formas en el uso real (Tablas 3 a 5). Se diseñaron 25 casos: uno por regla dentro de su límite, uno inmediatamente fuera y los limpios que la regla puede bloquear por error. La predicción derivada de la lectura estática de las reglas se cumplió en los 25. Es compatible con que el detector sea caracterizable desde su especificación, pero 25 casos diseñados no bastan para confirmarlo.</w:t>
+        <w:t>Las matrices estiman el desempeño sobre distribuciones de casos, pero no dicen dónde decide cada regla. Como el canal textual es determinista y su comportamiento es derivable del código, la técnica apropiada es el análisis de valores límite con partición en clases de equivalencia (Myers, 2004), complementario del muestreo. Se diseñaron 25 casos —uno por regla dentro de su límite, uno inmediatamente fuera y los limpios que la regla puede bloquear por error—, y la predicción derivada de la lectura estática de las reglas se cumplió en los 25 (Tabla 10).</w:t>
       </w:r>
     </w:p>
     <w:p>
@@ -24862,7 +24822,7 @@
         <w:jc w:val="both"/>
       </w:pPr>
       <w:r>
-        <w:t>El ejercicio expuso cuatro defectos corregibles —que se corrigieron—, cinco igualmente corregibles que quedan pendientes, entre ellos el precio escrito en palabras, y un límite inherente al enfoque léxico, la polisemia (Tabla 6). El hallazgo más grave no fue un defecto de una regla sino una divergencia entre flujos. El nodo que procesa las publicaciones programadas a futuro (HU10) mantenía un conjunto propio de cuatro patrones, sin la regla de palabra-moneda, sin la de palabra-precio y con el vocabulario comercial sin variantes acentuadas ni femeninas. Un contenido bloqueado al publicarse podía, por lo tanto, publicarse si se programaba. Sobre el canal de texto del conjunto representativo ese flujo alcanzaba un Recall de 0,500 —bloqueaba 9 de los 18 casos infractores— frente al 0,833 del flujo inmediato, que bloqueaba 15 de los mismos 18. Ambas cifras corresponden solo al canal textual, que es donde los dos flujos diferían, y por eso no coinciden con el 0,85 de la Tabla 3, que agrega texto e imagen. Sobre el contenido real del estudio de campo, en cambio, los dos flujos coincidieron: ambos bloquearon los doce casos infractores. Los dos textos que ofrecen un «2x1» —la forma comercial que el conjunto reducido de patrones no cubría— emplean además la palabra «promo», que sí figuraba en su vocabulario, de modo que el flujo programado los detuvo por esa otra vía. La divergencia queda así demostrada sobre los tres conjuntos controlados y no sobre el de campo, cuyo contenido la enmascara. El detalle caso por caso está en el depósito (Anexo E.4).</w:t>
+        <w:t>El ejercicio expuso cuatro defectos que se corrigieron, cinco igualmente corregibles que quedan pendientes —entre ellos el precio escrito en palabras— y un límite inherente al enfoque léxico, la polisemia (Tabla 6). El hallazgo más grave fue una divergencia entre flujos: el nodo de las publicaciones programadas (HU10) mantenía un conjunto propio y más débil de cuatro patrones, de modo que un contenido bloqueado al publicarse podía publicarse si se programaba. Sobre el canal textual del conjunto representativo, ese flujo bloqueaba 9 de 18 infractores (Recall 0,500) frente a 15 de 18 del flujo inmediato (0,833); sobre el contenido real, los dos coincidieron, por razones que detalla el Anexo E.1.4.</w:t>
       </w:r>
     </w:p>
     <w:p>
@@ -24870,19 +24830,16 @@
         <w:jc w:val="both"/>
       </w:pPr>
       <w:r>
-        <w:t xml:space="preserve">Conforme al ciclo de la fase de Evaluación del marco DSRM (§3.2), los defectos detectados se corrigieron y el módulo se reevaluó. Se unificó un conjunto único </w:t>
-      </w:r>
-      <w:r>
-        <w:lastRenderedPageBreak/>
-        <w:t>de reglas en los cuatro nodos que ejecutan compliance de precios y se volvieron a ejecutar los cuatro conjuntos de casos con el harness que replica las reglas desplegadas. La corrección eleva el desempeño sobre el conjunto de valores límite de un F1 de 0,500 a uno de 0,727 (Recall de 0,412 a 0,706) y no altera ningún caso de los tres conjuntos anteriores, cuyas matrices —Tablas 3, 4 y 5— permanecen válidas sin modificación. El límite restante, la polisemia del vocabulario comercial, no es corregible mediante reglas léxicas. El precio expresado en palabras sí lo es en principio: los numerales del español forman un vocabulario cerrado que una regla puede enumerar junto a una palabra de moneda, como la regla 2 ya lo hace con el dígito. Queda pendiente, con el costo de nuevos falsos positivos con palabras como «mil» en otros usos. La polisemia y esa deuda de reglas por agregar fundamentan la recomendación de sustituir el canal textual por un clasificador semántico.</w:t>
-      </w:r>
+        <w:t>Conforme al ciclo DSRM (§3.2), los defectos se corrigieron y el módulo se reevaluó: un conjunto único de reglas en los cuatro nodos que ejecutan compliance de precios, con los cuatro conjuntos de casos ejecutados de nuevo. El F1 sobre los valores límite sube de 0,500 a 0,727 (Recall de 0,412 a 0,706), y ningún caso de las Tablas 3, 4 y 5 cambia. La polisemia no es corregible con reglas léxicas; el precio en palabras sí lo es en principio, con el costo de nuevos falsos positivos con palabras como «mil», y queda pendiente. Las dos cosas fundamentan la recomendación de sustituir el canal textual por un clasificador semántico (§8.2).</w:t>
+      </w:r>
+      <w:r/>
     </w:p>
     <w:p>
       <w:pPr>
         <w:jc w:val="both"/>
       </w:pPr>
       <w:r>
-        <w:t>La revisión del canal visual, hecha después de la del textual, encontró una divergencia de la misma clase y de mayor alcance. El grafo de conexiones mostró que la detección de precios incrustados corría sólo en el flujo de imagen única. El carrusel usaba un criterio propio, sin una de las formas que el de imagen única enumera, y el video y la re-publicación no ejecutaban ninguna detección visual. Una foto con el precio impreso quedaba bloqueada si se enviaba sola y se publicaba como video o reciclada desde Mi Agenda. La corrección unificó la regla: los cuatro flujos con imagen llevan hoy el mismo criterio, idéntico carácter por carácter. El carrusel lo lleva dentro del prompt que le pide el orden narrativo, porque separarlo multiplicaría por el número de imágenes el consumo de una cuota diaria acotada. La verificación del Anexo E.4 comprueba esa identidad flujo por flujo, y los Anexos E.9 a E.11 miden que el comportamiento acompañe a la regla.</w:t>
+        <w:t>La revisión del canal visual, hecha después de la del textual, encontró una divergencia de la misma clase y de mayor alcance: la detección de precios incrustados corría sólo en el flujo de imagen única. El carrusel usaba un criterio propio, y el video y la re-publicación no detectaban nada, de modo que una foto con el precio impreso se bloqueaba si se enviaba sola y se publicaba como video o reciclada desde Mi Agenda. La corrección llevó el mismo criterio, carácter por carácter, a los cuatro flujos con imagen —en el carrusel, dentro del prompt del orden narrativo, para no multiplicar el consumo de cuota—. La verificación del Anexo E.4 lo comprueba, y los Anexos E.9 a E.11 miden la conducta.</w:t>
       </w:r>
     </w:p>
     <w:p>
@@ -24890,7 +24847,7 @@
         <w:jc w:val="both"/>
       </w:pPr>
       <w:r>
-        <w:t>Sobre los tres flujos corregidos se ejecutaron cuatro casos de extremo a extremo contra el bot sobre el entorno E2, uno por flujo y dos en el del video, que los Anexos E.9 a E.11 documentan. Los dos de video (HU13) son un clip vertical con una placa de precio dentro del encuadre, que el módulo bloqueó, y uno horizontal con la placa en un borde, que no bloqueó y avisó. Esa segunda respuesta es deliberada. La normalización recorta el video al encuadre vertical, de modo que una placa pegada a un borde no llega al material publicado. El detector analiza por eso cuatro imágenes en una sola petición —tres instantes del video ya normalizado y el encuadre original sin recortar— y distingue las dos situaciones: bloquea si el precio sobrevive al recorte y avisa si el recorte lo elimina. El tercer caso es de carrusel (HU5): un grupo de dos imágenes, una de ellas con el precio impreso en los píxeles, que el módulo bloqueó entero citando los dos montos. El cuarto es el de la re-publicación (HU12). Los cuatro demuestran cobertura y no desempeño: no entran en ninguna matriz. El Capítulo 7 los discute.</w:t>
+        <w:t>Sobre los tres flujos corregidos se ejecutaron cuatro casos de extremo a extremo en E2 (Anexos E.9 a E.11). En video, un clip vertical con la placa de precio dentro del encuadre se bloqueó, y uno horizontal con la placa en un borde, que el recorte a 9:16 elimina, no se bloqueó y se avisó. El detector analiza en una sola petición tres instantes del video normalizado y el encuadre original. Un carrusel de dos imágenes con un precio impreso se bloqueó entero, citando los dos montos, y la re-publicación se bloqueó también. Los cuatro demuestran cobertura y no desempeño, y no entran en ninguna matriz.</w:t>
       </w:r>
     </w:p>
     <w:p>
@@ -24898,12 +24855,9 @@
         <w:jc w:val="both"/>
       </w:pPr>
       <w:r>
-        <w:t xml:space="preserve">El cuarto caso expuso además un defecto: el módulo bloqueó la pieza, pero el aviso a la usuaria no llegaba. El nodo que lo emite leía el destinatario como si la </w:t>
-      </w:r>
-      <w:r>
-        <w:lastRenderedPageBreak/>
-        <w:t>rama naciera de un mensaje, y nace de un botón, de modo que el envío fallaba. Se corrigió el mismo día. Ni la lectura del código ni la verificación de los patrones lo habrían encontrado, y por eso estos cuatro casos valen más que su tamaño muestral.</w:t>
-      </w:r>
+        <w:t>El cuarto caso expuso además un defecto que ni la lectura del código ni la verificación de los patrones habrían encontrado: el aviso de bloqueo no llegaba a la usuaria. Se corrigió el mismo día (Anexo E.11).</w:t>
+      </w:r>
+      <w:r/>
     </w:p>
     <w:p>
       <w:pPr>
@@ -25714,7 +25668,7 @@
         <w:rPr>
           <w:i/>
         </w:rPr>
-        <w:t>Nota. Elaboración propia. FN: falso negativo; FP: falso positivo. El precio expresado en palabras y las cuatro últimas filas son defectos corregibles que el mismo ejercicio expuso y que quedaron sin corregir, no defectos descubiertos después: la columna de predicción del conjunto ya los anticipaba como falsos negativos. Quedan como deuda pendiente. Sólo la polisemia y el separador de miles, que el detector no distingue del contexto, son un límite que el §8.2 declara inherente al enfoque léxico. El detalle de los 25 casos se presenta en el Anexo E.1.3.</w:t>
+        <w:t>Nota. Elaboración propia. FN: falso negativo; FP: falso positivo. El precio en palabras y las cuatro últimas filas son defectos corregibles que el ejercicio anticipó y que quedan pendientes; sólo la polisemia y el separador de miles son un límite inherente al enfoque léxico (§8.2). El detalle de los 25 casos está en el Anexo E.1.3.</w:t>
       </w:r>
     </w:p>
     <w:p>
@@ -25734,31 +25688,25 @@
     </w:p>
     <w:p>
       <w:r>
-        <w:t xml:space="preserve">Las cuatro baterías del §3.4.2 —integración multimodal, interfaz conversacional, procesamiento multimedia y transacciones OAuth 2.0— se ejecutaron sobre el entorno E2 (Anexo E.5), cada una contra el umbral de su Historia de Usuario cuando fija uno. Las Historias fijan once umbrales numéricos, y el inventario del Anexo E.7 tiene una fila por cada uno. Dos —la firma de HU9 y el corte de 60 s de HU13— se comprueban leyendo del código desplegado el parámetro que impone el límite. Los otros nueve se contrastan contra E2 y su historial de ejecuciones, salvo el intercambio de token de HU2 y la regeneración de copys de HU12, que salen </w:t>
-      </w:r>
-      <w:r>
-        <w:lastRenderedPageBreak/>
-        <w:t>de las baterías del Anexo E.5. El inventario da dos recuentos que no se suman. Por grado de verificación, cuatro filas se miden sobre el sistema en marcha, una de forma indirecta, cuatro por lectura del workflow —una comprobación estructural y no una medición— y dos quedan sin evidencia. Por resultado, cinco umbrales se cumplen, dos se cumplen parcialmente, uno se mide y no se cumple, el de HU12, y tres quedan sin verificar: los dos de HU2 y el de HU4. La vigencia del token de HU2 figura en los dos recuentos con distinto signo: la petición devolvió un token, de modo que hubo medición, pero lo devuelto no verifica los sesenta días.</w:t>
-      </w:r>
-    </w:p>
-    <w:p>
-      <w:r>
-        <w:t>Entre los verificados por configuración están dos umbrales estructurales: la firma de HU9 y el corte de 60 s de HU13. La lectura de HU9 localiza la concatenación de la firma en los cuatro nodos que publican, y en ninguno depende de una bifurcación. Cubre así todas las ejecuciones de esos nodos, pero no establece que ninguna rama publique sin pasar por ellos, que es una propiedad del grafo y no del código de un nodo. La de HU13 expuso un defecto: la guarda era «dur &amp;&amp; dur &gt; 60», de modo que no se disparaba cuando la duración no se podía leer, el camino frágil que el §4.4.3 describe al no haber ffprobe. Se corrigió el 19 de septiembre de 2026 para que el flujo se detenga y ofrezca el recorte también ante una duración ilegible (Anexo E.4).</w:t>
-      </w:r>
-    </w:p>
-    <w:p>
-      <w:r>
-        <w:t>Sobre 9 repeticiones de la batería de integración multimodal, el trayecto de la foto recibida a los tres copys en pantalla tardó 59,7 segundos en promedio (DE 40,6; mínimo 30,4; máximo 143,1). Las 9 devolvieron las tres opciones, de modo que la extracción del JSON fue consistente. Una décima tentativa no se completó porque se agotó el cupo diario del modelo. No hay en ella JSON que evaluar: la cifra mide la consistencia de la extracción y no la disponibilidad de la cadena, que sobre diez tentativas no es estimable. Lo que importa es la dispersión: las dos llamadas al modelo tardaron entre 21,9 y 132,4 segundos, y el resto de la cadena, entre 8,6 y 10,7. La variabilidad es del modelo y no de la orquestación.</w:t>
-      </w:r>
-    </w:p>
-    <w:p>
-      <w:r>
-        <w:t xml:space="preserve">Las otras tres baterías cumplen su umbral donde la Historia fija uno, salvo la vigencia de 60 días de HU2, que la de OAuth no verifica. La respuesta al comando de inicio —1,85 s de media y 2,69 s de máximo sobre diez repeticiones— queda por debajo de los 3 s de HU1, con poco margen: el tramo dominante es la lectura de Google Sheets, y una hoja con muchas más filas lo estrecharía. El pico de memoria de FFmpeg fue de 654 MB sobre un clip de 1920×1080 y 45 s, medido en E2. No corresponde contrastarlo con los 2 GB de RAM de E1, otra máquina en la que no se midió memoria: la cifra dice cuánta reclama una normalización, no cuánta holgura quedaba. La validación preventiva del token resolvió en 0,3 s. El intercambio por uno de larga duración devolvió un token válido, sin campo de expiración ni la vigencia de 60 días que menciona el §2.3, lo esperable para un token de página. Las tres mediciones </w:t>
-      </w:r>
-      <w:r>
-        <w:lastRenderedPageBreak/>
-        <w:t>son monousuario y sin carga concurrente; la escalabilidad no se validó en ningún entorno (§8.2).</w:t>
-      </w:r>
+        <w:t>Las cuatro baterías del §3.4.2 se ejecutaron sobre E2 contra el umbral de cada Historia (Anexo E.5), y el Anexo E.7 inventaría los once umbrales numéricos que fijan las Historias (Tabla 13). Por resultado, cinco se cumplen, dos se cumplen parcialmente, uno se mide y no se cumple —el de HU12— y tres quedan sin verificar, los dos de HU2 y el de HU4. Dos de ellos, la firma de HU9 y el corte de 60 s de HU13, se comprueban leyendo el código desplegado, una comprobación estructural y no una medición.</w:t>
+      </w:r>
+      <w:r/>
+    </w:p>
+    <w:p>
+      <w:r>
+        <w:t>La lectura de HU9 localiza la concatenación de la firma en los cuatro nodos que publican, sin depender de ninguna bifurcación; no establece que ninguna rama publique sin pasar por ellos, que es una propiedad del grafo. La de HU13 expuso un defecto: la guarda no se disparaba cuando la duración no se podía leer, y se corrigió el 19 de septiembre de 2026 (§4.4.3; Tabla 16).</w:t>
+      </w:r>
+    </w:p>
+    <w:p>
+      <w:r>
+        <w:t>Sobre 9 repeticiones de la batería de integración multimodal, el trayecto de la foto a los tres copys tardó 59,7 s de media (DE 40,6; mínimo 30,4; máximo 143,1), y las 9 devolvieron las tres opciones. Una décima tentativa no se completó por falta de cupo, de modo que la cifra mide la consistencia de la extracción y no la disponibilidad. La dispersión es del modelo y no de la orquestación: las llamadas al modelo tardaron entre 21,9 y 132,4 s, y el resto de la cadena, entre 8,6 y 10,7 s.</w:t>
+      </w:r>
+    </w:p>
+    <w:p>
+      <w:r>
+        <w:t>Las otras tres baterías cumplen su umbral donde la Historia fija uno, salvo la vigencia de 60 días de HU2, que no se verifica porque el token de página llega sin campo de expiración. La respuesta al comando de inicio, de 1,85 s de media y 2,69 s de máximo, queda por debajo de los 3 s de HU1 con poco margen. El pico de memoria de FFmpeg fue de 654 MB, y la validación del token resolvió en 0,3 s. Son mediciones monousuario y sin carga concurrente (Anexo E.5; §8.2).</w:t>
+      </w:r>
+      <w:r/>
     </w:p>
     <w:p>
       <w:pPr>
@@ -25777,17 +25725,17 @@
     </w:p>
     <w:p>
       <w:r>
-        <w:t>Se cronometró el tramo operativo —del material en mano a la publicación confirmada— de una publicación de feed en Instagram y Facebook, comparando el flujo manual (As-Is) con el asistido por Postly (To-Be). La medición operacionaliza la variable (a) del §3.5.4 y contrasta la hipótesis del §3.5.4. Participaron ocho Consultoras de Belleza Independientes reales —las tres del piloto más cinco nuevas—, con el orden de las condiciones contrabalanceado entre participantes (protocolo de la ampliación, Anexo E.2). Cada una ejecutó la tarea en ambas condiciones para cuatro publicaciones, bajo un diseño intra-sujeto que evita confundir el efecto de la persona con el de la herramienta (n = 32 pares).</w:t>
-      </w:r>
-    </w:p>
-    <w:p>
-      <w:r>
-        <w:t>El cronómetro arrancó con las imágenes ya provistas —la búsqueda o creación del material no computa— y se detuvo al confirmarse la publicación en ambas redes. El alcance de la tarea difirió en dos puntos de distinta clase. En los carruseles, la condición manual incluyó ordenar las imágenes, que Postly automatiza: es funcionalidad del sistema y entra legítimamente en la comparación. La otra es la adaptación de la imagen al formato de feed, segundo paso del protocolo manual, que con Postly no le corresponde a la usuaria (§4.4.2). El sistema rellena la imagen única a 1:1 dentro de su propio tiempo y publica el carrusel en su proporción original, de modo que descontar la adaptación del lado manual es conservador. La ampliación la registró como un tramo separado del mismo cronómetro, y la reducción se reporta sobre el tramo comparable y sobre el total (Anexo E.2).</w:t>
-      </w:r>
-    </w:p>
-    <w:p>
-      <w:r>
-        <w:t>El tiempo con Postly que se analiza no es el del cronómetro sin más. El historial de ejecuciones del motor conserva las 32 publicaciones, y en 23 de ellas el cronómetro marcaba menos que el intervalo que el propio motor registró entre la llegada de la primera foto y el fin de la publicación. No había incluido de forma uniforme la espera por el modelo, cuya duración varió mucho de una publicación a otra. Para cada publicación se toma por eso el mayor de los dos valores, y el Anexo E.2 transcribe ambos. Ese valor es una cota inferior del tiempo real, porque no incluye lo que tarda la usuaria en elegir y enviar la foto, de modo que la reducción que sigue es, a su vez, una cota superior. Explica también la distancia con la batería del Anexo E.5, que se tomó otro día: en las sesiones, el intervalo registrado por el motor promedió 1,58 minutos por publicación. Con el cronómetro sin corregir, la reducción era del 81,8 % (t(7) = 8,51); se informa sólo como referencia.</w:t>
+        <w:t>Se cronometró el tramo operativo —del material en mano a la publicación confirmada en Instagram y Facebook— de una publicación de feed, a mano y con Postly, para contrastar la hipótesis del §3.5.4. Participaron ocho consultoras, las tres del piloto y cinco nuevas, con el orden de las condiciones contrabalanceado y cuatro publicaciones por condición, en un diseño intra-sujeto (n = 32 pares; Anexo E.2).</w:t>
+      </w:r>
+    </w:p>
+    <w:p>
+      <w:r>
+        <w:t>El cronómetro arrancó con las imágenes ya provistas y se detuvo al confirmarse la publicación en las dos redes. En los carruseles, la condición manual incluyó ordenar las imágenes, que Postly automatiza y que entra legítimamente en la comparación. La adaptación de la imagen al formato de feed, que con Postly no le corresponde a la usuaria (§4.4.2), se registró como un tramo separado, y la reducción se reporta sobre el tramo comparable y sobre el total.</w:t>
+      </w:r>
+    </w:p>
+    <w:p>
+      <w:r>
+        <w:t>El tiempo con Postly es el mayor entre el cronómetro y el intervalo que el motor registró entre la llegada de la primera foto y el fin de la publicación, porque en 23 de las 32 publicaciones el cronómetro no había incluido de forma uniforme la espera por el modelo. Ese valor es una cota inferior del tiempo real, porque no incluye lo que tarda la usuaria en enviar la foto, y la reducción que sigue es por eso una cota superior. Con el cronómetro sin corregir, la reducción era del 81,8 %; se informa sólo como referencia (Anexo E.2).</w:t>
       </w:r>
     </w:p>
     <w:p>
@@ -26436,45 +26384,39 @@
         <w:rPr>
           <w:i/>
         </w:rPr>
-        <w:t>Nota. Elaboración propia a partir de la planilla de cronometraje (Anexo E.2). «Manual» es el tramo comparable —producción y publicación, descontada la adaptación— y «Postly», el tiempo total corregido con el historial de ejecuciones (§6.1.6), porque esa subtarea no le corresponde a la usuaria: la imagen única la adapta el sistema, dentro de ese tiempo (§4.4.2). Ese tiempo es una cota inferior del real (§6.1.6). La «Reducción» es la media de las ocho reducciones individuales, no la reducción entre las medias globales de esta tabla. El detalle de la adaptación por participante y la reducción sobre el tiempo total están en el §6.1.6 y el Anexo E.2. La codificación cambió entre el piloto y la ampliación: la C1 del piloto es la C6 de la ampliación, y C2 y C3 conservan su código. Con la codificación de la ampliación, los estratos de relación son «Conocida», C2 y C3; «Familiar», C6; y «Ninguna», C1, C4, C5, C7 y C8.</w:t>
-      </w:r>
-    </w:p>
-    <w:p>
-      <w:r>
-        <w:t>El proceso manual insumió en promedio 9,3 minutos por publicación, de los cuales 1,8 correspondieron a la adaptación de la imagen; el tramo comparable es, por lo tanto, de 7,6 minutos. Sobre el tramo comparable, Postly insumió 1,7 minutos: una reducción media del 76,7 % (DE 3,9; IC 95 % [73,5 %; 79,9 %]) y un ahorro medio de 5,9 minutos por publicación. Las 32 observaciones no son independientes entre sí: provienen de ocho participantes con cuatro publicaciones cada una, de modo que la unidad de análisis es la participante y no la publicación, igual que en el piloto. La prueba t de Student pareada sobre la diferencia en minutos por participante (5,9 minutos de media; DE 1,1) indica que la diferencia entre ambos procesos es significativa (t(7) = 15,73; p &lt; 0,001; d de Cohen pareada = 5,56). Ese contraste establece que Postly ahorra tiempo; el que corresponde a la hipótesis del §3.5.4, una reducción mayor al 70 %, es el del párrafo siguiente.</w:t>
-      </w:r>
-    </w:p>
-    <w:p>
-      <w:r>
-        <w:t xml:space="preserve">El contraste contra el umbral del 70 % —H₀: reducción = 70 %, unilateral— es el que corresponde a la hipótesis del §3.5.4. Sobre el tiempo de Postly </w:t>
-      </w:r>
-      <w:r>
-        <w:lastRenderedPageBreak/>
-        <w:t>registrado es significativo: t(7) = 4,90; p &lt; 0,001; d = 1,73, y el intervalo de confianza del 95 % [73,5 %; 79,9 %] no cruza el umbral. Ese resultado no basta para afirmar la hipótesis, porque el tiempo registrado es una cota inferior y la reducción, una cota superior: el contraste establece que la reducción supera el 70 % con el tiempo registrado, no que lo supere con el tiempo real. La prueba pareada sobre los minutos ahorrados (t(7) = 15,73; p &lt; 0,001) establece que Postly ahorra tiempo, cosa que no está en discusión.</w:t>
-      </w:r>
-    </w:p>
-    <w:p>
-      <w:r>
-        <w:t>Falta estimar cuánto tiempo no se registró. En los 9 pares —de cinco participantes— en que el cronómetro superó al intervalo del motor, la diferencia entre ambos fue de 6 a 68 s, con una mediana de 17 s y una media de 28 s. Es lo que la usuaria tardó antes de que el motor viera la foto. Se aplica la regla del tiempo corregido con el intervalo del motor incrementado en esa cantidad. La reducción media es del 74,9 % con 10 s (t(7) = 3,31; p = 0,006). Es del 73,6 % con 17 s, la mediana (t(7) = 2,29; p = 0,028), y del 73,0 % con 20 s (p = 0,052). Con 28 s, la media, es del 71,4 % (t(7) = 0,80; p = 0,224). El contraste deja de ser significativo con unos 20 s, y la estimación puntual deja de superar el 70 % con unos 35 s. Los datos sostienen, entonces, una conclusión más acotada que el contraste sobre el tiempo registrado: con el tiempo omitido en su mediana observada la reducción supera el 70 % de forma significativa, y con su media no se distingue del umbral. La hipótesis es compatible con los datos, pero no queda confirmada de forma concluyente. Con las medidas no paramétricas que recomiendan Kitchenham y Madeyski (2024), Postly fue más rápido en los 32 pares (probabilidad de superioridad pareada = 1,00). La prueba de rangos con signo de Wilcoxon, exacta y unilateral, sobre las ocho reducciones frente al 70 % da p = 0,004 con el tiempo registrado, p = 0,027 con 17 s y p = 0,191 con 28 s. Los nueve pares en que el cronómetro cubrió todo el tramo dan una reducción media del 77,7 % (mínimo 63,1 %), aunque son un subconjunto que el propio cronómetro seleccionó y no un contraste. Estas cifras, los contrastes anteriores y la cuenta con el cronómetro sin corregir se reproducen desde la planilla del Anexo E.2 con los scripts que lista el Anexo E.4.</w:t>
-      </w:r>
-    </w:p>
-    <w:p>
-      <w:r>
-        <w:t>La diferencia entre las dos reducciones —76,7 % sobre el tramo comparable y 81,2 % sobre el tiempo total— es la propia subtarea de adaptación, de 1,8 minutos de media. La ampliación la midió como un tramo separado del mismo cronómetro (protocolo de la ampliación, §5). Sobre el tiempo total la reducción también es significativa contra el umbral del 70 % (t(7) = 9,27; p &lt; 0,001). El registro del tramo de adaptación y los datos completos están en el Anexo E.2.</w:t>
-      </w:r>
-    </w:p>
-    <w:p>
-      <w:r>
-        <w:t xml:space="preserve">La reducción no fue homogénea entre participantes: el rango sobre el tramo comparable va del 71,8 % (C6) al 83,0 % (C5). La relación previa con el equipo no se asocia con una reducción mayor: 77,5 % de reducción media en el </w:t>
-      </w:r>
-      <w:r>
-        <w:lastRenderedPageBreak/>
-        <w:t>estrato «Ninguna» (n = 5), 77,0 % en «Conocida» (n = 2) y 71,8 % en «Familiar» (n = 1). El orden de las condiciones se contrabalanceó entre participantes: cuatro secuencias manual-primero, cuatro Postly-primero, con la misma reducción media en ambas (76,7 %; t de Welch = 0,01; gl ≈ 3,4; p = 0,992). La diferencia de cinco puntos que mostraba el cronómetro sin corregir venía de su subregistro, que no fue igual en todas las sesiones. Tampoco hubo aprendizaje entre la primera y la última publicación con Postly (t(7) = -1,78; p = 0,118). Ninguno de los tres contrastes tiene potencia para ser concluyente con esta n.</w:t>
-      </w:r>
-    </w:p>
-    <w:p>
-      <w:r>
-        <w:t>Finalmente, el tiempo manual medido (≈ 9,3 min sobre ocho participantes) corresponde al tramo operativo «material en mano → publicación en ambas redes». La curación y creación del contenido, previa a ese tramo, no se midió, y el §1.2.a no le asigna una cifra.</w:t>
+        <w:t>Nota. Elaboración propia a partir de la planilla de cronometraje (Anexo E.2). «Manual» es el tramo comparable —producción y publicación, descontada la adaptación— y «Postly», el tiempo total corregido con el historial de ejecuciones, una cota inferior del real (§6.1.6). La «Reducción» es la media de las ocho reducciones individuales, no la reducción entre las medias globales. La C1 del piloto es la C6 de la ampliación; los estratos de relación son «Conocida», C2 y C3; «Familiar», C6; y «Ninguna», C1, C4, C5, C7 y C8.</w:t>
+      </w:r>
+    </w:p>
+    <w:p>
+      <w:r>
+        <w:t>El proceso manual insumió 9,3 minutos por publicación, de los cuales 1,8 fueron la adaptación de la imagen: el tramo comparable es de 7,6 minutos. Postly insumió 1,7: una reducción media del 76,7 % (DE 3,9; IC 95 % [73,5 %; 79,9 %]) y un ahorro de 5,9 minutos por publicación. Las 32 observaciones están anidadas en ocho personas, de modo que la unidad de análisis es la participante. La prueba t pareada sobre los minutos ahorrados es significativa (t(7) = 15,73; p &lt; 0,001; d de Cohen pareada = 5,56): Postly ahorra tiempo.</w:t>
+      </w:r>
+    </w:p>
+    <w:p>
+      <w:r>
+        <w:t>El contraste que corresponde a la hipótesis es el unilateral contra el 70 %. Con el tiempo registrado es significativo (t(7) = 4,90; p &lt; 0,001; d = 1,73), y el intervalo no cruza el umbral. No basta para afirmar la hipótesis, porque el tiempo registrado es una cota inferior: establece que la reducción supera el 70 % con ese tiempo, no con el real.</w:t>
+      </w:r>
+      <w:r/>
+    </w:p>
+    <w:p>
+      <w:r>
+        <w:t>Falta estimar el tiempo no registrado. En los 9 pares en que el cronómetro superó al motor, la diferencia fue de 6 a 68 s, con una mediana de 17 s y una media de 28 s. Sumada al tiempo de Postly, la reducción es del 73,6 % con la mediana, significativa frente al 70 % (t(7) = 2,29; p = 0,028), y del 71,4 % con la media, que no se distingue del umbral (t(7) = 0,80; p = 0,224). La hipótesis es compatible con los datos, pero no queda confirmada de forma concluyente. Las medidas no paramétricas que recomiendan Kitchenham y Madeyski (2024) van en el mismo sentido: Postly fue más rápido en los 32 pares (probabilidad de superioridad pareada = 1,00). La prueba de Wilcoxon contra el 70 % da p = 0,004 con el tiempo registrado y p = 0,191 con 28 s. El análisis completo está en el Anexo E.2.</w:t>
+      </w:r>
+    </w:p>
+    <w:p>
+      <w:r>
+        <w:t>Sobre el tiempo total, con la adaptación incluida, la reducción es del 81,2 % y también significativa contra el 70 % (t(7) = 9,27; p &lt; 0,001); la diferencia con el 76,7 % es la propia adaptación, de 1,8 minutos (Anexo E.2).</w:t>
+      </w:r>
+    </w:p>
+    <w:p>
+      <w:r>
+        <w:t>La reducción fue del 71,8 % (C6) al 83,0 % (C5) y no se asoció con la relación previa con el equipo (77,5 % en «Ninguna», 77,0 % en «Conocida», 71,8 % en «Familiar»). Tampoco hubo efecto de orden ni de aprendizaje, aunque ninguno de esos contrastes tiene potencia con n = 8 (Anexo E.2).</w:t>
+      </w:r>
+      <w:r/>
+    </w:p>
+    <w:p>
+      <w:r>
+        <w:t>El tiempo manual medido corresponde al tramo «material en mano → publicación en ambas redes»; la curación y creación previa del contenido no se midió.</w:t>
       </w:r>
     </w:p>
     <w:p>
@@ -26497,7 +26439,7 @@
         <w:jc w:val="both"/>
       </w:pPr>
       <w:r>
-        <w:t>Las ocho consultoras completaron, tras usar el sistema, un cuestionario de Aceptación Tecnológica (Davis, 1989) ampliado a doce ítems en escala Likert de 1 a 5, con tres ítems invertidos y un ítem de control de atención. El instrumento del piloto tenía diez ítems y ninguno invertido; el de la ampliación invierte ítems para medir la aquiescencia, la tendencia a acordar con una afirmación y también con su contraria (§3.5.5). Los ítems se agrupan en Utilidad Percibida, Facilidad de Uso Percibida e Intención de Uso, y operacionalizan la variable (c) del §3.5.4. La Tabla 8 resume los resultados.</w:t>
+        <w:t>Las ocho consultoras completaron, tras usar el sistema, un cuestionario de Aceptación Tecnológica (Davis, 1989) de doce ítems en escala Likert de 1 a 5, con tres invertidos para medir la aquiescencia y un control de atención (§3.5.5). Los ítems se agrupan en Utilidad Percibida, Facilidad de Uso Percibida e Intención de Uso, y la Tabla 8 resume los resultados.</w:t>
       </w:r>
     </w:p>
     <w:p>
@@ -26756,12 +26698,9 @@
         <w:jc w:val="both"/>
       </w:pPr>
       <w:r>
-        <w:t xml:space="preserve">El puntaje TAM global —la media de los once ítems, sin el control de atención— fue de 4,43 sobre 5; la media de los tres constructos es 4,33. No hay indicios de aquiescencia. La correlación entre los ítems directos e invertidos de cada constructo fue negativa en los tres —r = -0,33 en Utilidad Percibida, -0,61 en Facilidad de Uso y -0,90 en Intención de Uso—, la dirección esperable si el instrumento mide aceptación y no acuerdo generalizado. Con ocho participantes, y con r = -0,33 en un constructo de fiabilidad baja, eso es compatible con la ausencia de aquiescencia pero no alcanza para descartarla. Los estadísticos de </w:t>
-      </w:r>
-      <w:r>
-        <w:lastRenderedPageBreak/>
-        <w:t>fiabilidad mejoran respecto del piloto sin volverse concluyentes: α de Cronbach = 0,70 para Facilidad de Uso y 0,95 para Intención de Uso. El de Utilidad Percibida, 0,29, es bajo. No lo explica el ítem PU1, que tuvo varianza nula —las ocho participantes le dieron la nota máxima—: sin él, el α es 0,31. Lo baja PU3 («Postly me ayuda a cumplir las normas de la marca sin revisar todo a mano»), cuya correlación con el resto del constructo es negativa (-0,43); sin ese ítem, el α sube a 0,55. Con n = 8 no es posible distinguir si PU3 mide algo distinto de la utilidad o si la diferencia es azar, de modo que la causa queda sin identificar.</w:t>
-      </w:r>
+        <w:t>El puntaje TAM global, la media de los once ítems sin el control de atención, fue de 4,43 sobre 5. La correlación entre ítems directos e invertidos fue negativa en los tres constructos (r = -0,33, -0,61 y -0,90), la dirección esperable si el instrumento mide aceptación y no aquiescencia, aunque con ocho participantes no alcanza para descartarla. La fiabilidad es aceptable en Facilidad de Uso (α = 0,70) e Intención de Uso (0,95) y baja en Utilidad Percibida (0,29), por un ítem —PU3, sobre el cumplimiento de las normas— que correlaciona negativamente con el resto. Con n = 8 no se distingue si mide otra cosa o es azar (Anexo E.3).</w:t>
+      </w:r>
+      <w:r/>
     </w:p>
     <w:p>
       <w:pPr>
@@ -26779,7 +26718,7 @@
         <w:jc w:val="both"/>
       </w:pPr>
       <w:r>
-        <w:t>Las tres capacidades del Objetivo Específico 2 que la integración no mide por sí sola —la calidad del copywriting de HU4, el tono de HU6 y el ordenamiento de carrusel de HU5— tienen una primera evaluación con dos evaluadores externos, a ciegas, detallada en el Anexo E.14. El Estudio 1 comparó, sobre 8 productos, el copy de Postly contra un generador genérico de referencia: el evaluador prefirió a Postly en los 8, sin que ningún copy incluyera una afirmación no verificable contra la foto (Anexo E.14.1). En la dimensión de cumplimiento esa comparación favorece a Postly por diseño, porque el generador de referencia es un prompt de una línea que no conoce las reglas de la marca. El Estudio 2 midió si el tono elegido —Informativo, Vendedor, Divertido— se reconoce en el texto: un segundo evaluador acertó 22 de 24 asignaciones forzadas (91,7 %), por encima del umbral del 60 % fijado de antemano (Anexo E.14.3). El Estudio 3 comparó el orden de carrusel que propone el sistema contra el orden de envío original, sobre 8 conjuntos reales: fue preferido en 6 de 8, sin significancia estadística (n = 8; Anexo E.14.4). El Estudio 4 repitió la comparación de copy y de orden, ahora contra el trabajo manual real de las 8 participantes de la ampliación. El copy de Postly fue preferido en 26 de 32 pares (81,3 %), y su orden de carrusel, en 6 de los 7 conjuntos no triviales (85,7 %; binomial exacta bilateral, p = 0,125; Anexo E.14.2). Esos carruseles son de dos imágenes, de modo que cada uno admite sólo dos órdenes. Los cuatro estudios comparten la misma limitación: un único evaluador por estudio, sin acuerdo inter-evaluador que calcular.</w:t>
+        <w:t>Las tres capacidades del Objetivo Específico 2 que la integración no mide por sí sola —la calidad del copy (HU4), el tono (HU6) y el orden del carrusel (HU5)— tienen una primera evaluación a ciegas con dos evaluadores externos (Anexo E.14). Frente a un generador genérico, el copy de Postly fue preferido en los 8 productos, sin afirmaciones no verificables contra la foto (Estudio 1), aunque en la dimensión de cumplimiento el diseño favorece a Postly. El tono pedido se reconoció en 22 de 24 asignaciones (91,7 %), por encima del umbral del 60 % fijado de antemano (Estudio 2). Frente al trabajo manual de las ocho participantes, el copy de Postly fue preferido en 26 de 32 pares (81,3 %; Estudio 4). El orden de carrusel fue preferido frente al de envío en 6 de 8 conjuntos (Estudio 3) y frente al manual en 6 de 7 carruseles de dos imágenes, que admiten sólo dos órdenes (binomial exacta bilateral, p = 0,125), sin significancia estadística. Cada estudio tuvo un único evaluador.</w:t>
       </w:r>
     </w:p>
     <w:p>
@@ -26821,7 +26760,7 @@
         <w:t>Complejidad Criptográfica de APIs de Terceros:</w:t>
       </w:r>
       <w:r>
-        <w:t xml:space="preserve"> la integración con la Graph API de Meta y el protocolo OAuth 2.0 (Hardt, 2012) fue la curva de aprendizaje más costosa del proyecto. El canje del código por un token de larga duración ocurre una vez y no se repite —no hay refresco—, pero es lo que permite que el bot opere sin pedirle a la consultora que se autentique cada día.</w:t>
+        <w:t xml:space="preserve"> la Graph API de Meta y OAuth 2.0 (Hardt, 2012) fueron la curva de aprendizaje más costosa. El canje por un token de larga duración ocurre una vez, sin refresco, y es lo que permite al bot operar sin pedir autenticación cada día.</w:t>
       </w:r>
     </w:p>
     <w:p>
@@ -26850,7 +26789,7 @@
         <w:rPr>
           <w:bCs/>
         </w:rPr>
-        <w:t xml:space="preserve"> el sistema depende de la disponibilidad y de las políticas de servicios de terceros: Google Cloud, Meta y Telegram. Eso refuerza la decisión de auto-hospedar el orquestador (n8n), que retiene el control sobre la lógica de negocio y sobre el motor que la ejecuta. No alcanza a la base de datos, que vive en Google Sheets: el §2.1.a declara que el auto-hospedaje no preserva la localización del almacenamiento.</w:t>
+        <w:t xml:space="preserve"> el sistema depende de Google Cloud, Meta y Telegram. Eso refuerza la decisión de auto-hospedar el orquestador, que retiene el control de la lógica de negocio, aunque no de la base de datos, que vive en Google Sheets (§2.1.a).</w:t>
       </w:r>
     </w:p>
     <w:p>
@@ -33519,6 +33458,36 @@
       </w:r>
     </w:p>
     <w:p>
+      <w:pPr/>
+      <w:r>
+        <w:rPr>
+          <w:b w:val="0"/>
+          <w:i/>
+        </w:rPr>
+        <w:t>El contraste es posible porque los 29 textos verbatim del estudio de campo llegaron después de diseñados los conjuntos. Un script clasifica cada caso infractor de texto según la forma en que expresa el precio o la promoción, con una taxonomía léxica propia. Las formas son seis: símbolo de moneda con cifra, cifra con palabra de moneda, palabra de precio con cifra, descuento porcentual, vocabulario comercial y forma indirecta. A la quinta la define que el vocabulario, y no la cifra, sea lo que dispara la regla: dos de los tres casos de campo que caen en ella ofrecen un «2x1», que sí lleva cifra, y el tercero un «envío GRATIS». No son mutuamente excluyentes —cinco de los doce casos reales satisfacen más de una—, de modo que a cada caso se le asigna la primera que coincide, en ese orden. La distribución por forma depende por lo tanto del orden elegido; lo que no depende de él es la categoría residual, que es la que sostiene el contraste. Los 12 casos infractores de texto del corpus real se reparten en tres formas: 5 con símbolo de moneda, 4 con descuento porcentual y 3 con vocabulario comercial. Ninguno adopta una forma indirecta, mientras que el conjunto representativo lleva 1 de 18, y 4 de sus casos usan la palabra de moneda o la de precio, que en el corpus real no aparecen.</w:t>
+      </w:r>
+    </w:p>
+    <w:p>
+      <w:pPr/>
+      <w:r>
+        <w:rPr>
+          <w:b w:val="0"/>
+          <w:i/>
+        </w:rPr>
+        <w:t>Esa taxonomía no es del todo independiente de lo que mide: su primera categoría reproduce el patrón 1 del detector carácter por carácter, y la quinta repite buena parte del vocabulario del patrón 5. El contraste establece entonces qué formas trae cada corpus, y no si el detector las reconocería con independencia de cómo está escrito. Leído así sigue siendo útil para lo único que el §6.1 le pide —saber si el conjunto diseñado es más adverso que la redacción observada—, y no para más que eso.</w:t>
+      </w:r>
+    </w:p>
+    <w:p>
+      <w:pPr/>
+      <w:r>
+        <w:rPr>
+          <w:b w:val="0"/>
+          <w:i/>
+        </w:rPr>
+        <w:t>El conjunto diseñado incluye, entonces, una forma indirecta que el corpus real no exhibe: un caso sobre dieciocho frente a cero sobre doce, una diferencia que la prueba exacta de Fisher no distingue del azar (p = 1,0 bilateral). No autoriza a tratar las métricas del conjunto como cota de las reales, ni explica la brecha de F1 con el campo, que sale sobre todo de los falsos positivos —tres contra cero— y que la taxonomía no clasifica, porque sólo ordena los positivos. Los doce textos reales son, además, mensajes de canal privado, donde el precio se enuncia con menos rodeos que en una publicación de feed. El resultado por caso está en el material complementario (Anexo E.4).</w:t>
+      </w:r>
+    </w:p>
+    <w:p>
       <w:pPr>
         <w:pStyle w:val="Heading4"/>
       </w:pPr>
@@ -36151,6 +36120,36 @@
       </w:r>
     </w:p>
     <w:p>
+      <w:pPr/>
+      <w:r>
+        <w:rPr>
+          <w:b w:val="0"/>
+          <w:i/>
+        </w:rPr>
+        <w:t>El tiempo con Postly que se analiza no es el del cronómetro sin más. El historial de ejecuciones del motor conserva las 32 publicaciones, y en 23 de ellas el cronómetro marcaba menos que el intervalo que el propio motor registró entre la llegada de la primera foto y el fin de la publicación. No había incluido de forma uniforme la espera por el modelo, cuya duración varió mucho de una publicación a otra. Para cada publicación se toma por eso el mayor de los dos valores, y el Anexo E.2 transcribe ambos. Ese valor es una cota inferior del tiempo real, porque no incluye lo que tarda la usuaria en elegir y enviar la foto, de modo que la reducción que sigue es, a su vez, una cota superior. Explica también la distancia con la batería del Anexo E.5, que se tomó otro día: en las sesiones, el intervalo registrado por el motor promedió 1,58 minutos por publicación. Con el cronómetro sin corregir, la reducción era del 81,8 % (t(7) = 8,51); se informa sólo como referencia.</w:t>
+      </w:r>
+    </w:p>
+    <w:p>
+      <w:pPr/>
+      <w:r>
+        <w:rPr>
+          <w:b w:val="0"/>
+          <w:i/>
+        </w:rPr>
+        <w:t>Falta estimar cuánto tiempo no se registró. En los 9 pares —de cinco participantes— en que el cronómetro superó al intervalo del motor, la diferencia entre ambos fue de 6 a 68 s, con una mediana de 17 s y una media de 28 s. Es lo que la usuaria tardó antes de que el motor viera la foto. Se aplica la regla del tiempo corregido con el intervalo del motor incrementado en esa cantidad. La reducción media es del 74,9 % con 10 s (t(7) = 3,31; p = 0,006). Es del 73,6 % con 17 s, la mediana (t(7) = 2,29; p = 0,028), y del 73,0 % con 20 s (p = 0,052). Con 28 s, la media, es del 71,4 % (t(7) = 0,80; p = 0,224). El contraste deja de ser significativo con unos 20 s, y la estimación puntual deja de superar el 70 % con unos 35 s. Los datos sostienen, entonces, una conclusión más acotada que el contraste sobre el tiempo registrado: con el tiempo omitido en su mediana observada la reducción supera el 70 % de forma significativa, y con su media no se distingue del umbral. La hipótesis es compatible con los datos, pero no queda confirmada de forma concluyente. Con las medidas no paramétricas que recomiendan Kitchenham y Madeyski (2024), Postly fue más rápido en los 32 pares (probabilidad de superioridad pareada = 1,00). La prueba de rangos con signo de Wilcoxon, exacta y unilateral, sobre las ocho reducciones frente al 70 % da p = 0,004 con el tiempo registrado, p = 0,027 con 17 s y p = 0,191 con 28 s. Los nueve pares en que el cronómetro cubrió todo el tramo dan una reducción media del 77,7 % (mínimo 63,1 %), aunque son un subconjunto que el propio cronómetro seleccionó y no un contraste. Estas cifras, los contrastes anteriores y la cuenta con el cronómetro sin corregir se reproducen desde la planilla del Anexo E.2 con los scripts que lista el Anexo E.4.</w:t>
+      </w:r>
+    </w:p>
+    <w:p>
+      <w:pPr/>
+      <w:r>
+        <w:rPr>
+          <w:b w:val="0"/>
+          <w:i/>
+        </w:rPr>
+        <w:t>La reducción no fue homogénea entre participantes: el rango sobre el tramo comparable va del 71,8 % (C6) al 83,0 % (C5). La relación previa con el equipo no se asocia con una reducción mayor: 77,5 % de reducción media en el estrato «Ninguna» (n = 5), 77,0 % en «Conocida» (n = 2) y 71,8 % en «Familiar» (n = 1). El orden de las condiciones se contrabalanceó entre participantes: cuatro secuencias manual-primero, cuatro Postly-primero, con la misma reducción media en ambas (76,7 %; t de Welch = 0,01; gl ≈ 3,4; p = 0,992). La diferencia de cinco puntos que mostraba el cronómetro sin corregir venía de su subregistro, que no fue igual en todas las sesiones. Tampoco hubo aprendizaje entre la primera y la última publicación con Postly (t(7) = -1,78; p = 0,118). Ninguno de los tres contrastes tiene potencia para ser concluyente con esta n.</w:t>
+      </w:r>
+    </w:p>
+    <w:p>
       <w:pPr>
         <w:pStyle w:val="Heading3"/>
       </w:pPr>
@@ -37169,6 +37168,16 @@
       </w:r>
     </w:p>
     <w:p>
+      <w:pPr/>
+      <w:r>
+        <w:rPr>
+          <w:b w:val="0"/>
+          <w:i/>
+        </w:rPr>
+        <w:t>Las otras tres baterías cumplen su umbral donde la Historia fija uno, salvo la vigencia de 60 días de HU2, que la de OAuth no verifica. La respuesta al comando de inicio —1,85 s de media y 2,69 s de máximo sobre diez repeticiones— queda por debajo de los 3 s de HU1, con poco margen: el tramo dominante es la lectura de Google Sheets, y una hoja con muchas más filas lo estrecharía. El pico de memoria de FFmpeg fue de 654 MB sobre un clip de 1920×1080 y 45 s, medido en E2. No corresponde contrastarlo con los 2 GB de RAM de E1, otra máquina en la que no se midió memoria: la cifra dice cuánta reclama una normalización, no cuánta holgura quedaba. La validación preventiva del token resolvió en 0,3 s. El intercambio por uno de larga duración devolvió un token válido, sin campo de expiración ni la vigencia de 60 días que menciona el §2.3, lo esperable para un token de página. Las tres mediciones son monousuario y sin carga concurrente; la escalabilidad no se validó en ningún entorno (§8.2).</w:t>
+      </w:r>
+    </w:p>
+    <w:p>
       <w:pPr>
         <w:pStyle w:val="Heading3"/>
       </w:pPr>
@@ -37463,6 +37472,26 @@
         </w:rPr>
         <w:lastRenderedPageBreak/>
         <w:t>parseo replica el modo fail-open del nodo desplegado, de manera que una respuesta vacía, bloqueada por el filtro del propio modelo o con prosa delante del JSON queda registrada como «Publico», igual que un negativo genuino. Sobre estas corridas, un negativo no se puede distinguir de un fallo de formato. El script se corrigió para persistir la respuesta cruda en toda corrida futura; la de estas dos no se puede recuperar. Las salvedades sobre qué acota este resultado —la dificultad del conjunto y el carácter único de la corrida— se declaran en el §6.1. El Anexo E.8 las atiende sólo en parte: repitió la inferencia sobre ocho de los nueve casos difíciles y sobre ninguno de los veinte de este conjunto.</w:t>
+      </w:r>
+    </w:p>
+    <w:p>
+      <w:pPr/>
+      <w:r>
+        <w:rPr>
+          <w:b w:val="0"/>
+          <w:i/>
+        </w:rPr>
+        <w:t xml:space="preserve">Los diez casos limpios llevan, en cambio, cifras que pueden confundirse con un precio: el factor de protección solar, el volumen en mililitros, la duración en horas, la concentración porcentual de un activo y el año de un tono. Las otras cinco son la numeración de pasos de una rutina, un separador de miles, un porcentaje que no es un descuento, un nombre de línea de producto sobreimpreso y una foto de producto sin ninguna sobreimpresión. Dos de los diez infractores (V03 y V06) prueban la promoción sin monto —una marca de agua «PROMO 2x1» y una cinta de «30% OFF»—, que el Módulo Centinela debe bloquear con el mismo criterio que el precio. Un tercero, V10, combina el envío gratis con la cifra («ENVÍO GRATIS · $1.890») y pertenece por lo tanto a la clase del precio incrustado. </w:t>
+      </w:r>
+    </w:p>
+    <w:p>
+      <w:pPr/>
+      <w:r>
+        <w:rPr>
+          <w:b w:val="0"/>
+          <w:i/>
+        </w:rPr>
+        <w:t>Fuera de este trabajo, Yılmaz et al. (2026) comparan diez modelos, entre motores de OCR y modelos de visión y lenguaje, sobre 6.600 imágenes sintéticas de texto en turco. Los modelos de visión y lenguaje superan a los motores de OCR, y la baja resolución es lo que más dificulta el reconocimiento a todos, incluido el mejor. Es un antecedente sobre otro idioma y sobre texto sintético, y extenderlo a precios sobre arte comercial en español es una lectura de los autores. La dificultad de la baja resolución es, sin embargo, la que el corte difícil de este trabajo pone a prueba con un precio en cuerpo diminuto.</w:t>
       </w:r>
     </w:p>
     <w:p>
@@ -39096,6 +39125,16 @@
           <w:i/>
         </w:rPr>
         <w:t>Quedan la procedencia y una salvedad. La imagen es una pieza de prueba del equipo compuesta sobre arte oficial de la marca, no material auténtico de campo como R01. Y el caso cubre una sola de las dos respuestas posibles: demuestra que la detección corre en este flujo y lo detiene, no mide su exactitud, que es lo que el conjunto de veinte casos establece para el canal. La carpeta casos_repost del material complementario trae la imagen tal como la recibió el modelo y un archivo de resultados con su respuesta verbatim, el veredicto y el identificador de ejecución.</w:t>
+      </w:r>
+    </w:p>
+    <w:p>
+      <w:pPr/>
+      <w:r>
+        <w:rPr>
+          <w:b w:val="0"/>
+          <w:i/>
+        </w:rPr>
+        <w:t>El cuarto caso expuso además un defecto: el módulo bloqueó la pieza, pero el aviso a la usuaria no llegaba. El nodo que lo emite leía el destinatario como si la rama naciera de un mensaje, y nace de un botón, de modo que el envío fallaba. Se corrigió el mismo día. Ni la lectura del código ni la verificación de los patrones lo habrían encontrado, y por eso estos cuatro casos valen más que su tamaño muestral.</w:t>
       </w:r>
     </w:p>
     <w:p>

</xml_diff>

<commit_message>
docs(tesis): N-05, Capitulos 7 y 8 condensados de 4.971 a 3.656 palabras (pasadas 191 y 191b)
Veredictos por objetivo intactos. La hipotesis del 70 % queda completa en 8.1 y
abreviada en 7.7 y en el cierre. Arrastres de la migracion: 7.1 y el cierre de
8.1 ya no dicen que no hay despliegue vigente (E3 desde el 01-10). Cuerpo total:
~26.240 palabras (desde ~36.900).

Co-Authored-By: Claude Opus 5.5 <noreply@anthropic.com>
</commit_message>
<xml_diff>
--- a/avance/Tesis Postly Bontorno Hassan-1 v2.docx
+++ b/avance/Tesis Postly Bontorno Hassan-1 v2.docx
@@ -26877,12 +26877,9 @@
     </w:p>
     <w:p>
       <w:r>
-        <w:t xml:space="preserve">La elección de una Interfaz de Usuario Conversacional (CUI) como punto de entrada único sigue la premisa de McTear et al. (2016): las interfaces en lenguaje natural reducen la carga cognitiva de usuarios sin formación técnica al reemplazar menús y formularios por un diálogo. Postly es consistente con esa premisa en su arquitectura, porque la creación, la auditoría y la publicación ocurren en una sola conversación de Telegram. Este trabajo no midió, sin embargo, la carga cognitiva percibida: la reducción de fricción es una propiedad de diseño verificada funcionalmente y no un resultado. Larsen et al. (2025) estudian, por su título, las expectativas y el uso previsto de la IA conversacional basada en modelos de lenguaje en la atención al cliente; no se accedió a más que eso, y por eso se los menciona como antecedente temático y no se les apoya ninguna afirmación. El antecedente más próximo es Kunstmann et al. (2026), que implementan y evalúan con usuarias un sistema conversacional gobernado por un modelo de lenguaje en una pequeña empresa, y reportan el costo por interacción y la latencia junto con la aceptación. Este trabajo comparte con él la evaluación con usuarias reales de un artefacto que funcionó </w:t>
-      </w:r>
-      <w:r>
-        <w:lastRenderedPageBreak/>
-        <w:t>de extremo a extremo; no reporta, en cambio, un costo por interacción, y el sistema no tiene hoy un despliegue vigente.</w:t>
-      </w:r>
+        <w:t>La interfaz conversacional como punto de entrada único sigue la premisa de McTear et al. (2016): el diálogo reduce la carga cognitiva de usuarios sin formación técnica frente a menús y formularios. Postly es consistente con esa premisa en su arquitectura —la creación, la auditoría y la publicación ocurren en una sola conversación—, pero no midió la carga cognitiva percibida: es una propiedad de diseño y no un resultado. Larsen et al. (2025), de quienes sólo se conoce el título, estudian las expectativas sobre la IA conversacional en la atención al cliente, y se los menciona como antecedente temático. El antecedente más próximo es Kunstmann et al. (2026), que evalúan con usuarias un sistema conversacional gobernado por un modelo de lenguaje en una pequeña empresa y reportan, además de la aceptación, el costo por interacción y la latencia. Este trabajo comparte con él la evaluación con usuarias reales, y no reporta un costo por interacción.</w:t>
+      </w:r>
+      <w:r/>
     </w:p>
     <w:p>
       <w:pPr>
@@ -26899,7 +26896,7 @@
     </w:p>
     <w:p>
       <w:r>
-        <w:t>Anclar el copy al contenido visual real del producto (Visual Grounding) sigue a Ji et al. (2023), que identifican la falta de anclaje factual como una de las causas principales de alucinación en modelos de lenguaje. La única medición es acotada: sobre 8 copys de Postly, un evaluador externo no encontró ninguna afirmación no verificable contra la foto del producto (0/8; Anexo E.14). Es el juicio de una persona sobre ocho casos, y no la tasa que exigiría un protocolo sistemático como el de Ji et al. Huang et al. (2025) confirman que el anclaje factual y la recuperación de información mitigan las alucinaciones sin eliminarlas. La reducción de alucinaciones es, por lo tanto, una propiedad esperable del diseño y no una garantía.</w:t>
+        <w:t>Anclar el copy al contenido visual del producto sigue a Ji et al. (2023), que identifican la falta de anclaje factual como una causa principal de alucinación. La única medición es acotada: un evaluador externo no encontró afirmaciones no verificables contra la foto en 8 copys de Postly (Anexo E.14), el juicio de una persona sobre ocho casos y no una tasa sistemática. Huang et al. (2025) confirman que el anclaje mitiga las alucinaciones sin eliminarlas: es una propiedad esperable del diseño y no una garantía.</w:t>
       </w:r>
     </w:p>
     <w:p>
@@ -26917,7 +26914,7 @@
     </w:p>
     <w:p>
       <w:r>
-        <w:t>El Módulo Centinela es RegTech en el sentido de Arner et al. (2017): tecnología que automatiza el cumplimiento normativo de forma proactiva. Evalúa cada publicación antes de exponerla, lo que en la taxonomía por momento de intervención es moderación proactiva (Wang et al., 2026). Sobre un mismo detector, mover el criterio para ganar sensibilidad arriesga especificidad: es el intercambio a lo largo de una misma curva, que el Anexo B.4 reconoce para Postly. No vale entre detectores distintos. La corrección del §6.1.4 elevó el Recall sobre los valores límite de 0,412 a 0,706 con los falsos positivos constantes en 4 (Tabla 10), porque cambió las reglas y no sólo su umbral. En condiciones representativas el módulo equilibra sensibilidad y especificidad (Recall y Precisión de 0,85), y sobre contenido real no bloqueó ninguna pieza sin referencia monetaria (Precisión 1,00), aunque ese corpus no tiene casos en los que sobre-bloquear (Tabla 5). Sus errores se concentran en el canal textual y son léxicos, lo que orienta la mejora hacia una detección semántica del precio, como la que HU8 aplica sobre imágenes. Warner et al. (2025) agregan una lectura de uso: quien recibe el aviso de un filtro proactivo puede ajustar su redacción a lo que el algoritmo deja pasar, y no a la norma. En Postly ese camino está a la vista, porque un precio escrito en palabras no activa el canal textual.</w:t>
+        <w:t>El Módulo Centinela es RegTech en el sentido de Arner et al. (2017) y, por evaluar cada publicación antes de exponerla, moderación proactiva (Wang et al., 2026). Sobre un mismo detector, ganar sensibilidad arriesga especificidad, pero ese intercambio no vale entre detectores distintos: la corrección del §6.1.4 elevó el Recall sobre los valores límite de 0,412 a 0,706 con los falsos positivos constantes en 4 (Tabla 10), porque cambió las reglas y no su umbral. En condiciones representativas el módulo equilibra sensibilidad y precisión (0,85), y sus errores son léxicos, lo que orienta la mejora hacia una detección semántica del precio como la de HU8. Warner et al. (2025) agregan una lectura de uso: quien recibe el aviso de un filtro proactivo puede ajustar su redacción a lo que el algoritmo deja pasar, y no a la norma. En Postly ese camino está a la vista en el precio escrito en palabras.</w:t>
       </w:r>
     </w:p>
     <w:p>
@@ -26931,12 +26928,12 @@
     </w:p>
     <w:p>
       <w:r>
-        <w:t>De esos 17, dos están clasificados como de canal visual y 15 son piezas mixtas que se publicaron correctamente. No son quince verdaderos negativos del canal visual: la planilla registra un veredicto por pieza y no por canal. Junto con R01, que es también la imagen con precio del caso de carrusel, esos 17 son los casos en que el canal visual operó sobre material aportado por una consultora sin intervención de los autores. En su mayoría es arte oficial de la marca que ellas reciben y reenvían, y no fotografía propia. Los dos que la consultora etiquetó como infractores se publicaron: la etiqueta proviene de un defecto del producto ajeno al compliance y no mueve ninguna métrica del módulo.</w:t>
-      </w:r>
-    </w:p>
-    <w:p>
-      <w:r>
-        <w:t>Los dos cortes del canal visual se leen por separado. Sobre los 20 —construidos para cubrir las formas de incrustación frecuentes, no para llevar al modelo a su límite de legibilidad— no hubo errores. Sobre los nueve difíciles el F1 cae a 0,83: omitió un precio de cuerpo diminuto y bloqueó de más un número aislado sin unidad. La ventaja del canal visual es nítida sobre las formas frecuentes y deja de serlo en el límite, y sus imágenes con precio son composiciones de los autores, salvo la pieza auténtica que el Anexo E.8 incorpora.</w:t>
+        <w:t>De esos 17, dos se clasificaron como de canal visual y 15 son piezas mixtas que se publicaron correctamente, que no son quince verdaderos negativos del canal visual, porque la planilla registra un veredicto por pieza. Con R01 son los casos en que el canal visual operó sobre material aportado por una consultora sin intervención de los autores, en su mayoría arte oficial de la marca que ellas reenvían.</w:t>
+      </w:r>
+    </w:p>
+    <w:p>
+      <w:r>
+        <w:t>Los dos cortes del canal visual se leen por separado: sobre los 20 casos construidos para las formas frecuentes no hubo errores, y sobre los nueve difíciles el F1 cae a 0,83, con un precio de cuerpo diminuto omitido y un número aislado bloqueado de más. La ventaja del canal visual es nítida sobre las formas frecuentes y deja de serlo en el límite.</w:t>
       </w:r>
     </w:p>
     <w:p>
@@ -26954,7 +26951,7 @@
     </w:p>
     <w:p>
       <w:r>
-        <w:t>La normalización multimedia (§4.4) es una decisión de diseño y no una exigencia de la plataforma. Meta admite para un Reel duraciones y relaciones de aspecto más amplias que 1080 × 1920 y 60 s (Meta for Developers, s.f.); Postly fuerza vía FFmpeg un único formato de salida (Anexo B.9) para simplificar el procesamiento. Tiene un costo: el recorte a 60 s descarta contenido, y el recorte espacial a 9:16 puede eliminar una placa de precio pegada a un borde, que es lo que motivó la regla «bloquear o avisar» del §4.3.1 y el §6.1.4. Que el alcance de una publicación dependa de decisiones opacas de la plataforma es un hallazgo consolidado sobre visibilidad algorítmica (Bucher, 2012; Cotter, 2019; Stegeman et al., 2024). Esa literatura no estudia especificaciones de formato y no se invoca para sostenerlas. Este trabajo no midió el efecto de la normalización sobre el alcance orgánico de las publicaciones.</w:t>
+        <w:t>La normalización multimedia (§4.4) es una decisión de diseño y no una exigencia de la plataforma: Meta admite para un Reel duraciones y proporciones más amplias (Meta for Developers, s.f.), y Postly fuerza un único formato para simplificar el procesamiento. El costo es que el recorte a 60 s descarta contenido y el recorte a 9:16 puede eliminar una placa pegada a un borde, lo que motivó la regla «bloquear o avisar» (§4.3.1). La literatura sobre visibilidad algorítmica documenta que el alcance depende de decisiones opacas de la plataforma (Bucher, 2012; Cotter, 2019; Stegeman et al., 2024), pero no estudia especificaciones de formato, y este trabajo no midió el efecto de la normalización sobre el alcance.</w:t>
       </w:r>
     </w:p>
     <w:p>
@@ -26972,12 +26969,9 @@
     </w:p>
     <w:p>
       <w:r>
-        <w:t xml:space="preserve">El §1.6 sostiene que ni las plataformas SMMS (Hootsuite, Buffer) ni las iPaaS genéricas (Zapier, Make) ofrecen compliance programable accesible a una usuaria sin conocimientos técnicos. Postly cubre ese vacío funcionalmente: </w:t>
-      </w:r>
-      <w:r>
-        <w:lastRenderedPageBreak/>
-        <w:t>ninguna de las herramientas evaluadas integra en un mismo flujo un punto de entrada conversacional y una auditoría de compliance obligatoria (Tabla 1). La comparación es un análisis funcional de los autores (§1.6), no una revisión sistemática ni una prueba de usuario comparativa. La Tabla 1 declara su fecha de consulta; lo que le falta al relevamiento es el protocolo.</w:t>
-      </w:r>
+        <w:t>El §1.6 sostiene que ni las plataformas SMMS ni las iPaaS genéricas ofrecen compliance programable accesible a una usuaria sin conocimientos técnicos, y Postly cubre ese vacío funcionalmente: ninguna de las herramientas evaluadas integra un punto de entrada conversacional y una auditoría de compliance obligatoria (Tabla 1). Es un análisis funcional de los autores, con fecha de consulta declarada, y no una revisión sistemática ni una prueba comparativa con usuarias.</w:t>
+      </w:r>
+      <w:r/>
     </w:p>
     <w:p>
       <w:pPr>
@@ -26994,7 +26988,7 @@
     </w:p>
     <w:p>
       <w:r>
-        <w:t>Gran parte de la arquitectura de Postly integra tecnologías maduras (n8n, Gemini, OAuth 2.0, Google Sheets) según patrones de integración estándar (Hohpe y Woolf, 2003; Erl, 2005). Su aporte de ingeniería propio es doble: el candado de anti-duplicación basado en que Telegram rechaza una edición sin cambios (Anexo B.6) y la resolución de la condición de carrera en la ingesta de carruseles mediante un archivo compartido (Anexo B.5). Ambas son soluciones específicas a problemas de concurrencia en arquitecturas orquestadas por webhooks. Ninguna es una garantía demostrada: la primera descansa en un comportamiento de Telegram que su documentación no presenta como garantía de concurrencia, y se probó con una pulsación doble por flujo; la segunda, en que las ejecuciones comparten un proceso. Su originalidad, sin embargo, es de implementación y no de concepto: la deduplicación por identificador de callback es el patrón Idempotent Receiver y el armado del grupo de fotos por identificador de correlación es un Aggregator, y los dos están descritos en Hohpe y Woolf (2003). El aporte es haberlos resuelto con los medios que un motor de orquestación sin estado compartido ofrece, y no haberlos concebido.</w:t>
+        <w:t>La arquitectura integra tecnologías maduras según patrones estándar (Hohpe y Woolf, 2003; Erl, 2005). Su aporte de ingeniería propio es doble: el candado anti-duplicación que se apoya en que Telegram rechaza una edición sin cambios (Anexo B.6) y la resolución de la condición de carrera en la ingesta de carruseles mediante un archivo compartido (Anexo B.5). Ninguno es una garantía demostrada: el primero descansa en un comportamiento que la documentación de Telegram no garantiza, y se probó con una pulsación doble por flujo; el segundo, en que las ejecuciones comparten un proceso. Su originalidad es de implementación y no de concepto: son el Idempotent Receiver y el Aggregator de Hohpe y Woolf (2003), resueltos con los medios de un motor de orquestación sin estado compartido.</w:t>
       </w:r>
     </w:p>
     <w:p>
@@ -27012,21 +27006,18 @@
     </w:p>
     <w:p>
       <w:r>
-        <w:t xml:space="preserve">Además de las limitaciones de alcance del §1.5.2, la evidencia tiene tres, y el resultado principal, una salvedad. La muestra —29 casos de compliance, 32 pares cronometrados y ocho respuestas TAM— combina un piloto con una ampliación, y ninguno de los dos habilita una generalización estadística a la población objetivo. La aceptación fue alta (4,43/5) y el instrumento ya invierte un ítem por constructo, pero con n = 8 sus correlaciones no alcanzan para descartar la aquiescencia (§6.1.7). El orden de las condiciones se contrabalanceó y no se detectó efecto de orden ni de aprendizaje, aunque ninguno de los dos contrastes tiene potencia para ser concluyente. En cuanto al resultado, la reducción medida es del 76,7 % (IC 95 % [73,5 %; 79,9 %]; t(7) = 4,90; §6.1.6), pero es una cota superior: toma el tiempo de Postly del historial de ejecuciones, que no incluye lo que la usuaria tarda en enviar la foto. Con esa omisión estimada en 17 s, su mediana observada, la reducción es del 73,6 % y el contraste es significativo (p = 0,028); con 28 s, su media, es del 71,4 % y no se distingue del umbral (p = 0,224). La hipótesis del 70 % (§3.5.4) es </w:t>
-      </w:r>
-      <w:r>
-        <w:lastRenderedPageBreak/>
-        <w:t>compatible con los datos y no queda confirmada de forma concluyente. A eso se suma una salvedad de alcance: n = 8 es una muestra intencional, y generalizar exigiría una muestra mayor y probabilística.</w:t>
-      </w:r>
-    </w:p>
-    <w:p>
-      <w:r>
-        <w:t>El canal visual tiene además un límite de alcance. Sus conjuntos se construyeron sobre imagen fija, de modo que miden el flujo de imagen única. Los otros tres no llevaban ese criterio durante la evaluación, y la unificación del 19 de septiembre de 2026 es posterior a las matrices (§6.1.4). Desde entonces los cuatro nodos del canal textual comparten las seis expresiones, y los cuatro del visual, el mismo criterio; no son los mismos cuatro (§4.3.1; Anexo E.4). Esa identidad literal no cubre lo mismo en los dos canales. En el textual cubre todas las ejecuciones, porque las expresiones son deterministas. En el visual no cubre ninguna: el criterio lo lee un modelo probabilístico dentro de prompts distintos, y la identidad del texto no predice el comportamiento. Por eso hicieron falta los cuatro casos de extremo a extremo del §6.1.4.</w:t>
-      </w:r>
-    </w:p>
-    <w:p>
-      <w:r>
-        <w:t>En el video, esos casos separan dos situaciones que parecen la misma. El recorte vertical de HU13 (§4.4.3) puede dejar fuera una placa pegada a un borde: bloquear ahí sería un falso positivo sobre lo que se publica, y callarlo modificaría en silencio el contenido de la usuaria. De ahí la respuesta doble —bloquear si el precio sobrevive al recorte, avisar si lo elimina—, que cuesta una sola llamada porque el modelo admite varias imágenes por petición. Queda una salvedad de muestreo: la detección observa tres instantes del clip —al 10 %, 50 % y 90 % de su duración—, y una placa que apareciera sólo entre dos de ellos podría no verse.</w:t>
+        <w:t>Además de las limitaciones de alcance del §1.5.2, la evidencia tiene tres. La muestra —29 casos de compliance, 32 pares cronometrados y ocho respuestas TAM— es intencional y no habilita una generalización estadística. Con n = 8, las correlaciones del cuestionario no alcanzan para descartar la aquiescencia (§6.1.7), y los contrastes de orden y aprendizaje no tienen potencia. Y la reducción del 76,7 % es una cota superior: con el tiempo omitido estimado queda entre el 73,6 % y el 71,4 %, de modo que la hipótesis del 70 % es compatible con los datos y no queda confirmada (§6.1.6; §8.1).</w:t>
+      </w:r>
+      <w:r/>
+    </w:p>
+    <w:p>
+      <w:r>
+        <w:t>El canal visual tiene además un límite de alcance: sus conjuntos son de imagen fija y miden el flujo de imagen única, y la unificación del criterio en los otros tres flujos es posterior a las matrices (§6.1.4; Tabla 16). La identidad literal del criterio, que comprueba la verificación del Anexo E.4, no cubre lo mismo en los dos canales. En el textual cubre todas las ejecuciones, porque las expresiones son deterministas; en el visual, ninguna, porque un modelo probabilístico lee el criterio dentro de prompts distintos. Por eso hicieron falta los cuatro casos de extremo a extremo del §6.1.4.</w:t>
+      </w:r>
+    </w:p>
+    <w:p>
+      <w:r>
+        <w:t>En el video, esos casos separan dos situaciones que parecen la misma: una placa que el recorte vertical deja fuera no se publica, y bloquearla sería un falso positivo, pero callarlo modificaría en silencio el contenido. De ahí la respuesta doble, bloquear si el precio sobrevive al recorte y avisar si lo elimina. Queda una salvedad de muestreo: la detección observa tres instantes del clip (10 %, 50 % y 90 %), y una placa que apareciera sólo entre dos podría no verse.</w:t>
       </w:r>
     </w:p>
     <w:p>
@@ -27123,7 +27114,7 @@
         <w:spacing w:after="240" w:line="276" w:lineRule="auto"/>
       </w:pPr>
       <w:r>
-        <w:t>La respuesta a la pregunta rectora (§1.2) es afirmativa en parte. Es técnica y operativamente viable una arquitectura low-code con Inteligencia Artificial Multimodal que simplifica la creación de contenido y propone textos que un evaluador externo prefirió a la redacción manual. La verificación autónoma del cumplimiento alcanza, en cambio, a una parte de las pautas de la marca: la referencia monetaria en el canal público, que el módulo detecta, y la firma, que el sistema agrega. No alcanza a la solicitud de compra sin cifra —el módulo detiene doce de los veinticinco mensajes comerciales del corpus (§6.1.3)— ni a las materias que el módulo no audita, y el propio sistema modifica material de la marca al recortar el video y rellenar la imagen. Lo que sigue precisa, objetivo por objetivo, qué queda cubierto y qué no.</w:t>
+        <w:t>La respuesta a la pregunta rectora (§1.2) es afirmativa en parte. Es técnica y operativamente viable una arquitectura low-code con Inteligencia Artificial Multimodal que simplifica la creación de contenido y propone textos que un evaluador externo prefirió a la redacción manual. La verificación autónoma del cumplimiento alcanza, en cambio, a una parte de las pautas: la referencia monetaria en el canal público, que el módulo detecta, y la firma, que el sistema agrega. No alcanza a la solicitud de compra sin cifra —el módulo detiene doce de los veinticinco mensajes comerciales del corpus (§6.1.3)— ni a las materias que no audita, y el propio sistema modifica material de la marca al recortar el video y rellenar la imagen.</w:t>
       </w:r>
     </w:p>
     <w:p>
@@ -27151,7 +27142,7 @@
         <w:t>Sobre el Objetivo Específico 1 (Interfaz Conversacional orientada a la accesibilidad):</w:t>
       </w:r>
       <w:r>
-        <w:t xml:space="preserve"> el objetivo se cumplió con el bot de Telegram. Los webhooks y los teclados dinámicos abstrajeron la complejidad de n8n: las ocho consultoras publicaron sin instrucción ni demostración previa del bot y sin conocer la orquestación subyacente (Anexo E.2). Tres lo habían usado en el piloto, y todas publicaron en la cuenta de prueba del equipo, de modo que no recorrieron la vinculación por OAuth. La autorización en Meta, que es el tramo más exigente del recorrido para una usuaria sin perfil técnico, quedó por eso ejecutada sólo por los autores, en E1 y en E3 (Anexo B.1), y no evaluada con usuarias. La reducción de la carga cognitiva orientó el diseño, pero no se midió con un instrumento dedicado (Capítulo 7).</w:t>
+        <w:t xml:space="preserve"> el objetivo se cumplió con el bot de Telegram: las ocho consultoras publicaron sin instrucción ni demostración previa y sin conocer la orquestación subyacente (Anexo E.2). Todas publicaron en la cuenta de prueba del equipo, de modo que la autorización en Meta, el tramo más exigente para una usuaria sin perfil técnico, la ejecutaron sólo los autores, en E1 y en E3 (Anexo B.1), y no se evaluó con usuarias. La reducción de la carga cognitiva orientó el diseño, pero no se midió (Capítulo 7).</w:t>
       </w:r>
     </w:p>
     <w:p>
@@ -27179,7 +27170,7 @@
         <w:rPr>
           <w:bCs/>
         </w:rPr>
-        <w:t xml:space="preserve"> el objetivo se cumplió en la integración, y sus otras tres capacidades tienen una primera evaluación. Gemini 2.5 Flash está integrado y operativo, el §6.1 mide la auditoría visual de precios y el Anexo E.14 mide lo demás, con dos evaluadores externos al proyecto. En calidad del copy, Postly fue preferido frente a un generador genérico en los 8 productos del Estudio 1, y frente al trabajo manual real de las ocho participantes en 26 de los 32 pares del Estudio 4. Ninguno de sus 8 copys del Estudio 1 llevó una afirmación no verificable contra la foto. En correspondencia con el tono pedido, el Estudio 2 acertó 22 de 24 asignaciones (91,7 %), por encima del umbral del 60 % declarado de antemano. En el orden del carrusel, fue preferido frente al orden manual en 6 de 7 carruseles de dos imágenes del Estudio 4 y frente al orden de envío original en 6 de 8 conjuntos del Estudio 3, sin significancia estadística (binomial exacta bilateral: p = 0,125 y p = 0,289). Con un único evaluador por estudio, los intervalos de Wilson que el Anexo E.14 reporta describen la variación entre los ítems juzgados, no entre evaluadores. La «fatiga de decisión» es motivación de diseño y no un efecto medido (§2.2).</w:t>
+        <w:t xml:space="preserve"> el objetivo se cumplió en la integración, y sus otras tres capacidades tienen una primera evaluación con dos evaluadores externos (Anexo E.14). En calidad del copy, Postly fue preferido frente a un generador genérico en los 8 productos del Estudio 1, sin afirmaciones no verificables contra la foto, y frente al trabajo manual de las ocho participantes en 26 de 32 pares del Estudio 4. El tono pedido se reconoció en 22 de 24 asignaciones (91,7 %), por encima del umbral del 60 % declarado de antemano. El orden del carrusel fue preferido en 6 de 7 carruseles de dos imágenes frente al manual y en 6 de 8 conjuntos frente al de envío, sin significancia estadística (binomial exacta bilateral: p = 0,125 y p = 0,289). Con un único evaluador por estudio, los intervalos describen la variación entre ítems y no entre evaluadores.</w:t>
       </w:r>
     </w:p>
     <w:p>
@@ -27209,7 +27200,7 @@
           <w:i/>
           <w:iCs/>
         </w:rPr>
-        <w:t xml:space="preserve"> el objetivo, diferencial del sistema, se cumplió con alcance acotado. La cascada de expresiones regulares y la lectura de la imagen por el modelo multimodal bloquean la referencia monetaria, y el sistema fuerza la firma de identidad corporativa. Postly es así una herramienta RegTech que reduce la exposición de la consultora a incumplir la regla de mensaje comercial de la marca. No es una exposición contractual: las Pautas son instrumentales al Acuerdo (Mary Kay Inc., s.f., p. 1), pero para el mensaje comercial en canal público no fijan ninguna consecuencia </w:t>
+        <w:t xml:space="preserve"> el objetivo, diferencial del sistema, se cumplió con alcance acotado. La cascada de expresiones regulares y la lectura visual bloquean la referencia monetaria, y el sistema fuerza la firma corporativa: Postly reduce la exposición de la consultora a incumplir la regla de mensaje comercial, que las Pautas no asocian a ninguna consecuencia contractual (§3.7.4; Anexo D). Contra la regla completa no es efectivo: no detecta la solicitud de compra sin cifra, que el generador produjo en cada copy hasta el 19 de septiembre de 2026 (§6.1.3; Anexo E.12), y su cobertura sobre el corpus de campo es de doce sobre veinticinco. Tampoco calza exactamente con la fuente en las dos redes: en Facebook bloquea lo que la página de negocios admite, y en Instagram opera sobre una cuenta que las Pautas no contemplan como página de negocios (Anexo D).</w:t>
       </w:r>
       <w:r>
         <w:rPr>
@@ -27217,7 +27208,6 @@
           <w:i/>
           <w:iCs/>
         </w:rPr>
-        <w:t>(§3.7.4, Anexo D). Contra la regla completa el módulo no es efectivo: ésta alcanza también a la solicitud de compra sin cifra, que no detecta y que el generador produjo en cada copy hasta la corrección del 19 de septiembre de 2026 (§6.1.3; Anexo E.12). El OE3 se cumple, entonces, sobre el objeto que el módulo declara auditar, y no sobre la regla completa. Tampoco calza exactamente con la fuente en las dos redes: en Facebook bloquea lo que la página de negocios admite, y en Instagram opera sobre una cuenta que las Pautas no contemplan como página de negocios (Anexo D). El análisis de valores límite del §6.1 delimitó el alcance de la cascada léxica, motivó sus correcciones y fundamenta la recomendación del §8.2.</w:t>
       </w:r>
     </w:p>
     <w:p>
@@ -27266,7 +27256,7 @@
         <w:t>Sobre el Objetivo Específico 5 (Enrutamiento Seguro OAuth 2.0):</w:t>
       </w:r>
       <w:r>
-        <w:t xml:space="preserve"> el diseño de seguridad se ajusta a la práctica estándar de delegación de autorización. OAuth 2.0 (Hardt, 2012) aisló las credenciales de la usuaria del alcance de los desarrolladores, y el intercambio por un token de larga duración habilita la operación desatendida. El §6.1 precisó su alcance: la Graph API devuelve el token de página sin campo de expiración, y lo medido es la ausencia de ese campo y no la longevidad del token. Su validez sigue atada a la del token de usuaria del que deriva y a que la usuaria no revoque el permiso. El refresco programado a 60 días que el diseño contemplaba no se implementó —el Anexo B.2 no incluye ningún workflow que renueve tokens—, y tampoco habría servido, porque un token revocado no se refresca. Lo que sostiene la operación desatendida es que el token de página no declara vencimiento.</w:t>
+        <w:t xml:space="preserve"> el diseño se ajusta a la práctica estándar de delegación de autorización: OAuth 2.0 (Hardt, 2012) aisló las credenciales de la usuaria del alcance de los desarrolladores, y el token de larga duración habilita la operación desatendida. La Graph API devuelve el token de página sin campo de expiración, de modo que lo medido es la ausencia de ese campo y no la longevidad del token, cuya validez sigue atada a la del token de usuaria y a que la usuaria no revoque el permiso. El refresco programado a 60 días no se implementó, y tampoco serviría ante un token revocado.</w:t>
       </w:r>
     </w:p>
     <w:p>
@@ -27283,19 +27273,16 @@
         <w:t>Sobre la hipótesis central del proyecto:</w:t>
       </w:r>
       <w:r>
-        <w:t xml:space="preserve"> el §3.5.4 planteó que el sistema reduce el tiempo operativo de publicación en más de un 70 % respecto del proceso manual. El diseño no aísla la interfaz conversacional: la reducción es la del sistema completo. En la ampliación de ocho consultoras, el cronometraje intra-sujeto de 32 pares arrojó una reducción media del 76,7 % sobre el tramo comparable (IC 95 % [73,5 %; 79,9 %]; t(7) = 4,90 frente al 70 %). Es una cota </w:t>
-      </w:r>
-      <w:r>
-        <w:lastRenderedPageBreak/>
-        <w:t>superior, porque el tiempo de Postly, conciliado con el historial de ejecuciones, no incluye lo que la usuaria tarda en enviar la foto (§6.1.6). Con esa omisión estimada en 17 s, su mediana observada, la reducción es del 73,6 % y el contraste es significativo (p = 0,028); con 28 s, su media, es del 71,4 % y no se distingue del umbral (p = 0,224). La hipótesis es compatible con los datos, pero no queda confirmada de forma concluyente. Generalizarla, además, excede el diseño por el tamaño y el carácter intencional de la muestra (§3.5.1). La aceptación medida con el cuestionario TAM fue alta (4,43/5).</w:t>
-      </w:r>
+        <w:t xml:space="preserve"> el §3.5.4 planteó que el sistema completo reduce el tiempo operativo de publicación en más de un 70 % respecto del proceso manual. El cronometraje intra-sujeto de 32 pares arrojó una reducción media del 76,7 % sobre el tramo comparable (IC 95 % [73,5 %; 79,9 %]; t(7) = 4,90 frente al 70 %). Es una cota superior, porque el tiempo de Postly no incluye lo que la usuaria tarda en enviar la foto (§6.1.6). Con esa omisión estimada en su mediana, 17 s, la reducción es del 73,6 % y significativa (p = 0,028); con su media, 28 s, es del 71,4 % y no se distingue del umbral (p = 0,224). La hipótesis es compatible con los datos, pero no queda confirmada de forma concluyente, y generalizarla excede una muestra intencional de ocho. La aceptación medida con el cuestionario TAM fue alta (4,43/5).</w:t>
+      </w:r>
+      <w:r/>
     </w:p>
     <w:p>
       <w:pPr>
         <w:spacing w:after="240" w:line="276" w:lineRule="auto"/>
       </w:pPr>
       <w:r>
-        <w:t>En suma, Postly reduce de forma sustantiva el tramo operativo de la publicación. La reducción medida, del 76,7 %, es una cota superior de la real: con el tiempo omitido estimado queda entre el 71 % y el 74 %, en torno al umbral del 70 % fijado como hipótesis en el §3.5.4. Ese tramo no es toda la ineficiencia que motivó el trabajo, porque la curación previa del contenido no se automatizó ni se midió. Postly es además una salvaguarda parcial. Sobre las 29 piezas reales detectó la referencia monetaria sin un error, con la etiqueta de los autores (panel A), y contra la noción de «publicable» de los etiquetadores su F1 es de 0,923 (Tabla 5). La regla de la norma alcanza también a la solicitud de compra sin cifra, de modo que el sistema reduce la exposición de la consultora sin eliminarla. La arquitectura se validó funcionalmente sobre el entorno E1, hoy dado de baja: deja un sistema completo que puede volver a desplegarse, pero no un despliegue vigente. Transferirla a otras marcas de venta directa exigiría rederivar sus reglas de compliance. Llevar la evaluación a una muestra mayor y probabilística queda como línea de trabajo siguiente.</w:t>
+        <w:t>En suma, Postly reduce de forma sustantiva el tramo operativo de la publicación: entre un 71 % y un 74 % con el tiempo omitido estimado, en torno al umbral del 70 %, aunque la curación previa del contenido no se automatizó ni se midió. Es además una salvaguarda parcial. Sobre las 29 piezas reales detectó la referencia monetaria sin errores con la etiqueta de los autores (panel A), y su F1 es de 0,923 contra la noción de «publicable» de los etiquetadores (Tabla 5). La solicitud de compra sin cifra queda fuera de su alcance, de modo que reduce la exposición de la consultora sin eliminarla. La arquitectura se validó sobre E1 y corre desde octubre de 2026 sobre E3 (Anexo B.1). Transferirla a otras marcas exigiría rederivar sus reglas de compliance, y llevar la evaluación a una muestra mayor y probabilística es la línea de trabajo siguiente.</w:t>
       </w:r>
     </w:p>
     <w:p>
@@ -27340,7 +27327,7 @@
         <w:t>Consolidación de la Validación Empírica (Alta Prioridad, parcialmente aplicada):</w:t>
       </w:r>
       <w:r>
-        <w:t xml:space="preserve"> con las catorce Historias de Usuario recorridas de extremo a extremo (Tabla 9), la validación de campo pasó de un piloto de tres consultoras a una ampliación de ocho, con el orden de las condiciones contrabalanceado (§6.1; Anexo E.2). Con ocho participantes, el intervalo de confianza de la reducción es de ± 3,2 puntos porcentuales. El acceso del equipo a consultoras fuera de su círculo se agotó en esas ocho. Queda como línea siguiente una muestra probabilística que permita generalizar a la población objetivo.</w:t>
+        <w:t xml:space="preserve"> la validación de campo pasó de un piloto de tres consultoras a una ampliación de ocho, con el orden de las condiciones contrabalanceado (§6.1; Anexo E.2), y el intervalo de confianza de la reducción es de ± 3,2 puntos. Queda como línea siguiente una muestra probabilística que permita generalizar a la población objetivo.</w:t>
       </w:r>
     </w:p>
     <w:p>
@@ -27349,12 +27336,9 @@
         <w:spacing w:after="240" w:line="276" w:lineRule="auto"/>
       </w:pPr>
       <w:r>
-        <w:t xml:space="preserve">En el plano funcional quedan dos pendientes. Uno es la normalización de la relación de aspecto de las imágenes del carrusel, que el §4.4.2 describe y el flujo desplegado no implementa. El otro es la latencia de la regeneración de copys: la Tabla 13 la mide en 31,2 s de media contra los 15 s que fija la HU12, con el tramo dominante en la inferencia del </w:t>
-      </w:r>
-      <w:r>
-        <w:lastRenderedPageBreak/>
-        <w:t>modelo (Anexo E.5). Acortarla exige un modelo más rápido o un acuse intermedio que sostenga la ventana de tolerancia de Telegram. En el plano de la medición, conviene ampliar los casos del canal visual en los tres flujos que hoy tienen uno o dos (Anexos E.9 a E.11), que demuestran cobertura y no exactitud.</w:t>
-      </w:r>
+        <w:t>En el plano funcional quedan dos pendientes: normalizar la relación de aspecto de las imágenes del carrusel (§4.4.2) y acortar la regeneración de copys, que tarda 31,2 s contra los 15 s de HU12, con un modelo más rápido o un acuse intermedio (Tabla 13). En el plano de la medición, conviene ampliar los casos del canal visual en los tres flujos que hoy tienen uno o dos (Anexos E.9 a E.11).</w:t>
+      </w:r>
+      <w:r/>
     </w:p>
     <w:p>
       <w:pPr>
@@ -27372,7 +27356,7 @@
         <w:t>Sustitución del canal textual del Módulo Centinela por un clasificador semántico (Alta Prioridad):</w:t>
       </w:r>
       <w:r>
-        <w:t xml:space="preserve"> el análisis de valores límite del §6.1 delimitó el alcance del enfoque léxico. Cuatro defectos se corrigieron sobre las propias expresiones regulares y cinco quedan pendientes, pero sólo uno es inherente al método: términos como «rebaja» o «económica» son polisémicos y ninguna regla léxica los distingue por la forma. El precio expresado en palabras, que no tiene dígito para las reglas actuales, sí puede cubrirse enumerando los numerales del español junto a una palabra de moneda, a costa de nuevos falsos positivos; y cada regla agregada suma deuda a una cascada que ya tiene seis. Se recomienda reemplazar la cascada por un clasificador semántico: el mismo modelo multimodal que ya audita las imágenes en HU8, aplicado también al texto. Falcão y Canedo (2026) dan un antecedente sobre otro objeto: comparan la integración de modelos fundacionales con la detección por reglas para encontrar datos personales dentro de una tubería de software. Es el mismo problema de forma, un detector que corre sobre cada artefacto antes de que salga. El conjunto de imagen permite calibrar la recomendación. Sobre los 20 casos del conjunto ampliado no hubo errores (Tabla 12), y sobre los nueve difíciles del Anexo E.8 hubo un falso negativo y un falso positivo. Se leen por separado: el F1 es 1,00 sobre los primeros y 0,83 sobre los segundos, y el 0,94 agregado depende de una proporción que eligieron los autores. El detector léxico falla en dos clases: el precio que no adopta la forma esperada y el número que no es un precio. En imagen, el modelo acertó el único caso de monto escrito en palabras del conjunto difícil y dos de los tres casos limpios con forma de número. Son un caso y tres: indican que el modelo maneja esas clases, y no lo miden.</w:t>
+        <w:t xml:space="preserve"> el análisis de valores límite delimitó el alcance del enfoque léxico. De sus defectos, sólo la polisemia de términos como «rebaja» o «económica» es inherente al método; el precio en palabras puede cubrirse enumerando numerales, a costa de nuevos falsos positivos y de más deuda en una cascada que ya tiene seis reglas. Se recomienda reemplazarla por un clasificador semántico, el mismo modelo multimodal que ya audita las imágenes en HU8. Falcão y Canedo (2026) dan un antecedente sobre otro objeto, la detección de datos personales en una tubería de software, con el mismo problema de forma: un detector que corre sobre cada artefacto antes de que salga. El canal de imagen calibra la recomendación, con un F1 de 1,00 sobre los 20 casos del conjunto ampliado (Tabla 12) y de 0,83 sobre los nueve difíciles; el 0,94 agregado depende de una proporción elegida por los autores. En las dos clases en que falla el detector léxico —el precio sin la forma esperada y el número que no es precio— el modelo acertó un caso y dos de tres: indican que las maneja, no lo miden.</w:t>
       </w:r>
     </w:p>
     <w:p>
@@ -27381,7 +27365,7 @@
         <w:spacing w:after="240" w:line="276" w:lineRule="auto"/>
       </w:pPr>
       <w:r>
-        <w:t>Esa medición tiene un respaldo delimitado. Se tomó sobre imágenes y no sobre texto: transferirla al canal textual es una inferencia, que se contrasta evaluando el clasificador sobre los mismos conjuntos de texto del detector actual. Las imágenes con precio son además composiciones de los autores sobre material gráfico oficial de la marca, salvo el caso real R01 (Anexos E.6 y E.8). Y un clasificador probabilístico pierde el determinismo que hoy hace auditable y explicable cada bloqueo ante la usuaria, por lo que conviene una cascada que conserve las reglas como primera barrera y agregue el clasificador como segunda.</w:t>
+        <w:t>Esa medición se tomó sobre imágenes, y transferirla al texto es una inferencia que se contrasta evaluando el clasificador sobre los mismos conjuntos de texto. Además, un clasificador probabilístico pierde el determinismo que hoy hace explicable cada bloqueo, por lo que conviene una cascada que conserve las reglas como primera barrera y agregue el clasificador como segunda.</w:t>
       </w:r>
     </w:p>
     <w:p>
@@ -27400,11 +27384,9 @@
         <w:t>Gobernar el llamado a la acción que genera el sistema (Prioridad Alta, aplicada):</w:t>
       </w:r>
       <w:r>
-        <w:t xml:space="preserve"> hasta el 19 de septiembre de 2026 los cuatro prompts </w:t>
-      </w:r>
-      <w:r>
-        <w:t>de generación exigían cerrar los tres copys con una invitación a contactar a la consultora. Según la letra de la fuente, esa invitación convierte un mensaje informativo en comercial (§6.1.3; Anexo D). Se aplicó la salida estricta: la regla se invirtió en los cuatro prompts y ahora prohíbe la invitación en los tres tonos (Anexo E.12). La otra queda como trabajo futuro: conservar el llamado a la acción en la ruta de Facebook, que la fuente autoriza en la página de negocios (Anexo D, p. 1), y retirarlo de la de Instagram. Exige generar dos textos por publicación y medir cada ruta por separado, porque el sistema publica hoy el mismo copy en las dos redes. Queda pendiente, además, que el módulo detecte la solicitud de compra sin cifra cuando la escribe la usuaria al editar el copy. Y queda la línea de contacto que el sistema agrega a cada publicación (§4.3.2). Conviene hacerla opcional por publicación —ya se guarda por usuaria (§7.7)— y preguntar a la Compañía si un dato de contacto al pie de un mensaje informativo lo vuelve comercial.</w:t>
-      </w:r>
+        <w:t xml:space="preserve"> hasta el 19 de septiembre de 2026 los cuatro prompts exigían cerrar los copys con una invitación a contactar, que según la fuente convierte un mensaje informativo en comercial (§6.1.3; Anexo D). Se invirtió la regla en los cuatro prompts (Anexo E.12). Quedan tres pendientes. El primero es conservar el llamado a la acción sólo en la ruta de Facebook, que la fuente autoriza en la página de negocios (Anexo D, p. 1), lo que exige generar dos textos por publicación. El segundo, detectar la solicitud de compra sin cifra cuando la escribe la usuaria al editar. El tercero, hacer opcional la línea de contacto —ya se guarda por usuaria (§7.7)— y preguntar a la Compañía si un contacto al pie de un mensaje informativo lo vuelve comercial.</w:t>
+      </w:r>
+      <w:r/>
     </w:p>
     <w:p>
       <w:pPr>
@@ -27435,7 +27417,7 @@
         <w:t>Expansión del Ecosistema de Salida (Prioridad Media):</w:t>
       </w:r>
       <w:r>
-        <w:t xml:space="preserve"> consolidado el flujo de Meta (Instagram y Facebook, con imagen, carrusel y video en ambas), se recomienda extender la integración a TikTok. No se reduce a agregar nodos: TikTok tiene otro modelo de autorización y otro circuito de revisión de contenido, y sus reglas obligarían a rederivar el criterio de compliance. La generación de copy es independiente de la red de destino, de modo que la extensión recae sobre la capa de integración. Pero la arquitectura es un workflow único y no un conjunto de servicios desacoplados (§5.1): esa capa se extiende, no se enchufa.</w:t>
+        <w:t xml:space="preserve"> consolidado Meta, se recomienda extender la integración a TikTok, que no se reduce a agregar nodos: tiene otro modelo de autorización y otro circuito de revisión de contenido, y obligaría a rederivar el criterio de compliance. La generación de copy no depende de la red, de modo que la extensión recae sobre la capa de integración, que en un workflow único se extiende y no se enchufa (§5.1).</w:t>
       </w:r>
     </w:p>
     <w:p>
@@ -27493,7 +27475,7 @@
         <w:t>Política de retención del historial de ejecuciones (Prioridad Media, aplicada):</w:t>
       </w:r>
       <w:r>
-        <w:t xml:space="preserve"> el historial que el motor n8n conserva guarda los updates completos de Telegram, con el nombre, el apellido y el identificador de quien escribe, (§3.7.1). E3 lo purga a los catorce días con el borrado por antigüedad que el propio motor ofrece. Queda reducir lo que guarda durante ese plazo al subconjunto que el flujo necesita, que es la distancia que sigue habiendo entre el principio de minimización y lo que el despliegue almacena.</w:t>
+        <w:t xml:space="preserve"> el historial del motor guarda los updates completos de Telegram, con el nombre, el apellido y el identificador de quien escribe (§3.7.1). E3 lo purga a los catorce días; queda reducir lo que guarda durante ese plazo al subconjunto que el flujo necesita.</w:t>
       </w:r>
       <w:r/>
     </w:p>
@@ -27516,7 +27498,7 @@
         <w:rPr>
           <w:bCs/>
         </w:rPr>
-        <w:t xml:space="preserve"> el §8.1 declara no implementada la capa que convertiría las métricas de interacción en recomendaciones de publicación, que el §1.5.1 enuncia como propósito de diseño. Conviene construirla cuando el volumen de publicaciones por usuaria dé una base sobre la que ajustarla. En la misma línea, se recomienda extender la capa multimodal a un control de calidad del activo. Los dos falsos negativos del estudio de campo eran defectos del producto visibles en la foto —tinta corrida y tapa rota— que los etiquetadores consideraron motivo para no publicar. El mismo modelo de visión que ya audita los precios es apto para esa tarea.</w:t>
+        <w:t xml:space="preserve"> el §8.1 declara no implementada la capa que convertiría las métricas en recomendaciones de publicación, que conviene construir cuando el volumen por usuaria dé una base sobre la que ajustarla. Se recomienda además extender la capa multimodal a un control de calidad del activo: los dos falsos negativos del estudio de campo eran defectos del producto visibles en la foto, y el mismo modelo de visión es apto para detectarlos.</w:t>
       </w:r>
     </w:p>
     <w:p>

</xml_diff>

<commit_message>
docs(tesis): N-05 cerrado, cuerpo en 24.813 palabras y Resumen en 234 (pasadas 192 a 192c)
Segunda vuelta sobre los parrafos mas largos: el OE2 y el cierre del 8.1 ya no
repiten el 6.1.8 y el OE3; la nota de la Tabla 1 y la de la Figura 5, mas cortas.
Resumen de 296 a 234 palabras, con la reserva sobre quien etiqueto el corpus.
Cuerpo (Resumen a Cap. 8): de ~36.900 a 24.813. Ninguna oracion > 50 palabras;
media 24,5. Verificadores en verde.

Co-Authored-By: Claude Opus 5.5 <noreply@anthropic.com>
</commit_message>
<xml_diff>
--- a/avance/Tesis Postly Bontorno Hassan-1 v2.docx
+++ b/avance/Tesis Postly Bontorno Hassan-1 v2.docx
@@ -12091,7 +12091,7 @@
         <w:spacing w:before="240" w:after="240" w:line="240" w:lineRule="auto"/>
       </w:pPr>
       <w:r>
-        <w:t>Las Consultoras de Belleza Independientes publican en redes sociales bajo dos presiones: el tiempo que insume cada publicación y las pautas de la marca, que restringen el mensaje comercial en canales públicos. Este trabajo presenta Postly, un sistema que atiende ambas.</w:t>
+        <w:t>Las Consultoras de Belleza Independientes publican en redes sociales bajo dos presiones: el tiempo que insume cada publicación y las pautas de la marca, que restringen el mensaje comercial en canales públicos. Postly atiende ambas.</w:t>
       </w:r>
     </w:p>
     <w:p>
@@ -12099,7 +12099,7 @@
         <w:spacing w:before="240" w:after="240" w:line="240" w:lineRule="auto"/>
       </w:pPr>
       <w:r>
-        <w:t>Construido bajo Design Science Research hasta un Producto Mínimo Viable, orquesta en n8n un bot de Telegram, el modelo multimodal Gemini 2.5 Flash y la API Graph de Meta, con persistencia en Google Sheets. Su componente diferencial es un Módulo Centinela que audita cada publicación antes de emitirla, con un canal textual determinista y uno visual delegado al modelo. Se validó de extremo a extremo sobre un primer servidor propio, las mediciones corrieron sobre una instancia local y el sistema corre hoy sobre un segundo servidor.</w:t>
+        <w:t>Construido bajo Design Science Research hasta un Producto Mínimo Viable, orquesta en n8n un bot de Telegram, el modelo multimodal Gemini 2.5 Flash y la API Graph de Meta. Su componente diferencial es un Módulo Centinela que audita cada publicación antes de emitirla, con un canal textual determinista y uno visual delegado al modelo.</w:t>
       </w:r>
       <w:r/>
     </w:p>
@@ -12108,7 +12108,7 @@
         <w:spacing w:before="240" w:after="240" w:line="240" w:lineRule="auto"/>
       </w:pPr>
       <w:r>
-        <w:t>Las catorce Historias de Usuario se implementaron, con tres umbrales sin verificar y uno incumplido. En un experimento intra-sujeto con ocho consultoras (32 publicaciones), el tiempo se redujo un 76,7 % (IC 95 % [73,5 %; 79,9 %]). Es una cota superior, porque no incluye lo que la usuaria tarda en enviar la foto: con esa omisión estimada en 17 a 28 s, la reducción es de 73,6 a 71,4 % y la hipótesis del 70 % queda compatible con los datos, no confirmada. El Módulo Centinela alcanzó un F1 de 0,85 sobre 40 casos controlados y de 0,923 sobre 29 piezas reales, con reservas: su clase positiva son mensajes privados trasladados al feed y la etiqueta la comparten personas conocidas de los autores. La aceptación (TAM) promedió 4,43 sobre 5, y evaluadores externos a ciegas prefirieron los copys de Postly.</w:t>
+        <w:t>Las catorce Historias de Usuario se implementaron, con tres umbrales sin verificar y uno incumplido. En un experimento intra-sujeto con ocho consultoras (32 publicaciones), el tiempo se redujo un 76,7 % (IC 95 % [73,5 %; 79,9 %]). Es una cota superior: con el tiempo omitido estimado, la reducción es de 73,6 a 71,4 %, y la hipótesis del 70 % queda compatible con los datos, no confirmada. El Módulo Centinela alcanzó un F1 de 0,85 sobre 40 casos controlados y de 0,923 sobre 29 piezas reales, mensajes privados trasladados al feed y etiquetados por personas conocidas de los autores. La aceptación (TAM) promedió 4,43 sobre 5, y evaluadores externos a ciegas prefirieron los copys de Postly.</w:t>
       </w:r>
     </w:p>
     <w:p>
@@ -12235,7 +12235,7 @@
         <w:spacing w:after="240" w:line="276" w:lineRule="auto"/>
       </w:pPr>
       <w:r>
-        <w:t>Este último rol es el más sensible. Las pautas de Mary Kay reservan los mensajes comerciales a canales privados con clientas y clientas potenciales, y los prohíben en publicaciones dirigidas al público general (Mary Kay Inc., s.f.; Anexo D). Son comerciales los que dan información suficiente para decidir una compra, como un precio, un descuento o una oferta, y los que invitan a comprar o a contactar. Cumplirlas depende hoy sólo de la revisión, la memoria y el cuidado de la emprendedora, y el trabajo manual consume tiempo que no vuelve al cierre de ventas ni al liderazgo de equipos. En adelante, «mensaje comercial» es lo que la norma regula y «referencia monetaria» —un precio, un descuento o una oferta expresados—, la parte de aquél que audita el Módulo Centinela (§2.4).</w:t>
+        <w:t>Este último rol es el más sensible. Las pautas de Mary Kay reservan los mensajes comerciales —los que dan información suficiente para decidir una compra o invitan a comprar o a contactar— a canales privados con clientas (Mary Kay Inc., s.f.; Anexo D), y cumplirlas depende hoy sólo de la revisión y la memoria de la emprendedora. En adelante, «mensaje comercial» es lo que la norma regula y «referencia monetaria» —un precio, un descuento o una oferta expresados—, la parte de aquél que audita el Módulo Centinela (§2.4).</w:t>
       </w:r>
     </w:p>
     <w:p>
@@ -12312,7 +12312,7 @@
         <w:t>c) Vulnerabilidad estructural ante normativas de cumplimiento (Compliance):</w:t>
       </w:r>
       <w:r>
-        <w:t xml:space="preserve"> es el punto que motiva el componente diferencial del sistema. Este trabajo toma dos reglas de las Pautas de Mary Kay, que son instrumentales al Acuerdo de Consultora (§2.4; Anexo D). La primera prohíbe los mensajes comerciales fuera de un canal privado con clientas; el módulo audita de ellos la referencia monetaria, que es una parte de la regla (§6.1.3). La segunda obliga a usar la nomenclatura autorizada («Consultora de Belleza Independiente Mary Kay») en el nombre de la página de negocio (Mary Kay Inc., s.f.); la norma no exige firmar cada publicación del feed. El cumplimiento recae hoy en una supervisión humana falible bajo fatiga (Reason, 1990): basta no borrar el precio de una placa promocional. El §2.4 acota el alcance de esa exposición: la fuente no fija sanción para el mensaje comercial en canal público, de modo que lo comprometido es el cumplimiento y no una consecuencia tipificada. Lo que falta es un filtro de auditoría previo a la publicación.</w:t>
+        <w:t xml:space="preserve"> es el punto que motiva el componente diferencial del sistema. Este trabajo toma dos reglas de las Pautas de Mary Kay, instrumentales al Acuerdo de Consultora (§2.4; Anexo D). Una prohíbe los mensajes comerciales fuera de un canal privado, y el módulo audita de ellos la referencia monetaria (§6.1.3); la otra obliga a usar la nomenclatura autorizada en el nombre de la página de negocio (Mary Kay Inc., s.f.). El cumplimiento recae hoy en una supervisión humana falible bajo fatiga (Reason, 1990). El §2.4 acota el alcance de esa exposición: la fuente no fija sanción para el mensaje comercial en canal público. Lo que falta es un filtro de auditoría previo a la publicación.</w:t>
       </w:r>
     </w:p>
     <w:p>
@@ -12973,7 +12973,7 @@
     </w:p>
     <w:p>
       <w:r>
-        <w:t>Once de esos candidatos, los más cercanos al vacío —verificar, antes de publicar, que un contenido cumpla una norma—, se leyeron completos; nueve estaban accesibles. Ninguno es un antecedente directo de Postly. TORA (Wang et al., 2026) incorpora reglas de una comunidad a la moderación con modelos de lenguaje, pero la ejerce la plataforma y fuera de línea. Warner et al. (2025) estudian la moderación proactiva del lado de quien publica, como el Módulo Centinela, pero sobre toxicidad. Das et al. (2026) y Barrientos et al. (2026) verifican cumplimiento normativo con modelos de lenguaje —el segundo, combinados con reglas deterministas—, pero sobre requisitos de software y procesos de negocio. El vacío del §1.6.3 queda así respaldado por lectura y no sólo por la ausencia de resultados.</w:t>
+        <w:t>Once de esos candidatos, los más cercanos al vacío, se leyeron completos, y ninguno de los nueve accesibles es un antecedente directo de Postly. TORA (Wang et al., 2026) incorpora reglas de una comunidad a la moderación con modelos de lenguaje, pero la ejerce la plataforma. Warner et al. (2025) estudian la moderación proactiva del lado de quien publica, pero sobre toxicidad. Das et al. (2026) y Barrientos et al. (2026) verifican cumplimiento normativo con modelos de lenguaje, pero sobre requisitos de software y procesos de negocio. El vacío del §1.6.3 queda así respaldado por lectura.</w:t>
       </w:r>
       <w:r/>
     </w:p>
@@ -12984,12 +12984,12 @@
     </w:p>
     <w:p>
       <w:r>
-        <w:t>MetaGPT (Hong et al., 2024), que codifica procedimientos estandarizados para coordinar agentes especializados, y AutoAgents (Chen et al., 2024), que los genera según la tarea, representan el estado del arte en sistemas multiagente. Postly no lo es: invoca un único modelo (Gemini 2.5 Flash) en puntos discretos de un workflow determinista (§5.1), lo que simplifica su depuración y su costo a cambio de flexibilidad. Yao et al. (2025) formalizan ese patrón —un modelo invocado en varias etapas encadenadas por un orquestador externo—, aunque no lo presentan como alternativa a los sistemas multiagente, y Wang et al. (2024) organizan el campo en torno a la construcción, las aplicaciones y la evaluación de los agentes. En marketing, Grewal et al. (2025) sistematizan cómo la IA generativa redefine la creación de contenido, el movimiento en el que se inscribe este trabajo.</w:t>
-      </w:r>
-    </w:p>
-    <w:p>
-      <w:r>
-        <w:t>En el plano del Módulo Centinela, Gómez et al. (2024) muestran que decisiones de entrenamiento que no afectan la exactitud promedio de un clasificador sí determinan qué casos clasifica mal. El desempeño agregado no dice qué casos deja pasar un detector, que es lo que expone el análisis de valores límite del §6.1, aunque el canal textual de Postly sea un conjunto de reglas y no un modelo entrenado. Sobre los modelos de lenguaje como clasificadores, que el §8.2 recomienda en reemplazo de esas reglas, Kumar et al. (2024) los evalúan contra reglas de moderación de comunidades de Reddit, con un desempeño útil pero dispar, y Franco et al. (2025) describen cómo integrarlos a un sistema existente.</w:t>
+        <w:t>MetaGPT (Hong et al., 2024) y AutoAgents (Chen et al., 2024), que coordinan agentes especializados, representan el estado del arte en sistemas multiagente. Postly no lo es: invoca un único modelo en puntos discretos de un workflow determinista (§5.1), más simple de depurar y más barato, a cambio de flexibilidad. Yao et al. (2025) formalizan ese patrón de un modelo encadenado por un orquestador externo, y Wang et al. (2024) organizan el campo en torno a la construcción, las aplicaciones y la evaluación de los agentes. En marketing, Grewal et al. (2025) sistematizan cómo la IA generativa redefine la creación de contenido.</w:t>
+      </w:r>
+    </w:p>
+    <w:p>
+      <w:r>
+        <w:t>En el plano del Módulo Centinela, Gómez et al. (2024) muestran que el desempeño agregado de un clasificador no dice qué casos clasifica mal, que es lo que expone el análisis de valores límite del §6.1. Sobre los modelos de lenguaje como clasificadores, que el §8.2 recomienda, Kumar et al. (2024) los evalúan contra reglas de moderación reales, con un desempeño útil pero dispar, y Franco et al. (2025) describen cómo integrarlos a un sistema existente.</w:t>
       </w:r>
       <w:r/>
     </w:p>
@@ -14168,8 +14168,7 @@
         <w:t xml:space="preserve">Elaboración propia a partir de la documentación y los sitios oficiales de cada plataforma (consultados el 28 de septiembre de 2026): Hootsuite, https://www.hootsuite.com/newsroom/press-releases/hootsuite-launches-owlywriter-ai y https://help.hootsuite.com/hc/en-us/articles/235611847; Buffer, https://support.buffer.com/article/583-using-buffers-ai-assistant; Later, https://later.com/blog/caption-writer-for-instagram/; Metricool, https://help.metricool.com/en/article/how-to-create-posts-with-metricools-ai-text-generator-1fozdmp/; Zapier, https://help.zapier.com/hc/en-us/articles/14860148802829; Make, https://apps.make.com/openai-modules. Sí = capacidad nativa; Parcial = disponible con limitaciones, a costo empresarial o </w:t>
       </w:r>
       <w:r>
-        <w:lastRenderedPageBreak/>
-        <w:t>mediante construcción manual; No = ausente. **El compliance de Postly es parcial y no categórico: el módulo alcanza un F1 de 0,85 en la configuración representativa y de 0,67 en la de estrés —0,83 y 0,63 si se aísla el canal textual de las filas de imagen—, y el canal visual depende de la respuesta de un modelo externo (§6.1, §4.3.1). ***El auto-hospedaje cubre el motor de orquestación y la lógica de negocio, no el almacenamiento ni la inferencia, que se apoyan en servicios de terceros (§2.1.a). *Las suites empresariales (p. ej., Hootsuite Enterprise, Sprout Social) ofrecen gobernanza y moderación de marca —listas de palabras, registros de auditoría— a costo elevado, pero no detección multimodal de precios orientada a un microemprendimiento individual. ****Zapier y Make permiten construir reglas de compliance a medida, pero no de forma nativa ni accesible para un usuario sin perfil técnico, trasladando la responsabilidad arquitectónica al usuario final (§1.6.2).</w:t>
+        <w:t>mediante construcción manual; No = ausente. **El compliance de Postly es parcial: un F1 de 0,85 en la configuración representativa y de 0,67 en la de estrés, con un canal visual que depende de un modelo externo (§6.1). ***El auto-hospedaje cubre el motor y la lógica de negocio, no el almacenamiento ni la inferencia (§2.1.a). *Las suites empresariales (Hootsuite Enterprise, Sprout Social) ofrecen gobernanza de marca a costo elevado, sin detección multimodal de precios. ****Zapier y Make permiten construir reglas a medida, pero no de forma nativa ni accesible sin perfil técnico (§1.6.2).</w:t>
       </w:r>
     </w:p>
     <w:p>
@@ -14982,7 +14981,7 @@
         <w:spacing w:after="240" w:line="276" w:lineRule="auto"/>
       </w:pPr>
       <w:r>
-        <w:t>La primera regla prohíbe compartir el mensaje comercial con el público en general: sólo puede ir por un mecanismo privado a clientas y clientas potenciales (Mary Kay Inc., s.f., pp. 3 y 4; Anexo D). La fuente lo define por lo que el mensaje hace —da información suficiente para decidir una compra, con el precio, el descuento y la oferta como ejemplos, o invita a comprar— y no por una cifra. De ahí los dos términos de este trabajo: «mensaje comercial» es lo que la norma regula, y «referencia monetaria», la parte de aquél que el módulo audita. La fuente funda la regla en dos razones: los términos de uso de varias plataformas limitan el mensaje comercial en las páginas personales, y el consumidor responde mejor sin una solicitud comercial directa. Leerla como protección de la venta consultiva frente a la guerra de precios es una interpretación de los autores (Kotler y Keller, 2012), no un fundamento de la fuente.</w:t>
+        <w:t>La primera regla reserva el mensaje comercial a un mecanismo privado con clientas y clientas potenciales (Mary Kay Inc., s.f., pp. 3 y 4; Anexo D). Lo define por lo que hace —da información suficiente para decidir una compra, como un precio, un descuento o una oferta, o invita a comprar— y no por una cifra. De ahí los dos términos de este trabajo: «mensaje comercial» es lo que la norma regula, y «referencia monetaria», la parte que el módulo audita. La fuente funda la regla en los términos de uso de las plataformas y en que el consumidor responde mejor sin una solicitud comercial directa; leerla como protección frente a la guerra de precios es una interpretación de los autores (Kotler y Keller, 2012).</w:t>
       </w:r>
     </w:p>
     <w:p>
@@ -16679,7 +16678,7 @@
         <w:spacing w:before="240" w:after="240" w:line="240" w:lineRule="auto"/>
       </w:pPr>
       <w:r>
-        <w:t>El tamaño muestral no lo fijó el mismo criterio para las tres variables. Ninguno es la saturación teórica (Glaser y Strauss, 1967), que gobierna el muestreo de material narrativo: aquí las variables son un tiempo, una proporción y una escala Likert, cuyo campo libre completaron cuatro de las ocho participantes (Anexo E.3). El de la variable (a) es un criterio pragmático de disponibilidad declarado en el Anexo E —un mínimo de 3 consultoras con 3 publicaciones—, que el piloto cumplió (12 pares) y la ampliación escaló a 8 consultoras y 32 pares; el §6.1 reporta sólo la ampliación. El de la (b) lo fijan los conjuntos de casos (40, 40, 25, 20 y 9) y el corpus de campo (29), y el de la (c), las ocho participantes. Para muestras pequeñas y no normales como ésta, Kitchenham y Madeyski (2024) muestran que la probabilidad de superioridad sesga menos que la d de Cohen: el §6.1 informa la d por convención, y el §6.1.6 agrega la probabilidad de superioridad pareada y una prueba de rangos con signo.</w:t>
+        <w:t>El tamaño muestral no lo fijó el mismo criterio para las tres variables, y ninguno es la saturación teórica (Glaser y Strauss, 1967), propia del material narrativo. El de la variable (a) es un criterio de disponibilidad declarado en el Anexo E —un mínimo de 3 consultoras con 3 publicaciones—, que la ampliación escaló a 8 consultoras y 32 pares. El de la (b) lo fijan los conjuntos de casos (40, 40, 25, 20 y 9) y el corpus de campo (29), y el de la (c), las ocho participantes. Para muestras pequeñas y no normales, Kitchenham y Madeyski (2024) muestran que la probabilidad de superioridad sesga menos que la d de Cohen, y el §6.1.6 informa las dos.</w:t>
       </w:r>
     </w:p>
     <w:p>
@@ -16722,7 +16721,7 @@
     </w:p>
     <w:p>
       <w:r>
-        <w:t>La variable (a) sostiene la hipótesis del trabajo: que el sistema reduce el tiempo operativo de publicación en más de un 70 % respecto del proceso manual. Se mide el sistema entero, sin aislar la interfaz conversacional, con una prueba t unilateral contra el 70 % (H₀: reducción = 70 %), la participante como unidad de análisis y el tramo comparable, que descuenta del lado manual la adaptación de la imagen. Umbral, contraste y tramo se fijaron en el protocolo antes de la primera sesión (Anexo E.4). La regla que toma como tiempo de Postly el mayor entre el cronómetro y el intervalo del motor se adoptó al ver los datos, cuando el cronómetro resultó subregistrar la espera por el modelo; produce por construcción una cota, y el §6.1.6 la acompaña con un análisis de sensibilidad.</w:t>
+        <w:t>La variable (a) sostiene la hipótesis del trabajo: que el sistema completo reduce el tiempo operativo de publicación en más de un 70 % respecto del proceso manual. Se contrasta con una prueba t unilateral contra el 70 %, con la participante como unidad de análisis y sobre el tramo comparable, todo fijado en el protocolo antes de la primera sesión (Anexo E.4). La regla que toma como tiempo de Postly el mayor entre el cronómetro y el intervalo del motor se adoptó al ver los datos y produce una cota, que el §6.1.6 acompaña con un análisis de sensibilidad.</w:t>
       </w:r>
     </w:p>
     <w:p>
@@ -16765,7 +16764,7 @@
     </w:p>
     <w:p>
       <w:r>
-        <w:t>Validez interna: la ampliación contrabalanceó el orden de las condiciones y no detectó efecto de orden ni de aprendizaje, aunque con n = 8 ninguno de los dos contrastes tiene potencia para ser concluyente. Las observaciones están anidadas en ocho participantes, de modo que el contraste se calcula sobre las medias por sujeto. Se suman las características de demanda: la condición manual es autoadministrada, y tres participantes tienen relación previa con los autores. El registro de reclutamiento las estratifica en «Ninguna» (n = 5), «Conocida» (n = 2) y «Familiar» (n = 1), y la reducción no difiere entre estratos (§6.1.6). Y la condición manual incluye adaptar la imagen al formato de feed, que con Postly no le corresponde a la usuaria: la ampliación registró ese tramo por separado, de modo que la amenaza queda medida.</w:t>
+        <w:t>Validez interna: con n = 8, los contrastes de orden y de aprendizaje, que no detectaron efecto, no tienen potencia para ser concluyentes, y el contraste principal se calcula sobre las medias por participante. La condición manual es autoadministrada, y tres participantes tienen relación previa con los autores: «Ninguna» (n = 5), «Conocida» (n = 2) y «Familiar» (n = 1), sin diferencia de reducción entre estratos (§6.1.6). Y la condición manual incluye adaptar la imagen al formato de feed, que la ampliación registró por separado.</w:t>
       </w:r>
     </w:p>
     <w:p>
@@ -16976,7 +16975,7 @@
         <w:spacing w:before="240" w:after="240"/>
       </w:pPr>
       <w:r>
-        <w:t>Adhiriendo a la Privacidad desde el Diseño (Cavoukian, 2009), el sistema evita almacenar Información Personal Identificable (PII) que no sea necesaria para el flujo de publicación. La hoja Usuarios guarda el identificador que Telegram asigna a la conversación —clave primaria y filtro de multitenencia—, el identificador y el nombre de la página de Facebook, el de la cuenta de Instagram Business, la vigencia del token y el token, cifrado con AES-256-GCM (Anexo B.3). La hoja Config guarda la firma y el contacto de cada consultora, en una fila con su identificador, y una fila general para quien no tiene una propia (Anexo B.4). La de publicaciones guarda el copy, el estado, la fecha programada, las URIs de los activos y los identificadores de cada publicación en ambas redes. El identificador de la conversación es dato personal en cualquier marco de protección de datos, y se almacena porque es la dirección a la que responde el bot.</w:t>
+        <w:t>Adhiriendo a la Privacidad desde el Diseño (Cavoukian, 2009), el sistema evita almacenar información personal que el flujo de publicación no necesite. La hoja Usuarios guarda el identificador de la conversación de Telegram —clave primaria y filtro de multitenencia—, los datos de la página de Facebook y de la cuenta de Instagram, y el token cifrado con AES-256-GCM con su vigencia (Anexo B.3). Config guarda la firma y el contacto de cada consultora (Anexo B.4), y la hoja de publicaciones, el copy, el estado, la fecha programada, las URIs de los activos y los identificadores de cada publicación. El identificador de la conversación es dato personal, y se almacena porque es la dirección a la que responde el bot.</w:t>
       </w:r>
       <w:r/>
     </w:p>
@@ -16985,7 +16984,7 @@
         <w:spacing w:before="240" w:after="240"/>
       </w:pPr>
       <w:r>
-        <w:t>Fuera de esas hojas, el despliegue almacena cuatro cosas más. El historial de ejecuciones de n8n conserva los updates completos de Telegram, con el nombre, el apellido y el identificador de quien escribe. En E3 se purga a los catorce días; el de E2, del que salen la Tabla 13 y la conciliación de tiempos del Anexo E.2, se conserva en la máquina de los autores. El armado de un carrusel usa un archivo del servidor como buffer (Anexo B.5), y la deduplicación guarda identificadores de callback. Las imágenes y los videos se alojan en Cloudinary, un tercero, y se suben antes de la auditoría visual porque el modelo los lee por URL. Cuando el módulo bloquea una pieza por un precio, la borra en paralelo al aviso; un bloqueo por el texto no borra nada, porque la usuaria reintenta con las mismas imágenes. Lo subido antes del 1 de octubre de 2026 no se depuró. El principio, por lo tanto, no es que no haya otro dato personal, sino que no se recolecta ninguno ajeno al flujo; el historial, que durante su plazo guarda el update entero, es donde queda más expuesto (§8.2).</w:t>
+        <w:t>Fuera de esas hojas, el despliegue almacena cuatro cosas más. El historial de ejecuciones de n8n conserva los updates completos de Telegram, con el nombre, el apellido y el identificador de quien escribe. En E3 se purga a los catorce días; el de E2, fuente de la Tabla 13 y del Anexo E.2, queda en la máquina de los autores. El buffer del carrusel es un archivo del servidor (Anexo B.5), y la deduplicación guarda identificadores de callback. Las imágenes y los videos se alojan en Cloudinary y se borran cuando el canal visual los bloquea (§4.3.1); lo subido antes del 1 de octubre de 2026 no se depuró. El principio es no recolectar datos ajenos al flujo, y el historial es donde queda más expuesto (§8.2).</w:t>
       </w:r>
     </w:p>
     <w:p>
@@ -19809,7 +19808,7 @@
         <w:spacing w:after="240" w:line="276" w:lineRule="auto"/>
       </w:pPr>
       <w:r>
-        <w:t>Modo de falla de la detección visual. La capa textual evalúa siempre y no tiene un modo de falla propio; la visual depende de que un modelo externo devuelva un veredicto legible. Si la petición a la API falla o agota su cuota, el nodo reintenta y, agotados los reintentos, la ejecución se interrumpe sin publicar. Pero si la API responde con un texto que no es un JSON válido —porque el modelo antepuso prosa o lo truncó—, el veredicto se resuelve como negativo y el contenido sigue hacia la publicación: ese tramo es fail-open. Es deliberado, porque fallar en el sentido contrario dejaría a la consultora sin publicar cada vez que el modelo se desvía del formato, y significa que el bloqueo visual depende también de la forma de la respuesta. El script con que se validó el canal replica ese parseo tolerante (Anexo E.6), de modo que la medición del §6.1 corresponde al comportamiento real del nodo.</w:t>
+        <w:t>Modo de falla de la detección visual. El canal textual evalúa siempre; el visual depende de que el modelo devuelva un veredicto legible. Si la API falla o agota su cuota, el nodo reintenta y, agotados los reintentos, la ejecución se interrumpe sin publicar. Pero si responde con un texto que no es un JSON válido, el veredicto se resuelve como negativo y el contenido sigue hacia la publicación: ese tramo es fail-open por decisión, porque lo contrario dejaría a la consultora sin publicar cada vez que el modelo se desvía del formato. El script de validación replica ese parseo (Anexo E.6), de modo que la medición del §6.1 corresponde al comportamiento real del nodo.</w:t>
       </w:r>
     </w:p>
     <w:p>
@@ -19840,7 +19839,7 @@
         <w:spacing w:after="240" w:line="276" w:lineRule="auto"/>
       </w:pPr>
       <w:r>
-        <w:t>El nodo agrega, además de la firma, la línea de contacto que la hoja Config guarda para la consultora. En las 41 ejecuciones de E2 que van de las sesiones del 26 y 27 de septiembre a las pruebas del 28, esa línea es un identificador de Instagram y un número de WhatsApp, sin verbo ni invitación. Las Pautas ejemplifican el mensaje comercial con una invitación a contactar —«¡Pregúntame cómo puedes conseguirlo!» (p. 3)—. Una línea de datos no es ese acto, pero cumple su función, y la fuente no dice si un contacto al pie de un mensaje informativo lo vuelve comercial. Este trabajo lo declara como pregunta abierta, con tres consecuencias. Las mediciones del Anexo E.12 (0/15 y 0/32) se tomaron sobre el copy del modelo, antes de la concatenación, y no alcanzan a esa línea; ninguna corrección del prompt la modifica; y su contenido lo fija la consultora, a quien Postly no avisa de que podría ser comercial. Queda como riesgo residual, con la recomendación de hacerla opcional y de consultarla con la Compañía (§8.2).</w:t>
+        <w:t>El nodo agrega, además de la firma, la línea de contacto de la hoja Config: en las 41 ejecuciones de E2 de las sesiones y las pruebas de septiembre, un identificador de Instagram y un número de WhatsApp, sin verbo ni invitación. Las Pautas ejemplifican el mensaje comercial con una invitación a contactar —«¡Pregúntame cómo puedes conseguirlo!» (p. 3)—, y no dicen si un dato de contacto al pie de un mensaje informativo lo vuelve comercial. Este trabajo lo declara como pregunta abierta: las mediciones del Anexo E.12 no alcanzan a esa línea, ninguna corrección del prompt la modifica y su contenido lo fija la consultora. Queda como riesgo residual (§8.2).</w:t>
       </w:r>
       <w:r/>
     </w:p>
@@ -20009,7 +20008,7 @@
         <w:t>Relación de aspecto:</w:t>
       </w:r>
       <w:r>
-        <w:t xml:space="preserve"> el diseño preveía forzar una relación de aspecto uniforme —1:1 o 4:5— entre las imágenes de un carrusel, para que Instagram no lo fragmente ni le agregue bordes negros, y esa subrutina no se implementó. La imagen única, en cambio, se rellena a 1:1 con fondo blanco antes de publicar en las dos redes, lo mismo que la reanudación desde la agenda. Queda así dentro del rango de 4:5 a 1,91:1 que admite la Graph API (Meta for Developers, s.f.): una foto de 3:4 y otra de 4:5 se publicaron sin rechazo el 28 de septiembre de 2026 (ejecuciones 813 y 819). El carrusel, la publicación programada y la re-publicación suben cada imagen con su proporción original y sin verificar ese rango. Un carrusel con una imagen de 3:4 y otra de 4:5 se publicó sin rechazo el mismo día (ejecución 825), pero una proporción más extrema no se probó, y la normalización del carrusel queda entre las recomendaciones del §8.2.</w:t>
+        <w:t xml:space="preserve"> el diseño preveía uniformar la relación de aspecto de las imágenes de un carrusel, y esa subrutina no se implementó. La imagen única, en cambio, se rellena a 1:1 con fondo blanco antes de publicar, lo que la deja dentro del rango de 4:5 a 1,91:1 que admite la Graph API (Meta for Developers, s.f.); fotos de 3:4 y 4:5 se publicaron sin rechazo (ejecuciones 813 y 819). El carrusel, la publicación programada y la re-publicación suben cada imagen con su proporción original, sin verificar ese rango: un carrusel con imágenes de 3:4 y 4:5 se publicó sin rechazo (ejecución 825), pero una proporción más extrema no se probó (§8.2).</w:t>
       </w:r>
     </w:p>
     <w:p>
@@ -20339,7 +20338,7 @@
         <w:spacing w:after="240" w:line="276" w:lineRule="auto"/>
       </w:pPr>
       <w:r>
-        <w:t>La macro-arquitectura de Postly es un orquestador centralizado dirigido por eventos (Erl, 2005; Newman, 2015). Es un workflow principal de 213 nodos que corre en un único proceso n8n, con su propio historial de ejecuciones en SQLite (Anexos B.1 y B.2), y que persiste los datos del sistema en Google Sheets (§5.1.1). Sus componentes no se despliegan, versionan ni escalan por separado, que es lo que separa el monolito del microservicio (Dragoni et al., 2017): Postly es un monolito modular, aunque consuma APIs de terceros de forma desacoplada. La modularidad facilita el mantenimiento y el aislamiento de fallos sin perder la simplicidad de una sola instancia autoalojada (Bass et al., 2012), que corre en el modo «regular» del motor y no en el de cola (n8n GmbH, s.f.). La Figura 4 la presenta en notación C4.</w:t>
+        <w:t>La macro-arquitectura de Postly es un orquestador centralizado dirigido por eventos (Erl, 2005; Newman, 2015): un workflow principal de 213 nodos en un único proceso n8n (Anexos B.1 y B.2), con la persistencia en Google Sheets (§5.1.1). Sus componentes no se despliegan, versionan ni escalan por separado, que es lo que separa el monolito del microservicio (Dragoni et al., 2017). Postly es un monolito modular, con la simplicidad operativa de una sola instancia (Bass et al., 2012) en el modo «regular» del motor (n8n GmbH, s.f.). La Figura 4 la presenta en notación C4.</w:t>
       </w:r>
       <w:r/>
     </w:p>
@@ -20672,7 +20671,7 @@
           <w:i/>
           <w:sz w:val="20"/>
         </w:rPr>
-        <w:t>Nota. Fuente: elaboración propia. Los nombres son los de las columnas de la hoja, leídos del workflow desplegado (Anexo B.2). TelegramUserID, el identificador que Telegram asigna a la conversación, es la clave por la que se filtra la multitenencia (§5.2.2). «Reach» es una columna que ningún nodo puebla: el sistema recoge likes y comentarios. «ExpiresAt» guarda la vigencia del token de usuaria —60 días desde el canje— y no la del token de página, que se cifra con AES-256-GCM en «AccessToken» y que la Graph API devuelve sin expiración (Anexo B.3). La relación UserID → TelegramUserID se resuelve por lookup en tiempo de ejecución, sin integridad referencial ni transacciones ACID (§2.3; Anexo B.5). Config tiene una fila por consultora y una general sin dueña, de la que salen la firma y el contacto (Anexo B.4). Status alimenta el diagrama de estados de la Figura 2.</w:t>
+        <w:t>Nota. Fuente: elaboración propia. Columnas leídas del workflow desplegado (Anexo B.2). TelegramUserID es la clave por la que se filtra la multitenencia (§5.2.2). «Reach» no lo puebla ningún nodo. «ExpiresAt» guarda la vigencia del token de usuaria —60 días— y no la del token de página, cifrado en «AccessToken» y sin expiración (Anexo B.3). La relación UserID → TelegramUserID se resuelve por lookup, sin integridad referencial ni transacciones ACID (§2.3). Config tiene una fila por consultora y una general (Anexo B.4). Status alimenta la Figura 2.</w:t>
       </w:r>
     </w:p>
     <w:p>
@@ -21296,7 +21295,7 @@
           <w:i/>
           <w:sz w:val="20"/>
         </w:rPr>
-        <w:t>Nota. Fuente: elaboración propia. Recorrido de la imagen única, en el orden del sistema. La imagen se sube a Cloudinary al recibirla (pasos 2 y 3), porque la auditoría visual y la Graph API la leen por URL. La auditoría visual corre antes de generar los copys, de modo que una imagen con precio interrumpe el flujo sin gastar una inferencia de redacción; si la bloquea, se la borra de Cloudinary en paralelo al aviso (§3.7.1). En el video, que también se sube antes de la detección (Anexo B.9), hay una tercera respuesta: avisar sin bloquear cuando el recorte a 9:16 elimina el precio (§4.3.1). La firma se concatena por código antes de publicar (Anexo B.4). El canal visual es una llamada a Gemini (pasos 5 y 6) y el textual un nodo determinista (paso 12): el recorrido consume dos inferencias (Anexo E.5).</w:t>
+        <w:t>Nota. Fuente: elaboración propia. Recorrido de la imagen única, en el orden del sistema. La imagen se sube a Cloudinary al recibirla (pasos 2 y 3), porque la auditoría visual y la Graph API la leen por URL; la auditoría visual corre antes de los copys y, si bloquea, la imagen se borra (§3.7.1). El video también se sube antes de la detección, y agrega la respuesta de avisar sin bloquear (§4.3.1; Anexo B.9). El canal visual es una llamada a Gemini (pasos 5 y 6) y el textual un nodo determinista (paso 12): el recorrido consume dos inferencias (Anexo E.5).</w:t>
       </w:r>
     </w:p>
     <w:p>
@@ -24790,7 +24789,7 @@
     </w:p>
     <w:p>
       <w:r>
-        <w:t>En síntesis, el módulo es funcional. Su F1 es de 0,85 en el conjunto representativo y de 0,923 sobre contenido real contra la etiqueta de «publicable» de la consultora y del evaluador (panel B), y de 1,00 contra el constructo que audita, con la etiqueta de los autores (panel A). Su debilidad está en el canal de texto: las expresiones regulares no capturan la semántica del precio, que es lo que separa el reconocimiento de patrones de la clasificación semántica (Jurafsky y Martin, 2023), y el contraste con el canal de imagen sugiere complementarlo con un clasificador de lenguaje (§8.2). En Facebook, además, parte de los verdaderos positivos es contenido que la fuente admite en la página de negocios: ahí el módulo es más estricto que la norma (Capítulo 7).</w:t>
+        <w:t>En síntesis, el módulo es funcional: un F1 de 0,85 en el conjunto representativo, de 0,923 sobre contenido real (panel B) y de 1,00 contra el constructo que audita, con la etiqueta de los autores (panel A). Su debilidad es el canal de texto, cuyas expresiones no capturan la semántica del precio (Jurafsky y Martin, 2023), y el contraste con el canal de imagen sugiere complementarlo con un clasificador de lenguaje (§8.2). En Facebook, además, parte de los verdaderos positivos es contenido que la fuente admite en la página de negocios (Capítulo 7).</w:t>
       </w:r>
       <w:r/>
     </w:p>
@@ -26400,7 +26399,7 @@
     </w:p>
     <w:p>
       <w:r>
-        <w:t>Falta estimar el tiempo no registrado. En los 9 pares en que el cronómetro superó al motor, la diferencia fue de 6 a 68 s, con una mediana de 17 s y una media de 28 s. Sumada al tiempo de Postly, la reducción es del 73,6 % con la mediana, significativa frente al 70 % (t(7) = 2,29; p = 0,028), y del 71,4 % con la media, que no se distingue del umbral (t(7) = 0,80; p = 0,224). La hipótesis es compatible con los datos, pero no queda confirmada de forma concluyente. Las medidas no paramétricas que recomiendan Kitchenham y Madeyski (2024) van en el mismo sentido: Postly fue más rápido en los 32 pares (probabilidad de superioridad pareada = 1,00). La prueba de Wilcoxon contra el 70 % da p = 0,004 con el tiempo registrado y p = 0,191 con 28 s. El análisis completo está en el Anexo E.2.</w:t>
+        <w:t>Falta estimar el tiempo no registrado. En los 9 pares en que el cronómetro superó al motor, la diferencia fue de 6 a 68 s, con una mediana de 17 s y una media de 28 s. Sumada al tiempo de Postly, la reducción es del 73,6 % con la mediana, significativa frente al 70 % (t(7) = 2,29; p = 0,028), y del 71,4 % con la media, no distinguible del umbral (t(7) = 0,80; p = 0,224). La hipótesis es compatible con los datos y no queda confirmada. Con la medida no paramétrica que recomiendan Kitchenham y Madeyski (2024), Postly fue más rápido en los 32 pares (probabilidad de superioridad pareada = 1,00). El análisis completo, con la prueba de rangos con signo, está en el Anexo E.2.</w:t>
       </w:r>
     </w:p>
     <w:p>
@@ -26718,7 +26717,7 @@
         <w:jc w:val="both"/>
       </w:pPr>
       <w:r>
-        <w:t>Las tres capacidades del Objetivo Específico 2 que la integración no mide por sí sola —la calidad del copy (HU4), el tono (HU6) y el orden del carrusel (HU5)— tienen una primera evaluación a ciegas con dos evaluadores externos (Anexo E.14). Frente a un generador genérico, el copy de Postly fue preferido en los 8 productos, sin afirmaciones no verificables contra la foto (Estudio 1), aunque en la dimensión de cumplimiento el diseño favorece a Postly. El tono pedido se reconoció en 22 de 24 asignaciones (91,7 %), por encima del umbral del 60 % fijado de antemano (Estudio 2). Frente al trabajo manual de las ocho participantes, el copy de Postly fue preferido en 26 de 32 pares (81,3 %; Estudio 4). El orden de carrusel fue preferido frente al de envío en 6 de 8 conjuntos (Estudio 3) y frente al manual en 6 de 7 carruseles de dos imágenes, que admiten sólo dos órdenes (binomial exacta bilateral, p = 0,125), sin significancia estadística. Cada estudio tuvo un único evaluador.</w:t>
+        <w:t>Las tres capacidades del Objetivo Específico 2 que la integración no mide —la calidad del copy (HU4), el tono (HU6) y el orden del carrusel (HU5)— tienen una primera evaluación a ciegas con dos evaluadores externos, uno por estudio (Anexo E.14). El copy de Postly fue preferido frente a un generador genérico en los 8 productos, sin afirmaciones no verificables contra la foto (Estudio 1), aunque en cumplimiento el diseño del estudio favorece a Postly. Frente al trabajo manual de las participantes fue preferido en 26 de 32 pares (81,3 %; Estudio 4). El tono pedido se reconoció en 22 de 24 asignaciones (91,7 %), sobre un umbral del 60 % fijado de antemano (Estudio 2). El orden de carrusel fue preferido frente al de envío en 6 de 8 conjuntos (Estudio 3) y frente al manual en 6 de 7 carruseles de dos imágenes (binomial exacta bilateral, p = 0,125), sin significancia estadística.</w:t>
       </w:r>
     </w:p>
     <w:p>
@@ -26877,7 +26876,7 @@
     </w:p>
     <w:p>
       <w:r>
-        <w:t>La interfaz conversacional como punto de entrada único sigue la premisa de McTear et al. (2016): el diálogo reduce la carga cognitiva de usuarios sin formación técnica frente a menús y formularios. Postly es consistente con esa premisa en su arquitectura —la creación, la auditoría y la publicación ocurren en una sola conversación—, pero no midió la carga cognitiva percibida: es una propiedad de diseño y no un resultado. Larsen et al. (2025), de quienes sólo se conoce el título, estudian las expectativas sobre la IA conversacional en la atención al cliente, y se los menciona como antecedente temático. El antecedente más próximo es Kunstmann et al. (2026), que evalúan con usuarias un sistema conversacional gobernado por un modelo de lenguaje en una pequeña empresa y reportan, además de la aceptación, el costo por interacción y la latencia. Este trabajo comparte con él la evaluación con usuarias reales, y no reporta un costo por interacción.</w:t>
+        <w:t>La interfaz conversacional como punto de entrada único sigue la premisa de McTear et al. (2016): el diálogo reduce la carga cognitiva de usuarios sin formación técnica. Postly es consistente con ella en su arquitectura, pero no midió la carga cognitiva percibida. Larsen et al. (2025), de quienes sólo se conoce el título, son un antecedente temático. El más próximo es Kunstmann et al. (2026), que evalúan con usuarias un sistema conversacional gobernado por un modelo de lenguaje en una pequeña empresa; este trabajo comparte con él la evaluación con usuarias reales, y no reporta, como él, un costo por interacción.</w:t>
       </w:r>
       <w:r/>
     </w:p>
@@ -26914,17 +26913,14 @@
     </w:p>
     <w:p>
       <w:r>
-        <w:t>El Módulo Centinela es RegTech en el sentido de Arner et al. (2017) y, por evaluar cada publicación antes de exponerla, moderación proactiva (Wang et al., 2026). Sobre un mismo detector, ganar sensibilidad arriesga especificidad, pero ese intercambio no vale entre detectores distintos: la corrección del §6.1.4 elevó el Recall sobre los valores límite de 0,412 a 0,706 con los falsos positivos constantes en 4 (Tabla 10), porque cambió las reglas y no su umbral. En condiciones representativas el módulo equilibra sensibilidad y precisión (0,85), y sus errores son léxicos, lo que orienta la mejora hacia una detección semántica del precio como la de HU8. Warner et al. (2025) agregan una lectura de uso: quien recibe el aviso de un filtro proactivo puede ajustar su redacción a lo que el algoritmo deja pasar, y no a la norma. En Postly ese camino está a la vista en el precio escrito en palabras.</w:t>
-      </w:r>
-    </w:p>
-    <w:p>
-      <w:r>
-        <w:t xml:space="preserve">La comparación entre ambos canales se apoya en bases desiguales. El canal de texto se midió sobre 97 casos controlados y los 29 reales: el texto de los 29 pasó entero por el detector, porque los dos casos clasificados como de canal visual también son mensajes de venta, acompañados de una foto. El de imagen se midió sobre los cuatro de los conjuntos controlados, los 20 del conjunto ampliado (Anexo E.6), los nueve casos difíciles del Anexo E.8 y los 17 casos del estudio de campo que llevaban imagen. A esas bases se suman los </w:t>
-      </w:r>
-      <w:r>
-        <w:lastRenderedPageBreak/>
-        <w:t>cuatro casos de los otros tres flujos —dos de video, uno de carrusel y uno de re-publicación, Anexos E.9 a E.11—, que demuestran cobertura y no desempeño y no entran en ninguna matriz.</w:t>
-      </w:r>
+        <w:t>El Módulo Centinela es RegTech en el sentido de Arner et al. (2017) y moderación proactiva, por evaluar cada publicación antes de exponerla (Wang et al., 2026). Ganar sensibilidad arriesga especificidad sobre un mismo detector, pero no entre detectores distintos: la corrección del §6.1.4 elevó el Recall de 0,412 a 0,706 con los falsos positivos constantes (Tabla 10), porque cambió las reglas y no su umbral. Sus errores son léxicos, lo que orienta la mejora hacia una detección semántica como la de HU8. Warner et al. (2025) advierten que quien recibe el aviso de un filtro proactivo puede ajustar su redacción a lo que el filtro deja pasar; en Postly ese camino es el precio escrito en palabras.</w:t>
+      </w:r>
+    </w:p>
+    <w:p>
+      <w:r>
+        <w:t>La comparación entre canales se apoya en bases desiguales. El textual se midió sobre 97 casos controlados y los 29 reales; el visual, sobre los cuatro casos de imagen de los conjuntos controlados, los 20 del conjunto ampliado, los nueve difíciles y los 17 casos de campo con imagen (Anexos E.6 y E.8). A esas bases se suman los cuatro casos de los otros tres flujos —dos de video, uno de carrusel y uno de re-publicación, Anexos E.9 a E.11—, que demuestran cobertura y no desempeño.</w:t>
+      </w:r>
+      <w:r/>
     </w:p>
     <w:p>
       <w:r>
@@ -26951,7 +26947,7 @@
     </w:p>
     <w:p>
       <w:r>
-        <w:t>La normalización multimedia (§4.4) es una decisión de diseño y no una exigencia de la plataforma: Meta admite para un Reel duraciones y proporciones más amplias (Meta for Developers, s.f.), y Postly fuerza un único formato para simplificar el procesamiento. El costo es que el recorte a 60 s descarta contenido y el recorte a 9:16 puede eliminar una placa pegada a un borde, lo que motivó la regla «bloquear o avisar» (§4.3.1). La literatura sobre visibilidad algorítmica documenta que el alcance depende de decisiones opacas de la plataforma (Bucher, 2012; Cotter, 2019; Stegeman et al., 2024), pero no estudia especificaciones de formato, y este trabajo no midió el efecto de la normalización sobre el alcance.</w:t>
+        <w:t>La normalización multimedia (§4.4) es una decisión de diseño y no una exigencia de Meta, que admite duraciones y proporciones más amplias (Meta for Developers, s.f.). Su costo es descartar contenido al recortar a 60 s y poder eliminar una placa de un borde al recortar a 9:16, lo que motivó la regla «bloquear o avisar» (§4.3.1). La literatura documenta que el alcance depende de decisiones opacas de la plataforma (Bucher, 2012; Cotter, 2019; Stegeman et al., 2024), pero no estudia el formato, y este trabajo no midió ese efecto.</w:t>
       </w:r>
     </w:p>
     <w:p>
@@ -27045,12 +27041,9 @@
     </w:p>
     <w:p>
       <w:r>
-        <w:t xml:space="preserve">Antes de la transferencia va el alcance dentro de la propia marca. Las Pautas definen el mensaje comercial por el acto y no por la cifra: una pieza informativa se vuelve comercial al agregarle una invitación a comprar, sin ningún monto. El </w:t>
-      </w:r>
-      <w:r>
-        <w:lastRenderedPageBreak/>
-        <w:t>Módulo Centinela audita la referencia monetaria, que es una parte de la regla y no la regla entera. Contra la regla completa, su cobertura sobre el corpus de campo es de doce sobre veinticinco, y hasta el 19 de septiembre de 2026 el propio generador introducía la solicitud en cada copy (§6.1.3; Anexo E.12). A las cuatro materias que el módulo no audita —las afirmaciones de ingresos, las referencias a productos de terceros, la afiliación con eventos y el uso de imágenes de la Compañía— hay que sumar, por lo tanto, la solicitud comercial sin precio. El uso de imágenes de la Compañía no es además sólo una materia ajena al detector: el recorte de video, el relleno a 1:1 de la imagen única (§4.4.2) y la re-publicación modifican y redistribuyen material de la marca.</w:t>
-      </w:r>
+        <w:t>Antes de la transferencia va el alcance dentro de la propia marca. Las Pautas definen el mensaje comercial por el acto y no por la cifra, y el Módulo Centinela audita sólo la referencia monetaria. Su cobertura sobre el corpus de campo es de doce sobre veinticinco, y hasta el 19 de septiembre de 2026 el generador introducía la solicitud en cada copy (§6.1.3). A las cuatro materias que el módulo no audita —las afirmaciones de ingresos, las referencias a productos de terceros, la afiliación con eventos y el uso de imágenes de la Compañía— hay que sumar, por lo tanto, la solicitud comercial sin precio. Y el uso de imágenes de la Compañía no le es del todo ajeno al sistema: el recorte de video, el relleno a 1:1 y la re-publicación modifican y redistribuyen material de la marca.</w:t>
+      </w:r>
+      <w:r/>
     </w:p>
     <w:p>
       <w:r>
@@ -27170,7 +27163,7 @@
         <w:rPr>
           <w:bCs/>
         </w:rPr>
-        <w:t xml:space="preserve"> el objetivo se cumplió en la integración, y sus otras tres capacidades tienen una primera evaluación con dos evaluadores externos (Anexo E.14). En calidad del copy, Postly fue preferido frente a un generador genérico en los 8 productos del Estudio 1, sin afirmaciones no verificables contra la foto, y frente al trabajo manual de las ocho participantes en 26 de 32 pares del Estudio 4. El tono pedido se reconoció en 22 de 24 asignaciones (91,7 %), por encima del umbral del 60 % declarado de antemano. El orden del carrusel fue preferido en 6 de 7 carruseles de dos imágenes frente al manual y en 6 de 8 conjuntos frente al de envío, sin significancia estadística (binomial exacta bilateral: p = 0,125 y p = 0,289). Con un único evaluador por estudio, los intervalos describen la variación entre ítems y no entre evaluadores.</w:t>
+        <w:t xml:space="preserve"> el objetivo se cumplió en la integración, y sus otras tres capacidades tienen una primera evaluación favorable, a ciegas y con un único evaluador por estudio (§6.1.8). El copy de Postly fue preferido frente a un generador genérico y frente al trabajo manual, y el tono pedido se reconoció en 22 de 24 asignaciones. El orden del carrusel fue preferido sin significancia estadística (binomial exacta bilateral: p = 0,125 y p = 0,289).</w:t>
       </w:r>
     </w:p>
     <w:p>
@@ -27200,7 +27193,7 @@
           <w:i/>
           <w:iCs/>
         </w:rPr>
-        <w:t xml:space="preserve"> el objetivo, diferencial del sistema, se cumplió con alcance acotado. La cascada de expresiones regulares y la lectura visual bloquean la referencia monetaria, y el sistema fuerza la firma corporativa: Postly reduce la exposición de la consultora a incumplir la regla de mensaje comercial, que las Pautas no asocian a ninguna consecuencia contractual (§3.7.4; Anexo D). Contra la regla completa no es efectivo: no detecta la solicitud de compra sin cifra, que el generador produjo en cada copy hasta el 19 de septiembre de 2026 (§6.1.3; Anexo E.12), y su cobertura sobre el corpus de campo es de doce sobre veinticinco. Tampoco calza exactamente con la fuente en las dos redes: en Facebook bloquea lo que la página de negocios admite, y en Instagram opera sobre una cuenta que las Pautas no contemplan como página de negocios (Anexo D).</w:t>
+        <w:t xml:space="preserve"> el objetivo, diferencial del sistema, se cumplió con alcance acotado. El módulo bloquea la referencia monetaria y el sistema fuerza la firma corporativa, lo que reduce la exposición de la consultora a incumplir la regla de mensaje comercial, que las Pautas no asocian a ninguna consecuencia contractual (§3.7.4). Contra la regla completa no es efectivo: no detecta la solicitud de compra sin cifra, y su cobertura sobre el corpus de campo es de doce sobre veinticinco (§6.1.3). Tampoco calza exactamente con la fuente en las dos redes: en Facebook bloquea lo que la página de negocios admite, y en Instagram opera sobre una cuenta que las Pautas no contemplan como página de negocios (Anexo D).</w:t>
       </w:r>
       <w:r>
         <w:rPr>
@@ -27282,7 +27275,7 @@
         <w:spacing w:after="240" w:line="276" w:lineRule="auto"/>
       </w:pPr>
       <w:r>
-        <w:t>En suma, Postly reduce de forma sustantiva el tramo operativo de la publicación: entre un 71 % y un 74 % con el tiempo omitido estimado, en torno al umbral del 70 %, aunque la curación previa del contenido no se automatizó ni se midió. Es además una salvaguarda parcial. Sobre las 29 piezas reales detectó la referencia monetaria sin errores con la etiqueta de los autores (panel A), y su F1 es de 0,923 contra la noción de «publicable» de los etiquetadores (Tabla 5). La solicitud de compra sin cifra queda fuera de su alcance, de modo que reduce la exposición de la consultora sin eliminarla. La arquitectura se validó sobre E1 y corre desde octubre de 2026 sobre E3 (Anexo B.1). Transferirla a otras marcas exigiría rederivar sus reglas de compliance, y llevar la evaluación a una muestra mayor y probabilística es la línea de trabajo siguiente.</w:t>
+        <w:t>En suma, Postly reduce de forma sustantiva el tramo operativo de la publicación, en torno al umbral del 70 %, y es una salvaguarda parcial: detecta la referencia monetaria y deja fuera la solicitud de compra sin cifra, de modo que reduce la exposición de la consultora sin eliminarla. La arquitectura se validó sobre E1 y corre desde octubre de 2026 sobre E3 (Anexo B.1). Transferirla a otras marcas exigiría rederivar sus reglas de compliance, y llevar la evaluación a una muestra mayor y probabilística es la línea de trabajo siguiente.</w:t>
       </w:r>
     </w:p>
     <w:p>
@@ -27356,7 +27349,7 @@
         <w:t>Sustitución del canal textual del Módulo Centinela por un clasificador semántico (Alta Prioridad):</w:t>
       </w:r>
       <w:r>
-        <w:t xml:space="preserve"> el análisis de valores límite delimitó el alcance del enfoque léxico. De sus defectos, sólo la polisemia de términos como «rebaja» o «económica» es inherente al método; el precio en palabras puede cubrirse enumerando numerales, a costa de nuevos falsos positivos y de más deuda en una cascada que ya tiene seis reglas. Se recomienda reemplazarla por un clasificador semántico, el mismo modelo multimodal que ya audita las imágenes en HU8. Falcão y Canedo (2026) dan un antecedente sobre otro objeto, la detección de datos personales en una tubería de software, con el mismo problema de forma: un detector que corre sobre cada artefacto antes de que salga. El canal de imagen calibra la recomendación, con un F1 de 1,00 sobre los 20 casos del conjunto ampliado (Tabla 12) y de 0,83 sobre los nueve difíciles; el 0,94 agregado depende de una proporción elegida por los autores. En las dos clases en que falla el detector léxico —el precio sin la forma esperada y el número que no es precio— el modelo acertó un caso y dos de tres: indican que las maneja, no lo miden.</w:t>
+        <w:t xml:space="preserve"> el análisis de valores límite mostró que sólo la polisemia de términos como «rebaja» o «económica» es inherente al enfoque léxico. El precio en palabras puede cubrirse con más reglas, a costa de nuevos falsos positivos y de más deuda en la cascada. Se recomienda reemplazarla por un clasificador semántico, el mismo modelo multimodal que ya audita las imágenes, en la línea de lo que Falcão y Canedo (2026) comparan para detectar datos personales en una tubería de software. El canal de imagen calibra la recomendación: un F1 de 1,00 sobre los 20 casos del conjunto ampliado (Tabla 12) y de 0,83 sobre los nueve difíciles, y aciertos en las dos clases en que falla el detector léxico, que indican que el modelo las maneja sin medirlo.</w:t>
       </w:r>
     </w:p>
     <w:p>
@@ -27384,7 +27377,7 @@
         <w:t>Gobernar el llamado a la acción que genera el sistema (Prioridad Alta, aplicada):</w:t>
       </w:r>
       <w:r>
-        <w:t xml:space="preserve"> hasta el 19 de septiembre de 2026 los cuatro prompts exigían cerrar los copys con una invitación a contactar, que según la fuente convierte un mensaje informativo en comercial (§6.1.3; Anexo D). Se invirtió la regla en los cuatro prompts (Anexo E.12). Quedan tres pendientes. El primero es conservar el llamado a la acción sólo en la ruta de Facebook, que la fuente autoriza en la página de negocios (Anexo D, p. 1), lo que exige generar dos textos por publicación. El segundo, detectar la solicitud de compra sin cifra cuando la escribe la usuaria al editar. El tercero, hacer opcional la línea de contacto —ya se guarda por usuaria (§7.7)— y preguntar a la Compañía si un contacto al pie de un mensaje informativo lo vuelve comercial.</w:t>
+        <w:t xml:space="preserve"> hasta el 19 de septiembre de 2026 los cuatro prompts exigían cerrar los copys con una invitación a contactar, y la regla se invirtió (Anexo E.12). Quedan pendientes conservar el llamado a la acción sólo en Facebook, que la fuente autoriza en la página de negocios (Anexo D, p. 1); detectar la solicitud de compra sin cifra cuando la escribe la usuaria; y hacer opcional la línea de contacto, que ya se guarda por usuaria (§7.7), consultando a la Compañía si la vuelve comercial.</w:t>
       </w:r>
       <w:r/>
     </w:p>

</xml_diff>

<commit_message>
docs(tesis): N-03 y N-10, consentimientos formalizados y fecha del ejemplar de las Pautas (pasadas 193 y 193b)
3.7.6 y E.4: los dos evaluadores externos, las tres autoras del corpus y quien
aporto R01 firmaron un consentimiento escrito retroactivo a comienzos de octubre
de 2026. Anexo D y referencia: el ejemplar se adjunta a la entrega, y sus
metadatos dan la fecha del archivo (11-04-2019, 'Social-Media-Guidelines-
(Spanish)'), que no es la de la norma.

Co-Authored-By: Claude Opus 5.5 <noreply@anthropic.com>
</commit_message>
<xml_diff>
--- a/avance/Tesis Postly Bontorno Hassan-1 v2.docx
+++ b/avance/Tesis Postly Bontorno Hassan-1 v2.docx
@@ -17426,8 +17426,7 @@
         <w:t xml:space="preserve">El piloto obtuvo consentimiento verbal de sus tres consultoras. Se les explicó el objetivo académico de la medición, que los tiempos y las respuestas se </w:t>
       </w:r>
       <w:r>
-        <w:lastRenderedPageBreak/>
-        <w:t>publicarían de forma agregada y que su identidad no aparecería: la planilla sólo registra C1, C2 y C3 en esa ronda (Anexo E.2). No se recogió un consentimiento escrito, y esa es una carencia del procedimiento y no una decisión justificable por la escala del estudio. En la ampliación, las ocho participantes firmaron un consentimiento informado por escrito antes de la sesión, incluidas las tres del piloto, cuyo consentimiento verbal original no cubría la sesión nueva (protocolo de la ampliación, §7). El evaluador externo del corpus de campo, ajeno al cronometraje, no firmó un consentimiento escrito: participó bajo el acuerdo verbal del piloto.</w:t>
+        <w:t>publicarían de forma agregada y que su identidad no aparecería: la planilla sólo registra C1, C2 y C3 en esa ronda (Anexo E.2). No se recogió un consentimiento escrito, y esa es una carencia del procedimiento y no una decisión justificable por la escala del estudio. En la ampliación, las ocho participantes firmaron un consentimiento informado por escrito antes de la sesión, incluidas las tres del piloto, cuyo consentimiento verbal original no cubría la sesión nueva (protocolo de la ampliación, §7). El evaluador externo del corpus de campo, ajeno al cronometraje, participó bajo el acuerdo verbal del piloto. Ese acuerdo, y el de quienes aportaron el material del corpus y del caso R01, se formalizó por escrito a comienzos de octubre de 2026. Los dos evaluadores externos, las tres autoras del corpus y la consultora que aportó R01 firmaron un consentimiento retroactivo que describe su participación y el uso de su material, y que queda en poder de los autores sin publicarse.</w:t>
       </w:r>
     </w:p>
     <w:p>
@@ -29636,7 +29635,7 @@
         </w:rPr>
       </w:pPr>
       <w:r>
-        <w:t>Mary Kay Inc. (s.f.). Pautas Mary Kay para el uso en los medios sociales [Documento corporativo dirigido a las Consultoras de Belleza Independientes, 10 pp.; ejemplar entregado a la cátedra. Circula una edición pública de nueve páginas con otra redacción y otra paginación (Anexo D)].</w:t>
+        <w:t>Mary Kay Inc. (s.f.). Pautas Mary Kay para el uso en los medios sociales [Documento corporativo dirigido a las Consultoras de Belleza Independientes, 10 pp.; ejemplar adjunto a esta entrega, en un archivo generado el 11 de abril de 2019. Circula una edición pública de nueve páginas con otra redacción y otra paginación (Anexo D)].</w:t>
       </w:r>
     </w:p>
     <w:p>
@@ -33482,7 +33481,7 @@
     </w:p>
     <w:p>
       <w:r>
-        <w:t>El ejemplar consultado se entrega como material de respaldo a la cátedra junto con este trabajo, sin publicarse en el repositorio: son diez páginas dirigidas a las Consultoras de Belleza Independientes. La regla (a) está en su letra. Las Pautas definen el mensaje comercial como los «anuncios, incluyendo (1) mensajes que incluyen suficiente información para que una persona tome la decisión de comprar un producto/comprar contigo (por ejemplo: precios de productos, descuentos, ofertas especiales, regalos, rifas…)» (p. 3). Y fijan el canal: «aunque no puedes compartir un mensaje comercial con el público general, puedes compartir un mensaje comercial con tus clientas o clientas potenciales siempre y cuando sea solo por vía de un mecanismo privado» (p. 4). El documento precisa además que «una página personal en Facebook no es un mecanismo privado» (p. 4), que es la razón por la que el módulo audita el feed y no la conversación.</w:t>
+        <w:t>El ejemplar consultado se adjunta a esta entrega como material de respaldo, sin publicarse en el repositorio: son diez páginas dirigidas a las Consultoras de Belleza Independientes. La regla (a) está en su letra. Las Pautas definen el mensaje comercial como los «anuncios, incluyendo (1) mensajes que incluyen suficiente información para que una persona tome la decisión de comprar un producto/comprar contigo (por ejemplo: precios de productos, descuentos, ofertas especiales, regalos, rifas…)» (p. 3). Y fijan el canal: «aunque no puedes compartir un mensaje comercial con el público general, puedes compartir un mensaje comercial con tus clientas o clientas potenciales siempre y cuando sea solo por vía de un mecanismo privado» (p. 4). El documento precisa además que «una página personal en Facebook no es un mecanismo privado» (p. 4), que es la razón por la que el módulo audita el feed y no la conversación.</w:t>
       </w:r>
     </w:p>
     <w:p>
@@ -33543,7 +33542,7 @@
     </w:p>
     <w:p>
       <w:r>
-        <w:t>La limitación que queda en pie es acotada. El ejemplar consultado no lleva fecha ni número de versión, de modo que no puede establecerse si es el vigente ni si la Compañía emitió actualizaciones posteriores; el propio documento remite a secciones de «Información legal» de Mary Kay InTouch que no se consultaron. Hubo una versión de acceso público en marykay.sv, que al 28 de septiembre de 2026 el sitio ya no sirve. Circula en Scribd una edición del mismo documento, de nueve páginas y titulada «Pautas Mary Kay para uso de las redes sociales» (https://es.scribd.com/document/453413937/pautas-redes-sociales-en-mary-kay). Contiene las mismas reglas con otra redacción y otra paginación: dice «Contrato» donde este ejemplar dice «Acuerdo» de Consultora, «asegurar/garantizar» por «aseguran/garantizan» y «de ninguna manera» por «en modo alguno». Las citas y las páginas de este trabajo son las del ejemplar de diez páginas. Y el alcance del Módulo Centinela es deliberadamente menor que el de la norma. Las Pautas regulan también las afirmaciones de ingresos, las referencias a productos de terceros, la afiliación con eventos y el uso de imágenes de la Compañía: materias que el módulo no audita y que el Capítulo 7 declara fuera del alcance del sistema, bajo «Transferibilidad».</w:t>
+        <w:t>La limitación que queda en pie es acotada. El ejemplar consultado no lleva fecha ni número de versión en su texto. Sus metadatos registran que el archivo se generó el 11 de abril de 2019, con el título interno «Social-Media-Guidelines-(Spanish)». Es la fecha del archivo y no la de la norma, de modo que no puede establecerse si es el vigente ni si la Compañía emitió actualizaciones posteriores; el propio documento remite a secciones de «Información legal» de Mary Kay InTouch que no se consultaron. Hubo una versión de acceso público en marykay.sv, que al 28 de septiembre de 2026 el sitio ya no sirve. Circula en Scribd una edición del mismo documento, de nueve páginas y titulada «Pautas Mary Kay para uso de las redes sociales» (https://es.scribd.com/document/453413937/pautas-redes-sociales-en-mary-kay). Contiene las mismas reglas con otra redacción y otra paginación: dice «Contrato» donde este ejemplar dice «Acuerdo» de Consultora, «asegurar/garantizar» por «aseguran/garantizan» y «de ninguna manera» por «en modo alguno». Las citas y las páginas de este trabajo son las del ejemplar de diez páginas. Y el alcance del Módulo Centinela es deliberadamente menor que el de la norma. Las Pautas regulan también las afirmaciones de ingresos, las referencias a productos de terceros, la afiliación con eventos y el uso de imágenes de la Compañía: materias que el módulo no audita y que el Capítulo 7 declara fuera del alcance del sistema, bajo «Transferibilidad».</w:t>
       </w:r>
     </w:p>
     <w:p>
@@ -36409,7 +36408,7 @@
         <w:jc w:val="both"/>
       </w:pPr>
       <w:r>
-        <w:t>Ese segundo registro no es abierto, y las razones y el costo son los que siguen. El material gráfico de base es arte comercial oficial de la marca, y las placas de precio de los casos infractores las compusieron los autores sobre él: las Pautas prohíben modificar ese material «en modo alguno» (Anexo D, p. 8), de modo que los autores no están en condiciones de otorgar una licencia de redistribución. Los veintinueve textos del corpus los redactaron participantes identificables, con un consentimiento verbal circunscripto a esta evaluación (Anexo E.2). El costo no es el mismo para todas las tablas. Con el registro abierto solo, un lector recomputa desde el dato crudo todas las matrices del Capítulo 6 salvo la Tabla 5, cuyo dato es el corpus de campo. Los conjuntos de imagen de los Anexos E.6 y E.8 sí los recomputa, porque sus archivos de resultados viajan al registro abierto con el veredicto y la justificación de cada caso. Lo que ese nivel no permite es volver a ejecutar el canal visual, que exige las imágenes. La verificación de los CSV recorre esa frontera sin ambigüedad: corrido sobre el registro abierto declara omitida la Tabla 5 y recomputa el resto. La fuente normativa no se deposita en ninguno de los dos registros, por tratarse de material corporativo de un tercero; el Anexo D transcribe con su página las dos reglas sobre las que se construye el módulo.</w:t>
+        <w:t>Ese segundo registro no es abierto, y las razones y el costo son los que siguen. El material gráfico de base es arte comercial oficial de la marca, y las placas de precio de los casos infractores las compusieron los autores sobre él: las Pautas prohíben modificar ese material «en modo alguno» (Anexo D, p. 8), de modo que los autores no están en condiciones de otorgar una licencia de redistribución. Los veintinueve textos del corpus los redactaron participantes identificables, con un consentimiento verbal circunscripto a esta evaluación y formalizado por escrito en octubre de 2026 (§3.7.6). El costo no es el mismo para todas las tablas. Con el registro abierto solo, un lector recomputa desde el dato crudo todas las matrices del Capítulo 6 salvo la Tabla 5, cuyo dato es el corpus de campo. Los conjuntos de imagen de los Anexos E.6 y E.8 sí los recomputa, porque sus archivos de resultados viajan al registro abierto con el veredicto y la justificación de cada caso. Lo que ese nivel no permite es volver a ejecutar el canal visual, que exige las imágenes. La verificación de los CSV recorre esa frontera sin ambigüedad: corrido sobre el registro abierto declara omitida la Tabla 5 y recomputa el resto. La fuente normativa no se deposita en ninguno de los dos registros, por tratarse de material corporativo de un tercero; el Anexo D transcribe con su página las dos reglas sobre las que se construye el módulo.</w:t>
       </w:r>
     </w:p>
     <w:p>

</xml_diff>

<commit_message>
docs(tesis): N-03, arte de la marca difuminado en las Figuras 12 a 15 (pasada 194)
Las Pautas prohiben modificar el material de la Compania, y las capturas lo
mostraban con placas de precio compuestas por los autores. Quedan nitidas la
placa o etiqueta de precio (12, 13), las especificaciones tecnicas (15) y los
mensajes del bot; la 14 se difumina entera. Razon en cada nota y en 3.7.6.

Co-Authored-By: Claude Opus 5.5 <noreply@anthropic.com>
</commit_message>
<xml_diff>
--- a/avance/Tesis Postly Bontorno Hassan-1 v2.docx
+++ b/avance/Tesis Postly Bontorno Hassan-1 v2.docx
@@ -17434,7 +17434,7 @@
         <w:spacing w:before="240" w:after="240"/>
       </w:pPr>
       <w:r>
-        <w:t>El banco de casos del canal visual se compuso sobre material gráfico oficial de la marca, y las Pautas que este mismo trabajo invoca prohíben modificar esas imágenes «en modo alguno» (Anexo D, p. 8). Ninguna de esas composiciones se publicó: su destino fue un banco de pruebas. La excepción es el caso del Anexo E.11, donde para ejercitar el flujo de re-publicación hubo que publicar a mano, en una cuenta real, una pieza con precio compuesta sobre arte de la marca. Es la conducta que el Módulo Centinela existe para impedir. Se hizo al solo efecto de esa prueba y se retiró la publicación una vez ejecutada, pero hubo difusión efectiva y corresponde decirlo.</w:t>
+        <w:t>El banco de casos del canal visual se compuso sobre material gráfico oficial de la marca, y las Pautas que este mismo trabajo invoca prohíben modificar esas imágenes «en modo alguno» (Anexo D, p. 8). Ninguna de esas composiciones se publicó: su destino fue un banco de pruebas. La excepción es el caso del Anexo E.11, donde para ejercitar el flujo de re-publicación hubo que publicar a mano, en una cuenta real, una pieza con precio compuesta sobre arte de la marca. Es la conducta que el Módulo Centinela existe para impedir. Se hizo al solo efecto de esa prueba y se retiró la publicación una vez ejecutada, pero hubo difusión efectiva y corresponde decirlo. En las Figuras 12 a 15, que muestran ese material, el arte de la marca se presenta difuminado.</w:t>
       </w:r>
     </w:p>
     <w:p>
@@ -23907,7 +23907,7 @@
           <w:i/>
           <w:sz w:val="20"/>
         </w:rPr>
-        <w:t>Nota. Fuente: captura de pantalla del sistema sobre el entorno E2 (Anexo B.1).</w:t>
+        <w:t>Nota. Fuente: captura de pantalla del sistema sobre el entorno E2 (Anexo B.1). El arte de la marca aparece difuminado, porque las Pautas prohíben modificar el material de la Compañía (Anexo D, p. 8); quedan nítidas la placa de precio que compusieron los autores y la respuesta del bot.</w:t>
       </w:r>
     </w:p>
     <w:p>
@@ -24062,7 +24062,7 @@
           <w:i/>
           <w:sz w:val="20"/>
         </w:rPr>
-        <w:t>Nota. Fuente: captura de pantalla del sistema sobre el entorno E2 (Anexo B.1).</w:t>
+        <w:t>Nota. Fuente: captura de pantalla del sistema sobre el entorno E2 (Anexo B.1). El arte de la marca aparece difuminado, porque las Pautas prohíben modificar el material de la Compañía (Anexo D, p. 8); quedan nítidas la etiqueta de precio que compusieron los autores y la respuesta del bot.</w:t>
       </w:r>
     </w:p>
     <w:p>
@@ -24215,8 +24215,7 @@
           <w:i/>
           <w:sz w:val="20"/>
         </w:rPr>
-        <w:lastRenderedPageBreak/>
-        <w:t>Nota. Fuente: captura de pantalla del sistema sobre el entorno E2 (Anexo B.1). La captura es anterior a la corrección del llamado a la acción (Anexo E.12): la opción «Informativa» que muestra cierra con hashtags y sin invitación a contactar, pese a que el prompt vigente en ese momento la exigía.</w:t>
+        <w:t>Nota. Fuente: captura de pantalla del sistema sobre el entorno E2 (Anexo B.1). La captura es anterior a la corrección del llamado a la acción (Anexo E.12): la opción «Informativa» que muestra cierra con hashtags y sin invitación a contactar, pese a que el prompt vigente en ese momento la exigía. El arte de la marca aparece difuminado, porque las Pautas prohíben modificar el material de la Compañía (Anexo D, p. 8); quedan nítidos los copys generados, que es lo que la figura muestra.</w:t>
       </w:r>
     </w:p>
     <w:p>
@@ -24380,7 +24379,7 @@
           <w:i/>
           <w:sz w:val="20"/>
         </w:rPr>
-        <w:t>Nota. Fuente: captura de pantalla del sistema sobre el entorno E2 (Anexo B.1).</w:t>
+        <w:t>Nota. Fuente: captura de pantalla del sistema sobre el entorno E2 (Anexo B.1). El arte de la marca aparece difuminado, porque las Pautas prohíben modificar el material de la Compañía (Anexo D, p. 8); quedan nítidas las especificaciones técnicas y la respuesta del bot.</w:t>
       </w:r>
     </w:p>
     <w:p>

</xml_diff>

<commit_message>
docs(tesis): Anexo E.2 con los 32 pares en centesimas; el Wilcoxon se recalcula desde el texto (pasada 195)
La transcripcion redondeada al segundo daba 0,039 y 0,156 donde la tesis informa
0,027 y 0,191 (N-26 de la auditoria 15). Ahora se transcribe con la precision de
la planilla, generada desde Cronometraje_datos_v2.csv. Comprobado: una planilla
armada solo con el texto del anexo reproduce p = 0,004, 0,027 y 0,191.

Co-Authored-By: Claude Opus 5.5 <noreply@anthropic.com>
</commit_message>
<xml_diff>
--- a/avance/Tesis Postly Bontorno Hassan-1 v2.docx
+++ b/avance/Tesis Postly Bontorno Hassan-1 v2.docx
@@ -36237,11 +36237,10 @@
         <w:jc w:val="both"/>
       </w:pPr>
       <w:r>
-        <w:t xml:space="preserve">Los 32 pares se transcriben aquí, para que el contraste del §6.1 sea recalculable sin acceder al depósito. En minutos y segundos, adaptación / manual / Postly según el cronómetro / intervalo registrado por el motor entre la llegada de la primera foto y el fin de la publicación, en las cuatro publicaciones de cada participante. El tiempo de Postly que se analiza es el mayor de los dos últimos (§6.1.6). C1: 2:05/8:43/1:26/1:50, 1:58/9:34/0:59/1:22, 3:15/10:42/2:12/2:26, 2:52/12:34/1:54/1:39. C2: 2:11/7:13/1:52/1:03, 1:35/8:41/0:47/0:51, 2:54/11:45/2:19/2:39, 2:22/10:13/1:32/1:26. C3: 1:12/7:53/0:53/1:37, 1:02/8:43/0:50/1:02, 2:44/9:15/1:05/1:31, 2:19/9:55/1:36/1:52. C4: 2:53/13:55/2:23/1:14, 2:03/11:48/1:57/1:37, 3:55/10:59/2:23/1:24, 3:32/15:32/1:56/1:45. C5: 1:22/9:34/1:10/1:01, 1:42/10:10/0:52/1:02, </w:t>
-      </w:r>
-      <w:r>
-        <w:lastRenderedPageBreak/>
-        <w:t>0:59/10:13/0:56/1:30, 1:41/7:52/0:59/1:34. C6: 0:54/6:23/0:49/0:51, 1:13/7:50/0:53/1:56, 1:37/7:06/1:19/1:54, 1:58/8:14/1:02/2:06. C7: 0:43/8:07/1:08/1:17, 0:52/7:44/0:56/1:39, 0:58/8:25/1:37/1:38, 0:49/7:18/1:23/3:10. C8: 0:33/7:51/0:53/1:02, 0:26/7:22/1:18/1:01, 0:49/8:48/1:10/1:41, 0:42/8:19/1:01/2:00. El intervalo del motor sale del historial de ejecuciones de E2, del par 630-631 (C1, primera publicación) al 764-767 (C8, cuarta); la planilla registra el par de cada fila. En las dos publicaciones con un intento fallido —un carrusel de C6 y otro de C8— se descuenta la ventana del intento que falló.</w:t>
+        <w:t>Los 32 pares se transcriben aquí, para que el contraste del §6.1 sea recalculable sin acceder al depósito. En minutos, segundos y centésimas, la precisión de la planilla con que se calculan los contrastes, adaptación / manual / Postly según el cronómetro / intervalo registrado por el motor entre la llegada de la primera foto y el fin de la publicación, en las cuatro publicaciones de cada participante. El tiempo de Postly que se analiza es el mayor de los dos últimos (§6.1.6). C1: 2:04,70/8:43,43/1:26,06/1:50,18, 1:58,24/9:34,22/0:58,84/1:21,75, 3:14,96/10:41,67/2:12,01/2:26,02, 2:52,01/12:33,91/1:53,81/1:38,66. C2: 2:11,20/7:13,22/1:51,59/1:02,98, 1:34,81/8:41,19/0:47,12/0:50,69, 2:54,12/11:44,82/2:18,71/2:38,59, 2:22,41/10:12,51/1:32,35/1:26,09. C3: 1:12,12/7:52,61/0:52,51/1:36,63, 1:01,72/8:42,51/0:49,61/1:01,88, 2:43,56/9:15,23/1:05,13/1:30,61, 2:18,82/9:55,12/1:36,31/1:52,17. C4: 2:52,89/13:54,66/2:22,88/1:14,49, 2:03,11/11:47,77/1:57,21/1:36,68, 3:55,23/10:59,29/2:22,91/1:24,13, 3:31,82/15:32,11/1:56,33/1:45,05. C5: 1:21,77/9:33,76/1:10,11/1:01,20, 1:41,80/10:09,62/0:52,20/1:02,12, 0:58,86/10:12,91/0:56,30/1:29,77, 1:41,36/7:51,87/0:59,21/1:34,15. C6: 0:54,38/6:23,47/0:49,23/0:51,38, 1:12,85/7:49,91/0:53,41/1:55,50, 1:37,04/7:05,62/1:18,63/1:54,11, 1:58,21/8:14,08/1:02,18/2:05,94. C7: 0:43,18/8:06,53/1:08,47/1:16,58, 0:52,29/7:44,19/0:56,24/1:39,32, 0:57,94/8:24,87/1:36,89/1:38,34, 0:48,65/7:18,42/1:23,15/3:10,34. C8: 0:33,18/7:51,48/0:52,84/1:01,95, 0:26,43/7:22,15/1:17,56/1:00,78, 0:48,92/8:47,62/1:09,72/1:41,34, 0:41,75/8:19,34/1:01,39/1:59,90.</w:t>
+      </w:r>
+      <w:r>
+        <w:t xml:space="preserve"> El intervalo del motor sale del historial de ejecuciones de E2, del par 630-631 (C1, primera publicación) al 764-767 (C8, cuarta); la planilla registra el par de cada fila. Desde estos valores se reproducen las pruebas del §6.1.6, incluida la de rangos con signo (p = 0,004, 0,027 y 0,191). En las dos publicaciones con un intento fallido —un carrusel de C6 y otro de C8— se descuenta la ventana del intento que falló.</w:t>
       </w:r>
     </w:p>
     <w:p>

</xml_diff>

<commit_message>
docs(tesis): pasada 235, consentimiento escrito de la consultora que aporto los videos del E.9 (salvedad de N-03)
Co-Authored-By: Claude Opus 5.5 <noreply@anthropic.com>
</commit_message>
<xml_diff>
--- a/avance/Tesis Postly Bontorno Hassan-1 v2.docx
+++ b/avance/Tesis Postly Bontorno Hassan-1 v2.docx
@@ -316,7 +316,7 @@
       <w:r>
         <w:fldChar w:fldCharType="separate"/>
       </w:r>
-      <w:hyperlink w:anchor="_Toc242136718" w:history="1">
+      <w:hyperlink w:anchor="_Toc242137117" w:history="1">
         <w:r>
           <w:rPr>
             <w:rStyle w:val="Hyperlink"/>
@@ -339,7 +339,7 @@
           <w:rPr>
             <w:webHidden/>
           </w:rPr>
-          <w:instrText xml:space="preserve"> PAGEREF _Toc242136718 \h </w:instrText>
+          <w:instrText xml:space="preserve"> PAGEREF _Toc242137117 \h </w:instrText>
         </w:r>
         <w:r>
           <w:rPr>
@@ -378,7 +378,7 @@
           <w14:ligatures w14:val="standardContextual"/>
         </w:rPr>
       </w:pPr>
-      <w:hyperlink w:anchor="_Toc242136719" w:history="1">
+      <w:hyperlink w:anchor="_Toc242137118" w:history="1">
         <w:r>
           <w:rPr>
             <w:rStyle w:val="Hyperlink"/>
@@ -401,7 +401,7 @@
           <w:rPr>
             <w:webHidden/>
           </w:rPr>
-          <w:instrText xml:space="preserve"> PAGEREF _Toc242136719 \h </w:instrText>
+          <w:instrText xml:space="preserve"> PAGEREF _Toc242137118 \h </w:instrText>
         </w:r>
         <w:r>
           <w:rPr>
@@ -442,7 +442,7 @@
           <w14:ligatures w14:val="standardContextual"/>
         </w:rPr>
       </w:pPr>
-      <w:hyperlink w:anchor="_Toc242136720" w:history="1">
+      <w:hyperlink w:anchor="_Toc242137119" w:history="1">
         <w:r>
           <w:rPr>
             <w:rStyle w:val="Hyperlink"/>
@@ -469,7 +469,7 @@
             <w:noProof/>
             <w:webHidden/>
           </w:rPr>
-          <w:instrText xml:space="preserve"> PAGEREF _Toc242136720 \h </w:instrText>
+          <w:instrText xml:space="preserve"> PAGEREF _Toc242137119 \h </w:instrText>
         </w:r>
         <w:r>
           <w:rPr>
@@ -514,7 +514,7 @@
           <w14:ligatures w14:val="standardContextual"/>
         </w:rPr>
       </w:pPr>
-      <w:hyperlink w:anchor="_Toc242136721" w:history="1">
+      <w:hyperlink w:anchor="_Toc242137120" w:history="1">
         <w:r>
           <w:rPr>
             <w:rStyle w:val="Hyperlink"/>
@@ -541,7 +541,7 @@
             <w:noProof/>
             <w:webHidden/>
           </w:rPr>
-          <w:instrText xml:space="preserve"> PAGEREF _Toc242136721 \h </w:instrText>
+          <w:instrText xml:space="preserve"> PAGEREF _Toc242137120 \h </w:instrText>
         </w:r>
         <w:r>
           <w:rPr>
@@ -586,7 +586,7 @@
           <w14:ligatures w14:val="standardContextual"/>
         </w:rPr>
       </w:pPr>
-      <w:hyperlink w:anchor="_Toc242136722" w:history="1">
+      <w:hyperlink w:anchor="_Toc242137121" w:history="1">
         <w:r>
           <w:rPr>
             <w:rStyle w:val="Hyperlink"/>
@@ -613,7 +613,7 @@
             <w:noProof/>
             <w:webHidden/>
           </w:rPr>
-          <w:instrText xml:space="preserve"> PAGEREF _Toc242136722 \h </w:instrText>
+          <w:instrText xml:space="preserve"> PAGEREF _Toc242137121 \h </w:instrText>
         </w:r>
         <w:r>
           <w:rPr>
@@ -658,7 +658,7 @@
           <w14:ligatures w14:val="standardContextual"/>
         </w:rPr>
       </w:pPr>
-      <w:hyperlink w:anchor="_Toc242136723" w:history="1">
+      <w:hyperlink w:anchor="_Toc242137122" w:history="1">
         <w:r>
           <w:rPr>
             <w:rStyle w:val="Hyperlink"/>
@@ -685,7 +685,7 @@
             <w:noProof/>
             <w:webHidden/>
           </w:rPr>
-          <w:instrText xml:space="preserve"> PAGEREF _Toc242136723 \h </w:instrText>
+          <w:instrText xml:space="preserve"> PAGEREF _Toc242137122 \h </w:instrText>
         </w:r>
         <w:r>
           <w:rPr>
@@ -730,7 +730,7 @@
           <w14:ligatures w14:val="standardContextual"/>
         </w:rPr>
       </w:pPr>
-      <w:hyperlink w:anchor="_Toc242136724" w:history="1">
+      <w:hyperlink w:anchor="_Toc242137123" w:history="1">
         <w:r>
           <w:rPr>
             <w:rStyle w:val="Hyperlink"/>
@@ -757,7 +757,7 @@
             <w:noProof/>
             <w:webHidden/>
           </w:rPr>
-          <w:instrText xml:space="preserve"> PAGEREF _Toc242136724 \h </w:instrText>
+          <w:instrText xml:space="preserve"> PAGEREF _Toc242137123 \h </w:instrText>
         </w:r>
         <w:r>
           <w:rPr>
@@ -802,7 +802,7 @@
           <w14:ligatures w14:val="standardContextual"/>
         </w:rPr>
       </w:pPr>
-      <w:hyperlink w:anchor="_Toc242136725" w:history="1">
+      <w:hyperlink w:anchor="_Toc242137124" w:history="1">
         <w:r>
           <w:rPr>
             <w:rStyle w:val="Hyperlink"/>
@@ -829,7 +829,7 @@
             <w:noProof/>
             <w:webHidden/>
           </w:rPr>
-          <w:instrText xml:space="preserve"> PAGEREF _Toc242136725 \h </w:instrText>
+          <w:instrText xml:space="preserve"> PAGEREF _Toc242137124 \h </w:instrText>
         </w:r>
         <w:r>
           <w:rPr>
@@ -874,7 +874,7 @@
           <w14:ligatures w14:val="standardContextual"/>
         </w:rPr>
       </w:pPr>
-      <w:hyperlink w:anchor="_Toc242136726" w:history="1">
+      <w:hyperlink w:anchor="_Toc242137125" w:history="1">
         <w:r>
           <w:rPr>
             <w:rStyle w:val="Hyperlink"/>
@@ -901,7 +901,7 @@
             <w:noProof/>
             <w:webHidden/>
           </w:rPr>
-          <w:instrText xml:space="preserve"> PAGEREF _Toc242136726 \h </w:instrText>
+          <w:instrText xml:space="preserve"> PAGEREF _Toc242137125 \h </w:instrText>
         </w:r>
         <w:r>
           <w:rPr>
@@ -946,7 +946,7 @@
           <w14:ligatures w14:val="standardContextual"/>
         </w:rPr>
       </w:pPr>
-      <w:hyperlink w:anchor="_Toc242136727" w:history="1">
+      <w:hyperlink w:anchor="_Toc242137126" w:history="1">
         <w:r>
           <w:rPr>
             <w:rStyle w:val="Hyperlink"/>
@@ -973,7 +973,7 @@
             <w:noProof/>
             <w:webHidden/>
           </w:rPr>
-          <w:instrText xml:space="preserve"> PAGEREF _Toc242136727 \h </w:instrText>
+          <w:instrText xml:space="preserve"> PAGEREF _Toc242137126 \h </w:instrText>
         </w:r>
         <w:r>
           <w:rPr>
@@ -1018,7 +1018,7 @@
           <w14:ligatures w14:val="standardContextual"/>
         </w:rPr>
       </w:pPr>
-      <w:hyperlink w:anchor="_Toc242136728" w:history="1">
+      <w:hyperlink w:anchor="_Toc242137127" w:history="1">
         <w:r>
           <w:rPr>
             <w:rStyle w:val="Hyperlink"/>
@@ -1045,7 +1045,7 @@
             <w:noProof/>
             <w:webHidden/>
           </w:rPr>
-          <w:instrText xml:space="preserve"> PAGEREF _Toc242136728 \h </w:instrText>
+          <w:instrText xml:space="preserve"> PAGEREF _Toc242137127 \h </w:instrText>
         </w:r>
         <w:r>
           <w:rPr>
@@ -1090,7 +1090,7 @@
           <w14:ligatures w14:val="standardContextual"/>
         </w:rPr>
       </w:pPr>
-      <w:hyperlink w:anchor="_Toc242136729" w:history="1">
+      <w:hyperlink w:anchor="_Toc242137128" w:history="1">
         <w:r>
           <w:rPr>
             <w:rStyle w:val="Hyperlink"/>
@@ -1117,7 +1117,7 @@
             <w:noProof/>
             <w:webHidden/>
           </w:rPr>
-          <w:instrText xml:space="preserve"> PAGEREF _Toc242136729 \h </w:instrText>
+          <w:instrText xml:space="preserve"> PAGEREF _Toc242137128 \h </w:instrText>
         </w:r>
         <w:r>
           <w:rPr>
@@ -1162,7 +1162,7 @@
           <w14:ligatures w14:val="standardContextual"/>
         </w:rPr>
       </w:pPr>
-      <w:hyperlink w:anchor="_Toc242136730" w:history="1">
+      <w:hyperlink w:anchor="_Toc242137129" w:history="1">
         <w:r>
           <w:rPr>
             <w:rStyle w:val="Hyperlink"/>
@@ -1189,7 +1189,7 @@
             <w:noProof/>
             <w:webHidden/>
           </w:rPr>
-          <w:instrText xml:space="preserve"> PAGEREF _Toc242136730 \h </w:instrText>
+          <w:instrText xml:space="preserve"> PAGEREF _Toc242137129 \h </w:instrText>
         </w:r>
         <w:r>
           <w:rPr>
@@ -1234,7 +1234,7 @@
           <w14:ligatures w14:val="standardContextual"/>
         </w:rPr>
       </w:pPr>
-      <w:hyperlink w:anchor="_Toc242136731" w:history="1">
+      <w:hyperlink w:anchor="_Toc242137130" w:history="1">
         <w:r>
           <w:rPr>
             <w:rStyle w:val="Hyperlink"/>
@@ -1261,7 +1261,7 @@
             <w:noProof/>
             <w:webHidden/>
           </w:rPr>
-          <w:instrText xml:space="preserve"> PAGEREF _Toc242136731 \h </w:instrText>
+          <w:instrText xml:space="preserve"> PAGEREF _Toc242137130 \h </w:instrText>
         </w:r>
         <w:r>
           <w:rPr>
@@ -1306,7 +1306,7 @@
           <w14:ligatures w14:val="standardContextual"/>
         </w:rPr>
       </w:pPr>
-      <w:hyperlink w:anchor="_Toc242136732" w:history="1">
+      <w:hyperlink w:anchor="_Toc242137131" w:history="1">
         <w:r>
           <w:rPr>
             <w:rStyle w:val="Hyperlink"/>
@@ -1333,7 +1333,7 @@
             <w:noProof/>
             <w:webHidden/>
           </w:rPr>
-          <w:instrText xml:space="preserve"> PAGEREF _Toc242136732 \h </w:instrText>
+          <w:instrText xml:space="preserve"> PAGEREF _Toc242137131 \h </w:instrText>
         </w:r>
         <w:r>
           <w:rPr>
@@ -1378,7 +1378,7 @@
           <w14:ligatures w14:val="standardContextual"/>
         </w:rPr>
       </w:pPr>
-      <w:hyperlink w:anchor="_Toc242136733" w:history="1">
+      <w:hyperlink w:anchor="_Toc242137132" w:history="1">
         <w:r>
           <w:rPr>
             <w:rStyle w:val="Hyperlink"/>
@@ -1405,7 +1405,7 @@
             <w:noProof/>
             <w:webHidden/>
           </w:rPr>
-          <w:instrText xml:space="preserve"> PAGEREF _Toc242136733 \h </w:instrText>
+          <w:instrText xml:space="preserve"> PAGEREF _Toc242137132 \h </w:instrText>
         </w:r>
         <w:r>
           <w:rPr>
@@ -1448,7 +1448,7 @@
           <w14:ligatures w14:val="standardContextual"/>
         </w:rPr>
       </w:pPr>
-      <w:hyperlink w:anchor="_Toc242136734" w:history="1">
+      <w:hyperlink w:anchor="_Toc242137133" w:history="1">
         <w:r>
           <w:rPr>
             <w:rStyle w:val="Hyperlink"/>
@@ -1471,7 +1471,7 @@
           <w:rPr>
             <w:webHidden/>
           </w:rPr>
-          <w:instrText xml:space="preserve"> PAGEREF _Toc242136734 \h </w:instrText>
+          <w:instrText xml:space="preserve"> PAGEREF _Toc242137133 \h </w:instrText>
         </w:r>
         <w:r>
           <w:rPr>
@@ -1512,7 +1512,7 @@
           <w14:ligatures w14:val="standardContextual"/>
         </w:rPr>
       </w:pPr>
-      <w:hyperlink w:anchor="_Toc242136735" w:history="1">
+      <w:hyperlink w:anchor="_Toc242137134" w:history="1">
         <w:r>
           <w:rPr>
             <w:rStyle w:val="Hyperlink"/>
@@ -1539,7 +1539,7 @@
             <w:noProof/>
             <w:webHidden/>
           </w:rPr>
-          <w:instrText xml:space="preserve"> PAGEREF _Toc242136735 \h </w:instrText>
+          <w:instrText xml:space="preserve"> PAGEREF _Toc242137134 \h </w:instrText>
         </w:r>
         <w:r>
           <w:rPr>
@@ -1584,7 +1584,7 @@
           <w14:ligatures w14:val="standardContextual"/>
         </w:rPr>
       </w:pPr>
-      <w:hyperlink w:anchor="_Toc242136736" w:history="1">
+      <w:hyperlink w:anchor="_Toc242137135" w:history="1">
         <w:r>
           <w:rPr>
             <w:rStyle w:val="Hyperlink"/>
@@ -1611,7 +1611,7 @@
             <w:noProof/>
             <w:webHidden/>
           </w:rPr>
-          <w:instrText xml:space="preserve"> PAGEREF _Toc242136736 \h </w:instrText>
+          <w:instrText xml:space="preserve"> PAGEREF _Toc242137135 \h </w:instrText>
         </w:r>
         <w:r>
           <w:rPr>
@@ -1656,7 +1656,7 @@
           <w14:ligatures w14:val="standardContextual"/>
         </w:rPr>
       </w:pPr>
-      <w:hyperlink w:anchor="_Toc242136737" w:history="1">
+      <w:hyperlink w:anchor="_Toc242137136" w:history="1">
         <w:r>
           <w:rPr>
             <w:rStyle w:val="Hyperlink"/>
@@ -1683,7 +1683,7 @@
             <w:noProof/>
             <w:webHidden/>
           </w:rPr>
-          <w:instrText xml:space="preserve"> PAGEREF _Toc242136737 \h </w:instrText>
+          <w:instrText xml:space="preserve"> PAGEREF _Toc242137136 \h </w:instrText>
         </w:r>
         <w:r>
           <w:rPr>
@@ -1728,7 +1728,7 @@
           <w14:ligatures w14:val="standardContextual"/>
         </w:rPr>
       </w:pPr>
-      <w:hyperlink w:anchor="_Toc242136738" w:history="1">
+      <w:hyperlink w:anchor="_Toc242137137" w:history="1">
         <w:r>
           <w:rPr>
             <w:rStyle w:val="Hyperlink"/>
@@ -1755,7 +1755,7 @@
             <w:noProof/>
             <w:webHidden/>
           </w:rPr>
-          <w:instrText xml:space="preserve"> PAGEREF _Toc242136738 \h </w:instrText>
+          <w:instrText xml:space="preserve"> PAGEREF _Toc242137137 \h </w:instrText>
         </w:r>
         <w:r>
           <w:rPr>
@@ -1798,7 +1798,7 @@
           <w14:ligatures w14:val="standardContextual"/>
         </w:rPr>
       </w:pPr>
-      <w:hyperlink w:anchor="_Toc242136739" w:history="1">
+      <w:hyperlink w:anchor="_Toc242137138" w:history="1">
         <w:r>
           <w:rPr>
             <w:rStyle w:val="Hyperlink"/>
@@ -1821,7 +1821,7 @@
           <w:rPr>
             <w:webHidden/>
           </w:rPr>
-          <w:instrText xml:space="preserve"> PAGEREF _Toc242136739 \h </w:instrText>
+          <w:instrText xml:space="preserve"> PAGEREF _Toc242137138 \h </w:instrText>
         </w:r>
         <w:r>
           <w:rPr>
@@ -1862,7 +1862,7 @@
           <w14:ligatures w14:val="standardContextual"/>
         </w:rPr>
       </w:pPr>
-      <w:hyperlink w:anchor="_Toc242136740" w:history="1">
+      <w:hyperlink w:anchor="_Toc242137139" w:history="1">
         <w:r>
           <w:rPr>
             <w:rStyle w:val="Hyperlink"/>
@@ -1889,7 +1889,7 @@
             <w:noProof/>
             <w:webHidden/>
           </w:rPr>
-          <w:instrText xml:space="preserve"> PAGEREF _Toc242136740 \h </w:instrText>
+          <w:instrText xml:space="preserve"> PAGEREF _Toc242137139 \h </w:instrText>
         </w:r>
         <w:r>
           <w:rPr>
@@ -1934,7 +1934,7 @@
           <w14:ligatures w14:val="standardContextual"/>
         </w:rPr>
       </w:pPr>
-      <w:hyperlink w:anchor="_Toc242136741" w:history="1">
+      <w:hyperlink w:anchor="_Toc242137140" w:history="1">
         <w:r>
           <w:rPr>
             <w:rStyle w:val="Hyperlink"/>
@@ -1961,7 +1961,7 @@
             <w:noProof/>
             <w:webHidden/>
           </w:rPr>
-          <w:instrText xml:space="preserve"> PAGEREF _Toc242136741 \h </w:instrText>
+          <w:instrText xml:space="preserve"> PAGEREF _Toc242137140 \h </w:instrText>
         </w:r>
         <w:r>
           <w:rPr>
@@ -2006,7 +2006,7 @@
           <w14:ligatures w14:val="standardContextual"/>
         </w:rPr>
       </w:pPr>
-      <w:hyperlink w:anchor="_Toc242136742" w:history="1">
+      <w:hyperlink w:anchor="_Toc242137141" w:history="1">
         <w:r>
           <w:rPr>
             <w:rStyle w:val="Hyperlink"/>
@@ -2033,7 +2033,7 @@
             <w:noProof/>
             <w:webHidden/>
           </w:rPr>
-          <w:instrText xml:space="preserve"> PAGEREF _Toc242136742 \h </w:instrText>
+          <w:instrText xml:space="preserve"> PAGEREF _Toc242137141 \h </w:instrText>
         </w:r>
         <w:r>
           <w:rPr>
@@ -2078,7 +2078,7 @@
           <w14:ligatures w14:val="standardContextual"/>
         </w:rPr>
       </w:pPr>
-      <w:hyperlink w:anchor="_Toc242136743" w:history="1">
+      <w:hyperlink w:anchor="_Toc242137142" w:history="1">
         <w:r>
           <w:rPr>
             <w:rStyle w:val="Hyperlink"/>
@@ -2105,7 +2105,7 @@
             <w:noProof/>
             <w:webHidden/>
           </w:rPr>
-          <w:instrText xml:space="preserve"> PAGEREF _Toc242136743 \h </w:instrText>
+          <w:instrText xml:space="preserve"> PAGEREF _Toc242137142 \h </w:instrText>
         </w:r>
         <w:r>
           <w:rPr>
@@ -2150,7 +2150,7 @@
           <w14:ligatures w14:val="standardContextual"/>
         </w:rPr>
       </w:pPr>
-      <w:hyperlink w:anchor="_Toc242136744" w:history="1">
+      <w:hyperlink w:anchor="_Toc242137143" w:history="1">
         <w:r>
           <w:rPr>
             <w:rStyle w:val="Hyperlink"/>
@@ -2177,7 +2177,7 @@
             <w:noProof/>
             <w:webHidden/>
           </w:rPr>
-          <w:instrText xml:space="preserve"> PAGEREF _Toc242136744 \h </w:instrText>
+          <w:instrText xml:space="preserve"> PAGEREF _Toc242137143 \h </w:instrText>
         </w:r>
         <w:r>
           <w:rPr>
@@ -2222,7 +2222,7 @@
           <w14:ligatures w14:val="standardContextual"/>
         </w:rPr>
       </w:pPr>
-      <w:hyperlink w:anchor="_Toc242136745" w:history="1">
+      <w:hyperlink w:anchor="_Toc242137144" w:history="1">
         <w:r>
           <w:rPr>
             <w:rStyle w:val="Hyperlink"/>
@@ -2249,7 +2249,7 @@
             <w:noProof/>
             <w:webHidden/>
           </w:rPr>
-          <w:instrText xml:space="preserve"> PAGEREF _Toc242136745 \h </w:instrText>
+          <w:instrText xml:space="preserve"> PAGEREF _Toc242137144 \h </w:instrText>
         </w:r>
         <w:r>
           <w:rPr>
@@ -2294,7 +2294,7 @@
           <w14:ligatures w14:val="standardContextual"/>
         </w:rPr>
       </w:pPr>
-      <w:hyperlink w:anchor="_Toc242136746" w:history="1">
+      <w:hyperlink w:anchor="_Toc242137145" w:history="1">
         <w:r>
           <w:rPr>
             <w:rStyle w:val="Hyperlink"/>
@@ -2321,7 +2321,7 @@
             <w:noProof/>
             <w:webHidden/>
           </w:rPr>
-          <w:instrText xml:space="preserve"> PAGEREF _Toc242136746 \h </w:instrText>
+          <w:instrText xml:space="preserve"> PAGEREF _Toc242137145 \h </w:instrText>
         </w:r>
         <w:r>
           <w:rPr>
@@ -2366,7 +2366,7 @@
           <w14:ligatures w14:val="standardContextual"/>
         </w:rPr>
       </w:pPr>
-      <w:hyperlink w:anchor="_Toc242136747" w:history="1">
+      <w:hyperlink w:anchor="_Toc242137146" w:history="1">
         <w:r>
           <w:rPr>
             <w:rStyle w:val="Hyperlink"/>
@@ -2393,7 +2393,7 @@
             <w:noProof/>
             <w:webHidden/>
           </w:rPr>
-          <w:instrText xml:space="preserve"> PAGEREF _Toc242136747 \h </w:instrText>
+          <w:instrText xml:space="preserve"> PAGEREF _Toc242137146 \h </w:instrText>
         </w:r>
         <w:r>
           <w:rPr>
@@ -2438,7 +2438,7 @@
           <w14:ligatures w14:val="standardContextual"/>
         </w:rPr>
       </w:pPr>
-      <w:hyperlink w:anchor="_Toc242136748" w:history="1">
+      <w:hyperlink w:anchor="_Toc242137147" w:history="1">
         <w:r>
           <w:rPr>
             <w:rStyle w:val="Hyperlink"/>
@@ -2465,7 +2465,7 @@
             <w:noProof/>
             <w:webHidden/>
           </w:rPr>
-          <w:instrText xml:space="preserve"> PAGEREF _Toc242136748 \h </w:instrText>
+          <w:instrText xml:space="preserve"> PAGEREF _Toc242137147 \h </w:instrText>
         </w:r>
         <w:r>
           <w:rPr>
@@ -2510,7 +2510,7 @@
           <w14:ligatures w14:val="standardContextual"/>
         </w:rPr>
       </w:pPr>
-      <w:hyperlink w:anchor="_Toc242136749" w:history="1">
+      <w:hyperlink w:anchor="_Toc242137148" w:history="1">
         <w:r>
           <w:rPr>
             <w:rStyle w:val="Hyperlink"/>
@@ -2537,7 +2537,7 @@
             <w:noProof/>
             <w:webHidden/>
           </w:rPr>
-          <w:instrText xml:space="preserve"> PAGEREF _Toc242136749 \h </w:instrText>
+          <w:instrText xml:space="preserve"> PAGEREF _Toc242137148 \h </w:instrText>
         </w:r>
         <w:r>
           <w:rPr>
@@ -2582,7 +2582,7 @@
           <w14:ligatures w14:val="standardContextual"/>
         </w:rPr>
       </w:pPr>
-      <w:hyperlink w:anchor="_Toc242136750" w:history="1">
+      <w:hyperlink w:anchor="_Toc242137149" w:history="1">
         <w:r>
           <w:rPr>
             <w:rStyle w:val="Hyperlink"/>
@@ -2609,7 +2609,7 @@
             <w:noProof/>
             <w:webHidden/>
           </w:rPr>
-          <w:instrText xml:space="preserve"> PAGEREF _Toc242136750 \h </w:instrText>
+          <w:instrText xml:space="preserve"> PAGEREF _Toc242137149 \h </w:instrText>
         </w:r>
         <w:r>
           <w:rPr>
@@ -2654,7 +2654,7 @@
           <w14:ligatures w14:val="standardContextual"/>
         </w:rPr>
       </w:pPr>
-      <w:hyperlink w:anchor="_Toc242136751" w:history="1">
+      <w:hyperlink w:anchor="_Toc242137150" w:history="1">
         <w:r>
           <w:rPr>
             <w:rStyle w:val="Hyperlink"/>
@@ -2681,7 +2681,7 @@
             <w:noProof/>
             <w:webHidden/>
           </w:rPr>
-          <w:instrText xml:space="preserve"> PAGEREF _Toc242136751 \h </w:instrText>
+          <w:instrText xml:space="preserve"> PAGEREF _Toc242137150 \h </w:instrText>
         </w:r>
         <w:r>
           <w:rPr>
@@ -2726,7 +2726,7 @@
           <w14:ligatures w14:val="standardContextual"/>
         </w:rPr>
       </w:pPr>
-      <w:hyperlink w:anchor="_Toc242136752" w:history="1">
+      <w:hyperlink w:anchor="_Toc242137151" w:history="1">
         <w:r>
           <w:rPr>
             <w:rStyle w:val="Hyperlink"/>
@@ -2753,7 +2753,7 @@
             <w:noProof/>
             <w:webHidden/>
           </w:rPr>
-          <w:instrText xml:space="preserve"> PAGEREF _Toc242136752 \h </w:instrText>
+          <w:instrText xml:space="preserve"> PAGEREF _Toc242137151 \h </w:instrText>
         </w:r>
         <w:r>
           <w:rPr>
@@ -2798,7 +2798,7 @@
           <w14:ligatures w14:val="standardContextual"/>
         </w:rPr>
       </w:pPr>
-      <w:hyperlink w:anchor="_Toc242136753" w:history="1">
+      <w:hyperlink w:anchor="_Toc242137152" w:history="1">
         <w:r>
           <w:rPr>
             <w:rStyle w:val="Hyperlink"/>
@@ -2825,7 +2825,7 @@
             <w:noProof/>
             <w:webHidden/>
           </w:rPr>
-          <w:instrText xml:space="preserve"> PAGEREF _Toc242136753 \h </w:instrText>
+          <w:instrText xml:space="preserve"> PAGEREF _Toc242137152 \h </w:instrText>
         </w:r>
         <w:r>
           <w:rPr>
@@ -2870,7 +2870,7 @@
           <w14:ligatures w14:val="standardContextual"/>
         </w:rPr>
       </w:pPr>
-      <w:hyperlink w:anchor="_Toc242136754" w:history="1">
+      <w:hyperlink w:anchor="_Toc242137153" w:history="1">
         <w:r>
           <w:rPr>
             <w:rStyle w:val="Hyperlink"/>
@@ -2897,7 +2897,7 @@
             <w:noProof/>
             <w:webHidden/>
           </w:rPr>
-          <w:instrText xml:space="preserve"> PAGEREF _Toc242136754 \h </w:instrText>
+          <w:instrText xml:space="preserve"> PAGEREF _Toc242137153 \h </w:instrText>
         </w:r>
         <w:r>
           <w:rPr>
@@ -2942,7 +2942,7 @@
           <w14:ligatures w14:val="standardContextual"/>
         </w:rPr>
       </w:pPr>
-      <w:hyperlink w:anchor="_Toc242136755" w:history="1">
+      <w:hyperlink w:anchor="_Toc242137154" w:history="1">
         <w:r>
           <w:rPr>
             <w:rStyle w:val="Hyperlink"/>
@@ -2969,7 +2969,7 @@
             <w:noProof/>
             <w:webHidden/>
           </w:rPr>
-          <w:instrText xml:space="preserve"> PAGEREF _Toc242136755 \h </w:instrText>
+          <w:instrText xml:space="preserve"> PAGEREF _Toc242137154 \h </w:instrText>
         </w:r>
         <w:r>
           <w:rPr>
@@ -3014,7 +3014,7 @@
           <w14:ligatures w14:val="standardContextual"/>
         </w:rPr>
       </w:pPr>
-      <w:hyperlink w:anchor="_Toc242136756" w:history="1">
+      <w:hyperlink w:anchor="_Toc242137155" w:history="1">
         <w:r>
           <w:rPr>
             <w:rStyle w:val="Hyperlink"/>
@@ -3041,7 +3041,7 @@
             <w:noProof/>
             <w:webHidden/>
           </w:rPr>
-          <w:instrText xml:space="preserve"> PAGEREF _Toc242136756 \h </w:instrText>
+          <w:instrText xml:space="preserve"> PAGEREF _Toc242137155 \h </w:instrText>
         </w:r>
         <w:r>
           <w:rPr>
@@ -3086,7 +3086,7 @@
           <w14:ligatures w14:val="standardContextual"/>
         </w:rPr>
       </w:pPr>
-      <w:hyperlink w:anchor="_Toc242136757" w:history="1">
+      <w:hyperlink w:anchor="_Toc242137156" w:history="1">
         <w:r>
           <w:rPr>
             <w:rStyle w:val="Hyperlink"/>
@@ -3113,7 +3113,7 @@
             <w:noProof/>
             <w:webHidden/>
           </w:rPr>
-          <w:instrText xml:space="preserve"> PAGEREF _Toc242136757 \h </w:instrText>
+          <w:instrText xml:space="preserve"> PAGEREF _Toc242137156 \h </w:instrText>
         </w:r>
         <w:r>
           <w:rPr>
@@ -3158,7 +3158,7 @@
           <w14:ligatures w14:val="standardContextual"/>
         </w:rPr>
       </w:pPr>
-      <w:hyperlink w:anchor="_Toc242136758" w:history="1">
+      <w:hyperlink w:anchor="_Toc242137157" w:history="1">
         <w:r>
           <w:rPr>
             <w:rStyle w:val="Hyperlink"/>
@@ -3185,7 +3185,7 @@
             <w:noProof/>
             <w:webHidden/>
           </w:rPr>
-          <w:instrText xml:space="preserve"> PAGEREF _Toc242136758 \h </w:instrText>
+          <w:instrText xml:space="preserve"> PAGEREF _Toc242137157 \h </w:instrText>
         </w:r>
         <w:r>
           <w:rPr>
@@ -3230,7 +3230,7 @@
           <w14:ligatures w14:val="standardContextual"/>
         </w:rPr>
       </w:pPr>
-      <w:hyperlink w:anchor="_Toc242136759" w:history="1">
+      <w:hyperlink w:anchor="_Toc242137158" w:history="1">
         <w:r>
           <w:rPr>
             <w:rStyle w:val="Hyperlink"/>
@@ -3257,7 +3257,7 @@
             <w:noProof/>
             <w:webHidden/>
           </w:rPr>
-          <w:instrText xml:space="preserve"> PAGEREF _Toc242136759 \h </w:instrText>
+          <w:instrText xml:space="preserve"> PAGEREF _Toc242137158 \h </w:instrText>
         </w:r>
         <w:r>
           <w:rPr>
@@ -3302,7 +3302,7 @@
           <w14:ligatures w14:val="standardContextual"/>
         </w:rPr>
       </w:pPr>
-      <w:hyperlink w:anchor="_Toc242136760" w:history="1">
+      <w:hyperlink w:anchor="_Toc242137159" w:history="1">
         <w:r>
           <w:rPr>
             <w:rStyle w:val="Hyperlink"/>
@@ -3329,7 +3329,7 @@
             <w:noProof/>
             <w:webHidden/>
           </w:rPr>
-          <w:instrText xml:space="preserve"> PAGEREF _Toc242136760 \h </w:instrText>
+          <w:instrText xml:space="preserve"> PAGEREF _Toc242137159 \h </w:instrText>
         </w:r>
         <w:r>
           <w:rPr>
@@ -3374,7 +3374,7 @@
           <w14:ligatures w14:val="standardContextual"/>
         </w:rPr>
       </w:pPr>
-      <w:hyperlink w:anchor="_Toc242136761" w:history="1">
+      <w:hyperlink w:anchor="_Toc242137160" w:history="1">
         <w:r>
           <w:rPr>
             <w:rStyle w:val="Hyperlink"/>
@@ -3401,7 +3401,7 @@
             <w:noProof/>
             <w:webHidden/>
           </w:rPr>
-          <w:instrText xml:space="preserve"> PAGEREF _Toc242136761 \h </w:instrText>
+          <w:instrText xml:space="preserve"> PAGEREF _Toc242137160 \h </w:instrText>
         </w:r>
         <w:r>
           <w:rPr>
@@ -3446,7 +3446,7 @@
           <w14:ligatures w14:val="standardContextual"/>
         </w:rPr>
       </w:pPr>
-      <w:hyperlink w:anchor="_Toc242136762" w:history="1">
+      <w:hyperlink w:anchor="_Toc242137161" w:history="1">
         <w:r>
           <w:rPr>
             <w:rStyle w:val="Hyperlink"/>
@@ -3489,7 +3489,7 @@
             <w:noProof/>
             <w:webHidden/>
           </w:rPr>
-          <w:instrText xml:space="preserve"> PAGEREF _Toc242136762 \h </w:instrText>
+          <w:instrText xml:space="preserve"> PAGEREF _Toc242137161 \h </w:instrText>
         </w:r>
         <w:r>
           <w:rPr>
@@ -3534,7 +3534,7 @@
           <w14:ligatures w14:val="standardContextual"/>
         </w:rPr>
       </w:pPr>
-      <w:hyperlink w:anchor="_Toc242136763" w:history="1">
+      <w:hyperlink w:anchor="_Toc242137162" w:history="1">
         <w:r>
           <w:rPr>
             <w:rStyle w:val="Hyperlink"/>
@@ -3561,7 +3561,7 @@
             <w:noProof/>
             <w:webHidden/>
           </w:rPr>
-          <w:instrText xml:space="preserve"> PAGEREF _Toc242136763 \h </w:instrText>
+          <w:instrText xml:space="preserve"> PAGEREF _Toc242137162 \h </w:instrText>
         </w:r>
         <w:r>
           <w:rPr>
@@ -3606,7 +3606,7 @@
           <w14:ligatures w14:val="standardContextual"/>
         </w:rPr>
       </w:pPr>
-      <w:hyperlink w:anchor="_Toc242136764" w:history="1">
+      <w:hyperlink w:anchor="_Toc242137163" w:history="1">
         <w:r>
           <w:rPr>
             <w:rStyle w:val="Hyperlink"/>
@@ -3633,7 +3633,7 @@
             <w:noProof/>
             <w:webHidden/>
           </w:rPr>
-          <w:instrText xml:space="preserve"> PAGEREF _Toc242136764 \h </w:instrText>
+          <w:instrText xml:space="preserve"> PAGEREF _Toc242137163 \h </w:instrText>
         </w:r>
         <w:r>
           <w:rPr>
@@ -3678,7 +3678,7 @@
           <w14:ligatures w14:val="standardContextual"/>
         </w:rPr>
       </w:pPr>
-      <w:hyperlink w:anchor="_Toc242136765" w:history="1">
+      <w:hyperlink w:anchor="_Toc242137164" w:history="1">
         <w:r>
           <w:rPr>
             <w:rStyle w:val="Hyperlink"/>
@@ -3705,7 +3705,7 @@
             <w:noProof/>
             <w:webHidden/>
           </w:rPr>
-          <w:instrText xml:space="preserve"> PAGEREF _Toc242136765 \h </w:instrText>
+          <w:instrText xml:space="preserve"> PAGEREF _Toc242137164 \h </w:instrText>
         </w:r>
         <w:r>
           <w:rPr>
@@ -3748,7 +3748,7 @@
           <w14:ligatures w14:val="standardContextual"/>
         </w:rPr>
       </w:pPr>
-      <w:hyperlink w:anchor="_Toc242136766" w:history="1">
+      <w:hyperlink w:anchor="_Toc242137165" w:history="1">
         <w:r>
           <w:rPr>
             <w:rStyle w:val="Hyperlink"/>
@@ -3771,7 +3771,7 @@
           <w:rPr>
             <w:webHidden/>
           </w:rPr>
-          <w:instrText xml:space="preserve"> PAGEREF _Toc242136766 \h </w:instrText>
+          <w:instrText xml:space="preserve"> PAGEREF _Toc242137165 \h </w:instrText>
         </w:r>
         <w:r>
           <w:rPr>
@@ -3812,7 +3812,7 @@
           <w14:ligatures w14:val="standardContextual"/>
         </w:rPr>
       </w:pPr>
-      <w:hyperlink w:anchor="_Toc242136767" w:history="1">
+      <w:hyperlink w:anchor="_Toc242137166" w:history="1">
         <w:r>
           <w:rPr>
             <w:rStyle w:val="Hyperlink"/>
@@ -3839,7 +3839,7 @@
             <w:noProof/>
             <w:webHidden/>
           </w:rPr>
-          <w:instrText xml:space="preserve"> PAGEREF _Toc242136767 \h </w:instrText>
+          <w:instrText xml:space="preserve"> PAGEREF _Toc242137166 \h </w:instrText>
         </w:r>
         <w:r>
           <w:rPr>
@@ -3884,7 +3884,7 @@
           <w14:ligatures w14:val="standardContextual"/>
         </w:rPr>
       </w:pPr>
-      <w:hyperlink w:anchor="_Toc242136768" w:history="1">
+      <w:hyperlink w:anchor="_Toc242137167" w:history="1">
         <w:r>
           <w:rPr>
             <w:rStyle w:val="Hyperlink"/>
@@ -3911,7 +3911,7 @@
             <w:noProof/>
             <w:webHidden/>
           </w:rPr>
-          <w:instrText xml:space="preserve"> PAGEREF _Toc242136768 \h </w:instrText>
+          <w:instrText xml:space="preserve"> PAGEREF _Toc242137167 \h </w:instrText>
         </w:r>
         <w:r>
           <w:rPr>
@@ -3956,7 +3956,7 @@
           <w14:ligatures w14:val="standardContextual"/>
         </w:rPr>
       </w:pPr>
-      <w:hyperlink w:anchor="_Toc242136769" w:history="1">
+      <w:hyperlink w:anchor="_Toc242137168" w:history="1">
         <w:r>
           <w:rPr>
             <w:rStyle w:val="Hyperlink"/>
@@ -3983,7 +3983,7 @@
             <w:noProof/>
             <w:webHidden/>
           </w:rPr>
-          <w:instrText xml:space="preserve"> PAGEREF _Toc242136769 \h </w:instrText>
+          <w:instrText xml:space="preserve"> PAGEREF _Toc242137168 \h </w:instrText>
         </w:r>
         <w:r>
           <w:rPr>
@@ -4028,7 +4028,7 @@
           <w14:ligatures w14:val="standardContextual"/>
         </w:rPr>
       </w:pPr>
-      <w:hyperlink w:anchor="_Toc242136770" w:history="1">
+      <w:hyperlink w:anchor="_Toc242137169" w:history="1">
         <w:r>
           <w:rPr>
             <w:rStyle w:val="Hyperlink"/>
@@ -4055,7 +4055,7 @@
             <w:noProof/>
             <w:webHidden/>
           </w:rPr>
-          <w:instrText xml:space="preserve"> PAGEREF _Toc242136770 \h </w:instrText>
+          <w:instrText xml:space="preserve"> PAGEREF _Toc242137169 \h </w:instrText>
         </w:r>
         <w:r>
           <w:rPr>
@@ -4100,7 +4100,7 @@
           <w14:ligatures w14:val="standardContextual"/>
         </w:rPr>
       </w:pPr>
-      <w:hyperlink w:anchor="_Toc242136771" w:history="1">
+      <w:hyperlink w:anchor="_Toc242137170" w:history="1">
         <w:r>
           <w:rPr>
             <w:rStyle w:val="Hyperlink"/>
@@ -4127,7 +4127,7 @@
             <w:noProof/>
             <w:webHidden/>
           </w:rPr>
-          <w:instrText xml:space="preserve"> PAGEREF _Toc242136771 \h </w:instrText>
+          <w:instrText xml:space="preserve"> PAGEREF _Toc242137170 \h </w:instrText>
         </w:r>
         <w:r>
           <w:rPr>
@@ -4172,7 +4172,7 @@
           <w14:ligatures w14:val="standardContextual"/>
         </w:rPr>
       </w:pPr>
-      <w:hyperlink w:anchor="_Toc242136772" w:history="1">
+      <w:hyperlink w:anchor="_Toc242137171" w:history="1">
         <w:r>
           <w:rPr>
             <w:rStyle w:val="Hyperlink"/>
@@ -4199,7 +4199,7 @@
             <w:noProof/>
             <w:webHidden/>
           </w:rPr>
-          <w:instrText xml:space="preserve"> PAGEREF _Toc242136772 \h </w:instrText>
+          <w:instrText xml:space="preserve"> PAGEREF _Toc242137171 \h </w:instrText>
         </w:r>
         <w:r>
           <w:rPr>
@@ -4244,7 +4244,7 @@
           <w14:ligatures w14:val="standardContextual"/>
         </w:rPr>
       </w:pPr>
-      <w:hyperlink w:anchor="_Toc242136773" w:history="1">
+      <w:hyperlink w:anchor="_Toc242137172" w:history="1">
         <w:r>
           <w:rPr>
             <w:rStyle w:val="Hyperlink"/>
@@ -4271,7 +4271,7 @@
             <w:noProof/>
             <w:webHidden/>
           </w:rPr>
-          <w:instrText xml:space="preserve"> PAGEREF _Toc242136773 \h </w:instrText>
+          <w:instrText xml:space="preserve"> PAGEREF _Toc242137172 \h </w:instrText>
         </w:r>
         <w:r>
           <w:rPr>
@@ -4316,7 +4316,7 @@
           <w14:ligatures w14:val="standardContextual"/>
         </w:rPr>
       </w:pPr>
-      <w:hyperlink w:anchor="_Toc242136774" w:history="1">
+      <w:hyperlink w:anchor="_Toc242137173" w:history="1">
         <w:r>
           <w:rPr>
             <w:rStyle w:val="Hyperlink"/>
@@ -4343,7 +4343,7 @@
             <w:noProof/>
             <w:webHidden/>
           </w:rPr>
-          <w:instrText xml:space="preserve"> PAGEREF _Toc242136774 \h </w:instrText>
+          <w:instrText xml:space="preserve"> PAGEREF _Toc242137173 \h </w:instrText>
         </w:r>
         <w:r>
           <w:rPr>
@@ -4388,7 +4388,7 @@
           <w14:ligatures w14:val="standardContextual"/>
         </w:rPr>
       </w:pPr>
-      <w:hyperlink w:anchor="_Toc242136775" w:history="1">
+      <w:hyperlink w:anchor="_Toc242137174" w:history="1">
         <w:r>
           <w:rPr>
             <w:rStyle w:val="Hyperlink"/>
@@ -4415,7 +4415,7 @@
             <w:noProof/>
             <w:webHidden/>
           </w:rPr>
-          <w:instrText xml:space="preserve"> PAGEREF _Toc242136775 \h </w:instrText>
+          <w:instrText xml:space="preserve"> PAGEREF _Toc242137174 \h </w:instrText>
         </w:r>
         <w:r>
           <w:rPr>
@@ -4460,7 +4460,7 @@
           <w14:ligatures w14:val="standardContextual"/>
         </w:rPr>
       </w:pPr>
-      <w:hyperlink w:anchor="_Toc242136776" w:history="1">
+      <w:hyperlink w:anchor="_Toc242137175" w:history="1">
         <w:r>
           <w:rPr>
             <w:rStyle w:val="Hyperlink"/>
@@ -4487,7 +4487,7 @@
             <w:noProof/>
             <w:webHidden/>
           </w:rPr>
-          <w:instrText xml:space="preserve"> PAGEREF _Toc242136776 \h </w:instrText>
+          <w:instrText xml:space="preserve"> PAGEREF _Toc242137175 \h </w:instrText>
         </w:r>
         <w:r>
           <w:rPr>
@@ -4532,7 +4532,7 @@
           <w14:ligatures w14:val="standardContextual"/>
         </w:rPr>
       </w:pPr>
-      <w:hyperlink w:anchor="_Toc242136777" w:history="1">
+      <w:hyperlink w:anchor="_Toc242137176" w:history="1">
         <w:r>
           <w:rPr>
             <w:rStyle w:val="Hyperlink"/>
@@ -4559,7 +4559,7 @@
             <w:noProof/>
             <w:webHidden/>
           </w:rPr>
-          <w:instrText xml:space="preserve"> PAGEREF _Toc242136777 \h </w:instrText>
+          <w:instrText xml:space="preserve"> PAGEREF _Toc242137176 \h </w:instrText>
         </w:r>
         <w:r>
           <w:rPr>
@@ -4604,7 +4604,7 @@
           <w14:ligatures w14:val="standardContextual"/>
         </w:rPr>
       </w:pPr>
-      <w:hyperlink w:anchor="_Toc242136778" w:history="1">
+      <w:hyperlink w:anchor="_Toc242137177" w:history="1">
         <w:r>
           <w:rPr>
             <w:rStyle w:val="Hyperlink"/>
@@ -4631,7 +4631,7 @@
             <w:noProof/>
             <w:webHidden/>
           </w:rPr>
-          <w:instrText xml:space="preserve"> PAGEREF _Toc242136778 \h </w:instrText>
+          <w:instrText xml:space="preserve"> PAGEREF _Toc242137177 \h </w:instrText>
         </w:r>
         <w:r>
           <w:rPr>
@@ -4676,7 +4676,7 @@
           <w14:ligatures w14:val="standardContextual"/>
         </w:rPr>
       </w:pPr>
-      <w:hyperlink w:anchor="_Toc242136779" w:history="1">
+      <w:hyperlink w:anchor="_Toc242137178" w:history="1">
         <w:r>
           <w:rPr>
             <w:rStyle w:val="Hyperlink"/>
@@ -4703,7 +4703,7 @@
             <w:noProof/>
             <w:webHidden/>
           </w:rPr>
-          <w:instrText xml:space="preserve"> PAGEREF _Toc242136779 \h </w:instrText>
+          <w:instrText xml:space="preserve"> PAGEREF _Toc242137178 \h </w:instrText>
         </w:r>
         <w:r>
           <w:rPr>
@@ -4748,7 +4748,7 @@
           <w14:ligatures w14:val="standardContextual"/>
         </w:rPr>
       </w:pPr>
-      <w:hyperlink w:anchor="_Toc242136780" w:history="1">
+      <w:hyperlink w:anchor="_Toc242137179" w:history="1">
         <w:r>
           <w:rPr>
             <w:rStyle w:val="Hyperlink"/>
@@ -4775,7 +4775,7 @@
             <w:noProof/>
             <w:webHidden/>
           </w:rPr>
-          <w:instrText xml:space="preserve"> PAGEREF _Toc242136780 \h </w:instrText>
+          <w:instrText xml:space="preserve"> PAGEREF _Toc242137179 \h </w:instrText>
         </w:r>
         <w:r>
           <w:rPr>
@@ -4818,7 +4818,7 @@
           <w14:ligatures w14:val="standardContextual"/>
         </w:rPr>
       </w:pPr>
-      <w:hyperlink w:anchor="_Toc242136781" w:history="1">
+      <w:hyperlink w:anchor="_Toc242137180" w:history="1">
         <w:r>
           <w:rPr>
             <w:rStyle w:val="Hyperlink"/>
@@ -4841,7 +4841,7 @@
           <w:rPr>
             <w:webHidden/>
           </w:rPr>
-          <w:instrText xml:space="preserve"> PAGEREF _Toc242136781 \h </w:instrText>
+          <w:instrText xml:space="preserve"> PAGEREF _Toc242137180 \h </w:instrText>
         </w:r>
         <w:r>
           <w:rPr>
@@ -4882,7 +4882,7 @@
           <w14:ligatures w14:val="standardContextual"/>
         </w:rPr>
       </w:pPr>
-      <w:hyperlink w:anchor="_Toc242136782" w:history="1">
+      <w:hyperlink w:anchor="_Toc242137181" w:history="1">
         <w:r>
           <w:rPr>
             <w:rStyle w:val="Hyperlink"/>
@@ -4909,7 +4909,7 @@
             <w:noProof/>
             <w:webHidden/>
           </w:rPr>
-          <w:instrText xml:space="preserve"> PAGEREF _Toc242136782 \h </w:instrText>
+          <w:instrText xml:space="preserve"> PAGEREF _Toc242137181 \h </w:instrText>
         </w:r>
         <w:r>
           <w:rPr>
@@ -4954,7 +4954,7 @@
           <w14:ligatures w14:val="standardContextual"/>
         </w:rPr>
       </w:pPr>
-      <w:hyperlink w:anchor="_Toc242136783" w:history="1">
+      <w:hyperlink w:anchor="_Toc242137182" w:history="1">
         <w:r>
           <w:rPr>
             <w:rStyle w:val="Hyperlink"/>
@@ -4981,7 +4981,7 @@
             <w:noProof/>
             <w:webHidden/>
           </w:rPr>
-          <w:instrText xml:space="preserve"> PAGEREF _Toc242136783 \h </w:instrText>
+          <w:instrText xml:space="preserve"> PAGEREF _Toc242137182 \h </w:instrText>
         </w:r>
         <w:r>
           <w:rPr>
@@ -5026,7 +5026,7 @@
           <w14:ligatures w14:val="standardContextual"/>
         </w:rPr>
       </w:pPr>
-      <w:hyperlink w:anchor="_Toc242136784" w:history="1">
+      <w:hyperlink w:anchor="_Toc242137183" w:history="1">
         <w:r>
           <w:rPr>
             <w:rStyle w:val="Hyperlink"/>
@@ -5053,7 +5053,7 @@
             <w:noProof/>
             <w:webHidden/>
           </w:rPr>
-          <w:instrText xml:space="preserve"> PAGEREF _Toc242136784 \h </w:instrText>
+          <w:instrText xml:space="preserve"> PAGEREF _Toc242137183 \h </w:instrText>
         </w:r>
         <w:r>
           <w:rPr>
@@ -5098,7 +5098,7 @@
           <w14:ligatures w14:val="standardContextual"/>
         </w:rPr>
       </w:pPr>
-      <w:hyperlink w:anchor="_Toc242136785" w:history="1">
+      <w:hyperlink w:anchor="_Toc242137184" w:history="1">
         <w:r>
           <w:rPr>
             <w:rStyle w:val="Hyperlink"/>
@@ -5125,7 +5125,7 @@
             <w:noProof/>
             <w:webHidden/>
           </w:rPr>
-          <w:instrText xml:space="preserve"> PAGEREF _Toc242136785 \h </w:instrText>
+          <w:instrText xml:space="preserve"> PAGEREF _Toc242137184 \h </w:instrText>
         </w:r>
         <w:r>
           <w:rPr>
@@ -5170,7 +5170,7 @@
           <w14:ligatures w14:val="standardContextual"/>
         </w:rPr>
       </w:pPr>
-      <w:hyperlink w:anchor="_Toc242136786" w:history="1">
+      <w:hyperlink w:anchor="_Toc242137185" w:history="1">
         <w:r>
           <w:rPr>
             <w:rStyle w:val="Hyperlink"/>
@@ -5197,7 +5197,7 @@
             <w:noProof/>
             <w:webHidden/>
           </w:rPr>
-          <w:instrText xml:space="preserve"> PAGEREF _Toc242136786 \h </w:instrText>
+          <w:instrText xml:space="preserve"> PAGEREF _Toc242137185 \h </w:instrText>
         </w:r>
         <w:r>
           <w:rPr>
@@ -5242,7 +5242,7 @@
           <w14:ligatures w14:val="standardContextual"/>
         </w:rPr>
       </w:pPr>
-      <w:hyperlink w:anchor="_Toc242136787" w:history="1">
+      <w:hyperlink w:anchor="_Toc242137186" w:history="1">
         <w:r>
           <w:rPr>
             <w:rStyle w:val="Hyperlink"/>
@@ -5269,7 +5269,7 @@
             <w:noProof/>
             <w:webHidden/>
           </w:rPr>
-          <w:instrText xml:space="preserve"> PAGEREF _Toc242136787 \h </w:instrText>
+          <w:instrText xml:space="preserve"> PAGEREF _Toc242137186 \h </w:instrText>
         </w:r>
         <w:r>
           <w:rPr>
@@ -5314,7 +5314,7 @@
           <w14:ligatures w14:val="standardContextual"/>
         </w:rPr>
       </w:pPr>
-      <w:hyperlink w:anchor="_Toc242136788" w:history="1">
+      <w:hyperlink w:anchor="_Toc242137187" w:history="1">
         <w:r>
           <w:rPr>
             <w:rStyle w:val="Hyperlink"/>
@@ -5341,7 +5341,7 @@
             <w:noProof/>
             <w:webHidden/>
           </w:rPr>
-          <w:instrText xml:space="preserve"> PAGEREF _Toc242136788 \h </w:instrText>
+          <w:instrText xml:space="preserve"> PAGEREF _Toc242137187 \h </w:instrText>
         </w:r>
         <w:r>
           <w:rPr>
@@ -5386,7 +5386,7 @@
           <w14:ligatures w14:val="standardContextual"/>
         </w:rPr>
       </w:pPr>
-      <w:hyperlink w:anchor="_Toc242136789" w:history="1">
+      <w:hyperlink w:anchor="_Toc242137188" w:history="1">
         <w:r>
           <w:rPr>
             <w:rStyle w:val="Hyperlink"/>
@@ -5413,7 +5413,7 @@
             <w:noProof/>
             <w:webHidden/>
           </w:rPr>
-          <w:instrText xml:space="preserve"> PAGEREF _Toc242136789 \h </w:instrText>
+          <w:instrText xml:space="preserve"> PAGEREF _Toc242137188 \h </w:instrText>
         </w:r>
         <w:r>
           <w:rPr>
@@ -5458,7 +5458,7 @@
           <w14:ligatures w14:val="standardContextual"/>
         </w:rPr>
       </w:pPr>
-      <w:hyperlink w:anchor="_Toc242136790" w:history="1">
+      <w:hyperlink w:anchor="_Toc242137189" w:history="1">
         <w:r>
           <w:rPr>
             <w:rStyle w:val="Hyperlink"/>
@@ -5485,7 +5485,7 @@
             <w:noProof/>
             <w:webHidden/>
           </w:rPr>
-          <w:instrText xml:space="preserve"> PAGEREF _Toc242136790 \h </w:instrText>
+          <w:instrText xml:space="preserve"> PAGEREF _Toc242137189 \h </w:instrText>
         </w:r>
         <w:r>
           <w:rPr>
@@ -5530,7 +5530,7 @@
           <w14:ligatures w14:val="standardContextual"/>
         </w:rPr>
       </w:pPr>
-      <w:hyperlink w:anchor="_Toc242136791" w:history="1">
+      <w:hyperlink w:anchor="_Toc242137190" w:history="1">
         <w:r>
           <w:rPr>
             <w:rStyle w:val="Hyperlink"/>
@@ -5557,7 +5557,7 @@
             <w:noProof/>
             <w:webHidden/>
           </w:rPr>
-          <w:instrText xml:space="preserve"> PAGEREF _Toc242136791 \h </w:instrText>
+          <w:instrText xml:space="preserve"> PAGEREF _Toc242137190 \h </w:instrText>
         </w:r>
         <w:r>
           <w:rPr>
@@ -5600,7 +5600,7 @@
           <w14:ligatures w14:val="standardContextual"/>
         </w:rPr>
       </w:pPr>
-      <w:hyperlink w:anchor="_Toc242136792" w:history="1">
+      <w:hyperlink w:anchor="_Toc242137191" w:history="1">
         <w:r>
           <w:rPr>
             <w:rStyle w:val="Hyperlink"/>
@@ -5623,7 +5623,7 @@
           <w:rPr>
             <w:webHidden/>
           </w:rPr>
-          <w:instrText xml:space="preserve"> PAGEREF _Toc242136792 \h </w:instrText>
+          <w:instrText xml:space="preserve"> PAGEREF _Toc242137191 \h </w:instrText>
         </w:r>
         <w:r>
           <w:rPr>
@@ -5664,7 +5664,7 @@
           <w14:ligatures w14:val="standardContextual"/>
         </w:rPr>
       </w:pPr>
-      <w:hyperlink w:anchor="_Toc242136793" w:history="1">
+      <w:hyperlink w:anchor="_Toc242137192" w:history="1">
         <w:r>
           <w:rPr>
             <w:rStyle w:val="Hyperlink"/>
@@ -5691,7 +5691,7 @@
             <w:noProof/>
             <w:webHidden/>
           </w:rPr>
-          <w:instrText xml:space="preserve"> PAGEREF _Toc242136793 \h </w:instrText>
+          <w:instrText xml:space="preserve"> PAGEREF _Toc242137192 \h </w:instrText>
         </w:r>
         <w:r>
           <w:rPr>
@@ -5736,7 +5736,7 @@
           <w14:ligatures w14:val="standardContextual"/>
         </w:rPr>
       </w:pPr>
-      <w:hyperlink w:anchor="_Toc242136794" w:history="1">
+      <w:hyperlink w:anchor="_Toc242137193" w:history="1">
         <w:r>
           <w:rPr>
             <w:rStyle w:val="Hyperlink"/>
@@ -5763,7 +5763,7 @@
             <w:noProof/>
             <w:webHidden/>
           </w:rPr>
-          <w:instrText xml:space="preserve"> PAGEREF _Toc242136794 \h </w:instrText>
+          <w:instrText xml:space="preserve"> PAGEREF _Toc242137193 \h </w:instrText>
         </w:r>
         <w:r>
           <w:rPr>
@@ -5808,7 +5808,7 @@
           <w14:ligatures w14:val="standardContextual"/>
         </w:rPr>
       </w:pPr>
-      <w:hyperlink w:anchor="_Toc242136795" w:history="1">
+      <w:hyperlink w:anchor="_Toc242137194" w:history="1">
         <w:r>
           <w:rPr>
             <w:rStyle w:val="Hyperlink"/>
@@ -5835,7 +5835,7 @@
             <w:noProof/>
             <w:webHidden/>
           </w:rPr>
-          <w:instrText xml:space="preserve"> PAGEREF _Toc242136795 \h </w:instrText>
+          <w:instrText xml:space="preserve"> PAGEREF _Toc242137194 \h </w:instrText>
         </w:r>
         <w:r>
           <w:rPr>
@@ -5880,7 +5880,7 @@
           <w14:ligatures w14:val="standardContextual"/>
         </w:rPr>
       </w:pPr>
-      <w:hyperlink w:anchor="_Toc242136796" w:history="1">
+      <w:hyperlink w:anchor="_Toc242137195" w:history="1">
         <w:r>
           <w:rPr>
             <w:rStyle w:val="Hyperlink"/>
@@ -5907,7 +5907,7 @@
             <w:noProof/>
             <w:webHidden/>
           </w:rPr>
-          <w:instrText xml:space="preserve"> PAGEREF _Toc242136796 \h </w:instrText>
+          <w:instrText xml:space="preserve"> PAGEREF _Toc242137195 \h </w:instrText>
         </w:r>
         <w:r>
           <w:rPr>
@@ -5952,7 +5952,7 @@
           <w14:ligatures w14:val="standardContextual"/>
         </w:rPr>
       </w:pPr>
-      <w:hyperlink w:anchor="_Toc242136797" w:history="1">
+      <w:hyperlink w:anchor="_Toc242137196" w:history="1">
         <w:r>
           <w:rPr>
             <w:rStyle w:val="Hyperlink"/>
@@ -5979,7 +5979,7 @@
             <w:noProof/>
             <w:webHidden/>
           </w:rPr>
-          <w:instrText xml:space="preserve"> PAGEREF _Toc242136797 \h </w:instrText>
+          <w:instrText xml:space="preserve"> PAGEREF _Toc242137196 \h </w:instrText>
         </w:r>
         <w:r>
           <w:rPr>
@@ -6024,7 +6024,7 @@
           <w14:ligatures w14:val="standardContextual"/>
         </w:rPr>
       </w:pPr>
-      <w:hyperlink w:anchor="_Toc242136798" w:history="1">
+      <w:hyperlink w:anchor="_Toc242137197" w:history="1">
         <w:r>
           <w:rPr>
             <w:rStyle w:val="Hyperlink"/>
@@ -6051,7 +6051,7 @@
             <w:noProof/>
             <w:webHidden/>
           </w:rPr>
-          <w:instrText xml:space="preserve"> PAGEREF _Toc242136798 \h </w:instrText>
+          <w:instrText xml:space="preserve"> PAGEREF _Toc242137197 \h </w:instrText>
         </w:r>
         <w:r>
           <w:rPr>
@@ -6096,7 +6096,7 @@
           <w14:ligatures w14:val="standardContextual"/>
         </w:rPr>
       </w:pPr>
-      <w:hyperlink w:anchor="_Toc242136799" w:history="1">
+      <w:hyperlink w:anchor="_Toc242137198" w:history="1">
         <w:r>
           <w:rPr>
             <w:rStyle w:val="Hyperlink"/>
@@ -6123,7 +6123,7 @@
             <w:noProof/>
             <w:webHidden/>
           </w:rPr>
-          <w:instrText xml:space="preserve"> PAGEREF _Toc242136799 \h </w:instrText>
+          <w:instrText xml:space="preserve"> PAGEREF _Toc242137198 \h </w:instrText>
         </w:r>
         <w:r>
           <w:rPr>
@@ -6168,7 +6168,7 @@
           <w14:ligatures w14:val="standardContextual"/>
         </w:rPr>
       </w:pPr>
-      <w:hyperlink w:anchor="_Toc242136800" w:history="1">
+      <w:hyperlink w:anchor="_Toc242137199" w:history="1">
         <w:r>
           <w:rPr>
             <w:rStyle w:val="Hyperlink"/>
@@ -6195,7 +6195,7 @@
             <w:noProof/>
             <w:webHidden/>
           </w:rPr>
-          <w:instrText xml:space="preserve"> PAGEREF _Toc242136800 \h </w:instrText>
+          <w:instrText xml:space="preserve"> PAGEREF _Toc242137199 \h </w:instrText>
         </w:r>
         <w:r>
           <w:rPr>
@@ -6240,7 +6240,7 @@
           <w14:ligatures w14:val="standardContextual"/>
         </w:rPr>
       </w:pPr>
-      <w:hyperlink w:anchor="_Toc242136801" w:history="1">
+      <w:hyperlink w:anchor="_Toc242137200" w:history="1">
         <w:r>
           <w:rPr>
             <w:rStyle w:val="Hyperlink"/>
@@ -6267,7 +6267,7 @@
             <w:noProof/>
             <w:webHidden/>
           </w:rPr>
-          <w:instrText xml:space="preserve"> PAGEREF _Toc242136801 \h </w:instrText>
+          <w:instrText xml:space="preserve"> PAGEREF _Toc242137200 \h </w:instrText>
         </w:r>
         <w:r>
           <w:rPr>
@@ -6312,7 +6312,7 @@
           <w14:ligatures w14:val="standardContextual"/>
         </w:rPr>
       </w:pPr>
-      <w:hyperlink w:anchor="_Toc242136802" w:history="1">
+      <w:hyperlink w:anchor="_Toc242137201" w:history="1">
         <w:r>
           <w:rPr>
             <w:rStyle w:val="Hyperlink"/>
@@ -6339,7 +6339,7 @@
             <w:noProof/>
             <w:webHidden/>
           </w:rPr>
-          <w:instrText xml:space="preserve"> PAGEREF _Toc242136802 \h </w:instrText>
+          <w:instrText xml:space="preserve"> PAGEREF _Toc242137201 \h </w:instrText>
         </w:r>
         <w:r>
           <w:rPr>
@@ -6382,7 +6382,7 @@
           <w14:ligatures w14:val="standardContextual"/>
         </w:rPr>
       </w:pPr>
-      <w:hyperlink w:anchor="_Toc242136803" w:history="1">
+      <w:hyperlink w:anchor="_Toc242137202" w:history="1">
         <w:r>
           <w:rPr>
             <w:rStyle w:val="Hyperlink"/>
@@ -6405,7 +6405,7 @@
           <w:rPr>
             <w:webHidden/>
           </w:rPr>
-          <w:instrText xml:space="preserve"> PAGEREF _Toc242136803 \h </w:instrText>
+          <w:instrText xml:space="preserve"> PAGEREF _Toc242137202 \h </w:instrText>
         </w:r>
         <w:r>
           <w:rPr>
@@ -6446,7 +6446,7 @@
           <w14:ligatures w14:val="standardContextual"/>
         </w:rPr>
       </w:pPr>
-      <w:hyperlink w:anchor="_Toc242136804" w:history="1">
+      <w:hyperlink w:anchor="_Toc242137203" w:history="1">
         <w:r>
           <w:rPr>
             <w:rStyle w:val="Hyperlink"/>
@@ -6473,7 +6473,7 @@
             <w:noProof/>
             <w:webHidden/>
           </w:rPr>
-          <w:instrText xml:space="preserve"> PAGEREF _Toc242136804 \h </w:instrText>
+          <w:instrText xml:space="preserve"> PAGEREF _Toc242137203 \h </w:instrText>
         </w:r>
         <w:r>
           <w:rPr>
@@ -6518,7 +6518,7 @@
           <w14:ligatures w14:val="standardContextual"/>
         </w:rPr>
       </w:pPr>
-      <w:hyperlink w:anchor="_Toc242136805" w:history="1">
+      <w:hyperlink w:anchor="_Toc242137204" w:history="1">
         <w:r>
           <w:rPr>
             <w:rStyle w:val="Hyperlink"/>
@@ -6545,7 +6545,7 @@
             <w:noProof/>
             <w:webHidden/>
           </w:rPr>
-          <w:instrText xml:space="preserve"> PAGEREF _Toc242136805 \h </w:instrText>
+          <w:instrText xml:space="preserve"> PAGEREF _Toc242137204 \h </w:instrText>
         </w:r>
         <w:r>
           <w:rPr>
@@ -6590,7 +6590,7 @@
           <w14:ligatures w14:val="standardContextual"/>
         </w:rPr>
       </w:pPr>
-      <w:hyperlink w:anchor="_Toc242136806" w:history="1">
+      <w:hyperlink w:anchor="_Toc242137205" w:history="1">
         <w:r>
           <w:rPr>
             <w:rStyle w:val="Hyperlink"/>
@@ -6617,7 +6617,7 @@
             <w:noProof/>
             <w:webHidden/>
           </w:rPr>
-          <w:instrText xml:space="preserve"> PAGEREF _Toc242136806 \h </w:instrText>
+          <w:instrText xml:space="preserve"> PAGEREF _Toc242137205 \h </w:instrText>
         </w:r>
         <w:r>
           <w:rPr>
@@ -6662,7 +6662,7 @@
           <w14:ligatures w14:val="standardContextual"/>
         </w:rPr>
       </w:pPr>
-      <w:hyperlink w:anchor="_Toc242136807" w:history="1">
+      <w:hyperlink w:anchor="_Toc242137206" w:history="1">
         <w:r>
           <w:rPr>
             <w:rStyle w:val="Hyperlink"/>
@@ -6689,7 +6689,7 @@
             <w:noProof/>
             <w:webHidden/>
           </w:rPr>
-          <w:instrText xml:space="preserve"> PAGEREF _Toc242136807 \h </w:instrText>
+          <w:instrText xml:space="preserve"> PAGEREF _Toc242137206 \h </w:instrText>
         </w:r>
         <w:r>
           <w:rPr>
@@ -6734,7 +6734,7 @@
           <w14:ligatures w14:val="standardContextual"/>
         </w:rPr>
       </w:pPr>
-      <w:hyperlink w:anchor="_Toc242136808" w:history="1">
+      <w:hyperlink w:anchor="_Toc242137207" w:history="1">
         <w:r>
           <w:rPr>
             <w:rStyle w:val="Hyperlink"/>
@@ -6761,7 +6761,7 @@
             <w:noProof/>
             <w:webHidden/>
           </w:rPr>
-          <w:instrText xml:space="preserve"> PAGEREF _Toc242136808 \h </w:instrText>
+          <w:instrText xml:space="preserve"> PAGEREF _Toc242137207 \h </w:instrText>
         </w:r>
         <w:r>
           <w:rPr>
@@ -6806,7 +6806,7 @@
           <w14:ligatures w14:val="standardContextual"/>
         </w:rPr>
       </w:pPr>
-      <w:hyperlink w:anchor="_Toc242136809" w:history="1">
+      <w:hyperlink w:anchor="_Toc242137208" w:history="1">
         <w:r>
           <w:rPr>
             <w:rStyle w:val="Hyperlink"/>
@@ -6833,7 +6833,7 @@
             <w:noProof/>
             <w:webHidden/>
           </w:rPr>
-          <w:instrText xml:space="preserve"> PAGEREF _Toc242136809 \h </w:instrText>
+          <w:instrText xml:space="preserve"> PAGEREF _Toc242137208 \h </w:instrText>
         </w:r>
         <w:r>
           <w:rPr>
@@ -6878,7 +6878,7 @@
           <w14:ligatures w14:val="standardContextual"/>
         </w:rPr>
       </w:pPr>
-      <w:hyperlink w:anchor="_Toc242136810" w:history="1">
+      <w:hyperlink w:anchor="_Toc242137209" w:history="1">
         <w:r>
           <w:rPr>
             <w:rStyle w:val="Hyperlink"/>
@@ -6905,7 +6905,7 @@
             <w:noProof/>
             <w:webHidden/>
           </w:rPr>
-          <w:instrText xml:space="preserve"> PAGEREF _Toc242136810 \h </w:instrText>
+          <w:instrText xml:space="preserve"> PAGEREF _Toc242137209 \h </w:instrText>
         </w:r>
         <w:r>
           <w:rPr>
@@ -6950,7 +6950,7 @@
           <w14:ligatures w14:val="standardContextual"/>
         </w:rPr>
       </w:pPr>
-      <w:hyperlink w:anchor="_Toc242136811" w:history="1">
+      <w:hyperlink w:anchor="_Toc242137210" w:history="1">
         <w:r>
           <w:rPr>
             <w:rStyle w:val="Hyperlink"/>
@@ -6977,7 +6977,7 @@
             <w:noProof/>
             <w:webHidden/>
           </w:rPr>
-          <w:instrText xml:space="preserve"> PAGEREF _Toc242136811 \h </w:instrText>
+          <w:instrText xml:space="preserve"> PAGEREF _Toc242137210 \h </w:instrText>
         </w:r>
         <w:r>
           <w:rPr>
@@ -7020,7 +7020,7 @@
           <w14:ligatures w14:val="standardContextual"/>
         </w:rPr>
       </w:pPr>
-      <w:hyperlink w:anchor="_Toc242136812" w:history="1">
+      <w:hyperlink w:anchor="_Toc242137211" w:history="1">
         <w:r>
           <w:rPr>
             <w:rStyle w:val="Hyperlink"/>
@@ -7043,7 +7043,7 @@
           <w:rPr>
             <w:webHidden/>
           </w:rPr>
-          <w:instrText xml:space="preserve"> PAGEREF _Toc242136812 \h </w:instrText>
+          <w:instrText xml:space="preserve"> PAGEREF _Toc242137211 \h </w:instrText>
         </w:r>
         <w:r>
           <w:rPr>
@@ -7084,7 +7084,7 @@
           <w14:ligatures w14:val="standardContextual"/>
         </w:rPr>
       </w:pPr>
-      <w:hyperlink w:anchor="_Toc242136813" w:history="1">
+      <w:hyperlink w:anchor="_Toc242137212" w:history="1">
         <w:r>
           <w:rPr>
             <w:rStyle w:val="Hyperlink"/>
@@ -7111,7 +7111,7 @@
             <w:noProof/>
             <w:webHidden/>
           </w:rPr>
-          <w:instrText xml:space="preserve"> PAGEREF _Toc242136813 \h </w:instrText>
+          <w:instrText xml:space="preserve"> PAGEREF _Toc242137212 \h </w:instrText>
         </w:r>
         <w:r>
           <w:rPr>
@@ -7156,7 +7156,7 @@
           <w14:ligatures w14:val="standardContextual"/>
         </w:rPr>
       </w:pPr>
-      <w:hyperlink w:anchor="_Toc242136814" w:history="1">
+      <w:hyperlink w:anchor="_Toc242137213" w:history="1">
         <w:r>
           <w:rPr>
             <w:rStyle w:val="Hyperlink"/>
@@ -7183,7 +7183,7 @@
             <w:noProof/>
             <w:webHidden/>
           </w:rPr>
-          <w:instrText xml:space="preserve"> PAGEREF _Toc242136814 \h </w:instrText>
+          <w:instrText xml:space="preserve"> PAGEREF _Toc242137213 \h </w:instrText>
         </w:r>
         <w:r>
           <w:rPr>
@@ -7226,7 +7226,7 @@
           <w14:ligatures w14:val="standardContextual"/>
         </w:rPr>
       </w:pPr>
-      <w:hyperlink w:anchor="_Toc242136815" w:history="1">
+      <w:hyperlink w:anchor="_Toc242137214" w:history="1">
         <w:r>
           <w:rPr>
             <w:rStyle w:val="Hyperlink"/>
@@ -7249,7 +7249,7 @@
           <w:rPr>
             <w:webHidden/>
           </w:rPr>
-          <w:instrText xml:space="preserve"> PAGEREF _Toc242136815 \h </w:instrText>
+          <w:instrText xml:space="preserve"> PAGEREF _Toc242137214 \h </w:instrText>
         </w:r>
         <w:r>
           <w:rPr>
@@ -7288,7 +7288,7 @@
           <w14:ligatures w14:val="standardContextual"/>
         </w:rPr>
       </w:pPr>
-      <w:hyperlink w:anchor="_Toc242136816" w:history="1">
+      <w:hyperlink w:anchor="_Toc242137215" w:history="1">
         <w:r>
           <w:rPr>
             <w:rStyle w:val="Hyperlink"/>
@@ -7311,7 +7311,7 @@
           <w:rPr>
             <w:webHidden/>
           </w:rPr>
-          <w:instrText xml:space="preserve"> PAGEREF _Toc242136816 \h </w:instrText>
+          <w:instrText xml:space="preserve"> PAGEREF _Toc242137215 \h </w:instrText>
         </w:r>
         <w:r>
           <w:rPr>
@@ -7352,7 +7352,7 @@
           <w14:ligatures w14:val="standardContextual"/>
         </w:rPr>
       </w:pPr>
-      <w:hyperlink w:anchor="_Toc242136817" w:history="1">
+      <w:hyperlink w:anchor="_Toc242137216" w:history="1">
         <w:r>
           <w:rPr>
             <w:rStyle w:val="Hyperlink"/>
@@ -7379,7 +7379,7 @@
             <w:noProof/>
             <w:webHidden/>
           </w:rPr>
-          <w:instrText xml:space="preserve"> PAGEREF _Toc242136817 \h </w:instrText>
+          <w:instrText xml:space="preserve"> PAGEREF _Toc242137216 \h </w:instrText>
         </w:r>
         <w:r>
           <w:rPr>
@@ -7424,7 +7424,7 @@
           <w14:ligatures w14:val="standardContextual"/>
         </w:rPr>
       </w:pPr>
-      <w:hyperlink w:anchor="_Toc242136818" w:history="1">
+      <w:hyperlink w:anchor="_Toc242137217" w:history="1">
         <w:r>
           <w:rPr>
             <w:rStyle w:val="Hyperlink"/>
@@ -7451,7 +7451,7 @@
             <w:noProof/>
             <w:webHidden/>
           </w:rPr>
-          <w:instrText xml:space="preserve"> PAGEREF _Toc242136818 \h </w:instrText>
+          <w:instrText xml:space="preserve"> PAGEREF _Toc242137217 \h </w:instrText>
         </w:r>
         <w:r>
           <w:rPr>
@@ -7496,7 +7496,7 @@
           <w14:ligatures w14:val="standardContextual"/>
         </w:rPr>
       </w:pPr>
-      <w:hyperlink w:anchor="_Toc242136819" w:history="1">
+      <w:hyperlink w:anchor="_Toc242137218" w:history="1">
         <w:r>
           <w:rPr>
             <w:rStyle w:val="Hyperlink"/>
@@ -7523,7 +7523,7 @@
             <w:noProof/>
             <w:webHidden/>
           </w:rPr>
-          <w:instrText xml:space="preserve"> PAGEREF _Toc242136819 \h </w:instrText>
+          <w:instrText xml:space="preserve"> PAGEREF _Toc242137218 \h </w:instrText>
         </w:r>
         <w:r>
           <w:rPr>
@@ -7568,7 +7568,7 @@
           <w14:ligatures w14:val="standardContextual"/>
         </w:rPr>
       </w:pPr>
-      <w:hyperlink w:anchor="_Toc242136820" w:history="1">
+      <w:hyperlink w:anchor="_Toc242137219" w:history="1">
         <w:r>
           <w:rPr>
             <w:rStyle w:val="Hyperlink"/>
@@ -7595,7 +7595,7 @@
             <w:noProof/>
             <w:webHidden/>
           </w:rPr>
-          <w:instrText xml:space="preserve"> PAGEREF _Toc242136820 \h </w:instrText>
+          <w:instrText xml:space="preserve"> PAGEREF _Toc242137219 \h </w:instrText>
         </w:r>
         <w:r>
           <w:rPr>
@@ -7640,7 +7640,7 @@
           <w14:ligatures w14:val="standardContextual"/>
         </w:rPr>
       </w:pPr>
-      <w:hyperlink w:anchor="_Toc242136821" w:history="1">
+      <w:hyperlink w:anchor="_Toc242137220" w:history="1">
         <w:r>
           <w:rPr>
             <w:rStyle w:val="Hyperlink"/>
@@ -7667,7 +7667,7 @@
             <w:noProof/>
             <w:webHidden/>
           </w:rPr>
-          <w:instrText xml:space="preserve"> PAGEREF _Toc242136821 \h </w:instrText>
+          <w:instrText xml:space="preserve"> PAGEREF _Toc242137220 \h </w:instrText>
         </w:r>
         <w:r>
           <w:rPr>
@@ -7712,7 +7712,7 @@
           <w14:ligatures w14:val="standardContextual"/>
         </w:rPr>
       </w:pPr>
-      <w:hyperlink w:anchor="_Toc242136822" w:history="1">
+      <w:hyperlink w:anchor="_Toc242137221" w:history="1">
         <w:r>
           <w:rPr>
             <w:rStyle w:val="Hyperlink"/>
@@ -7739,7 +7739,7 @@
             <w:noProof/>
             <w:webHidden/>
           </w:rPr>
-          <w:instrText xml:space="preserve"> PAGEREF _Toc242136822 \h </w:instrText>
+          <w:instrText xml:space="preserve"> PAGEREF _Toc242137221 \h </w:instrText>
         </w:r>
         <w:r>
           <w:rPr>
@@ -7784,7 +7784,7 @@
           <w14:ligatures w14:val="standardContextual"/>
         </w:rPr>
       </w:pPr>
-      <w:hyperlink w:anchor="_Toc242136823" w:history="1">
+      <w:hyperlink w:anchor="_Toc242137222" w:history="1">
         <w:r>
           <w:rPr>
             <w:rStyle w:val="Hyperlink"/>
@@ -7811,7 +7811,7 @@
             <w:noProof/>
             <w:webHidden/>
           </w:rPr>
-          <w:instrText xml:space="preserve"> PAGEREF _Toc242136823 \h </w:instrText>
+          <w:instrText xml:space="preserve"> PAGEREF _Toc242137222 \h </w:instrText>
         </w:r>
         <w:r>
           <w:rPr>
@@ -7856,7 +7856,7 @@
           <w14:ligatures w14:val="standardContextual"/>
         </w:rPr>
       </w:pPr>
-      <w:hyperlink w:anchor="_Toc242136824" w:history="1">
+      <w:hyperlink w:anchor="_Toc242137223" w:history="1">
         <w:r>
           <w:rPr>
             <w:rStyle w:val="Hyperlink"/>
@@ -7883,7 +7883,7 @@
             <w:noProof/>
             <w:webHidden/>
           </w:rPr>
-          <w:instrText xml:space="preserve"> PAGEREF _Toc242136824 \h </w:instrText>
+          <w:instrText xml:space="preserve"> PAGEREF _Toc242137223 \h </w:instrText>
         </w:r>
         <w:r>
           <w:rPr>
@@ -7928,7 +7928,7 @@
           <w14:ligatures w14:val="standardContextual"/>
         </w:rPr>
       </w:pPr>
-      <w:hyperlink w:anchor="_Toc242136825" w:history="1">
+      <w:hyperlink w:anchor="_Toc242137224" w:history="1">
         <w:r>
           <w:rPr>
             <w:rStyle w:val="Hyperlink"/>
@@ -7955,7 +7955,7 @@
             <w:noProof/>
             <w:webHidden/>
           </w:rPr>
-          <w:instrText xml:space="preserve"> PAGEREF _Toc242136825 \h </w:instrText>
+          <w:instrText xml:space="preserve"> PAGEREF _Toc242137224 \h </w:instrText>
         </w:r>
         <w:r>
           <w:rPr>
@@ -8000,7 +8000,7 @@
           <w14:ligatures w14:val="standardContextual"/>
         </w:rPr>
       </w:pPr>
-      <w:hyperlink w:anchor="_Toc242136826" w:history="1">
+      <w:hyperlink w:anchor="_Toc242137225" w:history="1">
         <w:r>
           <w:rPr>
             <w:rStyle w:val="Hyperlink"/>
@@ -8027,7 +8027,7 @@
             <w:noProof/>
             <w:webHidden/>
           </w:rPr>
-          <w:instrText xml:space="preserve"> PAGEREF _Toc242136826 \h </w:instrText>
+          <w:instrText xml:space="preserve"> PAGEREF _Toc242137225 \h </w:instrText>
         </w:r>
         <w:r>
           <w:rPr>
@@ -8072,7 +8072,7 @@
           <w14:ligatures w14:val="standardContextual"/>
         </w:rPr>
       </w:pPr>
-      <w:hyperlink w:anchor="_Toc242136827" w:history="1">
+      <w:hyperlink w:anchor="_Toc242137226" w:history="1">
         <w:r>
           <w:rPr>
             <w:rStyle w:val="Hyperlink"/>
@@ -8099,7 +8099,7 @@
             <w:noProof/>
             <w:webHidden/>
           </w:rPr>
-          <w:instrText xml:space="preserve"> PAGEREF _Toc242136827 \h </w:instrText>
+          <w:instrText xml:space="preserve"> PAGEREF _Toc242137226 \h </w:instrText>
         </w:r>
         <w:r>
           <w:rPr>
@@ -8144,7 +8144,7 @@
           <w14:ligatures w14:val="standardContextual"/>
         </w:rPr>
       </w:pPr>
-      <w:hyperlink w:anchor="_Toc242136828" w:history="1">
+      <w:hyperlink w:anchor="_Toc242137227" w:history="1">
         <w:r>
           <w:rPr>
             <w:rStyle w:val="Hyperlink"/>
@@ -8171,7 +8171,7 @@
             <w:noProof/>
             <w:webHidden/>
           </w:rPr>
-          <w:instrText xml:space="preserve"> PAGEREF _Toc242136828 \h </w:instrText>
+          <w:instrText xml:space="preserve"> PAGEREF _Toc242137227 \h </w:instrText>
         </w:r>
         <w:r>
           <w:rPr>
@@ -8216,7 +8216,7 @@
           <w14:ligatures w14:val="standardContextual"/>
         </w:rPr>
       </w:pPr>
-      <w:hyperlink w:anchor="_Toc242136829" w:history="1">
+      <w:hyperlink w:anchor="_Toc242137228" w:history="1">
         <w:r>
           <w:rPr>
             <w:rStyle w:val="Hyperlink"/>
@@ -8243,7 +8243,7 @@
             <w:noProof/>
             <w:webHidden/>
           </w:rPr>
-          <w:instrText xml:space="preserve"> PAGEREF _Toc242136829 \h </w:instrText>
+          <w:instrText xml:space="preserve"> PAGEREF _Toc242137228 \h </w:instrText>
         </w:r>
         <w:r>
           <w:rPr>
@@ -8288,7 +8288,7 @@
           <w14:ligatures w14:val="standardContextual"/>
         </w:rPr>
       </w:pPr>
-      <w:hyperlink w:anchor="_Toc242136830" w:history="1">
+      <w:hyperlink w:anchor="_Toc242137229" w:history="1">
         <w:r>
           <w:rPr>
             <w:rStyle w:val="Hyperlink"/>
@@ -8315,7 +8315,7 @@
             <w:noProof/>
             <w:webHidden/>
           </w:rPr>
-          <w:instrText xml:space="preserve"> PAGEREF _Toc242136830 \h </w:instrText>
+          <w:instrText xml:space="preserve"> PAGEREF _Toc242137229 \h </w:instrText>
         </w:r>
         <w:r>
           <w:rPr>
@@ -8360,7 +8360,7 @@
           <w14:ligatures w14:val="standardContextual"/>
         </w:rPr>
       </w:pPr>
-      <w:hyperlink w:anchor="_Toc242136831" w:history="1">
+      <w:hyperlink w:anchor="_Toc242137230" w:history="1">
         <w:r>
           <w:rPr>
             <w:rStyle w:val="Hyperlink"/>
@@ -8387,7 +8387,7 @@
             <w:noProof/>
             <w:webHidden/>
           </w:rPr>
-          <w:instrText xml:space="preserve"> PAGEREF _Toc242136831 \h </w:instrText>
+          <w:instrText xml:space="preserve"> PAGEREF _Toc242137230 \h </w:instrText>
         </w:r>
         <w:r>
           <w:rPr>
@@ -8432,7 +8432,7 @@
           <w14:ligatures w14:val="standardContextual"/>
         </w:rPr>
       </w:pPr>
-      <w:hyperlink w:anchor="_Toc242136832" w:history="1">
+      <w:hyperlink w:anchor="_Toc242137231" w:history="1">
         <w:r>
           <w:rPr>
             <w:rStyle w:val="Hyperlink"/>
@@ -8459,7 +8459,7 @@
             <w:noProof/>
             <w:webHidden/>
           </w:rPr>
-          <w:instrText xml:space="preserve"> PAGEREF _Toc242136832 \h </w:instrText>
+          <w:instrText xml:space="preserve"> PAGEREF _Toc242137231 \h </w:instrText>
         </w:r>
         <w:r>
           <w:rPr>
@@ -8504,7 +8504,7 @@
           <w14:ligatures w14:val="standardContextual"/>
         </w:rPr>
       </w:pPr>
-      <w:hyperlink w:anchor="_Toc242136833" w:history="1">
+      <w:hyperlink w:anchor="_Toc242137232" w:history="1">
         <w:r>
           <w:rPr>
             <w:rStyle w:val="Hyperlink"/>
@@ -8531,7 +8531,7 @@
             <w:noProof/>
             <w:webHidden/>
           </w:rPr>
-          <w:instrText xml:space="preserve"> PAGEREF _Toc242136833 \h </w:instrText>
+          <w:instrText xml:space="preserve"> PAGEREF _Toc242137232 \h </w:instrText>
         </w:r>
         <w:r>
           <w:rPr>
@@ -8576,7 +8576,7 @@
           <w14:ligatures w14:val="standardContextual"/>
         </w:rPr>
       </w:pPr>
-      <w:hyperlink w:anchor="_Toc242136834" w:history="1">
+      <w:hyperlink w:anchor="_Toc242137233" w:history="1">
         <w:r>
           <w:rPr>
             <w:rStyle w:val="Hyperlink"/>
@@ -8603,7 +8603,7 @@
             <w:noProof/>
             <w:webHidden/>
           </w:rPr>
-          <w:instrText xml:space="preserve"> PAGEREF _Toc242136834 \h </w:instrText>
+          <w:instrText xml:space="preserve"> PAGEREF _Toc242137233 \h </w:instrText>
         </w:r>
         <w:r>
           <w:rPr>
@@ -8648,7 +8648,7 @@
           <w14:ligatures w14:val="standardContextual"/>
         </w:rPr>
       </w:pPr>
-      <w:hyperlink w:anchor="_Toc242136835" w:history="1">
+      <w:hyperlink w:anchor="_Toc242137234" w:history="1">
         <w:r>
           <w:rPr>
             <w:rStyle w:val="Hyperlink"/>
@@ -8675,7 +8675,7 @@
             <w:noProof/>
             <w:webHidden/>
           </w:rPr>
-          <w:instrText xml:space="preserve"> PAGEREF _Toc242136835 \h </w:instrText>
+          <w:instrText xml:space="preserve"> PAGEREF _Toc242137234 \h </w:instrText>
         </w:r>
         <w:r>
           <w:rPr>
@@ -8720,7 +8720,7 @@
           <w14:ligatures w14:val="standardContextual"/>
         </w:rPr>
       </w:pPr>
-      <w:hyperlink w:anchor="_Toc242136836" w:history="1">
+      <w:hyperlink w:anchor="_Toc242137235" w:history="1">
         <w:r>
           <w:rPr>
             <w:rStyle w:val="Hyperlink"/>
@@ -8747,7 +8747,7 @@
             <w:noProof/>
             <w:webHidden/>
           </w:rPr>
-          <w:instrText xml:space="preserve"> PAGEREF _Toc242136836 \h </w:instrText>
+          <w:instrText xml:space="preserve"> PAGEREF _Toc242137235 \h </w:instrText>
         </w:r>
         <w:r>
           <w:rPr>
@@ -8792,7 +8792,7 @@
           <w14:ligatures w14:val="standardContextual"/>
         </w:rPr>
       </w:pPr>
-      <w:hyperlink w:anchor="_Toc242136837" w:history="1">
+      <w:hyperlink w:anchor="_Toc242137236" w:history="1">
         <w:r>
           <w:rPr>
             <w:rStyle w:val="Hyperlink"/>
@@ -8819,7 +8819,7 @@
             <w:noProof/>
             <w:webHidden/>
           </w:rPr>
-          <w:instrText xml:space="preserve"> PAGEREF _Toc242136837 \h </w:instrText>
+          <w:instrText xml:space="preserve"> PAGEREF _Toc242137236 \h </w:instrText>
         </w:r>
         <w:r>
           <w:rPr>
@@ -8864,7 +8864,7 @@
           <w14:ligatures w14:val="standardContextual"/>
         </w:rPr>
       </w:pPr>
-      <w:hyperlink w:anchor="_Toc242136838" w:history="1">
+      <w:hyperlink w:anchor="_Toc242137237" w:history="1">
         <w:r>
           <w:rPr>
             <w:rStyle w:val="Hyperlink"/>
@@ -8891,7 +8891,7 @@
             <w:noProof/>
             <w:webHidden/>
           </w:rPr>
-          <w:instrText xml:space="preserve"> PAGEREF _Toc242136838 \h </w:instrText>
+          <w:instrText xml:space="preserve"> PAGEREF _Toc242137237 \h </w:instrText>
         </w:r>
         <w:r>
           <w:rPr>
@@ -8936,7 +8936,7 @@
           <w14:ligatures w14:val="standardContextual"/>
         </w:rPr>
       </w:pPr>
-      <w:hyperlink w:anchor="_Toc242136839" w:history="1">
+      <w:hyperlink w:anchor="_Toc242137238" w:history="1">
         <w:r>
           <w:rPr>
             <w:rStyle w:val="Hyperlink"/>
@@ -8963,7 +8963,7 @@
             <w:noProof/>
             <w:webHidden/>
           </w:rPr>
-          <w:instrText xml:space="preserve"> PAGEREF _Toc242136839 \h </w:instrText>
+          <w:instrText xml:space="preserve"> PAGEREF _Toc242137238 \h </w:instrText>
         </w:r>
         <w:r>
           <w:rPr>
@@ -9008,7 +9008,7 @@
           <w14:ligatures w14:val="standardContextual"/>
         </w:rPr>
       </w:pPr>
-      <w:hyperlink w:anchor="_Toc242136840" w:history="1">
+      <w:hyperlink w:anchor="_Toc242137239" w:history="1">
         <w:r>
           <w:rPr>
             <w:rStyle w:val="Hyperlink"/>
@@ -9035,7 +9035,7 @@
             <w:noProof/>
             <w:webHidden/>
           </w:rPr>
-          <w:instrText xml:space="preserve"> PAGEREF _Toc242136840 \h </w:instrText>
+          <w:instrText xml:space="preserve"> PAGEREF _Toc242137239 \h </w:instrText>
         </w:r>
         <w:r>
           <w:rPr>
@@ -9080,7 +9080,7 @@
           <w14:ligatures w14:val="standardContextual"/>
         </w:rPr>
       </w:pPr>
-      <w:hyperlink w:anchor="_Toc242136841" w:history="1">
+      <w:hyperlink w:anchor="_Toc242137240" w:history="1">
         <w:r>
           <w:rPr>
             <w:rStyle w:val="Hyperlink"/>
@@ -9107,7 +9107,7 @@
             <w:noProof/>
             <w:webHidden/>
           </w:rPr>
-          <w:instrText xml:space="preserve"> PAGEREF _Toc242136841 \h </w:instrText>
+          <w:instrText xml:space="preserve"> PAGEREF _Toc242137240 \h </w:instrText>
         </w:r>
         <w:r>
           <w:rPr>
@@ -9152,7 +9152,7 @@
           <w14:ligatures w14:val="standardContextual"/>
         </w:rPr>
       </w:pPr>
-      <w:hyperlink w:anchor="_Toc242136842" w:history="1">
+      <w:hyperlink w:anchor="_Toc242137241" w:history="1">
         <w:r>
           <w:rPr>
             <w:rStyle w:val="Hyperlink"/>
@@ -9179,7 +9179,7 @@
             <w:noProof/>
             <w:webHidden/>
           </w:rPr>
-          <w:instrText xml:space="preserve"> PAGEREF _Toc242136842 \h </w:instrText>
+          <w:instrText xml:space="preserve"> PAGEREF _Toc242137241 \h </w:instrText>
         </w:r>
         <w:r>
           <w:rPr>
@@ -9224,7 +9224,7 @@
           <w14:ligatures w14:val="standardContextual"/>
         </w:rPr>
       </w:pPr>
-      <w:hyperlink w:anchor="_Toc242136843" w:history="1">
+      <w:hyperlink w:anchor="_Toc242137242" w:history="1">
         <w:r>
           <w:rPr>
             <w:rStyle w:val="Hyperlink"/>
@@ -9251,7 +9251,7 @@
             <w:noProof/>
             <w:webHidden/>
           </w:rPr>
-          <w:instrText xml:space="preserve"> PAGEREF _Toc242136843 \h </w:instrText>
+          <w:instrText xml:space="preserve"> PAGEREF _Toc242137242 \h </w:instrText>
         </w:r>
         <w:r>
           <w:rPr>
@@ -9296,7 +9296,7 @@
           <w14:ligatures w14:val="standardContextual"/>
         </w:rPr>
       </w:pPr>
-      <w:hyperlink w:anchor="_Toc242136844" w:history="1">
+      <w:hyperlink w:anchor="_Toc242137243" w:history="1">
         <w:r>
           <w:rPr>
             <w:rStyle w:val="Hyperlink"/>
@@ -9323,7 +9323,7 @@
             <w:noProof/>
             <w:webHidden/>
           </w:rPr>
-          <w:instrText xml:space="preserve"> PAGEREF _Toc242136844 \h </w:instrText>
+          <w:instrText xml:space="preserve"> PAGEREF _Toc242137243 \h </w:instrText>
         </w:r>
         <w:r>
           <w:rPr>
@@ -9368,7 +9368,7 @@
           <w14:ligatures w14:val="standardContextual"/>
         </w:rPr>
       </w:pPr>
-      <w:hyperlink w:anchor="_Toc242136845" w:history="1">
+      <w:hyperlink w:anchor="_Toc242137244" w:history="1">
         <w:r>
           <w:rPr>
             <w:rStyle w:val="Hyperlink"/>
@@ -9395,7 +9395,7 @@
             <w:noProof/>
             <w:webHidden/>
           </w:rPr>
-          <w:instrText xml:space="preserve"> PAGEREF _Toc242136845 \h </w:instrText>
+          <w:instrText xml:space="preserve"> PAGEREF _Toc242137244 \h </w:instrText>
         </w:r>
         <w:r>
           <w:rPr>
@@ -9440,7 +9440,7 @@
           <w14:ligatures w14:val="standardContextual"/>
         </w:rPr>
       </w:pPr>
-      <w:hyperlink w:anchor="_Toc242136846" w:history="1">
+      <w:hyperlink w:anchor="_Toc242137245" w:history="1">
         <w:r>
           <w:rPr>
             <w:rStyle w:val="Hyperlink"/>
@@ -9467,7 +9467,7 @@
             <w:noProof/>
             <w:webHidden/>
           </w:rPr>
-          <w:instrText xml:space="preserve"> PAGEREF _Toc242136846 \h </w:instrText>
+          <w:instrText xml:space="preserve"> PAGEREF _Toc242137245 \h </w:instrText>
         </w:r>
         <w:r>
           <w:rPr>
@@ -9512,7 +9512,7 @@
           <w14:ligatures w14:val="standardContextual"/>
         </w:rPr>
       </w:pPr>
-      <w:hyperlink w:anchor="_Toc242136847" w:history="1">
+      <w:hyperlink w:anchor="_Toc242137246" w:history="1">
         <w:r>
           <w:rPr>
             <w:rStyle w:val="Hyperlink"/>
@@ -9539,7 +9539,7 @@
             <w:noProof/>
             <w:webHidden/>
           </w:rPr>
-          <w:instrText xml:space="preserve"> PAGEREF _Toc242136847 \h </w:instrText>
+          <w:instrText xml:space="preserve"> PAGEREF _Toc242137246 \h </w:instrText>
         </w:r>
         <w:r>
           <w:rPr>
@@ -9584,7 +9584,7 @@
           <w14:ligatures w14:val="standardContextual"/>
         </w:rPr>
       </w:pPr>
-      <w:hyperlink w:anchor="_Toc242136848" w:history="1">
+      <w:hyperlink w:anchor="_Toc242137247" w:history="1">
         <w:r>
           <w:rPr>
             <w:rStyle w:val="Hyperlink"/>
@@ -9611,7 +9611,7 @@
             <w:noProof/>
             <w:webHidden/>
           </w:rPr>
-          <w:instrText xml:space="preserve"> PAGEREF _Toc242136848 \h </w:instrText>
+          <w:instrText xml:space="preserve"> PAGEREF _Toc242137247 \h </w:instrText>
         </w:r>
         <w:r>
           <w:rPr>
@@ -9656,7 +9656,7 @@
           <w14:ligatures w14:val="standardContextual"/>
         </w:rPr>
       </w:pPr>
-      <w:hyperlink w:anchor="_Toc242136849" w:history="1">
+      <w:hyperlink w:anchor="_Toc242137248" w:history="1">
         <w:r>
           <w:rPr>
             <w:rStyle w:val="Hyperlink"/>
@@ -9683,7 +9683,7 @@
             <w:noProof/>
             <w:webHidden/>
           </w:rPr>
-          <w:instrText xml:space="preserve"> PAGEREF _Toc242136849 \h </w:instrText>
+          <w:instrText xml:space="preserve"> PAGEREF _Toc242137248 \h </w:instrText>
         </w:r>
         <w:r>
           <w:rPr>
@@ -9728,7 +9728,7 @@
           <w14:ligatures w14:val="standardContextual"/>
         </w:rPr>
       </w:pPr>
-      <w:hyperlink w:anchor="_Toc242136850" w:history="1">
+      <w:hyperlink w:anchor="_Toc242137249" w:history="1">
         <w:r>
           <w:rPr>
             <w:rStyle w:val="Hyperlink"/>
@@ -9755,7 +9755,7 @@
             <w:noProof/>
             <w:webHidden/>
           </w:rPr>
-          <w:instrText xml:space="preserve"> PAGEREF _Toc242136850 \h </w:instrText>
+          <w:instrText xml:space="preserve"> PAGEREF _Toc242137249 \h </w:instrText>
         </w:r>
         <w:r>
           <w:rPr>
@@ -9800,7 +9800,7 @@
           <w14:ligatures w14:val="standardContextual"/>
         </w:rPr>
       </w:pPr>
-      <w:hyperlink w:anchor="_Toc242136851" w:history="1">
+      <w:hyperlink w:anchor="_Toc242137250" w:history="1">
         <w:r>
           <w:rPr>
             <w:rStyle w:val="Hyperlink"/>
@@ -9827,7 +9827,7 @@
             <w:noProof/>
             <w:webHidden/>
           </w:rPr>
-          <w:instrText xml:space="preserve"> PAGEREF _Toc242136851 \h </w:instrText>
+          <w:instrText xml:space="preserve"> PAGEREF _Toc242137250 \h </w:instrText>
         </w:r>
         <w:r>
           <w:rPr>
@@ -9872,7 +9872,7 @@
           <w14:ligatures w14:val="standardContextual"/>
         </w:rPr>
       </w:pPr>
-      <w:hyperlink w:anchor="_Toc242136852" w:history="1">
+      <w:hyperlink w:anchor="_Toc242137251" w:history="1">
         <w:r>
           <w:rPr>
             <w:rStyle w:val="Hyperlink"/>
@@ -9899,7 +9899,7 @@
             <w:noProof/>
             <w:webHidden/>
           </w:rPr>
-          <w:instrText xml:space="preserve"> PAGEREF _Toc242136852 \h </w:instrText>
+          <w:instrText xml:space="preserve"> PAGEREF _Toc242137251 \h </w:instrText>
         </w:r>
         <w:r>
           <w:rPr>
@@ -9944,7 +9944,7 @@
           <w14:ligatures w14:val="standardContextual"/>
         </w:rPr>
       </w:pPr>
-      <w:hyperlink w:anchor="_Toc242136853" w:history="1">
+      <w:hyperlink w:anchor="_Toc242137252" w:history="1">
         <w:r>
           <w:rPr>
             <w:rStyle w:val="Hyperlink"/>
@@ -9971,7 +9971,7 @@
             <w:noProof/>
             <w:webHidden/>
           </w:rPr>
-          <w:instrText xml:space="preserve"> PAGEREF _Toc242136853 \h </w:instrText>
+          <w:instrText xml:space="preserve"> PAGEREF _Toc242137252 \h </w:instrText>
         </w:r>
         <w:r>
           <w:rPr>
@@ -10016,7 +10016,7 @@
           <w14:ligatures w14:val="standardContextual"/>
         </w:rPr>
       </w:pPr>
-      <w:hyperlink w:anchor="_Toc242136854" w:history="1">
+      <w:hyperlink w:anchor="_Toc242137253" w:history="1">
         <w:r>
           <w:rPr>
             <w:rStyle w:val="Hyperlink"/>
@@ -10043,7 +10043,7 @@
             <w:noProof/>
             <w:webHidden/>
           </w:rPr>
-          <w:instrText xml:space="preserve"> PAGEREF _Toc242136854 \h </w:instrText>
+          <w:instrText xml:space="preserve"> PAGEREF _Toc242137253 \h </w:instrText>
         </w:r>
         <w:r>
           <w:rPr>
@@ -10088,7 +10088,7 @@
           <w14:ligatures w14:val="standardContextual"/>
         </w:rPr>
       </w:pPr>
-      <w:hyperlink w:anchor="_Toc242136855" w:history="1">
+      <w:hyperlink w:anchor="_Toc242137254" w:history="1">
         <w:r>
           <w:rPr>
             <w:rStyle w:val="Hyperlink"/>
@@ -10115,7 +10115,7 @@
             <w:noProof/>
             <w:webHidden/>
           </w:rPr>
-          <w:instrText xml:space="preserve"> PAGEREF _Toc242136855 \h </w:instrText>
+          <w:instrText xml:space="preserve"> PAGEREF _Toc242137254 \h </w:instrText>
         </w:r>
         <w:r>
           <w:rPr>
@@ -10160,7 +10160,7 @@
           <w14:ligatures w14:val="standardContextual"/>
         </w:rPr>
       </w:pPr>
-      <w:hyperlink w:anchor="_Toc242136856" w:history="1">
+      <w:hyperlink w:anchor="_Toc242137255" w:history="1">
         <w:r>
           <w:rPr>
             <w:rStyle w:val="Hyperlink"/>
@@ -10187,7 +10187,7 @@
             <w:noProof/>
             <w:webHidden/>
           </w:rPr>
-          <w:instrText xml:space="preserve"> PAGEREF _Toc242136856 \h </w:instrText>
+          <w:instrText xml:space="preserve"> PAGEREF _Toc242137255 \h </w:instrText>
         </w:r>
         <w:r>
           <w:rPr>
@@ -10232,7 +10232,7 @@
           <w14:ligatures w14:val="standardContextual"/>
         </w:rPr>
       </w:pPr>
-      <w:hyperlink w:anchor="_Toc242136857" w:history="1">
+      <w:hyperlink w:anchor="_Toc242137256" w:history="1">
         <w:r>
           <w:rPr>
             <w:rStyle w:val="Hyperlink"/>
@@ -10259,7 +10259,7 @@
             <w:noProof/>
             <w:webHidden/>
           </w:rPr>
-          <w:instrText xml:space="preserve"> PAGEREF _Toc242136857 \h </w:instrText>
+          <w:instrText xml:space="preserve"> PAGEREF _Toc242137256 \h </w:instrText>
         </w:r>
         <w:r>
           <w:rPr>
@@ -10333,7 +10333,7 @@
       <w:r>
         <w:fldChar w:fldCharType="separate"/>
       </w:r>
-      <w:hyperlink w:anchor="_Toc242136858" w:history="1">
+      <w:hyperlink w:anchor="_Toc242137257" w:history="1">
         <w:r>
           <w:rPr>
             <w:rStyle w:val="Hyperlink"/>
@@ -10357,7 +10357,7 @@
           <w:rPr>
             <w:webHidden/>
           </w:rPr>
-          <w:instrText xml:space="preserve"> PAGEREF _Toc242136858 \h </w:instrText>
+          <w:instrText xml:space="preserve"> PAGEREF _Toc242137257 \h </w:instrText>
         </w:r>
         <w:r>
           <w:rPr>
@@ -10395,7 +10395,7 @@
           <w14:ligatures w14:val="standardContextual"/>
         </w:rPr>
       </w:pPr>
-      <w:hyperlink w:anchor="_Toc242136859" w:history="1">
+      <w:hyperlink w:anchor="_Toc242137258" w:history="1">
         <w:r>
           <w:rPr>
             <w:rStyle w:val="Hyperlink"/>
@@ -10419,7 +10419,7 @@
           <w:rPr>
             <w:webHidden/>
           </w:rPr>
-          <w:instrText xml:space="preserve"> PAGEREF _Toc242136859 \h </w:instrText>
+          <w:instrText xml:space="preserve"> PAGEREF _Toc242137258 \h </w:instrText>
         </w:r>
         <w:r>
           <w:rPr>
@@ -10457,7 +10457,7 @@
           <w14:ligatures w14:val="standardContextual"/>
         </w:rPr>
       </w:pPr>
-      <w:hyperlink w:anchor="_Toc242136860" w:history="1">
+      <w:hyperlink w:anchor="_Toc242137259" w:history="1">
         <w:r>
           <w:rPr>
             <w:rStyle w:val="Hyperlink"/>
@@ -10481,7 +10481,7 @@
           <w:rPr>
             <w:webHidden/>
           </w:rPr>
-          <w:instrText xml:space="preserve"> PAGEREF _Toc242136860 \h </w:instrText>
+          <w:instrText xml:space="preserve"> PAGEREF _Toc242137259 \h </w:instrText>
         </w:r>
         <w:r>
           <w:rPr>
@@ -10519,7 +10519,7 @@
           <w14:ligatures w14:val="standardContextual"/>
         </w:rPr>
       </w:pPr>
-      <w:hyperlink w:anchor="_Toc242136861" w:history="1">
+      <w:hyperlink w:anchor="_Toc242137260" w:history="1">
         <w:r>
           <w:rPr>
             <w:rStyle w:val="Hyperlink"/>
@@ -10543,7 +10543,7 @@
           <w:rPr>
             <w:webHidden/>
           </w:rPr>
-          <w:instrText xml:space="preserve"> PAGEREF _Toc242136861 \h </w:instrText>
+          <w:instrText xml:space="preserve"> PAGEREF _Toc242137260 \h </w:instrText>
         </w:r>
         <w:r>
           <w:rPr>
@@ -10581,7 +10581,7 @@
           <w14:ligatures w14:val="standardContextual"/>
         </w:rPr>
       </w:pPr>
-      <w:hyperlink w:anchor="_Toc242136862" w:history="1">
+      <w:hyperlink w:anchor="_Toc242137261" w:history="1">
         <w:r>
           <w:rPr>
             <w:rStyle w:val="Hyperlink"/>
@@ -10605,7 +10605,7 @@
           <w:rPr>
             <w:webHidden/>
           </w:rPr>
-          <w:instrText xml:space="preserve"> PAGEREF _Toc242136862 \h </w:instrText>
+          <w:instrText xml:space="preserve"> PAGEREF _Toc242137261 \h </w:instrText>
         </w:r>
         <w:r>
           <w:rPr>
@@ -10643,7 +10643,7 @@
           <w14:ligatures w14:val="standardContextual"/>
         </w:rPr>
       </w:pPr>
-      <w:hyperlink w:anchor="_Toc242136863" w:history="1">
+      <w:hyperlink w:anchor="_Toc242137262" w:history="1">
         <w:r>
           <w:rPr>
             <w:rStyle w:val="Hyperlink"/>
@@ -10667,7 +10667,7 @@
           <w:rPr>
             <w:webHidden/>
           </w:rPr>
-          <w:instrText xml:space="preserve"> PAGEREF _Toc242136863 \h </w:instrText>
+          <w:instrText xml:space="preserve"> PAGEREF _Toc242137262 \h </w:instrText>
         </w:r>
         <w:r>
           <w:rPr>
@@ -10705,7 +10705,7 @@
           <w14:ligatures w14:val="standardContextual"/>
         </w:rPr>
       </w:pPr>
-      <w:hyperlink w:anchor="_Toc242136864" w:history="1">
+      <w:hyperlink w:anchor="_Toc242137263" w:history="1">
         <w:r>
           <w:rPr>
             <w:rStyle w:val="Hyperlink"/>
@@ -10729,7 +10729,7 @@
           <w:rPr>
             <w:webHidden/>
           </w:rPr>
-          <w:instrText xml:space="preserve"> PAGEREF _Toc242136864 \h </w:instrText>
+          <w:instrText xml:space="preserve"> PAGEREF _Toc242137263 \h </w:instrText>
         </w:r>
         <w:r>
           <w:rPr>
@@ -10767,7 +10767,7 @@
           <w14:ligatures w14:val="standardContextual"/>
         </w:rPr>
       </w:pPr>
-      <w:hyperlink w:anchor="_Toc242136865" w:history="1">
+      <w:hyperlink w:anchor="_Toc242137264" w:history="1">
         <w:r>
           <w:rPr>
             <w:rStyle w:val="Hyperlink"/>
@@ -10791,7 +10791,7 @@
           <w:rPr>
             <w:webHidden/>
           </w:rPr>
-          <w:instrText xml:space="preserve"> PAGEREF _Toc242136865 \h </w:instrText>
+          <w:instrText xml:space="preserve"> PAGEREF _Toc242137264 \h </w:instrText>
         </w:r>
         <w:r>
           <w:rPr>
@@ -10829,7 +10829,7 @@
           <w14:ligatures w14:val="standardContextual"/>
         </w:rPr>
       </w:pPr>
-      <w:hyperlink w:anchor="_Toc242136866" w:history="1">
+      <w:hyperlink w:anchor="_Toc242137265" w:history="1">
         <w:r>
           <w:rPr>
             <w:rStyle w:val="Hyperlink"/>
@@ -10853,7 +10853,7 @@
           <w:rPr>
             <w:webHidden/>
           </w:rPr>
-          <w:instrText xml:space="preserve"> PAGEREF _Toc242136866 \h </w:instrText>
+          <w:instrText xml:space="preserve"> PAGEREF _Toc242137265 \h </w:instrText>
         </w:r>
         <w:r>
           <w:rPr>
@@ -10891,7 +10891,7 @@
           <w14:ligatures w14:val="standardContextual"/>
         </w:rPr>
       </w:pPr>
-      <w:hyperlink w:anchor="_Toc242136867" w:history="1">
+      <w:hyperlink w:anchor="_Toc242137266" w:history="1">
         <w:r>
           <w:rPr>
             <w:rStyle w:val="Hyperlink"/>
@@ -10915,7 +10915,7 @@
           <w:rPr>
             <w:webHidden/>
           </w:rPr>
-          <w:instrText xml:space="preserve"> PAGEREF _Toc242136867 \h </w:instrText>
+          <w:instrText xml:space="preserve"> PAGEREF _Toc242137266 \h </w:instrText>
         </w:r>
         <w:r>
           <w:rPr>
@@ -10953,7 +10953,7 @@
           <w14:ligatures w14:val="standardContextual"/>
         </w:rPr>
       </w:pPr>
-      <w:hyperlink w:anchor="_Toc242136868" w:history="1">
+      <w:hyperlink w:anchor="_Toc242137267" w:history="1">
         <w:r>
           <w:rPr>
             <w:rStyle w:val="Hyperlink"/>
@@ -10976,7 +10976,7 @@
           <w:rPr>
             <w:webHidden/>
           </w:rPr>
-          <w:instrText xml:space="preserve"> PAGEREF _Toc242136868 \h </w:instrText>
+          <w:instrText xml:space="preserve"> PAGEREF _Toc242137267 \h </w:instrText>
         </w:r>
         <w:r>
           <w:rPr>
@@ -11014,7 +11014,7 @@
           <w14:ligatures w14:val="standardContextual"/>
         </w:rPr>
       </w:pPr>
-      <w:hyperlink w:anchor="_Toc242136869" w:history="1">
+      <w:hyperlink w:anchor="_Toc242137268" w:history="1">
         <w:r>
           <w:rPr>
             <w:rStyle w:val="Hyperlink"/>
@@ -11037,7 +11037,7 @@
           <w:rPr>
             <w:webHidden/>
           </w:rPr>
-          <w:instrText xml:space="preserve"> PAGEREF _Toc242136869 \h </w:instrText>
+          <w:instrText xml:space="preserve"> PAGEREF _Toc242137268 \h </w:instrText>
         </w:r>
         <w:r>
           <w:rPr>
@@ -11075,7 +11075,7 @@
           <w14:ligatures w14:val="standardContextual"/>
         </w:rPr>
       </w:pPr>
-      <w:hyperlink w:anchor="_Toc242136870" w:history="1">
+      <w:hyperlink w:anchor="_Toc242137269" w:history="1">
         <w:r>
           <w:rPr>
             <w:rStyle w:val="Hyperlink"/>
@@ -11098,7 +11098,7 @@
           <w:rPr>
             <w:webHidden/>
           </w:rPr>
-          <w:instrText xml:space="preserve"> PAGEREF _Toc242136870 \h </w:instrText>
+          <w:instrText xml:space="preserve"> PAGEREF _Toc242137269 \h </w:instrText>
         </w:r>
         <w:r>
           <w:rPr>
@@ -11136,7 +11136,7 @@
           <w14:ligatures w14:val="standardContextual"/>
         </w:rPr>
       </w:pPr>
-      <w:hyperlink w:anchor="_Toc242136871" w:history="1">
+      <w:hyperlink w:anchor="_Toc242137270" w:history="1">
         <w:r>
           <w:rPr>
             <w:rStyle w:val="Hyperlink"/>
@@ -11159,7 +11159,7 @@
           <w:rPr>
             <w:webHidden/>
           </w:rPr>
-          <w:instrText xml:space="preserve"> PAGEREF _Toc242136871 \h </w:instrText>
+          <w:instrText xml:space="preserve"> PAGEREF _Toc242137270 \h </w:instrText>
         </w:r>
         <w:r>
           <w:rPr>
@@ -11197,7 +11197,7 @@
           <w14:ligatures w14:val="standardContextual"/>
         </w:rPr>
       </w:pPr>
-      <w:hyperlink w:anchor="_Toc242136872" w:history="1">
+      <w:hyperlink w:anchor="_Toc242137271" w:history="1">
         <w:r>
           <w:rPr>
             <w:rStyle w:val="Hyperlink"/>
@@ -11220,7 +11220,7 @@
           <w:rPr>
             <w:webHidden/>
           </w:rPr>
-          <w:instrText xml:space="preserve"> PAGEREF _Toc242136872 \h </w:instrText>
+          <w:instrText xml:space="preserve"> PAGEREF _Toc242137271 \h </w:instrText>
         </w:r>
         <w:r>
           <w:rPr>
@@ -11258,7 +11258,7 @@
           <w14:ligatures w14:val="standardContextual"/>
         </w:rPr>
       </w:pPr>
-      <w:hyperlink w:anchor="_Toc242136873" w:history="1">
+      <w:hyperlink w:anchor="_Toc242137272" w:history="1">
         <w:r>
           <w:rPr>
             <w:rStyle w:val="Hyperlink"/>
@@ -11281,7 +11281,7 @@
           <w:rPr>
             <w:webHidden/>
           </w:rPr>
-          <w:instrText xml:space="preserve"> PAGEREF _Toc242136873 \h </w:instrText>
+          <w:instrText xml:space="preserve"> PAGEREF _Toc242137272 \h </w:instrText>
         </w:r>
         <w:r>
           <w:rPr>
@@ -11319,7 +11319,7 @@
           <w14:ligatures w14:val="standardContextual"/>
         </w:rPr>
       </w:pPr>
-      <w:hyperlink w:anchor="_Toc242136874" w:history="1">
+      <w:hyperlink w:anchor="_Toc242137273" w:history="1">
         <w:r>
           <w:rPr>
             <w:rStyle w:val="Hyperlink"/>
@@ -11342,7 +11342,7 @@
           <w:rPr>
             <w:webHidden/>
           </w:rPr>
-          <w:instrText xml:space="preserve"> PAGEREF _Toc242136874 \h </w:instrText>
+          <w:instrText xml:space="preserve"> PAGEREF _Toc242137273 \h </w:instrText>
         </w:r>
         <w:r>
           <w:rPr>
@@ -11405,7 +11405,7 @@
       <w:r>
         <w:fldChar w:fldCharType="separate"/>
       </w:r>
-      <w:hyperlink w:anchor="_Toc242136875" w:history="1">
+      <w:hyperlink w:anchor="_Toc242137274" w:history="1">
         <w:r>
           <w:rPr>
             <w:rStyle w:val="Hyperlink"/>
@@ -11429,7 +11429,7 @@
           <w:rPr>
             <w:webHidden/>
           </w:rPr>
-          <w:instrText xml:space="preserve"> PAGEREF _Toc242136875 \h </w:instrText>
+          <w:instrText xml:space="preserve"> PAGEREF _Toc242137274 \h </w:instrText>
         </w:r>
         <w:r>
           <w:rPr>
@@ -11467,7 +11467,7 @@
           <w14:ligatures w14:val="standardContextual"/>
         </w:rPr>
       </w:pPr>
-      <w:hyperlink w:anchor="_Toc242136876" w:history="1">
+      <w:hyperlink w:anchor="_Toc242137275" w:history="1">
         <w:r>
           <w:rPr>
             <w:rStyle w:val="Hyperlink"/>
@@ -11491,7 +11491,7 @@
           <w:rPr>
             <w:webHidden/>
           </w:rPr>
-          <w:instrText xml:space="preserve"> PAGEREF _Toc242136876 \h </w:instrText>
+          <w:instrText xml:space="preserve"> PAGEREF _Toc242137275 \h </w:instrText>
         </w:r>
         <w:r>
           <w:rPr>
@@ -11529,7 +11529,7 @@
           <w14:ligatures w14:val="standardContextual"/>
         </w:rPr>
       </w:pPr>
-      <w:hyperlink w:anchor="_Toc242136877" w:history="1">
+      <w:hyperlink w:anchor="_Toc242137276" w:history="1">
         <w:r>
           <w:rPr>
             <w:rStyle w:val="Hyperlink"/>
@@ -11554,7 +11554,7 @@
           <w:rPr>
             <w:webHidden/>
           </w:rPr>
-          <w:instrText xml:space="preserve"> PAGEREF _Toc242136877 \h </w:instrText>
+          <w:instrText xml:space="preserve"> PAGEREF _Toc242137276 \h </w:instrText>
         </w:r>
         <w:r>
           <w:rPr>
@@ -11592,7 +11592,7 @@
           <w14:ligatures w14:val="standardContextual"/>
         </w:rPr>
       </w:pPr>
-      <w:hyperlink w:anchor="_Toc242136878" w:history="1">
+      <w:hyperlink w:anchor="_Toc242137277" w:history="1">
         <w:r>
           <w:rPr>
             <w:rStyle w:val="Hyperlink"/>
@@ -11616,7 +11616,7 @@
           <w:rPr>
             <w:webHidden/>
           </w:rPr>
-          <w:instrText xml:space="preserve"> PAGEREF _Toc242136878 \h </w:instrText>
+          <w:instrText xml:space="preserve"> PAGEREF _Toc242137277 \h </w:instrText>
         </w:r>
         <w:r>
           <w:rPr>
@@ -11654,7 +11654,7 @@
           <w14:ligatures w14:val="standardContextual"/>
         </w:rPr>
       </w:pPr>
-      <w:hyperlink w:anchor="_Toc242136879" w:history="1">
+      <w:hyperlink w:anchor="_Toc242137278" w:history="1">
         <w:r>
           <w:rPr>
             <w:rStyle w:val="Hyperlink"/>
@@ -11678,7 +11678,7 @@
           <w:rPr>
             <w:webHidden/>
           </w:rPr>
-          <w:instrText xml:space="preserve"> PAGEREF _Toc242136879 \h </w:instrText>
+          <w:instrText xml:space="preserve"> PAGEREF _Toc242137278 \h </w:instrText>
         </w:r>
         <w:r>
           <w:rPr>
@@ -11716,7 +11716,7 @@
           <w14:ligatures w14:val="standardContextual"/>
         </w:rPr>
       </w:pPr>
-      <w:hyperlink w:anchor="_Toc242136880" w:history="1">
+      <w:hyperlink w:anchor="_Toc242137279" w:history="1">
         <w:r>
           <w:rPr>
             <w:rStyle w:val="Hyperlink"/>
@@ -11740,7 +11740,7 @@
           <w:rPr>
             <w:webHidden/>
           </w:rPr>
-          <w:instrText xml:space="preserve"> PAGEREF _Toc242136880 \h </w:instrText>
+          <w:instrText xml:space="preserve"> PAGEREF _Toc242137279 \h </w:instrText>
         </w:r>
         <w:r>
           <w:rPr>
@@ -11778,7 +11778,7 @@
           <w14:ligatures w14:val="standardContextual"/>
         </w:rPr>
       </w:pPr>
-      <w:hyperlink w:anchor="_Toc242136881" w:history="1">
+      <w:hyperlink w:anchor="_Toc242137280" w:history="1">
         <w:r>
           <w:rPr>
             <w:rStyle w:val="Hyperlink"/>
@@ -11802,7 +11802,7 @@
           <w:rPr>
             <w:webHidden/>
           </w:rPr>
-          <w:instrText xml:space="preserve"> PAGEREF _Toc242136881 \h </w:instrText>
+          <w:instrText xml:space="preserve"> PAGEREF _Toc242137280 \h </w:instrText>
         </w:r>
         <w:r>
           <w:rPr>
@@ -11840,7 +11840,7 @@
           <w14:ligatures w14:val="standardContextual"/>
         </w:rPr>
       </w:pPr>
-      <w:hyperlink w:anchor="_Toc242136882" w:history="1">
+      <w:hyperlink w:anchor="_Toc242137281" w:history="1">
         <w:r>
           <w:rPr>
             <w:rStyle w:val="Hyperlink"/>
@@ -11864,7 +11864,7 @@
           <w:rPr>
             <w:webHidden/>
           </w:rPr>
-          <w:instrText xml:space="preserve"> PAGEREF _Toc242136882 \h </w:instrText>
+          <w:instrText xml:space="preserve"> PAGEREF _Toc242137281 \h </w:instrText>
         </w:r>
         <w:r>
           <w:rPr>
@@ -11902,7 +11902,7 @@
           <w14:ligatures w14:val="standardContextual"/>
         </w:rPr>
       </w:pPr>
-      <w:hyperlink w:anchor="_Toc242136883" w:history="1">
+      <w:hyperlink w:anchor="_Toc242137282" w:history="1">
         <w:r>
           <w:rPr>
             <w:rStyle w:val="Hyperlink"/>
@@ -11926,7 +11926,7 @@
           <w:rPr>
             <w:webHidden/>
           </w:rPr>
-          <w:instrText xml:space="preserve"> PAGEREF _Toc242136883 \h </w:instrText>
+          <w:instrText xml:space="preserve"> PAGEREF _Toc242137282 \h </w:instrText>
         </w:r>
         <w:r>
           <w:rPr>
@@ -11964,7 +11964,7 @@
           <w14:ligatures w14:val="standardContextual"/>
         </w:rPr>
       </w:pPr>
-      <w:hyperlink w:anchor="_Toc242136884" w:history="1">
+      <w:hyperlink w:anchor="_Toc242137283" w:history="1">
         <w:r>
           <w:rPr>
             <w:rStyle w:val="Hyperlink"/>
@@ -11988,7 +11988,7 @@
           <w:rPr>
             <w:webHidden/>
           </w:rPr>
-          <w:instrText xml:space="preserve"> PAGEREF _Toc242136884 \h </w:instrText>
+          <w:instrText xml:space="preserve"> PAGEREF _Toc242137283 \h </w:instrText>
         </w:r>
         <w:r>
           <w:rPr>
@@ -12026,7 +12026,7 @@
           <w14:ligatures w14:val="standardContextual"/>
         </w:rPr>
       </w:pPr>
-      <w:hyperlink w:anchor="_Toc242136885" w:history="1">
+      <w:hyperlink w:anchor="_Toc242137284" w:history="1">
         <w:r>
           <w:rPr>
             <w:rStyle w:val="Hyperlink"/>
@@ -12050,7 +12050,7 @@
           <w:rPr>
             <w:webHidden/>
           </w:rPr>
-          <w:instrText xml:space="preserve"> PAGEREF _Toc242136885 \h </w:instrText>
+          <w:instrText xml:space="preserve"> PAGEREF _Toc242137284 \h </w:instrText>
         </w:r>
         <w:r>
           <w:rPr>
@@ -12088,7 +12088,7 @@
           <w14:ligatures w14:val="standardContextual"/>
         </w:rPr>
       </w:pPr>
-      <w:hyperlink w:anchor="_Toc242136886" w:history="1">
+      <w:hyperlink w:anchor="_Toc242137285" w:history="1">
         <w:r>
           <w:rPr>
             <w:rStyle w:val="Hyperlink"/>
@@ -12112,7 +12112,7 @@
           <w:rPr>
             <w:webHidden/>
           </w:rPr>
-          <w:instrText xml:space="preserve"> PAGEREF _Toc242136886 \h </w:instrText>
+          <w:instrText xml:space="preserve"> PAGEREF _Toc242137285 \h </w:instrText>
         </w:r>
         <w:r>
           <w:rPr>
@@ -12150,7 +12150,7 @@
           <w14:ligatures w14:val="standardContextual"/>
         </w:rPr>
       </w:pPr>
-      <w:hyperlink w:anchor="_Toc242136887" w:history="1">
+      <w:hyperlink w:anchor="_Toc242137286" w:history="1">
         <w:r>
           <w:rPr>
             <w:rStyle w:val="Hyperlink"/>
@@ -12174,7 +12174,7 @@
           <w:rPr>
             <w:webHidden/>
           </w:rPr>
-          <w:instrText xml:space="preserve"> PAGEREF _Toc242136887 \h </w:instrText>
+          <w:instrText xml:space="preserve"> PAGEREF _Toc242137286 \h </w:instrText>
         </w:r>
         <w:r>
           <w:rPr>
@@ -12212,7 +12212,7 @@
           <w14:ligatures w14:val="standardContextual"/>
         </w:rPr>
       </w:pPr>
-      <w:hyperlink w:anchor="_Toc242136888" w:history="1">
+      <w:hyperlink w:anchor="_Toc242137287" w:history="1">
         <w:r>
           <w:rPr>
             <w:rStyle w:val="Hyperlink"/>
@@ -12236,7 +12236,7 @@
           <w:rPr>
             <w:webHidden/>
           </w:rPr>
-          <w:instrText xml:space="preserve"> PAGEREF _Toc242136888 \h </w:instrText>
+          <w:instrText xml:space="preserve"> PAGEREF _Toc242137287 \h </w:instrText>
         </w:r>
         <w:r>
           <w:rPr>
@@ -12274,7 +12274,7 @@
           <w14:ligatures w14:val="standardContextual"/>
         </w:rPr>
       </w:pPr>
-      <w:hyperlink w:anchor="_Toc242136889" w:history="1">
+      <w:hyperlink w:anchor="_Toc242137288" w:history="1">
         <w:r>
           <w:rPr>
             <w:rStyle w:val="Hyperlink"/>
@@ -12298,7 +12298,7 @@
           <w:rPr>
             <w:webHidden/>
           </w:rPr>
-          <w:instrText xml:space="preserve"> PAGEREF _Toc242136889 \h </w:instrText>
+          <w:instrText xml:space="preserve"> PAGEREF _Toc242137288 \h </w:instrText>
         </w:r>
         <w:r>
           <w:rPr>
@@ -12336,7 +12336,7 @@
           <w14:ligatures w14:val="standardContextual"/>
         </w:rPr>
       </w:pPr>
-      <w:hyperlink w:anchor="_Toc242136890" w:history="1">
+      <w:hyperlink w:anchor="_Toc242137289" w:history="1">
         <w:r>
           <w:rPr>
             <w:rStyle w:val="Hyperlink"/>
@@ -12360,7 +12360,7 @@
           <w:rPr>
             <w:webHidden/>
           </w:rPr>
-          <w:instrText xml:space="preserve"> PAGEREF _Toc242136890 \h </w:instrText>
+          <w:instrText xml:space="preserve"> PAGEREF _Toc242137289 \h </w:instrText>
         </w:r>
         <w:r>
           <w:rPr>
@@ -12478,7 +12478,7 @@
         <w:pStyle w:val="Heading1"/>
       </w:pPr>
       <w:bookmarkStart w:id="1" w:name="_Toc241062250"/>
-      <w:bookmarkStart w:id="2" w:name="_Toc242136718"/>
+      <w:bookmarkStart w:id="2" w:name="_Toc242137117"/>
       <w:r>
         <w:lastRenderedPageBreak/>
         <w:t>RESUMEN</w:t>
@@ -12564,7 +12564,7 @@
         <w:pStyle w:val="Heading1"/>
       </w:pPr>
       <w:bookmarkStart w:id="3" w:name="_Toc241062251"/>
-      <w:bookmarkStart w:id="4" w:name="_Toc242136719"/>
+      <w:bookmarkStart w:id="4" w:name="_Toc242137118"/>
       <w:r>
         <w:t>CAPÍTULO 1: Introducción</w:t>
       </w:r>
@@ -12597,7 +12597,7 @@
         <w:pStyle w:val="Heading2"/>
       </w:pPr>
       <w:bookmarkStart w:id="6" w:name="_Toc241062252"/>
-      <w:bookmarkStart w:id="7" w:name="_Toc242136720"/>
+      <w:bookmarkStart w:id="7" w:name="_Toc242137119"/>
       <w:r>
         <w:t>1.1 Contexto del problema</w:t>
       </w:r>
@@ -12658,7 +12658,7 @@
         <w:pStyle w:val="Heading2"/>
       </w:pPr>
       <w:bookmarkStart w:id="8" w:name="_Toc241062253"/>
-      <w:bookmarkStart w:id="9" w:name="_Toc242136721"/>
+      <w:bookmarkStart w:id="9" w:name="_Toc242137120"/>
       <w:r>
         <w:t>1.2 Planteamiento del problema</w:t>
       </w:r>
@@ -12753,7 +12753,7 @@
         <w:pStyle w:val="Heading2"/>
       </w:pPr>
       <w:bookmarkStart w:id="10" w:name="_Toc241062254"/>
-      <w:bookmarkStart w:id="11" w:name="_Toc242136722"/>
+      <w:bookmarkStart w:id="11" w:name="_Toc242137121"/>
       <w:r>
         <w:t>1.3 Justificación</w:t>
       </w:r>
@@ -12835,7 +12835,7 @@
         <w:pStyle w:val="Heading2"/>
       </w:pPr>
       <w:bookmarkStart w:id="12" w:name="_Toc241062255"/>
-      <w:bookmarkStart w:id="13" w:name="_Toc242136723"/>
+      <w:bookmarkStart w:id="13" w:name="_Toc242137122"/>
       <w:r>
         <w:t>1.4 Objetivos</w:t>
       </w:r>
@@ -12855,7 +12855,7 @@
         <w:pStyle w:val="Heading3"/>
       </w:pPr>
       <w:bookmarkStart w:id="14" w:name="_Toc241062256"/>
-      <w:bookmarkStart w:id="15" w:name="_Toc242136724"/>
+      <w:bookmarkStart w:id="15" w:name="_Toc242137123"/>
       <w:r>
         <w:t>1.4.1 Objetivo General</w:t>
       </w:r>
@@ -12875,7 +12875,7 @@
         <w:pStyle w:val="Heading3"/>
       </w:pPr>
       <w:bookmarkStart w:id="16" w:name="_Toc241062257"/>
-      <w:bookmarkStart w:id="17" w:name="_Toc242136725"/>
+      <w:bookmarkStart w:id="17" w:name="_Toc242137124"/>
       <w:r>
         <w:t>1.4.2 Objetivos Específicos</w:t>
       </w:r>
@@ -13009,7 +13009,7 @@
         <w:pStyle w:val="Heading2"/>
       </w:pPr>
       <w:bookmarkStart w:id="18" w:name="_Toc241062258"/>
-      <w:bookmarkStart w:id="19" w:name="_Toc242136726"/>
+      <w:bookmarkStart w:id="19" w:name="_Toc242137125"/>
       <w:r>
         <w:t>1.5 Alcance y Limitaciones</w:t>
       </w:r>
@@ -13029,7 +13029,7 @@
         <w:pStyle w:val="Heading3"/>
       </w:pPr>
       <w:bookmarkStart w:id="20" w:name="_Toc241062259"/>
-      <w:bookmarkStart w:id="21" w:name="_Toc242136727"/>
+      <w:bookmarkStart w:id="21" w:name="_Toc242137126"/>
       <w:r>
         <w:t>1.5.1 Alcance del Proyecto</w:t>
       </w:r>
@@ -13193,7 +13193,7 @@
         </w:rPr>
       </w:pPr>
       <w:bookmarkStart w:id="22" w:name="_Toc241062260"/>
-      <w:bookmarkStart w:id="23" w:name="_Toc242136728"/>
+      <w:bookmarkStart w:id="23" w:name="_Toc242137127"/>
       <w:r>
         <w:t>1.5.2 Limitaciones del Proyecto</w:t>
       </w:r>
@@ -13336,7 +13336,7 @@
         <w:pStyle w:val="Heading2"/>
       </w:pPr>
       <w:bookmarkStart w:id="24" w:name="_Toc241062261"/>
-      <w:bookmarkStart w:id="25" w:name="_Toc242136729"/>
+      <w:bookmarkStart w:id="25" w:name="_Toc242137128"/>
       <w:r>
         <w:t>1.6 Estado del Arte: Análisis de Soluciones y Vacío Tecnológico</w:t>
       </w:r>
@@ -13361,7 +13361,7 @@
         <w:pStyle w:val="Heading3"/>
       </w:pPr>
       <w:bookmarkStart w:id="26" w:name="_Toc241062262"/>
-      <w:bookmarkStart w:id="27" w:name="_Toc242136730"/>
+      <w:bookmarkStart w:id="27" w:name="_Toc242137129"/>
       <w:r>
         <w:t>1.6.0 Antecedentes académicos</w:t>
       </w:r>
@@ -13407,7 +13407,7 @@
         <w:spacing w:before="0" w:line="276" w:lineRule="auto"/>
       </w:pPr>
       <w:bookmarkStart w:id="28" w:name="_Toc241062263"/>
-      <w:bookmarkStart w:id="29" w:name="_Toc242136731"/>
+      <w:bookmarkStart w:id="29" w:name="_Toc242137130"/>
       <w:r>
         <w:t>1.6.1 Sistemas Tradicionales de Gestión de Redes Sociales (SMMS)</w:t>
       </w:r>
@@ -13455,7 +13455,7 @@
         <w:spacing w:before="0" w:line="276" w:lineRule="auto"/>
       </w:pPr>
       <w:bookmarkStart w:id="30" w:name="_Toc241062264"/>
-      <w:bookmarkStart w:id="31" w:name="_Toc242136732"/>
+      <w:bookmarkStart w:id="31" w:name="_Toc242137131"/>
       <w:r>
         <w:t>1.6.2 Plataformas Genéricas de Automatización (iPaaS)</w:t>
       </w:r>
@@ -13491,7 +13491,7 @@
         <w:spacing w:before="0" w:line="276" w:lineRule="auto"/>
       </w:pPr>
       <w:bookmarkStart w:id="32" w:name="_Toc241062265"/>
-      <w:bookmarkStart w:id="33" w:name="_Toc242136733"/>
+      <w:bookmarkStart w:id="33" w:name="_Toc242137132"/>
       <w:r>
         <w:t>1.6.3 El Vacío Tecnológico y la Propuesta de Valor de Postly</w:t>
       </w:r>
@@ -13510,7 +13510,7 @@
       <w:pPr>
         <w:keepNext/>
       </w:pPr>
-      <w:bookmarkStart w:id="34" w:name="_Toc242136858"/>
+      <w:bookmarkStart w:id="34" w:name="_Toc242137257"/>
       <w:r>
         <w:rPr>
           <w:b/>
@@ -14610,7 +14610,7 @@
         <w:pStyle w:val="Heading1"/>
       </w:pPr>
       <w:bookmarkStart w:id="35" w:name="_Toc241062266"/>
-      <w:bookmarkStart w:id="36" w:name="_Toc242136734"/>
+      <w:bookmarkStart w:id="36" w:name="_Toc242137133"/>
       <w:r>
         <w:t>CAPÍTULO 2: MARCO TEÓRICO</w:t>
       </w:r>
@@ -14639,7 +14639,7 @@
         <w:pStyle w:val="Heading2"/>
       </w:pPr>
       <w:bookmarkStart w:id="37" w:name="_Toc241062267"/>
-      <w:bookmarkStart w:id="38" w:name="_Toc242136735"/>
+      <w:bookmarkStart w:id="38" w:name="_Toc242137134"/>
       <w:r>
         <w:t>2.1 Automatización de Procesos de Negocio (BPA) y n8n</w:t>
       </w:r>
@@ -14741,7 +14741,7 @@
         <w:pStyle w:val="Heading2"/>
       </w:pPr>
       <w:bookmarkStart w:id="39" w:name="_Toc241062268"/>
-      <w:bookmarkStart w:id="40" w:name="_Toc242136736"/>
+      <w:bookmarkStart w:id="40" w:name="_Toc242137135"/>
       <w:r>
         <w:t>2.2 Modelos de Lenguaje de Gran Escala (LLM) y Multimodalidad</w:t>
       </w:r>
@@ -14831,7 +14831,7 @@
         <w:pStyle w:val="Heading2"/>
       </w:pPr>
       <w:bookmarkStart w:id="41" w:name="_Toc241062269"/>
-      <w:bookmarkStart w:id="42" w:name="_Toc242136737"/>
+      <w:bookmarkStart w:id="42" w:name="_Toc242137136"/>
       <w:r>
         <w:t>2.3 Arquitectura de Integración mediante APIs y Webhooks</w:t>
       </w:r>
@@ -15224,7 +15224,7 @@
         <w:keepNext/>
         <w:jc w:val="center"/>
       </w:pPr>
-      <w:bookmarkStart w:id="46" w:name="_Toc242136875"/>
+      <w:bookmarkStart w:id="46" w:name="_Toc242137274"/>
       <w:r>
         <w:rPr>
           <w:i/>
@@ -15346,7 +15346,7 @@
         <w:pStyle w:val="Heading2"/>
       </w:pPr>
       <w:bookmarkStart w:id="47" w:name="_Toc241062270"/>
-      <w:bookmarkStart w:id="48" w:name="_Toc242136738"/>
+      <w:bookmarkStart w:id="48" w:name="_Toc242137137"/>
       <w:r>
         <w:lastRenderedPageBreak/>
         <w:t>2.4 Normativas de Marketing y Cumplimiento Corporativo en Venta Directa</w:t>
@@ -15634,7 +15634,7 @@
         <w:pStyle w:val="Heading1"/>
       </w:pPr>
       <w:bookmarkStart w:id="52" w:name="_Toc241062271"/>
-      <w:bookmarkStart w:id="53" w:name="_Toc242136739"/>
+      <w:bookmarkStart w:id="53" w:name="_Toc242137138"/>
       <w:r>
         <w:t>CAPÍTULO 3: MARCO METODOLÓGICO</w:t>
       </w:r>
@@ -15646,7 +15646,7 @@
         <w:pStyle w:val="Heading2"/>
       </w:pPr>
       <w:bookmarkStart w:id="54" w:name="_Toc241062272"/>
-      <w:bookmarkStart w:id="55" w:name="_Toc242136740"/>
+      <w:bookmarkStart w:id="55" w:name="_Toc242137139"/>
       <w:r>
         <w:t>3.1 Tipo de investigación</w:t>
       </w:r>
@@ -15684,7 +15684,7 @@
         <w:pStyle w:val="Heading2"/>
       </w:pPr>
       <w:bookmarkStart w:id="56" w:name="_Toc241062273"/>
-      <w:bookmarkStart w:id="57" w:name="_Toc242136741"/>
+      <w:bookmarkStart w:id="57" w:name="_Toc242137140"/>
       <w:r>
         <w:t>3.2 Enfoque y Diseño de investigación</w:t>
       </w:r>
@@ -15861,7 +15861,7 @@
         <w:pStyle w:val="Heading2"/>
       </w:pPr>
       <w:bookmarkStart w:id="59" w:name="_Toc241062274"/>
-      <w:bookmarkStart w:id="60" w:name="_Toc242136742"/>
+      <w:bookmarkStart w:id="60" w:name="_Toc242137141"/>
       <w:r>
         <w:lastRenderedPageBreak/>
         <w:t>3.3 Metodología de Desarrollo (Agile/Scrum)</w:t>
@@ -15882,7 +15882,7 @@
         <w:spacing w:before="240" w:after="240" w:line="240" w:lineRule="auto"/>
       </w:pPr>
       <w:bookmarkStart w:id="62" w:name="_Toc241062275"/>
-      <w:bookmarkStart w:id="63" w:name="_Toc242136743"/>
+      <w:bookmarkStart w:id="63" w:name="_Toc242137142"/>
       <w:r>
         <w:t>3.3.1 Marco metodológico de desarrollo</w:t>
       </w:r>
@@ -15913,7 +15913,7 @@
         <w:spacing w:before="240" w:after="240" w:line="240" w:lineRule="auto"/>
       </w:pPr>
       <w:bookmarkStart w:id="64" w:name="_Toc241062276"/>
-      <w:bookmarkStart w:id="65" w:name="_Toc242136744"/>
+      <w:bookmarkStart w:id="65" w:name="_Toc242137143"/>
       <w:r>
         <w:t>3.3.2 Implementación de la metodología: Sprints de desarrollo</w:t>
       </w:r>
@@ -15941,7 +15941,7 @@
         <w:pStyle w:val="Heading3"/>
         <w:spacing w:before="240" w:after="240" w:line="240" w:lineRule="auto"/>
       </w:pPr>
-      <w:bookmarkStart w:id="66" w:name="_Toc242136745"/>
+      <w:bookmarkStart w:id="66" w:name="_Toc242137144"/>
       <w:r>
         <w:t>3.3.3 Riesgos del proyecto y decisiones de diseño derivadas</w:t>
       </w:r>
@@ -15963,7 +15963,7 @@
       <w:pPr>
         <w:keepNext/>
       </w:pPr>
-      <w:bookmarkStart w:id="67" w:name="_Toc242136859"/>
+      <w:bookmarkStart w:id="67" w:name="_Toc242137258"/>
       <w:r>
         <w:rPr>
           <w:b/>
@@ -16500,7 +16500,7 @@
         <w:pStyle w:val="Heading2"/>
       </w:pPr>
       <w:bookmarkStart w:id="68" w:name="_Toc241062277"/>
-      <w:bookmarkStart w:id="69" w:name="_Toc242136746"/>
+      <w:bookmarkStart w:id="69" w:name="_Toc242137145"/>
       <w:r>
         <w:t>3.4 Técnicas de recolección de datos e instrumentos</w:t>
       </w:r>
@@ -16525,7 +16525,7 @@
         <w:pStyle w:val="Heading3"/>
       </w:pPr>
       <w:bookmarkStart w:id="70" w:name="_Toc241062278"/>
-      <w:bookmarkStart w:id="71" w:name="_Toc242136747"/>
+      <w:bookmarkStart w:id="71" w:name="_Toc242137146"/>
       <w:r>
         <w:t>3.4.1 Recolección de información para el análisis del problema</w:t>
       </w:r>
@@ -16609,7 +16609,7 @@
         <w:pStyle w:val="Heading3"/>
       </w:pPr>
       <w:bookmarkStart w:id="72" w:name="_Toc241062279"/>
-      <w:bookmarkStart w:id="73" w:name="_Toc242136748"/>
+      <w:bookmarkStart w:id="73" w:name="_Toc242137147"/>
       <w:r>
         <w:lastRenderedPageBreak/>
         <w:t>3.4.2 Técnicas de validación técnica del sistema</w:t>
@@ -16751,7 +16751,7 @@
         <w:pStyle w:val="Heading3"/>
       </w:pPr>
       <w:bookmarkStart w:id="74" w:name="_Toc241062280"/>
-      <w:bookmarkStart w:id="75" w:name="_Toc242136749"/>
+      <w:bookmarkStart w:id="75" w:name="_Toc242137148"/>
       <w:r>
         <w:t>3.4.3 Limitaciones y alcance de la recolección de datos</w:t>
       </w:r>
@@ -16791,7 +16791,7 @@
         <w:pStyle w:val="Heading2"/>
       </w:pPr>
       <w:bookmarkStart w:id="76" w:name="_Toc241062281"/>
-      <w:bookmarkStart w:id="77" w:name="_Toc242136750"/>
+      <w:bookmarkStart w:id="77" w:name="_Toc242137149"/>
       <w:r>
         <w:t>3.5 Población, Muestra y Diseño de la Evaluación</w:t>
       </w:r>
@@ -16816,7 +16816,7 @@
         <w:pStyle w:val="Heading3"/>
       </w:pPr>
       <w:bookmarkStart w:id="78" w:name="_Toc241062282"/>
-      <w:bookmarkStart w:id="79" w:name="_Toc242136751"/>
+      <w:bookmarkStart w:id="79" w:name="_Toc242137150"/>
       <w:r>
         <w:t>3.5.1 Población objetivo</w:t>
       </w:r>
@@ -16849,7 +16849,7 @@
         <w:pStyle w:val="Heading3"/>
       </w:pPr>
       <w:bookmarkStart w:id="80" w:name="_Toc241062283"/>
-      <w:bookmarkStart w:id="81" w:name="_Toc242136752"/>
+      <w:bookmarkStart w:id="81" w:name="_Toc242137151"/>
       <w:r>
         <w:lastRenderedPageBreak/>
         <w:t>3.5.2 Definición de la muestra</w:t>
@@ -16891,7 +16891,7 @@
         <w:pStyle w:val="Heading3"/>
       </w:pPr>
       <w:bookmarkStart w:id="82" w:name="_Toc241062284"/>
-      <w:bookmarkStart w:id="83" w:name="_Toc242136753"/>
+      <w:bookmarkStart w:id="83" w:name="_Toc242137152"/>
       <w:r>
         <w:t>3.5.3 Consideraciones sobre el tamaño muestral</w:t>
       </w:r>
@@ -16926,7 +16926,7 @@
         <w:pStyle w:val="Heading3"/>
       </w:pPr>
       <w:bookmarkStart w:id="84" w:name="_Toc241062285"/>
-      <w:bookmarkStart w:id="85" w:name="_Toc242136754"/>
+      <w:bookmarkStart w:id="85" w:name="_Toc242137153"/>
       <w:r>
         <w:lastRenderedPageBreak/>
         <w:t>3.5.4 Variables e instrumentos de medición</w:t>
@@ -16964,7 +16964,7 @@
         <w:pStyle w:val="Heading3"/>
       </w:pPr>
       <w:bookmarkStart w:id="86" w:name="_Toc241062286"/>
-      <w:bookmarkStart w:id="87" w:name="_Toc242136755"/>
+      <w:bookmarkStart w:id="87" w:name="_Toc242137154"/>
       <w:r>
         <w:t>3.5.5 Amenazas a la validez</w:t>
       </w:r>
@@ -17031,7 +17031,7 @@
         <w:pStyle w:val="Heading2"/>
       </w:pPr>
       <w:bookmarkStart w:id="88" w:name="_Toc241062287"/>
-      <w:bookmarkStart w:id="89" w:name="_Toc242136756"/>
+      <w:bookmarkStart w:id="89" w:name="_Toc242137155"/>
       <w:r>
         <w:t>3.6 Herramientas y Tecnologías Seleccionadas</w:t>
       </w:r>
@@ -17064,7 +17064,7 @@
         <w:pStyle w:val="Heading3"/>
       </w:pPr>
       <w:bookmarkStart w:id="90" w:name="_Toc241062288"/>
-      <w:bookmarkStart w:id="91" w:name="_Toc242136757"/>
+      <w:bookmarkStart w:id="91" w:name="_Toc242137156"/>
       <w:r>
         <w:t>3.6.1 Motor de automatización: n8n</w:t>
       </w:r>
@@ -17098,7 +17098,7 @@
         <w:pStyle w:val="Heading3"/>
       </w:pPr>
       <w:bookmarkStart w:id="92" w:name="_Toc241062289"/>
-      <w:bookmarkStart w:id="93" w:name="_Toc242136758"/>
+      <w:bookmarkStart w:id="93" w:name="_Toc242137157"/>
       <w:r>
         <w:t>3.6.2 Modelo multimodal, integraciones y arquitectura</w:t>
       </w:r>
@@ -17147,7 +17147,7 @@
         <w:spacing w:before="280"/>
       </w:pPr>
       <w:bookmarkStart w:id="94" w:name="_Toc241062290"/>
-      <w:bookmarkStart w:id="95" w:name="_Toc242136759"/>
+      <w:bookmarkStart w:id="95" w:name="_Toc242137158"/>
       <w:r>
         <w:t>3.7 Consideraciones éticas y legales</w:t>
       </w:r>
@@ -17182,7 +17182,7 @@
         <w:pStyle w:val="Heading3"/>
       </w:pPr>
       <w:bookmarkStart w:id="96" w:name="_Toc241062291"/>
-      <w:bookmarkStart w:id="97" w:name="_Toc242136760"/>
+      <w:bookmarkStart w:id="97" w:name="_Toc242137159"/>
       <w:r>
         <w:t>3.7.1 Protección de datos personales y Privacidad desde el Diseño</w:t>
       </w:r>
@@ -17229,7 +17229,7 @@
         <w:pStyle w:val="Heading3"/>
       </w:pPr>
       <w:bookmarkStart w:id="98" w:name="_Toc241062292"/>
-      <w:bookmarkStart w:id="99" w:name="_Toc242136761"/>
+      <w:bookmarkStart w:id="99" w:name="_Toc242137160"/>
       <w:r>
         <w:t>3.7.2 Seguridad en la autenticación, acceso y soberanía</w:t>
       </w:r>
@@ -17267,7 +17267,7 @@
         <w:pStyle w:val="Heading3"/>
       </w:pPr>
       <w:bookmarkStart w:id="100" w:name="_Toc241062293"/>
-      <w:bookmarkStart w:id="101" w:name="_Toc242136762"/>
+      <w:bookmarkStart w:id="101" w:name="_Toc242137161"/>
       <w:r>
         <w:t>3.7.3 Ética en la Inteligencia Artificial (</w:t>
       </w:r>
@@ -17315,7 +17315,7 @@
         <w:pStyle w:val="Heading3"/>
       </w:pPr>
       <w:bookmarkStart w:id="102" w:name="_Toc241062294"/>
-      <w:bookmarkStart w:id="103" w:name="_Toc242136763"/>
+      <w:bookmarkStart w:id="103" w:name="_Toc242137162"/>
       <w:r>
         <w:t>3.7.4 Auditoría de compliance y exposición de la consultora ante la normativa de la marca</w:t>
       </w:r>
@@ -17350,7 +17350,7 @@
         <w:pStyle w:val="Heading3"/>
       </w:pPr>
       <w:bookmarkStart w:id="104" w:name="_Toc241062295"/>
-      <w:bookmarkStart w:id="105" w:name="_Toc242136764"/>
+      <w:bookmarkStart w:id="105" w:name="_Toc242137163"/>
       <w:r>
         <w:t>3.7.5 Responsabilidad en la automatización y uso indebido</w:t>
       </w:r>
@@ -17370,7 +17370,7 @@
         <w:pStyle w:val="Heading3"/>
       </w:pPr>
       <w:bookmarkStart w:id="106" w:name="_Toc241062296"/>
-      <w:bookmarkStart w:id="107" w:name="_Toc242136765"/>
+      <w:bookmarkStart w:id="107" w:name="_Toc242137164"/>
       <w:r>
         <w:t>3.7.6 Ética de la investigación</w:t>
       </w:r>
@@ -17394,7 +17394,7 @@
       </w:r>
       <w:r>
         <w:lastRenderedPageBreak/>
-        <w:t>las tres del piloto, firmaron un consentimiento informado antes de la sesión (protocolo de la ampliación, apartado 7). Los dos evaluadores externos, las tres autoras del corpus y la consultora que aportó R01, que habían participado con un acuerdo verbal, firmaron a comienzos de octubre de 2026 un consentimiento retroactivo. Describe su participación y el uso de su material, y queda en poder de los autores sin publicarse. La tercera evaluadora de los Estudios 1 y 4 firmó el suyo antes de participar, y la consultora de la prueba de vinculación (Anexo B.1), el mismo día de la prueba. La consultora que filmó los videos del Anexo E.9, una de las ocho participantes, consintió el uso de ese material, pero ese consentimiento no se formalizó por escrito aparte. El segundo usuario de la prueba con dos cuentas de Telegram (Anexo B.1) es uno de los autores.</w:t>
+        <w:t>las tres del piloto, firmaron un consentimiento informado antes de la sesión (protocolo de la ampliación, apartado 7). Los dos evaluadores externos, las tres autoras del corpus y la consultora que aportó R01, que habían participado con un acuerdo verbal, firmaron a comienzos de octubre de 2026 un consentimiento retroactivo. Describe su participación y el uso de su material, y queda en poder de los autores sin publicarse. La tercera evaluadora de los Estudios 1 y 4 firmó el suyo antes de participar, y la consultora de la prueba de vinculación (Anexo B.1), el mismo día de la prueba. La consultora que filmó los videos del Anexo E.9, una de las ocho participantes, consintió verbalmente el uso de ese material y lo formalizó por escrito, también retroactivo, el 5 de octubre de 2026. El segundo usuario de la prueba con dos cuentas de Telegram (Anexo B.1) es uno de los autores.</w:t>
       </w:r>
     </w:p>
     <w:p>
@@ -17498,7 +17498,7 @@
         <w:pStyle w:val="Heading1"/>
       </w:pPr>
       <w:bookmarkStart w:id="108" w:name="_Toc241062297"/>
-      <w:bookmarkStart w:id="109" w:name="_Toc242136766"/>
+      <w:bookmarkStart w:id="109" w:name="_Toc242137165"/>
       <w:r>
         <w:t>CAPÍTULO 4: DESARROLLO DEL ESTUDIO</w:t>
       </w:r>
@@ -17517,7 +17517,7 @@
         <w:pStyle w:val="Heading2"/>
       </w:pPr>
       <w:bookmarkStart w:id="110" w:name="_Toc241062298"/>
-      <w:bookmarkStart w:id="111" w:name="_Toc242136767"/>
+      <w:bookmarkStart w:id="111" w:name="_Toc242137166"/>
       <w:r>
         <w:lastRenderedPageBreak/>
         <w:t>4.1 Historias de Usuario y Criterios de Aceptación</w:t>
@@ -17562,7 +17562,7 @@
         <w:spacing w:before="360" w:line="240" w:lineRule="auto"/>
       </w:pPr>
       <w:bookmarkStart w:id="112" w:name="_Toc241062299"/>
-      <w:bookmarkStart w:id="113" w:name="_Toc242136768"/>
+      <w:bookmarkStart w:id="113" w:name="_Toc242137167"/>
       <w:r>
         <w:t>4.1.1 Módulo A: Seguridad, Onboarding y Autenticación</w:t>
       </w:r>
@@ -17976,7 +17976,7 @@
         <w:spacing w:before="0" w:line="276" w:lineRule="auto"/>
       </w:pPr>
       <w:bookmarkStart w:id="114" w:name="_Toc241062300"/>
-      <w:bookmarkStart w:id="115" w:name="_Toc242136769"/>
+      <w:bookmarkStart w:id="115" w:name="_Toc242137168"/>
       <w:r>
         <w:t>4.1.2 Módulo B: Creación de Contenido Asistida por IA</w:t>
       </w:r>
@@ -18392,7 +18392,7 @@
         <w:spacing w:before="0" w:line="276" w:lineRule="auto"/>
       </w:pPr>
       <w:bookmarkStart w:id="116" w:name="_Toc241062301"/>
-      <w:bookmarkStart w:id="117" w:name="_Toc242136770"/>
+      <w:bookmarkStart w:id="117" w:name="_Toc242137169"/>
       <w:r>
         <w:t>4.1.3 Módulo C: Auditoría de Compliance (Módulo Centinela)</w:t>
       </w:r>
@@ -18775,7 +18775,7 @@
         <w:spacing w:before="0" w:line="276" w:lineRule="auto"/>
       </w:pPr>
       <w:bookmarkStart w:id="118" w:name="_Toc241062302"/>
-      <w:bookmarkStart w:id="119" w:name="_Toc242136771"/>
+      <w:bookmarkStart w:id="119" w:name="_Toc242137170"/>
       <w:r>
         <w:t>4.1.4 Módulo D: Gestión de Publicación y Agenda</w:t>
       </w:r>
@@ -18935,7 +18935,7 @@
         <w:keepNext/>
         <w:jc w:val="center"/>
       </w:pPr>
-      <w:bookmarkStart w:id="120" w:name="_Toc242136876"/>
+      <w:bookmarkStart w:id="120" w:name="_Toc242137275"/>
       <w:r>
         <w:rPr>
           <w:i/>
@@ -19282,7 +19282,7 @@
         <w:spacing w:before="0" w:line="276" w:lineRule="auto"/>
       </w:pPr>
       <w:bookmarkStart w:id="121" w:name="_Toc241062303"/>
-      <w:bookmarkStart w:id="122" w:name="_Toc242136772"/>
+      <w:bookmarkStart w:id="122" w:name="_Toc242137171"/>
       <w:r>
         <w:t>4.1.5 Módulo E: Procesamiento Multimedia y Analítica de Datos</w:t>
       </w:r>
@@ -19548,7 +19548,7 @@
         <w:pStyle w:val="Heading2"/>
       </w:pPr>
       <w:bookmarkStart w:id="123" w:name="_Toc241062304"/>
-      <w:bookmarkStart w:id="124" w:name="_Toc242136773"/>
+      <w:bookmarkStart w:id="124" w:name="_Toc242137172"/>
       <w:r>
         <w:t>4.2 Definición del Producto Mínimo Viable (MVP)</w:t>
       </w:r>
@@ -19572,7 +19572,7 @@
           <w:lang w:val="en-US"/>
         </w:rPr>
       </w:pPr>
-      <w:bookmarkStart w:id="125" w:name="_Toc242136877"/>
+      <w:bookmarkStart w:id="125" w:name="_Toc242137276"/>
       <w:r>
         <w:rPr>
           <w:i/>
@@ -19857,7 +19857,7 @@
         <w:pStyle w:val="Heading2"/>
       </w:pPr>
       <w:bookmarkStart w:id="126" w:name="_Toc241062305"/>
-      <w:bookmarkStart w:id="127" w:name="_Toc242136774"/>
+      <w:bookmarkStart w:id="127" w:name="_Toc242137173"/>
       <w:r>
         <w:t>4.3 Implementación de Lógica de Auditoría y Compliance</w:t>
       </w:r>
@@ -19899,7 +19899,7 @@
         <w:spacing w:before="0" w:line="276" w:lineRule="auto"/>
       </w:pPr>
       <w:bookmarkStart w:id="128" w:name="_Toc241062306"/>
-      <w:bookmarkStart w:id="129" w:name="_Toc242136775"/>
+      <w:bookmarkStart w:id="129" w:name="_Toc242137174"/>
       <w:r>
         <w:t>4.3.1 Detección Multimodal de Precios y Restricciones Comerciales</w:t>
       </w:r>
@@ -20023,7 +20023,7 @@
         <w:spacing w:before="0" w:line="276" w:lineRule="auto"/>
       </w:pPr>
       <w:bookmarkStart w:id="130" w:name="_Toc241062307"/>
-      <w:bookmarkStart w:id="131" w:name="_Toc242136776"/>
+      <w:bookmarkStart w:id="131" w:name="_Toc242137175"/>
       <w:r>
         <w:t>4.3.2 Automatización de Identidad y Transparencia Corporativa</w:t>
       </w:r>
@@ -20091,7 +20091,7 @@
         <w:spacing w:before="0" w:line="276" w:lineRule="auto"/>
       </w:pPr>
       <w:bookmarkStart w:id="132" w:name="_Toc241062308"/>
-      <w:bookmarkStart w:id="133" w:name="_Toc242136777"/>
+      <w:bookmarkStart w:id="133" w:name="_Toc242137176"/>
       <w:r>
         <w:t>4.4 Procesamiento Multimedia y Optimización de Archivos</w:t>
       </w:r>
@@ -20121,7 +20121,7 @@
         <w:spacing w:before="0" w:line="276" w:lineRule="auto"/>
       </w:pPr>
       <w:bookmarkStart w:id="135" w:name="_Toc241062309"/>
-      <w:bookmarkStart w:id="136" w:name="_Toc242136778"/>
+      <w:bookmarkStart w:id="136" w:name="_Toc242137177"/>
       <w:r>
         <w:t>4.4.1 Integración de FFmpeg y Normalización de Formatos</w:t>
       </w:r>
@@ -20151,7 +20151,7 @@
         <w:spacing w:before="0" w:line="276" w:lineRule="auto"/>
       </w:pPr>
       <w:bookmarkStart w:id="138" w:name="_Toc241062310"/>
-      <w:bookmarkStart w:id="139" w:name="_Toc242136779"/>
+      <w:bookmarkStart w:id="139" w:name="_Toc242137178"/>
       <w:r>
         <w:t>4.4.2 Tratamiento de Imágenes para Carruseles y Feeds</w:t>
       </w:r>
@@ -20228,7 +20228,7 @@
         <w:spacing w:before="0" w:line="276" w:lineRule="auto"/>
       </w:pPr>
       <w:bookmarkStart w:id="141" w:name="_Toc241062311"/>
-      <w:bookmarkStart w:id="142" w:name="_Toc242136780"/>
+      <w:bookmarkStart w:id="142" w:name="_Toc242137179"/>
       <w:r>
         <w:t>4.4.3 Validación y Tratamiento de Video (Reels)</w:t>
       </w:r>
@@ -20391,7 +20391,7 @@
         <w:spacing w:before="0" w:line="276" w:lineRule="auto"/>
       </w:pPr>
       <w:bookmarkStart w:id="143" w:name="_Toc241062312"/>
-      <w:bookmarkStart w:id="144" w:name="_Toc242136781"/>
+      <w:bookmarkStart w:id="144" w:name="_Toc242137180"/>
       <w:r>
         <w:t>CAPÍTULO 5: ARQUITECTURA E INTERFAZ DE VISUALIZACIÓN</w:t>
       </w:r>
@@ -20411,7 +20411,7 @@
         <w:pStyle w:val="Heading2"/>
       </w:pPr>
       <w:bookmarkStart w:id="145" w:name="_Toc241062313"/>
-      <w:bookmarkStart w:id="146" w:name="_Toc242136782"/>
+      <w:bookmarkStart w:id="146" w:name="_Toc242137181"/>
       <w:r>
         <w:t>5.1 Arquitectura del Sistema Postly</w:t>
       </w:r>
@@ -20462,7 +20462,7 @@
         <w:keepNext/>
         <w:jc w:val="center"/>
       </w:pPr>
-      <w:bookmarkStart w:id="147" w:name="_Toc242136878"/>
+      <w:bookmarkStart w:id="147" w:name="_Toc242137277"/>
       <w:r>
         <w:rPr>
           <w:i/>
@@ -20584,7 +20584,7 @@
         <w:pStyle w:val="Heading3"/>
       </w:pPr>
       <w:bookmarkStart w:id="148" w:name="_Toc241062314"/>
-      <w:bookmarkStart w:id="149" w:name="_Toc242136783"/>
+      <w:bookmarkStart w:id="149" w:name="_Toc242137182"/>
       <w:r>
         <w:lastRenderedPageBreak/>
         <w:t>5.1.1 Capas de la arquitectura</w:t>
@@ -20740,7 +20740,7 @@
         <w:keepNext/>
         <w:jc w:val="center"/>
       </w:pPr>
-      <w:bookmarkStart w:id="150" w:name="_Toc242136879"/>
+      <w:bookmarkStart w:id="150" w:name="_Toc242137278"/>
       <w:r>
         <w:rPr>
           <w:i/>
@@ -20896,7 +20896,7 @@
         <w:pStyle w:val="Heading3"/>
       </w:pPr>
       <w:bookmarkStart w:id="151" w:name="_Toc241062315"/>
-      <w:bookmarkStart w:id="152" w:name="_Toc242136784"/>
+      <w:bookmarkStart w:id="152" w:name="_Toc242137183"/>
       <w:r>
         <w:t>5.1.2 Flujo de datos entre componentes</w:t>
       </w:r>
@@ -21120,7 +21120,7 @@
         <w:pStyle w:val="Heading3"/>
       </w:pPr>
       <w:bookmarkStart w:id="153" w:name="_Toc241062316"/>
-      <w:bookmarkStart w:id="154" w:name="_Toc242136785"/>
+      <w:bookmarkStart w:id="154" w:name="_Toc242137184"/>
       <w:r>
         <w:t>5.1.3 Principios de diseño adoptados</w:t>
       </w:r>
@@ -21244,7 +21244,7 @@
         <w:pStyle w:val="Heading3"/>
       </w:pPr>
       <w:bookmarkStart w:id="155" w:name="_Toc241062317"/>
-      <w:bookmarkStart w:id="156" w:name="_Toc242136786"/>
+      <w:bookmarkStart w:id="156" w:name="_Toc242137185"/>
       <w:r>
         <w:lastRenderedPageBreak/>
         <w:t>5.1.4 Consideraciones sobre la evolución arquitectónica</w:t>
@@ -21276,7 +21276,7 @@
         <w:pStyle w:val="Heading2"/>
       </w:pPr>
       <w:bookmarkStart w:id="157" w:name="_Toc241062318"/>
-      <w:bookmarkStart w:id="158" w:name="_Toc242136787"/>
+      <w:bookmarkStart w:id="158" w:name="_Toc242137186"/>
       <w:r>
         <w:t>5.2 Diseño de Flujos de Trabajo en n8n</w:t>
       </w:r>
@@ -21301,7 +21301,7 @@
         <w:pStyle w:val="Heading3"/>
       </w:pPr>
       <w:bookmarkStart w:id="159" w:name="_Toc241062319"/>
-      <w:bookmarkStart w:id="160" w:name="_Toc242136788"/>
+      <w:bookmarkStart w:id="160" w:name="_Toc242137187"/>
       <w:r>
         <w:t>5.2.1 Workflow de Creación y Publicación Inteligente</w:t>
       </w:r>
@@ -21347,7 +21347,7 @@
         <w:keepNext/>
         <w:jc w:val="center"/>
       </w:pPr>
-      <w:bookmarkStart w:id="161" w:name="_Toc242136880"/>
+      <w:bookmarkStart w:id="161" w:name="_Toc242137279"/>
       <w:r>
         <w:rPr>
           <w:i/>
@@ -21511,7 +21511,7 @@
         <w:keepNext/>
         <w:jc w:val="center"/>
       </w:pPr>
-      <w:bookmarkStart w:id="162" w:name="_Toc242136881"/>
+      <w:bookmarkStart w:id="162" w:name="_Toc242137280"/>
       <w:r>
         <w:rPr>
           <w:i/>
@@ -21680,7 +21680,7 @@
         <w:keepNext/>
         <w:jc w:val="center"/>
       </w:pPr>
-      <w:bookmarkStart w:id="163" w:name="_Toc242136882"/>
+      <w:bookmarkStart w:id="163" w:name="_Toc242137281"/>
       <w:r>
         <w:rPr>
           <w:i/>
@@ -21911,7 +21911,7 @@
         <w:keepNext/>
         <w:jc w:val="center"/>
       </w:pPr>
-      <w:bookmarkStart w:id="164" w:name="_Toc242136883"/>
+      <w:bookmarkStart w:id="164" w:name="_Toc242137282"/>
       <w:r>
         <w:rPr>
           <w:i/>
@@ -22026,7 +22026,7 @@
         <w:keepNext/>
         <w:jc w:val="center"/>
       </w:pPr>
-      <w:bookmarkStart w:id="165" w:name="_Toc242136884"/>
+      <w:bookmarkStart w:id="165" w:name="_Toc242137283"/>
       <w:r>
         <w:rPr>
           <w:i/>
@@ -22155,7 +22155,7 @@
           <w:sz w:val="20"/>
         </w:rPr>
       </w:pPr>
-      <w:bookmarkStart w:id="166" w:name="_Toc242136885"/>
+      <w:bookmarkStart w:id="166" w:name="_Toc242137284"/>
       <w:r>
         <w:rPr>
           <w:i/>
@@ -22280,7 +22280,7 @@
       <w:pPr>
         <w:pStyle w:val="Heading3"/>
       </w:pPr>
-      <w:bookmarkStart w:id="168" w:name="_Toc242136789"/>
+      <w:bookmarkStart w:id="168" w:name="_Toc242137188"/>
       <w:r>
         <w:t>5.2.2 Workflow de Gestión de Agenda y Estados</w:t>
       </w:r>
@@ -22381,7 +22381,7 @@
         <w:pStyle w:val="Heading3"/>
       </w:pPr>
       <w:bookmarkStart w:id="169" w:name="_Toc241062321"/>
-      <w:bookmarkStart w:id="170" w:name="_Toc242136790"/>
+      <w:bookmarkStart w:id="170" w:name="_Toc242137189"/>
       <w:r>
         <w:t>5.2.3 Workflow de Configuración y Tutorial de Vinculación</w:t>
       </w:r>
@@ -22500,7 +22500,7 @@
         <w:pStyle w:val="Heading2"/>
       </w:pPr>
       <w:bookmarkStart w:id="171" w:name="_Toc241062322"/>
-      <w:bookmarkStart w:id="172" w:name="_Toc242136791"/>
+      <w:bookmarkStart w:id="172" w:name="_Toc242137190"/>
       <w:r>
         <w:t>5.3 Diseño de la Experiencia de Usuario (User Journey)</w:t>
       </w:r>
@@ -22633,7 +22633,7 @@
         <w:spacing w:before="0" w:line="276" w:lineRule="auto"/>
       </w:pPr>
       <w:bookmarkStart w:id="173" w:name="_Toc241062323"/>
-      <w:bookmarkStart w:id="174" w:name="_Toc242136792"/>
+      <w:bookmarkStart w:id="174" w:name="_Toc242137191"/>
       <w:r>
         <w:t>CAPÍTULO 6: RESULTADOS</w:t>
       </w:r>
@@ -22680,7 +22680,7 @@
         <w:spacing w:before="0" w:line="276" w:lineRule="auto"/>
       </w:pPr>
       <w:bookmarkStart w:id="175" w:name="_Toc241062324"/>
-      <w:bookmarkStart w:id="176" w:name="_Toc242136793"/>
+      <w:bookmarkStart w:id="176" w:name="_Toc242137192"/>
       <w:r>
         <w:t>6.1 Validación empírica del artefacto</w:t>
       </w:r>
@@ -22751,7 +22751,7 @@
         <w:spacing w:before="360" w:line="240" w:lineRule="auto"/>
       </w:pPr>
       <w:bookmarkStart w:id="177" w:name="_Toc241062325"/>
-      <w:bookmarkStart w:id="178" w:name="_Toc242136794"/>
+      <w:bookmarkStart w:id="178" w:name="_Toc242137193"/>
       <w:r>
         <w:t>6.1.1 Validación empírica del Módulo Centinela</w:t>
       </w:r>
@@ -22819,7 +22819,7 @@
           <w:i/>
         </w:rPr>
       </w:pPr>
-      <w:bookmarkStart w:id="179" w:name="_Toc242136860"/>
+      <w:bookmarkStart w:id="179" w:name="_Toc242137259"/>
       <w:r>
         <w:rPr>
           <w:b/>
@@ -23058,7 +23058,7 @@
       <w:pPr>
         <w:keepNext/>
       </w:pPr>
-      <w:bookmarkStart w:id="180" w:name="_Toc242136861"/>
+      <w:bookmarkStart w:id="180" w:name="_Toc242137260"/>
       <w:r>
         <w:rPr>
           <w:b/>
@@ -23403,7 +23403,7 @@
         <w:keepNext/>
         <w:jc w:val="center"/>
       </w:pPr>
-      <w:bookmarkStart w:id="181" w:name="_Toc242136886"/>
+      <w:bookmarkStart w:id="181" w:name="_Toc242137285"/>
       <w:r>
         <w:rPr>
           <w:i/>
@@ -23542,7 +23542,7 @@
         <w:keepNext/>
         <w:jc w:val="center"/>
       </w:pPr>
-      <w:bookmarkStart w:id="182" w:name="_Toc242136887"/>
+      <w:bookmarkStart w:id="182" w:name="_Toc242137286"/>
       <w:r>
         <w:rPr>
           <w:i/>
@@ -23684,7 +23684,7 @@
         <w:keepNext/>
         <w:jc w:val="center"/>
       </w:pPr>
-      <w:bookmarkStart w:id="183" w:name="_Toc242136888"/>
+      <w:bookmarkStart w:id="183" w:name="_Toc242137287"/>
       <w:r>
         <w:rPr>
           <w:i/>
@@ -23827,7 +23827,7 @@
           <w:sz w:val="20"/>
         </w:rPr>
       </w:pPr>
-      <w:bookmarkStart w:id="184" w:name="_Toc242136889"/>
+      <w:bookmarkStart w:id="184" w:name="_Toc242137288"/>
       <w:r>
         <w:rPr>
           <w:i/>
@@ -23977,7 +23977,7 @@
         <w:spacing w:before="360" w:line="240" w:lineRule="auto"/>
       </w:pPr>
       <w:bookmarkStart w:id="185" w:name="_Toc241062326"/>
-      <w:bookmarkStart w:id="186" w:name="_Toc242136795"/>
+      <w:bookmarkStart w:id="186" w:name="_Toc242137194"/>
       <w:r>
         <w:t>6.1.2 Conjunto ampliado del canal de imagen (HU8)</w:t>
       </w:r>
@@ -24036,7 +24036,7 @@
         <w:spacing w:before="360" w:line="240" w:lineRule="auto"/>
       </w:pPr>
       <w:bookmarkStart w:id="187" w:name="_Toc241062327"/>
-      <w:bookmarkStart w:id="188" w:name="_Toc242136796"/>
+      <w:bookmarkStart w:id="188" w:name="_Toc242137195"/>
       <w:r>
         <w:t>6.1.3 Validación con contenido real y evaluación externa</w:t>
       </w:r>
@@ -24063,7 +24063,7 @@
       <w:pPr>
         <w:keepNext/>
       </w:pPr>
-      <w:bookmarkStart w:id="189" w:name="_Toc242136862"/>
+      <w:bookmarkStart w:id="189" w:name="_Toc242137261"/>
       <w:r>
         <w:rPr>
           <w:b/>
@@ -24553,7 +24553,7 @@
         <w:spacing w:before="360" w:line="240" w:lineRule="auto"/>
       </w:pPr>
       <w:bookmarkStart w:id="190" w:name="_Toc241062328"/>
-      <w:bookmarkStart w:id="191" w:name="_Toc242136797"/>
+      <w:bookmarkStart w:id="191" w:name="_Toc242137196"/>
       <w:r>
         <w:t>6.1.4 Análisis de valores límite y refinamiento del detector</w:t>
       </w:r>
@@ -24616,7 +24616,7 @@
       <w:pPr>
         <w:keepNext/>
       </w:pPr>
-      <w:bookmarkStart w:id="192" w:name="_Toc242136863"/>
+      <w:bookmarkStart w:id="192" w:name="_Toc242137262"/>
       <w:r>
         <w:rPr>
           <w:b/>
@@ -25433,7 +25433,7 @@
         <w:spacing w:before="360" w:line="240" w:lineRule="auto"/>
       </w:pPr>
       <w:bookmarkStart w:id="193" w:name="_Toc241062329"/>
-      <w:bookmarkStart w:id="194" w:name="_Toc242136798"/>
+      <w:bookmarkStart w:id="194" w:name="_Toc242137197"/>
       <w:r>
         <w:t>6.1.5 Baterías de validación técnica del sistema</w:t>
       </w:r>
@@ -25468,7 +25468,7 @@
         <w:spacing w:before="360" w:line="240" w:lineRule="auto"/>
       </w:pPr>
       <w:bookmarkStart w:id="195" w:name="_Toc241062330"/>
-      <w:bookmarkStart w:id="196" w:name="_Toc242136799"/>
+      <w:bookmarkStart w:id="196" w:name="_Toc242137198"/>
       <w:r>
         <w:t>6.1.6 Reducción del tiempo operativo y contraste de la hipótesis</w:t>
       </w:r>
@@ -25506,7 +25506,7 @@
           <w:i/>
         </w:rPr>
       </w:pPr>
-      <w:bookmarkStart w:id="197" w:name="_Toc242136864"/>
+      <w:bookmarkStart w:id="197" w:name="_Toc242137263"/>
       <w:r>
         <w:rPr>
           <w:b/>
@@ -26182,7 +26182,7 @@
         <w:spacing w:before="360" w:line="240" w:lineRule="auto"/>
       </w:pPr>
       <w:bookmarkStart w:id="198" w:name="_Toc241062331"/>
-      <w:bookmarkStart w:id="199" w:name="_Toc242136800"/>
+      <w:bookmarkStart w:id="199" w:name="_Toc242137199"/>
       <w:r>
         <w:t>6.1.7 Aceptación de las usuarias (Modelo TAM)</w:t>
       </w:r>
@@ -26201,7 +26201,7 @@
       <w:pPr>
         <w:keepNext/>
       </w:pPr>
-      <w:bookmarkStart w:id="200" w:name="_Toc242136865"/>
+      <w:bookmarkStart w:id="200" w:name="_Toc242137264"/>
       <w:r>
         <w:rPr>
           <w:b/>
@@ -26462,7 +26462,7 @@
         <w:pStyle w:val="Heading3"/>
         <w:spacing w:before="360" w:line="240" w:lineRule="auto"/>
       </w:pPr>
-      <w:bookmarkStart w:id="201" w:name="_Toc242136801"/>
+      <w:bookmarkStart w:id="201" w:name="_Toc242137200"/>
       <w:r>
         <w:t>6.1.8 Evaluación externa de la calidad del copy y del orden de carrusel (OE2)</w:t>
       </w:r>
@@ -26484,7 +26484,7 @@
         <w:spacing w:before="0" w:line="276" w:lineRule="auto"/>
       </w:pPr>
       <w:bookmarkStart w:id="202" w:name="_Toc241062332"/>
-      <w:bookmarkStart w:id="203" w:name="_Toc242136802"/>
+      <w:bookmarkStart w:id="203" w:name="_Toc242137201"/>
       <w:r>
         <w:t>6.2 Desafíos de Integración y Lecciones Aprendidas</w:t>
       </w:r>
@@ -26605,7 +26605,7 @@
         <w:pStyle w:val="Heading1"/>
       </w:pPr>
       <w:bookmarkStart w:id="204" w:name="_Toc241062334"/>
-      <w:bookmarkStart w:id="205" w:name="_Toc242136803"/>
+      <w:bookmarkStart w:id="205" w:name="_Toc242137202"/>
       <w:r>
         <w:t>CAPÍTULO 7: DISCUSIÓN</w:t>
       </w:r>
@@ -26623,7 +26623,7 @@
         <w:spacing w:after="240" w:line="276" w:lineRule="auto"/>
       </w:pPr>
       <w:bookmarkStart w:id="206" w:name="_Toc241062335"/>
-      <w:bookmarkStart w:id="207" w:name="_Toc242136804"/>
+      <w:bookmarkStart w:id="207" w:name="_Toc242137203"/>
       <w:r>
         <w:t>7.1 Contraste con la literatura sobre interfaces conversacionales</w:t>
       </w:r>
@@ -26641,7 +26641,7 @@
         <w:spacing w:after="240" w:line="276" w:lineRule="auto"/>
       </w:pPr>
       <w:bookmarkStart w:id="208" w:name="_Toc241062336"/>
-      <w:bookmarkStart w:id="209" w:name="_Toc242136805"/>
+      <w:bookmarkStart w:id="209" w:name="_Toc242137204"/>
       <w:r>
         <w:lastRenderedPageBreak/>
         <w:t>7.2 Grounding visual y mitigación de alucinaciones</w:t>
@@ -26660,7 +26660,7 @@
         <w:spacing w:after="240" w:line="276" w:lineRule="auto"/>
       </w:pPr>
       <w:bookmarkStart w:id="210" w:name="_Toc241062337"/>
-      <w:bookmarkStart w:id="211" w:name="_Toc242136806"/>
+      <w:bookmarkStart w:id="211" w:name="_Toc242137205"/>
       <w:r>
         <w:t>7.3 Compliance automatizado y RegTech</w:t>
       </w:r>
@@ -26688,7 +26688,7 @@
         <w:spacing w:after="240" w:line="276" w:lineRule="auto"/>
       </w:pPr>
       <w:bookmarkStart w:id="212" w:name="_Toc241062338"/>
-      <w:bookmarkStart w:id="213" w:name="_Toc242136807"/>
+      <w:bookmarkStart w:id="213" w:name="_Toc242137206"/>
       <w:r>
         <w:t>7.4 Visibilidad algorítmica y consistencia estética</w:t>
       </w:r>
@@ -26710,7 +26710,7 @@
         <w:spacing w:after="240" w:line="276" w:lineRule="auto"/>
       </w:pPr>
       <w:bookmarkStart w:id="214" w:name="_Toc241062339"/>
-      <w:bookmarkStart w:id="215" w:name="_Toc242136808"/>
+      <w:bookmarkStart w:id="215" w:name="_Toc242137207"/>
       <w:r>
         <w:t>7.5 Frente al vacío tecnológico del Estado del Arte</w:t>
       </w:r>
@@ -26728,7 +26728,7 @@
         <w:spacing w:after="240" w:line="276" w:lineRule="auto"/>
       </w:pPr>
       <w:bookmarkStart w:id="216" w:name="_Toc241062340"/>
-      <w:bookmarkStart w:id="217" w:name="_Toc242136809"/>
+      <w:bookmarkStart w:id="217" w:name="_Toc242137208"/>
       <w:r>
         <w:t>7.6 Aporte original frente a integración de tecnologías existentes</w:t>
       </w:r>
@@ -26746,7 +26746,7 @@
         <w:spacing w:after="240" w:line="276" w:lineRule="auto"/>
       </w:pPr>
       <w:bookmarkStart w:id="218" w:name="_Toc241062341"/>
-      <w:bookmarkStart w:id="219" w:name="_Toc242136810"/>
+      <w:bookmarkStart w:id="219" w:name="_Toc242137209"/>
       <w:r>
         <w:t>7.7 Limitaciones de la evidencia</w:t>
       </w:r>
@@ -26788,7 +26788,7 @@
         <w:spacing w:after="240" w:line="276" w:lineRule="auto"/>
       </w:pPr>
       <w:bookmarkStart w:id="220" w:name="_Toc241062342"/>
-      <w:bookmarkStart w:id="221" w:name="_Toc242136811"/>
+      <w:bookmarkStart w:id="221" w:name="_Toc242137210"/>
       <w:r>
         <w:t>7.8 Transferibilidad</w:t>
       </w:r>
@@ -26814,7 +26814,7 @@
         <w:pStyle w:val="Heading1"/>
       </w:pPr>
       <w:bookmarkStart w:id="222" w:name="_Toc241062343"/>
-      <w:bookmarkStart w:id="223" w:name="_Toc242136812"/>
+      <w:bookmarkStart w:id="223" w:name="_Toc242137211"/>
       <w:r>
         <w:t>CAPÍTULO 8. CONCLUSIONES Y RECOMENDACIONES</w:t>
       </w:r>
@@ -26850,7 +26850,7 @@
         <w:spacing w:after="240" w:line="276" w:lineRule="auto"/>
       </w:pPr>
       <w:bookmarkStart w:id="224" w:name="_Toc241062344"/>
-      <w:bookmarkStart w:id="225" w:name="_Toc242136813"/>
+      <w:bookmarkStart w:id="225" w:name="_Toc242137212"/>
       <w:r>
         <w:t>8.1 Conclusiones Generales y Cumplimiento de Objetivos</w:t>
       </w:r>
@@ -27040,7 +27040,7 @@
         <w:spacing w:after="240" w:line="276" w:lineRule="auto"/>
       </w:pPr>
       <w:bookmarkStart w:id="226" w:name="_Toc241062345"/>
-      <w:bookmarkStart w:id="227" w:name="_Toc242136814"/>
+      <w:bookmarkStart w:id="227" w:name="_Toc242137213"/>
       <w:r>
         <w:t>8.2 Recomendaciones Priorizadas</w:t>
       </w:r>
@@ -27289,7 +27289,7 @@
         <w:pStyle w:val="Heading1"/>
       </w:pPr>
       <w:bookmarkStart w:id="228" w:name="_Toc241062346"/>
-      <w:bookmarkStart w:id="229" w:name="_Toc242136815"/>
+      <w:bookmarkStart w:id="229" w:name="_Toc242137214"/>
       <w:r>
         <w:t>CAPÍTULO 9. REFERENCIAS BIBLIOGRÁFICAS</w:t>
       </w:r>
@@ -30537,7 +30537,7 @@
         <w:pStyle w:val="Heading1"/>
       </w:pPr>
       <w:bookmarkStart w:id="231" w:name="_Toc241062347"/>
-      <w:bookmarkStart w:id="232" w:name="_Toc242136816"/>
+      <w:bookmarkStart w:id="232" w:name="_Toc242137215"/>
       <w:r>
         <w:t>CAPÍTULO 10. ANEXOS</w:t>
       </w:r>
@@ -30560,7 +30560,7 @@
         <w:pStyle w:val="Heading2"/>
       </w:pPr>
       <w:bookmarkStart w:id="233" w:name="_Toc241062348"/>
-      <w:bookmarkStart w:id="234" w:name="_Toc242136817"/>
+      <w:bookmarkStart w:id="234" w:name="_Toc242137216"/>
       <w:r>
         <w:t>Anexo A — Tabla de cumplimiento de Historias de Usuario</w:t>
       </w:r>
@@ -30572,7 +30572,7 @@
         <w:pStyle w:val="Heading3"/>
       </w:pPr>
       <w:bookmarkStart w:id="235" w:name="_Toc241062349"/>
-      <w:bookmarkStart w:id="236" w:name="_Toc242136818"/>
+      <w:bookmarkStart w:id="236" w:name="_Toc242137217"/>
       <w:r>
         <w:t>A.1 Cumplimiento de las Historias de Usuario</w:t>
       </w:r>
@@ -30589,7 +30589,7 @@
       <w:pPr>
         <w:keepNext/>
       </w:pPr>
-      <w:bookmarkStart w:id="237" w:name="_Toc242136866"/>
+      <w:bookmarkStart w:id="237" w:name="_Toc242137265"/>
       <w:r>
         <w:rPr>
           <w:b/>
@@ -32313,7 +32313,7 @@
         <w:pStyle w:val="Heading3"/>
       </w:pPr>
       <w:bookmarkStart w:id="238" w:name="_Toc241062350"/>
-      <w:bookmarkStart w:id="239" w:name="_Toc242136819"/>
+      <w:bookmarkStart w:id="239" w:name="_Toc242137218"/>
       <w:r>
         <w:t>A.2 Cronología del desarrollo reconstruida del repositorio</w:t>
       </w:r>
@@ -32407,7 +32407,7 @@
         <w:pStyle w:val="Heading2"/>
       </w:pPr>
       <w:bookmarkStart w:id="240" w:name="_Toc241062351"/>
-      <w:bookmarkStart w:id="241" w:name="_Toc242136820"/>
+      <w:bookmarkStart w:id="241" w:name="_Toc242137219"/>
       <w:r>
         <w:t>Anexo B — Arquitectura técnica y decisiones de diseño</w:t>
       </w:r>
@@ -32427,7 +32427,7 @@
         <w:pStyle w:val="Heading3"/>
       </w:pPr>
       <w:bookmarkStart w:id="242" w:name="_Toc241062352"/>
-      <w:bookmarkStart w:id="243" w:name="_Toc242136821"/>
+      <w:bookmarkStart w:id="243" w:name="_Toc242137220"/>
       <w:r>
         <w:t>B.1 Infraestructura de despliegue</w:t>
       </w:r>
@@ -32476,10 +32476,7 @@
     <w:p>
       <w:r>
         <w:lastRenderedPageBreak/>
-        <w:t>El mismo 5 de octubre, una Consultora de Belleza Independiente recorrió sola la vinculación desde su propio Telegram, con la cuenta de Meta del proyecto, mientras uno de los autores la observaba sin intervenir. El bot la reconoció como usuaria nueva y le ofreció vincular (ejecución 1218). Pasó 1 min 30 s en las pantallas de Meta, y el callback completó el canje, el guardado de su fila y el aviso por el bot en 3,8 s (ejecución 1220). Su única pregunta fue qué significaba autorizar las páginas «actuales y fut</w:t>
-      </w:r>
-      <w:r>
-        <w:t>uras»: eligió «actuales» y marcó a mano la página del proyecto. Al terminar vio el mensaje de éxito en el navegador y volvió al chat, donde estaba la confirmación. La sesión entera, desde que abrió el bot, duró unos cuatro minutos. Es una observación sobre una sola consultora y sobre la cuenta del proyecto: no prueba que una consultora pueda vincular una página propia (§7.7).</w:t>
+        <w:t>El mismo 5 de octubre, una Consultora de Belleza Independiente recorrió sola la vinculación desde su propio Telegram, con la cuenta de Meta del proyecto, mientras uno de los autores la observaba sin intervenir. El bot la reconoció como usuaria nueva y le ofreció vincular (ejecución 1218). Pasó 1 min 30 s en las pantallas de Meta, y el callback completó el canje, el guardado de su fila y el aviso por el bot en 3,8 s (ejecución 1220). Su única pregunta fue qué significaba autorizar las páginas «actuales y futuras»: eligió «actuales» y marcó a mano la página del proyecto. Al terminar vio el mensaje de éxito en el navegador y volvió al chat, donde estaba la confirmación. La sesión entera, desde que abrió el bot, duró unos cuatro minutos. Es una observación sobre una sola consultora y sobre la cuenta del proyecto: no prueba que una consultora pueda vincular una página propia (§7.7).</w:t>
       </w:r>
     </w:p>
     <w:p>
@@ -32487,7 +32484,7 @@
         <w:pStyle w:val="Heading3"/>
       </w:pPr>
       <w:bookmarkStart w:id="244" w:name="_Toc241062353"/>
-      <w:bookmarkStart w:id="245" w:name="_Toc242136822"/>
+      <w:bookmarkStart w:id="245" w:name="_Toc242137221"/>
       <w:r>
         <w:t>B.2 Inventario de workflows y su función</w:t>
       </w:r>
@@ -32658,7 +32655,7 @@
           <w:sz w:val="20"/>
         </w:rPr>
       </w:pPr>
-      <w:bookmarkStart w:id="246" w:name="_Toc242136890"/>
+      <w:bookmarkStart w:id="246" w:name="_Toc242137289"/>
       <w:r>
         <w:rPr>
           <w:i/>
@@ -32778,7 +32775,7 @@
         <w:pStyle w:val="Heading3"/>
       </w:pPr>
       <w:bookmarkStart w:id="247" w:name="_Toc241062354"/>
-      <w:bookmarkStart w:id="248" w:name="_Toc242136823"/>
+      <w:bookmarkStart w:id="248" w:name="_Toc242137222"/>
       <w:r>
         <w:t>B.3 Seguridad de credenciales</w:t>
       </w:r>
@@ -32799,7 +32796,7 @@
         <w:pStyle w:val="Heading3"/>
       </w:pPr>
       <w:bookmarkStart w:id="249" w:name="_Toc241062355"/>
-      <w:bookmarkStart w:id="250" w:name="_Toc242136824"/>
+      <w:bookmarkStart w:id="250" w:name="_Toc242137223"/>
       <w:r>
         <w:t>B.4 Módulo Centinela de Compliance: implementación</w:t>
       </w:r>
@@ -32862,7 +32859,7 @@
         <w:pStyle w:val="Heading3"/>
       </w:pPr>
       <w:bookmarkStart w:id="251" w:name="_Toc241062356"/>
-      <w:bookmarkStart w:id="252" w:name="_Toc242136825"/>
+      <w:bookmarkStart w:id="252" w:name="_Toc242137224"/>
       <w:r>
         <w:t>B.5 Concurrencia en la ingesta de carruseles</w:t>
       </w:r>
@@ -32879,7 +32876,7 @@
         <w:pStyle w:val="Heading3"/>
       </w:pPr>
       <w:bookmarkStart w:id="253" w:name="_Toc241062357"/>
-      <w:bookmarkStart w:id="254" w:name="_Toc242136826"/>
+      <w:bookmarkStart w:id="254" w:name="_Toc242137225"/>
       <w:r>
         <w:t>B.6 Prevención de publicaciones duplicadas</w:t>
       </w:r>
@@ -32902,7 +32899,7 @@
         <w:pStyle w:val="Heading3"/>
       </w:pPr>
       <w:bookmarkStart w:id="255" w:name="_Toc241062358"/>
-      <w:bookmarkStart w:id="256" w:name="_Toc242136827"/>
+      <w:bookmarkStart w:id="256" w:name="_Toc242137226"/>
       <w:r>
         <w:t>B.7 Publicación multiplataforma: extensión a Facebook</w:t>
       </w:r>
@@ -32919,7 +32916,7 @@
         <w:pStyle w:val="Heading3"/>
       </w:pPr>
       <w:bookmarkStart w:id="257" w:name="_Toc241062359"/>
-      <w:bookmarkStart w:id="258" w:name="_Toc242136828"/>
+      <w:bookmarkStart w:id="258" w:name="_Toc242137227"/>
       <w:r>
         <w:t>B.8 Sincronización de estado con Instagram</w:t>
       </w:r>
@@ -32936,7 +32933,7 @@
         <w:pStyle w:val="Heading3"/>
       </w:pPr>
       <w:bookmarkStart w:id="259" w:name="_Toc241062360"/>
-      <w:bookmarkStart w:id="260" w:name="_Toc242136829"/>
+      <w:bookmarkStart w:id="260" w:name="_Toc242137228"/>
       <w:r>
         <w:t>B.9 Procesamiento de video (HU13): detalle de implementación</w:t>
       </w:r>
@@ -32958,7 +32955,7 @@
         <w:pStyle w:val="Heading2"/>
       </w:pPr>
       <w:bookmarkStart w:id="261" w:name="_Toc241062361"/>
-      <w:bookmarkStart w:id="262" w:name="_Toc242136830"/>
+      <w:bookmarkStart w:id="262" w:name="_Toc242137229"/>
       <w:r>
         <w:t>Anexo C — Lecciones aprendidas y desafíos técnicos</w:t>
       </w:r>
@@ -32977,7 +32974,7 @@
         <w:pStyle w:val="Heading3"/>
       </w:pPr>
       <w:bookmarkStart w:id="263" w:name="_Toc241062362"/>
-      <w:bookmarkStart w:id="264" w:name="_Toc242136831"/>
+      <w:bookmarkStart w:id="264" w:name="_Toc242137230"/>
       <w:r>
         <w:t>C.1 Restricciones de infraestructura: el problema de las tarjetas virtuales</w:t>
       </w:r>
@@ -32994,7 +32991,7 @@
         <w:pStyle w:val="Heading3"/>
       </w:pPr>
       <w:bookmarkStart w:id="265" w:name="_Toc241062363"/>
-      <w:bookmarkStart w:id="266" w:name="_Toc242136832"/>
+      <w:bookmarkStart w:id="266" w:name="_Toc242137231"/>
       <w:r>
         <w:t>C.2 Concurrencia en flujos disparados por eventos externos</w:t>
       </w:r>
@@ -33011,7 +33008,7 @@
         <w:pStyle w:val="Heading3"/>
       </w:pPr>
       <w:bookmarkStart w:id="267" w:name="_Toc241062364"/>
-      <w:bookmarkStart w:id="268" w:name="_Toc242136833"/>
+      <w:bookmarkStart w:id="268" w:name="_Toc242137232"/>
       <w:r>
         <w:lastRenderedPageBreak/>
         <w:t>C.3 Integridad de datos al editar el sistema por su propia API</w:t>
@@ -33029,7 +33026,7 @@
         <w:pStyle w:val="Heading3"/>
       </w:pPr>
       <w:bookmarkStart w:id="269" w:name="_Toc241062365"/>
-      <w:bookmarkStart w:id="270" w:name="_Toc242136834"/>
+      <w:bookmarkStart w:id="270" w:name="_Toc242137233"/>
       <w:r>
         <w:t>C.4 Regresiones de plataforma en la migración al servidor propio</w:t>
       </w:r>
@@ -33046,7 +33043,7 @@
         <w:pStyle w:val="Heading3"/>
       </w:pPr>
       <w:bookmarkStart w:id="271" w:name="_Toc241062366"/>
-      <w:bookmarkStart w:id="272" w:name="_Toc242136835"/>
+      <w:bookmarkStart w:id="272" w:name="_Toc242137234"/>
       <w:r>
         <w:t>C.5 Restricciones del entorno de ejecución para el procesamiento de video</w:t>
       </w:r>
@@ -33063,7 +33060,7 @@
         <w:pStyle w:val="Heading3"/>
       </w:pPr>
       <w:bookmarkStart w:id="273" w:name="_Toc241062367"/>
-      <w:bookmarkStart w:id="274" w:name="_Toc242136836"/>
+      <w:bookmarkStart w:id="274" w:name="_Toc242137235"/>
       <w:r>
         <w:t>C.6 Integración con servicios externos: formatos de envío no documentados con claridad</w:t>
       </w:r>
@@ -33080,7 +33077,7 @@
         <w:pStyle w:val="Heading3"/>
       </w:pPr>
       <w:bookmarkStart w:id="275" w:name="_Toc241062368"/>
-      <w:bookmarkStart w:id="276" w:name="_Toc242136837"/>
+      <w:bookmarkStart w:id="276" w:name="_Toc242137236"/>
       <w:r>
         <w:t>C.7 Errores intermitentes en APIs de terceros</w:t>
       </w:r>
@@ -33097,7 +33094,7 @@
         <w:pStyle w:val="Heading3"/>
       </w:pPr>
       <w:bookmarkStart w:id="277" w:name="_Toc241062369"/>
-      <w:bookmarkStart w:id="278" w:name="_Toc242136838"/>
+      <w:bookmarkStart w:id="278" w:name="_Toc242137237"/>
       <w:r>
         <w:lastRenderedPageBreak/>
         <w:t>C.8 Límites de cuota en servicios de IA gratuitos</w:t>
@@ -33114,7 +33111,7 @@
       <w:pPr>
         <w:pStyle w:val="Heading3"/>
       </w:pPr>
-      <w:bookmarkStart w:id="279" w:name="_Toc242136839"/>
+      <w:bookmarkStart w:id="279" w:name="_Toc242137238"/>
       <w:r>
         <w:t>C.9 Cuota de lecturas de Google Sheets al programar</w:t>
       </w:r>
@@ -33131,7 +33128,7 @@
         <w:pStyle w:val="Heading2"/>
       </w:pPr>
       <w:bookmarkStart w:id="280" w:name="_Toc241062370"/>
-      <w:bookmarkStart w:id="281" w:name="_Toc242136840"/>
+      <w:bookmarkStart w:id="281" w:name="_Toc242137239"/>
       <w:r>
         <w:t>Anexo D — Pautas Mary Kay para el uso en los medios sociales</w:t>
       </w:r>
@@ -33227,7 +33224,7 @@
         <w:pStyle w:val="Heading2"/>
       </w:pPr>
       <w:bookmarkStart w:id="282" w:name="_Toc241062371"/>
-      <w:bookmarkStart w:id="283" w:name="_Toc242136841"/>
+      <w:bookmarkStart w:id="283" w:name="_Toc242137240"/>
       <w:r>
         <w:t>Anexo E — Protocolo de validación empírica y conjuntos de datos</w:t>
       </w:r>
@@ -33247,7 +33244,7 @@
         <w:pStyle w:val="Heading3"/>
       </w:pPr>
       <w:bookmarkStart w:id="284" w:name="_Toc241062372"/>
-      <w:bookmarkStart w:id="285" w:name="_Toc242136842"/>
+      <w:bookmarkStart w:id="285" w:name="_Toc242137241"/>
       <w:r>
         <w:t>E.1 Validación del Módulo Centinela de Compliance</w:t>
       </w:r>
@@ -33377,7 +33374,7 @@
       <w:pPr>
         <w:keepNext/>
       </w:pPr>
-      <w:bookmarkStart w:id="286" w:name="_Toc242136867"/>
+      <w:bookmarkStart w:id="286" w:name="_Toc242137266"/>
       <w:r>
         <w:rPr>
           <w:b/>
@@ -35878,7 +35875,7 @@
         <w:pStyle w:val="Heading3"/>
       </w:pPr>
       <w:bookmarkStart w:id="287" w:name="_Toc241062373"/>
-      <w:bookmarkStart w:id="288" w:name="_Toc242136843"/>
+      <w:bookmarkStart w:id="288" w:name="_Toc242137242"/>
       <w:r>
         <w:t>E.2 Protocolo de cronometraje del tiempo operativo</w:t>
       </w:r>
@@ -35980,7 +35977,7 @@
         <w:pStyle w:val="Heading3"/>
       </w:pPr>
       <w:bookmarkStart w:id="289" w:name="_Toc241062374"/>
-      <w:bookmarkStart w:id="290" w:name="_Toc242136844"/>
+      <w:bookmarkStart w:id="290" w:name="_Toc242137243"/>
       <w:r>
         <w:t>E.3 Cuestionario de aceptación tecnológica (TAM)</w:t>
       </w:r>
@@ -36012,7 +36009,7 @@
         <w:pStyle w:val="Heading3"/>
       </w:pPr>
       <w:bookmarkStart w:id="291" w:name="_Toc241062375"/>
-      <w:bookmarkStart w:id="292" w:name="_Toc242136845"/>
+      <w:bookmarkStart w:id="292" w:name="_Toc242137244"/>
       <w:r>
         <w:t>E.4 Reproducibilidad de los análisis</w:t>
       </w:r>
@@ -36097,7 +36094,7 @@
         <w:pStyle w:val="Heading3"/>
       </w:pPr>
       <w:bookmarkStart w:id="293" w:name="_Toc241062376"/>
-      <w:bookmarkStart w:id="294" w:name="_Toc242136846"/>
+      <w:bookmarkStart w:id="294" w:name="_Toc242137245"/>
       <w:r>
         <w:t>E.5 Baterías de validación técnica</w:t>
       </w:r>
@@ -36128,7 +36125,7 @@
       <w:pPr>
         <w:keepNext/>
       </w:pPr>
-      <w:bookmarkStart w:id="295" w:name="_Toc242136868"/>
+      <w:bookmarkStart w:id="295" w:name="_Toc242137267"/>
       <w:r>
         <w:t xml:space="preserve">Tabla </w:t>
       </w:r>
@@ -37001,7 +36998,7 @@
         <w:pStyle w:val="Heading3"/>
       </w:pPr>
       <w:bookmarkStart w:id="296" w:name="_Toc241062377"/>
-      <w:bookmarkStart w:id="297" w:name="_Toc242136847"/>
+      <w:bookmarkStart w:id="297" w:name="_Toc242137246"/>
       <w:r>
         <w:t>E.6 Conjunto ampliado del canal de imagen (HU8)</w:t>
       </w:r>
@@ -37082,7 +37079,7 @@
       <w:pPr>
         <w:keepNext/>
       </w:pPr>
-      <w:bookmarkStart w:id="298" w:name="_Toc242136869"/>
+      <w:bookmarkStart w:id="298" w:name="_Toc242137268"/>
       <w:r>
         <w:t xml:space="preserve">Tabla </w:t>
       </w:r>
@@ -37313,7 +37310,7 @@
         <w:pStyle w:val="Heading3"/>
       </w:pPr>
       <w:bookmarkStart w:id="299" w:name="_Toc241062378"/>
-      <w:bookmarkStart w:id="300" w:name="_Toc242136848"/>
+      <w:bookmarkStart w:id="300" w:name="_Toc242137247"/>
       <w:r>
         <w:t>E.7 Verificación de los umbrales de las Historias de Usuario</w:t>
       </w:r>
@@ -37349,7 +37346,7 @@
       <w:pPr>
         <w:keepNext/>
       </w:pPr>
-      <w:bookmarkStart w:id="301" w:name="_Toc242136870"/>
+      <w:bookmarkStart w:id="301" w:name="_Toc242137269"/>
       <w:r>
         <w:t xml:space="preserve">Tabla </w:t>
       </w:r>
@@ -38529,7 +38526,7 @@
         <w:pStyle w:val="Heading3"/>
       </w:pPr>
       <w:bookmarkStart w:id="302" w:name="_Toc241062379"/>
-      <w:bookmarkStart w:id="303" w:name="_Toc242136849"/>
+      <w:bookmarkStart w:id="303" w:name="_Toc242137248"/>
       <w:r>
         <w:t>E.8 Casos difíciles del canal de imagen y variabilidad entre corridas</w:t>
       </w:r>
@@ -38579,7 +38576,7 @@
       <w:pPr>
         <w:keepNext/>
       </w:pPr>
-      <w:bookmarkStart w:id="304" w:name="_Toc242136871"/>
+      <w:bookmarkStart w:id="304" w:name="_Toc242137270"/>
       <w:r>
         <w:t xml:space="preserve">Tabla </w:t>
       </w:r>
@@ -38794,7 +38791,7 @@
         <w:pStyle w:val="Heading3"/>
       </w:pPr>
       <w:bookmarkStart w:id="305" w:name="_Toc241062380"/>
-      <w:bookmarkStart w:id="306" w:name="_Toc242136850"/>
+      <w:bookmarkStart w:id="306" w:name="_Toc242137249"/>
       <w:r>
         <w:t>E.9 Casos de video del canal visual (HU13)</w:t>
       </w:r>
@@ -38839,7 +38836,7 @@
         <w:pStyle w:val="Heading3"/>
       </w:pPr>
       <w:bookmarkStart w:id="307" w:name="_Toc241062381"/>
-      <w:bookmarkStart w:id="308" w:name="_Toc242136851"/>
+      <w:bookmarkStart w:id="308" w:name="_Toc242137250"/>
       <w:r>
         <w:t>E.10 Caso de carrusel del canal visual (HU5)</w:t>
       </w:r>
@@ -38883,7 +38880,7 @@
         <w:pStyle w:val="Heading3"/>
       </w:pPr>
       <w:bookmarkStart w:id="309" w:name="_Toc241062382"/>
-      <w:bookmarkStart w:id="310" w:name="_Toc242136852"/>
+      <w:bookmarkStart w:id="310" w:name="_Toc242137251"/>
       <w:r>
         <w:t>E.11 Caso de re-publicación del canal visual (HU12)</w:t>
       </w:r>
@@ -38934,7 +38931,7 @@
         <w:pStyle w:val="Heading3"/>
       </w:pPr>
       <w:bookmarkStart w:id="311" w:name="_Toc241062383"/>
-      <w:bookmarkStart w:id="312" w:name="_Toc242136853"/>
+      <w:bookmarkStart w:id="312" w:name="_Toc242137252"/>
       <w:r>
         <w:t>E.12 Gobierno del llamado a la acción generado</w:t>
       </w:r>
@@ -38985,7 +38982,7 @@
         <w:pStyle w:val="Heading3"/>
       </w:pPr>
       <w:bookmarkStart w:id="313" w:name="_Toc241062384"/>
-      <w:bookmarkStart w:id="314" w:name="_Toc242136854"/>
+      <w:bookmarkStart w:id="314" w:name="_Toc242137253"/>
       <w:r>
         <w:lastRenderedPageBreak/>
         <w:t>E.13 Trazabilidad de los Objetivos Específicos</w:t>
@@ -39005,7 +39002,7 @@
       <w:pPr>
         <w:keepNext/>
       </w:pPr>
-      <w:bookmarkStart w:id="315" w:name="_Toc242136872"/>
+      <w:bookmarkStart w:id="315" w:name="_Toc242137271"/>
       <w:r>
         <w:t xml:space="preserve">Tabla </w:t>
       </w:r>
@@ -39576,7 +39573,7 @@
       <w:pPr>
         <w:pStyle w:val="Heading3"/>
       </w:pPr>
-      <w:bookmarkStart w:id="316" w:name="_Toc242136855"/>
+      <w:bookmarkStart w:id="316" w:name="_Toc242137254"/>
       <w:r>
         <w:t>E.14 Objetivo Específico 2 — calidad del copy y comparación con el trabajo manual</w:t>
       </w:r>
@@ -39758,7 +39755,7 @@
       <w:pPr>
         <w:pStyle w:val="Heading3"/>
       </w:pPr>
-      <w:bookmarkStart w:id="317" w:name="_Toc242136856"/>
+      <w:bookmarkStart w:id="317" w:name="_Toc242137255"/>
       <w:r>
         <w:t>E.15 Trazabilidad entre versiones del sistema y mediciones</w:t>
       </w:r>
@@ -39773,7 +39770,7 @@
       <w:pPr>
         <w:keepNext/>
       </w:pPr>
-      <w:bookmarkStart w:id="318" w:name="_Toc242136873"/>
+      <w:bookmarkStart w:id="318" w:name="_Toc242137272"/>
       <w:r>
         <w:t xml:space="preserve">Tabla </w:t>
       </w:r>
@@ -40330,7 +40327,7 @@
       <w:pPr>
         <w:pStyle w:val="Heading3"/>
       </w:pPr>
-      <w:bookmarkStart w:id="319" w:name="_Toc242136857"/>
+      <w:bookmarkStart w:id="319" w:name="_Toc242137256"/>
       <w:r>
         <w:t>E.16 Inventario del material complementario</w:t>
       </w:r>
@@ -40345,7 +40342,7 @@
       <w:pPr>
         <w:keepNext/>
       </w:pPr>
-      <w:bookmarkStart w:id="320" w:name="_Toc242136874"/>
+      <w:bookmarkStart w:id="320" w:name="_Toc242137273"/>
       <w:r>
         <w:t xml:space="preserve">Tabla </w:t>
       </w:r>

</xml_diff>

<commit_message>
docs(tesis): pasada 242, 3.7.6 precisa que la carpeta de consentimientos de la entrega trae los nueve escritos posteriores y que los ocho de la ampliacion, firmados en papel y consignados en el reclutamiento, no la acompanan
Co-Authored-By: Claude Opus 5.5 <noreply@anthropic.com>
</commit_message>
<xml_diff>
--- a/avance/Tesis Postly Bontorno Hassan-1 v2.docx
+++ b/avance/Tesis Postly Bontorno Hassan-1 v2.docx
@@ -316,7 +316,7 @@
       <w:r>
         <w:fldChar w:fldCharType="separate"/>
       </w:r>
-      <w:hyperlink w:anchor="_Toc242140445" w:history="1">
+      <w:hyperlink w:anchor="_Toc242140845" w:history="1">
         <w:r>
           <w:rPr>
             <w:rStyle w:val="Hyperlink"/>
@@ -339,7 +339,7 @@
           <w:rPr>
             <w:webHidden/>
           </w:rPr>
-          <w:instrText xml:space="preserve"> PAGEREF _Toc242140445 \h </w:instrText>
+          <w:instrText xml:space="preserve"> PAGEREF _Toc242140845 \h </w:instrText>
         </w:r>
         <w:r>
           <w:rPr>
@@ -378,7 +378,7 @@
           <w14:ligatures w14:val="standardContextual"/>
         </w:rPr>
       </w:pPr>
-      <w:hyperlink w:anchor="_Toc242140446" w:history="1">
+      <w:hyperlink w:anchor="_Toc242140846" w:history="1">
         <w:r>
           <w:rPr>
             <w:rStyle w:val="Hyperlink"/>
@@ -401,7 +401,7 @@
           <w:rPr>
             <w:webHidden/>
           </w:rPr>
-          <w:instrText xml:space="preserve"> PAGEREF _Toc242140446 \h </w:instrText>
+          <w:instrText xml:space="preserve"> PAGEREF _Toc242140846 \h </w:instrText>
         </w:r>
         <w:r>
           <w:rPr>
@@ -442,7 +442,7 @@
           <w14:ligatures w14:val="standardContextual"/>
         </w:rPr>
       </w:pPr>
-      <w:hyperlink w:anchor="_Toc242140447" w:history="1">
+      <w:hyperlink w:anchor="_Toc242140847" w:history="1">
         <w:r>
           <w:rPr>
             <w:rStyle w:val="Hyperlink"/>
@@ -469,7 +469,7 @@
             <w:noProof/>
             <w:webHidden/>
           </w:rPr>
-          <w:instrText xml:space="preserve"> PAGEREF _Toc242140447 \h </w:instrText>
+          <w:instrText xml:space="preserve"> PAGEREF _Toc242140847 \h </w:instrText>
         </w:r>
         <w:r>
           <w:rPr>
@@ -514,7 +514,7 @@
           <w14:ligatures w14:val="standardContextual"/>
         </w:rPr>
       </w:pPr>
-      <w:hyperlink w:anchor="_Toc242140448" w:history="1">
+      <w:hyperlink w:anchor="_Toc242140848" w:history="1">
         <w:r>
           <w:rPr>
             <w:rStyle w:val="Hyperlink"/>
@@ -541,7 +541,7 @@
             <w:noProof/>
             <w:webHidden/>
           </w:rPr>
-          <w:instrText xml:space="preserve"> PAGEREF _Toc242140448 \h </w:instrText>
+          <w:instrText xml:space="preserve"> PAGEREF _Toc242140848 \h </w:instrText>
         </w:r>
         <w:r>
           <w:rPr>
@@ -586,7 +586,7 @@
           <w14:ligatures w14:val="standardContextual"/>
         </w:rPr>
       </w:pPr>
-      <w:hyperlink w:anchor="_Toc242140449" w:history="1">
+      <w:hyperlink w:anchor="_Toc242140849" w:history="1">
         <w:r>
           <w:rPr>
             <w:rStyle w:val="Hyperlink"/>
@@ -613,7 +613,7 @@
             <w:noProof/>
             <w:webHidden/>
           </w:rPr>
-          <w:instrText xml:space="preserve"> PAGEREF _Toc242140449 \h </w:instrText>
+          <w:instrText xml:space="preserve"> PAGEREF _Toc242140849 \h </w:instrText>
         </w:r>
         <w:r>
           <w:rPr>
@@ -658,7 +658,7 @@
           <w14:ligatures w14:val="standardContextual"/>
         </w:rPr>
       </w:pPr>
-      <w:hyperlink w:anchor="_Toc242140450" w:history="1">
+      <w:hyperlink w:anchor="_Toc242140850" w:history="1">
         <w:r>
           <w:rPr>
             <w:rStyle w:val="Hyperlink"/>
@@ -685,7 +685,7 @@
             <w:noProof/>
             <w:webHidden/>
           </w:rPr>
-          <w:instrText xml:space="preserve"> PAGEREF _Toc242140450 \h </w:instrText>
+          <w:instrText xml:space="preserve"> PAGEREF _Toc242140850 \h </w:instrText>
         </w:r>
         <w:r>
           <w:rPr>
@@ -730,7 +730,7 @@
           <w14:ligatures w14:val="standardContextual"/>
         </w:rPr>
       </w:pPr>
-      <w:hyperlink w:anchor="_Toc242140451" w:history="1">
+      <w:hyperlink w:anchor="_Toc242140851" w:history="1">
         <w:r>
           <w:rPr>
             <w:rStyle w:val="Hyperlink"/>
@@ -757,7 +757,7 @@
             <w:noProof/>
             <w:webHidden/>
           </w:rPr>
-          <w:instrText xml:space="preserve"> PAGEREF _Toc242140451 \h </w:instrText>
+          <w:instrText xml:space="preserve"> PAGEREF _Toc242140851 \h </w:instrText>
         </w:r>
         <w:r>
           <w:rPr>
@@ -802,7 +802,7 @@
           <w14:ligatures w14:val="standardContextual"/>
         </w:rPr>
       </w:pPr>
-      <w:hyperlink w:anchor="_Toc242140452" w:history="1">
+      <w:hyperlink w:anchor="_Toc242140852" w:history="1">
         <w:r>
           <w:rPr>
             <w:rStyle w:val="Hyperlink"/>
@@ -829,7 +829,7 @@
             <w:noProof/>
             <w:webHidden/>
           </w:rPr>
-          <w:instrText xml:space="preserve"> PAGEREF _Toc242140452 \h </w:instrText>
+          <w:instrText xml:space="preserve"> PAGEREF _Toc242140852 \h </w:instrText>
         </w:r>
         <w:r>
           <w:rPr>
@@ -874,7 +874,7 @@
           <w14:ligatures w14:val="standardContextual"/>
         </w:rPr>
       </w:pPr>
-      <w:hyperlink w:anchor="_Toc242140453" w:history="1">
+      <w:hyperlink w:anchor="_Toc242140853" w:history="1">
         <w:r>
           <w:rPr>
             <w:rStyle w:val="Hyperlink"/>
@@ -901,7 +901,7 @@
             <w:noProof/>
             <w:webHidden/>
           </w:rPr>
-          <w:instrText xml:space="preserve"> PAGEREF _Toc242140453 \h </w:instrText>
+          <w:instrText xml:space="preserve"> PAGEREF _Toc242140853 \h </w:instrText>
         </w:r>
         <w:r>
           <w:rPr>
@@ -946,7 +946,7 @@
           <w14:ligatures w14:val="standardContextual"/>
         </w:rPr>
       </w:pPr>
-      <w:hyperlink w:anchor="_Toc242140454" w:history="1">
+      <w:hyperlink w:anchor="_Toc242140854" w:history="1">
         <w:r>
           <w:rPr>
             <w:rStyle w:val="Hyperlink"/>
@@ -973,7 +973,7 @@
             <w:noProof/>
             <w:webHidden/>
           </w:rPr>
-          <w:instrText xml:space="preserve"> PAGEREF _Toc242140454 \h </w:instrText>
+          <w:instrText xml:space="preserve"> PAGEREF _Toc242140854 \h </w:instrText>
         </w:r>
         <w:r>
           <w:rPr>
@@ -1018,7 +1018,7 @@
           <w14:ligatures w14:val="standardContextual"/>
         </w:rPr>
       </w:pPr>
-      <w:hyperlink w:anchor="_Toc242140455" w:history="1">
+      <w:hyperlink w:anchor="_Toc242140855" w:history="1">
         <w:r>
           <w:rPr>
             <w:rStyle w:val="Hyperlink"/>
@@ -1045,7 +1045,7 @@
             <w:noProof/>
             <w:webHidden/>
           </w:rPr>
-          <w:instrText xml:space="preserve"> PAGEREF _Toc242140455 \h </w:instrText>
+          <w:instrText xml:space="preserve"> PAGEREF _Toc242140855 \h </w:instrText>
         </w:r>
         <w:r>
           <w:rPr>
@@ -1090,7 +1090,7 @@
           <w14:ligatures w14:val="standardContextual"/>
         </w:rPr>
       </w:pPr>
-      <w:hyperlink w:anchor="_Toc242140456" w:history="1">
+      <w:hyperlink w:anchor="_Toc242140856" w:history="1">
         <w:r>
           <w:rPr>
             <w:rStyle w:val="Hyperlink"/>
@@ -1117,7 +1117,7 @@
             <w:noProof/>
             <w:webHidden/>
           </w:rPr>
-          <w:instrText xml:space="preserve"> PAGEREF _Toc242140456 \h </w:instrText>
+          <w:instrText xml:space="preserve"> PAGEREF _Toc242140856 \h </w:instrText>
         </w:r>
         <w:r>
           <w:rPr>
@@ -1162,7 +1162,7 @@
           <w14:ligatures w14:val="standardContextual"/>
         </w:rPr>
       </w:pPr>
-      <w:hyperlink w:anchor="_Toc242140457" w:history="1">
+      <w:hyperlink w:anchor="_Toc242140857" w:history="1">
         <w:r>
           <w:rPr>
             <w:rStyle w:val="Hyperlink"/>
@@ -1189,7 +1189,7 @@
             <w:noProof/>
             <w:webHidden/>
           </w:rPr>
-          <w:instrText xml:space="preserve"> PAGEREF _Toc242140457 \h </w:instrText>
+          <w:instrText xml:space="preserve"> PAGEREF _Toc242140857 \h </w:instrText>
         </w:r>
         <w:r>
           <w:rPr>
@@ -1234,7 +1234,7 @@
           <w14:ligatures w14:val="standardContextual"/>
         </w:rPr>
       </w:pPr>
-      <w:hyperlink w:anchor="_Toc242140458" w:history="1">
+      <w:hyperlink w:anchor="_Toc242140858" w:history="1">
         <w:r>
           <w:rPr>
             <w:rStyle w:val="Hyperlink"/>
@@ -1261,7 +1261,7 @@
             <w:noProof/>
             <w:webHidden/>
           </w:rPr>
-          <w:instrText xml:space="preserve"> PAGEREF _Toc242140458 \h </w:instrText>
+          <w:instrText xml:space="preserve"> PAGEREF _Toc242140858 \h </w:instrText>
         </w:r>
         <w:r>
           <w:rPr>
@@ -1306,7 +1306,7 @@
           <w14:ligatures w14:val="standardContextual"/>
         </w:rPr>
       </w:pPr>
-      <w:hyperlink w:anchor="_Toc242140459" w:history="1">
+      <w:hyperlink w:anchor="_Toc242140859" w:history="1">
         <w:r>
           <w:rPr>
             <w:rStyle w:val="Hyperlink"/>
@@ -1333,7 +1333,7 @@
             <w:noProof/>
             <w:webHidden/>
           </w:rPr>
-          <w:instrText xml:space="preserve"> PAGEREF _Toc242140459 \h </w:instrText>
+          <w:instrText xml:space="preserve"> PAGEREF _Toc242140859 \h </w:instrText>
         </w:r>
         <w:r>
           <w:rPr>
@@ -1378,7 +1378,7 @@
           <w14:ligatures w14:val="standardContextual"/>
         </w:rPr>
       </w:pPr>
-      <w:hyperlink w:anchor="_Toc242140460" w:history="1">
+      <w:hyperlink w:anchor="_Toc242140860" w:history="1">
         <w:r>
           <w:rPr>
             <w:rStyle w:val="Hyperlink"/>
@@ -1405,7 +1405,7 @@
             <w:noProof/>
             <w:webHidden/>
           </w:rPr>
-          <w:instrText xml:space="preserve"> PAGEREF _Toc242140460 \h </w:instrText>
+          <w:instrText xml:space="preserve"> PAGEREF _Toc242140860 \h </w:instrText>
         </w:r>
         <w:r>
           <w:rPr>
@@ -1448,7 +1448,7 @@
           <w14:ligatures w14:val="standardContextual"/>
         </w:rPr>
       </w:pPr>
-      <w:hyperlink w:anchor="_Toc242140461" w:history="1">
+      <w:hyperlink w:anchor="_Toc242140861" w:history="1">
         <w:r>
           <w:rPr>
             <w:rStyle w:val="Hyperlink"/>
@@ -1471,7 +1471,7 @@
           <w:rPr>
             <w:webHidden/>
           </w:rPr>
-          <w:instrText xml:space="preserve"> PAGEREF _Toc242140461 \h </w:instrText>
+          <w:instrText xml:space="preserve"> PAGEREF _Toc242140861 \h </w:instrText>
         </w:r>
         <w:r>
           <w:rPr>
@@ -1512,7 +1512,7 @@
           <w14:ligatures w14:val="standardContextual"/>
         </w:rPr>
       </w:pPr>
-      <w:hyperlink w:anchor="_Toc242140462" w:history="1">
+      <w:hyperlink w:anchor="_Toc242140862" w:history="1">
         <w:r>
           <w:rPr>
             <w:rStyle w:val="Hyperlink"/>
@@ -1539,7 +1539,7 @@
             <w:noProof/>
             <w:webHidden/>
           </w:rPr>
-          <w:instrText xml:space="preserve"> PAGEREF _Toc242140462 \h </w:instrText>
+          <w:instrText xml:space="preserve"> PAGEREF _Toc242140862 \h </w:instrText>
         </w:r>
         <w:r>
           <w:rPr>
@@ -1584,7 +1584,7 @@
           <w14:ligatures w14:val="standardContextual"/>
         </w:rPr>
       </w:pPr>
-      <w:hyperlink w:anchor="_Toc242140463" w:history="1">
+      <w:hyperlink w:anchor="_Toc242140863" w:history="1">
         <w:r>
           <w:rPr>
             <w:rStyle w:val="Hyperlink"/>
@@ -1611,7 +1611,7 @@
             <w:noProof/>
             <w:webHidden/>
           </w:rPr>
-          <w:instrText xml:space="preserve"> PAGEREF _Toc242140463 \h </w:instrText>
+          <w:instrText xml:space="preserve"> PAGEREF _Toc242140863 \h </w:instrText>
         </w:r>
         <w:r>
           <w:rPr>
@@ -1656,7 +1656,7 @@
           <w14:ligatures w14:val="standardContextual"/>
         </w:rPr>
       </w:pPr>
-      <w:hyperlink w:anchor="_Toc242140464" w:history="1">
+      <w:hyperlink w:anchor="_Toc242140864" w:history="1">
         <w:r>
           <w:rPr>
             <w:rStyle w:val="Hyperlink"/>
@@ -1683,7 +1683,7 @@
             <w:noProof/>
             <w:webHidden/>
           </w:rPr>
-          <w:instrText xml:space="preserve"> PAGEREF _Toc242140464 \h </w:instrText>
+          <w:instrText xml:space="preserve"> PAGEREF _Toc242140864 \h </w:instrText>
         </w:r>
         <w:r>
           <w:rPr>
@@ -1728,7 +1728,7 @@
           <w14:ligatures w14:val="standardContextual"/>
         </w:rPr>
       </w:pPr>
-      <w:hyperlink w:anchor="_Toc242140465" w:history="1">
+      <w:hyperlink w:anchor="_Toc242140865" w:history="1">
         <w:r>
           <w:rPr>
             <w:rStyle w:val="Hyperlink"/>
@@ -1755,7 +1755,7 @@
             <w:noProof/>
             <w:webHidden/>
           </w:rPr>
-          <w:instrText xml:space="preserve"> PAGEREF _Toc242140465 \h </w:instrText>
+          <w:instrText xml:space="preserve"> PAGEREF _Toc242140865 \h </w:instrText>
         </w:r>
         <w:r>
           <w:rPr>
@@ -1798,7 +1798,7 @@
           <w14:ligatures w14:val="standardContextual"/>
         </w:rPr>
       </w:pPr>
-      <w:hyperlink w:anchor="_Toc242140466" w:history="1">
+      <w:hyperlink w:anchor="_Toc242140866" w:history="1">
         <w:r>
           <w:rPr>
             <w:rStyle w:val="Hyperlink"/>
@@ -1821,7 +1821,7 @@
           <w:rPr>
             <w:webHidden/>
           </w:rPr>
-          <w:instrText xml:space="preserve"> PAGEREF _Toc242140466 \h </w:instrText>
+          <w:instrText xml:space="preserve"> PAGEREF _Toc242140866 \h </w:instrText>
         </w:r>
         <w:r>
           <w:rPr>
@@ -1862,7 +1862,7 @@
           <w14:ligatures w14:val="standardContextual"/>
         </w:rPr>
       </w:pPr>
-      <w:hyperlink w:anchor="_Toc242140467" w:history="1">
+      <w:hyperlink w:anchor="_Toc242140867" w:history="1">
         <w:r>
           <w:rPr>
             <w:rStyle w:val="Hyperlink"/>
@@ -1889,7 +1889,7 @@
             <w:noProof/>
             <w:webHidden/>
           </w:rPr>
-          <w:instrText xml:space="preserve"> PAGEREF _Toc242140467 \h </w:instrText>
+          <w:instrText xml:space="preserve"> PAGEREF _Toc242140867 \h </w:instrText>
         </w:r>
         <w:r>
           <w:rPr>
@@ -1934,7 +1934,7 @@
           <w14:ligatures w14:val="standardContextual"/>
         </w:rPr>
       </w:pPr>
-      <w:hyperlink w:anchor="_Toc242140468" w:history="1">
+      <w:hyperlink w:anchor="_Toc242140868" w:history="1">
         <w:r>
           <w:rPr>
             <w:rStyle w:val="Hyperlink"/>
@@ -1961,7 +1961,7 @@
             <w:noProof/>
             <w:webHidden/>
           </w:rPr>
-          <w:instrText xml:space="preserve"> PAGEREF _Toc242140468 \h </w:instrText>
+          <w:instrText xml:space="preserve"> PAGEREF _Toc242140868 \h </w:instrText>
         </w:r>
         <w:r>
           <w:rPr>
@@ -2006,7 +2006,7 @@
           <w14:ligatures w14:val="standardContextual"/>
         </w:rPr>
       </w:pPr>
-      <w:hyperlink w:anchor="_Toc242140469" w:history="1">
+      <w:hyperlink w:anchor="_Toc242140869" w:history="1">
         <w:r>
           <w:rPr>
             <w:rStyle w:val="Hyperlink"/>
@@ -2033,7 +2033,7 @@
             <w:noProof/>
             <w:webHidden/>
           </w:rPr>
-          <w:instrText xml:space="preserve"> PAGEREF _Toc242140469 \h </w:instrText>
+          <w:instrText xml:space="preserve"> PAGEREF _Toc242140869 \h </w:instrText>
         </w:r>
         <w:r>
           <w:rPr>
@@ -2078,7 +2078,7 @@
           <w14:ligatures w14:val="standardContextual"/>
         </w:rPr>
       </w:pPr>
-      <w:hyperlink w:anchor="_Toc242140470" w:history="1">
+      <w:hyperlink w:anchor="_Toc242140870" w:history="1">
         <w:r>
           <w:rPr>
             <w:rStyle w:val="Hyperlink"/>
@@ -2105,7 +2105,7 @@
             <w:noProof/>
             <w:webHidden/>
           </w:rPr>
-          <w:instrText xml:space="preserve"> PAGEREF _Toc242140470 \h </w:instrText>
+          <w:instrText xml:space="preserve"> PAGEREF _Toc242140870 \h </w:instrText>
         </w:r>
         <w:r>
           <w:rPr>
@@ -2150,7 +2150,7 @@
           <w14:ligatures w14:val="standardContextual"/>
         </w:rPr>
       </w:pPr>
-      <w:hyperlink w:anchor="_Toc242140471" w:history="1">
+      <w:hyperlink w:anchor="_Toc242140871" w:history="1">
         <w:r>
           <w:rPr>
             <w:rStyle w:val="Hyperlink"/>
@@ -2177,7 +2177,7 @@
             <w:noProof/>
             <w:webHidden/>
           </w:rPr>
-          <w:instrText xml:space="preserve"> PAGEREF _Toc242140471 \h </w:instrText>
+          <w:instrText xml:space="preserve"> PAGEREF _Toc242140871 \h </w:instrText>
         </w:r>
         <w:r>
           <w:rPr>
@@ -2222,7 +2222,7 @@
           <w14:ligatures w14:val="standardContextual"/>
         </w:rPr>
       </w:pPr>
-      <w:hyperlink w:anchor="_Toc242140472" w:history="1">
+      <w:hyperlink w:anchor="_Toc242140872" w:history="1">
         <w:r>
           <w:rPr>
             <w:rStyle w:val="Hyperlink"/>
@@ -2249,7 +2249,7 @@
             <w:noProof/>
             <w:webHidden/>
           </w:rPr>
-          <w:instrText xml:space="preserve"> PAGEREF _Toc242140472 \h </w:instrText>
+          <w:instrText xml:space="preserve"> PAGEREF _Toc242140872 \h </w:instrText>
         </w:r>
         <w:r>
           <w:rPr>
@@ -2294,7 +2294,7 @@
           <w14:ligatures w14:val="standardContextual"/>
         </w:rPr>
       </w:pPr>
-      <w:hyperlink w:anchor="_Toc242140473" w:history="1">
+      <w:hyperlink w:anchor="_Toc242140873" w:history="1">
         <w:r>
           <w:rPr>
             <w:rStyle w:val="Hyperlink"/>
@@ -2321,7 +2321,7 @@
             <w:noProof/>
             <w:webHidden/>
           </w:rPr>
-          <w:instrText xml:space="preserve"> PAGEREF _Toc242140473 \h </w:instrText>
+          <w:instrText xml:space="preserve"> PAGEREF _Toc242140873 \h </w:instrText>
         </w:r>
         <w:r>
           <w:rPr>
@@ -2366,7 +2366,7 @@
           <w14:ligatures w14:val="standardContextual"/>
         </w:rPr>
       </w:pPr>
-      <w:hyperlink w:anchor="_Toc242140474" w:history="1">
+      <w:hyperlink w:anchor="_Toc242140874" w:history="1">
         <w:r>
           <w:rPr>
             <w:rStyle w:val="Hyperlink"/>
@@ -2393,7 +2393,7 @@
             <w:noProof/>
             <w:webHidden/>
           </w:rPr>
-          <w:instrText xml:space="preserve"> PAGEREF _Toc242140474 \h </w:instrText>
+          <w:instrText xml:space="preserve"> PAGEREF _Toc242140874 \h </w:instrText>
         </w:r>
         <w:r>
           <w:rPr>
@@ -2438,7 +2438,7 @@
           <w14:ligatures w14:val="standardContextual"/>
         </w:rPr>
       </w:pPr>
-      <w:hyperlink w:anchor="_Toc242140475" w:history="1">
+      <w:hyperlink w:anchor="_Toc242140875" w:history="1">
         <w:r>
           <w:rPr>
             <w:rStyle w:val="Hyperlink"/>
@@ -2465,7 +2465,7 @@
             <w:noProof/>
             <w:webHidden/>
           </w:rPr>
-          <w:instrText xml:space="preserve"> PAGEREF _Toc242140475 \h </w:instrText>
+          <w:instrText xml:space="preserve"> PAGEREF _Toc242140875 \h </w:instrText>
         </w:r>
         <w:r>
           <w:rPr>
@@ -2510,7 +2510,7 @@
           <w14:ligatures w14:val="standardContextual"/>
         </w:rPr>
       </w:pPr>
-      <w:hyperlink w:anchor="_Toc242140476" w:history="1">
+      <w:hyperlink w:anchor="_Toc242140876" w:history="1">
         <w:r>
           <w:rPr>
             <w:rStyle w:val="Hyperlink"/>
@@ -2537,7 +2537,7 @@
             <w:noProof/>
             <w:webHidden/>
           </w:rPr>
-          <w:instrText xml:space="preserve"> PAGEREF _Toc242140476 \h </w:instrText>
+          <w:instrText xml:space="preserve"> PAGEREF _Toc242140876 \h </w:instrText>
         </w:r>
         <w:r>
           <w:rPr>
@@ -2582,7 +2582,7 @@
           <w14:ligatures w14:val="standardContextual"/>
         </w:rPr>
       </w:pPr>
-      <w:hyperlink w:anchor="_Toc242140477" w:history="1">
+      <w:hyperlink w:anchor="_Toc242140877" w:history="1">
         <w:r>
           <w:rPr>
             <w:rStyle w:val="Hyperlink"/>
@@ -2609,7 +2609,7 @@
             <w:noProof/>
             <w:webHidden/>
           </w:rPr>
-          <w:instrText xml:space="preserve"> PAGEREF _Toc242140477 \h </w:instrText>
+          <w:instrText xml:space="preserve"> PAGEREF _Toc242140877 \h </w:instrText>
         </w:r>
         <w:r>
           <w:rPr>
@@ -2654,7 +2654,7 @@
           <w14:ligatures w14:val="standardContextual"/>
         </w:rPr>
       </w:pPr>
-      <w:hyperlink w:anchor="_Toc242140478" w:history="1">
+      <w:hyperlink w:anchor="_Toc242140878" w:history="1">
         <w:r>
           <w:rPr>
             <w:rStyle w:val="Hyperlink"/>
@@ -2681,7 +2681,7 @@
             <w:noProof/>
             <w:webHidden/>
           </w:rPr>
-          <w:instrText xml:space="preserve"> PAGEREF _Toc242140478 \h </w:instrText>
+          <w:instrText xml:space="preserve"> PAGEREF _Toc242140878 \h </w:instrText>
         </w:r>
         <w:r>
           <w:rPr>
@@ -2726,7 +2726,7 @@
           <w14:ligatures w14:val="standardContextual"/>
         </w:rPr>
       </w:pPr>
-      <w:hyperlink w:anchor="_Toc242140479" w:history="1">
+      <w:hyperlink w:anchor="_Toc242140879" w:history="1">
         <w:r>
           <w:rPr>
             <w:rStyle w:val="Hyperlink"/>
@@ -2753,7 +2753,7 @@
             <w:noProof/>
             <w:webHidden/>
           </w:rPr>
-          <w:instrText xml:space="preserve"> PAGEREF _Toc242140479 \h </w:instrText>
+          <w:instrText xml:space="preserve"> PAGEREF _Toc242140879 \h </w:instrText>
         </w:r>
         <w:r>
           <w:rPr>
@@ -2798,7 +2798,7 @@
           <w14:ligatures w14:val="standardContextual"/>
         </w:rPr>
       </w:pPr>
-      <w:hyperlink w:anchor="_Toc242140480" w:history="1">
+      <w:hyperlink w:anchor="_Toc242140880" w:history="1">
         <w:r>
           <w:rPr>
             <w:rStyle w:val="Hyperlink"/>
@@ -2825,7 +2825,7 @@
             <w:noProof/>
             <w:webHidden/>
           </w:rPr>
-          <w:instrText xml:space="preserve"> PAGEREF _Toc242140480 \h </w:instrText>
+          <w:instrText xml:space="preserve"> PAGEREF _Toc242140880 \h </w:instrText>
         </w:r>
         <w:r>
           <w:rPr>
@@ -2870,7 +2870,7 @@
           <w14:ligatures w14:val="standardContextual"/>
         </w:rPr>
       </w:pPr>
-      <w:hyperlink w:anchor="_Toc242140481" w:history="1">
+      <w:hyperlink w:anchor="_Toc242140881" w:history="1">
         <w:r>
           <w:rPr>
             <w:rStyle w:val="Hyperlink"/>
@@ -2897,7 +2897,7 @@
             <w:noProof/>
             <w:webHidden/>
           </w:rPr>
-          <w:instrText xml:space="preserve"> PAGEREF _Toc242140481 \h </w:instrText>
+          <w:instrText xml:space="preserve"> PAGEREF _Toc242140881 \h </w:instrText>
         </w:r>
         <w:r>
           <w:rPr>
@@ -2942,7 +2942,7 @@
           <w14:ligatures w14:val="standardContextual"/>
         </w:rPr>
       </w:pPr>
-      <w:hyperlink w:anchor="_Toc242140482" w:history="1">
+      <w:hyperlink w:anchor="_Toc242140882" w:history="1">
         <w:r>
           <w:rPr>
             <w:rStyle w:val="Hyperlink"/>
@@ -2969,7 +2969,7 @@
             <w:noProof/>
             <w:webHidden/>
           </w:rPr>
-          <w:instrText xml:space="preserve"> PAGEREF _Toc242140482 \h </w:instrText>
+          <w:instrText xml:space="preserve"> PAGEREF _Toc242140882 \h </w:instrText>
         </w:r>
         <w:r>
           <w:rPr>
@@ -3014,7 +3014,7 @@
           <w14:ligatures w14:val="standardContextual"/>
         </w:rPr>
       </w:pPr>
-      <w:hyperlink w:anchor="_Toc242140483" w:history="1">
+      <w:hyperlink w:anchor="_Toc242140883" w:history="1">
         <w:r>
           <w:rPr>
             <w:rStyle w:val="Hyperlink"/>
@@ -3041,7 +3041,7 @@
             <w:noProof/>
             <w:webHidden/>
           </w:rPr>
-          <w:instrText xml:space="preserve"> PAGEREF _Toc242140483 \h </w:instrText>
+          <w:instrText xml:space="preserve"> PAGEREF _Toc242140883 \h </w:instrText>
         </w:r>
         <w:r>
           <w:rPr>
@@ -3086,7 +3086,7 @@
           <w14:ligatures w14:val="standardContextual"/>
         </w:rPr>
       </w:pPr>
-      <w:hyperlink w:anchor="_Toc242140484" w:history="1">
+      <w:hyperlink w:anchor="_Toc242140884" w:history="1">
         <w:r>
           <w:rPr>
             <w:rStyle w:val="Hyperlink"/>
@@ -3113,7 +3113,7 @@
             <w:noProof/>
             <w:webHidden/>
           </w:rPr>
-          <w:instrText xml:space="preserve"> PAGEREF _Toc242140484 \h </w:instrText>
+          <w:instrText xml:space="preserve"> PAGEREF _Toc242140884 \h </w:instrText>
         </w:r>
         <w:r>
           <w:rPr>
@@ -3158,7 +3158,7 @@
           <w14:ligatures w14:val="standardContextual"/>
         </w:rPr>
       </w:pPr>
-      <w:hyperlink w:anchor="_Toc242140485" w:history="1">
+      <w:hyperlink w:anchor="_Toc242140885" w:history="1">
         <w:r>
           <w:rPr>
             <w:rStyle w:val="Hyperlink"/>
@@ -3185,7 +3185,7 @@
             <w:noProof/>
             <w:webHidden/>
           </w:rPr>
-          <w:instrText xml:space="preserve"> PAGEREF _Toc242140485 \h </w:instrText>
+          <w:instrText xml:space="preserve"> PAGEREF _Toc242140885 \h </w:instrText>
         </w:r>
         <w:r>
           <w:rPr>
@@ -3230,7 +3230,7 @@
           <w14:ligatures w14:val="standardContextual"/>
         </w:rPr>
       </w:pPr>
-      <w:hyperlink w:anchor="_Toc242140486" w:history="1">
+      <w:hyperlink w:anchor="_Toc242140886" w:history="1">
         <w:r>
           <w:rPr>
             <w:rStyle w:val="Hyperlink"/>
@@ -3257,7 +3257,7 @@
             <w:noProof/>
             <w:webHidden/>
           </w:rPr>
-          <w:instrText xml:space="preserve"> PAGEREF _Toc242140486 \h </w:instrText>
+          <w:instrText xml:space="preserve"> PAGEREF _Toc242140886 \h </w:instrText>
         </w:r>
         <w:r>
           <w:rPr>
@@ -3302,7 +3302,7 @@
           <w14:ligatures w14:val="standardContextual"/>
         </w:rPr>
       </w:pPr>
-      <w:hyperlink w:anchor="_Toc242140487" w:history="1">
+      <w:hyperlink w:anchor="_Toc242140887" w:history="1">
         <w:r>
           <w:rPr>
             <w:rStyle w:val="Hyperlink"/>
@@ -3329,7 +3329,7 @@
             <w:noProof/>
             <w:webHidden/>
           </w:rPr>
-          <w:instrText xml:space="preserve"> PAGEREF _Toc242140487 \h </w:instrText>
+          <w:instrText xml:space="preserve"> PAGEREF _Toc242140887 \h </w:instrText>
         </w:r>
         <w:r>
           <w:rPr>
@@ -3374,7 +3374,7 @@
           <w14:ligatures w14:val="standardContextual"/>
         </w:rPr>
       </w:pPr>
-      <w:hyperlink w:anchor="_Toc242140488" w:history="1">
+      <w:hyperlink w:anchor="_Toc242140888" w:history="1">
         <w:r>
           <w:rPr>
             <w:rStyle w:val="Hyperlink"/>
@@ -3401,7 +3401,7 @@
             <w:noProof/>
             <w:webHidden/>
           </w:rPr>
-          <w:instrText xml:space="preserve"> PAGEREF _Toc242140488 \h </w:instrText>
+          <w:instrText xml:space="preserve"> PAGEREF _Toc242140888 \h </w:instrText>
         </w:r>
         <w:r>
           <w:rPr>
@@ -3446,7 +3446,7 @@
           <w14:ligatures w14:val="standardContextual"/>
         </w:rPr>
       </w:pPr>
-      <w:hyperlink w:anchor="_Toc242140489" w:history="1">
+      <w:hyperlink w:anchor="_Toc242140889" w:history="1">
         <w:r>
           <w:rPr>
             <w:rStyle w:val="Hyperlink"/>
@@ -3489,7 +3489,7 @@
             <w:noProof/>
             <w:webHidden/>
           </w:rPr>
-          <w:instrText xml:space="preserve"> PAGEREF _Toc242140489 \h </w:instrText>
+          <w:instrText xml:space="preserve"> PAGEREF _Toc242140889 \h </w:instrText>
         </w:r>
         <w:r>
           <w:rPr>
@@ -3534,7 +3534,7 @@
           <w14:ligatures w14:val="standardContextual"/>
         </w:rPr>
       </w:pPr>
-      <w:hyperlink w:anchor="_Toc242140490" w:history="1">
+      <w:hyperlink w:anchor="_Toc242140890" w:history="1">
         <w:r>
           <w:rPr>
             <w:rStyle w:val="Hyperlink"/>
@@ -3561,7 +3561,7 @@
             <w:noProof/>
             <w:webHidden/>
           </w:rPr>
-          <w:instrText xml:space="preserve"> PAGEREF _Toc242140490 \h </w:instrText>
+          <w:instrText xml:space="preserve"> PAGEREF _Toc242140890 \h </w:instrText>
         </w:r>
         <w:r>
           <w:rPr>
@@ -3606,7 +3606,7 @@
           <w14:ligatures w14:val="standardContextual"/>
         </w:rPr>
       </w:pPr>
-      <w:hyperlink w:anchor="_Toc242140491" w:history="1">
+      <w:hyperlink w:anchor="_Toc242140891" w:history="1">
         <w:r>
           <w:rPr>
             <w:rStyle w:val="Hyperlink"/>
@@ -3633,7 +3633,7 @@
             <w:noProof/>
             <w:webHidden/>
           </w:rPr>
-          <w:instrText xml:space="preserve"> PAGEREF _Toc242140491 \h </w:instrText>
+          <w:instrText xml:space="preserve"> PAGEREF _Toc242140891 \h </w:instrText>
         </w:r>
         <w:r>
           <w:rPr>
@@ -3678,7 +3678,7 @@
           <w14:ligatures w14:val="standardContextual"/>
         </w:rPr>
       </w:pPr>
-      <w:hyperlink w:anchor="_Toc242140492" w:history="1">
+      <w:hyperlink w:anchor="_Toc242140892" w:history="1">
         <w:r>
           <w:rPr>
             <w:rStyle w:val="Hyperlink"/>
@@ -3705,7 +3705,7 @@
             <w:noProof/>
             <w:webHidden/>
           </w:rPr>
-          <w:instrText xml:space="preserve"> PAGEREF _Toc242140492 \h </w:instrText>
+          <w:instrText xml:space="preserve"> PAGEREF _Toc242140892 \h </w:instrText>
         </w:r>
         <w:r>
           <w:rPr>
@@ -3748,7 +3748,7 @@
           <w14:ligatures w14:val="standardContextual"/>
         </w:rPr>
       </w:pPr>
-      <w:hyperlink w:anchor="_Toc242140493" w:history="1">
+      <w:hyperlink w:anchor="_Toc242140893" w:history="1">
         <w:r>
           <w:rPr>
             <w:rStyle w:val="Hyperlink"/>
@@ -3771,7 +3771,7 @@
           <w:rPr>
             <w:webHidden/>
           </w:rPr>
-          <w:instrText xml:space="preserve"> PAGEREF _Toc242140493 \h </w:instrText>
+          <w:instrText xml:space="preserve"> PAGEREF _Toc242140893 \h </w:instrText>
         </w:r>
         <w:r>
           <w:rPr>
@@ -3812,7 +3812,7 @@
           <w14:ligatures w14:val="standardContextual"/>
         </w:rPr>
       </w:pPr>
-      <w:hyperlink w:anchor="_Toc242140494" w:history="1">
+      <w:hyperlink w:anchor="_Toc242140894" w:history="1">
         <w:r>
           <w:rPr>
             <w:rStyle w:val="Hyperlink"/>
@@ -3839,7 +3839,7 @@
             <w:noProof/>
             <w:webHidden/>
           </w:rPr>
-          <w:instrText xml:space="preserve"> PAGEREF _Toc242140494 \h </w:instrText>
+          <w:instrText xml:space="preserve"> PAGEREF _Toc242140894 \h </w:instrText>
         </w:r>
         <w:r>
           <w:rPr>
@@ -3884,7 +3884,7 @@
           <w14:ligatures w14:val="standardContextual"/>
         </w:rPr>
       </w:pPr>
-      <w:hyperlink w:anchor="_Toc242140495" w:history="1">
+      <w:hyperlink w:anchor="_Toc242140895" w:history="1">
         <w:r>
           <w:rPr>
             <w:rStyle w:val="Hyperlink"/>
@@ -3911,7 +3911,7 @@
             <w:noProof/>
             <w:webHidden/>
           </w:rPr>
-          <w:instrText xml:space="preserve"> PAGEREF _Toc242140495 \h </w:instrText>
+          <w:instrText xml:space="preserve"> PAGEREF _Toc242140895 \h </w:instrText>
         </w:r>
         <w:r>
           <w:rPr>
@@ -3956,7 +3956,7 @@
           <w14:ligatures w14:val="standardContextual"/>
         </w:rPr>
       </w:pPr>
-      <w:hyperlink w:anchor="_Toc242140496" w:history="1">
+      <w:hyperlink w:anchor="_Toc242140896" w:history="1">
         <w:r>
           <w:rPr>
             <w:rStyle w:val="Hyperlink"/>
@@ -3983,7 +3983,7 @@
             <w:noProof/>
             <w:webHidden/>
           </w:rPr>
-          <w:instrText xml:space="preserve"> PAGEREF _Toc242140496 \h </w:instrText>
+          <w:instrText xml:space="preserve"> PAGEREF _Toc242140896 \h </w:instrText>
         </w:r>
         <w:r>
           <w:rPr>
@@ -4028,7 +4028,7 @@
           <w14:ligatures w14:val="standardContextual"/>
         </w:rPr>
       </w:pPr>
-      <w:hyperlink w:anchor="_Toc242140497" w:history="1">
+      <w:hyperlink w:anchor="_Toc242140897" w:history="1">
         <w:r>
           <w:rPr>
             <w:rStyle w:val="Hyperlink"/>
@@ -4055,7 +4055,7 @@
             <w:noProof/>
             <w:webHidden/>
           </w:rPr>
-          <w:instrText xml:space="preserve"> PAGEREF _Toc242140497 \h </w:instrText>
+          <w:instrText xml:space="preserve"> PAGEREF _Toc242140897 \h </w:instrText>
         </w:r>
         <w:r>
           <w:rPr>
@@ -4075,7 +4075,7 @@
             <w:noProof/>
             <w:webHidden/>
           </w:rPr>
-          <w:t>42</w:t>
+          <w:t>43</w:t>
         </w:r>
         <w:r>
           <w:rPr>
@@ -4100,7 +4100,7 @@
           <w14:ligatures w14:val="standardContextual"/>
         </w:rPr>
       </w:pPr>
-      <w:hyperlink w:anchor="_Toc242140498" w:history="1">
+      <w:hyperlink w:anchor="_Toc242140898" w:history="1">
         <w:r>
           <w:rPr>
             <w:rStyle w:val="Hyperlink"/>
@@ -4127,7 +4127,7 @@
             <w:noProof/>
             <w:webHidden/>
           </w:rPr>
-          <w:instrText xml:space="preserve"> PAGEREF _Toc242140498 \h </w:instrText>
+          <w:instrText xml:space="preserve"> PAGEREF _Toc242140898 \h </w:instrText>
         </w:r>
         <w:r>
           <w:rPr>
@@ -4172,7 +4172,7 @@
           <w14:ligatures w14:val="standardContextual"/>
         </w:rPr>
       </w:pPr>
-      <w:hyperlink w:anchor="_Toc242140499" w:history="1">
+      <w:hyperlink w:anchor="_Toc242140899" w:history="1">
         <w:r>
           <w:rPr>
             <w:rStyle w:val="Hyperlink"/>
@@ -4199,7 +4199,7 @@
             <w:noProof/>
             <w:webHidden/>
           </w:rPr>
-          <w:instrText xml:space="preserve"> PAGEREF _Toc242140499 \h </w:instrText>
+          <w:instrText xml:space="preserve"> PAGEREF _Toc242140899 \h </w:instrText>
         </w:r>
         <w:r>
           <w:rPr>
@@ -4244,7 +4244,7 @@
           <w14:ligatures w14:val="standardContextual"/>
         </w:rPr>
       </w:pPr>
-      <w:hyperlink w:anchor="_Toc242140500" w:history="1">
+      <w:hyperlink w:anchor="_Toc242140900" w:history="1">
         <w:r>
           <w:rPr>
             <w:rStyle w:val="Hyperlink"/>
@@ -4271,7 +4271,7 @@
             <w:noProof/>
             <w:webHidden/>
           </w:rPr>
-          <w:instrText xml:space="preserve"> PAGEREF _Toc242140500 \h </w:instrText>
+          <w:instrText xml:space="preserve"> PAGEREF _Toc242140900 \h </w:instrText>
         </w:r>
         <w:r>
           <w:rPr>
@@ -4316,7 +4316,7 @@
           <w14:ligatures w14:val="standardContextual"/>
         </w:rPr>
       </w:pPr>
-      <w:hyperlink w:anchor="_Toc242140501" w:history="1">
+      <w:hyperlink w:anchor="_Toc242140901" w:history="1">
         <w:r>
           <w:rPr>
             <w:rStyle w:val="Hyperlink"/>
@@ -4343,7 +4343,7 @@
             <w:noProof/>
             <w:webHidden/>
           </w:rPr>
-          <w:instrText xml:space="preserve"> PAGEREF _Toc242140501 \h </w:instrText>
+          <w:instrText xml:space="preserve"> PAGEREF _Toc242140901 \h </w:instrText>
         </w:r>
         <w:r>
           <w:rPr>
@@ -4388,7 +4388,7 @@
           <w14:ligatures w14:val="standardContextual"/>
         </w:rPr>
       </w:pPr>
-      <w:hyperlink w:anchor="_Toc242140502" w:history="1">
+      <w:hyperlink w:anchor="_Toc242140902" w:history="1">
         <w:r>
           <w:rPr>
             <w:rStyle w:val="Hyperlink"/>
@@ -4415,7 +4415,7 @@
             <w:noProof/>
             <w:webHidden/>
           </w:rPr>
-          <w:instrText xml:space="preserve"> PAGEREF _Toc242140502 \h </w:instrText>
+          <w:instrText xml:space="preserve"> PAGEREF _Toc242140902 \h </w:instrText>
         </w:r>
         <w:r>
           <w:rPr>
@@ -4460,7 +4460,7 @@
           <w14:ligatures w14:val="standardContextual"/>
         </w:rPr>
       </w:pPr>
-      <w:hyperlink w:anchor="_Toc242140503" w:history="1">
+      <w:hyperlink w:anchor="_Toc242140903" w:history="1">
         <w:r>
           <w:rPr>
             <w:rStyle w:val="Hyperlink"/>
@@ -4487,7 +4487,7 @@
             <w:noProof/>
             <w:webHidden/>
           </w:rPr>
-          <w:instrText xml:space="preserve"> PAGEREF _Toc242140503 \h </w:instrText>
+          <w:instrText xml:space="preserve"> PAGEREF _Toc242140903 \h </w:instrText>
         </w:r>
         <w:r>
           <w:rPr>
@@ -4532,7 +4532,7 @@
           <w14:ligatures w14:val="standardContextual"/>
         </w:rPr>
       </w:pPr>
-      <w:hyperlink w:anchor="_Toc242140504" w:history="1">
+      <w:hyperlink w:anchor="_Toc242140904" w:history="1">
         <w:r>
           <w:rPr>
             <w:rStyle w:val="Hyperlink"/>
@@ -4559,7 +4559,7 @@
             <w:noProof/>
             <w:webHidden/>
           </w:rPr>
-          <w:instrText xml:space="preserve"> PAGEREF _Toc242140504 \h </w:instrText>
+          <w:instrText xml:space="preserve"> PAGEREF _Toc242140904 \h </w:instrText>
         </w:r>
         <w:r>
           <w:rPr>
@@ -4604,7 +4604,7 @@
           <w14:ligatures w14:val="standardContextual"/>
         </w:rPr>
       </w:pPr>
-      <w:hyperlink w:anchor="_Toc242140505" w:history="1">
+      <w:hyperlink w:anchor="_Toc242140905" w:history="1">
         <w:r>
           <w:rPr>
             <w:rStyle w:val="Hyperlink"/>
@@ -4631,7 +4631,7 @@
             <w:noProof/>
             <w:webHidden/>
           </w:rPr>
-          <w:instrText xml:space="preserve"> PAGEREF _Toc242140505 \h </w:instrText>
+          <w:instrText xml:space="preserve"> PAGEREF _Toc242140905 \h </w:instrText>
         </w:r>
         <w:r>
           <w:rPr>
@@ -4676,7 +4676,7 @@
           <w14:ligatures w14:val="standardContextual"/>
         </w:rPr>
       </w:pPr>
-      <w:hyperlink w:anchor="_Toc242140506" w:history="1">
+      <w:hyperlink w:anchor="_Toc242140906" w:history="1">
         <w:r>
           <w:rPr>
             <w:rStyle w:val="Hyperlink"/>
@@ -4703,7 +4703,7 @@
             <w:noProof/>
             <w:webHidden/>
           </w:rPr>
-          <w:instrText xml:space="preserve"> PAGEREF _Toc242140506 \h </w:instrText>
+          <w:instrText xml:space="preserve"> PAGEREF _Toc242140906 \h </w:instrText>
         </w:r>
         <w:r>
           <w:rPr>
@@ -4748,7 +4748,7 @@
           <w14:ligatures w14:val="standardContextual"/>
         </w:rPr>
       </w:pPr>
-      <w:hyperlink w:anchor="_Toc242140507" w:history="1">
+      <w:hyperlink w:anchor="_Toc242140907" w:history="1">
         <w:r>
           <w:rPr>
             <w:rStyle w:val="Hyperlink"/>
@@ -4775,7 +4775,7 @@
             <w:noProof/>
             <w:webHidden/>
           </w:rPr>
-          <w:instrText xml:space="preserve"> PAGEREF _Toc242140507 \h </w:instrText>
+          <w:instrText xml:space="preserve"> PAGEREF _Toc242140907 \h </w:instrText>
         </w:r>
         <w:r>
           <w:rPr>
@@ -4818,7 +4818,7 @@
           <w14:ligatures w14:val="standardContextual"/>
         </w:rPr>
       </w:pPr>
-      <w:hyperlink w:anchor="_Toc242140508" w:history="1">
+      <w:hyperlink w:anchor="_Toc242140908" w:history="1">
         <w:r>
           <w:rPr>
             <w:rStyle w:val="Hyperlink"/>
@@ -4841,7 +4841,7 @@
           <w:rPr>
             <w:webHidden/>
           </w:rPr>
-          <w:instrText xml:space="preserve"> PAGEREF _Toc242140508 \h </w:instrText>
+          <w:instrText xml:space="preserve"> PAGEREF _Toc242140908 \h </w:instrText>
         </w:r>
         <w:r>
           <w:rPr>
@@ -4882,7 +4882,7 @@
           <w14:ligatures w14:val="standardContextual"/>
         </w:rPr>
       </w:pPr>
-      <w:hyperlink w:anchor="_Toc242140509" w:history="1">
+      <w:hyperlink w:anchor="_Toc242140909" w:history="1">
         <w:r>
           <w:rPr>
             <w:rStyle w:val="Hyperlink"/>
@@ -4909,7 +4909,7 @@
             <w:noProof/>
             <w:webHidden/>
           </w:rPr>
-          <w:instrText xml:space="preserve"> PAGEREF _Toc242140509 \h </w:instrText>
+          <w:instrText xml:space="preserve"> PAGEREF _Toc242140909 \h </w:instrText>
         </w:r>
         <w:r>
           <w:rPr>
@@ -4954,7 +4954,7 @@
           <w14:ligatures w14:val="standardContextual"/>
         </w:rPr>
       </w:pPr>
-      <w:hyperlink w:anchor="_Toc242140510" w:history="1">
+      <w:hyperlink w:anchor="_Toc242140910" w:history="1">
         <w:r>
           <w:rPr>
             <w:rStyle w:val="Hyperlink"/>
@@ -4981,7 +4981,7 @@
             <w:noProof/>
             <w:webHidden/>
           </w:rPr>
-          <w:instrText xml:space="preserve"> PAGEREF _Toc242140510 \h </w:instrText>
+          <w:instrText xml:space="preserve"> PAGEREF _Toc242140910 \h </w:instrText>
         </w:r>
         <w:r>
           <w:rPr>
@@ -5026,7 +5026,7 @@
           <w14:ligatures w14:val="standardContextual"/>
         </w:rPr>
       </w:pPr>
-      <w:hyperlink w:anchor="_Toc242140511" w:history="1">
+      <w:hyperlink w:anchor="_Toc242140911" w:history="1">
         <w:r>
           <w:rPr>
             <w:rStyle w:val="Hyperlink"/>
@@ -5053,7 +5053,7 @@
             <w:noProof/>
             <w:webHidden/>
           </w:rPr>
-          <w:instrText xml:space="preserve"> PAGEREF _Toc242140511 \h </w:instrText>
+          <w:instrText xml:space="preserve"> PAGEREF _Toc242140911 \h </w:instrText>
         </w:r>
         <w:r>
           <w:rPr>
@@ -5098,7 +5098,7 @@
           <w14:ligatures w14:val="standardContextual"/>
         </w:rPr>
       </w:pPr>
-      <w:hyperlink w:anchor="_Toc242140512" w:history="1">
+      <w:hyperlink w:anchor="_Toc242140912" w:history="1">
         <w:r>
           <w:rPr>
             <w:rStyle w:val="Hyperlink"/>
@@ -5125,7 +5125,7 @@
             <w:noProof/>
             <w:webHidden/>
           </w:rPr>
-          <w:instrText xml:space="preserve"> PAGEREF _Toc242140512 \h </w:instrText>
+          <w:instrText xml:space="preserve"> PAGEREF _Toc242140912 \h </w:instrText>
         </w:r>
         <w:r>
           <w:rPr>
@@ -5170,7 +5170,7 @@
           <w14:ligatures w14:val="standardContextual"/>
         </w:rPr>
       </w:pPr>
-      <w:hyperlink w:anchor="_Toc242140513" w:history="1">
+      <w:hyperlink w:anchor="_Toc242140913" w:history="1">
         <w:r>
           <w:rPr>
             <w:rStyle w:val="Hyperlink"/>
@@ -5197,7 +5197,7 @@
             <w:noProof/>
             <w:webHidden/>
           </w:rPr>
-          <w:instrText xml:space="preserve"> PAGEREF _Toc242140513 \h </w:instrText>
+          <w:instrText xml:space="preserve"> PAGEREF _Toc242140913 \h </w:instrText>
         </w:r>
         <w:r>
           <w:rPr>
@@ -5242,7 +5242,7 @@
           <w14:ligatures w14:val="standardContextual"/>
         </w:rPr>
       </w:pPr>
-      <w:hyperlink w:anchor="_Toc242140514" w:history="1">
+      <w:hyperlink w:anchor="_Toc242140914" w:history="1">
         <w:r>
           <w:rPr>
             <w:rStyle w:val="Hyperlink"/>
@@ -5269,7 +5269,7 @@
             <w:noProof/>
             <w:webHidden/>
           </w:rPr>
-          <w:instrText xml:space="preserve"> PAGEREF _Toc242140514 \h </w:instrText>
+          <w:instrText xml:space="preserve"> PAGEREF _Toc242140914 \h </w:instrText>
         </w:r>
         <w:r>
           <w:rPr>
@@ -5314,7 +5314,7 @@
           <w14:ligatures w14:val="standardContextual"/>
         </w:rPr>
       </w:pPr>
-      <w:hyperlink w:anchor="_Toc242140515" w:history="1">
+      <w:hyperlink w:anchor="_Toc242140915" w:history="1">
         <w:r>
           <w:rPr>
             <w:rStyle w:val="Hyperlink"/>
@@ -5341,7 +5341,7 @@
             <w:noProof/>
             <w:webHidden/>
           </w:rPr>
-          <w:instrText xml:space="preserve"> PAGEREF _Toc242140515 \h </w:instrText>
+          <w:instrText xml:space="preserve"> PAGEREF _Toc242140915 \h </w:instrText>
         </w:r>
         <w:r>
           <w:rPr>
@@ -5386,7 +5386,7 @@
           <w14:ligatures w14:val="standardContextual"/>
         </w:rPr>
       </w:pPr>
-      <w:hyperlink w:anchor="_Toc242140516" w:history="1">
+      <w:hyperlink w:anchor="_Toc242140916" w:history="1">
         <w:r>
           <w:rPr>
             <w:rStyle w:val="Hyperlink"/>
@@ -5413,7 +5413,7 @@
             <w:noProof/>
             <w:webHidden/>
           </w:rPr>
-          <w:instrText xml:space="preserve"> PAGEREF _Toc242140516 \h </w:instrText>
+          <w:instrText xml:space="preserve"> PAGEREF _Toc242140916 \h </w:instrText>
         </w:r>
         <w:r>
           <w:rPr>
@@ -5458,7 +5458,7 @@
           <w14:ligatures w14:val="standardContextual"/>
         </w:rPr>
       </w:pPr>
-      <w:hyperlink w:anchor="_Toc242140517" w:history="1">
+      <w:hyperlink w:anchor="_Toc242140917" w:history="1">
         <w:r>
           <w:rPr>
             <w:rStyle w:val="Hyperlink"/>
@@ -5485,7 +5485,7 @@
             <w:noProof/>
             <w:webHidden/>
           </w:rPr>
-          <w:instrText xml:space="preserve"> PAGEREF _Toc242140517 \h </w:instrText>
+          <w:instrText xml:space="preserve"> PAGEREF _Toc242140917 \h </w:instrText>
         </w:r>
         <w:r>
           <w:rPr>
@@ -5530,7 +5530,7 @@
           <w14:ligatures w14:val="standardContextual"/>
         </w:rPr>
       </w:pPr>
-      <w:hyperlink w:anchor="_Toc242140518" w:history="1">
+      <w:hyperlink w:anchor="_Toc242140918" w:history="1">
         <w:r>
           <w:rPr>
             <w:rStyle w:val="Hyperlink"/>
@@ -5557,7 +5557,7 @@
             <w:noProof/>
             <w:webHidden/>
           </w:rPr>
-          <w:instrText xml:space="preserve"> PAGEREF _Toc242140518 \h </w:instrText>
+          <w:instrText xml:space="preserve"> PAGEREF _Toc242140918 \h </w:instrText>
         </w:r>
         <w:r>
           <w:rPr>
@@ -5600,7 +5600,7 @@
           <w14:ligatures w14:val="standardContextual"/>
         </w:rPr>
       </w:pPr>
-      <w:hyperlink w:anchor="_Toc242140519" w:history="1">
+      <w:hyperlink w:anchor="_Toc242140919" w:history="1">
         <w:r>
           <w:rPr>
             <w:rStyle w:val="Hyperlink"/>
@@ -5623,7 +5623,7 @@
           <w:rPr>
             <w:webHidden/>
           </w:rPr>
-          <w:instrText xml:space="preserve"> PAGEREF _Toc242140519 \h </w:instrText>
+          <w:instrText xml:space="preserve"> PAGEREF _Toc242140919 \h </w:instrText>
         </w:r>
         <w:r>
           <w:rPr>
@@ -5664,7 +5664,7 @@
           <w14:ligatures w14:val="standardContextual"/>
         </w:rPr>
       </w:pPr>
-      <w:hyperlink w:anchor="_Toc242140520" w:history="1">
+      <w:hyperlink w:anchor="_Toc242140920" w:history="1">
         <w:r>
           <w:rPr>
             <w:rStyle w:val="Hyperlink"/>
@@ -5691,7 +5691,7 @@
             <w:noProof/>
             <w:webHidden/>
           </w:rPr>
-          <w:instrText xml:space="preserve"> PAGEREF _Toc242140520 \h </w:instrText>
+          <w:instrText xml:space="preserve"> PAGEREF _Toc242140920 \h </w:instrText>
         </w:r>
         <w:r>
           <w:rPr>
@@ -5736,7 +5736,7 @@
           <w14:ligatures w14:val="standardContextual"/>
         </w:rPr>
       </w:pPr>
-      <w:hyperlink w:anchor="_Toc242140521" w:history="1">
+      <w:hyperlink w:anchor="_Toc242140921" w:history="1">
         <w:r>
           <w:rPr>
             <w:rStyle w:val="Hyperlink"/>
@@ -5763,7 +5763,7 @@
             <w:noProof/>
             <w:webHidden/>
           </w:rPr>
-          <w:instrText xml:space="preserve"> PAGEREF _Toc242140521 \h </w:instrText>
+          <w:instrText xml:space="preserve"> PAGEREF _Toc242140921 \h </w:instrText>
         </w:r>
         <w:r>
           <w:rPr>
@@ -5808,7 +5808,7 @@
           <w14:ligatures w14:val="standardContextual"/>
         </w:rPr>
       </w:pPr>
-      <w:hyperlink w:anchor="_Toc242140522" w:history="1">
+      <w:hyperlink w:anchor="_Toc242140922" w:history="1">
         <w:r>
           <w:rPr>
             <w:rStyle w:val="Hyperlink"/>
@@ -5835,7 +5835,7 @@
             <w:noProof/>
             <w:webHidden/>
           </w:rPr>
-          <w:instrText xml:space="preserve"> PAGEREF _Toc242140522 \h </w:instrText>
+          <w:instrText xml:space="preserve"> PAGEREF _Toc242140922 \h </w:instrText>
         </w:r>
         <w:r>
           <w:rPr>
@@ -5880,7 +5880,7 @@
           <w14:ligatures w14:val="standardContextual"/>
         </w:rPr>
       </w:pPr>
-      <w:hyperlink w:anchor="_Toc242140523" w:history="1">
+      <w:hyperlink w:anchor="_Toc242140923" w:history="1">
         <w:r>
           <w:rPr>
             <w:rStyle w:val="Hyperlink"/>
@@ -5907,7 +5907,7 @@
             <w:noProof/>
             <w:webHidden/>
           </w:rPr>
-          <w:instrText xml:space="preserve"> PAGEREF _Toc242140523 \h </w:instrText>
+          <w:instrText xml:space="preserve"> PAGEREF _Toc242140923 \h </w:instrText>
         </w:r>
         <w:r>
           <w:rPr>
@@ -5952,7 +5952,7 @@
           <w14:ligatures w14:val="standardContextual"/>
         </w:rPr>
       </w:pPr>
-      <w:hyperlink w:anchor="_Toc242140524" w:history="1">
+      <w:hyperlink w:anchor="_Toc242140924" w:history="1">
         <w:r>
           <w:rPr>
             <w:rStyle w:val="Hyperlink"/>
@@ -5979,7 +5979,7 @@
             <w:noProof/>
             <w:webHidden/>
           </w:rPr>
-          <w:instrText xml:space="preserve"> PAGEREF _Toc242140524 \h </w:instrText>
+          <w:instrText xml:space="preserve"> PAGEREF _Toc242140924 \h </w:instrText>
         </w:r>
         <w:r>
           <w:rPr>
@@ -6024,7 +6024,7 @@
           <w14:ligatures w14:val="standardContextual"/>
         </w:rPr>
       </w:pPr>
-      <w:hyperlink w:anchor="_Toc242140525" w:history="1">
+      <w:hyperlink w:anchor="_Toc242140925" w:history="1">
         <w:r>
           <w:rPr>
             <w:rStyle w:val="Hyperlink"/>
@@ -6051,7 +6051,7 @@
             <w:noProof/>
             <w:webHidden/>
           </w:rPr>
-          <w:instrText xml:space="preserve"> PAGEREF _Toc242140525 \h </w:instrText>
+          <w:instrText xml:space="preserve"> PAGEREF _Toc242140925 \h </w:instrText>
         </w:r>
         <w:r>
           <w:rPr>
@@ -6096,7 +6096,7 @@
           <w14:ligatures w14:val="standardContextual"/>
         </w:rPr>
       </w:pPr>
-      <w:hyperlink w:anchor="_Toc242140526" w:history="1">
+      <w:hyperlink w:anchor="_Toc242140926" w:history="1">
         <w:r>
           <w:rPr>
             <w:rStyle w:val="Hyperlink"/>
@@ -6123,7 +6123,7 @@
             <w:noProof/>
             <w:webHidden/>
           </w:rPr>
-          <w:instrText xml:space="preserve"> PAGEREF _Toc242140526 \h </w:instrText>
+          <w:instrText xml:space="preserve"> PAGEREF _Toc242140926 \h </w:instrText>
         </w:r>
         <w:r>
           <w:rPr>
@@ -6168,7 +6168,7 @@
           <w14:ligatures w14:val="standardContextual"/>
         </w:rPr>
       </w:pPr>
-      <w:hyperlink w:anchor="_Toc242140527" w:history="1">
+      <w:hyperlink w:anchor="_Toc242140927" w:history="1">
         <w:r>
           <w:rPr>
             <w:rStyle w:val="Hyperlink"/>
@@ -6195,7 +6195,7 @@
             <w:noProof/>
             <w:webHidden/>
           </w:rPr>
-          <w:instrText xml:space="preserve"> PAGEREF _Toc242140527 \h </w:instrText>
+          <w:instrText xml:space="preserve"> PAGEREF _Toc242140927 \h </w:instrText>
         </w:r>
         <w:r>
           <w:rPr>
@@ -6240,7 +6240,7 @@
           <w14:ligatures w14:val="standardContextual"/>
         </w:rPr>
       </w:pPr>
-      <w:hyperlink w:anchor="_Toc242140528" w:history="1">
+      <w:hyperlink w:anchor="_Toc242140928" w:history="1">
         <w:r>
           <w:rPr>
             <w:rStyle w:val="Hyperlink"/>
@@ -6267,7 +6267,7 @@
             <w:noProof/>
             <w:webHidden/>
           </w:rPr>
-          <w:instrText xml:space="preserve"> PAGEREF _Toc242140528 \h </w:instrText>
+          <w:instrText xml:space="preserve"> PAGEREF _Toc242140928 \h </w:instrText>
         </w:r>
         <w:r>
           <w:rPr>
@@ -6312,7 +6312,7 @@
           <w14:ligatures w14:val="standardContextual"/>
         </w:rPr>
       </w:pPr>
-      <w:hyperlink w:anchor="_Toc242140529" w:history="1">
+      <w:hyperlink w:anchor="_Toc242140929" w:history="1">
         <w:r>
           <w:rPr>
             <w:rStyle w:val="Hyperlink"/>
@@ -6339,7 +6339,7 @@
             <w:noProof/>
             <w:webHidden/>
           </w:rPr>
-          <w:instrText xml:space="preserve"> PAGEREF _Toc242140529 \h </w:instrText>
+          <w:instrText xml:space="preserve"> PAGEREF _Toc242140929 \h </w:instrText>
         </w:r>
         <w:r>
           <w:rPr>
@@ -6382,7 +6382,7 @@
           <w14:ligatures w14:val="standardContextual"/>
         </w:rPr>
       </w:pPr>
-      <w:hyperlink w:anchor="_Toc242140530" w:history="1">
+      <w:hyperlink w:anchor="_Toc242140930" w:history="1">
         <w:r>
           <w:rPr>
             <w:rStyle w:val="Hyperlink"/>
@@ -6405,7 +6405,7 @@
           <w:rPr>
             <w:webHidden/>
           </w:rPr>
-          <w:instrText xml:space="preserve"> PAGEREF _Toc242140530 \h </w:instrText>
+          <w:instrText xml:space="preserve"> PAGEREF _Toc242140930 \h </w:instrText>
         </w:r>
         <w:r>
           <w:rPr>
@@ -6446,7 +6446,7 @@
           <w14:ligatures w14:val="standardContextual"/>
         </w:rPr>
       </w:pPr>
-      <w:hyperlink w:anchor="_Toc242140531" w:history="1">
+      <w:hyperlink w:anchor="_Toc242140931" w:history="1">
         <w:r>
           <w:rPr>
             <w:rStyle w:val="Hyperlink"/>
@@ -6473,7 +6473,7 @@
             <w:noProof/>
             <w:webHidden/>
           </w:rPr>
-          <w:instrText xml:space="preserve"> PAGEREF _Toc242140531 \h </w:instrText>
+          <w:instrText xml:space="preserve"> PAGEREF _Toc242140931 \h </w:instrText>
         </w:r>
         <w:r>
           <w:rPr>
@@ -6518,7 +6518,7 @@
           <w14:ligatures w14:val="standardContextual"/>
         </w:rPr>
       </w:pPr>
-      <w:hyperlink w:anchor="_Toc242140532" w:history="1">
+      <w:hyperlink w:anchor="_Toc242140932" w:history="1">
         <w:r>
           <w:rPr>
             <w:rStyle w:val="Hyperlink"/>
@@ -6545,7 +6545,7 @@
             <w:noProof/>
             <w:webHidden/>
           </w:rPr>
-          <w:instrText xml:space="preserve"> PAGEREF _Toc242140532 \h </w:instrText>
+          <w:instrText xml:space="preserve"> PAGEREF _Toc242140932 \h </w:instrText>
         </w:r>
         <w:r>
           <w:rPr>
@@ -6590,7 +6590,7 @@
           <w14:ligatures w14:val="standardContextual"/>
         </w:rPr>
       </w:pPr>
-      <w:hyperlink w:anchor="_Toc242140533" w:history="1">
+      <w:hyperlink w:anchor="_Toc242140933" w:history="1">
         <w:r>
           <w:rPr>
             <w:rStyle w:val="Hyperlink"/>
@@ -6617,7 +6617,7 @@
             <w:noProof/>
             <w:webHidden/>
           </w:rPr>
-          <w:instrText xml:space="preserve"> PAGEREF _Toc242140533 \h </w:instrText>
+          <w:instrText xml:space="preserve"> PAGEREF _Toc242140933 \h </w:instrText>
         </w:r>
         <w:r>
           <w:rPr>
@@ -6662,7 +6662,7 @@
           <w14:ligatures w14:val="standardContextual"/>
         </w:rPr>
       </w:pPr>
-      <w:hyperlink w:anchor="_Toc242140534" w:history="1">
+      <w:hyperlink w:anchor="_Toc242140934" w:history="1">
         <w:r>
           <w:rPr>
             <w:rStyle w:val="Hyperlink"/>
@@ -6689,7 +6689,7 @@
             <w:noProof/>
             <w:webHidden/>
           </w:rPr>
-          <w:instrText xml:space="preserve"> PAGEREF _Toc242140534 \h </w:instrText>
+          <w:instrText xml:space="preserve"> PAGEREF _Toc242140934 \h </w:instrText>
         </w:r>
         <w:r>
           <w:rPr>
@@ -6734,7 +6734,7 @@
           <w14:ligatures w14:val="standardContextual"/>
         </w:rPr>
       </w:pPr>
-      <w:hyperlink w:anchor="_Toc242140535" w:history="1">
+      <w:hyperlink w:anchor="_Toc242140935" w:history="1">
         <w:r>
           <w:rPr>
             <w:rStyle w:val="Hyperlink"/>
@@ -6761,7 +6761,7 @@
             <w:noProof/>
             <w:webHidden/>
           </w:rPr>
-          <w:instrText xml:space="preserve"> PAGEREF _Toc242140535 \h </w:instrText>
+          <w:instrText xml:space="preserve"> PAGEREF _Toc242140935 \h </w:instrText>
         </w:r>
         <w:r>
           <w:rPr>
@@ -6806,7 +6806,7 @@
           <w14:ligatures w14:val="standardContextual"/>
         </w:rPr>
       </w:pPr>
-      <w:hyperlink w:anchor="_Toc242140536" w:history="1">
+      <w:hyperlink w:anchor="_Toc242140936" w:history="1">
         <w:r>
           <w:rPr>
             <w:rStyle w:val="Hyperlink"/>
@@ -6833,7 +6833,7 @@
             <w:noProof/>
             <w:webHidden/>
           </w:rPr>
-          <w:instrText xml:space="preserve"> PAGEREF _Toc242140536 \h </w:instrText>
+          <w:instrText xml:space="preserve"> PAGEREF _Toc242140936 \h </w:instrText>
         </w:r>
         <w:r>
           <w:rPr>
@@ -6878,7 +6878,7 @@
           <w14:ligatures w14:val="standardContextual"/>
         </w:rPr>
       </w:pPr>
-      <w:hyperlink w:anchor="_Toc242140537" w:history="1">
+      <w:hyperlink w:anchor="_Toc242140937" w:history="1">
         <w:r>
           <w:rPr>
             <w:rStyle w:val="Hyperlink"/>
@@ -6905,7 +6905,7 @@
             <w:noProof/>
             <w:webHidden/>
           </w:rPr>
-          <w:instrText xml:space="preserve"> PAGEREF _Toc242140537 \h </w:instrText>
+          <w:instrText xml:space="preserve"> PAGEREF _Toc242140937 \h </w:instrText>
         </w:r>
         <w:r>
           <w:rPr>
@@ -6950,7 +6950,7 @@
           <w14:ligatures w14:val="standardContextual"/>
         </w:rPr>
       </w:pPr>
-      <w:hyperlink w:anchor="_Toc242140538" w:history="1">
+      <w:hyperlink w:anchor="_Toc242140938" w:history="1">
         <w:r>
           <w:rPr>
             <w:rStyle w:val="Hyperlink"/>
@@ -6977,7 +6977,7 @@
             <w:noProof/>
             <w:webHidden/>
           </w:rPr>
-          <w:instrText xml:space="preserve"> PAGEREF _Toc242140538 \h </w:instrText>
+          <w:instrText xml:space="preserve"> PAGEREF _Toc242140938 \h </w:instrText>
         </w:r>
         <w:r>
           <w:rPr>
@@ -7020,7 +7020,7 @@
           <w14:ligatures w14:val="standardContextual"/>
         </w:rPr>
       </w:pPr>
-      <w:hyperlink w:anchor="_Toc242140539" w:history="1">
+      <w:hyperlink w:anchor="_Toc242140939" w:history="1">
         <w:r>
           <w:rPr>
             <w:rStyle w:val="Hyperlink"/>
@@ -7043,7 +7043,7 @@
           <w:rPr>
             <w:webHidden/>
           </w:rPr>
-          <w:instrText xml:space="preserve"> PAGEREF _Toc242140539 \h </w:instrText>
+          <w:instrText xml:space="preserve"> PAGEREF _Toc242140939 \h </w:instrText>
         </w:r>
         <w:r>
           <w:rPr>
@@ -7084,7 +7084,7 @@
           <w14:ligatures w14:val="standardContextual"/>
         </w:rPr>
       </w:pPr>
-      <w:hyperlink w:anchor="_Toc242140540" w:history="1">
+      <w:hyperlink w:anchor="_Toc242140940" w:history="1">
         <w:r>
           <w:rPr>
             <w:rStyle w:val="Hyperlink"/>
@@ -7111,7 +7111,7 @@
             <w:noProof/>
             <w:webHidden/>
           </w:rPr>
-          <w:instrText xml:space="preserve"> PAGEREF _Toc242140540 \h </w:instrText>
+          <w:instrText xml:space="preserve"> PAGEREF _Toc242140940 \h </w:instrText>
         </w:r>
         <w:r>
           <w:rPr>
@@ -7156,7 +7156,7 @@
           <w14:ligatures w14:val="standardContextual"/>
         </w:rPr>
       </w:pPr>
-      <w:hyperlink w:anchor="_Toc242140541" w:history="1">
+      <w:hyperlink w:anchor="_Toc242140941" w:history="1">
         <w:r>
           <w:rPr>
             <w:rStyle w:val="Hyperlink"/>
@@ -7183,7 +7183,7 @@
             <w:noProof/>
             <w:webHidden/>
           </w:rPr>
-          <w:instrText xml:space="preserve"> PAGEREF _Toc242140541 \h </w:instrText>
+          <w:instrText xml:space="preserve"> PAGEREF _Toc242140941 \h </w:instrText>
         </w:r>
         <w:r>
           <w:rPr>
@@ -7226,7 +7226,7 @@
           <w14:ligatures w14:val="standardContextual"/>
         </w:rPr>
       </w:pPr>
-      <w:hyperlink w:anchor="_Toc242140542" w:history="1">
+      <w:hyperlink w:anchor="_Toc242140942" w:history="1">
         <w:r>
           <w:rPr>
             <w:rStyle w:val="Hyperlink"/>
@@ -7249,7 +7249,7 @@
           <w:rPr>
             <w:webHidden/>
           </w:rPr>
-          <w:instrText xml:space="preserve"> PAGEREF _Toc242140542 \h </w:instrText>
+          <w:instrText xml:space="preserve"> PAGEREF _Toc242140942 \h </w:instrText>
         </w:r>
         <w:r>
           <w:rPr>
@@ -7288,7 +7288,7 @@
           <w14:ligatures w14:val="standardContextual"/>
         </w:rPr>
       </w:pPr>
-      <w:hyperlink w:anchor="_Toc242140543" w:history="1">
+      <w:hyperlink w:anchor="_Toc242140943" w:history="1">
         <w:r>
           <w:rPr>
             <w:rStyle w:val="Hyperlink"/>
@@ -7311,7 +7311,7 @@
           <w:rPr>
             <w:webHidden/>
           </w:rPr>
-          <w:instrText xml:space="preserve"> PAGEREF _Toc242140543 \h </w:instrText>
+          <w:instrText xml:space="preserve"> PAGEREF _Toc242140943 \h </w:instrText>
         </w:r>
         <w:r>
           <w:rPr>
@@ -7352,7 +7352,7 @@
           <w14:ligatures w14:val="standardContextual"/>
         </w:rPr>
       </w:pPr>
-      <w:hyperlink w:anchor="_Toc242140544" w:history="1">
+      <w:hyperlink w:anchor="_Toc242140944" w:history="1">
         <w:r>
           <w:rPr>
             <w:rStyle w:val="Hyperlink"/>
@@ -7379,7 +7379,7 @@
             <w:noProof/>
             <w:webHidden/>
           </w:rPr>
-          <w:instrText xml:space="preserve"> PAGEREF _Toc242140544 \h </w:instrText>
+          <w:instrText xml:space="preserve"> PAGEREF _Toc242140944 \h </w:instrText>
         </w:r>
         <w:r>
           <w:rPr>
@@ -7424,7 +7424,7 @@
           <w14:ligatures w14:val="standardContextual"/>
         </w:rPr>
       </w:pPr>
-      <w:hyperlink w:anchor="_Toc242140545" w:history="1">
+      <w:hyperlink w:anchor="_Toc242140945" w:history="1">
         <w:r>
           <w:rPr>
             <w:rStyle w:val="Hyperlink"/>
@@ -7451,7 +7451,7 @@
             <w:noProof/>
             <w:webHidden/>
           </w:rPr>
-          <w:instrText xml:space="preserve"> PAGEREF _Toc242140545 \h </w:instrText>
+          <w:instrText xml:space="preserve"> PAGEREF _Toc242140945 \h </w:instrText>
         </w:r>
         <w:r>
           <w:rPr>
@@ -7496,7 +7496,7 @@
           <w14:ligatures w14:val="standardContextual"/>
         </w:rPr>
       </w:pPr>
-      <w:hyperlink w:anchor="_Toc242140546" w:history="1">
+      <w:hyperlink w:anchor="_Toc242140946" w:history="1">
         <w:r>
           <w:rPr>
             <w:rStyle w:val="Hyperlink"/>
@@ -7523,7 +7523,7 @@
             <w:noProof/>
             <w:webHidden/>
           </w:rPr>
-          <w:instrText xml:space="preserve"> PAGEREF _Toc242140546 \h </w:instrText>
+          <w:instrText xml:space="preserve"> PAGEREF _Toc242140946 \h </w:instrText>
         </w:r>
         <w:r>
           <w:rPr>
@@ -7568,7 +7568,7 @@
           <w14:ligatures w14:val="standardContextual"/>
         </w:rPr>
       </w:pPr>
-      <w:hyperlink w:anchor="_Toc242140547" w:history="1">
+      <w:hyperlink w:anchor="_Toc242140947" w:history="1">
         <w:r>
           <w:rPr>
             <w:rStyle w:val="Hyperlink"/>
@@ -7595,7 +7595,7 @@
             <w:noProof/>
             <w:webHidden/>
           </w:rPr>
-          <w:instrText xml:space="preserve"> PAGEREF _Toc242140547 \h </w:instrText>
+          <w:instrText xml:space="preserve"> PAGEREF _Toc242140947 \h </w:instrText>
         </w:r>
         <w:r>
           <w:rPr>
@@ -7640,7 +7640,7 @@
           <w14:ligatures w14:val="standardContextual"/>
         </w:rPr>
       </w:pPr>
-      <w:hyperlink w:anchor="_Toc242140548" w:history="1">
+      <w:hyperlink w:anchor="_Toc242140948" w:history="1">
         <w:r>
           <w:rPr>
             <w:rStyle w:val="Hyperlink"/>
@@ -7667,7 +7667,7 @@
             <w:noProof/>
             <w:webHidden/>
           </w:rPr>
-          <w:instrText xml:space="preserve"> PAGEREF _Toc242140548 \h </w:instrText>
+          <w:instrText xml:space="preserve"> PAGEREF _Toc242140948 \h </w:instrText>
         </w:r>
         <w:r>
           <w:rPr>
@@ -7712,7 +7712,7 @@
           <w14:ligatures w14:val="standardContextual"/>
         </w:rPr>
       </w:pPr>
-      <w:hyperlink w:anchor="_Toc242140549" w:history="1">
+      <w:hyperlink w:anchor="_Toc242140949" w:history="1">
         <w:r>
           <w:rPr>
             <w:rStyle w:val="Hyperlink"/>
@@ -7739,7 +7739,7 @@
             <w:noProof/>
             <w:webHidden/>
           </w:rPr>
-          <w:instrText xml:space="preserve"> PAGEREF _Toc242140549 \h </w:instrText>
+          <w:instrText xml:space="preserve"> PAGEREF _Toc242140949 \h </w:instrText>
         </w:r>
         <w:r>
           <w:rPr>
@@ -7784,7 +7784,7 @@
           <w14:ligatures w14:val="standardContextual"/>
         </w:rPr>
       </w:pPr>
-      <w:hyperlink w:anchor="_Toc242140550" w:history="1">
+      <w:hyperlink w:anchor="_Toc242140950" w:history="1">
         <w:r>
           <w:rPr>
             <w:rStyle w:val="Hyperlink"/>
@@ -7811,7 +7811,7 @@
             <w:noProof/>
             <w:webHidden/>
           </w:rPr>
-          <w:instrText xml:space="preserve"> PAGEREF _Toc242140550 \h </w:instrText>
+          <w:instrText xml:space="preserve"> PAGEREF _Toc242140950 \h </w:instrText>
         </w:r>
         <w:r>
           <w:rPr>
@@ -7856,7 +7856,7 @@
           <w14:ligatures w14:val="standardContextual"/>
         </w:rPr>
       </w:pPr>
-      <w:hyperlink w:anchor="_Toc242140551" w:history="1">
+      <w:hyperlink w:anchor="_Toc242140951" w:history="1">
         <w:r>
           <w:rPr>
             <w:rStyle w:val="Hyperlink"/>
@@ -7883,7 +7883,7 @@
             <w:noProof/>
             <w:webHidden/>
           </w:rPr>
-          <w:instrText xml:space="preserve"> PAGEREF _Toc242140551 \h </w:instrText>
+          <w:instrText xml:space="preserve"> PAGEREF _Toc242140951 \h </w:instrText>
         </w:r>
         <w:r>
           <w:rPr>
@@ -7928,7 +7928,7 @@
           <w14:ligatures w14:val="standardContextual"/>
         </w:rPr>
       </w:pPr>
-      <w:hyperlink w:anchor="_Toc242140552" w:history="1">
+      <w:hyperlink w:anchor="_Toc242140952" w:history="1">
         <w:r>
           <w:rPr>
             <w:rStyle w:val="Hyperlink"/>
@@ -7955,7 +7955,7 @@
             <w:noProof/>
             <w:webHidden/>
           </w:rPr>
-          <w:instrText xml:space="preserve"> PAGEREF _Toc242140552 \h </w:instrText>
+          <w:instrText xml:space="preserve"> PAGEREF _Toc242140952 \h </w:instrText>
         </w:r>
         <w:r>
           <w:rPr>
@@ -8000,7 +8000,7 @@
           <w14:ligatures w14:val="standardContextual"/>
         </w:rPr>
       </w:pPr>
-      <w:hyperlink w:anchor="_Toc242140553" w:history="1">
+      <w:hyperlink w:anchor="_Toc242140953" w:history="1">
         <w:r>
           <w:rPr>
             <w:rStyle w:val="Hyperlink"/>
@@ -8027,7 +8027,7 @@
             <w:noProof/>
             <w:webHidden/>
           </w:rPr>
-          <w:instrText xml:space="preserve"> PAGEREF _Toc242140553 \h </w:instrText>
+          <w:instrText xml:space="preserve"> PAGEREF _Toc242140953 \h </w:instrText>
         </w:r>
         <w:r>
           <w:rPr>
@@ -8072,7 +8072,7 @@
           <w14:ligatures w14:val="standardContextual"/>
         </w:rPr>
       </w:pPr>
-      <w:hyperlink w:anchor="_Toc242140554" w:history="1">
+      <w:hyperlink w:anchor="_Toc242140954" w:history="1">
         <w:r>
           <w:rPr>
             <w:rStyle w:val="Hyperlink"/>
@@ -8099,7 +8099,7 @@
             <w:noProof/>
             <w:webHidden/>
           </w:rPr>
-          <w:instrText xml:space="preserve"> PAGEREF _Toc242140554 \h </w:instrText>
+          <w:instrText xml:space="preserve"> PAGEREF _Toc242140954 \h </w:instrText>
         </w:r>
         <w:r>
           <w:rPr>
@@ -8144,7 +8144,7 @@
           <w14:ligatures w14:val="standardContextual"/>
         </w:rPr>
       </w:pPr>
-      <w:hyperlink w:anchor="_Toc242140555" w:history="1">
+      <w:hyperlink w:anchor="_Toc242140955" w:history="1">
         <w:r>
           <w:rPr>
             <w:rStyle w:val="Hyperlink"/>
@@ -8171,7 +8171,7 @@
             <w:noProof/>
             <w:webHidden/>
           </w:rPr>
-          <w:instrText xml:space="preserve"> PAGEREF _Toc242140555 \h </w:instrText>
+          <w:instrText xml:space="preserve"> PAGEREF _Toc242140955 \h </w:instrText>
         </w:r>
         <w:r>
           <w:rPr>
@@ -8216,7 +8216,7 @@
           <w14:ligatures w14:val="standardContextual"/>
         </w:rPr>
       </w:pPr>
-      <w:hyperlink w:anchor="_Toc242140556" w:history="1">
+      <w:hyperlink w:anchor="_Toc242140956" w:history="1">
         <w:r>
           <w:rPr>
             <w:rStyle w:val="Hyperlink"/>
@@ -8243,7 +8243,7 @@
             <w:noProof/>
             <w:webHidden/>
           </w:rPr>
-          <w:instrText xml:space="preserve"> PAGEREF _Toc242140556 \h </w:instrText>
+          <w:instrText xml:space="preserve"> PAGEREF _Toc242140956 \h </w:instrText>
         </w:r>
         <w:r>
           <w:rPr>
@@ -8288,7 +8288,7 @@
           <w14:ligatures w14:val="standardContextual"/>
         </w:rPr>
       </w:pPr>
-      <w:hyperlink w:anchor="_Toc242140557" w:history="1">
+      <w:hyperlink w:anchor="_Toc242140957" w:history="1">
         <w:r>
           <w:rPr>
             <w:rStyle w:val="Hyperlink"/>
@@ -8315,7 +8315,7 @@
             <w:noProof/>
             <w:webHidden/>
           </w:rPr>
-          <w:instrText xml:space="preserve"> PAGEREF _Toc242140557 \h </w:instrText>
+          <w:instrText xml:space="preserve"> PAGEREF _Toc242140957 \h </w:instrText>
         </w:r>
         <w:r>
           <w:rPr>
@@ -8360,7 +8360,7 @@
           <w14:ligatures w14:val="standardContextual"/>
         </w:rPr>
       </w:pPr>
-      <w:hyperlink w:anchor="_Toc242140558" w:history="1">
+      <w:hyperlink w:anchor="_Toc242140958" w:history="1">
         <w:r>
           <w:rPr>
             <w:rStyle w:val="Hyperlink"/>
@@ -8387,7 +8387,7 @@
             <w:noProof/>
             <w:webHidden/>
           </w:rPr>
-          <w:instrText xml:space="preserve"> PAGEREF _Toc242140558 \h </w:instrText>
+          <w:instrText xml:space="preserve"> PAGEREF _Toc242140958 \h </w:instrText>
         </w:r>
         <w:r>
           <w:rPr>
@@ -8432,7 +8432,7 @@
           <w14:ligatures w14:val="standardContextual"/>
         </w:rPr>
       </w:pPr>
-      <w:hyperlink w:anchor="_Toc242140559" w:history="1">
+      <w:hyperlink w:anchor="_Toc242140959" w:history="1">
         <w:r>
           <w:rPr>
             <w:rStyle w:val="Hyperlink"/>
@@ -8459,7 +8459,7 @@
             <w:noProof/>
             <w:webHidden/>
           </w:rPr>
-          <w:instrText xml:space="preserve"> PAGEREF _Toc242140559 \h </w:instrText>
+          <w:instrText xml:space="preserve"> PAGEREF _Toc242140959 \h </w:instrText>
         </w:r>
         <w:r>
           <w:rPr>
@@ -8504,7 +8504,7 @@
           <w14:ligatures w14:val="standardContextual"/>
         </w:rPr>
       </w:pPr>
-      <w:hyperlink w:anchor="_Toc242140560" w:history="1">
+      <w:hyperlink w:anchor="_Toc242140960" w:history="1">
         <w:r>
           <w:rPr>
             <w:rStyle w:val="Hyperlink"/>
@@ -8531,7 +8531,7 @@
             <w:noProof/>
             <w:webHidden/>
           </w:rPr>
-          <w:instrText xml:space="preserve"> PAGEREF _Toc242140560 \h </w:instrText>
+          <w:instrText xml:space="preserve"> PAGEREF _Toc242140960 \h </w:instrText>
         </w:r>
         <w:r>
           <w:rPr>
@@ -8576,7 +8576,7 @@
           <w14:ligatures w14:val="standardContextual"/>
         </w:rPr>
       </w:pPr>
-      <w:hyperlink w:anchor="_Toc242140561" w:history="1">
+      <w:hyperlink w:anchor="_Toc242140961" w:history="1">
         <w:r>
           <w:rPr>
             <w:rStyle w:val="Hyperlink"/>
@@ -8603,7 +8603,7 @@
             <w:noProof/>
             <w:webHidden/>
           </w:rPr>
-          <w:instrText xml:space="preserve"> PAGEREF _Toc242140561 \h </w:instrText>
+          <w:instrText xml:space="preserve"> PAGEREF _Toc242140961 \h </w:instrText>
         </w:r>
         <w:r>
           <w:rPr>
@@ -8648,7 +8648,7 @@
           <w14:ligatures w14:val="standardContextual"/>
         </w:rPr>
       </w:pPr>
-      <w:hyperlink w:anchor="_Toc242140562" w:history="1">
+      <w:hyperlink w:anchor="_Toc242140962" w:history="1">
         <w:r>
           <w:rPr>
             <w:rStyle w:val="Hyperlink"/>
@@ -8675,7 +8675,7 @@
             <w:noProof/>
             <w:webHidden/>
           </w:rPr>
-          <w:instrText xml:space="preserve"> PAGEREF _Toc242140562 \h </w:instrText>
+          <w:instrText xml:space="preserve"> PAGEREF _Toc242140962 \h </w:instrText>
         </w:r>
         <w:r>
           <w:rPr>
@@ -8720,7 +8720,7 @@
           <w14:ligatures w14:val="standardContextual"/>
         </w:rPr>
       </w:pPr>
-      <w:hyperlink w:anchor="_Toc242140563" w:history="1">
+      <w:hyperlink w:anchor="_Toc242140963" w:history="1">
         <w:r>
           <w:rPr>
             <w:rStyle w:val="Hyperlink"/>
@@ -8747,7 +8747,7 @@
             <w:noProof/>
             <w:webHidden/>
           </w:rPr>
-          <w:instrText xml:space="preserve"> PAGEREF _Toc242140563 \h </w:instrText>
+          <w:instrText xml:space="preserve"> PAGEREF _Toc242140963 \h </w:instrText>
         </w:r>
         <w:r>
           <w:rPr>
@@ -8792,7 +8792,7 @@
           <w14:ligatures w14:val="standardContextual"/>
         </w:rPr>
       </w:pPr>
-      <w:hyperlink w:anchor="_Toc242140564" w:history="1">
+      <w:hyperlink w:anchor="_Toc242140964" w:history="1">
         <w:r>
           <w:rPr>
             <w:rStyle w:val="Hyperlink"/>
@@ -8819,7 +8819,7 @@
             <w:noProof/>
             <w:webHidden/>
           </w:rPr>
-          <w:instrText xml:space="preserve"> PAGEREF _Toc242140564 \h </w:instrText>
+          <w:instrText xml:space="preserve"> PAGEREF _Toc242140964 \h </w:instrText>
         </w:r>
         <w:r>
           <w:rPr>
@@ -8864,7 +8864,7 @@
           <w14:ligatures w14:val="standardContextual"/>
         </w:rPr>
       </w:pPr>
-      <w:hyperlink w:anchor="_Toc242140565" w:history="1">
+      <w:hyperlink w:anchor="_Toc242140965" w:history="1">
         <w:r>
           <w:rPr>
             <w:rStyle w:val="Hyperlink"/>
@@ -8891,7 +8891,7 @@
             <w:noProof/>
             <w:webHidden/>
           </w:rPr>
-          <w:instrText xml:space="preserve"> PAGEREF _Toc242140565 \h </w:instrText>
+          <w:instrText xml:space="preserve"> PAGEREF _Toc242140965 \h </w:instrText>
         </w:r>
         <w:r>
           <w:rPr>
@@ -8936,7 +8936,7 @@
           <w14:ligatures w14:val="standardContextual"/>
         </w:rPr>
       </w:pPr>
-      <w:hyperlink w:anchor="_Toc242140566" w:history="1">
+      <w:hyperlink w:anchor="_Toc242140966" w:history="1">
         <w:r>
           <w:rPr>
             <w:rStyle w:val="Hyperlink"/>
@@ -8963,7 +8963,7 @@
             <w:noProof/>
             <w:webHidden/>
           </w:rPr>
-          <w:instrText xml:space="preserve"> PAGEREF _Toc242140566 \h </w:instrText>
+          <w:instrText xml:space="preserve"> PAGEREF _Toc242140966 \h </w:instrText>
         </w:r>
         <w:r>
           <w:rPr>
@@ -9008,7 +9008,7 @@
           <w14:ligatures w14:val="standardContextual"/>
         </w:rPr>
       </w:pPr>
-      <w:hyperlink w:anchor="_Toc242140567" w:history="1">
+      <w:hyperlink w:anchor="_Toc242140967" w:history="1">
         <w:r>
           <w:rPr>
             <w:rStyle w:val="Hyperlink"/>
@@ -9035,7 +9035,7 @@
             <w:noProof/>
             <w:webHidden/>
           </w:rPr>
-          <w:instrText xml:space="preserve"> PAGEREF _Toc242140567 \h </w:instrText>
+          <w:instrText xml:space="preserve"> PAGEREF _Toc242140967 \h </w:instrText>
         </w:r>
         <w:r>
           <w:rPr>
@@ -9080,7 +9080,7 @@
           <w14:ligatures w14:val="standardContextual"/>
         </w:rPr>
       </w:pPr>
-      <w:hyperlink w:anchor="_Toc242140568" w:history="1">
+      <w:hyperlink w:anchor="_Toc242140968" w:history="1">
         <w:r>
           <w:rPr>
             <w:rStyle w:val="Hyperlink"/>
@@ -9107,7 +9107,7 @@
             <w:noProof/>
             <w:webHidden/>
           </w:rPr>
-          <w:instrText xml:space="preserve"> PAGEREF _Toc242140568 \h </w:instrText>
+          <w:instrText xml:space="preserve"> PAGEREF _Toc242140968 \h </w:instrText>
         </w:r>
         <w:r>
           <w:rPr>
@@ -9152,7 +9152,7 @@
           <w14:ligatures w14:val="standardContextual"/>
         </w:rPr>
       </w:pPr>
-      <w:hyperlink w:anchor="_Toc242140569" w:history="1">
+      <w:hyperlink w:anchor="_Toc242140969" w:history="1">
         <w:r>
           <w:rPr>
             <w:rStyle w:val="Hyperlink"/>
@@ -9179,7 +9179,7 @@
             <w:noProof/>
             <w:webHidden/>
           </w:rPr>
-          <w:instrText xml:space="preserve"> PAGEREF _Toc242140569 \h </w:instrText>
+          <w:instrText xml:space="preserve"> PAGEREF _Toc242140969 \h </w:instrText>
         </w:r>
         <w:r>
           <w:rPr>
@@ -9224,7 +9224,7 @@
           <w14:ligatures w14:val="standardContextual"/>
         </w:rPr>
       </w:pPr>
-      <w:hyperlink w:anchor="_Toc242140570" w:history="1">
+      <w:hyperlink w:anchor="_Toc242140970" w:history="1">
         <w:r>
           <w:rPr>
             <w:rStyle w:val="Hyperlink"/>
@@ -9251,7 +9251,7 @@
             <w:noProof/>
             <w:webHidden/>
           </w:rPr>
-          <w:instrText xml:space="preserve"> PAGEREF _Toc242140570 \h </w:instrText>
+          <w:instrText xml:space="preserve"> PAGEREF _Toc242140970 \h </w:instrText>
         </w:r>
         <w:r>
           <w:rPr>
@@ -9296,7 +9296,7 @@
           <w14:ligatures w14:val="standardContextual"/>
         </w:rPr>
       </w:pPr>
-      <w:hyperlink w:anchor="_Toc242140571" w:history="1">
+      <w:hyperlink w:anchor="_Toc242140971" w:history="1">
         <w:r>
           <w:rPr>
             <w:rStyle w:val="Hyperlink"/>
@@ -9323,7 +9323,7 @@
             <w:noProof/>
             <w:webHidden/>
           </w:rPr>
-          <w:instrText xml:space="preserve"> PAGEREF _Toc242140571 \h </w:instrText>
+          <w:instrText xml:space="preserve"> PAGEREF _Toc242140971 \h </w:instrText>
         </w:r>
         <w:r>
           <w:rPr>
@@ -9368,7 +9368,7 @@
           <w14:ligatures w14:val="standardContextual"/>
         </w:rPr>
       </w:pPr>
-      <w:hyperlink w:anchor="_Toc242140572" w:history="1">
+      <w:hyperlink w:anchor="_Toc242140972" w:history="1">
         <w:r>
           <w:rPr>
             <w:rStyle w:val="Hyperlink"/>
@@ -9395,7 +9395,7 @@
             <w:noProof/>
             <w:webHidden/>
           </w:rPr>
-          <w:instrText xml:space="preserve"> PAGEREF _Toc242140572 \h </w:instrText>
+          <w:instrText xml:space="preserve"> PAGEREF _Toc242140972 \h </w:instrText>
         </w:r>
         <w:r>
           <w:rPr>
@@ -9440,7 +9440,7 @@
           <w14:ligatures w14:val="standardContextual"/>
         </w:rPr>
       </w:pPr>
-      <w:hyperlink w:anchor="_Toc242140573" w:history="1">
+      <w:hyperlink w:anchor="_Toc242140973" w:history="1">
         <w:r>
           <w:rPr>
             <w:rStyle w:val="Hyperlink"/>
@@ -9467,7 +9467,7 @@
             <w:noProof/>
             <w:webHidden/>
           </w:rPr>
-          <w:instrText xml:space="preserve"> PAGEREF _Toc242140573 \h </w:instrText>
+          <w:instrText xml:space="preserve"> PAGEREF _Toc242140973 \h </w:instrText>
         </w:r>
         <w:r>
           <w:rPr>
@@ -9512,7 +9512,7 @@
           <w14:ligatures w14:val="standardContextual"/>
         </w:rPr>
       </w:pPr>
-      <w:hyperlink w:anchor="_Toc242140574" w:history="1">
+      <w:hyperlink w:anchor="_Toc242140974" w:history="1">
         <w:r>
           <w:rPr>
             <w:rStyle w:val="Hyperlink"/>
@@ -9539,7 +9539,7 @@
             <w:noProof/>
             <w:webHidden/>
           </w:rPr>
-          <w:instrText xml:space="preserve"> PAGEREF _Toc242140574 \h </w:instrText>
+          <w:instrText xml:space="preserve"> PAGEREF _Toc242140974 \h </w:instrText>
         </w:r>
         <w:r>
           <w:rPr>
@@ -9584,7 +9584,7 @@
           <w14:ligatures w14:val="standardContextual"/>
         </w:rPr>
       </w:pPr>
-      <w:hyperlink w:anchor="_Toc242140575" w:history="1">
+      <w:hyperlink w:anchor="_Toc242140975" w:history="1">
         <w:r>
           <w:rPr>
             <w:rStyle w:val="Hyperlink"/>
@@ -9611,7 +9611,7 @@
             <w:noProof/>
             <w:webHidden/>
           </w:rPr>
-          <w:instrText xml:space="preserve"> PAGEREF _Toc242140575 \h </w:instrText>
+          <w:instrText xml:space="preserve"> PAGEREF _Toc242140975 \h </w:instrText>
         </w:r>
         <w:r>
           <w:rPr>
@@ -9656,7 +9656,7 @@
           <w14:ligatures w14:val="standardContextual"/>
         </w:rPr>
       </w:pPr>
-      <w:hyperlink w:anchor="_Toc242140576" w:history="1">
+      <w:hyperlink w:anchor="_Toc242140976" w:history="1">
         <w:r>
           <w:rPr>
             <w:rStyle w:val="Hyperlink"/>
@@ -9683,7 +9683,7 @@
             <w:noProof/>
             <w:webHidden/>
           </w:rPr>
-          <w:instrText xml:space="preserve"> PAGEREF _Toc242140576 \h </w:instrText>
+          <w:instrText xml:space="preserve"> PAGEREF _Toc242140976 \h </w:instrText>
         </w:r>
         <w:r>
           <w:rPr>
@@ -9728,7 +9728,7 @@
           <w14:ligatures w14:val="standardContextual"/>
         </w:rPr>
       </w:pPr>
-      <w:hyperlink w:anchor="_Toc242140577" w:history="1">
+      <w:hyperlink w:anchor="_Toc242140977" w:history="1">
         <w:r>
           <w:rPr>
             <w:rStyle w:val="Hyperlink"/>
@@ -9755,7 +9755,7 @@
             <w:noProof/>
             <w:webHidden/>
           </w:rPr>
-          <w:instrText xml:space="preserve"> PAGEREF _Toc242140577 \h </w:instrText>
+          <w:instrText xml:space="preserve"> PAGEREF _Toc242140977 \h </w:instrText>
         </w:r>
         <w:r>
           <w:rPr>
@@ -9800,7 +9800,7 @@
           <w14:ligatures w14:val="standardContextual"/>
         </w:rPr>
       </w:pPr>
-      <w:hyperlink w:anchor="_Toc242140578" w:history="1">
+      <w:hyperlink w:anchor="_Toc242140978" w:history="1">
         <w:r>
           <w:rPr>
             <w:rStyle w:val="Hyperlink"/>
@@ -9827,7 +9827,7 @@
             <w:noProof/>
             <w:webHidden/>
           </w:rPr>
-          <w:instrText xml:space="preserve"> PAGEREF _Toc242140578 \h </w:instrText>
+          <w:instrText xml:space="preserve"> PAGEREF _Toc242140978 \h </w:instrText>
         </w:r>
         <w:r>
           <w:rPr>
@@ -9872,7 +9872,7 @@
           <w14:ligatures w14:val="standardContextual"/>
         </w:rPr>
       </w:pPr>
-      <w:hyperlink w:anchor="_Toc242140579" w:history="1">
+      <w:hyperlink w:anchor="_Toc242140979" w:history="1">
         <w:r>
           <w:rPr>
             <w:rStyle w:val="Hyperlink"/>
@@ -9899,7 +9899,7 @@
             <w:noProof/>
             <w:webHidden/>
           </w:rPr>
-          <w:instrText xml:space="preserve"> PAGEREF _Toc242140579 \h </w:instrText>
+          <w:instrText xml:space="preserve"> PAGEREF _Toc242140979 \h </w:instrText>
         </w:r>
         <w:r>
           <w:rPr>
@@ -9944,7 +9944,7 @@
           <w14:ligatures w14:val="standardContextual"/>
         </w:rPr>
       </w:pPr>
-      <w:hyperlink w:anchor="_Toc242140580" w:history="1">
+      <w:hyperlink w:anchor="_Toc242140980" w:history="1">
         <w:r>
           <w:rPr>
             <w:rStyle w:val="Hyperlink"/>
@@ -9971,7 +9971,7 @@
             <w:noProof/>
             <w:webHidden/>
           </w:rPr>
-          <w:instrText xml:space="preserve"> PAGEREF _Toc242140580 \h </w:instrText>
+          <w:instrText xml:space="preserve"> PAGEREF _Toc242140980 \h </w:instrText>
         </w:r>
         <w:r>
           <w:rPr>
@@ -10016,7 +10016,7 @@
           <w14:ligatures w14:val="standardContextual"/>
         </w:rPr>
       </w:pPr>
-      <w:hyperlink w:anchor="_Toc242140581" w:history="1">
+      <w:hyperlink w:anchor="_Toc242140981" w:history="1">
         <w:r>
           <w:rPr>
             <w:rStyle w:val="Hyperlink"/>
@@ -10043,7 +10043,7 @@
             <w:noProof/>
             <w:webHidden/>
           </w:rPr>
-          <w:instrText xml:space="preserve"> PAGEREF _Toc242140581 \h </w:instrText>
+          <w:instrText xml:space="preserve"> PAGEREF _Toc242140981 \h </w:instrText>
         </w:r>
         <w:r>
           <w:rPr>
@@ -10088,7 +10088,7 @@
           <w14:ligatures w14:val="standardContextual"/>
         </w:rPr>
       </w:pPr>
-      <w:hyperlink w:anchor="_Toc242140582" w:history="1">
+      <w:hyperlink w:anchor="_Toc242140982" w:history="1">
         <w:r>
           <w:rPr>
             <w:rStyle w:val="Hyperlink"/>
@@ -10115,7 +10115,7 @@
             <w:noProof/>
             <w:webHidden/>
           </w:rPr>
-          <w:instrText xml:space="preserve"> PAGEREF _Toc242140582 \h </w:instrText>
+          <w:instrText xml:space="preserve"> PAGEREF _Toc242140982 \h </w:instrText>
         </w:r>
         <w:r>
           <w:rPr>
@@ -10160,7 +10160,7 @@
           <w14:ligatures w14:val="standardContextual"/>
         </w:rPr>
       </w:pPr>
-      <w:hyperlink w:anchor="_Toc242140583" w:history="1">
+      <w:hyperlink w:anchor="_Toc242140983" w:history="1">
         <w:r>
           <w:rPr>
             <w:rStyle w:val="Hyperlink"/>
@@ -10187,7 +10187,7 @@
             <w:noProof/>
             <w:webHidden/>
           </w:rPr>
-          <w:instrText xml:space="preserve"> PAGEREF _Toc242140583 \h </w:instrText>
+          <w:instrText xml:space="preserve"> PAGEREF _Toc242140983 \h </w:instrText>
         </w:r>
         <w:r>
           <w:rPr>
@@ -10232,7 +10232,7 @@
           <w14:ligatures w14:val="standardContextual"/>
         </w:rPr>
       </w:pPr>
-      <w:hyperlink w:anchor="_Toc242140584" w:history="1">
+      <w:hyperlink w:anchor="_Toc242140984" w:history="1">
         <w:r>
           <w:rPr>
             <w:rStyle w:val="Hyperlink"/>
@@ -10259,7 +10259,7 @@
             <w:noProof/>
             <w:webHidden/>
           </w:rPr>
-          <w:instrText xml:space="preserve"> PAGEREF _Toc242140584 \h </w:instrText>
+          <w:instrText xml:space="preserve"> PAGEREF _Toc242140984 \h </w:instrText>
         </w:r>
         <w:r>
           <w:rPr>
@@ -10333,7 +10333,7 @@
       <w:r>
         <w:fldChar w:fldCharType="separate"/>
       </w:r>
-      <w:hyperlink w:anchor="_Toc242140585" w:history="1">
+      <w:hyperlink w:anchor="_Toc242140985" w:history="1">
         <w:r>
           <w:rPr>
             <w:rStyle w:val="Hyperlink"/>
@@ -10357,7 +10357,7 @@
           <w:rPr>
             <w:webHidden/>
           </w:rPr>
-          <w:instrText xml:space="preserve"> PAGEREF _Toc242140585 \h </w:instrText>
+          <w:instrText xml:space="preserve"> PAGEREF _Toc242140985 \h </w:instrText>
         </w:r>
         <w:r>
           <w:rPr>
@@ -10395,7 +10395,7 @@
           <w14:ligatures w14:val="standardContextual"/>
         </w:rPr>
       </w:pPr>
-      <w:hyperlink w:anchor="_Toc242140586" w:history="1">
+      <w:hyperlink w:anchor="_Toc242140986" w:history="1">
         <w:r>
           <w:rPr>
             <w:rStyle w:val="Hyperlink"/>
@@ -10419,7 +10419,7 @@
           <w:rPr>
             <w:webHidden/>
           </w:rPr>
-          <w:instrText xml:space="preserve"> PAGEREF _Toc242140586 \h </w:instrText>
+          <w:instrText xml:space="preserve"> PAGEREF _Toc242140986 \h </w:instrText>
         </w:r>
         <w:r>
           <w:rPr>
@@ -10457,7 +10457,7 @@
           <w14:ligatures w14:val="standardContextual"/>
         </w:rPr>
       </w:pPr>
-      <w:hyperlink w:anchor="_Toc242140587" w:history="1">
+      <w:hyperlink w:anchor="_Toc242140987" w:history="1">
         <w:r>
           <w:rPr>
             <w:rStyle w:val="Hyperlink"/>
@@ -10481,7 +10481,7 @@
           <w:rPr>
             <w:webHidden/>
           </w:rPr>
-          <w:instrText xml:space="preserve"> PAGEREF _Toc242140587 \h </w:instrText>
+          <w:instrText xml:space="preserve"> PAGEREF _Toc242140987 \h </w:instrText>
         </w:r>
         <w:r>
           <w:rPr>
@@ -10519,7 +10519,7 @@
           <w14:ligatures w14:val="standardContextual"/>
         </w:rPr>
       </w:pPr>
-      <w:hyperlink w:anchor="_Toc242140588" w:history="1">
+      <w:hyperlink w:anchor="_Toc242140988" w:history="1">
         <w:r>
           <w:rPr>
             <w:rStyle w:val="Hyperlink"/>
@@ -10543,7 +10543,7 @@
           <w:rPr>
             <w:webHidden/>
           </w:rPr>
-          <w:instrText xml:space="preserve"> PAGEREF _Toc242140588 \h </w:instrText>
+          <w:instrText xml:space="preserve"> PAGEREF _Toc242140988 \h </w:instrText>
         </w:r>
         <w:r>
           <w:rPr>
@@ -10581,7 +10581,7 @@
           <w14:ligatures w14:val="standardContextual"/>
         </w:rPr>
       </w:pPr>
-      <w:hyperlink w:anchor="_Toc242140589" w:history="1">
+      <w:hyperlink w:anchor="_Toc242140989" w:history="1">
         <w:r>
           <w:rPr>
             <w:rStyle w:val="Hyperlink"/>
@@ -10605,7 +10605,7 @@
           <w:rPr>
             <w:webHidden/>
           </w:rPr>
-          <w:instrText xml:space="preserve"> PAGEREF _Toc242140589 \h </w:instrText>
+          <w:instrText xml:space="preserve"> PAGEREF _Toc242140989 \h </w:instrText>
         </w:r>
         <w:r>
           <w:rPr>
@@ -10643,7 +10643,7 @@
           <w14:ligatures w14:val="standardContextual"/>
         </w:rPr>
       </w:pPr>
-      <w:hyperlink w:anchor="_Toc242140590" w:history="1">
+      <w:hyperlink w:anchor="_Toc242140990" w:history="1">
         <w:r>
           <w:rPr>
             <w:rStyle w:val="Hyperlink"/>
@@ -10667,7 +10667,7 @@
           <w:rPr>
             <w:webHidden/>
           </w:rPr>
-          <w:instrText xml:space="preserve"> PAGEREF _Toc242140590 \h </w:instrText>
+          <w:instrText xml:space="preserve"> PAGEREF _Toc242140990 \h </w:instrText>
         </w:r>
         <w:r>
           <w:rPr>
@@ -10705,7 +10705,7 @@
           <w14:ligatures w14:val="standardContextual"/>
         </w:rPr>
       </w:pPr>
-      <w:hyperlink w:anchor="_Toc242140591" w:history="1">
+      <w:hyperlink w:anchor="_Toc242140991" w:history="1">
         <w:r>
           <w:rPr>
             <w:rStyle w:val="Hyperlink"/>
@@ -10729,7 +10729,7 @@
           <w:rPr>
             <w:webHidden/>
           </w:rPr>
-          <w:instrText xml:space="preserve"> PAGEREF _Toc242140591 \h </w:instrText>
+          <w:instrText xml:space="preserve"> PAGEREF _Toc242140991 \h </w:instrText>
         </w:r>
         <w:r>
           <w:rPr>
@@ -10767,7 +10767,7 @@
           <w14:ligatures w14:val="standardContextual"/>
         </w:rPr>
       </w:pPr>
-      <w:hyperlink w:anchor="_Toc242140592" w:history="1">
+      <w:hyperlink w:anchor="_Toc242140992" w:history="1">
         <w:r>
           <w:rPr>
             <w:rStyle w:val="Hyperlink"/>
@@ -10791,7 +10791,7 @@
           <w:rPr>
             <w:webHidden/>
           </w:rPr>
-          <w:instrText xml:space="preserve"> PAGEREF _Toc242140592 \h </w:instrText>
+          <w:instrText xml:space="preserve"> PAGEREF _Toc242140992 \h </w:instrText>
         </w:r>
         <w:r>
           <w:rPr>
@@ -10829,7 +10829,7 @@
           <w14:ligatures w14:val="standardContextual"/>
         </w:rPr>
       </w:pPr>
-      <w:hyperlink w:anchor="_Toc242140593" w:history="1">
+      <w:hyperlink w:anchor="_Toc242140993" w:history="1">
         <w:r>
           <w:rPr>
             <w:rStyle w:val="Hyperlink"/>
@@ -10853,7 +10853,7 @@
           <w:rPr>
             <w:webHidden/>
           </w:rPr>
-          <w:instrText xml:space="preserve"> PAGEREF _Toc242140593 \h </w:instrText>
+          <w:instrText xml:space="preserve"> PAGEREF _Toc242140993 \h </w:instrText>
         </w:r>
         <w:r>
           <w:rPr>
@@ -10891,7 +10891,7 @@
           <w14:ligatures w14:val="standardContextual"/>
         </w:rPr>
       </w:pPr>
-      <w:hyperlink w:anchor="_Toc242140594" w:history="1">
+      <w:hyperlink w:anchor="_Toc242140994" w:history="1">
         <w:r>
           <w:rPr>
             <w:rStyle w:val="Hyperlink"/>
@@ -10915,7 +10915,7 @@
           <w:rPr>
             <w:webHidden/>
           </w:rPr>
-          <w:instrText xml:space="preserve"> PAGEREF _Toc242140594 \h </w:instrText>
+          <w:instrText xml:space="preserve"> PAGEREF _Toc242140994 \h </w:instrText>
         </w:r>
         <w:r>
           <w:rPr>
@@ -10953,7 +10953,7 @@
           <w14:ligatures w14:val="standardContextual"/>
         </w:rPr>
       </w:pPr>
-      <w:hyperlink w:anchor="_Toc242140595" w:history="1">
+      <w:hyperlink w:anchor="_Toc242140995" w:history="1">
         <w:r>
           <w:rPr>
             <w:rStyle w:val="Hyperlink"/>
@@ -10976,7 +10976,7 @@
           <w:rPr>
             <w:webHidden/>
           </w:rPr>
-          <w:instrText xml:space="preserve"> PAGEREF _Toc242140595 \h </w:instrText>
+          <w:instrText xml:space="preserve"> PAGEREF _Toc242140995 \h </w:instrText>
         </w:r>
         <w:r>
           <w:rPr>
@@ -11014,7 +11014,7 @@
           <w14:ligatures w14:val="standardContextual"/>
         </w:rPr>
       </w:pPr>
-      <w:hyperlink w:anchor="_Toc242140596" w:history="1">
+      <w:hyperlink w:anchor="_Toc242140996" w:history="1">
         <w:r>
           <w:rPr>
             <w:rStyle w:val="Hyperlink"/>
@@ -11037,7 +11037,7 @@
           <w:rPr>
             <w:webHidden/>
           </w:rPr>
-          <w:instrText xml:space="preserve"> PAGEREF _Toc242140596 \h </w:instrText>
+          <w:instrText xml:space="preserve"> PAGEREF _Toc242140996 \h </w:instrText>
         </w:r>
         <w:r>
           <w:rPr>
@@ -11075,7 +11075,7 @@
           <w14:ligatures w14:val="standardContextual"/>
         </w:rPr>
       </w:pPr>
-      <w:hyperlink w:anchor="_Toc242140597" w:history="1">
+      <w:hyperlink w:anchor="_Toc242140997" w:history="1">
         <w:r>
           <w:rPr>
             <w:rStyle w:val="Hyperlink"/>
@@ -11098,7 +11098,7 @@
           <w:rPr>
             <w:webHidden/>
           </w:rPr>
-          <w:instrText xml:space="preserve"> PAGEREF _Toc242140597 \h </w:instrText>
+          <w:instrText xml:space="preserve"> PAGEREF _Toc242140997 \h </w:instrText>
         </w:r>
         <w:r>
           <w:rPr>
@@ -11136,7 +11136,7 @@
           <w14:ligatures w14:val="standardContextual"/>
         </w:rPr>
       </w:pPr>
-      <w:hyperlink w:anchor="_Toc242140598" w:history="1">
+      <w:hyperlink w:anchor="_Toc242140998" w:history="1">
         <w:r>
           <w:rPr>
             <w:rStyle w:val="Hyperlink"/>
@@ -11159,7 +11159,7 @@
           <w:rPr>
             <w:webHidden/>
           </w:rPr>
-          <w:instrText xml:space="preserve"> PAGEREF _Toc242140598 \h </w:instrText>
+          <w:instrText xml:space="preserve"> PAGEREF _Toc242140998 \h </w:instrText>
         </w:r>
         <w:r>
           <w:rPr>
@@ -11197,7 +11197,7 @@
           <w14:ligatures w14:val="standardContextual"/>
         </w:rPr>
       </w:pPr>
-      <w:hyperlink w:anchor="_Toc242140599" w:history="1">
+      <w:hyperlink w:anchor="_Toc242140999" w:history="1">
         <w:r>
           <w:rPr>
             <w:rStyle w:val="Hyperlink"/>
@@ -11220,7 +11220,7 @@
           <w:rPr>
             <w:webHidden/>
           </w:rPr>
-          <w:instrText xml:space="preserve"> PAGEREF _Toc242140599 \h </w:instrText>
+          <w:instrText xml:space="preserve"> PAGEREF _Toc242140999 \h </w:instrText>
         </w:r>
         <w:r>
           <w:rPr>
@@ -11258,7 +11258,7 @@
           <w14:ligatures w14:val="standardContextual"/>
         </w:rPr>
       </w:pPr>
-      <w:hyperlink w:anchor="_Toc242140600" w:history="1">
+      <w:hyperlink w:anchor="_Toc242141000" w:history="1">
         <w:r>
           <w:rPr>
             <w:rStyle w:val="Hyperlink"/>
@@ -11281,7 +11281,7 @@
           <w:rPr>
             <w:webHidden/>
           </w:rPr>
-          <w:instrText xml:space="preserve"> PAGEREF _Toc242140600 \h </w:instrText>
+          <w:instrText xml:space="preserve"> PAGEREF _Toc242141000 \h </w:instrText>
         </w:r>
         <w:r>
           <w:rPr>
@@ -11319,7 +11319,7 @@
           <w14:ligatures w14:val="standardContextual"/>
         </w:rPr>
       </w:pPr>
-      <w:hyperlink w:anchor="_Toc242140601" w:history="1">
+      <w:hyperlink w:anchor="_Toc242141001" w:history="1">
         <w:r>
           <w:rPr>
             <w:rStyle w:val="Hyperlink"/>
@@ -11342,7 +11342,7 @@
           <w:rPr>
             <w:webHidden/>
           </w:rPr>
-          <w:instrText xml:space="preserve"> PAGEREF _Toc242140601 \h </w:instrText>
+          <w:instrText xml:space="preserve"> PAGEREF _Toc242141001 \h </w:instrText>
         </w:r>
         <w:r>
           <w:rPr>
@@ -11405,7 +11405,7 @@
       <w:r>
         <w:fldChar w:fldCharType="separate"/>
       </w:r>
-      <w:hyperlink w:anchor="_Toc242140602" w:history="1">
+      <w:hyperlink w:anchor="_Toc242141002" w:history="1">
         <w:r>
           <w:rPr>
             <w:rStyle w:val="Hyperlink"/>
@@ -11429,7 +11429,7 @@
           <w:rPr>
             <w:webHidden/>
           </w:rPr>
-          <w:instrText xml:space="preserve"> PAGEREF _Toc242140602 \h </w:instrText>
+          <w:instrText xml:space="preserve"> PAGEREF _Toc242141002 \h </w:instrText>
         </w:r>
         <w:r>
           <w:rPr>
@@ -11467,7 +11467,7 @@
           <w14:ligatures w14:val="standardContextual"/>
         </w:rPr>
       </w:pPr>
-      <w:hyperlink w:anchor="_Toc242140603" w:history="1">
+      <w:hyperlink w:anchor="_Toc242141003" w:history="1">
         <w:r>
           <w:rPr>
             <w:rStyle w:val="Hyperlink"/>
@@ -11491,7 +11491,7 @@
           <w:rPr>
             <w:webHidden/>
           </w:rPr>
-          <w:instrText xml:space="preserve"> PAGEREF _Toc242140603 \h </w:instrText>
+          <w:instrText xml:space="preserve"> PAGEREF _Toc242141003 \h </w:instrText>
         </w:r>
         <w:r>
           <w:rPr>
@@ -11529,7 +11529,7 @@
           <w14:ligatures w14:val="standardContextual"/>
         </w:rPr>
       </w:pPr>
-      <w:hyperlink w:anchor="_Toc242140604" w:history="1">
+      <w:hyperlink w:anchor="_Toc242141004" w:history="1">
         <w:r>
           <w:rPr>
             <w:rStyle w:val="Hyperlink"/>
@@ -11554,7 +11554,7 @@
           <w:rPr>
             <w:webHidden/>
           </w:rPr>
-          <w:instrText xml:space="preserve"> PAGEREF _Toc242140604 \h </w:instrText>
+          <w:instrText xml:space="preserve"> PAGEREF _Toc242141004 \h </w:instrText>
         </w:r>
         <w:r>
           <w:rPr>
@@ -11592,7 +11592,7 @@
           <w14:ligatures w14:val="standardContextual"/>
         </w:rPr>
       </w:pPr>
-      <w:hyperlink w:anchor="_Toc242140605" w:history="1">
+      <w:hyperlink w:anchor="_Toc242141005" w:history="1">
         <w:r>
           <w:rPr>
             <w:rStyle w:val="Hyperlink"/>
@@ -11616,7 +11616,7 @@
           <w:rPr>
             <w:webHidden/>
           </w:rPr>
-          <w:instrText xml:space="preserve"> PAGEREF _Toc242140605 \h </w:instrText>
+          <w:instrText xml:space="preserve"> PAGEREF _Toc242141005 \h </w:instrText>
         </w:r>
         <w:r>
           <w:rPr>
@@ -11654,7 +11654,7 @@
           <w14:ligatures w14:val="standardContextual"/>
         </w:rPr>
       </w:pPr>
-      <w:hyperlink w:anchor="_Toc242140606" w:history="1">
+      <w:hyperlink w:anchor="_Toc242141006" w:history="1">
         <w:r>
           <w:rPr>
             <w:rStyle w:val="Hyperlink"/>
@@ -11678,7 +11678,7 @@
           <w:rPr>
             <w:webHidden/>
           </w:rPr>
-          <w:instrText xml:space="preserve"> PAGEREF _Toc242140606 \h </w:instrText>
+          <w:instrText xml:space="preserve"> PAGEREF _Toc242141006 \h </w:instrText>
         </w:r>
         <w:r>
           <w:rPr>
@@ -11716,7 +11716,7 @@
           <w14:ligatures w14:val="standardContextual"/>
         </w:rPr>
       </w:pPr>
-      <w:hyperlink w:anchor="_Toc242140607" w:history="1">
+      <w:hyperlink w:anchor="_Toc242141007" w:history="1">
         <w:r>
           <w:rPr>
             <w:rStyle w:val="Hyperlink"/>
@@ -11740,7 +11740,7 @@
           <w:rPr>
             <w:webHidden/>
           </w:rPr>
-          <w:instrText xml:space="preserve"> PAGEREF _Toc242140607 \h </w:instrText>
+          <w:instrText xml:space="preserve"> PAGEREF _Toc242141007 \h </w:instrText>
         </w:r>
         <w:r>
           <w:rPr>
@@ -11778,7 +11778,7 @@
           <w14:ligatures w14:val="standardContextual"/>
         </w:rPr>
       </w:pPr>
-      <w:hyperlink w:anchor="_Toc242140608" w:history="1">
+      <w:hyperlink w:anchor="_Toc242141008" w:history="1">
         <w:r>
           <w:rPr>
             <w:rStyle w:val="Hyperlink"/>
@@ -11802,7 +11802,7 @@
           <w:rPr>
             <w:webHidden/>
           </w:rPr>
-          <w:instrText xml:space="preserve"> PAGEREF _Toc242140608 \h </w:instrText>
+          <w:instrText xml:space="preserve"> PAGEREF _Toc242141008 \h </w:instrText>
         </w:r>
         <w:r>
           <w:rPr>
@@ -11840,7 +11840,7 @@
           <w14:ligatures w14:val="standardContextual"/>
         </w:rPr>
       </w:pPr>
-      <w:hyperlink w:anchor="_Toc242140609" w:history="1">
+      <w:hyperlink w:anchor="_Toc242141009" w:history="1">
         <w:r>
           <w:rPr>
             <w:rStyle w:val="Hyperlink"/>
@@ -11864,7 +11864,7 @@
           <w:rPr>
             <w:webHidden/>
           </w:rPr>
-          <w:instrText xml:space="preserve"> PAGEREF _Toc242140609 \h </w:instrText>
+          <w:instrText xml:space="preserve"> PAGEREF _Toc242141009 \h </w:instrText>
         </w:r>
         <w:r>
           <w:rPr>
@@ -11902,7 +11902,7 @@
           <w14:ligatures w14:val="standardContextual"/>
         </w:rPr>
       </w:pPr>
-      <w:hyperlink w:anchor="_Toc242140610" w:history="1">
+      <w:hyperlink w:anchor="_Toc242141010" w:history="1">
         <w:r>
           <w:rPr>
             <w:rStyle w:val="Hyperlink"/>
@@ -11926,7 +11926,7 @@
           <w:rPr>
             <w:webHidden/>
           </w:rPr>
-          <w:instrText xml:space="preserve"> PAGEREF _Toc242140610 \h </w:instrText>
+          <w:instrText xml:space="preserve"> PAGEREF _Toc242141010 \h </w:instrText>
         </w:r>
         <w:r>
           <w:rPr>
@@ -11964,7 +11964,7 @@
           <w14:ligatures w14:val="standardContextual"/>
         </w:rPr>
       </w:pPr>
-      <w:hyperlink w:anchor="_Toc242140611" w:history="1">
+      <w:hyperlink w:anchor="_Toc242141011" w:history="1">
         <w:r>
           <w:rPr>
             <w:rStyle w:val="Hyperlink"/>
@@ -11988,7 +11988,7 @@
           <w:rPr>
             <w:webHidden/>
           </w:rPr>
-          <w:instrText xml:space="preserve"> PAGEREF _Toc242140611 \h </w:instrText>
+          <w:instrText xml:space="preserve"> PAGEREF _Toc242141011 \h </w:instrText>
         </w:r>
         <w:r>
           <w:rPr>
@@ -12026,7 +12026,7 @@
           <w14:ligatures w14:val="standardContextual"/>
         </w:rPr>
       </w:pPr>
-      <w:hyperlink w:anchor="_Toc242140612" w:history="1">
+      <w:hyperlink w:anchor="_Toc242141012" w:history="1">
         <w:r>
           <w:rPr>
             <w:rStyle w:val="Hyperlink"/>
@@ -12050,7 +12050,7 @@
           <w:rPr>
             <w:webHidden/>
           </w:rPr>
-          <w:instrText xml:space="preserve"> PAGEREF _Toc242140612 \h </w:instrText>
+          <w:instrText xml:space="preserve"> PAGEREF _Toc242141012 \h </w:instrText>
         </w:r>
         <w:r>
           <w:rPr>
@@ -12088,7 +12088,7 @@
           <w14:ligatures w14:val="standardContextual"/>
         </w:rPr>
       </w:pPr>
-      <w:hyperlink w:anchor="_Toc242140613" w:history="1">
+      <w:hyperlink w:anchor="_Toc242141013" w:history="1">
         <w:r>
           <w:rPr>
             <w:rStyle w:val="Hyperlink"/>
@@ -12112,7 +12112,7 @@
           <w:rPr>
             <w:webHidden/>
           </w:rPr>
-          <w:instrText xml:space="preserve"> PAGEREF _Toc242140613 \h </w:instrText>
+          <w:instrText xml:space="preserve"> PAGEREF _Toc242141013 \h </w:instrText>
         </w:r>
         <w:r>
           <w:rPr>
@@ -12150,7 +12150,7 @@
           <w14:ligatures w14:val="standardContextual"/>
         </w:rPr>
       </w:pPr>
-      <w:hyperlink w:anchor="_Toc242140614" w:history="1">
+      <w:hyperlink w:anchor="_Toc242141014" w:history="1">
         <w:r>
           <w:rPr>
             <w:rStyle w:val="Hyperlink"/>
@@ -12174,7 +12174,7 @@
           <w:rPr>
             <w:webHidden/>
           </w:rPr>
-          <w:instrText xml:space="preserve"> PAGEREF _Toc242140614 \h </w:instrText>
+          <w:instrText xml:space="preserve"> PAGEREF _Toc242141014 \h </w:instrText>
         </w:r>
         <w:r>
           <w:rPr>
@@ -12212,7 +12212,7 @@
           <w14:ligatures w14:val="standardContextual"/>
         </w:rPr>
       </w:pPr>
-      <w:hyperlink w:anchor="_Toc242140615" w:history="1">
+      <w:hyperlink w:anchor="_Toc242141015" w:history="1">
         <w:r>
           <w:rPr>
             <w:rStyle w:val="Hyperlink"/>
@@ -12236,7 +12236,7 @@
           <w:rPr>
             <w:webHidden/>
           </w:rPr>
-          <w:instrText xml:space="preserve"> PAGEREF _Toc242140615 \h </w:instrText>
+          <w:instrText xml:space="preserve"> PAGEREF _Toc242141015 \h </w:instrText>
         </w:r>
         <w:r>
           <w:rPr>
@@ -12274,7 +12274,7 @@
           <w14:ligatures w14:val="standardContextual"/>
         </w:rPr>
       </w:pPr>
-      <w:hyperlink w:anchor="_Toc242140616" w:history="1">
+      <w:hyperlink w:anchor="_Toc242141016" w:history="1">
         <w:r>
           <w:rPr>
             <w:rStyle w:val="Hyperlink"/>
@@ -12298,7 +12298,7 @@
           <w:rPr>
             <w:webHidden/>
           </w:rPr>
-          <w:instrText xml:space="preserve"> PAGEREF _Toc242140616 \h </w:instrText>
+          <w:instrText xml:space="preserve"> PAGEREF _Toc242141016 \h </w:instrText>
         </w:r>
         <w:r>
           <w:rPr>
@@ -12336,7 +12336,7 @@
           <w14:ligatures w14:val="standardContextual"/>
         </w:rPr>
       </w:pPr>
-      <w:hyperlink w:anchor="_Toc242140617" w:history="1">
+      <w:hyperlink w:anchor="_Toc242141017" w:history="1">
         <w:r>
           <w:rPr>
             <w:rStyle w:val="Hyperlink"/>
@@ -12360,7 +12360,7 @@
           <w:rPr>
             <w:webHidden/>
           </w:rPr>
-          <w:instrText xml:space="preserve"> PAGEREF _Toc242140617 \h </w:instrText>
+          <w:instrText xml:space="preserve"> PAGEREF _Toc242141017 \h </w:instrText>
         </w:r>
         <w:r>
           <w:rPr>
@@ -12478,7 +12478,7 @@
         <w:pStyle w:val="Heading1"/>
       </w:pPr>
       <w:bookmarkStart w:id="1" w:name="_Toc241062250"/>
-      <w:bookmarkStart w:id="2" w:name="_Toc242140445"/>
+      <w:bookmarkStart w:id="2" w:name="_Toc242140845"/>
       <w:r>
         <w:lastRenderedPageBreak/>
         <w:t>RESUMEN</w:t>
@@ -12564,7 +12564,7 @@
         <w:pStyle w:val="Heading1"/>
       </w:pPr>
       <w:bookmarkStart w:id="3" w:name="_Toc241062251"/>
-      <w:bookmarkStart w:id="4" w:name="_Toc242140446"/>
+      <w:bookmarkStart w:id="4" w:name="_Toc242140846"/>
       <w:r>
         <w:t>CAPÍTULO 1: Introducción</w:t>
       </w:r>
@@ -12597,7 +12597,7 @@
         <w:pStyle w:val="Heading2"/>
       </w:pPr>
       <w:bookmarkStart w:id="6" w:name="_Toc241062252"/>
-      <w:bookmarkStart w:id="7" w:name="_Toc242140447"/>
+      <w:bookmarkStart w:id="7" w:name="_Toc242140847"/>
       <w:r>
         <w:t>1.1 Contexto del problema</w:t>
       </w:r>
@@ -12658,7 +12658,7 @@
         <w:pStyle w:val="Heading2"/>
       </w:pPr>
       <w:bookmarkStart w:id="8" w:name="_Toc241062253"/>
-      <w:bookmarkStart w:id="9" w:name="_Toc242140448"/>
+      <w:bookmarkStart w:id="9" w:name="_Toc242140848"/>
       <w:r>
         <w:t>1.2 Planteamiento del problema</w:t>
       </w:r>
@@ -12756,7 +12756,7 @@
         <w:pStyle w:val="Heading2"/>
       </w:pPr>
       <w:bookmarkStart w:id="10" w:name="_Toc241062254"/>
-      <w:bookmarkStart w:id="11" w:name="_Toc242140449"/>
+      <w:bookmarkStart w:id="11" w:name="_Toc242140849"/>
       <w:r>
         <w:t>1.3 Justificación</w:t>
       </w:r>
@@ -12835,7 +12835,7 @@
         <w:pStyle w:val="Heading2"/>
       </w:pPr>
       <w:bookmarkStart w:id="12" w:name="_Toc241062255"/>
-      <w:bookmarkStart w:id="13" w:name="_Toc242140450"/>
+      <w:bookmarkStart w:id="13" w:name="_Toc242140850"/>
       <w:r>
         <w:t>1.4 Objetivos</w:t>
       </w:r>
@@ -12855,7 +12855,7 @@
         <w:pStyle w:val="Heading3"/>
       </w:pPr>
       <w:bookmarkStart w:id="14" w:name="_Toc241062256"/>
-      <w:bookmarkStart w:id="15" w:name="_Toc242140451"/>
+      <w:bookmarkStart w:id="15" w:name="_Toc242140851"/>
       <w:r>
         <w:t>1.4.1 Objetivo General</w:t>
       </w:r>
@@ -12875,7 +12875,7 @@
         <w:pStyle w:val="Heading3"/>
       </w:pPr>
       <w:bookmarkStart w:id="16" w:name="_Toc241062257"/>
-      <w:bookmarkStart w:id="17" w:name="_Toc242140452"/>
+      <w:bookmarkStart w:id="17" w:name="_Toc242140852"/>
       <w:r>
         <w:t>1.4.2 Objetivos Específicos</w:t>
       </w:r>
@@ -13006,7 +13006,7 @@
         <w:pStyle w:val="Heading2"/>
       </w:pPr>
       <w:bookmarkStart w:id="18" w:name="_Toc241062258"/>
-      <w:bookmarkStart w:id="19" w:name="_Toc242140453"/>
+      <w:bookmarkStart w:id="19" w:name="_Toc242140853"/>
       <w:r>
         <w:t>1.5 Alcance y Limitaciones</w:t>
       </w:r>
@@ -13026,7 +13026,7 @@
         <w:pStyle w:val="Heading3"/>
       </w:pPr>
       <w:bookmarkStart w:id="20" w:name="_Toc241062259"/>
-      <w:bookmarkStart w:id="21" w:name="_Toc242140454"/>
+      <w:bookmarkStart w:id="21" w:name="_Toc242140854"/>
       <w:r>
         <w:t>1.5.1 Alcance del Proyecto</w:t>
       </w:r>
@@ -13190,7 +13190,7 @@
         </w:rPr>
       </w:pPr>
       <w:bookmarkStart w:id="22" w:name="_Toc241062260"/>
-      <w:bookmarkStart w:id="23" w:name="_Toc242140455"/>
+      <w:bookmarkStart w:id="23" w:name="_Toc242140855"/>
       <w:r>
         <w:t>1.5.2 Limitaciones del Proyecto</w:t>
       </w:r>
@@ -13336,7 +13336,7 @@
         <w:pStyle w:val="Heading2"/>
       </w:pPr>
       <w:bookmarkStart w:id="24" w:name="_Toc241062261"/>
-      <w:bookmarkStart w:id="25" w:name="_Toc242140456"/>
+      <w:bookmarkStart w:id="25" w:name="_Toc242140856"/>
       <w:r>
         <w:t>1.6 Estado del Arte: Análisis de Soluciones y Vacío Tecnológico</w:t>
       </w:r>
@@ -13361,7 +13361,7 @@
         <w:pStyle w:val="Heading3"/>
       </w:pPr>
       <w:bookmarkStart w:id="26" w:name="_Toc241062262"/>
-      <w:bookmarkStart w:id="27" w:name="_Toc242140457"/>
+      <w:bookmarkStart w:id="27" w:name="_Toc242140857"/>
       <w:r>
         <w:t>1.6.0 Antecedentes académicos</w:t>
       </w:r>
@@ -13410,7 +13410,7 @@
         <w:spacing w:before="0" w:line="276" w:lineRule="auto"/>
       </w:pPr>
       <w:bookmarkStart w:id="28" w:name="_Toc241062263"/>
-      <w:bookmarkStart w:id="29" w:name="_Toc242140458"/>
+      <w:bookmarkStart w:id="29" w:name="_Toc242140858"/>
       <w:r>
         <w:t>1.6.1 Sistemas Tradicionales de Gestión de Redes Sociales (SMMS)</w:t>
       </w:r>
@@ -13455,7 +13455,7 @@
         <w:spacing w:before="0" w:line="276" w:lineRule="auto"/>
       </w:pPr>
       <w:bookmarkStart w:id="30" w:name="_Toc241062264"/>
-      <w:bookmarkStart w:id="31" w:name="_Toc242140459"/>
+      <w:bookmarkStart w:id="31" w:name="_Toc242140859"/>
       <w:r>
         <w:t>1.6.2 Plataformas Genéricas de Automatización (iPaaS)</w:t>
       </w:r>
@@ -13491,7 +13491,7 @@
         <w:spacing w:before="0" w:line="276" w:lineRule="auto"/>
       </w:pPr>
       <w:bookmarkStart w:id="32" w:name="_Toc241062265"/>
-      <w:bookmarkStart w:id="33" w:name="_Toc242140460"/>
+      <w:bookmarkStart w:id="33" w:name="_Toc242140860"/>
       <w:r>
         <w:t>1.6.3 El Vacío Tecnológico y la Propuesta de Valor de Postly</w:t>
       </w:r>
@@ -13510,7 +13510,7 @@
       <w:pPr>
         <w:keepNext/>
       </w:pPr>
-      <w:bookmarkStart w:id="34" w:name="_Toc242140585"/>
+      <w:bookmarkStart w:id="34" w:name="_Toc242140985"/>
       <w:r>
         <w:rPr>
           <w:b/>
@@ -14610,7 +14610,7 @@
         <w:pStyle w:val="Heading1"/>
       </w:pPr>
       <w:bookmarkStart w:id="35" w:name="_Toc241062266"/>
-      <w:bookmarkStart w:id="36" w:name="_Toc242140461"/>
+      <w:bookmarkStart w:id="36" w:name="_Toc242140861"/>
       <w:r>
         <w:t>CAPÍTULO 2: MARCO TEÓRICO</w:t>
       </w:r>
@@ -14639,7 +14639,7 @@
         <w:pStyle w:val="Heading2"/>
       </w:pPr>
       <w:bookmarkStart w:id="37" w:name="_Toc241062267"/>
-      <w:bookmarkStart w:id="38" w:name="_Toc242140462"/>
+      <w:bookmarkStart w:id="38" w:name="_Toc242140862"/>
       <w:r>
         <w:t>2.1 Automatización de Procesos de Negocio (BPA) y n8n</w:t>
       </w:r>
@@ -14744,7 +14744,7 @@
         <w:pStyle w:val="Heading2"/>
       </w:pPr>
       <w:bookmarkStart w:id="39" w:name="_Toc241062268"/>
-      <w:bookmarkStart w:id="40" w:name="_Toc242140463"/>
+      <w:bookmarkStart w:id="40" w:name="_Toc242140863"/>
       <w:r>
         <w:t>2.2 Modelos de Lenguaje de Gran Escala (LLM) y Multimodalidad</w:t>
       </w:r>
@@ -14834,7 +14834,7 @@
         <w:pStyle w:val="Heading2"/>
       </w:pPr>
       <w:bookmarkStart w:id="41" w:name="_Toc241062269"/>
-      <w:bookmarkStart w:id="42" w:name="_Toc242140464"/>
+      <w:bookmarkStart w:id="42" w:name="_Toc242140864"/>
       <w:r>
         <w:lastRenderedPageBreak/>
         <w:t>2.3 Arquitectura de Integración mediante APIs y Webhooks</w:t>
@@ -15224,7 +15224,7 @@
         <w:keepNext/>
         <w:jc w:val="center"/>
       </w:pPr>
-      <w:bookmarkStart w:id="46" w:name="_Toc242140602"/>
+      <w:bookmarkStart w:id="46" w:name="_Toc242141002"/>
       <w:r>
         <w:rPr>
           <w:i/>
@@ -15346,7 +15346,7 @@
         <w:pStyle w:val="Heading2"/>
       </w:pPr>
       <w:bookmarkStart w:id="47" w:name="_Toc241062270"/>
-      <w:bookmarkStart w:id="48" w:name="_Toc242140465"/>
+      <w:bookmarkStart w:id="48" w:name="_Toc242140865"/>
       <w:r>
         <w:lastRenderedPageBreak/>
         <w:t>2.4 Normativas de Marketing y Cumplimiento Corporativo en Venta Directa</w:t>
@@ -15640,7 +15640,7 @@
         <w:pStyle w:val="Heading1"/>
       </w:pPr>
       <w:bookmarkStart w:id="52" w:name="_Toc241062271"/>
-      <w:bookmarkStart w:id="53" w:name="_Toc242140466"/>
+      <w:bookmarkStart w:id="53" w:name="_Toc242140866"/>
       <w:r>
         <w:t>CAPÍTULO 3: MARCO METODOLÓGICO</w:t>
       </w:r>
@@ -15652,7 +15652,7 @@
         <w:pStyle w:val="Heading2"/>
       </w:pPr>
       <w:bookmarkStart w:id="54" w:name="_Toc241062272"/>
-      <w:bookmarkStart w:id="55" w:name="_Toc242140467"/>
+      <w:bookmarkStart w:id="55" w:name="_Toc242140867"/>
       <w:r>
         <w:t>3.1 Tipo de investigación</w:t>
       </w:r>
@@ -15690,7 +15690,7 @@
         <w:pStyle w:val="Heading2"/>
       </w:pPr>
       <w:bookmarkStart w:id="56" w:name="_Toc241062273"/>
-      <w:bookmarkStart w:id="57" w:name="_Toc242140468"/>
+      <w:bookmarkStart w:id="57" w:name="_Toc242140868"/>
       <w:r>
         <w:t>3.2 Enfoque y Diseño de investigación</w:t>
       </w:r>
@@ -15871,7 +15871,7 @@
         <w:pStyle w:val="Heading2"/>
       </w:pPr>
       <w:bookmarkStart w:id="59" w:name="_Toc241062274"/>
-      <w:bookmarkStart w:id="60" w:name="_Toc242140469"/>
+      <w:bookmarkStart w:id="60" w:name="_Toc242140869"/>
       <w:r>
         <w:t>3.3 Metodología de Desarrollo (Agile/Scrum)</w:t>
       </w:r>
@@ -15891,7 +15891,7 @@
         <w:spacing w:before="240" w:after="240" w:line="240" w:lineRule="auto"/>
       </w:pPr>
       <w:bookmarkStart w:id="62" w:name="_Toc241062275"/>
-      <w:bookmarkStart w:id="63" w:name="_Toc242140470"/>
+      <w:bookmarkStart w:id="63" w:name="_Toc242140870"/>
       <w:r>
         <w:t>3.3.1 Marco metodológico de desarrollo</w:t>
       </w:r>
@@ -15922,7 +15922,7 @@
         <w:spacing w:before="240" w:after="240" w:line="240" w:lineRule="auto"/>
       </w:pPr>
       <w:bookmarkStart w:id="64" w:name="_Toc241062276"/>
-      <w:bookmarkStart w:id="65" w:name="_Toc242140471"/>
+      <w:bookmarkStart w:id="65" w:name="_Toc242140871"/>
       <w:r>
         <w:t>3.3.2 Implementación de la metodología: Sprints de desarrollo</w:t>
       </w:r>
@@ -15951,7 +15951,7 @@
         <w:pStyle w:val="Heading3"/>
         <w:spacing w:before="240" w:after="240" w:line="240" w:lineRule="auto"/>
       </w:pPr>
-      <w:bookmarkStart w:id="66" w:name="_Toc242140472"/>
+      <w:bookmarkStart w:id="66" w:name="_Toc242140872"/>
       <w:r>
         <w:t>3.3.3 Riesgos del proyecto y decisiones de diseño derivadas</w:t>
       </w:r>
@@ -15969,7 +15969,7 @@
       <w:pPr>
         <w:keepNext/>
       </w:pPr>
-      <w:bookmarkStart w:id="67" w:name="_Toc242140586"/>
+      <w:bookmarkStart w:id="67" w:name="_Toc242140986"/>
       <w:r>
         <w:rPr>
           <w:b/>
@@ -16506,7 +16506,7 @@
         <w:pStyle w:val="Heading2"/>
       </w:pPr>
       <w:bookmarkStart w:id="68" w:name="_Toc241062277"/>
-      <w:bookmarkStart w:id="69" w:name="_Toc242140473"/>
+      <w:bookmarkStart w:id="69" w:name="_Toc242140873"/>
       <w:r>
         <w:t>3.4 Técnicas de recolección de datos e instrumentos</w:t>
       </w:r>
@@ -16531,7 +16531,7 @@
         <w:pStyle w:val="Heading3"/>
       </w:pPr>
       <w:bookmarkStart w:id="70" w:name="_Toc241062278"/>
-      <w:bookmarkStart w:id="71" w:name="_Toc242140474"/>
+      <w:bookmarkStart w:id="71" w:name="_Toc242140874"/>
       <w:r>
         <w:t>3.4.1 Recolección de información para el análisis del problema</w:t>
       </w:r>
@@ -16615,7 +16615,7 @@
         <w:pStyle w:val="Heading3"/>
       </w:pPr>
       <w:bookmarkStart w:id="72" w:name="_Toc241062279"/>
-      <w:bookmarkStart w:id="73" w:name="_Toc242140475"/>
+      <w:bookmarkStart w:id="73" w:name="_Toc242140875"/>
       <w:r>
         <w:t>3.4.2 Técnicas de validación técnica del sistema</w:t>
       </w:r>
@@ -16757,7 +16757,7 @@
         <w:pStyle w:val="Heading3"/>
       </w:pPr>
       <w:bookmarkStart w:id="74" w:name="_Toc241062280"/>
-      <w:bookmarkStart w:id="75" w:name="_Toc242140476"/>
+      <w:bookmarkStart w:id="75" w:name="_Toc242140876"/>
       <w:r>
         <w:t>3.4.3 Limitaciones y alcance de la recolección de datos</w:t>
       </w:r>
@@ -16793,7 +16793,7 @@
         <w:pStyle w:val="Heading2"/>
       </w:pPr>
       <w:bookmarkStart w:id="76" w:name="_Toc241062281"/>
-      <w:bookmarkStart w:id="77" w:name="_Toc242140477"/>
+      <w:bookmarkStart w:id="77" w:name="_Toc242140877"/>
       <w:r>
         <w:lastRenderedPageBreak/>
         <w:t>3.5 Población, Muestra y Diseño de la Evaluación</w:t>
@@ -16819,7 +16819,7 @@
         <w:pStyle w:val="Heading3"/>
       </w:pPr>
       <w:bookmarkStart w:id="78" w:name="_Toc241062282"/>
-      <w:bookmarkStart w:id="79" w:name="_Toc242140478"/>
+      <w:bookmarkStart w:id="79" w:name="_Toc242140878"/>
       <w:r>
         <w:t>3.5.1 Población objetivo</w:t>
       </w:r>
@@ -16852,7 +16852,7 @@
         <w:pStyle w:val="Heading3"/>
       </w:pPr>
       <w:bookmarkStart w:id="80" w:name="_Toc241062283"/>
-      <w:bookmarkStart w:id="81" w:name="_Toc242140479"/>
+      <w:bookmarkStart w:id="81" w:name="_Toc242140879"/>
       <w:r>
         <w:t>3.5.2 Definición de la muestra</w:t>
       </w:r>
@@ -16893,7 +16893,7 @@
         <w:pStyle w:val="Heading3"/>
       </w:pPr>
       <w:bookmarkStart w:id="82" w:name="_Toc241062284"/>
-      <w:bookmarkStart w:id="83" w:name="_Toc242140480"/>
+      <w:bookmarkStart w:id="83" w:name="_Toc242140880"/>
       <w:r>
         <w:t>3.5.3 Consideraciones sobre el tamaño muestral</w:t>
       </w:r>
@@ -16928,7 +16928,7 @@
         <w:pStyle w:val="Heading3"/>
       </w:pPr>
       <w:bookmarkStart w:id="84" w:name="_Toc241062285"/>
-      <w:bookmarkStart w:id="85" w:name="_Toc242140481"/>
+      <w:bookmarkStart w:id="85" w:name="_Toc242140881"/>
       <w:r>
         <w:t>3.5.4 Variables e instrumentos de medición</w:t>
       </w:r>
@@ -16965,7 +16965,7 @@
         <w:pStyle w:val="Heading3"/>
       </w:pPr>
       <w:bookmarkStart w:id="86" w:name="_Toc241062286"/>
-      <w:bookmarkStart w:id="87" w:name="_Toc242140482"/>
+      <w:bookmarkStart w:id="87" w:name="_Toc242140882"/>
       <w:r>
         <w:lastRenderedPageBreak/>
         <w:t>3.5.5 Amenazas a la validez</w:t>
@@ -17032,7 +17032,7 @@
         <w:pStyle w:val="Heading2"/>
       </w:pPr>
       <w:bookmarkStart w:id="88" w:name="_Toc241062287"/>
-      <w:bookmarkStart w:id="89" w:name="_Toc242140483"/>
+      <w:bookmarkStart w:id="89" w:name="_Toc242140883"/>
       <w:r>
         <w:t>3.6 Herramientas y Tecnologías Seleccionadas</w:t>
       </w:r>
@@ -17065,7 +17065,7 @@
         <w:pStyle w:val="Heading3"/>
       </w:pPr>
       <w:bookmarkStart w:id="90" w:name="_Toc241062288"/>
-      <w:bookmarkStart w:id="91" w:name="_Toc242140484"/>
+      <w:bookmarkStart w:id="91" w:name="_Toc242140884"/>
       <w:r>
         <w:t>3.6.1 Motor de automatización: n8n</w:t>
       </w:r>
@@ -17098,7 +17098,7 @@
         <w:pStyle w:val="Heading3"/>
       </w:pPr>
       <w:bookmarkStart w:id="92" w:name="_Toc241062289"/>
-      <w:bookmarkStart w:id="93" w:name="_Toc242140485"/>
+      <w:bookmarkStart w:id="93" w:name="_Toc242140885"/>
       <w:r>
         <w:lastRenderedPageBreak/>
         <w:t>3.6.2 Modelo multimodal, integraciones y arquitectura</w:t>
@@ -17148,7 +17148,7 @@
         <w:spacing w:before="280"/>
       </w:pPr>
       <w:bookmarkStart w:id="94" w:name="_Toc241062290"/>
-      <w:bookmarkStart w:id="95" w:name="_Toc242140486"/>
+      <w:bookmarkStart w:id="95" w:name="_Toc242140886"/>
       <w:r>
         <w:t>3.7 Consideraciones éticas y legales</w:t>
       </w:r>
@@ -17183,7 +17183,7 @@
         <w:pStyle w:val="Heading3"/>
       </w:pPr>
       <w:bookmarkStart w:id="96" w:name="_Toc241062291"/>
-      <w:bookmarkStart w:id="97" w:name="_Toc242140487"/>
+      <w:bookmarkStart w:id="97" w:name="_Toc242140887"/>
       <w:r>
         <w:t>3.7.1 Protección de datos personales y Privacidad desde el Diseño</w:t>
       </w:r>
@@ -17233,7 +17233,7 @@
         <w:pStyle w:val="Heading3"/>
       </w:pPr>
       <w:bookmarkStart w:id="98" w:name="_Toc241062292"/>
-      <w:bookmarkStart w:id="99" w:name="_Toc242140488"/>
+      <w:bookmarkStart w:id="99" w:name="_Toc242140888"/>
       <w:r>
         <w:t>3.7.2 Seguridad en la autenticación, acceso y soberanía</w:t>
       </w:r>
@@ -17271,7 +17271,7 @@
         <w:pStyle w:val="Heading3"/>
       </w:pPr>
       <w:bookmarkStart w:id="100" w:name="_Toc241062293"/>
-      <w:bookmarkStart w:id="101" w:name="_Toc242140489"/>
+      <w:bookmarkStart w:id="101" w:name="_Toc242140889"/>
       <w:r>
         <w:t>3.7.3 Ética en la Inteligencia Artificial (</w:t>
       </w:r>
@@ -17319,7 +17319,7 @@
         <w:pStyle w:val="Heading3"/>
       </w:pPr>
       <w:bookmarkStart w:id="102" w:name="_Toc241062294"/>
-      <w:bookmarkStart w:id="103" w:name="_Toc242140490"/>
+      <w:bookmarkStart w:id="103" w:name="_Toc242140890"/>
       <w:r>
         <w:t>3.7.4 Auditoría de compliance y exposición de la consultora ante la normativa de la marca</w:t>
       </w:r>
@@ -17355,7 +17355,7 @@
         <w:pStyle w:val="Heading3"/>
       </w:pPr>
       <w:bookmarkStart w:id="104" w:name="_Toc241062295"/>
-      <w:bookmarkStart w:id="105" w:name="_Toc242140491"/>
+      <w:bookmarkStart w:id="105" w:name="_Toc242140891"/>
       <w:r>
         <w:t>3.7.5 Responsabilidad en la automatización y uso indebido</w:t>
       </w:r>
@@ -17375,7 +17375,7 @@
         <w:pStyle w:val="Heading3"/>
       </w:pPr>
       <w:bookmarkStart w:id="106" w:name="_Toc241062296"/>
-      <w:bookmarkStart w:id="107" w:name="_Toc242140492"/>
+      <w:bookmarkStart w:id="107" w:name="_Toc242140892"/>
       <w:r>
         <w:t>3.7.6 Ética de la investigación</w:t>
       </w:r>
@@ -17395,7 +17395,7 @@
         <w:spacing w:before="240" w:after="240"/>
       </w:pPr>
       <w:r>
-        <w:t>El piloto obtuvo consentimiento verbal de sus tres consultoras. Se les explicó el objetivo académico y que su identidad no aparecería: la planilla sólo registra C1, C2 y C3 (Anexo E.2). No se recogió un consentimiento escrito, y esa es una carencia del procedimiento y no una decisión justificable por la escala del estudio. En la ampliación, las ocho participantes, incluidas las tres del piloto, firmaron un consentimiento informado antes de la sesión (protocolo de la ampliación, apartado 7). Los dos evaluadores externos, las tres autoras del corpus y la consultora que aportó R01, que habían participado con un acuerdo verbal, firmaron a comienzos de octubre de 2026 un consentimiento retroactivo. Describe su participación y el uso de su material, y no se publica. Una copia escaneada de cada consentimiento firmado acompaña a esta entrega, en la carpeta «Consentimientos» junto al documento. La tercera evaluadora de los Estudios 1 y 4 firmó el suyo antes de participar, y la consultora de la prueba de vinculación (Anexo B.1), el mismo día de la prueba. La consultora que filmó los videos del Anexo E.9, una de las ocho participantes, consintió verbalmente el uso de ese material y lo formalizó por escrito, también retroactivo, el 5 de octubre de 2026. El segundo usuario de la prueba con dos cuentas de Telegram (Anexo B.1) es uno de los autores.</w:t>
+        <w:t>El piloto obtuvo consentimiento verbal de sus tres consultoras. Se les explicó el objetivo académico y que su identidad no aparecería: la planilla sólo registra C1, C2 y C3 (Anexo E.2). No se recogió un consentimiento escrito, y esa es una carencia del procedimiento y no una decisión justificable por la escala del estudio. En la ampliación, las ocho participantes, incluidas las tres del piloto, firmaron en papel un consentimiento informado antes de la sesión (protocolo de la ampliación, apartado 7), y el registro de reclutamiento de cada una lo consigna (Anexo E.4). Esos ocho ejemplares no acompañan a esta entrega. Los dos evaluadores externos, las tres autoras del corpus y la consultora que aportó R01, que habían participado con un acuerdo verbal, firmaron a comienzos de octubre de 2026 un consentimiento retroactivo. Describe su participación y el uso de su material, y no se publica. La tercera evaluadora de los Estudios 1 y 4 firmó el suyo antes de participar, y la consultora de la prueba de vinculación (Anexo B.1), el mismo día de la prueba. La consultora que filmó los videos del Anexo E.9, una de las ocho participantes, consintió verbalmente el uso de ese material y lo formalizó por escrito, también retroactivo, el 5 de octubre de 2026. La carpeta «Consentimientos» que acompaña a esta entrega, junto al documento, reúne la copia escaneada de esos nueve consentimientos escritos. El segundo usuario de la prueba con dos cuentas de Telegram (Anexo B.1) es uno de los autores.</w:t>
       </w:r>
     </w:p>
     <w:p>
@@ -17403,11 +17403,11 @@
         <w:spacing w:before="240" w:after="240"/>
       </w:pPr>
       <w:r>
-        <w:t xml:space="preserve">El banco de casos del canal visual se compuso sobre material gráfico oficial de la marca, y las Pautas que este mismo trabajo invoca prohíben modificar esas imágenes «en modo alguno» (Anexo D, p. 8). Ninguna de esas composiciones se publicó, con una excepción. Para ejercitar la re-publicación (Anexo E.11) hubo que publicar a mano, en la cuenta del proyecto, una pieza con precio compuesta sobre arte de la marca, la conducta que el Módulo Centinela existe para impedir. Se borró apenas el módulo bloqueó la re-publicación; la cuenta no tenía seguidores, pero la publicación fue pública y corresponde decirlo. Lo mismo se repitió una vez en E3, el 1 de octubre de 2026, con una foto propia y no con arte de la marca. Estuvo publicada menos de dos minutos y se borró en </w:t>
+        <w:t xml:space="preserve">El banco de casos del canal visual se compuso sobre material gráfico oficial de la marca, y las Pautas que este mismo trabajo invoca prohíben modificar esas imágenes «en modo alguno» (Anexo D, p. 8). Ninguna de esas composiciones se publicó, con una excepción. Para ejercitar la re-publicación (Anexo E.11) hubo que publicar a mano, en la cuenta del proyecto, una pieza con precio compuesta sobre arte de la marca, la conducta que el Módulo Centinela existe para impedir. Se borró apenas el módulo bloqueó la re-publicación; la cuenta no tenía seguidores, pero la publicación fue pública y corresponde decirlo. Lo mismo se repitió una vez en E3, el 1 de octubre de 2026, con una foto propia y </w:t>
       </w:r>
       <w:r>
         <w:lastRenderedPageBreak/>
-        <w:t>cuanto el módulo bloqueó la re-publicación (Anexo C.9). Las Figuras 12 a 15 se recortaron para no reproducir el arte de la marca.</w:t>
+        <w:t>no con arte de la marca. Estuvo publicada menos de dos minutos y se borró en cuanto el módulo bloqueó la re-publicación (Anexo C.9). Las Figuras 12 a 15 se recortaron para no reproducir el arte de la marca.</w:t>
       </w:r>
     </w:p>
     <w:p>
@@ -17503,7 +17503,7 @@
         <w:pStyle w:val="Heading1"/>
       </w:pPr>
       <w:bookmarkStart w:id="108" w:name="_Toc241062297"/>
-      <w:bookmarkStart w:id="109" w:name="_Toc242140493"/>
+      <w:bookmarkStart w:id="109" w:name="_Toc242140893"/>
       <w:r>
         <w:t>CAPÍTULO 4: DESARROLLO DEL ESTUDIO</w:t>
       </w:r>
@@ -17522,9 +17522,8 @@
         <w:pStyle w:val="Heading2"/>
       </w:pPr>
       <w:bookmarkStart w:id="110" w:name="_Toc241062298"/>
-      <w:bookmarkStart w:id="111" w:name="_Toc242140494"/>
-      <w:r>
-        <w:lastRenderedPageBreak/>
+      <w:bookmarkStart w:id="111" w:name="_Toc242140894"/>
+      <w:r>
         <w:t>4.1 Historias de Usuario y Criterios de Aceptación</w:t>
       </w:r>
       <w:bookmarkEnd w:id="110"/>
@@ -17567,7 +17566,7 @@
         <w:spacing w:before="360" w:line="240" w:lineRule="auto"/>
       </w:pPr>
       <w:bookmarkStart w:id="112" w:name="_Toc241062299"/>
-      <w:bookmarkStart w:id="113" w:name="_Toc242140495"/>
+      <w:bookmarkStart w:id="113" w:name="_Toc242140895"/>
       <w:r>
         <w:t>4.1.1 Módulo A: Seguridad, Onboarding y Autenticación</w:t>
       </w:r>
@@ -17682,6 +17681,7 @@
         <w:spacing w:after="240" w:line="276" w:lineRule="auto"/>
       </w:pPr>
       <w:r>
+        <w:lastRenderedPageBreak/>
         <w:t xml:space="preserve">Si la consulta retorna </w:t>
       </w:r>
       <w:r>
@@ -17718,7 +17718,6 @@
           <w:b/>
           <w:bCs/>
         </w:rPr>
-        <w:lastRenderedPageBreak/>
         <w:t>Historia de Usuario 2: Vinculación Segura de Cuentas (Delegación OAuth 2.0)</w:t>
       </w:r>
     </w:p>
@@ -17915,7 +17914,11 @@
         <w:spacing w:after="0" w:line="276" w:lineRule="auto"/>
       </w:pPr>
       <w:r>
-        <w:t>Cada vez que se inicie una publicación o se abra la agenda, el sistema debe descifrar el token almacenado y consultar con él a la Graph API la identidad de la cuenta. Sólo una respuesta que devuelva el identificador de la cuenta se toma como token vigente.</w:t>
+        <w:t xml:space="preserve">Cada vez que se inicie una publicación o se abra la agenda, el sistema debe descifrar el token almacenado y consultar con él a </w:t>
+      </w:r>
+      <w:r>
+        <w:lastRenderedPageBreak/>
+        <w:t>la Graph API la identidad de la cuenta. Sólo una respuesta que devuelva el identificador de la cuenta se toma como token vigente.</w:t>
       </w:r>
     </w:p>
     <w:p>
@@ -17927,7 +17930,6 @@
         <w:spacing w:after="0" w:line="276" w:lineRule="auto"/>
       </w:pPr>
       <w:r>
-        <w:lastRenderedPageBreak/>
         <w:t>En caso de capturar una excepción de autorización (</w:t>
       </w:r>
       <w:r>
@@ -17981,7 +17983,7 @@
         <w:spacing w:before="0" w:line="276" w:lineRule="auto"/>
       </w:pPr>
       <w:bookmarkStart w:id="114" w:name="_Toc241062300"/>
-      <w:bookmarkStart w:id="115" w:name="_Toc242140496"/>
+      <w:bookmarkStart w:id="115" w:name="_Toc242140896"/>
       <w:r>
         <w:t>4.1.2 Módulo B: Creación de Contenido Asistida por IA</w:t>
       </w:r>
@@ -18125,6 +18127,7 @@
           <w:b/>
           <w:bCs/>
         </w:rPr>
+        <w:lastRenderedPageBreak/>
         <w:t>Historia de Usuario 5: Creación Estructurada de Carruseles con Ordenamiento Lógico</w:t>
       </w:r>
     </w:p>
@@ -18141,7 +18144,6 @@
           <w:i/>
           <w:iCs/>
         </w:rPr>
-        <w:lastRenderedPageBreak/>
         <w:t>Como usuaria sin conocimientos de diseño, quiero enviar un conjunto de hasta 10 imágenes al bot, para que el sistema me proponga un orden narrativo para una publicación tipo carrusel.</w:t>
       </w:r>
     </w:p>
@@ -18396,7 +18398,7 @@
         <w:spacing w:before="0" w:line="276" w:lineRule="auto"/>
       </w:pPr>
       <w:bookmarkStart w:id="116" w:name="_Toc241062301"/>
-      <w:bookmarkStart w:id="117" w:name="_Toc242140497"/>
+      <w:bookmarkStart w:id="117" w:name="_Toc242140897"/>
       <w:r>
         <w:t>4.1.3 Módulo C: Auditoría de Compliance (Módulo Centinela)</w:t>
       </w:r>
@@ -18408,7 +18410,6 @@
         <w:spacing w:after="240" w:line="276" w:lineRule="auto"/>
       </w:pPr>
       <w:r>
-        <w:lastRenderedPageBreak/>
         <w:t>Este módulo es el Módulo Centinela (§2.4): verifica cada texto y cada imagen antes de publicar, para reducir el riesgo de incumplir las directrices de la compañía (Tarantino, 2008). El canal textual es determinista; el visual depende de que un modelo externo devuelva un veredicto legible (§4.3.1).</w:t>
       </w:r>
     </w:p>
@@ -18609,6 +18610,7 @@
           <w:b/>
           <w:bCs/>
         </w:rPr>
+        <w:lastRenderedPageBreak/>
         <w:t>Criterios de Aceptación:</w:t>
       </w:r>
     </w:p>
@@ -18621,7 +18623,6 @@
         <w:spacing w:after="0" w:line="276" w:lineRule="auto"/>
       </w:pPr>
       <w:r>
-        <w:lastRenderedPageBreak/>
         <w:t>El sistema debe invocar la API multimodal utilizando la capacidad de visión de Gemini 2.5 Flash para leer las cadenas de texto ocultas en los píxeles de las imágenes.</w:t>
       </w:r>
     </w:p>
@@ -18776,7 +18777,7 @@
         <w:spacing w:before="0" w:line="276" w:lineRule="auto"/>
       </w:pPr>
       <w:bookmarkStart w:id="118" w:name="_Toc241062302"/>
-      <w:bookmarkStart w:id="119" w:name="_Toc242140498"/>
+      <w:bookmarkStart w:id="119" w:name="_Toc242140898"/>
       <w:r>
         <w:t>4.1.4 Módulo D: Gestión de Publicación y Agenda</w:t>
       </w:r>
@@ -18936,7 +18937,7 @@
         <w:keepNext/>
         <w:jc w:val="center"/>
       </w:pPr>
-      <w:bookmarkStart w:id="120" w:name="_Toc242140603"/>
+      <w:bookmarkStart w:id="120" w:name="_Toc242141003"/>
       <w:r>
         <w:rPr>
           <w:i/>
@@ -19291,7 +19292,7 @@
         <w:spacing w:before="0" w:line="276" w:lineRule="auto"/>
       </w:pPr>
       <w:bookmarkStart w:id="121" w:name="_Toc241062303"/>
-      <w:bookmarkStart w:id="122" w:name="_Toc242140499"/>
+      <w:bookmarkStart w:id="122" w:name="_Toc242140899"/>
       <w:r>
         <w:t>4.1.5 Módulo E: Procesamiento Multimedia y Analítica de Datos</w:t>
       </w:r>
@@ -19557,7 +19558,7 @@
         <w:pStyle w:val="Heading2"/>
       </w:pPr>
       <w:bookmarkStart w:id="123" w:name="_Toc241062304"/>
-      <w:bookmarkStart w:id="124" w:name="_Toc242140500"/>
+      <w:bookmarkStart w:id="124" w:name="_Toc242140900"/>
       <w:r>
         <w:t>4.2 Definición del Producto Mínimo Viable (MVP)</w:t>
       </w:r>
@@ -19586,7 +19587,7 @@
           <w:lang w:val="en-US"/>
         </w:rPr>
       </w:pPr>
-      <w:bookmarkStart w:id="125" w:name="_Toc242140604"/>
+      <w:bookmarkStart w:id="125" w:name="_Toc242141004"/>
       <w:r>
         <w:rPr>
           <w:i/>
@@ -19871,7 +19872,7 @@
         <w:pStyle w:val="Heading2"/>
       </w:pPr>
       <w:bookmarkStart w:id="126" w:name="_Toc241062305"/>
-      <w:bookmarkStart w:id="127" w:name="_Toc242140501"/>
+      <w:bookmarkStart w:id="127" w:name="_Toc242140901"/>
       <w:r>
         <w:t>4.3 Implementación de Lógica de Auditoría y Compliance</w:t>
       </w:r>
@@ -19913,7 +19914,7 @@
         <w:spacing w:before="0" w:line="276" w:lineRule="auto"/>
       </w:pPr>
       <w:bookmarkStart w:id="128" w:name="_Toc241062306"/>
-      <w:bookmarkStart w:id="129" w:name="_Toc242140502"/>
+      <w:bookmarkStart w:id="129" w:name="_Toc242140902"/>
       <w:r>
         <w:t>4.3.1 Detección Multimodal de Precios y Restricciones Comerciales</w:t>
       </w:r>
@@ -20037,7 +20038,7 @@
         <w:spacing w:before="0" w:line="276" w:lineRule="auto"/>
       </w:pPr>
       <w:bookmarkStart w:id="130" w:name="_Toc241062307"/>
-      <w:bookmarkStart w:id="131" w:name="_Toc242140503"/>
+      <w:bookmarkStart w:id="131" w:name="_Toc242140903"/>
       <w:r>
         <w:t>4.3.2 Automatización de Identidad y Transparencia Corporativa</w:t>
       </w:r>
@@ -20105,7 +20106,7 @@
         <w:spacing w:before="0" w:line="276" w:lineRule="auto"/>
       </w:pPr>
       <w:bookmarkStart w:id="132" w:name="_Toc241062308"/>
-      <w:bookmarkStart w:id="133" w:name="_Toc242140504"/>
+      <w:bookmarkStart w:id="133" w:name="_Toc242140904"/>
       <w:r>
         <w:t>4.4 Procesamiento Multimedia y Optimización de Archivos</w:t>
       </w:r>
@@ -20135,7 +20136,7 @@
         <w:spacing w:before="0" w:line="276" w:lineRule="auto"/>
       </w:pPr>
       <w:bookmarkStart w:id="135" w:name="_Toc241062309"/>
-      <w:bookmarkStart w:id="136" w:name="_Toc242140505"/>
+      <w:bookmarkStart w:id="136" w:name="_Toc242140905"/>
       <w:r>
         <w:t>4.4.1 Integración de FFmpeg y Normalización de Formatos</w:t>
       </w:r>
@@ -20165,7 +20166,7 @@
         <w:spacing w:before="0" w:line="276" w:lineRule="auto"/>
       </w:pPr>
       <w:bookmarkStart w:id="138" w:name="_Toc241062310"/>
-      <w:bookmarkStart w:id="139" w:name="_Toc242140506"/>
+      <w:bookmarkStart w:id="139" w:name="_Toc242140906"/>
       <w:r>
         <w:t>4.4.2 Tratamiento de Imágenes para Carruseles y Feeds</w:t>
       </w:r>
@@ -20242,7 +20243,7 @@
         <w:spacing w:before="0" w:line="276" w:lineRule="auto"/>
       </w:pPr>
       <w:bookmarkStart w:id="141" w:name="_Toc241062311"/>
-      <w:bookmarkStart w:id="142" w:name="_Toc242140507"/>
+      <w:bookmarkStart w:id="142" w:name="_Toc242140907"/>
       <w:r>
         <w:t>4.4.3 Validación y Tratamiento de Video (Reels)</w:t>
       </w:r>
@@ -20405,7 +20406,7 @@
         <w:spacing w:before="0" w:line="276" w:lineRule="auto"/>
       </w:pPr>
       <w:bookmarkStart w:id="143" w:name="_Toc241062312"/>
-      <w:bookmarkStart w:id="144" w:name="_Toc242140508"/>
+      <w:bookmarkStart w:id="144" w:name="_Toc242140908"/>
       <w:r>
         <w:t>CAPÍTULO 5: ARQUITECTURA E INTERFAZ DE VISUALIZACIÓN</w:t>
       </w:r>
@@ -20425,7 +20426,7 @@
         <w:pStyle w:val="Heading2"/>
       </w:pPr>
       <w:bookmarkStart w:id="145" w:name="_Toc241062313"/>
-      <w:bookmarkStart w:id="146" w:name="_Toc242140509"/>
+      <w:bookmarkStart w:id="146" w:name="_Toc242140909"/>
       <w:r>
         <w:t>5.1 Arquitectura del Sistema Postly</w:t>
       </w:r>
@@ -20476,7 +20477,7 @@
         <w:keepNext/>
         <w:jc w:val="center"/>
       </w:pPr>
-      <w:bookmarkStart w:id="147" w:name="_Toc242140605"/>
+      <w:bookmarkStart w:id="147" w:name="_Toc242141005"/>
       <w:r>
         <w:rPr>
           <w:i/>
@@ -20598,7 +20599,7 @@
         <w:pStyle w:val="Heading3"/>
       </w:pPr>
       <w:bookmarkStart w:id="148" w:name="_Toc241062314"/>
-      <w:bookmarkStart w:id="149" w:name="_Toc242140510"/>
+      <w:bookmarkStart w:id="149" w:name="_Toc242140910"/>
       <w:r>
         <w:lastRenderedPageBreak/>
         <w:t>5.1.1 Capas de la arquitectura</w:t>
@@ -20754,7 +20755,7 @@
         <w:keepNext/>
         <w:jc w:val="center"/>
       </w:pPr>
-      <w:bookmarkStart w:id="150" w:name="_Toc242140606"/>
+      <w:bookmarkStart w:id="150" w:name="_Toc242141006"/>
       <w:r>
         <w:rPr>
           <w:i/>
@@ -20910,7 +20911,7 @@
         <w:pStyle w:val="Heading3"/>
       </w:pPr>
       <w:bookmarkStart w:id="151" w:name="_Toc241062315"/>
-      <w:bookmarkStart w:id="152" w:name="_Toc242140511"/>
+      <w:bookmarkStart w:id="152" w:name="_Toc242140911"/>
       <w:r>
         <w:t>5.1.2 Flujo de datos entre componentes</w:t>
       </w:r>
@@ -21134,7 +21135,7 @@
         <w:pStyle w:val="Heading3"/>
       </w:pPr>
       <w:bookmarkStart w:id="153" w:name="_Toc241062316"/>
-      <w:bookmarkStart w:id="154" w:name="_Toc242140512"/>
+      <w:bookmarkStart w:id="154" w:name="_Toc242140912"/>
       <w:r>
         <w:t>5.1.3 Principios de diseño adoptados</w:t>
       </w:r>
@@ -21258,7 +21259,7 @@
         <w:pStyle w:val="Heading3"/>
       </w:pPr>
       <w:bookmarkStart w:id="155" w:name="_Toc241062317"/>
-      <w:bookmarkStart w:id="156" w:name="_Toc242140513"/>
+      <w:bookmarkStart w:id="156" w:name="_Toc242140913"/>
       <w:r>
         <w:lastRenderedPageBreak/>
         <w:t>5.1.4 Consideraciones sobre la evolución arquitectónica</w:t>
@@ -21290,7 +21291,7 @@
         <w:pStyle w:val="Heading2"/>
       </w:pPr>
       <w:bookmarkStart w:id="157" w:name="_Toc241062318"/>
-      <w:bookmarkStart w:id="158" w:name="_Toc242140514"/>
+      <w:bookmarkStart w:id="158" w:name="_Toc242140914"/>
       <w:r>
         <w:t>5.2 Diseño de Flujos de Trabajo en n8n</w:t>
       </w:r>
@@ -21315,7 +21316,7 @@
         <w:pStyle w:val="Heading3"/>
       </w:pPr>
       <w:bookmarkStart w:id="159" w:name="_Toc241062319"/>
-      <w:bookmarkStart w:id="160" w:name="_Toc242140515"/>
+      <w:bookmarkStart w:id="160" w:name="_Toc242140915"/>
       <w:r>
         <w:t>5.2.1 Workflow de Creación y Publicación Inteligente</w:t>
       </w:r>
@@ -21361,7 +21362,7 @@
         <w:keepNext/>
         <w:jc w:val="center"/>
       </w:pPr>
-      <w:bookmarkStart w:id="161" w:name="_Toc242140607"/>
+      <w:bookmarkStart w:id="161" w:name="_Toc242141007"/>
       <w:r>
         <w:rPr>
           <w:i/>
@@ -21525,7 +21526,7 @@
         <w:keepNext/>
         <w:jc w:val="center"/>
       </w:pPr>
-      <w:bookmarkStart w:id="162" w:name="_Toc242140608"/>
+      <w:bookmarkStart w:id="162" w:name="_Toc242141008"/>
       <w:r>
         <w:rPr>
           <w:i/>
@@ -21694,7 +21695,7 @@
         <w:keepNext/>
         <w:jc w:val="center"/>
       </w:pPr>
-      <w:bookmarkStart w:id="163" w:name="_Toc242140609"/>
+      <w:bookmarkStart w:id="163" w:name="_Toc242141009"/>
       <w:r>
         <w:rPr>
           <w:i/>
@@ -21925,7 +21926,7 @@
         <w:keepNext/>
         <w:jc w:val="center"/>
       </w:pPr>
-      <w:bookmarkStart w:id="164" w:name="_Toc242140610"/>
+      <w:bookmarkStart w:id="164" w:name="_Toc242141010"/>
       <w:r>
         <w:rPr>
           <w:i/>
@@ -22040,7 +22041,7 @@
         <w:keepNext/>
         <w:jc w:val="center"/>
       </w:pPr>
-      <w:bookmarkStart w:id="165" w:name="_Toc242140611"/>
+      <w:bookmarkStart w:id="165" w:name="_Toc242141011"/>
       <w:r>
         <w:rPr>
           <w:i/>
@@ -22169,7 +22170,7 @@
           <w:sz w:val="20"/>
         </w:rPr>
       </w:pPr>
-      <w:bookmarkStart w:id="166" w:name="_Toc242140612"/>
+      <w:bookmarkStart w:id="166" w:name="_Toc242141012"/>
       <w:r>
         <w:rPr>
           <w:i/>
@@ -22294,7 +22295,7 @@
       <w:pPr>
         <w:pStyle w:val="Heading3"/>
       </w:pPr>
-      <w:bookmarkStart w:id="168" w:name="_Toc242140516"/>
+      <w:bookmarkStart w:id="168" w:name="_Toc242140916"/>
       <w:r>
         <w:t>5.2.2 Workflow de Gestión de Agenda y Estados</w:t>
       </w:r>
@@ -22395,7 +22396,7 @@
         <w:pStyle w:val="Heading3"/>
       </w:pPr>
       <w:bookmarkStart w:id="169" w:name="_Toc241062321"/>
-      <w:bookmarkStart w:id="170" w:name="_Toc242140517"/>
+      <w:bookmarkStart w:id="170" w:name="_Toc242140917"/>
       <w:r>
         <w:t>5.2.3 Workflow de Configuración y Tutorial de Vinculación</w:t>
       </w:r>
@@ -22514,7 +22515,7 @@
         <w:pStyle w:val="Heading2"/>
       </w:pPr>
       <w:bookmarkStart w:id="171" w:name="_Toc241062322"/>
-      <w:bookmarkStart w:id="172" w:name="_Toc242140518"/>
+      <w:bookmarkStart w:id="172" w:name="_Toc242140918"/>
       <w:r>
         <w:t>5.3 Diseño de la Experiencia de Usuario (User Journey)</w:t>
       </w:r>
@@ -22647,7 +22648,7 @@
         <w:spacing w:before="0" w:line="276" w:lineRule="auto"/>
       </w:pPr>
       <w:bookmarkStart w:id="173" w:name="_Toc241062323"/>
-      <w:bookmarkStart w:id="174" w:name="_Toc242140519"/>
+      <w:bookmarkStart w:id="174" w:name="_Toc242140919"/>
       <w:r>
         <w:t>CAPÍTULO 6: RESULTADOS</w:t>
       </w:r>
@@ -22694,7 +22695,7 @@
         <w:spacing w:before="0" w:line="276" w:lineRule="auto"/>
       </w:pPr>
       <w:bookmarkStart w:id="175" w:name="_Toc241062324"/>
-      <w:bookmarkStart w:id="176" w:name="_Toc242140520"/>
+      <w:bookmarkStart w:id="176" w:name="_Toc242140920"/>
       <w:r>
         <w:t>6.1 Validación empírica del artefacto</w:t>
       </w:r>
@@ -22765,7 +22766,7 @@
         <w:spacing w:before="360" w:line="240" w:lineRule="auto"/>
       </w:pPr>
       <w:bookmarkStart w:id="177" w:name="_Toc241062325"/>
-      <w:bookmarkStart w:id="178" w:name="_Toc242140521"/>
+      <w:bookmarkStart w:id="178" w:name="_Toc242140921"/>
       <w:r>
         <w:t>6.1.1 Validación empírica del Módulo Centinela</w:t>
       </w:r>
@@ -22833,7 +22834,7 @@
           <w:i/>
         </w:rPr>
       </w:pPr>
-      <w:bookmarkStart w:id="179" w:name="_Toc242140587"/>
+      <w:bookmarkStart w:id="179" w:name="_Toc242140987"/>
       <w:r>
         <w:rPr>
           <w:b/>
@@ -23072,7 +23073,7 @@
       <w:pPr>
         <w:keepNext/>
       </w:pPr>
-      <w:bookmarkStart w:id="180" w:name="_Toc242140588"/>
+      <w:bookmarkStart w:id="180" w:name="_Toc242140988"/>
       <w:r>
         <w:rPr>
           <w:b/>
@@ -23417,7 +23418,7 @@
         <w:keepNext/>
         <w:jc w:val="center"/>
       </w:pPr>
-      <w:bookmarkStart w:id="181" w:name="_Toc242140613"/>
+      <w:bookmarkStart w:id="181" w:name="_Toc242141013"/>
       <w:r>
         <w:rPr>
           <w:i/>
@@ -23556,7 +23557,7 @@
         <w:keepNext/>
         <w:jc w:val="center"/>
       </w:pPr>
-      <w:bookmarkStart w:id="182" w:name="_Toc242140614"/>
+      <w:bookmarkStart w:id="182" w:name="_Toc242141014"/>
       <w:r>
         <w:rPr>
           <w:i/>
@@ -23698,7 +23699,7 @@
         <w:keepNext/>
         <w:jc w:val="center"/>
       </w:pPr>
-      <w:bookmarkStart w:id="183" w:name="_Toc242140615"/>
+      <w:bookmarkStart w:id="183" w:name="_Toc242141015"/>
       <w:r>
         <w:rPr>
           <w:i/>
@@ -23841,7 +23842,7 @@
           <w:sz w:val="20"/>
         </w:rPr>
       </w:pPr>
-      <w:bookmarkStart w:id="184" w:name="_Toc242140616"/>
+      <w:bookmarkStart w:id="184" w:name="_Toc242141016"/>
       <w:r>
         <w:rPr>
           <w:i/>
@@ -23991,7 +23992,7 @@
         <w:spacing w:before="360" w:line="240" w:lineRule="auto"/>
       </w:pPr>
       <w:bookmarkStart w:id="185" w:name="_Toc241062326"/>
-      <w:bookmarkStart w:id="186" w:name="_Toc242140522"/>
+      <w:bookmarkStart w:id="186" w:name="_Toc242140922"/>
       <w:r>
         <w:t>6.1.2 Conjunto ampliado del canal de imagen (HU8)</w:t>
       </w:r>
@@ -24050,7 +24051,7 @@
         <w:spacing w:before="360" w:line="240" w:lineRule="auto"/>
       </w:pPr>
       <w:bookmarkStart w:id="187" w:name="_Toc241062327"/>
-      <w:bookmarkStart w:id="188" w:name="_Toc242140523"/>
+      <w:bookmarkStart w:id="188" w:name="_Toc242140923"/>
       <w:r>
         <w:t>6.1.3 Validación con contenido real y evaluación externa</w:t>
       </w:r>
@@ -24077,7 +24078,7 @@
       <w:pPr>
         <w:keepNext/>
       </w:pPr>
-      <w:bookmarkStart w:id="189" w:name="_Toc242140589"/>
+      <w:bookmarkStart w:id="189" w:name="_Toc242140989"/>
       <w:r>
         <w:rPr>
           <w:b/>
@@ -24567,7 +24568,7 @@
         <w:spacing w:before="360" w:line="240" w:lineRule="auto"/>
       </w:pPr>
       <w:bookmarkStart w:id="190" w:name="_Toc241062328"/>
-      <w:bookmarkStart w:id="191" w:name="_Toc242140524"/>
+      <w:bookmarkStart w:id="191" w:name="_Toc242140924"/>
       <w:r>
         <w:t>6.1.4 Análisis de valores límite y refinamiento del detector</w:t>
       </w:r>
@@ -24630,7 +24631,7 @@
       <w:pPr>
         <w:keepNext/>
       </w:pPr>
-      <w:bookmarkStart w:id="192" w:name="_Toc242140590"/>
+      <w:bookmarkStart w:id="192" w:name="_Toc242140990"/>
       <w:r>
         <w:rPr>
           <w:b/>
@@ -25447,7 +25448,7 @@
         <w:spacing w:before="360" w:line="240" w:lineRule="auto"/>
       </w:pPr>
       <w:bookmarkStart w:id="193" w:name="_Toc241062329"/>
-      <w:bookmarkStart w:id="194" w:name="_Toc242140525"/>
+      <w:bookmarkStart w:id="194" w:name="_Toc242140925"/>
       <w:r>
         <w:t>6.1.5 Baterías de validación técnica del sistema</w:t>
       </w:r>
@@ -25482,7 +25483,7 @@
         <w:spacing w:before="360" w:line="240" w:lineRule="auto"/>
       </w:pPr>
       <w:bookmarkStart w:id="195" w:name="_Toc241062330"/>
-      <w:bookmarkStart w:id="196" w:name="_Toc242140526"/>
+      <w:bookmarkStart w:id="196" w:name="_Toc242140926"/>
       <w:r>
         <w:t>6.1.6 Reducción del tiempo operativo y contraste de la hipótesis</w:t>
       </w:r>
@@ -25520,7 +25521,7 @@
           <w:i/>
         </w:rPr>
       </w:pPr>
-      <w:bookmarkStart w:id="197" w:name="_Toc242140591"/>
+      <w:bookmarkStart w:id="197" w:name="_Toc242140991"/>
       <w:r>
         <w:rPr>
           <w:b/>
@@ -26196,7 +26197,7 @@
         <w:spacing w:before="360" w:line="240" w:lineRule="auto"/>
       </w:pPr>
       <w:bookmarkStart w:id="198" w:name="_Toc241062331"/>
-      <w:bookmarkStart w:id="199" w:name="_Toc242140527"/>
+      <w:bookmarkStart w:id="199" w:name="_Toc242140927"/>
       <w:r>
         <w:t>6.1.7 Aceptación de las usuarias (Modelo TAM)</w:t>
       </w:r>
@@ -26215,7 +26216,7 @@
       <w:pPr>
         <w:keepNext/>
       </w:pPr>
-      <w:bookmarkStart w:id="200" w:name="_Toc242140592"/>
+      <w:bookmarkStart w:id="200" w:name="_Toc242140992"/>
       <w:r>
         <w:rPr>
           <w:b/>
@@ -26476,7 +26477,7 @@
         <w:pStyle w:val="Heading3"/>
         <w:spacing w:before="360" w:line="240" w:lineRule="auto"/>
       </w:pPr>
-      <w:bookmarkStart w:id="201" w:name="_Toc242140528"/>
+      <w:bookmarkStart w:id="201" w:name="_Toc242140928"/>
       <w:r>
         <w:t>6.1.8 Evaluación externa de la calidad del copy y del orden de carrusel (OE2)</w:t>
       </w:r>
@@ -26498,7 +26499,7 @@
         <w:spacing w:before="0" w:line="276" w:lineRule="auto"/>
       </w:pPr>
       <w:bookmarkStart w:id="202" w:name="_Toc241062332"/>
-      <w:bookmarkStart w:id="203" w:name="_Toc242140529"/>
+      <w:bookmarkStart w:id="203" w:name="_Toc242140929"/>
       <w:r>
         <w:t>6.2 Desafíos de Integración y Lecciones Aprendidas</w:t>
       </w:r>
@@ -26619,7 +26620,7 @@
         <w:pStyle w:val="Heading1"/>
       </w:pPr>
       <w:bookmarkStart w:id="204" w:name="_Toc241062334"/>
-      <w:bookmarkStart w:id="205" w:name="_Toc242140530"/>
+      <w:bookmarkStart w:id="205" w:name="_Toc242140930"/>
       <w:r>
         <w:t>CAPÍTULO 7: DISCUSIÓN</w:t>
       </w:r>
@@ -26637,7 +26638,7 @@
         <w:spacing w:after="240" w:line="276" w:lineRule="auto"/>
       </w:pPr>
       <w:bookmarkStart w:id="206" w:name="_Toc241062335"/>
-      <w:bookmarkStart w:id="207" w:name="_Toc242140531"/>
+      <w:bookmarkStart w:id="207" w:name="_Toc242140931"/>
       <w:r>
         <w:t>7.1 Contraste con la literatura sobre interfaces conversacionales</w:t>
       </w:r>
@@ -26655,7 +26656,7 @@
         <w:spacing w:after="240" w:line="276" w:lineRule="auto"/>
       </w:pPr>
       <w:bookmarkStart w:id="208" w:name="_Toc241062336"/>
-      <w:bookmarkStart w:id="209" w:name="_Toc242140532"/>
+      <w:bookmarkStart w:id="209" w:name="_Toc242140932"/>
       <w:r>
         <w:lastRenderedPageBreak/>
         <w:t>7.2 Grounding visual y mitigación de alucinaciones</w:t>
@@ -26674,7 +26675,7 @@
         <w:spacing w:after="240" w:line="276" w:lineRule="auto"/>
       </w:pPr>
       <w:bookmarkStart w:id="210" w:name="_Toc241062337"/>
-      <w:bookmarkStart w:id="211" w:name="_Toc242140533"/>
+      <w:bookmarkStart w:id="211" w:name="_Toc242140933"/>
       <w:r>
         <w:t>7.3 Compliance automatizado y RegTech</w:t>
       </w:r>
@@ -26702,7 +26703,7 @@
         <w:spacing w:after="240" w:line="276" w:lineRule="auto"/>
       </w:pPr>
       <w:bookmarkStart w:id="212" w:name="_Toc241062338"/>
-      <w:bookmarkStart w:id="213" w:name="_Toc242140534"/>
+      <w:bookmarkStart w:id="213" w:name="_Toc242140934"/>
       <w:r>
         <w:t>7.4 Visibilidad algorítmica y consistencia estética</w:t>
       </w:r>
@@ -26724,7 +26725,7 @@
         <w:spacing w:after="240" w:line="276" w:lineRule="auto"/>
       </w:pPr>
       <w:bookmarkStart w:id="214" w:name="_Toc241062339"/>
-      <w:bookmarkStart w:id="215" w:name="_Toc242140535"/>
+      <w:bookmarkStart w:id="215" w:name="_Toc242140935"/>
       <w:r>
         <w:t>7.5 Frente al vacío tecnológico del Estado del Arte</w:t>
       </w:r>
@@ -26742,7 +26743,7 @@
         <w:spacing w:after="240" w:line="276" w:lineRule="auto"/>
       </w:pPr>
       <w:bookmarkStart w:id="216" w:name="_Toc241062340"/>
-      <w:bookmarkStart w:id="217" w:name="_Toc242140536"/>
+      <w:bookmarkStart w:id="217" w:name="_Toc242140936"/>
       <w:r>
         <w:t>7.6 Aporte original frente a integración de tecnologías existentes</w:t>
       </w:r>
@@ -26760,7 +26761,7 @@
         <w:spacing w:after="240" w:line="276" w:lineRule="auto"/>
       </w:pPr>
       <w:bookmarkStart w:id="218" w:name="_Toc241062341"/>
-      <w:bookmarkStart w:id="219" w:name="_Toc242140537"/>
+      <w:bookmarkStart w:id="219" w:name="_Toc242140937"/>
       <w:r>
         <w:t>7.7 Limitaciones de la evidencia</w:t>
       </w:r>
@@ -26802,7 +26803,7 @@
         <w:spacing w:after="240" w:line="276" w:lineRule="auto"/>
       </w:pPr>
       <w:bookmarkStart w:id="220" w:name="_Toc241062342"/>
-      <w:bookmarkStart w:id="221" w:name="_Toc242140538"/>
+      <w:bookmarkStart w:id="221" w:name="_Toc242140938"/>
       <w:r>
         <w:t>7.8 Transferibilidad</w:t>
       </w:r>
@@ -26828,7 +26829,7 @@
         <w:pStyle w:val="Heading1"/>
       </w:pPr>
       <w:bookmarkStart w:id="222" w:name="_Toc241062343"/>
-      <w:bookmarkStart w:id="223" w:name="_Toc242140539"/>
+      <w:bookmarkStart w:id="223" w:name="_Toc242140939"/>
       <w:r>
         <w:t>CAPÍTULO 8. CONCLUSIONES Y RECOMENDACIONES</w:t>
       </w:r>
@@ -26864,7 +26865,7 @@
         <w:spacing w:after="240" w:line="276" w:lineRule="auto"/>
       </w:pPr>
       <w:bookmarkStart w:id="224" w:name="_Toc241062344"/>
-      <w:bookmarkStart w:id="225" w:name="_Toc242140540"/>
+      <w:bookmarkStart w:id="225" w:name="_Toc242140940"/>
       <w:r>
         <w:t>8.1 Conclusiones Generales y Cumplimiento de Objetivos</w:t>
       </w:r>
@@ -27053,7 +27054,7 @@
         <w:spacing w:after="240" w:line="276" w:lineRule="auto"/>
       </w:pPr>
       <w:bookmarkStart w:id="226" w:name="_Toc241062345"/>
-      <w:bookmarkStart w:id="227" w:name="_Toc242140541"/>
+      <w:bookmarkStart w:id="227" w:name="_Toc242140941"/>
       <w:r>
         <w:t>8.2 Recomendaciones Priorizadas</w:t>
       </w:r>
@@ -27299,7 +27300,7 @@
         <w:pStyle w:val="Heading1"/>
       </w:pPr>
       <w:bookmarkStart w:id="228" w:name="_Toc241062346"/>
-      <w:bookmarkStart w:id="229" w:name="_Toc242140542"/>
+      <w:bookmarkStart w:id="229" w:name="_Toc242140942"/>
       <w:r>
         <w:t>CAPÍTULO 9. REFERENCIAS BIBLIOGRÁFICAS</w:t>
       </w:r>
@@ -30541,7 +30542,7 @@
         <w:pStyle w:val="Heading1"/>
       </w:pPr>
       <w:bookmarkStart w:id="231" w:name="_Toc241062347"/>
-      <w:bookmarkStart w:id="232" w:name="_Toc242140543"/>
+      <w:bookmarkStart w:id="232" w:name="_Toc242140943"/>
       <w:r>
         <w:t>CAPÍTULO 10. ANEXOS</w:t>
       </w:r>
@@ -30564,7 +30565,7 @@
         <w:pStyle w:val="Heading2"/>
       </w:pPr>
       <w:bookmarkStart w:id="233" w:name="_Toc241062348"/>
-      <w:bookmarkStart w:id="234" w:name="_Toc242140544"/>
+      <w:bookmarkStart w:id="234" w:name="_Toc242140944"/>
       <w:r>
         <w:lastRenderedPageBreak/>
         <w:t>Anexo A — Tabla de cumplimiento de Historias de Usuario</w:t>
@@ -30577,7 +30578,7 @@
         <w:pStyle w:val="Heading3"/>
       </w:pPr>
       <w:bookmarkStart w:id="235" w:name="_Toc241062349"/>
-      <w:bookmarkStart w:id="236" w:name="_Toc242140545"/>
+      <w:bookmarkStart w:id="236" w:name="_Toc242140945"/>
       <w:r>
         <w:t>A.1 Cumplimiento de las Historias de Usuario</w:t>
       </w:r>
@@ -30594,7 +30595,7 @@
       <w:pPr>
         <w:keepNext/>
       </w:pPr>
-      <w:bookmarkStart w:id="237" w:name="_Toc242140593"/>
+      <w:bookmarkStart w:id="237" w:name="_Toc242140993"/>
       <w:r>
         <w:rPr>
           <w:b/>
@@ -32318,7 +32319,7 @@
         <w:pStyle w:val="Heading3"/>
       </w:pPr>
       <w:bookmarkStart w:id="238" w:name="_Toc241062350"/>
-      <w:bookmarkStart w:id="239" w:name="_Toc242140546"/>
+      <w:bookmarkStart w:id="239" w:name="_Toc242140946"/>
       <w:r>
         <w:t>A.2 Cronología del desarrollo reconstruida del repositorio</w:t>
       </w:r>
@@ -32413,7 +32414,7 @@
         <w:pStyle w:val="Heading2"/>
       </w:pPr>
       <w:bookmarkStart w:id="240" w:name="_Toc241062351"/>
-      <w:bookmarkStart w:id="241" w:name="_Toc242140547"/>
+      <w:bookmarkStart w:id="241" w:name="_Toc242140947"/>
       <w:r>
         <w:t>Anexo B — Arquitectura técnica y decisiones de diseño</w:t>
       </w:r>
@@ -32432,7 +32433,7 @@
         <w:pStyle w:val="Heading3"/>
       </w:pPr>
       <w:bookmarkStart w:id="242" w:name="_Toc241062352"/>
-      <w:bookmarkStart w:id="243" w:name="_Toc242140548"/>
+      <w:bookmarkStart w:id="243" w:name="_Toc242140948"/>
       <w:r>
         <w:t>B.1 Infraestructura de despliegue</w:t>
       </w:r>
@@ -32479,10 +32480,7 @@
     </w:p>
     <w:p>
       <w:r>
-        <w:t>El 6 de octubre se repitió el video largo con un clip propio escalado a 1080 × 1920 y 60 s, sin publicar. Con 61 MB no llegó al sistema, porque la API de bots de Telegram no entrega archivos de más de 20 MB (ejecución 1241). Con 17,6 MB, el recorte con FFmpeg superó los 30 s y n8n lo abortó: el proceso que ejecuta los nodos de código debe responder dentro de ese plazo (ejecución 1244). Se amplió el plazo a 180 s en la configuración de E3, sin cambiar el workflow, y el flujo se completó en 91 s: 52 s de reco</w:t>
-      </w:r>
-      <w:r>
-        <w:t>rte, 23 s de detección visual y 13 s de generación de los copys (ejecución 1248). El contenedor del motor llegó a unos 1.200 MB y FFmpeg a 348 MB, y nunca quedaron menos de 380 MB libres.</w:t>
+        <w:t>El 6 de octubre se repitió el video largo con un clip propio escalado a 1080 × 1920 y 60 s, sin publicar. Con 61 MB no llegó al sistema, porque la API de bots de Telegram no entrega archivos de más de 20 MB (ejecución 1241). Con 17,6 MB, el recorte con FFmpeg superó los 30 s y n8n lo abortó: el proceso que ejecuta los nodos de código debe responder dentro de ese plazo (ejecución 1244). Se amplió el plazo a 180 s en la configuración de E3, sin cambiar el workflow, y el flujo se completó en 91 s: 52 s de recorte, 23 s de detección visual y 13 s de generación de los copys (ejecución 1248). El contenedor del motor llegó a unos 1.200 MB y FFmpeg a 348 MB, y nunca quedaron menos de 380 MB libres.</w:t>
       </w:r>
     </w:p>
     <w:p>
@@ -32500,7 +32498,7 @@
         <w:pStyle w:val="Heading3"/>
       </w:pPr>
       <w:bookmarkStart w:id="244" w:name="_Toc241062353"/>
-      <w:bookmarkStart w:id="245" w:name="_Toc242140549"/>
+      <w:bookmarkStart w:id="245" w:name="_Toc242140949"/>
       <w:r>
         <w:t>B.2 Inventario de workflows y su función</w:t>
       </w:r>
@@ -32672,7 +32670,7 @@
           <w:sz w:val="20"/>
         </w:rPr>
       </w:pPr>
-      <w:bookmarkStart w:id="246" w:name="_Toc242140617"/>
+      <w:bookmarkStart w:id="246" w:name="_Toc242141017"/>
       <w:r>
         <w:rPr>
           <w:i/>
@@ -32792,7 +32790,7 @@
         <w:pStyle w:val="Heading3"/>
       </w:pPr>
       <w:bookmarkStart w:id="247" w:name="_Toc241062354"/>
-      <w:bookmarkStart w:id="248" w:name="_Toc242140550"/>
+      <w:bookmarkStart w:id="248" w:name="_Toc242140950"/>
       <w:r>
         <w:t>B.3 Seguridad de credenciales</w:t>
       </w:r>
@@ -32813,7 +32811,7 @@
         <w:pStyle w:val="Heading3"/>
       </w:pPr>
       <w:bookmarkStart w:id="249" w:name="_Toc241062355"/>
-      <w:bookmarkStart w:id="250" w:name="_Toc242140551"/>
+      <w:bookmarkStart w:id="250" w:name="_Toc242140951"/>
       <w:r>
         <w:t>B.4 Módulo Centinela de Compliance: implementación</w:t>
       </w:r>
@@ -32876,7 +32874,7 @@
         <w:pStyle w:val="Heading3"/>
       </w:pPr>
       <w:bookmarkStart w:id="251" w:name="_Toc241062356"/>
-      <w:bookmarkStart w:id="252" w:name="_Toc242140552"/>
+      <w:bookmarkStart w:id="252" w:name="_Toc242140952"/>
       <w:r>
         <w:t>B.5 Concurrencia en la ingesta de carruseles</w:t>
       </w:r>
@@ -32893,7 +32891,7 @@
         <w:pStyle w:val="Heading3"/>
       </w:pPr>
       <w:bookmarkStart w:id="253" w:name="_Toc241062357"/>
-      <w:bookmarkStart w:id="254" w:name="_Toc242140553"/>
+      <w:bookmarkStart w:id="254" w:name="_Toc242140953"/>
       <w:r>
         <w:t>B.6 Prevención de publicaciones duplicadas</w:t>
       </w:r>
@@ -32916,7 +32914,7 @@
         <w:pStyle w:val="Heading3"/>
       </w:pPr>
       <w:bookmarkStart w:id="255" w:name="_Toc241062358"/>
-      <w:bookmarkStart w:id="256" w:name="_Toc242140554"/>
+      <w:bookmarkStart w:id="256" w:name="_Toc242140954"/>
       <w:r>
         <w:t>B.7 Publicación multiplataforma: extensión a Facebook</w:t>
       </w:r>
@@ -32933,7 +32931,7 @@
         <w:pStyle w:val="Heading3"/>
       </w:pPr>
       <w:bookmarkStart w:id="257" w:name="_Toc241062359"/>
-      <w:bookmarkStart w:id="258" w:name="_Toc242140555"/>
+      <w:bookmarkStart w:id="258" w:name="_Toc242140955"/>
       <w:r>
         <w:t>B.8 Sincronización de estado con Instagram</w:t>
       </w:r>
@@ -32950,7 +32948,7 @@
         <w:pStyle w:val="Heading3"/>
       </w:pPr>
       <w:bookmarkStart w:id="259" w:name="_Toc241062360"/>
-      <w:bookmarkStart w:id="260" w:name="_Toc242140556"/>
+      <w:bookmarkStart w:id="260" w:name="_Toc242140956"/>
       <w:r>
         <w:t>B.9 Procesamiento de video (HU13): detalle de implementación</w:t>
       </w:r>
@@ -32972,7 +32970,7 @@
         <w:pStyle w:val="Heading2"/>
       </w:pPr>
       <w:bookmarkStart w:id="261" w:name="_Toc241062361"/>
-      <w:bookmarkStart w:id="262" w:name="_Toc242140557"/>
+      <w:bookmarkStart w:id="262" w:name="_Toc242140957"/>
       <w:r>
         <w:t>Anexo C — Lecciones aprendidas y desafíos técnicos</w:t>
       </w:r>
@@ -32991,7 +32989,7 @@
         <w:pStyle w:val="Heading3"/>
       </w:pPr>
       <w:bookmarkStart w:id="263" w:name="_Toc241062362"/>
-      <w:bookmarkStart w:id="264" w:name="_Toc242140558"/>
+      <w:bookmarkStart w:id="264" w:name="_Toc242140958"/>
       <w:r>
         <w:t>C.1 Restricciones de infraestructura: el problema de las tarjetas virtuales</w:t>
       </w:r>
@@ -33008,7 +33006,7 @@
         <w:pStyle w:val="Heading3"/>
       </w:pPr>
       <w:bookmarkStart w:id="265" w:name="_Toc241062363"/>
-      <w:bookmarkStart w:id="266" w:name="_Toc242140559"/>
+      <w:bookmarkStart w:id="266" w:name="_Toc242140959"/>
       <w:r>
         <w:t>C.2 Concurrencia en flujos disparados por eventos externos</w:t>
       </w:r>
@@ -33025,7 +33023,7 @@
         <w:pStyle w:val="Heading3"/>
       </w:pPr>
       <w:bookmarkStart w:id="267" w:name="_Toc241062364"/>
-      <w:bookmarkStart w:id="268" w:name="_Toc242140560"/>
+      <w:bookmarkStart w:id="268" w:name="_Toc242140960"/>
       <w:r>
         <w:lastRenderedPageBreak/>
         <w:t>C.3 Integridad de datos al editar el sistema por su propia API</w:t>
@@ -33043,7 +33041,7 @@
         <w:pStyle w:val="Heading3"/>
       </w:pPr>
       <w:bookmarkStart w:id="269" w:name="_Toc241062365"/>
-      <w:bookmarkStart w:id="270" w:name="_Toc242140561"/>
+      <w:bookmarkStart w:id="270" w:name="_Toc242140961"/>
       <w:r>
         <w:t>C.4 Regresiones de plataforma en la migración al servidor propio</w:t>
       </w:r>
@@ -33060,7 +33058,7 @@
         <w:pStyle w:val="Heading3"/>
       </w:pPr>
       <w:bookmarkStart w:id="271" w:name="_Toc241062366"/>
-      <w:bookmarkStart w:id="272" w:name="_Toc242140562"/>
+      <w:bookmarkStart w:id="272" w:name="_Toc242140962"/>
       <w:r>
         <w:t>C.5 Restricciones del entorno de ejecución para el procesamiento de video</w:t>
       </w:r>
@@ -33077,7 +33075,7 @@
         <w:pStyle w:val="Heading3"/>
       </w:pPr>
       <w:bookmarkStart w:id="273" w:name="_Toc241062367"/>
-      <w:bookmarkStart w:id="274" w:name="_Toc242140563"/>
+      <w:bookmarkStart w:id="274" w:name="_Toc242140963"/>
       <w:r>
         <w:t>C.6 Integración con servicios externos: formatos de envío no documentados con claridad</w:t>
       </w:r>
@@ -33094,7 +33092,7 @@
         <w:pStyle w:val="Heading3"/>
       </w:pPr>
       <w:bookmarkStart w:id="275" w:name="_Toc241062368"/>
-      <w:bookmarkStart w:id="276" w:name="_Toc242140564"/>
+      <w:bookmarkStart w:id="276" w:name="_Toc242140964"/>
       <w:r>
         <w:t>C.7 Errores intermitentes en APIs de terceros</w:t>
       </w:r>
@@ -33111,7 +33109,7 @@
         <w:pStyle w:val="Heading3"/>
       </w:pPr>
       <w:bookmarkStart w:id="277" w:name="_Toc241062369"/>
-      <w:bookmarkStart w:id="278" w:name="_Toc242140565"/>
+      <w:bookmarkStart w:id="278" w:name="_Toc242140965"/>
       <w:r>
         <w:lastRenderedPageBreak/>
         <w:t>C.8 Límites de cuota en servicios de IA gratuitos</w:t>
@@ -33128,7 +33126,7 @@
       <w:pPr>
         <w:pStyle w:val="Heading3"/>
       </w:pPr>
-      <w:bookmarkStart w:id="279" w:name="_Toc242140566"/>
+      <w:bookmarkStart w:id="279" w:name="_Toc242140966"/>
       <w:r>
         <w:t>C.9 Cuota de lecturas de Google Sheets al programar</w:t>
       </w:r>
@@ -33145,7 +33143,7 @@
         <w:pStyle w:val="Heading2"/>
       </w:pPr>
       <w:bookmarkStart w:id="280" w:name="_Toc241062370"/>
-      <w:bookmarkStart w:id="281" w:name="_Toc242140567"/>
+      <w:bookmarkStart w:id="281" w:name="_Toc242140967"/>
       <w:r>
         <w:t>Anexo D — Pautas Mary Kay para el uso en los medios sociales</w:t>
       </w:r>
@@ -33247,7 +33245,7 @@
         <w:pStyle w:val="Heading2"/>
       </w:pPr>
       <w:bookmarkStart w:id="282" w:name="_Toc241062371"/>
-      <w:bookmarkStart w:id="283" w:name="_Toc242140568"/>
+      <w:bookmarkStart w:id="283" w:name="_Toc242140968"/>
       <w:r>
         <w:t>Anexo E — Protocolo de validación empírica y conjuntos de datos</w:t>
       </w:r>
@@ -33267,7 +33265,7 @@
         <w:pStyle w:val="Heading3"/>
       </w:pPr>
       <w:bookmarkStart w:id="284" w:name="_Toc241062372"/>
-      <w:bookmarkStart w:id="285" w:name="_Toc242140569"/>
+      <w:bookmarkStart w:id="285" w:name="_Toc242140969"/>
       <w:r>
         <w:t>E.1 Validación del Módulo Centinela de Compliance</w:t>
       </w:r>
@@ -33391,7 +33389,7 @@
       <w:pPr>
         <w:keepNext/>
       </w:pPr>
-      <w:bookmarkStart w:id="286" w:name="_Toc242140594"/>
+      <w:bookmarkStart w:id="286" w:name="_Toc242140994"/>
       <w:r>
         <w:rPr>
           <w:b/>
@@ -35892,7 +35890,7 @@
         <w:pStyle w:val="Heading3"/>
       </w:pPr>
       <w:bookmarkStart w:id="287" w:name="_Toc241062373"/>
-      <w:bookmarkStart w:id="288" w:name="_Toc242140570"/>
+      <w:bookmarkStart w:id="288" w:name="_Toc242140970"/>
       <w:r>
         <w:lastRenderedPageBreak/>
         <w:t>E.2 Protocolo de cronometraje del tiempo operativo</w:t>
@@ -35997,7 +35995,7 @@
         <w:pStyle w:val="Heading3"/>
       </w:pPr>
       <w:bookmarkStart w:id="289" w:name="_Toc241062374"/>
-      <w:bookmarkStart w:id="290" w:name="_Toc242140571"/>
+      <w:bookmarkStart w:id="290" w:name="_Toc242140971"/>
       <w:r>
         <w:t>E.3 Cuestionario de aceptación tecnológica (TAM)</w:t>
       </w:r>
@@ -36029,7 +36027,7 @@
         <w:pStyle w:val="Heading3"/>
       </w:pPr>
       <w:bookmarkStart w:id="291" w:name="_Toc241062375"/>
-      <w:bookmarkStart w:id="292" w:name="_Toc242140572"/>
+      <w:bookmarkStart w:id="292" w:name="_Toc242140972"/>
       <w:r>
         <w:t>E.4 Reproducibilidad de los análisis</w:t>
       </w:r>
@@ -36117,7 +36115,7 @@
         <w:pStyle w:val="Heading3"/>
       </w:pPr>
       <w:bookmarkStart w:id="293" w:name="_Toc241062376"/>
-      <w:bookmarkStart w:id="294" w:name="_Toc242140573"/>
+      <w:bookmarkStart w:id="294" w:name="_Toc242140973"/>
       <w:r>
         <w:t>E.5 Baterías de validación técnica</w:t>
       </w:r>
@@ -36148,7 +36146,7 @@
       <w:pPr>
         <w:keepNext/>
       </w:pPr>
-      <w:bookmarkStart w:id="295" w:name="_Toc242140595"/>
+      <w:bookmarkStart w:id="295" w:name="_Toc242140995"/>
       <w:r>
         <w:t xml:space="preserve">Tabla </w:t>
       </w:r>
@@ -37021,7 +37019,7 @@
         <w:pStyle w:val="Heading3"/>
       </w:pPr>
       <w:bookmarkStart w:id="296" w:name="_Toc241062377"/>
-      <w:bookmarkStart w:id="297" w:name="_Toc242140574"/>
+      <w:bookmarkStart w:id="297" w:name="_Toc242140974"/>
       <w:r>
         <w:t>E.6 Conjunto ampliado del canal de imagen (HU8)</w:t>
       </w:r>
@@ -37108,7 +37106,7 @@
       <w:pPr>
         <w:keepNext/>
       </w:pPr>
-      <w:bookmarkStart w:id="298" w:name="_Toc242140596"/>
+      <w:bookmarkStart w:id="298" w:name="_Toc242140996"/>
       <w:r>
         <w:t xml:space="preserve">Tabla </w:t>
       </w:r>
@@ -37339,7 +37337,7 @@
         <w:pStyle w:val="Heading3"/>
       </w:pPr>
       <w:bookmarkStart w:id="299" w:name="_Toc241062378"/>
-      <w:bookmarkStart w:id="300" w:name="_Toc242140575"/>
+      <w:bookmarkStart w:id="300" w:name="_Toc242140975"/>
       <w:r>
         <w:t>E.7 Verificación de los umbrales de las Historias de Usuario</w:t>
       </w:r>
@@ -37375,7 +37373,7 @@
       <w:pPr>
         <w:keepNext/>
       </w:pPr>
-      <w:bookmarkStart w:id="301" w:name="_Toc242140597"/>
+      <w:bookmarkStart w:id="301" w:name="_Toc242140997"/>
       <w:r>
         <w:t xml:space="preserve">Tabla </w:t>
       </w:r>
@@ -38578,7 +38576,7 @@
         <w:pStyle w:val="Heading3"/>
       </w:pPr>
       <w:bookmarkStart w:id="302" w:name="_Toc241062379"/>
-      <w:bookmarkStart w:id="303" w:name="_Toc242140576"/>
+      <w:bookmarkStart w:id="303" w:name="_Toc242140976"/>
       <w:r>
         <w:t>E.8 Casos difíciles del canal de imagen y variabilidad entre corridas</w:t>
       </w:r>
@@ -38628,7 +38626,7 @@
       <w:pPr>
         <w:keepNext/>
       </w:pPr>
-      <w:bookmarkStart w:id="304" w:name="_Toc242140598"/>
+      <w:bookmarkStart w:id="304" w:name="_Toc242140998"/>
       <w:r>
         <w:t xml:space="preserve">Tabla </w:t>
       </w:r>
@@ -38843,7 +38841,7 @@
         <w:pStyle w:val="Heading3"/>
       </w:pPr>
       <w:bookmarkStart w:id="305" w:name="_Toc241062380"/>
-      <w:bookmarkStart w:id="306" w:name="_Toc242140577"/>
+      <w:bookmarkStart w:id="306" w:name="_Toc242140977"/>
       <w:r>
         <w:t>E.9 Casos de video del canal visual (HU13)</w:t>
       </w:r>
@@ -38894,7 +38892,7 @@
         <w:pStyle w:val="Heading3"/>
       </w:pPr>
       <w:bookmarkStart w:id="307" w:name="_Toc241062381"/>
-      <w:bookmarkStart w:id="308" w:name="_Toc242140578"/>
+      <w:bookmarkStart w:id="308" w:name="_Toc242140978"/>
       <w:r>
         <w:t>E.10 Caso de carrusel del canal visual (HU5)</w:t>
       </w:r>
@@ -38945,7 +38943,7 @@
         <w:pStyle w:val="Heading3"/>
       </w:pPr>
       <w:bookmarkStart w:id="309" w:name="_Toc241062382"/>
-      <w:bookmarkStart w:id="310" w:name="_Toc242140579"/>
+      <w:bookmarkStart w:id="310" w:name="_Toc242140979"/>
       <w:r>
         <w:t>E.11 Caso de re-publicación del canal visual (HU12)</w:t>
       </w:r>
@@ -38996,7 +38994,7 @@
         <w:pStyle w:val="Heading3"/>
       </w:pPr>
       <w:bookmarkStart w:id="311" w:name="_Toc241062383"/>
-      <w:bookmarkStart w:id="312" w:name="_Toc242140580"/>
+      <w:bookmarkStart w:id="312" w:name="_Toc242140980"/>
       <w:r>
         <w:t>E.12 Gobierno del llamado a la acción generado</w:t>
       </w:r>
@@ -39047,7 +39045,7 @@
         <w:pStyle w:val="Heading3"/>
       </w:pPr>
       <w:bookmarkStart w:id="313" w:name="_Toc241062384"/>
-      <w:bookmarkStart w:id="314" w:name="_Toc242140581"/>
+      <w:bookmarkStart w:id="314" w:name="_Toc242140981"/>
       <w:r>
         <w:t>E.13 Trazabilidad de los Objetivos Específicos</w:t>
       </w:r>
@@ -39066,7 +39064,7 @@
       <w:pPr>
         <w:keepNext/>
       </w:pPr>
-      <w:bookmarkStart w:id="315" w:name="_Toc242140599"/>
+      <w:bookmarkStart w:id="315" w:name="_Toc242140999"/>
       <w:r>
         <w:t xml:space="preserve">Tabla </w:t>
       </w:r>
@@ -39628,7 +39626,7 @@
       <w:pPr>
         <w:pStyle w:val="Heading3"/>
       </w:pPr>
-      <w:bookmarkStart w:id="316" w:name="_Toc242140582"/>
+      <w:bookmarkStart w:id="316" w:name="_Toc242140982"/>
       <w:r>
         <w:lastRenderedPageBreak/>
         <w:t>E.14 Objetivo Específico 2 — calidad del copy y comparación con el trabajo manual</w:t>
@@ -39798,7 +39796,7 @@
       <w:pPr>
         <w:pStyle w:val="Heading3"/>
       </w:pPr>
-      <w:bookmarkStart w:id="317" w:name="_Toc242140583"/>
+      <w:bookmarkStart w:id="317" w:name="_Toc242140983"/>
       <w:r>
         <w:t>E.15 Trazabilidad entre versiones del sistema y mediciones</w:t>
       </w:r>
@@ -39813,7 +39811,7 @@
       <w:pPr>
         <w:keepNext/>
       </w:pPr>
-      <w:bookmarkStart w:id="318" w:name="_Toc242140600"/>
+      <w:bookmarkStart w:id="318" w:name="_Toc242141000"/>
       <w:r>
         <w:t xml:space="preserve">Tabla </w:t>
       </w:r>
@@ -40358,7 +40356,7 @@
       <w:pPr>
         <w:pStyle w:val="Heading3"/>
       </w:pPr>
-      <w:bookmarkStart w:id="319" w:name="_Toc242140584"/>
+      <w:bookmarkStart w:id="319" w:name="_Toc242140984"/>
       <w:r>
         <w:t>E.16 Inventario del material complementario</w:t>
       </w:r>
@@ -40373,7 +40371,7 @@
       <w:pPr>
         <w:keepNext/>
       </w:pPr>
-      <w:bookmarkStart w:id="320" w:name="_Toc242140601"/>
+      <w:bookmarkStart w:id="320" w:name="_Toc242141001"/>
       <w:r>
         <w:t xml:space="preserve">Tabla </w:t>
       </w:r>

</xml_diff>

<commit_message>
docs(tesis): pasada 244, auditoria 19 (U-01): 3.7.6 describe los consentimientos como son: los nueve firmados a mano en papel el 6 de octubre y escaneados; la tercera evaluadora y la consultora de la vinculacion firmaron al dia siguiente de participar (declarado como carencia, ahora cuatro); el de videos de C2 ya no se fecha el 5 de octubre
Co-Authored-By: Claude Opus 5.5 <noreply@anthropic.com>
</commit_message>
<xml_diff>
--- a/avance/Tesis Postly Bontorno Hassan-1 v2.docx
+++ b/avance/Tesis Postly Bontorno Hassan-1 v2.docx
@@ -316,7 +316,7 @@
       <w:r>
         <w:fldChar w:fldCharType="separate"/>
       </w:r>
-      <w:hyperlink w:anchor="_Toc242142785" w:history="1">
+      <w:hyperlink w:anchor="_Toc242180526" w:history="1">
         <w:r>
           <w:rPr>
             <w:rStyle w:val="Hyperlink"/>
@@ -339,7 +339,7 @@
           <w:rPr>
             <w:webHidden/>
           </w:rPr>
-          <w:instrText xml:space="preserve"> PAGEREF _Toc242142785 \h </w:instrText>
+          <w:instrText xml:space="preserve"> PAGEREF _Toc242180526 \h </w:instrText>
         </w:r>
         <w:r>
           <w:rPr>
@@ -378,7 +378,7 @@
           <w14:ligatures w14:val="standardContextual"/>
         </w:rPr>
       </w:pPr>
-      <w:hyperlink w:anchor="_Toc242142786" w:history="1">
+      <w:hyperlink w:anchor="_Toc242180527" w:history="1">
         <w:r>
           <w:rPr>
             <w:rStyle w:val="Hyperlink"/>
@@ -401,7 +401,7 @@
           <w:rPr>
             <w:webHidden/>
           </w:rPr>
-          <w:instrText xml:space="preserve"> PAGEREF _Toc242142786 \h </w:instrText>
+          <w:instrText xml:space="preserve"> PAGEREF _Toc242180527 \h </w:instrText>
         </w:r>
         <w:r>
           <w:rPr>
@@ -442,7 +442,7 @@
           <w14:ligatures w14:val="standardContextual"/>
         </w:rPr>
       </w:pPr>
-      <w:hyperlink w:anchor="_Toc242142787" w:history="1">
+      <w:hyperlink w:anchor="_Toc242180528" w:history="1">
         <w:r>
           <w:rPr>
             <w:rStyle w:val="Hyperlink"/>
@@ -469,7 +469,7 @@
             <w:noProof/>
             <w:webHidden/>
           </w:rPr>
-          <w:instrText xml:space="preserve"> PAGEREF _Toc242142787 \h </w:instrText>
+          <w:instrText xml:space="preserve"> PAGEREF _Toc242180528 \h </w:instrText>
         </w:r>
         <w:r>
           <w:rPr>
@@ -514,7 +514,7 @@
           <w14:ligatures w14:val="standardContextual"/>
         </w:rPr>
       </w:pPr>
-      <w:hyperlink w:anchor="_Toc242142788" w:history="1">
+      <w:hyperlink w:anchor="_Toc242180529" w:history="1">
         <w:r>
           <w:rPr>
             <w:rStyle w:val="Hyperlink"/>
@@ -541,7 +541,7 @@
             <w:noProof/>
             <w:webHidden/>
           </w:rPr>
-          <w:instrText xml:space="preserve"> PAGEREF _Toc242142788 \h </w:instrText>
+          <w:instrText xml:space="preserve"> PAGEREF _Toc242180529 \h </w:instrText>
         </w:r>
         <w:r>
           <w:rPr>
@@ -586,7 +586,7 @@
           <w14:ligatures w14:val="standardContextual"/>
         </w:rPr>
       </w:pPr>
-      <w:hyperlink w:anchor="_Toc242142789" w:history="1">
+      <w:hyperlink w:anchor="_Toc242180530" w:history="1">
         <w:r>
           <w:rPr>
             <w:rStyle w:val="Hyperlink"/>
@@ -613,7 +613,7 @@
             <w:noProof/>
             <w:webHidden/>
           </w:rPr>
-          <w:instrText xml:space="preserve"> PAGEREF _Toc242142789 \h </w:instrText>
+          <w:instrText xml:space="preserve"> PAGEREF _Toc242180530 \h </w:instrText>
         </w:r>
         <w:r>
           <w:rPr>
@@ -658,7 +658,7 @@
           <w14:ligatures w14:val="standardContextual"/>
         </w:rPr>
       </w:pPr>
-      <w:hyperlink w:anchor="_Toc242142790" w:history="1">
+      <w:hyperlink w:anchor="_Toc242180531" w:history="1">
         <w:r>
           <w:rPr>
             <w:rStyle w:val="Hyperlink"/>
@@ -685,7 +685,7 @@
             <w:noProof/>
             <w:webHidden/>
           </w:rPr>
-          <w:instrText xml:space="preserve"> PAGEREF _Toc242142790 \h </w:instrText>
+          <w:instrText xml:space="preserve"> PAGEREF _Toc242180531 \h </w:instrText>
         </w:r>
         <w:r>
           <w:rPr>
@@ -730,7 +730,7 @@
           <w14:ligatures w14:val="standardContextual"/>
         </w:rPr>
       </w:pPr>
-      <w:hyperlink w:anchor="_Toc242142791" w:history="1">
+      <w:hyperlink w:anchor="_Toc242180532" w:history="1">
         <w:r>
           <w:rPr>
             <w:rStyle w:val="Hyperlink"/>
@@ -757,7 +757,7 @@
             <w:noProof/>
             <w:webHidden/>
           </w:rPr>
-          <w:instrText xml:space="preserve"> PAGEREF _Toc242142791 \h </w:instrText>
+          <w:instrText xml:space="preserve"> PAGEREF _Toc242180532 \h </w:instrText>
         </w:r>
         <w:r>
           <w:rPr>
@@ -802,7 +802,7 @@
           <w14:ligatures w14:val="standardContextual"/>
         </w:rPr>
       </w:pPr>
-      <w:hyperlink w:anchor="_Toc242142792" w:history="1">
+      <w:hyperlink w:anchor="_Toc242180533" w:history="1">
         <w:r>
           <w:rPr>
             <w:rStyle w:val="Hyperlink"/>
@@ -829,7 +829,7 @@
             <w:noProof/>
             <w:webHidden/>
           </w:rPr>
-          <w:instrText xml:space="preserve"> PAGEREF _Toc242142792 \h </w:instrText>
+          <w:instrText xml:space="preserve"> PAGEREF _Toc242180533 \h </w:instrText>
         </w:r>
         <w:r>
           <w:rPr>
@@ -874,7 +874,7 @@
           <w14:ligatures w14:val="standardContextual"/>
         </w:rPr>
       </w:pPr>
-      <w:hyperlink w:anchor="_Toc242142793" w:history="1">
+      <w:hyperlink w:anchor="_Toc242180534" w:history="1">
         <w:r>
           <w:rPr>
             <w:rStyle w:val="Hyperlink"/>
@@ -901,7 +901,7 @@
             <w:noProof/>
             <w:webHidden/>
           </w:rPr>
-          <w:instrText xml:space="preserve"> PAGEREF _Toc242142793 \h </w:instrText>
+          <w:instrText xml:space="preserve"> PAGEREF _Toc242180534 \h </w:instrText>
         </w:r>
         <w:r>
           <w:rPr>
@@ -946,7 +946,7 @@
           <w14:ligatures w14:val="standardContextual"/>
         </w:rPr>
       </w:pPr>
-      <w:hyperlink w:anchor="_Toc242142794" w:history="1">
+      <w:hyperlink w:anchor="_Toc242180535" w:history="1">
         <w:r>
           <w:rPr>
             <w:rStyle w:val="Hyperlink"/>
@@ -973,7 +973,7 @@
             <w:noProof/>
             <w:webHidden/>
           </w:rPr>
-          <w:instrText xml:space="preserve"> PAGEREF _Toc242142794 \h </w:instrText>
+          <w:instrText xml:space="preserve"> PAGEREF _Toc242180535 \h </w:instrText>
         </w:r>
         <w:r>
           <w:rPr>
@@ -1018,7 +1018,7 @@
           <w14:ligatures w14:val="standardContextual"/>
         </w:rPr>
       </w:pPr>
-      <w:hyperlink w:anchor="_Toc242142795" w:history="1">
+      <w:hyperlink w:anchor="_Toc242180536" w:history="1">
         <w:r>
           <w:rPr>
             <w:rStyle w:val="Hyperlink"/>
@@ -1045,7 +1045,7 @@
             <w:noProof/>
             <w:webHidden/>
           </w:rPr>
-          <w:instrText xml:space="preserve"> PAGEREF _Toc242142795 \h </w:instrText>
+          <w:instrText xml:space="preserve"> PAGEREF _Toc242180536 \h </w:instrText>
         </w:r>
         <w:r>
           <w:rPr>
@@ -1090,7 +1090,7 @@
           <w14:ligatures w14:val="standardContextual"/>
         </w:rPr>
       </w:pPr>
-      <w:hyperlink w:anchor="_Toc242142796" w:history="1">
+      <w:hyperlink w:anchor="_Toc242180537" w:history="1">
         <w:r>
           <w:rPr>
             <w:rStyle w:val="Hyperlink"/>
@@ -1117,7 +1117,7 @@
             <w:noProof/>
             <w:webHidden/>
           </w:rPr>
-          <w:instrText xml:space="preserve"> PAGEREF _Toc242142796 \h </w:instrText>
+          <w:instrText xml:space="preserve"> PAGEREF _Toc242180537 \h </w:instrText>
         </w:r>
         <w:r>
           <w:rPr>
@@ -1162,7 +1162,7 @@
           <w14:ligatures w14:val="standardContextual"/>
         </w:rPr>
       </w:pPr>
-      <w:hyperlink w:anchor="_Toc242142797" w:history="1">
+      <w:hyperlink w:anchor="_Toc242180538" w:history="1">
         <w:r>
           <w:rPr>
             <w:rStyle w:val="Hyperlink"/>
@@ -1189,7 +1189,7 @@
             <w:noProof/>
             <w:webHidden/>
           </w:rPr>
-          <w:instrText xml:space="preserve"> PAGEREF _Toc242142797 \h </w:instrText>
+          <w:instrText xml:space="preserve"> PAGEREF _Toc242180538 \h </w:instrText>
         </w:r>
         <w:r>
           <w:rPr>
@@ -1234,7 +1234,7 @@
           <w14:ligatures w14:val="standardContextual"/>
         </w:rPr>
       </w:pPr>
-      <w:hyperlink w:anchor="_Toc242142798" w:history="1">
+      <w:hyperlink w:anchor="_Toc242180539" w:history="1">
         <w:r>
           <w:rPr>
             <w:rStyle w:val="Hyperlink"/>
@@ -1261,7 +1261,7 @@
             <w:noProof/>
             <w:webHidden/>
           </w:rPr>
-          <w:instrText xml:space="preserve"> PAGEREF _Toc242142798 \h </w:instrText>
+          <w:instrText xml:space="preserve"> PAGEREF _Toc242180539 \h </w:instrText>
         </w:r>
         <w:r>
           <w:rPr>
@@ -1306,7 +1306,7 @@
           <w14:ligatures w14:val="standardContextual"/>
         </w:rPr>
       </w:pPr>
-      <w:hyperlink w:anchor="_Toc242142799" w:history="1">
+      <w:hyperlink w:anchor="_Toc242180540" w:history="1">
         <w:r>
           <w:rPr>
             <w:rStyle w:val="Hyperlink"/>
@@ -1333,7 +1333,7 @@
             <w:noProof/>
             <w:webHidden/>
           </w:rPr>
-          <w:instrText xml:space="preserve"> PAGEREF _Toc242142799 \h </w:instrText>
+          <w:instrText xml:space="preserve"> PAGEREF _Toc242180540 \h </w:instrText>
         </w:r>
         <w:r>
           <w:rPr>
@@ -1378,7 +1378,7 @@
           <w14:ligatures w14:val="standardContextual"/>
         </w:rPr>
       </w:pPr>
-      <w:hyperlink w:anchor="_Toc242142800" w:history="1">
+      <w:hyperlink w:anchor="_Toc242180541" w:history="1">
         <w:r>
           <w:rPr>
             <w:rStyle w:val="Hyperlink"/>
@@ -1405,7 +1405,7 @@
             <w:noProof/>
             <w:webHidden/>
           </w:rPr>
-          <w:instrText xml:space="preserve"> PAGEREF _Toc242142800 \h </w:instrText>
+          <w:instrText xml:space="preserve"> PAGEREF _Toc242180541 \h </w:instrText>
         </w:r>
         <w:r>
           <w:rPr>
@@ -1448,7 +1448,7 @@
           <w14:ligatures w14:val="standardContextual"/>
         </w:rPr>
       </w:pPr>
-      <w:hyperlink w:anchor="_Toc242142801" w:history="1">
+      <w:hyperlink w:anchor="_Toc242180542" w:history="1">
         <w:r>
           <w:rPr>
             <w:rStyle w:val="Hyperlink"/>
@@ -1471,7 +1471,7 @@
           <w:rPr>
             <w:webHidden/>
           </w:rPr>
-          <w:instrText xml:space="preserve"> PAGEREF _Toc242142801 \h </w:instrText>
+          <w:instrText xml:space="preserve"> PAGEREF _Toc242180542 \h </w:instrText>
         </w:r>
         <w:r>
           <w:rPr>
@@ -1512,7 +1512,7 @@
           <w14:ligatures w14:val="standardContextual"/>
         </w:rPr>
       </w:pPr>
-      <w:hyperlink w:anchor="_Toc242142802" w:history="1">
+      <w:hyperlink w:anchor="_Toc242180543" w:history="1">
         <w:r>
           <w:rPr>
             <w:rStyle w:val="Hyperlink"/>
@@ -1539,7 +1539,7 @@
             <w:noProof/>
             <w:webHidden/>
           </w:rPr>
-          <w:instrText xml:space="preserve"> PAGEREF _Toc242142802 \h </w:instrText>
+          <w:instrText xml:space="preserve"> PAGEREF _Toc242180543 \h </w:instrText>
         </w:r>
         <w:r>
           <w:rPr>
@@ -1584,7 +1584,7 @@
           <w14:ligatures w14:val="standardContextual"/>
         </w:rPr>
       </w:pPr>
-      <w:hyperlink w:anchor="_Toc242142803" w:history="1">
+      <w:hyperlink w:anchor="_Toc242180544" w:history="1">
         <w:r>
           <w:rPr>
             <w:rStyle w:val="Hyperlink"/>
@@ -1611,7 +1611,7 @@
             <w:noProof/>
             <w:webHidden/>
           </w:rPr>
-          <w:instrText xml:space="preserve"> PAGEREF _Toc242142803 \h </w:instrText>
+          <w:instrText xml:space="preserve"> PAGEREF _Toc242180544 \h </w:instrText>
         </w:r>
         <w:r>
           <w:rPr>
@@ -1656,7 +1656,7 @@
           <w14:ligatures w14:val="standardContextual"/>
         </w:rPr>
       </w:pPr>
-      <w:hyperlink w:anchor="_Toc242142804" w:history="1">
+      <w:hyperlink w:anchor="_Toc242180545" w:history="1">
         <w:r>
           <w:rPr>
             <w:rStyle w:val="Hyperlink"/>
@@ -1683,7 +1683,7 @@
             <w:noProof/>
             <w:webHidden/>
           </w:rPr>
-          <w:instrText xml:space="preserve"> PAGEREF _Toc242142804 \h </w:instrText>
+          <w:instrText xml:space="preserve"> PAGEREF _Toc242180545 \h </w:instrText>
         </w:r>
         <w:r>
           <w:rPr>
@@ -1728,7 +1728,7 @@
           <w14:ligatures w14:val="standardContextual"/>
         </w:rPr>
       </w:pPr>
-      <w:hyperlink w:anchor="_Toc242142805" w:history="1">
+      <w:hyperlink w:anchor="_Toc242180546" w:history="1">
         <w:r>
           <w:rPr>
             <w:rStyle w:val="Hyperlink"/>
@@ -1755,7 +1755,7 @@
             <w:noProof/>
             <w:webHidden/>
           </w:rPr>
-          <w:instrText xml:space="preserve"> PAGEREF _Toc242142805 \h </w:instrText>
+          <w:instrText xml:space="preserve"> PAGEREF _Toc242180546 \h </w:instrText>
         </w:r>
         <w:r>
           <w:rPr>
@@ -1798,7 +1798,7 @@
           <w14:ligatures w14:val="standardContextual"/>
         </w:rPr>
       </w:pPr>
-      <w:hyperlink w:anchor="_Toc242142806" w:history="1">
+      <w:hyperlink w:anchor="_Toc242180547" w:history="1">
         <w:r>
           <w:rPr>
             <w:rStyle w:val="Hyperlink"/>
@@ -1821,7 +1821,7 @@
           <w:rPr>
             <w:webHidden/>
           </w:rPr>
-          <w:instrText xml:space="preserve"> PAGEREF _Toc242142806 \h </w:instrText>
+          <w:instrText xml:space="preserve"> PAGEREF _Toc242180547 \h </w:instrText>
         </w:r>
         <w:r>
           <w:rPr>
@@ -1862,7 +1862,7 @@
           <w14:ligatures w14:val="standardContextual"/>
         </w:rPr>
       </w:pPr>
-      <w:hyperlink w:anchor="_Toc242142807" w:history="1">
+      <w:hyperlink w:anchor="_Toc242180548" w:history="1">
         <w:r>
           <w:rPr>
             <w:rStyle w:val="Hyperlink"/>
@@ -1889,7 +1889,7 @@
             <w:noProof/>
             <w:webHidden/>
           </w:rPr>
-          <w:instrText xml:space="preserve"> PAGEREF _Toc242142807 \h </w:instrText>
+          <w:instrText xml:space="preserve"> PAGEREF _Toc242180548 \h </w:instrText>
         </w:r>
         <w:r>
           <w:rPr>
@@ -1934,7 +1934,7 @@
           <w14:ligatures w14:val="standardContextual"/>
         </w:rPr>
       </w:pPr>
-      <w:hyperlink w:anchor="_Toc242142808" w:history="1">
+      <w:hyperlink w:anchor="_Toc242180549" w:history="1">
         <w:r>
           <w:rPr>
             <w:rStyle w:val="Hyperlink"/>
@@ -1961,7 +1961,7 @@
             <w:noProof/>
             <w:webHidden/>
           </w:rPr>
-          <w:instrText xml:space="preserve"> PAGEREF _Toc242142808 \h </w:instrText>
+          <w:instrText xml:space="preserve"> PAGEREF _Toc242180549 \h </w:instrText>
         </w:r>
         <w:r>
           <w:rPr>
@@ -2006,7 +2006,7 @@
           <w14:ligatures w14:val="standardContextual"/>
         </w:rPr>
       </w:pPr>
-      <w:hyperlink w:anchor="_Toc242142809" w:history="1">
+      <w:hyperlink w:anchor="_Toc242180550" w:history="1">
         <w:r>
           <w:rPr>
             <w:rStyle w:val="Hyperlink"/>
@@ -2033,7 +2033,7 @@
             <w:noProof/>
             <w:webHidden/>
           </w:rPr>
-          <w:instrText xml:space="preserve"> PAGEREF _Toc242142809 \h </w:instrText>
+          <w:instrText xml:space="preserve"> PAGEREF _Toc242180550 \h </w:instrText>
         </w:r>
         <w:r>
           <w:rPr>
@@ -2078,7 +2078,7 @@
           <w14:ligatures w14:val="standardContextual"/>
         </w:rPr>
       </w:pPr>
-      <w:hyperlink w:anchor="_Toc242142810" w:history="1">
+      <w:hyperlink w:anchor="_Toc242180551" w:history="1">
         <w:r>
           <w:rPr>
             <w:rStyle w:val="Hyperlink"/>
@@ -2105,7 +2105,7 @@
             <w:noProof/>
             <w:webHidden/>
           </w:rPr>
-          <w:instrText xml:space="preserve"> PAGEREF _Toc242142810 \h </w:instrText>
+          <w:instrText xml:space="preserve"> PAGEREF _Toc242180551 \h </w:instrText>
         </w:r>
         <w:r>
           <w:rPr>
@@ -2150,7 +2150,7 @@
           <w14:ligatures w14:val="standardContextual"/>
         </w:rPr>
       </w:pPr>
-      <w:hyperlink w:anchor="_Toc242142811" w:history="1">
+      <w:hyperlink w:anchor="_Toc242180552" w:history="1">
         <w:r>
           <w:rPr>
             <w:rStyle w:val="Hyperlink"/>
@@ -2177,7 +2177,7 @@
             <w:noProof/>
             <w:webHidden/>
           </w:rPr>
-          <w:instrText xml:space="preserve"> PAGEREF _Toc242142811 \h </w:instrText>
+          <w:instrText xml:space="preserve"> PAGEREF _Toc242180552 \h </w:instrText>
         </w:r>
         <w:r>
           <w:rPr>
@@ -2222,7 +2222,7 @@
           <w14:ligatures w14:val="standardContextual"/>
         </w:rPr>
       </w:pPr>
-      <w:hyperlink w:anchor="_Toc242142812" w:history="1">
+      <w:hyperlink w:anchor="_Toc242180553" w:history="1">
         <w:r>
           <w:rPr>
             <w:rStyle w:val="Hyperlink"/>
@@ -2249,7 +2249,7 @@
             <w:noProof/>
             <w:webHidden/>
           </w:rPr>
-          <w:instrText xml:space="preserve"> PAGEREF _Toc242142812 \h </w:instrText>
+          <w:instrText xml:space="preserve"> PAGEREF _Toc242180553 \h </w:instrText>
         </w:r>
         <w:r>
           <w:rPr>
@@ -2294,7 +2294,7 @@
           <w14:ligatures w14:val="standardContextual"/>
         </w:rPr>
       </w:pPr>
-      <w:hyperlink w:anchor="_Toc242142813" w:history="1">
+      <w:hyperlink w:anchor="_Toc242180554" w:history="1">
         <w:r>
           <w:rPr>
             <w:rStyle w:val="Hyperlink"/>
@@ -2321,7 +2321,7 @@
             <w:noProof/>
             <w:webHidden/>
           </w:rPr>
-          <w:instrText xml:space="preserve"> PAGEREF _Toc242142813 \h </w:instrText>
+          <w:instrText xml:space="preserve"> PAGEREF _Toc242180554 \h </w:instrText>
         </w:r>
         <w:r>
           <w:rPr>
@@ -2366,7 +2366,7 @@
           <w14:ligatures w14:val="standardContextual"/>
         </w:rPr>
       </w:pPr>
-      <w:hyperlink w:anchor="_Toc242142814" w:history="1">
+      <w:hyperlink w:anchor="_Toc242180555" w:history="1">
         <w:r>
           <w:rPr>
             <w:rStyle w:val="Hyperlink"/>
@@ -2393,7 +2393,7 @@
             <w:noProof/>
             <w:webHidden/>
           </w:rPr>
-          <w:instrText xml:space="preserve"> PAGEREF _Toc242142814 \h </w:instrText>
+          <w:instrText xml:space="preserve"> PAGEREF _Toc242180555 \h </w:instrText>
         </w:r>
         <w:r>
           <w:rPr>
@@ -2438,7 +2438,7 @@
           <w14:ligatures w14:val="standardContextual"/>
         </w:rPr>
       </w:pPr>
-      <w:hyperlink w:anchor="_Toc242142815" w:history="1">
+      <w:hyperlink w:anchor="_Toc242180556" w:history="1">
         <w:r>
           <w:rPr>
             <w:rStyle w:val="Hyperlink"/>
@@ -2465,7 +2465,7 @@
             <w:noProof/>
             <w:webHidden/>
           </w:rPr>
-          <w:instrText xml:space="preserve"> PAGEREF _Toc242142815 \h </w:instrText>
+          <w:instrText xml:space="preserve"> PAGEREF _Toc242180556 \h </w:instrText>
         </w:r>
         <w:r>
           <w:rPr>
@@ -2510,7 +2510,7 @@
           <w14:ligatures w14:val="standardContextual"/>
         </w:rPr>
       </w:pPr>
-      <w:hyperlink w:anchor="_Toc242142816" w:history="1">
+      <w:hyperlink w:anchor="_Toc242180557" w:history="1">
         <w:r>
           <w:rPr>
             <w:rStyle w:val="Hyperlink"/>
@@ -2537,7 +2537,7 @@
             <w:noProof/>
             <w:webHidden/>
           </w:rPr>
-          <w:instrText xml:space="preserve"> PAGEREF _Toc242142816 \h </w:instrText>
+          <w:instrText xml:space="preserve"> PAGEREF _Toc242180557 \h </w:instrText>
         </w:r>
         <w:r>
           <w:rPr>
@@ -2582,7 +2582,7 @@
           <w14:ligatures w14:val="standardContextual"/>
         </w:rPr>
       </w:pPr>
-      <w:hyperlink w:anchor="_Toc242142817" w:history="1">
+      <w:hyperlink w:anchor="_Toc242180558" w:history="1">
         <w:r>
           <w:rPr>
             <w:rStyle w:val="Hyperlink"/>
@@ -2609,7 +2609,7 @@
             <w:noProof/>
             <w:webHidden/>
           </w:rPr>
-          <w:instrText xml:space="preserve"> PAGEREF _Toc242142817 \h </w:instrText>
+          <w:instrText xml:space="preserve"> PAGEREF _Toc242180558 \h </w:instrText>
         </w:r>
         <w:r>
           <w:rPr>
@@ -2654,7 +2654,7 @@
           <w14:ligatures w14:val="standardContextual"/>
         </w:rPr>
       </w:pPr>
-      <w:hyperlink w:anchor="_Toc242142818" w:history="1">
+      <w:hyperlink w:anchor="_Toc242180559" w:history="1">
         <w:r>
           <w:rPr>
             <w:rStyle w:val="Hyperlink"/>
@@ -2681,7 +2681,7 @@
             <w:noProof/>
             <w:webHidden/>
           </w:rPr>
-          <w:instrText xml:space="preserve"> PAGEREF _Toc242142818 \h </w:instrText>
+          <w:instrText xml:space="preserve"> PAGEREF _Toc242180559 \h </w:instrText>
         </w:r>
         <w:r>
           <w:rPr>
@@ -2726,7 +2726,7 @@
           <w14:ligatures w14:val="standardContextual"/>
         </w:rPr>
       </w:pPr>
-      <w:hyperlink w:anchor="_Toc242142819" w:history="1">
+      <w:hyperlink w:anchor="_Toc242180560" w:history="1">
         <w:r>
           <w:rPr>
             <w:rStyle w:val="Hyperlink"/>
@@ -2753,7 +2753,7 @@
             <w:noProof/>
             <w:webHidden/>
           </w:rPr>
-          <w:instrText xml:space="preserve"> PAGEREF _Toc242142819 \h </w:instrText>
+          <w:instrText xml:space="preserve"> PAGEREF _Toc242180560 \h </w:instrText>
         </w:r>
         <w:r>
           <w:rPr>
@@ -2798,7 +2798,7 @@
           <w14:ligatures w14:val="standardContextual"/>
         </w:rPr>
       </w:pPr>
-      <w:hyperlink w:anchor="_Toc242142820" w:history="1">
+      <w:hyperlink w:anchor="_Toc242180561" w:history="1">
         <w:r>
           <w:rPr>
             <w:rStyle w:val="Hyperlink"/>
@@ -2825,7 +2825,7 @@
             <w:noProof/>
             <w:webHidden/>
           </w:rPr>
-          <w:instrText xml:space="preserve"> PAGEREF _Toc242142820 \h </w:instrText>
+          <w:instrText xml:space="preserve"> PAGEREF _Toc242180561 \h </w:instrText>
         </w:r>
         <w:r>
           <w:rPr>
@@ -2870,7 +2870,7 @@
           <w14:ligatures w14:val="standardContextual"/>
         </w:rPr>
       </w:pPr>
-      <w:hyperlink w:anchor="_Toc242142821" w:history="1">
+      <w:hyperlink w:anchor="_Toc242180562" w:history="1">
         <w:r>
           <w:rPr>
             <w:rStyle w:val="Hyperlink"/>
@@ -2897,7 +2897,7 @@
             <w:noProof/>
             <w:webHidden/>
           </w:rPr>
-          <w:instrText xml:space="preserve"> PAGEREF _Toc242142821 \h </w:instrText>
+          <w:instrText xml:space="preserve"> PAGEREF _Toc242180562 \h </w:instrText>
         </w:r>
         <w:r>
           <w:rPr>
@@ -2942,7 +2942,7 @@
           <w14:ligatures w14:val="standardContextual"/>
         </w:rPr>
       </w:pPr>
-      <w:hyperlink w:anchor="_Toc242142822" w:history="1">
+      <w:hyperlink w:anchor="_Toc242180563" w:history="1">
         <w:r>
           <w:rPr>
             <w:rStyle w:val="Hyperlink"/>
@@ -2969,7 +2969,7 @@
             <w:noProof/>
             <w:webHidden/>
           </w:rPr>
-          <w:instrText xml:space="preserve"> PAGEREF _Toc242142822 \h </w:instrText>
+          <w:instrText xml:space="preserve"> PAGEREF _Toc242180563 \h </w:instrText>
         </w:r>
         <w:r>
           <w:rPr>
@@ -3014,7 +3014,7 @@
           <w14:ligatures w14:val="standardContextual"/>
         </w:rPr>
       </w:pPr>
-      <w:hyperlink w:anchor="_Toc242142823" w:history="1">
+      <w:hyperlink w:anchor="_Toc242180564" w:history="1">
         <w:r>
           <w:rPr>
             <w:rStyle w:val="Hyperlink"/>
@@ -3041,7 +3041,7 @@
             <w:noProof/>
             <w:webHidden/>
           </w:rPr>
-          <w:instrText xml:space="preserve"> PAGEREF _Toc242142823 \h </w:instrText>
+          <w:instrText xml:space="preserve"> PAGEREF _Toc242180564 \h </w:instrText>
         </w:r>
         <w:r>
           <w:rPr>
@@ -3086,7 +3086,7 @@
           <w14:ligatures w14:val="standardContextual"/>
         </w:rPr>
       </w:pPr>
-      <w:hyperlink w:anchor="_Toc242142824" w:history="1">
+      <w:hyperlink w:anchor="_Toc242180565" w:history="1">
         <w:r>
           <w:rPr>
             <w:rStyle w:val="Hyperlink"/>
@@ -3113,7 +3113,7 @@
             <w:noProof/>
             <w:webHidden/>
           </w:rPr>
-          <w:instrText xml:space="preserve"> PAGEREF _Toc242142824 \h </w:instrText>
+          <w:instrText xml:space="preserve"> PAGEREF _Toc242180565 \h </w:instrText>
         </w:r>
         <w:r>
           <w:rPr>
@@ -3158,7 +3158,7 @@
           <w14:ligatures w14:val="standardContextual"/>
         </w:rPr>
       </w:pPr>
-      <w:hyperlink w:anchor="_Toc242142825" w:history="1">
+      <w:hyperlink w:anchor="_Toc242180566" w:history="1">
         <w:r>
           <w:rPr>
             <w:rStyle w:val="Hyperlink"/>
@@ -3185,7 +3185,7 @@
             <w:noProof/>
             <w:webHidden/>
           </w:rPr>
-          <w:instrText xml:space="preserve"> PAGEREF _Toc242142825 \h </w:instrText>
+          <w:instrText xml:space="preserve"> PAGEREF _Toc242180566 \h </w:instrText>
         </w:r>
         <w:r>
           <w:rPr>
@@ -3230,7 +3230,7 @@
           <w14:ligatures w14:val="standardContextual"/>
         </w:rPr>
       </w:pPr>
-      <w:hyperlink w:anchor="_Toc242142826" w:history="1">
+      <w:hyperlink w:anchor="_Toc242180567" w:history="1">
         <w:r>
           <w:rPr>
             <w:rStyle w:val="Hyperlink"/>
@@ -3257,7 +3257,7 @@
             <w:noProof/>
             <w:webHidden/>
           </w:rPr>
-          <w:instrText xml:space="preserve"> PAGEREF _Toc242142826 \h </w:instrText>
+          <w:instrText xml:space="preserve"> PAGEREF _Toc242180567 \h </w:instrText>
         </w:r>
         <w:r>
           <w:rPr>
@@ -3302,7 +3302,7 @@
           <w14:ligatures w14:val="standardContextual"/>
         </w:rPr>
       </w:pPr>
-      <w:hyperlink w:anchor="_Toc242142827" w:history="1">
+      <w:hyperlink w:anchor="_Toc242180568" w:history="1">
         <w:r>
           <w:rPr>
             <w:rStyle w:val="Hyperlink"/>
@@ -3329,7 +3329,7 @@
             <w:noProof/>
             <w:webHidden/>
           </w:rPr>
-          <w:instrText xml:space="preserve"> PAGEREF _Toc242142827 \h </w:instrText>
+          <w:instrText xml:space="preserve"> PAGEREF _Toc242180568 \h </w:instrText>
         </w:r>
         <w:r>
           <w:rPr>
@@ -3374,7 +3374,7 @@
           <w14:ligatures w14:val="standardContextual"/>
         </w:rPr>
       </w:pPr>
-      <w:hyperlink w:anchor="_Toc242142828" w:history="1">
+      <w:hyperlink w:anchor="_Toc242180569" w:history="1">
         <w:r>
           <w:rPr>
             <w:rStyle w:val="Hyperlink"/>
@@ -3401,7 +3401,7 @@
             <w:noProof/>
             <w:webHidden/>
           </w:rPr>
-          <w:instrText xml:space="preserve"> PAGEREF _Toc242142828 \h </w:instrText>
+          <w:instrText xml:space="preserve"> PAGEREF _Toc242180569 \h </w:instrText>
         </w:r>
         <w:r>
           <w:rPr>
@@ -3446,7 +3446,7 @@
           <w14:ligatures w14:val="standardContextual"/>
         </w:rPr>
       </w:pPr>
-      <w:hyperlink w:anchor="_Toc242142829" w:history="1">
+      <w:hyperlink w:anchor="_Toc242180570" w:history="1">
         <w:r>
           <w:rPr>
             <w:rStyle w:val="Hyperlink"/>
@@ -3489,7 +3489,7 @@
             <w:noProof/>
             <w:webHidden/>
           </w:rPr>
-          <w:instrText xml:space="preserve"> PAGEREF _Toc242142829 \h </w:instrText>
+          <w:instrText xml:space="preserve"> PAGEREF _Toc242180570 \h </w:instrText>
         </w:r>
         <w:r>
           <w:rPr>
@@ -3534,7 +3534,7 @@
           <w14:ligatures w14:val="standardContextual"/>
         </w:rPr>
       </w:pPr>
-      <w:hyperlink w:anchor="_Toc242142830" w:history="1">
+      <w:hyperlink w:anchor="_Toc242180571" w:history="1">
         <w:r>
           <w:rPr>
             <w:rStyle w:val="Hyperlink"/>
@@ -3561,7 +3561,7 @@
             <w:noProof/>
             <w:webHidden/>
           </w:rPr>
-          <w:instrText xml:space="preserve"> PAGEREF _Toc242142830 \h </w:instrText>
+          <w:instrText xml:space="preserve"> PAGEREF _Toc242180571 \h </w:instrText>
         </w:r>
         <w:r>
           <w:rPr>
@@ -3606,7 +3606,7 @@
           <w14:ligatures w14:val="standardContextual"/>
         </w:rPr>
       </w:pPr>
-      <w:hyperlink w:anchor="_Toc242142831" w:history="1">
+      <w:hyperlink w:anchor="_Toc242180572" w:history="1">
         <w:r>
           <w:rPr>
             <w:rStyle w:val="Hyperlink"/>
@@ -3633,7 +3633,7 @@
             <w:noProof/>
             <w:webHidden/>
           </w:rPr>
-          <w:instrText xml:space="preserve"> PAGEREF _Toc242142831 \h </w:instrText>
+          <w:instrText xml:space="preserve"> PAGEREF _Toc242180572 \h </w:instrText>
         </w:r>
         <w:r>
           <w:rPr>
@@ -3678,7 +3678,7 @@
           <w14:ligatures w14:val="standardContextual"/>
         </w:rPr>
       </w:pPr>
-      <w:hyperlink w:anchor="_Toc242142832" w:history="1">
+      <w:hyperlink w:anchor="_Toc242180573" w:history="1">
         <w:r>
           <w:rPr>
             <w:rStyle w:val="Hyperlink"/>
@@ -3705,7 +3705,7 @@
             <w:noProof/>
             <w:webHidden/>
           </w:rPr>
-          <w:instrText xml:space="preserve"> PAGEREF _Toc242142832 \h </w:instrText>
+          <w:instrText xml:space="preserve"> PAGEREF _Toc242180573 \h </w:instrText>
         </w:r>
         <w:r>
           <w:rPr>
@@ -3748,7 +3748,7 @@
           <w14:ligatures w14:val="standardContextual"/>
         </w:rPr>
       </w:pPr>
-      <w:hyperlink w:anchor="_Toc242142833" w:history="1">
+      <w:hyperlink w:anchor="_Toc242180574" w:history="1">
         <w:r>
           <w:rPr>
             <w:rStyle w:val="Hyperlink"/>
@@ -3771,7 +3771,7 @@
           <w:rPr>
             <w:webHidden/>
           </w:rPr>
-          <w:instrText xml:space="preserve"> PAGEREF _Toc242142833 \h </w:instrText>
+          <w:instrText xml:space="preserve"> PAGEREF _Toc242180574 \h </w:instrText>
         </w:r>
         <w:r>
           <w:rPr>
@@ -3812,7 +3812,7 @@
           <w14:ligatures w14:val="standardContextual"/>
         </w:rPr>
       </w:pPr>
-      <w:hyperlink w:anchor="_Toc242142834" w:history="1">
+      <w:hyperlink w:anchor="_Toc242180575" w:history="1">
         <w:r>
           <w:rPr>
             <w:rStyle w:val="Hyperlink"/>
@@ -3839,7 +3839,7 @@
             <w:noProof/>
             <w:webHidden/>
           </w:rPr>
-          <w:instrText xml:space="preserve"> PAGEREF _Toc242142834 \h </w:instrText>
+          <w:instrText xml:space="preserve"> PAGEREF _Toc242180575 \h </w:instrText>
         </w:r>
         <w:r>
           <w:rPr>
@@ -3884,7 +3884,7 @@
           <w14:ligatures w14:val="standardContextual"/>
         </w:rPr>
       </w:pPr>
-      <w:hyperlink w:anchor="_Toc242142835" w:history="1">
+      <w:hyperlink w:anchor="_Toc242180576" w:history="1">
         <w:r>
           <w:rPr>
             <w:rStyle w:val="Hyperlink"/>
@@ -3911,7 +3911,7 @@
             <w:noProof/>
             <w:webHidden/>
           </w:rPr>
-          <w:instrText xml:space="preserve"> PAGEREF _Toc242142835 \h </w:instrText>
+          <w:instrText xml:space="preserve"> PAGEREF _Toc242180576 \h </w:instrText>
         </w:r>
         <w:r>
           <w:rPr>
@@ -3956,7 +3956,7 @@
           <w14:ligatures w14:val="standardContextual"/>
         </w:rPr>
       </w:pPr>
-      <w:hyperlink w:anchor="_Toc242142836" w:history="1">
+      <w:hyperlink w:anchor="_Toc242180577" w:history="1">
         <w:r>
           <w:rPr>
             <w:rStyle w:val="Hyperlink"/>
@@ -3983,7 +3983,7 @@
             <w:noProof/>
             <w:webHidden/>
           </w:rPr>
-          <w:instrText xml:space="preserve"> PAGEREF _Toc242142836 \h </w:instrText>
+          <w:instrText xml:space="preserve"> PAGEREF _Toc242180577 \h </w:instrText>
         </w:r>
         <w:r>
           <w:rPr>
@@ -4028,7 +4028,7 @@
           <w14:ligatures w14:val="standardContextual"/>
         </w:rPr>
       </w:pPr>
-      <w:hyperlink w:anchor="_Toc242142837" w:history="1">
+      <w:hyperlink w:anchor="_Toc242180578" w:history="1">
         <w:r>
           <w:rPr>
             <w:rStyle w:val="Hyperlink"/>
@@ -4055,7 +4055,7 @@
             <w:noProof/>
             <w:webHidden/>
           </w:rPr>
-          <w:instrText xml:space="preserve"> PAGEREF _Toc242142837 \h </w:instrText>
+          <w:instrText xml:space="preserve"> PAGEREF _Toc242180578 \h </w:instrText>
         </w:r>
         <w:r>
           <w:rPr>
@@ -4075,7 +4075,7 @@
             <w:noProof/>
             <w:webHidden/>
           </w:rPr>
-          <w:t>42</w:t>
+          <w:t>43</w:t>
         </w:r>
         <w:r>
           <w:rPr>
@@ -4100,7 +4100,7 @@
           <w14:ligatures w14:val="standardContextual"/>
         </w:rPr>
       </w:pPr>
-      <w:hyperlink w:anchor="_Toc242142838" w:history="1">
+      <w:hyperlink w:anchor="_Toc242180579" w:history="1">
         <w:r>
           <w:rPr>
             <w:rStyle w:val="Hyperlink"/>
@@ -4127,7 +4127,7 @@
             <w:noProof/>
             <w:webHidden/>
           </w:rPr>
-          <w:instrText xml:space="preserve"> PAGEREF _Toc242142838 \h </w:instrText>
+          <w:instrText xml:space="preserve"> PAGEREF _Toc242180579 \h </w:instrText>
         </w:r>
         <w:r>
           <w:rPr>
@@ -4172,7 +4172,7 @@
           <w14:ligatures w14:val="standardContextual"/>
         </w:rPr>
       </w:pPr>
-      <w:hyperlink w:anchor="_Toc242142839" w:history="1">
+      <w:hyperlink w:anchor="_Toc242180580" w:history="1">
         <w:r>
           <w:rPr>
             <w:rStyle w:val="Hyperlink"/>
@@ -4199,7 +4199,7 @@
             <w:noProof/>
             <w:webHidden/>
           </w:rPr>
-          <w:instrText xml:space="preserve"> PAGEREF _Toc242142839 \h </w:instrText>
+          <w:instrText xml:space="preserve"> PAGEREF _Toc242180580 \h </w:instrText>
         </w:r>
         <w:r>
           <w:rPr>
@@ -4244,7 +4244,7 @@
           <w14:ligatures w14:val="standardContextual"/>
         </w:rPr>
       </w:pPr>
-      <w:hyperlink w:anchor="_Toc242142840" w:history="1">
+      <w:hyperlink w:anchor="_Toc242180581" w:history="1">
         <w:r>
           <w:rPr>
             <w:rStyle w:val="Hyperlink"/>
@@ -4271,7 +4271,7 @@
             <w:noProof/>
             <w:webHidden/>
           </w:rPr>
-          <w:instrText xml:space="preserve"> PAGEREF _Toc242142840 \h </w:instrText>
+          <w:instrText xml:space="preserve"> PAGEREF _Toc242180581 \h </w:instrText>
         </w:r>
         <w:r>
           <w:rPr>
@@ -4316,7 +4316,7 @@
           <w14:ligatures w14:val="standardContextual"/>
         </w:rPr>
       </w:pPr>
-      <w:hyperlink w:anchor="_Toc242142841" w:history="1">
+      <w:hyperlink w:anchor="_Toc242180582" w:history="1">
         <w:r>
           <w:rPr>
             <w:rStyle w:val="Hyperlink"/>
@@ -4343,7 +4343,7 @@
             <w:noProof/>
             <w:webHidden/>
           </w:rPr>
-          <w:instrText xml:space="preserve"> PAGEREF _Toc242142841 \h </w:instrText>
+          <w:instrText xml:space="preserve"> PAGEREF _Toc242180582 \h </w:instrText>
         </w:r>
         <w:r>
           <w:rPr>
@@ -4388,7 +4388,7 @@
           <w14:ligatures w14:val="standardContextual"/>
         </w:rPr>
       </w:pPr>
-      <w:hyperlink w:anchor="_Toc242142842" w:history="1">
+      <w:hyperlink w:anchor="_Toc242180583" w:history="1">
         <w:r>
           <w:rPr>
             <w:rStyle w:val="Hyperlink"/>
@@ -4415,7 +4415,7 @@
             <w:noProof/>
             <w:webHidden/>
           </w:rPr>
-          <w:instrText xml:space="preserve"> PAGEREF _Toc242142842 \h </w:instrText>
+          <w:instrText xml:space="preserve"> PAGEREF _Toc242180583 \h </w:instrText>
         </w:r>
         <w:r>
           <w:rPr>
@@ -4460,7 +4460,7 @@
           <w14:ligatures w14:val="standardContextual"/>
         </w:rPr>
       </w:pPr>
-      <w:hyperlink w:anchor="_Toc242142843" w:history="1">
+      <w:hyperlink w:anchor="_Toc242180584" w:history="1">
         <w:r>
           <w:rPr>
             <w:rStyle w:val="Hyperlink"/>
@@ -4487,7 +4487,7 @@
             <w:noProof/>
             <w:webHidden/>
           </w:rPr>
-          <w:instrText xml:space="preserve"> PAGEREF _Toc242142843 \h </w:instrText>
+          <w:instrText xml:space="preserve"> PAGEREF _Toc242180584 \h </w:instrText>
         </w:r>
         <w:r>
           <w:rPr>
@@ -4532,7 +4532,7 @@
           <w14:ligatures w14:val="standardContextual"/>
         </w:rPr>
       </w:pPr>
-      <w:hyperlink w:anchor="_Toc242142844" w:history="1">
+      <w:hyperlink w:anchor="_Toc242180585" w:history="1">
         <w:r>
           <w:rPr>
             <w:rStyle w:val="Hyperlink"/>
@@ -4559,7 +4559,7 @@
             <w:noProof/>
             <w:webHidden/>
           </w:rPr>
-          <w:instrText xml:space="preserve"> PAGEREF _Toc242142844 \h </w:instrText>
+          <w:instrText xml:space="preserve"> PAGEREF _Toc242180585 \h </w:instrText>
         </w:r>
         <w:r>
           <w:rPr>
@@ -4604,7 +4604,7 @@
           <w14:ligatures w14:val="standardContextual"/>
         </w:rPr>
       </w:pPr>
-      <w:hyperlink w:anchor="_Toc242142845" w:history="1">
+      <w:hyperlink w:anchor="_Toc242180586" w:history="1">
         <w:r>
           <w:rPr>
             <w:rStyle w:val="Hyperlink"/>
@@ -4631,7 +4631,7 @@
             <w:noProof/>
             <w:webHidden/>
           </w:rPr>
-          <w:instrText xml:space="preserve"> PAGEREF _Toc242142845 \h </w:instrText>
+          <w:instrText xml:space="preserve"> PAGEREF _Toc242180586 \h </w:instrText>
         </w:r>
         <w:r>
           <w:rPr>
@@ -4676,7 +4676,7 @@
           <w14:ligatures w14:val="standardContextual"/>
         </w:rPr>
       </w:pPr>
-      <w:hyperlink w:anchor="_Toc242142846" w:history="1">
+      <w:hyperlink w:anchor="_Toc242180587" w:history="1">
         <w:r>
           <w:rPr>
             <w:rStyle w:val="Hyperlink"/>
@@ -4703,7 +4703,7 @@
             <w:noProof/>
             <w:webHidden/>
           </w:rPr>
-          <w:instrText xml:space="preserve"> PAGEREF _Toc242142846 \h </w:instrText>
+          <w:instrText xml:space="preserve"> PAGEREF _Toc242180587 \h </w:instrText>
         </w:r>
         <w:r>
           <w:rPr>
@@ -4748,7 +4748,7 @@
           <w14:ligatures w14:val="standardContextual"/>
         </w:rPr>
       </w:pPr>
-      <w:hyperlink w:anchor="_Toc242142847" w:history="1">
+      <w:hyperlink w:anchor="_Toc242180588" w:history="1">
         <w:r>
           <w:rPr>
             <w:rStyle w:val="Hyperlink"/>
@@ -4775,7 +4775,7 @@
             <w:noProof/>
             <w:webHidden/>
           </w:rPr>
-          <w:instrText xml:space="preserve"> PAGEREF _Toc242142847 \h </w:instrText>
+          <w:instrText xml:space="preserve"> PAGEREF _Toc242180588 \h </w:instrText>
         </w:r>
         <w:r>
           <w:rPr>
@@ -4818,7 +4818,7 @@
           <w14:ligatures w14:val="standardContextual"/>
         </w:rPr>
       </w:pPr>
-      <w:hyperlink w:anchor="_Toc242142848" w:history="1">
+      <w:hyperlink w:anchor="_Toc242180589" w:history="1">
         <w:r>
           <w:rPr>
             <w:rStyle w:val="Hyperlink"/>
@@ -4841,7 +4841,7 @@
           <w:rPr>
             <w:webHidden/>
           </w:rPr>
-          <w:instrText xml:space="preserve"> PAGEREF _Toc242142848 \h </w:instrText>
+          <w:instrText xml:space="preserve"> PAGEREF _Toc242180589 \h </w:instrText>
         </w:r>
         <w:r>
           <w:rPr>
@@ -4882,7 +4882,7 @@
           <w14:ligatures w14:val="standardContextual"/>
         </w:rPr>
       </w:pPr>
-      <w:hyperlink w:anchor="_Toc242142849" w:history="1">
+      <w:hyperlink w:anchor="_Toc242180590" w:history="1">
         <w:r>
           <w:rPr>
             <w:rStyle w:val="Hyperlink"/>
@@ -4909,7 +4909,7 @@
             <w:noProof/>
             <w:webHidden/>
           </w:rPr>
-          <w:instrText xml:space="preserve"> PAGEREF _Toc242142849 \h </w:instrText>
+          <w:instrText xml:space="preserve"> PAGEREF _Toc242180590 \h </w:instrText>
         </w:r>
         <w:r>
           <w:rPr>
@@ -4954,7 +4954,7 @@
           <w14:ligatures w14:val="standardContextual"/>
         </w:rPr>
       </w:pPr>
-      <w:hyperlink w:anchor="_Toc242142850" w:history="1">
+      <w:hyperlink w:anchor="_Toc242180591" w:history="1">
         <w:r>
           <w:rPr>
             <w:rStyle w:val="Hyperlink"/>
@@ -4981,7 +4981,7 @@
             <w:noProof/>
             <w:webHidden/>
           </w:rPr>
-          <w:instrText xml:space="preserve"> PAGEREF _Toc242142850 \h </w:instrText>
+          <w:instrText xml:space="preserve"> PAGEREF _Toc242180591 \h </w:instrText>
         </w:r>
         <w:r>
           <w:rPr>
@@ -5026,7 +5026,7 @@
           <w14:ligatures w14:val="standardContextual"/>
         </w:rPr>
       </w:pPr>
-      <w:hyperlink w:anchor="_Toc242142851" w:history="1">
+      <w:hyperlink w:anchor="_Toc242180592" w:history="1">
         <w:r>
           <w:rPr>
             <w:rStyle w:val="Hyperlink"/>
@@ -5053,7 +5053,7 @@
             <w:noProof/>
             <w:webHidden/>
           </w:rPr>
-          <w:instrText xml:space="preserve"> PAGEREF _Toc242142851 \h </w:instrText>
+          <w:instrText xml:space="preserve"> PAGEREF _Toc242180592 \h </w:instrText>
         </w:r>
         <w:r>
           <w:rPr>
@@ -5098,7 +5098,7 @@
           <w14:ligatures w14:val="standardContextual"/>
         </w:rPr>
       </w:pPr>
-      <w:hyperlink w:anchor="_Toc242142852" w:history="1">
+      <w:hyperlink w:anchor="_Toc242180593" w:history="1">
         <w:r>
           <w:rPr>
             <w:rStyle w:val="Hyperlink"/>
@@ -5125,7 +5125,7 @@
             <w:noProof/>
             <w:webHidden/>
           </w:rPr>
-          <w:instrText xml:space="preserve"> PAGEREF _Toc242142852 \h </w:instrText>
+          <w:instrText xml:space="preserve"> PAGEREF _Toc242180593 \h </w:instrText>
         </w:r>
         <w:r>
           <w:rPr>
@@ -5170,7 +5170,7 @@
           <w14:ligatures w14:val="standardContextual"/>
         </w:rPr>
       </w:pPr>
-      <w:hyperlink w:anchor="_Toc242142853" w:history="1">
+      <w:hyperlink w:anchor="_Toc242180594" w:history="1">
         <w:r>
           <w:rPr>
             <w:rStyle w:val="Hyperlink"/>
@@ -5197,7 +5197,7 @@
             <w:noProof/>
             <w:webHidden/>
           </w:rPr>
-          <w:instrText xml:space="preserve"> PAGEREF _Toc242142853 \h </w:instrText>
+          <w:instrText xml:space="preserve"> PAGEREF _Toc242180594 \h </w:instrText>
         </w:r>
         <w:r>
           <w:rPr>
@@ -5242,7 +5242,7 @@
           <w14:ligatures w14:val="standardContextual"/>
         </w:rPr>
       </w:pPr>
-      <w:hyperlink w:anchor="_Toc242142854" w:history="1">
+      <w:hyperlink w:anchor="_Toc242180595" w:history="1">
         <w:r>
           <w:rPr>
             <w:rStyle w:val="Hyperlink"/>
@@ -5269,7 +5269,7 @@
             <w:noProof/>
             <w:webHidden/>
           </w:rPr>
-          <w:instrText xml:space="preserve"> PAGEREF _Toc242142854 \h </w:instrText>
+          <w:instrText xml:space="preserve"> PAGEREF _Toc242180595 \h </w:instrText>
         </w:r>
         <w:r>
           <w:rPr>
@@ -5314,7 +5314,7 @@
           <w14:ligatures w14:val="standardContextual"/>
         </w:rPr>
       </w:pPr>
-      <w:hyperlink w:anchor="_Toc242142855" w:history="1">
+      <w:hyperlink w:anchor="_Toc242180596" w:history="1">
         <w:r>
           <w:rPr>
             <w:rStyle w:val="Hyperlink"/>
@@ -5341,7 +5341,7 @@
             <w:noProof/>
             <w:webHidden/>
           </w:rPr>
-          <w:instrText xml:space="preserve"> PAGEREF _Toc242142855 \h </w:instrText>
+          <w:instrText xml:space="preserve"> PAGEREF _Toc242180596 \h </w:instrText>
         </w:r>
         <w:r>
           <w:rPr>
@@ -5386,7 +5386,7 @@
           <w14:ligatures w14:val="standardContextual"/>
         </w:rPr>
       </w:pPr>
-      <w:hyperlink w:anchor="_Toc242142856" w:history="1">
+      <w:hyperlink w:anchor="_Toc242180597" w:history="1">
         <w:r>
           <w:rPr>
             <w:rStyle w:val="Hyperlink"/>
@@ -5413,7 +5413,7 @@
             <w:noProof/>
             <w:webHidden/>
           </w:rPr>
-          <w:instrText xml:space="preserve"> PAGEREF _Toc242142856 \h </w:instrText>
+          <w:instrText xml:space="preserve"> PAGEREF _Toc242180597 \h </w:instrText>
         </w:r>
         <w:r>
           <w:rPr>
@@ -5458,7 +5458,7 @@
           <w14:ligatures w14:val="standardContextual"/>
         </w:rPr>
       </w:pPr>
-      <w:hyperlink w:anchor="_Toc242142857" w:history="1">
+      <w:hyperlink w:anchor="_Toc242180598" w:history="1">
         <w:r>
           <w:rPr>
             <w:rStyle w:val="Hyperlink"/>
@@ -5485,7 +5485,7 @@
             <w:noProof/>
             <w:webHidden/>
           </w:rPr>
-          <w:instrText xml:space="preserve"> PAGEREF _Toc242142857 \h </w:instrText>
+          <w:instrText xml:space="preserve"> PAGEREF _Toc242180598 \h </w:instrText>
         </w:r>
         <w:r>
           <w:rPr>
@@ -5530,7 +5530,7 @@
           <w14:ligatures w14:val="standardContextual"/>
         </w:rPr>
       </w:pPr>
-      <w:hyperlink w:anchor="_Toc242142858" w:history="1">
+      <w:hyperlink w:anchor="_Toc242180599" w:history="1">
         <w:r>
           <w:rPr>
             <w:rStyle w:val="Hyperlink"/>
@@ -5557,7 +5557,7 @@
             <w:noProof/>
             <w:webHidden/>
           </w:rPr>
-          <w:instrText xml:space="preserve"> PAGEREF _Toc242142858 \h </w:instrText>
+          <w:instrText xml:space="preserve"> PAGEREF _Toc242180599 \h </w:instrText>
         </w:r>
         <w:r>
           <w:rPr>
@@ -5600,7 +5600,7 @@
           <w14:ligatures w14:val="standardContextual"/>
         </w:rPr>
       </w:pPr>
-      <w:hyperlink w:anchor="_Toc242142859" w:history="1">
+      <w:hyperlink w:anchor="_Toc242180600" w:history="1">
         <w:r>
           <w:rPr>
             <w:rStyle w:val="Hyperlink"/>
@@ -5623,7 +5623,7 @@
           <w:rPr>
             <w:webHidden/>
           </w:rPr>
-          <w:instrText xml:space="preserve"> PAGEREF _Toc242142859 \h </w:instrText>
+          <w:instrText xml:space="preserve"> PAGEREF _Toc242180600 \h </w:instrText>
         </w:r>
         <w:r>
           <w:rPr>
@@ -5664,7 +5664,7 @@
           <w14:ligatures w14:val="standardContextual"/>
         </w:rPr>
       </w:pPr>
-      <w:hyperlink w:anchor="_Toc242142860" w:history="1">
+      <w:hyperlink w:anchor="_Toc242180601" w:history="1">
         <w:r>
           <w:rPr>
             <w:rStyle w:val="Hyperlink"/>
@@ -5691,7 +5691,7 @@
             <w:noProof/>
             <w:webHidden/>
           </w:rPr>
-          <w:instrText xml:space="preserve"> PAGEREF _Toc242142860 \h </w:instrText>
+          <w:instrText xml:space="preserve"> PAGEREF _Toc242180601 \h </w:instrText>
         </w:r>
         <w:r>
           <w:rPr>
@@ -5736,7 +5736,7 @@
           <w14:ligatures w14:val="standardContextual"/>
         </w:rPr>
       </w:pPr>
-      <w:hyperlink w:anchor="_Toc242142861" w:history="1">
+      <w:hyperlink w:anchor="_Toc242180602" w:history="1">
         <w:r>
           <w:rPr>
             <w:rStyle w:val="Hyperlink"/>
@@ -5763,7 +5763,7 @@
             <w:noProof/>
             <w:webHidden/>
           </w:rPr>
-          <w:instrText xml:space="preserve"> PAGEREF _Toc242142861 \h </w:instrText>
+          <w:instrText xml:space="preserve"> PAGEREF _Toc242180602 \h </w:instrText>
         </w:r>
         <w:r>
           <w:rPr>
@@ -5808,7 +5808,7 @@
           <w14:ligatures w14:val="standardContextual"/>
         </w:rPr>
       </w:pPr>
-      <w:hyperlink w:anchor="_Toc242142862" w:history="1">
+      <w:hyperlink w:anchor="_Toc242180603" w:history="1">
         <w:r>
           <w:rPr>
             <w:rStyle w:val="Hyperlink"/>
@@ -5835,7 +5835,7 @@
             <w:noProof/>
             <w:webHidden/>
           </w:rPr>
-          <w:instrText xml:space="preserve"> PAGEREF _Toc242142862 \h </w:instrText>
+          <w:instrText xml:space="preserve"> PAGEREF _Toc242180603 \h </w:instrText>
         </w:r>
         <w:r>
           <w:rPr>
@@ -5880,7 +5880,7 @@
           <w14:ligatures w14:val="standardContextual"/>
         </w:rPr>
       </w:pPr>
-      <w:hyperlink w:anchor="_Toc242142863" w:history="1">
+      <w:hyperlink w:anchor="_Toc242180604" w:history="1">
         <w:r>
           <w:rPr>
             <w:rStyle w:val="Hyperlink"/>
@@ -5907,7 +5907,7 @@
             <w:noProof/>
             <w:webHidden/>
           </w:rPr>
-          <w:instrText xml:space="preserve"> PAGEREF _Toc242142863 \h </w:instrText>
+          <w:instrText xml:space="preserve"> PAGEREF _Toc242180604 \h </w:instrText>
         </w:r>
         <w:r>
           <w:rPr>
@@ -5952,7 +5952,7 @@
           <w14:ligatures w14:val="standardContextual"/>
         </w:rPr>
       </w:pPr>
-      <w:hyperlink w:anchor="_Toc242142864" w:history="1">
+      <w:hyperlink w:anchor="_Toc242180605" w:history="1">
         <w:r>
           <w:rPr>
             <w:rStyle w:val="Hyperlink"/>
@@ -5979,7 +5979,7 @@
             <w:noProof/>
             <w:webHidden/>
           </w:rPr>
-          <w:instrText xml:space="preserve"> PAGEREF _Toc242142864 \h </w:instrText>
+          <w:instrText xml:space="preserve"> PAGEREF _Toc242180605 \h </w:instrText>
         </w:r>
         <w:r>
           <w:rPr>
@@ -6024,7 +6024,7 @@
           <w14:ligatures w14:val="standardContextual"/>
         </w:rPr>
       </w:pPr>
-      <w:hyperlink w:anchor="_Toc242142865" w:history="1">
+      <w:hyperlink w:anchor="_Toc242180606" w:history="1">
         <w:r>
           <w:rPr>
             <w:rStyle w:val="Hyperlink"/>
@@ -6051,7 +6051,7 @@
             <w:noProof/>
             <w:webHidden/>
           </w:rPr>
-          <w:instrText xml:space="preserve"> PAGEREF _Toc242142865 \h </w:instrText>
+          <w:instrText xml:space="preserve"> PAGEREF _Toc242180606 \h </w:instrText>
         </w:r>
         <w:r>
           <w:rPr>
@@ -6096,7 +6096,7 @@
           <w14:ligatures w14:val="standardContextual"/>
         </w:rPr>
       </w:pPr>
-      <w:hyperlink w:anchor="_Toc242142866" w:history="1">
+      <w:hyperlink w:anchor="_Toc242180607" w:history="1">
         <w:r>
           <w:rPr>
             <w:rStyle w:val="Hyperlink"/>
@@ -6123,7 +6123,7 @@
             <w:noProof/>
             <w:webHidden/>
           </w:rPr>
-          <w:instrText xml:space="preserve"> PAGEREF _Toc242142866 \h </w:instrText>
+          <w:instrText xml:space="preserve"> PAGEREF _Toc242180607 \h </w:instrText>
         </w:r>
         <w:r>
           <w:rPr>
@@ -6168,7 +6168,7 @@
           <w14:ligatures w14:val="standardContextual"/>
         </w:rPr>
       </w:pPr>
-      <w:hyperlink w:anchor="_Toc242142867" w:history="1">
+      <w:hyperlink w:anchor="_Toc242180608" w:history="1">
         <w:r>
           <w:rPr>
             <w:rStyle w:val="Hyperlink"/>
@@ -6195,7 +6195,7 @@
             <w:noProof/>
             <w:webHidden/>
           </w:rPr>
-          <w:instrText xml:space="preserve"> PAGEREF _Toc242142867 \h </w:instrText>
+          <w:instrText xml:space="preserve"> PAGEREF _Toc242180608 \h </w:instrText>
         </w:r>
         <w:r>
           <w:rPr>
@@ -6240,7 +6240,7 @@
           <w14:ligatures w14:val="standardContextual"/>
         </w:rPr>
       </w:pPr>
-      <w:hyperlink w:anchor="_Toc242142868" w:history="1">
+      <w:hyperlink w:anchor="_Toc242180609" w:history="1">
         <w:r>
           <w:rPr>
             <w:rStyle w:val="Hyperlink"/>
@@ -6267,7 +6267,7 @@
             <w:noProof/>
             <w:webHidden/>
           </w:rPr>
-          <w:instrText xml:space="preserve"> PAGEREF _Toc242142868 \h </w:instrText>
+          <w:instrText xml:space="preserve"> PAGEREF _Toc242180609 \h </w:instrText>
         </w:r>
         <w:r>
           <w:rPr>
@@ -6312,7 +6312,7 @@
           <w14:ligatures w14:val="standardContextual"/>
         </w:rPr>
       </w:pPr>
-      <w:hyperlink w:anchor="_Toc242142869" w:history="1">
+      <w:hyperlink w:anchor="_Toc242180610" w:history="1">
         <w:r>
           <w:rPr>
             <w:rStyle w:val="Hyperlink"/>
@@ -6339,7 +6339,7 @@
             <w:noProof/>
             <w:webHidden/>
           </w:rPr>
-          <w:instrText xml:space="preserve"> PAGEREF _Toc242142869 \h </w:instrText>
+          <w:instrText xml:space="preserve"> PAGEREF _Toc242180610 \h </w:instrText>
         </w:r>
         <w:r>
           <w:rPr>
@@ -6382,7 +6382,7 @@
           <w14:ligatures w14:val="standardContextual"/>
         </w:rPr>
       </w:pPr>
-      <w:hyperlink w:anchor="_Toc242142870" w:history="1">
+      <w:hyperlink w:anchor="_Toc242180611" w:history="1">
         <w:r>
           <w:rPr>
             <w:rStyle w:val="Hyperlink"/>
@@ -6405,7 +6405,7 @@
           <w:rPr>
             <w:webHidden/>
           </w:rPr>
-          <w:instrText xml:space="preserve"> PAGEREF _Toc242142870 \h </w:instrText>
+          <w:instrText xml:space="preserve"> PAGEREF _Toc242180611 \h </w:instrText>
         </w:r>
         <w:r>
           <w:rPr>
@@ -6446,7 +6446,7 @@
           <w14:ligatures w14:val="standardContextual"/>
         </w:rPr>
       </w:pPr>
-      <w:hyperlink w:anchor="_Toc242142871" w:history="1">
+      <w:hyperlink w:anchor="_Toc242180612" w:history="1">
         <w:r>
           <w:rPr>
             <w:rStyle w:val="Hyperlink"/>
@@ -6473,7 +6473,7 @@
             <w:noProof/>
             <w:webHidden/>
           </w:rPr>
-          <w:instrText xml:space="preserve"> PAGEREF _Toc242142871 \h </w:instrText>
+          <w:instrText xml:space="preserve"> PAGEREF _Toc242180612 \h </w:instrText>
         </w:r>
         <w:r>
           <w:rPr>
@@ -6518,7 +6518,7 @@
           <w14:ligatures w14:val="standardContextual"/>
         </w:rPr>
       </w:pPr>
-      <w:hyperlink w:anchor="_Toc242142872" w:history="1">
+      <w:hyperlink w:anchor="_Toc242180613" w:history="1">
         <w:r>
           <w:rPr>
             <w:rStyle w:val="Hyperlink"/>
@@ -6545,7 +6545,7 @@
             <w:noProof/>
             <w:webHidden/>
           </w:rPr>
-          <w:instrText xml:space="preserve"> PAGEREF _Toc242142872 \h </w:instrText>
+          <w:instrText xml:space="preserve"> PAGEREF _Toc242180613 \h </w:instrText>
         </w:r>
         <w:r>
           <w:rPr>
@@ -6590,7 +6590,7 @@
           <w14:ligatures w14:val="standardContextual"/>
         </w:rPr>
       </w:pPr>
-      <w:hyperlink w:anchor="_Toc242142873" w:history="1">
+      <w:hyperlink w:anchor="_Toc242180614" w:history="1">
         <w:r>
           <w:rPr>
             <w:rStyle w:val="Hyperlink"/>
@@ -6617,7 +6617,7 @@
             <w:noProof/>
             <w:webHidden/>
           </w:rPr>
-          <w:instrText xml:space="preserve"> PAGEREF _Toc242142873 \h </w:instrText>
+          <w:instrText xml:space="preserve"> PAGEREF _Toc242180614 \h </w:instrText>
         </w:r>
         <w:r>
           <w:rPr>
@@ -6662,7 +6662,7 @@
           <w14:ligatures w14:val="standardContextual"/>
         </w:rPr>
       </w:pPr>
-      <w:hyperlink w:anchor="_Toc242142874" w:history="1">
+      <w:hyperlink w:anchor="_Toc242180615" w:history="1">
         <w:r>
           <w:rPr>
             <w:rStyle w:val="Hyperlink"/>
@@ -6689,7 +6689,7 @@
             <w:noProof/>
             <w:webHidden/>
           </w:rPr>
-          <w:instrText xml:space="preserve"> PAGEREF _Toc242142874 \h </w:instrText>
+          <w:instrText xml:space="preserve"> PAGEREF _Toc242180615 \h </w:instrText>
         </w:r>
         <w:r>
           <w:rPr>
@@ -6734,7 +6734,7 @@
           <w14:ligatures w14:val="standardContextual"/>
         </w:rPr>
       </w:pPr>
-      <w:hyperlink w:anchor="_Toc242142875" w:history="1">
+      <w:hyperlink w:anchor="_Toc242180616" w:history="1">
         <w:r>
           <w:rPr>
             <w:rStyle w:val="Hyperlink"/>
@@ -6761,7 +6761,7 @@
             <w:noProof/>
             <w:webHidden/>
           </w:rPr>
-          <w:instrText xml:space="preserve"> PAGEREF _Toc242142875 \h </w:instrText>
+          <w:instrText xml:space="preserve"> PAGEREF _Toc242180616 \h </w:instrText>
         </w:r>
         <w:r>
           <w:rPr>
@@ -6806,7 +6806,7 @@
           <w14:ligatures w14:val="standardContextual"/>
         </w:rPr>
       </w:pPr>
-      <w:hyperlink w:anchor="_Toc242142876" w:history="1">
+      <w:hyperlink w:anchor="_Toc242180617" w:history="1">
         <w:r>
           <w:rPr>
             <w:rStyle w:val="Hyperlink"/>
@@ -6833,7 +6833,7 @@
             <w:noProof/>
             <w:webHidden/>
           </w:rPr>
-          <w:instrText xml:space="preserve"> PAGEREF _Toc242142876 \h </w:instrText>
+          <w:instrText xml:space="preserve"> PAGEREF _Toc242180617 \h </w:instrText>
         </w:r>
         <w:r>
           <w:rPr>
@@ -6878,7 +6878,7 @@
           <w14:ligatures w14:val="standardContextual"/>
         </w:rPr>
       </w:pPr>
-      <w:hyperlink w:anchor="_Toc242142877" w:history="1">
+      <w:hyperlink w:anchor="_Toc242180618" w:history="1">
         <w:r>
           <w:rPr>
             <w:rStyle w:val="Hyperlink"/>
@@ -6905,7 +6905,7 @@
             <w:noProof/>
             <w:webHidden/>
           </w:rPr>
-          <w:instrText xml:space="preserve"> PAGEREF _Toc242142877 \h </w:instrText>
+          <w:instrText xml:space="preserve"> PAGEREF _Toc242180618 \h </w:instrText>
         </w:r>
         <w:r>
           <w:rPr>
@@ -6950,7 +6950,7 @@
           <w14:ligatures w14:val="standardContextual"/>
         </w:rPr>
       </w:pPr>
-      <w:hyperlink w:anchor="_Toc242142878" w:history="1">
+      <w:hyperlink w:anchor="_Toc242180619" w:history="1">
         <w:r>
           <w:rPr>
             <w:rStyle w:val="Hyperlink"/>
@@ -6977,7 +6977,7 @@
             <w:noProof/>
             <w:webHidden/>
           </w:rPr>
-          <w:instrText xml:space="preserve"> PAGEREF _Toc242142878 \h </w:instrText>
+          <w:instrText xml:space="preserve"> PAGEREF _Toc242180619 \h </w:instrText>
         </w:r>
         <w:r>
           <w:rPr>
@@ -7020,7 +7020,7 @@
           <w14:ligatures w14:val="standardContextual"/>
         </w:rPr>
       </w:pPr>
-      <w:hyperlink w:anchor="_Toc242142879" w:history="1">
+      <w:hyperlink w:anchor="_Toc242180620" w:history="1">
         <w:r>
           <w:rPr>
             <w:rStyle w:val="Hyperlink"/>
@@ -7043,7 +7043,7 @@
           <w:rPr>
             <w:webHidden/>
           </w:rPr>
-          <w:instrText xml:space="preserve"> PAGEREF _Toc242142879 \h </w:instrText>
+          <w:instrText xml:space="preserve"> PAGEREF _Toc242180620 \h </w:instrText>
         </w:r>
         <w:r>
           <w:rPr>
@@ -7084,7 +7084,7 @@
           <w14:ligatures w14:val="standardContextual"/>
         </w:rPr>
       </w:pPr>
-      <w:hyperlink w:anchor="_Toc242142880" w:history="1">
+      <w:hyperlink w:anchor="_Toc242180621" w:history="1">
         <w:r>
           <w:rPr>
             <w:rStyle w:val="Hyperlink"/>
@@ -7111,7 +7111,7 @@
             <w:noProof/>
             <w:webHidden/>
           </w:rPr>
-          <w:instrText xml:space="preserve"> PAGEREF _Toc242142880 \h </w:instrText>
+          <w:instrText xml:space="preserve"> PAGEREF _Toc242180621 \h </w:instrText>
         </w:r>
         <w:r>
           <w:rPr>
@@ -7156,7 +7156,7 @@
           <w14:ligatures w14:val="standardContextual"/>
         </w:rPr>
       </w:pPr>
-      <w:hyperlink w:anchor="_Toc242142881" w:history="1">
+      <w:hyperlink w:anchor="_Toc242180622" w:history="1">
         <w:r>
           <w:rPr>
             <w:rStyle w:val="Hyperlink"/>
@@ -7183,7 +7183,7 @@
             <w:noProof/>
             <w:webHidden/>
           </w:rPr>
-          <w:instrText xml:space="preserve"> PAGEREF _Toc242142881 \h </w:instrText>
+          <w:instrText xml:space="preserve"> PAGEREF _Toc242180622 \h </w:instrText>
         </w:r>
         <w:r>
           <w:rPr>
@@ -7226,7 +7226,7 @@
           <w14:ligatures w14:val="standardContextual"/>
         </w:rPr>
       </w:pPr>
-      <w:hyperlink w:anchor="_Toc242142882" w:history="1">
+      <w:hyperlink w:anchor="_Toc242180623" w:history="1">
         <w:r>
           <w:rPr>
             <w:rStyle w:val="Hyperlink"/>
@@ -7249,7 +7249,7 @@
           <w:rPr>
             <w:webHidden/>
           </w:rPr>
-          <w:instrText xml:space="preserve"> PAGEREF _Toc242142882 \h </w:instrText>
+          <w:instrText xml:space="preserve"> PAGEREF _Toc242180623 \h </w:instrText>
         </w:r>
         <w:r>
           <w:rPr>
@@ -7288,7 +7288,7 @@
           <w14:ligatures w14:val="standardContextual"/>
         </w:rPr>
       </w:pPr>
-      <w:hyperlink w:anchor="_Toc242142883" w:history="1">
+      <w:hyperlink w:anchor="_Toc242180624" w:history="1">
         <w:r>
           <w:rPr>
             <w:rStyle w:val="Hyperlink"/>
@@ -7311,7 +7311,7 @@
           <w:rPr>
             <w:webHidden/>
           </w:rPr>
-          <w:instrText xml:space="preserve"> PAGEREF _Toc242142883 \h </w:instrText>
+          <w:instrText xml:space="preserve"> PAGEREF _Toc242180624 \h </w:instrText>
         </w:r>
         <w:r>
           <w:rPr>
@@ -7352,7 +7352,7 @@
           <w14:ligatures w14:val="standardContextual"/>
         </w:rPr>
       </w:pPr>
-      <w:hyperlink w:anchor="_Toc242142884" w:history="1">
+      <w:hyperlink w:anchor="_Toc242180625" w:history="1">
         <w:r>
           <w:rPr>
             <w:rStyle w:val="Hyperlink"/>
@@ -7379,7 +7379,7 @@
             <w:noProof/>
             <w:webHidden/>
           </w:rPr>
-          <w:instrText xml:space="preserve"> PAGEREF _Toc242142884 \h </w:instrText>
+          <w:instrText xml:space="preserve"> PAGEREF _Toc242180625 \h </w:instrText>
         </w:r>
         <w:r>
           <w:rPr>
@@ -7424,7 +7424,7 @@
           <w14:ligatures w14:val="standardContextual"/>
         </w:rPr>
       </w:pPr>
-      <w:hyperlink w:anchor="_Toc242142885" w:history="1">
+      <w:hyperlink w:anchor="_Toc242180626" w:history="1">
         <w:r>
           <w:rPr>
             <w:rStyle w:val="Hyperlink"/>
@@ -7451,7 +7451,7 @@
             <w:noProof/>
             <w:webHidden/>
           </w:rPr>
-          <w:instrText xml:space="preserve"> PAGEREF _Toc242142885 \h </w:instrText>
+          <w:instrText xml:space="preserve"> PAGEREF _Toc242180626 \h </w:instrText>
         </w:r>
         <w:r>
           <w:rPr>
@@ -7496,7 +7496,7 @@
           <w14:ligatures w14:val="standardContextual"/>
         </w:rPr>
       </w:pPr>
-      <w:hyperlink w:anchor="_Toc242142886" w:history="1">
+      <w:hyperlink w:anchor="_Toc242180627" w:history="1">
         <w:r>
           <w:rPr>
             <w:rStyle w:val="Hyperlink"/>
@@ -7523,7 +7523,7 @@
             <w:noProof/>
             <w:webHidden/>
           </w:rPr>
-          <w:instrText xml:space="preserve"> PAGEREF _Toc242142886 \h </w:instrText>
+          <w:instrText xml:space="preserve"> PAGEREF _Toc242180627 \h </w:instrText>
         </w:r>
         <w:r>
           <w:rPr>
@@ -7568,7 +7568,7 @@
           <w14:ligatures w14:val="standardContextual"/>
         </w:rPr>
       </w:pPr>
-      <w:hyperlink w:anchor="_Toc242142887" w:history="1">
+      <w:hyperlink w:anchor="_Toc242180628" w:history="1">
         <w:r>
           <w:rPr>
             <w:rStyle w:val="Hyperlink"/>
@@ -7595,7 +7595,7 @@
             <w:noProof/>
             <w:webHidden/>
           </w:rPr>
-          <w:instrText xml:space="preserve"> PAGEREF _Toc242142887 \h </w:instrText>
+          <w:instrText xml:space="preserve"> PAGEREF _Toc242180628 \h </w:instrText>
         </w:r>
         <w:r>
           <w:rPr>
@@ -7640,7 +7640,7 @@
           <w14:ligatures w14:val="standardContextual"/>
         </w:rPr>
       </w:pPr>
-      <w:hyperlink w:anchor="_Toc242142888" w:history="1">
+      <w:hyperlink w:anchor="_Toc242180629" w:history="1">
         <w:r>
           <w:rPr>
             <w:rStyle w:val="Hyperlink"/>
@@ -7667,7 +7667,7 @@
             <w:noProof/>
             <w:webHidden/>
           </w:rPr>
-          <w:instrText xml:space="preserve"> PAGEREF _Toc242142888 \h </w:instrText>
+          <w:instrText xml:space="preserve"> PAGEREF _Toc242180629 \h </w:instrText>
         </w:r>
         <w:r>
           <w:rPr>
@@ -7712,7 +7712,7 @@
           <w14:ligatures w14:val="standardContextual"/>
         </w:rPr>
       </w:pPr>
-      <w:hyperlink w:anchor="_Toc242142889" w:history="1">
+      <w:hyperlink w:anchor="_Toc242180630" w:history="1">
         <w:r>
           <w:rPr>
             <w:rStyle w:val="Hyperlink"/>
@@ -7739,7 +7739,7 @@
             <w:noProof/>
             <w:webHidden/>
           </w:rPr>
-          <w:instrText xml:space="preserve"> PAGEREF _Toc242142889 \h </w:instrText>
+          <w:instrText xml:space="preserve"> PAGEREF _Toc242180630 \h </w:instrText>
         </w:r>
         <w:r>
           <w:rPr>
@@ -7784,7 +7784,7 @@
           <w14:ligatures w14:val="standardContextual"/>
         </w:rPr>
       </w:pPr>
-      <w:hyperlink w:anchor="_Toc242142890" w:history="1">
+      <w:hyperlink w:anchor="_Toc242180631" w:history="1">
         <w:r>
           <w:rPr>
             <w:rStyle w:val="Hyperlink"/>
@@ -7811,7 +7811,7 @@
             <w:noProof/>
             <w:webHidden/>
           </w:rPr>
-          <w:instrText xml:space="preserve"> PAGEREF _Toc242142890 \h </w:instrText>
+          <w:instrText xml:space="preserve"> PAGEREF _Toc242180631 \h </w:instrText>
         </w:r>
         <w:r>
           <w:rPr>
@@ -7856,7 +7856,7 @@
           <w14:ligatures w14:val="standardContextual"/>
         </w:rPr>
       </w:pPr>
-      <w:hyperlink w:anchor="_Toc242142891" w:history="1">
+      <w:hyperlink w:anchor="_Toc242180632" w:history="1">
         <w:r>
           <w:rPr>
             <w:rStyle w:val="Hyperlink"/>
@@ -7883,7 +7883,7 @@
             <w:noProof/>
             <w:webHidden/>
           </w:rPr>
-          <w:instrText xml:space="preserve"> PAGEREF _Toc242142891 \h </w:instrText>
+          <w:instrText xml:space="preserve"> PAGEREF _Toc242180632 \h </w:instrText>
         </w:r>
         <w:r>
           <w:rPr>
@@ -7928,7 +7928,7 @@
           <w14:ligatures w14:val="standardContextual"/>
         </w:rPr>
       </w:pPr>
-      <w:hyperlink w:anchor="_Toc242142892" w:history="1">
+      <w:hyperlink w:anchor="_Toc242180633" w:history="1">
         <w:r>
           <w:rPr>
             <w:rStyle w:val="Hyperlink"/>
@@ -7955,7 +7955,7 @@
             <w:noProof/>
             <w:webHidden/>
           </w:rPr>
-          <w:instrText xml:space="preserve"> PAGEREF _Toc242142892 \h </w:instrText>
+          <w:instrText xml:space="preserve"> PAGEREF _Toc242180633 \h </w:instrText>
         </w:r>
         <w:r>
           <w:rPr>
@@ -8000,7 +8000,7 @@
           <w14:ligatures w14:val="standardContextual"/>
         </w:rPr>
       </w:pPr>
-      <w:hyperlink w:anchor="_Toc242142893" w:history="1">
+      <w:hyperlink w:anchor="_Toc242180634" w:history="1">
         <w:r>
           <w:rPr>
             <w:rStyle w:val="Hyperlink"/>
@@ -8027,7 +8027,7 @@
             <w:noProof/>
             <w:webHidden/>
           </w:rPr>
-          <w:instrText xml:space="preserve"> PAGEREF _Toc242142893 \h </w:instrText>
+          <w:instrText xml:space="preserve"> PAGEREF _Toc242180634 \h </w:instrText>
         </w:r>
         <w:r>
           <w:rPr>
@@ -8072,7 +8072,7 @@
           <w14:ligatures w14:val="standardContextual"/>
         </w:rPr>
       </w:pPr>
-      <w:hyperlink w:anchor="_Toc242142894" w:history="1">
+      <w:hyperlink w:anchor="_Toc242180635" w:history="1">
         <w:r>
           <w:rPr>
             <w:rStyle w:val="Hyperlink"/>
@@ -8099,7 +8099,7 @@
             <w:noProof/>
             <w:webHidden/>
           </w:rPr>
-          <w:instrText xml:space="preserve"> PAGEREF _Toc242142894 \h </w:instrText>
+          <w:instrText xml:space="preserve"> PAGEREF _Toc242180635 \h </w:instrText>
         </w:r>
         <w:r>
           <w:rPr>
@@ -8144,7 +8144,7 @@
           <w14:ligatures w14:val="standardContextual"/>
         </w:rPr>
       </w:pPr>
-      <w:hyperlink w:anchor="_Toc242142895" w:history="1">
+      <w:hyperlink w:anchor="_Toc242180636" w:history="1">
         <w:r>
           <w:rPr>
             <w:rStyle w:val="Hyperlink"/>
@@ -8171,7 +8171,7 @@
             <w:noProof/>
             <w:webHidden/>
           </w:rPr>
-          <w:instrText xml:space="preserve"> PAGEREF _Toc242142895 \h </w:instrText>
+          <w:instrText xml:space="preserve"> PAGEREF _Toc242180636 \h </w:instrText>
         </w:r>
         <w:r>
           <w:rPr>
@@ -8216,7 +8216,7 @@
           <w14:ligatures w14:val="standardContextual"/>
         </w:rPr>
       </w:pPr>
-      <w:hyperlink w:anchor="_Toc242142896" w:history="1">
+      <w:hyperlink w:anchor="_Toc242180637" w:history="1">
         <w:r>
           <w:rPr>
             <w:rStyle w:val="Hyperlink"/>
@@ -8243,7 +8243,7 @@
             <w:noProof/>
             <w:webHidden/>
           </w:rPr>
-          <w:instrText xml:space="preserve"> PAGEREF _Toc242142896 \h </w:instrText>
+          <w:instrText xml:space="preserve"> PAGEREF _Toc242180637 \h </w:instrText>
         </w:r>
         <w:r>
           <w:rPr>
@@ -8288,7 +8288,7 @@
           <w14:ligatures w14:val="standardContextual"/>
         </w:rPr>
       </w:pPr>
-      <w:hyperlink w:anchor="_Toc242142897" w:history="1">
+      <w:hyperlink w:anchor="_Toc242180638" w:history="1">
         <w:r>
           <w:rPr>
             <w:rStyle w:val="Hyperlink"/>
@@ -8315,7 +8315,7 @@
             <w:noProof/>
             <w:webHidden/>
           </w:rPr>
-          <w:instrText xml:space="preserve"> PAGEREF _Toc242142897 \h </w:instrText>
+          <w:instrText xml:space="preserve"> PAGEREF _Toc242180638 \h </w:instrText>
         </w:r>
         <w:r>
           <w:rPr>
@@ -8360,7 +8360,7 @@
           <w14:ligatures w14:val="standardContextual"/>
         </w:rPr>
       </w:pPr>
-      <w:hyperlink w:anchor="_Toc242142898" w:history="1">
+      <w:hyperlink w:anchor="_Toc242180639" w:history="1">
         <w:r>
           <w:rPr>
             <w:rStyle w:val="Hyperlink"/>
@@ -8387,7 +8387,7 @@
             <w:noProof/>
             <w:webHidden/>
           </w:rPr>
-          <w:instrText xml:space="preserve"> PAGEREF _Toc242142898 \h </w:instrText>
+          <w:instrText xml:space="preserve"> PAGEREF _Toc242180639 \h </w:instrText>
         </w:r>
         <w:r>
           <w:rPr>
@@ -8432,7 +8432,7 @@
           <w14:ligatures w14:val="standardContextual"/>
         </w:rPr>
       </w:pPr>
-      <w:hyperlink w:anchor="_Toc242142899" w:history="1">
+      <w:hyperlink w:anchor="_Toc242180640" w:history="1">
         <w:r>
           <w:rPr>
             <w:rStyle w:val="Hyperlink"/>
@@ -8459,7 +8459,7 @@
             <w:noProof/>
             <w:webHidden/>
           </w:rPr>
-          <w:instrText xml:space="preserve"> PAGEREF _Toc242142899 \h </w:instrText>
+          <w:instrText xml:space="preserve"> PAGEREF _Toc242180640 \h </w:instrText>
         </w:r>
         <w:r>
           <w:rPr>
@@ -8504,7 +8504,7 @@
           <w14:ligatures w14:val="standardContextual"/>
         </w:rPr>
       </w:pPr>
-      <w:hyperlink w:anchor="_Toc242142900" w:history="1">
+      <w:hyperlink w:anchor="_Toc242180641" w:history="1">
         <w:r>
           <w:rPr>
             <w:rStyle w:val="Hyperlink"/>
@@ -8531,7 +8531,7 @@
             <w:noProof/>
             <w:webHidden/>
           </w:rPr>
-          <w:instrText xml:space="preserve"> PAGEREF _Toc242142900 \h </w:instrText>
+          <w:instrText xml:space="preserve"> PAGEREF _Toc242180641 \h </w:instrText>
         </w:r>
         <w:r>
           <w:rPr>
@@ -8576,7 +8576,7 @@
           <w14:ligatures w14:val="standardContextual"/>
         </w:rPr>
       </w:pPr>
-      <w:hyperlink w:anchor="_Toc242142901" w:history="1">
+      <w:hyperlink w:anchor="_Toc242180642" w:history="1">
         <w:r>
           <w:rPr>
             <w:rStyle w:val="Hyperlink"/>
@@ -8603,7 +8603,7 @@
             <w:noProof/>
             <w:webHidden/>
           </w:rPr>
-          <w:instrText xml:space="preserve"> PAGEREF _Toc242142901 \h </w:instrText>
+          <w:instrText xml:space="preserve"> PAGEREF _Toc242180642 \h </w:instrText>
         </w:r>
         <w:r>
           <w:rPr>
@@ -8648,7 +8648,7 @@
           <w14:ligatures w14:val="standardContextual"/>
         </w:rPr>
       </w:pPr>
-      <w:hyperlink w:anchor="_Toc242142902" w:history="1">
+      <w:hyperlink w:anchor="_Toc242180643" w:history="1">
         <w:r>
           <w:rPr>
             <w:rStyle w:val="Hyperlink"/>
@@ -8675,7 +8675,7 @@
             <w:noProof/>
             <w:webHidden/>
           </w:rPr>
-          <w:instrText xml:space="preserve"> PAGEREF _Toc242142902 \h </w:instrText>
+          <w:instrText xml:space="preserve"> PAGEREF _Toc242180643 \h </w:instrText>
         </w:r>
         <w:r>
           <w:rPr>
@@ -8720,7 +8720,7 @@
           <w14:ligatures w14:val="standardContextual"/>
         </w:rPr>
       </w:pPr>
-      <w:hyperlink w:anchor="_Toc242142903" w:history="1">
+      <w:hyperlink w:anchor="_Toc242180644" w:history="1">
         <w:r>
           <w:rPr>
             <w:rStyle w:val="Hyperlink"/>
@@ -8747,7 +8747,7 @@
             <w:noProof/>
             <w:webHidden/>
           </w:rPr>
-          <w:instrText xml:space="preserve"> PAGEREF _Toc242142903 \h </w:instrText>
+          <w:instrText xml:space="preserve"> PAGEREF _Toc242180644 \h </w:instrText>
         </w:r>
         <w:r>
           <w:rPr>
@@ -8792,7 +8792,7 @@
           <w14:ligatures w14:val="standardContextual"/>
         </w:rPr>
       </w:pPr>
-      <w:hyperlink w:anchor="_Toc242142904" w:history="1">
+      <w:hyperlink w:anchor="_Toc242180645" w:history="1">
         <w:r>
           <w:rPr>
             <w:rStyle w:val="Hyperlink"/>
@@ -8819,7 +8819,7 @@
             <w:noProof/>
             <w:webHidden/>
           </w:rPr>
-          <w:instrText xml:space="preserve"> PAGEREF _Toc242142904 \h </w:instrText>
+          <w:instrText xml:space="preserve"> PAGEREF _Toc242180645 \h </w:instrText>
         </w:r>
         <w:r>
           <w:rPr>
@@ -8864,7 +8864,7 @@
           <w14:ligatures w14:val="standardContextual"/>
         </w:rPr>
       </w:pPr>
-      <w:hyperlink w:anchor="_Toc242142905" w:history="1">
+      <w:hyperlink w:anchor="_Toc242180646" w:history="1">
         <w:r>
           <w:rPr>
             <w:rStyle w:val="Hyperlink"/>
@@ -8891,7 +8891,7 @@
             <w:noProof/>
             <w:webHidden/>
           </w:rPr>
-          <w:instrText xml:space="preserve"> PAGEREF _Toc242142905 \h </w:instrText>
+          <w:instrText xml:space="preserve"> PAGEREF _Toc242180646 \h </w:instrText>
         </w:r>
         <w:r>
           <w:rPr>
@@ -8936,7 +8936,7 @@
           <w14:ligatures w14:val="standardContextual"/>
         </w:rPr>
       </w:pPr>
-      <w:hyperlink w:anchor="_Toc242142906" w:history="1">
+      <w:hyperlink w:anchor="_Toc242180647" w:history="1">
         <w:r>
           <w:rPr>
             <w:rStyle w:val="Hyperlink"/>
@@ -8963,7 +8963,7 @@
             <w:noProof/>
             <w:webHidden/>
           </w:rPr>
-          <w:instrText xml:space="preserve"> PAGEREF _Toc242142906 \h </w:instrText>
+          <w:instrText xml:space="preserve"> PAGEREF _Toc242180647 \h </w:instrText>
         </w:r>
         <w:r>
           <w:rPr>
@@ -9008,7 +9008,7 @@
           <w14:ligatures w14:val="standardContextual"/>
         </w:rPr>
       </w:pPr>
-      <w:hyperlink w:anchor="_Toc242142907" w:history="1">
+      <w:hyperlink w:anchor="_Toc242180648" w:history="1">
         <w:r>
           <w:rPr>
             <w:rStyle w:val="Hyperlink"/>
@@ -9035,7 +9035,7 @@
             <w:noProof/>
             <w:webHidden/>
           </w:rPr>
-          <w:instrText xml:space="preserve"> PAGEREF _Toc242142907 \h </w:instrText>
+          <w:instrText xml:space="preserve"> PAGEREF _Toc242180648 \h </w:instrText>
         </w:r>
         <w:r>
           <w:rPr>
@@ -9080,7 +9080,7 @@
           <w14:ligatures w14:val="standardContextual"/>
         </w:rPr>
       </w:pPr>
-      <w:hyperlink w:anchor="_Toc242142908" w:history="1">
+      <w:hyperlink w:anchor="_Toc242180649" w:history="1">
         <w:r>
           <w:rPr>
             <w:rStyle w:val="Hyperlink"/>
@@ -9107,7 +9107,7 @@
             <w:noProof/>
             <w:webHidden/>
           </w:rPr>
-          <w:instrText xml:space="preserve"> PAGEREF _Toc242142908 \h </w:instrText>
+          <w:instrText xml:space="preserve"> PAGEREF _Toc242180649 \h </w:instrText>
         </w:r>
         <w:r>
           <w:rPr>
@@ -9152,7 +9152,7 @@
           <w14:ligatures w14:val="standardContextual"/>
         </w:rPr>
       </w:pPr>
-      <w:hyperlink w:anchor="_Toc242142909" w:history="1">
+      <w:hyperlink w:anchor="_Toc242180650" w:history="1">
         <w:r>
           <w:rPr>
             <w:rStyle w:val="Hyperlink"/>
@@ -9179,7 +9179,7 @@
             <w:noProof/>
             <w:webHidden/>
           </w:rPr>
-          <w:instrText xml:space="preserve"> PAGEREF _Toc242142909 \h </w:instrText>
+          <w:instrText xml:space="preserve"> PAGEREF _Toc242180650 \h </w:instrText>
         </w:r>
         <w:r>
           <w:rPr>
@@ -9224,7 +9224,7 @@
           <w14:ligatures w14:val="standardContextual"/>
         </w:rPr>
       </w:pPr>
-      <w:hyperlink w:anchor="_Toc242142910" w:history="1">
+      <w:hyperlink w:anchor="_Toc242180651" w:history="1">
         <w:r>
           <w:rPr>
             <w:rStyle w:val="Hyperlink"/>
@@ -9251,7 +9251,7 @@
             <w:noProof/>
             <w:webHidden/>
           </w:rPr>
-          <w:instrText xml:space="preserve"> PAGEREF _Toc242142910 \h </w:instrText>
+          <w:instrText xml:space="preserve"> PAGEREF _Toc242180651 \h </w:instrText>
         </w:r>
         <w:r>
           <w:rPr>
@@ -9296,7 +9296,7 @@
           <w14:ligatures w14:val="standardContextual"/>
         </w:rPr>
       </w:pPr>
-      <w:hyperlink w:anchor="_Toc242142911" w:history="1">
+      <w:hyperlink w:anchor="_Toc242180652" w:history="1">
         <w:r>
           <w:rPr>
             <w:rStyle w:val="Hyperlink"/>
@@ -9323,7 +9323,7 @@
             <w:noProof/>
             <w:webHidden/>
           </w:rPr>
-          <w:instrText xml:space="preserve"> PAGEREF _Toc242142911 \h </w:instrText>
+          <w:instrText xml:space="preserve"> PAGEREF _Toc242180652 \h </w:instrText>
         </w:r>
         <w:r>
           <w:rPr>
@@ -9368,7 +9368,7 @@
           <w14:ligatures w14:val="standardContextual"/>
         </w:rPr>
       </w:pPr>
-      <w:hyperlink w:anchor="_Toc242142912" w:history="1">
+      <w:hyperlink w:anchor="_Toc242180653" w:history="1">
         <w:r>
           <w:rPr>
             <w:rStyle w:val="Hyperlink"/>
@@ -9395,7 +9395,7 @@
             <w:noProof/>
             <w:webHidden/>
           </w:rPr>
-          <w:instrText xml:space="preserve"> PAGEREF _Toc242142912 \h </w:instrText>
+          <w:instrText xml:space="preserve"> PAGEREF _Toc242180653 \h </w:instrText>
         </w:r>
         <w:r>
           <w:rPr>
@@ -9440,7 +9440,7 @@
           <w14:ligatures w14:val="standardContextual"/>
         </w:rPr>
       </w:pPr>
-      <w:hyperlink w:anchor="_Toc242142913" w:history="1">
+      <w:hyperlink w:anchor="_Toc242180654" w:history="1">
         <w:r>
           <w:rPr>
             <w:rStyle w:val="Hyperlink"/>
@@ -9467,7 +9467,7 @@
             <w:noProof/>
             <w:webHidden/>
           </w:rPr>
-          <w:instrText xml:space="preserve"> PAGEREF _Toc242142913 \h </w:instrText>
+          <w:instrText xml:space="preserve"> PAGEREF _Toc242180654 \h </w:instrText>
         </w:r>
         <w:r>
           <w:rPr>
@@ -9512,7 +9512,7 @@
           <w14:ligatures w14:val="standardContextual"/>
         </w:rPr>
       </w:pPr>
-      <w:hyperlink w:anchor="_Toc242142914" w:history="1">
+      <w:hyperlink w:anchor="_Toc242180655" w:history="1">
         <w:r>
           <w:rPr>
             <w:rStyle w:val="Hyperlink"/>
@@ -9539,7 +9539,7 @@
             <w:noProof/>
             <w:webHidden/>
           </w:rPr>
-          <w:instrText xml:space="preserve"> PAGEREF _Toc242142914 \h </w:instrText>
+          <w:instrText xml:space="preserve"> PAGEREF _Toc242180655 \h </w:instrText>
         </w:r>
         <w:r>
           <w:rPr>
@@ -9584,7 +9584,7 @@
           <w14:ligatures w14:val="standardContextual"/>
         </w:rPr>
       </w:pPr>
-      <w:hyperlink w:anchor="_Toc242142915" w:history="1">
+      <w:hyperlink w:anchor="_Toc242180656" w:history="1">
         <w:r>
           <w:rPr>
             <w:rStyle w:val="Hyperlink"/>
@@ -9611,7 +9611,7 @@
             <w:noProof/>
             <w:webHidden/>
           </w:rPr>
-          <w:instrText xml:space="preserve"> PAGEREF _Toc242142915 \h </w:instrText>
+          <w:instrText xml:space="preserve"> PAGEREF _Toc242180656 \h </w:instrText>
         </w:r>
         <w:r>
           <w:rPr>
@@ -9656,7 +9656,7 @@
           <w14:ligatures w14:val="standardContextual"/>
         </w:rPr>
       </w:pPr>
-      <w:hyperlink w:anchor="_Toc242142916" w:history="1">
+      <w:hyperlink w:anchor="_Toc242180657" w:history="1">
         <w:r>
           <w:rPr>
             <w:rStyle w:val="Hyperlink"/>
@@ -9683,7 +9683,7 @@
             <w:noProof/>
             <w:webHidden/>
           </w:rPr>
-          <w:instrText xml:space="preserve"> PAGEREF _Toc242142916 \h </w:instrText>
+          <w:instrText xml:space="preserve"> PAGEREF _Toc242180657 \h </w:instrText>
         </w:r>
         <w:r>
           <w:rPr>
@@ -9728,7 +9728,7 @@
           <w14:ligatures w14:val="standardContextual"/>
         </w:rPr>
       </w:pPr>
-      <w:hyperlink w:anchor="_Toc242142917" w:history="1">
+      <w:hyperlink w:anchor="_Toc242180658" w:history="1">
         <w:r>
           <w:rPr>
             <w:rStyle w:val="Hyperlink"/>
@@ -9755,7 +9755,7 @@
             <w:noProof/>
             <w:webHidden/>
           </w:rPr>
-          <w:instrText xml:space="preserve"> PAGEREF _Toc242142917 \h </w:instrText>
+          <w:instrText xml:space="preserve"> PAGEREF _Toc242180658 \h </w:instrText>
         </w:r>
         <w:r>
           <w:rPr>
@@ -9800,7 +9800,7 @@
           <w14:ligatures w14:val="standardContextual"/>
         </w:rPr>
       </w:pPr>
-      <w:hyperlink w:anchor="_Toc242142918" w:history="1">
+      <w:hyperlink w:anchor="_Toc242180659" w:history="1">
         <w:r>
           <w:rPr>
             <w:rStyle w:val="Hyperlink"/>
@@ -9827,7 +9827,7 @@
             <w:noProof/>
             <w:webHidden/>
           </w:rPr>
-          <w:instrText xml:space="preserve"> PAGEREF _Toc242142918 \h </w:instrText>
+          <w:instrText xml:space="preserve"> PAGEREF _Toc242180659 \h </w:instrText>
         </w:r>
         <w:r>
           <w:rPr>
@@ -9872,7 +9872,7 @@
           <w14:ligatures w14:val="standardContextual"/>
         </w:rPr>
       </w:pPr>
-      <w:hyperlink w:anchor="_Toc242142919" w:history="1">
+      <w:hyperlink w:anchor="_Toc242180660" w:history="1">
         <w:r>
           <w:rPr>
             <w:rStyle w:val="Hyperlink"/>
@@ -9899,7 +9899,7 @@
             <w:noProof/>
             <w:webHidden/>
           </w:rPr>
-          <w:instrText xml:space="preserve"> PAGEREF _Toc242142919 \h </w:instrText>
+          <w:instrText xml:space="preserve"> PAGEREF _Toc242180660 \h </w:instrText>
         </w:r>
         <w:r>
           <w:rPr>
@@ -9944,7 +9944,7 @@
           <w14:ligatures w14:val="standardContextual"/>
         </w:rPr>
       </w:pPr>
-      <w:hyperlink w:anchor="_Toc242142920" w:history="1">
+      <w:hyperlink w:anchor="_Toc242180661" w:history="1">
         <w:r>
           <w:rPr>
             <w:rStyle w:val="Hyperlink"/>
@@ -9971,7 +9971,7 @@
             <w:noProof/>
             <w:webHidden/>
           </w:rPr>
-          <w:instrText xml:space="preserve"> PAGEREF _Toc242142920 \h </w:instrText>
+          <w:instrText xml:space="preserve"> PAGEREF _Toc242180661 \h </w:instrText>
         </w:r>
         <w:r>
           <w:rPr>
@@ -10016,7 +10016,7 @@
           <w14:ligatures w14:val="standardContextual"/>
         </w:rPr>
       </w:pPr>
-      <w:hyperlink w:anchor="_Toc242142921" w:history="1">
+      <w:hyperlink w:anchor="_Toc242180662" w:history="1">
         <w:r>
           <w:rPr>
             <w:rStyle w:val="Hyperlink"/>
@@ -10043,7 +10043,7 @@
             <w:noProof/>
             <w:webHidden/>
           </w:rPr>
-          <w:instrText xml:space="preserve"> PAGEREF _Toc242142921 \h </w:instrText>
+          <w:instrText xml:space="preserve"> PAGEREF _Toc242180662 \h </w:instrText>
         </w:r>
         <w:r>
           <w:rPr>
@@ -10088,7 +10088,7 @@
           <w14:ligatures w14:val="standardContextual"/>
         </w:rPr>
       </w:pPr>
-      <w:hyperlink w:anchor="_Toc242142922" w:history="1">
+      <w:hyperlink w:anchor="_Toc242180663" w:history="1">
         <w:r>
           <w:rPr>
             <w:rStyle w:val="Hyperlink"/>
@@ -10115,7 +10115,7 @@
             <w:noProof/>
             <w:webHidden/>
           </w:rPr>
-          <w:instrText xml:space="preserve"> PAGEREF _Toc242142922 \h </w:instrText>
+          <w:instrText xml:space="preserve"> PAGEREF _Toc242180663 \h </w:instrText>
         </w:r>
         <w:r>
           <w:rPr>
@@ -10160,7 +10160,7 @@
           <w14:ligatures w14:val="standardContextual"/>
         </w:rPr>
       </w:pPr>
-      <w:hyperlink w:anchor="_Toc242142923" w:history="1">
+      <w:hyperlink w:anchor="_Toc242180664" w:history="1">
         <w:r>
           <w:rPr>
             <w:rStyle w:val="Hyperlink"/>
@@ -10187,7 +10187,7 @@
             <w:noProof/>
             <w:webHidden/>
           </w:rPr>
-          <w:instrText xml:space="preserve"> PAGEREF _Toc242142923 \h </w:instrText>
+          <w:instrText xml:space="preserve"> PAGEREF _Toc242180664 \h </w:instrText>
         </w:r>
         <w:r>
           <w:rPr>
@@ -10232,7 +10232,7 @@
           <w14:ligatures w14:val="standardContextual"/>
         </w:rPr>
       </w:pPr>
-      <w:hyperlink w:anchor="_Toc242142924" w:history="1">
+      <w:hyperlink w:anchor="_Toc242180665" w:history="1">
         <w:r>
           <w:rPr>
             <w:rStyle w:val="Hyperlink"/>
@@ -10259,7 +10259,7 @@
             <w:noProof/>
             <w:webHidden/>
           </w:rPr>
-          <w:instrText xml:space="preserve"> PAGEREF _Toc242142924 \h </w:instrText>
+          <w:instrText xml:space="preserve"> PAGEREF _Toc242180665 \h </w:instrText>
         </w:r>
         <w:r>
           <w:rPr>
@@ -10333,7 +10333,7 @@
       <w:r>
         <w:fldChar w:fldCharType="separate"/>
       </w:r>
-      <w:hyperlink w:anchor="_Toc242142925" w:history="1">
+      <w:hyperlink w:anchor="_Toc242180666" w:history="1">
         <w:r>
           <w:rPr>
             <w:rStyle w:val="Hyperlink"/>
@@ -10357,7 +10357,7 @@
           <w:rPr>
             <w:webHidden/>
           </w:rPr>
-          <w:instrText xml:space="preserve"> PAGEREF _Toc242142925 \h </w:instrText>
+          <w:instrText xml:space="preserve"> PAGEREF _Toc242180666 \h </w:instrText>
         </w:r>
         <w:r>
           <w:rPr>
@@ -10395,7 +10395,7 @@
           <w14:ligatures w14:val="standardContextual"/>
         </w:rPr>
       </w:pPr>
-      <w:hyperlink w:anchor="_Toc242142926" w:history="1">
+      <w:hyperlink w:anchor="_Toc242180667" w:history="1">
         <w:r>
           <w:rPr>
             <w:rStyle w:val="Hyperlink"/>
@@ -10419,7 +10419,7 @@
           <w:rPr>
             <w:webHidden/>
           </w:rPr>
-          <w:instrText xml:space="preserve"> PAGEREF _Toc242142926 \h </w:instrText>
+          <w:instrText xml:space="preserve"> PAGEREF _Toc242180667 \h </w:instrText>
         </w:r>
         <w:r>
           <w:rPr>
@@ -10457,7 +10457,7 @@
           <w14:ligatures w14:val="standardContextual"/>
         </w:rPr>
       </w:pPr>
-      <w:hyperlink w:anchor="_Toc242142927" w:history="1">
+      <w:hyperlink w:anchor="_Toc242180668" w:history="1">
         <w:r>
           <w:rPr>
             <w:rStyle w:val="Hyperlink"/>
@@ -10481,7 +10481,7 @@
           <w:rPr>
             <w:webHidden/>
           </w:rPr>
-          <w:instrText xml:space="preserve"> PAGEREF _Toc242142927 \h </w:instrText>
+          <w:instrText xml:space="preserve"> PAGEREF _Toc242180668 \h </w:instrText>
         </w:r>
         <w:r>
           <w:rPr>
@@ -10519,7 +10519,7 @@
           <w14:ligatures w14:val="standardContextual"/>
         </w:rPr>
       </w:pPr>
-      <w:hyperlink w:anchor="_Toc242142928" w:history="1">
+      <w:hyperlink w:anchor="_Toc242180669" w:history="1">
         <w:r>
           <w:rPr>
             <w:rStyle w:val="Hyperlink"/>
@@ -10543,7 +10543,7 @@
           <w:rPr>
             <w:webHidden/>
           </w:rPr>
-          <w:instrText xml:space="preserve"> PAGEREF _Toc242142928 \h </w:instrText>
+          <w:instrText xml:space="preserve"> PAGEREF _Toc242180669 \h </w:instrText>
         </w:r>
         <w:r>
           <w:rPr>
@@ -10581,7 +10581,7 @@
           <w14:ligatures w14:val="standardContextual"/>
         </w:rPr>
       </w:pPr>
-      <w:hyperlink w:anchor="_Toc242142929" w:history="1">
+      <w:hyperlink w:anchor="_Toc242180670" w:history="1">
         <w:r>
           <w:rPr>
             <w:rStyle w:val="Hyperlink"/>
@@ -10605,7 +10605,7 @@
           <w:rPr>
             <w:webHidden/>
           </w:rPr>
-          <w:instrText xml:space="preserve"> PAGEREF _Toc242142929 \h </w:instrText>
+          <w:instrText xml:space="preserve"> PAGEREF _Toc242180670 \h </w:instrText>
         </w:r>
         <w:r>
           <w:rPr>
@@ -10643,7 +10643,7 @@
           <w14:ligatures w14:val="standardContextual"/>
         </w:rPr>
       </w:pPr>
-      <w:hyperlink w:anchor="_Toc242142930" w:history="1">
+      <w:hyperlink w:anchor="_Toc242180671" w:history="1">
         <w:r>
           <w:rPr>
             <w:rStyle w:val="Hyperlink"/>
@@ -10667,7 +10667,7 @@
           <w:rPr>
             <w:webHidden/>
           </w:rPr>
-          <w:instrText xml:space="preserve"> PAGEREF _Toc242142930 \h </w:instrText>
+          <w:instrText xml:space="preserve"> PAGEREF _Toc242180671 \h </w:instrText>
         </w:r>
         <w:r>
           <w:rPr>
@@ -10705,7 +10705,7 @@
           <w14:ligatures w14:val="standardContextual"/>
         </w:rPr>
       </w:pPr>
-      <w:hyperlink w:anchor="_Toc242142931" w:history="1">
+      <w:hyperlink w:anchor="_Toc242180672" w:history="1">
         <w:r>
           <w:rPr>
             <w:rStyle w:val="Hyperlink"/>
@@ -10729,7 +10729,7 @@
           <w:rPr>
             <w:webHidden/>
           </w:rPr>
-          <w:instrText xml:space="preserve"> PAGEREF _Toc242142931 \h </w:instrText>
+          <w:instrText xml:space="preserve"> PAGEREF _Toc242180672 \h </w:instrText>
         </w:r>
         <w:r>
           <w:rPr>
@@ -10767,7 +10767,7 @@
           <w14:ligatures w14:val="standardContextual"/>
         </w:rPr>
       </w:pPr>
-      <w:hyperlink w:anchor="_Toc242142932" w:history="1">
+      <w:hyperlink w:anchor="_Toc242180673" w:history="1">
         <w:r>
           <w:rPr>
             <w:rStyle w:val="Hyperlink"/>
@@ -10791,7 +10791,7 @@
           <w:rPr>
             <w:webHidden/>
           </w:rPr>
-          <w:instrText xml:space="preserve"> PAGEREF _Toc242142932 \h </w:instrText>
+          <w:instrText xml:space="preserve"> PAGEREF _Toc242180673 \h </w:instrText>
         </w:r>
         <w:r>
           <w:rPr>
@@ -10829,7 +10829,7 @@
           <w14:ligatures w14:val="standardContextual"/>
         </w:rPr>
       </w:pPr>
-      <w:hyperlink w:anchor="_Toc242142933" w:history="1">
+      <w:hyperlink w:anchor="_Toc242180674" w:history="1">
         <w:r>
           <w:rPr>
             <w:rStyle w:val="Hyperlink"/>
@@ -10853,7 +10853,7 @@
           <w:rPr>
             <w:webHidden/>
           </w:rPr>
-          <w:instrText xml:space="preserve"> PAGEREF _Toc242142933 \h </w:instrText>
+          <w:instrText xml:space="preserve"> PAGEREF _Toc242180674 \h </w:instrText>
         </w:r>
         <w:r>
           <w:rPr>
@@ -10891,7 +10891,7 @@
           <w14:ligatures w14:val="standardContextual"/>
         </w:rPr>
       </w:pPr>
-      <w:hyperlink w:anchor="_Toc242142934" w:history="1">
+      <w:hyperlink w:anchor="_Toc242180675" w:history="1">
         <w:r>
           <w:rPr>
             <w:rStyle w:val="Hyperlink"/>
@@ -10915,7 +10915,7 @@
           <w:rPr>
             <w:webHidden/>
           </w:rPr>
-          <w:instrText xml:space="preserve"> PAGEREF _Toc242142934 \h </w:instrText>
+          <w:instrText xml:space="preserve"> PAGEREF _Toc242180675 \h </w:instrText>
         </w:r>
         <w:r>
           <w:rPr>
@@ -10953,7 +10953,7 @@
           <w14:ligatures w14:val="standardContextual"/>
         </w:rPr>
       </w:pPr>
-      <w:hyperlink w:anchor="_Toc242142935" w:history="1">
+      <w:hyperlink w:anchor="_Toc242180676" w:history="1">
         <w:r>
           <w:rPr>
             <w:rStyle w:val="Hyperlink"/>
@@ -10976,7 +10976,7 @@
           <w:rPr>
             <w:webHidden/>
           </w:rPr>
-          <w:instrText xml:space="preserve"> PAGEREF _Toc242142935 \h </w:instrText>
+          <w:instrText xml:space="preserve"> PAGEREF _Toc242180676 \h </w:instrText>
         </w:r>
         <w:r>
           <w:rPr>
@@ -11014,7 +11014,7 @@
           <w14:ligatures w14:val="standardContextual"/>
         </w:rPr>
       </w:pPr>
-      <w:hyperlink w:anchor="_Toc242142936" w:history="1">
+      <w:hyperlink w:anchor="_Toc242180677" w:history="1">
         <w:r>
           <w:rPr>
             <w:rStyle w:val="Hyperlink"/>
@@ -11037,7 +11037,7 @@
           <w:rPr>
             <w:webHidden/>
           </w:rPr>
-          <w:instrText xml:space="preserve"> PAGEREF _Toc242142936 \h </w:instrText>
+          <w:instrText xml:space="preserve"> PAGEREF _Toc242180677 \h </w:instrText>
         </w:r>
         <w:r>
           <w:rPr>
@@ -11075,7 +11075,7 @@
           <w14:ligatures w14:val="standardContextual"/>
         </w:rPr>
       </w:pPr>
-      <w:hyperlink w:anchor="_Toc242142937" w:history="1">
+      <w:hyperlink w:anchor="_Toc242180678" w:history="1">
         <w:r>
           <w:rPr>
             <w:rStyle w:val="Hyperlink"/>
@@ -11098,7 +11098,7 @@
           <w:rPr>
             <w:webHidden/>
           </w:rPr>
-          <w:instrText xml:space="preserve"> PAGEREF _Toc242142937 \h </w:instrText>
+          <w:instrText xml:space="preserve"> PAGEREF _Toc242180678 \h </w:instrText>
         </w:r>
         <w:r>
           <w:rPr>
@@ -11136,7 +11136,7 @@
           <w14:ligatures w14:val="standardContextual"/>
         </w:rPr>
       </w:pPr>
-      <w:hyperlink w:anchor="_Toc242142938" w:history="1">
+      <w:hyperlink w:anchor="_Toc242180679" w:history="1">
         <w:r>
           <w:rPr>
             <w:rStyle w:val="Hyperlink"/>
@@ -11159,7 +11159,7 @@
           <w:rPr>
             <w:webHidden/>
           </w:rPr>
-          <w:instrText xml:space="preserve"> PAGEREF _Toc242142938 \h </w:instrText>
+          <w:instrText xml:space="preserve"> PAGEREF _Toc242180679 \h </w:instrText>
         </w:r>
         <w:r>
           <w:rPr>
@@ -11197,7 +11197,7 @@
           <w14:ligatures w14:val="standardContextual"/>
         </w:rPr>
       </w:pPr>
-      <w:hyperlink w:anchor="_Toc242142939" w:history="1">
+      <w:hyperlink w:anchor="_Toc242180680" w:history="1">
         <w:r>
           <w:rPr>
             <w:rStyle w:val="Hyperlink"/>
@@ -11220,7 +11220,7 @@
           <w:rPr>
             <w:webHidden/>
           </w:rPr>
-          <w:instrText xml:space="preserve"> PAGEREF _Toc242142939 \h </w:instrText>
+          <w:instrText xml:space="preserve"> PAGEREF _Toc242180680 \h </w:instrText>
         </w:r>
         <w:r>
           <w:rPr>
@@ -11258,7 +11258,7 @@
           <w14:ligatures w14:val="standardContextual"/>
         </w:rPr>
       </w:pPr>
-      <w:hyperlink w:anchor="_Toc242142940" w:history="1">
+      <w:hyperlink w:anchor="_Toc242180681" w:history="1">
         <w:r>
           <w:rPr>
             <w:rStyle w:val="Hyperlink"/>
@@ -11281,7 +11281,7 @@
           <w:rPr>
             <w:webHidden/>
           </w:rPr>
-          <w:instrText xml:space="preserve"> PAGEREF _Toc242142940 \h </w:instrText>
+          <w:instrText xml:space="preserve"> PAGEREF _Toc242180681 \h </w:instrText>
         </w:r>
         <w:r>
           <w:rPr>
@@ -11319,7 +11319,7 @@
           <w14:ligatures w14:val="standardContextual"/>
         </w:rPr>
       </w:pPr>
-      <w:hyperlink w:anchor="_Toc242142941" w:history="1">
+      <w:hyperlink w:anchor="_Toc242180682" w:history="1">
         <w:r>
           <w:rPr>
             <w:rStyle w:val="Hyperlink"/>
@@ -11342,7 +11342,7 @@
           <w:rPr>
             <w:webHidden/>
           </w:rPr>
-          <w:instrText xml:space="preserve"> PAGEREF _Toc242142941 \h </w:instrText>
+          <w:instrText xml:space="preserve"> PAGEREF _Toc242180682 \h </w:instrText>
         </w:r>
         <w:r>
           <w:rPr>
@@ -11405,7 +11405,7 @@
       <w:r>
         <w:fldChar w:fldCharType="separate"/>
       </w:r>
-      <w:hyperlink w:anchor="_Toc242142942" w:history="1">
+      <w:hyperlink w:anchor="_Toc242180683" w:history="1">
         <w:r>
           <w:rPr>
             <w:rStyle w:val="Hyperlink"/>
@@ -11429,7 +11429,7 @@
           <w:rPr>
             <w:webHidden/>
           </w:rPr>
-          <w:instrText xml:space="preserve"> PAGEREF _Toc242142942 \h </w:instrText>
+          <w:instrText xml:space="preserve"> PAGEREF _Toc242180683 \h </w:instrText>
         </w:r>
         <w:r>
           <w:rPr>
@@ -11467,7 +11467,7 @@
           <w14:ligatures w14:val="standardContextual"/>
         </w:rPr>
       </w:pPr>
-      <w:hyperlink w:anchor="_Toc242142943" w:history="1">
+      <w:hyperlink w:anchor="_Toc242180684" w:history="1">
         <w:r>
           <w:rPr>
             <w:rStyle w:val="Hyperlink"/>
@@ -11491,7 +11491,7 @@
           <w:rPr>
             <w:webHidden/>
           </w:rPr>
-          <w:instrText xml:space="preserve"> PAGEREF _Toc242142943 \h </w:instrText>
+          <w:instrText xml:space="preserve"> PAGEREF _Toc242180684 \h </w:instrText>
         </w:r>
         <w:r>
           <w:rPr>
@@ -11529,7 +11529,7 @@
           <w14:ligatures w14:val="standardContextual"/>
         </w:rPr>
       </w:pPr>
-      <w:hyperlink w:anchor="_Toc242142944" w:history="1">
+      <w:hyperlink w:anchor="_Toc242180685" w:history="1">
         <w:r>
           <w:rPr>
             <w:rStyle w:val="Hyperlink"/>
@@ -11554,7 +11554,7 @@
           <w:rPr>
             <w:webHidden/>
           </w:rPr>
-          <w:instrText xml:space="preserve"> PAGEREF _Toc242142944 \h </w:instrText>
+          <w:instrText xml:space="preserve"> PAGEREF _Toc242180685 \h </w:instrText>
         </w:r>
         <w:r>
           <w:rPr>
@@ -11592,7 +11592,7 @@
           <w14:ligatures w14:val="standardContextual"/>
         </w:rPr>
       </w:pPr>
-      <w:hyperlink w:anchor="_Toc242142945" w:history="1">
+      <w:hyperlink w:anchor="_Toc242180686" w:history="1">
         <w:r>
           <w:rPr>
             <w:rStyle w:val="Hyperlink"/>
@@ -11616,7 +11616,7 @@
           <w:rPr>
             <w:webHidden/>
           </w:rPr>
-          <w:instrText xml:space="preserve"> PAGEREF _Toc242142945 \h </w:instrText>
+          <w:instrText xml:space="preserve"> PAGEREF _Toc242180686 \h </w:instrText>
         </w:r>
         <w:r>
           <w:rPr>
@@ -11654,7 +11654,7 @@
           <w14:ligatures w14:val="standardContextual"/>
         </w:rPr>
       </w:pPr>
-      <w:hyperlink w:anchor="_Toc242142946" w:history="1">
+      <w:hyperlink w:anchor="_Toc242180687" w:history="1">
         <w:r>
           <w:rPr>
             <w:rStyle w:val="Hyperlink"/>
@@ -11678,7 +11678,7 @@
           <w:rPr>
             <w:webHidden/>
           </w:rPr>
-          <w:instrText xml:space="preserve"> PAGEREF _Toc242142946 \h </w:instrText>
+          <w:instrText xml:space="preserve"> PAGEREF _Toc242180687 \h </w:instrText>
         </w:r>
         <w:r>
           <w:rPr>
@@ -11716,7 +11716,7 @@
           <w14:ligatures w14:val="standardContextual"/>
         </w:rPr>
       </w:pPr>
-      <w:hyperlink w:anchor="_Toc242142947" w:history="1">
+      <w:hyperlink w:anchor="_Toc242180688" w:history="1">
         <w:r>
           <w:rPr>
             <w:rStyle w:val="Hyperlink"/>
@@ -11740,7 +11740,7 @@
           <w:rPr>
             <w:webHidden/>
           </w:rPr>
-          <w:instrText xml:space="preserve"> PAGEREF _Toc242142947 \h </w:instrText>
+          <w:instrText xml:space="preserve"> PAGEREF _Toc242180688 \h </w:instrText>
         </w:r>
         <w:r>
           <w:rPr>
@@ -11778,7 +11778,7 @@
           <w14:ligatures w14:val="standardContextual"/>
         </w:rPr>
       </w:pPr>
-      <w:hyperlink w:anchor="_Toc242142948" w:history="1">
+      <w:hyperlink w:anchor="_Toc242180689" w:history="1">
         <w:r>
           <w:rPr>
             <w:rStyle w:val="Hyperlink"/>
@@ -11802,7 +11802,7 @@
           <w:rPr>
             <w:webHidden/>
           </w:rPr>
-          <w:instrText xml:space="preserve"> PAGEREF _Toc242142948 \h </w:instrText>
+          <w:instrText xml:space="preserve"> PAGEREF _Toc242180689 \h </w:instrText>
         </w:r>
         <w:r>
           <w:rPr>
@@ -11840,7 +11840,7 @@
           <w14:ligatures w14:val="standardContextual"/>
         </w:rPr>
       </w:pPr>
-      <w:hyperlink w:anchor="_Toc242142949" w:history="1">
+      <w:hyperlink w:anchor="_Toc242180690" w:history="1">
         <w:r>
           <w:rPr>
             <w:rStyle w:val="Hyperlink"/>
@@ -11864,7 +11864,7 @@
           <w:rPr>
             <w:webHidden/>
           </w:rPr>
-          <w:instrText xml:space="preserve"> PAGEREF _Toc242142949 \h </w:instrText>
+          <w:instrText xml:space="preserve"> PAGEREF _Toc242180690 \h </w:instrText>
         </w:r>
         <w:r>
           <w:rPr>
@@ -11902,7 +11902,7 @@
           <w14:ligatures w14:val="standardContextual"/>
         </w:rPr>
       </w:pPr>
-      <w:hyperlink w:anchor="_Toc242142950" w:history="1">
+      <w:hyperlink w:anchor="_Toc242180691" w:history="1">
         <w:r>
           <w:rPr>
             <w:rStyle w:val="Hyperlink"/>
@@ -11926,7 +11926,7 @@
           <w:rPr>
             <w:webHidden/>
           </w:rPr>
-          <w:instrText xml:space="preserve"> PAGEREF _Toc242142950 \h </w:instrText>
+          <w:instrText xml:space="preserve"> PAGEREF _Toc242180691 \h </w:instrText>
         </w:r>
         <w:r>
           <w:rPr>
@@ -11964,7 +11964,7 @@
           <w14:ligatures w14:val="standardContextual"/>
         </w:rPr>
       </w:pPr>
-      <w:hyperlink w:anchor="_Toc242142951" w:history="1">
+      <w:hyperlink w:anchor="_Toc242180692" w:history="1">
         <w:r>
           <w:rPr>
             <w:rStyle w:val="Hyperlink"/>
@@ -11988,7 +11988,7 @@
           <w:rPr>
             <w:webHidden/>
           </w:rPr>
-          <w:instrText xml:space="preserve"> PAGEREF _Toc242142951 \h </w:instrText>
+          <w:instrText xml:space="preserve"> PAGEREF _Toc242180692 \h </w:instrText>
         </w:r>
         <w:r>
           <w:rPr>
@@ -12026,7 +12026,7 @@
           <w14:ligatures w14:val="standardContextual"/>
         </w:rPr>
       </w:pPr>
-      <w:hyperlink w:anchor="_Toc242142952" w:history="1">
+      <w:hyperlink w:anchor="_Toc242180693" w:history="1">
         <w:r>
           <w:rPr>
             <w:rStyle w:val="Hyperlink"/>
@@ -12050,7 +12050,7 @@
           <w:rPr>
             <w:webHidden/>
           </w:rPr>
-          <w:instrText xml:space="preserve"> PAGEREF _Toc242142952 \h </w:instrText>
+          <w:instrText xml:space="preserve"> PAGEREF _Toc242180693 \h </w:instrText>
         </w:r>
         <w:r>
           <w:rPr>
@@ -12088,7 +12088,7 @@
           <w14:ligatures w14:val="standardContextual"/>
         </w:rPr>
       </w:pPr>
-      <w:hyperlink w:anchor="_Toc242142953" w:history="1">
+      <w:hyperlink w:anchor="_Toc242180694" w:history="1">
         <w:r>
           <w:rPr>
             <w:rStyle w:val="Hyperlink"/>
@@ -12112,7 +12112,7 @@
           <w:rPr>
             <w:webHidden/>
           </w:rPr>
-          <w:instrText xml:space="preserve"> PAGEREF _Toc242142953 \h </w:instrText>
+          <w:instrText xml:space="preserve"> PAGEREF _Toc242180694 \h </w:instrText>
         </w:r>
         <w:r>
           <w:rPr>
@@ -12150,7 +12150,7 @@
           <w14:ligatures w14:val="standardContextual"/>
         </w:rPr>
       </w:pPr>
-      <w:hyperlink w:anchor="_Toc242142954" w:history="1">
+      <w:hyperlink w:anchor="_Toc242180695" w:history="1">
         <w:r>
           <w:rPr>
             <w:rStyle w:val="Hyperlink"/>
@@ -12174,7 +12174,7 @@
           <w:rPr>
             <w:webHidden/>
           </w:rPr>
-          <w:instrText xml:space="preserve"> PAGEREF _Toc242142954 \h </w:instrText>
+          <w:instrText xml:space="preserve"> PAGEREF _Toc242180695 \h </w:instrText>
         </w:r>
         <w:r>
           <w:rPr>
@@ -12212,7 +12212,7 @@
           <w14:ligatures w14:val="standardContextual"/>
         </w:rPr>
       </w:pPr>
-      <w:hyperlink w:anchor="_Toc242142955" w:history="1">
+      <w:hyperlink w:anchor="_Toc242180696" w:history="1">
         <w:r>
           <w:rPr>
             <w:rStyle w:val="Hyperlink"/>
@@ -12236,7 +12236,7 @@
           <w:rPr>
             <w:webHidden/>
           </w:rPr>
-          <w:instrText xml:space="preserve"> PAGEREF _Toc242142955 \h </w:instrText>
+          <w:instrText xml:space="preserve"> PAGEREF _Toc242180696 \h </w:instrText>
         </w:r>
         <w:r>
           <w:rPr>
@@ -12274,7 +12274,7 @@
           <w14:ligatures w14:val="standardContextual"/>
         </w:rPr>
       </w:pPr>
-      <w:hyperlink w:anchor="_Toc242142956" w:history="1">
+      <w:hyperlink w:anchor="_Toc242180697" w:history="1">
         <w:r>
           <w:rPr>
             <w:rStyle w:val="Hyperlink"/>
@@ -12298,7 +12298,7 @@
           <w:rPr>
             <w:webHidden/>
           </w:rPr>
-          <w:instrText xml:space="preserve"> PAGEREF _Toc242142956 \h </w:instrText>
+          <w:instrText xml:space="preserve"> PAGEREF _Toc242180697 \h </w:instrText>
         </w:r>
         <w:r>
           <w:rPr>
@@ -12336,7 +12336,7 @@
           <w14:ligatures w14:val="standardContextual"/>
         </w:rPr>
       </w:pPr>
-      <w:hyperlink w:anchor="_Toc242142957" w:history="1">
+      <w:hyperlink w:anchor="_Toc242180698" w:history="1">
         <w:r>
           <w:rPr>
             <w:rStyle w:val="Hyperlink"/>
@@ -12360,7 +12360,7 @@
           <w:rPr>
             <w:webHidden/>
           </w:rPr>
-          <w:instrText xml:space="preserve"> PAGEREF _Toc242142957 \h </w:instrText>
+          <w:instrText xml:space="preserve"> PAGEREF _Toc242180698 \h </w:instrText>
         </w:r>
         <w:r>
           <w:rPr>
@@ -12478,7 +12478,7 @@
         <w:pStyle w:val="Heading1"/>
       </w:pPr>
       <w:bookmarkStart w:id="1" w:name="_Toc241062250"/>
-      <w:bookmarkStart w:id="2" w:name="_Toc242142785"/>
+      <w:bookmarkStart w:id="2" w:name="_Toc242180526"/>
       <w:r>
         <w:lastRenderedPageBreak/>
         <w:t>RESUMEN</w:t>
@@ -12564,7 +12564,7 @@
         <w:pStyle w:val="Heading1"/>
       </w:pPr>
       <w:bookmarkStart w:id="3" w:name="_Toc241062251"/>
-      <w:bookmarkStart w:id="4" w:name="_Toc242142786"/>
+      <w:bookmarkStart w:id="4" w:name="_Toc242180527"/>
       <w:r>
         <w:t>CAPÍTULO 1: Introducción</w:t>
       </w:r>
@@ -12597,7 +12597,7 @@
         <w:pStyle w:val="Heading2"/>
       </w:pPr>
       <w:bookmarkStart w:id="6" w:name="_Toc241062252"/>
-      <w:bookmarkStart w:id="7" w:name="_Toc242142787"/>
+      <w:bookmarkStart w:id="7" w:name="_Toc242180528"/>
       <w:r>
         <w:t>1.1 Contexto del problema</w:t>
       </w:r>
@@ -12658,7 +12658,7 @@
         <w:pStyle w:val="Heading2"/>
       </w:pPr>
       <w:bookmarkStart w:id="8" w:name="_Toc241062253"/>
-      <w:bookmarkStart w:id="9" w:name="_Toc242142788"/>
+      <w:bookmarkStart w:id="9" w:name="_Toc242180529"/>
       <w:r>
         <w:t>1.2 Planteamiento del problema</w:t>
       </w:r>
@@ -12756,7 +12756,7 @@
         <w:pStyle w:val="Heading2"/>
       </w:pPr>
       <w:bookmarkStart w:id="10" w:name="_Toc241062254"/>
-      <w:bookmarkStart w:id="11" w:name="_Toc242142789"/>
+      <w:bookmarkStart w:id="11" w:name="_Toc242180530"/>
       <w:r>
         <w:t>1.3 Justificación</w:t>
       </w:r>
@@ -12835,7 +12835,7 @@
         <w:pStyle w:val="Heading2"/>
       </w:pPr>
       <w:bookmarkStart w:id="12" w:name="_Toc241062255"/>
-      <w:bookmarkStart w:id="13" w:name="_Toc242142790"/>
+      <w:bookmarkStart w:id="13" w:name="_Toc242180531"/>
       <w:r>
         <w:t>1.4 Objetivos</w:t>
       </w:r>
@@ -12855,7 +12855,7 @@
         <w:pStyle w:val="Heading3"/>
       </w:pPr>
       <w:bookmarkStart w:id="14" w:name="_Toc241062256"/>
-      <w:bookmarkStart w:id="15" w:name="_Toc242142791"/>
+      <w:bookmarkStart w:id="15" w:name="_Toc242180532"/>
       <w:r>
         <w:t>1.4.1 Objetivo General</w:t>
       </w:r>
@@ -12875,7 +12875,7 @@
         <w:pStyle w:val="Heading3"/>
       </w:pPr>
       <w:bookmarkStart w:id="16" w:name="_Toc241062257"/>
-      <w:bookmarkStart w:id="17" w:name="_Toc242142792"/>
+      <w:bookmarkStart w:id="17" w:name="_Toc242180533"/>
       <w:r>
         <w:t>1.4.2 Objetivos Específicos</w:t>
       </w:r>
@@ -13006,7 +13006,7 @@
         <w:pStyle w:val="Heading2"/>
       </w:pPr>
       <w:bookmarkStart w:id="18" w:name="_Toc241062258"/>
-      <w:bookmarkStart w:id="19" w:name="_Toc242142793"/>
+      <w:bookmarkStart w:id="19" w:name="_Toc242180534"/>
       <w:r>
         <w:t>1.5 Alcance y Limitaciones</w:t>
       </w:r>
@@ -13026,7 +13026,7 @@
         <w:pStyle w:val="Heading3"/>
       </w:pPr>
       <w:bookmarkStart w:id="20" w:name="_Toc241062259"/>
-      <w:bookmarkStart w:id="21" w:name="_Toc242142794"/>
+      <w:bookmarkStart w:id="21" w:name="_Toc242180535"/>
       <w:r>
         <w:t>1.5.1 Alcance del Proyecto</w:t>
       </w:r>
@@ -13190,7 +13190,7 @@
         </w:rPr>
       </w:pPr>
       <w:bookmarkStart w:id="22" w:name="_Toc241062260"/>
-      <w:bookmarkStart w:id="23" w:name="_Toc242142795"/>
+      <w:bookmarkStart w:id="23" w:name="_Toc242180536"/>
       <w:r>
         <w:t>1.5.2 Limitaciones del Proyecto</w:t>
       </w:r>
@@ -13336,7 +13336,7 @@
         <w:pStyle w:val="Heading2"/>
       </w:pPr>
       <w:bookmarkStart w:id="24" w:name="_Toc241062261"/>
-      <w:bookmarkStart w:id="25" w:name="_Toc242142796"/>
+      <w:bookmarkStart w:id="25" w:name="_Toc242180537"/>
       <w:r>
         <w:t>1.6 Estado del Arte: Análisis de Soluciones y Vacío Tecnológico</w:t>
       </w:r>
@@ -13361,7 +13361,7 @@
         <w:pStyle w:val="Heading3"/>
       </w:pPr>
       <w:bookmarkStart w:id="26" w:name="_Toc241062262"/>
-      <w:bookmarkStart w:id="27" w:name="_Toc242142797"/>
+      <w:bookmarkStart w:id="27" w:name="_Toc242180538"/>
       <w:r>
         <w:lastRenderedPageBreak/>
         <w:t>1.6.0 Antecedentes académicos</w:t>
@@ -13411,7 +13411,7 @@
         <w:spacing w:before="0" w:line="276" w:lineRule="auto"/>
       </w:pPr>
       <w:bookmarkStart w:id="28" w:name="_Toc241062263"/>
-      <w:bookmarkStart w:id="29" w:name="_Toc242142798"/>
+      <w:bookmarkStart w:id="29" w:name="_Toc242180539"/>
       <w:r>
         <w:t>1.6.1 Sistemas Tradicionales de Gestión de Redes Sociales (SMMS)</w:t>
       </w:r>
@@ -13455,7 +13455,7 @@
         <w:spacing w:before="0" w:line="276" w:lineRule="auto"/>
       </w:pPr>
       <w:bookmarkStart w:id="30" w:name="_Toc241062264"/>
-      <w:bookmarkStart w:id="31" w:name="_Toc242142799"/>
+      <w:bookmarkStart w:id="31" w:name="_Toc242180540"/>
       <w:r>
         <w:t>1.6.2 Plataformas Genéricas de Automatización (iPaaS)</w:t>
       </w:r>
@@ -13491,7 +13491,7 @@
         <w:spacing w:before="0" w:line="276" w:lineRule="auto"/>
       </w:pPr>
       <w:bookmarkStart w:id="32" w:name="_Toc241062265"/>
-      <w:bookmarkStart w:id="33" w:name="_Toc242142800"/>
+      <w:bookmarkStart w:id="33" w:name="_Toc242180541"/>
       <w:r>
         <w:t>1.6.3 El Vacío Tecnológico y la Propuesta de Valor de Postly</w:t>
       </w:r>
@@ -13514,7 +13514,7 @@
       <w:pPr>
         <w:keepNext/>
       </w:pPr>
-      <w:bookmarkStart w:id="34" w:name="_Toc242142925"/>
+      <w:bookmarkStart w:id="34" w:name="_Toc242180666"/>
       <w:r>
         <w:rPr>
           <w:b/>
@@ -14613,7 +14613,7 @@
         <w:pStyle w:val="Heading1"/>
       </w:pPr>
       <w:bookmarkStart w:id="35" w:name="_Toc241062266"/>
-      <w:bookmarkStart w:id="36" w:name="_Toc242142801"/>
+      <w:bookmarkStart w:id="36" w:name="_Toc242180542"/>
       <w:r>
         <w:t>CAPÍTULO 2: MARCO TEÓRICO</w:t>
       </w:r>
@@ -14642,7 +14642,7 @@
         <w:pStyle w:val="Heading2"/>
       </w:pPr>
       <w:bookmarkStart w:id="37" w:name="_Toc241062267"/>
-      <w:bookmarkStart w:id="38" w:name="_Toc242142802"/>
+      <w:bookmarkStart w:id="38" w:name="_Toc242180543"/>
       <w:r>
         <w:t>2.1 Automatización de Procesos de Negocio (BPA) y n8n</w:t>
       </w:r>
@@ -14744,7 +14744,7 @@
         <w:pStyle w:val="Heading2"/>
       </w:pPr>
       <w:bookmarkStart w:id="39" w:name="_Toc241062268"/>
-      <w:bookmarkStart w:id="40" w:name="_Toc242142803"/>
+      <w:bookmarkStart w:id="40" w:name="_Toc242180544"/>
       <w:r>
         <w:t>2.2 Modelos de Lenguaje de Gran Escala (LLM) y Multimodalidad</w:t>
       </w:r>
@@ -14834,7 +14834,7 @@
         <w:pStyle w:val="Heading2"/>
       </w:pPr>
       <w:bookmarkStart w:id="41" w:name="_Toc241062269"/>
-      <w:bookmarkStart w:id="42" w:name="_Toc242142804"/>
+      <w:bookmarkStart w:id="42" w:name="_Toc242180545"/>
       <w:r>
         <w:lastRenderedPageBreak/>
         <w:t>2.3 Arquitectura de Integración mediante APIs y Webhooks</w:t>
@@ -15224,7 +15224,7 @@
         <w:keepNext/>
         <w:jc w:val="center"/>
       </w:pPr>
-      <w:bookmarkStart w:id="46" w:name="_Toc242142942"/>
+      <w:bookmarkStart w:id="46" w:name="_Toc242180683"/>
       <w:r>
         <w:rPr>
           <w:i/>
@@ -15346,7 +15346,7 @@
         <w:pStyle w:val="Heading2"/>
       </w:pPr>
       <w:bookmarkStart w:id="47" w:name="_Toc241062270"/>
-      <w:bookmarkStart w:id="48" w:name="_Toc242142805"/>
+      <w:bookmarkStart w:id="48" w:name="_Toc242180546"/>
       <w:r>
         <w:lastRenderedPageBreak/>
         <w:t>2.4 Normativas de Marketing y Cumplimiento Corporativo en Venta Directa</w:t>
@@ -15640,7 +15640,7 @@
         <w:pStyle w:val="Heading1"/>
       </w:pPr>
       <w:bookmarkStart w:id="52" w:name="_Toc241062271"/>
-      <w:bookmarkStart w:id="53" w:name="_Toc242142806"/>
+      <w:bookmarkStart w:id="53" w:name="_Toc242180547"/>
       <w:r>
         <w:t>CAPÍTULO 3: MARCO METODOLÓGICO</w:t>
       </w:r>
@@ -15652,7 +15652,7 @@
         <w:pStyle w:val="Heading2"/>
       </w:pPr>
       <w:bookmarkStart w:id="54" w:name="_Toc241062272"/>
-      <w:bookmarkStart w:id="55" w:name="_Toc242142807"/>
+      <w:bookmarkStart w:id="55" w:name="_Toc242180548"/>
       <w:r>
         <w:t>3.1 Tipo de investigación</w:t>
       </w:r>
@@ -15690,7 +15690,7 @@
         <w:pStyle w:val="Heading2"/>
       </w:pPr>
       <w:bookmarkStart w:id="56" w:name="_Toc241062273"/>
-      <w:bookmarkStart w:id="57" w:name="_Toc242142808"/>
+      <w:bookmarkStart w:id="57" w:name="_Toc242180549"/>
       <w:r>
         <w:t>3.2 Enfoque y Diseño de investigación</w:t>
       </w:r>
@@ -15871,7 +15871,7 @@
         <w:pStyle w:val="Heading2"/>
       </w:pPr>
       <w:bookmarkStart w:id="59" w:name="_Toc241062274"/>
-      <w:bookmarkStart w:id="60" w:name="_Toc242142809"/>
+      <w:bookmarkStart w:id="60" w:name="_Toc242180550"/>
       <w:r>
         <w:t>3.3 Metodología de Desarrollo (Agile/Scrum)</w:t>
       </w:r>
@@ -15891,7 +15891,7 @@
         <w:spacing w:before="240" w:after="240" w:line="240" w:lineRule="auto"/>
       </w:pPr>
       <w:bookmarkStart w:id="62" w:name="_Toc241062275"/>
-      <w:bookmarkStart w:id="63" w:name="_Toc242142810"/>
+      <w:bookmarkStart w:id="63" w:name="_Toc242180551"/>
       <w:r>
         <w:t>3.3.1 Marco metodológico de desarrollo</w:t>
       </w:r>
@@ -15922,7 +15922,7 @@
         <w:spacing w:before="240" w:after="240" w:line="240" w:lineRule="auto"/>
       </w:pPr>
       <w:bookmarkStart w:id="64" w:name="_Toc241062276"/>
-      <w:bookmarkStart w:id="65" w:name="_Toc242142811"/>
+      <w:bookmarkStart w:id="65" w:name="_Toc242180552"/>
       <w:r>
         <w:t>3.3.2 Implementación de la metodología: Sprints de desarrollo</w:t>
       </w:r>
@@ -15951,7 +15951,7 @@
         <w:pStyle w:val="Heading3"/>
         <w:spacing w:before="240" w:after="240" w:line="240" w:lineRule="auto"/>
       </w:pPr>
-      <w:bookmarkStart w:id="66" w:name="_Toc242142812"/>
+      <w:bookmarkStart w:id="66" w:name="_Toc242180553"/>
       <w:r>
         <w:t>3.3.3 Riesgos del proyecto y decisiones de diseño derivadas</w:t>
       </w:r>
@@ -15969,7 +15969,7 @@
       <w:pPr>
         <w:keepNext/>
       </w:pPr>
-      <w:bookmarkStart w:id="67" w:name="_Toc242142926"/>
+      <w:bookmarkStart w:id="67" w:name="_Toc242180667"/>
       <w:r>
         <w:rPr>
           <w:b/>
@@ -16506,7 +16506,7 @@
         <w:pStyle w:val="Heading2"/>
       </w:pPr>
       <w:bookmarkStart w:id="68" w:name="_Toc241062277"/>
-      <w:bookmarkStart w:id="69" w:name="_Toc242142813"/>
+      <w:bookmarkStart w:id="69" w:name="_Toc242180554"/>
       <w:r>
         <w:t>3.4 Técnicas de recolección de datos e instrumentos</w:t>
       </w:r>
@@ -16531,7 +16531,7 @@
         <w:pStyle w:val="Heading3"/>
       </w:pPr>
       <w:bookmarkStart w:id="70" w:name="_Toc241062278"/>
-      <w:bookmarkStart w:id="71" w:name="_Toc242142814"/>
+      <w:bookmarkStart w:id="71" w:name="_Toc242180555"/>
       <w:r>
         <w:t>3.4.1 Recolección de información para el análisis del problema</w:t>
       </w:r>
@@ -16615,7 +16615,7 @@
         <w:pStyle w:val="Heading3"/>
       </w:pPr>
       <w:bookmarkStart w:id="72" w:name="_Toc241062279"/>
-      <w:bookmarkStart w:id="73" w:name="_Toc242142815"/>
+      <w:bookmarkStart w:id="73" w:name="_Toc242180556"/>
       <w:r>
         <w:t>3.4.2 Técnicas de validación técnica del sistema</w:t>
       </w:r>
@@ -16757,7 +16757,7 @@
         <w:pStyle w:val="Heading3"/>
       </w:pPr>
       <w:bookmarkStart w:id="74" w:name="_Toc241062280"/>
-      <w:bookmarkStart w:id="75" w:name="_Toc242142816"/>
+      <w:bookmarkStart w:id="75" w:name="_Toc242180557"/>
       <w:r>
         <w:t>3.4.3 Limitaciones y alcance de la recolección de datos</w:t>
       </w:r>
@@ -16793,7 +16793,7 @@
         <w:pStyle w:val="Heading2"/>
       </w:pPr>
       <w:bookmarkStart w:id="76" w:name="_Toc241062281"/>
-      <w:bookmarkStart w:id="77" w:name="_Toc242142817"/>
+      <w:bookmarkStart w:id="77" w:name="_Toc242180558"/>
       <w:r>
         <w:lastRenderedPageBreak/>
         <w:t>3.5 Población, Muestra y Diseño de la Evaluación</w:t>
@@ -16819,7 +16819,7 @@
         <w:pStyle w:val="Heading3"/>
       </w:pPr>
       <w:bookmarkStart w:id="78" w:name="_Toc241062282"/>
-      <w:bookmarkStart w:id="79" w:name="_Toc242142818"/>
+      <w:bookmarkStart w:id="79" w:name="_Toc242180559"/>
       <w:r>
         <w:t>3.5.1 Población objetivo</w:t>
       </w:r>
@@ -16852,7 +16852,7 @@
         <w:pStyle w:val="Heading3"/>
       </w:pPr>
       <w:bookmarkStart w:id="80" w:name="_Toc241062283"/>
-      <w:bookmarkStart w:id="81" w:name="_Toc242142819"/>
+      <w:bookmarkStart w:id="81" w:name="_Toc242180560"/>
       <w:r>
         <w:t>3.5.2 Definición de la muestra</w:t>
       </w:r>
@@ -16893,7 +16893,7 @@
         <w:pStyle w:val="Heading3"/>
       </w:pPr>
       <w:bookmarkStart w:id="82" w:name="_Toc241062284"/>
-      <w:bookmarkStart w:id="83" w:name="_Toc242142820"/>
+      <w:bookmarkStart w:id="83" w:name="_Toc242180561"/>
       <w:r>
         <w:t>3.5.3 Consideraciones sobre el tamaño muestral</w:t>
       </w:r>
@@ -16928,7 +16928,7 @@
         <w:pStyle w:val="Heading3"/>
       </w:pPr>
       <w:bookmarkStart w:id="84" w:name="_Toc241062285"/>
-      <w:bookmarkStart w:id="85" w:name="_Toc242142821"/>
+      <w:bookmarkStart w:id="85" w:name="_Toc242180562"/>
       <w:r>
         <w:t>3.5.4 Variables e instrumentos de medición</w:t>
       </w:r>
@@ -16965,7 +16965,7 @@
         <w:pStyle w:val="Heading3"/>
       </w:pPr>
       <w:bookmarkStart w:id="86" w:name="_Toc241062286"/>
-      <w:bookmarkStart w:id="87" w:name="_Toc242142822"/>
+      <w:bookmarkStart w:id="87" w:name="_Toc242180563"/>
       <w:r>
         <w:lastRenderedPageBreak/>
         <w:t>3.5.5 Amenazas a la validez</w:t>
@@ -17032,7 +17032,7 @@
         <w:pStyle w:val="Heading2"/>
       </w:pPr>
       <w:bookmarkStart w:id="88" w:name="_Toc241062287"/>
-      <w:bookmarkStart w:id="89" w:name="_Toc242142823"/>
+      <w:bookmarkStart w:id="89" w:name="_Toc242180564"/>
       <w:r>
         <w:t>3.6 Herramientas y Tecnologías Seleccionadas</w:t>
       </w:r>
@@ -17065,7 +17065,7 @@
         <w:pStyle w:val="Heading3"/>
       </w:pPr>
       <w:bookmarkStart w:id="90" w:name="_Toc241062288"/>
-      <w:bookmarkStart w:id="91" w:name="_Toc242142824"/>
+      <w:bookmarkStart w:id="91" w:name="_Toc242180565"/>
       <w:r>
         <w:t>3.6.1 Motor de automatización: n8n</w:t>
       </w:r>
@@ -17098,7 +17098,7 @@
         <w:pStyle w:val="Heading3"/>
       </w:pPr>
       <w:bookmarkStart w:id="92" w:name="_Toc241062289"/>
-      <w:bookmarkStart w:id="93" w:name="_Toc242142825"/>
+      <w:bookmarkStart w:id="93" w:name="_Toc242180566"/>
       <w:r>
         <w:lastRenderedPageBreak/>
         <w:t>3.6.2 Modelo multimodal, integraciones y arquitectura</w:t>
@@ -17148,7 +17148,7 @@
         <w:spacing w:before="280"/>
       </w:pPr>
       <w:bookmarkStart w:id="94" w:name="_Toc241062290"/>
-      <w:bookmarkStart w:id="95" w:name="_Toc242142826"/>
+      <w:bookmarkStart w:id="95" w:name="_Toc242180567"/>
       <w:r>
         <w:t>3.7 Consideraciones éticas y legales</w:t>
       </w:r>
@@ -17183,7 +17183,7 @@
         <w:pStyle w:val="Heading3"/>
       </w:pPr>
       <w:bookmarkStart w:id="96" w:name="_Toc241062291"/>
-      <w:bookmarkStart w:id="97" w:name="_Toc242142827"/>
+      <w:bookmarkStart w:id="97" w:name="_Toc242180568"/>
       <w:r>
         <w:t>3.7.1 Protección de datos personales y Privacidad desde el Diseño</w:t>
       </w:r>
@@ -17233,7 +17233,7 @@
         <w:pStyle w:val="Heading3"/>
       </w:pPr>
       <w:bookmarkStart w:id="98" w:name="_Toc241062292"/>
-      <w:bookmarkStart w:id="99" w:name="_Toc242142828"/>
+      <w:bookmarkStart w:id="99" w:name="_Toc242180569"/>
       <w:r>
         <w:t>3.7.2 Seguridad en la autenticación, acceso y soberanía</w:t>
       </w:r>
@@ -17271,7 +17271,7 @@
         <w:pStyle w:val="Heading3"/>
       </w:pPr>
       <w:bookmarkStart w:id="100" w:name="_Toc241062293"/>
-      <w:bookmarkStart w:id="101" w:name="_Toc242142829"/>
+      <w:bookmarkStart w:id="101" w:name="_Toc242180570"/>
       <w:r>
         <w:t>3.7.3 Ética en la Inteligencia Artificial (</w:t>
       </w:r>
@@ -17319,7 +17319,7 @@
         <w:pStyle w:val="Heading3"/>
       </w:pPr>
       <w:bookmarkStart w:id="102" w:name="_Toc241062294"/>
-      <w:bookmarkStart w:id="103" w:name="_Toc242142830"/>
+      <w:bookmarkStart w:id="103" w:name="_Toc242180571"/>
       <w:r>
         <w:t>3.7.4 Auditoría de compliance y exposición de la consultora ante la normativa de la marca</w:t>
       </w:r>
@@ -17355,7 +17355,7 @@
         <w:pStyle w:val="Heading3"/>
       </w:pPr>
       <w:bookmarkStart w:id="104" w:name="_Toc241062295"/>
-      <w:bookmarkStart w:id="105" w:name="_Toc242142831"/>
+      <w:bookmarkStart w:id="105" w:name="_Toc242180572"/>
       <w:r>
         <w:t>3.7.5 Responsabilidad en la automatización y uso indebido</w:t>
       </w:r>
@@ -17375,7 +17375,7 @@
         <w:pStyle w:val="Heading3"/>
       </w:pPr>
       <w:bookmarkStart w:id="106" w:name="_Toc241062296"/>
-      <w:bookmarkStart w:id="107" w:name="_Toc242142832"/>
+      <w:bookmarkStart w:id="107" w:name="_Toc242180573"/>
       <w:r>
         <w:t>3.7.6 Ética de la investigación</w:t>
       </w:r>
@@ -17395,7 +17395,7 @@
         <w:spacing w:before="240" w:after="240"/>
       </w:pPr>
       <w:r>
-        <w:t>El piloto obtuvo consentimiento verbal de sus tres consultoras. Se les explicó el objetivo académico y que su identidad no aparecería: la planilla sólo registra C1, C2 y C3 (Anexo E.2). No se recogió un consentimiento escrito, y esa es una carencia del procedimiento y no una decisión justificable por la escala del estudio. En la ampliación, las ocho participantes, incluidas las tres del piloto, firmaron en papel un consentimiento informado antes de la sesión (protocolo de la ampliación, apartado 7), y el registro de reclutamiento de cada una lo consigna (Anexo E.4). Esos ocho ejemplares no acompañan a esta entrega. Los dos evaluadores externos, las tres autoras del corpus y la consultora que aportó R01, que habían participado con un acuerdo verbal, firmaron a comienzos de octubre de 2026 un consentimiento retroactivo. Describe su participación y el uso de su material, y no se publica. La tercera evaluadora de los Estudios 1 y 4 firmó el suyo antes de participar, y la consultora de la prueba de vinculación (Anexo B.1), el mismo día de la prueba. La consultora que filmó los videos del Anexo E.9, una de las ocho participantes, consintió verbalmente el uso de ese material y lo formalizó por escrito, también retroactivo, el 5 de octubre de 2026. La carpeta «Consentimientos» que acompaña a esta entrega, junto al documento, reúne la copia escaneada de esos nueve consentimientos escritos. El segundo usuario de la prueba con dos cuentas de Telegram (Anexo B.1) es uno de los autores.</w:t>
+        <w:t>El piloto obtuvo consentimiento verbal de sus tres consultoras. Se les explicó el objetivo académico y que su identidad no aparecería: la planilla sólo registra C1, C2 y C3 (Anexo E.2). No se recogió un consentimiento escrito, y esa es una carencia del procedimiento y no una decisión justificable por la escala del estudio. En la ampliación, las ocho participantes, incluidas las tres del piloto, firmaron en papel un consentimiento informado antes de la sesión (protocolo de la ampliación, apartado 7), y el registro de reclutamiento de cada una lo consigna (Anexo E.4). Esos ocho ejemplares no acompañan a esta entrega. Los dos evaluadores externos, las tres autoras del corpus y la consultora que aportó R01, que habían participado en septiembre con un acuerdo verbal, firmaron un consentimiento retroactivo. Describe su participación y el uso de su material, y no se publica. La consultora que filmó los videos del Anexo E.9, una de las ocho participantes, consintió verbalmente el uso de ese material y también lo formalizó por escrito en forma retroactiva. La tercera evaluadora de los Estudios 1 y 4 y la consultora de la prueba de vinculación (Anexo B.1) participaron el 5 de octubre de 2026 y firmaron el suyo al día siguiente, no antes de participar, y esa es otra carencia del procedimiento. Los nueve se firmaron a mano, en papel, el 6 de octubre de 2026. La carpeta «Consentimientos» que acompaña a esta entrega, junto al documento, reúne su copia escaneada. El segundo usuario de la prueba con dos cuentas de Telegram (Anexo B.1) es uno de los autores.</w:t>
       </w:r>
     </w:p>
     <w:p>
@@ -17403,7 +17403,11 @@
         <w:spacing w:before="240" w:after="240"/>
       </w:pPr>
       <w:r>
-        <w:t>El banco de casos del canal visual se compuso sobre material gráfico oficial de la marca, y las Pautas que este mismo trabajo invoca prohíben modificar esas imágenes «en modo alguno» (Anexo D, p. 8). Ninguna de esas composiciones se publicó, con una excepción. Para ejercitar la re-publicación (Anexo E.11) hubo que publicar a mano, en la cuenta del proyecto, una pieza con precio compuesta sobre arte de la marca, la conducta que el Módulo Centinela existe para impedir. Se borró apenas el módulo bloqueó la re-publicación; la cuenta no tenía seguidores, pero la publicación fue pública y corresponde decirlo. Las Figuras 12 a 15 se recortaron para no reproducir el arte de la marca.</w:t>
+        <w:t xml:space="preserve">El banco de casos del canal visual se compuso sobre material gráfico oficial de la marca, y las Pautas que este mismo trabajo invoca prohíben modificar esas imágenes «en modo alguno» (Anexo D, p. 8). Ninguna de esas composiciones se publicó, con una excepción. Para ejercitar la re-publicación (Anexo E.11) hubo que publicar a mano, en la cuenta del proyecto, una pieza con precio compuesta sobre arte de la marca, la conducta que el Módulo Centinela existe para impedir. Se borró apenas el módulo bloqueó la re-publicación; la cuenta </w:t>
+      </w:r>
+      <w:r>
+        <w:lastRenderedPageBreak/>
+        <w:t>no tenía seguidores, pero la publicación fue pública y corresponde decirlo. Las Figuras 12 a 15 se recortaron para no reproducir el arte de la marca.</w:t>
       </w:r>
     </w:p>
     <w:p>
@@ -17411,8 +17415,7 @@
         <w:spacing w:before="240" w:after="240"/>
       </w:pPr>
       <w:r>
-        <w:lastRenderedPageBreak/>
-        <w:t>Ninguna instancia institucional revisó el diseño de esta evaluación. La carrera no cuenta con un comité de ética ante el cual someter un trabajo final, de modo que las decisiones sobre consentimiento, anonimización y uso de material de terceros las tomaron los autores. Las tres carencias que este apartado declara —el consentimiento sólo verbal del piloto, la composición sobre arte de la marca y la publicación del Anexo E.11— son las que un comité habría observado primero.</w:t>
+        <w:t>Ninguna instancia institucional revisó el diseño de esta evaluación. La carrera no cuenta con un comité de ética ante el cual someter un trabajo final, de modo que las decisiones sobre consentimiento, anonimización y uso de material de terceros las tomaron los autores. Las cuatro carencias que este apartado declara —el consentimiento sólo verbal del piloto, el escrito posterior a la participación en dos casos, la composición sobre arte de la marca y la publicación del Anexo E.11— son las que un comité habría observado primero.</w:t>
       </w:r>
     </w:p>
     <w:p>
@@ -17500,7 +17503,7 @@
         <w:pStyle w:val="Heading1"/>
       </w:pPr>
       <w:bookmarkStart w:id="108" w:name="_Toc241062297"/>
-      <w:bookmarkStart w:id="109" w:name="_Toc242142833"/>
+      <w:bookmarkStart w:id="109" w:name="_Toc242180574"/>
       <w:r>
         <w:t>CAPÍTULO 4: DESARROLLO DEL ESTUDIO</w:t>
       </w:r>
@@ -17519,9 +17522,8 @@
         <w:pStyle w:val="Heading2"/>
       </w:pPr>
       <w:bookmarkStart w:id="110" w:name="_Toc241062298"/>
-      <w:bookmarkStart w:id="111" w:name="_Toc242142834"/>
-      <w:r>
-        <w:lastRenderedPageBreak/>
+      <w:bookmarkStart w:id="111" w:name="_Toc242180575"/>
+      <w:r>
         <w:t>4.1 Historias de Usuario y Criterios de Aceptación</w:t>
       </w:r>
       <w:bookmarkEnd w:id="110"/>
@@ -17564,7 +17566,7 @@
         <w:spacing w:before="360" w:line="240" w:lineRule="auto"/>
       </w:pPr>
       <w:bookmarkStart w:id="112" w:name="_Toc241062299"/>
-      <w:bookmarkStart w:id="113" w:name="_Toc242142835"/>
+      <w:bookmarkStart w:id="113" w:name="_Toc242180576"/>
       <w:r>
         <w:t>4.1.1 Módulo A: Seguridad, Onboarding y Autenticación</w:t>
       </w:r>
@@ -17679,6 +17681,7 @@
         <w:spacing w:after="240" w:line="276" w:lineRule="auto"/>
       </w:pPr>
       <w:r>
+        <w:lastRenderedPageBreak/>
         <w:t xml:space="preserve">Si la consulta retorna </w:t>
       </w:r>
       <w:r>
@@ -17715,7 +17718,6 @@
           <w:b/>
           <w:bCs/>
         </w:rPr>
-        <w:lastRenderedPageBreak/>
         <w:t>Historia de Usuario 2: Vinculación Segura de Cuentas (Delegación OAuth 2.0)</w:t>
       </w:r>
     </w:p>
@@ -17912,7 +17914,11 @@
         <w:spacing w:after="0" w:line="276" w:lineRule="auto"/>
       </w:pPr>
       <w:r>
-        <w:t>Cada vez que se inicie una publicación o se abra la agenda, el sistema debe descifrar el token almacenado y consultar con él a la Graph API la identidad de la cuenta. Sólo una respuesta que devuelva el identificador de la cuenta se toma como token vigente.</w:t>
+        <w:t xml:space="preserve">Cada vez que se inicie una publicación o se abra la agenda, el sistema debe descifrar el token almacenado y consultar con él a </w:t>
+      </w:r>
+      <w:r>
+        <w:lastRenderedPageBreak/>
+        <w:t>la Graph API la identidad de la cuenta. Sólo una respuesta que devuelva el identificador de la cuenta se toma como token vigente.</w:t>
       </w:r>
     </w:p>
     <w:p>
@@ -17924,7 +17930,6 @@
         <w:spacing w:after="0" w:line="276" w:lineRule="auto"/>
       </w:pPr>
       <w:r>
-        <w:lastRenderedPageBreak/>
         <w:t>En caso de capturar una excepción de autorización (</w:t>
       </w:r>
       <w:r>
@@ -17978,7 +17983,7 @@
         <w:spacing w:before="0" w:line="276" w:lineRule="auto"/>
       </w:pPr>
       <w:bookmarkStart w:id="114" w:name="_Toc241062300"/>
-      <w:bookmarkStart w:id="115" w:name="_Toc242142836"/>
+      <w:bookmarkStart w:id="115" w:name="_Toc242180577"/>
       <w:r>
         <w:t>4.1.2 Módulo B: Creación de Contenido Asistida por IA</w:t>
       </w:r>
@@ -18122,6 +18127,7 @@
           <w:b/>
           <w:bCs/>
         </w:rPr>
+        <w:lastRenderedPageBreak/>
         <w:t>Historia de Usuario 5: Creación Estructurada de Carruseles con Ordenamiento Lógico</w:t>
       </w:r>
     </w:p>
@@ -18138,7 +18144,6 @@
           <w:i/>
           <w:iCs/>
         </w:rPr>
-        <w:lastRenderedPageBreak/>
         <w:t>Como usuaria sin conocimientos de diseño, quiero enviar un conjunto de hasta 10 imágenes al bot, para que el sistema me proponga un orden narrativo para una publicación tipo carrusel.</w:t>
       </w:r>
     </w:p>
@@ -18393,7 +18398,7 @@
         <w:spacing w:before="0" w:line="276" w:lineRule="auto"/>
       </w:pPr>
       <w:bookmarkStart w:id="116" w:name="_Toc241062301"/>
-      <w:bookmarkStart w:id="117" w:name="_Toc242142837"/>
+      <w:bookmarkStart w:id="117" w:name="_Toc242180578"/>
       <w:r>
         <w:t>4.1.3 Módulo C: Auditoría de Compliance (Módulo Centinela)</w:t>
       </w:r>
@@ -18405,7 +18410,6 @@
         <w:spacing w:after="240" w:line="276" w:lineRule="auto"/>
       </w:pPr>
       <w:r>
-        <w:lastRenderedPageBreak/>
         <w:t>Este módulo es el Módulo Centinela (§2.4): verifica cada texto y cada imagen antes de publicar, para reducir el riesgo de incumplir las directrices de la compañía (Tarantino, 2008). El canal textual es determinista; el visual depende de que un modelo externo devuelva un veredicto legible (§4.3.1).</w:t>
       </w:r>
     </w:p>
@@ -18606,6 +18610,7 @@
           <w:b/>
           <w:bCs/>
         </w:rPr>
+        <w:lastRenderedPageBreak/>
         <w:t>Criterios de Aceptación:</w:t>
       </w:r>
     </w:p>
@@ -18618,7 +18623,6 @@
         <w:spacing w:after="0" w:line="276" w:lineRule="auto"/>
       </w:pPr>
       <w:r>
-        <w:lastRenderedPageBreak/>
         <w:t>El sistema debe invocar la API multimodal utilizando la capacidad de visión de Gemini 2.5 Flash para leer las cadenas de texto ocultas en los píxeles de las imágenes.</w:t>
       </w:r>
     </w:p>
@@ -18773,7 +18777,7 @@
         <w:spacing w:before="0" w:line="276" w:lineRule="auto"/>
       </w:pPr>
       <w:bookmarkStart w:id="118" w:name="_Toc241062302"/>
-      <w:bookmarkStart w:id="119" w:name="_Toc242142838"/>
+      <w:bookmarkStart w:id="119" w:name="_Toc242180579"/>
       <w:r>
         <w:t>4.1.4 Módulo D: Gestión de Publicación y Agenda</w:t>
       </w:r>
@@ -18933,7 +18937,7 @@
         <w:keepNext/>
         <w:jc w:val="center"/>
       </w:pPr>
-      <w:bookmarkStart w:id="120" w:name="_Toc242142943"/>
+      <w:bookmarkStart w:id="120" w:name="_Toc242180684"/>
       <w:r>
         <w:rPr>
           <w:i/>
@@ -19288,7 +19292,7 @@
         <w:spacing w:before="0" w:line="276" w:lineRule="auto"/>
       </w:pPr>
       <w:bookmarkStart w:id="121" w:name="_Toc241062303"/>
-      <w:bookmarkStart w:id="122" w:name="_Toc242142839"/>
+      <w:bookmarkStart w:id="122" w:name="_Toc242180580"/>
       <w:r>
         <w:t>4.1.5 Módulo E: Procesamiento Multimedia y Analítica de Datos</w:t>
       </w:r>
@@ -19554,7 +19558,7 @@
         <w:pStyle w:val="Heading2"/>
       </w:pPr>
       <w:bookmarkStart w:id="123" w:name="_Toc241062304"/>
-      <w:bookmarkStart w:id="124" w:name="_Toc242142840"/>
+      <w:bookmarkStart w:id="124" w:name="_Toc242180581"/>
       <w:r>
         <w:t>4.2 Definición del Producto Mínimo Viable (MVP)</w:t>
       </w:r>
@@ -19583,7 +19587,7 @@
           <w:lang w:val="en-US"/>
         </w:rPr>
       </w:pPr>
-      <w:bookmarkStart w:id="125" w:name="_Toc242142944"/>
+      <w:bookmarkStart w:id="125" w:name="_Toc242180685"/>
       <w:r>
         <w:rPr>
           <w:i/>
@@ -19868,7 +19872,7 @@
         <w:pStyle w:val="Heading2"/>
       </w:pPr>
       <w:bookmarkStart w:id="126" w:name="_Toc241062305"/>
-      <w:bookmarkStart w:id="127" w:name="_Toc242142841"/>
+      <w:bookmarkStart w:id="127" w:name="_Toc242180582"/>
       <w:r>
         <w:t>4.3 Implementación de Lógica de Auditoría y Compliance</w:t>
       </w:r>
@@ -19910,7 +19914,7 @@
         <w:spacing w:before="0" w:line="276" w:lineRule="auto"/>
       </w:pPr>
       <w:bookmarkStart w:id="128" w:name="_Toc241062306"/>
-      <w:bookmarkStart w:id="129" w:name="_Toc242142842"/>
+      <w:bookmarkStart w:id="129" w:name="_Toc242180583"/>
       <w:r>
         <w:t>4.3.1 Detección Multimodal de Precios y Restricciones Comerciales</w:t>
       </w:r>
@@ -20034,7 +20038,7 @@
         <w:spacing w:before="0" w:line="276" w:lineRule="auto"/>
       </w:pPr>
       <w:bookmarkStart w:id="130" w:name="_Toc241062307"/>
-      <w:bookmarkStart w:id="131" w:name="_Toc242142843"/>
+      <w:bookmarkStart w:id="131" w:name="_Toc242180584"/>
       <w:r>
         <w:t>4.3.2 Automatización de Identidad y Transparencia Corporativa</w:t>
       </w:r>
@@ -20102,7 +20106,7 @@
         <w:spacing w:before="0" w:line="276" w:lineRule="auto"/>
       </w:pPr>
       <w:bookmarkStart w:id="132" w:name="_Toc241062308"/>
-      <w:bookmarkStart w:id="133" w:name="_Toc242142844"/>
+      <w:bookmarkStart w:id="133" w:name="_Toc242180585"/>
       <w:r>
         <w:t>4.4 Procesamiento Multimedia y Optimización de Archivos</w:t>
       </w:r>
@@ -20132,7 +20136,7 @@
         <w:spacing w:before="0" w:line="276" w:lineRule="auto"/>
       </w:pPr>
       <w:bookmarkStart w:id="135" w:name="_Toc241062309"/>
-      <w:bookmarkStart w:id="136" w:name="_Toc242142845"/>
+      <w:bookmarkStart w:id="136" w:name="_Toc242180586"/>
       <w:r>
         <w:t>4.4.1 Integración de FFmpeg y Normalización de Formatos</w:t>
       </w:r>
@@ -20162,7 +20166,7 @@
         <w:spacing w:before="0" w:line="276" w:lineRule="auto"/>
       </w:pPr>
       <w:bookmarkStart w:id="138" w:name="_Toc241062310"/>
-      <w:bookmarkStart w:id="139" w:name="_Toc242142846"/>
+      <w:bookmarkStart w:id="139" w:name="_Toc242180587"/>
       <w:r>
         <w:t>4.4.2 Tratamiento de Imágenes para Carruseles y Feeds</w:t>
       </w:r>
@@ -20239,7 +20243,7 @@
         <w:spacing w:before="0" w:line="276" w:lineRule="auto"/>
       </w:pPr>
       <w:bookmarkStart w:id="141" w:name="_Toc241062311"/>
-      <w:bookmarkStart w:id="142" w:name="_Toc242142847"/>
+      <w:bookmarkStart w:id="142" w:name="_Toc242180588"/>
       <w:r>
         <w:t>4.4.3 Validación y Tratamiento de Video (Reels)</w:t>
       </w:r>
@@ -20402,7 +20406,7 @@
         <w:spacing w:before="0" w:line="276" w:lineRule="auto"/>
       </w:pPr>
       <w:bookmarkStart w:id="143" w:name="_Toc241062312"/>
-      <w:bookmarkStart w:id="144" w:name="_Toc242142848"/>
+      <w:bookmarkStart w:id="144" w:name="_Toc242180589"/>
       <w:r>
         <w:t>CAPÍTULO 5: ARQUITECTURA E INTERFAZ DE VISUALIZACIÓN</w:t>
       </w:r>
@@ -20422,7 +20426,7 @@
         <w:pStyle w:val="Heading2"/>
       </w:pPr>
       <w:bookmarkStart w:id="145" w:name="_Toc241062313"/>
-      <w:bookmarkStart w:id="146" w:name="_Toc242142849"/>
+      <w:bookmarkStart w:id="146" w:name="_Toc242180590"/>
       <w:r>
         <w:t>5.1 Arquitectura del Sistema Postly</w:t>
       </w:r>
@@ -20473,7 +20477,7 @@
         <w:keepNext/>
         <w:jc w:val="center"/>
       </w:pPr>
-      <w:bookmarkStart w:id="147" w:name="_Toc242142945"/>
+      <w:bookmarkStart w:id="147" w:name="_Toc242180686"/>
       <w:r>
         <w:rPr>
           <w:i/>
@@ -20595,7 +20599,7 @@
         <w:pStyle w:val="Heading3"/>
       </w:pPr>
       <w:bookmarkStart w:id="148" w:name="_Toc241062314"/>
-      <w:bookmarkStart w:id="149" w:name="_Toc242142850"/>
+      <w:bookmarkStart w:id="149" w:name="_Toc242180591"/>
       <w:r>
         <w:lastRenderedPageBreak/>
         <w:t>5.1.1 Capas de la arquitectura</w:t>
@@ -20751,7 +20755,7 @@
         <w:keepNext/>
         <w:jc w:val="center"/>
       </w:pPr>
-      <w:bookmarkStart w:id="150" w:name="_Toc242142946"/>
+      <w:bookmarkStart w:id="150" w:name="_Toc242180687"/>
       <w:r>
         <w:rPr>
           <w:i/>
@@ -20907,7 +20911,7 @@
         <w:pStyle w:val="Heading3"/>
       </w:pPr>
       <w:bookmarkStart w:id="151" w:name="_Toc241062315"/>
-      <w:bookmarkStart w:id="152" w:name="_Toc242142851"/>
+      <w:bookmarkStart w:id="152" w:name="_Toc242180592"/>
       <w:r>
         <w:t>5.1.2 Flujo de datos entre componentes</w:t>
       </w:r>
@@ -21131,7 +21135,7 @@
         <w:pStyle w:val="Heading3"/>
       </w:pPr>
       <w:bookmarkStart w:id="153" w:name="_Toc241062316"/>
-      <w:bookmarkStart w:id="154" w:name="_Toc242142852"/>
+      <w:bookmarkStart w:id="154" w:name="_Toc242180593"/>
       <w:r>
         <w:t>5.1.3 Principios de diseño adoptados</w:t>
       </w:r>
@@ -21255,7 +21259,7 @@
         <w:pStyle w:val="Heading3"/>
       </w:pPr>
       <w:bookmarkStart w:id="155" w:name="_Toc241062317"/>
-      <w:bookmarkStart w:id="156" w:name="_Toc242142853"/>
+      <w:bookmarkStart w:id="156" w:name="_Toc242180594"/>
       <w:r>
         <w:lastRenderedPageBreak/>
         <w:t>5.1.4 Consideraciones sobre la evolución arquitectónica</w:t>
@@ -21287,7 +21291,7 @@
         <w:pStyle w:val="Heading2"/>
       </w:pPr>
       <w:bookmarkStart w:id="157" w:name="_Toc241062318"/>
-      <w:bookmarkStart w:id="158" w:name="_Toc242142854"/>
+      <w:bookmarkStart w:id="158" w:name="_Toc242180595"/>
       <w:r>
         <w:t>5.2 Diseño de Flujos de Trabajo en n8n</w:t>
       </w:r>
@@ -21312,7 +21316,7 @@
         <w:pStyle w:val="Heading3"/>
       </w:pPr>
       <w:bookmarkStart w:id="159" w:name="_Toc241062319"/>
-      <w:bookmarkStart w:id="160" w:name="_Toc242142855"/>
+      <w:bookmarkStart w:id="160" w:name="_Toc242180596"/>
       <w:r>
         <w:t>5.2.1 Workflow de Creación y Publicación Inteligente</w:t>
       </w:r>
@@ -21358,7 +21362,7 @@
         <w:keepNext/>
         <w:jc w:val="center"/>
       </w:pPr>
-      <w:bookmarkStart w:id="161" w:name="_Toc242142947"/>
+      <w:bookmarkStart w:id="161" w:name="_Toc242180688"/>
       <w:r>
         <w:rPr>
           <w:i/>
@@ -21522,7 +21526,7 @@
         <w:keepNext/>
         <w:jc w:val="center"/>
       </w:pPr>
-      <w:bookmarkStart w:id="162" w:name="_Toc242142948"/>
+      <w:bookmarkStart w:id="162" w:name="_Toc242180689"/>
       <w:r>
         <w:rPr>
           <w:i/>
@@ -21691,7 +21695,7 @@
         <w:keepNext/>
         <w:jc w:val="center"/>
       </w:pPr>
-      <w:bookmarkStart w:id="163" w:name="_Toc242142949"/>
+      <w:bookmarkStart w:id="163" w:name="_Toc242180690"/>
       <w:r>
         <w:rPr>
           <w:i/>
@@ -21922,7 +21926,7 @@
         <w:keepNext/>
         <w:jc w:val="center"/>
       </w:pPr>
-      <w:bookmarkStart w:id="164" w:name="_Toc242142950"/>
+      <w:bookmarkStart w:id="164" w:name="_Toc242180691"/>
       <w:r>
         <w:rPr>
           <w:i/>
@@ -22037,7 +22041,7 @@
         <w:keepNext/>
         <w:jc w:val="center"/>
       </w:pPr>
-      <w:bookmarkStart w:id="165" w:name="_Toc242142951"/>
+      <w:bookmarkStart w:id="165" w:name="_Toc242180692"/>
       <w:r>
         <w:rPr>
           <w:i/>
@@ -22166,7 +22170,7 @@
           <w:sz w:val="20"/>
         </w:rPr>
       </w:pPr>
-      <w:bookmarkStart w:id="166" w:name="_Toc242142952"/>
+      <w:bookmarkStart w:id="166" w:name="_Toc242180693"/>
       <w:r>
         <w:rPr>
           <w:i/>
@@ -22291,7 +22295,7 @@
       <w:pPr>
         <w:pStyle w:val="Heading3"/>
       </w:pPr>
-      <w:bookmarkStart w:id="168" w:name="_Toc242142856"/>
+      <w:bookmarkStart w:id="168" w:name="_Toc242180597"/>
       <w:r>
         <w:t>5.2.2 Workflow de Gestión de Agenda y Estados</w:t>
       </w:r>
@@ -22392,7 +22396,7 @@
         <w:pStyle w:val="Heading3"/>
       </w:pPr>
       <w:bookmarkStart w:id="169" w:name="_Toc241062321"/>
-      <w:bookmarkStart w:id="170" w:name="_Toc242142857"/>
+      <w:bookmarkStart w:id="170" w:name="_Toc242180598"/>
       <w:r>
         <w:t>5.2.3 Workflow de Configuración y Tutorial de Vinculación</w:t>
       </w:r>
@@ -22511,7 +22515,7 @@
         <w:pStyle w:val="Heading2"/>
       </w:pPr>
       <w:bookmarkStart w:id="171" w:name="_Toc241062322"/>
-      <w:bookmarkStart w:id="172" w:name="_Toc242142858"/>
+      <w:bookmarkStart w:id="172" w:name="_Toc242180599"/>
       <w:r>
         <w:t>5.3 Diseño de la Experiencia de Usuario (User Journey)</w:t>
       </w:r>
@@ -22644,7 +22648,7 @@
         <w:spacing w:before="0" w:line="276" w:lineRule="auto"/>
       </w:pPr>
       <w:bookmarkStart w:id="173" w:name="_Toc241062323"/>
-      <w:bookmarkStart w:id="174" w:name="_Toc242142859"/>
+      <w:bookmarkStart w:id="174" w:name="_Toc242180600"/>
       <w:r>
         <w:t>CAPÍTULO 6: RESULTADOS</w:t>
       </w:r>
@@ -22691,7 +22695,7 @@
         <w:spacing w:before="0" w:line="276" w:lineRule="auto"/>
       </w:pPr>
       <w:bookmarkStart w:id="175" w:name="_Toc241062324"/>
-      <w:bookmarkStart w:id="176" w:name="_Toc242142860"/>
+      <w:bookmarkStart w:id="176" w:name="_Toc242180601"/>
       <w:r>
         <w:t>6.1 Validación empírica del artefacto</w:t>
       </w:r>
@@ -22762,7 +22766,7 @@
         <w:spacing w:before="360" w:line="240" w:lineRule="auto"/>
       </w:pPr>
       <w:bookmarkStart w:id="177" w:name="_Toc241062325"/>
-      <w:bookmarkStart w:id="178" w:name="_Toc242142861"/>
+      <w:bookmarkStart w:id="178" w:name="_Toc242180602"/>
       <w:r>
         <w:t>6.1.1 Validación empírica del Módulo Centinela</w:t>
       </w:r>
@@ -22830,7 +22834,7 @@
           <w:i/>
         </w:rPr>
       </w:pPr>
-      <w:bookmarkStart w:id="179" w:name="_Toc242142927"/>
+      <w:bookmarkStart w:id="179" w:name="_Toc242180668"/>
       <w:r>
         <w:rPr>
           <w:b/>
@@ -23069,7 +23073,7 @@
       <w:pPr>
         <w:keepNext/>
       </w:pPr>
-      <w:bookmarkStart w:id="180" w:name="_Toc242142928"/>
+      <w:bookmarkStart w:id="180" w:name="_Toc242180669"/>
       <w:r>
         <w:rPr>
           <w:b/>
@@ -23414,7 +23418,7 @@
         <w:keepNext/>
         <w:jc w:val="center"/>
       </w:pPr>
-      <w:bookmarkStart w:id="181" w:name="_Toc242142953"/>
+      <w:bookmarkStart w:id="181" w:name="_Toc242180694"/>
       <w:r>
         <w:rPr>
           <w:i/>
@@ -23553,7 +23557,7 @@
         <w:keepNext/>
         <w:jc w:val="center"/>
       </w:pPr>
-      <w:bookmarkStart w:id="182" w:name="_Toc242142954"/>
+      <w:bookmarkStart w:id="182" w:name="_Toc242180695"/>
       <w:r>
         <w:rPr>
           <w:i/>
@@ -23695,7 +23699,7 @@
         <w:keepNext/>
         <w:jc w:val="center"/>
       </w:pPr>
-      <w:bookmarkStart w:id="183" w:name="_Toc242142955"/>
+      <w:bookmarkStart w:id="183" w:name="_Toc242180696"/>
       <w:r>
         <w:rPr>
           <w:i/>
@@ -23838,7 +23842,7 @@
           <w:sz w:val="20"/>
         </w:rPr>
       </w:pPr>
-      <w:bookmarkStart w:id="184" w:name="_Toc242142956"/>
+      <w:bookmarkStart w:id="184" w:name="_Toc242180697"/>
       <w:r>
         <w:rPr>
           <w:i/>
@@ -23988,7 +23992,7 @@
         <w:spacing w:before="360" w:line="240" w:lineRule="auto"/>
       </w:pPr>
       <w:bookmarkStart w:id="185" w:name="_Toc241062326"/>
-      <w:bookmarkStart w:id="186" w:name="_Toc242142862"/>
+      <w:bookmarkStart w:id="186" w:name="_Toc242180603"/>
       <w:r>
         <w:t>6.1.2 Conjunto ampliado del canal de imagen (HU8)</w:t>
       </w:r>
@@ -24047,7 +24051,7 @@
         <w:spacing w:before="360" w:line="240" w:lineRule="auto"/>
       </w:pPr>
       <w:bookmarkStart w:id="187" w:name="_Toc241062327"/>
-      <w:bookmarkStart w:id="188" w:name="_Toc242142863"/>
+      <w:bookmarkStart w:id="188" w:name="_Toc242180604"/>
       <w:r>
         <w:t>6.1.3 Validación con contenido real y evaluación externa</w:t>
       </w:r>
@@ -24074,7 +24078,7 @@
       <w:pPr>
         <w:keepNext/>
       </w:pPr>
-      <w:bookmarkStart w:id="189" w:name="_Toc242142929"/>
+      <w:bookmarkStart w:id="189" w:name="_Toc242180670"/>
       <w:r>
         <w:rPr>
           <w:b/>
@@ -24564,7 +24568,7 @@
         <w:spacing w:before="360" w:line="240" w:lineRule="auto"/>
       </w:pPr>
       <w:bookmarkStart w:id="190" w:name="_Toc241062328"/>
-      <w:bookmarkStart w:id="191" w:name="_Toc242142864"/>
+      <w:bookmarkStart w:id="191" w:name="_Toc242180605"/>
       <w:r>
         <w:t>6.1.4 Análisis de valores límite y refinamiento del detector</w:t>
       </w:r>
@@ -24627,7 +24631,7 @@
       <w:pPr>
         <w:keepNext/>
       </w:pPr>
-      <w:bookmarkStart w:id="192" w:name="_Toc242142930"/>
+      <w:bookmarkStart w:id="192" w:name="_Toc242180671"/>
       <w:r>
         <w:rPr>
           <w:b/>
@@ -25444,7 +25448,7 @@
         <w:spacing w:before="360" w:line="240" w:lineRule="auto"/>
       </w:pPr>
       <w:bookmarkStart w:id="193" w:name="_Toc241062329"/>
-      <w:bookmarkStart w:id="194" w:name="_Toc242142865"/>
+      <w:bookmarkStart w:id="194" w:name="_Toc242180606"/>
       <w:r>
         <w:t>6.1.5 Baterías de validación técnica del sistema</w:t>
       </w:r>
@@ -25479,7 +25483,7 @@
         <w:spacing w:before="360" w:line="240" w:lineRule="auto"/>
       </w:pPr>
       <w:bookmarkStart w:id="195" w:name="_Toc241062330"/>
-      <w:bookmarkStart w:id="196" w:name="_Toc242142866"/>
+      <w:bookmarkStart w:id="196" w:name="_Toc242180607"/>
       <w:r>
         <w:t>6.1.6 Reducción del tiempo operativo y contraste de la hipótesis</w:t>
       </w:r>
@@ -25517,7 +25521,7 @@
           <w:i/>
         </w:rPr>
       </w:pPr>
-      <w:bookmarkStart w:id="197" w:name="_Toc242142931"/>
+      <w:bookmarkStart w:id="197" w:name="_Toc242180672"/>
       <w:r>
         <w:rPr>
           <w:b/>
@@ -26193,7 +26197,7 @@
         <w:spacing w:before="360" w:line="240" w:lineRule="auto"/>
       </w:pPr>
       <w:bookmarkStart w:id="198" w:name="_Toc241062331"/>
-      <w:bookmarkStart w:id="199" w:name="_Toc242142867"/>
+      <w:bookmarkStart w:id="199" w:name="_Toc242180608"/>
       <w:r>
         <w:t>6.1.7 Aceptación de las usuarias (Modelo TAM)</w:t>
       </w:r>
@@ -26212,7 +26216,7 @@
       <w:pPr>
         <w:keepNext/>
       </w:pPr>
-      <w:bookmarkStart w:id="200" w:name="_Toc242142932"/>
+      <w:bookmarkStart w:id="200" w:name="_Toc242180673"/>
       <w:r>
         <w:rPr>
           <w:b/>
@@ -26473,7 +26477,7 @@
         <w:pStyle w:val="Heading3"/>
         <w:spacing w:before="360" w:line="240" w:lineRule="auto"/>
       </w:pPr>
-      <w:bookmarkStart w:id="201" w:name="_Toc242142868"/>
+      <w:bookmarkStart w:id="201" w:name="_Toc242180609"/>
       <w:r>
         <w:t>6.1.8 Evaluación externa de la calidad del copy y del orden de carrusel (OE2)</w:t>
       </w:r>
@@ -26495,7 +26499,7 @@
         <w:spacing w:before="0" w:line="276" w:lineRule="auto"/>
       </w:pPr>
       <w:bookmarkStart w:id="202" w:name="_Toc241062332"/>
-      <w:bookmarkStart w:id="203" w:name="_Toc242142869"/>
+      <w:bookmarkStart w:id="203" w:name="_Toc242180610"/>
       <w:r>
         <w:t>6.2 Desafíos de Integración y Lecciones Aprendidas</w:t>
       </w:r>
@@ -26616,7 +26620,7 @@
         <w:pStyle w:val="Heading1"/>
       </w:pPr>
       <w:bookmarkStart w:id="204" w:name="_Toc241062334"/>
-      <w:bookmarkStart w:id="205" w:name="_Toc242142870"/>
+      <w:bookmarkStart w:id="205" w:name="_Toc242180611"/>
       <w:r>
         <w:t>CAPÍTULO 7: DISCUSIÓN</w:t>
       </w:r>
@@ -26634,7 +26638,7 @@
         <w:spacing w:after="240" w:line="276" w:lineRule="auto"/>
       </w:pPr>
       <w:bookmarkStart w:id="206" w:name="_Toc241062335"/>
-      <w:bookmarkStart w:id="207" w:name="_Toc242142871"/>
+      <w:bookmarkStart w:id="207" w:name="_Toc242180612"/>
       <w:r>
         <w:t>7.1 Contraste con la literatura sobre interfaces conversacionales</w:t>
       </w:r>
@@ -26652,7 +26656,7 @@
         <w:spacing w:after="240" w:line="276" w:lineRule="auto"/>
       </w:pPr>
       <w:bookmarkStart w:id="208" w:name="_Toc241062336"/>
-      <w:bookmarkStart w:id="209" w:name="_Toc242142872"/>
+      <w:bookmarkStart w:id="209" w:name="_Toc242180613"/>
       <w:r>
         <w:lastRenderedPageBreak/>
         <w:t>7.2 Grounding visual y mitigación de alucinaciones</w:t>
@@ -26671,7 +26675,7 @@
         <w:spacing w:after="240" w:line="276" w:lineRule="auto"/>
       </w:pPr>
       <w:bookmarkStart w:id="210" w:name="_Toc241062337"/>
-      <w:bookmarkStart w:id="211" w:name="_Toc242142873"/>
+      <w:bookmarkStart w:id="211" w:name="_Toc242180614"/>
       <w:r>
         <w:t>7.3 Compliance automatizado y RegTech</w:t>
       </w:r>
@@ -26699,7 +26703,7 @@
         <w:spacing w:after="240" w:line="276" w:lineRule="auto"/>
       </w:pPr>
       <w:bookmarkStart w:id="212" w:name="_Toc241062338"/>
-      <w:bookmarkStart w:id="213" w:name="_Toc242142874"/>
+      <w:bookmarkStart w:id="213" w:name="_Toc242180615"/>
       <w:r>
         <w:t>7.4 Visibilidad algorítmica y consistencia estética</w:t>
       </w:r>
@@ -26721,7 +26725,7 @@
         <w:spacing w:after="240" w:line="276" w:lineRule="auto"/>
       </w:pPr>
       <w:bookmarkStart w:id="214" w:name="_Toc241062339"/>
-      <w:bookmarkStart w:id="215" w:name="_Toc242142875"/>
+      <w:bookmarkStart w:id="215" w:name="_Toc242180616"/>
       <w:r>
         <w:t>7.5 Frente al vacío tecnológico del Estado del Arte</w:t>
       </w:r>
@@ -26739,7 +26743,7 @@
         <w:spacing w:after="240" w:line="276" w:lineRule="auto"/>
       </w:pPr>
       <w:bookmarkStart w:id="216" w:name="_Toc241062340"/>
-      <w:bookmarkStart w:id="217" w:name="_Toc242142876"/>
+      <w:bookmarkStart w:id="217" w:name="_Toc242180617"/>
       <w:r>
         <w:t>7.6 Aporte original frente a integración de tecnologías existentes</w:t>
       </w:r>
@@ -26757,7 +26761,7 @@
         <w:spacing w:after="240" w:line="276" w:lineRule="auto"/>
       </w:pPr>
       <w:bookmarkStart w:id="218" w:name="_Toc241062341"/>
-      <w:bookmarkStart w:id="219" w:name="_Toc242142877"/>
+      <w:bookmarkStart w:id="219" w:name="_Toc242180618"/>
       <w:r>
         <w:t>7.7 Limitaciones de la evidencia</w:t>
       </w:r>
@@ -26799,7 +26803,7 @@
         <w:spacing w:after="240" w:line="276" w:lineRule="auto"/>
       </w:pPr>
       <w:bookmarkStart w:id="220" w:name="_Toc241062342"/>
-      <w:bookmarkStart w:id="221" w:name="_Toc242142878"/>
+      <w:bookmarkStart w:id="221" w:name="_Toc242180619"/>
       <w:r>
         <w:t>7.8 Transferibilidad</w:t>
       </w:r>
@@ -26825,7 +26829,7 @@
         <w:pStyle w:val="Heading1"/>
       </w:pPr>
       <w:bookmarkStart w:id="222" w:name="_Toc241062343"/>
-      <w:bookmarkStart w:id="223" w:name="_Toc242142879"/>
+      <w:bookmarkStart w:id="223" w:name="_Toc242180620"/>
       <w:r>
         <w:t>CAPÍTULO 8. CONCLUSIONES Y RECOMENDACIONES</w:t>
       </w:r>
@@ -26861,7 +26865,7 @@
         <w:spacing w:after="240" w:line="276" w:lineRule="auto"/>
       </w:pPr>
       <w:bookmarkStart w:id="224" w:name="_Toc241062344"/>
-      <w:bookmarkStart w:id="225" w:name="_Toc242142880"/>
+      <w:bookmarkStart w:id="225" w:name="_Toc242180621"/>
       <w:r>
         <w:t>8.1 Conclusiones Generales y Cumplimiento de Objetivos</w:t>
       </w:r>
@@ -27050,7 +27054,7 @@
         <w:spacing w:after="240" w:line="276" w:lineRule="auto"/>
       </w:pPr>
       <w:bookmarkStart w:id="226" w:name="_Toc241062345"/>
-      <w:bookmarkStart w:id="227" w:name="_Toc242142881"/>
+      <w:bookmarkStart w:id="227" w:name="_Toc242180622"/>
       <w:r>
         <w:t>8.2 Recomendaciones Priorizadas</w:t>
       </w:r>
@@ -27292,7 +27296,7 @@
         <w:pStyle w:val="Heading1"/>
       </w:pPr>
       <w:bookmarkStart w:id="228" w:name="_Toc241062346"/>
-      <w:bookmarkStart w:id="229" w:name="_Toc242142882"/>
+      <w:bookmarkStart w:id="229" w:name="_Toc242180623"/>
       <w:r>
         <w:t>CAPÍTULO 9. REFERENCIAS BIBLIOGRÁFICAS</w:t>
       </w:r>
@@ -30533,7 +30537,7 @@
         <w:pStyle w:val="Heading1"/>
       </w:pPr>
       <w:bookmarkStart w:id="231" w:name="_Toc241062347"/>
-      <w:bookmarkStart w:id="232" w:name="_Toc242142883"/>
+      <w:bookmarkStart w:id="232" w:name="_Toc242180624"/>
       <w:r>
         <w:t>CAPÍTULO 10. ANEXOS</w:t>
       </w:r>
@@ -30556,7 +30560,7 @@
         <w:pStyle w:val="Heading2"/>
       </w:pPr>
       <w:bookmarkStart w:id="233" w:name="_Toc241062348"/>
-      <w:bookmarkStart w:id="234" w:name="_Toc242142884"/>
+      <w:bookmarkStart w:id="234" w:name="_Toc242180625"/>
       <w:r>
         <w:t>Anexo A — Tabla de cumplimiento de Historias de Usuario</w:t>
       </w:r>
@@ -30568,7 +30572,7 @@
         <w:pStyle w:val="Heading3"/>
       </w:pPr>
       <w:bookmarkStart w:id="235" w:name="_Toc241062349"/>
-      <w:bookmarkStart w:id="236" w:name="_Toc242142885"/>
+      <w:bookmarkStart w:id="236" w:name="_Toc242180626"/>
       <w:r>
         <w:t>A.1 Cumplimiento de las Historias de Usuario</w:t>
       </w:r>
@@ -30585,7 +30589,7 @@
       <w:pPr>
         <w:keepNext/>
       </w:pPr>
-      <w:bookmarkStart w:id="237" w:name="_Toc242142933"/>
+      <w:bookmarkStart w:id="237" w:name="_Toc242180674"/>
       <w:r>
         <w:rPr>
           <w:b/>
@@ -32309,7 +32313,7 @@
         <w:pStyle w:val="Heading3"/>
       </w:pPr>
       <w:bookmarkStart w:id="238" w:name="_Toc241062350"/>
-      <w:bookmarkStart w:id="239" w:name="_Toc242142886"/>
+      <w:bookmarkStart w:id="239" w:name="_Toc242180627"/>
       <w:r>
         <w:t>A.2 Cronología del desarrollo reconstruida del repositorio</w:t>
       </w:r>
@@ -32404,7 +32408,7 @@
         <w:pStyle w:val="Heading2"/>
       </w:pPr>
       <w:bookmarkStart w:id="240" w:name="_Toc241062351"/>
-      <w:bookmarkStart w:id="241" w:name="_Toc242142887"/>
+      <w:bookmarkStart w:id="241" w:name="_Toc242180628"/>
       <w:r>
         <w:t>Anexo B — Arquitectura técnica y decisiones de diseño</w:t>
       </w:r>
@@ -32423,7 +32427,7 @@
         <w:pStyle w:val="Heading3"/>
       </w:pPr>
       <w:bookmarkStart w:id="242" w:name="_Toc241062352"/>
-      <w:bookmarkStart w:id="243" w:name="_Toc242142888"/>
+      <w:bookmarkStart w:id="243" w:name="_Toc242180629"/>
       <w:r>
         <w:t>B.1 Infraestructura de despliegue</w:t>
       </w:r>
@@ -32485,7 +32489,7 @@
         <w:pStyle w:val="Heading3"/>
       </w:pPr>
       <w:bookmarkStart w:id="244" w:name="_Toc241062353"/>
-      <w:bookmarkStart w:id="245" w:name="_Toc242142889"/>
+      <w:bookmarkStart w:id="245" w:name="_Toc242180630"/>
       <w:r>
         <w:t>B.2 Inventario de workflows y su función</w:t>
       </w:r>
@@ -32664,7 +32668,7 @@
           <w:sz w:val="20"/>
         </w:rPr>
       </w:pPr>
-      <w:bookmarkStart w:id="246" w:name="_Toc242142957"/>
+      <w:bookmarkStart w:id="246" w:name="_Toc242180698"/>
       <w:r>
         <w:rPr>
           <w:i/>
@@ -32784,7 +32788,7 @@
         <w:pStyle w:val="Heading3"/>
       </w:pPr>
       <w:bookmarkStart w:id="247" w:name="_Toc241062354"/>
-      <w:bookmarkStart w:id="248" w:name="_Toc242142890"/>
+      <w:bookmarkStart w:id="248" w:name="_Toc242180631"/>
       <w:r>
         <w:t>B.3 Seguridad de credenciales</w:t>
       </w:r>
@@ -32805,7 +32809,7 @@
         <w:pStyle w:val="Heading3"/>
       </w:pPr>
       <w:bookmarkStart w:id="249" w:name="_Toc241062355"/>
-      <w:bookmarkStart w:id="250" w:name="_Toc242142891"/>
+      <w:bookmarkStart w:id="250" w:name="_Toc242180632"/>
       <w:r>
         <w:t>B.4 Módulo Centinela de Compliance: implementación</w:t>
       </w:r>
@@ -32868,7 +32872,7 @@
         <w:pStyle w:val="Heading3"/>
       </w:pPr>
       <w:bookmarkStart w:id="251" w:name="_Toc241062356"/>
-      <w:bookmarkStart w:id="252" w:name="_Toc242142892"/>
+      <w:bookmarkStart w:id="252" w:name="_Toc242180633"/>
       <w:r>
         <w:t>B.5 Concurrencia en la ingesta de carruseles</w:t>
       </w:r>
@@ -32885,7 +32889,7 @@
         <w:pStyle w:val="Heading3"/>
       </w:pPr>
       <w:bookmarkStart w:id="253" w:name="_Toc241062357"/>
-      <w:bookmarkStart w:id="254" w:name="_Toc242142893"/>
+      <w:bookmarkStart w:id="254" w:name="_Toc242180634"/>
       <w:r>
         <w:t>B.6 Prevención de publicaciones duplicadas</w:t>
       </w:r>
@@ -32908,7 +32912,7 @@
         <w:pStyle w:val="Heading3"/>
       </w:pPr>
       <w:bookmarkStart w:id="255" w:name="_Toc241062358"/>
-      <w:bookmarkStart w:id="256" w:name="_Toc242142894"/>
+      <w:bookmarkStart w:id="256" w:name="_Toc242180635"/>
       <w:r>
         <w:t>B.7 Publicación multiplataforma: extensión a Facebook</w:t>
       </w:r>
@@ -32925,7 +32929,7 @@
         <w:pStyle w:val="Heading3"/>
       </w:pPr>
       <w:bookmarkStart w:id="257" w:name="_Toc241062359"/>
-      <w:bookmarkStart w:id="258" w:name="_Toc242142895"/>
+      <w:bookmarkStart w:id="258" w:name="_Toc242180636"/>
       <w:r>
         <w:t>B.8 Sincronización de estado con Instagram</w:t>
       </w:r>
@@ -32942,7 +32946,7 @@
         <w:pStyle w:val="Heading3"/>
       </w:pPr>
       <w:bookmarkStart w:id="259" w:name="_Toc241062360"/>
-      <w:bookmarkStart w:id="260" w:name="_Toc242142896"/>
+      <w:bookmarkStart w:id="260" w:name="_Toc242180637"/>
       <w:r>
         <w:t>B.9 Procesamiento de video (HU13): detalle de implementación</w:t>
       </w:r>
@@ -32964,7 +32968,7 @@
         <w:pStyle w:val="Heading2"/>
       </w:pPr>
       <w:bookmarkStart w:id="261" w:name="_Toc241062361"/>
-      <w:bookmarkStart w:id="262" w:name="_Toc242142897"/>
+      <w:bookmarkStart w:id="262" w:name="_Toc242180638"/>
       <w:r>
         <w:t>Anexo C — Lecciones aprendidas y desafíos técnicos</w:t>
       </w:r>
@@ -32983,7 +32987,7 @@
         <w:pStyle w:val="Heading3"/>
       </w:pPr>
       <w:bookmarkStart w:id="263" w:name="_Toc241062362"/>
-      <w:bookmarkStart w:id="264" w:name="_Toc242142898"/>
+      <w:bookmarkStart w:id="264" w:name="_Toc242180639"/>
       <w:r>
         <w:t>C.1 Restricciones de infraestructura: el problema de las tarjetas virtuales</w:t>
       </w:r>
@@ -33000,7 +33004,7 @@
         <w:pStyle w:val="Heading3"/>
       </w:pPr>
       <w:bookmarkStart w:id="265" w:name="_Toc241062363"/>
-      <w:bookmarkStart w:id="266" w:name="_Toc242142899"/>
+      <w:bookmarkStart w:id="266" w:name="_Toc242180640"/>
       <w:r>
         <w:t>C.2 Concurrencia en flujos disparados por eventos externos</w:t>
       </w:r>
@@ -33017,7 +33021,7 @@
         <w:pStyle w:val="Heading3"/>
       </w:pPr>
       <w:bookmarkStart w:id="267" w:name="_Toc241062364"/>
-      <w:bookmarkStart w:id="268" w:name="_Toc242142900"/>
+      <w:bookmarkStart w:id="268" w:name="_Toc242180641"/>
       <w:r>
         <w:lastRenderedPageBreak/>
         <w:t>C.3 Integridad de datos al editar el sistema por su propia API</w:t>
@@ -33035,7 +33039,7 @@
         <w:pStyle w:val="Heading3"/>
       </w:pPr>
       <w:bookmarkStart w:id="269" w:name="_Toc241062365"/>
-      <w:bookmarkStart w:id="270" w:name="_Toc242142901"/>
+      <w:bookmarkStart w:id="270" w:name="_Toc242180642"/>
       <w:r>
         <w:t>C.4 Regresiones de plataforma en la migración al servidor propio</w:t>
       </w:r>
@@ -33052,7 +33056,7 @@
         <w:pStyle w:val="Heading3"/>
       </w:pPr>
       <w:bookmarkStart w:id="271" w:name="_Toc241062366"/>
-      <w:bookmarkStart w:id="272" w:name="_Toc242142902"/>
+      <w:bookmarkStart w:id="272" w:name="_Toc242180643"/>
       <w:r>
         <w:t>C.5 Restricciones del entorno de ejecución para el procesamiento de video</w:t>
       </w:r>
@@ -33069,7 +33073,7 @@
         <w:pStyle w:val="Heading3"/>
       </w:pPr>
       <w:bookmarkStart w:id="273" w:name="_Toc241062367"/>
-      <w:bookmarkStart w:id="274" w:name="_Toc242142903"/>
+      <w:bookmarkStart w:id="274" w:name="_Toc242180644"/>
       <w:r>
         <w:t>C.6 Integración con servicios externos: formatos de envío no documentados con claridad</w:t>
       </w:r>
@@ -33086,7 +33090,7 @@
         <w:pStyle w:val="Heading3"/>
       </w:pPr>
       <w:bookmarkStart w:id="275" w:name="_Toc241062368"/>
-      <w:bookmarkStart w:id="276" w:name="_Toc242142904"/>
+      <w:bookmarkStart w:id="276" w:name="_Toc242180645"/>
       <w:r>
         <w:t>C.7 Errores intermitentes en APIs de terceros</w:t>
       </w:r>
@@ -33103,7 +33107,7 @@
         <w:pStyle w:val="Heading3"/>
       </w:pPr>
       <w:bookmarkStart w:id="277" w:name="_Toc241062369"/>
-      <w:bookmarkStart w:id="278" w:name="_Toc242142905"/>
+      <w:bookmarkStart w:id="278" w:name="_Toc242180646"/>
       <w:r>
         <w:lastRenderedPageBreak/>
         <w:t>C.8 Límites de cuota en servicios de IA gratuitos</w:t>
@@ -33120,7 +33124,7 @@
       <w:pPr>
         <w:pStyle w:val="Heading3"/>
       </w:pPr>
-      <w:bookmarkStart w:id="279" w:name="_Toc242142906"/>
+      <w:bookmarkStart w:id="279" w:name="_Toc242180647"/>
       <w:r>
         <w:t>C.9 Cuota de lecturas de Google Sheets al programar</w:t>
       </w:r>
@@ -33137,7 +33141,7 @@
         <w:pStyle w:val="Heading2"/>
       </w:pPr>
       <w:bookmarkStart w:id="280" w:name="_Toc241062370"/>
-      <w:bookmarkStart w:id="281" w:name="_Toc242142907"/>
+      <w:bookmarkStart w:id="281" w:name="_Toc242180648"/>
       <w:r>
         <w:t>Anexo D — Pautas Mary Kay para el uso en los medios sociales</w:t>
       </w:r>
@@ -33239,7 +33243,7 @@
         <w:pStyle w:val="Heading2"/>
       </w:pPr>
       <w:bookmarkStart w:id="282" w:name="_Toc241062371"/>
-      <w:bookmarkStart w:id="283" w:name="_Toc242142908"/>
+      <w:bookmarkStart w:id="283" w:name="_Toc242180649"/>
       <w:r>
         <w:t>Anexo E — Protocolo de validación empírica y conjuntos de datos</w:t>
       </w:r>
@@ -33259,7 +33263,7 @@
         <w:pStyle w:val="Heading3"/>
       </w:pPr>
       <w:bookmarkStart w:id="284" w:name="_Toc241062372"/>
-      <w:bookmarkStart w:id="285" w:name="_Toc242142909"/>
+      <w:bookmarkStart w:id="285" w:name="_Toc242180650"/>
       <w:r>
         <w:t>E.1 Validación del Módulo Centinela de Compliance</w:t>
       </w:r>
@@ -33383,7 +33387,7 @@
       <w:pPr>
         <w:keepNext/>
       </w:pPr>
-      <w:bookmarkStart w:id="286" w:name="_Toc242142934"/>
+      <w:bookmarkStart w:id="286" w:name="_Toc242180675"/>
       <w:r>
         <w:rPr>
           <w:b/>
@@ -35884,7 +35888,7 @@
         <w:pStyle w:val="Heading3"/>
       </w:pPr>
       <w:bookmarkStart w:id="287" w:name="_Toc241062373"/>
-      <w:bookmarkStart w:id="288" w:name="_Toc242142910"/>
+      <w:bookmarkStart w:id="288" w:name="_Toc242180651"/>
       <w:r>
         <w:lastRenderedPageBreak/>
         <w:t>E.2 Protocolo de cronometraje del tiempo operativo</w:t>
@@ -35989,7 +35993,7 @@
         <w:pStyle w:val="Heading3"/>
       </w:pPr>
       <w:bookmarkStart w:id="289" w:name="_Toc241062374"/>
-      <w:bookmarkStart w:id="290" w:name="_Toc242142911"/>
+      <w:bookmarkStart w:id="290" w:name="_Toc242180652"/>
       <w:r>
         <w:t>E.3 Cuestionario de aceptación tecnológica (TAM)</w:t>
       </w:r>
@@ -36021,7 +36025,7 @@
         <w:pStyle w:val="Heading3"/>
       </w:pPr>
       <w:bookmarkStart w:id="291" w:name="_Toc241062375"/>
-      <w:bookmarkStart w:id="292" w:name="_Toc242142912"/>
+      <w:bookmarkStart w:id="292" w:name="_Toc242180653"/>
       <w:r>
         <w:t>E.4 Reproducibilidad de los análisis</w:t>
       </w:r>
@@ -36109,7 +36113,7 @@
         <w:pStyle w:val="Heading3"/>
       </w:pPr>
       <w:bookmarkStart w:id="293" w:name="_Toc241062376"/>
-      <w:bookmarkStart w:id="294" w:name="_Toc242142913"/>
+      <w:bookmarkStart w:id="294" w:name="_Toc242180654"/>
       <w:r>
         <w:t>E.5 Baterías de validación técnica</w:t>
       </w:r>
@@ -36140,7 +36144,7 @@
       <w:pPr>
         <w:keepNext/>
       </w:pPr>
-      <w:bookmarkStart w:id="295" w:name="_Toc242142935"/>
+      <w:bookmarkStart w:id="295" w:name="_Toc242180676"/>
       <w:r>
         <w:t xml:space="preserve">Tabla </w:t>
       </w:r>
@@ -37013,7 +37017,7 @@
         <w:pStyle w:val="Heading3"/>
       </w:pPr>
       <w:bookmarkStart w:id="296" w:name="_Toc241062377"/>
-      <w:bookmarkStart w:id="297" w:name="_Toc242142914"/>
+      <w:bookmarkStart w:id="297" w:name="_Toc242180655"/>
       <w:r>
         <w:t>E.6 Conjunto ampliado del canal de imagen (HU8)</w:t>
       </w:r>
@@ -37100,7 +37104,7 @@
       <w:pPr>
         <w:keepNext/>
       </w:pPr>
-      <w:bookmarkStart w:id="298" w:name="_Toc242142936"/>
+      <w:bookmarkStart w:id="298" w:name="_Toc242180677"/>
       <w:r>
         <w:t xml:space="preserve">Tabla </w:t>
       </w:r>
@@ -37331,7 +37335,7 @@
         <w:pStyle w:val="Heading3"/>
       </w:pPr>
       <w:bookmarkStart w:id="299" w:name="_Toc241062378"/>
-      <w:bookmarkStart w:id="300" w:name="_Toc242142915"/>
+      <w:bookmarkStart w:id="300" w:name="_Toc242180656"/>
       <w:r>
         <w:t>E.7 Verificación de los umbrales de las Historias de Usuario</w:t>
       </w:r>
@@ -37367,7 +37371,7 @@
       <w:pPr>
         <w:keepNext/>
       </w:pPr>
-      <w:bookmarkStart w:id="301" w:name="_Toc242142937"/>
+      <w:bookmarkStart w:id="301" w:name="_Toc242180678"/>
       <w:r>
         <w:t xml:space="preserve">Tabla </w:t>
       </w:r>
@@ -38570,7 +38574,7 @@
         <w:pStyle w:val="Heading3"/>
       </w:pPr>
       <w:bookmarkStart w:id="302" w:name="_Toc241062379"/>
-      <w:bookmarkStart w:id="303" w:name="_Toc242142916"/>
+      <w:bookmarkStart w:id="303" w:name="_Toc242180657"/>
       <w:r>
         <w:t>E.8 Casos difíciles del canal de imagen y variabilidad entre corridas</w:t>
       </w:r>
@@ -38620,7 +38624,7 @@
       <w:pPr>
         <w:keepNext/>
       </w:pPr>
-      <w:bookmarkStart w:id="304" w:name="_Toc242142938"/>
+      <w:bookmarkStart w:id="304" w:name="_Toc242180679"/>
       <w:r>
         <w:t xml:space="preserve">Tabla </w:t>
       </w:r>
@@ -38835,7 +38839,7 @@
         <w:pStyle w:val="Heading3"/>
       </w:pPr>
       <w:bookmarkStart w:id="305" w:name="_Toc241062380"/>
-      <w:bookmarkStart w:id="306" w:name="_Toc242142917"/>
+      <w:bookmarkStart w:id="306" w:name="_Toc242180658"/>
       <w:r>
         <w:t>E.9 Casos de video del canal visual (HU13)</w:t>
       </w:r>
@@ -38880,7 +38884,7 @@
         <w:pStyle w:val="Heading3"/>
       </w:pPr>
       <w:bookmarkStart w:id="307" w:name="_Toc241062381"/>
-      <w:bookmarkStart w:id="308" w:name="_Toc242142918"/>
+      <w:bookmarkStart w:id="308" w:name="_Toc242180659"/>
       <w:r>
         <w:t>E.10 Caso de carrusel del canal visual (HU5)</w:t>
       </w:r>
@@ -38931,7 +38935,7 @@
         <w:pStyle w:val="Heading3"/>
       </w:pPr>
       <w:bookmarkStart w:id="309" w:name="_Toc241062382"/>
-      <w:bookmarkStart w:id="310" w:name="_Toc242142919"/>
+      <w:bookmarkStart w:id="310" w:name="_Toc242180660"/>
       <w:r>
         <w:t>E.11 Caso de re-publicación del canal visual (HU12)</w:t>
       </w:r>
@@ -38982,7 +38986,7 @@
         <w:pStyle w:val="Heading3"/>
       </w:pPr>
       <w:bookmarkStart w:id="311" w:name="_Toc241062383"/>
-      <w:bookmarkStart w:id="312" w:name="_Toc242142920"/>
+      <w:bookmarkStart w:id="312" w:name="_Toc242180661"/>
       <w:r>
         <w:t>E.12 Gobierno del llamado a la acción generado</w:t>
       </w:r>
@@ -39033,7 +39037,7 @@
         <w:pStyle w:val="Heading3"/>
       </w:pPr>
       <w:bookmarkStart w:id="313" w:name="_Toc241062384"/>
-      <w:bookmarkStart w:id="314" w:name="_Toc242142921"/>
+      <w:bookmarkStart w:id="314" w:name="_Toc242180662"/>
       <w:r>
         <w:t>E.13 Trazabilidad de los Objetivos Específicos</w:t>
       </w:r>
@@ -39052,7 +39056,7 @@
       <w:pPr>
         <w:keepNext/>
       </w:pPr>
-      <w:bookmarkStart w:id="315" w:name="_Toc242142939"/>
+      <w:bookmarkStart w:id="315" w:name="_Toc242180680"/>
       <w:r>
         <w:t xml:space="preserve">Tabla </w:t>
       </w:r>
@@ -39621,7 +39625,7 @@
       <w:pPr>
         <w:pStyle w:val="Heading3"/>
       </w:pPr>
-      <w:bookmarkStart w:id="316" w:name="_Toc242142922"/>
+      <w:bookmarkStart w:id="316" w:name="_Toc242180663"/>
       <w:r>
         <w:t>E.14 Objetivo Específico 2 — calidad del copy y comparación con el trabajo manual</w:t>
       </w:r>
@@ -39790,7 +39794,7 @@
       <w:pPr>
         <w:pStyle w:val="Heading3"/>
       </w:pPr>
-      <w:bookmarkStart w:id="317" w:name="_Toc242142923"/>
+      <w:bookmarkStart w:id="317" w:name="_Toc242180664"/>
       <w:r>
         <w:t>E.15 Trazabilidad entre versiones del sistema y mediciones</w:t>
       </w:r>
@@ -39805,7 +39809,7 @@
       <w:pPr>
         <w:keepNext/>
       </w:pPr>
-      <w:bookmarkStart w:id="318" w:name="_Toc242142940"/>
+      <w:bookmarkStart w:id="318" w:name="_Toc242180681"/>
       <w:r>
         <w:t xml:space="preserve">Tabla </w:t>
       </w:r>
@@ -40356,7 +40360,7 @@
       <w:pPr>
         <w:pStyle w:val="Heading3"/>
       </w:pPr>
-      <w:bookmarkStart w:id="319" w:name="_Toc242142924"/>
+      <w:bookmarkStart w:id="319" w:name="_Toc242180665"/>
       <w:r>
         <w:t>E.16 Inventario del material complementario</w:t>
       </w:r>
@@ -40371,7 +40375,7 @@
       <w:pPr>
         <w:keepNext/>
       </w:pPr>
-      <w:bookmarkStart w:id="320" w:name="_Toc242142941"/>
+      <w:bookmarkStart w:id="320" w:name="_Toc242180682"/>
       <w:r>
         <w:t xml:space="preserve">Tabla </w:t>
       </w:r>

</xml_diff>

<commit_message>
docs(tesis): pasada 245b, parte dos oraciones largas (E.15 y 3.7.6) y rotula la fila nueva de la Tabla 17 sin cortar la palabra
Co-Authored-By: Claude Opus 5.5 <noreply@anthropic.com>
</commit_message>
<xml_diff>
--- a/avance/Tesis Postly Bontorno Hassan-1 v2.docx
+++ b/avance/Tesis Postly Bontorno Hassan-1 v2.docx
@@ -316,7 +316,7 @@
       <w:r>
         <w:fldChar w:fldCharType="separate"/>
       </w:r>
-      <w:hyperlink w:anchor="_Toc242182621" w:history="1">
+      <w:hyperlink w:anchor="_Toc242182867" w:history="1">
         <w:r>
           <w:rPr>
             <w:rStyle w:val="Hyperlink"/>
@@ -339,7 +339,7 @@
           <w:rPr>
             <w:webHidden/>
           </w:rPr>
-          <w:instrText xml:space="preserve"> PAGEREF _Toc242182621 \h </w:instrText>
+          <w:instrText xml:space="preserve"> PAGEREF _Toc242182867 \h </w:instrText>
         </w:r>
         <w:r>
           <w:rPr>
@@ -378,7 +378,7 @@
           <w14:ligatures w14:val="standardContextual"/>
         </w:rPr>
       </w:pPr>
-      <w:hyperlink w:anchor="_Toc242182622" w:history="1">
+      <w:hyperlink w:anchor="_Toc242182868" w:history="1">
         <w:r>
           <w:rPr>
             <w:rStyle w:val="Hyperlink"/>
@@ -401,7 +401,7 @@
           <w:rPr>
             <w:webHidden/>
           </w:rPr>
-          <w:instrText xml:space="preserve"> PAGEREF _Toc242182622 \h </w:instrText>
+          <w:instrText xml:space="preserve"> PAGEREF _Toc242182868 \h </w:instrText>
         </w:r>
         <w:r>
           <w:rPr>
@@ -442,7 +442,7 @@
           <w14:ligatures w14:val="standardContextual"/>
         </w:rPr>
       </w:pPr>
-      <w:hyperlink w:anchor="_Toc242182623" w:history="1">
+      <w:hyperlink w:anchor="_Toc242182869" w:history="1">
         <w:r>
           <w:rPr>
             <w:rStyle w:val="Hyperlink"/>
@@ -469,7 +469,7 @@
             <w:noProof/>
             <w:webHidden/>
           </w:rPr>
-          <w:instrText xml:space="preserve"> PAGEREF _Toc242182623 \h </w:instrText>
+          <w:instrText xml:space="preserve"> PAGEREF _Toc242182869 \h </w:instrText>
         </w:r>
         <w:r>
           <w:rPr>
@@ -514,7 +514,7 @@
           <w14:ligatures w14:val="standardContextual"/>
         </w:rPr>
       </w:pPr>
-      <w:hyperlink w:anchor="_Toc242182624" w:history="1">
+      <w:hyperlink w:anchor="_Toc242182870" w:history="1">
         <w:r>
           <w:rPr>
             <w:rStyle w:val="Hyperlink"/>
@@ -541,7 +541,7 @@
             <w:noProof/>
             <w:webHidden/>
           </w:rPr>
-          <w:instrText xml:space="preserve"> PAGEREF _Toc242182624 \h </w:instrText>
+          <w:instrText xml:space="preserve"> PAGEREF _Toc242182870 \h </w:instrText>
         </w:r>
         <w:r>
           <w:rPr>
@@ -586,7 +586,7 @@
           <w14:ligatures w14:val="standardContextual"/>
         </w:rPr>
       </w:pPr>
-      <w:hyperlink w:anchor="_Toc242182625" w:history="1">
+      <w:hyperlink w:anchor="_Toc242182871" w:history="1">
         <w:r>
           <w:rPr>
             <w:rStyle w:val="Hyperlink"/>
@@ -613,7 +613,7 @@
             <w:noProof/>
             <w:webHidden/>
           </w:rPr>
-          <w:instrText xml:space="preserve"> PAGEREF _Toc242182625 \h </w:instrText>
+          <w:instrText xml:space="preserve"> PAGEREF _Toc242182871 \h </w:instrText>
         </w:r>
         <w:r>
           <w:rPr>
@@ -658,7 +658,7 @@
           <w14:ligatures w14:val="standardContextual"/>
         </w:rPr>
       </w:pPr>
-      <w:hyperlink w:anchor="_Toc242182626" w:history="1">
+      <w:hyperlink w:anchor="_Toc242182872" w:history="1">
         <w:r>
           <w:rPr>
             <w:rStyle w:val="Hyperlink"/>
@@ -685,7 +685,7 @@
             <w:noProof/>
             <w:webHidden/>
           </w:rPr>
-          <w:instrText xml:space="preserve"> PAGEREF _Toc242182626 \h </w:instrText>
+          <w:instrText xml:space="preserve"> PAGEREF _Toc242182872 \h </w:instrText>
         </w:r>
         <w:r>
           <w:rPr>
@@ -730,7 +730,7 @@
           <w14:ligatures w14:val="standardContextual"/>
         </w:rPr>
       </w:pPr>
-      <w:hyperlink w:anchor="_Toc242182627" w:history="1">
+      <w:hyperlink w:anchor="_Toc242182873" w:history="1">
         <w:r>
           <w:rPr>
             <w:rStyle w:val="Hyperlink"/>
@@ -757,7 +757,7 @@
             <w:noProof/>
             <w:webHidden/>
           </w:rPr>
-          <w:instrText xml:space="preserve"> PAGEREF _Toc242182627 \h </w:instrText>
+          <w:instrText xml:space="preserve"> PAGEREF _Toc242182873 \h </w:instrText>
         </w:r>
         <w:r>
           <w:rPr>
@@ -802,7 +802,7 @@
           <w14:ligatures w14:val="standardContextual"/>
         </w:rPr>
       </w:pPr>
-      <w:hyperlink w:anchor="_Toc242182628" w:history="1">
+      <w:hyperlink w:anchor="_Toc242182874" w:history="1">
         <w:r>
           <w:rPr>
             <w:rStyle w:val="Hyperlink"/>
@@ -829,7 +829,7 @@
             <w:noProof/>
             <w:webHidden/>
           </w:rPr>
-          <w:instrText xml:space="preserve"> PAGEREF _Toc242182628 \h </w:instrText>
+          <w:instrText xml:space="preserve"> PAGEREF _Toc242182874 \h </w:instrText>
         </w:r>
         <w:r>
           <w:rPr>
@@ -874,7 +874,7 @@
           <w14:ligatures w14:val="standardContextual"/>
         </w:rPr>
       </w:pPr>
-      <w:hyperlink w:anchor="_Toc242182629" w:history="1">
+      <w:hyperlink w:anchor="_Toc242182875" w:history="1">
         <w:r>
           <w:rPr>
             <w:rStyle w:val="Hyperlink"/>
@@ -901,7 +901,7 @@
             <w:noProof/>
             <w:webHidden/>
           </w:rPr>
-          <w:instrText xml:space="preserve"> PAGEREF _Toc242182629 \h </w:instrText>
+          <w:instrText xml:space="preserve"> PAGEREF _Toc242182875 \h </w:instrText>
         </w:r>
         <w:r>
           <w:rPr>
@@ -946,7 +946,7 @@
           <w14:ligatures w14:val="standardContextual"/>
         </w:rPr>
       </w:pPr>
-      <w:hyperlink w:anchor="_Toc242182630" w:history="1">
+      <w:hyperlink w:anchor="_Toc242182876" w:history="1">
         <w:r>
           <w:rPr>
             <w:rStyle w:val="Hyperlink"/>
@@ -973,7 +973,7 @@
             <w:noProof/>
             <w:webHidden/>
           </w:rPr>
-          <w:instrText xml:space="preserve"> PAGEREF _Toc242182630 \h </w:instrText>
+          <w:instrText xml:space="preserve"> PAGEREF _Toc242182876 \h </w:instrText>
         </w:r>
         <w:r>
           <w:rPr>
@@ -1018,7 +1018,7 @@
           <w14:ligatures w14:val="standardContextual"/>
         </w:rPr>
       </w:pPr>
-      <w:hyperlink w:anchor="_Toc242182631" w:history="1">
+      <w:hyperlink w:anchor="_Toc242182877" w:history="1">
         <w:r>
           <w:rPr>
             <w:rStyle w:val="Hyperlink"/>
@@ -1045,7 +1045,7 @@
             <w:noProof/>
             <w:webHidden/>
           </w:rPr>
-          <w:instrText xml:space="preserve"> PAGEREF _Toc242182631 \h </w:instrText>
+          <w:instrText xml:space="preserve"> PAGEREF _Toc242182877 \h </w:instrText>
         </w:r>
         <w:r>
           <w:rPr>
@@ -1090,7 +1090,7 @@
           <w14:ligatures w14:val="standardContextual"/>
         </w:rPr>
       </w:pPr>
-      <w:hyperlink w:anchor="_Toc242182632" w:history="1">
+      <w:hyperlink w:anchor="_Toc242182878" w:history="1">
         <w:r>
           <w:rPr>
             <w:rStyle w:val="Hyperlink"/>
@@ -1117,7 +1117,7 @@
             <w:noProof/>
             <w:webHidden/>
           </w:rPr>
-          <w:instrText xml:space="preserve"> PAGEREF _Toc242182632 \h </w:instrText>
+          <w:instrText xml:space="preserve"> PAGEREF _Toc242182878 \h </w:instrText>
         </w:r>
         <w:r>
           <w:rPr>
@@ -1162,7 +1162,7 @@
           <w14:ligatures w14:val="standardContextual"/>
         </w:rPr>
       </w:pPr>
-      <w:hyperlink w:anchor="_Toc242182633" w:history="1">
+      <w:hyperlink w:anchor="_Toc242182879" w:history="1">
         <w:r>
           <w:rPr>
             <w:rStyle w:val="Hyperlink"/>
@@ -1189,7 +1189,7 @@
             <w:noProof/>
             <w:webHidden/>
           </w:rPr>
-          <w:instrText xml:space="preserve"> PAGEREF _Toc242182633 \h </w:instrText>
+          <w:instrText xml:space="preserve"> PAGEREF _Toc242182879 \h </w:instrText>
         </w:r>
         <w:r>
           <w:rPr>
@@ -1234,7 +1234,7 @@
           <w14:ligatures w14:val="standardContextual"/>
         </w:rPr>
       </w:pPr>
-      <w:hyperlink w:anchor="_Toc242182634" w:history="1">
+      <w:hyperlink w:anchor="_Toc242182880" w:history="1">
         <w:r>
           <w:rPr>
             <w:rStyle w:val="Hyperlink"/>
@@ -1261,7 +1261,7 @@
             <w:noProof/>
             <w:webHidden/>
           </w:rPr>
-          <w:instrText xml:space="preserve"> PAGEREF _Toc242182634 \h </w:instrText>
+          <w:instrText xml:space="preserve"> PAGEREF _Toc242182880 \h </w:instrText>
         </w:r>
         <w:r>
           <w:rPr>
@@ -1306,7 +1306,7 @@
           <w14:ligatures w14:val="standardContextual"/>
         </w:rPr>
       </w:pPr>
-      <w:hyperlink w:anchor="_Toc242182635" w:history="1">
+      <w:hyperlink w:anchor="_Toc242182881" w:history="1">
         <w:r>
           <w:rPr>
             <w:rStyle w:val="Hyperlink"/>
@@ -1333,7 +1333,7 @@
             <w:noProof/>
             <w:webHidden/>
           </w:rPr>
-          <w:instrText xml:space="preserve"> PAGEREF _Toc242182635 \h </w:instrText>
+          <w:instrText xml:space="preserve"> PAGEREF _Toc242182881 \h </w:instrText>
         </w:r>
         <w:r>
           <w:rPr>
@@ -1378,7 +1378,7 @@
           <w14:ligatures w14:val="standardContextual"/>
         </w:rPr>
       </w:pPr>
-      <w:hyperlink w:anchor="_Toc242182636" w:history="1">
+      <w:hyperlink w:anchor="_Toc242182882" w:history="1">
         <w:r>
           <w:rPr>
             <w:rStyle w:val="Hyperlink"/>
@@ -1405,7 +1405,7 @@
             <w:noProof/>
             <w:webHidden/>
           </w:rPr>
-          <w:instrText xml:space="preserve"> PAGEREF _Toc242182636 \h </w:instrText>
+          <w:instrText xml:space="preserve"> PAGEREF _Toc242182882 \h </w:instrText>
         </w:r>
         <w:r>
           <w:rPr>
@@ -1448,7 +1448,7 @@
           <w14:ligatures w14:val="standardContextual"/>
         </w:rPr>
       </w:pPr>
-      <w:hyperlink w:anchor="_Toc242182637" w:history="1">
+      <w:hyperlink w:anchor="_Toc242182883" w:history="1">
         <w:r>
           <w:rPr>
             <w:rStyle w:val="Hyperlink"/>
@@ -1471,7 +1471,7 @@
           <w:rPr>
             <w:webHidden/>
           </w:rPr>
-          <w:instrText xml:space="preserve"> PAGEREF _Toc242182637 \h </w:instrText>
+          <w:instrText xml:space="preserve"> PAGEREF _Toc242182883 \h </w:instrText>
         </w:r>
         <w:r>
           <w:rPr>
@@ -1512,7 +1512,7 @@
           <w14:ligatures w14:val="standardContextual"/>
         </w:rPr>
       </w:pPr>
-      <w:hyperlink w:anchor="_Toc242182638" w:history="1">
+      <w:hyperlink w:anchor="_Toc242182884" w:history="1">
         <w:r>
           <w:rPr>
             <w:rStyle w:val="Hyperlink"/>
@@ -1539,7 +1539,7 @@
             <w:noProof/>
             <w:webHidden/>
           </w:rPr>
-          <w:instrText xml:space="preserve"> PAGEREF _Toc242182638 \h </w:instrText>
+          <w:instrText xml:space="preserve"> PAGEREF _Toc242182884 \h </w:instrText>
         </w:r>
         <w:r>
           <w:rPr>
@@ -1584,7 +1584,7 @@
           <w14:ligatures w14:val="standardContextual"/>
         </w:rPr>
       </w:pPr>
-      <w:hyperlink w:anchor="_Toc242182639" w:history="1">
+      <w:hyperlink w:anchor="_Toc242182885" w:history="1">
         <w:r>
           <w:rPr>
             <w:rStyle w:val="Hyperlink"/>
@@ -1611,7 +1611,7 @@
             <w:noProof/>
             <w:webHidden/>
           </w:rPr>
-          <w:instrText xml:space="preserve"> PAGEREF _Toc242182639 \h </w:instrText>
+          <w:instrText xml:space="preserve"> PAGEREF _Toc242182885 \h </w:instrText>
         </w:r>
         <w:r>
           <w:rPr>
@@ -1656,7 +1656,7 @@
           <w14:ligatures w14:val="standardContextual"/>
         </w:rPr>
       </w:pPr>
-      <w:hyperlink w:anchor="_Toc242182640" w:history="1">
+      <w:hyperlink w:anchor="_Toc242182886" w:history="1">
         <w:r>
           <w:rPr>
             <w:rStyle w:val="Hyperlink"/>
@@ -1683,7 +1683,7 @@
             <w:noProof/>
             <w:webHidden/>
           </w:rPr>
-          <w:instrText xml:space="preserve"> PAGEREF _Toc242182640 \h </w:instrText>
+          <w:instrText xml:space="preserve"> PAGEREF _Toc242182886 \h </w:instrText>
         </w:r>
         <w:r>
           <w:rPr>
@@ -1728,7 +1728,7 @@
           <w14:ligatures w14:val="standardContextual"/>
         </w:rPr>
       </w:pPr>
-      <w:hyperlink w:anchor="_Toc242182641" w:history="1">
+      <w:hyperlink w:anchor="_Toc242182887" w:history="1">
         <w:r>
           <w:rPr>
             <w:rStyle w:val="Hyperlink"/>
@@ -1755,7 +1755,7 @@
             <w:noProof/>
             <w:webHidden/>
           </w:rPr>
-          <w:instrText xml:space="preserve"> PAGEREF _Toc242182641 \h </w:instrText>
+          <w:instrText xml:space="preserve"> PAGEREF _Toc242182887 \h </w:instrText>
         </w:r>
         <w:r>
           <w:rPr>
@@ -1798,7 +1798,7 @@
           <w14:ligatures w14:val="standardContextual"/>
         </w:rPr>
       </w:pPr>
-      <w:hyperlink w:anchor="_Toc242182642" w:history="1">
+      <w:hyperlink w:anchor="_Toc242182888" w:history="1">
         <w:r>
           <w:rPr>
             <w:rStyle w:val="Hyperlink"/>
@@ -1821,7 +1821,7 @@
           <w:rPr>
             <w:webHidden/>
           </w:rPr>
-          <w:instrText xml:space="preserve"> PAGEREF _Toc242182642 \h </w:instrText>
+          <w:instrText xml:space="preserve"> PAGEREF _Toc242182888 \h </w:instrText>
         </w:r>
         <w:r>
           <w:rPr>
@@ -1862,7 +1862,7 @@
           <w14:ligatures w14:val="standardContextual"/>
         </w:rPr>
       </w:pPr>
-      <w:hyperlink w:anchor="_Toc242182643" w:history="1">
+      <w:hyperlink w:anchor="_Toc242182889" w:history="1">
         <w:r>
           <w:rPr>
             <w:rStyle w:val="Hyperlink"/>
@@ -1889,7 +1889,7 @@
             <w:noProof/>
             <w:webHidden/>
           </w:rPr>
-          <w:instrText xml:space="preserve"> PAGEREF _Toc242182643 \h </w:instrText>
+          <w:instrText xml:space="preserve"> PAGEREF _Toc242182889 \h </w:instrText>
         </w:r>
         <w:r>
           <w:rPr>
@@ -1934,7 +1934,7 @@
           <w14:ligatures w14:val="standardContextual"/>
         </w:rPr>
       </w:pPr>
-      <w:hyperlink w:anchor="_Toc242182644" w:history="1">
+      <w:hyperlink w:anchor="_Toc242182890" w:history="1">
         <w:r>
           <w:rPr>
             <w:rStyle w:val="Hyperlink"/>
@@ -1961,7 +1961,7 @@
             <w:noProof/>
             <w:webHidden/>
           </w:rPr>
-          <w:instrText xml:space="preserve"> PAGEREF _Toc242182644 \h </w:instrText>
+          <w:instrText xml:space="preserve"> PAGEREF _Toc242182890 \h </w:instrText>
         </w:r>
         <w:r>
           <w:rPr>
@@ -2006,7 +2006,7 @@
           <w14:ligatures w14:val="standardContextual"/>
         </w:rPr>
       </w:pPr>
-      <w:hyperlink w:anchor="_Toc242182645" w:history="1">
+      <w:hyperlink w:anchor="_Toc242182891" w:history="1">
         <w:r>
           <w:rPr>
             <w:rStyle w:val="Hyperlink"/>
@@ -2033,7 +2033,7 @@
             <w:noProof/>
             <w:webHidden/>
           </w:rPr>
-          <w:instrText xml:space="preserve"> PAGEREF _Toc242182645 \h </w:instrText>
+          <w:instrText xml:space="preserve"> PAGEREF _Toc242182891 \h </w:instrText>
         </w:r>
         <w:r>
           <w:rPr>
@@ -2078,7 +2078,7 @@
           <w14:ligatures w14:val="standardContextual"/>
         </w:rPr>
       </w:pPr>
-      <w:hyperlink w:anchor="_Toc242182646" w:history="1">
+      <w:hyperlink w:anchor="_Toc242182892" w:history="1">
         <w:r>
           <w:rPr>
             <w:rStyle w:val="Hyperlink"/>
@@ -2105,7 +2105,7 @@
             <w:noProof/>
             <w:webHidden/>
           </w:rPr>
-          <w:instrText xml:space="preserve"> PAGEREF _Toc242182646 \h </w:instrText>
+          <w:instrText xml:space="preserve"> PAGEREF _Toc242182892 \h </w:instrText>
         </w:r>
         <w:r>
           <w:rPr>
@@ -2150,7 +2150,7 @@
           <w14:ligatures w14:val="standardContextual"/>
         </w:rPr>
       </w:pPr>
-      <w:hyperlink w:anchor="_Toc242182647" w:history="1">
+      <w:hyperlink w:anchor="_Toc242182893" w:history="1">
         <w:r>
           <w:rPr>
             <w:rStyle w:val="Hyperlink"/>
@@ -2177,7 +2177,7 @@
             <w:noProof/>
             <w:webHidden/>
           </w:rPr>
-          <w:instrText xml:space="preserve"> PAGEREF _Toc242182647 \h </w:instrText>
+          <w:instrText xml:space="preserve"> PAGEREF _Toc242182893 \h </w:instrText>
         </w:r>
         <w:r>
           <w:rPr>
@@ -2222,7 +2222,7 @@
           <w14:ligatures w14:val="standardContextual"/>
         </w:rPr>
       </w:pPr>
-      <w:hyperlink w:anchor="_Toc242182648" w:history="1">
+      <w:hyperlink w:anchor="_Toc242182894" w:history="1">
         <w:r>
           <w:rPr>
             <w:rStyle w:val="Hyperlink"/>
@@ -2249,7 +2249,7 @@
             <w:noProof/>
             <w:webHidden/>
           </w:rPr>
-          <w:instrText xml:space="preserve"> PAGEREF _Toc242182648 \h </w:instrText>
+          <w:instrText xml:space="preserve"> PAGEREF _Toc242182894 \h </w:instrText>
         </w:r>
         <w:r>
           <w:rPr>
@@ -2294,7 +2294,7 @@
           <w14:ligatures w14:val="standardContextual"/>
         </w:rPr>
       </w:pPr>
-      <w:hyperlink w:anchor="_Toc242182649" w:history="1">
+      <w:hyperlink w:anchor="_Toc242182895" w:history="1">
         <w:r>
           <w:rPr>
             <w:rStyle w:val="Hyperlink"/>
@@ -2321,7 +2321,7 @@
             <w:noProof/>
             <w:webHidden/>
           </w:rPr>
-          <w:instrText xml:space="preserve"> PAGEREF _Toc242182649 \h </w:instrText>
+          <w:instrText xml:space="preserve"> PAGEREF _Toc242182895 \h </w:instrText>
         </w:r>
         <w:r>
           <w:rPr>
@@ -2366,7 +2366,7 @@
           <w14:ligatures w14:val="standardContextual"/>
         </w:rPr>
       </w:pPr>
-      <w:hyperlink w:anchor="_Toc242182650" w:history="1">
+      <w:hyperlink w:anchor="_Toc242182896" w:history="1">
         <w:r>
           <w:rPr>
             <w:rStyle w:val="Hyperlink"/>
@@ -2393,7 +2393,7 @@
             <w:noProof/>
             <w:webHidden/>
           </w:rPr>
-          <w:instrText xml:space="preserve"> PAGEREF _Toc242182650 \h </w:instrText>
+          <w:instrText xml:space="preserve"> PAGEREF _Toc242182896 \h </w:instrText>
         </w:r>
         <w:r>
           <w:rPr>
@@ -2438,7 +2438,7 @@
           <w14:ligatures w14:val="standardContextual"/>
         </w:rPr>
       </w:pPr>
-      <w:hyperlink w:anchor="_Toc242182651" w:history="1">
+      <w:hyperlink w:anchor="_Toc242182897" w:history="1">
         <w:r>
           <w:rPr>
             <w:rStyle w:val="Hyperlink"/>
@@ -2465,7 +2465,7 @@
             <w:noProof/>
             <w:webHidden/>
           </w:rPr>
-          <w:instrText xml:space="preserve"> PAGEREF _Toc242182651 \h </w:instrText>
+          <w:instrText xml:space="preserve"> PAGEREF _Toc242182897 \h </w:instrText>
         </w:r>
         <w:r>
           <w:rPr>
@@ -2510,7 +2510,7 @@
           <w14:ligatures w14:val="standardContextual"/>
         </w:rPr>
       </w:pPr>
-      <w:hyperlink w:anchor="_Toc242182652" w:history="1">
+      <w:hyperlink w:anchor="_Toc242182898" w:history="1">
         <w:r>
           <w:rPr>
             <w:rStyle w:val="Hyperlink"/>
@@ -2537,7 +2537,7 @@
             <w:noProof/>
             <w:webHidden/>
           </w:rPr>
-          <w:instrText xml:space="preserve"> PAGEREF _Toc242182652 \h </w:instrText>
+          <w:instrText xml:space="preserve"> PAGEREF _Toc242182898 \h </w:instrText>
         </w:r>
         <w:r>
           <w:rPr>
@@ -2582,7 +2582,7 @@
           <w14:ligatures w14:val="standardContextual"/>
         </w:rPr>
       </w:pPr>
-      <w:hyperlink w:anchor="_Toc242182653" w:history="1">
+      <w:hyperlink w:anchor="_Toc242182899" w:history="1">
         <w:r>
           <w:rPr>
             <w:rStyle w:val="Hyperlink"/>
@@ -2609,7 +2609,7 @@
             <w:noProof/>
             <w:webHidden/>
           </w:rPr>
-          <w:instrText xml:space="preserve"> PAGEREF _Toc242182653 \h </w:instrText>
+          <w:instrText xml:space="preserve"> PAGEREF _Toc242182899 \h </w:instrText>
         </w:r>
         <w:r>
           <w:rPr>
@@ -2654,7 +2654,7 @@
           <w14:ligatures w14:val="standardContextual"/>
         </w:rPr>
       </w:pPr>
-      <w:hyperlink w:anchor="_Toc242182654" w:history="1">
+      <w:hyperlink w:anchor="_Toc242182900" w:history="1">
         <w:r>
           <w:rPr>
             <w:rStyle w:val="Hyperlink"/>
@@ -2681,7 +2681,7 @@
             <w:noProof/>
             <w:webHidden/>
           </w:rPr>
-          <w:instrText xml:space="preserve"> PAGEREF _Toc242182654 \h </w:instrText>
+          <w:instrText xml:space="preserve"> PAGEREF _Toc242182900 \h </w:instrText>
         </w:r>
         <w:r>
           <w:rPr>
@@ -2726,7 +2726,7 @@
           <w14:ligatures w14:val="standardContextual"/>
         </w:rPr>
       </w:pPr>
-      <w:hyperlink w:anchor="_Toc242182655" w:history="1">
+      <w:hyperlink w:anchor="_Toc242182901" w:history="1">
         <w:r>
           <w:rPr>
             <w:rStyle w:val="Hyperlink"/>
@@ -2753,7 +2753,7 @@
             <w:noProof/>
             <w:webHidden/>
           </w:rPr>
-          <w:instrText xml:space="preserve"> PAGEREF _Toc242182655 \h </w:instrText>
+          <w:instrText xml:space="preserve"> PAGEREF _Toc242182901 \h </w:instrText>
         </w:r>
         <w:r>
           <w:rPr>
@@ -2798,7 +2798,7 @@
           <w14:ligatures w14:val="standardContextual"/>
         </w:rPr>
       </w:pPr>
-      <w:hyperlink w:anchor="_Toc242182656" w:history="1">
+      <w:hyperlink w:anchor="_Toc242182902" w:history="1">
         <w:r>
           <w:rPr>
             <w:rStyle w:val="Hyperlink"/>
@@ -2825,7 +2825,7 @@
             <w:noProof/>
             <w:webHidden/>
           </w:rPr>
-          <w:instrText xml:space="preserve"> PAGEREF _Toc242182656 \h </w:instrText>
+          <w:instrText xml:space="preserve"> PAGEREF _Toc242182902 \h </w:instrText>
         </w:r>
         <w:r>
           <w:rPr>
@@ -2870,7 +2870,7 @@
           <w14:ligatures w14:val="standardContextual"/>
         </w:rPr>
       </w:pPr>
-      <w:hyperlink w:anchor="_Toc242182657" w:history="1">
+      <w:hyperlink w:anchor="_Toc242182903" w:history="1">
         <w:r>
           <w:rPr>
             <w:rStyle w:val="Hyperlink"/>
@@ -2897,7 +2897,7 @@
             <w:noProof/>
             <w:webHidden/>
           </w:rPr>
-          <w:instrText xml:space="preserve"> PAGEREF _Toc242182657 \h </w:instrText>
+          <w:instrText xml:space="preserve"> PAGEREF _Toc242182903 \h </w:instrText>
         </w:r>
         <w:r>
           <w:rPr>
@@ -2942,7 +2942,7 @@
           <w14:ligatures w14:val="standardContextual"/>
         </w:rPr>
       </w:pPr>
-      <w:hyperlink w:anchor="_Toc242182658" w:history="1">
+      <w:hyperlink w:anchor="_Toc242182904" w:history="1">
         <w:r>
           <w:rPr>
             <w:rStyle w:val="Hyperlink"/>
@@ -2969,7 +2969,7 @@
             <w:noProof/>
             <w:webHidden/>
           </w:rPr>
-          <w:instrText xml:space="preserve"> PAGEREF _Toc242182658 \h </w:instrText>
+          <w:instrText xml:space="preserve"> PAGEREF _Toc242182904 \h </w:instrText>
         </w:r>
         <w:r>
           <w:rPr>
@@ -3014,7 +3014,7 @@
           <w14:ligatures w14:val="standardContextual"/>
         </w:rPr>
       </w:pPr>
-      <w:hyperlink w:anchor="_Toc242182659" w:history="1">
+      <w:hyperlink w:anchor="_Toc242182905" w:history="1">
         <w:r>
           <w:rPr>
             <w:rStyle w:val="Hyperlink"/>
@@ -3041,7 +3041,7 @@
             <w:noProof/>
             <w:webHidden/>
           </w:rPr>
-          <w:instrText xml:space="preserve"> PAGEREF _Toc242182659 \h </w:instrText>
+          <w:instrText xml:space="preserve"> PAGEREF _Toc242182905 \h </w:instrText>
         </w:r>
         <w:r>
           <w:rPr>
@@ -3086,7 +3086,7 @@
           <w14:ligatures w14:val="standardContextual"/>
         </w:rPr>
       </w:pPr>
-      <w:hyperlink w:anchor="_Toc242182660" w:history="1">
+      <w:hyperlink w:anchor="_Toc242182906" w:history="1">
         <w:r>
           <w:rPr>
             <w:rStyle w:val="Hyperlink"/>
@@ -3113,7 +3113,7 @@
             <w:noProof/>
             <w:webHidden/>
           </w:rPr>
-          <w:instrText xml:space="preserve"> PAGEREF _Toc242182660 \h </w:instrText>
+          <w:instrText xml:space="preserve"> PAGEREF _Toc242182906 \h </w:instrText>
         </w:r>
         <w:r>
           <w:rPr>
@@ -3158,7 +3158,7 @@
           <w14:ligatures w14:val="standardContextual"/>
         </w:rPr>
       </w:pPr>
-      <w:hyperlink w:anchor="_Toc242182661" w:history="1">
+      <w:hyperlink w:anchor="_Toc242182907" w:history="1">
         <w:r>
           <w:rPr>
             <w:rStyle w:val="Hyperlink"/>
@@ -3185,7 +3185,7 @@
             <w:noProof/>
             <w:webHidden/>
           </w:rPr>
-          <w:instrText xml:space="preserve"> PAGEREF _Toc242182661 \h </w:instrText>
+          <w:instrText xml:space="preserve"> PAGEREF _Toc242182907 \h </w:instrText>
         </w:r>
         <w:r>
           <w:rPr>
@@ -3230,7 +3230,7 @@
           <w14:ligatures w14:val="standardContextual"/>
         </w:rPr>
       </w:pPr>
-      <w:hyperlink w:anchor="_Toc242182662" w:history="1">
+      <w:hyperlink w:anchor="_Toc242182908" w:history="1">
         <w:r>
           <w:rPr>
             <w:rStyle w:val="Hyperlink"/>
@@ -3257,7 +3257,7 @@
             <w:noProof/>
             <w:webHidden/>
           </w:rPr>
-          <w:instrText xml:space="preserve"> PAGEREF _Toc242182662 \h </w:instrText>
+          <w:instrText xml:space="preserve"> PAGEREF _Toc242182908 \h </w:instrText>
         </w:r>
         <w:r>
           <w:rPr>
@@ -3302,7 +3302,7 @@
           <w14:ligatures w14:val="standardContextual"/>
         </w:rPr>
       </w:pPr>
-      <w:hyperlink w:anchor="_Toc242182663" w:history="1">
+      <w:hyperlink w:anchor="_Toc242182909" w:history="1">
         <w:r>
           <w:rPr>
             <w:rStyle w:val="Hyperlink"/>
@@ -3329,7 +3329,7 @@
             <w:noProof/>
             <w:webHidden/>
           </w:rPr>
-          <w:instrText xml:space="preserve"> PAGEREF _Toc242182663 \h </w:instrText>
+          <w:instrText xml:space="preserve"> PAGEREF _Toc242182909 \h </w:instrText>
         </w:r>
         <w:r>
           <w:rPr>
@@ -3374,7 +3374,7 @@
           <w14:ligatures w14:val="standardContextual"/>
         </w:rPr>
       </w:pPr>
-      <w:hyperlink w:anchor="_Toc242182664" w:history="1">
+      <w:hyperlink w:anchor="_Toc242182910" w:history="1">
         <w:r>
           <w:rPr>
             <w:rStyle w:val="Hyperlink"/>
@@ -3401,7 +3401,7 @@
             <w:noProof/>
             <w:webHidden/>
           </w:rPr>
-          <w:instrText xml:space="preserve"> PAGEREF _Toc242182664 \h </w:instrText>
+          <w:instrText xml:space="preserve"> PAGEREF _Toc242182910 \h </w:instrText>
         </w:r>
         <w:r>
           <w:rPr>
@@ -3446,7 +3446,7 @@
           <w14:ligatures w14:val="standardContextual"/>
         </w:rPr>
       </w:pPr>
-      <w:hyperlink w:anchor="_Toc242182665" w:history="1">
+      <w:hyperlink w:anchor="_Toc242182911" w:history="1">
         <w:r>
           <w:rPr>
             <w:rStyle w:val="Hyperlink"/>
@@ -3489,7 +3489,7 @@
             <w:noProof/>
             <w:webHidden/>
           </w:rPr>
-          <w:instrText xml:space="preserve"> PAGEREF _Toc242182665 \h </w:instrText>
+          <w:instrText xml:space="preserve"> PAGEREF _Toc242182911 \h </w:instrText>
         </w:r>
         <w:r>
           <w:rPr>
@@ -3534,7 +3534,7 @@
           <w14:ligatures w14:val="standardContextual"/>
         </w:rPr>
       </w:pPr>
-      <w:hyperlink w:anchor="_Toc242182666" w:history="1">
+      <w:hyperlink w:anchor="_Toc242182912" w:history="1">
         <w:r>
           <w:rPr>
             <w:rStyle w:val="Hyperlink"/>
@@ -3561,7 +3561,7 @@
             <w:noProof/>
             <w:webHidden/>
           </w:rPr>
-          <w:instrText xml:space="preserve"> PAGEREF _Toc242182666 \h </w:instrText>
+          <w:instrText xml:space="preserve"> PAGEREF _Toc242182912 \h </w:instrText>
         </w:r>
         <w:r>
           <w:rPr>
@@ -3606,7 +3606,7 @@
           <w14:ligatures w14:val="standardContextual"/>
         </w:rPr>
       </w:pPr>
-      <w:hyperlink w:anchor="_Toc242182667" w:history="1">
+      <w:hyperlink w:anchor="_Toc242182913" w:history="1">
         <w:r>
           <w:rPr>
             <w:rStyle w:val="Hyperlink"/>
@@ -3633,7 +3633,7 @@
             <w:noProof/>
             <w:webHidden/>
           </w:rPr>
-          <w:instrText xml:space="preserve"> PAGEREF _Toc242182667 \h </w:instrText>
+          <w:instrText xml:space="preserve"> PAGEREF _Toc242182913 \h </w:instrText>
         </w:r>
         <w:r>
           <w:rPr>
@@ -3678,7 +3678,7 @@
           <w14:ligatures w14:val="standardContextual"/>
         </w:rPr>
       </w:pPr>
-      <w:hyperlink w:anchor="_Toc242182668" w:history="1">
+      <w:hyperlink w:anchor="_Toc242182914" w:history="1">
         <w:r>
           <w:rPr>
             <w:rStyle w:val="Hyperlink"/>
@@ -3705,7 +3705,7 @@
             <w:noProof/>
             <w:webHidden/>
           </w:rPr>
-          <w:instrText xml:space="preserve"> PAGEREF _Toc242182668 \h </w:instrText>
+          <w:instrText xml:space="preserve"> PAGEREF _Toc242182914 \h </w:instrText>
         </w:r>
         <w:r>
           <w:rPr>
@@ -3748,7 +3748,7 @@
           <w14:ligatures w14:val="standardContextual"/>
         </w:rPr>
       </w:pPr>
-      <w:hyperlink w:anchor="_Toc242182669" w:history="1">
+      <w:hyperlink w:anchor="_Toc242182915" w:history="1">
         <w:r>
           <w:rPr>
             <w:rStyle w:val="Hyperlink"/>
@@ -3771,7 +3771,7 @@
           <w:rPr>
             <w:webHidden/>
           </w:rPr>
-          <w:instrText xml:space="preserve"> PAGEREF _Toc242182669 \h </w:instrText>
+          <w:instrText xml:space="preserve"> PAGEREF _Toc242182915 \h </w:instrText>
         </w:r>
         <w:r>
           <w:rPr>
@@ -3812,7 +3812,7 @@
           <w14:ligatures w14:val="standardContextual"/>
         </w:rPr>
       </w:pPr>
-      <w:hyperlink w:anchor="_Toc242182670" w:history="1">
+      <w:hyperlink w:anchor="_Toc242182916" w:history="1">
         <w:r>
           <w:rPr>
             <w:rStyle w:val="Hyperlink"/>
@@ -3839,7 +3839,7 @@
             <w:noProof/>
             <w:webHidden/>
           </w:rPr>
-          <w:instrText xml:space="preserve"> PAGEREF _Toc242182670 \h </w:instrText>
+          <w:instrText xml:space="preserve"> PAGEREF _Toc242182916 \h </w:instrText>
         </w:r>
         <w:r>
           <w:rPr>
@@ -3884,7 +3884,7 @@
           <w14:ligatures w14:val="standardContextual"/>
         </w:rPr>
       </w:pPr>
-      <w:hyperlink w:anchor="_Toc242182671" w:history="1">
+      <w:hyperlink w:anchor="_Toc242182917" w:history="1">
         <w:r>
           <w:rPr>
             <w:rStyle w:val="Hyperlink"/>
@@ -3911,7 +3911,7 @@
             <w:noProof/>
             <w:webHidden/>
           </w:rPr>
-          <w:instrText xml:space="preserve"> PAGEREF _Toc242182671 \h </w:instrText>
+          <w:instrText xml:space="preserve"> PAGEREF _Toc242182917 \h </w:instrText>
         </w:r>
         <w:r>
           <w:rPr>
@@ -3956,7 +3956,7 @@
           <w14:ligatures w14:val="standardContextual"/>
         </w:rPr>
       </w:pPr>
-      <w:hyperlink w:anchor="_Toc242182672" w:history="1">
+      <w:hyperlink w:anchor="_Toc242182918" w:history="1">
         <w:r>
           <w:rPr>
             <w:rStyle w:val="Hyperlink"/>
@@ -3983,7 +3983,7 @@
             <w:noProof/>
             <w:webHidden/>
           </w:rPr>
-          <w:instrText xml:space="preserve"> PAGEREF _Toc242182672 \h </w:instrText>
+          <w:instrText xml:space="preserve"> PAGEREF _Toc242182918 \h </w:instrText>
         </w:r>
         <w:r>
           <w:rPr>
@@ -4028,7 +4028,7 @@
           <w14:ligatures w14:val="standardContextual"/>
         </w:rPr>
       </w:pPr>
-      <w:hyperlink w:anchor="_Toc242182673" w:history="1">
+      <w:hyperlink w:anchor="_Toc242182919" w:history="1">
         <w:r>
           <w:rPr>
             <w:rStyle w:val="Hyperlink"/>
@@ -4055,7 +4055,7 @@
             <w:noProof/>
             <w:webHidden/>
           </w:rPr>
-          <w:instrText xml:space="preserve"> PAGEREF _Toc242182673 \h </w:instrText>
+          <w:instrText xml:space="preserve"> PAGEREF _Toc242182919 \h </w:instrText>
         </w:r>
         <w:r>
           <w:rPr>
@@ -4100,7 +4100,7 @@
           <w14:ligatures w14:val="standardContextual"/>
         </w:rPr>
       </w:pPr>
-      <w:hyperlink w:anchor="_Toc242182674" w:history="1">
+      <w:hyperlink w:anchor="_Toc242182920" w:history="1">
         <w:r>
           <w:rPr>
             <w:rStyle w:val="Hyperlink"/>
@@ -4127,7 +4127,7 @@
             <w:noProof/>
             <w:webHidden/>
           </w:rPr>
-          <w:instrText xml:space="preserve"> PAGEREF _Toc242182674 \h </w:instrText>
+          <w:instrText xml:space="preserve"> PAGEREF _Toc242182920 \h </w:instrText>
         </w:r>
         <w:r>
           <w:rPr>
@@ -4172,7 +4172,7 @@
           <w14:ligatures w14:val="standardContextual"/>
         </w:rPr>
       </w:pPr>
-      <w:hyperlink w:anchor="_Toc242182675" w:history="1">
+      <w:hyperlink w:anchor="_Toc242182921" w:history="1">
         <w:r>
           <w:rPr>
             <w:rStyle w:val="Hyperlink"/>
@@ -4199,7 +4199,7 @@
             <w:noProof/>
             <w:webHidden/>
           </w:rPr>
-          <w:instrText xml:space="preserve"> PAGEREF _Toc242182675 \h </w:instrText>
+          <w:instrText xml:space="preserve"> PAGEREF _Toc242182921 \h </w:instrText>
         </w:r>
         <w:r>
           <w:rPr>
@@ -4244,7 +4244,7 @@
           <w14:ligatures w14:val="standardContextual"/>
         </w:rPr>
       </w:pPr>
-      <w:hyperlink w:anchor="_Toc242182676" w:history="1">
+      <w:hyperlink w:anchor="_Toc242182922" w:history="1">
         <w:r>
           <w:rPr>
             <w:rStyle w:val="Hyperlink"/>
@@ -4271,7 +4271,7 @@
             <w:noProof/>
             <w:webHidden/>
           </w:rPr>
-          <w:instrText xml:space="preserve"> PAGEREF _Toc242182676 \h </w:instrText>
+          <w:instrText xml:space="preserve"> PAGEREF _Toc242182922 \h </w:instrText>
         </w:r>
         <w:r>
           <w:rPr>
@@ -4316,7 +4316,7 @@
           <w14:ligatures w14:val="standardContextual"/>
         </w:rPr>
       </w:pPr>
-      <w:hyperlink w:anchor="_Toc242182677" w:history="1">
+      <w:hyperlink w:anchor="_Toc242182923" w:history="1">
         <w:r>
           <w:rPr>
             <w:rStyle w:val="Hyperlink"/>
@@ -4343,7 +4343,7 @@
             <w:noProof/>
             <w:webHidden/>
           </w:rPr>
-          <w:instrText xml:space="preserve"> PAGEREF _Toc242182677 \h </w:instrText>
+          <w:instrText xml:space="preserve"> PAGEREF _Toc242182923 \h </w:instrText>
         </w:r>
         <w:r>
           <w:rPr>
@@ -4388,7 +4388,7 @@
           <w14:ligatures w14:val="standardContextual"/>
         </w:rPr>
       </w:pPr>
-      <w:hyperlink w:anchor="_Toc242182678" w:history="1">
+      <w:hyperlink w:anchor="_Toc242182924" w:history="1">
         <w:r>
           <w:rPr>
             <w:rStyle w:val="Hyperlink"/>
@@ -4415,7 +4415,7 @@
             <w:noProof/>
             <w:webHidden/>
           </w:rPr>
-          <w:instrText xml:space="preserve"> PAGEREF _Toc242182678 \h </w:instrText>
+          <w:instrText xml:space="preserve"> PAGEREF _Toc242182924 \h </w:instrText>
         </w:r>
         <w:r>
           <w:rPr>
@@ -4460,7 +4460,7 @@
           <w14:ligatures w14:val="standardContextual"/>
         </w:rPr>
       </w:pPr>
-      <w:hyperlink w:anchor="_Toc242182679" w:history="1">
+      <w:hyperlink w:anchor="_Toc242182925" w:history="1">
         <w:r>
           <w:rPr>
             <w:rStyle w:val="Hyperlink"/>
@@ -4487,7 +4487,7 @@
             <w:noProof/>
             <w:webHidden/>
           </w:rPr>
-          <w:instrText xml:space="preserve"> PAGEREF _Toc242182679 \h </w:instrText>
+          <w:instrText xml:space="preserve"> PAGEREF _Toc242182925 \h </w:instrText>
         </w:r>
         <w:r>
           <w:rPr>
@@ -4532,7 +4532,7 @@
           <w14:ligatures w14:val="standardContextual"/>
         </w:rPr>
       </w:pPr>
-      <w:hyperlink w:anchor="_Toc242182680" w:history="1">
+      <w:hyperlink w:anchor="_Toc242182926" w:history="1">
         <w:r>
           <w:rPr>
             <w:rStyle w:val="Hyperlink"/>
@@ -4559,7 +4559,7 @@
             <w:noProof/>
             <w:webHidden/>
           </w:rPr>
-          <w:instrText xml:space="preserve"> PAGEREF _Toc242182680 \h </w:instrText>
+          <w:instrText xml:space="preserve"> PAGEREF _Toc242182926 \h </w:instrText>
         </w:r>
         <w:r>
           <w:rPr>
@@ -4604,7 +4604,7 @@
           <w14:ligatures w14:val="standardContextual"/>
         </w:rPr>
       </w:pPr>
-      <w:hyperlink w:anchor="_Toc242182681" w:history="1">
+      <w:hyperlink w:anchor="_Toc242182927" w:history="1">
         <w:r>
           <w:rPr>
             <w:rStyle w:val="Hyperlink"/>
@@ -4631,7 +4631,7 @@
             <w:noProof/>
             <w:webHidden/>
           </w:rPr>
-          <w:instrText xml:space="preserve"> PAGEREF _Toc242182681 \h </w:instrText>
+          <w:instrText xml:space="preserve"> PAGEREF _Toc242182927 \h </w:instrText>
         </w:r>
         <w:r>
           <w:rPr>
@@ -4676,7 +4676,7 @@
           <w14:ligatures w14:val="standardContextual"/>
         </w:rPr>
       </w:pPr>
-      <w:hyperlink w:anchor="_Toc242182682" w:history="1">
+      <w:hyperlink w:anchor="_Toc242182928" w:history="1">
         <w:r>
           <w:rPr>
             <w:rStyle w:val="Hyperlink"/>
@@ -4703,7 +4703,7 @@
             <w:noProof/>
             <w:webHidden/>
           </w:rPr>
-          <w:instrText xml:space="preserve"> PAGEREF _Toc242182682 \h </w:instrText>
+          <w:instrText xml:space="preserve"> PAGEREF _Toc242182928 \h </w:instrText>
         </w:r>
         <w:r>
           <w:rPr>
@@ -4748,7 +4748,7 @@
           <w14:ligatures w14:val="standardContextual"/>
         </w:rPr>
       </w:pPr>
-      <w:hyperlink w:anchor="_Toc242182683" w:history="1">
+      <w:hyperlink w:anchor="_Toc242182929" w:history="1">
         <w:r>
           <w:rPr>
             <w:rStyle w:val="Hyperlink"/>
@@ -4775,7 +4775,7 @@
             <w:noProof/>
             <w:webHidden/>
           </w:rPr>
-          <w:instrText xml:space="preserve"> PAGEREF _Toc242182683 \h </w:instrText>
+          <w:instrText xml:space="preserve"> PAGEREF _Toc242182929 \h </w:instrText>
         </w:r>
         <w:r>
           <w:rPr>
@@ -4818,7 +4818,7 @@
           <w14:ligatures w14:val="standardContextual"/>
         </w:rPr>
       </w:pPr>
-      <w:hyperlink w:anchor="_Toc242182684" w:history="1">
+      <w:hyperlink w:anchor="_Toc242182930" w:history="1">
         <w:r>
           <w:rPr>
             <w:rStyle w:val="Hyperlink"/>
@@ -4841,7 +4841,7 @@
           <w:rPr>
             <w:webHidden/>
           </w:rPr>
-          <w:instrText xml:space="preserve"> PAGEREF _Toc242182684 \h </w:instrText>
+          <w:instrText xml:space="preserve"> PAGEREF _Toc242182930 \h </w:instrText>
         </w:r>
         <w:r>
           <w:rPr>
@@ -4882,7 +4882,7 @@
           <w14:ligatures w14:val="standardContextual"/>
         </w:rPr>
       </w:pPr>
-      <w:hyperlink w:anchor="_Toc242182685" w:history="1">
+      <w:hyperlink w:anchor="_Toc242182931" w:history="1">
         <w:r>
           <w:rPr>
             <w:rStyle w:val="Hyperlink"/>
@@ -4909,7 +4909,7 @@
             <w:noProof/>
             <w:webHidden/>
           </w:rPr>
-          <w:instrText xml:space="preserve"> PAGEREF _Toc242182685 \h </w:instrText>
+          <w:instrText xml:space="preserve"> PAGEREF _Toc242182931 \h </w:instrText>
         </w:r>
         <w:r>
           <w:rPr>
@@ -4954,7 +4954,7 @@
           <w14:ligatures w14:val="standardContextual"/>
         </w:rPr>
       </w:pPr>
-      <w:hyperlink w:anchor="_Toc242182686" w:history="1">
+      <w:hyperlink w:anchor="_Toc242182932" w:history="1">
         <w:r>
           <w:rPr>
             <w:rStyle w:val="Hyperlink"/>
@@ -4981,7 +4981,7 @@
             <w:noProof/>
             <w:webHidden/>
           </w:rPr>
-          <w:instrText xml:space="preserve"> PAGEREF _Toc242182686 \h </w:instrText>
+          <w:instrText xml:space="preserve"> PAGEREF _Toc242182932 \h </w:instrText>
         </w:r>
         <w:r>
           <w:rPr>
@@ -5026,7 +5026,7 @@
           <w14:ligatures w14:val="standardContextual"/>
         </w:rPr>
       </w:pPr>
-      <w:hyperlink w:anchor="_Toc242182687" w:history="1">
+      <w:hyperlink w:anchor="_Toc242182933" w:history="1">
         <w:r>
           <w:rPr>
             <w:rStyle w:val="Hyperlink"/>
@@ -5053,7 +5053,7 @@
             <w:noProof/>
             <w:webHidden/>
           </w:rPr>
-          <w:instrText xml:space="preserve"> PAGEREF _Toc242182687 \h </w:instrText>
+          <w:instrText xml:space="preserve"> PAGEREF _Toc242182933 \h </w:instrText>
         </w:r>
         <w:r>
           <w:rPr>
@@ -5098,7 +5098,7 @@
           <w14:ligatures w14:val="standardContextual"/>
         </w:rPr>
       </w:pPr>
-      <w:hyperlink w:anchor="_Toc242182688" w:history="1">
+      <w:hyperlink w:anchor="_Toc242182934" w:history="1">
         <w:r>
           <w:rPr>
             <w:rStyle w:val="Hyperlink"/>
@@ -5125,7 +5125,7 @@
             <w:noProof/>
             <w:webHidden/>
           </w:rPr>
-          <w:instrText xml:space="preserve"> PAGEREF _Toc242182688 \h </w:instrText>
+          <w:instrText xml:space="preserve"> PAGEREF _Toc242182934 \h </w:instrText>
         </w:r>
         <w:r>
           <w:rPr>
@@ -5170,7 +5170,7 @@
           <w14:ligatures w14:val="standardContextual"/>
         </w:rPr>
       </w:pPr>
-      <w:hyperlink w:anchor="_Toc242182689" w:history="1">
+      <w:hyperlink w:anchor="_Toc242182935" w:history="1">
         <w:r>
           <w:rPr>
             <w:rStyle w:val="Hyperlink"/>
@@ -5197,7 +5197,7 @@
             <w:noProof/>
             <w:webHidden/>
           </w:rPr>
-          <w:instrText xml:space="preserve"> PAGEREF _Toc242182689 \h </w:instrText>
+          <w:instrText xml:space="preserve"> PAGEREF _Toc242182935 \h </w:instrText>
         </w:r>
         <w:r>
           <w:rPr>
@@ -5242,7 +5242,7 @@
           <w14:ligatures w14:val="standardContextual"/>
         </w:rPr>
       </w:pPr>
-      <w:hyperlink w:anchor="_Toc242182690" w:history="1">
+      <w:hyperlink w:anchor="_Toc242182936" w:history="1">
         <w:r>
           <w:rPr>
             <w:rStyle w:val="Hyperlink"/>
@@ -5269,7 +5269,7 @@
             <w:noProof/>
             <w:webHidden/>
           </w:rPr>
-          <w:instrText xml:space="preserve"> PAGEREF _Toc242182690 \h </w:instrText>
+          <w:instrText xml:space="preserve"> PAGEREF _Toc242182936 \h </w:instrText>
         </w:r>
         <w:r>
           <w:rPr>
@@ -5314,7 +5314,7 @@
           <w14:ligatures w14:val="standardContextual"/>
         </w:rPr>
       </w:pPr>
-      <w:hyperlink w:anchor="_Toc242182691" w:history="1">
+      <w:hyperlink w:anchor="_Toc242182937" w:history="1">
         <w:r>
           <w:rPr>
             <w:rStyle w:val="Hyperlink"/>
@@ -5341,7 +5341,7 @@
             <w:noProof/>
             <w:webHidden/>
           </w:rPr>
-          <w:instrText xml:space="preserve"> PAGEREF _Toc242182691 \h </w:instrText>
+          <w:instrText xml:space="preserve"> PAGEREF _Toc242182937 \h </w:instrText>
         </w:r>
         <w:r>
           <w:rPr>
@@ -5386,7 +5386,7 @@
           <w14:ligatures w14:val="standardContextual"/>
         </w:rPr>
       </w:pPr>
-      <w:hyperlink w:anchor="_Toc242182692" w:history="1">
+      <w:hyperlink w:anchor="_Toc242182938" w:history="1">
         <w:r>
           <w:rPr>
             <w:rStyle w:val="Hyperlink"/>
@@ -5413,7 +5413,7 @@
             <w:noProof/>
             <w:webHidden/>
           </w:rPr>
-          <w:instrText xml:space="preserve"> PAGEREF _Toc242182692 \h </w:instrText>
+          <w:instrText xml:space="preserve"> PAGEREF _Toc242182938 \h </w:instrText>
         </w:r>
         <w:r>
           <w:rPr>
@@ -5458,7 +5458,7 @@
           <w14:ligatures w14:val="standardContextual"/>
         </w:rPr>
       </w:pPr>
-      <w:hyperlink w:anchor="_Toc242182693" w:history="1">
+      <w:hyperlink w:anchor="_Toc242182939" w:history="1">
         <w:r>
           <w:rPr>
             <w:rStyle w:val="Hyperlink"/>
@@ -5485,7 +5485,7 @@
             <w:noProof/>
             <w:webHidden/>
           </w:rPr>
-          <w:instrText xml:space="preserve"> PAGEREF _Toc242182693 \h </w:instrText>
+          <w:instrText xml:space="preserve"> PAGEREF _Toc242182939 \h </w:instrText>
         </w:r>
         <w:r>
           <w:rPr>
@@ -5530,7 +5530,7 @@
           <w14:ligatures w14:val="standardContextual"/>
         </w:rPr>
       </w:pPr>
-      <w:hyperlink w:anchor="_Toc242182694" w:history="1">
+      <w:hyperlink w:anchor="_Toc242182940" w:history="1">
         <w:r>
           <w:rPr>
             <w:rStyle w:val="Hyperlink"/>
@@ -5557,7 +5557,7 @@
             <w:noProof/>
             <w:webHidden/>
           </w:rPr>
-          <w:instrText xml:space="preserve"> PAGEREF _Toc242182694 \h </w:instrText>
+          <w:instrText xml:space="preserve"> PAGEREF _Toc242182940 \h </w:instrText>
         </w:r>
         <w:r>
           <w:rPr>
@@ -5600,7 +5600,7 @@
           <w14:ligatures w14:val="standardContextual"/>
         </w:rPr>
       </w:pPr>
-      <w:hyperlink w:anchor="_Toc242182695" w:history="1">
+      <w:hyperlink w:anchor="_Toc242182941" w:history="1">
         <w:r>
           <w:rPr>
             <w:rStyle w:val="Hyperlink"/>
@@ -5623,7 +5623,7 @@
           <w:rPr>
             <w:webHidden/>
           </w:rPr>
-          <w:instrText xml:space="preserve"> PAGEREF _Toc242182695 \h </w:instrText>
+          <w:instrText xml:space="preserve"> PAGEREF _Toc242182941 \h </w:instrText>
         </w:r>
         <w:r>
           <w:rPr>
@@ -5664,7 +5664,7 @@
           <w14:ligatures w14:val="standardContextual"/>
         </w:rPr>
       </w:pPr>
-      <w:hyperlink w:anchor="_Toc242182696" w:history="1">
+      <w:hyperlink w:anchor="_Toc242182942" w:history="1">
         <w:r>
           <w:rPr>
             <w:rStyle w:val="Hyperlink"/>
@@ -5691,7 +5691,7 @@
             <w:noProof/>
             <w:webHidden/>
           </w:rPr>
-          <w:instrText xml:space="preserve"> PAGEREF _Toc242182696 \h </w:instrText>
+          <w:instrText xml:space="preserve"> PAGEREF _Toc242182942 \h </w:instrText>
         </w:r>
         <w:r>
           <w:rPr>
@@ -5736,7 +5736,7 @@
           <w14:ligatures w14:val="standardContextual"/>
         </w:rPr>
       </w:pPr>
-      <w:hyperlink w:anchor="_Toc242182697" w:history="1">
+      <w:hyperlink w:anchor="_Toc242182943" w:history="1">
         <w:r>
           <w:rPr>
             <w:rStyle w:val="Hyperlink"/>
@@ -5763,7 +5763,7 @@
             <w:noProof/>
             <w:webHidden/>
           </w:rPr>
-          <w:instrText xml:space="preserve"> PAGEREF _Toc242182697 \h </w:instrText>
+          <w:instrText xml:space="preserve"> PAGEREF _Toc242182943 \h </w:instrText>
         </w:r>
         <w:r>
           <w:rPr>
@@ -5808,7 +5808,7 @@
           <w14:ligatures w14:val="standardContextual"/>
         </w:rPr>
       </w:pPr>
-      <w:hyperlink w:anchor="_Toc242182698" w:history="1">
+      <w:hyperlink w:anchor="_Toc242182944" w:history="1">
         <w:r>
           <w:rPr>
             <w:rStyle w:val="Hyperlink"/>
@@ -5835,7 +5835,7 @@
             <w:noProof/>
             <w:webHidden/>
           </w:rPr>
-          <w:instrText xml:space="preserve"> PAGEREF _Toc242182698 \h </w:instrText>
+          <w:instrText xml:space="preserve"> PAGEREF _Toc242182944 \h </w:instrText>
         </w:r>
         <w:r>
           <w:rPr>
@@ -5880,7 +5880,7 @@
           <w14:ligatures w14:val="standardContextual"/>
         </w:rPr>
       </w:pPr>
-      <w:hyperlink w:anchor="_Toc242182699" w:history="1">
+      <w:hyperlink w:anchor="_Toc242182945" w:history="1">
         <w:r>
           <w:rPr>
             <w:rStyle w:val="Hyperlink"/>
@@ -5907,7 +5907,7 @@
             <w:noProof/>
             <w:webHidden/>
           </w:rPr>
-          <w:instrText xml:space="preserve"> PAGEREF _Toc242182699 \h </w:instrText>
+          <w:instrText xml:space="preserve"> PAGEREF _Toc242182945 \h </w:instrText>
         </w:r>
         <w:r>
           <w:rPr>
@@ -5952,7 +5952,7 @@
           <w14:ligatures w14:val="standardContextual"/>
         </w:rPr>
       </w:pPr>
-      <w:hyperlink w:anchor="_Toc242182700" w:history="1">
+      <w:hyperlink w:anchor="_Toc242182946" w:history="1">
         <w:r>
           <w:rPr>
             <w:rStyle w:val="Hyperlink"/>
@@ -5979,7 +5979,7 @@
             <w:noProof/>
             <w:webHidden/>
           </w:rPr>
-          <w:instrText xml:space="preserve"> PAGEREF _Toc242182700 \h </w:instrText>
+          <w:instrText xml:space="preserve"> PAGEREF _Toc242182946 \h </w:instrText>
         </w:r>
         <w:r>
           <w:rPr>
@@ -6024,7 +6024,7 @@
           <w14:ligatures w14:val="standardContextual"/>
         </w:rPr>
       </w:pPr>
-      <w:hyperlink w:anchor="_Toc242182701" w:history="1">
+      <w:hyperlink w:anchor="_Toc242182947" w:history="1">
         <w:r>
           <w:rPr>
             <w:rStyle w:val="Hyperlink"/>
@@ -6051,7 +6051,7 @@
             <w:noProof/>
             <w:webHidden/>
           </w:rPr>
-          <w:instrText xml:space="preserve"> PAGEREF _Toc242182701 \h </w:instrText>
+          <w:instrText xml:space="preserve"> PAGEREF _Toc242182947 \h </w:instrText>
         </w:r>
         <w:r>
           <w:rPr>
@@ -6096,7 +6096,7 @@
           <w14:ligatures w14:val="standardContextual"/>
         </w:rPr>
       </w:pPr>
-      <w:hyperlink w:anchor="_Toc242182702" w:history="1">
+      <w:hyperlink w:anchor="_Toc242182948" w:history="1">
         <w:r>
           <w:rPr>
             <w:rStyle w:val="Hyperlink"/>
@@ -6123,7 +6123,7 @@
             <w:noProof/>
             <w:webHidden/>
           </w:rPr>
-          <w:instrText xml:space="preserve"> PAGEREF _Toc242182702 \h </w:instrText>
+          <w:instrText xml:space="preserve"> PAGEREF _Toc242182948 \h </w:instrText>
         </w:r>
         <w:r>
           <w:rPr>
@@ -6168,7 +6168,7 @@
           <w14:ligatures w14:val="standardContextual"/>
         </w:rPr>
       </w:pPr>
-      <w:hyperlink w:anchor="_Toc242182703" w:history="1">
+      <w:hyperlink w:anchor="_Toc242182949" w:history="1">
         <w:r>
           <w:rPr>
             <w:rStyle w:val="Hyperlink"/>
@@ -6195,7 +6195,7 @@
             <w:noProof/>
             <w:webHidden/>
           </w:rPr>
-          <w:instrText xml:space="preserve"> PAGEREF _Toc242182703 \h </w:instrText>
+          <w:instrText xml:space="preserve"> PAGEREF _Toc242182949 \h </w:instrText>
         </w:r>
         <w:r>
           <w:rPr>
@@ -6240,7 +6240,7 @@
           <w14:ligatures w14:val="standardContextual"/>
         </w:rPr>
       </w:pPr>
-      <w:hyperlink w:anchor="_Toc242182704" w:history="1">
+      <w:hyperlink w:anchor="_Toc242182950" w:history="1">
         <w:r>
           <w:rPr>
             <w:rStyle w:val="Hyperlink"/>
@@ -6267,7 +6267,7 @@
             <w:noProof/>
             <w:webHidden/>
           </w:rPr>
-          <w:instrText xml:space="preserve"> PAGEREF _Toc242182704 \h </w:instrText>
+          <w:instrText xml:space="preserve"> PAGEREF _Toc242182950 \h </w:instrText>
         </w:r>
         <w:r>
           <w:rPr>
@@ -6312,7 +6312,7 @@
           <w14:ligatures w14:val="standardContextual"/>
         </w:rPr>
       </w:pPr>
-      <w:hyperlink w:anchor="_Toc242182705" w:history="1">
+      <w:hyperlink w:anchor="_Toc242182951" w:history="1">
         <w:r>
           <w:rPr>
             <w:rStyle w:val="Hyperlink"/>
@@ -6339,7 +6339,7 @@
             <w:noProof/>
             <w:webHidden/>
           </w:rPr>
-          <w:instrText xml:space="preserve"> PAGEREF _Toc242182705 \h </w:instrText>
+          <w:instrText xml:space="preserve"> PAGEREF _Toc242182951 \h </w:instrText>
         </w:r>
         <w:r>
           <w:rPr>
@@ -6382,7 +6382,7 @@
           <w14:ligatures w14:val="standardContextual"/>
         </w:rPr>
       </w:pPr>
-      <w:hyperlink w:anchor="_Toc242182706" w:history="1">
+      <w:hyperlink w:anchor="_Toc242182952" w:history="1">
         <w:r>
           <w:rPr>
             <w:rStyle w:val="Hyperlink"/>
@@ -6405,7 +6405,7 @@
           <w:rPr>
             <w:webHidden/>
           </w:rPr>
-          <w:instrText xml:space="preserve"> PAGEREF _Toc242182706 \h </w:instrText>
+          <w:instrText xml:space="preserve"> PAGEREF _Toc242182952 \h </w:instrText>
         </w:r>
         <w:r>
           <w:rPr>
@@ -6446,7 +6446,7 @@
           <w14:ligatures w14:val="standardContextual"/>
         </w:rPr>
       </w:pPr>
-      <w:hyperlink w:anchor="_Toc242182707" w:history="1">
+      <w:hyperlink w:anchor="_Toc242182953" w:history="1">
         <w:r>
           <w:rPr>
             <w:rStyle w:val="Hyperlink"/>
@@ -6473,7 +6473,7 @@
             <w:noProof/>
             <w:webHidden/>
           </w:rPr>
-          <w:instrText xml:space="preserve"> PAGEREF _Toc242182707 \h </w:instrText>
+          <w:instrText xml:space="preserve"> PAGEREF _Toc242182953 \h </w:instrText>
         </w:r>
         <w:r>
           <w:rPr>
@@ -6518,7 +6518,7 @@
           <w14:ligatures w14:val="standardContextual"/>
         </w:rPr>
       </w:pPr>
-      <w:hyperlink w:anchor="_Toc242182708" w:history="1">
+      <w:hyperlink w:anchor="_Toc242182954" w:history="1">
         <w:r>
           <w:rPr>
             <w:rStyle w:val="Hyperlink"/>
@@ -6545,7 +6545,7 @@
             <w:noProof/>
             <w:webHidden/>
           </w:rPr>
-          <w:instrText xml:space="preserve"> PAGEREF _Toc242182708 \h </w:instrText>
+          <w:instrText xml:space="preserve"> PAGEREF _Toc242182954 \h </w:instrText>
         </w:r>
         <w:r>
           <w:rPr>
@@ -6590,7 +6590,7 @@
           <w14:ligatures w14:val="standardContextual"/>
         </w:rPr>
       </w:pPr>
-      <w:hyperlink w:anchor="_Toc242182709" w:history="1">
+      <w:hyperlink w:anchor="_Toc242182955" w:history="1">
         <w:r>
           <w:rPr>
             <w:rStyle w:val="Hyperlink"/>
@@ -6617,7 +6617,7 @@
             <w:noProof/>
             <w:webHidden/>
           </w:rPr>
-          <w:instrText xml:space="preserve"> PAGEREF _Toc242182709 \h </w:instrText>
+          <w:instrText xml:space="preserve"> PAGEREF _Toc242182955 \h </w:instrText>
         </w:r>
         <w:r>
           <w:rPr>
@@ -6662,7 +6662,7 @@
           <w14:ligatures w14:val="standardContextual"/>
         </w:rPr>
       </w:pPr>
-      <w:hyperlink w:anchor="_Toc242182710" w:history="1">
+      <w:hyperlink w:anchor="_Toc242182956" w:history="1">
         <w:r>
           <w:rPr>
             <w:rStyle w:val="Hyperlink"/>
@@ -6689,7 +6689,7 @@
             <w:noProof/>
             <w:webHidden/>
           </w:rPr>
-          <w:instrText xml:space="preserve"> PAGEREF _Toc242182710 \h </w:instrText>
+          <w:instrText xml:space="preserve"> PAGEREF _Toc242182956 \h </w:instrText>
         </w:r>
         <w:r>
           <w:rPr>
@@ -6734,7 +6734,7 @@
           <w14:ligatures w14:val="standardContextual"/>
         </w:rPr>
       </w:pPr>
-      <w:hyperlink w:anchor="_Toc242182711" w:history="1">
+      <w:hyperlink w:anchor="_Toc242182957" w:history="1">
         <w:r>
           <w:rPr>
             <w:rStyle w:val="Hyperlink"/>
@@ -6761,7 +6761,7 @@
             <w:noProof/>
             <w:webHidden/>
           </w:rPr>
-          <w:instrText xml:space="preserve"> PAGEREF _Toc242182711 \h </w:instrText>
+          <w:instrText xml:space="preserve"> PAGEREF _Toc242182957 \h </w:instrText>
         </w:r>
         <w:r>
           <w:rPr>
@@ -6806,7 +6806,7 @@
           <w14:ligatures w14:val="standardContextual"/>
         </w:rPr>
       </w:pPr>
-      <w:hyperlink w:anchor="_Toc242182712" w:history="1">
+      <w:hyperlink w:anchor="_Toc242182958" w:history="1">
         <w:r>
           <w:rPr>
             <w:rStyle w:val="Hyperlink"/>
@@ -6833,7 +6833,7 @@
             <w:noProof/>
             <w:webHidden/>
           </w:rPr>
-          <w:instrText xml:space="preserve"> PAGEREF _Toc242182712 \h </w:instrText>
+          <w:instrText xml:space="preserve"> PAGEREF _Toc242182958 \h </w:instrText>
         </w:r>
         <w:r>
           <w:rPr>
@@ -6878,7 +6878,7 @@
           <w14:ligatures w14:val="standardContextual"/>
         </w:rPr>
       </w:pPr>
-      <w:hyperlink w:anchor="_Toc242182713" w:history="1">
+      <w:hyperlink w:anchor="_Toc242182959" w:history="1">
         <w:r>
           <w:rPr>
             <w:rStyle w:val="Hyperlink"/>
@@ -6905,7 +6905,7 @@
             <w:noProof/>
             <w:webHidden/>
           </w:rPr>
-          <w:instrText xml:space="preserve"> PAGEREF _Toc242182713 \h </w:instrText>
+          <w:instrText xml:space="preserve"> PAGEREF _Toc242182959 \h </w:instrText>
         </w:r>
         <w:r>
           <w:rPr>
@@ -6950,7 +6950,7 @@
           <w14:ligatures w14:val="standardContextual"/>
         </w:rPr>
       </w:pPr>
-      <w:hyperlink w:anchor="_Toc242182714" w:history="1">
+      <w:hyperlink w:anchor="_Toc242182960" w:history="1">
         <w:r>
           <w:rPr>
             <w:rStyle w:val="Hyperlink"/>
@@ -6977,7 +6977,7 @@
             <w:noProof/>
             <w:webHidden/>
           </w:rPr>
-          <w:instrText xml:space="preserve"> PAGEREF _Toc242182714 \h </w:instrText>
+          <w:instrText xml:space="preserve"> PAGEREF _Toc242182960 \h </w:instrText>
         </w:r>
         <w:r>
           <w:rPr>
@@ -7020,7 +7020,7 @@
           <w14:ligatures w14:val="standardContextual"/>
         </w:rPr>
       </w:pPr>
-      <w:hyperlink w:anchor="_Toc242182715" w:history="1">
+      <w:hyperlink w:anchor="_Toc242182961" w:history="1">
         <w:r>
           <w:rPr>
             <w:rStyle w:val="Hyperlink"/>
@@ -7043,7 +7043,7 @@
           <w:rPr>
             <w:webHidden/>
           </w:rPr>
-          <w:instrText xml:space="preserve"> PAGEREF _Toc242182715 \h </w:instrText>
+          <w:instrText xml:space="preserve"> PAGEREF _Toc242182961 \h </w:instrText>
         </w:r>
         <w:r>
           <w:rPr>
@@ -7084,7 +7084,7 @@
           <w14:ligatures w14:val="standardContextual"/>
         </w:rPr>
       </w:pPr>
-      <w:hyperlink w:anchor="_Toc242182716" w:history="1">
+      <w:hyperlink w:anchor="_Toc242182962" w:history="1">
         <w:r>
           <w:rPr>
             <w:rStyle w:val="Hyperlink"/>
@@ -7111,7 +7111,7 @@
             <w:noProof/>
             <w:webHidden/>
           </w:rPr>
-          <w:instrText xml:space="preserve"> PAGEREF _Toc242182716 \h </w:instrText>
+          <w:instrText xml:space="preserve"> PAGEREF _Toc242182962 \h </w:instrText>
         </w:r>
         <w:r>
           <w:rPr>
@@ -7156,7 +7156,7 @@
           <w14:ligatures w14:val="standardContextual"/>
         </w:rPr>
       </w:pPr>
-      <w:hyperlink w:anchor="_Toc242182717" w:history="1">
+      <w:hyperlink w:anchor="_Toc242182963" w:history="1">
         <w:r>
           <w:rPr>
             <w:rStyle w:val="Hyperlink"/>
@@ -7183,7 +7183,7 @@
             <w:noProof/>
             <w:webHidden/>
           </w:rPr>
-          <w:instrText xml:space="preserve"> PAGEREF _Toc242182717 \h </w:instrText>
+          <w:instrText xml:space="preserve"> PAGEREF _Toc242182963 \h </w:instrText>
         </w:r>
         <w:r>
           <w:rPr>
@@ -7226,7 +7226,7 @@
           <w14:ligatures w14:val="standardContextual"/>
         </w:rPr>
       </w:pPr>
-      <w:hyperlink w:anchor="_Toc242182718" w:history="1">
+      <w:hyperlink w:anchor="_Toc242182964" w:history="1">
         <w:r>
           <w:rPr>
             <w:rStyle w:val="Hyperlink"/>
@@ -7249,7 +7249,7 @@
           <w:rPr>
             <w:webHidden/>
           </w:rPr>
-          <w:instrText xml:space="preserve"> PAGEREF _Toc242182718 \h </w:instrText>
+          <w:instrText xml:space="preserve"> PAGEREF _Toc242182964 \h </w:instrText>
         </w:r>
         <w:r>
           <w:rPr>
@@ -7288,7 +7288,7 @@
           <w14:ligatures w14:val="standardContextual"/>
         </w:rPr>
       </w:pPr>
-      <w:hyperlink w:anchor="_Toc242182719" w:history="1">
+      <w:hyperlink w:anchor="_Toc242182965" w:history="1">
         <w:r>
           <w:rPr>
             <w:rStyle w:val="Hyperlink"/>
@@ -7311,7 +7311,7 @@
           <w:rPr>
             <w:webHidden/>
           </w:rPr>
-          <w:instrText xml:space="preserve"> PAGEREF _Toc242182719 \h </w:instrText>
+          <w:instrText xml:space="preserve"> PAGEREF _Toc242182965 \h </w:instrText>
         </w:r>
         <w:r>
           <w:rPr>
@@ -7352,7 +7352,7 @@
           <w14:ligatures w14:val="standardContextual"/>
         </w:rPr>
       </w:pPr>
-      <w:hyperlink w:anchor="_Toc242182720" w:history="1">
+      <w:hyperlink w:anchor="_Toc242182966" w:history="1">
         <w:r>
           <w:rPr>
             <w:rStyle w:val="Hyperlink"/>
@@ -7379,7 +7379,7 @@
             <w:noProof/>
             <w:webHidden/>
           </w:rPr>
-          <w:instrText xml:space="preserve"> PAGEREF _Toc242182720 \h </w:instrText>
+          <w:instrText xml:space="preserve"> PAGEREF _Toc242182966 \h </w:instrText>
         </w:r>
         <w:r>
           <w:rPr>
@@ -7424,7 +7424,7 @@
           <w14:ligatures w14:val="standardContextual"/>
         </w:rPr>
       </w:pPr>
-      <w:hyperlink w:anchor="_Toc242182721" w:history="1">
+      <w:hyperlink w:anchor="_Toc242182967" w:history="1">
         <w:r>
           <w:rPr>
             <w:rStyle w:val="Hyperlink"/>
@@ -7451,7 +7451,7 @@
             <w:noProof/>
             <w:webHidden/>
           </w:rPr>
-          <w:instrText xml:space="preserve"> PAGEREF _Toc242182721 \h </w:instrText>
+          <w:instrText xml:space="preserve"> PAGEREF _Toc242182967 \h </w:instrText>
         </w:r>
         <w:r>
           <w:rPr>
@@ -7496,7 +7496,7 @@
           <w14:ligatures w14:val="standardContextual"/>
         </w:rPr>
       </w:pPr>
-      <w:hyperlink w:anchor="_Toc242182722" w:history="1">
+      <w:hyperlink w:anchor="_Toc242182968" w:history="1">
         <w:r>
           <w:rPr>
             <w:rStyle w:val="Hyperlink"/>
@@ -7523,7 +7523,7 @@
             <w:noProof/>
             <w:webHidden/>
           </w:rPr>
-          <w:instrText xml:space="preserve"> PAGEREF _Toc242182722 \h </w:instrText>
+          <w:instrText xml:space="preserve"> PAGEREF _Toc242182968 \h </w:instrText>
         </w:r>
         <w:r>
           <w:rPr>
@@ -7568,7 +7568,7 @@
           <w14:ligatures w14:val="standardContextual"/>
         </w:rPr>
       </w:pPr>
-      <w:hyperlink w:anchor="_Toc242182723" w:history="1">
+      <w:hyperlink w:anchor="_Toc242182969" w:history="1">
         <w:r>
           <w:rPr>
             <w:rStyle w:val="Hyperlink"/>
@@ -7595,7 +7595,7 @@
             <w:noProof/>
             <w:webHidden/>
           </w:rPr>
-          <w:instrText xml:space="preserve"> PAGEREF _Toc242182723 \h </w:instrText>
+          <w:instrText xml:space="preserve"> PAGEREF _Toc242182969 \h </w:instrText>
         </w:r>
         <w:r>
           <w:rPr>
@@ -7640,7 +7640,7 @@
           <w14:ligatures w14:val="standardContextual"/>
         </w:rPr>
       </w:pPr>
-      <w:hyperlink w:anchor="_Toc242182724" w:history="1">
+      <w:hyperlink w:anchor="_Toc242182970" w:history="1">
         <w:r>
           <w:rPr>
             <w:rStyle w:val="Hyperlink"/>
@@ -7667,7 +7667,7 @@
             <w:noProof/>
             <w:webHidden/>
           </w:rPr>
-          <w:instrText xml:space="preserve"> PAGEREF _Toc242182724 \h </w:instrText>
+          <w:instrText xml:space="preserve"> PAGEREF _Toc242182970 \h </w:instrText>
         </w:r>
         <w:r>
           <w:rPr>
@@ -7712,7 +7712,7 @@
           <w14:ligatures w14:val="standardContextual"/>
         </w:rPr>
       </w:pPr>
-      <w:hyperlink w:anchor="_Toc242182725" w:history="1">
+      <w:hyperlink w:anchor="_Toc242182971" w:history="1">
         <w:r>
           <w:rPr>
             <w:rStyle w:val="Hyperlink"/>
@@ -7739,7 +7739,7 @@
             <w:noProof/>
             <w:webHidden/>
           </w:rPr>
-          <w:instrText xml:space="preserve"> PAGEREF _Toc242182725 \h </w:instrText>
+          <w:instrText xml:space="preserve"> PAGEREF _Toc242182971 \h </w:instrText>
         </w:r>
         <w:r>
           <w:rPr>
@@ -7784,7 +7784,7 @@
           <w14:ligatures w14:val="standardContextual"/>
         </w:rPr>
       </w:pPr>
-      <w:hyperlink w:anchor="_Toc242182726" w:history="1">
+      <w:hyperlink w:anchor="_Toc242182972" w:history="1">
         <w:r>
           <w:rPr>
             <w:rStyle w:val="Hyperlink"/>
@@ -7811,7 +7811,7 @@
             <w:noProof/>
             <w:webHidden/>
           </w:rPr>
-          <w:instrText xml:space="preserve"> PAGEREF _Toc242182726 \h </w:instrText>
+          <w:instrText xml:space="preserve"> PAGEREF _Toc242182972 \h </w:instrText>
         </w:r>
         <w:r>
           <w:rPr>
@@ -7856,7 +7856,7 @@
           <w14:ligatures w14:val="standardContextual"/>
         </w:rPr>
       </w:pPr>
-      <w:hyperlink w:anchor="_Toc242182727" w:history="1">
+      <w:hyperlink w:anchor="_Toc242182973" w:history="1">
         <w:r>
           <w:rPr>
             <w:rStyle w:val="Hyperlink"/>
@@ -7883,7 +7883,7 @@
             <w:noProof/>
             <w:webHidden/>
           </w:rPr>
-          <w:instrText xml:space="preserve"> PAGEREF _Toc242182727 \h </w:instrText>
+          <w:instrText xml:space="preserve"> PAGEREF _Toc242182973 \h </w:instrText>
         </w:r>
         <w:r>
           <w:rPr>
@@ -7928,7 +7928,7 @@
           <w14:ligatures w14:val="standardContextual"/>
         </w:rPr>
       </w:pPr>
-      <w:hyperlink w:anchor="_Toc242182728" w:history="1">
+      <w:hyperlink w:anchor="_Toc242182974" w:history="1">
         <w:r>
           <w:rPr>
             <w:rStyle w:val="Hyperlink"/>
@@ -7955,7 +7955,7 @@
             <w:noProof/>
             <w:webHidden/>
           </w:rPr>
-          <w:instrText xml:space="preserve"> PAGEREF _Toc242182728 \h </w:instrText>
+          <w:instrText xml:space="preserve"> PAGEREF _Toc242182974 \h </w:instrText>
         </w:r>
         <w:r>
           <w:rPr>
@@ -8000,7 +8000,7 @@
           <w14:ligatures w14:val="standardContextual"/>
         </w:rPr>
       </w:pPr>
-      <w:hyperlink w:anchor="_Toc242182729" w:history="1">
+      <w:hyperlink w:anchor="_Toc242182975" w:history="1">
         <w:r>
           <w:rPr>
             <w:rStyle w:val="Hyperlink"/>
@@ -8027,7 +8027,7 @@
             <w:noProof/>
             <w:webHidden/>
           </w:rPr>
-          <w:instrText xml:space="preserve"> PAGEREF _Toc242182729 \h </w:instrText>
+          <w:instrText xml:space="preserve"> PAGEREF _Toc242182975 \h </w:instrText>
         </w:r>
         <w:r>
           <w:rPr>
@@ -8072,7 +8072,7 @@
           <w14:ligatures w14:val="standardContextual"/>
         </w:rPr>
       </w:pPr>
-      <w:hyperlink w:anchor="_Toc242182730" w:history="1">
+      <w:hyperlink w:anchor="_Toc242182976" w:history="1">
         <w:r>
           <w:rPr>
             <w:rStyle w:val="Hyperlink"/>
@@ -8099,7 +8099,7 @@
             <w:noProof/>
             <w:webHidden/>
           </w:rPr>
-          <w:instrText xml:space="preserve"> PAGEREF _Toc242182730 \h </w:instrText>
+          <w:instrText xml:space="preserve"> PAGEREF _Toc242182976 \h </w:instrText>
         </w:r>
         <w:r>
           <w:rPr>
@@ -8144,7 +8144,7 @@
           <w14:ligatures w14:val="standardContextual"/>
         </w:rPr>
       </w:pPr>
-      <w:hyperlink w:anchor="_Toc242182731" w:history="1">
+      <w:hyperlink w:anchor="_Toc242182977" w:history="1">
         <w:r>
           <w:rPr>
             <w:rStyle w:val="Hyperlink"/>
@@ -8171,7 +8171,7 @@
             <w:noProof/>
             <w:webHidden/>
           </w:rPr>
-          <w:instrText xml:space="preserve"> PAGEREF _Toc242182731 \h </w:instrText>
+          <w:instrText xml:space="preserve"> PAGEREF _Toc242182977 \h </w:instrText>
         </w:r>
         <w:r>
           <w:rPr>
@@ -8216,7 +8216,7 @@
           <w14:ligatures w14:val="standardContextual"/>
         </w:rPr>
       </w:pPr>
-      <w:hyperlink w:anchor="_Toc242182732" w:history="1">
+      <w:hyperlink w:anchor="_Toc242182978" w:history="1">
         <w:r>
           <w:rPr>
             <w:rStyle w:val="Hyperlink"/>
@@ -8243,7 +8243,7 @@
             <w:noProof/>
             <w:webHidden/>
           </w:rPr>
-          <w:instrText xml:space="preserve"> PAGEREF _Toc242182732 \h </w:instrText>
+          <w:instrText xml:space="preserve"> PAGEREF _Toc242182978 \h </w:instrText>
         </w:r>
         <w:r>
           <w:rPr>
@@ -8288,7 +8288,7 @@
           <w14:ligatures w14:val="standardContextual"/>
         </w:rPr>
       </w:pPr>
-      <w:hyperlink w:anchor="_Toc242182733" w:history="1">
+      <w:hyperlink w:anchor="_Toc242182979" w:history="1">
         <w:r>
           <w:rPr>
             <w:rStyle w:val="Hyperlink"/>
@@ -8315,7 +8315,7 @@
             <w:noProof/>
             <w:webHidden/>
           </w:rPr>
-          <w:instrText xml:space="preserve"> PAGEREF _Toc242182733 \h </w:instrText>
+          <w:instrText xml:space="preserve"> PAGEREF _Toc242182979 \h </w:instrText>
         </w:r>
         <w:r>
           <w:rPr>
@@ -8360,7 +8360,7 @@
           <w14:ligatures w14:val="standardContextual"/>
         </w:rPr>
       </w:pPr>
-      <w:hyperlink w:anchor="_Toc242182734" w:history="1">
+      <w:hyperlink w:anchor="_Toc242182980" w:history="1">
         <w:r>
           <w:rPr>
             <w:rStyle w:val="Hyperlink"/>
@@ -8387,7 +8387,7 @@
             <w:noProof/>
             <w:webHidden/>
           </w:rPr>
-          <w:instrText xml:space="preserve"> PAGEREF _Toc242182734 \h </w:instrText>
+          <w:instrText xml:space="preserve"> PAGEREF _Toc242182980 \h </w:instrText>
         </w:r>
         <w:r>
           <w:rPr>
@@ -8432,7 +8432,7 @@
           <w14:ligatures w14:val="standardContextual"/>
         </w:rPr>
       </w:pPr>
-      <w:hyperlink w:anchor="_Toc242182735" w:history="1">
+      <w:hyperlink w:anchor="_Toc242182981" w:history="1">
         <w:r>
           <w:rPr>
             <w:rStyle w:val="Hyperlink"/>
@@ -8459,7 +8459,7 @@
             <w:noProof/>
             <w:webHidden/>
           </w:rPr>
-          <w:instrText xml:space="preserve"> PAGEREF _Toc242182735 \h </w:instrText>
+          <w:instrText xml:space="preserve"> PAGEREF _Toc242182981 \h </w:instrText>
         </w:r>
         <w:r>
           <w:rPr>
@@ -8504,7 +8504,7 @@
           <w14:ligatures w14:val="standardContextual"/>
         </w:rPr>
       </w:pPr>
-      <w:hyperlink w:anchor="_Toc242182736" w:history="1">
+      <w:hyperlink w:anchor="_Toc242182982" w:history="1">
         <w:r>
           <w:rPr>
             <w:rStyle w:val="Hyperlink"/>
@@ -8531,7 +8531,7 @@
             <w:noProof/>
             <w:webHidden/>
           </w:rPr>
-          <w:instrText xml:space="preserve"> PAGEREF _Toc242182736 \h </w:instrText>
+          <w:instrText xml:space="preserve"> PAGEREF _Toc242182982 \h </w:instrText>
         </w:r>
         <w:r>
           <w:rPr>
@@ -8576,7 +8576,7 @@
           <w14:ligatures w14:val="standardContextual"/>
         </w:rPr>
       </w:pPr>
-      <w:hyperlink w:anchor="_Toc242182737" w:history="1">
+      <w:hyperlink w:anchor="_Toc242182983" w:history="1">
         <w:r>
           <w:rPr>
             <w:rStyle w:val="Hyperlink"/>
@@ -8603,7 +8603,7 @@
             <w:noProof/>
             <w:webHidden/>
           </w:rPr>
-          <w:instrText xml:space="preserve"> PAGEREF _Toc242182737 \h </w:instrText>
+          <w:instrText xml:space="preserve"> PAGEREF _Toc242182983 \h </w:instrText>
         </w:r>
         <w:r>
           <w:rPr>
@@ -8648,7 +8648,7 @@
           <w14:ligatures w14:val="standardContextual"/>
         </w:rPr>
       </w:pPr>
-      <w:hyperlink w:anchor="_Toc242182738" w:history="1">
+      <w:hyperlink w:anchor="_Toc242182984" w:history="1">
         <w:r>
           <w:rPr>
             <w:rStyle w:val="Hyperlink"/>
@@ -8675,7 +8675,7 @@
             <w:noProof/>
             <w:webHidden/>
           </w:rPr>
-          <w:instrText xml:space="preserve"> PAGEREF _Toc242182738 \h </w:instrText>
+          <w:instrText xml:space="preserve"> PAGEREF _Toc242182984 \h </w:instrText>
         </w:r>
         <w:r>
           <w:rPr>
@@ -8720,7 +8720,7 @@
           <w14:ligatures w14:val="standardContextual"/>
         </w:rPr>
       </w:pPr>
-      <w:hyperlink w:anchor="_Toc242182739" w:history="1">
+      <w:hyperlink w:anchor="_Toc242182985" w:history="1">
         <w:r>
           <w:rPr>
             <w:rStyle w:val="Hyperlink"/>
@@ -8747,7 +8747,7 @@
             <w:noProof/>
             <w:webHidden/>
           </w:rPr>
-          <w:instrText xml:space="preserve"> PAGEREF _Toc242182739 \h </w:instrText>
+          <w:instrText xml:space="preserve"> PAGEREF _Toc242182985 \h </w:instrText>
         </w:r>
         <w:r>
           <w:rPr>
@@ -8792,7 +8792,7 @@
           <w14:ligatures w14:val="standardContextual"/>
         </w:rPr>
       </w:pPr>
-      <w:hyperlink w:anchor="_Toc242182740" w:history="1">
+      <w:hyperlink w:anchor="_Toc242182986" w:history="1">
         <w:r>
           <w:rPr>
             <w:rStyle w:val="Hyperlink"/>
@@ -8819,7 +8819,7 @@
             <w:noProof/>
             <w:webHidden/>
           </w:rPr>
-          <w:instrText xml:space="preserve"> PAGEREF _Toc242182740 \h </w:instrText>
+          <w:instrText xml:space="preserve"> PAGEREF _Toc242182986 \h </w:instrText>
         </w:r>
         <w:r>
           <w:rPr>
@@ -8864,7 +8864,7 @@
           <w14:ligatures w14:val="standardContextual"/>
         </w:rPr>
       </w:pPr>
-      <w:hyperlink w:anchor="_Toc242182741" w:history="1">
+      <w:hyperlink w:anchor="_Toc242182987" w:history="1">
         <w:r>
           <w:rPr>
             <w:rStyle w:val="Hyperlink"/>
@@ -8891,7 +8891,7 @@
             <w:noProof/>
             <w:webHidden/>
           </w:rPr>
-          <w:instrText xml:space="preserve"> PAGEREF _Toc242182741 \h </w:instrText>
+          <w:instrText xml:space="preserve"> PAGEREF _Toc242182987 \h </w:instrText>
         </w:r>
         <w:r>
           <w:rPr>
@@ -8936,7 +8936,7 @@
           <w14:ligatures w14:val="standardContextual"/>
         </w:rPr>
       </w:pPr>
-      <w:hyperlink w:anchor="_Toc242182742" w:history="1">
+      <w:hyperlink w:anchor="_Toc242182988" w:history="1">
         <w:r>
           <w:rPr>
             <w:rStyle w:val="Hyperlink"/>
@@ -8963,7 +8963,7 @@
             <w:noProof/>
             <w:webHidden/>
           </w:rPr>
-          <w:instrText xml:space="preserve"> PAGEREF _Toc242182742 \h </w:instrText>
+          <w:instrText xml:space="preserve"> PAGEREF _Toc242182988 \h </w:instrText>
         </w:r>
         <w:r>
           <w:rPr>
@@ -9008,7 +9008,7 @@
           <w14:ligatures w14:val="standardContextual"/>
         </w:rPr>
       </w:pPr>
-      <w:hyperlink w:anchor="_Toc242182743" w:history="1">
+      <w:hyperlink w:anchor="_Toc242182989" w:history="1">
         <w:r>
           <w:rPr>
             <w:rStyle w:val="Hyperlink"/>
@@ -9035,7 +9035,7 @@
             <w:noProof/>
             <w:webHidden/>
           </w:rPr>
-          <w:instrText xml:space="preserve"> PAGEREF _Toc242182743 \h </w:instrText>
+          <w:instrText xml:space="preserve"> PAGEREF _Toc242182989 \h </w:instrText>
         </w:r>
         <w:r>
           <w:rPr>
@@ -9080,7 +9080,7 @@
           <w14:ligatures w14:val="standardContextual"/>
         </w:rPr>
       </w:pPr>
-      <w:hyperlink w:anchor="_Toc242182744" w:history="1">
+      <w:hyperlink w:anchor="_Toc242182990" w:history="1">
         <w:r>
           <w:rPr>
             <w:rStyle w:val="Hyperlink"/>
@@ -9107,7 +9107,7 @@
             <w:noProof/>
             <w:webHidden/>
           </w:rPr>
-          <w:instrText xml:space="preserve"> PAGEREF _Toc242182744 \h </w:instrText>
+          <w:instrText xml:space="preserve"> PAGEREF _Toc242182990 \h </w:instrText>
         </w:r>
         <w:r>
           <w:rPr>
@@ -9152,7 +9152,7 @@
           <w14:ligatures w14:val="standardContextual"/>
         </w:rPr>
       </w:pPr>
-      <w:hyperlink w:anchor="_Toc242182745" w:history="1">
+      <w:hyperlink w:anchor="_Toc242182991" w:history="1">
         <w:r>
           <w:rPr>
             <w:rStyle w:val="Hyperlink"/>
@@ -9179,7 +9179,7 @@
             <w:noProof/>
             <w:webHidden/>
           </w:rPr>
-          <w:instrText xml:space="preserve"> PAGEREF _Toc242182745 \h </w:instrText>
+          <w:instrText xml:space="preserve"> PAGEREF _Toc242182991 \h </w:instrText>
         </w:r>
         <w:r>
           <w:rPr>
@@ -9224,7 +9224,7 @@
           <w14:ligatures w14:val="standardContextual"/>
         </w:rPr>
       </w:pPr>
-      <w:hyperlink w:anchor="_Toc242182746" w:history="1">
+      <w:hyperlink w:anchor="_Toc242182992" w:history="1">
         <w:r>
           <w:rPr>
             <w:rStyle w:val="Hyperlink"/>
@@ -9251,7 +9251,7 @@
             <w:noProof/>
             <w:webHidden/>
           </w:rPr>
-          <w:instrText xml:space="preserve"> PAGEREF _Toc242182746 \h </w:instrText>
+          <w:instrText xml:space="preserve"> PAGEREF _Toc242182992 \h </w:instrText>
         </w:r>
         <w:r>
           <w:rPr>
@@ -9296,7 +9296,7 @@
           <w14:ligatures w14:val="standardContextual"/>
         </w:rPr>
       </w:pPr>
-      <w:hyperlink w:anchor="_Toc242182747" w:history="1">
+      <w:hyperlink w:anchor="_Toc242182993" w:history="1">
         <w:r>
           <w:rPr>
             <w:rStyle w:val="Hyperlink"/>
@@ -9323,7 +9323,7 @@
             <w:noProof/>
             <w:webHidden/>
           </w:rPr>
-          <w:instrText xml:space="preserve"> PAGEREF _Toc242182747 \h </w:instrText>
+          <w:instrText xml:space="preserve"> PAGEREF _Toc242182993 \h </w:instrText>
         </w:r>
         <w:r>
           <w:rPr>
@@ -9368,7 +9368,7 @@
           <w14:ligatures w14:val="standardContextual"/>
         </w:rPr>
       </w:pPr>
-      <w:hyperlink w:anchor="_Toc242182748" w:history="1">
+      <w:hyperlink w:anchor="_Toc242182994" w:history="1">
         <w:r>
           <w:rPr>
             <w:rStyle w:val="Hyperlink"/>
@@ -9395,7 +9395,7 @@
             <w:noProof/>
             <w:webHidden/>
           </w:rPr>
-          <w:instrText xml:space="preserve"> PAGEREF _Toc242182748 \h </w:instrText>
+          <w:instrText xml:space="preserve"> PAGEREF _Toc242182994 \h </w:instrText>
         </w:r>
         <w:r>
           <w:rPr>
@@ -9440,7 +9440,7 @@
           <w14:ligatures w14:val="standardContextual"/>
         </w:rPr>
       </w:pPr>
-      <w:hyperlink w:anchor="_Toc242182749" w:history="1">
+      <w:hyperlink w:anchor="_Toc242182995" w:history="1">
         <w:r>
           <w:rPr>
             <w:rStyle w:val="Hyperlink"/>
@@ -9467,7 +9467,7 @@
             <w:noProof/>
             <w:webHidden/>
           </w:rPr>
-          <w:instrText xml:space="preserve"> PAGEREF _Toc242182749 \h </w:instrText>
+          <w:instrText xml:space="preserve"> PAGEREF _Toc242182995 \h </w:instrText>
         </w:r>
         <w:r>
           <w:rPr>
@@ -9512,7 +9512,7 @@
           <w14:ligatures w14:val="standardContextual"/>
         </w:rPr>
       </w:pPr>
-      <w:hyperlink w:anchor="_Toc242182750" w:history="1">
+      <w:hyperlink w:anchor="_Toc242182996" w:history="1">
         <w:r>
           <w:rPr>
             <w:rStyle w:val="Hyperlink"/>
@@ -9539,7 +9539,7 @@
             <w:noProof/>
             <w:webHidden/>
           </w:rPr>
-          <w:instrText xml:space="preserve"> PAGEREF _Toc242182750 \h </w:instrText>
+          <w:instrText xml:space="preserve"> PAGEREF _Toc242182996 \h </w:instrText>
         </w:r>
         <w:r>
           <w:rPr>
@@ -9584,7 +9584,7 @@
           <w14:ligatures w14:val="standardContextual"/>
         </w:rPr>
       </w:pPr>
-      <w:hyperlink w:anchor="_Toc242182751" w:history="1">
+      <w:hyperlink w:anchor="_Toc242182997" w:history="1">
         <w:r>
           <w:rPr>
             <w:rStyle w:val="Hyperlink"/>
@@ -9611,7 +9611,7 @@
             <w:noProof/>
             <w:webHidden/>
           </w:rPr>
-          <w:instrText xml:space="preserve"> PAGEREF _Toc242182751 \h </w:instrText>
+          <w:instrText xml:space="preserve"> PAGEREF _Toc242182997 \h </w:instrText>
         </w:r>
         <w:r>
           <w:rPr>
@@ -9656,7 +9656,7 @@
           <w14:ligatures w14:val="standardContextual"/>
         </w:rPr>
       </w:pPr>
-      <w:hyperlink w:anchor="_Toc242182752" w:history="1">
+      <w:hyperlink w:anchor="_Toc242182998" w:history="1">
         <w:r>
           <w:rPr>
             <w:rStyle w:val="Hyperlink"/>
@@ -9683,7 +9683,7 @@
             <w:noProof/>
             <w:webHidden/>
           </w:rPr>
-          <w:instrText xml:space="preserve"> PAGEREF _Toc242182752 \h </w:instrText>
+          <w:instrText xml:space="preserve"> PAGEREF _Toc242182998 \h </w:instrText>
         </w:r>
         <w:r>
           <w:rPr>
@@ -9728,7 +9728,7 @@
           <w14:ligatures w14:val="standardContextual"/>
         </w:rPr>
       </w:pPr>
-      <w:hyperlink w:anchor="_Toc242182753" w:history="1">
+      <w:hyperlink w:anchor="_Toc242182999" w:history="1">
         <w:r>
           <w:rPr>
             <w:rStyle w:val="Hyperlink"/>
@@ -9755,7 +9755,7 @@
             <w:noProof/>
             <w:webHidden/>
           </w:rPr>
-          <w:instrText xml:space="preserve"> PAGEREF _Toc242182753 \h </w:instrText>
+          <w:instrText xml:space="preserve"> PAGEREF _Toc242182999 \h </w:instrText>
         </w:r>
         <w:r>
           <w:rPr>
@@ -9800,7 +9800,7 @@
           <w14:ligatures w14:val="standardContextual"/>
         </w:rPr>
       </w:pPr>
-      <w:hyperlink w:anchor="_Toc242182754" w:history="1">
+      <w:hyperlink w:anchor="_Toc242183000" w:history="1">
         <w:r>
           <w:rPr>
             <w:rStyle w:val="Hyperlink"/>
@@ -9827,7 +9827,7 @@
             <w:noProof/>
             <w:webHidden/>
           </w:rPr>
-          <w:instrText xml:space="preserve"> PAGEREF _Toc242182754 \h </w:instrText>
+          <w:instrText xml:space="preserve"> PAGEREF _Toc242183000 \h </w:instrText>
         </w:r>
         <w:r>
           <w:rPr>
@@ -9872,7 +9872,7 @@
           <w14:ligatures w14:val="standardContextual"/>
         </w:rPr>
       </w:pPr>
-      <w:hyperlink w:anchor="_Toc242182755" w:history="1">
+      <w:hyperlink w:anchor="_Toc242183001" w:history="1">
         <w:r>
           <w:rPr>
             <w:rStyle w:val="Hyperlink"/>
@@ -9899,7 +9899,7 @@
             <w:noProof/>
             <w:webHidden/>
           </w:rPr>
-          <w:instrText xml:space="preserve"> PAGEREF _Toc242182755 \h </w:instrText>
+          <w:instrText xml:space="preserve"> PAGEREF _Toc242183001 \h </w:instrText>
         </w:r>
         <w:r>
           <w:rPr>
@@ -9944,7 +9944,7 @@
           <w14:ligatures w14:val="standardContextual"/>
         </w:rPr>
       </w:pPr>
-      <w:hyperlink w:anchor="_Toc242182756" w:history="1">
+      <w:hyperlink w:anchor="_Toc242183002" w:history="1">
         <w:r>
           <w:rPr>
             <w:rStyle w:val="Hyperlink"/>
@@ -9971,7 +9971,7 @@
             <w:noProof/>
             <w:webHidden/>
           </w:rPr>
-          <w:instrText xml:space="preserve"> PAGEREF _Toc242182756 \h </w:instrText>
+          <w:instrText xml:space="preserve"> PAGEREF _Toc242183002 \h </w:instrText>
         </w:r>
         <w:r>
           <w:rPr>
@@ -10016,7 +10016,7 @@
           <w14:ligatures w14:val="standardContextual"/>
         </w:rPr>
       </w:pPr>
-      <w:hyperlink w:anchor="_Toc242182757" w:history="1">
+      <w:hyperlink w:anchor="_Toc242183003" w:history="1">
         <w:r>
           <w:rPr>
             <w:rStyle w:val="Hyperlink"/>
@@ -10043,7 +10043,7 @@
             <w:noProof/>
             <w:webHidden/>
           </w:rPr>
-          <w:instrText xml:space="preserve"> PAGEREF _Toc242182757 \h </w:instrText>
+          <w:instrText xml:space="preserve"> PAGEREF _Toc242183003 \h </w:instrText>
         </w:r>
         <w:r>
           <w:rPr>
@@ -10088,7 +10088,7 @@
           <w14:ligatures w14:val="standardContextual"/>
         </w:rPr>
       </w:pPr>
-      <w:hyperlink w:anchor="_Toc242182758" w:history="1">
+      <w:hyperlink w:anchor="_Toc242183004" w:history="1">
         <w:r>
           <w:rPr>
             <w:rStyle w:val="Hyperlink"/>
@@ -10115,7 +10115,7 @@
             <w:noProof/>
             <w:webHidden/>
           </w:rPr>
-          <w:instrText xml:space="preserve"> PAGEREF _Toc242182758 \h </w:instrText>
+          <w:instrText xml:space="preserve"> PAGEREF _Toc242183004 \h </w:instrText>
         </w:r>
         <w:r>
           <w:rPr>
@@ -10160,7 +10160,7 @@
           <w14:ligatures w14:val="standardContextual"/>
         </w:rPr>
       </w:pPr>
-      <w:hyperlink w:anchor="_Toc242182759" w:history="1">
+      <w:hyperlink w:anchor="_Toc242183005" w:history="1">
         <w:r>
           <w:rPr>
             <w:rStyle w:val="Hyperlink"/>
@@ -10187,7 +10187,7 @@
             <w:noProof/>
             <w:webHidden/>
           </w:rPr>
-          <w:instrText xml:space="preserve"> PAGEREF _Toc242182759 \h </w:instrText>
+          <w:instrText xml:space="preserve"> PAGEREF _Toc242183005 \h </w:instrText>
         </w:r>
         <w:r>
           <w:rPr>
@@ -10232,7 +10232,7 @@
           <w14:ligatures w14:val="standardContextual"/>
         </w:rPr>
       </w:pPr>
-      <w:hyperlink w:anchor="_Toc242182760" w:history="1">
+      <w:hyperlink w:anchor="_Toc242183006" w:history="1">
         <w:r>
           <w:rPr>
             <w:rStyle w:val="Hyperlink"/>
@@ -10259,7 +10259,7 @@
             <w:noProof/>
             <w:webHidden/>
           </w:rPr>
-          <w:instrText xml:space="preserve"> PAGEREF _Toc242182760 \h </w:instrText>
+          <w:instrText xml:space="preserve"> PAGEREF _Toc242183006 \h </w:instrText>
         </w:r>
         <w:r>
           <w:rPr>
@@ -10333,7 +10333,7 @@
       <w:r>
         <w:fldChar w:fldCharType="separate"/>
       </w:r>
-      <w:hyperlink w:anchor="_Toc242182761" w:history="1">
+      <w:hyperlink w:anchor="_Toc242183007" w:history="1">
         <w:r>
           <w:rPr>
             <w:rStyle w:val="Hyperlink"/>
@@ -10357,7 +10357,7 @@
           <w:rPr>
             <w:webHidden/>
           </w:rPr>
-          <w:instrText xml:space="preserve"> PAGEREF _Toc242182761 \h </w:instrText>
+          <w:instrText xml:space="preserve"> PAGEREF _Toc242183007 \h </w:instrText>
         </w:r>
         <w:r>
           <w:rPr>
@@ -10395,7 +10395,7 @@
           <w14:ligatures w14:val="standardContextual"/>
         </w:rPr>
       </w:pPr>
-      <w:hyperlink w:anchor="_Toc242182762" w:history="1">
+      <w:hyperlink w:anchor="_Toc242183008" w:history="1">
         <w:r>
           <w:rPr>
             <w:rStyle w:val="Hyperlink"/>
@@ -10419,7 +10419,7 @@
           <w:rPr>
             <w:webHidden/>
           </w:rPr>
-          <w:instrText xml:space="preserve"> PAGEREF _Toc242182762 \h </w:instrText>
+          <w:instrText xml:space="preserve"> PAGEREF _Toc242183008 \h </w:instrText>
         </w:r>
         <w:r>
           <w:rPr>
@@ -10457,7 +10457,7 @@
           <w14:ligatures w14:val="standardContextual"/>
         </w:rPr>
       </w:pPr>
-      <w:hyperlink w:anchor="_Toc242182763" w:history="1">
+      <w:hyperlink w:anchor="_Toc242183009" w:history="1">
         <w:r>
           <w:rPr>
             <w:rStyle w:val="Hyperlink"/>
@@ -10481,7 +10481,7 @@
           <w:rPr>
             <w:webHidden/>
           </w:rPr>
-          <w:instrText xml:space="preserve"> PAGEREF _Toc242182763 \h </w:instrText>
+          <w:instrText xml:space="preserve"> PAGEREF _Toc242183009 \h </w:instrText>
         </w:r>
         <w:r>
           <w:rPr>
@@ -10519,7 +10519,7 @@
           <w14:ligatures w14:val="standardContextual"/>
         </w:rPr>
       </w:pPr>
-      <w:hyperlink w:anchor="_Toc242182764" w:history="1">
+      <w:hyperlink w:anchor="_Toc242183010" w:history="1">
         <w:r>
           <w:rPr>
             <w:rStyle w:val="Hyperlink"/>
@@ -10543,7 +10543,7 @@
           <w:rPr>
             <w:webHidden/>
           </w:rPr>
-          <w:instrText xml:space="preserve"> PAGEREF _Toc242182764 \h </w:instrText>
+          <w:instrText xml:space="preserve"> PAGEREF _Toc242183010 \h </w:instrText>
         </w:r>
         <w:r>
           <w:rPr>
@@ -10581,7 +10581,7 @@
           <w14:ligatures w14:val="standardContextual"/>
         </w:rPr>
       </w:pPr>
-      <w:hyperlink w:anchor="_Toc242182765" w:history="1">
+      <w:hyperlink w:anchor="_Toc242183011" w:history="1">
         <w:r>
           <w:rPr>
             <w:rStyle w:val="Hyperlink"/>
@@ -10605,7 +10605,7 @@
           <w:rPr>
             <w:webHidden/>
           </w:rPr>
-          <w:instrText xml:space="preserve"> PAGEREF _Toc242182765 \h </w:instrText>
+          <w:instrText xml:space="preserve"> PAGEREF _Toc242183011 \h </w:instrText>
         </w:r>
         <w:r>
           <w:rPr>
@@ -10643,7 +10643,7 @@
           <w14:ligatures w14:val="standardContextual"/>
         </w:rPr>
       </w:pPr>
-      <w:hyperlink w:anchor="_Toc242182766" w:history="1">
+      <w:hyperlink w:anchor="_Toc242183012" w:history="1">
         <w:r>
           <w:rPr>
             <w:rStyle w:val="Hyperlink"/>
@@ -10667,7 +10667,7 @@
           <w:rPr>
             <w:webHidden/>
           </w:rPr>
-          <w:instrText xml:space="preserve"> PAGEREF _Toc242182766 \h </w:instrText>
+          <w:instrText xml:space="preserve"> PAGEREF _Toc242183012 \h </w:instrText>
         </w:r>
         <w:r>
           <w:rPr>
@@ -10705,7 +10705,7 @@
           <w14:ligatures w14:val="standardContextual"/>
         </w:rPr>
       </w:pPr>
-      <w:hyperlink w:anchor="_Toc242182767" w:history="1">
+      <w:hyperlink w:anchor="_Toc242183013" w:history="1">
         <w:r>
           <w:rPr>
             <w:rStyle w:val="Hyperlink"/>
@@ -10729,7 +10729,7 @@
           <w:rPr>
             <w:webHidden/>
           </w:rPr>
-          <w:instrText xml:space="preserve"> PAGEREF _Toc242182767 \h </w:instrText>
+          <w:instrText xml:space="preserve"> PAGEREF _Toc242183013 \h </w:instrText>
         </w:r>
         <w:r>
           <w:rPr>
@@ -10767,7 +10767,7 @@
           <w14:ligatures w14:val="standardContextual"/>
         </w:rPr>
       </w:pPr>
-      <w:hyperlink w:anchor="_Toc242182768" w:history="1">
+      <w:hyperlink w:anchor="_Toc242183014" w:history="1">
         <w:r>
           <w:rPr>
             <w:rStyle w:val="Hyperlink"/>
@@ -10791,7 +10791,7 @@
           <w:rPr>
             <w:webHidden/>
           </w:rPr>
-          <w:instrText xml:space="preserve"> PAGEREF _Toc242182768 \h </w:instrText>
+          <w:instrText xml:space="preserve"> PAGEREF _Toc242183014 \h </w:instrText>
         </w:r>
         <w:r>
           <w:rPr>
@@ -10829,7 +10829,7 @@
           <w14:ligatures w14:val="standardContextual"/>
         </w:rPr>
       </w:pPr>
-      <w:hyperlink w:anchor="_Toc242182769" w:history="1">
+      <w:hyperlink w:anchor="_Toc242183015" w:history="1">
         <w:r>
           <w:rPr>
             <w:rStyle w:val="Hyperlink"/>
@@ -10853,7 +10853,7 @@
           <w:rPr>
             <w:webHidden/>
           </w:rPr>
-          <w:instrText xml:space="preserve"> PAGEREF _Toc242182769 \h </w:instrText>
+          <w:instrText xml:space="preserve"> PAGEREF _Toc242183015 \h </w:instrText>
         </w:r>
         <w:r>
           <w:rPr>
@@ -10891,7 +10891,7 @@
           <w14:ligatures w14:val="standardContextual"/>
         </w:rPr>
       </w:pPr>
-      <w:hyperlink w:anchor="_Toc242182770" w:history="1">
+      <w:hyperlink w:anchor="_Toc242183016" w:history="1">
         <w:r>
           <w:rPr>
             <w:rStyle w:val="Hyperlink"/>
@@ -10915,7 +10915,7 @@
           <w:rPr>
             <w:webHidden/>
           </w:rPr>
-          <w:instrText xml:space="preserve"> PAGEREF _Toc242182770 \h </w:instrText>
+          <w:instrText xml:space="preserve"> PAGEREF _Toc242183016 \h </w:instrText>
         </w:r>
         <w:r>
           <w:rPr>
@@ -10953,7 +10953,7 @@
           <w14:ligatures w14:val="standardContextual"/>
         </w:rPr>
       </w:pPr>
-      <w:hyperlink w:anchor="_Toc242182771" w:history="1">
+      <w:hyperlink w:anchor="_Toc242183017" w:history="1">
         <w:r>
           <w:rPr>
             <w:rStyle w:val="Hyperlink"/>
@@ -10976,7 +10976,7 @@
           <w:rPr>
             <w:webHidden/>
           </w:rPr>
-          <w:instrText xml:space="preserve"> PAGEREF _Toc242182771 \h </w:instrText>
+          <w:instrText xml:space="preserve"> PAGEREF _Toc242183017 \h </w:instrText>
         </w:r>
         <w:r>
           <w:rPr>
@@ -11014,7 +11014,7 @@
           <w14:ligatures w14:val="standardContextual"/>
         </w:rPr>
       </w:pPr>
-      <w:hyperlink w:anchor="_Toc242182772" w:history="1">
+      <w:hyperlink w:anchor="_Toc242183018" w:history="1">
         <w:r>
           <w:rPr>
             <w:rStyle w:val="Hyperlink"/>
@@ -11037,7 +11037,7 @@
           <w:rPr>
             <w:webHidden/>
           </w:rPr>
-          <w:instrText xml:space="preserve"> PAGEREF _Toc242182772 \h </w:instrText>
+          <w:instrText xml:space="preserve"> PAGEREF _Toc242183018 \h </w:instrText>
         </w:r>
         <w:r>
           <w:rPr>
@@ -11075,7 +11075,7 @@
           <w14:ligatures w14:val="standardContextual"/>
         </w:rPr>
       </w:pPr>
-      <w:hyperlink w:anchor="_Toc242182773" w:history="1">
+      <w:hyperlink w:anchor="_Toc242183019" w:history="1">
         <w:r>
           <w:rPr>
             <w:rStyle w:val="Hyperlink"/>
@@ -11098,7 +11098,7 @@
           <w:rPr>
             <w:webHidden/>
           </w:rPr>
-          <w:instrText xml:space="preserve"> PAGEREF _Toc242182773 \h </w:instrText>
+          <w:instrText xml:space="preserve"> PAGEREF _Toc242183019 \h </w:instrText>
         </w:r>
         <w:r>
           <w:rPr>
@@ -11136,7 +11136,7 @@
           <w14:ligatures w14:val="standardContextual"/>
         </w:rPr>
       </w:pPr>
-      <w:hyperlink w:anchor="_Toc242182774" w:history="1">
+      <w:hyperlink w:anchor="_Toc242183020" w:history="1">
         <w:r>
           <w:rPr>
             <w:rStyle w:val="Hyperlink"/>
@@ -11159,7 +11159,7 @@
           <w:rPr>
             <w:webHidden/>
           </w:rPr>
-          <w:instrText xml:space="preserve"> PAGEREF _Toc242182774 \h </w:instrText>
+          <w:instrText xml:space="preserve"> PAGEREF _Toc242183020 \h </w:instrText>
         </w:r>
         <w:r>
           <w:rPr>
@@ -11197,7 +11197,7 @@
           <w14:ligatures w14:val="standardContextual"/>
         </w:rPr>
       </w:pPr>
-      <w:hyperlink w:anchor="_Toc242182775" w:history="1">
+      <w:hyperlink w:anchor="_Toc242183021" w:history="1">
         <w:r>
           <w:rPr>
             <w:rStyle w:val="Hyperlink"/>
@@ -11220,7 +11220,7 @@
           <w:rPr>
             <w:webHidden/>
           </w:rPr>
-          <w:instrText xml:space="preserve"> PAGEREF _Toc242182775 \h </w:instrText>
+          <w:instrText xml:space="preserve"> PAGEREF _Toc242183021 \h </w:instrText>
         </w:r>
         <w:r>
           <w:rPr>
@@ -11258,7 +11258,7 @@
           <w14:ligatures w14:val="standardContextual"/>
         </w:rPr>
       </w:pPr>
-      <w:hyperlink w:anchor="_Toc242182776" w:history="1">
+      <w:hyperlink w:anchor="_Toc242183022" w:history="1">
         <w:r>
           <w:rPr>
             <w:rStyle w:val="Hyperlink"/>
@@ -11281,7 +11281,7 @@
           <w:rPr>
             <w:webHidden/>
           </w:rPr>
-          <w:instrText xml:space="preserve"> PAGEREF _Toc242182776 \h </w:instrText>
+          <w:instrText xml:space="preserve"> PAGEREF _Toc242183022 \h </w:instrText>
         </w:r>
         <w:r>
           <w:rPr>
@@ -11319,7 +11319,7 @@
           <w14:ligatures w14:val="standardContextual"/>
         </w:rPr>
       </w:pPr>
-      <w:hyperlink w:anchor="_Toc242182777" w:history="1">
+      <w:hyperlink w:anchor="_Toc242183023" w:history="1">
         <w:r>
           <w:rPr>
             <w:rStyle w:val="Hyperlink"/>
@@ -11342,7 +11342,7 @@
           <w:rPr>
             <w:webHidden/>
           </w:rPr>
-          <w:instrText xml:space="preserve"> PAGEREF _Toc242182777 \h </w:instrText>
+          <w:instrText xml:space="preserve"> PAGEREF _Toc242183023 \h </w:instrText>
         </w:r>
         <w:r>
           <w:rPr>
@@ -11405,7 +11405,7 @@
       <w:r>
         <w:fldChar w:fldCharType="separate"/>
       </w:r>
-      <w:hyperlink w:anchor="_Toc242182778" w:history="1">
+      <w:hyperlink w:anchor="_Toc242183024" w:history="1">
         <w:r>
           <w:rPr>
             <w:rStyle w:val="Hyperlink"/>
@@ -11429,7 +11429,7 @@
           <w:rPr>
             <w:webHidden/>
           </w:rPr>
-          <w:instrText xml:space="preserve"> PAGEREF _Toc242182778 \h </w:instrText>
+          <w:instrText xml:space="preserve"> PAGEREF _Toc242183024 \h </w:instrText>
         </w:r>
         <w:r>
           <w:rPr>
@@ -11467,7 +11467,7 @@
           <w14:ligatures w14:val="standardContextual"/>
         </w:rPr>
       </w:pPr>
-      <w:hyperlink w:anchor="_Toc242182779" w:history="1">
+      <w:hyperlink w:anchor="_Toc242183025" w:history="1">
         <w:r>
           <w:rPr>
             <w:rStyle w:val="Hyperlink"/>
@@ -11491,7 +11491,7 @@
           <w:rPr>
             <w:webHidden/>
           </w:rPr>
-          <w:instrText xml:space="preserve"> PAGEREF _Toc242182779 \h </w:instrText>
+          <w:instrText xml:space="preserve"> PAGEREF _Toc242183025 \h </w:instrText>
         </w:r>
         <w:r>
           <w:rPr>
@@ -11529,7 +11529,7 @@
           <w14:ligatures w14:val="standardContextual"/>
         </w:rPr>
       </w:pPr>
-      <w:hyperlink w:anchor="_Toc242182780" w:history="1">
+      <w:hyperlink w:anchor="_Toc242183026" w:history="1">
         <w:r>
           <w:rPr>
             <w:rStyle w:val="Hyperlink"/>
@@ -11554,7 +11554,7 @@
           <w:rPr>
             <w:webHidden/>
           </w:rPr>
-          <w:instrText xml:space="preserve"> PAGEREF _Toc242182780 \h </w:instrText>
+          <w:instrText xml:space="preserve"> PAGEREF _Toc242183026 \h </w:instrText>
         </w:r>
         <w:r>
           <w:rPr>
@@ -11592,7 +11592,7 @@
           <w14:ligatures w14:val="standardContextual"/>
         </w:rPr>
       </w:pPr>
-      <w:hyperlink w:anchor="_Toc242182781" w:history="1">
+      <w:hyperlink w:anchor="_Toc242183027" w:history="1">
         <w:r>
           <w:rPr>
             <w:rStyle w:val="Hyperlink"/>
@@ -11616,7 +11616,7 @@
           <w:rPr>
             <w:webHidden/>
           </w:rPr>
-          <w:instrText xml:space="preserve"> PAGEREF _Toc242182781 \h </w:instrText>
+          <w:instrText xml:space="preserve"> PAGEREF _Toc242183027 \h </w:instrText>
         </w:r>
         <w:r>
           <w:rPr>
@@ -11654,7 +11654,7 @@
           <w14:ligatures w14:val="standardContextual"/>
         </w:rPr>
       </w:pPr>
-      <w:hyperlink w:anchor="_Toc242182782" w:history="1">
+      <w:hyperlink w:anchor="_Toc242183028" w:history="1">
         <w:r>
           <w:rPr>
             <w:rStyle w:val="Hyperlink"/>
@@ -11678,7 +11678,7 @@
           <w:rPr>
             <w:webHidden/>
           </w:rPr>
-          <w:instrText xml:space="preserve"> PAGEREF _Toc242182782 \h </w:instrText>
+          <w:instrText xml:space="preserve"> PAGEREF _Toc242183028 \h </w:instrText>
         </w:r>
         <w:r>
           <w:rPr>
@@ -11716,7 +11716,7 @@
           <w14:ligatures w14:val="standardContextual"/>
         </w:rPr>
       </w:pPr>
-      <w:hyperlink w:anchor="_Toc242182783" w:history="1">
+      <w:hyperlink w:anchor="_Toc242183029" w:history="1">
         <w:r>
           <w:rPr>
             <w:rStyle w:val="Hyperlink"/>
@@ -11740,7 +11740,7 @@
           <w:rPr>
             <w:webHidden/>
           </w:rPr>
-          <w:instrText xml:space="preserve"> PAGEREF _Toc242182783 \h </w:instrText>
+          <w:instrText xml:space="preserve"> PAGEREF _Toc242183029 \h </w:instrText>
         </w:r>
         <w:r>
           <w:rPr>
@@ -11778,7 +11778,7 @@
           <w14:ligatures w14:val="standardContextual"/>
         </w:rPr>
       </w:pPr>
-      <w:hyperlink w:anchor="_Toc242182784" w:history="1">
+      <w:hyperlink w:anchor="_Toc242183030" w:history="1">
         <w:r>
           <w:rPr>
             <w:rStyle w:val="Hyperlink"/>
@@ -11802,7 +11802,7 @@
           <w:rPr>
             <w:webHidden/>
           </w:rPr>
-          <w:instrText xml:space="preserve"> PAGEREF _Toc242182784 \h </w:instrText>
+          <w:instrText xml:space="preserve"> PAGEREF _Toc242183030 \h </w:instrText>
         </w:r>
         <w:r>
           <w:rPr>
@@ -11840,7 +11840,7 @@
           <w14:ligatures w14:val="standardContextual"/>
         </w:rPr>
       </w:pPr>
-      <w:hyperlink w:anchor="_Toc242182785" w:history="1">
+      <w:hyperlink w:anchor="_Toc242183031" w:history="1">
         <w:r>
           <w:rPr>
             <w:rStyle w:val="Hyperlink"/>
@@ -11864,7 +11864,7 @@
           <w:rPr>
             <w:webHidden/>
           </w:rPr>
-          <w:instrText xml:space="preserve"> PAGEREF _Toc242182785 \h </w:instrText>
+          <w:instrText xml:space="preserve"> PAGEREF _Toc242183031 \h </w:instrText>
         </w:r>
         <w:r>
           <w:rPr>
@@ -11902,7 +11902,7 @@
           <w14:ligatures w14:val="standardContextual"/>
         </w:rPr>
       </w:pPr>
-      <w:hyperlink w:anchor="_Toc242182786" w:history="1">
+      <w:hyperlink w:anchor="_Toc242183032" w:history="1">
         <w:r>
           <w:rPr>
             <w:rStyle w:val="Hyperlink"/>
@@ -11926,7 +11926,7 @@
           <w:rPr>
             <w:webHidden/>
           </w:rPr>
-          <w:instrText xml:space="preserve"> PAGEREF _Toc242182786 \h </w:instrText>
+          <w:instrText xml:space="preserve"> PAGEREF _Toc242183032 \h </w:instrText>
         </w:r>
         <w:r>
           <w:rPr>
@@ -11964,7 +11964,7 @@
           <w14:ligatures w14:val="standardContextual"/>
         </w:rPr>
       </w:pPr>
-      <w:hyperlink w:anchor="_Toc242182787" w:history="1">
+      <w:hyperlink w:anchor="_Toc242183033" w:history="1">
         <w:r>
           <w:rPr>
             <w:rStyle w:val="Hyperlink"/>
@@ -11988,7 +11988,7 @@
           <w:rPr>
             <w:webHidden/>
           </w:rPr>
-          <w:instrText xml:space="preserve"> PAGEREF _Toc242182787 \h </w:instrText>
+          <w:instrText xml:space="preserve"> PAGEREF _Toc242183033 \h </w:instrText>
         </w:r>
         <w:r>
           <w:rPr>
@@ -12026,7 +12026,7 @@
           <w14:ligatures w14:val="standardContextual"/>
         </w:rPr>
       </w:pPr>
-      <w:hyperlink w:anchor="_Toc242182788" w:history="1">
+      <w:hyperlink w:anchor="_Toc242183034" w:history="1">
         <w:r>
           <w:rPr>
             <w:rStyle w:val="Hyperlink"/>
@@ -12050,7 +12050,7 @@
           <w:rPr>
             <w:webHidden/>
           </w:rPr>
-          <w:instrText xml:space="preserve"> PAGEREF _Toc242182788 \h </w:instrText>
+          <w:instrText xml:space="preserve"> PAGEREF _Toc242183034 \h </w:instrText>
         </w:r>
         <w:r>
           <w:rPr>
@@ -12088,7 +12088,7 @@
           <w14:ligatures w14:val="standardContextual"/>
         </w:rPr>
       </w:pPr>
-      <w:hyperlink w:anchor="_Toc242182789" w:history="1">
+      <w:hyperlink w:anchor="_Toc242183035" w:history="1">
         <w:r>
           <w:rPr>
             <w:rStyle w:val="Hyperlink"/>
@@ -12112,7 +12112,7 @@
           <w:rPr>
             <w:webHidden/>
           </w:rPr>
-          <w:instrText xml:space="preserve"> PAGEREF _Toc242182789 \h </w:instrText>
+          <w:instrText xml:space="preserve"> PAGEREF _Toc242183035 \h </w:instrText>
         </w:r>
         <w:r>
           <w:rPr>
@@ -12150,7 +12150,7 @@
           <w14:ligatures w14:val="standardContextual"/>
         </w:rPr>
       </w:pPr>
-      <w:hyperlink w:anchor="_Toc242182790" w:history="1">
+      <w:hyperlink w:anchor="_Toc242183036" w:history="1">
         <w:r>
           <w:rPr>
             <w:rStyle w:val="Hyperlink"/>
@@ -12174,7 +12174,7 @@
           <w:rPr>
             <w:webHidden/>
           </w:rPr>
-          <w:instrText xml:space="preserve"> PAGEREF _Toc242182790 \h </w:instrText>
+          <w:instrText xml:space="preserve"> PAGEREF _Toc242183036 \h </w:instrText>
         </w:r>
         <w:r>
           <w:rPr>
@@ -12212,7 +12212,7 @@
           <w14:ligatures w14:val="standardContextual"/>
         </w:rPr>
       </w:pPr>
-      <w:hyperlink w:anchor="_Toc242182791" w:history="1">
+      <w:hyperlink w:anchor="_Toc242183037" w:history="1">
         <w:r>
           <w:rPr>
             <w:rStyle w:val="Hyperlink"/>
@@ -12236,7 +12236,7 @@
           <w:rPr>
             <w:webHidden/>
           </w:rPr>
-          <w:instrText xml:space="preserve"> PAGEREF _Toc242182791 \h </w:instrText>
+          <w:instrText xml:space="preserve"> PAGEREF _Toc242183037 \h </w:instrText>
         </w:r>
         <w:r>
           <w:rPr>
@@ -12274,7 +12274,7 @@
           <w14:ligatures w14:val="standardContextual"/>
         </w:rPr>
       </w:pPr>
-      <w:hyperlink w:anchor="_Toc242182792" w:history="1">
+      <w:hyperlink w:anchor="_Toc242183038" w:history="1">
         <w:r>
           <w:rPr>
             <w:rStyle w:val="Hyperlink"/>
@@ -12298,7 +12298,7 @@
           <w:rPr>
             <w:webHidden/>
           </w:rPr>
-          <w:instrText xml:space="preserve"> PAGEREF _Toc242182792 \h </w:instrText>
+          <w:instrText xml:space="preserve"> PAGEREF _Toc242183038 \h </w:instrText>
         </w:r>
         <w:r>
           <w:rPr>
@@ -12336,7 +12336,7 @@
           <w14:ligatures w14:val="standardContextual"/>
         </w:rPr>
       </w:pPr>
-      <w:hyperlink w:anchor="_Toc242182793" w:history="1">
+      <w:hyperlink w:anchor="_Toc242183039" w:history="1">
         <w:r>
           <w:rPr>
             <w:rStyle w:val="Hyperlink"/>
@@ -12360,7 +12360,7 @@
           <w:rPr>
             <w:webHidden/>
           </w:rPr>
-          <w:instrText xml:space="preserve"> PAGEREF _Toc242182793 \h </w:instrText>
+          <w:instrText xml:space="preserve"> PAGEREF _Toc242183039 \h </w:instrText>
         </w:r>
         <w:r>
           <w:rPr>
@@ -12478,7 +12478,7 @@
         <w:pStyle w:val="Heading1"/>
       </w:pPr>
       <w:bookmarkStart w:id="1" w:name="_Toc241062250"/>
-      <w:bookmarkStart w:id="2" w:name="_Toc242182621"/>
+      <w:bookmarkStart w:id="2" w:name="_Toc242182867"/>
       <w:r>
         <w:lastRenderedPageBreak/>
         <w:t>RESUMEN</w:t>
@@ -12564,7 +12564,7 @@
         <w:pStyle w:val="Heading1"/>
       </w:pPr>
       <w:bookmarkStart w:id="3" w:name="_Toc241062251"/>
-      <w:bookmarkStart w:id="4" w:name="_Toc242182622"/>
+      <w:bookmarkStart w:id="4" w:name="_Toc242182868"/>
       <w:r>
         <w:t>CAPÍTULO 1: Introducción</w:t>
       </w:r>
@@ -12597,7 +12597,7 @@
         <w:pStyle w:val="Heading2"/>
       </w:pPr>
       <w:bookmarkStart w:id="6" w:name="_Toc241062252"/>
-      <w:bookmarkStart w:id="7" w:name="_Toc242182623"/>
+      <w:bookmarkStart w:id="7" w:name="_Toc242182869"/>
       <w:r>
         <w:t>1.1 Contexto del problema</w:t>
       </w:r>
@@ -12658,7 +12658,7 @@
         <w:pStyle w:val="Heading2"/>
       </w:pPr>
       <w:bookmarkStart w:id="8" w:name="_Toc241062253"/>
-      <w:bookmarkStart w:id="9" w:name="_Toc242182624"/>
+      <w:bookmarkStart w:id="9" w:name="_Toc242182870"/>
       <w:r>
         <w:t>1.2 Planteamiento del problema</w:t>
       </w:r>
@@ -12756,7 +12756,7 @@
         <w:pStyle w:val="Heading2"/>
       </w:pPr>
       <w:bookmarkStart w:id="10" w:name="_Toc241062254"/>
-      <w:bookmarkStart w:id="11" w:name="_Toc242182625"/>
+      <w:bookmarkStart w:id="11" w:name="_Toc242182871"/>
       <w:r>
         <w:t>1.3 Justificación</w:t>
       </w:r>
@@ -12835,7 +12835,7 @@
         <w:pStyle w:val="Heading2"/>
       </w:pPr>
       <w:bookmarkStart w:id="12" w:name="_Toc241062255"/>
-      <w:bookmarkStart w:id="13" w:name="_Toc242182626"/>
+      <w:bookmarkStart w:id="13" w:name="_Toc242182872"/>
       <w:r>
         <w:t>1.4 Objetivos</w:t>
       </w:r>
@@ -12855,7 +12855,7 @@
         <w:pStyle w:val="Heading3"/>
       </w:pPr>
       <w:bookmarkStart w:id="14" w:name="_Toc241062256"/>
-      <w:bookmarkStart w:id="15" w:name="_Toc242182627"/>
+      <w:bookmarkStart w:id="15" w:name="_Toc242182873"/>
       <w:r>
         <w:t>1.4.1 Objetivo General</w:t>
       </w:r>
@@ -12875,7 +12875,7 @@
         <w:pStyle w:val="Heading3"/>
       </w:pPr>
       <w:bookmarkStart w:id="16" w:name="_Toc241062257"/>
-      <w:bookmarkStart w:id="17" w:name="_Toc242182628"/>
+      <w:bookmarkStart w:id="17" w:name="_Toc242182874"/>
       <w:r>
         <w:t>1.4.2 Objetivos Específicos</w:t>
       </w:r>
@@ -13006,7 +13006,7 @@
         <w:pStyle w:val="Heading2"/>
       </w:pPr>
       <w:bookmarkStart w:id="18" w:name="_Toc241062258"/>
-      <w:bookmarkStart w:id="19" w:name="_Toc242182629"/>
+      <w:bookmarkStart w:id="19" w:name="_Toc242182875"/>
       <w:r>
         <w:t>1.5 Alcance y Limitaciones</w:t>
       </w:r>
@@ -13026,7 +13026,7 @@
         <w:pStyle w:val="Heading3"/>
       </w:pPr>
       <w:bookmarkStart w:id="20" w:name="_Toc241062259"/>
-      <w:bookmarkStart w:id="21" w:name="_Toc242182630"/>
+      <w:bookmarkStart w:id="21" w:name="_Toc242182876"/>
       <w:r>
         <w:t>1.5.1 Alcance del Proyecto</w:t>
       </w:r>
@@ -13190,7 +13190,7 @@
         </w:rPr>
       </w:pPr>
       <w:bookmarkStart w:id="22" w:name="_Toc241062260"/>
-      <w:bookmarkStart w:id="23" w:name="_Toc242182631"/>
+      <w:bookmarkStart w:id="23" w:name="_Toc242182877"/>
       <w:r>
         <w:t>1.5.2 Limitaciones del Proyecto</w:t>
       </w:r>
@@ -13336,7 +13336,7 @@
         <w:pStyle w:val="Heading2"/>
       </w:pPr>
       <w:bookmarkStart w:id="24" w:name="_Toc241062261"/>
-      <w:bookmarkStart w:id="25" w:name="_Toc242182632"/>
+      <w:bookmarkStart w:id="25" w:name="_Toc242182878"/>
       <w:r>
         <w:t>1.6 Estado del Arte: Análisis de Soluciones y Vacío Tecnológico</w:t>
       </w:r>
@@ -13361,7 +13361,7 @@
         <w:pStyle w:val="Heading3"/>
       </w:pPr>
       <w:bookmarkStart w:id="26" w:name="_Toc241062262"/>
-      <w:bookmarkStart w:id="27" w:name="_Toc242182633"/>
+      <w:bookmarkStart w:id="27" w:name="_Toc242182879"/>
       <w:r>
         <w:lastRenderedPageBreak/>
         <w:t>1.6.0 Antecedentes académicos</w:t>
@@ -13411,7 +13411,7 @@
         <w:spacing w:before="0" w:line="276" w:lineRule="auto"/>
       </w:pPr>
       <w:bookmarkStart w:id="28" w:name="_Toc241062263"/>
-      <w:bookmarkStart w:id="29" w:name="_Toc242182634"/>
+      <w:bookmarkStart w:id="29" w:name="_Toc242182880"/>
       <w:r>
         <w:t>1.6.1 Sistemas Tradicionales de Gestión de Redes Sociales (SMMS)</w:t>
       </w:r>
@@ -13455,7 +13455,7 @@
         <w:spacing w:before="0" w:line="276" w:lineRule="auto"/>
       </w:pPr>
       <w:bookmarkStart w:id="30" w:name="_Toc241062264"/>
-      <w:bookmarkStart w:id="31" w:name="_Toc242182635"/>
+      <w:bookmarkStart w:id="31" w:name="_Toc242182881"/>
       <w:r>
         <w:t>1.6.2 Plataformas Genéricas de Automatización (iPaaS)</w:t>
       </w:r>
@@ -13491,7 +13491,7 @@
         <w:spacing w:before="0" w:line="276" w:lineRule="auto"/>
       </w:pPr>
       <w:bookmarkStart w:id="32" w:name="_Toc241062265"/>
-      <w:bookmarkStart w:id="33" w:name="_Toc242182636"/>
+      <w:bookmarkStart w:id="33" w:name="_Toc242182882"/>
       <w:r>
         <w:t>1.6.3 El Vacío Tecnológico y la Propuesta de Valor de Postly</w:t>
       </w:r>
@@ -13514,7 +13514,7 @@
       <w:pPr>
         <w:keepNext/>
       </w:pPr>
-      <w:bookmarkStart w:id="34" w:name="_Toc242182761"/>
+      <w:bookmarkStart w:id="34" w:name="_Toc242183007"/>
       <w:r>
         <w:rPr>
           <w:b/>
@@ -14613,7 +14613,7 @@
         <w:pStyle w:val="Heading1"/>
       </w:pPr>
       <w:bookmarkStart w:id="35" w:name="_Toc241062266"/>
-      <w:bookmarkStart w:id="36" w:name="_Toc242182637"/>
+      <w:bookmarkStart w:id="36" w:name="_Toc242182883"/>
       <w:r>
         <w:t>CAPÍTULO 2: MARCO TEÓRICO</w:t>
       </w:r>
@@ -14642,7 +14642,7 @@
         <w:pStyle w:val="Heading2"/>
       </w:pPr>
       <w:bookmarkStart w:id="37" w:name="_Toc241062267"/>
-      <w:bookmarkStart w:id="38" w:name="_Toc242182638"/>
+      <w:bookmarkStart w:id="38" w:name="_Toc242182884"/>
       <w:r>
         <w:t>2.1 Automatización de Procesos de Negocio (BPA) y n8n</w:t>
       </w:r>
@@ -14744,7 +14744,7 @@
         <w:pStyle w:val="Heading2"/>
       </w:pPr>
       <w:bookmarkStart w:id="39" w:name="_Toc241062268"/>
-      <w:bookmarkStart w:id="40" w:name="_Toc242182639"/>
+      <w:bookmarkStart w:id="40" w:name="_Toc242182885"/>
       <w:r>
         <w:t>2.2 Modelos de Lenguaje de Gran Escala (LLM) y Multimodalidad</w:t>
       </w:r>
@@ -14834,7 +14834,7 @@
         <w:pStyle w:val="Heading2"/>
       </w:pPr>
       <w:bookmarkStart w:id="41" w:name="_Toc241062269"/>
-      <w:bookmarkStart w:id="42" w:name="_Toc242182640"/>
+      <w:bookmarkStart w:id="42" w:name="_Toc242182886"/>
       <w:r>
         <w:lastRenderedPageBreak/>
         <w:t>2.3 Arquitectura de Integración mediante APIs y Webhooks</w:t>
@@ -15224,7 +15224,7 @@
         <w:keepNext/>
         <w:jc w:val="center"/>
       </w:pPr>
-      <w:bookmarkStart w:id="46" w:name="_Toc242182778"/>
+      <w:bookmarkStart w:id="46" w:name="_Toc242183024"/>
       <w:r>
         <w:rPr>
           <w:i/>
@@ -15346,7 +15346,7 @@
         <w:pStyle w:val="Heading2"/>
       </w:pPr>
       <w:bookmarkStart w:id="47" w:name="_Toc241062270"/>
-      <w:bookmarkStart w:id="48" w:name="_Toc242182641"/>
+      <w:bookmarkStart w:id="48" w:name="_Toc242182887"/>
       <w:r>
         <w:lastRenderedPageBreak/>
         <w:t>2.4 Normativas de Marketing y Cumplimiento Corporativo en Venta Directa</w:t>
@@ -15640,7 +15640,7 @@
         <w:pStyle w:val="Heading1"/>
       </w:pPr>
       <w:bookmarkStart w:id="52" w:name="_Toc241062271"/>
-      <w:bookmarkStart w:id="53" w:name="_Toc242182642"/>
+      <w:bookmarkStart w:id="53" w:name="_Toc242182888"/>
       <w:r>
         <w:t>CAPÍTULO 3: MARCO METODOLÓGICO</w:t>
       </w:r>
@@ -15652,7 +15652,7 @@
         <w:pStyle w:val="Heading2"/>
       </w:pPr>
       <w:bookmarkStart w:id="54" w:name="_Toc241062272"/>
-      <w:bookmarkStart w:id="55" w:name="_Toc242182643"/>
+      <w:bookmarkStart w:id="55" w:name="_Toc242182889"/>
       <w:r>
         <w:t>3.1 Tipo de investigación</w:t>
       </w:r>
@@ -15690,7 +15690,7 @@
         <w:pStyle w:val="Heading2"/>
       </w:pPr>
       <w:bookmarkStart w:id="56" w:name="_Toc241062273"/>
-      <w:bookmarkStart w:id="57" w:name="_Toc242182644"/>
+      <w:bookmarkStart w:id="57" w:name="_Toc242182890"/>
       <w:r>
         <w:t>3.2 Enfoque y Diseño de investigación</w:t>
       </w:r>
@@ -15871,7 +15871,7 @@
         <w:pStyle w:val="Heading2"/>
       </w:pPr>
       <w:bookmarkStart w:id="59" w:name="_Toc241062274"/>
-      <w:bookmarkStart w:id="60" w:name="_Toc242182645"/>
+      <w:bookmarkStart w:id="60" w:name="_Toc242182891"/>
       <w:r>
         <w:t>3.3 Metodología de Desarrollo (Agile/Scrum)</w:t>
       </w:r>
@@ -15891,7 +15891,7 @@
         <w:spacing w:before="240" w:after="240" w:line="240" w:lineRule="auto"/>
       </w:pPr>
       <w:bookmarkStart w:id="62" w:name="_Toc241062275"/>
-      <w:bookmarkStart w:id="63" w:name="_Toc242182646"/>
+      <w:bookmarkStart w:id="63" w:name="_Toc242182892"/>
       <w:r>
         <w:t>3.3.1 Marco metodológico de desarrollo</w:t>
       </w:r>
@@ -15922,7 +15922,7 @@
         <w:spacing w:before="240" w:after="240" w:line="240" w:lineRule="auto"/>
       </w:pPr>
       <w:bookmarkStart w:id="64" w:name="_Toc241062276"/>
-      <w:bookmarkStart w:id="65" w:name="_Toc242182647"/>
+      <w:bookmarkStart w:id="65" w:name="_Toc242182893"/>
       <w:r>
         <w:t>3.3.2 Implementación de la metodología: Sprints de desarrollo</w:t>
       </w:r>
@@ -15951,7 +15951,7 @@
         <w:pStyle w:val="Heading3"/>
         <w:spacing w:before="240" w:after="240" w:line="240" w:lineRule="auto"/>
       </w:pPr>
-      <w:bookmarkStart w:id="66" w:name="_Toc242182648"/>
+      <w:bookmarkStart w:id="66" w:name="_Toc242182894"/>
       <w:r>
         <w:t>3.3.3 Riesgos del proyecto y decisiones de diseño derivadas</w:t>
       </w:r>
@@ -15969,7 +15969,7 @@
       <w:pPr>
         <w:keepNext/>
       </w:pPr>
-      <w:bookmarkStart w:id="67" w:name="_Toc242182762"/>
+      <w:bookmarkStart w:id="67" w:name="_Toc242183008"/>
       <w:r>
         <w:rPr>
           <w:b/>
@@ -16506,7 +16506,7 @@
         <w:pStyle w:val="Heading2"/>
       </w:pPr>
       <w:bookmarkStart w:id="68" w:name="_Toc241062277"/>
-      <w:bookmarkStart w:id="69" w:name="_Toc242182649"/>
+      <w:bookmarkStart w:id="69" w:name="_Toc242182895"/>
       <w:r>
         <w:t>3.4 Técnicas de recolección de datos e instrumentos</w:t>
       </w:r>
@@ -16531,7 +16531,7 @@
         <w:pStyle w:val="Heading3"/>
       </w:pPr>
       <w:bookmarkStart w:id="70" w:name="_Toc241062278"/>
-      <w:bookmarkStart w:id="71" w:name="_Toc242182650"/>
+      <w:bookmarkStart w:id="71" w:name="_Toc242182896"/>
       <w:r>
         <w:t>3.4.1 Recolección de información para el análisis del problema</w:t>
       </w:r>
@@ -16615,7 +16615,7 @@
         <w:pStyle w:val="Heading3"/>
       </w:pPr>
       <w:bookmarkStart w:id="72" w:name="_Toc241062279"/>
-      <w:bookmarkStart w:id="73" w:name="_Toc242182651"/>
+      <w:bookmarkStart w:id="73" w:name="_Toc242182897"/>
       <w:r>
         <w:t>3.4.2 Técnicas de validación técnica del sistema</w:t>
       </w:r>
@@ -16757,7 +16757,7 @@
         <w:pStyle w:val="Heading3"/>
       </w:pPr>
       <w:bookmarkStart w:id="74" w:name="_Toc241062280"/>
-      <w:bookmarkStart w:id="75" w:name="_Toc242182652"/>
+      <w:bookmarkStart w:id="75" w:name="_Toc242182898"/>
       <w:r>
         <w:t>3.4.3 Limitaciones y alcance de la recolección de datos</w:t>
       </w:r>
@@ -16793,7 +16793,7 @@
         <w:pStyle w:val="Heading2"/>
       </w:pPr>
       <w:bookmarkStart w:id="76" w:name="_Toc241062281"/>
-      <w:bookmarkStart w:id="77" w:name="_Toc242182653"/>
+      <w:bookmarkStart w:id="77" w:name="_Toc242182899"/>
       <w:r>
         <w:lastRenderedPageBreak/>
         <w:t>3.5 Población, Muestra y Diseño de la Evaluación</w:t>
@@ -16819,7 +16819,7 @@
         <w:pStyle w:val="Heading3"/>
       </w:pPr>
       <w:bookmarkStart w:id="78" w:name="_Toc241062282"/>
-      <w:bookmarkStart w:id="79" w:name="_Toc242182654"/>
+      <w:bookmarkStart w:id="79" w:name="_Toc242182900"/>
       <w:r>
         <w:t>3.5.1 Población objetivo</w:t>
       </w:r>
@@ -16852,7 +16852,7 @@
         <w:pStyle w:val="Heading3"/>
       </w:pPr>
       <w:bookmarkStart w:id="80" w:name="_Toc241062283"/>
-      <w:bookmarkStart w:id="81" w:name="_Toc242182655"/>
+      <w:bookmarkStart w:id="81" w:name="_Toc242182901"/>
       <w:r>
         <w:t>3.5.2 Definición de la muestra</w:t>
       </w:r>
@@ -16893,7 +16893,7 @@
         <w:pStyle w:val="Heading3"/>
       </w:pPr>
       <w:bookmarkStart w:id="82" w:name="_Toc241062284"/>
-      <w:bookmarkStart w:id="83" w:name="_Toc242182656"/>
+      <w:bookmarkStart w:id="83" w:name="_Toc242182902"/>
       <w:r>
         <w:t>3.5.3 Consideraciones sobre el tamaño muestral</w:t>
       </w:r>
@@ -16928,7 +16928,7 @@
         <w:pStyle w:val="Heading3"/>
       </w:pPr>
       <w:bookmarkStart w:id="84" w:name="_Toc241062285"/>
-      <w:bookmarkStart w:id="85" w:name="_Toc242182657"/>
+      <w:bookmarkStart w:id="85" w:name="_Toc242182903"/>
       <w:r>
         <w:t>3.5.4 Variables e instrumentos de medición</w:t>
       </w:r>
@@ -16965,7 +16965,7 @@
         <w:pStyle w:val="Heading3"/>
       </w:pPr>
       <w:bookmarkStart w:id="86" w:name="_Toc241062286"/>
-      <w:bookmarkStart w:id="87" w:name="_Toc242182658"/>
+      <w:bookmarkStart w:id="87" w:name="_Toc242182904"/>
       <w:r>
         <w:lastRenderedPageBreak/>
         <w:t>3.5.5 Amenazas a la validez</w:t>
@@ -17032,7 +17032,7 @@
         <w:pStyle w:val="Heading2"/>
       </w:pPr>
       <w:bookmarkStart w:id="88" w:name="_Toc241062287"/>
-      <w:bookmarkStart w:id="89" w:name="_Toc242182659"/>
+      <w:bookmarkStart w:id="89" w:name="_Toc242182905"/>
       <w:r>
         <w:t>3.6 Herramientas y Tecnologías Seleccionadas</w:t>
       </w:r>
@@ -17065,7 +17065,7 @@
         <w:pStyle w:val="Heading3"/>
       </w:pPr>
       <w:bookmarkStart w:id="90" w:name="_Toc241062288"/>
-      <w:bookmarkStart w:id="91" w:name="_Toc242182660"/>
+      <w:bookmarkStart w:id="91" w:name="_Toc242182906"/>
       <w:r>
         <w:t>3.6.1 Motor de automatización: n8n</w:t>
       </w:r>
@@ -17098,7 +17098,7 @@
         <w:pStyle w:val="Heading3"/>
       </w:pPr>
       <w:bookmarkStart w:id="92" w:name="_Toc241062289"/>
-      <w:bookmarkStart w:id="93" w:name="_Toc242182661"/>
+      <w:bookmarkStart w:id="93" w:name="_Toc242182907"/>
       <w:r>
         <w:lastRenderedPageBreak/>
         <w:t>3.6.2 Modelo multimodal, integraciones y arquitectura</w:t>
@@ -17148,7 +17148,7 @@
         <w:spacing w:before="280"/>
       </w:pPr>
       <w:bookmarkStart w:id="94" w:name="_Toc241062290"/>
-      <w:bookmarkStart w:id="95" w:name="_Toc242182662"/>
+      <w:bookmarkStart w:id="95" w:name="_Toc242182908"/>
       <w:r>
         <w:t>3.7 Consideraciones éticas y legales</w:t>
       </w:r>
@@ -17183,7 +17183,7 @@
         <w:pStyle w:val="Heading3"/>
       </w:pPr>
       <w:bookmarkStart w:id="96" w:name="_Toc241062291"/>
-      <w:bookmarkStart w:id="97" w:name="_Toc242182663"/>
+      <w:bookmarkStart w:id="97" w:name="_Toc242182909"/>
       <w:r>
         <w:t>3.7.1 Protección de datos personales y Privacidad desde el Diseño</w:t>
       </w:r>
@@ -17233,7 +17233,7 @@
         <w:pStyle w:val="Heading3"/>
       </w:pPr>
       <w:bookmarkStart w:id="98" w:name="_Toc241062292"/>
-      <w:bookmarkStart w:id="99" w:name="_Toc242182664"/>
+      <w:bookmarkStart w:id="99" w:name="_Toc242182910"/>
       <w:r>
         <w:t>3.7.2 Seguridad en la autenticación, acceso y soberanía</w:t>
       </w:r>
@@ -17271,7 +17271,7 @@
         <w:pStyle w:val="Heading3"/>
       </w:pPr>
       <w:bookmarkStart w:id="100" w:name="_Toc241062293"/>
-      <w:bookmarkStart w:id="101" w:name="_Toc242182665"/>
+      <w:bookmarkStart w:id="101" w:name="_Toc242182911"/>
       <w:r>
         <w:t>3.7.3 Ética en la Inteligencia Artificial (</w:t>
       </w:r>
@@ -17319,7 +17319,7 @@
         <w:pStyle w:val="Heading3"/>
       </w:pPr>
       <w:bookmarkStart w:id="102" w:name="_Toc241062294"/>
-      <w:bookmarkStart w:id="103" w:name="_Toc242182666"/>
+      <w:bookmarkStart w:id="103" w:name="_Toc242182912"/>
       <w:r>
         <w:t>3.7.4 Auditoría de compliance y exposición de la consultora ante la normativa de la marca</w:t>
       </w:r>
@@ -17355,7 +17355,7 @@
         <w:pStyle w:val="Heading3"/>
       </w:pPr>
       <w:bookmarkStart w:id="104" w:name="_Toc241062295"/>
-      <w:bookmarkStart w:id="105" w:name="_Toc242182667"/>
+      <w:bookmarkStart w:id="105" w:name="_Toc242182913"/>
       <w:r>
         <w:t>3.7.5 Responsabilidad en la automatización y uso indebido</w:t>
       </w:r>
@@ -17375,7 +17375,7 @@
         <w:pStyle w:val="Heading3"/>
       </w:pPr>
       <w:bookmarkStart w:id="106" w:name="_Toc241062296"/>
-      <w:bookmarkStart w:id="107" w:name="_Toc242182668"/>
+      <w:bookmarkStart w:id="107" w:name="_Toc242182914"/>
       <w:r>
         <w:t>3.7.6 Ética de la investigación</w:t>
       </w:r>
@@ -17503,7 +17503,7 @@
         <w:pStyle w:val="Heading1"/>
       </w:pPr>
       <w:bookmarkStart w:id="108" w:name="_Toc241062297"/>
-      <w:bookmarkStart w:id="109" w:name="_Toc242182669"/>
+      <w:bookmarkStart w:id="109" w:name="_Toc242182915"/>
       <w:r>
         <w:t>CAPÍTULO 4: DESARROLLO DEL ESTUDIO</w:t>
       </w:r>
@@ -17522,7 +17522,7 @@
         <w:pStyle w:val="Heading2"/>
       </w:pPr>
       <w:bookmarkStart w:id="110" w:name="_Toc241062298"/>
-      <w:bookmarkStart w:id="111" w:name="_Toc242182670"/>
+      <w:bookmarkStart w:id="111" w:name="_Toc242182916"/>
       <w:r>
         <w:t>4.1 Historias de Usuario y Criterios de Aceptación</w:t>
       </w:r>
@@ -17566,7 +17566,7 @@
         <w:spacing w:before="360" w:line="240" w:lineRule="auto"/>
       </w:pPr>
       <w:bookmarkStart w:id="112" w:name="_Toc241062299"/>
-      <w:bookmarkStart w:id="113" w:name="_Toc242182671"/>
+      <w:bookmarkStart w:id="113" w:name="_Toc242182917"/>
       <w:r>
         <w:t>4.1.1 Módulo A: Seguridad, Onboarding y Autenticación</w:t>
       </w:r>
@@ -17983,7 +17983,7 @@
         <w:spacing w:before="0" w:line="276" w:lineRule="auto"/>
       </w:pPr>
       <w:bookmarkStart w:id="114" w:name="_Toc241062300"/>
-      <w:bookmarkStart w:id="115" w:name="_Toc242182672"/>
+      <w:bookmarkStart w:id="115" w:name="_Toc242182918"/>
       <w:r>
         <w:t>4.1.2 Módulo B: Creación de Contenido Asistida por IA</w:t>
       </w:r>
@@ -18398,7 +18398,7 @@
         <w:spacing w:before="0" w:line="276" w:lineRule="auto"/>
       </w:pPr>
       <w:bookmarkStart w:id="116" w:name="_Toc241062301"/>
-      <w:bookmarkStart w:id="117" w:name="_Toc242182673"/>
+      <w:bookmarkStart w:id="117" w:name="_Toc242182919"/>
       <w:r>
         <w:t>4.1.3 Módulo C: Auditoría de Compliance (Módulo Centinela)</w:t>
       </w:r>
@@ -18777,7 +18777,7 @@
         <w:spacing w:before="0" w:line="276" w:lineRule="auto"/>
       </w:pPr>
       <w:bookmarkStart w:id="118" w:name="_Toc241062302"/>
-      <w:bookmarkStart w:id="119" w:name="_Toc242182674"/>
+      <w:bookmarkStart w:id="119" w:name="_Toc242182920"/>
       <w:r>
         <w:t>4.1.4 Módulo D: Gestión de Publicación y Agenda</w:t>
       </w:r>
@@ -18937,7 +18937,7 @@
         <w:keepNext/>
         <w:jc w:val="center"/>
       </w:pPr>
-      <w:bookmarkStart w:id="120" w:name="_Toc242182779"/>
+      <w:bookmarkStart w:id="120" w:name="_Toc242183025"/>
       <w:r>
         <w:rPr>
           <w:i/>
@@ -19292,7 +19292,7 @@
         <w:spacing w:before="0" w:line="276" w:lineRule="auto"/>
       </w:pPr>
       <w:bookmarkStart w:id="121" w:name="_Toc241062303"/>
-      <w:bookmarkStart w:id="122" w:name="_Toc242182675"/>
+      <w:bookmarkStart w:id="122" w:name="_Toc242182921"/>
       <w:r>
         <w:t>4.1.5 Módulo E: Procesamiento Multimedia y Analítica de Datos</w:t>
       </w:r>
@@ -19558,7 +19558,7 @@
         <w:pStyle w:val="Heading2"/>
       </w:pPr>
       <w:bookmarkStart w:id="123" w:name="_Toc241062304"/>
-      <w:bookmarkStart w:id="124" w:name="_Toc242182676"/>
+      <w:bookmarkStart w:id="124" w:name="_Toc242182922"/>
       <w:r>
         <w:t>4.2 Definición del Producto Mínimo Viable (MVP)</w:t>
       </w:r>
@@ -19587,7 +19587,7 @@
           <w:lang w:val="en-US"/>
         </w:rPr>
       </w:pPr>
-      <w:bookmarkStart w:id="125" w:name="_Toc242182780"/>
+      <w:bookmarkStart w:id="125" w:name="_Toc242183026"/>
       <w:r>
         <w:rPr>
           <w:i/>
@@ -19872,7 +19872,7 @@
         <w:pStyle w:val="Heading2"/>
       </w:pPr>
       <w:bookmarkStart w:id="126" w:name="_Toc241062305"/>
-      <w:bookmarkStart w:id="127" w:name="_Toc242182677"/>
+      <w:bookmarkStart w:id="127" w:name="_Toc242182923"/>
       <w:r>
         <w:t>4.3 Implementación de Lógica de Auditoría y Compliance</w:t>
       </w:r>
@@ -19914,7 +19914,7 @@
         <w:spacing w:before="0" w:line="276" w:lineRule="auto"/>
       </w:pPr>
       <w:bookmarkStart w:id="128" w:name="_Toc241062306"/>
-      <w:bookmarkStart w:id="129" w:name="_Toc242182678"/>
+      <w:bookmarkStart w:id="129" w:name="_Toc242182924"/>
       <w:r>
         <w:t>4.3.1 Detección Multimodal de Precios y Restricciones Comerciales</w:t>
       </w:r>
@@ -20038,7 +20038,7 @@
         <w:spacing w:before="0" w:line="276" w:lineRule="auto"/>
       </w:pPr>
       <w:bookmarkStart w:id="130" w:name="_Toc241062307"/>
-      <w:bookmarkStart w:id="131" w:name="_Toc242182679"/>
+      <w:bookmarkStart w:id="131" w:name="_Toc242182925"/>
       <w:r>
         <w:t>4.3.2 Automatización de Identidad y Transparencia Corporativa</w:t>
       </w:r>
@@ -20106,7 +20106,7 @@
         <w:spacing w:before="0" w:line="276" w:lineRule="auto"/>
       </w:pPr>
       <w:bookmarkStart w:id="132" w:name="_Toc241062308"/>
-      <w:bookmarkStart w:id="133" w:name="_Toc242182680"/>
+      <w:bookmarkStart w:id="133" w:name="_Toc242182926"/>
       <w:r>
         <w:t>4.4 Procesamiento Multimedia y Optimización de Archivos</w:t>
       </w:r>
@@ -20136,7 +20136,7 @@
         <w:spacing w:before="0" w:line="276" w:lineRule="auto"/>
       </w:pPr>
       <w:bookmarkStart w:id="135" w:name="_Toc241062309"/>
-      <w:bookmarkStart w:id="136" w:name="_Toc242182681"/>
+      <w:bookmarkStart w:id="136" w:name="_Toc242182927"/>
       <w:r>
         <w:t>4.4.1 Integración de FFmpeg y Normalización de Formatos</w:t>
       </w:r>
@@ -20166,7 +20166,7 @@
         <w:spacing w:before="0" w:line="276" w:lineRule="auto"/>
       </w:pPr>
       <w:bookmarkStart w:id="138" w:name="_Toc241062310"/>
-      <w:bookmarkStart w:id="139" w:name="_Toc242182682"/>
+      <w:bookmarkStart w:id="139" w:name="_Toc242182928"/>
       <w:r>
         <w:t>4.4.2 Tratamiento de Imágenes para Carruseles y Feeds</w:t>
       </w:r>
@@ -20243,7 +20243,7 @@
         <w:spacing w:before="0" w:line="276" w:lineRule="auto"/>
       </w:pPr>
       <w:bookmarkStart w:id="141" w:name="_Toc241062311"/>
-      <w:bookmarkStart w:id="142" w:name="_Toc242182683"/>
+      <w:bookmarkStart w:id="142" w:name="_Toc242182929"/>
       <w:r>
         <w:t>4.4.3 Validación y Tratamiento de Video (Reels)</w:t>
       </w:r>
@@ -20406,7 +20406,7 @@
         <w:spacing w:before="0" w:line="276" w:lineRule="auto"/>
       </w:pPr>
       <w:bookmarkStart w:id="143" w:name="_Toc241062312"/>
-      <w:bookmarkStart w:id="144" w:name="_Toc242182684"/>
+      <w:bookmarkStart w:id="144" w:name="_Toc242182930"/>
       <w:r>
         <w:t>CAPÍTULO 5: ARQUITECTURA E INTERFAZ DE VISUALIZACIÓN</w:t>
       </w:r>
@@ -20426,7 +20426,7 @@
         <w:pStyle w:val="Heading2"/>
       </w:pPr>
       <w:bookmarkStart w:id="145" w:name="_Toc241062313"/>
-      <w:bookmarkStart w:id="146" w:name="_Toc242182685"/>
+      <w:bookmarkStart w:id="146" w:name="_Toc242182931"/>
       <w:r>
         <w:t>5.1 Arquitectura del Sistema Postly</w:t>
       </w:r>
@@ -20477,7 +20477,7 @@
         <w:keepNext/>
         <w:jc w:val="center"/>
       </w:pPr>
-      <w:bookmarkStart w:id="147" w:name="_Toc242182781"/>
+      <w:bookmarkStart w:id="147" w:name="_Toc242183027"/>
       <w:r>
         <w:rPr>
           <w:i/>
@@ -20599,7 +20599,7 @@
         <w:pStyle w:val="Heading3"/>
       </w:pPr>
       <w:bookmarkStart w:id="148" w:name="_Toc241062314"/>
-      <w:bookmarkStart w:id="149" w:name="_Toc242182686"/>
+      <w:bookmarkStart w:id="149" w:name="_Toc242182932"/>
       <w:r>
         <w:lastRenderedPageBreak/>
         <w:t>5.1.1 Capas de la arquitectura</w:t>
@@ -20755,7 +20755,7 @@
         <w:keepNext/>
         <w:jc w:val="center"/>
       </w:pPr>
-      <w:bookmarkStart w:id="150" w:name="_Toc242182782"/>
+      <w:bookmarkStart w:id="150" w:name="_Toc242183028"/>
       <w:r>
         <w:rPr>
           <w:i/>
@@ -20911,7 +20911,7 @@
         <w:pStyle w:val="Heading3"/>
       </w:pPr>
       <w:bookmarkStart w:id="151" w:name="_Toc241062315"/>
-      <w:bookmarkStart w:id="152" w:name="_Toc242182687"/>
+      <w:bookmarkStart w:id="152" w:name="_Toc242182933"/>
       <w:r>
         <w:t>5.1.2 Flujo de datos entre componentes</w:t>
       </w:r>
@@ -21135,7 +21135,7 @@
         <w:pStyle w:val="Heading3"/>
       </w:pPr>
       <w:bookmarkStart w:id="153" w:name="_Toc241062316"/>
-      <w:bookmarkStart w:id="154" w:name="_Toc242182688"/>
+      <w:bookmarkStart w:id="154" w:name="_Toc242182934"/>
       <w:r>
         <w:t>5.1.3 Principios de diseño adoptados</w:t>
       </w:r>
@@ -21259,7 +21259,7 @@
         <w:pStyle w:val="Heading3"/>
       </w:pPr>
       <w:bookmarkStart w:id="155" w:name="_Toc241062317"/>
-      <w:bookmarkStart w:id="156" w:name="_Toc242182689"/>
+      <w:bookmarkStart w:id="156" w:name="_Toc242182935"/>
       <w:r>
         <w:lastRenderedPageBreak/>
         <w:t>5.1.4 Consideraciones sobre la evolución arquitectónica</w:t>
@@ -21291,7 +21291,7 @@
         <w:pStyle w:val="Heading2"/>
       </w:pPr>
       <w:bookmarkStart w:id="157" w:name="_Toc241062318"/>
-      <w:bookmarkStart w:id="158" w:name="_Toc242182690"/>
+      <w:bookmarkStart w:id="158" w:name="_Toc242182936"/>
       <w:r>
         <w:t>5.2 Diseño de Flujos de Trabajo en n8n</w:t>
       </w:r>
@@ -21316,7 +21316,7 @@
         <w:pStyle w:val="Heading3"/>
       </w:pPr>
       <w:bookmarkStart w:id="159" w:name="_Toc241062319"/>
-      <w:bookmarkStart w:id="160" w:name="_Toc242182691"/>
+      <w:bookmarkStart w:id="160" w:name="_Toc242182937"/>
       <w:r>
         <w:t>5.2.1 Workflow de Creación y Publicación Inteligente</w:t>
       </w:r>
@@ -21362,7 +21362,7 @@
         <w:keepNext/>
         <w:jc w:val="center"/>
       </w:pPr>
-      <w:bookmarkStart w:id="161" w:name="_Toc242182783"/>
+      <w:bookmarkStart w:id="161" w:name="_Toc242183029"/>
       <w:r>
         <w:rPr>
           <w:i/>
@@ -21526,7 +21526,7 @@
         <w:keepNext/>
         <w:jc w:val="center"/>
       </w:pPr>
-      <w:bookmarkStart w:id="162" w:name="_Toc242182784"/>
+      <w:bookmarkStart w:id="162" w:name="_Toc242183030"/>
       <w:r>
         <w:rPr>
           <w:i/>
@@ -21695,7 +21695,7 @@
         <w:keepNext/>
         <w:jc w:val="center"/>
       </w:pPr>
-      <w:bookmarkStart w:id="163" w:name="_Toc242182785"/>
+      <w:bookmarkStart w:id="163" w:name="_Toc242183031"/>
       <w:r>
         <w:rPr>
           <w:i/>
@@ -21926,7 +21926,7 @@
         <w:keepNext/>
         <w:jc w:val="center"/>
       </w:pPr>
-      <w:bookmarkStart w:id="164" w:name="_Toc242182786"/>
+      <w:bookmarkStart w:id="164" w:name="_Toc242183032"/>
       <w:r>
         <w:rPr>
           <w:i/>
@@ -22041,7 +22041,7 @@
         <w:keepNext/>
         <w:jc w:val="center"/>
       </w:pPr>
-      <w:bookmarkStart w:id="165" w:name="_Toc242182787"/>
+      <w:bookmarkStart w:id="165" w:name="_Toc242183033"/>
       <w:r>
         <w:rPr>
           <w:i/>
@@ -22170,7 +22170,7 @@
           <w:sz w:val="20"/>
         </w:rPr>
       </w:pPr>
-      <w:bookmarkStart w:id="166" w:name="_Toc242182788"/>
+      <w:bookmarkStart w:id="166" w:name="_Toc242183034"/>
       <w:r>
         <w:rPr>
           <w:i/>
@@ -22295,7 +22295,7 @@
       <w:pPr>
         <w:pStyle w:val="Heading3"/>
       </w:pPr>
-      <w:bookmarkStart w:id="168" w:name="_Toc242182692"/>
+      <w:bookmarkStart w:id="168" w:name="_Toc242182938"/>
       <w:r>
         <w:t>5.2.2 Workflow de Gestión de Agenda y Estados</w:t>
       </w:r>
@@ -22396,7 +22396,7 @@
         <w:pStyle w:val="Heading3"/>
       </w:pPr>
       <w:bookmarkStart w:id="169" w:name="_Toc241062321"/>
-      <w:bookmarkStart w:id="170" w:name="_Toc242182693"/>
+      <w:bookmarkStart w:id="170" w:name="_Toc242182939"/>
       <w:r>
         <w:t>5.2.3 Workflow de Configuración y Tutorial de Vinculación</w:t>
       </w:r>
@@ -22515,7 +22515,7 @@
         <w:pStyle w:val="Heading2"/>
       </w:pPr>
       <w:bookmarkStart w:id="171" w:name="_Toc241062322"/>
-      <w:bookmarkStart w:id="172" w:name="_Toc242182694"/>
+      <w:bookmarkStart w:id="172" w:name="_Toc242182940"/>
       <w:r>
         <w:t>5.3 Diseño de la Experiencia de Usuario (User Journey)</w:t>
       </w:r>
@@ -22648,7 +22648,7 @@
         <w:spacing w:before="0" w:line="276" w:lineRule="auto"/>
       </w:pPr>
       <w:bookmarkStart w:id="173" w:name="_Toc241062323"/>
-      <w:bookmarkStart w:id="174" w:name="_Toc242182695"/>
+      <w:bookmarkStart w:id="174" w:name="_Toc242182941"/>
       <w:r>
         <w:t>CAPÍTULO 6: RESULTADOS</w:t>
       </w:r>
@@ -22695,7 +22695,7 @@
         <w:spacing w:before="0" w:line="276" w:lineRule="auto"/>
       </w:pPr>
       <w:bookmarkStart w:id="175" w:name="_Toc241062324"/>
-      <w:bookmarkStart w:id="176" w:name="_Toc242182696"/>
+      <w:bookmarkStart w:id="176" w:name="_Toc242182942"/>
       <w:r>
         <w:t>6.1 Validación empírica del artefacto</w:t>
       </w:r>
@@ -22766,7 +22766,7 @@
         <w:spacing w:before="360" w:line="240" w:lineRule="auto"/>
       </w:pPr>
       <w:bookmarkStart w:id="177" w:name="_Toc241062325"/>
-      <w:bookmarkStart w:id="178" w:name="_Toc242182697"/>
+      <w:bookmarkStart w:id="178" w:name="_Toc242182943"/>
       <w:r>
         <w:t>6.1.1 Validación empírica del Módulo Centinela</w:t>
       </w:r>
@@ -22831,7 +22831,7 @@
           <w:i/>
         </w:rPr>
       </w:pPr>
-      <w:bookmarkStart w:id="179" w:name="_Toc242182763"/>
+      <w:bookmarkStart w:id="179" w:name="_Toc242183009"/>
       <w:r>
         <w:rPr>
           <w:b/>
@@ -23067,7 +23067,7 @@
       <w:pPr>
         <w:keepNext/>
       </w:pPr>
-      <w:bookmarkStart w:id="180" w:name="_Toc242182764"/>
+      <w:bookmarkStart w:id="180" w:name="_Toc242183010"/>
       <w:r>
         <w:rPr>
           <w:b/>
@@ -23412,7 +23412,7 @@
         <w:keepNext/>
         <w:jc w:val="center"/>
       </w:pPr>
-      <w:bookmarkStart w:id="181" w:name="_Toc242182789"/>
+      <w:bookmarkStart w:id="181" w:name="_Toc242183035"/>
       <w:r>
         <w:rPr>
           <w:i/>
@@ -23550,7 +23550,7 @@
         <w:keepNext/>
         <w:jc w:val="center"/>
       </w:pPr>
-      <w:bookmarkStart w:id="182" w:name="_Toc242182790"/>
+      <w:bookmarkStart w:id="182" w:name="_Toc242183036"/>
       <w:r>
         <w:rPr>
           <w:i/>
@@ -23692,7 +23692,7 @@
         <w:keepNext/>
         <w:jc w:val="center"/>
       </w:pPr>
-      <w:bookmarkStart w:id="183" w:name="_Toc242182791"/>
+      <w:bookmarkStart w:id="183" w:name="_Toc242183037"/>
       <w:r>
         <w:rPr>
           <w:i/>
@@ -23835,7 +23835,7 @@
           <w:sz w:val="20"/>
         </w:rPr>
       </w:pPr>
-      <w:bookmarkStart w:id="184" w:name="_Toc242182792"/>
+      <w:bookmarkStart w:id="184" w:name="_Toc242183038"/>
       <w:r>
         <w:rPr>
           <w:i/>
@@ -23985,7 +23985,7 @@
         <w:spacing w:before="360" w:line="240" w:lineRule="auto"/>
       </w:pPr>
       <w:bookmarkStart w:id="185" w:name="_Toc241062326"/>
-      <w:bookmarkStart w:id="186" w:name="_Toc242182698"/>
+      <w:bookmarkStart w:id="186" w:name="_Toc242182944"/>
       <w:r>
         <w:t>6.1.2 Conjunto ampliado del canal de imagen (HU8)</w:t>
       </w:r>
@@ -24044,7 +24044,7 @@
         <w:spacing w:before="360" w:line="240" w:lineRule="auto"/>
       </w:pPr>
       <w:bookmarkStart w:id="187" w:name="_Toc241062327"/>
-      <w:bookmarkStart w:id="188" w:name="_Toc242182699"/>
+      <w:bookmarkStart w:id="188" w:name="_Toc242182945"/>
       <w:r>
         <w:t>6.1.3 Validación con contenido real y evaluación externa</w:t>
       </w:r>
@@ -24071,7 +24071,7 @@
       <w:pPr>
         <w:keepNext/>
       </w:pPr>
-      <w:bookmarkStart w:id="189" w:name="_Toc242182765"/>
+      <w:bookmarkStart w:id="189" w:name="_Toc242183011"/>
       <w:r>
         <w:rPr>
           <w:b/>
@@ -24561,7 +24561,7 @@
         <w:spacing w:before="360" w:line="240" w:lineRule="auto"/>
       </w:pPr>
       <w:bookmarkStart w:id="190" w:name="_Toc241062328"/>
-      <w:bookmarkStart w:id="191" w:name="_Toc242182700"/>
+      <w:bookmarkStart w:id="191" w:name="_Toc242182946"/>
       <w:r>
         <w:t>6.1.4 Análisis de valores límite y refinamiento del detector</w:t>
       </w:r>
@@ -24624,7 +24624,7 @@
       <w:pPr>
         <w:keepNext/>
       </w:pPr>
-      <w:bookmarkStart w:id="192" w:name="_Toc242182766"/>
+      <w:bookmarkStart w:id="192" w:name="_Toc242183012"/>
       <w:r>
         <w:rPr>
           <w:b/>
@@ -25441,7 +25441,7 @@
         <w:spacing w:before="360" w:line="240" w:lineRule="auto"/>
       </w:pPr>
       <w:bookmarkStart w:id="193" w:name="_Toc241062329"/>
-      <w:bookmarkStart w:id="194" w:name="_Toc242182701"/>
+      <w:bookmarkStart w:id="194" w:name="_Toc242182947"/>
       <w:r>
         <w:t>6.1.5 Baterías de validación técnica del sistema</w:t>
       </w:r>
@@ -25476,7 +25476,7 @@
         <w:spacing w:before="360" w:line="240" w:lineRule="auto"/>
       </w:pPr>
       <w:bookmarkStart w:id="195" w:name="_Toc241062330"/>
-      <w:bookmarkStart w:id="196" w:name="_Toc242182702"/>
+      <w:bookmarkStart w:id="196" w:name="_Toc242182948"/>
       <w:r>
         <w:t>6.1.6 Reducción del tiempo operativo y contraste de la hipótesis</w:t>
       </w:r>
@@ -25514,7 +25514,7 @@
           <w:i/>
         </w:rPr>
       </w:pPr>
-      <w:bookmarkStart w:id="197" w:name="_Toc242182767"/>
+      <w:bookmarkStart w:id="197" w:name="_Toc242183013"/>
       <w:r>
         <w:rPr>
           <w:b/>
@@ -26190,7 +26190,7 @@
         <w:spacing w:before="360" w:line="240" w:lineRule="auto"/>
       </w:pPr>
       <w:bookmarkStart w:id="198" w:name="_Toc241062331"/>
-      <w:bookmarkStart w:id="199" w:name="_Toc242182703"/>
+      <w:bookmarkStart w:id="199" w:name="_Toc242182949"/>
       <w:r>
         <w:t>6.1.7 Aceptación de las usuarias (Modelo TAM)</w:t>
       </w:r>
@@ -26209,7 +26209,7 @@
       <w:pPr>
         <w:keepNext/>
       </w:pPr>
-      <w:bookmarkStart w:id="200" w:name="_Toc242182768"/>
+      <w:bookmarkStart w:id="200" w:name="_Toc242183014"/>
       <w:r>
         <w:rPr>
           <w:b/>
@@ -26470,7 +26470,7 @@
         <w:pStyle w:val="Heading3"/>
         <w:spacing w:before="360" w:line="240" w:lineRule="auto"/>
       </w:pPr>
-      <w:bookmarkStart w:id="201" w:name="_Toc242182704"/>
+      <w:bookmarkStart w:id="201" w:name="_Toc242182950"/>
       <w:r>
         <w:t>6.1.8 Evaluación externa de la calidad del copy y del orden de carrusel (OE2)</w:t>
       </w:r>
@@ -26492,7 +26492,7 @@
         <w:spacing w:before="0" w:line="276" w:lineRule="auto"/>
       </w:pPr>
       <w:bookmarkStart w:id="202" w:name="_Toc241062332"/>
-      <w:bookmarkStart w:id="203" w:name="_Toc242182705"/>
+      <w:bookmarkStart w:id="203" w:name="_Toc242182951"/>
       <w:r>
         <w:t>6.2 Desafíos de Integración y Lecciones Aprendidas</w:t>
       </w:r>
@@ -26613,7 +26613,7 @@
         <w:pStyle w:val="Heading1"/>
       </w:pPr>
       <w:bookmarkStart w:id="204" w:name="_Toc241062334"/>
-      <w:bookmarkStart w:id="205" w:name="_Toc242182706"/>
+      <w:bookmarkStart w:id="205" w:name="_Toc242182952"/>
       <w:r>
         <w:t>CAPÍTULO 7: DISCUSIÓN</w:t>
       </w:r>
@@ -26631,7 +26631,7 @@
         <w:spacing w:after="240" w:line="276" w:lineRule="auto"/>
       </w:pPr>
       <w:bookmarkStart w:id="206" w:name="_Toc241062335"/>
-      <w:bookmarkStart w:id="207" w:name="_Toc242182707"/>
+      <w:bookmarkStart w:id="207" w:name="_Toc242182953"/>
       <w:r>
         <w:t>7.1 Contraste con la literatura sobre interfaces conversacionales</w:t>
       </w:r>
@@ -26649,7 +26649,7 @@
         <w:spacing w:after="240" w:line="276" w:lineRule="auto"/>
       </w:pPr>
       <w:bookmarkStart w:id="208" w:name="_Toc241062336"/>
-      <w:bookmarkStart w:id="209" w:name="_Toc242182708"/>
+      <w:bookmarkStart w:id="209" w:name="_Toc242182954"/>
       <w:r>
         <w:lastRenderedPageBreak/>
         <w:t>7.2 Grounding visual y mitigación de alucinaciones</w:t>
@@ -26668,7 +26668,7 @@
         <w:spacing w:after="240" w:line="276" w:lineRule="auto"/>
       </w:pPr>
       <w:bookmarkStart w:id="210" w:name="_Toc241062337"/>
-      <w:bookmarkStart w:id="211" w:name="_Toc242182709"/>
+      <w:bookmarkStart w:id="211" w:name="_Toc242182955"/>
       <w:r>
         <w:t>7.3 Compliance automatizado y RegTech</w:t>
       </w:r>
@@ -26696,7 +26696,7 @@
         <w:spacing w:after="240" w:line="276" w:lineRule="auto"/>
       </w:pPr>
       <w:bookmarkStart w:id="212" w:name="_Toc241062338"/>
-      <w:bookmarkStart w:id="213" w:name="_Toc242182710"/>
+      <w:bookmarkStart w:id="213" w:name="_Toc242182956"/>
       <w:r>
         <w:t>7.4 Visibilidad algorítmica y consistencia estética</w:t>
       </w:r>
@@ -26718,7 +26718,7 @@
         <w:spacing w:after="240" w:line="276" w:lineRule="auto"/>
       </w:pPr>
       <w:bookmarkStart w:id="214" w:name="_Toc241062339"/>
-      <w:bookmarkStart w:id="215" w:name="_Toc242182711"/>
+      <w:bookmarkStart w:id="215" w:name="_Toc242182957"/>
       <w:r>
         <w:t>7.5 Frente al vacío tecnológico del Estado del Arte</w:t>
       </w:r>
@@ -26736,7 +26736,7 @@
         <w:spacing w:after="240" w:line="276" w:lineRule="auto"/>
       </w:pPr>
       <w:bookmarkStart w:id="216" w:name="_Toc241062340"/>
-      <w:bookmarkStart w:id="217" w:name="_Toc242182712"/>
+      <w:bookmarkStart w:id="217" w:name="_Toc242182958"/>
       <w:r>
         <w:t>7.6 Aporte original frente a integración de tecnologías existentes</w:t>
       </w:r>
@@ -26754,7 +26754,7 @@
         <w:spacing w:after="240" w:line="276" w:lineRule="auto"/>
       </w:pPr>
       <w:bookmarkStart w:id="218" w:name="_Toc241062341"/>
-      <w:bookmarkStart w:id="219" w:name="_Toc242182713"/>
+      <w:bookmarkStart w:id="219" w:name="_Toc242182959"/>
       <w:r>
         <w:t>7.7 Limitaciones de la evidencia</w:t>
       </w:r>
@@ -26796,7 +26796,7 @@
         <w:spacing w:after="240" w:line="276" w:lineRule="auto"/>
       </w:pPr>
       <w:bookmarkStart w:id="220" w:name="_Toc241062342"/>
-      <w:bookmarkStart w:id="221" w:name="_Toc242182714"/>
+      <w:bookmarkStart w:id="221" w:name="_Toc242182960"/>
       <w:r>
         <w:t>7.8 Transferibilidad</w:t>
       </w:r>
@@ -26822,7 +26822,7 @@
         <w:pStyle w:val="Heading1"/>
       </w:pPr>
       <w:bookmarkStart w:id="222" w:name="_Toc241062343"/>
-      <w:bookmarkStart w:id="223" w:name="_Toc242182715"/>
+      <w:bookmarkStart w:id="223" w:name="_Toc242182961"/>
       <w:r>
         <w:t>CAPÍTULO 8. CONCLUSIONES Y RECOMENDACIONES</w:t>
       </w:r>
@@ -26858,7 +26858,7 @@
         <w:spacing w:after="240" w:line="276" w:lineRule="auto"/>
       </w:pPr>
       <w:bookmarkStart w:id="224" w:name="_Toc241062344"/>
-      <w:bookmarkStart w:id="225" w:name="_Toc242182716"/>
+      <w:bookmarkStart w:id="225" w:name="_Toc242182962"/>
       <w:r>
         <w:t>8.1 Conclusiones Generales y Cumplimiento de Objetivos</w:t>
       </w:r>
@@ -27047,7 +27047,7 @@
         <w:spacing w:after="240" w:line="276" w:lineRule="auto"/>
       </w:pPr>
       <w:bookmarkStart w:id="226" w:name="_Toc241062345"/>
-      <w:bookmarkStart w:id="227" w:name="_Toc242182717"/>
+      <w:bookmarkStart w:id="227" w:name="_Toc242182963"/>
       <w:r>
         <w:t>8.2 Recomendaciones Priorizadas</w:t>
       </w:r>
@@ -27299,7 +27299,7 @@
         <w:pStyle w:val="Heading1"/>
       </w:pPr>
       <w:bookmarkStart w:id="228" w:name="_Toc241062346"/>
-      <w:bookmarkStart w:id="229" w:name="_Toc242182718"/>
+      <w:bookmarkStart w:id="229" w:name="_Toc242182964"/>
       <w:r>
         <w:t>CAPÍTULO 9. REFERENCIAS BIBLIOGRÁFICAS</w:t>
       </w:r>
@@ -30568,7 +30568,7 @@
         <w:pStyle w:val="Heading1"/>
       </w:pPr>
       <w:bookmarkStart w:id="231" w:name="_Toc241062347"/>
-      <w:bookmarkStart w:id="232" w:name="_Toc242182719"/>
+      <w:bookmarkStart w:id="232" w:name="_Toc242182965"/>
       <w:r>
         <w:lastRenderedPageBreak/>
         <w:t>CAPÍTULO 10. ANEXOS</w:t>
@@ -30592,7 +30592,7 @@
         <w:pStyle w:val="Heading2"/>
       </w:pPr>
       <w:bookmarkStart w:id="233" w:name="_Toc241062348"/>
-      <w:bookmarkStart w:id="234" w:name="_Toc242182720"/>
+      <w:bookmarkStart w:id="234" w:name="_Toc242182966"/>
       <w:r>
         <w:t>Anexo A — Tabla de cumplimiento de Historias de Usuario</w:t>
       </w:r>
@@ -30604,7 +30604,7 @@
         <w:pStyle w:val="Heading3"/>
       </w:pPr>
       <w:bookmarkStart w:id="235" w:name="_Toc241062349"/>
-      <w:bookmarkStart w:id="236" w:name="_Toc242182721"/>
+      <w:bookmarkStart w:id="236" w:name="_Toc242182967"/>
       <w:r>
         <w:t>A.1 Cumplimiento de las Historias de Usuario</w:t>
       </w:r>
@@ -30621,7 +30621,7 @@
       <w:pPr>
         <w:keepNext/>
       </w:pPr>
-      <w:bookmarkStart w:id="237" w:name="_Toc242182769"/>
+      <w:bookmarkStart w:id="237" w:name="_Toc242183015"/>
       <w:r>
         <w:rPr>
           <w:b/>
@@ -32345,7 +32345,7 @@
         <w:pStyle w:val="Heading3"/>
       </w:pPr>
       <w:bookmarkStart w:id="238" w:name="_Toc241062350"/>
-      <w:bookmarkStart w:id="239" w:name="_Toc242182722"/>
+      <w:bookmarkStart w:id="239" w:name="_Toc242182968"/>
       <w:r>
         <w:t>A.2 Cronología del desarrollo reconstruida del repositorio</w:t>
       </w:r>
@@ -32440,7 +32440,7 @@
         <w:pStyle w:val="Heading2"/>
       </w:pPr>
       <w:bookmarkStart w:id="240" w:name="_Toc241062351"/>
-      <w:bookmarkStart w:id="241" w:name="_Toc242182723"/>
+      <w:bookmarkStart w:id="241" w:name="_Toc242182969"/>
       <w:r>
         <w:t>Anexo B — Arquitectura técnica y decisiones de diseño</w:t>
       </w:r>
@@ -32459,7 +32459,7 @@
         <w:pStyle w:val="Heading3"/>
       </w:pPr>
       <w:bookmarkStart w:id="242" w:name="_Toc241062352"/>
-      <w:bookmarkStart w:id="243" w:name="_Toc242182724"/>
+      <w:bookmarkStart w:id="243" w:name="_Toc242182970"/>
       <w:r>
         <w:t>B.1 Infraestructura de despliegue</w:t>
       </w:r>
@@ -32524,7 +32524,7 @@
         <w:pStyle w:val="Heading3"/>
       </w:pPr>
       <w:bookmarkStart w:id="244" w:name="_Toc241062353"/>
-      <w:bookmarkStart w:id="245" w:name="_Toc242182725"/>
+      <w:bookmarkStart w:id="245" w:name="_Toc242182971"/>
       <w:r>
         <w:lastRenderedPageBreak/>
         <w:t>B.2 Inventario de workflows y su función</w:t>
@@ -32696,7 +32696,7 @@
           <w:sz w:val="20"/>
         </w:rPr>
       </w:pPr>
-      <w:bookmarkStart w:id="246" w:name="_Toc242182793"/>
+      <w:bookmarkStart w:id="246" w:name="_Toc242183039"/>
       <w:r>
         <w:rPr>
           <w:i/>
@@ -32816,7 +32816,7 @@
         <w:pStyle w:val="Heading3"/>
       </w:pPr>
       <w:bookmarkStart w:id="247" w:name="_Toc241062354"/>
-      <w:bookmarkStart w:id="248" w:name="_Toc242182726"/>
+      <w:bookmarkStart w:id="248" w:name="_Toc242182972"/>
       <w:r>
         <w:t>B.3 Seguridad de credenciales</w:t>
       </w:r>
@@ -32837,7 +32837,7 @@
         <w:pStyle w:val="Heading3"/>
       </w:pPr>
       <w:bookmarkStart w:id="249" w:name="_Toc241062355"/>
-      <w:bookmarkStart w:id="250" w:name="_Toc242182727"/>
+      <w:bookmarkStart w:id="250" w:name="_Toc242182973"/>
       <w:r>
         <w:t>B.4 Módulo Centinela de Compliance: implementación</w:t>
       </w:r>
@@ -32900,7 +32900,7 @@
         <w:pStyle w:val="Heading3"/>
       </w:pPr>
       <w:bookmarkStart w:id="251" w:name="_Toc241062356"/>
-      <w:bookmarkStart w:id="252" w:name="_Toc242182728"/>
+      <w:bookmarkStart w:id="252" w:name="_Toc242182974"/>
       <w:r>
         <w:t>B.5 Concurrencia en la ingesta de carruseles</w:t>
       </w:r>
@@ -32917,7 +32917,7 @@
         <w:pStyle w:val="Heading3"/>
       </w:pPr>
       <w:bookmarkStart w:id="253" w:name="_Toc241062357"/>
-      <w:bookmarkStart w:id="254" w:name="_Toc242182729"/>
+      <w:bookmarkStart w:id="254" w:name="_Toc242182975"/>
       <w:r>
         <w:t>B.6 Prevención de publicaciones duplicadas</w:t>
       </w:r>
@@ -32940,7 +32940,7 @@
         <w:pStyle w:val="Heading3"/>
       </w:pPr>
       <w:bookmarkStart w:id="255" w:name="_Toc241062358"/>
-      <w:bookmarkStart w:id="256" w:name="_Toc242182730"/>
+      <w:bookmarkStart w:id="256" w:name="_Toc242182976"/>
       <w:r>
         <w:t>B.7 Publicación multiplataforma: extensión a Facebook</w:t>
       </w:r>
@@ -32957,7 +32957,7 @@
         <w:pStyle w:val="Heading3"/>
       </w:pPr>
       <w:bookmarkStart w:id="257" w:name="_Toc241062359"/>
-      <w:bookmarkStart w:id="258" w:name="_Toc242182731"/>
+      <w:bookmarkStart w:id="258" w:name="_Toc242182977"/>
       <w:r>
         <w:t>B.8 Sincronización de estado con Instagram</w:t>
       </w:r>
@@ -32974,7 +32974,7 @@
         <w:pStyle w:val="Heading3"/>
       </w:pPr>
       <w:bookmarkStart w:id="259" w:name="_Toc241062360"/>
-      <w:bookmarkStart w:id="260" w:name="_Toc242182732"/>
+      <w:bookmarkStart w:id="260" w:name="_Toc242182978"/>
       <w:r>
         <w:t>B.9 Procesamiento de video (HU13): detalle de implementación</w:t>
       </w:r>
@@ -32996,7 +32996,7 @@
         <w:pStyle w:val="Heading2"/>
       </w:pPr>
       <w:bookmarkStart w:id="261" w:name="_Toc241062361"/>
-      <w:bookmarkStart w:id="262" w:name="_Toc242182733"/>
+      <w:bookmarkStart w:id="262" w:name="_Toc242182979"/>
       <w:r>
         <w:t>Anexo C — Lecciones aprendidas y desafíos técnicos</w:t>
       </w:r>
@@ -33015,7 +33015,7 @@
         <w:pStyle w:val="Heading3"/>
       </w:pPr>
       <w:bookmarkStart w:id="263" w:name="_Toc241062362"/>
-      <w:bookmarkStart w:id="264" w:name="_Toc242182734"/>
+      <w:bookmarkStart w:id="264" w:name="_Toc242182980"/>
       <w:r>
         <w:t>C.1 Restricciones de infraestructura: el problema de las tarjetas virtuales</w:t>
       </w:r>
@@ -33032,7 +33032,7 @@
         <w:pStyle w:val="Heading3"/>
       </w:pPr>
       <w:bookmarkStart w:id="265" w:name="_Toc241062363"/>
-      <w:bookmarkStart w:id="266" w:name="_Toc242182735"/>
+      <w:bookmarkStart w:id="266" w:name="_Toc242182981"/>
       <w:r>
         <w:t>C.2 Concurrencia en flujos disparados por eventos externos</w:t>
       </w:r>
@@ -33049,7 +33049,7 @@
         <w:pStyle w:val="Heading3"/>
       </w:pPr>
       <w:bookmarkStart w:id="267" w:name="_Toc241062364"/>
-      <w:bookmarkStart w:id="268" w:name="_Toc242182736"/>
+      <w:bookmarkStart w:id="268" w:name="_Toc242182982"/>
       <w:r>
         <w:lastRenderedPageBreak/>
         <w:t>C.3 Integridad de datos al editar el sistema por su propia API</w:t>
@@ -33067,7 +33067,7 @@
         <w:pStyle w:val="Heading3"/>
       </w:pPr>
       <w:bookmarkStart w:id="269" w:name="_Toc241062365"/>
-      <w:bookmarkStart w:id="270" w:name="_Toc242182737"/>
+      <w:bookmarkStart w:id="270" w:name="_Toc242182983"/>
       <w:r>
         <w:t>C.4 Regresiones de plataforma en la migración al servidor propio</w:t>
       </w:r>
@@ -33084,7 +33084,7 @@
         <w:pStyle w:val="Heading3"/>
       </w:pPr>
       <w:bookmarkStart w:id="271" w:name="_Toc241062366"/>
-      <w:bookmarkStart w:id="272" w:name="_Toc242182738"/>
+      <w:bookmarkStart w:id="272" w:name="_Toc242182984"/>
       <w:r>
         <w:t>C.5 Restricciones del entorno de ejecución para el procesamiento de video</w:t>
       </w:r>
@@ -33101,7 +33101,7 @@
         <w:pStyle w:val="Heading3"/>
       </w:pPr>
       <w:bookmarkStart w:id="273" w:name="_Toc241062367"/>
-      <w:bookmarkStart w:id="274" w:name="_Toc242182739"/>
+      <w:bookmarkStart w:id="274" w:name="_Toc242182985"/>
       <w:r>
         <w:t>C.6 Integración con servicios externos: formatos de envío no documentados con claridad</w:t>
       </w:r>
@@ -33118,7 +33118,7 @@
         <w:pStyle w:val="Heading3"/>
       </w:pPr>
       <w:bookmarkStart w:id="275" w:name="_Toc241062368"/>
-      <w:bookmarkStart w:id="276" w:name="_Toc242182740"/>
+      <w:bookmarkStart w:id="276" w:name="_Toc242182986"/>
       <w:r>
         <w:t>C.7 Errores intermitentes en APIs de terceros</w:t>
       </w:r>
@@ -33135,7 +33135,7 @@
         <w:pStyle w:val="Heading3"/>
       </w:pPr>
       <w:bookmarkStart w:id="277" w:name="_Toc241062369"/>
-      <w:bookmarkStart w:id="278" w:name="_Toc242182741"/>
+      <w:bookmarkStart w:id="278" w:name="_Toc242182987"/>
       <w:r>
         <w:lastRenderedPageBreak/>
         <w:t>C.8 Límites de cuota en servicios de IA gratuitos</w:t>
@@ -33152,7 +33152,7 @@
       <w:pPr>
         <w:pStyle w:val="Heading3"/>
       </w:pPr>
-      <w:bookmarkStart w:id="279" w:name="_Toc242182742"/>
+      <w:bookmarkStart w:id="279" w:name="_Toc242182988"/>
       <w:r>
         <w:t>C.9 Cuota de lecturas de Google Sheets al programar</w:t>
       </w:r>
@@ -33169,7 +33169,7 @@
         <w:pStyle w:val="Heading2"/>
       </w:pPr>
       <w:bookmarkStart w:id="280" w:name="_Toc241062370"/>
-      <w:bookmarkStart w:id="281" w:name="_Toc242182743"/>
+      <w:bookmarkStart w:id="281" w:name="_Toc242182989"/>
       <w:r>
         <w:t>Anexo D — Pautas Mary Kay para el uso en los medios sociales</w:t>
       </w:r>
@@ -33271,7 +33271,7 @@
         <w:pStyle w:val="Heading2"/>
       </w:pPr>
       <w:bookmarkStart w:id="282" w:name="_Toc241062371"/>
-      <w:bookmarkStart w:id="283" w:name="_Toc242182744"/>
+      <w:bookmarkStart w:id="283" w:name="_Toc242182990"/>
       <w:r>
         <w:t>Anexo E — Protocolo de validación empírica y conjuntos de datos</w:t>
       </w:r>
@@ -33291,7 +33291,7 @@
         <w:pStyle w:val="Heading3"/>
       </w:pPr>
       <w:bookmarkStart w:id="284" w:name="_Toc241062372"/>
-      <w:bookmarkStart w:id="285" w:name="_Toc242182745"/>
+      <w:bookmarkStart w:id="285" w:name="_Toc242182991"/>
       <w:r>
         <w:t>E.1 Validación del Módulo Centinela de Compliance</w:t>
       </w:r>
@@ -33415,7 +33415,7 @@
       <w:pPr>
         <w:keepNext/>
       </w:pPr>
-      <w:bookmarkStart w:id="286" w:name="_Toc242182770"/>
+      <w:bookmarkStart w:id="286" w:name="_Toc242183016"/>
       <w:r>
         <w:rPr>
           <w:b/>
@@ -35916,7 +35916,7 @@
         <w:pStyle w:val="Heading3"/>
       </w:pPr>
       <w:bookmarkStart w:id="287" w:name="_Toc241062373"/>
-      <w:bookmarkStart w:id="288" w:name="_Toc242182746"/>
+      <w:bookmarkStart w:id="288" w:name="_Toc242182992"/>
       <w:r>
         <w:lastRenderedPageBreak/>
         <w:t>E.2 Protocolo de cronometraje del tiempo operativo</w:t>
@@ -36021,7 +36021,7 @@
         <w:pStyle w:val="Heading3"/>
       </w:pPr>
       <w:bookmarkStart w:id="289" w:name="_Toc241062374"/>
-      <w:bookmarkStart w:id="290" w:name="_Toc242182747"/>
+      <w:bookmarkStart w:id="290" w:name="_Toc242182993"/>
       <w:r>
         <w:t>E.3 Cuestionario de aceptación tecnológica (TAM)</w:t>
       </w:r>
@@ -36053,7 +36053,7 @@
         <w:pStyle w:val="Heading3"/>
       </w:pPr>
       <w:bookmarkStart w:id="291" w:name="_Toc241062375"/>
-      <w:bookmarkStart w:id="292" w:name="_Toc242182748"/>
+      <w:bookmarkStart w:id="292" w:name="_Toc242182994"/>
       <w:r>
         <w:t>E.4 Reproducibilidad de los análisis</w:t>
       </w:r>
@@ -36141,7 +36141,7 @@
         <w:pStyle w:val="Heading3"/>
       </w:pPr>
       <w:bookmarkStart w:id="293" w:name="_Toc241062376"/>
-      <w:bookmarkStart w:id="294" w:name="_Toc242182749"/>
+      <w:bookmarkStart w:id="294" w:name="_Toc242182995"/>
       <w:r>
         <w:t>E.5 Baterías de validación técnica</w:t>
       </w:r>
@@ -36172,7 +36172,7 @@
       <w:pPr>
         <w:keepNext/>
       </w:pPr>
-      <w:bookmarkStart w:id="295" w:name="_Toc242182771"/>
+      <w:bookmarkStart w:id="295" w:name="_Toc242183017"/>
       <w:r>
         <w:t xml:space="preserve">Tabla </w:t>
       </w:r>
@@ -37045,7 +37045,7 @@
         <w:pStyle w:val="Heading3"/>
       </w:pPr>
       <w:bookmarkStart w:id="296" w:name="_Toc241062377"/>
-      <w:bookmarkStart w:id="297" w:name="_Toc242182750"/>
+      <w:bookmarkStart w:id="297" w:name="_Toc242182996"/>
       <w:r>
         <w:t>E.6 Conjunto ampliado del canal de imagen (HU8)</w:t>
       </w:r>
@@ -37132,7 +37132,7 @@
       <w:pPr>
         <w:keepNext/>
       </w:pPr>
-      <w:bookmarkStart w:id="298" w:name="_Toc242182772"/>
+      <w:bookmarkStart w:id="298" w:name="_Toc242183018"/>
       <w:r>
         <w:t xml:space="preserve">Tabla </w:t>
       </w:r>
@@ -37363,7 +37363,7 @@
         <w:pStyle w:val="Heading3"/>
       </w:pPr>
       <w:bookmarkStart w:id="299" w:name="_Toc241062378"/>
-      <w:bookmarkStart w:id="300" w:name="_Toc242182751"/>
+      <w:bookmarkStart w:id="300" w:name="_Toc242182997"/>
       <w:r>
         <w:t>E.7 Verificación de los umbrales de las Historias de Usuario</w:t>
       </w:r>
@@ -37399,7 +37399,7 @@
       <w:pPr>
         <w:keepNext/>
       </w:pPr>
-      <w:bookmarkStart w:id="301" w:name="_Toc242182773"/>
+      <w:bookmarkStart w:id="301" w:name="_Toc242183019"/>
       <w:r>
         <w:t xml:space="preserve">Tabla </w:t>
       </w:r>
@@ -38602,7 +38602,7 @@
         <w:pStyle w:val="Heading3"/>
       </w:pPr>
       <w:bookmarkStart w:id="302" w:name="_Toc241062379"/>
-      <w:bookmarkStart w:id="303" w:name="_Toc242182752"/>
+      <w:bookmarkStart w:id="303" w:name="_Toc242182998"/>
       <w:r>
         <w:t>E.8 Casos difíciles del canal de imagen y variabilidad entre corridas</w:t>
       </w:r>
@@ -38652,7 +38652,7 @@
       <w:pPr>
         <w:keepNext/>
       </w:pPr>
-      <w:bookmarkStart w:id="304" w:name="_Toc242182774"/>
+      <w:bookmarkStart w:id="304" w:name="_Toc242183020"/>
       <w:r>
         <w:t xml:space="preserve">Tabla </w:t>
       </w:r>
@@ -38867,7 +38867,7 @@
         <w:pStyle w:val="Heading3"/>
       </w:pPr>
       <w:bookmarkStart w:id="305" w:name="_Toc241062380"/>
-      <w:bookmarkStart w:id="306" w:name="_Toc242182753"/>
+      <w:bookmarkStart w:id="306" w:name="_Toc242182999"/>
       <w:r>
         <w:t>E.9 Casos de video del canal visual (HU13)</w:t>
       </w:r>
@@ -38912,7 +38912,7 @@
         <w:pStyle w:val="Heading3"/>
       </w:pPr>
       <w:bookmarkStart w:id="307" w:name="_Toc241062381"/>
-      <w:bookmarkStart w:id="308" w:name="_Toc242182754"/>
+      <w:bookmarkStart w:id="308" w:name="_Toc242183000"/>
       <w:r>
         <w:t>E.10 Caso de carrusel del canal visual (HU5)</w:t>
       </w:r>
@@ -38963,7 +38963,7 @@
         <w:pStyle w:val="Heading3"/>
       </w:pPr>
       <w:bookmarkStart w:id="309" w:name="_Toc241062382"/>
-      <w:bookmarkStart w:id="310" w:name="_Toc242182755"/>
+      <w:bookmarkStart w:id="310" w:name="_Toc242183001"/>
       <w:r>
         <w:t>E.11 Caso de re-publicación del canal visual (HU12)</w:t>
       </w:r>
@@ -39014,7 +39014,7 @@
         <w:pStyle w:val="Heading3"/>
       </w:pPr>
       <w:bookmarkStart w:id="311" w:name="_Toc241062383"/>
-      <w:bookmarkStart w:id="312" w:name="_Toc242182756"/>
+      <w:bookmarkStart w:id="312" w:name="_Toc242183002"/>
       <w:r>
         <w:t>E.12 Gobierno del llamado a la acción generado</w:t>
       </w:r>
@@ -39065,7 +39065,7 @@
         <w:pStyle w:val="Heading3"/>
       </w:pPr>
       <w:bookmarkStart w:id="313" w:name="_Toc241062384"/>
-      <w:bookmarkStart w:id="314" w:name="_Toc242182757"/>
+      <w:bookmarkStart w:id="314" w:name="_Toc242183003"/>
       <w:r>
         <w:t>E.13 Trazabilidad de los Objetivos Específicos</w:t>
       </w:r>
@@ -39084,7 +39084,7 @@
       <w:pPr>
         <w:keepNext/>
       </w:pPr>
-      <w:bookmarkStart w:id="315" w:name="_Toc242182775"/>
+      <w:bookmarkStart w:id="315" w:name="_Toc242183021"/>
       <w:r>
         <w:t xml:space="preserve">Tabla </w:t>
       </w:r>
@@ -39653,7 +39653,7 @@
       <w:pPr>
         <w:pStyle w:val="Heading3"/>
       </w:pPr>
-      <w:bookmarkStart w:id="316" w:name="_Toc242182758"/>
+      <w:bookmarkStart w:id="316" w:name="_Toc242183004"/>
       <w:r>
         <w:t>E.14 Objetivo Específico 2 — calidad del copy y comparación con el trabajo manual</w:t>
       </w:r>
@@ -39822,7 +39822,7 @@
       <w:pPr>
         <w:pStyle w:val="Heading3"/>
       </w:pPr>
-      <w:bookmarkStart w:id="317" w:name="_Toc242182759"/>
+      <w:bookmarkStart w:id="317" w:name="_Toc242183005"/>
       <w:r>
         <w:t>E.15 Trazabilidad entre versiones del sistema y mediciones</w:t>
       </w:r>
@@ -39837,7 +39837,7 @@
       <w:pPr>
         <w:keepNext/>
       </w:pPr>
-      <w:bookmarkStart w:id="318" w:name="_Toc242182776"/>
+      <w:bookmarkStart w:id="318" w:name="_Toc242183022"/>
       <w:r>
         <w:t xml:space="preserve">Tabla </w:t>
       </w:r>
@@ -40388,7 +40388,7 @@
       <w:pPr>
         <w:pStyle w:val="Heading3"/>
       </w:pPr>
-      <w:bookmarkStart w:id="319" w:name="_Toc242182760"/>
+      <w:bookmarkStart w:id="319" w:name="_Toc242183006"/>
       <w:r>
         <w:t>E.16 Inventario del material complementario</w:t>
       </w:r>
@@ -40403,7 +40403,7 @@
       <w:pPr>
         <w:keepNext/>
       </w:pPr>
-      <w:bookmarkStart w:id="320" w:name="_Toc242182777"/>
+      <w:bookmarkStart w:id="320" w:name="_Toc242183023"/>
       <w:r>
         <w:t xml:space="preserve">Tabla </w:t>
       </w:r>
@@ -41583,7 +41583,7 @@
                 <w:rFonts w:ascii="Arial" w:hAnsi="Arial" w:cs="Arial"/>
                 <w:sz w:val="18"/>
               </w:rPr>
-              <w:t>Configuración de E3 (B.1, E.15)</w:t>
+              <w:t>Servidor de E3 (B.1, E.15)</w:t>
             </w:r>
           </w:p>
         </w:tc>

</xml_diff>